<commit_message>
Attendee automation, deck, follow-along and site refreshed from the private source through tools/publish (logical networks named with the VLAN, SDN example parameters, security baseline, GPU, Day-2 monitoring; analyzer clean)
Co-Authored-By: Claude Opus 5.5 <noreply@anthropic.com>
</commit_message>
<xml_diff>
--- a/follow-along/Azure_Local_Follow_Along_Guide.docx
+++ b/follow-along/Azure_Local_Follow_Along_Guide.docx
@@ -4020,7 +4020,7 @@
           <w:rFonts w:ascii="Segoe UI" w:eastAsia="Times New Roman" w:hAnsi="Segoe UI" w:cs="Segoe UI"/>
           <w:lang w:val="en"/>
         </w:rPr>
-        <w:t>Security and governance baseline</w:t>
+        <w:t>Security baseline as production: Policy, Defender for Cloud and Sentinel</w:t>
       </w:r>
     </w:p>
     <w:p>
@@ -4087,6 +4087,24 @@
           <w:lang w:val="en"/>
         </w:rPr>
         <w:t xml:space="preserve"> </w:t>
+      </w:r>
+      <w:r>
+        <w:rPr>
+          <w:rStyle w:val="HTMLCode"/>
+          <w:color w:val="1B2430"/>
+          <w:lang w:val="en"/>
+        </w:rPr>
+        <w:t>automation/shared/security</w:t>
+      </w:r>
+      <w:r>
+        <w:rPr>
+          <w:rFonts w:ascii="Segoe UI" w:hAnsi="Segoe UI" w:cs="Segoe UI"/>
+          <w:color w:val="1B2430"/>
+          <w:sz w:val="21"/>
+          <w:szCs w:val="21"/>
+          <w:lang w:val="en"/>
+        </w:rPr>
+        <w:t xml:space="preserve">, </w:t>
       </w:r>
       <w:r>
         <w:rPr>
@@ -5464,9 +5482,158 @@
 <file path=word/numbering.xml><?xml version="1.0" encoding="utf-8"?>
 <w:numbering xmlns:wpc="http://schemas.microsoft.com/office/word/2010/wordprocessingCanvas" xmlns:cx="http://schemas.microsoft.com/office/drawing/2014/chartex" xmlns:cx1="http://schemas.microsoft.com/office/drawing/2015/9/8/chartex" xmlns:cx2="http://schemas.microsoft.com/office/drawing/2015/10/21/chartex" xmlns:cx3="http://schemas.microsoft.com/office/drawing/2016/5/9/chartex" xmlns:cx4="http://schemas.microsoft.com/office/drawing/2016/5/10/chartex" xmlns:cx5="http://schemas.microsoft.com/office/drawing/2016/5/11/chartex" xmlns:cx6="http://schemas.microsoft.com/office/drawing/2016/5/12/chartex" xmlns:cx7="http://schemas.microsoft.com/office/drawing/2016/5/13/chartex" xmlns:cx8="http://schemas.microsoft.com/office/drawing/2016/5/14/chartex" xmlns:mc="http://schemas.openxmlformats.org/markup-compatibility/2006" xmlns:aink="http://schemas.microsoft.com/office/drawing/2016/ink" xmlns:am3d="http://schemas.microsoft.com/office/drawing/2017/model3d" xmlns:o="urn:schemas-microsoft-com:office:office" xmlns:oel="http://schemas.microsoft.com/office/2019/extlst" xmlns:r="http://schemas.openxmlformats.org/officeDocument/2006/relationships" xmlns:m="http://schemas.openxmlformats.org/officeDocument/2006/math" xmlns:v="urn:schemas-microsoft-com:vml" xmlns:wp14="http://schemas.microsoft.com/office/word/2010/wordprocessingDrawing" xmlns:wp="http://schemas.openxmlformats.org/drawingml/2006/wordprocessingDrawing" xmlns:w10="urn:schemas-microsoft-com:office:word" xmlns:w="http://schemas.openxmlformats.org/wordprocessingml/2006/main" xmlns:w14="http://schemas.microsoft.com/office/word/2010/wordml" xmlns:w15="http://schemas.microsoft.com/office/word/2012/wordml" xmlns:w16cex="http://schemas.microsoft.com/office/word/2018/wordml/cex" xmlns:w16cid="http://schemas.microsoft.com/office/word/2016/wordml/cid" xmlns:w16="http://schemas.microsoft.com/office/word/2018/wordml" xmlns:w16du="http://schemas.microsoft.com/office/word/2023/wordml/word16du" xmlns:w16sdtdh="http://schemas.microsoft.com/office/word/2020/wordml/sdtdatahash" xmlns:w16sdtfl="http://schemas.microsoft.com/office/word/2024/wordml/sdtformatlock" xmlns:w16se="http://schemas.microsoft.com/office/word/2015/wordml/symex" xmlns:wpg="http://schemas.microsoft.com/office/word/2010/wordprocessingGroup" xmlns:wpi="http://schemas.microsoft.com/office/word/2010/wordprocessingInk" xmlns:wne="http://schemas.microsoft.com/office/word/2006/wordml" xmlns:wps="http://schemas.microsoft.com/office/word/2010/wordprocessingShape" mc:Ignorable="w14 w15 w16se w16cid w16 w16cex w16sdtdh w16sdtfl w16du wp14">
   <w:abstractNum w:abstractNumId="0" w15:restartNumberingAfterBreak="0">
-    <w:nsid w:val="00101C3B"/>
+    <w:nsid w:val="07CE0C65"/>
     <w:multiLevelType w:val="multilevel"/>
-    <w:tmpl w:val="972A96B6"/>
+    <w:tmpl w:val="84A2AE46"/>
+    <w:lvl w:ilvl="0">
+      <w:start w:val="1"/>
+      <w:numFmt w:val="bullet"/>
+      <w:lvlText w:val=""/>
+      <w:lvlJc w:val="left"/>
+      <w:pPr>
+        <w:tabs>
+          <w:tab w:val="num" w:pos="720"/>
+        </w:tabs>
+        <w:ind w:left="720" w:hanging="360"/>
+      </w:pPr>
+      <w:rPr>
+        <w:rFonts w:ascii="Symbol" w:hAnsi="Symbol" w:hint="default"/>
+        <w:sz w:val="20"/>
+      </w:rPr>
+    </w:lvl>
+    <w:lvl w:ilvl="1" w:tentative="1">
+      <w:start w:val="1"/>
+      <w:numFmt w:val="bullet"/>
+      <w:lvlText w:val="o"/>
+      <w:lvlJc w:val="left"/>
+      <w:pPr>
+        <w:tabs>
+          <w:tab w:val="num" w:pos="1440"/>
+        </w:tabs>
+        <w:ind w:left="1440" w:hanging="360"/>
+      </w:pPr>
+      <w:rPr>
+        <w:rFonts w:ascii="Courier New" w:hAnsi="Courier New" w:hint="default"/>
+        <w:sz w:val="20"/>
+      </w:rPr>
+    </w:lvl>
+    <w:lvl w:ilvl="2" w:tentative="1">
+      <w:start w:val="1"/>
+      <w:numFmt w:val="bullet"/>
+      <w:lvlText w:val=""/>
+      <w:lvlJc w:val="left"/>
+      <w:pPr>
+        <w:tabs>
+          <w:tab w:val="num" w:pos="2160"/>
+        </w:tabs>
+        <w:ind w:left="2160" w:hanging="360"/>
+      </w:pPr>
+      <w:rPr>
+        <w:rFonts w:ascii="Wingdings" w:hAnsi="Wingdings" w:hint="default"/>
+        <w:sz w:val="20"/>
+      </w:rPr>
+    </w:lvl>
+    <w:lvl w:ilvl="3" w:tentative="1">
+      <w:start w:val="1"/>
+      <w:numFmt w:val="bullet"/>
+      <w:lvlText w:val=""/>
+      <w:lvlJc w:val="left"/>
+      <w:pPr>
+        <w:tabs>
+          <w:tab w:val="num" w:pos="2880"/>
+        </w:tabs>
+        <w:ind w:left="2880" w:hanging="360"/>
+      </w:pPr>
+      <w:rPr>
+        <w:rFonts w:ascii="Wingdings" w:hAnsi="Wingdings" w:hint="default"/>
+        <w:sz w:val="20"/>
+      </w:rPr>
+    </w:lvl>
+    <w:lvl w:ilvl="4" w:tentative="1">
+      <w:start w:val="1"/>
+      <w:numFmt w:val="bullet"/>
+      <w:lvlText w:val=""/>
+      <w:lvlJc w:val="left"/>
+      <w:pPr>
+        <w:tabs>
+          <w:tab w:val="num" w:pos="3600"/>
+        </w:tabs>
+        <w:ind w:left="3600" w:hanging="360"/>
+      </w:pPr>
+      <w:rPr>
+        <w:rFonts w:ascii="Wingdings" w:hAnsi="Wingdings" w:hint="default"/>
+        <w:sz w:val="20"/>
+      </w:rPr>
+    </w:lvl>
+    <w:lvl w:ilvl="5" w:tentative="1">
+      <w:start w:val="1"/>
+      <w:numFmt w:val="bullet"/>
+      <w:lvlText w:val=""/>
+      <w:lvlJc w:val="left"/>
+      <w:pPr>
+        <w:tabs>
+          <w:tab w:val="num" w:pos="4320"/>
+        </w:tabs>
+        <w:ind w:left="4320" w:hanging="360"/>
+      </w:pPr>
+      <w:rPr>
+        <w:rFonts w:ascii="Wingdings" w:hAnsi="Wingdings" w:hint="default"/>
+        <w:sz w:val="20"/>
+      </w:rPr>
+    </w:lvl>
+    <w:lvl w:ilvl="6" w:tentative="1">
+      <w:start w:val="1"/>
+      <w:numFmt w:val="bullet"/>
+      <w:lvlText w:val=""/>
+      <w:lvlJc w:val="left"/>
+      <w:pPr>
+        <w:tabs>
+          <w:tab w:val="num" w:pos="5040"/>
+        </w:tabs>
+        <w:ind w:left="5040" w:hanging="360"/>
+      </w:pPr>
+      <w:rPr>
+        <w:rFonts w:ascii="Wingdings" w:hAnsi="Wingdings" w:hint="default"/>
+        <w:sz w:val="20"/>
+      </w:rPr>
+    </w:lvl>
+    <w:lvl w:ilvl="7" w:tentative="1">
+      <w:start w:val="1"/>
+      <w:numFmt w:val="bullet"/>
+      <w:lvlText w:val=""/>
+      <w:lvlJc w:val="left"/>
+      <w:pPr>
+        <w:tabs>
+          <w:tab w:val="num" w:pos="5760"/>
+        </w:tabs>
+        <w:ind w:left="5760" w:hanging="360"/>
+      </w:pPr>
+      <w:rPr>
+        <w:rFonts w:ascii="Wingdings" w:hAnsi="Wingdings" w:hint="default"/>
+        <w:sz w:val="20"/>
+      </w:rPr>
+    </w:lvl>
+    <w:lvl w:ilvl="8" w:tentative="1">
+      <w:start w:val="1"/>
+      <w:numFmt w:val="bullet"/>
+      <w:lvlText w:val=""/>
+      <w:lvlJc w:val="left"/>
+      <w:pPr>
+        <w:tabs>
+          <w:tab w:val="num" w:pos="6480"/>
+        </w:tabs>
+        <w:ind w:left="6480" w:hanging="360"/>
+      </w:pPr>
+      <w:rPr>
+        <w:rFonts w:ascii="Wingdings" w:hAnsi="Wingdings" w:hint="default"/>
+        <w:sz w:val="20"/>
+      </w:rPr>
+    </w:lvl>
+  </w:abstractNum>
+  <w:abstractNum w:abstractNumId="1" w15:restartNumberingAfterBreak="0">
+    <w:nsid w:val="0CF716E0"/>
+    <w:multiLevelType w:val="multilevel"/>
+    <w:tmpl w:val="6B1EFDC0"/>
     <w:lvl w:ilvl="0">
       <w:start w:val="1"/>
       <w:numFmt w:val="decimal"/>
@@ -5580,10 +5747,10 @@
       </w:pPr>
     </w:lvl>
   </w:abstractNum>
-  <w:abstractNum w:abstractNumId="1" w15:restartNumberingAfterBreak="0">
-    <w:nsid w:val="0C0145A3"/>
+  <w:abstractNum w:abstractNumId="2" w15:restartNumberingAfterBreak="0">
+    <w:nsid w:val="31026201"/>
     <w:multiLevelType w:val="multilevel"/>
-    <w:tmpl w:val="7C567BF0"/>
+    <w:tmpl w:val="311ED1A2"/>
     <w:lvl w:ilvl="0">
       <w:start w:val="1"/>
       <w:numFmt w:val="decimal"/>
@@ -5697,10 +5864,1351 @@
       </w:pPr>
     </w:lvl>
   </w:abstractNum>
-  <w:abstractNum w:abstractNumId="2" w15:restartNumberingAfterBreak="0">
-    <w:nsid w:val="0E31319D"/>
+  <w:abstractNum w:abstractNumId="3" w15:restartNumberingAfterBreak="0">
+    <w:nsid w:val="3EB01539"/>
     <w:multiLevelType w:val="multilevel"/>
-    <w:tmpl w:val="26C0EDD4"/>
+    <w:tmpl w:val="B34C08D4"/>
+    <w:lvl w:ilvl="0">
+      <w:start w:val="1"/>
+      <w:numFmt w:val="bullet"/>
+      <w:lvlText w:val=""/>
+      <w:lvlJc w:val="left"/>
+      <w:pPr>
+        <w:tabs>
+          <w:tab w:val="num" w:pos="720"/>
+        </w:tabs>
+        <w:ind w:left="720" w:hanging="360"/>
+      </w:pPr>
+      <w:rPr>
+        <w:rFonts w:ascii="Symbol" w:hAnsi="Symbol" w:hint="default"/>
+        <w:sz w:val="20"/>
+      </w:rPr>
+    </w:lvl>
+    <w:lvl w:ilvl="1" w:tentative="1">
+      <w:start w:val="1"/>
+      <w:numFmt w:val="bullet"/>
+      <w:lvlText w:val="o"/>
+      <w:lvlJc w:val="left"/>
+      <w:pPr>
+        <w:tabs>
+          <w:tab w:val="num" w:pos="1440"/>
+        </w:tabs>
+        <w:ind w:left="1440" w:hanging="360"/>
+      </w:pPr>
+      <w:rPr>
+        <w:rFonts w:ascii="Courier New" w:hAnsi="Courier New" w:hint="default"/>
+        <w:sz w:val="20"/>
+      </w:rPr>
+    </w:lvl>
+    <w:lvl w:ilvl="2" w:tentative="1">
+      <w:start w:val="1"/>
+      <w:numFmt w:val="bullet"/>
+      <w:lvlText w:val=""/>
+      <w:lvlJc w:val="left"/>
+      <w:pPr>
+        <w:tabs>
+          <w:tab w:val="num" w:pos="2160"/>
+        </w:tabs>
+        <w:ind w:left="2160" w:hanging="360"/>
+      </w:pPr>
+      <w:rPr>
+        <w:rFonts w:ascii="Wingdings" w:hAnsi="Wingdings" w:hint="default"/>
+        <w:sz w:val="20"/>
+      </w:rPr>
+    </w:lvl>
+    <w:lvl w:ilvl="3" w:tentative="1">
+      <w:start w:val="1"/>
+      <w:numFmt w:val="bullet"/>
+      <w:lvlText w:val=""/>
+      <w:lvlJc w:val="left"/>
+      <w:pPr>
+        <w:tabs>
+          <w:tab w:val="num" w:pos="2880"/>
+        </w:tabs>
+        <w:ind w:left="2880" w:hanging="360"/>
+      </w:pPr>
+      <w:rPr>
+        <w:rFonts w:ascii="Wingdings" w:hAnsi="Wingdings" w:hint="default"/>
+        <w:sz w:val="20"/>
+      </w:rPr>
+    </w:lvl>
+    <w:lvl w:ilvl="4" w:tentative="1">
+      <w:start w:val="1"/>
+      <w:numFmt w:val="bullet"/>
+      <w:lvlText w:val=""/>
+      <w:lvlJc w:val="left"/>
+      <w:pPr>
+        <w:tabs>
+          <w:tab w:val="num" w:pos="3600"/>
+        </w:tabs>
+        <w:ind w:left="3600" w:hanging="360"/>
+      </w:pPr>
+      <w:rPr>
+        <w:rFonts w:ascii="Wingdings" w:hAnsi="Wingdings" w:hint="default"/>
+        <w:sz w:val="20"/>
+      </w:rPr>
+    </w:lvl>
+    <w:lvl w:ilvl="5" w:tentative="1">
+      <w:start w:val="1"/>
+      <w:numFmt w:val="bullet"/>
+      <w:lvlText w:val=""/>
+      <w:lvlJc w:val="left"/>
+      <w:pPr>
+        <w:tabs>
+          <w:tab w:val="num" w:pos="4320"/>
+        </w:tabs>
+        <w:ind w:left="4320" w:hanging="360"/>
+      </w:pPr>
+      <w:rPr>
+        <w:rFonts w:ascii="Wingdings" w:hAnsi="Wingdings" w:hint="default"/>
+        <w:sz w:val="20"/>
+      </w:rPr>
+    </w:lvl>
+    <w:lvl w:ilvl="6" w:tentative="1">
+      <w:start w:val="1"/>
+      <w:numFmt w:val="bullet"/>
+      <w:lvlText w:val=""/>
+      <w:lvlJc w:val="left"/>
+      <w:pPr>
+        <w:tabs>
+          <w:tab w:val="num" w:pos="5040"/>
+        </w:tabs>
+        <w:ind w:left="5040" w:hanging="360"/>
+      </w:pPr>
+      <w:rPr>
+        <w:rFonts w:ascii="Wingdings" w:hAnsi="Wingdings" w:hint="default"/>
+        <w:sz w:val="20"/>
+      </w:rPr>
+    </w:lvl>
+    <w:lvl w:ilvl="7" w:tentative="1">
+      <w:start w:val="1"/>
+      <w:numFmt w:val="bullet"/>
+      <w:lvlText w:val=""/>
+      <w:lvlJc w:val="left"/>
+      <w:pPr>
+        <w:tabs>
+          <w:tab w:val="num" w:pos="5760"/>
+        </w:tabs>
+        <w:ind w:left="5760" w:hanging="360"/>
+      </w:pPr>
+      <w:rPr>
+        <w:rFonts w:ascii="Wingdings" w:hAnsi="Wingdings" w:hint="default"/>
+        <w:sz w:val="20"/>
+      </w:rPr>
+    </w:lvl>
+    <w:lvl w:ilvl="8" w:tentative="1">
+      <w:start w:val="1"/>
+      <w:numFmt w:val="bullet"/>
+      <w:lvlText w:val=""/>
+      <w:lvlJc w:val="left"/>
+      <w:pPr>
+        <w:tabs>
+          <w:tab w:val="num" w:pos="6480"/>
+        </w:tabs>
+        <w:ind w:left="6480" w:hanging="360"/>
+      </w:pPr>
+      <w:rPr>
+        <w:rFonts w:ascii="Wingdings" w:hAnsi="Wingdings" w:hint="default"/>
+        <w:sz w:val="20"/>
+      </w:rPr>
+    </w:lvl>
+  </w:abstractNum>
+  <w:abstractNum w:abstractNumId="4" w15:restartNumberingAfterBreak="0">
+    <w:nsid w:val="40024B25"/>
+    <w:multiLevelType w:val="multilevel"/>
+    <w:tmpl w:val="3BB271A8"/>
+    <w:lvl w:ilvl="0">
+      <w:start w:val="1"/>
+      <w:numFmt w:val="bullet"/>
+      <w:lvlText w:val=""/>
+      <w:lvlJc w:val="left"/>
+      <w:pPr>
+        <w:tabs>
+          <w:tab w:val="num" w:pos="720"/>
+        </w:tabs>
+        <w:ind w:left="720" w:hanging="360"/>
+      </w:pPr>
+      <w:rPr>
+        <w:rFonts w:ascii="Symbol" w:hAnsi="Symbol" w:hint="default"/>
+        <w:sz w:val="20"/>
+      </w:rPr>
+    </w:lvl>
+    <w:lvl w:ilvl="1" w:tentative="1">
+      <w:start w:val="1"/>
+      <w:numFmt w:val="bullet"/>
+      <w:lvlText w:val="o"/>
+      <w:lvlJc w:val="left"/>
+      <w:pPr>
+        <w:tabs>
+          <w:tab w:val="num" w:pos="1440"/>
+        </w:tabs>
+        <w:ind w:left="1440" w:hanging="360"/>
+      </w:pPr>
+      <w:rPr>
+        <w:rFonts w:ascii="Courier New" w:hAnsi="Courier New" w:hint="default"/>
+        <w:sz w:val="20"/>
+      </w:rPr>
+    </w:lvl>
+    <w:lvl w:ilvl="2" w:tentative="1">
+      <w:start w:val="1"/>
+      <w:numFmt w:val="bullet"/>
+      <w:lvlText w:val=""/>
+      <w:lvlJc w:val="left"/>
+      <w:pPr>
+        <w:tabs>
+          <w:tab w:val="num" w:pos="2160"/>
+        </w:tabs>
+        <w:ind w:left="2160" w:hanging="360"/>
+      </w:pPr>
+      <w:rPr>
+        <w:rFonts w:ascii="Wingdings" w:hAnsi="Wingdings" w:hint="default"/>
+        <w:sz w:val="20"/>
+      </w:rPr>
+    </w:lvl>
+    <w:lvl w:ilvl="3" w:tentative="1">
+      <w:start w:val="1"/>
+      <w:numFmt w:val="bullet"/>
+      <w:lvlText w:val=""/>
+      <w:lvlJc w:val="left"/>
+      <w:pPr>
+        <w:tabs>
+          <w:tab w:val="num" w:pos="2880"/>
+        </w:tabs>
+        <w:ind w:left="2880" w:hanging="360"/>
+      </w:pPr>
+      <w:rPr>
+        <w:rFonts w:ascii="Wingdings" w:hAnsi="Wingdings" w:hint="default"/>
+        <w:sz w:val="20"/>
+      </w:rPr>
+    </w:lvl>
+    <w:lvl w:ilvl="4" w:tentative="1">
+      <w:start w:val="1"/>
+      <w:numFmt w:val="bullet"/>
+      <w:lvlText w:val=""/>
+      <w:lvlJc w:val="left"/>
+      <w:pPr>
+        <w:tabs>
+          <w:tab w:val="num" w:pos="3600"/>
+        </w:tabs>
+        <w:ind w:left="3600" w:hanging="360"/>
+      </w:pPr>
+      <w:rPr>
+        <w:rFonts w:ascii="Wingdings" w:hAnsi="Wingdings" w:hint="default"/>
+        <w:sz w:val="20"/>
+      </w:rPr>
+    </w:lvl>
+    <w:lvl w:ilvl="5" w:tentative="1">
+      <w:start w:val="1"/>
+      <w:numFmt w:val="bullet"/>
+      <w:lvlText w:val=""/>
+      <w:lvlJc w:val="left"/>
+      <w:pPr>
+        <w:tabs>
+          <w:tab w:val="num" w:pos="4320"/>
+        </w:tabs>
+        <w:ind w:left="4320" w:hanging="360"/>
+      </w:pPr>
+      <w:rPr>
+        <w:rFonts w:ascii="Wingdings" w:hAnsi="Wingdings" w:hint="default"/>
+        <w:sz w:val="20"/>
+      </w:rPr>
+    </w:lvl>
+    <w:lvl w:ilvl="6" w:tentative="1">
+      <w:start w:val="1"/>
+      <w:numFmt w:val="bullet"/>
+      <w:lvlText w:val=""/>
+      <w:lvlJc w:val="left"/>
+      <w:pPr>
+        <w:tabs>
+          <w:tab w:val="num" w:pos="5040"/>
+        </w:tabs>
+        <w:ind w:left="5040" w:hanging="360"/>
+      </w:pPr>
+      <w:rPr>
+        <w:rFonts w:ascii="Wingdings" w:hAnsi="Wingdings" w:hint="default"/>
+        <w:sz w:val="20"/>
+      </w:rPr>
+    </w:lvl>
+    <w:lvl w:ilvl="7" w:tentative="1">
+      <w:start w:val="1"/>
+      <w:numFmt w:val="bullet"/>
+      <w:lvlText w:val=""/>
+      <w:lvlJc w:val="left"/>
+      <w:pPr>
+        <w:tabs>
+          <w:tab w:val="num" w:pos="5760"/>
+        </w:tabs>
+        <w:ind w:left="5760" w:hanging="360"/>
+      </w:pPr>
+      <w:rPr>
+        <w:rFonts w:ascii="Wingdings" w:hAnsi="Wingdings" w:hint="default"/>
+        <w:sz w:val="20"/>
+      </w:rPr>
+    </w:lvl>
+    <w:lvl w:ilvl="8" w:tentative="1">
+      <w:start w:val="1"/>
+      <w:numFmt w:val="bullet"/>
+      <w:lvlText w:val=""/>
+      <w:lvlJc w:val="left"/>
+      <w:pPr>
+        <w:tabs>
+          <w:tab w:val="num" w:pos="6480"/>
+        </w:tabs>
+        <w:ind w:left="6480" w:hanging="360"/>
+      </w:pPr>
+      <w:rPr>
+        <w:rFonts w:ascii="Wingdings" w:hAnsi="Wingdings" w:hint="default"/>
+        <w:sz w:val="20"/>
+      </w:rPr>
+    </w:lvl>
+  </w:abstractNum>
+  <w:abstractNum w:abstractNumId="5" w15:restartNumberingAfterBreak="0">
+    <w:nsid w:val="43170B79"/>
+    <w:multiLevelType w:val="multilevel"/>
+    <w:tmpl w:val="C1FEC4C2"/>
+    <w:lvl w:ilvl="0">
+      <w:start w:val="1"/>
+      <w:numFmt w:val="bullet"/>
+      <w:lvlText w:val=""/>
+      <w:lvlJc w:val="left"/>
+      <w:pPr>
+        <w:tabs>
+          <w:tab w:val="num" w:pos="720"/>
+        </w:tabs>
+        <w:ind w:left="720" w:hanging="360"/>
+      </w:pPr>
+      <w:rPr>
+        <w:rFonts w:ascii="Symbol" w:hAnsi="Symbol" w:hint="default"/>
+        <w:sz w:val="20"/>
+      </w:rPr>
+    </w:lvl>
+    <w:lvl w:ilvl="1" w:tentative="1">
+      <w:start w:val="1"/>
+      <w:numFmt w:val="bullet"/>
+      <w:lvlText w:val="o"/>
+      <w:lvlJc w:val="left"/>
+      <w:pPr>
+        <w:tabs>
+          <w:tab w:val="num" w:pos="1440"/>
+        </w:tabs>
+        <w:ind w:left="1440" w:hanging="360"/>
+      </w:pPr>
+      <w:rPr>
+        <w:rFonts w:ascii="Courier New" w:hAnsi="Courier New" w:hint="default"/>
+        <w:sz w:val="20"/>
+      </w:rPr>
+    </w:lvl>
+    <w:lvl w:ilvl="2" w:tentative="1">
+      <w:start w:val="1"/>
+      <w:numFmt w:val="bullet"/>
+      <w:lvlText w:val=""/>
+      <w:lvlJc w:val="left"/>
+      <w:pPr>
+        <w:tabs>
+          <w:tab w:val="num" w:pos="2160"/>
+        </w:tabs>
+        <w:ind w:left="2160" w:hanging="360"/>
+      </w:pPr>
+      <w:rPr>
+        <w:rFonts w:ascii="Wingdings" w:hAnsi="Wingdings" w:hint="default"/>
+        <w:sz w:val="20"/>
+      </w:rPr>
+    </w:lvl>
+    <w:lvl w:ilvl="3" w:tentative="1">
+      <w:start w:val="1"/>
+      <w:numFmt w:val="bullet"/>
+      <w:lvlText w:val=""/>
+      <w:lvlJc w:val="left"/>
+      <w:pPr>
+        <w:tabs>
+          <w:tab w:val="num" w:pos="2880"/>
+        </w:tabs>
+        <w:ind w:left="2880" w:hanging="360"/>
+      </w:pPr>
+      <w:rPr>
+        <w:rFonts w:ascii="Wingdings" w:hAnsi="Wingdings" w:hint="default"/>
+        <w:sz w:val="20"/>
+      </w:rPr>
+    </w:lvl>
+    <w:lvl w:ilvl="4" w:tentative="1">
+      <w:start w:val="1"/>
+      <w:numFmt w:val="bullet"/>
+      <w:lvlText w:val=""/>
+      <w:lvlJc w:val="left"/>
+      <w:pPr>
+        <w:tabs>
+          <w:tab w:val="num" w:pos="3600"/>
+        </w:tabs>
+        <w:ind w:left="3600" w:hanging="360"/>
+      </w:pPr>
+      <w:rPr>
+        <w:rFonts w:ascii="Wingdings" w:hAnsi="Wingdings" w:hint="default"/>
+        <w:sz w:val="20"/>
+      </w:rPr>
+    </w:lvl>
+    <w:lvl w:ilvl="5" w:tentative="1">
+      <w:start w:val="1"/>
+      <w:numFmt w:val="bullet"/>
+      <w:lvlText w:val=""/>
+      <w:lvlJc w:val="left"/>
+      <w:pPr>
+        <w:tabs>
+          <w:tab w:val="num" w:pos="4320"/>
+        </w:tabs>
+        <w:ind w:left="4320" w:hanging="360"/>
+      </w:pPr>
+      <w:rPr>
+        <w:rFonts w:ascii="Wingdings" w:hAnsi="Wingdings" w:hint="default"/>
+        <w:sz w:val="20"/>
+      </w:rPr>
+    </w:lvl>
+    <w:lvl w:ilvl="6" w:tentative="1">
+      <w:start w:val="1"/>
+      <w:numFmt w:val="bullet"/>
+      <w:lvlText w:val=""/>
+      <w:lvlJc w:val="left"/>
+      <w:pPr>
+        <w:tabs>
+          <w:tab w:val="num" w:pos="5040"/>
+        </w:tabs>
+        <w:ind w:left="5040" w:hanging="360"/>
+      </w:pPr>
+      <w:rPr>
+        <w:rFonts w:ascii="Wingdings" w:hAnsi="Wingdings" w:hint="default"/>
+        <w:sz w:val="20"/>
+      </w:rPr>
+    </w:lvl>
+    <w:lvl w:ilvl="7" w:tentative="1">
+      <w:start w:val="1"/>
+      <w:numFmt w:val="bullet"/>
+      <w:lvlText w:val=""/>
+      <w:lvlJc w:val="left"/>
+      <w:pPr>
+        <w:tabs>
+          <w:tab w:val="num" w:pos="5760"/>
+        </w:tabs>
+        <w:ind w:left="5760" w:hanging="360"/>
+      </w:pPr>
+      <w:rPr>
+        <w:rFonts w:ascii="Wingdings" w:hAnsi="Wingdings" w:hint="default"/>
+        <w:sz w:val="20"/>
+      </w:rPr>
+    </w:lvl>
+    <w:lvl w:ilvl="8" w:tentative="1">
+      <w:start w:val="1"/>
+      <w:numFmt w:val="bullet"/>
+      <w:lvlText w:val=""/>
+      <w:lvlJc w:val="left"/>
+      <w:pPr>
+        <w:tabs>
+          <w:tab w:val="num" w:pos="6480"/>
+        </w:tabs>
+        <w:ind w:left="6480" w:hanging="360"/>
+      </w:pPr>
+      <w:rPr>
+        <w:rFonts w:ascii="Wingdings" w:hAnsi="Wingdings" w:hint="default"/>
+        <w:sz w:val="20"/>
+      </w:rPr>
+    </w:lvl>
+  </w:abstractNum>
+  <w:abstractNum w:abstractNumId="6" w15:restartNumberingAfterBreak="0">
+    <w:nsid w:val="4CA52285"/>
+    <w:multiLevelType w:val="multilevel"/>
+    <w:tmpl w:val="EC62F7B8"/>
+    <w:lvl w:ilvl="0">
+      <w:start w:val="1"/>
+      <w:numFmt w:val="bullet"/>
+      <w:lvlText w:val=""/>
+      <w:lvlJc w:val="left"/>
+      <w:pPr>
+        <w:tabs>
+          <w:tab w:val="num" w:pos="720"/>
+        </w:tabs>
+        <w:ind w:left="720" w:hanging="360"/>
+      </w:pPr>
+      <w:rPr>
+        <w:rFonts w:ascii="Symbol" w:hAnsi="Symbol" w:hint="default"/>
+        <w:sz w:val="20"/>
+      </w:rPr>
+    </w:lvl>
+    <w:lvl w:ilvl="1" w:tentative="1">
+      <w:start w:val="1"/>
+      <w:numFmt w:val="bullet"/>
+      <w:lvlText w:val="o"/>
+      <w:lvlJc w:val="left"/>
+      <w:pPr>
+        <w:tabs>
+          <w:tab w:val="num" w:pos="1440"/>
+        </w:tabs>
+        <w:ind w:left="1440" w:hanging="360"/>
+      </w:pPr>
+      <w:rPr>
+        <w:rFonts w:ascii="Courier New" w:hAnsi="Courier New" w:hint="default"/>
+        <w:sz w:val="20"/>
+      </w:rPr>
+    </w:lvl>
+    <w:lvl w:ilvl="2" w:tentative="1">
+      <w:start w:val="1"/>
+      <w:numFmt w:val="bullet"/>
+      <w:lvlText w:val=""/>
+      <w:lvlJc w:val="left"/>
+      <w:pPr>
+        <w:tabs>
+          <w:tab w:val="num" w:pos="2160"/>
+        </w:tabs>
+        <w:ind w:left="2160" w:hanging="360"/>
+      </w:pPr>
+      <w:rPr>
+        <w:rFonts w:ascii="Wingdings" w:hAnsi="Wingdings" w:hint="default"/>
+        <w:sz w:val="20"/>
+      </w:rPr>
+    </w:lvl>
+    <w:lvl w:ilvl="3" w:tentative="1">
+      <w:start w:val="1"/>
+      <w:numFmt w:val="bullet"/>
+      <w:lvlText w:val=""/>
+      <w:lvlJc w:val="left"/>
+      <w:pPr>
+        <w:tabs>
+          <w:tab w:val="num" w:pos="2880"/>
+        </w:tabs>
+        <w:ind w:left="2880" w:hanging="360"/>
+      </w:pPr>
+      <w:rPr>
+        <w:rFonts w:ascii="Wingdings" w:hAnsi="Wingdings" w:hint="default"/>
+        <w:sz w:val="20"/>
+      </w:rPr>
+    </w:lvl>
+    <w:lvl w:ilvl="4" w:tentative="1">
+      <w:start w:val="1"/>
+      <w:numFmt w:val="bullet"/>
+      <w:lvlText w:val=""/>
+      <w:lvlJc w:val="left"/>
+      <w:pPr>
+        <w:tabs>
+          <w:tab w:val="num" w:pos="3600"/>
+        </w:tabs>
+        <w:ind w:left="3600" w:hanging="360"/>
+      </w:pPr>
+      <w:rPr>
+        <w:rFonts w:ascii="Wingdings" w:hAnsi="Wingdings" w:hint="default"/>
+        <w:sz w:val="20"/>
+      </w:rPr>
+    </w:lvl>
+    <w:lvl w:ilvl="5" w:tentative="1">
+      <w:start w:val="1"/>
+      <w:numFmt w:val="bullet"/>
+      <w:lvlText w:val=""/>
+      <w:lvlJc w:val="left"/>
+      <w:pPr>
+        <w:tabs>
+          <w:tab w:val="num" w:pos="4320"/>
+        </w:tabs>
+        <w:ind w:left="4320" w:hanging="360"/>
+      </w:pPr>
+      <w:rPr>
+        <w:rFonts w:ascii="Wingdings" w:hAnsi="Wingdings" w:hint="default"/>
+        <w:sz w:val="20"/>
+      </w:rPr>
+    </w:lvl>
+    <w:lvl w:ilvl="6" w:tentative="1">
+      <w:start w:val="1"/>
+      <w:numFmt w:val="bullet"/>
+      <w:lvlText w:val=""/>
+      <w:lvlJc w:val="left"/>
+      <w:pPr>
+        <w:tabs>
+          <w:tab w:val="num" w:pos="5040"/>
+        </w:tabs>
+        <w:ind w:left="5040" w:hanging="360"/>
+      </w:pPr>
+      <w:rPr>
+        <w:rFonts w:ascii="Wingdings" w:hAnsi="Wingdings" w:hint="default"/>
+        <w:sz w:val="20"/>
+      </w:rPr>
+    </w:lvl>
+    <w:lvl w:ilvl="7" w:tentative="1">
+      <w:start w:val="1"/>
+      <w:numFmt w:val="bullet"/>
+      <w:lvlText w:val=""/>
+      <w:lvlJc w:val="left"/>
+      <w:pPr>
+        <w:tabs>
+          <w:tab w:val="num" w:pos="5760"/>
+        </w:tabs>
+        <w:ind w:left="5760" w:hanging="360"/>
+      </w:pPr>
+      <w:rPr>
+        <w:rFonts w:ascii="Wingdings" w:hAnsi="Wingdings" w:hint="default"/>
+        <w:sz w:val="20"/>
+      </w:rPr>
+    </w:lvl>
+    <w:lvl w:ilvl="8" w:tentative="1">
+      <w:start w:val="1"/>
+      <w:numFmt w:val="bullet"/>
+      <w:lvlText w:val=""/>
+      <w:lvlJc w:val="left"/>
+      <w:pPr>
+        <w:tabs>
+          <w:tab w:val="num" w:pos="6480"/>
+        </w:tabs>
+        <w:ind w:left="6480" w:hanging="360"/>
+      </w:pPr>
+      <w:rPr>
+        <w:rFonts w:ascii="Wingdings" w:hAnsi="Wingdings" w:hint="default"/>
+        <w:sz w:val="20"/>
+      </w:rPr>
+    </w:lvl>
+  </w:abstractNum>
+  <w:abstractNum w:abstractNumId="7" w15:restartNumberingAfterBreak="0">
+    <w:nsid w:val="4F647AA5"/>
+    <w:multiLevelType w:val="multilevel"/>
+    <w:tmpl w:val="AD1A2A3E"/>
+    <w:lvl w:ilvl="0">
+      <w:start w:val="1"/>
+      <w:numFmt w:val="bullet"/>
+      <w:lvlText w:val=""/>
+      <w:lvlJc w:val="left"/>
+      <w:pPr>
+        <w:tabs>
+          <w:tab w:val="num" w:pos="720"/>
+        </w:tabs>
+        <w:ind w:left="720" w:hanging="360"/>
+      </w:pPr>
+      <w:rPr>
+        <w:rFonts w:ascii="Symbol" w:hAnsi="Symbol" w:hint="default"/>
+        <w:sz w:val="20"/>
+      </w:rPr>
+    </w:lvl>
+    <w:lvl w:ilvl="1" w:tentative="1">
+      <w:start w:val="1"/>
+      <w:numFmt w:val="bullet"/>
+      <w:lvlText w:val="o"/>
+      <w:lvlJc w:val="left"/>
+      <w:pPr>
+        <w:tabs>
+          <w:tab w:val="num" w:pos="1440"/>
+        </w:tabs>
+        <w:ind w:left="1440" w:hanging="360"/>
+      </w:pPr>
+      <w:rPr>
+        <w:rFonts w:ascii="Courier New" w:hAnsi="Courier New" w:hint="default"/>
+        <w:sz w:val="20"/>
+      </w:rPr>
+    </w:lvl>
+    <w:lvl w:ilvl="2" w:tentative="1">
+      <w:start w:val="1"/>
+      <w:numFmt w:val="bullet"/>
+      <w:lvlText w:val=""/>
+      <w:lvlJc w:val="left"/>
+      <w:pPr>
+        <w:tabs>
+          <w:tab w:val="num" w:pos="2160"/>
+        </w:tabs>
+        <w:ind w:left="2160" w:hanging="360"/>
+      </w:pPr>
+      <w:rPr>
+        <w:rFonts w:ascii="Wingdings" w:hAnsi="Wingdings" w:hint="default"/>
+        <w:sz w:val="20"/>
+      </w:rPr>
+    </w:lvl>
+    <w:lvl w:ilvl="3" w:tentative="1">
+      <w:start w:val="1"/>
+      <w:numFmt w:val="bullet"/>
+      <w:lvlText w:val=""/>
+      <w:lvlJc w:val="left"/>
+      <w:pPr>
+        <w:tabs>
+          <w:tab w:val="num" w:pos="2880"/>
+        </w:tabs>
+        <w:ind w:left="2880" w:hanging="360"/>
+      </w:pPr>
+      <w:rPr>
+        <w:rFonts w:ascii="Wingdings" w:hAnsi="Wingdings" w:hint="default"/>
+        <w:sz w:val="20"/>
+      </w:rPr>
+    </w:lvl>
+    <w:lvl w:ilvl="4" w:tentative="1">
+      <w:start w:val="1"/>
+      <w:numFmt w:val="bullet"/>
+      <w:lvlText w:val=""/>
+      <w:lvlJc w:val="left"/>
+      <w:pPr>
+        <w:tabs>
+          <w:tab w:val="num" w:pos="3600"/>
+        </w:tabs>
+        <w:ind w:left="3600" w:hanging="360"/>
+      </w:pPr>
+      <w:rPr>
+        <w:rFonts w:ascii="Wingdings" w:hAnsi="Wingdings" w:hint="default"/>
+        <w:sz w:val="20"/>
+      </w:rPr>
+    </w:lvl>
+    <w:lvl w:ilvl="5" w:tentative="1">
+      <w:start w:val="1"/>
+      <w:numFmt w:val="bullet"/>
+      <w:lvlText w:val=""/>
+      <w:lvlJc w:val="left"/>
+      <w:pPr>
+        <w:tabs>
+          <w:tab w:val="num" w:pos="4320"/>
+        </w:tabs>
+        <w:ind w:left="4320" w:hanging="360"/>
+      </w:pPr>
+      <w:rPr>
+        <w:rFonts w:ascii="Wingdings" w:hAnsi="Wingdings" w:hint="default"/>
+        <w:sz w:val="20"/>
+      </w:rPr>
+    </w:lvl>
+    <w:lvl w:ilvl="6" w:tentative="1">
+      <w:start w:val="1"/>
+      <w:numFmt w:val="bullet"/>
+      <w:lvlText w:val=""/>
+      <w:lvlJc w:val="left"/>
+      <w:pPr>
+        <w:tabs>
+          <w:tab w:val="num" w:pos="5040"/>
+        </w:tabs>
+        <w:ind w:left="5040" w:hanging="360"/>
+      </w:pPr>
+      <w:rPr>
+        <w:rFonts w:ascii="Wingdings" w:hAnsi="Wingdings" w:hint="default"/>
+        <w:sz w:val="20"/>
+      </w:rPr>
+    </w:lvl>
+    <w:lvl w:ilvl="7" w:tentative="1">
+      <w:start w:val="1"/>
+      <w:numFmt w:val="bullet"/>
+      <w:lvlText w:val=""/>
+      <w:lvlJc w:val="left"/>
+      <w:pPr>
+        <w:tabs>
+          <w:tab w:val="num" w:pos="5760"/>
+        </w:tabs>
+        <w:ind w:left="5760" w:hanging="360"/>
+      </w:pPr>
+      <w:rPr>
+        <w:rFonts w:ascii="Wingdings" w:hAnsi="Wingdings" w:hint="default"/>
+        <w:sz w:val="20"/>
+      </w:rPr>
+    </w:lvl>
+    <w:lvl w:ilvl="8" w:tentative="1">
+      <w:start w:val="1"/>
+      <w:numFmt w:val="bullet"/>
+      <w:lvlText w:val=""/>
+      <w:lvlJc w:val="left"/>
+      <w:pPr>
+        <w:tabs>
+          <w:tab w:val="num" w:pos="6480"/>
+        </w:tabs>
+        <w:ind w:left="6480" w:hanging="360"/>
+      </w:pPr>
+      <w:rPr>
+        <w:rFonts w:ascii="Wingdings" w:hAnsi="Wingdings" w:hint="default"/>
+        <w:sz w:val="20"/>
+      </w:rPr>
+    </w:lvl>
+  </w:abstractNum>
+  <w:abstractNum w:abstractNumId="8" w15:restartNumberingAfterBreak="0">
+    <w:nsid w:val="51D179B3"/>
+    <w:multiLevelType w:val="multilevel"/>
+    <w:tmpl w:val="59627D48"/>
+    <w:lvl w:ilvl="0">
+      <w:start w:val="1"/>
+      <w:numFmt w:val="bullet"/>
+      <w:lvlText w:val=""/>
+      <w:lvlJc w:val="left"/>
+      <w:pPr>
+        <w:tabs>
+          <w:tab w:val="num" w:pos="720"/>
+        </w:tabs>
+        <w:ind w:left="720" w:hanging="360"/>
+      </w:pPr>
+      <w:rPr>
+        <w:rFonts w:ascii="Symbol" w:hAnsi="Symbol" w:hint="default"/>
+        <w:sz w:val="20"/>
+      </w:rPr>
+    </w:lvl>
+    <w:lvl w:ilvl="1" w:tentative="1">
+      <w:start w:val="1"/>
+      <w:numFmt w:val="bullet"/>
+      <w:lvlText w:val="o"/>
+      <w:lvlJc w:val="left"/>
+      <w:pPr>
+        <w:tabs>
+          <w:tab w:val="num" w:pos="1440"/>
+        </w:tabs>
+        <w:ind w:left="1440" w:hanging="360"/>
+      </w:pPr>
+      <w:rPr>
+        <w:rFonts w:ascii="Courier New" w:hAnsi="Courier New" w:hint="default"/>
+        <w:sz w:val="20"/>
+      </w:rPr>
+    </w:lvl>
+    <w:lvl w:ilvl="2" w:tentative="1">
+      <w:start w:val="1"/>
+      <w:numFmt w:val="bullet"/>
+      <w:lvlText w:val=""/>
+      <w:lvlJc w:val="left"/>
+      <w:pPr>
+        <w:tabs>
+          <w:tab w:val="num" w:pos="2160"/>
+        </w:tabs>
+        <w:ind w:left="2160" w:hanging="360"/>
+      </w:pPr>
+      <w:rPr>
+        <w:rFonts w:ascii="Wingdings" w:hAnsi="Wingdings" w:hint="default"/>
+        <w:sz w:val="20"/>
+      </w:rPr>
+    </w:lvl>
+    <w:lvl w:ilvl="3" w:tentative="1">
+      <w:start w:val="1"/>
+      <w:numFmt w:val="bullet"/>
+      <w:lvlText w:val=""/>
+      <w:lvlJc w:val="left"/>
+      <w:pPr>
+        <w:tabs>
+          <w:tab w:val="num" w:pos="2880"/>
+        </w:tabs>
+        <w:ind w:left="2880" w:hanging="360"/>
+      </w:pPr>
+      <w:rPr>
+        <w:rFonts w:ascii="Wingdings" w:hAnsi="Wingdings" w:hint="default"/>
+        <w:sz w:val="20"/>
+      </w:rPr>
+    </w:lvl>
+    <w:lvl w:ilvl="4" w:tentative="1">
+      <w:start w:val="1"/>
+      <w:numFmt w:val="bullet"/>
+      <w:lvlText w:val=""/>
+      <w:lvlJc w:val="left"/>
+      <w:pPr>
+        <w:tabs>
+          <w:tab w:val="num" w:pos="3600"/>
+        </w:tabs>
+        <w:ind w:left="3600" w:hanging="360"/>
+      </w:pPr>
+      <w:rPr>
+        <w:rFonts w:ascii="Wingdings" w:hAnsi="Wingdings" w:hint="default"/>
+        <w:sz w:val="20"/>
+      </w:rPr>
+    </w:lvl>
+    <w:lvl w:ilvl="5" w:tentative="1">
+      <w:start w:val="1"/>
+      <w:numFmt w:val="bullet"/>
+      <w:lvlText w:val=""/>
+      <w:lvlJc w:val="left"/>
+      <w:pPr>
+        <w:tabs>
+          <w:tab w:val="num" w:pos="4320"/>
+        </w:tabs>
+        <w:ind w:left="4320" w:hanging="360"/>
+      </w:pPr>
+      <w:rPr>
+        <w:rFonts w:ascii="Wingdings" w:hAnsi="Wingdings" w:hint="default"/>
+        <w:sz w:val="20"/>
+      </w:rPr>
+    </w:lvl>
+    <w:lvl w:ilvl="6" w:tentative="1">
+      <w:start w:val="1"/>
+      <w:numFmt w:val="bullet"/>
+      <w:lvlText w:val=""/>
+      <w:lvlJc w:val="left"/>
+      <w:pPr>
+        <w:tabs>
+          <w:tab w:val="num" w:pos="5040"/>
+        </w:tabs>
+        <w:ind w:left="5040" w:hanging="360"/>
+      </w:pPr>
+      <w:rPr>
+        <w:rFonts w:ascii="Wingdings" w:hAnsi="Wingdings" w:hint="default"/>
+        <w:sz w:val="20"/>
+      </w:rPr>
+    </w:lvl>
+    <w:lvl w:ilvl="7" w:tentative="1">
+      <w:start w:val="1"/>
+      <w:numFmt w:val="bullet"/>
+      <w:lvlText w:val=""/>
+      <w:lvlJc w:val="left"/>
+      <w:pPr>
+        <w:tabs>
+          <w:tab w:val="num" w:pos="5760"/>
+        </w:tabs>
+        <w:ind w:left="5760" w:hanging="360"/>
+      </w:pPr>
+      <w:rPr>
+        <w:rFonts w:ascii="Wingdings" w:hAnsi="Wingdings" w:hint="default"/>
+        <w:sz w:val="20"/>
+      </w:rPr>
+    </w:lvl>
+    <w:lvl w:ilvl="8" w:tentative="1">
+      <w:start w:val="1"/>
+      <w:numFmt w:val="bullet"/>
+      <w:lvlText w:val=""/>
+      <w:lvlJc w:val="left"/>
+      <w:pPr>
+        <w:tabs>
+          <w:tab w:val="num" w:pos="6480"/>
+        </w:tabs>
+        <w:ind w:left="6480" w:hanging="360"/>
+      </w:pPr>
+      <w:rPr>
+        <w:rFonts w:ascii="Wingdings" w:hAnsi="Wingdings" w:hint="default"/>
+        <w:sz w:val="20"/>
+      </w:rPr>
+    </w:lvl>
+  </w:abstractNum>
+  <w:abstractNum w:abstractNumId="9" w15:restartNumberingAfterBreak="0">
+    <w:nsid w:val="555C79F9"/>
+    <w:multiLevelType w:val="multilevel"/>
+    <w:tmpl w:val="0B589050"/>
+    <w:lvl w:ilvl="0">
+      <w:start w:val="1"/>
+      <w:numFmt w:val="bullet"/>
+      <w:lvlText w:val=""/>
+      <w:lvlJc w:val="left"/>
+      <w:pPr>
+        <w:tabs>
+          <w:tab w:val="num" w:pos="720"/>
+        </w:tabs>
+        <w:ind w:left="720" w:hanging="360"/>
+      </w:pPr>
+      <w:rPr>
+        <w:rFonts w:ascii="Symbol" w:hAnsi="Symbol" w:hint="default"/>
+        <w:sz w:val="20"/>
+      </w:rPr>
+    </w:lvl>
+    <w:lvl w:ilvl="1" w:tentative="1">
+      <w:start w:val="1"/>
+      <w:numFmt w:val="bullet"/>
+      <w:lvlText w:val="o"/>
+      <w:lvlJc w:val="left"/>
+      <w:pPr>
+        <w:tabs>
+          <w:tab w:val="num" w:pos="1440"/>
+        </w:tabs>
+        <w:ind w:left="1440" w:hanging="360"/>
+      </w:pPr>
+      <w:rPr>
+        <w:rFonts w:ascii="Courier New" w:hAnsi="Courier New" w:hint="default"/>
+        <w:sz w:val="20"/>
+      </w:rPr>
+    </w:lvl>
+    <w:lvl w:ilvl="2" w:tentative="1">
+      <w:start w:val="1"/>
+      <w:numFmt w:val="bullet"/>
+      <w:lvlText w:val=""/>
+      <w:lvlJc w:val="left"/>
+      <w:pPr>
+        <w:tabs>
+          <w:tab w:val="num" w:pos="2160"/>
+        </w:tabs>
+        <w:ind w:left="2160" w:hanging="360"/>
+      </w:pPr>
+      <w:rPr>
+        <w:rFonts w:ascii="Wingdings" w:hAnsi="Wingdings" w:hint="default"/>
+        <w:sz w:val="20"/>
+      </w:rPr>
+    </w:lvl>
+    <w:lvl w:ilvl="3" w:tentative="1">
+      <w:start w:val="1"/>
+      <w:numFmt w:val="bullet"/>
+      <w:lvlText w:val=""/>
+      <w:lvlJc w:val="left"/>
+      <w:pPr>
+        <w:tabs>
+          <w:tab w:val="num" w:pos="2880"/>
+        </w:tabs>
+        <w:ind w:left="2880" w:hanging="360"/>
+      </w:pPr>
+      <w:rPr>
+        <w:rFonts w:ascii="Wingdings" w:hAnsi="Wingdings" w:hint="default"/>
+        <w:sz w:val="20"/>
+      </w:rPr>
+    </w:lvl>
+    <w:lvl w:ilvl="4" w:tentative="1">
+      <w:start w:val="1"/>
+      <w:numFmt w:val="bullet"/>
+      <w:lvlText w:val=""/>
+      <w:lvlJc w:val="left"/>
+      <w:pPr>
+        <w:tabs>
+          <w:tab w:val="num" w:pos="3600"/>
+        </w:tabs>
+        <w:ind w:left="3600" w:hanging="360"/>
+      </w:pPr>
+      <w:rPr>
+        <w:rFonts w:ascii="Wingdings" w:hAnsi="Wingdings" w:hint="default"/>
+        <w:sz w:val="20"/>
+      </w:rPr>
+    </w:lvl>
+    <w:lvl w:ilvl="5" w:tentative="1">
+      <w:start w:val="1"/>
+      <w:numFmt w:val="bullet"/>
+      <w:lvlText w:val=""/>
+      <w:lvlJc w:val="left"/>
+      <w:pPr>
+        <w:tabs>
+          <w:tab w:val="num" w:pos="4320"/>
+        </w:tabs>
+        <w:ind w:left="4320" w:hanging="360"/>
+      </w:pPr>
+      <w:rPr>
+        <w:rFonts w:ascii="Wingdings" w:hAnsi="Wingdings" w:hint="default"/>
+        <w:sz w:val="20"/>
+      </w:rPr>
+    </w:lvl>
+    <w:lvl w:ilvl="6" w:tentative="1">
+      <w:start w:val="1"/>
+      <w:numFmt w:val="bullet"/>
+      <w:lvlText w:val=""/>
+      <w:lvlJc w:val="left"/>
+      <w:pPr>
+        <w:tabs>
+          <w:tab w:val="num" w:pos="5040"/>
+        </w:tabs>
+        <w:ind w:left="5040" w:hanging="360"/>
+      </w:pPr>
+      <w:rPr>
+        <w:rFonts w:ascii="Wingdings" w:hAnsi="Wingdings" w:hint="default"/>
+        <w:sz w:val="20"/>
+      </w:rPr>
+    </w:lvl>
+    <w:lvl w:ilvl="7" w:tentative="1">
+      <w:start w:val="1"/>
+      <w:numFmt w:val="bullet"/>
+      <w:lvlText w:val=""/>
+      <w:lvlJc w:val="left"/>
+      <w:pPr>
+        <w:tabs>
+          <w:tab w:val="num" w:pos="5760"/>
+        </w:tabs>
+        <w:ind w:left="5760" w:hanging="360"/>
+      </w:pPr>
+      <w:rPr>
+        <w:rFonts w:ascii="Wingdings" w:hAnsi="Wingdings" w:hint="default"/>
+        <w:sz w:val="20"/>
+      </w:rPr>
+    </w:lvl>
+    <w:lvl w:ilvl="8" w:tentative="1">
+      <w:start w:val="1"/>
+      <w:numFmt w:val="bullet"/>
+      <w:lvlText w:val=""/>
+      <w:lvlJc w:val="left"/>
+      <w:pPr>
+        <w:tabs>
+          <w:tab w:val="num" w:pos="6480"/>
+        </w:tabs>
+        <w:ind w:left="6480" w:hanging="360"/>
+      </w:pPr>
+      <w:rPr>
+        <w:rFonts w:ascii="Wingdings" w:hAnsi="Wingdings" w:hint="default"/>
+        <w:sz w:val="20"/>
+      </w:rPr>
+    </w:lvl>
+  </w:abstractNum>
+  <w:abstractNum w:abstractNumId="10" w15:restartNumberingAfterBreak="0">
+    <w:nsid w:val="565B2FE7"/>
+    <w:multiLevelType w:val="multilevel"/>
+    <w:tmpl w:val="F74CA118"/>
+    <w:lvl w:ilvl="0">
+      <w:start w:val="1"/>
+      <w:numFmt w:val="bullet"/>
+      <w:lvlText w:val=""/>
+      <w:lvlJc w:val="left"/>
+      <w:pPr>
+        <w:tabs>
+          <w:tab w:val="num" w:pos="720"/>
+        </w:tabs>
+        <w:ind w:left="720" w:hanging="360"/>
+      </w:pPr>
+      <w:rPr>
+        <w:rFonts w:ascii="Symbol" w:hAnsi="Symbol" w:hint="default"/>
+        <w:sz w:val="20"/>
+      </w:rPr>
+    </w:lvl>
+    <w:lvl w:ilvl="1" w:tentative="1">
+      <w:start w:val="1"/>
+      <w:numFmt w:val="bullet"/>
+      <w:lvlText w:val="o"/>
+      <w:lvlJc w:val="left"/>
+      <w:pPr>
+        <w:tabs>
+          <w:tab w:val="num" w:pos="1440"/>
+        </w:tabs>
+        <w:ind w:left="1440" w:hanging="360"/>
+      </w:pPr>
+      <w:rPr>
+        <w:rFonts w:ascii="Courier New" w:hAnsi="Courier New" w:hint="default"/>
+        <w:sz w:val="20"/>
+      </w:rPr>
+    </w:lvl>
+    <w:lvl w:ilvl="2" w:tentative="1">
+      <w:start w:val="1"/>
+      <w:numFmt w:val="bullet"/>
+      <w:lvlText w:val=""/>
+      <w:lvlJc w:val="left"/>
+      <w:pPr>
+        <w:tabs>
+          <w:tab w:val="num" w:pos="2160"/>
+        </w:tabs>
+        <w:ind w:left="2160" w:hanging="360"/>
+      </w:pPr>
+      <w:rPr>
+        <w:rFonts w:ascii="Wingdings" w:hAnsi="Wingdings" w:hint="default"/>
+        <w:sz w:val="20"/>
+      </w:rPr>
+    </w:lvl>
+    <w:lvl w:ilvl="3" w:tentative="1">
+      <w:start w:val="1"/>
+      <w:numFmt w:val="bullet"/>
+      <w:lvlText w:val=""/>
+      <w:lvlJc w:val="left"/>
+      <w:pPr>
+        <w:tabs>
+          <w:tab w:val="num" w:pos="2880"/>
+        </w:tabs>
+        <w:ind w:left="2880" w:hanging="360"/>
+      </w:pPr>
+      <w:rPr>
+        <w:rFonts w:ascii="Wingdings" w:hAnsi="Wingdings" w:hint="default"/>
+        <w:sz w:val="20"/>
+      </w:rPr>
+    </w:lvl>
+    <w:lvl w:ilvl="4" w:tentative="1">
+      <w:start w:val="1"/>
+      <w:numFmt w:val="bullet"/>
+      <w:lvlText w:val=""/>
+      <w:lvlJc w:val="left"/>
+      <w:pPr>
+        <w:tabs>
+          <w:tab w:val="num" w:pos="3600"/>
+        </w:tabs>
+        <w:ind w:left="3600" w:hanging="360"/>
+      </w:pPr>
+      <w:rPr>
+        <w:rFonts w:ascii="Wingdings" w:hAnsi="Wingdings" w:hint="default"/>
+        <w:sz w:val="20"/>
+      </w:rPr>
+    </w:lvl>
+    <w:lvl w:ilvl="5" w:tentative="1">
+      <w:start w:val="1"/>
+      <w:numFmt w:val="bullet"/>
+      <w:lvlText w:val=""/>
+      <w:lvlJc w:val="left"/>
+      <w:pPr>
+        <w:tabs>
+          <w:tab w:val="num" w:pos="4320"/>
+        </w:tabs>
+        <w:ind w:left="4320" w:hanging="360"/>
+      </w:pPr>
+      <w:rPr>
+        <w:rFonts w:ascii="Wingdings" w:hAnsi="Wingdings" w:hint="default"/>
+        <w:sz w:val="20"/>
+      </w:rPr>
+    </w:lvl>
+    <w:lvl w:ilvl="6" w:tentative="1">
+      <w:start w:val="1"/>
+      <w:numFmt w:val="bullet"/>
+      <w:lvlText w:val=""/>
+      <w:lvlJc w:val="left"/>
+      <w:pPr>
+        <w:tabs>
+          <w:tab w:val="num" w:pos="5040"/>
+        </w:tabs>
+        <w:ind w:left="5040" w:hanging="360"/>
+      </w:pPr>
+      <w:rPr>
+        <w:rFonts w:ascii="Wingdings" w:hAnsi="Wingdings" w:hint="default"/>
+        <w:sz w:val="20"/>
+      </w:rPr>
+    </w:lvl>
+    <w:lvl w:ilvl="7" w:tentative="1">
+      <w:start w:val="1"/>
+      <w:numFmt w:val="bullet"/>
+      <w:lvlText w:val=""/>
+      <w:lvlJc w:val="left"/>
+      <w:pPr>
+        <w:tabs>
+          <w:tab w:val="num" w:pos="5760"/>
+        </w:tabs>
+        <w:ind w:left="5760" w:hanging="360"/>
+      </w:pPr>
+      <w:rPr>
+        <w:rFonts w:ascii="Wingdings" w:hAnsi="Wingdings" w:hint="default"/>
+        <w:sz w:val="20"/>
+      </w:rPr>
+    </w:lvl>
+    <w:lvl w:ilvl="8" w:tentative="1">
+      <w:start w:val="1"/>
+      <w:numFmt w:val="bullet"/>
+      <w:lvlText w:val=""/>
+      <w:lvlJc w:val="left"/>
+      <w:pPr>
+        <w:tabs>
+          <w:tab w:val="num" w:pos="6480"/>
+        </w:tabs>
+        <w:ind w:left="6480" w:hanging="360"/>
+      </w:pPr>
+      <w:rPr>
+        <w:rFonts w:ascii="Wingdings" w:hAnsi="Wingdings" w:hint="default"/>
+        <w:sz w:val="20"/>
+      </w:rPr>
+    </w:lvl>
+  </w:abstractNum>
+  <w:abstractNum w:abstractNumId="11" w15:restartNumberingAfterBreak="0">
+    <w:nsid w:val="5A605033"/>
+    <w:multiLevelType w:val="multilevel"/>
+    <w:tmpl w:val="FC54EFA0"/>
+    <w:lvl w:ilvl="0">
+      <w:start w:val="1"/>
+      <w:numFmt w:val="bullet"/>
+      <w:lvlText w:val=""/>
+      <w:lvlJc w:val="left"/>
+      <w:pPr>
+        <w:tabs>
+          <w:tab w:val="num" w:pos="720"/>
+        </w:tabs>
+        <w:ind w:left="720" w:hanging="360"/>
+      </w:pPr>
+      <w:rPr>
+        <w:rFonts w:ascii="Symbol" w:hAnsi="Symbol" w:hint="default"/>
+        <w:sz w:val="20"/>
+      </w:rPr>
+    </w:lvl>
+    <w:lvl w:ilvl="1" w:tentative="1">
+      <w:start w:val="1"/>
+      <w:numFmt w:val="bullet"/>
+      <w:lvlText w:val="o"/>
+      <w:lvlJc w:val="left"/>
+      <w:pPr>
+        <w:tabs>
+          <w:tab w:val="num" w:pos="1440"/>
+        </w:tabs>
+        <w:ind w:left="1440" w:hanging="360"/>
+      </w:pPr>
+      <w:rPr>
+        <w:rFonts w:ascii="Courier New" w:hAnsi="Courier New" w:hint="default"/>
+        <w:sz w:val="20"/>
+      </w:rPr>
+    </w:lvl>
+    <w:lvl w:ilvl="2" w:tentative="1">
+      <w:start w:val="1"/>
+      <w:numFmt w:val="bullet"/>
+      <w:lvlText w:val=""/>
+      <w:lvlJc w:val="left"/>
+      <w:pPr>
+        <w:tabs>
+          <w:tab w:val="num" w:pos="2160"/>
+        </w:tabs>
+        <w:ind w:left="2160" w:hanging="360"/>
+      </w:pPr>
+      <w:rPr>
+        <w:rFonts w:ascii="Wingdings" w:hAnsi="Wingdings" w:hint="default"/>
+        <w:sz w:val="20"/>
+      </w:rPr>
+    </w:lvl>
+    <w:lvl w:ilvl="3" w:tentative="1">
+      <w:start w:val="1"/>
+      <w:numFmt w:val="bullet"/>
+      <w:lvlText w:val=""/>
+      <w:lvlJc w:val="left"/>
+      <w:pPr>
+        <w:tabs>
+          <w:tab w:val="num" w:pos="2880"/>
+        </w:tabs>
+        <w:ind w:left="2880" w:hanging="360"/>
+      </w:pPr>
+      <w:rPr>
+        <w:rFonts w:ascii="Wingdings" w:hAnsi="Wingdings" w:hint="default"/>
+        <w:sz w:val="20"/>
+      </w:rPr>
+    </w:lvl>
+    <w:lvl w:ilvl="4" w:tentative="1">
+      <w:start w:val="1"/>
+      <w:numFmt w:val="bullet"/>
+      <w:lvlText w:val=""/>
+      <w:lvlJc w:val="left"/>
+      <w:pPr>
+        <w:tabs>
+          <w:tab w:val="num" w:pos="3600"/>
+        </w:tabs>
+        <w:ind w:left="3600" w:hanging="360"/>
+      </w:pPr>
+      <w:rPr>
+        <w:rFonts w:ascii="Wingdings" w:hAnsi="Wingdings" w:hint="default"/>
+        <w:sz w:val="20"/>
+      </w:rPr>
+    </w:lvl>
+    <w:lvl w:ilvl="5" w:tentative="1">
+      <w:start w:val="1"/>
+      <w:numFmt w:val="bullet"/>
+      <w:lvlText w:val=""/>
+      <w:lvlJc w:val="left"/>
+      <w:pPr>
+        <w:tabs>
+          <w:tab w:val="num" w:pos="4320"/>
+        </w:tabs>
+        <w:ind w:left="4320" w:hanging="360"/>
+      </w:pPr>
+      <w:rPr>
+        <w:rFonts w:ascii="Wingdings" w:hAnsi="Wingdings" w:hint="default"/>
+        <w:sz w:val="20"/>
+      </w:rPr>
+    </w:lvl>
+    <w:lvl w:ilvl="6" w:tentative="1">
+      <w:start w:val="1"/>
+      <w:numFmt w:val="bullet"/>
+      <w:lvlText w:val=""/>
+      <w:lvlJc w:val="left"/>
+      <w:pPr>
+        <w:tabs>
+          <w:tab w:val="num" w:pos="5040"/>
+        </w:tabs>
+        <w:ind w:left="5040" w:hanging="360"/>
+      </w:pPr>
+      <w:rPr>
+        <w:rFonts w:ascii="Wingdings" w:hAnsi="Wingdings" w:hint="default"/>
+        <w:sz w:val="20"/>
+      </w:rPr>
+    </w:lvl>
+    <w:lvl w:ilvl="7" w:tentative="1">
+      <w:start w:val="1"/>
+      <w:numFmt w:val="bullet"/>
+      <w:lvlText w:val=""/>
+      <w:lvlJc w:val="left"/>
+      <w:pPr>
+        <w:tabs>
+          <w:tab w:val="num" w:pos="5760"/>
+        </w:tabs>
+        <w:ind w:left="5760" w:hanging="360"/>
+      </w:pPr>
+      <w:rPr>
+        <w:rFonts w:ascii="Wingdings" w:hAnsi="Wingdings" w:hint="default"/>
+        <w:sz w:val="20"/>
+      </w:rPr>
+    </w:lvl>
+    <w:lvl w:ilvl="8" w:tentative="1">
+      <w:start w:val="1"/>
+      <w:numFmt w:val="bullet"/>
+      <w:lvlText w:val=""/>
+      <w:lvlJc w:val="left"/>
+      <w:pPr>
+        <w:tabs>
+          <w:tab w:val="num" w:pos="6480"/>
+        </w:tabs>
+        <w:ind w:left="6480" w:hanging="360"/>
+      </w:pPr>
+      <w:rPr>
+        <w:rFonts w:ascii="Wingdings" w:hAnsi="Wingdings" w:hint="default"/>
+        <w:sz w:val="20"/>
+      </w:rPr>
+    </w:lvl>
+  </w:abstractNum>
+  <w:abstractNum w:abstractNumId="12" w15:restartNumberingAfterBreak="0">
+    <w:nsid w:val="5B983236"/>
+    <w:multiLevelType w:val="multilevel"/>
+    <w:tmpl w:val="1A744DD4"/>
     <w:lvl w:ilvl="0">
       <w:start w:val="1"/>
       <w:numFmt w:val="decimal"/>
@@ -5814,10 +7322,10 @@
       </w:pPr>
     </w:lvl>
   </w:abstractNum>
-  <w:abstractNum w:abstractNumId="3" w15:restartNumberingAfterBreak="0">
-    <w:nsid w:val="0E9E67F4"/>
+  <w:abstractNum w:abstractNumId="13" w15:restartNumberingAfterBreak="0">
+    <w:nsid w:val="5C46293A"/>
     <w:multiLevelType w:val="multilevel"/>
-    <w:tmpl w:val="731A4808"/>
+    <w:tmpl w:val="77DCA186"/>
     <w:lvl w:ilvl="0">
       <w:start w:val="1"/>
       <w:numFmt w:val="bullet"/>
@@ -5963,10 +7471,10 @@
       </w:rPr>
     </w:lvl>
   </w:abstractNum>
-  <w:abstractNum w:abstractNumId="4" w15:restartNumberingAfterBreak="0">
-    <w:nsid w:val="25B3088F"/>
+  <w:abstractNum w:abstractNumId="14" w15:restartNumberingAfterBreak="0">
+    <w:nsid w:val="5D7637E2"/>
     <w:multiLevelType w:val="multilevel"/>
-    <w:tmpl w:val="F744AB22"/>
+    <w:tmpl w:val="405EB588"/>
     <w:lvl w:ilvl="0">
       <w:start w:val="1"/>
       <w:numFmt w:val="bullet"/>
@@ -6112,457 +7620,10 @@
       </w:rPr>
     </w:lvl>
   </w:abstractNum>
-  <w:abstractNum w:abstractNumId="5" w15:restartNumberingAfterBreak="0">
-    <w:nsid w:val="34712053"/>
+  <w:abstractNum w:abstractNumId="15" w15:restartNumberingAfterBreak="0">
+    <w:nsid w:val="64AF4EEC"/>
     <w:multiLevelType w:val="multilevel"/>
-    <w:tmpl w:val="AA4CB064"/>
-    <w:lvl w:ilvl="0">
-      <w:start w:val="1"/>
-      <w:numFmt w:val="bullet"/>
-      <w:lvlText w:val=""/>
-      <w:lvlJc w:val="left"/>
-      <w:pPr>
-        <w:tabs>
-          <w:tab w:val="num" w:pos="720"/>
-        </w:tabs>
-        <w:ind w:left="720" w:hanging="360"/>
-      </w:pPr>
-      <w:rPr>
-        <w:rFonts w:ascii="Symbol" w:hAnsi="Symbol" w:hint="default"/>
-        <w:sz w:val="20"/>
-      </w:rPr>
-    </w:lvl>
-    <w:lvl w:ilvl="1" w:tentative="1">
-      <w:start w:val="1"/>
-      <w:numFmt w:val="bullet"/>
-      <w:lvlText w:val="o"/>
-      <w:lvlJc w:val="left"/>
-      <w:pPr>
-        <w:tabs>
-          <w:tab w:val="num" w:pos="1440"/>
-        </w:tabs>
-        <w:ind w:left="1440" w:hanging="360"/>
-      </w:pPr>
-      <w:rPr>
-        <w:rFonts w:ascii="Courier New" w:hAnsi="Courier New" w:hint="default"/>
-        <w:sz w:val="20"/>
-      </w:rPr>
-    </w:lvl>
-    <w:lvl w:ilvl="2" w:tentative="1">
-      <w:start w:val="1"/>
-      <w:numFmt w:val="bullet"/>
-      <w:lvlText w:val=""/>
-      <w:lvlJc w:val="left"/>
-      <w:pPr>
-        <w:tabs>
-          <w:tab w:val="num" w:pos="2160"/>
-        </w:tabs>
-        <w:ind w:left="2160" w:hanging="360"/>
-      </w:pPr>
-      <w:rPr>
-        <w:rFonts w:ascii="Wingdings" w:hAnsi="Wingdings" w:hint="default"/>
-        <w:sz w:val="20"/>
-      </w:rPr>
-    </w:lvl>
-    <w:lvl w:ilvl="3" w:tentative="1">
-      <w:start w:val="1"/>
-      <w:numFmt w:val="bullet"/>
-      <w:lvlText w:val=""/>
-      <w:lvlJc w:val="left"/>
-      <w:pPr>
-        <w:tabs>
-          <w:tab w:val="num" w:pos="2880"/>
-        </w:tabs>
-        <w:ind w:left="2880" w:hanging="360"/>
-      </w:pPr>
-      <w:rPr>
-        <w:rFonts w:ascii="Wingdings" w:hAnsi="Wingdings" w:hint="default"/>
-        <w:sz w:val="20"/>
-      </w:rPr>
-    </w:lvl>
-    <w:lvl w:ilvl="4" w:tentative="1">
-      <w:start w:val="1"/>
-      <w:numFmt w:val="bullet"/>
-      <w:lvlText w:val=""/>
-      <w:lvlJc w:val="left"/>
-      <w:pPr>
-        <w:tabs>
-          <w:tab w:val="num" w:pos="3600"/>
-        </w:tabs>
-        <w:ind w:left="3600" w:hanging="360"/>
-      </w:pPr>
-      <w:rPr>
-        <w:rFonts w:ascii="Wingdings" w:hAnsi="Wingdings" w:hint="default"/>
-        <w:sz w:val="20"/>
-      </w:rPr>
-    </w:lvl>
-    <w:lvl w:ilvl="5" w:tentative="1">
-      <w:start w:val="1"/>
-      <w:numFmt w:val="bullet"/>
-      <w:lvlText w:val=""/>
-      <w:lvlJc w:val="left"/>
-      <w:pPr>
-        <w:tabs>
-          <w:tab w:val="num" w:pos="4320"/>
-        </w:tabs>
-        <w:ind w:left="4320" w:hanging="360"/>
-      </w:pPr>
-      <w:rPr>
-        <w:rFonts w:ascii="Wingdings" w:hAnsi="Wingdings" w:hint="default"/>
-        <w:sz w:val="20"/>
-      </w:rPr>
-    </w:lvl>
-    <w:lvl w:ilvl="6" w:tentative="1">
-      <w:start w:val="1"/>
-      <w:numFmt w:val="bullet"/>
-      <w:lvlText w:val=""/>
-      <w:lvlJc w:val="left"/>
-      <w:pPr>
-        <w:tabs>
-          <w:tab w:val="num" w:pos="5040"/>
-        </w:tabs>
-        <w:ind w:left="5040" w:hanging="360"/>
-      </w:pPr>
-      <w:rPr>
-        <w:rFonts w:ascii="Wingdings" w:hAnsi="Wingdings" w:hint="default"/>
-        <w:sz w:val="20"/>
-      </w:rPr>
-    </w:lvl>
-    <w:lvl w:ilvl="7" w:tentative="1">
-      <w:start w:val="1"/>
-      <w:numFmt w:val="bullet"/>
-      <w:lvlText w:val=""/>
-      <w:lvlJc w:val="left"/>
-      <w:pPr>
-        <w:tabs>
-          <w:tab w:val="num" w:pos="5760"/>
-        </w:tabs>
-        <w:ind w:left="5760" w:hanging="360"/>
-      </w:pPr>
-      <w:rPr>
-        <w:rFonts w:ascii="Wingdings" w:hAnsi="Wingdings" w:hint="default"/>
-        <w:sz w:val="20"/>
-      </w:rPr>
-    </w:lvl>
-    <w:lvl w:ilvl="8" w:tentative="1">
-      <w:start w:val="1"/>
-      <w:numFmt w:val="bullet"/>
-      <w:lvlText w:val=""/>
-      <w:lvlJc w:val="left"/>
-      <w:pPr>
-        <w:tabs>
-          <w:tab w:val="num" w:pos="6480"/>
-        </w:tabs>
-        <w:ind w:left="6480" w:hanging="360"/>
-      </w:pPr>
-      <w:rPr>
-        <w:rFonts w:ascii="Wingdings" w:hAnsi="Wingdings" w:hint="default"/>
-        <w:sz w:val="20"/>
-      </w:rPr>
-    </w:lvl>
-  </w:abstractNum>
-  <w:abstractNum w:abstractNumId="6" w15:restartNumberingAfterBreak="0">
-    <w:nsid w:val="3E144A9C"/>
-    <w:multiLevelType w:val="multilevel"/>
-    <w:tmpl w:val="082012E4"/>
-    <w:lvl w:ilvl="0">
-      <w:start w:val="1"/>
-      <w:numFmt w:val="bullet"/>
-      <w:lvlText w:val=""/>
-      <w:lvlJc w:val="left"/>
-      <w:pPr>
-        <w:tabs>
-          <w:tab w:val="num" w:pos="720"/>
-        </w:tabs>
-        <w:ind w:left="720" w:hanging="360"/>
-      </w:pPr>
-      <w:rPr>
-        <w:rFonts w:ascii="Symbol" w:hAnsi="Symbol" w:hint="default"/>
-        <w:sz w:val="20"/>
-      </w:rPr>
-    </w:lvl>
-    <w:lvl w:ilvl="1" w:tentative="1">
-      <w:start w:val="1"/>
-      <w:numFmt w:val="bullet"/>
-      <w:lvlText w:val="o"/>
-      <w:lvlJc w:val="left"/>
-      <w:pPr>
-        <w:tabs>
-          <w:tab w:val="num" w:pos="1440"/>
-        </w:tabs>
-        <w:ind w:left="1440" w:hanging="360"/>
-      </w:pPr>
-      <w:rPr>
-        <w:rFonts w:ascii="Courier New" w:hAnsi="Courier New" w:hint="default"/>
-        <w:sz w:val="20"/>
-      </w:rPr>
-    </w:lvl>
-    <w:lvl w:ilvl="2" w:tentative="1">
-      <w:start w:val="1"/>
-      <w:numFmt w:val="bullet"/>
-      <w:lvlText w:val=""/>
-      <w:lvlJc w:val="left"/>
-      <w:pPr>
-        <w:tabs>
-          <w:tab w:val="num" w:pos="2160"/>
-        </w:tabs>
-        <w:ind w:left="2160" w:hanging="360"/>
-      </w:pPr>
-      <w:rPr>
-        <w:rFonts w:ascii="Wingdings" w:hAnsi="Wingdings" w:hint="default"/>
-        <w:sz w:val="20"/>
-      </w:rPr>
-    </w:lvl>
-    <w:lvl w:ilvl="3" w:tentative="1">
-      <w:start w:val="1"/>
-      <w:numFmt w:val="bullet"/>
-      <w:lvlText w:val=""/>
-      <w:lvlJc w:val="left"/>
-      <w:pPr>
-        <w:tabs>
-          <w:tab w:val="num" w:pos="2880"/>
-        </w:tabs>
-        <w:ind w:left="2880" w:hanging="360"/>
-      </w:pPr>
-      <w:rPr>
-        <w:rFonts w:ascii="Wingdings" w:hAnsi="Wingdings" w:hint="default"/>
-        <w:sz w:val="20"/>
-      </w:rPr>
-    </w:lvl>
-    <w:lvl w:ilvl="4" w:tentative="1">
-      <w:start w:val="1"/>
-      <w:numFmt w:val="bullet"/>
-      <w:lvlText w:val=""/>
-      <w:lvlJc w:val="left"/>
-      <w:pPr>
-        <w:tabs>
-          <w:tab w:val="num" w:pos="3600"/>
-        </w:tabs>
-        <w:ind w:left="3600" w:hanging="360"/>
-      </w:pPr>
-      <w:rPr>
-        <w:rFonts w:ascii="Wingdings" w:hAnsi="Wingdings" w:hint="default"/>
-        <w:sz w:val="20"/>
-      </w:rPr>
-    </w:lvl>
-    <w:lvl w:ilvl="5" w:tentative="1">
-      <w:start w:val="1"/>
-      <w:numFmt w:val="bullet"/>
-      <w:lvlText w:val=""/>
-      <w:lvlJc w:val="left"/>
-      <w:pPr>
-        <w:tabs>
-          <w:tab w:val="num" w:pos="4320"/>
-        </w:tabs>
-        <w:ind w:left="4320" w:hanging="360"/>
-      </w:pPr>
-      <w:rPr>
-        <w:rFonts w:ascii="Wingdings" w:hAnsi="Wingdings" w:hint="default"/>
-        <w:sz w:val="20"/>
-      </w:rPr>
-    </w:lvl>
-    <w:lvl w:ilvl="6" w:tentative="1">
-      <w:start w:val="1"/>
-      <w:numFmt w:val="bullet"/>
-      <w:lvlText w:val=""/>
-      <w:lvlJc w:val="left"/>
-      <w:pPr>
-        <w:tabs>
-          <w:tab w:val="num" w:pos="5040"/>
-        </w:tabs>
-        <w:ind w:left="5040" w:hanging="360"/>
-      </w:pPr>
-      <w:rPr>
-        <w:rFonts w:ascii="Wingdings" w:hAnsi="Wingdings" w:hint="default"/>
-        <w:sz w:val="20"/>
-      </w:rPr>
-    </w:lvl>
-    <w:lvl w:ilvl="7" w:tentative="1">
-      <w:start w:val="1"/>
-      <w:numFmt w:val="bullet"/>
-      <w:lvlText w:val=""/>
-      <w:lvlJc w:val="left"/>
-      <w:pPr>
-        <w:tabs>
-          <w:tab w:val="num" w:pos="5760"/>
-        </w:tabs>
-        <w:ind w:left="5760" w:hanging="360"/>
-      </w:pPr>
-      <w:rPr>
-        <w:rFonts w:ascii="Wingdings" w:hAnsi="Wingdings" w:hint="default"/>
-        <w:sz w:val="20"/>
-      </w:rPr>
-    </w:lvl>
-    <w:lvl w:ilvl="8" w:tentative="1">
-      <w:start w:val="1"/>
-      <w:numFmt w:val="bullet"/>
-      <w:lvlText w:val=""/>
-      <w:lvlJc w:val="left"/>
-      <w:pPr>
-        <w:tabs>
-          <w:tab w:val="num" w:pos="6480"/>
-        </w:tabs>
-        <w:ind w:left="6480" w:hanging="360"/>
-      </w:pPr>
-      <w:rPr>
-        <w:rFonts w:ascii="Wingdings" w:hAnsi="Wingdings" w:hint="default"/>
-        <w:sz w:val="20"/>
-      </w:rPr>
-    </w:lvl>
-  </w:abstractNum>
-  <w:abstractNum w:abstractNumId="7" w15:restartNumberingAfterBreak="0">
-    <w:nsid w:val="3E323B0E"/>
-    <w:multiLevelType w:val="multilevel"/>
-    <w:tmpl w:val="73C48FC4"/>
-    <w:lvl w:ilvl="0">
-      <w:start w:val="1"/>
-      <w:numFmt w:val="bullet"/>
-      <w:lvlText w:val=""/>
-      <w:lvlJc w:val="left"/>
-      <w:pPr>
-        <w:tabs>
-          <w:tab w:val="num" w:pos="720"/>
-        </w:tabs>
-        <w:ind w:left="720" w:hanging="360"/>
-      </w:pPr>
-      <w:rPr>
-        <w:rFonts w:ascii="Symbol" w:hAnsi="Symbol" w:hint="default"/>
-        <w:sz w:val="20"/>
-      </w:rPr>
-    </w:lvl>
-    <w:lvl w:ilvl="1" w:tentative="1">
-      <w:start w:val="1"/>
-      <w:numFmt w:val="bullet"/>
-      <w:lvlText w:val="o"/>
-      <w:lvlJc w:val="left"/>
-      <w:pPr>
-        <w:tabs>
-          <w:tab w:val="num" w:pos="1440"/>
-        </w:tabs>
-        <w:ind w:left="1440" w:hanging="360"/>
-      </w:pPr>
-      <w:rPr>
-        <w:rFonts w:ascii="Courier New" w:hAnsi="Courier New" w:hint="default"/>
-        <w:sz w:val="20"/>
-      </w:rPr>
-    </w:lvl>
-    <w:lvl w:ilvl="2" w:tentative="1">
-      <w:start w:val="1"/>
-      <w:numFmt w:val="bullet"/>
-      <w:lvlText w:val=""/>
-      <w:lvlJc w:val="left"/>
-      <w:pPr>
-        <w:tabs>
-          <w:tab w:val="num" w:pos="2160"/>
-        </w:tabs>
-        <w:ind w:left="2160" w:hanging="360"/>
-      </w:pPr>
-      <w:rPr>
-        <w:rFonts w:ascii="Wingdings" w:hAnsi="Wingdings" w:hint="default"/>
-        <w:sz w:val="20"/>
-      </w:rPr>
-    </w:lvl>
-    <w:lvl w:ilvl="3" w:tentative="1">
-      <w:start w:val="1"/>
-      <w:numFmt w:val="bullet"/>
-      <w:lvlText w:val=""/>
-      <w:lvlJc w:val="left"/>
-      <w:pPr>
-        <w:tabs>
-          <w:tab w:val="num" w:pos="2880"/>
-        </w:tabs>
-        <w:ind w:left="2880" w:hanging="360"/>
-      </w:pPr>
-      <w:rPr>
-        <w:rFonts w:ascii="Wingdings" w:hAnsi="Wingdings" w:hint="default"/>
-        <w:sz w:val="20"/>
-      </w:rPr>
-    </w:lvl>
-    <w:lvl w:ilvl="4" w:tentative="1">
-      <w:start w:val="1"/>
-      <w:numFmt w:val="bullet"/>
-      <w:lvlText w:val=""/>
-      <w:lvlJc w:val="left"/>
-      <w:pPr>
-        <w:tabs>
-          <w:tab w:val="num" w:pos="3600"/>
-        </w:tabs>
-        <w:ind w:left="3600" w:hanging="360"/>
-      </w:pPr>
-      <w:rPr>
-        <w:rFonts w:ascii="Wingdings" w:hAnsi="Wingdings" w:hint="default"/>
-        <w:sz w:val="20"/>
-      </w:rPr>
-    </w:lvl>
-    <w:lvl w:ilvl="5" w:tentative="1">
-      <w:start w:val="1"/>
-      <w:numFmt w:val="bullet"/>
-      <w:lvlText w:val=""/>
-      <w:lvlJc w:val="left"/>
-      <w:pPr>
-        <w:tabs>
-          <w:tab w:val="num" w:pos="4320"/>
-        </w:tabs>
-        <w:ind w:left="4320" w:hanging="360"/>
-      </w:pPr>
-      <w:rPr>
-        <w:rFonts w:ascii="Wingdings" w:hAnsi="Wingdings" w:hint="default"/>
-        <w:sz w:val="20"/>
-      </w:rPr>
-    </w:lvl>
-    <w:lvl w:ilvl="6" w:tentative="1">
-      <w:start w:val="1"/>
-      <w:numFmt w:val="bullet"/>
-      <w:lvlText w:val=""/>
-      <w:lvlJc w:val="left"/>
-      <w:pPr>
-        <w:tabs>
-          <w:tab w:val="num" w:pos="5040"/>
-        </w:tabs>
-        <w:ind w:left="5040" w:hanging="360"/>
-      </w:pPr>
-      <w:rPr>
-        <w:rFonts w:ascii="Wingdings" w:hAnsi="Wingdings" w:hint="default"/>
-        <w:sz w:val="20"/>
-      </w:rPr>
-    </w:lvl>
-    <w:lvl w:ilvl="7" w:tentative="1">
-      <w:start w:val="1"/>
-      <w:numFmt w:val="bullet"/>
-      <w:lvlText w:val=""/>
-      <w:lvlJc w:val="left"/>
-      <w:pPr>
-        <w:tabs>
-          <w:tab w:val="num" w:pos="5760"/>
-        </w:tabs>
-        <w:ind w:left="5760" w:hanging="360"/>
-      </w:pPr>
-      <w:rPr>
-        <w:rFonts w:ascii="Wingdings" w:hAnsi="Wingdings" w:hint="default"/>
-        <w:sz w:val="20"/>
-      </w:rPr>
-    </w:lvl>
-    <w:lvl w:ilvl="8" w:tentative="1">
-      <w:start w:val="1"/>
-      <w:numFmt w:val="bullet"/>
-      <w:lvlText w:val=""/>
-      <w:lvlJc w:val="left"/>
-      <w:pPr>
-        <w:tabs>
-          <w:tab w:val="num" w:pos="6480"/>
-        </w:tabs>
-        <w:ind w:left="6480" w:hanging="360"/>
-      </w:pPr>
-      <w:rPr>
-        <w:rFonts w:ascii="Wingdings" w:hAnsi="Wingdings" w:hint="default"/>
-        <w:sz w:val="20"/>
-      </w:rPr>
-    </w:lvl>
-  </w:abstractNum>
-  <w:abstractNum w:abstractNumId="8" w15:restartNumberingAfterBreak="0">
-    <w:nsid w:val="436E2391"/>
-    <w:multiLevelType w:val="multilevel"/>
-    <w:tmpl w:val="421ECFC6"/>
+    <w:tmpl w:val="D6D8BF38"/>
     <w:lvl w:ilvl="0">
       <w:start w:val="1"/>
       <w:numFmt w:val="decimal"/>
@@ -6676,10 +7737,10 @@
       </w:pPr>
     </w:lvl>
   </w:abstractNum>
-  <w:abstractNum w:abstractNumId="9" w15:restartNumberingAfterBreak="0">
-    <w:nsid w:val="495B7BC6"/>
+  <w:abstractNum w:abstractNumId="16" w15:restartNumberingAfterBreak="0">
+    <w:nsid w:val="65216CA7"/>
     <w:multiLevelType w:val="multilevel"/>
-    <w:tmpl w:val="4AC0F632"/>
+    <w:tmpl w:val="40BAB0C0"/>
     <w:lvl w:ilvl="0">
       <w:start w:val="1"/>
       <w:numFmt w:val="decimal"/>
@@ -6793,14 +7854,14 @@
       </w:pPr>
     </w:lvl>
   </w:abstractNum>
-  <w:abstractNum w:abstractNumId="10" w15:restartNumberingAfterBreak="0">
-    <w:nsid w:val="51B84C53"/>
+  <w:abstractNum w:abstractNumId="17" w15:restartNumberingAfterBreak="0">
+    <w:nsid w:val="664F3E85"/>
     <w:multiLevelType w:val="multilevel"/>
-    <w:tmpl w:val="9F7241EC"/>
+    <w:tmpl w:val="7D885D74"/>
     <w:lvl w:ilvl="0">
       <w:start w:val="1"/>
-      <w:numFmt w:val="bullet"/>
-      <w:lvlText w:val=""/>
+      <w:numFmt w:val="decimal"/>
+      <w:lvlText w:val="%1."/>
       <w:lvlJc w:val="left"/>
       <w:pPr>
         <w:tabs>
@@ -6808,12 +7869,8 @@
         </w:tabs>
         <w:ind w:left="720" w:hanging="360"/>
       </w:pPr>
-      <w:rPr>
-        <w:rFonts w:ascii="Symbol" w:hAnsi="Symbol" w:hint="default"/>
-        <w:sz w:val="20"/>
-      </w:rPr>
-    </w:lvl>
-    <w:lvl w:ilvl="1" w:tentative="1">
+    </w:lvl>
+    <w:lvl w:ilvl="1">
       <w:start w:val="1"/>
       <w:numFmt w:val="bullet"/>
       <w:lvlText w:val="o"/>
@@ -6831,8 +7888,8 @@
     </w:lvl>
     <w:lvl w:ilvl="2" w:tentative="1">
       <w:start w:val="1"/>
-      <w:numFmt w:val="bullet"/>
-      <w:lvlText w:val=""/>
+      <w:numFmt w:val="decimal"/>
+      <w:lvlText w:val="%3."/>
       <w:lvlJc w:val="left"/>
       <w:pPr>
         <w:tabs>
@@ -6840,15 +7897,11 @@
         </w:tabs>
         <w:ind w:left="2160" w:hanging="360"/>
       </w:pPr>
-      <w:rPr>
-        <w:rFonts w:ascii="Wingdings" w:hAnsi="Wingdings" w:hint="default"/>
-        <w:sz w:val="20"/>
-      </w:rPr>
     </w:lvl>
     <w:lvl w:ilvl="3" w:tentative="1">
       <w:start w:val="1"/>
-      <w:numFmt w:val="bullet"/>
-      <w:lvlText w:val=""/>
+      <w:numFmt w:val="decimal"/>
+      <w:lvlText w:val="%4."/>
       <w:lvlJc w:val="left"/>
       <w:pPr>
         <w:tabs>
@@ -6856,15 +7909,11 @@
         </w:tabs>
         <w:ind w:left="2880" w:hanging="360"/>
       </w:pPr>
-      <w:rPr>
-        <w:rFonts w:ascii="Wingdings" w:hAnsi="Wingdings" w:hint="default"/>
-        <w:sz w:val="20"/>
-      </w:rPr>
     </w:lvl>
     <w:lvl w:ilvl="4" w:tentative="1">
       <w:start w:val="1"/>
-      <w:numFmt w:val="bullet"/>
-      <w:lvlText w:val=""/>
+      <w:numFmt w:val="decimal"/>
+      <w:lvlText w:val="%5."/>
       <w:lvlJc w:val="left"/>
       <w:pPr>
         <w:tabs>
@@ -6872,15 +7921,11 @@
         </w:tabs>
         <w:ind w:left="3600" w:hanging="360"/>
       </w:pPr>
-      <w:rPr>
-        <w:rFonts w:ascii="Wingdings" w:hAnsi="Wingdings" w:hint="default"/>
-        <w:sz w:val="20"/>
-      </w:rPr>
     </w:lvl>
     <w:lvl w:ilvl="5" w:tentative="1">
       <w:start w:val="1"/>
-      <w:numFmt w:val="bullet"/>
-      <w:lvlText w:val=""/>
+      <w:numFmt w:val="decimal"/>
+      <w:lvlText w:val="%6."/>
       <w:lvlJc w:val="left"/>
       <w:pPr>
         <w:tabs>
@@ -6888,15 +7933,11 @@
         </w:tabs>
         <w:ind w:left="4320" w:hanging="360"/>
       </w:pPr>
-      <w:rPr>
-        <w:rFonts w:ascii="Wingdings" w:hAnsi="Wingdings" w:hint="default"/>
-        <w:sz w:val="20"/>
-      </w:rPr>
     </w:lvl>
     <w:lvl w:ilvl="6" w:tentative="1">
       <w:start w:val="1"/>
-      <w:numFmt w:val="bullet"/>
-      <w:lvlText w:val=""/>
+      <w:numFmt w:val="decimal"/>
+      <w:lvlText w:val="%7."/>
       <w:lvlJc w:val="left"/>
       <w:pPr>
         <w:tabs>
@@ -6904,15 +7945,11 @@
         </w:tabs>
         <w:ind w:left="5040" w:hanging="360"/>
       </w:pPr>
-      <w:rPr>
-        <w:rFonts w:ascii="Wingdings" w:hAnsi="Wingdings" w:hint="default"/>
-        <w:sz w:val="20"/>
-      </w:rPr>
     </w:lvl>
     <w:lvl w:ilvl="7" w:tentative="1">
       <w:start w:val="1"/>
-      <w:numFmt w:val="bullet"/>
-      <w:lvlText w:val=""/>
+      <w:numFmt w:val="decimal"/>
+      <w:lvlText w:val="%8."/>
       <w:lvlJc w:val="left"/>
       <w:pPr>
         <w:tabs>
@@ -6920,15 +7957,11 @@
         </w:tabs>
         <w:ind w:left="5760" w:hanging="360"/>
       </w:pPr>
-      <w:rPr>
-        <w:rFonts w:ascii="Wingdings" w:hAnsi="Wingdings" w:hint="default"/>
-        <w:sz w:val="20"/>
-      </w:rPr>
     </w:lvl>
     <w:lvl w:ilvl="8" w:tentative="1">
       <w:start w:val="1"/>
-      <w:numFmt w:val="bullet"/>
-      <w:lvlText w:val=""/>
+      <w:numFmt w:val="decimal"/>
+      <w:lvlText w:val="%9."/>
       <w:lvlJc w:val="left"/>
       <w:pPr>
         <w:tabs>
@@ -6936,1059 +7969,12 @@
         </w:tabs>
         <w:ind w:left="6480" w:hanging="360"/>
       </w:pPr>
-      <w:rPr>
-        <w:rFonts w:ascii="Wingdings" w:hAnsi="Wingdings" w:hint="default"/>
-        <w:sz w:val="20"/>
-      </w:rPr>
-    </w:lvl>
-  </w:abstractNum>
-  <w:abstractNum w:abstractNumId="11" w15:restartNumberingAfterBreak="0">
-    <w:nsid w:val="5E070691"/>
-    <w:multiLevelType w:val="multilevel"/>
-    <w:tmpl w:val="456C9904"/>
-    <w:lvl w:ilvl="0">
-      <w:start w:val="1"/>
-      <w:numFmt w:val="bullet"/>
-      <w:lvlText w:val=""/>
-      <w:lvlJc w:val="left"/>
-      <w:pPr>
-        <w:tabs>
-          <w:tab w:val="num" w:pos="720"/>
-        </w:tabs>
-        <w:ind w:left="720" w:hanging="360"/>
-      </w:pPr>
-      <w:rPr>
-        <w:rFonts w:ascii="Symbol" w:hAnsi="Symbol" w:hint="default"/>
-        <w:sz w:val="20"/>
-      </w:rPr>
-    </w:lvl>
-    <w:lvl w:ilvl="1" w:tentative="1">
-      <w:start w:val="1"/>
-      <w:numFmt w:val="bullet"/>
-      <w:lvlText w:val="o"/>
-      <w:lvlJc w:val="left"/>
-      <w:pPr>
-        <w:tabs>
-          <w:tab w:val="num" w:pos="1440"/>
-        </w:tabs>
-        <w:ind w:left="1440" w:hanging="360"/>
-      </w:pPr>
-      <w:rPr>
-        <w:rFonts w:ascii="Courier New" w:hAnsi="Courier New" w:hint="default"/>
-        <w:sz w:val="20"/>
-      </w:rPr>
-    </w:lvl>
-    <w:lvl w:ilvl="2" w:tentative="1">
-      <w:start w:val="1"/>
-      <w:numFmt w:val="bullet"/>
-      <w:lvlText w:val=""/>
-      <w:lvlJc w:val="left"/>
-      <w:pPr>
-        <w:tabs>
-          <w:tab w:val="num" w:pos="2160"/>
-        </w:tabs>
-        <w:ind w:left="2160" w:hanging="360"/>
-      </w:pPr>
-      <w:rPr>
-        <w:rFonts w:ascii="Wingdings" w:hAnsi="Wingdings" w:hint="default"/>
-        <w:sz w:val="20"/>
-      </w:rPr>
-    </w:lvl>
-    <w:lvl w:ilvl="3" w:tentative="1">
-      <w:start w:val="1"/>
-      <w:numFmt w:val="bullet"/>
-      <w:lvlText w:val=""/>
-      <w:lvlJc w:val="left"/>
-      <w:pPr>
-        <w:tabs>
-          <w:tab w:val="num" w:pos="2880"/>
-        </w:tabs>
-        <w:ind w:left="2880" w:hanging="360"/>
-      </w:pPr>
-      <w:rPr>
-        <w:rFonts w:ascii="Wingdings" w:hAnsi="Wingdings" w:hint="default"/>
-        <w:sz w:val="20"/>
-      </w:rPr>
-    </w:lvl>
-    <w:lvl w:ilvl="4" w:tentative="1">
-      <w:start w:val="1"/>
-      <w:numFmt w:val="bullet"/>
-      <w:lvlText w:val=""/>
-      <w:lvlJc w:val="left"/>
-      <w:pPr>
-        <w:tabs>
-          <w:tab w:val="num" w:pos="3600"/>
-        </w:tabs>
-        <w:ind w:left="3600" w:hanging="360"/>
-      </w:pPr>
-      <w:rPr>
-        <w:rFonts w:ascii="Wingdings" w:hAnsi="Wingdings" w:hint="default"/>
-        <w:sz w:val="20"/>
-      </w:rPr>
-    </w:lvl>
-    <w:lvl w:ilvl="5" w:tentative="1">
-      <w:start w:val="1"/>
-      <w:numFmt w:val="bullet"/>
-      <w:lvlText w:val=""/>
-      <w:lvlJc w:val="left"/>
-      <w:pPr>
-        <w:tabs>
-          <w:tab w:val="num" w:pos="4320"/>
-        </w:tabs>
-        <w:ind w:left="4320" w:hanging="360"/>
-      </w:pPr>
-      <w:rPr>
-        <w:rFonts w:ascii="Wingdings" w:hAnsi="Wingdings" w:hint="default"/>
-        <w:sz w:val="20"/>
-      </w:rPr>
-    </w:lvl>
-    <w:lvl w:ilvl="6" w:tentative="1">
-      <w:start w:val="1"/>
-      <w:numFmt w:val="bullet"/>
-      <w:lvlText w:val=""/>
-      <w:lvlJc w:val="left"/>
-      <w:pPr>
-        <w:tabs>
-          <w:tab w:val="num" w:pos="5040"/>
-        </w:tabs>
-        <w:ind w:left="5040" w:hanging="360"/>
-      </w:pPr>
-      <w:rPr>
-        <w:rFonts w:ascii="Wingdings" w:hAnsi="Wingdings" w:hint="default"/>
-        <w:sz w:val="20"/>
-      </w:rPr>
-    </w:lvl>
-    <w:lvl w:ilvl="7" w:tentative="1">
-      <w:start w:val="1"/>
-      <w:numFmt w:val="bullet"/>
-      <w:lvlText w:val=""/>
-      <w:lvlJc w:val="left"/>
-      <w:pPr>
-        <w:tabs>
-          <w:tab w:val="num" w:pos="5760"/>
-        </w:tabs>
-        <w:ind w:left="5760" w:hanging="360"/>
-      </w:pPr>
-      <w:rPr>
-        <w:rFonts w:ascii="Wingdings" w:hAnsi="Wingdings" w:hint="default"/>
-        <w:sz w:val="20"/>
-      </w:rPr>
-    </w:lvl>
-    <w:lvl w:ilvl="8" w:tentative="1">
-      <w:start w:val="1"/>
-      <w:numFmt w:val="bullet"/>
-      <w:lvlText w:val=""/>
-      <w:lvlJc w:val="left"/>
-      <w:pPr>
-        <w:tabs>
-          <w:tab w:val="num" w:pos="6480"/>
-        </w:tabs>
-        <w:ind w:left="6480" w:hanging="360"/>
-      </w:pPr>
-      <w:rPr>
-        <w:rFonts w:ascii="Wingdings" w:hAnsi="Wingdings" w:hint="default"/>
-        <w:sz w:val="20"/>
-      </w:rPr>
-    </w:lvl>
-  </w:abstractNum>
-  <w:abstractNum w:abstractNumId="12" w15:restartNumberingAfterBreak="0">
-    <w:nsid w:val="5F76054E"/>
-    <w:multiLevelType w:val="multilevel"/>
-    <w:tmpl w:val="3FA28D4C"/>
-    <w:lvl w:ilvl="0">
-      <w:start w:val="1"/>
-      <w:numFmt w:val="bullet"/>
-      <w:lvlText w:val=""/>
-      <w:lvlJc w:val="left"/>
-      <w:pPr>
-        <w:tabs>
-          <w:tab w:val="num" w:pos="720"/>
-        </w:tabs>
-        <w:ind w:left="720" w:hanging="360"/>
-      </w:pPr>
-      <w:rPr>
-        <w:rFonts w:ascii="Symbol" w:hAnsi="Symbol" w:hint="default"/>
-        <w:sz w:val="20"/>
-      </w:rPr>
-    </w:lvl>
-    <w:lvl w:ilvl="1" w:tentative="1">
-      <w:start w:val="1"/>
-      <w:numFmt w:val="bullet"/>
-      <w:lvlText w:val="o"/>
-      <w:lvlJc w:val="left"/>
-      <w:pPr>
-        <w:tabs>
-          <w:tab w:val="num" w:pos="1440"/>
-        </w:tabs>
-        <w:ind w:left="1440" w:hanging="360"/>
-      </w:pPr>
-      <w:rPr>
-        <w:rFonts w:ascii="Courier New" w:hAnsi="Courier New" w:hint="default"/>
-        <w:sz w:val="20"/>
-      </w:rPr>
-    </w:lvl>
-    <w:lvl w:ilvl="2" w:tentative="1">
-      <w:start w:val="1"/>
-      <w:numFmt w:val="bullet"/>
-      <w:lvlText w:val=""/>
-      <w:lvlJc w:val="left"/>
-      <w:pPr>
-        <w:tabs>
-          <w:tab w:val="num" w:pos="2160"/>
-        </w:tabs>
-        <w:ind w:left="2160" w:hanging="360"/>
-      </w:pPr>
-      <w:rPr>
-        <w:rFonts w:ascii="Wingdings" w:hAnsi="Wingdings" w:hint="default"/>
-        <w:sz w:val="20"/>
-      </w:rPr>
-    </w:lvl>
-    <w:lvl w:ilvl="3" w:tentative="1">
-      <w:start w:val="1"/>
-      <w:numFmt w:val="bullet"/>
-      <w:lvlText w:val=""/>
-      <w:lvlJc w:val="left"/>
-      <w:pPr>
-        <w:tabs>
-          <w:tab w:val="num" w:pos="2880"/>
-        </w:tabs>
-        <w:ind w:left="2880" w:hanging="360"/>
-      </w:pPr>
-      <w:rPr>
-        <w:rFonts w:ascii="Wingdings" w:hAnsi="Wingdings" w:hint="default"/>
-        <w:sz w:val="20"/>
-      </w:rPr>
-    </w:lvl>
-    <w:lvl w:ilvl="4" w:tentative="1">
-      <w:start w:val="1"/>
-      <w:numFmt w:val="bullet"/>
-      <w:lvlText w:val=""/>
-      <w:lvlJc w:val="left"/>
-      <w:pPr>
-        <w:tabs>
-          <w:tab w:val="num" w:pos="3600"/>
-        </w:tabs>
-        <w:ind w:left="3600" w:hanging="360"/>
-      </w:pPr>
-      <w:rPr>
-        <w:rFonts w:ascii="Wingdings" w:hAnsi="Wingdings" w:hint="default"/>
-        <w:sz w:val="20"/>
-      </w:rPr>
-    </w:lvl>
-    <w:lvl w:ilvl="5" w:tentative="1">
-      <w:start w:val="1"/>
-      <w:numFmt w:val="bullet"/>
-      <w:lvlText w:val=""/>
-      <w:lvlJc w:val="left"/>
-      <w:pPr>
-        <w:tabs>
-          <w:tab w:val="num" w:pos="4320"/>
-        </w:tabs>
-        <w:ind w:left="4320" w:hanging="360"/>
-      </w:pPr>
-      <w:rPr>
-        <w:rFonts w:ascii="Wingdings" w:hAnsi="Wingdings" w:hint="default"/>
-        <w:sz w:val="20"/>
-      </w:rPr>
-    </w:lvl>
-    <w:lvl w:ilvl="6" w:tentative="1">
-      <w:start w:val="1"/>
-      <w:numFmt w:val="bullet"/>
-      <w:lvlText w:val=""/>
-      <w:lvlJc w:val="left"/>
-      <w:pPr>
-        <w:tabs>
-          <w:tab w:val="num" w:pos="5040"/>
-        </w:tabs>
-        <w:ind w:left="5040" w:hanging="360"/>
-      </w:pPr>
-      <w:rPr>
-        <w:rFonts w:ascii="Wingdings" w:hAnsi="Wingdings" w:hint="default"/>
-        <w:sz w:val="20"/>
-      </w:rPr>
-    </w:lvl>
-    <w:lvl w:ilvl="7" w:tentative="1">
-      <w:start w:val="1"/>
-      <w:numFmt w:val="bullet"/>
-      <w:lvlText w:val=""/>
-      <w:lvlJc w:val="left"/>
-      <w:pPr>
-        <w:tabs>
-          <w:tab w:val="num" w:pos="5760"/>
-        </w:tabs>
-        <w:ind w:left="5760" w:hanging="360"/>
-      </w:pPr>
-      <w:rPr>
-        <w:rFonts w:ascii="Wingdings" w:hAnsi="Wingdings" w:hint="default"/>
-        <w:sz w:val="20"/>
-      </w:rPr>
-    </w:lvl>
-    <w:lvl w:ilvl="8" w:tentative="1">
-      <w:start w:val="1"/>
-      <w:numFmt w:val="bullet"/>
-      <w:lvlText w:val=""/>
-      <w:lvlJc w:val="left"/>
-      <w:pPr>
-        <w:tabs>
-          <w:tab w:val="num" w:pos="6480"/>
-        </w:tabs>
-        <w:ind w:left="6480" w:hanging="360"/>
-      </w:pPr>
-      <w:rPr>
-        <w:rFonts w:ascii="Wingdings" w:hAnsi="Wingdings" w:hint="default"/>
-        <w:sz w:val="20"/>
-      </w:rPr>
-    </w:lvl>
-  </w:abstractNum>
-  <w:abstractNum w:abstractNumId="13" w15:restartNumberingAfterBreak="0">
-    <w:nsid w:val="5F866D60"/>
-    <w:multiLevelType w:val="multilevel"/>
-    <w:tmpl w:val="A9AA5E80"/>
-    <w:lvl w:ilvl="0">
-      <w:start w:val="1"/>
-      <w:numFmt w:val="bullet"/>
-      <w:lvlText w:val=""/>
-      <w:lvlJc w:val="left"/>
-      <w:pPr>
-        <w:tabs>
-          <w:tab w:val="num" w:pos="720"/>
-        </w:tabs>
-        <w:ind w:left="720" w:hanging="360"/>
-      </w:pPr>
-      <w:rPr>
-        <w:rFonts w:ascii="Symbol" w:hAnsi="Symbol" w:hint="default"/>
-        <w:sz w:val="20"/>
-      </w:rPr>
-    </w:lvl>
-    <w:lvl w:ilvl="1" w:tentative="1">
-      <w:start w:val="1"/>
-      <w:numFmt w:val="bullet"/>
-      <w:lvlText w:val="o"/>
-      <w:lvlJc w:val="left"/>
-      <w:pPr>
-        <w:tabs>
-          <w:tab w:val="num" w:pos="1440"/>
-        </w:tabs>
-        <w:ind w:left="1440" w:hanging="360"/>
-      </w:pPr>
-      <w:rPr>
-        <w:rFonts w:ascii="Courier New" w:hAnsi="Courier New" w:hint="default"/>
-        <w:sz w:val="20"/>
-      </w:rPr>
-    </w:lvl>
-    <w:lvl w:ilvl="2" w:tentative="1">
-      <w:start w:val="1"/>
-      <w:numFmt w:val="bullet"/>
-      <w:lvlText w:val=""/>
-      <w:lvlJc w:val="left"/>
-      <w:pPr>
-        <w:tabs>
-          <w:tab w:val="num" w:pos="2160"/>
-        </w:tabs>
-        <w:ind w:left="2160" w:hanging="360"/>
-      </w:pPr>
-      <w:rPr>
-        <w:rFonts w:ascii="Wingdings" w:hAnsi="Wingdings" w:hint="default"/>
-        <w:sz w:val="20"/>
-      </w:rPr>
-    </w:lvl>
-    <w:lvl w:ilvl="3" w:tentative="1">
-      <w:start w:val="1"/>
-      <w:numFmt w:val="bullet"/>
-      <w:lvlText w:val=""/>
-      <w:lvlJc w:val="left"/>
-      <w:pPr>
-        <w:tabs>
-          <w:tab w:val="num" w:pos="2880"/>
-        </w:tabs>
-        <w:ind w:left="2880" w:hanging="360"/>
-      </w:pPr>
-      <w:rPr>
-        <w:rFonts w:ascii="Wingdings" w:hAnsi="Wingdings" w:hint="default"/>
-        <w:sz w:val="20"/>
-      </w:rPr>
-    </w:lvl>
-    <w:lvl w:ilvl="4" w:tentative="1">
-      <w:start w:val="1"/>
-      <w:numFmt w:val="bullet"/>
-      <w:lvlText w:val=""/>
-      <w:lvlJc w:val="left"/>
-      <w:pPr>
-        <w:tabs>
-          <w:tab w:val="num" w:pos="3600"/>
-        </w:tabs>
-        <w:ind w:left="3600" w:hanging="360"/>
-      </w:pPr>
-      <w:rPr>
-        <w:rFonts w:ascii="Wingdings" w:hAnsi="Wingdings" w:hint="default"/>
-        <w:sz w:val="20"/>
-      </w:rPr>
-    </w:lvl>
-    <w:lvl w:ilvl="5" w:tentative="1">
-      <w:start w:val="1"/>
-      <w:numFmt w:val="bullet"/>
-      <w:lvlText w:val=""/>
-      <w:lvlJc w:val="left"/>
-      <w:pPr>
-        <w:tabs>
-          <w:tab w:val="num" w:pos="4320"/>
-        </w:tabs>
-        <w:ind w:left="4320" w:hanging="360"/>
-      </w:pPr>
-      <w:rPr>
-        <w:rFonts w:ascii="Wingdings" w:hAnsi="Wingdings" w:hint="default"/>
-        <w:sz w:val="20"/>
-      </w:rPr>
-    </w:lvl>
-    <w:lvl w:ilvl="6" w:tentative="1">
-      <w:start w:val="1"/>
-      <w:numFmt w:val="bullet"/>
-      <w:lvlText w:val=""/>
-      <w:lvlJc w:val="left"/>
-      <w:pPr>
-        <w:tabs>
-          <w:tab w:val="num" w:pos="5040"/>
-        </w:tabs>
-        <w:ind w:left="5040" w:hanging="360"/>
-      </w:pPr>
-      <w:rPr>
-        <w:rFonts w:ascii="Wingdings" w:hAnsi="Wingdings" w:hint="default"/>
-        <w:sz w:val="20"/>
-      </w:rPr>
-    </w:lvl>
-    <w:lvl w:ilvl="7" w:tentative="1">
-      <w:start w:val="1"/>
-      <w:numFmt w:val="bullet"/>
-      <w:lvlText w:val=""/>
-      <w:lvlJc w:val="left"/>
-      <w:pPr>
-        <w:tabs>
-          <w:tab w:val="num" w:pos="5760"/>
-        </w:tabs>
-        <w:ind w:left="5760" w:hanging="360"/>
-      </w:pPr>
-      <w:rPr>
-        <w:rFonts w:ascii="Wingdings" w:hAnsi="Wingdings" w:hint="default"/>
-        <w:sz w:val="20"/>
-      </w:rPr>
-    </w:lvl>
-    <w:lvl w:ilvl="8" w:tentative="1">
-      <w:start w:val="1"/>
-      <w:numFmt w:val="bullet"/>
-      <w:lvlText w:val=""/>
-      <w:lvlJc w:val="left"/>
-      <w:pPr>
-        <w:tabs>
-          <w:tab w:val="num" w:pos="6480"/>
-        </w:tabs>
-        <w:ind w:left="6480" w:hanging="360"/>
-      </w:pPr>
-      <w:rPr>
-        <w:rFonts w:ascii="Wingdings" w:hAnsi="Wingdings" w:hint="default"/>
-        <w:sz w:val="20"/>
-      </w:rPr>
-    </w:lvl>
-  </w:abstractNum>
-  <w:abstractNum w:abstractNumId="14" w15:restartNumberingAfterBreak="0">
-    <w:nsid w:val="60D6356F"/>
-    <w:multiLevelType w:val="multilevel"/>
-    <w:tmpl w:val="30466C4A"/>
-    <w:lvl w:ilvl="0">
-      <w:start w:val="1"/>
-      <w:numFmt w:val="bullet"/>
-      <w:lvlText w:val=""/>
-      <w:lvlJc w:val="left"/>
-      <w:pPr>
-        <w:tabs>
-          <w:tab w:val="num" w:pos="720"/>
-        </w:tabs>
-        <w:ind w:left="720" w:hanging="360"/>
-      </w:pPr>
-      <w:rPr>
-        <w:rFonts w:ascii="Symbol" w:hAnsi="Symbol" w:hint="default"/>
-        <w:sz w:val="20"/>
-      </w:rPr>
-    </w:lvl>
-    <w:lvl w:ilvl="1" w:tentative="1">
-      <w:start w:val="1"/>
-      <w:numFmt w:val="bullet"/>
-      <w:lvlText w:val="o"/>
-      <w:lvlJc w:val="left"/>
-      <w:pPr>
-        <w:tabs>
-          <w:tab w:val="num" w:pos="1440"/>
-        </w:tabs>
-        <w:ind w:left="1440" w:hanging="360"/>
-      </w:pPr>
-      <w:rPr>
-        <w:rFonts w:ascii="Courier New" w:hAnsi="Courier New" w:hint="default"/>
-        <w:sz w:val="20"/>
-      </w:rPr>
-    </w:lvl>
-    <w:lvl w:ilvl="2" w:tentative="1">
-      <w:start w:val="1"/>
-      <w:numFmt w:val="bullet"/>
-      <w:lvlText w:val=""/>
-      <w:lvlJc w:val="left"/>
-      <w:pPr>
-        <w:tabs>
-          <w:tab w:val="num" w:pos="2160"/>
-        </w:tabs>
-        <w:ind w:left="2160" w:hanging="360"/>
-      </w:pPr>
-      <w:rPr>
-        <w:rFonts w:ascii="Wingdings" w:hAnsi="Wingdings" w:hint="default"/>
-        <w:sz w:val="20"/>
-      </w:rPr>
-    </w:lvl>
-    <w:lvl w:ilvl="3" w:tentative="1">
-      <w:start w:val="1"/>
-      <w:numFmt w:val="bullet"/>
-      <w:lvlText w:val=""/>
-      <w:lvlJc w:val="left"/>
-      <w:pPr>
-        <w:tabs>
-          <w:tab w:val="num" w:pos="2880"/>
-        </w:tabs>
-        <w:ind w:left="2880" w:hanging="360"/>
-      </w:pPr>
-      <w:rPr>
-        <w:rFonts w:ascii="Wingdings" w:hAnsi="Wingdings" w:hint="default"/>
-        <w:sz w:val="20"/>
-      </w:rPr>
-    </w:lvl>
-    <w:lvl w:ilvl="4" w:tentative="1">
-      <w:start w:val="1"/>
-      <w:numFmt w:val="bullet"/>
-      <w:lvlText w:val=""/>
-      <w:lvlJc w:val="left"/>
-      <w:pPr>
-        <w:tabs>
-          <w:tab w:val="num" w:pos="3600"/>
-        </w:tabs>
-        <w:ind w:left="3600" w:hanging="360"/>
-      </w:pPr>
-      <w:rPr>
-        <w:rFonts w:ascii="Wingdings" w:hAnsi="Wingdings" w:hint="default"/>
-        <w:sz w:val="20"/>
-      </w:rPr>
-    </w:lvl>
-    <w:lvl w:ilvl="5" w:tentative="1">
-      <w:start w:val="1"/>
-      <w:numFmt w:val="bullet"/>
-      <w:lvlText w:val=""/>
-      <w:lvlJc w:val="left"/>
-      <w:pPr>
-        <w:tabs>
-          <w:tab w:val="num" w:pos="4320"/>
-        </w:tabs>
-        <w:ind w:left="4320" w:hanging="360"/>
-      </w:pPr>
-      <w:rPr>
-        <w:rFonts w:ascii="Wingdings" w:hAnsi="Wingdings" w:hint="default"/>
-        <w:sz w:val="20"/>
-      </w:rPr>
-    </w:lvl>
-    <w:lvl w:ilvl="6" w:tentative="1">
-      <w:start w:val="1"/>
-      <w:numFmt w:val="bullet"/>
-      <w:lvlText w:val=""/>
-      <w:lvlJc w:val="left"/>
-      <w:pPr>
-        <w:tabs>
-          <w:tab w:val="num" w:pos="5040"/>
-        </w:tabs>
-        <w:ind w:left="5040" w:hanging="360"/>
-      </w:pPr>
-      <w:rPr>
-        <w:rFonts w:ascii="Wingdings" w:hAnsi="Wingdings" w:hint="default"/>
-        <w:sz w:val="20"/>
-      </w:rPr>
-    </w:lvl>
-    <w:lvl w:ilvl="7" w:tentative="1">
-      <w:start w:val="1"/>
-      <w:numFmt w:val="bullet"/>
-      <w:lvlText w:val=""/>
-      <w:lvlJc w:val="left"/>
-      <w:pPr>
-        <w:tabs>
-          <w:tab w:val="num" w:pos="5760"/>
-        </w:tabs>
-        <w:ind w:left="5760" w:hanging="360"/>
-      </w:pPr>
-      <w:rPr>
-        <w:rFonts w:ascii="Wingdings" w:hAnsi="Wingdings" w:hint="default"/>
-        <w:sz w:val="20"/>
-      </w:rPr>
-    </w:lvl>
-    <w:lvl w:ilvl="8" w:tentative="1">
-      <w:start w:val="1"/>
-      <w:numFmt w:val="bullet"/>
-      <w:lvlText w:val=""/>
-      <w:lvlJc w:val="left"/>
-      <w:pPr>
-        <w:tabs>
-          <w:tab w:val="num" w:pos="6480"/>
-        </w:tabs>
-        <w:ind w:left="6480" w:hanging="360"/>
-      </w:pPr>
-      <w:rPr>
-        <w:rFonts w:ascii="Wingdings" w:hAnsi="Wingdings" w:hint="default"/>
-        <w:sz w:val="20"/>
-      </w:rPr>
-    </w:lvl>
-  </w:abstractNum>
-  <w:abstractNum w:abstractNumId="15" w15:restartNumberingAfterBreak="0">
-    <w:nsid w:val="6CDC7D71"/>
-    <w:multiLevelType w:val="multilevel"/>
-    <w:tmpl w:val="7486D608"/>
-    <w:lvl w:ilvl="0">
-      <w:start w:val="1"/>
-      <w:numFmt w:val="bullet"/>
-      <w:lvlText w:val=""/>
-      <w:lvlJc w:val="left"/>
-      <w:pPr>
-        <w:tabs>
-          <w:tab w:val="num" w:pos="720"/>
-        </w:tabs>
-        <w:ind w:left="720" w:hanging="360"/>
-      </w:pPr>
-      <w:rPr>
-        <w:rFonts w:ascii="Symbol" w:hAnsi="Symbol" w:hint="default"/>
-        <w:sz w:val="20"/>
-      </w:rPr>
-    </w:lvl>
-    <w:lvl w:ilvl="1" w:tentative="1">
-      <w:start w:val="1"/>
-      <w:numFmt w:val="bullet"/>
-      <w:lvlText w:val="o"/>
-      <w:lvlJc w:val="left"/>
-      <w:pPr>
-        <w:tabs>
-          <w:tab w:val="num" w:pos="1440"/>
-        </w:tabs>
-        <w:ind w:left="1440" w:hanging="360"/>
-      </w:pPr>
-      <w:rPr>
-        <w:rFonts w:ascii="Courier New" w:hAnsi="Courier New" w:hint="default"/>
-        <w:sz w:val="20"/>
-      </w:rPr>
-    </w:lvl>
-    <w:lvl w:ilvl="2" w:tentative="1">
-      <w:start w:val="1"/>
-      <w:numFmt w:val="bullet"/>
-      <w:lvlText w:val=""/>
-      <w:lvlJc w:val="left"/>
-      <w:pPr>
-        <w:tabs>
-          <w:tab w:val="num" w:pos="2160"/>
-        </w:tabs>
-        <w:ind w:left="2160" w:hanging="360"/>
-      </w:pPr>
-      <w:rPr>
-        <w:rFonts w:ascii="Wingdings" w:hAnsi="Wingdings" w:hint="default"/>
-        <w:sz w:val="20"/>
-      </w:rPr>
-    </w:lvl>
-    <w:lvl w:ilvl="3" w:tentative="1">
-      <w:start w:val="1"/>
-      <w:numFmt w:val="bullet"/>
-      <w:lvlText w:val=""/>
-      <w:lvlJc w:val="left"/>
-      <w:pPr>
-        <w:tabs>
-          <w:tab w:val="num" w:pos="2880"/>
-        </w:tabs>
-        <w:ind w:left="2880" w:hanging="360"/>
-      </w:pPr>
-      <w:rPr>
-        <w:rFonts w:ascii="Wingdings" w:hAnsi="Wingdings" w:hint="default"/>
-        <w:sz w:val="20"/>
-      </w:rPr>
-    </w:lvl>
-    <w:lvl w:ilvl="4" w:tentative="1">
-      <w:start w:val="1"/>
-      <w:numFmt w:val="bullet"/>
-      <w:lvlText w:val=""/>
-      <w:lvlJc w:val="left"/>
-      <w:pPr>
-        <w:tabs>
-          <w:tab w:val="num" w:pos="3600"/>
-        </w:tabs>
-        <w:ind w:left="3600" w:hanging="360"/>
-      </w:pPr>
-      <w:rPr>
-        <w:rFonts w:ascii="Wingdings" w:hAnsi="Wingdings" w:hint="default"/>
-        <w:sz w:val="20"/>
-      </w:rPr>
-    </w:lvl>
-    <w:lvl w:ilvl="5" w:tentative="1">
-      <w:start w:val="1"/>
-      <w:numFmt w:val="bullet"/>
-      <w:lvlText w:val=""/>
-      <w:lvlJc w:val="left"/>
-      <w:pPr>
-        <w:tabs>
-          <w:tab w:val="num" w:pos="4320"/>
-        </w:tabs>
-        <w:ind w:left="4320" w:hanging="360"/>
-      </w:pPr>
-      <w:rPr>
-        <w:rFonts w:ascii="Wingdings" w:hAnsi="Wingdings" w:hint="default"/>
-        <w:sz w:val="20"/>
-      </w:rPr>
-    </w:lvl>
-    <w:lvl w:ilvl="6" w:tentative="1">
-      <w:start w:val="1"/>
-      <w:numFmt w:val="bullet"/>
-      <w:lvlText w:val=""/>
-      <w:lvlJc w:val="left"/>
-      <w:pPr>
-        <w:tabs>
-          <w:tab w:val="num" w:pos="5040"/>
-        </w:tabs>
-        <w:ind w:left="5040" w:hanging="360"/>
-      </w:pPr>
-      <w:rPr>
-        <w:rFonts w:ascii="Wingdings" w:hAnsi="Wingdings" w:hint="default"/>
-        <w:sz w:val="20"/>
-      </w:rPr>
-    </w:lvl>
-    <w:lvl w:ilvl="7" w:tentative="1">
-      <w:start w:val="1"/>
-      <w:numFmt w:val="bullet"/>
-      <w:lvlText w:val=""/>
-      <w:lvlJc w:val="left"/>
-      <w:pPr>
-        <w:tabs>
-          <w:tab w:val="num" w:pos="5760"/>
-        </w:tabs>
-        <w:ind w:left="5760" w:hanging="360"/>
-      </w:pPr>
-      <w:rPr>
-        <w:rFonts w:ascii="Wingdings" w:hAnsi="Wingdings" w:hint="default"/>
-        <w:sz w:val="20"/>
-      </w:rPr>
-    </w:lvl>
-    <w:lvl w:ilvl="8" w:tentative="1">
-      <w:start w:val="1"/>
-      <w:numFmt w:val="bullet"/>
-      <w:lvlText w:val=""/>
-      <w:lvlJc w:val="left"/>
-      <w:pPr>
-        <w:tabs>
-          <w:tab w:val="num" w:pos="6480"/>
-        </w:tabs>
-        <w:ind w:left="6480" w:hanging="360"/>
-      </w:pPr>
-      <w:rPr>
-        <w:rFonts w:ascii="Wingdings" w:hAnsi="Wingdings" w:hint="default"/>
-        <w:sz w:val="20"/>
-      </w:rPr>
-    </w:lvl>
-  </w:abstractNum>
-  <w:abstractNum w:abstractNumId="16" w15:restartNumberingAfterBreak="0">
-    <w:nsid w:val="6F5E3DC3"/>
-    <w:multiLevelType w:val="multilevel"/>
-    <w:tmpl w:val="6706E832"/>
-    <w:lvl w:ilvl="0">
-      <w:start w:val="1"/>
-      <w:numFmt w:val="bullet"/>
-      <w:lvlText w:val=""/>
-      <w:lvlJc w:val="left"/>
-      <w:pPr>
-        <w:tabs>
-          <w:tab w:val="num" w:pos="720"/>
-        </w:tabs>
-        <w:ind w:left="720" w:hanging="360"/>
-      </w:pPr>
-      <w:rPr>
-        <w:rFonts w:ascii="Symbol" w:hAnsi="Symbol" w:hint="default"/>
-        <w:sz w:val="20"/>
-      </w:rPr>
-    </w:lvl>
-    <w:lvl w:ilvl="1" w:tentative="1">
-      <w:start w:val="1"/>
-      <w:numFmt w:val="bullet"/>
-      <w:lvlText w:val="o"/>
-      <w:lvlJc w:val="left"/>
-      <w:pPr>
-        <w:tabs>
-          <w:tab w:val="num" w:pos="1440"/>
-        </w:tabs>
-        <w:ind w:left="1440" w:hanging="360"/>
-      </w:pPr>
-      <w:rPr>
-        <w:rFonts w:ascii="Courier New" w:hAnsi="Courier New" w:hint="default"/>
-        <w:sz w:val="20"/>
-      </w:rPr>
-    </w:lvl>
-    <w:lvl w:ilvl="2" w:tentative="1">
-      <w:start w:val="1"/>
-      <w:numFmt w:val="bullet"/>
-      <w:lvlText w:val=""/>
-      <w:lvlJc w:val="left"/>
-      <w:pPr>
-        <w:tabs>
-          <w:tab w:val="num" w:pos="2160"/>
-        </w:tabs>
-        <w:ind w:left="2160" w:hanging="360"/>
-      </w:pPr>
-      <w:rPr>
-        <w:rFonts w:ascii="Wingdings" w:hAnsi="Wingdings" w:hint="default"/>
-        <w:sz w:val="20"/>
-      </w:rPr>
-    </w:lvl>
-    <w:lvl w:ilvl="3" w:tentative="1">
-      <w:start w:val="1"/>
-      <w:numFmt w:val="bullet"/>
-      <w:lvlText w:val=""/>
-      <w:lvlJc w:val="left"/>
-      <w:pPr>
-        <w:tabs>
-          <w:tab w:val="num" w:pos="2880"/>
-        </w:tabs>
-        <w:ind w:left="2880" w:hanging="360"/>
-      </w:pPr>
-      <w:rPr>
-        <w:rFonts w:ascii="Wingdings" w:hAnsi="Wingdings" w:hint="default"/>
-        <w:sz w:val="20"/>
-      </w:rPr>
-    </w:lvl>
-    <w:lvl w:ilvl="4" w:tentative="1">
-      <w:start w:val="1"/>
-      <w:numFmt w:val="bullet"/>
-      <w:lvlText w:val=""/>
-      <w:lvlJc w:val="left"/>
-      <w:pPr>
-        <w:tabs>
-          <w:tab w:val="num" w:pos="3600"/>
-        </w:tabs>
-        <w:ind w:left="3600" w:hanging="360"/>
-      </w:pPr>
-      <w:rPr>
-        <w:rFonts w:ascii="Wingdings" w:hAnsi="Wingdings" w:hint="default"/>
-        <w:sz w:val="20"/>
-      </w:rPr>
-    </w:lvl>
-    <w:lvl w:ilvl="5" w:tentative="1">
-      <w:start w:val="1"/>
-      <w:numFmt w:val="bullet"/>
-      <w:lvlText w:val=""/>
-      <w:lvlJc w:val="left"/>
-      <w:pPr>
-        <w:tabs>
-          <w:tab w:val="num" w:pos="4320"/>
-        </w:tabs>
-        <w:ind w:left="4320" w:hanging="360"/>
-      </w:pPr>
-      <w:rPr>
-        <w:rFonts w:ascii="Wingdings" w:hAnsi="Wingdings" w:hint="default"/>
-        <w:sz w:val="20"/>
-      </w:rPr>
-    </w:lvl>
-    <w:lvl w:ilvl="6" w:tentative="1">
-      <w:start w:val="1"/>
-      <w:numFmt w:val="bullet"/>
-      <w:lvlText w:val=""/>
-      <w:lvlJc w:val="left"/>
-      <w:pPr>
-        <w:tabs>
-          <w:tab w:val="num" w:pos="5040"/>
-        </w:tabs>
-        <w:ind w:left="5040" w:hanging="360"/>
-      </w:pPr>
-      <w:rPr>
-        <w:rFonts w:ascii="Wingdings" w:hAnsi="Wingdings" w:hint="default"/>
-        <w:sz w:val="20"/>
-      </w:rPr>
-    </w:lvl>
-    <w:lvl w:ilvl="7" w:tentative="1">
-      <w:start w:val="1"/>
-      <w:numFmt w:val="bullet"/>
-      <w:lvlText w:val=""/>
-      <w:lvlJc w:val="left"/>
-      <w:pPr>
-        <w:tabs>
-          <w:tab w:val="num" w:pos="5760"/>
-        </w:tabs>
-        <w:ind w:left="5760" w:hanging="360"/>
-      </w:pPr>
-      <w:rPr>
-        <w:rFonts w:ascii="Wingdings" w:hAnsi="Wingdings" w:hint="default"/>
-        <w:sz w:val="20"/>
-      </w:rPr>
-    </w:lvl>
-    <w:lvl w:ilvl="8" w:tentative="1">
-      <w:start w:val="1"/>
-      <w:numFmt w:val="bullet"/>
-      <w:lvlText w:val=""/>
-      <w:lvlJc w:val="left"/>
-      <w:pPr>
-        <w:tabs>
-          <w:tab w:val="num" w:pos="6480"/>
-        </w:tabs>
-        <w:ind w:left="6480" w:hanging="360"/>
-      </w:pPr>
-      <w:rPr>
-        <w:rFonts w:ascii="Wingdings" w:hAnsi="Wingdings" w:hint="default"/>
-        <w:sz w:val="20"/>
-      </w:rPr>
-    </w:lvl>
-  </w:abstractNum>
-  <w:abstractNum w:abstractNumId="17" w15:restartNumberingAfterBreak="0">
-    <w:nsid w:val="6FEA24DC"/>
-    <w:multiLevelType w:val="multilevel"/>
-    <w:tmpl w:val="9B64EDEA"/>
-    <w:lvl w:ilvl="0">
-      <w:start w:val="1"/>
-      <w:numFmt w:val="bullet"/>
-      <w:lvlText w:val=""/>
-      <w:lvlJc w:val="left"/>
-      <w:pPr>
-        <w:tabs>
-          <w:tab w:val="num" w:pos="720"/>
-        </w:tabs>
-        <w:ind w:left="720" w:hanging="360"/>
-      </w:pPr>
-      <w:rPr>
-        <w:rFonts w:ascii="Symbol" w:hAnsi="Symbol" w:hint="default"/>
-        <w:sz w:val="20"/>
-      </w:rPr>
-    </w:lvl>
-    <w:lvl w:ilvl="1" w:tentative="1">
-      <w:start w:val="1"/>
-      <w:numFmt w:val="bullet"/>
-      <w:lvlText w:val="o"/>
-      <w:lvlJc w:val="left"/>
-      <w:pPr>
-        <w:tabs>
-          <w:tab w:val="num" w:pos="1440"/>
-        </w:tabs>
-        <w:ind w:left="1440" w:hanging="360"/>
-      </w:pPr>
-      <w:rPr>
-        <w:rFonts w:ascii="Courier New" w:hAnsi="Courier New" w:hint="default"/>
-        <w:sz w:val="20"/>
-      </w:rPr>
-    </w:lvl>
-    <w:lvl w:ilvl="2" w:tentative="1">
-      <w:start w:val="1"/>
-      <w:numFmt w:val="bullet"/>
-      <w:lvlText w:val=""/>
-      <w:lvlJc w:val="left"/>
-      <w:pPr>
-        <w:tabs>
-          <w:tab w:val="num" w:pos="2160"/>
-        </w:tabs>
-        <w:ind w:left="2160" w:hanging="360"/>
-      </w:pPr>
-      <w:rPr>
-        <w:rFonts w:ascii="Wingdings" w:hAnsi="Wingdings" w:hint="default"/>
-        <w:sz w:val="20"/>
-      </w:rPr>
-    </w:lvl>
-    <w:lvl w:ilvl="3" w:tentative="1">
-      <w:start w:val="1"/>
-      <w:numFmt w:val="bullet"/>
-      <w:lvlText w:val=""/>
-      <w:lvlJc w:val="left"/>
-      <w:pPr>
-        <w:tabs>
-          <w:tab w:val="num" w:pos="2880"/>
-        </w:tabs>
-        <w:ind w:left="2880" w:hanging="360"/>
-      </w:pPr>
-      <w:rPr>
-        <w:rFonts w:ascii="Wingdings" w:hAnsi="Wingdings" w:hint="default"/>
-        <w:sz w:val="20"/>
-      </w:rPr>
-    </w:lvl>
-    <w:lvl w:ilvl="4" w:tentative="1">
-      <w:start w:val="1"/>
-      <w:numFmt w:val="bullet"/>
-      <w:lvlText w:val=""/>
-      <w:lvlJc w:val="left"/>
-      <w:pPr>
-        <w:tabs>
-          <w:tab w:val="num" w:pos="3600"/>
-        </w:tabs>
-        <w:ind w:left="3600" w:hanging="360"/>
-      </w:pPr>
-      <w:rPr>
-        <w:rFonts w:ascii="Wingdings" w:hAnsi="Wingdings" w:hint="default"/>
-        <w:sz w:val="20"/>
-      </w:rPr>
-    </w:lvl>
-    <w:lvl w:ilvl="5" w:tentative="1">
-      <w:start w:val="1"/>
-      <w:numFmt w:val="bullet"/>
-      <w:lvlText w:val=""/>
-      <w:lvlJc w:val="left"/>
-      <w:pPr>
-        <w:tabs>
-          <w:tab w:val="num" w:pos="4320"/>
-        </w:tabs>
-        <w:ind w:left="4320" w:hanging="360"/>
-      </w:pPr>
-      <w:rPr>
-        <w:rFonts w:ascii="Wingdings" w:hAnsi="Wingdings" w:hint="default"/>
-        <w:sz w:val="20"/>
-      </w:rPr>
-    </w:lvl>
-    <w:lvl w:ilvl="6" w:tentative="1">
-      <w:start w:val="1"/>
-      <w:numFmt w:val="bullet"/>
-      <w:lvlText w:val=""/>
-      <w:lvlJc w:val="left"/>
-      <w:pPr>
-        <w:tabs>
-          <w:tab w:val="num" w:pos="5040"/>
-        </w:tabs>
-        <w:ind w:left="5040" w:hanging="360"/>
-      </w:pPr>
-      <w:rPr>
-        <w:rFonts w:ascii="Wingdings" w:hAnsi="Wingdings" w:hint="default"/>
-        <w:sz w:val="20"/>
-      </w:rPr>
-    </w:lvl>
-    <w:lvl w:ilvl="7" w:tentative="1">
-      <w:start w:val="1"/>
-      <w:numFmt w:val="bullet"/>
-      <w:lvlText w:val=""/>
-      <w:lvlJc w:val="left"/>
-      <w:pPr>
-        <w:tabs>
-          <w:tab w:val="num" w:pos="5760"/>
-        </w:tabs>
-        <w:ind w:left="5760" w:hanging="360"/>
-      </w:pPr>
-      <w:rPr>
-        <w:rFonts w:ascii="Wingdings" w:hAnsi="Wingdings" w:hint="default"/>
-        <w:sz w:val="20"/>
-      </w:rPr>
-    </w:lvl>
-    <w:lvl w:ilvl="8" w:tentative="1">
-      <w:start w:val="1"/>
-      <w:numFmt w:val="bullet"/>
-      <w:lvlText w:val=""/>
-      <w:lvlJc w:val="left"/>
-      <w:pPr>
-        <w:tabs>
-          <w:tab w:val="num" w:pos="6480"/>
-        </w:tabs>
-        <w:ind w:left="6480" w:hanging="360"/>
-      </w:pPr>
-      <w:rPr>
-        <w:rFonts w:ascii="Wingdings" w:hAnsi="Wingdings" w:hint="default"/>
-        <w:sz w:val="20"/>
-      </w:rPr>
     </w:lvl>
   </w:abstractNum>
   <w:abstractNum w:abstractNumId="18" w15:restartNumberingAfterBreak="0">
-    <w:nsid w:val="706944AB"/>
+    <w:nsid w:val="67393C57"/>
     <w:multiLevelType w:val="multilevel"/>
-    <w:tmpl w:val="390ABDEE"/>
+    <w:tmpl w:val="15EA21A0"/>
     <w:lvl w:ilvl="0">
       <w:start w:val="1"/>
       <w:numFmt w:val="bullet"/>
@@ -8135,9 +8121,9 @@
     </w:lvl>
   </w:abstractNum>
   <w:abstractNum w:abstractNumId="19" w15:restartNumberingAfterBreak="0">
-    <w:nsid w:val="71645BBA"/>
+    <w:nsid w:val="730F5111"/>
     <w:multiLevelType w:val="multilevel"/>
-    <w:tmpl w:val="69CA0356"/>
+    <w:tmpl w:val="8042E268"/>
     <w:lvl w:ilvl="0">
       <w:start w:val="1"/>
       <w:numFmt w:val="bullet"/>
@@ -8284,13 +8270,13 @@
     </w:lvl>
   </w:abstractNum>
   <w:abstractNum w:abstractNumId="20" w15:restartNumberingAfterBreak="0">
-    <w:nsid w:val="724D504C"/>
+    <w:nsid w:val="77D21196"/>
     <w:multiLevelType w:val="multilevel"/>
-    <w:tmpl w:val="7AFA5530"/>
+    <w:tmpl w:val="B3CE6316"/>
     <w:lvl w:ilvl="0">
       <w:start w:val="1"/>
-      <w:numFmt w:val="decimal"/>
-      <w:lvlText w:val="%1."/>
+      <w:numFmt w:val="bullet"/>
+      <w:lvlText w:val=""/>
       <w:lvlJc w:val="left"/>
       <w:pPr>
         <w:tabs>
@@ -8298,8 +8284,12 @@
         </w:tabs>
         <w:ind w:left="720" w:hanging="360"/>
       </w:pPr>
-    </w:lvl>
-    <w:lvl w:ilvl="1">
+      <w:rPr>
+        <w:rFonts w:ascii="Symbol" w:hAnsi="Symbol" w:hint="default"/>
+        <w:sz w:val="20"/>
+      </w:rPr>
+    </w:lvl>
+    <w:lvl w:ilvl="1" w:tentative="1">
       <w:start w:val="1"/>
       <w:numFmt w:val="bullet"/>
       <w:lvlText w:val="o"/>
@@ -8317,8 +8307,8 @@
     </w:lvl>
     <w:lvl w:ilvl="2" w:tentative="1">
       <w:start w:val="1"/>
-      <w:numFmt w:val="decimal"/>
-      <w:lvlText w:val="%3."/>
+      <w:numFmt w:val="bullet"/>
+      <w:lvlText w:val=""/>
       <w:lvlJc w:val="left"/>
       <w:pPr>
         <w:tabs>
@@ -8326,11 +8316,15 @@
         </w:tabs>
         <w:ind w:left="2160" w:hanging="360"/>
       </w:pPr>
+      <w:rPr>
+        <w:rFonts w:ascii="Wingdings" w:hAnsi="Wingdings" w:hint="default"/>
+        <w:sz w:val="20"/>
+      </w:rPr>
     </w:lvl>
     <w:lvl w:ilvl="3" w:tentative="1">
       <w:start w:val="1"/>
-      <w:numFmt w:val="decimal"/>
-      <w:lvlText w:val="%4."/>
+      <w:numFmt w:val="bullet"/>
+      <w:lvlText w:val=""/>
       <w:lvlJc w:val="left"/>
       <w:pPr>
         <w:tabs>
@@ -8338,11 +8332,15 @@
         </w:tabs>
         <w:ind w:left="2880" w:hanging="360"/>
       </w:pPr>
+      <w:rPr>
+        <w:rFonts w:ascii="Wingdings" w:hAnsi="Wingdings" w:hint="default"/>
+        <w:sz w:val="20"/>
+      </w:rPr>
     </w:lvl>
     <w:lvl w:ilvl="4" w:tentative="1">
       <w:start w:val="1"/>
-      <w:numFmt w:val="decimal"/>
-      <w:lvlText w:val="%5."/>
+      <w:numFmt w:val="bullet"/>
+      <w:lvlText w:val=""/>
       <w:lvlJc w:val="left"/>
       <w:pPr>
         <w:tabs>
@@ -8350,11 +8348,15 @@
         </w:tabs>
         <w:ind w:left="3600" w:hanging="360"/>
       </w:pPr>
+      <w:rPr>
+        <w:rFonts w:ascii="Wingdings" w:hAnsi="Wingdings" w:hint="default"/>
+        <w:sz w:val="20"/>
+      </w:rPr>
     </w:lvl>
     <w:lvl w:ilvl="5" w:tentative="1">
       <w:start w:val="1"/>
-      <w:numFmt w:val="decimal"/>
-      <w:lvlText w:val="%6."/>
+      <w:numFmt w:val="bullet"/>
+      <w:lvlText w:val=""/>
       <w:lvlJc w:val="left"/>
       <w:pPr>
         <w:tabs>
@@ -8362,11 +8364,15 @@
         </w:tabs>
         <w:ind w:left="4320" w:hanging="360"/>
       </w:pPr>
+      <w:rPr>
+        <w:rFonts w:ascii="Wingdings" w:hAnsi="Wingdings" w:hint="default"/>
+        <w:sz w:val="20"/>
+      </w:rPr>
     </w:lvl>
     <w:lvl w:ilvl="6" w:tentative="1">
       <w:start w:val="1"/>
-      <w:numFmt w:val="decimal"/>
-      <w:lvlText w:val="%7."/>
+      <w:numFmt w:val="bullet"/>
+      <w:lvlText w:val=""/>
       <w:lvlJc w:val="left"/>
       <w:pPr>
         <w:tabs>
@@ -8374,11 +8380,15 @@
         </w:tabs>
         <w:ind w:left="5040" w:hanging="360"/>
       </w:pPr>
+      <w:rPr>
+        <w:rFonts w:ascii="Wingdings" w:hAnsi="Wingdings" w:hint="default"/>
+        <w:sz w:val="20"/>
+      </w:rPr>
     </w:lvl>
     <w:lvl w:ilvl="7" w:tentative="1">
       <w:start w:val="1"/>
-      <w:numFmt w:val="decimal"/>
-      <w:lvlText w:val="%8."/>
+      <w:numFmt w:val="bullet"/>
+      <w:lvlText w:val=""/>
       <w:lvlJc w:val="left"/>
       <w:pPr>
         <w:tabs>
@@ -8386,11 +8396,15 @@
         </w:tabs>
         <w:ind w:left="5760" w:hanging="360"/>
       </w:pPr>
+      <w:rPr>
+        <w:rFonts w:ascii="Wingdings" w:hAnsi="Wingdings" w:hint="default"/>
+        <w:sz w:val="20"/>
+      </w:rPr>
     </w:lvl>
     <w:lvl w:ilvl="8" w:tentative="1">
       <w:start w:val="1"/>
-      <w:numFmt w:val="decimal"/>
-      <w:lvlText w:val="%9."/>
+      <w:numFmt w:val="bullet"/>
+      <w:lvlText w:val=""/>
       <w:lvlJc w:val="left"/>
       <w:pPr>
         <w:tabs>
@@ -8398,70 +8412,74 @@
         </w:tabs>
         <w:ind w:left="6480" w:hanging="360"/>
       </w:pPr>
+      <w:rPr>
+        <w:rFonts w:ascii="Wingdings" w:hAnsi="Wingdings" w:hint="default"/>
+        <w:sz w:val="20"/>
+      </w:rPr>
     </w:lvl>
   </w:abstractNum>
-  <w:num w:numId="1" w16cid:durableId="1407991367">
+  <w:num w:numId="1" w16cid:durableId="46035603">
+    <w:abstractNumId w:val="13"/>
+  </w:num>
+  <w:num w:numId="2" w16cid:durableId="2054621723">
     <w:abstractNumId w:val="3"/>
   </w:num>
-  <w:num w:numId="2" w16cid:durableId="1640069681">
+  <w:num w:numId="3" w16cid:durableId="704989097">
+    <w:abstractNumId w:val="16"/>
+  </w:num>
+  <w:num w:numId="4" w16cid:durableId="1315178238">
+    <w:abstractNumId w:val="14"/>
+  </w:num>
+  <w:num w:numId="5" w16cid:durableId="1066340888">
+    <w:abstractNumId w:val="18"/>
+  </w:num>
+  <w:num w:numId="6" w16cid:durableId="1614630035">
+    <w:abstractNumId w:val="10"/>
+  </w:num>
+  <w:num w:numId="7" w16cid:durableId="218640175">
+    <w:abstractNumId w:val="12"/>
+  </w:num>
+  <w:num w:numId="8" w16cid:durableId="1676808574">
+    <w:abstractNumId w:val="8"/>
+  </w:num>
+  <w:num w:numId="9" w16cid:durableId="1639457666">
+    <w:abstractNumId w:val="4"/>
+  </w:num>
+  <w:num w:numId="10" w16cid:durableId="1246763121">
+    <w:abstractNumId w:val="17"/>
+  </w:num>
+  <w:num w:numId="11" w16cid:durableId="1837845428">
+    <w:abstractNumId w:val="9"/>
+  </w:num>
+  <w:num w:numId="12" w16cid:durableId="339241265">
+    <w:abstractNumId w:val="0"/>
+  </w:num>
+  <w:num w:numId="13" w16cid:durableId="233056446">
+    <w:abstractNumId w:val="7"/>
+  </w:num>
+  <w:num w:numId="14" w16cid:durableId="1655716558">
+    <w:abstractNumId w:val="2"/>
+  </w:num>
+  <w:num w:numId="15" w16cid:durableId="2073036692">
+    <w:abstractNumId w:val="5"/>
+  </w:num>
+  <w:num w:numId="16" w16cid:durableId="1150443154">
     <w:abstractNumId w:val="11"/>
   </w:num>
-  <w:num w:numId="3" w16cid:durableId="1213687433">
+  <w:num w:numId="17" w16cid:durableId="797182265">
+    <w:abstractNumId w:val="15"/>
+  </w:num>
+  <w:num w:numId="18" w16cid:durableId="1698118322">
     <w:abstractNumId w:val="20"/>
   </w:num>
-  <w:num w:numId="4" w16cid:durableId="703754259">
-    <w:abstractNumId w:val="10"/>
-  </w:num>
-  <w:num w:numId="5" w16cid:durableId="2057700914">
-    <w:abstractNumId w:val="14"/>
-  </w:num>
-  <w:num w:numId="6" w16cid:durableId="1185552428">
-    <w:abstractNumId w:val="15"/>
-  </w:num>
-  <w:num w:numId="7" w16cid:durableId="929393942">
-    <w:abstractNumId w:val="2"/>
-  </w:num>
-  <w:num w:numId="8" w16cid:durableId="1554806814">
-    <w:abstractNumId w:val="4"/>
-  </w:num>
-  <w:num w:numId="9" w16cid:durableId="75826894">
-    <w:abstractNumId w:val="18"/>
-  </w:num>
-  <w:num w:numId="10" w16cid:durableId="1320767944">
-    <w:abstractNumId w:val="9"/>
-  </w:num>
-  <w:num w:numId="11" w16cid:durableId="1696493887">
-    <w:abstractNumId w:val="7"/>
-  </w:num>
-  <w:num w:numId="12" w16cid:durableId="1489595333">
-    <w:abstractNumId w:val="13"/>
-  </w:num>
-  <w:num w:numId="13" w16cid:durableId="993605542">
-    <w:abstractNumId w:val="5"/>
-  </w:num>
-  <w:num w:numId="14" w16cid:durableId="62216674">
+  <w:num w:numId="19" w16cid:durableId="993216299">
     <w:abstractNumId w:val="1"/>
   </w:num>
-  <w:num w:numId="15" w16cid:durableId="2016568292">
-    <w:abstractNumId w:val="17"/>
+  <w:num w:numId="20" w16cid:durableId="922763927">
+    <w:abstractNumId w:val="19"/>
   </w:num>
-  <w:num w:numId="16" w16cid:durableId="372311478">
-    <w:abstractNumId w:val="12"/>
-  </w:num>
-  <w:num w:numId="17" w16cid:durableId="1025861835">
-    <w:abstractNumId w:val="8"/>
-  </w:num>
-  <w:num w:numId="18" w16cid:durableId="831137680">
-    <w:abstractNumId w:val="16"/>
-  </w:num>
-  <w:num w:numId="19" w16cid:durableId="506529166">
-    <w:abstractNumId w:val="0"/>
-  </w:num>
-  <w:num w:numId="20" w16cid:durableId="252981610">
+  <w:num w:numId="21" w16cid:durableId="1738362552">
     <w:abstractNumId w:val="6"/>
-  </w:num>
-  <w:num w:numId="21" w16cid:durableId="767850884">
-    <w:abstractNumId w:val="19"/>
   </w:num>
 </w:numbering>
 </file>

</xml_diff>

<commit_message>
follow-along: PDF and Word copies rebuilt
Co-Authored-By: Claude Opus 5.5 <noreply@anthropic.com>
</commit_message>
<xml_diff>
--- a/follow-along/Azure_Local_Follow_Along_Guide.docx
+++ b/follow-along/Azure_Local_Follow_Along_Guide.docx
@@ -1194,7 +1194,7 @@
           <w:szCs w:val="21"/>
           <w:lang w:val="en"/>
         </w:rPr>
-        <w:t xml:space="preserve"> Try right-sizing (measured P95 instead of allocation), fewer VMs in the first wave, or more memory per node or a third node (Size from workloads). Then open Storage Design and change the storage basis (provisioned or consumed). </w:t>
+        <w:t xml:space="preserve"> Try right-sizing (measured P95 instead of allocation) or fewer VMs in the first wave. Then open Storage Design and change the storage basis (provisioned or consumed). </w:t>
       </w:r>
     </w:p>
     <w:p>
@@ -1583,7 +1583,17 @@
           <w:szCs w:val="21"/>
           <w:lang w:val="en"/>
         </w:rPr>
-        <w:t xml:space="preserve"> In the management network step, change the end address so the IP pool holds only five addresses. </w:t>
+        <w:t xml:space="preserve"> </w:t>
+      </w:r>
+      <w:r>
+        <w:rPr>
+          <w:rFonts w:ascii="Segoe UI" w:eastAsia="Times New Roman" w:hAnsi="Segoe UI" w:cs="Segoe UI"/>
+          <w:color w:val="1B2430"/>
+          <w:sz w:val="21"/>
+          <w:szCs w:val="21"/>
+          <w:lang w:val="en"/>
+        </w:rPr>
+        <w:t xml:space="preserve">In the management network step, change the end address so the IP pool holds only five addresses. </w:t>
       </w:r>
     </w:p>
     <w:p>
@@ -1646,17 +1656,7 @@
           <w:szCs w:val="21"/>
           <w:lang w:val="en"/>
         </w:rPr>
-        <w:t xml:space="preserve"> </w:t>
-      </w:r>
-      <w:r>
-        <w:rPr>
-          <w:rFonts w:ascii="Segoe UI" w:eastAsia="Times New Roman" w:hAnsi="Segoe UI" w:cs="Segoe UI"/>
-          <w:color w:val="1B2430"/>
-          <w:sz w:val="21"/>
-          <w:szCs w:val="21"/>
-          <w:lang w:val="en"/>
-        </w:rPr>
-        <w:t xml:space="preserve">Widen the pool to six or more addresses (or restore the original end address), then review the network intents, identity and connectivity steps. </w:t>
+        <w:t xml:space="preserve"> Widen the pool to six or more addresses (or restore the original end address), then review the network intents, identity and connectivity steps. </w:t>
       </w:r>
     </w:p>
     <w:p>
@@ -1719,7 +1719,17 @@
           <w:szCs w:val="21"/>
           <w:lang w:val="en"/>
         </w:rPr>
-        <w:t xml:space="preserve"> Export infrastructure.yml (and, if you want, the Bicep parameter starting point) and open it in an editor. </w:t>
+        <w:t xml:space="preserve"> </w:t>
+      </w:r>
+      <w:r>
+        <w:rPr>
+          <w:rFonts w:ascii="Segoe UI" w:eastAsia="Times New Roman" w:hAnsi="Segoe UI" w:cs="Segoe UI"/>
+          <w:color w:val="1B2430"/>
+          <w:sz w:val="21"/>
+          <w:szCs w:val="21"/>
+          <w:lang w:val="en"/>
+        </w:rPr>
+        <w:t xml:space="preserve">Export infrastructure.yml (and, if you want, the Bicep parameter starting point) and open it in an editor. </w:t>
       </w:r>
     </w:p>
     <w:p>
@@ -1977,17 +1987,7 @@
           <w:szCs w:val="21"/>
           <w:lang w:val="en"/>
         </w:rPr>
-        <w:t xml:space="preserve"> </w:t>
-      </w:r>
-      <w:r>
-        <w:rPr>
-          <w:rFonts w:ascii="Segoe UI" w:hAnsi="Segoe UI" w:cs="Segoe UI"/>
-          <w:color w:val="1B2430"/>
-          <w:sz w:val="21"/>
-          <w:szCs w:val="21"/>
-          <w:lang w:val="en"/>
-        </w:rPr>
-        <w:t>Generate and preview an Azure Local deployment without creating anything.</w:t>
+        <w:t xml:space="preserve"> Generate and preview an Azure Local deployment without creating anything.</w:t>
       </w:r>
     </w:p>
     <w:p>
@@ -2200,7 +2200,17 @@
           <w:szCs w:val="21"/>
           <w:lang w:val="en"/>
         </w:rPr>
-        <w:t xml:space="preserve"> Copy the two example environment files (shared values and Azure Local values) and replace the values with yours: names, nodes, IP pool, VLANs.</w:t>
+        <w:t xml:space="preserve"> </w:t>
+      </w:r>
+      <w:r>
+        <w:rPr>
+          <w:rFonts w:ascii="Segoe UI" w:hAnsi="Segoe UI" w:cs="Segoe UI"/>
+          <w:color w:val="1B2430"/>
+          <w:sz w:val="21"/>
+          <w:szCs w:val="21"/>
+          <w:lang w:val="en"/>
+        </w:rPr>
+        <w:t>Copy the two example environment files (shared values and Azure Local values) and replace the values with yours: names, nodes, IP pool, VLANs.</w:t>
       </w:r>
     </w:p>
     <w:p>
@@ -2481,7 +2491,17 @@
           <w:szCs w:val="21"/>
           <w:lang w:val="en"/>
         </w:rPr>
-        <w:t xml:space="preserve"> The what-if runs against your subscription and creates nothing. The script reads through Az PowerShell and runs the what-if with the Azure CLI, so sign in to both.</w:t>
+        <w:t xml:space="preserve"> </w:t>
+      </w:r>
+      <w:r>
+        <w:rPr>
+          <w:rFonts w:ascii="Segoe UI" w:hAnsi="Segoe UI" w:cs="Segoe UI"/>
+          <w:color w:val="1B2430"/>
+          <w:sz w:val="21"/>
+          <w:szCs w:val="21"/>
+          <w:lang w:val="en"/>
+        </w:rPr>
+        <w:t>The what-if runs against your subscription and creates nothing. The script reads through Az PowerShell and runs the what-if with the Azure CLI, so sign in to both.</w:t>
       </w:r>
     </w:p>
     <w:p>
@@ -2731,17 +2751,7 @@
           <w:szCs w:val="21"/>
           <w:lang w:val="en"/>
         </w:rPr>
-        <w:t xml:space="preserve"> </w:t>
-      </w:r>
-      <w:r>
-        <w:rPr>
-          <w:rFonts w:ascii="Segoe UI" w:hAnsi="Segoe UI" w:cs="Segoe UI"/>
-          <w:color w:val="1B2430"/>
-          <w:sz w:val="21"/>
-          <w:szCs w:val="21"/>
-          <w:lang w:val="en"/>
-        </w:rPr>
-        <w:t>Compare the output with the Environment Checker results. Platform-side checks run only during the Validate pass in Azure.</w:t>
+        <w:t xml:space="preserve"> Compare the output with the Environment Checker results. Platform-side checks run only during the Validate pass in Azure.</w:t>
       </w:r>
     </w:p>
     <w:p>
@@ -3041,7 +3051,17 @@
           <w:szCs w:val="21"/>
           <w:lang w:val="en"/>
         </w:rPr>
-        <w:t xml:space="preserve"> Understand the Azure Migrate discovery route to Azure Local.</w:t>
+        <w:t xml:space="preserve"> </w:t>
+      </w:r>
+      <w:r>
+        <w:rPr>
+          <w:rFonts w:ascii="Segoe UI" w:hAnsi="Segoe UI" w:cs="Segoe UI"/>
+          <w:color w:val="1B2430"/>
+          <w:sz w:val="21"/>
+          <w:szCs w:val="21"/>
+          <w:lang w:val="en"/>
+        </w:rPr>
+        <w:t>Understand the Azure Migrate discovery route to Azure Local.</w:t>
       </w:r>
     </w:p>
     <w:p>
@@ -4039,7 +4059,17 @@
           <w:szCs w:val="21"/>
           <w:lang w:val="en"/>
         </w:rPr>
-        <w:t xml:space="preserve"> Read the monitoring artefacts.</w:t>
+        <w:t xml:space="preserve"> </w:t>
+      </w:r>
+      <w:r>
+        <w:rPr>
+          <w:rFonts w:ascii="Segoe UI" w:hAnsi="Segoe UI" w:cs="Segoe UI"/>
+          <w:color w:val="1B2430"/>
+          <w:sz w:val="21"/>
+          <w:szCs w:val="21"/>
+          <w:lang w:val="en"/>
+        </w:rPr>
+        <w:t>Read the monitoring artefacts.</w:t>
       </w:r>
     </w:p>
     <w:p>
@@ -4507,17 +4537,7 @@
           <w:szCs w:val="21"/>
           <w:lang w:val="en"/>
         </w:rPr>
-        <w:t xml:space="preserve"> </w:t>
-      </w:r>
-      <w:r>
-        <w:rPr>
-          <w:rFonts w:ascii="Segoe UI" w:hAnsi="Segoe UI" w:cs="Segoe UI"/>
-          <w:color w:val="1B2430"/>
-          <w:sz w:val="21"/>
-          <w:szCs w:val="21"/>
-          <w:lang w:val="en"/>
-        </w:rPr>
-        <w:t>Read how logical networks and network security groups are defined for each workload tier on an Azure Local instance with SDN enabled by Azure Arc.</w:t>
+        <w:t xml:space="preserve"> Read how logical networks and network security groups are defined for each workload tier on an Azure Local instance with SDN enabled by Azure Arc.</w:t>
       </w:r>
     </w:p>
     <w:p>
@@ -4757,17 +4777,7 @@
           <w:szCs w:val="21"/>
           <w:lang w:val="en"/>
         </w:rPr>
-        <w:t xml:space="preserve"> </w:t>
-      </w:r>
-      <w:r>
-        <w:rPr>
-          <w:rFonts w:ascii="Segoe UI" w:eastAsia="Times New Roman" w:hAnsi="Segoe UI" w:cs="Segoe UI"/>
-          <w:color w:val="1B2430"/>
-          <w:sz w:val="21"/>
-          <w:szCs w:val="21"/>
-          <w:lang w:val="en"/>
-        </w:rPr>
-        <w:t>Read Steps 2 and 3 of 'Discover and replicate VMware VMs' (</w:t>
+        <w:t xml:space="preserve"> Read Steps 2 and 3 of 'Discover and replicate VMware VMs' (</w:t>
       </w:r>
       <w:hyperlink r:id="rId8" w:history="1">
         <w:r>
@@ -4852,17 +4862,7 @@
           <w:szCs w:val="21"/>
           <w:lang w:val="en"/>
         </w:rPr>
-        <w:t xml:space="preserve"> </w:t>
-      </w:r>
-      <w:r>
-        <w:rPr>
-          <w:rFonts w:ascii="Segoe UI" w:eastAsia="Times New Roman" w:hAnsi="Segoe UI" w:cs="Segoe UI"/>
-          <w:color w:val="1B2430"/>
-          <w:sz w:val="21"/>
-          <w:szCs w:val="21"/>
-          <w:lang w:val="en"/>
-        </w:rPr>
-        <w:t>Read 'Migrate VMware VMs to Azure Local' (</w:t>
+        <w:t xml:space="preserve"> Read 'Migrate VMware VMs to Azure Local' (</w:t>
       </w:r>
       <w:hyperlink r:id="rId9" w:history="1">
         <w:r>
@@ -5473,7 +5473,17 @@
           <w:szCs w:val="21"/>
           <w:lang w:val="en"/>
         </w:rPr>
-        <w:t>You should see: The issue is listed under Monitor &gt; Issues with the investigation attached.</w:t>
+        <w:t xml:space="preserve">You should see: The issue is listed under Monitor &gt; </w:t>
+      </w:r>
+      <w:r>
+        <w:rPr>
+          <w:rFonts w:ascii="Segoe UI" w:eastAsia="Times New Roman" w:hAnsi="Segoe UI" w:cs="Segoe UI"/>
+          <w:color w:val="1B2430"/>
+          <w:sz w:val="21"/>
+          <w:szCs w:val="21"/>
+          <w:lang w:val="en"/>
+        </w:rPr>
+        <w:t>Issues with the investigation attached.</w:t>
       </w:r>
     </w:p>
     <w:p>
@@ -5898,7 +5908,17 @@
           <w:szCs w:val="21"/>
           <w:lang w:val="en"/>
         </w:rPr>
-        <w:t xml:space="preserve"> Read 'Understand and monitor storage resync' (</w:t>
+        <w:t xml:space="preserve"> </w:t>
+      </w:r>
+      <w:r>
+        <w:rPr>
+          <w:rFonts w:ascii="Segoe UI" w:eastAsia="Times New Roman" w:hAnsi="Segoe UI" w:cs="Segoe UI"/>
+          <w:color w:val="1B2430"/>
+          <w:sz w:val="21"/>
+          <w:szCs w:val="21"/>
+          <w:lang w:val="en"/>
+        </w:rPr>
+        <w:t>Read 'Understand and monitor storage resync' (</w:t>
       </w:r>
       <w:hyperlink r:id="rId15" w:history="1">
         <w:r>
@@ -6434,17 +6454,7 @@
           <w:szCs w:val="21"/>
           <w:lang w:val="en"/>
         </w:rPr>
-        <w:t xml:space="preserve"> </w:t>
-      </w:r>
-      <w:r>
-        <w:rPr>
-          <w:rFonts w:ascii="Segoe UI" w:hAnsi="Segoe UI" w:cs="Segoe UI"/>
-          <w:color w:val="1B2430"/>
-          <w:sz w:val="21"/>
-          <w:szCs w:val="21"/>
-          <w:lang w:val="en"/>
-        </w:rPr>
-        <w:t>Faults are run only on the lab cluster.</w:t>
+        <w:t xml:space="preserve"> Faults are run only on the lab cluster.</w:t>
       </w:r>
     </w:p>
     <w:p>
@@ -6501,13 +6511,13 @@
 <file path=word/numbering.xml><?xml version="1.0" encoding="utf-8"?>
 <w:numbering xmlns:wpc="http://schemas.microsoft.com/office/word/2010/wordprocessingCanvas" xmlns:cx="http://schemas.microsoft.com/office/drawing/2014/chartex" xmlns:cx1="http://schemas.microsoft.com/office/drawing/2015/9/8/chartex" xmlns:cx2="http://schemas.microsoft.com/office/drawing/2015/10/21/chartex" xmlns:cx3="http://schemas.microsoft.com/office/drawing/2016/5/9/chartex" xmlns:cx4="http://schemas.microsoft.com/office/drawing/2016/5/10/chartex" xmlns:cx5="http://schemas.microsoft.com/office/drawing/2016/5/11/chartex" xmlns:cx6="http://schemas.microsoft.com/office/drawing/2016/5/12/chartex" xmlns:cx7="http://schemas.microsoft.com/office/drawing/2016/5/13/chartex" xmlns:cx8="http://schemas.microsoft.com/office/drawing/2016/5/14/chartex" xmlns:mc="http://schemas.openxmlformats.org/markup-compatibility/2006" xmlns:aink="http://schemas.microsoft.com/office/drawing/2016/ink" xmlns:am3d="http://schemas.microsoft.com/office/drawing/2017/model3d" xmlns:o="urn:schemas-microsoft-com:office:office" xmlns:oel="http://schemas.microsoft.com/office/2019/extlst" xmlns:r="http://schemas.openxmlformats.org/officeDocument/2006/relationships" xmlns:m="http://schemas.openxmlformats.org/officeDocument/2006/math" xmlns:v="urn:schemas-microsoft-com:vml" xmlns:wp14="http://schemas.microsoft.com/office/word/2010/wordprocessingDrawing" xmlns:wp="http://schemas.openxmlformats.org/drawingml/2006/wordprocessingDrawing" xmlns:w10="urn:schemas-microsoft-com:office:word" xmlns:w="http://schemas.openxmlformats.org/wordprocessingml/2006/main" xmlns:w14="http://schemas.microsoft.com/office/word/2010/wordml" xmlns:w15="http://schemas.microsoft.com/office/word/2012/wordml" xmlns:w16cex="http://schemas.microsoft.com/office/word/2018/wordml/cex" xmlns:w16cid="http://schemas.microsoft.com/office/word/2016/wordml/cid" xmlns:w16="http://schemas.microsoft.com/office/word/2018/wordml" xmlns:w16du="http://schemas.microsoft.com/office/word/2023/wordml/word16du" xmlns:w16sdtdh="http://schemas.microsoft.com/office/word/2020/wordml/sdtdatahash" xmlns:w16sdtfl="http://schemas.microsoft.com/office/word/2024/wordml/sdtformatlock" xmlns:w16se="http://schemas.microsoft.com/office/word/2015/wordml/symex" xmlns:wpg="http://schemas.microsoft.com/office/word/2010/wordprocessingGroup" xmlns:wpi="http://schemas.microsoft.com/office/word/2010/wordprocessingInk" xmlns:wne="http://schemas.microsoft.com/office/word/2006/wordml" xmlns:wps="http://schemas.microsoft.com/office/word/2010/wordprocessingShape" mc:Ignorable="w14 w15 w16se w16cid w16 w16cex w16sdtdh w16sdtfl w16du wp14">
   <w:abstractNum w:abstractNumId="0" w15:restartNumberingAfterBreak="0">
-    <w:nsid w:val="00B147DE"/>
+    <w:nsid w:val="045720A3"/>
     <w:multiLevelType w:val="multilevel"/>
-    <w:tmpl w:val="AA889D50"/>
+    <w:tmpl w:val="A83806B2"/>
     <w:lvl w:ilvl="0">
       <w:start w:val="1"/>
-      <w:numFmt w:val="bullet"/>
-      <w:lvlText w:val=""/>
+      <w:numFmt w:val="decimal"/>
+      <w:lvlText w:val="%1."/>
       <w:lvlJc w:val="left"/>
       <w:pPr>
         <w:tabs>
@@ -6515,12 +6525,8 @@
         </w:tabs>
         <w:ind w:left="720" w:hanging="360"/>
       </w:pPr>
-      <w:rPr>
-        <w:rFonts w:ascii="Symbol" w:hAnsi="Symbol" w:hint="default"/>
-        <w:sz w:val="20"/>
-      </w:rPr>
-    </w:lvl>
-    <w:lvl w:ilvl="1" w:tentative="1">
+    </w:lvl>
+    <w:lvl w:ilvl="1">
       <w:start w:val="1"/>
       <w:numFmt w:val="bullet"/>
       <w:lvlText w:val="o"/>
@@ -6538,8 +6544,8 @@
     </w:lvl>
     <w:lvl w:ilvl="2" w:tentative="1">
       <w:start w:val="1"/>
-      <w:numFmt w:val="bullet"/>
-      <w:lvlText w:val=""/>
+      <w:numFmt w:val="decimal"/>
+      <w:lvlText w:val="%3."/>
       <w:lvlJc w:val="left"/>
       <w:pPr>
         <w:tabs>
@@ -6547,15 +6553,11 @@
         </w:tabs>
         <w:ind w:left="2160" w:hanging="360"/>
       </w:pPr>
-      <w:rPr>
-        <w:rFonts w:ascii="Wingdings" w:hAnsi="Wingdings" w:hint="default"/>
-        <w:sz w:val="20"/>
-      </w:rPr>
     </w:lvl>
     <w:lvl w:ilvl="3" w:tentative="1">
       <w:start w:val="1"/>
-      <w:numFmt w:val="bullet"/>
-      <w:lvlText w:val=""/>
+      <w:numFmt w:val="decimal"/>
+      <w:lvlText w:val="%4."/>
       <w:lvlJc w:val="left"/>
       <w:pPr>
         <w:tabs>
@@ -6563,15 +6565,11 @@
         </w:tabs>
         <w:ind w:left="2880" w:hanging="360"/>
       </w:pPr>
-      <w:rPr>
-        <w:rFonts w:ascii="Wingdings" w:hAnsi="Wingdings" w:hint="default"/>
-        <w:sz w:val="20"/>
-      </w:rPr>
     </w:lvl>
     <w:lvl w:ilvl="4" w:tentative="1">
       <w:start w:val="1"/>
-      <w:numFmt w:val="bullet"/>
-      <w:lvlText w:val=""/>
+      <w:numFmt w:val="decimal"/>
+      <w:lvlText w:val="%5."/>
       <w:lvlJc w:val="left"/>
       <w:pPr>
         <w:tabs>
@@ -6579,15 +6577,11 @@
         </w:tabs>
         <w:ind w:left="3600" w:hanging="360"/>
       </w:pPr>
-      <w:rPr>
-        <w:rFonts w:ascii="Wingdings" w:hAnsi="Wingdings" w:hint="default"/>
-        <w:sz w:val="20"/>
-      </w:rPr>
     </w:lvl>
     <w:lvl w:ilvl="5" w:tentative="1">
       <w:start w:val="1"/>
-      <w:numFmt w:val="bullet"/>
-      <w:lvlText w:val=""/>
+      <w:numFmt w:val="decimal"/>
+      <w:lvlText w:val="%6."/>
       <w:lvlJc w:val="left"/>
       <w:pPr>
         <w:tabs>
@@ -6595,15 +6589,11 @@
         </w:tabs>
         <w:ind w:left="4320" w:hanging="360"/>
       </w:pPr>
-      <w:rPr>
-        <w:rFonts w:ascii="Wingdings" w:hAnsi="Wingdings" w:hint="default"/>
-        <w:sz w:val="20"/>
-      </w:rPr>
     </w:lvl>
     <w:lvl w:ilvl="6" w:tentative="1">
       <w:start w:val="1"/>
-      <w:numFmt w:val="bullet"/>
-      <w:lvlText w:val=""/>
+      <w:numFmt w:val="decimal"/>
+      <w:lvlText w:val="%7."/>
       <w:lvlJc w:val="left"/>
       <w:pPr>
         <w:tabs>
@@ -6611,15 +6601,11 @@
         </w:tabs>
         <w:ind w:left="5040" w:hanging="360"/>
       </w:pPr>
-      <w:rPr>
-        <w:rFonts w:ascii="Wingdings" w:hAnsi="Wingdings" w:hint="default"/>
-        <w:sz w:val="20"/>
-      </w:rPr>
     </w:lvl>
     <w:lvl w:ilvl="7" w:tentative="1">
       <w:start w:val="1"/>
-      <w:numFmt w:val="bullet"/>
-      <w:lvlText w:val=""/>
+      <w:numFmt w:val="decimal"/>
+      <w:lvlText w:val="%8."/>
       <w:lvlJc w:val="left"/>
       <w:pPr>
         <w:tabs>
@@ -6627,15 +6613,11 @@
         </w:tabs>
         <w:ind w:left="5760" w:hanging="360"/>
       </w:pPr>
-      <w:rPr>
-        <w:rFonts w:ascii="Wingdings" w:hAnsi="Wingdings" w:hint="default"/>
-        <w:sz w:val="20"/>
-      </w:rPr>
     </w:lvl>
     <w:lvl w:ilvl="8" w:tentative="1">
       <w:start w:val="1"/>
-      <w:numFmt w:val="bullet"/>
-      <w:lvlText w:val=""/>
+      <w:numFmt w:val="decimal"/>
+      <w:lvlText w:val="%9."/>
       <w:lvlJc w:val="left"/>
       <w:pPr>
         <w:tabs>
@@ -6643,16 +6625,608 @@
         </w:tabs>
         <w:ind w:left="6480" w:hanging="360"/>
       </w:pPr>
-      <w:rPr>
-        <w:rFonts w:ascii="Wingdings" w:hAnsi="Wingdings" w:hint="default"/>
-        <w:sz w:val="20"/>
-      </w:rPr>
     </w:lvl>
   </w:abstractNum>
   <w:abstractNum w:abstractNumId="1" w15:restartNumberingAfterBreak="0">
-    <w:nsid w:val="06C0280D"/>
+    <w:nsid w:val="05B77484"/>
     <w:multiLevelType w:val="multilevel"/>
-    <w:tmpl w:val="6D12BF66"/>
+    <w:tmpl w:val="913C2470"/>
+    <w:lvl w:ilvl="0">
+      <w:start w:val="1"/>
+      <w:numFmt w:val="bullet"/>
+      <w:lvlText w:val=""/>
+      <w:lvlJc w:val="left"/>
+      <w:pPr>
+        <w:tabs>
+          <w:tab w:val="num" w:pos="720"/>
+        </w:tabs>
+        <w:ind w:left="720" w:hanging="360"/>
+      </w:pPr>
+      <w:rPr>
+        <w:rFonts w:ascii="Symbol" w:hAnsi="Symbol" w:hint="default"/>
+        <w:sz w:val="20"/>
+      </w:rPr>
+    </w:lvl>
+    <w:lvl w:ilvl="1" w:tentative="1">
+      <w:start w:val="1"/>
+      <w:numFmt w:val="bullet"/>
+      <w:lvlText w:val="o"/>
+      <w:lvlJc w:val="left"/>
+      <w:pPr>
+        <w:tabs>
+          <w:tab w:val="num" w:pos="1440"/>
+        </w:tabs>
+        <w:ind w:left="1440" w:hanging="360"/>
+      </w:pPr>
+      <w:rPr>
+        <w:rFonts w:ascii="Courier New" w:hAnsi="Courier New" w:hint="default"/>
+        <w:sz w:val="20"/>
+      </w:rPr>
+    </w:lvl>
+    <w:lvl w:ilvl="2" w:tentative="1">
+      <w:start w:val="1"/>
+      <w:numFmt w:val="bullet"/>
+      <w:lvlText w:val=""/>
+      <w:lvlJc w:val="left"/>
+      <w:pPr>
+        <w:tabs>
+          <w:tab w:val="num" w:pos="2160"/>
+        </w:tabs>
+        <w:ind w:left="2160" w:hanging="360"/>
+      </w:pPr>
+      <w:rPr>
+        <w:rFonts w:ascii="Wingdings" w:hAnsi="Wingdings" w:hint="default"/>
+        <w:sz w:val="20"/>
+      </w:rPr>
+    </w:lvl>
+    <w:lvl w:ilvl="3" w:tentative="1">
+      <w:start w:val="1"/>
+      <w:numFmt w:val="bullet"/>
+      <w:lvlText w:val=""/>
+      <w:lvlJc w:val="left"/>
+      <w:pPr>
+        <w:tabs>
+          <w:tab w:val="num" w:pos="2880"/>
+        </w:tabs>
+        <w:ind w:left="2880" w:hanging="360"/>
+      </w:pPr>
+      <w:rPr>
+        <w:rFonts w:ascii="Wingdings" w:hAnsi="Wingdings" w:hint="default"/>
+        <w:sz w:val="20"/>
+      </w:rPr>
+    </w:lvl>
+    <w:lvl w:ilvl="4" w:tentative="1">
+      <w:start w:val="1"/>
+      <w:numFmt w:val="bullet"/>
+      <w:lvlText w:val=""/>
+      <w:lvlJc w:val="left"/>
+      <w:pPr>
+        <w:tabs>
+          <w:tab w:val="num" w:pos="3600"/>
+        </w:tabs>
+        <w:ind w:left="3600" w:hanging="360"/>
+      </w:pPr>
+      <w:rPr>
+        <w:rFonts w:ascii="Wingdings" w:hAnsi="Wingdings" w:hint="default"/>
+        <w:sz w:val="20"/>
+      </w:rPr>
+    </w:lvl>
+    <w:lvl w:ilvl="5" w:tentative="1">
+      <w:start w:val="1"/>
+      <w:numFmt w:val="bullet"/>
+      <w:lvlText w:val=""/>
+      <w:lvlJc w:val="left"/>
+      <w:pPr>
+        <w:tabs>
+          <w:tab w:val="num" w:pos="4320"/>
+        </w:tabs>
+        <w:ind w:left="4320" w:hanging="360"/>
+      </w:pPr>
+      <w:rPr>
+        <w:rFonts w:ascii="Wingdings" w:hAnsi="Wingdings" w:hint="default"/>
+        <w:sz w:val="20"/>
+      </w:rPr>
+    </w:lvl>
+    <w:lvl w:ilvl="6" w:tentative="1">
+      <w:start w:val="1"/>
+      <w:numFmt w:val="bullet"/>
+      <w:lvlText w:val=""/>
+      <w:lvlJc w:val="left"/>
+      <w:pPr>
+        <w:tabs>
+          <w:tab w:val="num" w:pos="5040"/>
+        </w:tabs>
+        <w:ind w:left="5040" w:hanging="360"/>
+      </w:pPr>
+      <w:rPr>
+        <w:rFonts w:ascii="Wingdings" w:hAnsi="Wingdings" w:hint="default"/>
+        <w:sz w:val="20"/>
+      </w:rPr>
+    </w:lvl>
+    <w:lvl w:ilvl="7" w:tentative="1">
+      <w:start w:val="1"/>
+      <w:numFmt w:val="bullet"/>
+      <w:lvlText w:val=""/>
+      <w:lvlJc w:val="left"/>
+      <w:pPr>
+        <w:tabs>
+          <w:tab w:val="num" w:pos="5760"/>
+        </w:tabs>
+        <w:ind w:left="5760" w:hanging="360"/>
+      </w:pPr>
+      <w:rPr>
+        <w:rFonts w:ascii="Wingdings" w:hAnsi="Wingdings" w:hint="default"/>
+        <w:sz w:val="20"/>
+      </w:rPr>
+    </w:lvl>
+    <w:lvl w:ilvl="8" w:tentative="1">
+      <w:start w:val="1"/>
+      <w:numFmt w:val="bullet"/>
+      <w:lvlText w:val=""/>
+      <w:lvlJc w:val="left"/>
+      <w:pPr>
+        <w:tabs>
+          <w:tab w:val="num" w:pos="6480"/>
+        </w:tabs>
+        <w:ind w:left="6480" w:hanging="360"/>
+      </w:pPr>
+      <w:rPr>
+        <w:rFonts w:ascii="Wingdings" w:hAnsi="Wingdings" w:hint="default"/>
+        <w:sz w:val="20"/>
+      </w:rPr>
+    </w:lvl>
+  </w:abstractNum>
+  <w:abstractNum w:abstractNumId="2" w15:restartNumberingAfterBreak="0">
+    <w:nsid w:val="0E7A131D"/>
+    <w:multiLevelType w:val="multilevel"/>
+    <w:tmpl w:val="C7965302"/>
+    <w:lvl w:ilvl="0">
+      <w:start w:val="1"/>
+      <w:numFmt w:val="bullet"/>
+      <w:lvlText w:val=""/>
+      <w:lvlJc w:val="left"/>
+      <w:pPr>
+        <w:tabs>
+          <w:tab w:val="num" w:pos="720"/>
+        </w:tabs>
+        <w:ind w:left="720" w:hanging="360"/>
+      </w:pPr>
+      <w:rPr>
+        <w:rFonts w:ascii="Symbol" w:hAnsi="Symbol" w:hint="default"/>
+        <w:sz w:val="20"/>
+      </w:rPr>
+    </w:lvl>
+    <w:lvl w:ilvl="1" w:tentative="1">
+      <w:start w:val="1"/>
+      <w:numFmt w:val="bullet"/>
+      <w:lvlText w:val="o"/>
+      <w:lvlJc w:val="left"/>
+      <w:pPr>
+        <w:tabs>
+          <w:tab w:val="num" w:pos="1440"/>
+        </w:tabs>
+        <w:ind w:left="1440" w:hanging="360"/>
+      </w:pPr>
+      <w:rPr>
+        <w:rFonts w:ascii="Courier New" w:hAnsi="Courier New" w:hint="default"/>
+        <w:sz w:val="20"/>
+      </w:rPr>
+    </w:lvl>
+    <w:lvl w:ilvl="2" w:tentative="1">
+      <w:start w:val="1"/>
+      <w:numFmt w:val="bullet"/>
+      <w:lvlText w:val=""/>
+      <w:lvlJc w:val="left"/>
+      <w:pPr>
+        <w:tabs>
+          <w:tab w:val="num" w:pos="2160"/>
+        </w:tabs>
+        <w:ind w:left="2160" w:hanging="360"/>
+      </w:pPr>
+      <w:rPr>
+        <w:rFonts w:ascii="Wingdings" w:hAnsi="Wingdings" w:hint="default"/>
+        <w:sz w:val="20"/>
+      </w:rPr>
+    </w:lvl>
+    <w:lvl w:ilvl="3" w:tentative="1">
+      <w:start w:val="1"/>
+      <w:numFmt w:val="bullet"/>
+      <w:lvlText w:val=""/>
+      <w:lvlJc w:val="left"/>
+      <w:pPr>
+        <w:tabs>
+          <w:tab w:val="num" w:pos="2880"/>
+        </w:tabs>
+        <w:ind w:left="2880" w:hanging="360"/>
+      </w:pPr>
+      <w:rPr>
+        <w:rFonts w:ascii="Wingdings" w:hAnsi="Wingdings" w:hint="default"/>
+        <w:sz w:val="20"/>
+      </w:rPr>
+    </w:lvl>
+    <w:lvl w:ilvl="4" w:tentative="1">
+      <w:start w:val="1"/>
+      <w:numFmt w:val="bullet"/>
+      <w:lvlText w:val=""/>
+      <w:lvlJc w:val="left"/>
+      <w:pPr>
+        <w:tabs>
+          <w:tab w:val="num" w:pos="3600"/>
+        </w:tabs>
+        <w:ind w:left="3600" w:hanging="360"/>
+      </w:pPr>
+      <w:rPr>
+        <w:rFonts w:ascii="Wingdings" w:hAnsi="Wingdings" w:hint="default"/>
+        <w:sz w:val="20"/>
+      </w:rPr>
+    </w:lvl>
+    <w:lvl w:ilvl="5" w:tentative="1">
+      <w:start w:val="1"/>
+      <w:numFmt w:val="bullet"/>
+      <w:lvlText w:val=""/>
+      <w:lvlJc w:val="left"/>
+      <w:pPr>
+        <w:tabs>
+          <w:tab w:val="num" w:pos="4320"/>
+        </w:tabs>
+        <w:ind w:left="4320" w:hanging="360"/>
+      </w:pPr>
+      <w:rPr>
+        <w:rFonts w:ascii="Wingdings" w:hAnsi="Wingdings" w:hint="default"/>
+        <w:sz w:val="20"/>
+      </w:rPr>
+    </w:lvl>
+    <w:lvl w:ilvl="6" w:tentative="1">
+      <w:start w:val="1"/>
+      <w:numFmt w:val="bullet"/>
+      <w:lvlText w:val=""/>
+      <w:lvlJc w:val="left"/>
+      <w:pPr>
+        <w:tabs>
+          <w:tab w:val="num" w:pos="5040"/>
+        </w:tabs>
+        <w:ind w:left="5040" w:hanging="360"/>
+      </w:pPr>
+      <w:rPr>
+        <w:rFonts w:ascii="Wingdings" w:hAnsi="Wingdings" w:hint="default"/>
+        <w:sz w:val="20"/>
+      </w:rPr>
+    </w:lvl>
+    <w:lvl w:ilvl="7" w:tentative="1">
+      <w:start w:val="1"/>
+      <w:numFmt w:val="bullet"/>
+      <w:lvlText w:val=""/>
+      <w:lvlJc w:val="left"/>
+      <w:pPr>
+        <w:tabs>
+          <w:tab w:val="num" w:pos="5760"/>
+        </w:tabs>
+        <w:ind w:left="5760" w:hanging="360"/>
+      </w:pPr>
+      <w:rPr>
+        <w:rFonts w:ascii="Wingdings" w:hAnsi="Wingdings" w:hint="default"/>
+        <w:sz w:val="20"/>
+      </w:rPr>
+    </w:lvl>
+    <w:lvl w:ilvl="8" w:tentative="1">
+      <w:start w:val="1"/>
+      <w:numFmt w:val="bullet"/>
+      <w:lvlText w:val=""/>
+      <w:lvlJc w:val="left"/>
+      <w:pPr>
+        <w:tabs>
+          <w:tab w:val="num" w:pos="6480"/>
+        </w:tabs>
+        <w:ind w:left="6480" w:hanging="360"/>
+      </w:pPr>
+      <w:rPr>
+        <w:rFonts w:ascii="Wingdings" w:hAnsi="Wingdings" w:hint="default"/>
+        <w:sz w:val="20"/>
+      </w:rPr>
+    </w:lvl>
+  </w:abstractNum>
+  <w:abstractNum w:abstractNumId="3" w15:restartNumberingAfterBreak="0">
+    <w:nsid w:val="241B4AC8"/>
+    <w:multiLevelType w:val="multilevel"/>
+    <w:tmpl w:val="3D8C9BCE"/>
+    <w:lvl w:ilvl="0">
+      <w:start w:val="1"/>
+      <w:numFmt w:val="bullet"/>
+      <w:lvlText w:val=""/>
+      <w:lvlJc w:val="left"/>
+      <w:pPr>
+        <w:tabs>
+          <w:tab w:val="num" w:pos="720"/>
+        </w:tabs>
+        <w:ind w:left="720" w:hanging="360"/>
+      </w:pPr>
+      <w:rPr>
+        <w:rFonts w:ascii="Symbol" w:hAnsi="Symbol" w:hint="default"/>
+        <w:sz w:val="20"/>
+      </w:rPr>
+    </w:lvl>
+    <w:lvl w:ilvl="1" w:tentative="1">
+      <w:start w:val="1"/>
+      <w:numFmt w:val="bullet"/>
+      <w:lvlText w:val="o"/>
+      <w:lvlJc w:val="left"/>
+      <w:pPr>
+        <w:tabs>
+          <w:tab w:val="num" w:pos="1440"/>
+        </w:tabs>
+        <w:ind w:left="1440" w:hanging="360"/>
+      </w:pPr>
+      <w:rPr>
+        <w:rFonts w:ascii="Courier New" w:hAnsi="Courier New" w:hint="default"/>
+        <w:sz w:val="20"/>
+      </w:rPr>
+    </w:lvl>
+    <w:lvl w:ilvl="2" w:tentative="1">
+      <w:start w:val="1"/>
+      <w:numFmt w:val="bullet"/>
+      <w:lvlText w:val=""/>
+      <w:lvlJc w:val="left"/>
+      <w:pPr>
+        <w:tabs>
+          <w:tab w:val="num" w:pos="2160"/>
+        </w:tabs>
+        <w:ind w:left="2160" w:hanging="360"/>
+      </w:pPr>
+      <w:rPr>
+        <w:rFonts w:ascii="Wingdings" w:hAnsi="Wingdings" w:hint="default"/>
+        <w:sz w:val="20"/>
+      </w:rPr>
+    </w:lvl>
+    <w:lvl w:ilvl="3" w:tentative="1">
+      <w:start w:val="1"/>
+      <w:numFmt w:val="bullet"/>
+      <w:lvlText w:val=""/>
+      <w:lvlJc w:val="left"/>
+      <w:pPr>
+        <w:tabs>
+          <w:tab w:val="num" w:pos="2880"/>
+        </w:tabs>
+        <w:ind w:left="2880" w:hanging="360"/>
+      </w:pPr>
+      <w:rPr>
+        <w:rFonts w:ascii="Wingdings" w:hAnsi="Wingdings" w:hint="default"/>
+        <w:sz w:val="20"/>
+      </w:rPr>
+    </w:lvl>
+    <w:lvl w:ilvl="4" w:tentative="1">
+      <w:start w:val="1"/>
+      <w:numFmt w:val="bullet"/>
+      <w:lvlText w:val=""/>
+      <w:lvlJc w:val="left"/>
+      <w:pPr>
+        <w:tabs>
+          <w:tab w:val="num" w:pos="3600"/>
+        </w:tabs>
+        <w:ind w:left="3600" w:hanging="360"/>
+      </w:pPr>
+      <w:rPr>
+        <w:rFonts w:ascii="Wingdings" w:hAnsi="Wingdings" w:hint="default"/>
+        <w:sz w:val="20"/>
+      </w:rPr>
+    </w:lvl>
+    <w:lvl w:ilvl="5" w:tentative="1">
+      <w:start w:val="1"/>
+      <w:numFmt w:val="bullet"/>
+      <w:lvlText w:val=""/>
+      <w:lvlJc w:val="left"/>
+      <w:pPr>
+        <w:tabs>
+          <w:tab w:val="num" w:pos="4320"/>
+        </w:tabs>
+        <w:ind w:left="4320" w:hanging="360"/>
+      </w:pPr>
+      <w:rPr>
+        <w:rFonts w:ascii="Wingdings" w:hAnsi="Wingdings" w:hint="default"/>
+        <w:sz w:val="20"/>
+      </w:rPr>
+    </w:lvl>
+    <w:lvl w:ilvl="6" w:tentative="1">
+      <w:start w:val="1"/>
+      <w:numFmt w:val="bullet"/>
+      <w:lvlText w:val=""/>
+      <w:lvlJc w:val="left"/>
+      <w:pPr>
+        <w:tabs>
+          <w:tab w:val="num" w:pos="5040"/>
+        </w:tabs>
+        <w:ind w:left="5040" w:hanging="360"/>
+      </w:pPr>
+      <w:rPr>
+        <w:rFonts w:ascii="Wingdings" w:hAnsi="Wingdings" w:hint="default"/>
+        <w:sz w:val="20"/>
+      </w:rPr>
+    </w:lvl>
+    <w:lvl w:ilvl="7" w:tentative="1">
+      <w:start w:val="1"/>
+      <w:numFmt w:val="bullet"/>
+      <w:lvlText w:val=""/>
+      <w:lvlJc w:val="left"/>
+      <w:pPr>
+        <w:tabs>
+          <w:tab w:val="num" w:pos="5760"/>
+        </w:tabs>
+        <w:ind w:left="5760" w:hanging="360"/>
+      </w:pPr>
+      <w:rPr>
+        <w:rFonts w:ascii="Wingdings" w:hAnsi="Wingdings" w:hint="default"/>
+        <w:sz w:val="20"/>
+      </w:rPr>
+    </w:lvl>
+    <w:lvl w:ilvl="8" w:tentative="1">
+      <w:start w:val="1"/>
+      <w:numFmt w:val="bullet"/>
+      <w:lvlText w:val=""/>
+      <w:lvlJc w:val="left"/>
+      <w:pPr>
+        <w:tabs>
+          <w:tab w:val="num" w:pos="6480"/>
+        </w:tabs>
+        <w:ind w:left="6480" w:hanging="360"/>
+      </w:pPr>
+      <w:rPr>
+        <w:rFonts w:ascii="Wingdings" w:hAnsi="Wingdings" w:hint="default"/>
+        <w:sz w:val="20"/>
+      </w:rPr>
+    </w:lvl>
+  </w:abstractNum>
+  <w:abstractNum w:abstractNumId="4" w15:restartNumberingAfterBreak="0">
+    <w:nsid w:val="298B7641"/>
+    <w:multiLevelType w:val="multilevel"/>
+    <w:tmpl w:val="CEBEE974"/>
+    <w:lvl w:ilvl="0">
+      <w:start w:val="1"/>
+      <w:numFmt w:val="bullet"/>
+      <w:lvlText w:val=""/>
+      <w:lvlJc w:val="left"/>
+      <w:pPr>
+        <w:tabs>
+          <w:tab w:val="num" w:pos="720"/>
+        </w:tabs>
+        <w:ind w:left="720" w:hanging="360"/>
+      </w:pPr>
+      <w:rPr>
+        <w:rFonts w:ascii="Symbol" w:hAnsi="Symbol" w:hint="default"/>
+        <w:sz w:val="20"/>
+      </w:rPr>
+    </w:lvl>
+    <w:lvl w:ilvl="1" w:tentative="1">
+      <w:start w:val="1"/>
+      <w:numFmt w:val="bullet"/>
+      <w:lvlText w:val="o"/>
+      <w:lvlJc w:val="left"/>
+      <w:pPr>
+        <w:tabs>
+          <w:tab w:val="num" w:pos="1440"/>
+        </w:tabs>
+        <w:ind w:left="1440" w:hanging="360"/>
+      </w:pPr>
+      <w:rPr>
+        <w:rFonts w:ascii="Courier New" w:hAnsi="Courier New" w:hint="default"/>
+        <w:sz w:val="20"/>
+      </w:rPr>
+    </w:lvl>
+    <w:lvl w:ilvl="2" w:tentative="1">
+      <w:start w:val="1"/>
+      <w:numFmt w:val="bullet"/>
+      <w:lvlText w:val=""/>
+      <w:lvlJc w:val="left"/>
+      <w:pPr>
+        <w:tabs>
+          <w:tab w:val="num" w:pos="2160"/>
+        </w:tabs>
+        <w:ind w:left="2160" w:hanging="360"/>
+      </w:pPr>
+      <w:rPr>
+        <w:rFonts w:ascii="Wingdings" w:hAnsi="Wingdings" w:hint="default"/>
+        <w:sz w:val="20"/>
+      </w:rPr>
+    </w:lvl>
+    <w:lvl w:ilvl="3" w:tentative="1">
+      <w:start w:val="1"/>
+      <w:numFmt w:val="bullet"/>
+      <w:lvlText w:val=""/>
+      <w:lvlJc w:val="left"/>
+      <w:pPr>
+        <w:tabs>
+          <w:tab w:val="num" w:pos="2880"/>
+        </w:tabs>
+        <w:ind w:left="2880" w:hanging="360"/>
+      </w:pPr>
+      <w:rPr>
+        <w:rFonts w:ascii="Wingdings" w:hAnsi="Wingdings" w:hint="default"/>
+        <w:sz w:val="20"/>
+      </w:rPr>
+    </w:lvl>
+    <w:lvl w:ilvl="4" w:tentative="1">
+      <w:start w:val="1"/>
+      <w:numFmt w:val="bullet"/>
+      <w:lvlText w:val=""/>
+      <w:lvlJc w:val="left"/>
+      <w:pPr>
+        <w:tabs>
+          <w:tab w:val="num" w:pos="3600"/>
+        </w:tabs>
+        <w:ind w:left="3600" w:hanging="360"/>
+      </w:pPr>
+      <w:rPr>
+        <w:rFonts w:ascii="Wingdings" w:hAnsi="Wingdings" w:hint="default"/>
+        <w:sz w:val="20"/>
+      </w:rPr>
+    </w:lvl>
+    <w:lvl w:ilvl="5" w:tentative="1">
+      <w:start w:val="1"/>
+      <w:numFmt w:val="bullet"/>
+      <w:lvlText w:val=""/>
+      <w:lvlJc w:val="left"/>
+      <w:pPr>
+        <w:tabs>
+          <w:tab w:val="num" w:pos="4320"/>
+        </w:tabs>
+        <w:ind w:left="4320" w:hanging="360"/>
+      </w:pPr>
+      <w:rPr>
+        <w:rFonts w:ascii="Wingdings" w:hAnsi="Wingdings" w:hint="default"/>
+        <w:sz w:val="20"/>
+      </w:rPr>
+    </w:lvl>
+    <w:lvl w:ilvl="6" w:tentative="1">
+      <w:start w:val="1"/>
+      <w:numFmt w:val="bullet"/>
+      <w:lvlText w:val=""/>
+      <w:lvlJc w:val="left"/>
+      <w:pPr>
+        <w:tabs>
+          <w:tab w:val="num" w:pos="5040"/>
+        </w:tabs>
+        <w:ind w:left="5040" w:hanging="360"/>
+      </w:pPr>
+      <w:rPr>
+        <w:rFonts w:ascii="Wingdings" w:hAnsi="Wingdings" w:hint="default"/>
+        <w:sz w:val="20"/>
+      </w:rPr>
+    </w:lvl>
+    <w:lvl w:ilvl="7" w:tentative="1">
+      <w:start w:val="1"/>
+      <w:numFmt w:val="bullet"/>
+      <w:lvlText w:val=""/>
+      <w:lvlJc w:val="left"/>
+      <w:pPr>
+        <w:tabs>
+          <w:tab w:val="num" w:pos="5760"/>
+        </w:tabs>
+        <w:ind w:left="5760" w:hanging="360"/>
+      </w:pPr>
+      <w:rPr>
+        <w:rFonts w:ascii="Wingdings" w:hAnsi="Wingdings" w:hint="default"/>
+        <w:sz w:val="20"/>
+      </w:rPr>
+    </w:lvl>
+    <w:lvl w:ilvl="8" w:tentative="1">
+      <w:start w:val="1"/>
+      <w:numFmt w:val="bullet"/>
+      <w:lvlText w:val=""/>
+      <w:lvlJc w:val="left"/>
+      <w:pPr>
+        <w:tabs>
+          <w:tab w:val="num" w:pos="6480"/>
+        </w:tabs>
+        <w:ind w:left="6480" w:hanging="360"/>
+      </w:pPr>
+      <w:rPr>
+        <w:rFonts w:ascii="Wingdings" w:hAnsi="Wingdings" w:hint="default"/>
+        <w:sz w:val="20"/>
+      </w:rPr>
+    </w:lvl>
+  </w:abstractNum>
+  <w:abstractNum w:abstractNumId="5" w15:restartNumberingAfterBreak="0">
+    <w:nsid w:val="2F976AA0"/>
+    <w:multiLevelType w:val="multilevel"/>
+    <w:tmpl w:val="A030FBB2"/>
     <w:lvl w:ilvl="0">
       <w:start w:val="1"/>
       <w:numFmt w:val="decimal"/>
@@ -6766,10 +7340,10 @@
       </w:pPr>
     </w:lvl>
   </w:abstractNum>
-  <w:abstractNum w:abstractNumId="2" w15:restartNumberingAfterBreak="0">
-    <w:nsid w:val="1AAE4A24"/>
+  <w:abstractNum w:abstractNumId="6" w15:restartNumberingAfterBreak="0">
+    <w:nsid w:val="31A96F0E"/>
     <w:multiLevelType w:val="multilevel"/>
-    <w:tmpl w:val="1D14EBEE"/>
+    <w:tmpl w:val="7E9EE1EA"/>
     <w:lvl w:ilvl="0">
       <w:start w:val="1"/>
       <w:numFmt w:val="decimal"/>
@@ -6883,159 +7457,10 @@
       </w:pPr>
     </w:lvl>
   </w:abstractNum>
-  <w:abstractNum w:abstractNumId="3" w15:restartNumberingAfterBreak="0">
-    <w:nsid w:val="1EA7251B"/>
+  <w:abstractNum w:abstractNumId="7" w15:restartNumberingAfterBreak="0">
+    <w:nsid w:val="37B25D14"/>
     <w:multiLevelType w:val="multilevel"/>
-    <w:tmpl w:val="70C6E74E"/>
-    <w:lvl w:ilvl="0">
-      <w:start w:val="1"/>
-      <w:numFmt w:val="bullet"/>
-      <w:lvlText w:val=""/>
-      <w:lvlJc w:val="left"/>
-      <w:pPr>
-        <w:tabs>
-          <w:tab w:val="num" w:pos="720"/>
-        </w:tabs>
-        <w:ind w:left="720" w:hanging="360"/>
-      </w:pPr>
-      <w:rPr>
-        <w:rFonts w:ascii="Symbol" w:hAnsi="Symbol" w:hint="default"/>
-        <w:sz w:val="20"/>
-      </w:rPr>
-    </w:lvl>
-    <w:lvl w:ilvl="1" w:tentative="1">
-      <w:start w:val="1"/>
-      <w:numFmt w:val="bullet"/>
-      <w:lvlText w:val="o"/>
-      <w:lvlJc w:val="left"/>
-      <w:pPr>
-        <w:tabs>
-          <w:tab w:val="num" w:pos="1440"/>
-        </w:tabs>
-        <w:ind w:left="1440" w:hanging="360"/>
-      </w:pPr>
-      <w:rPr>
-        <w:rFonts w:ascii="Courier New" w:hAnsi="Courier New" w:hint="default"/>
-        <w:sz w:val="20"/>
-      </w:rPr>
-    </w:lvl>
-    <w:lvl w:ilvl="2" w:tentative="1">
-      <w:start w:val="1"/>
-      <w:numFmt w:val="bullet"/>
-      <w:lvlText w:val=""/>
-      <w:lvlJc w:val="left"/>
-      <w:pPr>
-        <w:tabs>
-          <w:tab w:val="num" w:pos="2160"/>
-        </w:tabs>
-        <w:ind w:left="2160" w:hanging="360"/>
-      </w:pPr>
-      <w:rPr>
-        <w:rFonts w:ascii="Wingdings" w:hAnsi="Wingdings" w:hint="default"/>
-        <w:sz w:val="20"/>
-      </w:rPr>
-    </w:lvl>
-    <w:lvl w:ilvl="3" w:tentative="1">
-      <w:start w:val="1"/>
-      <w:numFmt w:val="bullet"/>
-      <w:lvlText w:val=""/>
-      <w:lvlJc w:val="left"/>
-      <w:pPr>
-        <w:tabs>
-          <w:tab w:val="num" w:pos="2880"/>
-        </w:tabs>
-        <w:ind w:left="2880" w:hanging="360"/>
-      </w:pPr>
-      <w:rPr>
-        <w:rFonts w:ascii="Wingdings" w:hAnsi="Wingdings" w:hint="default"/>
-        <w:sz w:val="20"/>
-      </w:rPr>
-    </w:lvl>
-    <w:lvl w:ilvl="4" w:tentative="1">
-      <w:start w:val="1"/>
-      <w:numFmt w:val="bullet"/>
-      <w:lvlText w:val=""/>
-      <w:lvlJc w:val="left"/>
-      <w:pPr>
-        <w:tabs>
-          <w:tab w:val="num" w:pos="3600"/>
-        </w:tabs>
-        <w:ind w:left="3600" w:hanging="360"/>
-      </w:pPr>
-      <w:rPr>
-        <w:rFonts w:ascii="Wingdings" w:hAnsi="Wingdings" w:hint="default"/>
-        <w:sz w:val="20"/>
-      </w:rPr>
-    </w:lvl>
-    <w:lvl w:ilvl="5" w:tentative="1">
-      <w:start w:val="1"/>
-      <w:numFmt w:val="bullet"/>
-      <w:lvlText w:val=""/>
-      <w:lvlJc w:val="left"/>
-      <w:pPr>
-        <w:tabs>
-          <w:tab w:val="num" w:pos="4320"/>
-        </w:tabs>
-        <w:ind w:left="4320" w:hanging="360"/>
-      </w:pPr>
-      <w:rPr>
-        <w:rFonts w:ascii="Wingdings" w:hAnsi="Wingdings" w:hint="default"/>
-        <w:sz w:val="20"/>
-      </w:rPr>
-    </w:lvl>
-    <w:lvl w:ilvl="6" w:tentative="1">
-      <w:start w:val="1"/>
-      <w:numFmt w:val="bullet"/>
-      <w:lvlText w:val=""/>
-      <w:lvlJc w:val="left"/>
-      <w:pPr>
-        <w:tabs>
-          <w:tab w:val="num" w:pos="5040"/>
-        </w:tabs>
-        <w:ind w:left="5040" w:hanging="360"/>
-      </w:pPr>
-      <w:rPr>
-        <w:rFonts w:ascii="Wingdings" w:hAnsi="Wingdings" w:hint="default"/>
-        <w:sz w:val="20"/>
-      </w:rPr>
-    </w:lvl>
-    <w:lvl w:ilvl="7" w:tentative="1">
-      <w:start w:val="1"/>
-      <w:numFmt w:val="bullet"/>
-      <w:lvlText w:val=""/>
-      <w:lvlJc w:val="left"/>
-      <w:pPr>
-        <w:tabs>
-          <w:tab w:val="num" w:pos="5760"/>
-        </w:tabs>
-        <w:ind w:left="5760" w:hanging="360"/>
-      </w:pPr>
-      <w:rPr>
-        <w:rFonts w:ascii="Wingdings" w:hAnsi="Wingdings" w:hint="default"/>
-        <w:sz w:val="20"/>
-      </w:rPr>
-    </w:lvl>
-    <w:lvl w:ilvl="8" w:tentative="1">
-      <w:start w:val="1"/>
-      <w:numFmt w:val="bullet"/>
-      <w:lvlText w:val=""/>
-      <w:lvlJc w:val="left"/>
-      <w:pPr>
-        <w:tabs>
-          <w:tab w:val="num" w:pos="6480"/>
-        </w:tabs>
-        <w:ind w:left="6480" w:hanging="360"/>
-      </w:pPr>
-      <w:rPr>
-        <w:rFonts w:ascii="Wingdings" w:hAnsi="Wingdings" w:hint="default"/>
-        <w:sz w:val="20"/>
-      </w:rPr>
-    </w:lvl>
-  </w:abstractNum>
-  <w:abstractNum w:abstractNumId="4" w15:restartNumberingAfterBreak="0">
-    <w:nsid w:val="22C641D5"/>
-    <w:multiLevelType w:val="multilevel"/>
-    <w:tmpl w:val="75ACA8DC"/>
+    <w:tmpl w:val="25D25754"/>
     <w:lvl w:ilvl="0">
       <w:start w:val="1"/>
       <w:numFmt w:val="decimal"/>
@@ -7149,10 +7574,159 @@
       </w:pPr>
     </w:lvl>
   </w:abstractNum>
-  <w:abstractNum w:abstractNumId="5" w15:restartNumberingAfterBreak="0">
-    <w:nsid w:val="25C70479"/>
+  <w:abstractNum w:abstractNumId="8" w15:restartNumberingAfterBreak="0">
+    <w:nsid w:val="42295FD7"/>
     <w:multiLevelType w:val="multilevel"/>
-    <w:tmpl w:val="68F63306"/>
+    <w:tmpl w:val="FED28452"/>
+    <w:lvl w:ilvl="0">
+      <w:start w:val="1"/>
+      <w:numFmt w:val="bullet"/>
+      <w:lvlText w:val=""/>
+      <w:lvlJc w:val="left"/>
+      <w:pPr>
+        <w:tabs>
+          <w:tab w:val="num" w:pos="720"/>
+        </w:tabs>
+        <w:ind w:left="720" w:hanging="360"/>
+      </w:pPr>
+      <w:rPr>
+        <w:rFonts w:ascii="Symbol" w:hAnsi="Symbol" w:hint="default"/>
+        <w:sz w:val="20"/>
+      </w:rPr>
+    </w:lvl>
+    <w:lvl w:ilvl="1" w:tentative="1">
+      <w:start w:val="1"/>
+      <w:numFmt w:val="bullet"/>
+      <w:lvlText w:val="o"/>
+      <w:lvlJc w:val="left"/>
+      <w:pPr>
+        <w:tabs>
+          <w:tab w:val="num" w:pos="1440"/>
+        </w:tabs>
+        <w:ind w:left="1440" w:hanging="360"/>
+      </w:pPr>
+      <w:rPr>
+        <w:rFonts w:ascii="Courier New" w:hAnsi="Courier New" w:hint="default"/>
+        <w:sz w:val="20"/>
+      </w:rPr>
+    </w:lvl>
+    <w:lvl w:ilvl="2" w:tentative="1">
+      <w:start w:val="1"/>
+      <w:numFmt w:val="bullet"/>
+      <w:lvlText w:val=""/>
+      <w:lvlJc w:val="left"/>
+      <w:pPr>
+        <w:tabs>
+          <w:tab w:val="num" w:pos="2160"/>
+        </w:tabs>
+        <w:ind w:left="2160" w:hanging="360"/>
+      </w:pPr>
+      <w:rPr>
+        <w:rFonts w:ascii="Wingdings" w:hAnsi="Wingdings" w:hint="default"/>
+        <w:sz w:val="20"/>
+      </w:rPr>
+    </w:lvl>
+    <w:lvl w:ilvl="3" w:tentative="1">
+      <w:start w:val="1"/>
+      <w:numFmt w:val="bullet"/>
+      <w:lvlText w:val=""/>
+      <w:lvlJc w:val="left"/>
+      <w:pPr>
+        <w:tabs>
+          <w:tab w:val="num" w:pos="2880"/>
+        </w:tabs>
+        <w:ind w:left="2880" w:hanging="360"/>
+      </w:pPr>
+      <w:rPr>
+        <w:rFonts w:ascii="Wingdings" w:hAnsi="Wingdings" w:hint="default"/>
+        <w:sz w:val="20"/>
+      </w:rPr>
+    </w:lvl>
+    <w:lvl w:ilvl="4" w:tentative="1">
+      <w:start w:val="1"/>
+      <w:numFmt w:val="bullet"/>
+      <w:lvlText w:val=""/>
+      <w:lvlJc w:val="left"/>
+      <w:pPr>
+        <w:tabs>
+          <w:tab w:val="num" w:pos="3600"/>
+        </w:tabs>
+        <w:ind w:left="3600" w:hanging="360"/>
+      </w:pPr>
+      <w:rPr>
+        <w:rFonts w:ascii="Wingdings" w:hAnsi="Wingdings" w:hint="default"/>
+        <w:sz w:val="20"/>
+      </w:rPr>
+    </w:lvl>
+    <w:lvl w:ilvl="5" w:tentative="1">
+      <w:start w:val="1"/>
+      <w:numFmt w:val="bullet"/>
+      <w:lvlText w:val=""/>
+      <w:lvlJc w:val="left"/>
+      <w:pPr>
+        <w:tabs>
+          <w:tab w:val="num" w:pos="4320"/>
+        </w:tabs>
+        <w:ind w:left="4320" w:hanging="360"/>
+      </w:pPr>
+      <w:rPr>
+        <w:rFonts w:ascii="Wingdings" w:hAnsi="Wingdings" w:hint="default"/>
+        <w:sz w:val="20"/>
+      </w:rPr>
+    </w:lvl>
+    <w:lvl w:ilvl="6" w:tentative="1">
+      <w:start w:val="1"/>
+      <w:numFmt w:val="bullet"/>
+      <w:lvlText w:val=""/>
+      <w:lvlJc w:val="left"/>
+      <w:pPr>
+        <w:tabs>
+          <w:tab w:val="num" w:pos="5040"/>
+        </w:tabs>
+        <w:ind w:left="5040" w:hanging="360"/>
+      </w:pPr>
+      <w:rPr>
+        <w:rFonts w:ascii="Wingdings" w:hAnsi="Wingdings" w:hint="default"/>
+        <w:sz w:val="20"/>
+      </w:rPr>
+    </w:lvl>
+    <w:lvl w:ilvl="7" w:tentative="1">
+      <w:start w:val="1"/>
+      <w:numFmt w:val="bullet"/>
+      <w:lvlText w:val=""/>
+      <w:lvlJc w:val="left"/>
+      <w:pPr>
+        <w:tabs>
+          <w:tab w:val="num" w:pos="5760"/>
+        </w:tabs>
+        <w:ind w:left="5760" w:hanging="360"/>
+      </w:pPr>
+      <w:rPr>
+        <w:rFonts w:ascii="Wingdings" w:hAnsi="Wingdings" w:hint="default"/>
+        <w:sz w:val="20"/>
+      </w:rPr>
+    </w:lvl>
+    <w:lvl w:ilvl="8" w:tentative="1">
+      <w:start w:val="1"/>
+      <w:numFmt w:val="bullet"/>
+      <w:lvlText w:val=""/>
+      <w:lvlJc w:val="left"/>
+      <w:pPr>
+        <w:tabs>
+          <w:tab w:val="num" w:pos="6480"/>
+        </w:tabs>
+        <w:ind w:left="6480" w:hanging="360"/>
+      </w:pPr>
+      <w:rPr>
+        <w:rFonts w:ascii="Wingdings" w:hAnsi="Wingdings" w:hint="default"/>
+        <w:sz w:val="20"/>
+      </w:rPr>
+    </w:lvl>
+  </w:abstractNum>
+  <w:abstractNum w:abstractNumId="9" w15:restartNumberingAfterBreak="0">
+    <w:nsid w:val="435D03D0"/>
+    <w:multiLevelType w:val="multilevel"/>
+    <w:tmpl w:val="FE7ED246"/>
     <w:lvl w:ilvl="0">
       <w:start w:val="1"/>
       <w:numFmt w:val="decimal"/>
@@ -7266,10 +7840,159 @@
       </w:pPr>
     </w:lvl>
   </w:abstractNum>
-  <w:abstractNum w:abstractNumId="6" w15:restartNumberingAfterBreak="0">
-    <w:nsid w:val="29D51C1E"/>
+  <w:abstractNum w:abstractNumId="10" w15:restartNumberingAfterBreak="0">
+    <w:nsid w:val="4C521AEB"/>
     <w:multiLevelType w:val="multilevel"/>
-    <w:tmpl w:val="A048615C"/>
+    <w:tmpl w:val="AC5CB0C6"/>
+    <w:lvl w:ilvl="0">
+      <w:start w:val="1"/>
+      <w:numFmt w:val="bullet"/>
+      <w:lvlText w:val=""/>
+      <w:lvlJc w:val="left"/>
+      <w:pPr>
+        <w:tabs>
+          <w:tab w:val="num" w:pos="720"/>
+        </w:tabs>
+        <w:ind w:left="720" w:hanging="360"/>
+      </w:pPr>
+      <w:rPr>
+        <w:rFonts w:ascii="Symbol" w:hAnsi="Symbol" w:hint="default"/>
+        <w:sz w:val="20"/>
+      </w:rPr>
+    </w:lvl>
+    <w:lvl w:ilvl="1" w:tentative="1">
+      <w:start w:val="1"/>
+      <w:numFmt w:val="bullet"/>
+      <w:lvlText w:val="o"/>
+      <w:lvlJc w:val="left"/>
+      <w:pPr>
+        <w:tabs>
+          <w:tab w:val="num" w:pos="1440"/>
+        </w:tabs>
+        <w:ind w:left="1440" w:hanging="360"/>
+      </w:pPr>
+      <w:rPr>
+        <w:rFonts w:ascii="Courier New" w:hAnsi="Courier New" w:hint="default"/>
+        <w:sz w:val="20"/>
+      </w:rPr>
+    </w:lvl>
+    <w:lvl w:ilvl="2" w:tentative="1">
+      <w:start w:val="1"/>
+      <w:numFmt w:val="bullet"/>
+      <w:lvlText w:val=""/>
+      <w:lvlJc w:val="left"/>
+      <w:pPr>
+        <w:tabs>
+          <w:tab w:val="num" w:pos="2160"/>
+        </w:tabs>
+        <w:ind w:left="2160" w:hanging="360"/>
+      </w:pPr>
+      <w:rPr>
+        <w:rFonts w:ascii="Wingdings" w:hAnsi="Wingdings" w:hint="default"/>
+        <w:sz w:val="20"/>
+      </w:rPr>
+    </w:lvl>
+    <w:lvl w:ilvl="3" w:tentative="1">
+      <w:start w:val="1"/>
+      <w:numFmt w:val="bullet"/>
+      <w:lvlText w:val=""/>
+      <w:lvlJc w:val="left"/>
+      <w:pPr>
+        <w:tabs>
+          <w:tab w:val="num" w:pos="2880"/>
+        </w:tabs>
+        <w:ind w:left="2880" w:hanging="360"/>
+      </w:pPr>
+      <w:rPr>
+        <w:rFonts w:ascii="Wingdings" w:hAnsi="Wingdings" w:hint="default"/>
+        <w:sz w:val="20"/>
+      </w:rPr>
+    </w:lvl>
+    <w:lvl w:ilvl="4" w:tentative="1">
+      <w:start w:val="1"/>
+      <w:numFmt w:val="bullet"/>
+      <w:lvlText w:val=""/>
+      <w:lvlJc w:val="left"/>
+      <w:pPr>
+        <w:tabs>
+          <w:tab w:val="num" w:pos="3600"/>
+        </w:tabs>
+        <w:ind w:left="3600" w:hanging="360"/>
+      </w:pPr>
+      <w:rPr>
+        <w:rFonts w:ascii="Wingdings" w:hAnsi="Wingdings" w:hint="default"/>
+        <w:sz w:val="20"/>
+      </w:rPr>
+    </w:lvl>
+    <w:lvl w:ilvl="5" w:tentative="1">
+      <w:start w:val="1"/>
+      <w:numFmt w:val="bullet"/>
+      <w:lvlText w:val=""/>
+      <w:lvlJc w:val="left"/>
+      <w:pPr>
+        <w:tabs>
+          <w:tab w:val="num" w:pos="4320"/>
+        </w:tabs>
+        <w:ind w:left="4320" w:hanging="360"/>
+      </w:pPr>
+      <w:rPr>
+        <w:rFonts w:ascii="Wingdings" w:hAnsi="Wingdings" w:hint="default"/>
+        <w:sz w:val="20"/>
+      </w:rPr>
+    </w:lvl>
+    <w:lvl w:ilvl="6" w:tentative="1">
+      <w:start w:val="1"/>
+      <w:numFmt w:val="bullet"/>
+      <w:lvlText w:val=""/>
+      <w:lvlJc w:val="left"/>
+      <w:pPr>
+        <w:tabs>
+          <w:tab w:val="num" w:pos="5040"/>
+        </w:tabs>
+        <w:ind w:left="5040" w:hanging="360"/>
+      </w:pPr>
+      <w:rPr>
+        <w:rFonts w:ascii="Wingdings" w:hAnsi="Wingdings" w:hint="default"/>
+        <w:sz w:val="20"/>
+      </w:rPr>
+    </w:lvl>
+    <w:lvl w:ilvl="7" w:tentative="1">
+      <w:start w:val="1"/>
+      <w:numFmt w:val="bullet"/>
+      <w:lvlText w:val=""/>
+      <w:lvlJc w:val="left"/>
+      <w:pPr>
+        <w:tabs>
+          <w:tab w:val="num" w:pos="5760"/>
+        </w:tabs>
+        <w:ind w:left="5760" w:hanging="360"/>
+      </w:pPr>
+      <w:rPr>
+        <w:rFonts w:ascii="Wingdings" w:hAnsi="Wingdings" w:hint="default"/>
+        <w:sz w:val="20"/>
+      </w:rPr>
+    </w:lvl>
+    <w:lvl w:ilvl="8" w:tentative="1">
+      <w:start w:val="1"/>
+      <w:numFmt w:val="bullet"/>
+      <w:lvlText w:val=""/>
+      <w:lvlJc w:val="left"/>
+      <w:pPr>
+        <w:tabs>
+          <w:tab w:val="num" w:pos="6480"/>
+        </w:tabs>
+        <w:ind w:left="6480" w:hanging="360"/>
+      </w:pPr>
+      <w:rPr>
+        <w:rFonts w:ascii="Wingdings" w:hAnsi="Wingdings" w:hint="default"/>
+        <w:sz w:val="20"/>
+      </w:rPr>
+    </w:lvl>
+  </w:abstractNum>
+  <w:abstractNum w:abstractNumId="11" w15:restartNumberingAfterBreak="0">
+    <w:nsid w:val="5223438A"/>
+    <w:multiLevelType w:val="multilevel"/>
+    <w:tmpl w:val="97D68E30"/>
     <w:lvl w:ilvl="0">
       <w:start w:val="1"/>
       <w:numFmt w:val="decimal"/>
@@ -7383,14 +8106,14 @@
       </w:pPr>
     </w:lvl>
   </w:abstractNum>
-  <w:abstractNum w:abstractNumId="7" w15:restartNumberingAfterBreak="0">
-    <w:nsid w:val="2A0F45BC"/>
+  <w:abstractNum w:abstractNumId="12" w15:restartNumberingAfterBreak="0">
+    <w:nsid w:val="548F3FA6"/>
     <w:multiLevelType w:val="multilevel"/>
-    <w:tmpl w:val="E6527B34"/>
+    <w:tmpl w:val="FB14B72E"/>
     <w:lvl w:ilvl="0">
       <w:start w:val="1"/>
-      <w:numFmt w:val="bullet"/>
-      <w:lvlText w:val=""/>
+      <w:numFmt w:val="decimal"/>
+      <w:lvlText w:val="%1."/>
       <w:lvlJc w:val="left"/>
       <w:pPr>
         <w:tabs>
@@ -7398,12 +8121,8 @@
         </w:tabs>
         <w:ind w:left="720" w:hanging="360"/>
       </w:pPr>
-      <w:rPr>
-        <w:rFonts w:ascii="Symbol" w:hAnsi="Symbol" w:hint="default"/>
-        <w:sz w:val="20"/>
-      </w:rPr>
-    </w:lvl>
-    <w:lvl w:ilvl="1" w:tentative="1">
+    </w:lvl>
+    <w:lvl w:ilvl="1">
       <w:start w:val="1"/>
       <w:numFmt w:val="bullet"/>
       <w:lvlText w:val="o"/>
@@ -7421,8 +8140,8 @@
     </w:lvl>
     <w:lvl w:ilvl="2" w:tentative="1">
       <w:start w:val="1"/>
-      <w:numFmt w:val="bullet"/>
-      <w:lvlText w:val=""/>
+      <w:numFmt w:val="decimal"/>
+      <w:lvlText w:val="%3."/>
       <w:lvlJc w:val="left"/>
       <w:pPr>
         <w:tabs>
@@ -7430,15 +8149,11 @@
         </w:tabs>
         <w:ind w:left="2160" w:hanging="360"/>
       </w:pPr>
-      <w:rPr>
-        <w:rFonts w:ascii="Wingdings" w:hAnsi="Wingdings" w:hint="default"/>
-        <w:sz w:val="20"/>
-      </w:rPr>
     </w:lvl>
     <w:lvl w:ilvl="3" w:tentative="1">
       <w:start w:val="1"/>
-      <w:numFmt w:val="bullet"/>
-      <w:lvlText w:val=""/>
+      <w:numFmt w:val="decimal"/>
+      <w:lvlText w:val="%4."/>
       <w:lvlJc w:val="left"/>
       <w:pPr>
         <w:tabs>
@@ -7446,15 +8161,11 @@
         </w:tabs>
         <w:ind w:left="2880" w:hanging="360"/>
       </w:pPr>
-      <w:rPr>
-        <w:rFonts w:ascii="Wingdings" w:hAnsi="Wingdings" w:hint="default"/>
-        <w:sz w:val="20"/>
-      </w:rPr>
     </w:lvl>
     <w:lvl w:ilvl="4" w:tentative="1">
       <w:start w:val="1"/>
-      <w:numFmt w:val="bullet"/>
-      <w:lvlText w:val=""/>
+      <w:numFmt w:val="decimal"/>
+      <w:lvlText w:val="%5."/>
       <w:lvlJc w:val="left"/>
       <w:pPr>
         <w:tabs>
@@ -7462,15 +8173,11 @@
         </w:tabs>
         <w:ind w:left="3600" w:hanging="360"/>
       </w:pPr>
-      <w:rPr>
-        <w:rFonts w:ascii="Wingdings" w:hAnsi="Wingdings" w:hint="default"/>
-        <w:sz w:val="20"/>
-      </w:rPr>
     </w:lvl>
     <w:lvl w:ilvl="5" w:tentative="1">
       <w:start w:val="1"/>
-      <w:numFmt w:val="bullet"/>
-      <w:lvlText w:val=""/>
+      <w:numFmt w:val="decimal"/>
+      <w:lvlText w:val="%6."/>
       <w:lvlJc w:val="left"/>
       <w:pPr>
         <w:tabs>
@@ -7478,15 +8185,11 @@
         </w:tabs>
         <w:ind w:left="4320" w:hanging="360"/>
       </w:pPr>
-      <w:rPr>
-        <w:rFonts w:ascii="Wingdings" w:hAnsi="Wingdings" w:hint="default"/>
-        <w:sz w:val="20"/>
-      </w:rPr>
     </w:lvl>
     <w:lvl w:ilvl="6" w:tentative="1">
       <w:start w:val="1"/>
-      <w:numFmt w:val="bullet"/>
-      <w:lvlText w:val=""/>
+      <w:numFmt w:val="decimal"/>
+      <w:lvlText w:val="%7."/>
       <w:lvlJc w:val="left"/>
       <w:pPr>
         <w:tabs>
@@ -7494,15 +8197,11 @@
         </w:tabs>
         <w:ind w:left="5040" w:hanging="360"/>
       </w:pPr>
-      <w:rPr>
-        <w:rFonts w:ascii="Wingdings" w:hAnsi="Wingdings" w:hint="default"/>
-        <w:sz w:val="20"/>
-      </w:rPr>
     </w:lvl>
     <w:lvl w:ilvl="7" w:tentative="1">
       <w:start w:val="1"/>
-      <w:numFmt w:val="bullet"/>
-      <w:lvlText w:val=""/>
+      <w:numFmt w:val="decimal"/>
+      <w:lvlText w:val="%8."/>
       <w:lvlJc w:val="left"/>
       <w:pPr>
         <w:tabs>
@@ -7510,15 +8209,11 @@
         </w:tabs>
         <w:ind w:left="5760" w:hanging="360"/>
       </w:pPr>
-      <w:rPr>
-        <w:rFonts w:ascii="Wingdings" w:hAnsi="Wingdings" w:hint="default"/>
-        <w:sz w:val="20"/>
-      </w:rPr>
     </w:lvl>
     <w:lvl w:ilvl="8" w:tentative="1">
       <w:start w:val="1"/>
-      <w:numFmt w:val="bullet"/>
-      <w:lvlText w:val=""/>
+      <w:numFmt w:val="decimal"/>
+      <w:lvlText w:val="%9."/>
       <w:lvlJc w:val="left"/>
       <w:pPr>
         <w:tabs>
@@ -7526,761 +8221,310 @@
         </w:tabs>
         <w:ind w:left="6480" w:hanging="360"/>
       </w:pPr>
-      <w:rPr>
-        <w:rFonts w:ascii="Wingdings" w:hAnsi="Wingdings" w:hint="default"/>
-        <w:sz w:val="20"/>
-      </w:rPr>
-    </w:lvl>
-  </w:abstractNum>
-  <w:abstractNum w:abstractNumId="8" w15:restartNumberingAfterBreak="0">
-    <w:nsid w:val="2A2874E8"/>
-    <w:multiLevelType w:val="multilevel"/>
-    <w:tmpl w:val="85C69C92"/>
-    <w:lvl w:ilvl="0">
-      <w:start w:val="1"/>
-      <w:numFmt w:val="bullet"/>
-      <w:lvlText w:val=""/>
-      <w:lvlJc w:val="left"/>
-      <w:pPr>
-        <w:tabs>
-          <w:tab w:val="num" w:pos="720"/>
-        </w:tabs>
-        <w:ind w:left="720" w:hanging="360"/>
-      </w:pPr>
-      <w:rPr>
-        <w:rFonts w:ascii="Symbol" w:hAnsi="Symbol" w:hint="default"/>
-        <w:sz w:val="20"/>
-      </w:rPr>
-    </w:lvl>
-    <w:lvl w:ilvl="1" w:tentative="1">
-      <w:start w:val="1"/>
-      <w:numFmt w:val="bullet"/>
-      <w:lvlText w:val="o"/>
-      <w:lvlJc w:val="left"/>
-      <w:pPr>
-        <w:tabs>
-          <w:tab w:val="num" w:pos="1440"/>
-        </w:tabs>
-        <w:ind w:left="1440" w:hanging="360"/>
-      </w:pPr>
-      <w:rPr>
-        <w:rFonts w:ascii="Courier New" w:hAnsi="Courier New" w:hint="default"/>
-        <w:sz w:val="20"/>
-      </w:rPr>
-    </w:lvl>
-    <w:lvl w:ilvl="2" w:tentative="1">
-      <w:start w:val="1"/>
-      <w:numFmt w:val="bullet"/>
-      <w:lvlText w:val=""/>
-      <w:lvlJc w:val="left"/>
-      <w:pPr>
-        <w:tabs>
-          <w:tab w:val="num" w:pos="2160"/>
-        </w:tabs>
-        <w:ind w:left="2160" w:hanging="360"/>
-      </w:pPr>
-      <w:rPr>
-        <w:rFonts w:ascii="Wingdings" w:hAnsi="Wingdings" w:hint="default"/>
-        <w:sz w:val="20"/>
-      </w:rPr>
-    </w:lvl>
-    <w:lvl w:ilvl="3" w:tentative="1">
-      <w:start w:val="1"/>
-      <w:numFmt w:val="bullet"/>
-      <w:lvlText w:val=""/>
-      <w:lvlJc w:val="left"/>
-      <w:pPr>
-        <w:tabs>
-          <w:tab w:val="num" w:pos="2880"/>
-        </w:tabs>
-        <w:ind w:left="2880" w:hanging="360"/>
-      </w:pPr>
-      <w:rPr>
-        <w:rFonts w:ascii="Wingdings" w:hAnsi="Wingdings" w:hint="default"/>
-        <w:sz w:val="20"/>
-      </w:rPr>
-    </w:lvl>
-    <w:lvl w:ilvl="4" w:tentative="1">
-      <w:start w:val="1"/>
-      <w:numFmt w:val="bullet"/>
-      <w:lvlText w:val=""/>
-      <w:lvlJc w:val="left"/>
-      <w:pPr>
-        <w:tabs>
-          <w:tab w:val="num" w:pos="3600"/>
-        </w:tabs>
-        <w:ind w:left="3600" w:hanging="360"/>
-      </w:pPr>
-      <w:rPr>
-        <w:rFonts w:ascii="Wingdings" w:hAnsi="Wingdings" w:hint="default"/>
-        <w:sz w:val="20"/>
-      </w:rPr>
-    </w:lvl>
-    <w:lvl w:ilvl="5" w:tentative="1">
-      <w:start w:val="1"/>
-      <w:numFmt w:val="bullet"/>
-      <w:lvlText w:val=""/>
-      <w:lvlJc w:val="left"/>
-      <w:pPr>
-        <w:tabs>
-          <w:tab w:val="num" w:pos="4320"/>
-        </w:tabs>
-        <w:ind w:left="4320" w:hanging="360"/>
-      </w:pPr>
-      <w:rPr>
-        <w:rFonts w:ascii="Wingdings" w:hAnsi="Wingdings" w:hint="default"/>
-        <w:sz w:val="20"/>
-      </w:rPr>
-    </w:lvl>
-    <w:lvl w:ilvl="6" w:tentative="1">
-      <w:start w:val="1"/>
-      <w:numFmt w:val="bullet"/>
-      <w:lvlText w:val=""/>
-      <w:lvlJc w:val="left"/>
-      <w:pPr>
-        <w:tabs>
-          <w:tab w:val="num" w:pos="5040"/>
-        </w:tabs>
-        <w:ind w:left="5040" w:hanging="360"/>
-      </w:pPr>
-      <w:rPr>
-        <w:rFonts w:ascii="Wingdings" w:hAnsi="Wingdings" w:hint="default"/>
-        <w:sz w:val="20"/>
-      </w:rPr>
-    </w:lvl>
-    <w:lvl w:ilvl="7" w:tentative="1">
-      <w:start w:val="1"/>
-      <w:numFmt w:val="bullet"/>
-      <w:lvlText w:val=""/>
-      <w:lvlJc w:val="left"/>
-      <w:pPr>
-        <w:tabs>
-          <w:tab w:val="num" w:pos="5760"/>
-        </w:tabs>
-        <w:ind w:left="5760" w:hanging="360"/>
-      </w:pPr>
-      <w:rPr>
-        <w:rFonts w:ascii="Wingdings" w:hAnsi="Wingdings" w:hint="default"/>
-        <w:sz w:val="20"/>
-      </w:rPr>
-    </w:lvl>
-    <w:lvl w:ilvl="8" w:tentative="1">
-      <w:start w:val="1"/>
-      <w:numFmt w:val="bullet"/>
-      <w:lvlText w:val=""/>
-      <w:lvlJc w:val="left"/>
-      <w:pPr>
-        <w:tabs>
-          <w:tab w:val="num" w:pos="6480"/>
-        </w:tabs>
-        <w:ind w:left="6480" w:hanging="360"/>
-      </w:pPr>
-      <w:rPr>
-        <w:rFonts w:ascii="Wingdings" w:hAnsi="Wingdings" w:hint="default"/>
-        <w:sz w:val="20"/>
-      </w:rPr>
-    </w:lvl>
-  </w:abstractNum>
-  <w:abstractNum w:abstractNumId="9" w15:restartNumberingAfterBreak="0">
-    <w:nsid w:val="2BA940DF"/>
-    <w:multiLevelType w:val="multilevel"/>
-    <w:tmpl w:val="B5B09FE0"/>
-    <w:lvl w:ilvl="0">
-      <w:start w:val="1"/>
-      <w:numFmt w:val="bullet"/>
-      <w:lvlText w:val=""/>
-      <w:lvlJc w:val="left"/>
-      <w:pPr>
-        <w:tabs>
-          <w:tab w:val="num" w:pos="720"/>
-        </w:tabs>
-        <w:ind w:left="720" w:hanging="360"/>
-      </w:pPr>
-      <w:rPr>
-        <w:rFonts w:ascii="Symbol" w:hAnsi="Symbol" w:hint="default"/>
-        <w:sz w:val="20"/>
-      </w:rPr>
-    </w:lvl>
-    <w:lvl w:ilvl="1" w:tentative="1">
-      <w:start w:val="1"/>
-      <w:numFmt w:val="bullet"/>
-      <w:lvlText w:val="o"/>
-      <w:lvlJc w:val="left"/>
-      <w:pPr>
-        <w:tabs>
-          <w:tab w:val="num" w:pos="1440"/>
-        </w:tabs>
-        <w:ind w:left="1440" w:hanging="360"/>
-      </w:pPr>
-      <w:rPr>
-        <w:rFonts w:ascii="Courier New" w:hAnsi="Courier New" w:hint="default"/>
-        <w:sz w:val="20"/>
-      </w:rPr>
-    </w:lvl>
-    <w:lvl w:ilvl="2" w:tentative="1">
-      <w:start w:val="1"/>
-      <w:numFmt w:val="bullet"/>
-      <w:lvlText w:val=""/>
-      <w:lvlJc w:val="left"/>
-      <w:pPr>
-        <w:tabs>
-          <w:tab w:val="num" w:pos="2160"/>
-        </w:tabs>
-        <w:ind w:left="2160" w:hanging="360"/>
-      </w:pPr>
-      <w:rPr>
-        <w:rFonts w:ascii="Wingdings" w:hAnsi="Wingdings" w:hint="default"/>
-        <w:sz w:val="20"/>
-      </w:rPr>
-    </w:lvl>
-    <w:lvl w:ilvl="3" w:tentative="1">
-      <w:start w:val="1"/>
-      <w:numFmt w:val="bullet"/>
-      <w:lvlText w:val=""/>
-      <w:lvlJc w:val="left"/>
-      <w:pPr>
-        <w:tabs>
-          <w:tab w:val="num" w:pos="2880"/>
-        </w:tabs>
-        <w:ind w:left="2880" w:hanging="360"/>
-      </w:pPr>
-      <w:rPr>
-        <w:rFonts w:ascii="Wingdings" w:hAnsi="Wingdings" w:hint="default"/>
-        <w:sz w:val="20"/>
-      </w:rPr>
-    </w:lvl>
-    <w:lvl w:ilvl="4" w:tentative="1">
-      <w:start w:val="1"/>
-      <w:numFmt w:val="bullet"/>
-      <w:lvlText w:val=""/>
-      <w:lvlJc w:val="left"/>
-      <w:pPr>
-        <w:tabs>
-          <w:tab w:val="num" w:pos="3600"/>
-        </w:tabs>
-        <w:ind w:left="3600" w:hanging="360"/>
-      </w:pPr>
-      <w:rPr>
-        <w:rFonts w:ascii="Wingdings" w:hAnsi="Wingdings" w:hint="default"/>
-        <w:sz w:val="20"/>
-      </w:rPr>
-    </w:lvl>
-    <w:lvl w:ilvl="5" w:tentative="1">
-      <w:start w:val="1"/>
-      <w:numFmt w:val="bullet"/>
-      <w:lvlText w:val=""/>
-      <w:lvlJc w:val="left"/>
-      <w:pPr>
-        <w:tabs>
-          <w:tab w:val="num" w:pos="4320"/>
-        </w:tabs>
-        <w:ind w:left="4320" w:hanging="360"/>
-      </w:pPr>
-      <w:rPr>
-        <w:rFonts w:ascii="Wingdings" w:hAnsi="Wingdings" w:hint="default"/>
-        <w:sz w:val="20"/>
-      </w:rPr>
-    </w:lvl>
-    <w:lvl w:ilvl="6" w:tentative="1">
-      <w:start w:val="1"/>
-      <w:numFmt w:val="bullet"/>
-      <w:lvlText w:val=""/>
-      <w:lvlJc w:val="left"/>
-      <w:pPr>
-        <w:tabs>
-          <w:tab w:val="num" w:pos="5040"/>
-        </w:tabs>
-        <w:ind w:left="5040" w:hanging="360"/>
-      </w:pPr>
-      <w:rPr>
-        <w:rFonts w:ascii="Wingdings" w:hAnsi="Wingdings" w:hint="default"/>
-        <w:sz w:val="20"/>
-      </w:rPr>
-    </w:lvl>
-    <w:lvl w:ilvl="7" w:tentative="1">
-      <w:start w:val="1"/>
-      <w:numFmt w:val="bullet"/>
-      <w:lvlText w:val=""/>
-      <w:lvlJc w:val="left"/>
-      <w:pPr>
-        <w:tabs>
-          <w:tab w:val="num" w:pos="5760"/>
-        </w:tabs>
-        <w:ind w:left="5760" w:hanging="360"/>
-      </w:pPr>
-      <w:rPr>
-        <w:rFonts w:ascii="Wingdings" w:hAnsi="Wingdings" w:hint="default"/>
-        <w:sz w:val="20"/>
-      </w:rPr>
-    </w:lvl>
-    <w:lvl w:ilvl="8" w:tentative="1">
-      <w:start w:val="1"/>
-      <w:numFmt w:val="bullet"/>
-      <w:lvlText w:val=""/>
-      <w:lvlJc w:val="left"/>
-      <w:pPr>
-        <w:tabs>
-          <w:tab w:val="num" w:pos="6480"/>
-        </w:tabs>
-        <w:ind w:left="6480" w:hanging="360"/>
-      </w:pPr>
-      <w:rPr>
-        <w:rFonts w:ascii="Wingdings" w:hAnsi="Wingdings" w:hint="default"/>
-        <w:sz w:val="20"/>
-      </w:rPr>
-    </w:lvl>
-  </w:abstractNum>
-  <w:abstractNum w:abstractNumId="10" w15:restartNumberingAfterBreak="0">
-    <w:nsid w:val="2EB50860"/>
-    <w:multiLevelType w:val="multilevel"/>
-    <w:tmpl w:val="D58037E8"/>
-    <w:lvl w:ilvl="0">
-      <w:start w:val="1"/>
-      <w:numFmt w:val="bullet"/>
-      <w:lvlText w:val=""/>
-      <w:lvlJc w:val="left"/>
-      <w:pPr>
-        <w:tabs>
-          <w:tab w:val="num" w:pos="720"/>
-        </w:tabs>
-        <w:ind w:left="720" w:hanging="360"/>
-      </w:pPr>
-      <w:rPr>
-        <w:rFonts w:ascii="Symbol" w:hAnsi="Symbol" w:hint="default"/>
-        <w:sz w:val="20"/>
-      </w:rPr>
-    </w:lvl>
-    <w:lvl w:ilvl="1" w:tentative="1">
-      <w:start w:val="1"/>
-      <w:numFmt w:val="bullet"/>
-      <w:lvlText w:val="o"/>
-      <w:lvlJc w:val="left"/>
-      <w:pPr>
-        <w:tabs>
-          <w:tab w:val="num" w:pos="1440"/>
-        </w:tabs>
-        <w:ind w:left="1440" w:hanging="360"/>
-      </w:pPr>
-      <w:rPr>
-        <w:rFonts w:ascii="Courier New" w:hAnsi="Courier New" w:hint="default"/>
-        <w:sz w:val="20"/>
-      </w:rPr>
-    </w:lvl>
-    <w:lvl w:ilvl="2" w:tentative="1">
-      <w:start w:val="1"/>
-      <w:numFmt w:val="bullet"/>
-      <w:lvlText w:val=""/>
-      <w:lvlJc w:val="left"/>
-      <w:pPr>
-        <w:tabs>
-          <w:tab w:val="num" w:pos="2160"/>
-        </w:tabs>
-        <w:ind w:left="2160" w:hanging="360"/>
-      </w:pPr>
-      <w:rPr>
-        <w:rFonts w:ascii="Wingdings" w:hAnsi="Wingdings" w:hint="default"/>
-        <w:sz w:val="20"/>
-      </w:rPr>
-    </w:lvl>
-    <w:lvl w:ilvl="3" w:tentative="1">
-      <w:start w:val="1"/>
-      <w:numFmt w:val="bullet"/>
-      <w:lvlText w:val=""/>
-      <w:lvlJc w:val="left"/>
-      <w:pPr>
-        <w:tabs>
-          <w:tab w:val="num" w:pos="2880"/>
-        </w:tabs>
-        <w:ind w:left="2880" w:hanging="360"/>
-      </w:pPr>
-      <w:rPr>
-        <w:rFonts w:ascii="Wingdings" w:hAnsi="Wingdings" w:hint="default"/>
-        <w:sz w:val="20"/>
-      </w:rPr>
-    </w:lvl>
-    <w:lvl w:ilvl="4" w:tentative="1">
-      <w:start w:val="1"/>
-      <w:numFmt w:val="bullet"/>
-      <w:lvlText w:val=""/>
-      <w:lvlJc w:val="left"/>
-      <w:pPr>
-        <w:tabs>
-          <w:tab w:val="num" w:pos="3600"/>
-        </w:tabs>
-        <w:ind w:left="3600" w:hanging="360"/>
-      </w:pPr>
-      <w:rPr>
-        <w:rFonts w:ascii="Wingdings" w:hAnsi="Wingdings" w:hint="default"/>
-        <w:sz w:val="20"/>
-      </w:rPr>
-    </w:lvl>
-    <w:lvl w:ilvl="5" w:tentative="1">
-      <w:start w:val="1"/>
-      <w:numFmt w:val="bullet"/>
-      <w:lvlText w:val=""/>
-      <w:lvlJc w:val="left"/>
-      <w:pPr>
-        <w:tabs>
-          <w:tab w:val="num" w:pos="4320"/>
-        </w:tabs>
-        <w:ind w:left="4320" w:hanging="360"/>
-      </w:pPr>
-      <w:rPr>
-        <w:rFonts w:ascii="Wingdings" w:hAnsi="Wingdings" w:hint="default"/>
-        <w:sz w:val="20"/>
-      </w:rPr>
-    </w:lvl>
-    <w:lvl w:ilvl="6" w:tentative="1">
-      <w:start w:val="1"/>
-      <w:numFmt w:val="bullet"/>
-      <w:lvlText w:val=""/>
-      <w:lvlJc w:val="left"/>
-      <w:pPr>
-        <w:tabs>
-          <w:tab w:val="num" w:pos="5040"/>
-        </w:tabs>
-        <w:ind w:left="5040" w:hanging="360"/>
-      </w:pPr>
-      <w:rPr>
-        <w:rFonts w:ascii="Wingdings" w:hAnsi="Wingdings" w:hint="default"/>
-        <w:sz w:val="20"/>
-      </w:rPr>
-    </w:lvl>
-    <w:lvl w:ilvl="7" w:tentative="1">
-      <w:start w:val="1"/>
-      <w:numFmt w:val="bullet"/>
-      <w:lvlText w:val=""/>
-      <w:lvlJc w:val="left"/>
-      <w:pPr>
-        <w:tabs>
-          <w:tab w:val="num" w:pos="5760"/>
-        </w:tabs>
-        <w:ind w:left="5760" w:hanging="360"/>
-      </w:pPr>
-      <w:rPr>
-        <w:rFonts w:ascii="Wingdings" w:hAnsi="Wingdings" w:hint="default"/>
-        <w:sz w:val="20"/>
-      </w:rPr>
-    </w:lvl>
-    <w:lvl w:ilvl="8" w:tentative="1">
-      <w:start w:val="1"/>
-      <w:numFmt w:val="bullet"/>
-      <w:lvlText w:val=""/>
-      <w:lvlJc w:val="left"/>
-      <w:pPr>
-        <w:tabs>
-          <w:tab w:val="num" w:pos="6480"/>
-        </w:tabs>
-        <w:ind w:left="6480" w:hanging="360"/>
-      </w:pPr>
-      <w:rPr>
-        <w:rFonts w:ascii="Wingdings" w:hAnsi="Wingdings" w:hint="default"/>
-        <w:sz w:val="20"/>
-      </w:rPr>
-    </w:lvl>
-  </w:abstractNum>
-  <w:abstractNum w:abstractNumId="11" w15:restartNumberingAfterBreak="0">
-    <w:nsid w:val="34FD05B9"/>
-    <w:multiLevelType w:val="multilevel"/>
-    <w:tmpl w:val="99283072"/>
-    <w:lvl w:ilvl="0">
-      <w:start w:val="1"/>
-      <w:numFmt w:val="bullet"/>
-      <w:lvlText w:val=""/>
-      <w:lvlJc w:val="left"/>
-      <w:pPr>
-        <w:tabs>
-          <w:tab w:val="num" w:pos="720"/>
-        </w:tabs>
-        <w:ind w:left="720" w:hanging="360"/>
-      </w:pPr>
-      <w:rPr>
-        <w:rFonts w:ascii="Symbol" w:hAnsi="Symbol" w:hint="default"/>
-        <w:sz w:val="20"/>
-      </w:rPr>
-    </w:lvl>
-    <w:lvl w:ilvl="1" w:tentative="1">
-      <w:start w:val="1"/>
-      <w:numFmt w:val="bullet"/>
-      <w:lvlText w:val="o"/>
-      <w:lvlJc w:val="left"/>
-      <w:pPr>
-        <w:tabs>
-          <w:tab w:val="num" w:pos="1440"/>
-        </w:tabs>
-        <w:ind w:left="1440" w:hanging="360"/>
-      </w:pPr>
-      <w:rPr>
-        <w:rFonts w:ascii="Courier New" w:hAnsi="Courier New" w:hint="default"/>
-        <w:sz w:val="20"/>
-      </w:rPr>
-    </w:lvl>
-    <w:lvl w:ilvl="2" w:tentative="1">
-      <w:start w:val="1"/>
-      <w:numFmt w:val="bullet"/>
-      <w:lvlText w:val=""/>
-      <w:lvlJc w:val="left"/>
-      <w:pPr>
-        <w:tabs>
-          <w:tab w:val="num" w:pos="2160"/>
-        </w:tabs>
-        <w:ind w:left="2160" w:hanging="360"/>
-      </w:pPr>
-      <w:rPr>
-        <w:rFonts w:ascii="Wingdings" w:hAnsi="Wingdings" w:hint="default"/>
-        <w:sz w:val="20"/>
-      </w:rPr>
-    </w:lvl>
-    <w:lvl w:ilvl="3" w:tentative="1">
-      <w:start w:val="1"/>
-      <w:numFmt w:val="bullet"/>
-      <w:lvlText w:val=""/>
-      <w:lvlJc w:val="left"/>
-      <w:pPr>
-        <w:tabs>
-          <w:tab w:val="num" w:pos="2880"/>
-        </w:tabs>
-        <w:ind w:left="2880" w:hanging="360"/>
-      </w:pPr>
-      <w:rPr>
-        <w:rFonts w:ascii="Wingdings" w:hAnsi="Wingdings" w:hint="default"/>
-        <w:sz w:val="20"/>
-      </w:rPr>
-    </w:lvl>
-    <w:lvl w:ilvl="4" w:tentative="1">
-      <w:start w:val="1"/>
-      <w:numFmt w:val="bullet"/>
-      <w:lvlText w:val=""/>
-      <w:lvlJc w:val="left"/>
-      <w:pPr>
-        <w:tabs>
-          <w:tab w:val="num" w:pos="3600"/>
-        </w:tabs>
-        <w:ind w:left="3600" w:hanging="360"/>
-      </w:pPr>
-      <w:rPr>
-        <w:rFonts w:ascii="Wingdings" w:hAnsi="Wingdings" w:hint="default"/>
-        <w:sz w:val="20"/>
-      </w:rPr>
-    </w:lvl>
-    <w:lvl w:ilvl="5" w:tentative="1">
-      <w:start w:val="1"/>
-      <w:numFmt w:val="bullet"/>
-      <w:lvlText w:val=""/>
-      <w:lvlJc w:val="left"/>
-      <w:pPr>
-        <w:tabs>
-          <w:tab w:val="num" w:pos="4320"/>
-        </w:tabs>
-        <w:ind w:left="4320" w:hanging="360"/>
-      </w:pPr>
-      <w:rPr>
-        <w:rFonts w:ascii="Wingdings" w:hAnsi="Wingdings" w:hint="default"/>
-        <w:sz w:val="20"/>
-      </w:rPr>
-    </w:lvl>
-    <w:lvl w:ilvl="6" w:tentative="1">
-      <w:start w:val="1"/>
-      <w:numFmt w:val="bullet"/>
-      <w:lvlText w:val=""/>
-      <w:lvlJc w:val="left"/>
-      <w:pPr>
-        <w:tabs>
-          <w:tab w:val="num" w:pos="5040"/>
-        </w:tabs>
-        <w:ind w:left="5040" w:hanging="360"/>
-      </w:pPr>
-      <w:rPr>
-        <w:rFonts w:ascii="Wingdings" w:hAnsi="Wingdings" w:hint="default"/>
-        <w:sz w:val="20"/>
-      </w:rPr>
-    </w:lvl>
-    <w:lvl w:ilvl="7" w:tentative="1">
-      <w:start w:val="1"/>
-      <w:numFmt w:val="bullet"/>
-      <w:lvlText w:val=""/>
-      <w:lvlJc w:val="left"/>
-      <w:pPr>
-        <w:tabs>
-          <w:tab w:val="num" w:pos="5760"/>
-        </w:tabs>
-        <w:ind w:left="5760" w:hanging="360"/>
-      </w:pPr>
-      <w:rPr>
-        <w:rFonts w:ascii="Wingdings" w:hAnsi="Wingdings" w:hint="default"/>
-        <w:sz w:val="20"/>
-      </w:rPr>
-    </w:lvl>
-    <w:lvl w:ilvl="8" w:tentative="1">
-      <w:start w:val="1"/>
-      <w:numFmt w:val="bullet"/>
-      <w:lvlText w:val=""/>
-      <w:lvlJc w:val="left"/>
-      <w:pPr>
-        <w:tabs>
-          <w:tab w:val="num" w:pos="6480"/>
-        </w:tabs>
-        <w:ind w:left="6480" w:hanging="360"/>
-      </w:pPr>
-      <w:rPr>
-        <w:rFonts w:ascii="Wingdings" w:hAnsi="Wingdings" w:hint="default"/>
-        <w:sz w:val="20"/>
-      </w:rPr>
-    </w:lvl>
-  </w:abstractNum>
-  <w:abstractNum w:abstractNumId="12" w15:restartNumberingAfterBreak="0">
-    <w:nsid w:val="37EA5365"/>
-    <w:multiLevelType w:val="multilevel"/>
-    <w:tmpl w:val="5B8463CA"/>
-    <w:lvl w:ilvl="0">
-      <w:start w:val="1"/>
-      <w:numFmt w:val="bullet"/>
-      <w:lvlText w:val=""/>
-      <w:lvlJc w:val="left"/>
-      <w:pPr>
-        <w:tabs>
-          <w:tab w:val="num" w:pos="720"/>
-        </w:tabs>
-        <w:ind w:left="720" w:hanging="360"/>
-      </w:pPr>
-      <w:rPr>
-        <w:rFonts w:ascii="Symbol" w:hAnsi="Symbol" w:hint="default"/>
-        <w:sz w:val="20"/>
-      </w:rPr>
-    </w:lvl>
-    <w:lvl w:ilvl="1" w:tentative="1">
-      <w:start w:val="1"/>
-      <w:numFmt w:val="bullet"/>
-      <w:lvlText w:val="o"/>
-      <w:lvlJc w:val="left"/>
-      <w:pPr>
-        <w:tabs>
-          <w:tab w:val="num" w:pos="1440"/>
-        </w:tabs>
-        <w:ind w:left="1440" w:hanging="360"/>
-      </w:pPr>
-      <w:rPr>
-        <w:rFonts w:ascii="Courier New" w:hAnsi="Courier New" w:hint="default"/>
-        <w:sz w:val="20"/>
-      </w:rPr>
-    </w:lvl>
-    <w:lvl w:ilvl="2" w:tentative="1">
-      <w:start w:val="1"/>
-      <w:numFmt w:val="bullet"/>
-      <w:lvlText w:val=""/>
-      <w:lvlJc w:val="left"/>
-      <w:pPr>
-        <w:tabs>
-          <w:tab w:val="num" w:pos="2160"/>
-        </w:tabs>
-        <w:ind w:left="2160" w:hanging="360"/>
-      </w:pPr>
-      <w:rPr>
-        <w:rFonts w:ascii="Wingdings" w:hAnsi="Wingdings" w:hint="default"/>
-        <w:sz w:val="20"/>
-      </w:rPr>
-    </w:lvl>
-    <w:lvl w:ilvl="3" w:tentative="1">
-      <w:start w:val="1"/>
-      <w:numFmt w:val="bullet"/>
-      <w:lvlText w:val=""/>
-      <w:lvlJc w:val="left"/>
-      <w:pPr>
-        <w:tabs>
-          <w:tab w:val="num" w:pos="2880"/>
-        </w:tabs>
-        <w:ind w:left="2880" w:hanging="360"/>
-      </w:pPr>
-      <w:rPr>
-        <w:rFonts w:ascii="Wingdings" w:hAnsi="Wingdings" w:hint="default"/>
-        <w:sz w:val="20"/>
-      </w:rPr>
-    </w:lvl>
-    <w:lvl w:ilvl="4" w:tentative="1">
-      <w:start w:val="1"/>
-      <w:numFmt w:val="bullet"/>
-      <w:lvlText w:val=""/>
-      <w:lvlJc w:val="left"/>
-      <w:pPr>
-        <w:tabs>
-          <w:tab w:val="num" w:pos="3600"/>
-        </w:tabs>
-        <w:ind w:left="3600" w:hanging="360"/>
-      </w:pPr>
-      <w:rPr>
-        <w:rFonts w:ascii="Wingdings" w:hAnsi="Wingdings" w:hint="default"/>
-        <w:sz w:val="20"/>
-      </w:rPr>
-    </w:lvl>
-    <w:lvl w:ilvl="5" w:tentative="1">
-      <w:start w:val="1"/>
-      <w:numFmt w:val="bullet"/>
-      <w:lvlText w:val=""/>
-      <w:lvlJc w:val="left"/>
-      <w:pPr>
-        <w:tabs>
-          <w:tab w:val="num" w:pos="4320"/>
-        </w:tabs>
-        <w:ind w:left="4320" w:hanging="360"/>
-      </w:pPr>
-      <w:rPr>
-        <w:rFonts w:ascii="Wingdings" w:hAnsi="Wingdings" w:hint="default"/>
-        <w:sz w:val="20"/>
-      </w:rPr>
-    </w:lvl>
-    <w:lvl w:ilvl="6" w:tentative="1">
-      <w:start w:val="1"/>
-      <w:numFmt w:val="bullet"/>
-      <w:lvlText w:val=""/>
-      <w:lvlJc w:val="left"/>
-      <w:pPr>
-        <w:tabs>
-          <w:tab w:val="num" w:pos="5040"/>
-        </w:tabs>
-        <w:ind w:left="5040" w:hanging="360"/>
-      </w:pPr>
-      <w:rPr>
-        <w:rFonts w:ascii="Wingdings" w:hAnsi="Wingdings" w:hint="default"/>
-        <w:sz w:val="20"/>
-      </w:rPr>
-    </w:lvl>
-    <w:lvl w:ilvl="7" w:tentative="1">
-      <w:start w:val="1"/>
-      <w:numFmt w:val="bullet"/>
-      <w:lvlText w:val=""/>
-      <w:lvlJc w:val="left"/>
-      <w:pPr>
-        <w:tabs>
-          <w:tab w:val="num" w:pos="5760"/>
-        </w:tabs>
-        <w:ind w:left="5760" w:hanging="360"/>
-      </w:pPr>
-      <w:rPr>
-        <w:rFonts w:ascii="Wingdings" w:hAnsi="Wingdings" w:hint="default"/>
-        <w:sz w:val="20"/>
-      </w:rPr>
-    </w:lvl>
-    <w:lvl w:ilvl="8" w:tentative="1">
-      <w:start w:val="1"/>
-      <w:numFmt w:val="bullet"/>
-      <w:lvlText w:val=""/>
-      <w:lvlJc w:val="left"/>
-      <w:pPr>
-        <w:tabs>
-          <w:tab w:val="num" w:pos="6480"/>
-        </w:tabs>
-        <w:ind w:left="6480" w:hanging="360"/>
-      </w:pPr>
-      <w:rPr>
-        <w:rFonts w:ascii="Wingdings" w:hAnsi="Wingdings" w:hint="default"/>
-        <w:sz w:val="20"/>
-      </w:rPr>
     </w:lvl>
   </w:abstractNum>
   <w:abstractNum w:abstractNumId="13" w15:restartNumberingAfterBreak="0">
-    <w:nsid w:val="47BC41ED"/>
+    <w:nsid w:val="57040D45"/>
     <w:multiLevelType w:val="multilevel"/>
-    <w:tmpl w:val="A7A4A872"/>
+    <w:tmpl w:val="7548E8EE"/>
+    <w:lvl w:ilvl="0">
+      <w:start w:val="1"/>
+      <w:numFmt w:val="bullet"/>
+      <w:lvlText w:val=""/>
+      <w:lvlJc w:val="left"/>
+      <w:pPr>
+        <w:tabs>
+          <w:tab w:val="num" w:pos="720"/>
+        </w:tabs>
+        <w:ind w:left="720" w:hanging="360"/>
+      </w:pPr>
+      <w:rPr>
+        <w:rFonts w:ascii="Symbol" w:hAnsi="Symbol" w:hint="default"/>
+        <w:sz w:val="20"/>
+      </w:rPr>
+    </w:lvl>
+    <w:lvl w:ilvl="1" w:tentative="1">
+      <w:start w:val="1"/>
+      <w:numFmt w:val="bullet"/>
+      <w:lvlText w:val="o"/>
+      <w:lvlJc w:val="left"/>
+      <w:pPr>
+        <w:tabs>
+          <w:tab w:val="num" w:pos="1440"/>
+        </w:tabs>
+        <w:ind w:left="1440" w:hanging="360"/>
+      </w:pPr>
+      <w:rPr>
+        <w:rFonts w:ascii="Courier New" w:hAnsi="Courier New" w:hint="default"/>
+        <w:sz w:val="20"/>
+      </w:rPr>
+    </w:lvl>
+    <w:lvl w:ilvl="2" w:tentative="1">
+      <w:start w:val="1"/>
+      <w:numFmt w:val="bullet"/>
+      <w:lvlText w:val=""/>
+      <w:lvlJc w:val="left"/>
+      <w:pPr>
+        <w:tabs>
+          <w:tab w:val="num" w:pos="2160"/>
+        </w:tabs>
+        <w:ind w:left="2160" w:hanging="360"/>
+      </w:pPr>
+      <w:rPr>
+        <w:rFonts w:ascii="Wingdings" w:hAnsi="Wingdings" w:hint="default"/>
+        <w:sz w:val="20"/>
+      </w:rPr>
+    </w:lvl>
+    <w:lvl w:ilvl="3" w:tentative="1">
+      <w:start w:val="1"/>
+      <w:numFmt w:val="bullet"/>
+      <w:lvlText w:val=""/>
+      <w:lvlJc w:val="left"/>
+      <w:pPr>
+        <w:tabs>
+          <w:tab w:val="num" w:pos="2880"/>
+        </w:tabs>
+        <w:ind w:left="2880" w:hanging="360"/>
+      </w:pPr>
+      <w:rPr>
+        <w:rFonts w:ascii="Wingdings" w:hAnsi="Wingdings" w:hint="default"/>
+        <w:sz w:val="20"/>
+      </w:rPr>
+    </w:lvl>
+    <w:lvl w:ilvl="4" w:tentative="1">
+      <w:start w:val="1"/>
+      <w:numFmt w:val="bullet"/>
+      <w:lvlText w:val=""/>
+      <w:lvlJc w:val="left"/>
+      <w:pPr>
+        <w:tabs>
+          <w:tab w:val="num" w:pos="3600"/>
+        </w:tabs>
+        <w:ind w:left="3600" w:hanging="360"/>
+      </w:pPr>
+      <w:rPr>
+        <w:rFonts w:ascii="Wingdings" w:hAnsi="Wingdings" w:hint="default"/>
+        <w:sz w:val="20"/>
+      </w:rPr>
+    </w:lvl>
+    <w:lvl w:ilvl="5" w:tentative="1">
+      <w:start w:val="1"/>
+      <w:numFmt w:val="bullet"/>
+      <w:lvlText w:val=""/>
+      <w:lvlJc w:val="left"/>
+      <w:pPr>
+        <w:tabs>
+          <w:tab w:val="num" w:pos="4320"/>
+        </w:tabs>
+        <w:ind w:left="4320" w:hanging="360"/>
+      </w:pPr>
+      <w:rPr>
+        <w:rFonts w:ascii="Wingdings" w:hAnsi="Wingdings" w:hint="default"/>
+        <w:sz w:val="20"/>
+      </w:rPr>
+    </w:lvl>
+    <w:lvl w:ilvl="6" w:tentative="1">
+      <w:start w:val="1"/>
+      <w:numFmt w:val="bullet"/>
+      <w:lvlText w:val=""/>
+      <w:lvlJc w:val="left"/>
+      <w:pPr>
+        <w:tabs>
+          <w:tab w:val="num" w:pos="5040"/>
+        </w:tabs>
+        <w:ind w:left="5040" w:hanging="360"/>
+      </w:pPr>
+      <w:rPr>
+        <w:rFonts w:ascii="Wingdings" w:hAnsi="Wingdings" w:hint="default"/>
+        <w:sz w:val="20"/>
+      </w:rPr>
+    </w:lvl>
+    <w:lvl w:ilvl="7" w:tentative="1">
+      <w:start w:val="1"/>
+      <w:numFmt w:val="bullet"/>
+      <w:lvlText w:val=""/>
+      <w:lvlJc w:val="left"/>
+      <w:pPr>
+        <w:tabs>
+          <w:tab w:val="num" w:pos="5760"/>
+        </w:tabs>
+        <w:ind w:left="5760" w:hanging="360"/>
+      </w:pPr>
+      <w:rPr>
+        <w:rFonts w:ascii="Wingdings" w:hAnsi="Wingdings" w:hint="default"/>
+        <w:sz w:val="20"/>
+      </w:rPr>
+    </w:lvl>
+    <w:lvl w:ilvl="8" w:tentative="1">
+      <w:start w:val="1"/>
+      <w:numFmt w:val="bullet"/>
+      <w:lvlText w:val=""/>
+      <w:lvlJc w:val="left"/>
+      <w:pPr>
+        <w:tabs>
+          <w:tab w:val="num" w:pos="6480"/>
+        </w:tabs>
+        <w:ind w:left="6480" w:hanging="360"/>
+      </w:pPr>
+      <w:rPr>
+        <w:rFonts w:ascii="Wingdings" w:hAnsi="Wingdings" w:hint="default"/>
+        <w:sz w:val="20"/>
+      </w:rPr>
+    </w:lvl>
+  </w:abstractNum>
+  <w:abstractNum w:abstractNumId="14" w15:restartNumberingAfterBreak="0">
+    <w:nsid w:val="5AE012BE"/>
+    <w:multiLevelType w:val="multilevel"/>
+    <w:tmpl w:val="71EE3C04"/>
+    <w:lvl w:ilvl="0">
+      <w:start w:val="1"/>
+      <w:numFmt w:val="bullet"/>
+      <w:lvlText w:val=""/>
+      <w:lvlJc w:val="left"/>
+      <w:pPr>
+        <w:tabs>
+          <w:tab w:val="num" w:pos="720"/>
+        </w:tabs>
+        <w:ind w:left="720" w:hanging="360"/>
+      </w:pPr>
+      <w:rPr>
+        <w:rFonts w:ascii="Symbol" w:hAnsi="Symbol" w:hint="default"/>
+        <w:sz w:val="20"/>
+      </w:rPr>
+    </w:lvl>
+    <w:lvl w:ilvl="1" w:tentative="1">
+      <w:start w:val="1"/>
+      <w:numFmt w:val="bullet"/>
+      <w:lvlText w:val="o"/>
+      <w:lvlJc w:val="left"/>
+      <w:pPr>
+        <w:tabs>
+          <w:tab w:val="num" w:pos="1440"/>
+        </w:tabs>
+        <w:ind w:left="1440" w:hanging="360"/>
+      </w:pPr>
+      <w:rPr>
+        <w:rFonts w:ascii="Courier New" w:hAnsi="Courier New" w:hint="default"/>
+        <w:sz w:val="20"/>
+      </w:rPr>
+    </w:lvl>
+    <w:lvl w:ilvl="2" w:tentative="1">
+      <w:start w:val="1"/>
+      <w:numFmt w:val="bullet"/>
+      <w:lvlText w:val=""/>
+      <w:lvlJc w:val="left"/>
+      <w:pPr>
+        <w:tabs>
+          <w:tab w:val="num" w:pos="2160"/>
+        </w:tabs>
+        <w:ind w:left="2160" w:hanging="360"/>
+      </w:pPr>
+      <w:rPr>
+        <w:rFonts w:ascii="Wingdings" w:hAnsi="Wingdings" w:hint="default"/>
+        <w:sz w:val="20"/>
+      </w:rPr>
+    </w:lvl>
+    <w:lvl w:ilvl="3" w:tentative="1">
+      <w:start w:val="1"/>
+      <w:numFmt w:val="bullet"/>
+      <w:lvlText w:val=""/>
+      <w:lvlJc w:val="left"/>
+      <w:pPr>
+        <w:tabs>
+          <w:tab w:val="num" w:pos="2880"/>
+        </w:tabs>
+        <w:ind w:left="2880" w:hanging="360"/>
+      </w:pPr>
+      <w:rPr>
+        <w:rFonts w:ascii="Wingdings" w:hAnsi="Wingdings" w:hint="default"/>
+        <w:sz w:val="20"/>
+      </w:rPr>
+    </w:lvl>
+    <w:lvl w:ilvl="4" w:tentative="1">
+      <w:start w:val="1"/>
+      <w:numFmt w:val="bullet"/>
+      <w:lvlText w:val=""/>
+      <w:lvlJc w:val="left"/>
+      <w:pPr>
+        <w:tabs>
+          <w:tab w:val="num" w:pos="3600"/>
+        </w:tabs>
+        <w:ind w:left="3600" w:hanging="360"/>
+      </w:pPr>
+      <w:rPr>
+        <w:rFonts w:ascii="Wingdings" w:hAnsi="Wingdings" w:hint="default"/>
+        <w:sz w:val="20"/>
+      </w:rPr>
+    </w:lvl>
+    <w:lvl w:ilvl="5" w:tentative="1">
+      <w:start w:val="1"/>
+      <w:numFmt w:val="bullet"/>
+      <w:lvlText w:val=""/>
+      <w:lvlJc w:val="left"/>
+      <w:pPr>
+        <w:tabs>
+          <w:tab w:val="num" w:pos="4320"/>
+        </w:tabs>
+        <w:ind w:left="4320" w:hanging="360"/>
+      </w:pPr>
+      <w:rPr>
+        <w:rFonts w:ascii="Wingdings" w:hAnsi="Wingdings" w:hint="default"/>
+        <w:sz w:val="20"/>
+      </w:rPr>
+    </w:lvl>
+    <w:lvl w:ilvl="6" w:tentative="1">
+      <w:start w:val="1"/>
+      <w:numFmt w:val="bullet"/>
+      <w:lvlText w:val=""/>
+      <w:lvlJc w:val="left"/>
+      <w:pPr>
+        <w:tabs>
+          <w:tab w:val="num" w:pos="5040"/>
+        </w:tabs>
+        <w:ind w:left="5040" w:hanging="360"/>
+      </w:pPr>
+      <w:rPr>
+        <w:rFonts w:ascii="Wingdings" w:hAnsi="Wingdings" w:hint="default"/>
+        <w:sz w:val="20"/>
+      </w:rPr>
+    </w:lvl>
+    <w:lvl w:ilvl="7" w:tentative="1">
+      <w:start w:val="1"/>
+      <w:numFmt w:val="bullet"/>
+      <w:lvlText w:val=""/>
+      <w:lvlJc w:val="left"/>
+      <w:pPr>
+        <w:tabs>
+          <w:tab w:val="num" w:pos="5760"/>
+        </w:tabs>
+        <w:ind w:left="5760" w:hanging="360"/>
+      </w:pPr>
+      <w:rPr>
+        <w:rFonts w:ascii="Wingdings" w:hAnsi="Wingdings" w:hint="default"/>
+        <w:sz w:val="20"/>
+      </w:rPr>
+    </w:lvl>
+    <w:lvl w:ilvl="8" w:tentative="1">
+      <w:start w:val="1"/>
+      <w:numFmt w:val="bullet"/>
+      <w:lvlText w:val=""/>
+      <w:lvlJc w:val="left"/>
+      <w:pPr>
+        <w:tabs>
+          <w:tab w:val="num" w:pos="6480"/>
+        </w:tabs>
+        <w:ind w:left="6480" w:hanging="360"/>
+      </w:pPr>
+      <w:rPr>
+        <w:rFonts w:ascii="Wingdings" w:hAnsi="Wingdings" w:hint="default"/>
+        <w:sz w:val="20"/>
+      </w:rPr>
+    </w:lvl>
+  </w:abstractNum>
+  <w:abstractNum w:abstractNumId="15" w15:restartNumberingAfterBreak="0">
+    <w:nsid w:val="5BC9096B"/>
+    <w:multiLevelType w:val="multilevel"/>
+    <w:tmpl w:val="E8464B1E"/>
     <w:lvl w:ilvl="0">
       <w:start w:val="1"/>
       <w:numFmt w:val="decimal"/>
@@ -8394,308 +8638,10 @@
       </w:pPr>
     </w:lvl>
   </w:abstractNum>
-  <w:abstractNum w:abstractNumId="14" w15:restartNumberingAfterBreak="0">
-    <w:nsid w:val="49866DCE"/>
+  <w:abstractNum w:abstractNumId="16" w15:restartNumberingAfterBreak="0">
+    <w:nsid w:val="61C87A82"/>
     <w:multiLevelType w:val="multilevel"/>
-    <w:tmpl w:val="6BD06888"/>
-    <w:lvl w:ilvl="0">
-      <w:start w:val="1"/>
-      <w:numFmt w:val="bullet"/>
-      <w:lvlText w:val=""/>
-      <w:lvlJc w:val="left"/>
-      <w:pPr>
-        <w:tabs>
-          <w:tab w:val="num" w:pos="720"/>
-        </w:tabs>
-        <w:ind w:left="720" w:hanging="360"/>
-      </w:pPr>
-      <w:rPr>
-        <w:rFonts w:ascii="Symbol" w:hAnsi="Symbol" w:hint="default"/>
-        <w:sz w:val="20"/>
-      </w:rPr>
-    </w:lvl>
-    <w:lvl w:ilvl="1" w:tentative="1">
-      <w:start w:val="1"/>
-      <w:numFmt w:val="bullet"/>
-      <w:lvlText w:val="o"/>
-      <w:lvlJc w:val="left"/>
-      <w:pPr>
-        <w:tabs>
-          <w:tab w:val="num" w:pos="1440"/>
-        </w:tabs>
-        <w:ind w:left="1440" w:hanging="360"/>
-      </w:pPr>
-      <w:rPr>
-        <w:rFonts w:ascii="Courier New" w:hAnsi="Courier New" w:hint="default"/>
-        <w:sz w:val="20"/>
-      </w:rPr>
-    </w:lvl>
-    <w:lvl w:ilvl="2" w:tentative="1">
-      <w:start w:val="1"/>
-      <w:numFmt w:val="bullet"/>
-      <w:lvlText w:val=""/>
-      <w:lvlJc w:val="left"/>
-      <w:pPr>
-        <w:tabs>
-          <w:tab w:val="num" w:pos="2160"/>
-        </w:tabs>
-        <w:ind w:left="2160" w:hanging="360"/>
-      </w:pPr>
-      <w:rPr>
-        <w:rFonts w:ascii="Wingdings" w:hAnsi="Wingdings" w:hint="default"/>
-        <w:sz w:val="20"/>
-      </w:rPr>
-    </w:lvl>
-    <w:lvl w:ilvl="3" w:tentative="1">
-      <w:start w:val="1"/>
-      <w:numFmt w:val="bullet"/>
-      <w:lvlText w:val=""/>
-      <w:lvlJc w:val="left"/>
-      <w:pPr>
-        <w:tabs>
-          <w:tab w:val="num" w:pos="2880"/>
-        </w:tabs>
-        <w:ind w:left="2880" w:hanging="360"/>
-      </w:pPr>
-      <w:rPr>
-        <w:rFonts w:ascii="Wingdings" w:hAnsi="Wingdings" w:hint="default"/>
-        <w:sz w:val="20"/>
-      </w:rPr>
-    </w:lvl>
-    <w:lvl w:ilvl="4" w:tentative="1">
-      <w:start w:val="1"/>
-      <w:numFmt w:val="bullet"/>
-      <w:lvlText w:val=""/>
-      <w:lvlJc w:val="left"/>
-      <w:pPr>
-        <w:tabs>
-          <w:tab w:val="num" w:pos="3600"/>
-        </w:tabs>
-        <w:ind w:left="3600" w:hanging="360"/>
-      </w:pPr>
-      <w:rPr>
-        <w:rFonts w:ascii="Wingdings" w:hAnsi="Wingdings" w:hint="default"/>
-        <w:sz w:val="20"/>
-      </w:rPr>
-    </w:lvl>
-    <w:lvl w:ilvl="5" w:tentative="1">
-      <w:start w:val="1"/>
-      <w:numFmt w:val="bullet"/>
-      <w:lvlText w:val=""/>
-      <w:lvlJc w:val="left"/>
-      <w:pPr>
-        <w:tabs>
-          <w:tab w:val="num" w:pos="4320"/>
-        </w:tabs>
-        <w:ind w:left="4320" w:hanging="360"/>
-      </w:pPr>
-      <w:rPr>
-        <w:rFonts w:ascii="Wingdings" w:hAnsi="Wingdings" w:hint="default"/>
-        <w:sz w:val="20"/>
-      </w:rPr>
-    </w:lvl>
-    <w:lvl w:ilvl="6" w:tentative="1">
-      <w:start w:val="1"/>
-      <w:numFmt w:val="bullet"/>
-      <w:lvlText w:val=""/>
-      <w:lvlJc w:val="left"/>
-      <w:pPr>
-        <w:tabs>
-          <w:tab w:val="num" w:pos="5040"/>
-        </w:tabs>
-        <w:ind w:left="5040" w:hanging="360"/>
-      </w:pPr>
-      <w:rPr>
-        <w:rFonts w:ascii="Wingdings" w:hAnsi="Wingdings" w:hint="default"/>
-        <w:sz w:val="20"/>
-      </w:rPr>
-    </w:lvl>
-    <w:lvl w:ilvl="7" w:tentative="1">
-      <w:start w:val="1"/>
-      <w:numFmt w:val="bullet"/>
-      <w:lvlText w:val=""/>
-      <w:lvlJc w:val="left"/>
-      <w:pPr>
-        <w:tabs>
-          <w:tab w:val="num" w:pos="5760"/>
-        </w:tabs>
-        <w:ind w:left="5760" w:hanging="360"/>
-      </w:pPr>
-      <w:rPr>
-        <w:rFonts w:ascii="Wingdings" w:hAnsi="Wingdings" w:hint="default"/>
-        <w:sz w:val="20"/>
-      </w:rPr>
-    </w:lvl>
-    <w:lvl w:ilvl="8" w:tentative="1">
-      <w:start w:val="1"/>
-      <w:numFmt w:val="bullet"/>
-      <w:lvlText w:val=""/>
-      <w:lvlJc w:val="left"/>
-      <w:pPr>
-        <w:tabs>
-          <w:tab w:val="num" w:pos="6480"/>
-        </w:tabs>
-        <w:ind w:left="6480" w:hanging="360"/>
-      </w:pPr>
-      <w:rPr>
-        <w:rFonts w:ascii="Wingdings" w:hAnsi="Wingdings" w:hint="default"/>
-        <w:sz w:val="20"/>
-      </w:rPr>
-    </w:lvl>
-  </w:abstractNum>
-  <w:abstractNum w:abstractNumId="15" w15:restartNumberingAfterBreak="0">
-    <w:nsid w:val="4C661A88"/>
-    <w:multiLevelType w:val="multilevel"/>
-    <w:tmpl w:val="270C5A7A"/>
-    <w:lvl w:ilvl="0">
-      <w:start w:val="1"/>
-      <w:numFmt w:val="bullet"/>
-      <w:lvlText w:val=""/>
-      <w:lvlJc w:val="left"/>
-      <w:pPr>
-        <w:tabs>
-          <w:tab w:val="num" w:pos="720"/>
-        </w:tabs>
-        <w:ind w:left="720" w:hanging="360"/>
-      </w:pPr>
-      <w:rPr>
-        <w:rFonts w:ascii="Symbol" w:hAnsi="Symbol" w:hint="default"/>
-        <w:sz w:val="20"/>
-      </w:rPr>
-    </w:lvl>
-    <w:lvl w:ilvl="1" w:tentative="1">
-      <w:start w:val="1"/>
-      <w:numFmt w:val="bullet"/>
-      <w:lvlText w:val="o"/>
-      <w:lvlJc w:val="left"/>
-      <w:pPr>
-        <w:tabs>
-          <w:tab w:val="num" w:pos="1440"/>
-        </w:tabs>
-        <w:ind w:left="1440" w:hanging="360"/>
-      </w:pPr>
-      <w:rPr>
-        <w:rFonts w:ascii="Courier New" w:hAnsi="Courier New" w:hint="default"/>
-        <w:sz w:val="20"/>
-      </w:rPr>
-    </w:lvl>
-    <w:lvl w:ilvl="2" w:tentative="1">
-      <w:start w:val="1"/>
-      <w:numFmt w:val="bullet"/>
-      <w:lvlText w:val=""/>
-      <w:lvlJc w:val="left"/>
-      <w:pPr>
-        <w:tabs>
-          <w:tab w:val="num" w:pos="2160"/>
-        </w:tabs>
-        <w:ind w:left="2160" w:hanging="360"/>
-      </w:pPr>
-      <w:rPr>
-        <w:rFonts w:ascii="Wingdings" w:hAnsi="Wingdings" w:hint="default"/>
-        <w:sz w:val="20"/>
-      </w:rPr>
-    </w:lvl>
-    <w:lvl w:ilvl="3" w:tentative="1">
-      <w:start w:val="1"/>
-      <w:numFmt w:val="bullet"/>
-      <w:lvlText w:val=""/>
-      <w:lvlJc w:val="left"/>
-      <w:pPr>
-        <w:tabs>
-          <w:tab w:val="num" w:pos="2880"/>
-        </w:tabs>
-        <w:ind w:left="2880" w:hanging="360"/>
-      </w:pPr>
-      <w:rPr>
-        <w:rFonts w:ascii="Wingdings" w:hAnsi="Wingdings" w:hint="default"/>
-        <w:sz w:val="20"/>
-      </w:rPr>
-    </w:lvl>
-    <w:lvl w:ilvl="4" w:tentative="1">
-      <w:start w:val="1"/>
-      <w:numFmt w:val="bullet"/>
-      <w:lvlText w:val=""/>
-      <w:lvlJc w:val="left"/>
-      <w:pPr>
-        <w:tabs>
-          <w:tab w:val="num" w:pos="3600"/>
-        </w:tabs>
-        <w:ind w:left="3600" w:hanging="360"/>
-      </w:pPr>
-      <w:rPr>
-        <w:rFonts w:ascii="Wingdings" w:hAnsi="Wingdings" w:hint="default"/>
-        <w:sz w:val="20"/>
-      </w:rPr>
-    </w:lvl>
-    <w:lvl w:ilvl="5" w:tentative="1">
-      <w:start w:val="1"/>
-      <w:numFmt w:val="bullet"/>
-      <w:lvlText w:val=""/>
-      <w:lvlJc w:val="left"/>
-      <w:pPr>
-        <w:tabs>
-          <w:tab w:val="num" w:pos="4320"/>
-        </w:tabs>
-        <w:ind w:left="4320" w:hanging="360"/>
-      </w:pPr>
-      <w:rPr>
-        <w:rFonts w:ascii="Wingdings" w:hAnsi="Wingdings" w:hint="default"/>
-        <w:sz w:val="20"/>
-      </w:rPr>
-    </w:lvl>
-    <w:lvl w:ilvl="6" w:tentative="1">
-      <w:start w:val="1"/>
-      <w:numFmt w:val="bullet"/>
-      <w:lvlText w:val=""/>
-      <w:lvlJc w:val="left"/>
-      <w:pPr>
-        <w:tabs>
-          <w:tab w:val="num" w:pos="5040"/>
-        </w:tabs>
-        <w:ind w:left="5040" w:hanging="360"/>
-      </w:pPr>
-      <w:rPr>
-        <w:rFonts w:ascii="Wingdings" w:hAnsi="Wingdings" w:hint="default"/>
-        <w:sz w:val="20"/>
-      </w:rPr>
-    </w:lvl>
-    <w:lvl w:ilvl="7" w:tentative="1">
-      <w:start w:val="1"/>
-      <w:numFmt w:val="bullet"/>
-      <w:lvlText w:val=""/>
-      <w:lvlJc w:val="left"/>
-      <w:pPr>
-        <w:tabs>
-          <w:tab w:val="num" w:pos="5760"/>
-        </w:tabs>
-        <w:ind w:left="5760" w:hanging="360"/>
-      </w:pPr>
-      <w:rPr>
-        <w:rFonts w:ascii="Wingdings" w:hAnsi="Wingdings" w:hint="default"/>
-        <w:sz w:val="20"/>
-      </w:rPr>
-    </w:lvl>
-    <w:lvl w:ilvl="8" w:tentative="1">
-      <w:start w:val="1"/>
-      <w:numFmt w:val="bullet"/>
-      <w:lvlText w:val=""/>
-      <w:lvlJc w:val="left"/>
-      <w:pPr>
-        <w:tabs>
-          <w:tab w:val="num" w:pos="6480"/>
-        </w:tabs>
-        <w:ind w:left="6480" w:hanging="360"/>
-      </w:pPr>
-      <w:rPr>
-        <w:rFonts w:ascii="Wingdings" w:hAnsi="Wingdings" w:hint="default"/>
-        <w:sz w:val="20"/>
-      </w:rPr>
-    </w:lvl>
-  </w:abstractNum>
-  <w:abstractNum w:abstractNumId="16" w15:restartNumberingAfterBreak="0">
-    <w:nsid w:val="4FAC4231"/>
-    <w:multiLevelType w:val="multilevel"/>
-    <w:tmpl w:val="2A847890"/>
+    <w:tmpl w:val="2BC8DBEE"/>
     <w:lvl w:ilvl="0">
       <w:start w:val="1"/>
       <w:numFmt w:val="bullet"/>
@@ -8842,13 +8788,13 @@
     </w:lvl>
   </w:abstractNum>
   <w:abstractNum w:abstractNumId="17" w15:restartNumberingAfterBreak="0">
-    <w:nsid w:val="521E226D"/>
+    <w:nsid w:val="70B7622F"/>
     <w:multiLevelType w:val="multilevel"/>
-    <w:tmpl w:val="DDC09E22"/>
+    <w:tmpl w:val="C110102E"/>
     <w:lvl w:ilvl="0">
       <w:start w:val="1"/>
-      <w:numFmt w:val="bullet"/>
-      <w:lvlText w:val=""/>
+      <w:numFmt w:val="decimal"/>
+      <w:lvlText w:val="%1."/>
       <w:lvlJc w:val="left"/>
       <w:pPr>
         <w:tabs>
@@ -8856,12 +8802,8 @@
         </w:tabs>
         <w:ind w:left="720" w:hanging="360"/>
       </w:pPr>
-      <w:rPr>
-        <w:rFonts w:ascii="Symbol" w:hAnsi="Symbol" w:hint="default"/>
-        <w:sz w:val="20"/>
-      </w:rPr>
-    </w:lvl>
-    <w:lvl w:ilvl="1" w:tentative="1">
+    </w:lvl>
+    <w:lvl w:ilvl="1">
       <w:start w:val="1"/>
       <w:numFmt w:val="bullet"/>
       <w:lvlText w:val="o"/>
@@ -8879,8 +8821,8 @@
     </w:lvl>
     <w:lvl w:ilvl="2" w:tentative="1">
       <w:start w:val="1"/>
-      <w:numFmt w:val="bullet"/>
-      <w:lvlText w:val=""/>
+      <w:numFmt w:val="decimal"/>
+      <w:lvlText w:val="%3."/>
       <w:lvlJc w:val="left"/>
       <w:pPr>
         <w:tabs>
@@ -8888,15 +8830,11 @@
         </w:tabs>
         <w:ind w:left="2160" w:hanging="360"/>
       </w:pPr>
-      <w:rPr>
-        <w:rFonts w:ascii="Wingdings" w:hAnsi="Wingdings" w:hint="default"/>
-        <w:sz w:val="20"/>
-      </w:rPr>
     </w:lvl>
     <w:lvl w:ilvl="3" w:tentative="1">
       <w:start w:val="1"/>
-      <w:numFmt w:val="bullet"/>
-      <w:lvlText w:val=""/>
+      <w:numFmt w:val="decimal"/>
+      <w:lvlText w:val="%4."/>
       <w:lvlJc w:val="left"/>
       <w:pPr>
         <w:tabs>
@@ -8904,15 +8842,11 @@
         </w:tabs>
         <w:ind w:left="2880" w:hanging="360"/>
       </w:pPr>
-      <w:rPr>
-        <w:rFonts w:ascii="Wingdings" w:hAnsi="Wingdings" w:hint="default"/>
-        <w:sz w:val="20"/>
-      </w:rPr>
     </w:lvl>
     <w:lvl w:ilvl="4" w:tentative="1">
       <w:start w:val="1"/>
-      <w:numFmt w:val="bullet"/>
-      <w:lvlText w:val=""/>
+      <w:numFmt w:val="decimal"/>
+      <w:lvlText w:val="%5."/>
       <w:lvlJc w:val="left"/>
       <w:pPr>
         <w:tabs>
@@ -8920,15 +8854,11 @@
         </w:tabs>
         <w:ind w:left="3600" w:hanging="360"/>
       </w:pPr>
-      <w:rPr>
-        <w:rFonts w:ascii="Wingdings" w:hAnsi="Wingdings" w:hint="default"/>
-        <w:sz w:val="20"/>
-      </w:rPr>
     </w:lvl>
     <w:lvl w:ilvl="5" w:tentative="1">
       <w:start w:val="1"/>
-      <w:numFmt w:val="bullet"/>
-      <w:lvlText w:val=""/>
+      <w:numFmt w:val="decimal"/>
+      <w:lvlText w:val="%6."/>
       <w:lvlJc w:val="left"/>
       <w:pPr>
         <w:tabs>
@@ -8936,15 +8866,11 @@
         </w:tabs>
         <w:ind w:left="4320" w:hanging="360"/>
       </w:pPr>
-      <w:rPr>
-        <w:rFonts w:ascii="Wingdings" w:hAnsi="Wingdings" w:hint="default"/>
-        <w:sz w:val="20"/>
-      </w:rPr>
     </w:lvl>
     <w:lvl w:ilvl="6" w:tentative="1">
       <w:start w:val="1"/>
-      <w:numFmt w:val="bullet"/>
-      <w:lvlText w:val=""/>
+      <w:numFmt w:val="decimal"/>
+      <w:lvlText w:val="%7."/>
       <w:lvlJc w:val="left"/>
       <w:pPr>
         <w:tabs>
@@ -8952,15 +8878,11 @@
         </w:tabs>
         <w:ind w:left="5040" w:hanging="360"/>
       </w:pPr>
-      <w:rPr>
-        <w:rFonts w:ascii="Wingdings" w:hAnsi="Wingdings" w:hint="default"/>
-        <w:sz w:val="20"/>
-      </w:rPr>
     </w:lvl>
     <w:lvl w:ilvl="7" w:tentative="1">
       <w:start w:val="1"/>
-      <w:numFmt w:val="bullet"/>
-      <w:lvlText w:val=""/>
+      <w:numFmt w:val="decimal"/>
+      <w:lvlText w:val="%8."/>
       <w:lvlJc w:val="left"/>
       <w:pPr>
         <w:tabs>
@@ -8968,15 +8890,11 @@
         </w:tabs>
         <w:ind w:left="5760" w:hanging="360"/>
       </w:pPr>
-      <w:rPr>
-        <w:rFonts w:ascii="Wingdings" w:hAnsi="Wingdings" w:hint="default"/>
-        <w:sz w:val="20"/>
-      </w:rPr>
     </w:lvl>
     <w:lvl w:ilvl="8" w:tentative="1">
       <w:start w:val="1"/>
-      <w:numFmt w:val="bullet"/>
-      <w:lvlText w:val=""/>
+      <w:numFmt w:val="decimal"/>
+      <w:lvlText w:val="%9."/>
       <w:lvlJc w:val="left"/>
       <w:pPr>
         <w:tabs>
@@ -8984,16 +8902,12 @@
         </w:tabs>
         <w:ind w:left="6480" w:hanging="360"/>
       </w:pPr>
-      <w:rPr>
-        <w:rFonts w:ascii="Wingdings" w:hAnsi="Wingdings" w:hint="default"/>
-        <w:sz w:val="20"/>
-      </w:rPr>
     </w:lvl>
   </w:abstractNum>
   <w:abstractNum w:abstractNumId="18" w15:restartNumberingAfterBreak="0">
-    <w:nsid w:val="562B7B23"/>
+    <w:nsid w:val="70D56883"/>
     <w:multiLevelType w:val="multilevel"/>
-    <w:tmpl w:val="64267206"/>
+    <w:tmpl w:val="75384776"/>
     <w:lvl w:ilvl="0">
       <w:start w:val="1"/>
       <w:numFmt w:val="bullet"/>
@@ -9140,13 +9054,13 @@
     </w:lvl>
   </w:abstractNum>
   <w:abstractNum w:abstractNumId="19" w15:restartNumberingAfterBreak="0">
-    <w:nsid w:val="605F7620"/>
+    <w:nsid w:val="71466C13"/>
     <w:multiLevelType w:val="multilevel"/>
-    <w:tmpl w:val="1A5209BA"/>
+    <w:tmpl w:val="640EC306"/>
     <w:lvl w:ilvl="0">
       <w:start w:val="1"/>
-      <w:numFmt w:val="decimal"/>
-      <w:lvlText w:val="%1."/>
+      <w:numFmt w:val="bullet"/>
+      <w:lvlText w:val=""/>
       <w:lvlJc w:val="left"/>
       <w:pPr>
         <w:tabs>
@@ -9154,8 +9068,12 @@
         </w:tabs>
         <w:ind w:left="720" w:hanging="360"/>
       </w:pPr>
-    </w:lvl>
-    <w:lvl w:ilvl="1">
+      <w:rPr>
+        <w:rFonts w:ascii="Symbol" w:hAnsi="Symbol" w:hint="default"/>
+        <w:sz w:val="20"/>
+      </w:rPr>
+    </w:lvl>
+    <w:lvl w:ilvl="1" w:tentative="1">
       <w:start w:val="1"/>
       <w:numFmt w:val="bullet"/>
       <w:lvlText w:val="o"/>
@@ -9173,8 +9091,8 @@
     </w:lvl>
     <w:lvl w:ilvl="2" w:tentative="1">
       <w:start w:val="1"/>
-      <w:numFmt w:val="decimal"/>
-      <w:lvlText w:val="%3."/>
+      <w:numFmt w:val="bullet"/>
+      <w:lvlText w:val=""/>
       <w:lvlJc w:val="left"/>
       <w:pPr>
         <w:tabs>
@@ -9182,11 +9100,15 @@
         </w:tabs>
         <w:ind w:left="2160" w:hanging="360"/>
       </w:pPr>
+      <w:rPr>
+        <w:rFonts w:ascii="Wingdings" w:hAnsi="Wingdings" w:hint="default"/>
+        <w:sz w:val="20"/>
+      </w:rPr>
     </w:lvl>
     <w:lvl w:ilvl="3" w:tentative="1">
       <w:start w:val="1"/>
-      <w:numFmt w:val="decimal"/>
-      <w:lvlText w:val="%4."/>
+      <w:numFmt w:val="bullet"/>
+      <w:lvlText w:val=""/>
       <w:lvlJc w:val="left"/>
       <w:pPr>
         <w:tabs>
@@ -9194,11 +9116,15 @@
         </w:tabs>
         <w:ind w:left="2880" w:hanging="360"/>
       </w:pPr>
+      <w:rPr>
+        <w:rFonts w:ascii="Wingdings" w:hAnsi="Wingdings" w:hint="default"/>
+        <w:sz w:val="20"/>
+      </w:rPr>
     </w:lvl>
     <w:lvl w:ilvl="4" w:tentative="1">
       <w:start w:val="1"/>
-      <w:numFmt w:val="decimal"/>
-      <w:lvlText w:val="%5."/>
+      <w:numFmt w:val="bullet"/>
+      <w:lvlText w:val=""/>
       <w:lvlJc w:val="left"/>
       <w:pPr>
         <w:tabs>
@@ -9206,11 +9132,15 @@
         </w:tabs>
         <w:ind w:left="3600" w:hanging="360"/>
       </w:pPr>
+      <w:rPr>
+        <w:rFonts w:ascii="Wingdings" w:hAnsi="Wingdings" w:hint="default"/>
+        <w:sz w:val="20"/>
+      </w:rPr>
     </w:lvl>
     <w:lvl w:ilvl="5" w:tentative="1">
       <w:start w:val="1"/>
-      <w:numFmt w:val="decimal"/>
-      <w:lvlText w:val="%6."/>
+      <w:numFmt w:val="bullet"/>
+      <w:lvlText w:val=""/>
       <w:lvlJc w:val="left"/>
       <w:pPr>
         <w:tabs>
@@ -9218,11 +9148,15 @@
         </w:tabs>
         <w:ind w:left="4320" w:hanging="360"/>
       </w:pPr>
+      <w:rPr>
+        <w:rFonts w:ascii="Wingdings" w:hAnsi="Wingdings" w:hint="default"/>
+        <w:sz w:val="20"/>
+      </w:rPr>
     </w:lvl>
     <w:lvl w:ilvl="6" w:tentative="1">
       <w:start w:val="1"/>
-      <w:numFmt w:val="decimal"/>
-      <w:lvlText w:val="%7."/>
+      <w:numFmt w:val="bullet"/>
+      <w:lvlText w:val=""/>
       <w:lvlJc w:val="left"/>
       <w:pPr>
         <w:tabs>
@@ -9230,11 +9164,15 @@
         </w:tabs>
         <w:ind w:left="5040" w:hanging="360"/>
       </w:pPr>
+      <w:rPr>
+        <w:rFonts w:ascii="Wingdings" w:hAnsi="Wingdings" w:hint="default"/>
+        <w:sz w:val="20"/>
+      </w:rPr>
     </w:lvl>
     <w:lvl w:ilvl="7" w:tentative="1">
       <w:start w:val="1"/>
-      <w:numFmt w:val="decimal"/>
-      <w:lvlText w:val="%8."/>
+      <w:numFmt w:val="bullet"/>
+      <w:lvlText w:val=""/>
       <w:lvlJc w:val="left"/>
       <w:pPr>
         <w:tabs>
@@ -9242,11 +9180,15 @@
         </w:tabs>
         <w:ind w:left="5760" w:hanging="360"/>
       </w:pPr>
+      <w:rPr>
+        <w:rFonts w:ascii="Wingdings" w:hAnsi="Wingdings" w:hint="default"/>
+        <w:sz w:val="20"/>
+      </w:rPr>
     </w:lvl>
     <w:lvl w:ilvl="8" w:tentative="1">
       <w:start w:val="1"/>
-      <w:numFmt w:val="decimal"/>
-      <w:lvlText w:val="%9."/>
+      <w:numFmt w:val="bullet"/>
+      <w:lvlText w:val=""/>
       <w:lvlJc w:val="left"/>
       <w:pPr>
         <w:tabs>
@@ -9254,12 +9196,16 @@
         </w:tabs>
         <w:ind w:left="6480" w:hanging="360"/>
       </w:pPr>
+      <w:rPr>
+        <w:rFonts w:ascii="Wingdings" w:hAnsi="Wingdings" w:hint="default"/>
+        <w:sz w:val="20"/>
+      </w:rPr>
     </w:lvl>
   </w:abstractNum>
   <w:abstractNum w:abstractNumId="20" w15:restartNumberingAfterBreak="0">
-    <w:nsid w:val="62B176B1"/>
+    <w:nsid w:val="78DE3D09"/>
     <w:multiLevelType w:val="multilevel"/>
-    <w:tmpl w:val="58CAB5F2"/>
+    <w:tmpl w:val="80D86A42"/>
     <w:lvl w:ilvl="0">
       <w:start w:val="1"/>
       <w:numFmt w:val="bullet"/>
@@ -9406,13 +9352,13 @@
     </w:lvl>
   </w:abstractNum>
   <w:abstractNum w:abstractNumId="21" w15:restartNumberingAfterBreak="0">
-    <w:nsid w:val="68EA2F8A"/>
+    <w:nsid w:val="79015DCC"/>
     <w:multiLevelType w:val="multilevel"/>
-    <w:tmpl w:val="FB044BDE"/>
+    <w:tmpl w:val="445E3B8C"/>
     <w:lvl w:ilvl="0">
       <w:start w:val="1"/>
-      <w:numFmt w:val="decimal"/>
-      <w:lvlText w:val="%1."/>
+      <w:numFmt w:val="bullet"/>
+      <w:lvlText w:val=""/>
       <w:lvlJc w:val="left"/>
       <w:pPr>
         <w:tabs>
@@ -9420,8 +9366,12 @@
         </w:tabs>
         <w:ind w:left="720" w:hanging="360"/>
       </w:pPr>
-    </w:lvl>
-    <w:lvl w:ilvl="1">
+      <w:rPr>
+        <w:rFonts w:ascii="Symbol" w:hAnsi="Symbol" w:hint="default"/>
+        <w:sz w:val="20"/>
+      </w:rPr>
+    </w:lvl>
+    <w:lvl w:ilvl="1" w:tentative="1">
       <w:start w:val="1"/>
       <w:numFmt w:val="bullet"/>
       <w:lvlText w:val="o"/>
@@ -9439,8 +9389,8 @@
     </w:lvl>
     <w:lvl w:ilvl="2" w:tentative="1">
       <w:start w:val="1"/>
-      <w:numFmt w:val="decimal"/>
-      <w:lvlText w:val="%3."/>
+      <w:numFmt w:val="bullet"/>
+      <w:lvlText w:val=""/>
       <w:lvlJc w:val="left"/>
       <w:pPr>
         <w:tabs>
@@ -9448,11 +9398,15 @@
         </w:tabs>
         <w:ind w:left="2160" w:hanging="360"/>
       </w:pPr>
+      <w:rPr>
+        <w:rFonts w:ascii="Wingdings" w:hAnsi="Wingdings" w:hint="default"/>
+        <w:sz w:val="20"/>
+      </w:rPr>
     </w:lvl>
     <w:lvl w:ilvl="3" w:tentative="1">
       <w:start w:val="1"/>
-      <w:numFmt w:val="decimal"/>
-      <w:lvlText w:val="%4."/>
+      <w:numFmt w:val="bullet"/>
+      <w:lvlText w:val=""/>
       <w:lvlJc w:val="left"/>
       <w:pPr>
         <w:tabs>
@@ -9460,11 +9414,15 @@
         </w:tabs>
         <w:ind w:left="2880" w:hanging="360"/>
       </w:pPr>
+      <w:rPr>
+        <w:rFonts w:ascii="Wingdings" w:hAnsi="Wingdings" w:hint="default"/>
+        <w:sz w:val="20"/>
+      </w:rPr>
     </w:lvl>
     <w:lvl w:ilvl="4" w:tentative="1">
       <w:start w:val="1"/>
-      <w:numFmt w:val="decimal"/>
-      <w:lvlText w:val="%5."/>
+      <w:numFmt w:val="bullet"/>
+      <w:lvlText w:val=""/>
       <w:lvlJc w:val="left"/>
       <w:pPr>
         <w:tabs>
@@ -9472,11 +9430,15 @@
         </w:tabs>
         <w:ind w:left="3600" w:hanging="360"/>
       </w:pPr>
+      <w:rPr>
+        <w:rFonts w:ascii="Wingdings" w:hAnsi="Wingdings" w:hint="default"/>
+        <w:sz w:val="20"/>
+      </w:rPr>
     </w:lvl>
     <w:lvl w:ilvl="5" w:tentative="1">
       <w:start w:val="1"/>
-      <w:numFmt w:val="decimal"/>
-      <w:lvlText w:val="%6."/>
+      <w:numFmt w:val="bullet"/>
+      <w:lvlText w:val=""/>
       <w:lvlJc w:val="left"/>
       <w:pPr>
         <w:tabs>
@@ -9484,11 +9446,15 @@
         </w:tabs>
         <w:ind w:left="4320" w:hanging="360"/>
       </w:pPr>
+      <w:rPr>
+        <w:rFonts w:ascii="Wingdings" w:hAnsi="Wingdings" w:hint="default"/>
+        <w:sz w:val="20"/>
+      </w:rPr>
     </w:lvl>
     <w:lvl w:ilvl="6" w:tentative="1">
       <w:start w:val="1"/>
-      <w:numFmt w:val="decimal"/>
-      <w:lvlText w:val="%7."/>
+      <w:numFmt w:val="bullet"/>
+      <w:lvlText w:val=""/>
       <w:lvlJc w:val="left"/>
       <w:pPr>
         <w:tabs>
@@ -9496,11 +9462,15 @@
         </w:tabs>
         <w:ind w:left="5040" w:hanging="360"/>
       </w:pPr>
+      <w:rPr>
+        <w:rFonts w:ascii="Wingdings" w:hAnsi="Wingdings" w:hint="default"/>
+        <w:sz w:val="20"/>
+      </w:rPr>
     </w:lvl>
     <w:lvl w:ilvl="7" w:tentative="1">
       <w:start w:val="1"/>
-      <w:numFmt w:val="decimal"/>
-      <w:lvlText w:val="%8."/>
+      <w:numFmt w:val="bullet"/>
+      <w:lvlText w:val=""/>
       <w:lvlJc w:val="left"/>
       <w:pPr>
         <w:tabs>
@@ -9508,11 +9478,15 @@
         </w:tabs>
         <w:ind w:left="5760" w:hanging="360"/>
       </w:pPr>
+      <w:rPr>
+        <w:rFonts w:ascii="Wingdings" w:hAnsi="Wingdings" w:hint="default"/>
+        <w:sz w:val="20"/>
+      </w:rPr>
     </w:lvl>
     <w:lvl w:ilvl="8" w:tentative="1">
       <w:start w:val="1"/>
-      <w:numFmt w:val="decimal"/>
-      <w:lvlText w:val="%9."/>
+      <w:numFmt w:val="bullet"/>
+      <w:lvlText w:val=""/>
       <w:lvlJc w:val="left"/>
       <w:pPr>
         <w:tabs>
@@ -9520,12 +9494,16 @@
         </w:tabs>
         <w:ind w:left="6480" w:hanging="360"/>
       </w:pPr>
+      <w:rPr>
+        <w:rFonts w:ascii="Wingdings" w:hAnsi="Wingdings" w:hint="default"/>
+        <w:sz w:val="20"/>
+      </w:rPr>
     </w:lvl>
   </w:abstractNum>
   <w:abstractNum w:abstractNumId="22" w15:restartNumberingAfterBreak="0">
-    <w:nsid w:val="71755C6C"/>
+    <w:nsid w:val="7A0905AD"/>
     <w:multiLevelType w:val="multilevel"/>
-    <w:tmpl w:val="DF3EEBA6"/>
+    <w:tmpl w:val="C75CB0F4"/>
     <w:lvl w:ilvl="0">
       <w:start w:val="1"/>
       <w:numFmt w:val="bullet"/>
@@ -9672,13 +9650,13 @@
     </w:lvl>
   </w:abstractNum>
   <w:abstractNum w:abstractNumId="23" w15:restartNumberingAfterBreak="0">
-    <w:nsid w:val="78CE4C00"/>
+    <w:nsid w:val="7E375984"/>
     <w:multiLevelType w:val="multilevel"/>
-    <w:tmpl w:val="CF1C1BA2"/>
+    <w:tmpl w:val="CE702272"/>
     <w:lvl w:ilvl="0">
       <w:start w:val="1"/>
-      <w:numFmt w:val="decimal"/>
-      <w:lvlText w:val="%1."/>
+      <w:numFmt w:val="bullet"/>
+      <w:lvlText w:val=""/>
       <w:lvlJc w:val="left"/>
       <w:pPr>
         <w:tabs>
@@ -9686,8 +9664,12 @@
         </w:tabs>
         <w:ind w:left="720" w:hanging="360"/>
       </w:pPr>
-    </w:lvl>
-    <w:lvl w:ilvl="1">
+      <w:rPr>
+        <w:rFonts w:ascii="Symbol" w:hAnsi="Symbol" w:hint="default"/>
+        <w:sz w:val="20"/>
+      </w:rPr>
+    </w:lvl>
+    <w:lvl w:ilvl="1" w:tentative="1">
       <w:start w:val="1"/>
       <w:numFmt w:val="bullet"/>
       <w:lvlText w:val="o"/>
@@ -9705,8 +9687,8 @@
     </w:lvl>
     <w:lvl w:ilvl="2" w:tentative="1">
       <w:start w:val="1"/>
-      <w:numFmt w:val="decimal"/>
-      <w:lvlText w:val="%3."/>
+      <w:numFmt w:val="bullet"/>
+      <w:lvlText w:val=""/>
       <w:lvlJc w:val="left"/>
       <w:pPr>
         <w:tabs>
@@ -9714,11 +9696,15 @@
         </w:tabs>
         <w:ind w:left="2160" w:hanging="360"/>
       </w:pPr>
+      <w:rPr>
+        <w:rFonts w:ascii="Wingdings" w:hAnsi="Wingdings" w:hint="default"/>
+        <w:sz w:val="20"/>
+      </w:rPr>
     </w:lvl>
     <w:lvl w:ilvl="3" w:tentative="1">
       <w:start w:val="1"/>
-      <w:numFmt w:val="decimal"/>
-      <w:lvlText w:val="%4."/>
+      <w:numFmt w:val="bullet"/>
+      <w:lvlText w:val=""/>
       <w:lvlJc w:val="left"/>
       <w:pPr>
         <w:tabs>
@@ -9726,11 +9712,15 @@
         </w:tabs>
         <w:ind w:left="2880" w:hanging="360"/>
       </w:pPr>
+      <w:rPr>
+        <w:rFonts w:ascii="Wingdings" w:hAnsi="Wingdings" w:hint="default"/>
+        <w:sz w:val="20"/>
+      </w:rPr>
     </w:lvl>
     <w:lvl w:ilvl="4" w:tentative="1">
       <w:start w:val="1"/>
-      <w:numFmt w:val="decimal"/>
-      <w:lvlText w:val="%5."/>
+      <w:numFmt w:val="bullet"/>
+      <w:lvlText w:val=""/>
       <w:lvlJc w:val="left"/>
       <w:pPr>
         <w:tabs>
@@ -9738,11 +9728,15 @@
         </w:tabs>
         <w:ind w:left="3600" w:hanging="360"/>
       </w:pPr>
+      <w:rPr>
+        <w:rFonts w:ascii="Wingdings" w:hAnsi="Wingdings" w:hint="default"/>
+        <w:sz w:val="20"/>
+      </w:rPr>
     </w:lvl>
     <w:lvl w:ilvl="5" w:tentative="1">
       <w:start w:val="1"/>
-      <w:numFmt w:val="decimal"/>
-      <w:lvlText w:val="%6."/>
+      <w:numFmt w:val="bullet"/>
+      <w:lvlText w:val=""/>
       <w:lvlJc w:val="left"/>
       <w:pPr>
         <w:tabs>
@@ -9750,11 +9744,15 @@
         </w:tabs>
         <w:ind w:left="4320" w:hanging="360"/>
       </w:pPr>
+      <w:rPr>
+        <w:rFonts w:ascii="Wingdings" w:hAnsi="Wingdings" w:hint="default"/>
+        <w:sz w:val="20"/>
+      </w:rPr>
     </w:lvl>
     <w:lvl w:ilvl="6" w:tentative="1">
       <w:start w:val="1"/>
-      <w:numFmt w:val="decimal"/>
-      <w:lvlText w:val="%7."/>
+      <w:numFmt w:val="bullet"/>
+      <w:lvlText w:val=""/>
       <w:lvlJc w:val="left"/>
       <w:pPr>
         <w:tabs>
@@ -9762,11 +9760,15 @@
         </w:tabs>
         <w:ind w:left="5040" w:hanging="360"/>
       </w:pPr>
+      <w:rPr>
+        <w:rFonts w:ascii="Wingdings" w:hAnsi="Wingdings" w:hint="default"/>
+        <w:sz w:val="20"/>
+      </w:rPr>
     </w:lvl>
     <w:lvl w:ilvl="7" w:tentative="1">
       <w:start w:val="1"/>
-      <w:numFmt w:val="decimal"/>
-      <w:lvlText w:val="%8."/>
+      <w:numFmt w:val="bullet"/>
+      <w:lvlText w:val=""/>
       <w:lvlJc w:val="left"/>
       <w:pPr>
         <w:tabs>
@@ -9774,11 +9776,15 @@
         </w:tabs>
         <w:ind w:left="5760" w:hanging="360"/>
       </w:pPr>
+      <w:rPr>
+        <w:rFonts w:ascii="Wingdings" w:hAnsi="Wingdings" w:hint="default"/>
+        <w:sz w:val="20"/>
+      </w:rPr>
     </w:lvl>
     <w:lvl w:ilvl="8" w:tentative="1">
       <w:start w:val="1"/>
-      <w:numFmt w:val="decimal"/>
-      <w:lvlText w:val="%9."/>
+      <w:numFmt w:val="bullet"/>
+      <w:lvlText w:val=""/>
       <w:lvlJc w:val="left"/>
       <w:pPr>
         <w:tabs>
@@ -9786,79 +9792,83 @@
         </w:tabs>
         <w:ind w:left="6480" w:hanging="360"/>
       </w:pPr>
+      <w:rPr>
+        <w:rFonts w:ascii="Wingdings" w:hAnsi="Wingdings" w:hint="default"/>
+        <w:sz w:val="20"/>
+      </w:rPr>
     </w:lvl>
   </w:abstractNum>
-  <w:num w:numId="1" w16cid:durableId="1234701750">
+  <w:num w:numId="1" w16cid:durableId="469177503">
+    <w:abstractNumId w:val="19"/>
+  </w:num>
+  <w:num w:numId="2" w16cid:durableId="2010257221">
+    <w:abstractNumId w:val="14"/>
+  </w:num>
+  <w:num w:numId="3" w16cid:durableId="2144304891">
     <w:abstractNumId w:val="12"/>
   </w:num>
-  <w:num w:numId="2" w16cid:durableId="305402315">
+  <w:num w:numId="4" w16cid:durableId="1463498019">
+    <w:abstractNumId w:val="8"/>
+  </w:num>
+  <w:num w:numId="5" w16cid:durableId="122963397">
+    <w:abstractNumId w:val="10"/>
+  </w:num>
+  <w:num w:numId="6" w16cid:durableId="1096561021">
+    <w:abstractNumId w:val="13"/>
+  </w:num>
+  <w:num w:numId="7" w16cid:durableId="352338745">
+    <w:abstractNumId w:val="11"/>
+  </w:num>
+  <w:num w:numId="8" w16cid:durableId="1235968277">
     <w:abstractNumId w:val="3"/>
   </w:num>
-  <w:num w:numId="3" w16cid:durableId="1531800374">
-    <w:abstractNumId w:val="13"/>
+  <w:num w:numId="9" w16cid:durableId="1186820558">
+    <w:abstractNumId w:val="4"/>
   </w:num>
-  <w:num w:numId="4" w16cid:durableId="1311862476">
-    <w:abstractNumId w:val="14"/>
+  <w:num w:numId="10" w16cid:durableId="1160392483">
+    <w:abstractNumId w:val="7"/>
   </w:num>
-  <w:num w:numId="5" w16cid:durableId="1214195288">
+  <w:num w:numId="11" w16cid:durableId="1650161811">
+    <w:abstractNumId w:val="2"/>
+  </w:num>
+  <w:num w:numId="12" w16cid:durableId="1882857940">
+    <w:abstractNumId w:val="20"/>
+  </w:num>
+  <w:num w:numId="13" w16cid:durableId="390352338">
+    <w:abstractNumId w:val="22"/>
+  </w:num>
+  <w:num w:numId="14" w16cid:durableId="1289360721">
+    <w:abstractNumId w:val="5"/>
+  </w:num>
+  <w:num w:numId="15" w16cid:durableId="431243867">
+    <w:abstractNumId w:val="1"/>
+  </w:num>
+  <w:num w:numId="16" w16cid:durableId="1561551493">
+    <w:abstractNumId w:val="16"/>
+  </w:num>
+  <w:num w:numId="17" w16cid:durableId="134221150">
     <w:abstractNumId w:val="15"/>
   </w:num>
-  <w:num w:numId="6" w16cid:durableId="242371376">
-    <w:abstractNumId w:val="8"/>
+  <w:num w:numId="18" w16cid:durableId="646593038">
+    <w:abstractNumId w:val="0"/>
   </w:num>
-  <w:num w:numId="7" w16cid:durableId="1248732513">
-    <w:abstractNumId w:val="6"/>
+  <w:num w:numId="19" w16cid:durableId="332339844">
+    <w:abstractNumId w:val="17"/>
   </w:num>
-  <w:num w:numId="8" w16cid:durableId="433671864">
-    <w:abstractNumId w:val="10"/>
+  <w:num w:numId="20" w16cid:durableId="1877814506">
+    <w:abstractNumId w:val="23"/>
   </w:num>
-  <w:num w:numId="9" w16cid:durableId="2000887803">
+  <w:num w:numId="21" w16cid:durableId="896159451">
     <w:abstractNumId w:val="9"/>
   </w:num>
-  <w:num w:numId="10" w16cid:durableId="1241787633">
-    <w:abstractNumId w:val="4"/>
+  <w:num w:numId="22" w16cid:durableId="1972513066">
+    <w:abstractNumId w:val="18"/>
   </w:num>
-  <w:num w:numId="11" w16cid:durableId="1567182350">
-    <w:abstractNumId w:val="20"/>
-  </w:num>
-  <w:num w:numId="12" w16cid:durableId="105197840">
-    <w:abstractNumId w:val="11"/>
-  </w:num>
-  <w:num w:numId="13" w16cid:durableId="36660648">
-    <w:abstractNumId w:val="22"/>
-  </w:num>
-  <w:num w:numId="14" w16cid:durableId="1335693756">
-    <w:abstractNumId w:val="2"/>
-  </w:num>
-  <w:num w:numId="15" w16cid:durableId="1203785787">
-    <w:abstractNumId w:val="0"/>
-  </w:num>
-  <w:num w:numId="16" w16cid:durableId="1908689033">
-    <w:abstractNumId w:val="7"/>
-  </w:num>
-  <w:num w:numId="17" w16cid:durableId="155654291">
+  <w:num w:numId="23" w16cid:durableId="1864199730">
     <w:abstractNumId w:val="21"/>
   </w:num>
-  <w:num w:numId="18" w16cid:durableId="1307321623">
-    <w:abstractNumId w:val="23"/>
-  </w:num>
-  <w:num w:numId="19" w16cid:durableId="1680738916">
-    <w:abstractNumId w:val="5"/>
-  </w:num>
-  <w:num w:numId="20" w16cid:durableId="1563061775">
-    <w:abstractNumId w:val="16"/>
-  </w:num>
-  <w:num w:numId="21" w16cid:durableId="667245392">
-    <w:abstractNumId w:val="1"/>
-  </w:num>
-  <w:num w:numId="22" w16cid:durableId="73402043">
-    <w:abstractNumId w:val="17"/>
-  </w:num>
-  <w:num w:numId="23" w16cid:durableId="1445148163">
-    <w:abstractNumId w:val="18"/>
-  </w:num>
-  <w:num w:numId="24" w16cid:durableId="1167987537">
-    <w:abstractNumId w:val="19"/>
+  <w:num w:numId="24" w16cid:durableId="1100568857">
+    <w:abstractNumId w:val="6"/>
   </w:num>
 </w:numbering>
 </file>

</xml_diff>

<commit_message>
session rebuilt on the thirteen-stage lifecycle: deck (60 slides), follow-along guide and site, Lifecycle Guide handout, one-file Surveyor workbook
- presentation: Azure_Local_Discovery_to_Day2_NIC2026.pptx follows the lifecycle (engage, assess, discover, plan, design, document, prepare, deploy 8a/8b/8c, validate, Day-2 ready, go-live gate, migrate, operate, review)
- follow-along: guide (Markdown, PDF, Word) and site content regenerated from the same source
- handouts: Azure_Local_Lifecycle_Guide (md, pdf, docx) added
- src/assessment: IIC-RVTools-demo-with-AVD.xlsx, the workbook the session imports; README explains it

Co-Authored-By: Claude Fable 5.1 <noreply@anthropic.com>
</commit_message>
<xml_diff>
--- a/follow-along/Azure_Local_Follow_Along_Guide.docx
+++ b/follow-along/Azure_Local_Follow_Along_Guide.docx
@@ -972,7 +972,7 @@
           <w:szCs w:val="21"/>
           <w:lang w:val="en"/>
         </w:rPr>
-        <w:t>The Surveyor project from the previous demo</w:t>
+        <w:t>A browser</w:t>
       </w:r>
     </w:p>
     <w:p>
@@ -998,7 +998,33 @@
           <w:szCs w:val="21"/>
           <w:lang w:val="en"/>
         </w:rPr>
-        <w:t>The second input src/assessment/IIC-new-workloads.csv</w:t>
+        <w:t>The workbook IIC-RVTools-demo-with-AVD.xlsx from the repo (src/assessment): the VMware estate plus the 7 new AVD VMs in one file</w:t>
+      </w:r>
+    </w:p>
+    <w:p>
+      <w:pPr>
+        <w:numPr>
+          <w:ilvl w:val="0"/>
+          <w:numId w:val="6"/>
+        </w:numPr>
+        <w:spacing w:after="100"/>
+        <w:rPr>
+          <w:rFonts w:ascii="Segoe UI" w:eastAsia="Times New Roman" w:hAnsi="Segoe UI" w:cs="Segoe UI"/>
+          <w:color w:val="1B2430"/>
+          <w:sz w:val="21"/>
+          <w:szCs w:val="21"/>
+          <w:lang w:val="en"/>
+        </w:rPr>
+      </w:pPr>
+      <w:r>
+        <w:rPr>
+          <w:rFonts w:ascii="Segoe UI" w:eastAsia="Times New Roman" w:hAnsi="Segoe UI" w:cs="Segoe UI"/>
+          <w:color w:val="1B2430"/>
+          <w:sz w:val="21"/>
+          <w:szCs w:val="21"/>
+          <w:lang w:val="en"/>
+        </w:rPr>
+        <w:t>No cluster required</w:t>
       </w:r>
     </w:p>
     <w:p>
@@ -1048,17 +1074,17 @@
           <w:szCs w:val="21"/>
           <w:lang w:val="en"/>
         </w:rPr>
-        <w:t>Add the new workloads.</w:t>
-      </w:r>
-      <w:r>
-        <w:rPr>
-          <w:rFonts w:ascii="Segoe UI" w:eastAsia="Times New Roman" w:hAnsi="Segoe UI" w:cs="Segoe UI"/>
-          <w:color w:val="1B2430"/>
-          <w:sz w:val="21"/>
-          <w:szCs w:val="21"/>
-          <w:lang w:val="en"/>
-        </w:rPr>
-        <w:t xml:space="preserve"> Add the seven VMs from IIC-new-workloads.csv to the project next to the RVTools import (they are not in the workbook, so they are not counted twice). </w:t>
+        <w:t>Import the one workbook.</w:t>
+      </w:r>
+      <w:r>
+        <w:rPr>
+          <w:rFonts w:ascii="Segoe UI" w:eastAsia="Times New Roman" w:hAnsi="Segoe UI" w:cs="Segoe UI"/>
+          <w:color w:val="1B2430"/>
+          <w:sz w:val="21"/>
+          <w:szCs w:val="21"/>
+          <w:lang w:val="en"/>
+        </w:rPr>
+        <w:t xml:space="preserve"> Workloads &gt; Import RVTools &gt; IIC-RVTools-demo-with-AVD.xlsx (the 24 VMware VMs plus the 7 AVD VMs). Confirm Use this inventory. </w:t>
       </w:r>
     </w:p>
     <w:p>
@@ -1121,17 +1147,7 @@
           <w:szCs w:val="21"/>
           <w:lang w:val="en"/>
         </w:rPr>
-        <w:t xml:space="preserve"> Open Fit &amp; </w:t>
-      </w:r>
-      <w:r>
-        <w:rPr>
-          <w:rFonts w:ascii="Segoe UI" w:eastAsia="Times New Roman" w:hAnsi="Segoe UI" w:cs="Segoe UI"/>
-          <w:color w:val="1B2430"/>
-          <w:sz w:val="21"/>
-          <w:szCs w:val="21"/>
-          <w:lang w:val="en"/>
-        </w:rPr>
-        <w:t xml:space="preserve">Recommendations with the maintenance reserve off, then turn it on. </w:t>
+        <w:t xml:space="preserve"> Open Fit &amp; Recommendations with the maintenance reserve off, then turn it on. </w:t>
       </w:r>
     </w:p>
     <w:p>
@@ -1583,17 +1599,7 @@
           <w:szCs w:val="21"/>
           <w:lang w:val="en"/>
         </w:rPr>
-        <w:t xml:space="preserve"> </w:t>
-      </w:r>
-      <w:r>
-        <w:rPr>
-          <w:rFonts w:ascii="Segoe UI" w:eastAsia="Times New Roman" w:hAnsi="Segoe UI" w:cs="Segoe UI"/>
-          <w:color w:val="1B2430"/>
-          <w:sz w:val="21"/>
-          <w:szCs w:val="21"/>
-          <w:lang w:val="en"/>
-        </w:rPr>
-        <w:t xml:space="preserve">In the management network step, change the end address so the IP pool holds only five addresses. </w:t>
+        <w:t xml:space="preserve"> In the management network step, change the end address so the IP pool holds only five addresses. </w:t>
       </w:r>
     </w:p>
     <w:p>
@@ -1656,7 +1662,17 @@
           <w:szCs w:val="21"/>
           <w:lang w:val="en"/>
         </w:rPr>
-        <w:t xml:space="preserve"> Widen the pool to six or more addresses (or restore the original end address), then review the network intents, identity and connectivity steps. </w:t>
+        <w:t xml:space="preserve"> </w:t>
+      </w:r>
+      <w:r>
+        <w:rPr>
+          <w:rFonts w:ascii="Segoe UI" w:eastAsia="Times New Roman" w:hAnsi="Segoe UI" w:cs="Segoe UI"/>
+          <w:color w:val="1B2430"/>
+          <w:sz w:val="21"/>
+          <w:szCs w:val="21"/>
+          <w:lang w:val="en"/>
+        </w:rPr>
+        <w:t xml:space="preserve">Widen the pool to six or more addresses (or restore the original end address), then review the network intents, identity and connectivity steps. </w:t>
       </w:r>
     </w:p>
     <w:p>
@@ -1719,17 +1735,7 @@
           <w:szCs w:val="21"/>
           <w:lang w:val="en"/>
         </w:rPr>
-        <w:t xml:space="preserve"> </w:t>
-      </w:r>
-      <w:r>
-        <w:rPr>
-          <w:rFonts w:ascii="Segoe UI" w:eastAsia="Times New Roman" w:hAnsi="Segoe UI" w:cs="Segoe UI"/>
-          <w:color w:val="1B2430"/>
-          <w:sz w:val="21"/>
-          <w:szCs w:val="21"/>
-          <w:lang w:val="en"/>
-        </w:rPr>
-        <w:t xml:space="preserve">Export infrastructure.yml (and, if you want, the Bicep parameter starting point) and open it in an editor. </w:t>
+        <w:t xml:space="preserve"> Export infrastructure.yml (and, if you want, the Bicep parameter starting point) and open it in an editor. </w:t>
       </w:r>
     </w:p>
     <w:p>
@@ -1987,7 +1993,17 @@
           <w:szCs w:val="21"/>
           <w:lang w:val="en"/>
         </w:rPr>
-        <w:t xml:space="preserve"> Generate and preview an Azure Local deployment without creating anything.</w:t>
+        <w:t xml:space="preserve"> </w:t>
+      </w:r>
+      <w:r>
+        <w:rPr>
+          <w:rFonts w:ascii="Segoe UI" w:hAnsi="Segoe UI" w:cs="Segoe UI"/>
+          <w:color w:val="1B2430"/>
+          <w:sz w:val="21"/>
+          <w:szCs w:val="21"/>
+          <w:lang w:val="en"/>
+        </w:rPr>
+        <w:t>Generate and preview an Azure Local deployment without creating anything.</w:t>
       </w:r>
     </w:p>
     <w:p>
@@ -2200,17 +2216,7 @@
           <w:szCs w:val="21"/>
           <w:lang w:val="en"/>
         </w:rPr>
-        <w:t xml:space="preserve"> </w:t>
-      </w:r>
-      <w:r>
-        <w:rPr>
-          <w:rFonts w:ascii="Segoe UI" w:hAnsi="Segoe UI" w:cs="Segoe UI"/>
-          <w:color w:val="1B2430"/>
-          <w:sz w:val="21"/>
-          <w:szCs w:val="21"/>
-          <w:lang w:val="en"/>
-        </w:rPr>
-        <w:t>Copy the two example environment files (shared values and Azure Local values) and replace the values with yours: names, nodes, IP pool, VLANs.</w:t>
+        <w:t xml:space="preserve"> Copy the two example environment files (shared values and Azure Local values) and replace the values with yours: names, nodes, IP pool, VLANs.</w:t>
       </w:r>
     </w:p>
     <w:p>
@@ -2491,17 +2497,7 @@
           <w:szCs w:val="21"/>
           <w:lang w:val="en"/>
         </w:rPr>
-        <w:t xml:space="preserve"> </w:t>
-      </w:r>
-      <w:r>
-        <w:rPr>
-          <w:rFonts w:ascii="Segoe UI" w:hAnsi="Segoe UI" w:cs="Segoe UI"/>
-          <w:color w:val="1B2430"/>
-          <w:sz w:val="21"/>
-          <w:szCs w:val="21"/>
-          <w:lang w:val="en"/>
-        </w:rPr>
-        <w:t>The what-if runs against your subscription and creates nothing. The script reads through Az PowerShell and runs the what-if with the Azure CLI, so sign in to both.</w:t>
+        <w:t xml:space="preserve"> The what-if runs against your subscription and creates nothing. The script reads through Az PowerShell and runs the what-if with the Azure CLI, so sign in to both.</w:t>
       </w:r>
     </w:p>
     <w:p>
@@ -2751,7 +2747,17 @@
           <w:szCs w:val="21"/>
           <w:lang w:val="en"/>
         </w:rPr>
-        <w:t xml:space="preserve"> Compare the output with the Environment Checker results. Platform-side checks run only during the Validate pass in Azure.</w:t>
+        <w:t xml:space="preserve"> </w:t>
+      </w:r>
+      <w:r>
+        <w:rPr>
+          <w:rFonts w:ascii="Segoe UI" w:hAnsi="Segoe UI" w:cs="Segoe UI"/>
+          <w:color w:val="1B2430"/>
+          <w:sz w:val="21"/>
+          <w:szCs w:val="21"/>
+          <w:lang w:val="en"/>
+        </w:rPr>
+        <w:t>Compare the output with the Environment Checker results. Platform-side checks run only during the Validate pass in Azure.</w:t>
       </w:r>
     </w:p>
     <w:p>
@@ -3051,17 +3057,7 @@
           <w:szCs w:val="21"/>
           <w:lang w:val="en"/>
         </w:rPr>
-        <w:t xml:space="preserve"> </w:t>
-      </w:r>
-      <w:r>
-        <w:rPr>
-          <w:rFonts w:ascii="Segoe UI" w:hAnsi="Segoe UI" w:cs="Segoe UI"/>
-          <w:color w:val="1B2430"/>
-          <w:sz w:val="21"/>
-          <w:szCs w:val="21"/>
-          <w:lang w:val="en"/>
-        </w:rPr>
-        <w:t>Understand the Azure Migrate discovery route to Azure Local.</w:t>
+        <w:t xml:space="preserve"> Understand the Azure Migrate discovery route to Azure Local.</w:t>
       </w:r>
     </w:p>
     <w:p>
@@ -4059,17 +4055,64 @@
           <w:szCs w:val="21"/>
           <w:lang w:val="en"/>
         </w:rPr>
+        <w:t xml:space="preserve"> Read the monitoring artefacts.</w:t>
+      </w:r>
+    </w:p>
+    <w:p>
+      <w:pPr>
+        <w:pStyle w:val="NormalWeb"/>
+        <w:rPr>
+          <w:rFonts w:ascii="Segoe UI" w:hAnsi="Segoe UI" w:cs="Segoe UI"/>
+          <w:color w:val="1B2430"/>
+          <w:sz w:val="21"/>
+          <w:szCs w:val="21"/>
+          <w:lang w:val="en"/>
+        </w:rPr>
+      </w:pPr>
+      <w:r>
+        <w:rPr>
+          <w:rStyle w:val="Strong"/>
+          <w:rFonts w:ascii="Segoe UI" w:hAnsi="Segoe UI" w:cs="Segoe UI"/>
+          <w:color w:val="1B2430"/>
+          <w:sz w:val="21"/>
+          <w:szCs w:val="21"/>
+          <w:lang w:val="en"/>
+        </w:rPr>
+        <w:t>In the repo:</w:t>
+      </w:r>
+      <w:r>
+        <w:rPr>
+          <w:rFonts w:ascii="Segoe UI" w:hAnsi="Segoe UI" w:cs="Segoe UI"/>
+          <w:color w:val="1B2430"/>
+          <w:sz w:val="21"/>
+          <w:szCs w:val="21"/>
+          <w:lang w:val="en"/>
+        </w:rPr>
         <w:t xml:space="preserve"> </w:t>
       </w:r>
       <w:r>
         <w:rPr>
-          <w:rFonts w:ascii="Segoe UI" w:hAnsi="Segoe UI" w:cs="Segoe UI"/>
-          <w:color w:val="1B2430"/>
-          <w:sz w:val="21"/>
-          <w:szCs w:val="21"/>
-          <w:lang w:val="en"/>
-        </w:rPr>
-        <w:t>Read the monitoring artefacts.</w:t>
+          <w:rStyle w:val="HTMLCode"/>
+          <w:color w:val="1B2430"/>
+          <w:lang w:val="en"/>
+        </w:rPr>
+        <w:t>automation/azure-local/cluster-configure/monitoring</w:t>
+      </w:r>
+    </w:p>
+    <w:p>
+      <w:pPr>
+        <w:pStyle w:val="Heading3"/>
+        <w:rPr>
+          <w:rFonts w:ascii="Segoe UI" w:eastAsia="Times New Roman" w:hAnsi="Segoe UI" w:cs="Segoe UI"/>
+          <w:lang w:val="en"/>
+        </w:rPr>
+      </w:pPr>
+      <w:r>
+        <w:rPr>
+          <w:rFonts w:ascii="Segoe UI" w:eastAsia="Times New Roman" w:hAnsi="Segoe UI" w:cs="Segoe UI"/>
+          <w:lang w:val="en"/>
+        </w:rPr>
+        <w:t>Update management: the maintenance configuration</w:t>
       </w:r>
     </w:p>
     <w:p>
@@ -4092,6 +4135,39 @@
           <w:szCs w:val="21"/>
           <w:lang w:val="en"/>
         </w:rPr>
+        <w:t>Goal:</w:t>
+      </w:r>
+      <w:r>
+        <w:rPr>
+          <w:rFonts w:ascii="Segoe UI" w:hAnsi="Segoe UI" w:cs="Segoe UI"/>
+          <w:color w:val="1B2430"/>
+          <w:sz w:val="21"/>
+          <w:szCs w:val="21"/>
+          <w:lang w:val="en"/>
+        </w:rPr>
+        <w:t xml:space="preserve"> Read the maintenance configuration templates.</w:t>
+      </w:r>
+    </w:p>
+    <w:p>
+      <w:pPr>
+        <w:pStyle w:val="NormalWeb"/>
+        <w:rPr>
+          <w:rFonts w:ascii="Segoe UI" w:hAnsi="Segoe UI" w:cs="Segoe UI"/>
+          <w:color w:val="1B2430"/>
+          <w:sz w:val="21"/>
+          <w:szCs w:val="21"/>
+          <w:lang w:val="en"/>
+        </w:rPr>
+      </w:pPr>
+      <w:r>
+        <w:rPr>
+          <w:rStyle w:val="Strong"/>
+          <w:rFonts w:ascii="Segoe UI" w:hAnsi="Segoe UI" w:cs="Segoe UI"/>
+          <w:color w:val="1B2430"/>
+          <w:sz w:val="21"/>
+          <w:szCs w:val="21"/>
+          <w:lang w:val="en"/>
+        </w:rPr>
         <w:t>In the repo:</w:t>
       </w:r>
       <w:r>
@@ -4110,7 +4186,7 @@
           <w:color w:val="1B2430"/>
           <w:lang w:val="en"/>
         </w:rPr>
-        <w:t>automation/azure-local/cluster-configure/monitoring</w:t>
+        <w:t>automation/azure-local/cluster-configure/update-manager</w:t>
       </w:r>
     </w:p>
     <w:p>
@@ -4126,7 +4202,7 @@
           <w:rFonts w:ascii="Segoe UI" w:eastAsia="Times New Roman" w:hAnsi="Segoe UI" w:cs="Segoe UI"/>
           <w:lang w:val="en"/>
         </w:rPr>
-        <w:t>Update management: the maintenance configuration</w:t>
+        <w:t>Backup and DR setup</w:t>
       </w:r>
     </w:p>
     <w:p>
@@ -4159,7 +4235,7 @@
           <w:szCs w:val="21"/>
           <w:lang w:val="en"/>
         </w:rPr>
-        <w:t xml:space="preserve"> Read the maintenance configuration templates.</w:t>
+        <w:t xml:space="preserve"> Read the backup and Site Recovery configuration.</w:t>
       </w:r>
     </w:p>
     <w:p>
@@ -4200,7 +4276,7 @@
           <w:color w:val="1B2430"/>
           <w:lang w:val="en"/>
         </w:rPr>
-        <w:t>automation/azure-local/cluster-configure/update-manager</w:t>
+        <w:t>automation/azure-local/cluster-configure/backup-asr</w:t>
       </w:r>
     </w:p>
     <w:p>
@@ -4216,7 +4292,7 @@
           <w:rFonts w:ascii="Segoe UI" w:eastAsia="Times New Roman" w:hAnsi="Segoe UI" w:cs="Segoe UI"/>
           <w:lang w:val="en"/>
         </w:rPr>
-        <w:t>Backup and DR setup</w:t>
+        <w:t>RBAC with Entra PIM</w:t>
       </w:r>
     </w:p>
     <w:p>
@@ -4249,7 +4325,7 @@
           <w:szCs w:val="21"/>
           <w:lang w:val="en"/>
         </w:rPr>
-        <w:t xml:space="preserve"> Read the backup and Site Recovery configuration.</w:t>
+        <w:t xml:space="preserve"> Read the PIM configuration.</w:t>
       </w:r>
     </w:p>
     <w:p>
@@ -4290,7 +4366,7 @@
           <w:color w:val="1B2430"/>
           <w:lang w:val="en"/>
         </w:rPr>
-        <w:t>automation/azure-local/cluster-configure/backup-asr</w:t>
+        <w:t>automation/azure-local/cluster-configure/access-pim</w:t>
       </w:r>
     </w:p>
     <w:p>
@@ -4306,7 +4382,7 @@
           <w:rFonts w:ascii="Segoe UI" w:eastAsia="Times New Roman" w:hAnsi="Segoe UI" w:cs="Segoe UI"/>
           <w:lang w:val="en"/>
         </w:rPr>
-        <w:t>RBAC with Entra PIM</w:t>
+        <w:t>Security baseline as production: Policy, Defender for Cloud and Sentinel</w:t>
       </w:r>
     </w:p>
     <w:p>
@@ -4339,7 +4415,7 @@
           <w:szCs w:val="21"/>
           <w:lang w:val="en"/>
         </w:rPr>
-        <w:t xml:space="preserve"> Read the PIM configuration.</w:t>
+        <w:t xml:space="preserve"> Read the policy initiative.</w:t>
       </w:r>
     </w:p>
     <w:p>
@@ -4380,7 +4456,25 @@
           <w:color w:val="1B2430"/>
           <w:lang w:val="en"/>
         </w:rPr>
-        <w:t>automation/azure-local/cluster-configure/access-pim</w:t>
+        <w:t>automation/shared/security</w:t>
+      </w:r>
+      <w:r>
+        <w:rPr>
+          <w:rFonts w:ascii="Segoe UI" w:hAnsi="Segoe UI" w:cs="Segoe UI"/>
+          <w:color w:val="1B2430"/>
+          <w:sz w:val="21"/>
+          <w:szCs w:val="21"/>
+          <w:lang w:val="en"/>
+        </w:rPr>
+        <w:t xml:space="preserve">, </w:t>
+      </w:r>
+      <w:r>
+        <w:rPr>
+          <w:rStyle w:val="HTMLCode"/>
+          <w:color w:val="1B2430"/>
+          <w:lang w:val="en"/>
+        </w:rPr>
+        <w:t>automation/azure-local/cluster-configure/policy</w:t>
       </w:r>
     </w:p>
     <w:p>
@@ -4396,7 +4490,7 @@
           <w:rFonts w:ascii="Segoe UI" w:eastAsia="Times New Roman" w:hAnsi="Segoe UI" w:cs="Segoe UI"/>
           <w:lang w:val="en"/>
         </w:rPr>
-        <w:t>Security baseline as production: Policy, Defender for Cloud and Sentinel</w:t>
+        <w:t>Workload platform: SDN enabled by Arc, six logical networks and their NSGs</w:t>
       </w:r>
     </w:p>
     <w:p>
@@ -4429,115 +4523,17 @@
           <w:szCs w:val="21"/>
           <w:lang w:val="en"/>
         </w:rPr>
-        <w:t xml:space="preserve"> Read the policy initiative.</w:t>
-      </w:r>
-    </w:p>
-    <w:p>
-      <w:pPr>
-        <w:pStyle w:val="NormalWeb"/>
-        <w:rPr>
-          <w:rFonts w:ascii="Segoe UI" w:hAnsi="Segoe UI" w:cs="Segoe UI"/>
-          <w:color w:val="1B2430"/>
-          <w:sz w:val="21"/>
-          <w:szCs w:val="21"/>
-          <w:lang w:val="en"/>
-        </w:rPr>
-      </w:pPr>
-      <w:r>
-        <w:rPr>
-          <w:rStyle w:val="Strong"/>
-          <w:rFonts w:ascii="Segoe UI" w:hAnsi="Segoe UI" w:cs="Segoe UI"/>
-          <w:color w:val="1B2430"/>
-          <w:sz w:val="21"/>
-          <w:szCs w:val="21"/>
-          <w:lang w:val="en"/>
-        </w:rPr>
-        <w:t>In the repo:</w:t>
-      </w:r>
-      <w:r>
-        <w:rPr>
-          <w:rFonts w:ascii="Segoe UI" w:hAnsi="Segoe UI" w:cs="Segoe UI"/>
-          <w:color w:val="1B2430"/>
-          <w:sz w:val="21"/>
-          <w:szCs w:val="21"/>
-          <w:lang w:val="en"/>
-        </w:rPr>
         <w:t xml:space="preserve"> </w:t>
       </w:r>
       <w:r>
         <w:rPr>
-          <w:rStyle w:val="HTMLCode"/>
-          <w:color w:val="1B2430"/>
-          <w:lang w:val="en"/>
-        </w:rPr>
-        <w:t>automation/shared/security</w:t>
-      </w:r>
-      <w:r>
-        <w:rPr>
-          <w:rFonts w:ascii="Segoe UI" w:hAnsi="Segoe UI" w:cs="Segoe UI"/>
-          <w:color w:val="1B2430"/>
-          <w:sz w:val="21"/>
-          <w:szCs w:val="21"/>
-          <w:lang w:val="en"/>
-        </w:rPr>
-        <w:t xml:space="preserve">, </w:t>
-      </w:r>
-      <w:r>
-        <w:rPr>
-          <w:rStyle w:val="HTMLCode"/>
-          <w:color w:val="1B2430"/>
-          <w:lang w:val="en"/>
-        </w:rPr>
-        <w:t>automation/azure-local/cluster-configure/policy</w:t>
-      </w:r>
-    </w:p>
-    <w:p>
-      <w:pPr>
-        <w:pStyle w:val="Heading3"/>
-        <w:rPr>
-          <w:rFonts w:ascii="Segoe UI" w:eastAsia="Times New Roman" w:hAnsi="Segoe UI" w:cs="Segoe UI"/>
-          <w:lang w:val="en"/>
-        </w:rPr>
-      </w:pPr>
-      <w:r>
-        <w:rPr>
-          <w:rFonts w:ascii="Segoe UI" w:eastAsia="Times New Roman" w:hAnsi="Segoe UI" w:cs="Segoe UI"/>
-          <w:lang w:val="en"/>
-        </w:rPr>
-        <w:t>Workload platform: SDN enabled by Arc, six logical networks and their NSGs</w:t>
-      </w:r>
-    </w:p>
-    <w:p>
-      <w:pPr>
-        <w:pStyle w:val="NormalWeb"/>
-        <w:rPr>
-          <w:rFonts w:ascii="Segoe UI" w:hAnsi="Segoe UI" w:cs="Segoe UI"/>
-          <w:color w:val="1B2430"/>
-          <w:sz w:val="21"/>
-          <w:szCs w:val="21"/>
-          <w:lang w:val="en"/>
-        </w:rPr>
-      </w:pPr>
-      <w:r>
-        <w:rPr>
-          <w:rStyle w:val="Strong"/>
-          <w:rFonts w:ascii="Segoe UI" w:hAnsi="Segoe UI" w:cs="Segoe UI"/>
-          <w:color w:val="1B2430"/>
-          <w:sz w:val="21"/>
-          <w:szCs w:val="21"/>
-          <w:lang w:val="en"/>
-        </w:rPr>
-        <w:t>Goal:</w:t>
-      </w:r>
-      <w:r>
-        <w:rPr>
-          <w:rFonts w:ascii="Segoe UI" w:hAnsi="Segoe UI" w:cs="Segoe UI"/>
-          <w:color w:val="1B2430"/>
-          <w:sz w:val="21"/>
-          <w:szCs w:val="21"/>
-          <w:lang w:val="en"/>
-        </w:rPr>
-        <w:t xml:space="preserve"> Read how logical networks and network security groups are defined for each workload tier on an Azure Local instance with SDN enabled by Azure Arc.</w:t>
+          <w:rFonts w:ascii="Segoe UI" w:hAnsi="Segoe UI" w:cs="Segoe UI"/>
+          <w:color w:val="1B2430"/>
+          <w:sz w:val="21"/>
+          <w:szCs w:val="21"/>
+          <w:lang w:val="en"/>
+        </w:rPr>
+        <w:t>Read how logical networks and network security groups are defined for each workload tier on an Azure Local instance with SDN enabled by Azure Arc.</w:t>
       </w:r>
     </w:p>
     <w:p>
@@ -4777,7 +4773,17 @@
           <w:szCs w:val="21"/>
           <w:lang w:val="en"/>
         </w:rPr>
-        <w:t xml:space="preserve"> Read Steps 2 and 3 of 'Discover and replicate VMware VMs' (</w:t>
+        <w:t xml:space="preserve"> </w:t>
+      </w:r>
+      <w:r>
+        <w:rPr>
+          <w:rFonts w:ascii="Segoe UI" w:eastAsia="Times New Roman" w:hAnsi="Segoe UI" w:cs="Segoe UI"/>
+          <w:color w:val="1B2430"/>
+          <w:sz w:val="21"/>
+          <w:szCs w:val="21"/>
+          <w:lang w:val="en"/>
+        </w:rPr>
+        <w:t>Read Steps 2 and 3 of 'Discover and replicate VMware VMs' (</w:t>
       </w:r>
       <w:hyperlink r:id="rId8" w:history="1">
         <w:r>
@@ -4862,7 +4868,17 @@
           <w:szCs w:val="21"/>
           <w:lang w:val="en"/>
         </w:rPr>
-        <w:t xml:space="preserve"> Read 'Migrate VMware VMs to Azure Local' (</w:t>
+        <w:t xml:space="preserve"> </w:t>
+      </w:r>
+      <w:r>
+        <w:rPr>
+          <w:rFonts w:ascii="Segoe UI" w:eastAsia="Times New Roman" w:hAnsi="Segoe UI" w:cs="Segoe UI"/>
+          <w:color w:val="1B2430"/>
+          <w:sz w:val="21"/>
+          <w:szCs w:val="21"/>
+          <w:lang w:val="en"/>
+        </w:rPr>
+        <w:t>Read 'Migrate VMware VMs to Azure Local' (</w:t>
       </w:r>
       <w:hyperlink r:id="rId9" w:history="1">
         <w:r>
@@ -5473,17 +5489,7 @@
           <w:szCs w:val="21"/>
           <w:lang w:val="en"/>
         </w:rPr>
-        <w:t xml:space="preserve">You should see: The issue is listed under Monitor &gt; </w:t>
-      </w:r>
-      <w:r>
-        <w:rPr>
-          <w:rFonts w:ascii="Segoe UI" w:eastAsia="Times New Roman" w:hAnsi="Segoe UI" w:cs="Segoe UI"/>
-          <w:color w:val="1B2430"/>
-          <w:sz w:val="21"/>
-          <w:szCs w:val="21"/>
-          <w:lang w:val="en"/>
-        </w:rPr>
-        <w:t>Issues with the investigation attached.</w:t>
+        <w:t>You should see: The issue is listed under Monitor &gt; Issues with the investigation attached.</w:t>
       </w:r>
     </w:p>
     <w:p>
@@ -5908,17 +5914,7 @@
           <w:szCs w:val="21"/>
           <w:lang w:val="en"/>
         </w:rPr>
-        <w:t xml:space="preserve"> </w:t>
-      </w:r>
-      <w:r>
-        <w:rPr>
-          <w:rFonts w:ascii="Segoe UI" w:eastAsia="Times New Roman" w:hAnsi="Segoe UI" w:cs="Segoe UI"/>
-          <w:color w:val="1B2430"/>
-          <w:sz w:val="21"/>
-          <w:szCs w:val="21"/>
-          <w:lang w:val="en"/>
-        </w:rPr>
-        <w:t>Read 'Understand and monitor storage resync' (</w:t>
+        <w:t xml:space="preserve"> Read 'Understand and monitor storage resync' (</w:t>
       </w:r>
       <w:hyperlink r:id="rId15" w:history="1">
         <w:r>
@@ -6454,7 +6450,17 @@
           <w:szCs w:val="21"/>
           <w:lang w:val="en"/>
         </w:rPr>
-        <w:t xml:space="preserve"> Faults are run only on the lab cluster.</w:t>
+        <w:t xml:space="preserve"> </w:t>
+      </w:r>
+      <w:r>
+        <w:rPr>
+          <w:rFonts w:ascii="Segoe UI" w:hAnsi="Segoe UI" w:cs="Segoe UI"/>
+          <w:color w:val="1B2430"/>
+          <w:sz w:val="21"/>
+          <w:szCs w:val="21"/>
+          <w:lang w:val="en"/>
+        </w:rPr>
+        <w:t>Faults are run only on the lab cluster.</w:t>
       </w:r>
     </w:p>
     <w:p>
@@ -6511,9 +6517,9 @@
 <file path=word/numbering.xml><?xml version="1.0" encoding="utf-8"?>
 <w:numbering xmlns:wpc="http://schemas.microsoft.com/office/word/2010/wordprocessingCanvas" xmlns:cx="http://schemas.microsoft.com/office/drawing/2014/chartex" xmlns:cx1="http://schemas.microsoft.com/office/drawing/2015/9/8/chartex" xmlns:cx2="http://schemas.microsoft.com/office/drawing/2015/10/21/chartex" xmlns:cx3="http://schemas.microsoft.com/office/drawing/2016/5/9/chartex" xmlns:cx4="http://schemas.microsoft.com/office/drawing/2016/5/10/chartex" xmlns:cx5="http://schemas.microsoft.com/office/drawing/2016/5/11/chartex" xmlns:cx6="http://schemas.microsoft.com/office/drawing/2016/5/12/chartex" xmlns:cx7="http://schemas.microsoft.com/office/drawing/2016/5/13/chartex" xmlns:cx8="http://schemas.microsoft.com/office/drawing/2016/5/14/chartex" xmlns:mc="http://schemas.openxmlformats.org/markup-compatibility/2006" xmlns:aink="http://schemas.microsoft.com/office/drawing/2016/ink" xmlns:am3d="http://schemas.microsoft.com/office/drawing/2017/model3d" xmlns:o="urn:schemas-microsoft-com:office:office" xmlns:oel="http://schemas.microsoft.com/office/2019/extlst" xmlns:r="http://schemas.openxmlformats.org/officeDocument/2006/relationships" xmlns:m="http://schemas.openxmlformats.org/officeDocument/2006/math" xmlns:v="urn:schemas-microsoft-com:vml" xmlns:wp14="http://schemas.microsoft.com/office/word/2010/wordprocessingDrawing" xmlns:wp="http://schemas.openxmlformats.org/drawingml/2006/wordprocessingDrawing" xmlns:w10="urn:schemas-microsoft-com:office:word" xmlns:w="http://schemas.openxmlformats.org/wordprocessingml/2006/main" xmlns:w14="http://schemas.microsoft.com/office/word/2010/wordml" xmlns:w15="http://schemas.microsoft.com/office/word/2012/wordml" xmlns:w16cex="http://schemas.microsoft.com/office/word/2018/wordml/cex" xmlns:w16cid="http://schemas.microsoft.com/office/word/2016/wordml/cid" xmlns:w16="http://schemas.microsoft.com/office/word/2018/wordml" xmlns:w16du="http://schemas.microsoft.com/office/word/2023/wordml/word16du" xmlns:w16sdtdh="http://schemas.microsoft.com/office/word/2020/wordml/sdtdatahash" xmlns:w16sdtfl="http://schemas.microsoft.com/office/word/2024/wordml/sdtformatlock" xmlns:w16se="http://schemas.microsoft.com/office/word/2015/wordml/symex" xmlns:wpg="http://schemas.microsoft.com/office/word/2010/wordprocessingGroup" xmlns:wpi="http://schemas.microsoft.com/office/word/2010/wordprocessingInk" xmlns:wne="http://schemas.microsoft.com/office/word/2006/wordml" xmlns:wps="http://schemas.microsoft.com/office/word/2010/wordprocessingShape" mc:Ignorable="w14 w15 w16se w16cid w16 w16cex w16sdtdh w16sdtfl w16du wp14">
   <w:abstractNum w:abstractNumId="0" w15:restartNumberingAfterBreak="0">
-    <w:nsid w:val="045720A3"/>
+    <w:nsid w:val="09B33F6C"/>
     <w:multiLevelType w:val="multilevel"/>
-    <w:tmpl w:val="A83806B2"/>
+    <w:tmpl w:val="BF4655FE"/>
     <w:lvl w:ilvl="0">
       <w:start w:val="1"/>
       <w:numFmt w:val="decimal"/>
@@ -6628,9 +6634,9 @@
     </w:lvl>
   </w:abstractNum>
   <w:abstractNum w:abstractNumId="1" w15:restartNumberingAfterBreak="0">
-    <w:nsid w:val="05B77484"/>
+    <w:nsid w:val="0BEF6E73"/>
     <w:multiLevelType w:val="multilevel"/>
-    <w:tmpl w:val="913C2470"/>
+    <w:tmpl w:val="1F30E01A"/>
     <w:lvl w:ilvl="0">
       <w:start w:val="1"/>
       <w:numFmt w:val="bullet"/>
@@ -6777,13 +6783,13 @@
     </w:lvl>
   </w:abstractNum>
   <w:abstractNum w:abstractNumId="2" w15:restartNumberingAfterBreak="0">
-    <w:nsid w:val="0E7A131D"/>
+    <w:nsid w:val="0D552ACB"/>
     <w:multiLevelType w:val="multilevel"/>
-    <w:tmpl w:val="C7965302"/>
+    <w:tmpl w:val="EE48D34A"/>
     <w:lvl w:ilvl="0">
       <w:start w:val="1"/>
-      <w:numFmt w:val="bullet"/>
-      <w:lvlText w:val=""/>
+      <w:numFmt w:val="decimal"/>
+      <w:lvlText w:val="%1."/>
       <w:lvlJc w:val="left"/>
       <w:pPr>
         <w:tabs>
@@ -6791,12 +6797,8 @@
         </w:tabs>
         <w:ind w:left="720" w:hanging="360"/>
       </w:pPr>
-      <w:rPr>
-        <w:rFonts w:ascii="Symbol" w:hAnsi="Symbol" w:hint="default"/>
-        <w:sz w:val="20"/>
-      </w:rPr>
-    </w:lvl>
-    <w:lvl w:ilvl="1" w:tentative="1">
+    </w:lvl>
+    <w:lvl w:ilvl="1">
       <w:start w:val="1"/>
       <w:numFmt w:val="bullet"/>
       <w:lvlText w:val="o"/>
@@ -6814,8 +6816,8 @@
     </w:lvl>
     <w:lvl w:ilvl="2" w:tentative="1">
       <w:start w:val="1"/>
-      <w:numFmt w:val="bullet"/>
-      <w:lvlText w:val=""/>
+      <w:numFmt w:val="decimal"/>
+      <w:lvlText w:val="%3."/>
       <w:lvlJc w:val="left"/>
       <w:pPr>
         <w:tabs>
@@ -6823,15 +6825,11 @@
         </w:tabs>
         <w:ind w:left="2160" w:hanging="360"/>
       </w:pPr>
-      <w:rPr>
-        <w:rFonts w:ascii="Wingdings" w:hAnsi="Wingdings" w:hint="default"/>
-        <w:sz w:val="20"/>
-      </w:rPr>
     </w:lvl>
     <w:lvl w:ilvl="3" w:tentative="1">
       <w:start w:val="1"/>
-      <w:numFmt w:val="bullet"/>
-      <w:lvlText w:val=""/>
+      <w:numFmt w:val="decimal"/>
+      <w:lvlText w:val="%4."/>
       <w:lvlJc w:val="left"/>
       <w:pPr>
         <w:tabs>
@@ -6839,15 +6837,11 @@
         </w:tabs>
         <w:ind w:left="2880" w:hanging="360"/>
       </w:pPr>
-      <w:rPr>
-        <w:rFonts w:ascii="Wingdings" w:hAnsi="Wingdings" w:hint="default"/>
-        <w:sz w:val="20"/>
-      </w:rPr>
     </w:lvl>
     <w:lvl w:ilvl="4" w:tentative="1">
       <w:start w:val="1"/>
-      <w:numFmt w:val="bullet"/>
-      <w:lvlText w:val=""/>
+      <w:numFmt w:val="decimal"/>
+      <w:lvlText w:val="%5."/>
       <w:lvlJc w:val="left"/>
       <w:pPr>
         <w:tabs>
@@ -6855,15 +6849,11 @@
         </w:tabs>
         <w:ind w:left="3600" w:hanging="360"/>
       </w:pPr>
-      <w:rPr>
-        <w:rFonts w:ascii="Wingdings" w:hAnsi="Wingdings" w:hint="default"/>
-        <w:sz w:val="20"/>
-      </w:rPr>
     </w:lvl>
     <w:lvl w:ilvl="5" w:tentative="1">
       <w:start w:val="1"/>
-      <w:numFmt w:val="bullet"/>
-      <w:lvlText w:val=""/>
+      <w:numFmt w:val="decimal"/>
+      <w:lvlText w:val="%6."/>
       <w:lvlJc w:val="left"/>
       <w:pPr>
         <w:tabs>
@@ -6871,15 +6861,11 @@
         </w:tabs>
         <w:ind w:left="4320" w:hanging="360"/>
       </w:pPr>
-      <w:rPr>
-        <w:rFonts w:ascii="Wingdings" w:hAnsi="Wingdings" w:hint="default"/>
-        <w:sz w:val="20"/>
-      </w:rPr>
     </w:lvl>
     <w:lvl w:ilvl="6" w:tentative="1">
       <w:start w:val="1"/>
-      <w:numFmt w:val="bullet"/>
-      <w:lvlText w:val=""/>
+      <w:numFmt w:val="decimal"/>
+      <w:lvlText w:val="%7."/>
       <w:lvlJc w:val="left"/>
       <w:pPr>
         <w:tabs>
@@ -6887,15 +6873,11 @@
         </w:tabs>
         <w:ind w:left="5040" w:hanging="360"/>
       </w:pPr>
-      <w:rPr>
-        <w:rFonts w:ascii="Wingdings" w:hAnsi="Wingdings" w:hint="default"/>
-        <w:sz w:val="20"/>
-      </w:rPr>
     </w:lvl>
     <w:lvl w:ilvl="7" w:tentative="1">
       <w:start w:val="1"/>
-      <w:numFmt w:val="bullet"/>
-      <w:lvlText w:val=""/>
+      <w:numFmt w:val="decimal"/>
+      <w:lvlText w:val="%8."/>
       <w:lvlJc w:val="left"/>
       <w:pPr>
         <w:tabs>
@@ -6903,15 +6885,11 @@
         </w:tabs>
         <w:ind w:left="5760" w:hanging="360"/>
       </w:pPr>
-      <w:rPr>
-        <w:rFonts w:ascii="Wingdings" w:hAnsi="Wingdings" w:hint="default"/>
-        <w:sz w:val="20"/>
-      </w:rPr>
     </w:lvl>
     <w:lvl w:ilvl="8" w:tentative="1">
       <w:start w:val="1"/>
-      <w:numFmt w:val="bullet"/>
-      <w:lvlText w:val=""/>
+      <w:numFmt w:val="decimal"/>
+      <w:lvlText w:val="%9."/>
       <w:lvlJc w:val="left"/>
       <w:pPr>
         <w:tabs>
@@ -6919,16 +6897,12 @@
         </w:tabs>
         <w:ind w:left="6480" w:hanging="360"/>
       </w:pPr>
-      <w:rPr>
-        <w:rFonts w:ascii="Wingdings" w:hAnsi="Wingdings" w:hint="default"/>
-        <w:sz w:val="20"/>
-      </w:rPr>
     </w:lvl>
   </w:abstractNum>
   <w:abstractNum w:abstractNumId="3" w15:restartNumberingAfterBreak="0">
-    <w:nsid w:val="241B4AC8"/>
+    <w:nsid w:val="16D11825"/>
     <w:multiLevelType w:val="multilevel"/>
-    <w:tmpl w:val="3D8C9BCE"/>
+    <w:tmpl w:val="EFF8A8B8"/>
     <w:lvl w:ilvl="0">
       <w:start w:val="1"/>
       <w:numFmt w:val="bullet"/>
@@ -7075,13 +7049,13 @@
     </w:lvl>
   </w:abstractNum>
   <w:abstractNum w:abstractNumId="4" w15:restartNumberingAfterBreak="0">
-    <w:nsid w:val="298B7641"/>
+    <w:nsid w:val="1D6E45AA"/>
     <w:multiLevelType w:val="multilevel"/>
-    <w:tmpl w:val="CEBEE974"/>
+    <w:tmpl w:val="AFA62596"/>
     <w:lvl w:ilvl="0">
       <w:start w:val="1"/>
-      <w:numFmt w:val="bullet"/>
-      <w:lvlText w:val=""/>
+      <w:numFmt w:val="decimal"/>
+      <w:lvlText w:val="%1."/>
       <w:lvlJc w:val="left"/>
       <w:pPr>
         <w:tabs>
@@ -7089,12 +7063,8 @@
         </w:tabs>
         <w:ind w:left="720" w:hanging="360"/>
       </w:pPr>
-      <w:rPr>
-        <w:rFonts w:ascii="Symbol" w:hAnsi="Symbol" w:hint="default"/>
-        <w:sz w:val="20"/>
-      </w:rPr>
-    </w:lvl>
-    <w:lvl w:ilvl="1" w:tentative="1">
+    </w:lvl>
+    <w:lvl w:ilvl="1">
       <w:start w:val="1"/>
       <w:numFmt w:val="bullet"/>
       <w:lvlText w:val="o"/>
@@ -7112,8 +7082,8 @@
     </w:lvl>
     <w:lvl w:ilvl="2" w:tentative="1">
       <w:start w:val="1"/>
-      <w:numFmt w:val="bullet"/>
-      <w:lvlText w:val=""/>
+      <w:numFmt w:val="decimal"/>
+      <w:lvlText w:val="%3."/>
       <w:lvlJc w:val="left"/>
       <w:pPr>
         <w:tabs>
@@ -7121,15 +7091,11 @@
         </w:tabs>
         <w:ind w:left="2160" w:hanging="360"/>
       </w:pPr>
-      <w:rPr>
-        <w:rFonts w:ascii="Wingdings" w:hAnsi="Wingdings" w:hint="default"/>
-        <w:sz w:val="20"/>
-      </w:rPr>
     </w:lvl>
     <w:lvl w:ilvl="3" w:tentative="1">
       <w:start w:val="1"/>
-      <w:numFmt w:val="bullet"/>
-      <w:lvlText w:val=""/>
+      <w:numFmt w:val="decimal"/>
+      <w:lvlText w:val="%4."/>
       <w:lvlJc w:val="left"/>
       <w:pPr>
         <w:tabs>
@@ -7137,15 +7103,11 @@
         </w:tabs>
         <w:ind w:left="2880" w:hanging="360"/>
       </w:pPr>
-      <w:rPr>
-        <w:rFonts w:ascii="Wingdings" w:hAnsi="Wingdings" w:hint="default"/>
-        <w:sz w:val="20"/>
-      </w:rPr>
     </w:lvl>
     <w:lvl w:ilvl="4" w:tentative="1">
       <w:start w:val="1"/>
-      <w:numFmt w:val="bullet"/>
-      <w:lvlText w:val=""/>
+      <w:numFmt w:val="decimal"/>
+      <w:lvlText w:val="%5."/>
       <w:lvlJc w:val="left"/>
       <w:pPr>
         <w:tabs>
@@ -7153,15 +7115,11 @@
         </w:tabs>
         <w:ind w:left="3600" w:hanging="360"/>
       </w:pPr>
-      <w:rPr>
-        <w:rFonts w:ascii="Wingdings" w:hAnsi="Wingdings" w:hint="default"/>
-        <w:sz w:val="20"/>
-      </w:rPr>
     </w:lvl>
     <w:lvl w:ilvl="5" w:tentative="1">
       <w:start w:val="1"/>
-      <w:numFmt w:val="bullet"/>
-      <w:lvlText w:val=""/>
+      <w:numFmt w:val="decimal"/>
+      <w:lvlText w:val="%6."/>
       <w:lvlJc w:val="left"/>
       <w:pPr>
         <w:tabs>
@@ -7169,15 +7127,11 @@
         </w:tabs>
         <w:ind w:left="4320" w:hanging="360"/>
       </w:pPr>
-      <w:rPr>
-        <w:rFonts w:ascii="Wingdings" w:hAnsi="Wingdings" w:hint="default"/>
-        <w:sz w:val="20"/>
-      </w:rPr>
     </w:lvl>
     <w:lvl w:ilvl="6" w:tentative="1">
       <w:start w:val="1"/>
-      <w:numFmt w:val="bullet"/>
-      <w:lvlText w:val=""/>
+      <w:numFmt w:val="decimal"/>
+      <w:lvlText w:val="%7."/>
       <w:lvlJc w:val="left"/>
       <w:pPr>
         <w:tabs>
@@ -7185,15 +7139,11 @@
         </w:tabs>
         <w:ind w:left="5040" w:hanging="360"/>
       </w:pPr>
-      <w:rPr>
-        <w:rFonts w:ascii="Wingdings" w:hAnsi="Wingdings" w:hint="default"/>
-        <w:sz w:val="20"/>
-      </w:rPr>
     </w:lvl>
     <w:lvl w:ilvl="7" w:tentative="1">
       <w:start w:val="1"/>
-      <w:numFmt w:val="bullet"/>
-      <w:lvlText w:val=""/>
+      <w:numFmt w:val="decimal"/>
+      <w:lvlText w:val="%8."/>
       <w:lvlJc w:val="left"/>
       <w:pPr>
         <w:tabs>
@@ -7201,15 +7151,11 @@
         </w:tabs>
         <w:ind w:left="5760" w:hanging="360"/>
       </w:pPr>
-      <w:rPr>
-        <w:rFonts w:ascii="Wingdings" w:hAnsi="Wingdings" w:hint="default"/>
-        <w:sz w:val="20"/>
-      </w:rPr>
     </w:lvl>
     <w:lvl w:ilvl="8" w:tentative="1">
       <w:start w:val="1"/>
-      <w:numFmt w:val="bullet"/>
-      <w:lvlText w:val=""/>
+      <w:numFmt w:val="decimal"/>
+      <w:lvlText w:val="%9."/>
       <w:lvlJc w:val="left"/>
       <w:pPr>
         <w:tabs>
@@ -7217,16 +7163,310 @@
         </w:tabs>
         <w:ind w:left="6480" w:hanging="360"/>
       </w:pPr>
-      <w:rPr>
-        <w:rFonts w:ascii="Wingdings" w:hAnsi="Wingdings" w:hint="default"/>
-        <w:sz w:val="20"/>
-      </w:rPr>
     </w:lvl>
   </w:abstractNum>
   <w:abstractNum w:abstractNumId="5" w15:restartNumberingAfterBreak="0">
-    <w:nsid w:val="2F976AA0"/>
+    <w:nsid w:val="221941C0"/>
     <w:multiLevelType w:val="multilevel"/>
-    <w:tmpl w:val="A030FBB2"/>
+    <w:tmpl w:val="2BEC55D4"/>
+    <w:lvl w:ilvl="0">
+      <w:start w:val="1"/>
+      <w:numFmt w:val="bullet"/>
+      <w:lvlText w:val=""/>
+      <w:lvlJc w:val="left"/>
+      <w:pPr>
+        <w:tabs>
+          <w:tab w:val="num" w:pos="720"/>
+        </w:tabs>
+        <w:ind w:left="720" w:hanging="360"/>
+      </w:pPr>
+      <w:rPr>
+        <w:rFonts w:ascii="Symbol" w:hAnsi="Symbol" w:hint="default"/>
+        <w:sz w:val="20"/>
+      </w:rPr>
+    </w:lvl>
+    <w:lvl w:ilvl="1" w:tentative="1">
+      <w:start w:val="1"/>
+      <w:numFmt w:val="bullet"/>
+      <w:lvlText w:val="o"/>
+      <w:lvlJc w:val="left"/>
+      <w:pPr>
+        <w:tabs>
+          <w:tab w:val="num" w:pos="1440"/>
+        </w:tabs>
+        <w:ind w:left="1440" w:hanging="360"/>
+      </w:pPr>
+      <w:rPr>
+        <w:rFonts w:ascii="Courier New" w:hAnsi="Courier New" w:hint="default"/>
+        <w:sz w:val="20"/>
+      </w:rPr>
+    </w:lvl>
+    <w:lvl w:ilvl="2" w:tentative="1">
+      <w:start w:val="1"/>
+      <w:numFmt w:val="bullet"/>
+      <w:lvlText w:val=""/>
+      <w:lvlJc w:val="left"/>
+      <w:pPr>
+        <w:tabs>
+          <w:tab w:val="num" w:pos="2160"/>
+        </w:tabs>
+        <w:ind w:left="2160" w:hanging="360"/>
+      </w:pPr>
+      <w:rPr>
+        <w:rFonts w:ascii="Wingdings" w:hAnsi="Wingdings" w:hint="default"/>
+        <w:sz w:val="20"/>
+      </w:rPr>
+    </w:lvl>
+    <w:lvl w:ilvl="3" w:tentative="1">
+      <w:start w:val="1"/>
+      <w:numFmt w:val="bullet"/>
+      <w:lvlText w:val=""/>
+      <w:lvlJc w:val="left"/>
+      <w:pPr>
+        <w:tabs>
+          <w:tab w:val="num" w:pos="2880"/>
+        </w:tabs>
+        <w:ind w:left="2880" w:hanging="360"/>
+      </w:pPr>
+      <w:rPr>
+        <w:rFonts w:ascii="Wingdings" w:hAnsi="Wingdings" w:hint="default"/>
+        <w:sz w:val="20"/>
+      </w:rPr>
+    </w:lvl>
+    <w:lvl w:ilvl="4" w:tentative="1">
+      <w:start w:val="1"/>
+      <w:numFmt w:val="bullet"/>
+      <w:lvlText w:val=""/>
+      <w:lvlJc w:val="left"/>
+      <w:pPr>
+        <w:tabs>
+          <w:tab w:val="num" w:pos="3600"/>
+        </w:tabs>
+        <w:ind w:left="3600" w:hanging="360"/>
+      </w:pPr>
+      <w:rPr>
+        <w:rFonts w:ascii="Wingdings" w:hAnsi="Wingdings" w:hint="default"/>
+        <w:sz w:val="20"/>
+      </w:rPr>
+    </w:lvl>
+    <w:lvl w:ilvl="5" w:tentative="1">
+      <w:start w:val="1"/>
+      <w:numFmt w:val="bullet"/>
+      <w:lvlText w:val=""/>
+      <w:lvlJc w:val="left"/>
+      <w:pPr>
+        <w:tabs>
+          <w:tab w:val="num" w:pos="4320"/>
+        </w:tabs>
+        <w:ind w:left="4320" w:hanging="360"/>
+      </w:pPr>
+      <w:rPr>
+        <w:rFonts w:ascii="Wingdings" w:hAnsi="Wingdings" w:hint="default"/>
+        <w:sz w:val="20"/>
+      </w:rPr>
+    </w:lvl>
+    <w:lvl w:ilvl="6" w:tentative="1">
+      <w:start w:val="1"/>
+      <w:numFmt w:val="bullet"/>
+      <w:lvlText w:val=""/>
+      <w:lvlJc w:val="left"/>
+      <w:pPr>
+        <w:tabs>
+          <w:tab w:val="num" w:pos="5040"/>
+        </w:tabs>
+        <w:ind w:left="5040" w:hanging="360"/>
+      </w:pPr>
+      <w:rPr>
+        <w:rFonts w:ascii="Wingdings" w:hAnsi="Wingdings" w:hint="default"/>
+        <w:sz w:val="20"/>
+      </w:rPr>
+    </w:lvl>
+    <w:lvl w:ilvl="7" w:tentative="1">
+      <w:start w:val="1"/>
+      <w:numFmt w:val="bullet"/>
+      <w:lvlText w:val=""/>
+      <w:lvlJc w:val="left"/>
+      <w:pPr>
+        <w:tabs>
+          <w:tab w:val="num" w:pos="5760"/>
+        </w:tabs>
+        <w:ind w:left="5760" w:hanging="360"/>
+      </w:pPr>
+      <w:rPr>
+        <w:rFonts w:ascii="Wingdings" w:hAnsi="Wingdings" w:hint="default"/>
+        <w:sz w:val="20"/>
+      </w:rPr>
+    </w:lvl>
+    <w:lvl w:ilvl="8" w:tentative="1">
+      <w:start w:val="1"/>
+      <w:numFmt w:val="bullet"/>
+      <w:lvlText w:val=""/>
+      <w:lvlJc w:val="left"/>
+      <w:pPr>
+        <w:tabs>
+          <w:tab w:val="num" w:pos="6480"/>
+        </w:tabs>
+        <w:ind w:left="6480" w:hanging="360"/>
+      </w:pPr>
+      <w:rPr>
+        <w:rFonts w:ascii="Wingdings" w:hAnsi="Wingdings" w:hint="default"/>
+        <w:sz w:val="20"/>
+      </w:rPr>
+    </w:lvl>
+  </w:abstractNum>
+  <w:abstractNum w:abstractNumId="6" w15:restartNumberingAfterBreak="0">
+    <w:nsid w:val="22BF39F8"/>
+    <w:multiLevelType w:val="multilevel"/>
+    <w:tmpl w:val="A12A4814"/>
+    <w:lvl w:ilvl="0">
+      <w:start w:val="1"/>
+      <w:numFmt w:val="bullet"/>
+      <w:lvlText w:val=""/>
+      <w:lvlJc w:val="left"/>
+      <w:pPr>
+        <w:tabs>
+          <w:tab w:val="num" w:pos="720"/>
+        </w:tabs>
+        <w:ind w:left="720" w:hanging="360"/>
+      </w:pPr>
+      <w:rPr>
+        <w:rFonts w:ascii="Symbol" w:hAnsi="Symbol" w:hint="default"/>
+        <w:sz w:val="20"/>
+      </w:rPr>
+    </w:lvl>
+    <w:lvl w:ilvl="1" w:tentative="1">
+      <w:start w:val="1"/>
+      <w:numFmt w:val="bullet"/>
+      <w:lvlText w:val="o"/>
+      <w:lvlJc w:val="left"/>
+      <w:pPr>
+        <w:tabs>
+          <w:tab w:val="num" w:pos="1440"/>
+        </w:tabs>
+        <w:ind w:left="1440" w:hanging="360"/>
+      </w:pPr>
+      <w:rPr>
+        <w:rFonts w:ascii="Courier New" w:hAnsi="Courier New" w:hint="default"/>
+        <w:sz w:val="20"/>
+      </w:rPr>
+    </w:lvl>
+    <w:lvl w:ilvl="2" w:tentative="1">
+      <w:start w:val="1"/>
+      <w:numFmt w:val="bullet"/>
+      <w:lvlText w:val=""/>
+      <w:lvlJc w:val="left"/>
+      <w:pPr>
+        <w:tabs>
+          <w:tab w:val="num" w:pos="2160"/>
+        </w:tabs>
+        <w:ind w:left="2160" w:hanging="360"/>
+      </w:pPr>
+      <w:rPr>
+        <w:rFonts w:ascii="Wingdings" w:hAnsi="Wingdings" w:hint="default"/>
+        <w:sz w:val="20"/>
+      </w:rPr>
+    </w:lvl>
+    <w:lvl w:ilvl="3" w:tentative="1">
+      <w:start w:val="1"/>
+      <w:numFmt w:val="bullet"/>
+      <w:lvlText w:val=""/>
+      <w:lvlJc w:val="left"/>
+      <w:pPr>
+        <w:tabs>
+          <w:tab w:val="num" w:pos="2880"/>
+        </w:tabs>
+        <w:ind w:left="2880" w:hanging="360"/>
+      </w:pPr>
+      <w:rPr>
+        <w:rFonts w:ascii="Wingdings" w:hAnsi="Wingdings" w:hint="default"/>
+        <w:sz w:val="20"/>
+      </w:rPr>
+    </w:lvl>
+    <w:lvl w:ilvl="4" w:tentative="1">
+      <w:start w:val="1"/>
+      <w:numFmt w:val="bullet"/>
+      <w:lvlText w:val=""/>
+      <w:lvlJc w:val="left"/>
+      <w:pPr>
+        <w:tabs>
+          <w:tab w:val="num" w:pos="3600"/>
+        </w:tabs>
+        <w:ind w:left="3600" w:hanging="360"/>
+      </w:pPr>
+      <w:rPr>
+        <w:rFonts w:ascii="Wingdings" w:hAnsi="Wingdings" w:hint="default"/>
+        <w:sz w:val="20"/>
+      </w:rPr>
+    </w:lvl>
+    <w:lvl w:ilvl="5" w:tentative="1">
+      <w:start w:val="1"/>
+      <w:numFmt w:val="bullet"/>
+      <w:lvlText w:val=""/>
+      <w:lvlJc w:val="left"/>
+      <w:pPr>
+        <w:tabs>
+          <w:tab w:val="num" w:pos="4320"/>
+        </w:tabs>
+        <w:ind w:left="4320" w:hanging="360"/>
+      </w:pPr>
+      <w:rPr>
+        <w:rFonts w:ascii="Wingdings" w:hAnsi="Wingdings" w:hint="default"/>
+        <w:sz w:val="20"/>
+      </w:rPr>
+    </w:lvl>
+    <w:lvl w:ilvl="6" w:tentative="1">
+      <w:start w:val="1"/>
+      <w:numFmt w:val="bullet"/>
+      <w:lvlText w:val=""/>
+      <w:lvlJc w:val="left"/>
+      <w:pPr>
+        <w:tabs>
+          <w:tab w:val="num" w:pos="5040"/>
+        </w:tabs>
+        <w:ind w:left="5040" w:hanging="360"/>
+      </w:pPr>
+      <w:rPr>
+        <w:rFonts w:ascii="Wingdings" w:hAnsi="Wingdings" w:hint="default"/>
+        <w:sz w:val="20"/>
+      </w:rPr>
+    </w:lvl>
+    <w:lvl w:ilvl="7" w:tentative="1">
+      <w:start w:val="1"/>
+      <w:numFmt w:val="bullet"/>
+      <w:lvlText w:val=""/>
+      <w:lvlJc w:val="left"/>
+      <w:pPr>
+        <w:tabs>
+          <w:tab w:val="num" w:pos="5760"/>
+        </w:tabs>
+        <w:ind w:left="5760" w:hanging="360"/>
+      </w:pPr>
+      <w:rPr>
+        <w:rFonts w:ascii="Wingdings" w:hAnsi="Wingdings" w:hint="default"/>
+        <w:sz w:val="20"/>
+      </w:rPr>
+    </w:lvl>
+    <w:lvl w:ilvl="8" w:tentative="1">
+      <w:start w:val="1"/>
+      <w:numFmt w:val="bullet"/>
+      <w:lvlText w:val=""/>
+      <w:lvlJc w:val="left"/>
+      <w:pPr>
+        <w:tabs>
+          <w:tab w:val="num" w:pos="6480"/>
+        </w:tabs>
+        <w:ind w:left="6480" w:hanging="360"/>
+      </w:pPr>
+      <w:rPr>
+        <w:rFonts w:ascii="Wingdings" w:hAnsi="Wingdings" w:hint="default"/>
+        <w:sz w:val="20"/>
+      </w:rPr>
+    </w:lvl>
+  </w:abstractNum>
+  <w:abstractNum w:abstractNumId="7" w15:restartNumberingAfterBreak="0">
+    <w:nsid w:val="2675064E"/>
+    <w:multiLevelType w:val="multilevel"/>
+    <w:tmpl w:val="149AC6CA"/>
     <w:lvl w:ilvl="0">
       <w:start w:val="1"/>
       <w:numFmt w:val="decimal"/>
@@ -7340,10 +7580,10 @@
       </w:pPr>
     </w:lvl>
   </w:abstractNum>
-  <w:abstractNum w:abstractNumId="6" w15:restartNumberingAfterBreak="0">
-    <w:nsid w:val="31A96F0E"/>
+  <w:abstractNum w:abstractNumId="8" w15:restartNumberingAfterBreak="0">
+    <w:nsid w:val="37D93A36"/>
     <w:multiLevelType w:val="multilevel"/>
-    <w:tmpl w:val="7E9EE1EA"/>
+    <w:tmpl w:val="C6E031D4"/>
     <w:lvl w:ilvl="0">
       <w:start w:val="1"/>
       <w:numFmt w:val="decimal"/>
@@ -7457,10 +7697,159 @@
       </w:pPr>
     </w:lvl>
   </w:abstractNum>
-  <w:abstractNum w:abstractNumId="7" w15:restartNumberingAfterBreak="0">
-    <w:nsid w:val="37B25D14"/>
+  <w:abstractNum w:abstractNumId="9" w15:restartNumberingAfterBreak="0">
+    <w:nsid w:val="3E8653C5"/>
     <w:multiLevelType w:val="multilevel"/>
-    <w:tmpl w:val="25D25754"/>
+    <w:tmpl w:val="E3027C30"/>
+    <w:lvl w:ilvl="0">
+      <w:start w:val="1"/>
+      <w:numFmt w:val="bullet"/>
+      <w:lvlText w:val=""/>
+      <w:lvlJc w:val="left"/>
+      <w:pPr>
+        <w:tabs>
+          <w:tab w:val="num" w:pos="720"/>
+        </w:tabs>
+        <w:ind w:left="720" w:hanging="360"/>
+      </w:pPr>
+      <w:rPr>
+        <w:rFonts w:ascii="Symbol" w:hAnsi="Symbol" w:hint="default"/>
+        <w:sz w:val="20"/>
+      </w:rPr>
+    </w:lvl>
+    <w:lvl w:ilvl="1" w:tentative="1">
+      <w:start w:val="1"/>
+      <w:numFmt w:val="bullet"/>
+      <w:lvlText w:val="o"/>
+      <w:lvlJc w:val="left"/>
+      <w:pPr>
+        <w:tabs>
+          <w:tab w:val="num" w:pos="1440"/>
+        </w:tabs>
+        <w:ind w:left="1440" w:hanging="360"/>
+      </w:pPr>
+      <w:rPr>
+        <w:rFonts w:ascii="Courier New" w:hAnsi="Courier New" w:hint="default"/>
+        <w:sz w:val="20"/>
+      </w:rPr>
+    </w:lvl>
+    <w:lvl w:ilvl="2" w:tentative="1">
+      <w:start w:val="1"/>
+      <w:numFmt w:val="bullet"/>
+      <w:lvlText w:val=""/>
+      <w:lvlJc w:val="left"/>
+      <w:pPr>
+        <w:tabs>
+          <w:tab w:val="num" w:pos="2160"/>
+        </w:tabs>
+        <w:ind w:left="2160" w:hanging="360"/>
+      </w:pPr>
+      <w:rPr>
+        <w:rFonts w:ascii="Wingdings" w:hAnsi="Wingdings" w:hint="default"/>
+        <w:sz w:val="20"/>
+      </w:rPr>
+    </w:lvl>
+    <w:lvl w:ilvl="3" w:tentative="1">
+      <w:start w:val="1"/>
+      <w:numFmt w:val="bullet"/>
+      <w:lvlText w:val=""/>
+      <w:lvlJc w:val="left"/>
+      <w:pPr>
+        <w:tabs>
+          <w:tab w:val="num" w:pos="2880"/>
+        </w:tabs>
+        <w:ind w:left="2880" w:hanging="360"/>
+      </w:pPr>
+      <w:rPr>
+        <w:rFonts w:ascii="Wingdings" w:hAnsi="Wingdings" w:hint="default"/>
+        <w:sz w:val="20"/>
+      </w:rPr>
+    </w:lvl>
+    <w:lvl w:ilvl="4" w:tentative="1">
+      <w:start w:val="1"/>
+      <w:numFmt w:val="bullet"/>
+      <w:lvlText w:val=""/>
+      <w:lvlJc w:val="left"/>
+      <w:pPr>
+        <w:tabs>
+          <w:tab w:val="num" w:pos="3600"/>
+        </w:tabs>
+        <w:ind w:left="3600" w:hanging="360"/>
+      </w:pPr>
+      <w:rPr>
+        <w:rFonts w:ascii="Wingdings" w:hAnsi="Wingdings" w:hint="default"/>
+        <w:sz w:val="20"/>
+      </w:rPr>
+    </w:lvl>
+    <w:lvl w:ilvl="5" w:tentative="1">
+      <w:start w:val="1"/>
+      <w:numFmt w:val="bullet"/>
+      <w:lvlText w:val=""/>
+      <w:lvlJc w:val="left"/>
+      <w:pPr>
+        <w:tabs>
+          <w:tab w:val="num" w:pos="4320"/>
+        </w:tabs>
+        <w:ind w:left="4320" w:hanging="360"/>
+      </w:pPr>
+      <w:rPr>
+        <w:rFonts w:ascii="Wingdings" w:hAnsi="Wingdings" w:hint="default"/>
+        <w:sz w:val="20"/>
+      </w:rPr>
+    </w:lvl>
+    <w:lvl w:ilvl="6" w:tentative="1">
+      <w:start w:val="1"/>
+      <w:numFmt w:val="bullet"/>
+      <w:lvlText w:val=""/>
+      <w:lvlJc w:val="left"/>
+      <w:pPr>
+        <w:tabs>
+          <w:tab w:val="num" w:pos="5040"/>
+        </w:tabs>
+        <w:ind w:left="5040" w:hanging="360"/>
+      </w:pPr>
+      <w:rPr>
+        <w:rFonts w:ascii="Wingdings" w:hAnsi="Wingdings" w:hint="default"/>
+        <w:sz w:val="20"/>
+      </w:rPr>
+    </w:lvl>
+    <w:lvl w:ilvl="7" w:tentative="1">
+      <w:start w:val="1"/>
+      <w:numFmt w:val="bullet"/>
+      <w:lvlText w:val=""/>
+      <w:lvlJc w:val="left"/>
+      <w:pPr>
+        <w:tabs>
+          <w:tab w:val="num" w:pos="5760"/>
+        </w:tabs>
+        <w:ind w:left="5760" w:hanging="360"/>
+      </w:pPr>
+      <w:rPr>
+        <w:rFonts w:ascii="Wingdings" w:hAnsi="Wingdings" w:hint="default"/>
+        <w:sz w:val="20"/>
+      </w:rPr>
+    </w:lvl>
+    <w:lvl w:ilvl="8" w:tentative="1">
+      <w:start w:val="1"/>
+      <w:numFmt w:val="bullet"/>
+      <w:lvlText w:val=""/>
+      <w:lvlJc w:val="left"/>
+      <w:pPr>
+        <w:tabs>
+          <w:tab w:val="num" w:pos="6480"/>
+        </w:tabs>
+        <w:ind w:left="6480" w:hanging="360"/>
+      </w:pPr>
+      <w:rPr>
+        <w:rFonts w:ascii="Wingdings" w:hAnsi="Wingdings" w:hint="default"/>
+        <w:sz w:val="20"/>
+      </w:rPr>
+    </w:lvl>
+  </w:abstractNum>
+  <w:abstractNum w:abstractNumId="10" w15:restartNumberingAfterBreak="0">
+    <w:nsid w:val="41064503"/>
+    <w:multiLevelType w:val="multilevel"/>
+    <w:tmpl w:val="7970254C"/>
     <w:lvl w:ilvl="0">
       <w:start w:val="1"/>
       <w:numFmt w:val="decimal"/>
@@ -7574,10 +7963,10 @@
       </w:pPr>
     </w:lvl>
   </w:abstractNum>
-  <w:abstractNum w:abstractNumId="8" w15:restartNumberingAfterBreak="0">
-    <w:nsid w:val="42295FD7"/>
+  <w:abstractNum w:abstractNumId="11" w15:restartNumberingAfterBreak="0">
+    <w:nsid w:val="41367D89"/>
     <w:multiLevelType w:val="multilevel"/>
-    <w:tmpl w:val="FED28452"/>
+    <w:tmpl w:val="6CE4D154"/>
     <w:lvl w:ilvl="0">
       <w:start w:val="1"/>
       <w:numFmt w:val="bullet"/>
@@ -7723,10 +8112,308 @@
       </w:rPr>
     </w:lvl>
   </w:abstractNum>
-  <w:abstractNum w:abstractNumId="9" w15:restartNumberingAfterBreak="0">
-    <w:nsid w:val="435D03D0"/>
+  <w:abstractNum w:abstractNumId="12" w15:restartNumberingAfterBreak="0">
+    <w:nsid w:val="4CDB2B4D"/>
     <w:multiLevelType w:val="multilevel"/>
-    <w:tmpl w:val="FE7ED246"/>
+    <w:tmpl w:val="B1D4B054"/>
+    <w:lvl w:ilvl="0">
+      <w:start w:val="1"/>
+      <w:numFmt w:val="bullet"/>
+      <w:lvlText w:val=""/>
+      <w:lvlJc w:val="left"/>
+      <w:pPr>
+        <w:tabs>
+          <w:tab w:val="num" w:pos="720"/>
+        </w:tabs>
+        <w:ind w:left="720" w:hanging="360"/>
+      </w:pPr>
+      <w:rPr>
+        <w:rFonts w:ascii="Symbol" w:hAnsi="Symbol" w:hint="default"/>
+        <w:sz w:val="20"/>
+      </w:rPr>
+    </w:lvl>
+    <w:lvl w:ilvl="1" w:tentative="1">
+      <w:start w:val="1"/>
+      <w:numFmt w:val="bullet"/>
+      <w:lvlText w:val="o"/>
+      <w:lvlJc w:val="left"/>
+      <w:pPr>
+        <w:tabs>
+          <w:tab w:val="num" w:pos="1440"/>
+        </w:tabs>
+        <w:ind w:left="1440" w:hanging="360"/>
+      </w:pPr>
+      <w:rPr>
+        <w:rFonts w:ascii="Courier New" w:hAnsi="Courier New" w:hint="default"/>
+        <w:sz w:val="20"/>
+      </w:rPr>
+    </w:lvl>
+    <w:lvl w:ilvl="2" w:tentative="1">
+      <w:start w:val="1"/>
+      <w:numFmt w:val="bullet"/>
+      <w:lvlText w:val=""/>
+      <w:lvlJc w:val="left"/>
+      <w:pPr>
+        <w:tabs>
+          <w:tab w:val="num" w:pos="2160"/>
+        </w:tabs>
+        <w:ind w:left="2160" w:hanging="360"/>
+      </w:pPr>
+      <w:rPr>
+        <w:rFonts w:ascii="Wingdings" w:hAnsi="Wingdings" w:hint="default"/>
+        <w:sz w:val="20"/>
+      </w:rPr>
+    </w:lvl>
+    <w:lvl w:ilvl="3" w:tentative="1">
+      <w:start w:val="1"/>
+      <w:numFmt w:val="bullet"/>
+      <w:lvlText w:val=""/>
+      <w:lvlJc w:val="left"/>
+      <w:pPr>
+        <w:tabs>
+          <w:tab w:val="num" w:pos="2880"/>
+        </w:tabs>
+        <w:ind w:left="2880" w:hanging="360"/>
+      </w:pPr>
+      <w:rPr>
+        <w:rFonts w:ascii="Wingdings" w:hAnsi="Wingdings" w:hint="default"/>
+        <w:sz w:val="20"/>
+      </w:rPr>
+    </w:lvl>
+    <w:lvl w:ilvl="4" w:tentative="1">
+      <w:start w:val="1"/>
+      <w:numFmt w:val="bullet"/>
+      <w:lvlText w:val=""/>
+      <w:lvlJc w:val="left"/>
+      <w:pPr>
+        <w:tabs>
+          <w:tab w:val="num" w:pos="3600"/>
+        </w:tabs>
+        <w:ind w:left="3600" w:hanging="360"/>
+      </w:pPr>
+      <w:rPr>
+        <w:rFonts w:ascii="Wingdings" w:hAnsi="Wingdings" w:hint="default"/>
+        <w:sz w:val="20"/>
+      </w:rPr>
+    </w:lvl>
+    <w:lvl w:ilvl="5" w:tentative="1">
+      <w:start w:val="1"/>
+      <w:numFmt w:val="bullet"/>
+      <w:lvlText w:val=""/>
+      <w:lvlJc w:val="left"/>
+      <w:pPr>
+        <w:tabs>
+          <w:tab w:val="num" w:pos="4320"/>
+        </w:tabs>
+        <w:ind w:left="4320" w:hanging="360"/>
+      </w:pPr>
+      <w:rPr>
+        <w:rFonts w:ascii="Wingdings" w:hAnsi="Wingdings" w:hint="default"/>
+        <w:sz w:val="20"/>
+      </w:rPr>
+    </w:lvl>
+    <w:lvl w:ilvl="6" w:tentative="1">
+      <w:start w:val="1"/>
+      <w:numFmt w:val="bullet"/>
+      <w:lvlText w:val=""/>
+      <w:lvlJc w:val="left"/>
+      <w:pPr>
+        <w:tabs>
+          <w:tab w:val="num" w:pos="5040"/>
+        </w:tabs>
+        <w:ind w:left="5040" w:hanging="360"/>
+      </w:pPr>
+      <w:rPr>
+        <w:rFonts w:ascii="Wingdings" w:hAnsi="Wingdings" w:hint="default"/>
+        <w:sz w:val="20"/>
+      </w:rPr>
+    </w:lvl>
+    <w:lvl w:ilvl="7" w:tentative="1">
+      <w:start w:val="1"/>
+      <w:numFmt w:val="bullet"/>
+      <w:lvlText w:val=""/>
+      <w:lvlJc w:val="left"/>
+      <w:pPr>
+        <w:tabs>
+          <w:tab w:val="num" w:pos="5760"/>
+        </w:tabs>
+        <w:ind w:left="5760" w:hanging="360"/>
+      </w:pPr>
+      <w:rPr>
+        <w:rFonts w:ascii="Wingdings" w:hAnsi="Wingdings" w:hint="default"/>
+        <w:sz w:val="20"/>
+      </w:rPr>
+    </w:lvl>
+    <w:lvl w:ilvl="8" w:tentative="1">
+      <w:start w:val="1"/>
+      <w:numFmt w:val="bullet"/>
+      <w:lvlText w:val=""/>
+      <w:lvlJc w:val="left"/>
+      <w:pPr>
+        <w:tabs>
+          <w:tab w:val="num" w:pos="6480"/>
+        </w:tabs>
+        <w:ind w:left="6480" w:hanging="360"/>
+      </w:pPr>
+      <w:rPr>
+        <w:rFonts w:ascii="Wingdings" w:hAnsi="Wingdings" w:hint="default"/>
+        <w:sz w:val="20"/>
+      </w:rPr>
+    </w:lvl>
+  </w:abstractNum>
+  <w:abstractNum w:abstractNumId="13" w15:restartNumberingAfterBreak="0">
+    <w:nsid w:val="4EFF4799"/>
+    <w:multiLevelType w:val="multilevel"/>
+    <w:tmpl w:val="F68A9C46"/>
+    <w:lvl w:ilvl="0">
+      <w:start w:val="1"/>
+      <w:numFmt w:val="bullet"/>
+      <w:lvlText w:val=""/>
+      <w:lvlJc w:val="left"/>
+      <w:pPr>
+        <w:tabs>
+          <w:tab w:val="num" w:pos="720"/>
+        </w:tabs>
+        <w:ind w:left="720" w:hanging="360"/>
+      </w:pPr>
+      <w:rPr>
+        <w:rFonts w:ascii="Symbol" w:hAnsi="Symbol" w:hint="default"/>
+        <w:sz w:val="20"/>
+      </w:rPr>
+    </w:lvl>
+    <w:lvl w:ilvl="1" w:tentative="1">
+      <w:start w:val="1"/>
+      <w:numFmt w:val="bullet"/>
+      <w:lvlText w:val="o"/>
+      <w:lvlJc w:val="left"/>
+      <w:pPr>
+        <w:tabs>
+          <w:tab w:val="num" w:pos="1440"/>
+        </w:tabs>
+        <w:ind w:left="1440" w:hanging="360"/>
+      </w:pPr>
+      <w:rPr>
+        <w:rFonts w:ascii="Courier New" w:hAnsi="Courier New" w:hint="default"/>
+        <w:sz w:val="20"/>
+      </w:rPr>
+    </w:lvl>
+    <w:lvl w:ilvl="2" w:tentative="1">
+      <w:start w:val="1"/>
+      <w:numFmt w:val="bullet"/>
+      <w:lvlText w:val=""/>
+      <w:lvlJc w:val="left"/>
+      <w:pPr>
+        <w:tabs>
+          <w:tab w:val="num" w:pos="2160"/>
+        </w:tabs>
+        <w:ind w:left="2160" w:hanging="360"/>
+      </w:pPr>
+      <w:rPr>
+        <w:rFonts w:ascii="Wingdings" w:hAnsi="Wingdings" w:hint="default"/>
+        <w:sz w:val="20"/>
+      </w:rPr>
+    </w:lvl>
+    <w:lvl w:ilvl="3" w:tentative="1">
+      <w:start w:val="1"/>
+      <w:numFmt w:val="bullet"/>
+      <w:lvlText w:val=""/>
+      <w:lvlJc w:val="left"/>
+      <w:pPr>
+        <w:tabs>
+          <w:tab w:val="num" w:pos="2880"/>
+        </w:tabs>
+        <w:ind w:left="2880" w:hanging="360"/>
+      </w:pPr>
+      <w:rPr>
+        <w:rFonts w:ascii="Wingdings" w:hAnsi="Wingdings" w:hint="default"/>
+        <w:sz w:val="20"/>
+      </w:rPr>
+    </w:lvl>
+    <w:lvl w:ilvl="4" w:tentative="1">
+      <w:start w:val="1"/>
+      <w:numFmt w:val="bullet"/>
+      <w:lvlText w:val=""/>
+      <w:lvlJc w:val="left"/>
+      <w:pPr>
+        <w:tabs>
+          <w:tab w:val="num" w:pos="3600"/>
+        </w:tabs>
+        <w:ind w:left="3600" w:hanging="360"/>
+      </w:pPr>
+      <w:rPr>
+        <w:rFonts w:ascii="Wingdings" w:hAnsi="Wingdings" w:hint="default"/>
+        <w:sz w:val="20"/>
+      </w:rPr>
+    </w:lvl>
+    <w:lvl w:ilvl="5" w:tentative="1">
+      <w:start w:val="1"/>
+      <w:numFmt w:val="bullet"/>
+      <w:lvlText w:val=""/>
+      <w:lvlJc w:val="left"/>
+      <w:pPr>
+        <w:tabs>
+          <w:tab w:val="num" w:pos="4320"/>
+        </w:tabs>
+        <w:ind w:left="4320" w:hanging="360"/>
+      </w:pPr>
+      <w:rPr>
+        <w:rFonts w:ascii="Wingdings" w:hAnsi="Wingdings" w:hint="default"/>
+        <w:sz w:val="20"/>
+      </w:rPr>
+    </w:lvl>
+    <w:lvl w:ilvl="6" w:tentative="1">
+      <w:start w:val="1"/>
+      <w:numFmt w:val="bullet"/>
+      <w:lvlText w:val=""/>
+      <w:lvlJc w:val="left"/>
+      <w:pPr>
+        <w:tabs>
+          <w:tab w:val="num" w:pos="5040"/>
+        </w:tabs>
+        <w:ind w:left="5040" w:hanging="360"/>
+      </w:pPr>
+      <w:rPr>
+        <w:rFonts w:ascii="Wingdings" w:hAnsi="Wingdings" w:hint="default"/>
+        <w:sz w:val="20"/>
+      </w:rPr>
+    </w:lvl>
+    <w:lvl w:ilvl="7" w:tentative="1">
+      <w:start w:val="1"/>
+      <w:numFmt w:val="bullet"/>
+      <w:lvlText w:val=""/>
+      <w:lvlJc w:val="left"/>
+      <w:pPr>
+        <w:tabs>
+          <w:tab w:val="num" w:pos="5760"/>
+        </w:tabs>
+        <w:ind w:left="5760" w:hanging="360"/>
+      </w:pPr>
+      <w:rPr>
+        <w:rFonts w:ascii="Wingdings" w:hAnsi="Wingdings" w:hint="default"/>
+        <w:sz w:val="20"/>
+      </w:rPr>
+    </w:lvl>
+    <w:lvl w:ilvl="8" w:tentative="1">
+      <w:start w:val="1"/>
+      <w:numFmt w:val="bullet"/>
+      <w:lvlText w:val=""/>
+      <w:lvlJc w:val="left"/>
+      <w:pPr>
+        <w:tabs>
+          <w:tab w:val="num" w:pos="6480"/>
+        </w:tabs>
+        <w:ind w:left="6480" w:hanging="360"/>
+      </w:pPr>
+      <w:rPr>
+        <w:rFonts w:ascii="Wingdings" w:hAnsi="Wingdings" w:hint="default"/>
+        <w:sz w:val="20"/>
+      </w:rPr>
+    </w:lvl>
+  </w:abstractNum>
+  <w:abstractNum w:abstractNumId="14" w15:restartNumberingAfterBreak="0">
+    <w:nsid w:val="577A34D1"/>
+    <w:multiLevelType w:val="multilevel"/>
+    <w:tmpl w:val="C436F832"/>
     <w:lvl w:ilvl="0">
       <w:start w:val="1"/>
       <w:numFmt w:val="decimal"/>
@@ -7840,10 +8527,10 @@
       </w:pPr>
     </w:lvl>
   </w:abstractNum>
-  <w:abstractNum w:abstractNumId="10" w15:restartNumberingAfterBreak="0">
-    <w:nsid w:val="4C521AEB"/>
+  <w:abstractNum w:abstractNumId="15" w15:restartNumberingAfterBreak="0">
+    <w:nsid w:val="582E1483"/>
     <w:multiLevelType w:val="multilevel"/>
-    <w:tmpl w:val="AC5CB0C6"/>
+    <w:tmpl w:val="3168B22C"/>
     <w:lvl w:ilvl="0">
       <w:start w:val="1"/>
       <w:numFmt w:val="bullet"/>
@@ -7989,10 +8676,755 @@
       </w:rPr>
     </w:lvl>
   </w:abstractNum>
-  <w:abstractNum w:abstractNumId="11" w15:restartNumberingAfterBreak="0">
-    <w:nsid w:val="5223438A"/>
+  <w:abstractNum w:abstractNumId="16" w15:restartNumberingAfterBreak="0">
+    <w:nsid w:val="644C0126"/>
     <w:multiLevelType w:val="multilevel"/>
-    <w:tmpl w:val="97D68E30"/>
+    <w:tmpl w:val="68F87042"/>
+    <w:lvl w:ilvl="0">
+      <w:start w:val="1"/>
+      <w:numFmt w:val="bullet"/>
+      <w:lvlText w:val=""/>
+      <w:lvlJc w:val="left"/>
+      <w:pPr>
+        <w:tabs>
+          <w:tab w:val="num" w:pos="720"/>
+        </w:tabs>
+        <w:ind w:left="720" w:hanging="360"/>
+      </w:pPr>
+      <w:rPr>
+        <w:rFonts w:ascii="Symbol" w:hAnsi="Symbol" w:hint="default"/>
+        <w:sz w:val="20"/>
+      </w:rPr>
+    </w:lvl>
+    <w:lvl w:ilvl="1" w:tentative="1">
+      <w:start w:val="1"/>
+      <w:numFmt w:val="bullet"/>
+      <w:lvlText w:val="o"/>
+      <w:lvlJc w:val="left"/>
+      <w:pPr>
+        <w:tabs>
+          <w:tab w:val="num" w:pos="1440"/>
+        </w:tabs>
+        <w:ind w:left="1440" w:hanging="360"/>
+      </w:pPr>
+      <w:rPr>
+        <w:rFonts w:ascii="Courier New" w:hAnsi="Courier New" w:hint="default"/>
+        <w:sz w:val="20"/>
+      </w:rPr>
+    </w:lvl>
+    <w:lvl w:ilvl="2" w:tentative="1">
+      <w:start w:val="1"/>
+      <w:numFmt w:val="bullet"/>
+      <w:lvlText w:val=""/>
+      <w:lvlJc w:val="left"/>
+      <w:pPr>
+        <w:tabs>
+          <w:tab w:val="num" w:pos="2160"/>
+        </w:tabs>
+        <w:ind w:left="2160" w:hanging="360"/>
+      </w:pPr>
+      <w:rPr>
+        <w:rFonts w:ascii="Wingdings" w:hAnsi="Wingdings" w:hint="default"/>
+        <w:sz w:val="20"/>
+      </w:rPr>
+    </w:lvl>
+    <w:lvl w:ilvl="3" w:tentative="1">
+      <w:start w:val="1"/>
+      <w:numFmt w:val="bullet"/>
+      <w:lvlText w:val=""/>
+      <w:lvlJc w:val="left"/>
+      <w:pPr>
+        <w:tabs>
+          <w:tab w:val="num" w:pos="2880"/>
+        </w:tabs>
+        <w:ind w:left="2880" w:hanging="360"/>
+      </w:pPr>
+      <w:rPr>
+        <w:rFonts w:ascii="Wingdings" w:hAnsi="Wingdings" w:hint="default"/>
+        <w:sz w:val="20"/>
+      </w:rPr>
+    </w:lvl>
+    <w:lvl w:ilvl="4" w:tentative="1">
+      <w:start w:val="1"/>
+      <w:numFmt w:val="bullet"/>
+      <w:lvlText w:val=""/>
+      <w:lvlJc w:val="left"/>
+      <w:pPr>
+        <w:tabs>
+          <w:tab w:val="num" w:pos="3600"/>
+        </w:tabs>
+        <w:ind w:left="3600" w:hanging="360"/>
+      </w:pPr>
+      <w:rPr>
+        <w:rFonts w:ascii="Wingdings" w:hAnsi="Wingdings" w:hint="default"/>
+        <w:sz w:val="20"/>
+      </w:rPr>
+    </w:lvl>
+    <w:lvl w:ilvl="5" w:tentative="1">
+      <w:start w:val="1"/>
+      <w:numFmt w:val="bullet"/>
+      <w:lvlText w:val=""/>
+      <w:lvlJc w:val="left"/>
+      <w:pPr>
+        <w:tabs>
+          <w:tab w:val="num" w:pos="4320"/>
+        </w:tabs>
+        <w:ind w:left="4320" w:hanging="360"/>
+      </w:pPr>
+      <w:rPr>
+        <w:rFonts w:ascii="Wingdings" w:hAnsi="Wingdings" w:hint="default"/>
+        <w:sz w:val="20"/>
+      </w:rPr>
+    </w:lvl>
+    <w:lvl w:ilvl="6" w:tentative="1">
+      <w:start w:val="1"/>
+      <w:numFmt w:val="bullet"/>
+      <w:lvlText w:val=""/>
+      <w:lvlJc w:val="left"/>
+      <w:pPr>
+        <w:tabs>
+          <w:tab w:val="num" w:pos="5040"/>
+        </w:tabs>
+        <w:ind w:left="5040" w:hanging="360"/>
+      </w:pPr>
+      <w:rPr>
+        <w:rFonts w:ascii="Wingdings" w:hAnsi="Wingdings" w:hint="default"/>
+        <w:sz w:val="20"/>
+      </w:rPr>
+    </w:lvl>
+    <w:lvl w:ilvl="7" w:tentative="1">
+      <w:start w:val="1"/>
+      <w:numFmt w:val="bullet"/>
+      <w:lvlText w:val=""/>
+      <w:lvlJc w:val="left"/>
+      <w:pPr>
+        <w:tabs>
+          <w:tab w:val="num" w:pos="5760"/>
+        </w:tabs>
+        <w:ind w:left="5760" w:hanging="360"/>
+      </w:pPr>
+      <w:rPr>
+        <w:rFonts w:ascii="Wingdings" w:hAnsi="Wingdings" w:hint="default"/>
+        <w:sz w:val="20"/>
+      </w:rPr>
+    </w:lvl>
+    <w:lvl w:ilvl="8" w:tentative="1">
+      <w:start w:val="1"/>
+      <w:numFmt w:val="bullet"/>
+      <w:lvlText w:val=""/>
+      <w:lvlJc w:val="left"/>
+      <w:pPr>
+        <w:tabs>
+          <w:tab w:val="num" w:pos="6480"/>
+        </w:tabs>
+        <w:ind w:left="6480" w:hanging="360"/>
+      </w:pPr>
+      <w:rPr>
+        <w:rFonts w:ascii="Wingdings" w:hAnsi="Wingdings" w:hint="default"/>
+        <w:sz w:val="20"/>
+      </w:rPr>
+    </w:lvl>
+  </w:abstractNum>
+  <w:abstractNum w:abstractNumId="17" w15:restartNumberingAfterBreak="0">
+    <w:nsid w:val="666A4A82"/>
+    <w:multiLevelType w:val="multilevel"/>
+    <w:tmpl w:val="5900AF72"/>
+    <w:lvl w:ilvl="0">
+      <w:start w:val="1"/>
+      <w:numFmt w:val="bullet"/>
+      <w:lvlText w:val=""/>
+      <w:lvlJc w:val="left"/>
+      <w:pPr>
+        <w:tabs>
+          <w:tab w:val="num" w:pos="720"/>
+        </w:tabs>
+        <w:ind w:left="720" w:hanging="360"/>
+      </w:pPr>
+      <w:rPr>
+        <w:rFonts w:ascii="Symbol" w:hAnsi="Symbol" w:hint="default"/>
+        <w:sz w:val="20"/>
+      </w:rPr>
+    </w:lvl>
+    <w:lvl w:ilvl="1" w:tentative="1">
+      <w:start w:val="1"/>
+      <w:numFmt w:val="bullet"/>
+      <w:lvlText w:val="o"/>
+      <w:lvlJc w:val="left"/>
+      <w:pPr>
+        <w:tabs>
+          <w:tab w:val="num" w:pos="1440"/>
+        </w:tabs>
+        <w:ind w:left="1440" w:hanging="360"/>
+      </w:pPr>
+      <w:rPr>
+        <w:rFonts w:ascii="Courier New" w:hAnsi="Courier New" w:hint="default"/>
+        <w:sz w:val="20"/>
+      </w:rPr>
+    </w:lvl>
+    <w:lvl w:ilvl="2" w:tentative="1">
+      <w:start w:val="1"/>
+      <w:numFmt w:val="bullet"/>
+      <w:lvlText w:val=""/>
+      <w:lvlJc w:val="left"/>
+      <w:pPr>
+        <w:tabs>
+          <w:tab w:val="num" w:pos="2160"/>
+        </w:tabs>
+        <w:ind w:left="2160" w:hanging="360"/>
+      </w:pPr>
+      <w:rPr>
+        <w:rFonts w:ascii="Wingdings" w:hAnsi="Wingdings" w:hint="default"/>
+        <w:sz w:val="20"/>
+      </w:rPr>
+    </w:lvl>
+    <w:lvl w:ilvl="3" w:tentative="1">
+      <w:start w:val="1"/>
+      <w:numFmt w:val="bullet"/>
+      <w:lvlText w:val=""/>
+      <w:lvlJc w:val="left"/>
+      <w:pPr>
+        <w:tabs>
+          <w:tab w:val="num" w:pos="2880"/>
+        </w:tabs>
+        <w:ind w:left="2880" w:hanging="360"/>
+      </w:pPr>
+      <w:rPr>
+        <w:rFonts w:ascii="Wingdings" w:hAnsi="Wingdings" w:hint="default"/>
+        <w:sz w:val="20"/>
+      </w:rPr>
+    </w:lvl>
+    <w:lvl w:ilvl="4" w:tentative="1">
+      <w:start w:val="1"/>
+      <w:numFmt w:val="bullet"/>
+      <w:lvlText w:val=""/>
+      <w:lvlJc w:val="left"/>
+      <w:pPr>
+        <w:tabs>
+          <w:tab w:val="num" w:pos="3600"/>
+        </w:tabs>
+        <w:ind w:left="3600" w:hanging="360"/>
+      </w:pPr>
+      <w:rPr>
+        <w:rFonts w:ascii="Wingdings" w:hAnsi="Wingdings" w:hint="default"/>
+        <w:sz w:val="20"/>
+      </w:rPr>
+    </w:lvl>
+    <w:lvl w:ilvl="5" w:tentative="1">
+      <w:start w:val="1"/>
+      <w:numFmt w:val="bullet"/>
+      <w:lvlText w:val=""/>
+      <w:lvlJc w:val="left"/>
+      <w:pPr>
+        <w:tabs>
+          <w:tab w:val="num" w:pos="4320"/>
+        </w:tabs>
+        <w:ind w:left="4320" w:hanging="360"/>
+      </w:pPr>
+      <w:rPr>
+        <w:rFonts w:ascii="Wingdings" w:hAnsi="Wingdings" w:hint="default"/>
+        <w:sz w:val="20"/>
+      </w:rPr>
+    </w:lvl>
+    <w:lvl w:ilvl="6" w:tentative="1">
+      <w:start w:val="1"/>
+      <w:numFmt w:val="bullet"/>
+      <w:lvlText w:val=""/>
+      <w:lvlJc w:val="left"/>
+      <w:pPr>
+        <w:tabs>
+          <w:tab w:val="num" w:pos="5040"/>
+        </w:tabs>
+        <w:ind w:left="5040" w:hanging="360"/>
+      </w:pPr>
+      <w:rPr>
+        <w:rFonts w:ascii="Wingdings" w:hAnsi="Wingdings" w:hint="default"/>
+        <w:sz w:val="20"/>
+      </w:rPr>
+    </w:lvl>
+    <w:lvl w:ilvl="7" w:tentative="1">
+      <w:start w:val="1"/>
+      <w:numFmt w:val="bullet"/>
+      <w:lvlText w:val=""/>
+      <w:lvlJc w:val="left"/>
+      <w:pPr>
+        <w:tabs>
+          <w:tab w:val="num" w:pos="5760"/>
+        </w:tabs>
+        <w:ind w:left="5760" w:hanging="360"/>
+      </w:pPr>
+      <w:rPr>
+        <w:rFonts w:ascii="Wingdings" w:hAnsi="Wingdings" w:hint="default"/>
+        <w:sz w:val="20"/>
+      </w:rPr>
+    </w:lvl>
+    <w:lvl w:ilvl="8" w:tentative="1">
+      <w:start w:val="1"/>
+      <w:numFmt w:val="bullet"/>
+      <w:lvlText w:val=""/>
+      <w:lvlJc w:val="left"/>
+      <w:pPr>
+        <w:tabs>
+          <w:tab w:val="num" w:pos="6480"/>
+        </w:tabs>
+        <w:ind w:left="6480" w:hanging="360"/>
+      </w:pPr>
+      <w:rPr>
+        <w:rFonts w:ascii="Wingdings" w:hAnsi="Wingdings" w:hint="default"/>
+        <w:sz w:val="20"/>
+      </w:rPr>
+    </w:lvl>
+  </w:abstractNum>
+  <w:abstractNum w:abstractNumId="18" w15:restartNumberingAfterBreak="0">
+    <w:nsid w:val="6BA56F05"/>
+    <w:multiLevelType w:val="multilevel"/>
+    <w:tmpl w:val="B200427E"/>
+    <w:lvl w:ilvl="0">
+      <w:start w:val="1"/>
+      <w:numFmt w:val="bullet"/>
+      <w:lvlText w:val=""/>
+      <w:lvlJc w:val="left"/>
+      <w:pPr>
+        <w:tabs>
+          <w:tab w:val="num" w:pos="720"/>
+        </w:tabs>
+        <w:ind w:left="720" w:hanging="360"/>
+      </w:pPr>
+      <w:rPr>
+        <w:rFonts w:ascii="Symbol" w:hAnsi="Symbol" w:hint="default"/>
+        <w:sz w:val="20"/>
+      </w:rPr>
+    </w:lvl>
+    <w:lvl w:ilvl="1" w:tentative="1">
+      <w:start w:val="1"/>
+      <w:numFmt w:val="bullet"/>
+      <w:lvlText w:val="o"/>
+      <w:lvlJc w:val="left"/>
+      <w:pPr>
+        <w:tabs>
+          <w:tab w:val="num" w:pos="1440"/>
+        </w:tabs>
+        <w:ind w:left="1440" w:hanging="360"/>
+      </w:pPr>
+      <w:rPr>
+        <w:rFonts w:ascii="Courier New" w:hAnsi="Courier New" w:hint="default"/>
+        <w:sz w:val="20"/>
+      </w:rPr>
+    </w:lvl>
+    <w:lvl w:ilvl="2" w:tentative="1">
+      <w:start w:val="1"/>
+      <w:numFmt w:val="bullet"/>
+      <w:lvlText w:val=""/>
+      <w:lvlJc w:val="left"/>
+      <w:pPr>
+        <w:tabs>
+          <w:tab w:val="num" w:pos="2160"/>
+        </w:tabs>
+        <w:ind w:left="2160" w:hanging="360"/>
+      </w:pPr>
+      <w:rPr>
+        <w:rFonts w:ascii="Wingdings" w:hAnsi="Wingdings" w:hint="default"/>
+        <w:sz w:val="20"/>
+      </w:rPr>
+    </w:lvl>
+    <w:lvl w:ilvl="3" w:tentative="1">
+      <w:start w:val="1"/>
+      <w:numFmt w:val="bullet"/>
+      <w:lvlText w:val=""/>
+      <w:lvlJc w:val="left"/>
+      <w:pPr>
+        <w:tabs>
+          <w:tab w:val="num" w:pos="2880"/>
+        </w:tabs>
+        <w:ind w:left="2880" w:hanging="360"/>
+      </w:pPr>
+      <w:rPr>
+        <w:rFonts w:ascii="Wingdings" w:hAnsi="Wingdings" w:hint="default"/>
+        <w:sz w:val="20"/>
+      </w:rPr>
+    </w:lvl>
+    <w:lvl w:ilvl="4" w:tentative="1">
+      <w:start w:val="1"/>
+      <w:numFmt w:val="bullet"/>
+      <w:lvlText w:val=""/>
+      <w:lvlJc w:val="left"/>
+      <w:pPr>
+        <w:tabs>
+          <w:tab w:val="num" w:pos="3600"/>
+        </w:tabs>
+        <w:ind w:left="3600" w:hanging="360"/>
+      </w:pPr>
+      <w:rPr>
+        <w:rFonts w:ascii="Wingdings" w:hAnsi="Wingdings" w:hint="default"/>
+        <w:sz w:val="20"/>
+      </w:rPr>
+    </w:lvl>
+    <w:lvl w:ilvl="5" w:tentative="1">
+      <w:start w:val="1"/>
+      <w:numFmt w:val="bullet"/>
+      <w:lvlText w:val=""/>
+      <w:lvlJc w:val="left"/>
+      <w:pPr>
+        <w:tabs>
+          <w:tab w:val="num" w:pos="4320"/>
+        </w:tabs>
+        <w:ind w:left="4320" w:hanging="360"/>
+      </w:pPr>
+      <w:rPr>
+        <w:rFonts w:ascii="Wingdings" w:hAnsi="Wingdings" w:hint="default"/>
+        <w:sz w:val="20"/>
+      </w:rPr>
+    </w:lvl>
+    <w:lvl w:ilvl="6" w:tentative="1">
+      <w:start w:val="1"/>
+      <w:numFmt w:val="bullet"/>
+      <w:lvlText w:val=""/>
+      <w:lvlJc w:val="left"/>
+      <w:pPr>
+        <w:tabs>
+          <w:tab w:val="num" w:pos="5040"/>
+        </w:tabs>
+        <w:ind w:left="5040" w:hanging="360"/>
+      </w:pPr>
+      <w:rPr>
+        <w:rFonts w:ascii="Wingdings" w:hAnsi="Wingdings" w:hint="default"/>
+        <w:sz w:val="20"/>
+      </w:rPr>
+    </w:lvl>
+    <w:lvl w:ilvl="7" w:tentative="1">
+      <w:start w:val="1"/>
+      <w:numFmt w:val="bullet"/>
+      <w:lvlText w:val=""/>
+      <w:lvlJc w:val="left"/>
+      <w:pPr>
+        <w:tabs>
+          <w:tab w:val="num" w:pos="5760"/>
+        </w:tabs>
+        <w:ind w:left="5760" w:hanging="360"/>
+      </w:pPr>
+      <w:rPr>
+        <w:rFonts w:ascii="Wingdings" w:hAnsi="Wingdings" w:hint="default"/>
+        <w:sz w:val="20"/>
+      </w:rPr>
+    </w:lvl>
+    <w:lvl w:ilvl="8" w:tentative="1">
+      <w:start w:val="1"/>
+      <w:numFmt w:val="bullet"/>
+      <w:lvlText w:val=""/>
+      <w:lvlJc w:val="left"/>
+      <w:pPr>
+        <w:tabs>
+          <w:tab w:val="num" w:pos="6480"/>
+        </w:tabs>
+        <w:ind w:left="6480" w:hanging="360"/>
+      </w:pPr>
+      <w:rPr>
+        <w:rFonts w:ascii="Wingdings" w:hAnsi="Wingdings" w:hint="default"/>
+        <w:sz w:val="20"/>
+      </w:rPr>
+    </w:lvl>
+  </w:abstractNum>
+  <w:abstractNum w:abstractNumId="19" w15:restartNumberingAfterBreak="0">
+    <w:nsid w:val="6D540C72"/>
+    <w:multiLevelType w:val="multilevel"/>
+    <w:tmpl w:val="2220A812"/>
+    <w:lvl w:ilvl="0">
+      <w:start w:val="1"/>
+      <w:numFmt w:val="bullet"/>
+      <w:lvlText w:val=""/>
+      <w:lvlJc w:val="left"/>
+      <w:pPr>
+        <w:tabs>
+          <w:tab w:val="num" w:pos="720"/>
+        </w:tabs>
+        <w:ind w:left="720" w:hanging="360"/>
+      </w:pPr>
+      <w:rPr>
+        <w:rFonts w:ascii="Symbol" w:hAnsi="Symbol" w:hint="default"/>
+        <w:sz w:val="20"/>
+      </w:rPr>
+    </w:lvl>
+    <w:lvl w:ilvl="1" w:tentative="1">
+      <w:start w:val="1"/>
+      <w:numFmt w:val="bullet"/>
+      <w:lvlText w:val="o"/>
+      <w:lvlJc w:val="left"/>
+      <w:pPr>
+        <w:tabs>
+          <w:tab w:val="num" w:pos="1440"/>
+        </w:tabs>
+        <w:ind w:left="1440" w:hanging="360"/>
+      </w:pPr>
+      <w:rPr>
+        <w:rFonts w:ascii="Courier New" w:hAnsi="Courier New" w:hint="default"/>
+        <w:sz w:val="20"/>
+      </w:rPr>
+    </w:lvl>
+    <w:lvl w:ilvl="2" w:tentative="1">
+      <w:start w:val="1"/>
+      <w:numFmt w:val="bullet"/>
+      <w:lvlText w:val=""/>
+      <w:lvlJc w:val="left"/>
+      <w:pPr>
+        <w:tabs>
+          <w:tab w:val="num" w:pos="2160"/>
+        </w:tabs>
+        <w:ind w:left="2160" w:hanging="360"/>
+      </w:pPr>
+      <w:rPr>
+        <w:rFonts w:ascii="Wingdings" w:hAnsi="Wingdings" w:hint="default"/>
+        <w:sz w:val="20"/>
+      </w:rPr>
+    </w:lvl>
+    <w:lvl w:ilvl="3" w:tentative="1">
+      <w:start w:val="1"/>
+      <w:numFmt w:val="bullet"/>
+      <w:lvlText w:val=""/>
+      <w:lvlJc w:val="left"/>
+      <w:pPr>
+        <w:tabs>
+          <w:tab w:val="num" w:pos="2880"/>
+        </w:tabs>
+        <w:ind w:left="2880" w:hanging="360"/>
+      </w:pPr>
+      <w:rPr>
+        <w:rFonts w:ascii="Wingdings" w:hAnsi="Wingdings" w:hint="default"/>
+        <w:sz w:val="20"/>
+      </w:rPr>
+    </w:lvl>
+    <w:lvl w:ilvl="4" w:tentative="1">
+      <w:start w:val="1"/>
+      <w:numFmt w:val="bullet"/>
+      <w:lvlText w:val=""/>
+      <w:lvlJc w:val="left"/>
+      <w:pPr>
+        <w:tabs>
+          <w:tab w:val="num" w:pos="3600"/>
+        </w:tabs>
+        <w:ind w:left="3600" w:hanging="360"/>
+      </w:pPr>
+      <w:rPr>
+        <w:rFonts w:ascii="Wingdings" w:hAnsi="Wingdings" w:hint="default"/>
+        <w:sz w:val="20"/>
+      </w:rPr>
+    </w:lvl>
+    <w:lvl w:ilvl="5" w:tentative="1">
+      <w:start w:val="1"/>
+      <w:numFmt w:val="bullet"/>
+      <w:lvlText w:val=""/>
+      <w:lvlJc w:val="left"/>
+      <w:pPr>
+        <w:tabs>
+          <w:tab w:val="num" w:pos="4320"/>
+        </w:tabs>
+        <w:ind w:left="4320" w:hanging="360"/>
+      </w:pPr>
+      <w:rPr>
+        <w:rFonts w:ascii="Wingdings" w:hAnsi="Wingdings" w:hint="default"/>
+        <w:sz w:val="20"/>
+      </w:rPr>
+    </w:lvl>
+    <w:lvl w:ilvl="6" w:tentative="1">
+      <w:start w:val="1"/>
+      <w:numFmt w:val="bullet"/>
+      <w:lvlText w:val=""/>
+      <w:lvlJc w:val="left"/>
+      <w:pPr>
+        <w:tabs>
+          <w:tab w:val="num" w:pos="5040"/>
+        </w:tabs>
+        <w:ind w:left="5040" w:hanging="360"/>
+      </w:pPr>
+      <w:rPr>
+        <w:rFonts w:ascii="Wingdings" w:hAnsi="Wingdings" w:hint="default"/>
+        <w:sz w:val="20"/>
+      </w:rPr>
+    </w:lvl>
+    <w:lvl w:ilvl="7" w:tentative="1">
+      <w:start w:val="1"/>
+      <w:numFmt w:val="bullet"/>
+      <w:lvlText w:val=""/>
+      <w:lvlJc w:val="left"/>
+      <w:pPr>
+        <w:tabs>
+          <w:tab w:val="num" w:pos="5760"/>
+        </w:tabs>
+        <w:ind w:left="5760" w:hanging="360"/>
+      </w:pPr>
+      <w:rPr>
+        <w:rFonts w:ascii="Wingdings" w:hAnsi="Wingdings" w:hint="default"/>
+        <w:sz w:val="20"/>
+      </w:rPr>
+    </w:lvl>
+    <w:lvl w:ilvl="8" w:tentative="1">
+      <w:start w:val="1"/>
+      <w:numFmt w:val="bullet"/>
+      <w:lvlText w:val=""/>
+      <w:lvlJc w:val="left"/>
+      <w:pPr>
+        <w:tabs>
+          <w:tab w:val="num" w:pos="6480"/>
+        </w:tabs>
+        <w:ind w:left="6480" w:hanging="360"/>
+      </w:pPr>
+      <w:rPr>
+        <w:rFonts w:ascii="Wingdings" w:hAnsi="Wingdings" w:hint="default"/>
+        <w:sz w:val="20"/>
+      </w:rPr>
+    </w:lvl>
+  </w:abstractNum>
+  <w:abstractNum w:abstractNumId="20" w15:restartNumberingAfterBreak="0">
+    <w:nsid w:val="728073BC"/>
+    <w:multiLevelType w:val="multilevel"/>
+    <w:tmpl w:val="99AABF74"/>
+    <w:lvl w:ilvl="0">
+      <w:start w:val="1"/>
+      <w:numFmt w:val="bullet"/>
+      <w:lvlText w:val=""/>
+      <w:lvlJc w:val="left"/>
+      <w:pPr>
+        <w:tabs>
+          <w:tab w:val="num" w:pos="720"/>
+        </w:tabs>
+        <w:ind w:left="720" w:hanging="360"/>
+      </w:pPr>
+      <w:rPr>
+        <w:rFonts w:ascii="Symbol" w:hAnsi="Symbol" w:hint="default"/>
+        <w:sz w:val="20"/>
+      </w:rPr>
+    </w:lvl>
+    <w:lvl w:ilvl="1" w:tentative="1">
+      <w:start w:val="1"/>
+      <w:numFmt w:val="bullet"/>
+      <w:lvlText w:val="o"/>
+      <w:lvlJc w:val="left"/>
+      <w:pPr>
+        <w:tabs>
+          <w:tab w:val="num" w:pos="1440"/>
+        </w:tabs>
+        <w:ind w:left="1440" w:hanging="360"/>
+      </w:pPr>
+      <w:rPr>
+        <w:rFonts w:ascii="Courier New" w:hAnsi="Courier New" w:hint="default"/>
+        <w:sz w:val="20"/>
+      </w:rPr>
+    </w:lvl>
+    <w:lvl w:ilvl="2" w:tentative="1">
+      <w:start w:val="1"/>
+      <w:numFmt w:val="bullet"/>
+      <w:lvlText w:val=""/>
+      <w:lvlJc w:val="left"/>
+      <w:pPr>
+        <w:tabs>
+          <w:tab w:val="num" w:pos="2160"/>
+        </w:tabs>
+        <w:ind w:left="2160" w:hanging="360"/>
+      </w:pPr>
+      <w:rPr>
+        <w:rFonts w:ascii="Wingdings" w:hAnsi="Wingdings" w:hint="default"/>
+        <w:sz w:val="20"/>
+      </w:rPr>
+    </w:lvl>
+    <w:lvl w:ilvl="3" w:tentative="1">
+      <w:start w:val="1"/>
+      <w:numFmt w:val="bullet"/>
+      <w:lvlText w:val=""/>
+      <w:lvlJc w:val="left"/>
+      <w:pPr>
+        <w:tabs>
+          <w:tab w:val="num" w:pos="2880"/>
+        </w:tabs>
+        <w:ind w:left="2880" w:hanging="360"/>
+      </w:pPr>
+      <w:rPr>
+        <w:rFonts w:ascii="Wingdings" w:hAnsi="Wingdings" w:hint="default"/>
+        <w:sz w:val="20"/>
+      </w:rPr>
+    </w:lvl>
+    <w:lvl w:ilvl="4" w:tentative="1">
+      <w:start w:val="1"/>
+      <w:numFmt w:val="bullet"/>
+      <w:lvlText w:val=""/>
+      <w:lvlJc w:val="left"/>
+      <w:pPr>
+        <w:tabs>
+          <w:tab w:val="num" w:pos="3600"/>
+        </w:tabs>
+        <w:ind w:left="3600" w:hanging="360"/>
+      </w:pPr>
+      <w:rPr>
+        <w:rFonts w:ascii="Wingdings" w:hAnsi="Wingdings" w:hint="default"/>
+        <w:sz w:val="20"/>
+      </w:rPr>
+    </w:lvl>
+    <w:lvl w:ilvl="5" w:tentative="1">
+      <w:start w:val="1"/>
+      <w:numFmt w:val="bullet"/>
+      <w:lvlText w:val=""/>
+      <w:lvlJc w:val="left"/>
+      <w:pPr>
+        <w:tabs>
+          <w:tab w:val="num" w:pos="4320"/>
+        </w:tabs>
+        <w:ind w:left="4320" w:hanging="360"/>
+      </w:pPr>
+      <w:rPr>
+        <w:rFonts w:ascii="Wingdings" w:hAnsi="Wingdings" w:hint="default"/>
+        <w:sz w:val="20"/>
+      </w:rPr>
+    </w:lvl>
+    <w:lvl w:ilvl="6" w:tentative="1">
+      <w:start w:val="1"/>
+      <w:numFmt w:val="bullet"/>
+      <w:lvlText w:val=""/>
+      <w:lvlJc w:val="left"/>
+      <w:pPr>
+        <w:tabs>
+          <w:tab w:val="num" w:pos="5040"/>
+        </w:tabs>
+        <w:ind w:left="5040" w:hanging="360"/>
+      </w:pPr>
+      <w:rPr>
+        <w:rFonts w:ascii="Wingdings" w:hAnsi="Wingdings" w:hint="default"/>
+        <w:sz w:val="20"/>
+      </w:rPr>
+    </w:lvl>
+    <w:lvl w:ilvl="7" w:tentative="1">
+      <w:start w:val="1"/>
+      <w:numFmt w:val="bullet"/>
+      <w:lvlText w:val=""/>
+      <w:lvlJc w:val="left"/>
+      <w:pPr>
+        <w:tabs>
+          <w:tab w:val="num" w:pos="5760"/>
+        </w:tabs>
+        <w:ind w:left="5760" w:hanging="360"/>
+      </w:pPr>
+      <w:rPr>
+        <w:rFonts w:ascii="Wingdings" w:hAnsi="Wingdings" w:hint="default"/>
+        <w:sz w:val="20"/>
+      </w:rPr>
+    </w:lvl>
+    <w:lvl w:ilvl="8" w:tentative="1">
+      <w:start w:val="1"/>
+      <w:numFmt w:val="bullet"/>
+      <w:lvlText w:val=""/>
+      <w:lvlJc w:val="left"/>
+      <w:pPr>
+        <w:tabs>
+          <w:tab w:val="num" w:pos="6480"/>
+        </w:tabs>
+        <w:ind w:left="6480" w:hanging="360"/>
+      </w:pPr>
+      <w:rPr>
+        <w:rFonts w:ascii="Wingdings" w:hAnsi="Wingdings" w:hint="default"/>
+        <w:sz w:val="20"/>
+      </w:rPr>
+    </w:lvl>
+  </w:abstractNum>
+  <w:abstractNum w:abstractNumId="21" w15:restartNumberingAfterBreak="0">
+    <w:nsid w:val="73E455B7"/>
+    <w:multiLevelType w:val="multilevel"/>
+    <w:tmpl w:val="2834C214"/>
     <w:lvl w:ilvl="0">
       <w:start w:val="1"/>
       <w:numFmt w:val="decimal"/>
@@ -8106,10 +9538,10 @@
       </w:pPr>
     </w:lvl>
   </w:abstractNum>
-  <w:abstractNum w:abstractNumId="12" w15:restartNumberingAfterBreak="0">
-    <w:nsid w:val="548F3FA6"/>
+  <w:abstractNum w:abstractNumId="22" w15:restartNumberingAfterBreak="0">
+    <w:nsid w:val="7DFC6F05"/>
     <w:multiLevelType w:val="multilevel"/>
-    <w:tmpl w:val="FB14B72E"/>
+    <w:tmpl w:val="AF1C3DD4"/>
     <w:lvl w:ilvl="0">
       <w:start w:val="1"/>
       <w:numFmt w:val="decimal"/>
@@ -8223,10 +9655,10 @@
       </w:pPr>
     </w:lvl>
   </w:abstractNum>
-  <w:abstractNum w:abstractNumId="13" w15:restartNumberingAfterBreak="0">
-    <w:nsid w:val="57040D45"/>
+  <w:abstractNum w:abstractNumId="23" w15:restartNumberingAfterBreak="0">
+    <w:nsid w:val="7E7B1945"/>
     <w:multiLevelType w:val="multilevel"/>
-    <w:tmpl w:val="7548E8EE"/>
+    <w:tmpl w:val="5FDC0A68"/>
     <w:lvl w:ilvl="0">
       <w:start w:val="1"/>
       <w:numFmt w:val="bullet"/>
@@ -8372,1503 +9804,77 @@
       </w:rPr>
     </w:lvl>
   </w:abstractNum>
-  <w:abstractNum w:abstractNumId="14" w15:restartNumberingAfterBreak="0">
-    <w:nsid w:val="5AE012BE"/>
-    <w:multiLevelType w:val="multilevel"/>
-    <w:tmpl w:val="71EE3C04"/>
-    <w:lvl w:ilvl="0">
-      <w:start w:val="1"/>
-      <w:numFmt w:val="bullet"/>
-      <w:lvlText w:val=""/>
-      <w:lvlJc w:val="left"/>
-      <w:pPr>
-        <w:tabs>
-          <w:tab w:val="num" w:pos="720"/>
-        </w:tabs>
-        <w:ind w:left="720" w:hanging="360"/>
-      </w:pPr>
-      <w:rPr>
-        <w:rFonts w:ascii="Symbol" w:hAnsi="Symbol" w:hint="default"/>
-        <w:sz w:val="20"/>
-      </w:rPr>
-    </w:lvl>
-    <w:lvl w:ilvl="1" w:tentative="1">
-      <w:start w:val="1"/>
-      <w:numFmt w:val="bullet"/>
-      <w:lvlText w:val="o"/>
-      <w:lvlJc w:val="left"/>
-      <w:pPr>
-        <w:tabs>
-          <w:tab w:val="num" w:pos="1440"/>
-        </w:tabs>
-        <w:ind w:left="1440" w:hanging="360"/>
-      </w:pPr>
-      <w:rPr>
-        <w:rFonts w:ascii="Courier New" w:hAnsi="Courier New" w:hint="default"/>
-        <w:sz w:val="20"/>
-      </w:rPr>
-    </w:lvl>
-    <w:lvl w:ilvl="2" w:tentative="1">
-      <w:start w:val="1"/>
-      <w:numFmt w:val="bullet"/>
-      <w:lvlText w:val=""/>
-      <w:lvlJc w:val="left"/>
-      <w:pPr>
-        <w:tabs>
-          <w:tab w:val="num" w:pos="2160"/>
-        </w:tabs>
-        <w:ind w:left="2160" w:hanging="360"/>
-      </w:pPr>
-      <w:rPr>
-        <w:rFonts w:ascii="Wingdings" w:hAnsi="Wingdings" w:hint="default"/>
-        <w:sz w:val="20"/>
-      </w:rPr>
-    </w:lvl>
-    <w:lvl w:ilvl="3" w:tentative="1">
-      <w:start w:val="1"/>
-      <w:numFmt w:val="bullet"/>
-      <w:lvlText w:val=""/>
-      <w:lvlJc w:val="left"/>
-      <w:pPr>
-        <w:tabs>
-          <w:tab w:val="num" w:pos="2880"/>
-        </w:tabs>
-        <w:ind w:left="2880" w:hanging="360"/>
-      </w:pPr>
-      <w:rPr>
-        <w:rFonts w:ascii="Wingdings" w:hAnsi="Wingdings" w:hint="default"/>
-        <w:sz w:val="20"/>
-      </w:rPr>
-    </w:lvl>
-    <w:lvl w:ilvl="4" w:tentative="1">
-      <w:start w:val="1"/>
-      <w:numFmt w:val="bullet"/>
-      <w:lvlText w:val=""/>
-      <w:lvlJc w:val="left"/>
-      <w:pPr>
-        <w:tabs>
-          <w:tab w:val="num" w:pos="3600"/>
-        </w:tabs>
-        <w:ind w:left="3600" w:hanging="360"/>
-      </w:pPr>
-      <w:rPr>
-        <w:rFonts w:ascii="Wingdings" w:hAnsi="Wingdings" w:hint="default"/>
-        <w:sz w:val="20"/>
-      </w:rPr>
-    </w:lvl>
-    <w:lvl w:ilvl="5" w:tentative="1">
-      <w:start w:val="1"/>
-      <w:numFmt w:val="bullet"/>
-      <w:lvlText w:val=""/>
-      <w:lvlJc w:val="left"/>
-      <w:pPr>
-        <w:tabs>
-          <w:tab w:val="num" w:pos="4320"/>
-        </w:tabs>
-        <w:ind w:left="4320" w:hanging="360"/>
-      </w:pPr>
-      <w:rPr>
-        <w:rFonts w:ascii="Wingdings" w:hAnsi="Wingdings" w:hint="default"/>
-        <w:sz w:val="20"/>
-      </w:rPr>
-    </w:lvl>
-    <w:lvl w:ilvl="6" w:tentative="1">
-      <w:start w:val="1"/>
-      <w:numFmt w:val="bullet"/>
-      <w:lvlText w:val=""/>
-      <w:lvlJc w:val="left"/>
-      <w:pPr>
-        <w:tabs>
-          <w:tab w:val="num" w:pos="5040"/>
-        </w:tabs>
-        <w:ind w:left="5040" w:hanging="360"/>
-      </w:pPr>
-      <w:rPr>
-        <w:rFonts w:ascii="Wingdings" w:hAnsi="Wingdings" w:hint="default"/>
-        <w:sz w:val="20"/>
-      </w:rPr>
-    </w:lvl>
-    <w:lvl w:ilvl="7" w:tentative="1">
-      <w:start w:val="1"/>
-      <w:numFmt w:val="bullet"/>
-      <w:lvlText w:val=""/>
-      <w:lvlJc w:val="left"/>
-      <w:pPr>
-        <w:tabs>
-          <w:tab w:val="num" w:pos="5760"/>
-        </w:tabs>
-        <w:ind w:left="5760" w:hanging="360"/>
-      </w:pPr>
-      <w:rPr>
-        <w:rFonts w:ascii="Wingdings" w:hAnsi="Wingdings" w:hint="default"/>
-        <w:sz w:val="20"/>
-      </w:rPr>
-    </w:lvl>
-    <w:lvl w:ilvl="8" w:tentative="1">
-      <w:start w:val="1"/>
-      <w:numFmt w:val="bullet"/>
-      <w:lvlText w:val=""/>
-      <w:lvlJc w:val="left"/>
-      <w:pPr>
-        <w:tabs>
-          <w:tab w:val="num" w:pos="6480"/>
-        </w:tabs>
-        <w:ind w:left="6480" w:hanging="360"/>
-      </w:pPr>
-      <w:rPr>
-        <w:rFonts w:ascii="Wingdings" w:hAnsi="Wingdings" w:hint="default"/>
-        <w:sz w:val="20"/>
-      </w:rPr>
-    </w:lvl>
-  </w:abstractNum>
-  <w:abstractNum w:abstractNumId="15" w15:restartNumberingAfterBreak="0">
-    <w:nsid w:val="5BC9096B"/>
-    <w:multiLevelType w:val="multilevel"/>
-    <w:tmpl w:val="E8464B1E"/>
-    <w:lvl w:ilvl="0">
-      <w:start w:val="1"/>
-      <w:numFmt w:val="decimal"/>
-      <w:lvlText w:val="%1."/>
-      <w:lvlJc w:val="left"/>
-      <w:pPr>
-        <w:tabs>
-          <w:tab w:val="num" w:pos="720"/>
-        </w:tabs>
-        <w:ind w:left="720" w:hanging="360"/>
-      </w:pPr>
-    </w:lvl>
-    <w:lvl w:ilvl="1">
-      <w:start w:val="1"/>
-      <w:numFmt w:val="bullet"/>
-      <w:lvlText w:val="o"/>
-      <w:lvlJc w:val="left"/>
-      <w:pPr>
-        <w:tabs>
-          <w:tab w:val="num" w:pos="1440"/>
-        </w:tabs>
-        <w:ind w:left="1440" w:hanging="360"/>
-      </w:pPr>
-      <w:rPr>
-        <w:rFonts w:ascii="Courier New" w:hAnsi="Courier New" w:hint="default"/>
-        <w:sz w:val="20"/>
-      </w:rPr>
-    </w:lvl>
-    <w:lvl w:ilvl="2" w:tentative="1">
-      <w:start w:val="1"/>
-      <w:numFmt w:val="decimal"/>
-      <w:lvlText w:val="%3."/>
-      <w:lvlJc w:val="left"/>
-      <w:pPr>
-        <w:tabs>
-          <w:tab w:val="num" w:pos="2160"/>
-        </w:tabs>
-        <w:ind w:left="2160" w:hanging="360"/>
-      </w:pPr>
-    </w:lvl>
-    <w:lvl w:ilvl="3" w:tentative="1">
-      <w:start w:val="1"/>
-      <w:numFmt w:val="decimal"/>
-      <w:lvlText w:val="%4."/>
-      <w:lvlJc w:val="left"/>
-      <w:pPr>
-        <w:tabs>
-          <w:tab w:val="num" w:pos="2880"/>
-        </w:tabs>
-        <w:ind w:left="2880" w:hanging="360"/>
-      </w:pPr>
-    </w:lvl>
-    <w:lvl w:ilvl="4" w:tentative="1">
-      <w:start w:val="1"/>
-      <w:numFmt w:val="decimal"/>
-      <w:lvlText w:val="%5."/>
-      <w:lvlJc w:val="left"/>
-      <w:pPr>
-        <w:tabs>
-          <w:tab w:val="num" w:pos="3600"/>
-        </w:tabs>
-        <w:ind w:left="3600" w:hanging="360"/>
-      </w:pPr>
-    </w:lvl>
-    <w:lvl w:ilvl="5" w:tentative="1">
-      <w:start w:val="1"/>
-      <w:numFmt w:val="decimal"/>
-      <w:lvlText w:val="%6."/>
-      <w:lvlJc w:val="left"/>
-      <w:pPr>
-        <w:tabs>
-          <w:tab w:val="num" w:pos="4320"/>
-        </w:tabs>
-        <w:ind w:left="4320" w:hanging="360"/>
-      </w:pPr>
-    </w:lvl>
-    <w:lvl w:ilvl="6" w:tentative="1">
-      <w:start w:val="1"/>
-      <w:numFmt w:val="decimal"/>
-      <w:lvlText w:val="%7."/>
-      <w:lvlJc w:val="left"/>
-      <w:pPr>
-        <w:tabs>
-          <w:tab w:val="num" w:pos="5040"/>
-        </w:tabs>
-        <w:ind w:left="5040" w:hanging="360"/>
-      </w:pPr>
-    </w:lvl>
-    <w:lvl w:ilvl="7" w:tentative="1">
-      <w:start w:val="1"/>
-      <w:numFmt w:val="decimal"/>
-      <w:lvlText w:val="%8."/>
-      <w:lvlJc w:val="left"/>
-      <w:pPr>
-        <w:tabs>
-          <w:tab w:val="num" w:pos="5760"/>
-        </w:tabs>
-        <w:ind w:left="5760" w:hanging="360"/>
-      </w:pPr>
-    </w:lvl>
-    <w:lvl w:ilvl="8" w:tentative="1">
-      <w:start w:val="1"/>
-      <w:numFmt w:val="decimal"/>
-      <w:lvlText w:val="%9."/>
-      <w:lvlJc w:val="left"/>
-      <w:pPr>
-        <w:tabs>
-          <w:tab w:val="num" w:pos="6480"/>
-        </w:tabs>
-        <w:ind w:left="6480" w:hanging="360"/>
-      </w:pPr>
-    </w:lvl>
-  </w:abstractNum>
-  <w:abstractNum w:abstractNumId="16" w15:restartNumberingAfterBreak="0">
-    <w:nsid w:val="61C87A82"/>
-    <w:multiLevelType w:val="multilevel"/>
-    <w:tmpl w:val="2BC8DBEE"/>
-    <w:lvl w:ilvl="0">
-      <w:start w:val="1"/>
-      <w:numFmt w:val="bullet"/>
-      <w:lvlText w:val=""/>
-      <w:lvlJc w:val="left"/>
-      <w:pPr>
-        <w:tabs>
-          <w:tab w:val="num" w:pos="720"/>
-        </w:tabs>
-        <w:ind w:left="720" w:hanging="360"/>
-      </w:pPr>
-      <w:rPr>
-        <w:rFonts w:ascii="Symbol" w:hAnsi="Symbol" w:hint="default"/>
-        <w:sz w:val="20"/>
-      </w:rPr>
-    </w:lvl>
-    <w:lvl w:ilvl="1" w:tentative="1">
-      <w:start w:val="1"/>
-      <w:numFmt w:val="bullet"/>
-      <w:lvlText w:val="o"/>
-      <w:lvlJc w:val="left"/>
-      <w:pPr>
-        <w:tabs>
-          <w:tab w:val="num" w:pos="1440"/>
-        </w:tabs>
-        <w:ind w:left="1440" w:hanging="360"/>
-      </w:pPr>
-      <w:rPr>
-        <w:rFonts w:ascii="Courier New" w:hAnsi="Courier New" w:hint="default"/>
-        <w:sz w:val="20"/>
-      </w:rPr>
-    </w:lvl>
-    <w:lvl w:ilvl="2" w:tentative="1">
-      <w:start w:val="1"/>
-      <w:numFmt w:val="bullet"/>
-      <w:lvlText w:val=""/>
-      <w:lvlJc w:val="left"/>
-      <w:pPr>
-        <w:tabs>
-          <w:tab w:val="num" w:pos="2160"/>
-        </w:tabs>
-        <w:ind w:left="2160" w:hanging="360"/>
-      </w:pPr>
-      <w:rPr>
-        <w:rFonts w:ascii="Wingdings" w:hAnsi="Wingdings" w:hint="default"/>
-        <w:sz w:val="20"/>
-      </w:rPr>
-    </w:lvl>
-    <w:lvl w:ilvl="3" w:tentative="1">
-      <w:start w:val="1"/>
-      <w:numFmt w:val="bullet"/>
-      <w:lvlText w:val=""/>
-      <w:lvlJc w:val="left"/>
-      <w:pPr>
-        <w:tabs>
-          <w:tab w:val="num" w:pos="2880"/>
-        </w:tabs>
-        <w:ind w:left="2880" w:hanging="360"/>
-      </w:pPr>
-      <w:rPr>
-        <w:rFonts w:ascii="Wingdings" w:hAnsi="Wingdings" w:hint="default"/>
-        <w:sz w:val="20"/>
-      </w:rPr>
-    </w:lvl>
-    <w:lvl w:ilvl="4" w:tentative="1">
-      <w:start w:val="1"/>
-      <w:numFmt w:val="bullet"/>
-      <w:lvlText w:val=""/>
-      <w:lvlJc w:val="left"/>
-      <w:pPr>
-        <w:tabs>
-          <w:tab w:val="num" w:pos="3600"/>
-        </w:tabs>
-        <w:ind w:left="3600" w:hanging="360"/>
-      </w:pPr>
-      <w:rPr>
-        <w:rFonts w:ascii="Wingdings" w:hAnsi="Wingdings" w:hint="default"/>
-        <w:sz w:val="20"/>
-      </w:rPr>
-    </w:lvl>
-    <w:lvl w:ilvl="5" w:tentative="1">
-      <w:start w:val="1"/>
-      <w:numFmt w:val="bullet"/>
-      <w:lvlText w:val=""/>
-      <w:lvlJc w:val="left"/>
-      <w:pPr>
-        <w:tabs>
-          <w:tab w:val="num" w:pos="4320"/>
-        </w:tabs>
-        <w:ind w:left="4320" w:hanging="360"/>
-      </w:pPr>
-      <w:rPr>
-        <w:rFonts w:ascii="Wingdings" w:hAnsi="Wingdings" w:hint="default"/>
-        <w:sz w:val="20"/>
-      </w:rPr>
-    </w:lvl>
-    <w:lvl w:ilvl="6" w:tentative="1">
-      <w:start w:val="1"/>
-      <w:numFmt w:val="bullet"/>
-      <w:lvlText w:val=""/>
-      <w:lvlJc w:val="left"/>
-      <w:pPr>
-        <w:tabs>
-          <w:tab w:val="num" w:pos="5040"/>
-        </w:tabs>
-        <w:ind w:left="5040" w:hanging="360"/>
-      </w:pPr>
-      <w:rPr>
-        <w:rFonts w:ascii="Wingdings" w:hAnsi="Wingdings" w:hint="default"/>
-        <w:sz w:val="20"/>
-      </w:rPr>
-    </w:lvl>
-    <w:lvl w:ilvl="7" w:tentative="1">
-      <w:start w:val="1"/>
-      <w:numFmt w:val="bullet"/>
-      <w:lvlText w:val=""/>
-      <w:lvlJc w:val="left"/>
-      <w:pPr>
-        <w:tabs>
-          <w:tab w:val="num" w:pos="5760"/>
-        </w:tabs>
-        <w:ind w:left="5760" w:hanging="360"/>
-      </w:pPr>
-      <w:rPr>
-        <w:rFonts w:ascii="Wingdings" w:hAnsi="Wingdings" w:hint="default"/>
-        <w:sz w:val="20"/>
-      </w:rPr>
-    </w:lvl>
-    <w:lvl w:ilvl="8" w:tentative="1">
-      <w:start w:val="1"/>
-      <w:numFmt w:val="bullet"/>
-      <w:lvlText w:val=""/>
-      <w:lvlJc w:val="left"/>
-      <w:pPr>
-        <w:tabs>
-          <w:tab w:val="num" w:pos="6480"/>
-        </w:tabs>
-        <w:ind w:left="6480" w:hanging="360"/>
-      </w:pPr>
-      <w:rPr>
-        <w:rFonts w:ascii="Wingdings" w:hAnsi="Wingdings" w:hint="default"/>
-        <w:sz w:val="20"/>
-      </w:rPr>
-    </w:lvl>
-  </w:abstractNum>
-  <w:abstractNum w:abstractNumId="17" w15:restartNumberingAfterBreak="0">
-    <w:nsid w:val="70B7622F"/>
-    <w:multiLevelType w:val="multilevel"/>
-    <w:tmpl w:val="C110102E"/>
-    <w:lvl w:ilvl="0">
-      <w:start w:val="1"/>
-      <w:numFmt w:val="decimal"/>
-      <w:lvlText w:val="%1."/>
-      <w:lvlJc w:val="left"/>
-      <w:pPr>
-        <w:tabs>
-          <w:tab w:val="num" w:pos="720"/>
-        </w:tabs>
-        <w:ind w:left="720" w:hanging="360"/>
-      </w:pPr>
-    </w:lvl>
-    <w:lvl w:ilvl="1">
-      <w:start w:val="1"/>
-      <w:numFmt w:val="bullet"/>
-      <w:lvlText w:val="o"/>
-      <w:lvlJc w:val="left"/>
-      <w:pPr>
-        <w:tabs>
-          <w:tab w:val="num" w:pos="1440"/>
-        </w:tabs>
-        <w:ind w:left="1440" w:hanging="360"/>
-      </w:pPr>
-      <w:rPr>
-        <w:rFonts w:ascii="Courier New" w:hAnsi="Courier New" w:hint="default"/>
-        <w:sz w:val="20"/>
-      </w:rPr>
-    </w:lvl>
-    <w:lvl w:ilvl="2" w:tentative="1">
-      <w:start w:val="1"/>
-      <w:numFmt w:val="decimal"/>
-      <w:lvlText w:val="%3."/>
-      <w:lvlJc w:val="left"/>
-      <w:pPr>
-        <w:tabs>
-          <w:tab w:val="num" w:pos="2160"/>
-        </w:tabs>
-        <w:ind w:left="2160" w:hanging="360"/>
-      </w:pPr>
-    </w:lvl>
-    <w:lvl w:ilvl="3" w:tentative="1">
-      <w:start w:val="1"/>
-      <w:numFmt w:val="decimal"/>
-      <w:lvlText w:val="%4."/>
-      <w:lvlJc w:val="left"/>
-      <w:pPr>
-        <w:tabs>
-          <w:tab w:val="num" w:pos="2880"/>
-        </w:tabs>
-        <w:ind w:left="2880" w:hanging="360"/>
-      </w:pPr>
-    </w:lvl>
-    <w:lvl w:ilvl="4" w:tentative="1">
-      <w:start w:val="1"/>
-      <w:numFmt w:val="decimal"/>
-      <w:lvlText w:val="%5."/>
-      <w:lvlJc w:val="left"/>
-      <w:pPr>
-        <w:tabs>
-          <w:tab w:val="num" w:pos="3600"/>
-        </w:tabs>
-        <w:ind w:left="3600" w:hanging="360"/>
-      </w:pPr>
-    </w:lvl>
-    <w:lvl w:ilvl="5" w:tentative="1">
-      <w:start w:val="1"/>
-      <w:numFmt w:val="decimal"/>
-      <w:lvlText w:val="%6."/>
-      <w:lvlJc w:val="left"/>
-      <w:pPr>
-        <w:tabs>
-          <w:tab w:val="num" w:pos="4320"/>
-        </w:tabs>
-        <w:ind w:left="4320" w:hanging="360"/>
-      </w:pPr>
-    </w:lvl>
-    <w:lvl w:ilvl="6" w:tentative="1">
-      <w:start w:val="1"/>
-      <w:numFmt w:val="decimal"/>
-      <w:lvlText w:val="%7."/>
-      <w:lvlJc w:val="left"/>
-      <w:pPr>
-        <w:tabs>
-          <w:tab w:val="num" w:pos="5040"/>
-        </w:tabs>
-        <w:ind w:left="5040" w:hanging="360"/>
-      </w:pPr>
-    </w:lvl>
-    <w:lvl w:ilvl="7" w:tentative="1">
-      <w:start w:val="1"/>
-      <w:numFmt w:val="decimal"/>
-      <w:lvlText w:val="%8."/>
-      <w:lvlJc w:val="left"/>
-      <w:pPr>
-        <w:tabs>
-          <w:tab w:val="num" w:pos="5760"/>
-        </w:tabs>
-        <w:ind w:left="5760" w:hanging="360"/>
-      </w:pPr>
-    </w:lvl>
-    <w:lvl w:ilvl="8" w:tentative="1">
-      <w:start w:val="1"/>
-      <w:numFmt w:val="decimal"/>
-      <w:lvlText w:val="%9."/>
-      <w:lvlJc w:val="left"/>
-      <w:pPr>
-        <w:tabs>
-          <w:tab w:val="num" w:pos="6480"/>
-        </w:tabs>
-        <w:ind w:left="6480" w:hanging="360"/>
-      </w:pPr>
-    </w:lvl>
-  </w:abstractNum>
-  <w:abstractNum w:abstractNumId="18" w15:restartNumberingAfterBreak="0">
-    <w:nsid w:val="70D56883"/>
-    <w:multiLevelType w:val="multilevel"/>
-    <w:tmpl w:val="75384776"/>
-    <w:lvl w:ilvl="0">
-      <w:start w:val="1"/>
-      <w:numFmt w:val="bullet"/>
-      <w:lvlText w:val=""/>
-      <w:lvlJc w:val="left"/>
-      <w:pPr>
-        <w:tabs>
-          <w:tab w:val="num" w:pos="720"/>
-        </w:tabs>
-        <w:ind w:left="720" w:hanging="360"/>
-      </w:pPr>
-      <w:rPr>
-        <w:rFonts w:ascii="Symbol" w:hAnsi="Symbol" w:hint="default"/>
-        <w:sz w:val="20"/>
-      </w:rPr>
-    </w:lvl>
-    <w:lvl w:ilvl="1" w:tentative="1">
-      <w:start w:val="1"/>
-      <w:numFmt w:val="bullet"/>
-      <w:lvlText w:val="o"/>
-      <w:lvlJc w:val="left"/>
-      <w:pPr>
-        <w:tabs>
-          <w:tab w:val="num" w:pos="1440"/>
-        </w:tabs>
-        <w:ind w:left="1440" w:hanging="360"/>
-      </w:pPr>
-      <w:rPr>
-        <w:rFonts w:ascii="Courier New" w:hAnsi="Courier New" w:hint="default"/>
-        <w:sz w:val="20"/>
-      </w:rPr>
-    </w:lvl>
-    <w:lvl w:ilvl="2" w:tentative="1">
-      <w:start w:val="1"/>
-      <w:numFmt w:val="bullet"/>
-      <w:lvlText w:val=""/>
-      <w:lvlJc w:val="left"/>
-      <w:pPr>
-        <w:tabs>
-          <w:tab w:val="num" w:pos="2160"/>
-        </w:tabs>
-        <w:ind w:left="2160" w:hanging="360"/>
-      </w:pPr>
-      <w:rPr>
-        <w:rFonts w:ascii="Wingdings" w:hAnsi="Wingdings" w:hint="default"/>
-        <w:sz w:val="20"/>
-      </w:rPr>
-    </w:lvl>
-    <w:lvl w:ilvl="3" w:tentative="1">
-      <w:start w:val="1"/>
-      <w:numFmt w:val="bullet"/>
-      <w:lvlText w:val=""/>
-      <w:lvlJc w:val="left"/>
-      <w:pPr>
-        <w:tabs>
-          <w:tab w:val="num" w:pos="2880"/>
-        </w:tabs>
-        <w:ind w:left="2880" w:hanging="360"/>
-      </w:pPr>
-      <w:rPr>
-        <w:rFonts w:ascii="Wingdings" w:hAnsi="Wingdings" w:hint="default"/>
-        <w:sz w:val="20"/>
-      </w:rPr>
-    </w:lvl>
-    <w:lvl w:ilvl="4" w:tentative="1">
-      <w:start w:val="1"/>
-      <w:numFmt w:val="bullet"/>
-      <w:lvlText w:val=""/>
-      <w:lvlJc w:val="left"/>
-      <w:pPr>
-        <w:tabs>
-          <w:tab w:val="num" w:pos="3600"/>
-        </w:tabs>
-        <w:ind w:left="3600" w:hanging="360"/>
-      </w:pPr>
-      <w:rPr>
-        <w:rFonts w:ascii="Wingdings" w:hAnsi="Wingdings" w:hint="default"/>
-        <w:sz w:val="20"/>
-      </w:rPr>
-    </w:lvl>
-    <w:lvl w:ilvl="5" w:tentative="1">
-      <w:start w:val="1"/>
-      <w:numFmt w:val="bullet"/>
-      <w:lvlText w:val=""/>
-      <w:lvlJc w:val="left"/>
-      <w:pPr>
-        <w:tabs>
-          <w:tab w:val="num" w:pos="4320"/>
-        </w:tabs>
-        <w:ind w:left="4320" w:hanging="360"/>
-      </w:pPr>
-      <w:rPr>
-        <w:rFonts w:ascii="Wingdings" w:hAnsi="Wingdings" w:hint="default"/>
-        <w:sz w:val="20"/>
-      </w:rPr>
-    </w:lvl>
-    <w:lvl w:ilvl="6" w:tentative="1">
-      <w:start w:val="1"/>
-      <w:numFmt w:val="bullet"/>
-      <w:lvlText w:val=""/>
-      <w:lvlJc w:val="left"/>
-      <w:pPr>
-        <w:tabs>
-          <w:tab w:val="num" w:pos="5040"/>
-        </w:tabs>
-        <w:ind w:left="5040" w:hanging="360"/>
-      </w:pPr>
-      <w:rPr>
-        <w:rFonts w:ascii="Wingdings" w:hAnsi="Wingdings" w:hint="default"/>
-        <w:sz w:val="20"/>
-      </w:rPr>
-    </w:lvl>
-    <w:lvl w:ilvl="7" w:tentative="1">
-      <w:start w:val="1"/>
-      <w:numFmt w:val="bullet"/>
-      <w:lvlText w:val=""/>
-      <w:lvlJc w:val="left"/>
-      <w:pPr>
-        <w:tabs>
-          <w:tab w:val="num" w:pos="5760"/>
-        </w:tabs>
-        <w:ind w:left="5760" w:hanging="360"/>
-      </w:pPr>
-      <w:rPr>
-        <w:rFonts w:ascii="Wingdings" w:hAnsi="Wingdings" w:hint="default"/>
-        <w:sz w:val="20"/>
-      </w:rPr>
-    </w:lvl>
-    <w:lvl w:ilvl="8" w:tentative="1">
-      <w:start w:val="1"/>
-      <w:numFmt w:val="bullet"/>
-      <w:lvlText w:val=""/>
-      <w:lvlJc w:val="left"/>
-      <w:pPr>
-        <w:tabs>
-          <w:tab w:val="num" w:pos="6480"/>
-        </w:tabs>
-        <w:ind w:left="6480" w:hanging="360"/>
-      </w:pPr>
-      <w:rPr>
-        <w:rFonts w:ascii="Wingdings" w:hAnsi="Wingdings" w:hint="default"/>
-        <w:sz w:val="20"/>
-      </w:rPr>
-    </w:lvl>
-  </w:abstractNum>
-  <w:abstractNum w:abstractNumId="19" w15:restartNumberingAfterBreak="0">
-    <w:nsid w:val="71466C13"/>
-    <w:multiLevelType w:val="multilevel"/>
-    <w:tmpl w:val="640EC306"/>
-    <w:lvl w:ilvl="0">
-      <w:start w:val="1"/>
-      <w:numFmt w:val="bullet"/>
-      <w:lvlText w:val=""/>
-      <w:lvlJc w:val="left"/>
-      <w:pPr>
-        <w:tabs>
-          <w:tab w:val="num" w:pos="720"/>
-        </w:tabs>
-        <w:ind w:left="720" w:hanging="360"/>
-      </w:pPr>
-      <w:rPr>
-        <w:rFonts w:ascii="Symbol" w:hAnsi="Symbol" w:hint="default"/>
-        <w:sz w:val="20"/>
-      </w:rPr>
-    </w:lvl>
-    <w:lvl w:ilvl="1" w:tentative="1">
-      <w:start w:val="1"/>
-      <w:numFmt w:val="bullet"/>
-      <w:lvlText w:val="o"/>
-      <w:lvlJc w:val="left"/>
-      <w:pPr>
-        <w:tabs>
-          <w:tab w:val="num" w:pos="1440"/>
-        </w:tabs>
-        <w:ind w:left="1440" w:hanging="360"/>
-      </w:pPr>
-      <w:rPr>
-        <w:rFonts w:ascii="Courier New" w:hAnsi="Courier New" w:hint="default"/>
-        <w:sz w:val="20"/>
-      </w:rPr>
-    </w:lvl>
-    <w:lvl w:ilvl="2" w:tentative="1">
-      <w:start w:val="1"/>
-      <w:numFmt w:val="bullet"/>
-      <w:lvlText w:val=""/>
-      <w:lvlJc w:val="left"/>
-      <w:pPr>
-        <w:tabs>
-          <w:tab w:val="num" w:pos="2160"/>
-        </w:tabs>
-        <w:ind w:left="2160" w:hanging="360"/>
-      </w:pPr>
-      <w:rPr>
-        <w:rFonts w:ascii="Wingdings" w:hAnsi="Wingdings" w:hint="default"/>
-        <w:sz w:val="20"/>
-      </w:rPr>
-    </w:lvl>
-    <w:lvl w:ilvl="3" w:tentative="1">
-      <w:start w:val="1"/>
-      <w:numFmt w:val="bullet"/>
-      <w:lvlText w:val=""/>
-      <w:lvlJc w:val="left"/>
-      <w:pPr>
-        <w:tabs>
-          <w:tab w:val="num" w:pos="2880"/>
-        </w:tabs>
-        <w:ind w:left="2880" w:hanging="360"/>
-      </w:pPr>
-      <w:rPr>
-        <w:rFonts w:ascii="Wingdings" w:hAnsi="Wingdings" w:hint="default"/>
-        <w:sz w:val="20"/>
-      </w:rPr>
-    </w:lvl>
-    <w:lvl w:ilvl="4" w:tentative="1">
-      <w:start w:val="1"/>
-      <w:numFmt w:val="bullet"/>
-      <w:lvlText w:val=""/>
-      <w:lvlJc w:val="left"/>
-      <w:pPr>
-        <w:tabs>
-          <w:tab w:val="num" w:pos="3600"/>
-        </w:tabs>
-        <w:ind w:left="3600" w:hanging="360"/>
-      </w:pPr>
-      <w:rPr>
-        <w:rFonts w:ascii="Wingdings" w:hAnsi="Wingdings" w:hint="default"/>
-        <w:sz w:val="20"/>
-      </w:rPr>
-    </w:lvl>
-    <w:lvl w:ilvl="5" w:tentative="1">
-      <w:start w:val="1"/>
-      <w:numFmt w:val="bullet"/>
-      <w:lvlText w:val=""/>
-      <w:lvlJc w:val="left"/>
-      <w:pPr>
-        <w:tabs>
-          <w:tab w:val="num" w:pos="4320"/>
-        </w:tabs>
-        <w:ind w:left="4320" w:hanging="360"/>
-      </w:pPr>
-      <w:rPr>
-        <w:rFonts w:ascii="Wingdings" w:hAnsi="Wingdings" w:hint="default"/>
-        <w:sz w:val="20"/>
-      </w:rPr>
-    </w:lvl>
-    <w:lvl w:ilvl="6" w:tentative="1">
-      <w:start w:val="1"/>
-      <w:numFmt w:val="bullet"/>
-      <w:lvlText w:val=""/>
-      <w:lvlJc w:val="left"/>
-      <w:pPr>
-        <w:tabs>
-          <w:tab w:val="num" w:pos="5040"/>
-        </w:tabs>
-        <w:ind w:left="5040" w:hanging="360"/>
-      </w:pPr>
-      <w:rPr>
-        <w:rFonts w:ascii="Wingdings" w:hAnsi="Wingdings" w:hint="default"/>
-        <w:sz w:val="20"/>
-      </w:rPr>
-    </w:lvl>
-    <w:lvl w:ilvl="7" w:tentative="1">
-      <w:start w:val="1"/>
-      <w:numFmt w:val="bullet"/>
-      <w:lvlText w:val=""/>
-      <w:lvlJc w:val="left"/>
-      <w:pPr>
-        <w:tabs>
-          <w:tab w:val="num" w:pos="5760"/>
-        </w:tabs>
-        <w:ind w:left="5760" w:hanging="360"/>
-      </w:pPr>
-      <w:rPr>
-        <w:rFonts w:ascii="Wingdings" w:hAnsi="Wingdings" w:hint="default"/>
-        <w:sz w:val="20"/>
-      </w:rPr>
-    </w:lvl>
-    <w:lvl w:ilvl="8" w:tentative="1">
-      <w:start w:val="1"/>
-      <w:numFmt w:val="bullet"/>
-      <w:lvlText w:val=""/>
-      <w:lvlJc w:val="left"/>
-      <w:pPr>
-        <w:tabs>
-          <w:tab w:val="num" w:pos="6480"/>
-        </w:tabs>
-        <w:ind w:left="6480" w:hanging="360"/>
-      </w:pPr>
-      <w:rPr>
-        <w:rFonts w:ascii="Wingdings" w:hAnsi="Wingdings" w:hint="default"/>
-        <w:sz w:val="20"/>
-      </w:rPr>
-    </w:lvl>
-  </w:abstractNum>
-  <w:abstractNum w:abstractNumId="20" w15:restartNumberingAfterBreak="0">
-    <w:nsid w:val="78DE3D09"/>
-    <w:multiLevelType w:val="multilevel"/>
-    <w:tmpl w:val="80D86A42"/>
-    <w:lvl w:ilvl="0">
-      <w:start w:val="1"/>
-      <w:numFmt w:val="bullet"/>
-      <w:lvlText w:val=""/>
-      <w:lvlJc w:val="left"/>
-      <w:pPr>
-        <w:tabs>
-          <w:tab w:val="num" w:pos="720"/>
-        </w:tabs>
-        <w:ind w:left="720" w:hanging="360"/>
-      </w:pPr>
-      <w:rPr>
-        <w:rFonts w:ascii="Symbol" w:hAnsi="Symbol" w:hint="default"/>
-        <w:sz w:val="20"/>
-      </w:rPr>
-    </w:lvl>
-    <w:lvl w:ilvl="1" w:tentative="1">
-      <w:start w:val="1"/>
-      <w:numFmt w:val="bullet"/>
-      <w:lvlText w:val="o"/>
-      <w:lvlJc w:val="left"/>
-      <w:pPr>
-        <w:tabs>
-          <w:tab w:val="num" w:pos="1440"/>
-        </w:tabs>
-        <w:ind w:left="1440" w:hanging="360"/>
-      </w:pPr>
-      <w:rPr>
-        <w:rFonts w:ascii="Courier New" w:hAnsi="Courier New" w:hint="default"/>
-        <w:sz w:val="20"/>
-      </w:rPr>
-    </w:lvl>
-    <w:lvl w:ilvl="2" w:tentative="1">
-      <w:start w:val="1"/>
-      <w:numFmt w:val="bullet"/>
-      <w:lvlText w:val=""/>
-      <w:lvlJc w:val="left"/>
-      <w:pPr>
-        <w:tabs>
-          <w:tab w:val="num" w:pos="2160"/>
-        </w:tabs>
-        <w:ind w:left="2160" w:hanging="360"/>
-      </w:pPr>
-      <w:rPr>
-        <w:rFonts w:ascii="Wingdings" w:hAnsi="Wingdings" w:hint="default"/>
-        <w:sz w:val="20"/>
-      </w:rPr>
-    </w:lvl>
-    <w:lvl w:ilvl="3" w:tentative="1">
-      <w:start w:val="1"/>
-      <w:numFmt w:val="bullet"/>
-      <w:lvlText w:val=""/>
-      <w:lvlJc w:val="left"/>
-      <w:pPr>
-        <w:tabs>
-          <w:tab w:val="num" w:pos="2880"/>
-        </w:tabs>
-        <w:ind w:left="2880" w:hanging="360"/>
-      </w:pPr>
-      <w:rPr>
-        <w:rFonts w:ascii="Wingdings" w:hAnsi="Wingdings" w:hint="default"/>
-        <w:sz w:val="20"/>
-      </w:rPr>
-    </w:lvl>
-    <w:lvl w:ilvl="4" w:tentative="1">
-      <w:start w:val="1"/>
-      <w:numFmt w:val="bullet"/>
-      <w:lvlText w:val=""/>
-      <w:lvlJc w:val="left"/>
-      <w:pPr>
-        <w:tabs>
-          <w:tab w:val="num" w:pos="3600"/>
-        </w:tabs>
-        <w:ind w:left="3600" w:hanging="360"/>
-      </w:pPr>
-      <w:rPr>
-        <w:rFonts w:ascii="Wingdings" w:hAnsi="Wingdings" w:hint="default"/>
-        <w:sz w:val="20"/>
-      </w:rPr>
-    </w:lvl>
-    <w:lvl w:ilvl="5" w:tentative="1">
-      <w:start w:val="1"/>
-      <w:numFmt w:val="bullet"/>
-      <w:lvlText w:val=""/>
-      <w:lvlJc w:val="left"/>
-      <w:pPr>
-        <w:tabs>
-          <w:tab w:val="num" w:pos="4320"/>
-        </w:tabs>
-        <w:ind w:left="4320" w:hanging="360"/>
-      </w:pPr>
-      <w:rPr>
-        <w:rFonts w:ascii="Wingdings" w:hAnsi="Wingdings" w:hint="default"/>
-        <w:sz w:val="20"/>
-      </w:rPr>
-    </w:lvl>
-    <w:lvl w:ilvl="6" w:tentative="1">
-      <w:start w:val="1"/>
-      <w:numFmt w:val="bullet"/>
-      <w:lvlText w:val=""/>
-      <w:lvlJc w:val="left"/>
-      <w:pPr>
-        <w:tabs>
-          <w:tab w:val="num" w:pos="5040"/>
-        </w:tabs>
-        <w:ind w:left="5040" w:hanging="360"/>
-      </w:pPr>
-      <w:rPr>
-        <w:rFonts w:ascii="Wingdings" w:hAnsi="Wingdings" w:hint="default"/>
-        <w:sz w:val="20"/>
-      </w:rPr>
-    </w:lvl>
-    <w:lvl w:ilvl="7" w:tentative="1">
-      <w:start w:val="1"/>
-      <w:numFmt w:val="bullet"/>
-      <w:lvlText w:val=""/>
-      <w:lvlJc w:val="left"/>
-      <w:pPr>
-        <w:tabs>
-          <w:tab w:val="num" w:pos="5760"/>
-        </w:tabs>
-        <w:ind w:left="5760" w:hanging="360"/>
-      </w:pPr>
-      <w:rPr>
-        <w:rFonts w:ascii="Wingdings" w:hAnsi="Wingdings" w:hint="default"/>
-        <w:sz w:val="20"/>
-      </w:rPr>
-    </w:lvl>
-    <w:lvl w:ilvl="8" w:tentative="1">
-      <w:start w:val="1"/>
-      <w:numFmt w:val="bullet"/>
-      <w:lvlText w:val=""/>
-      <w:lvlJc w:val="left"/>
-      <w:pPr>
-        <w:tabs>
-          <w:tab w:val="num" w:pos="6480"/>
-        </w:tabs>
-        <w:ind w:left="6480" w:hanging="360"/>
-      </w:pPr>
-      <w:rPr>
-        <w:rFonts w:ascii="Wingdings" w:hAnsi="Wingdings" w:hint="default"/>
-        <w:sz w:val="20"/>
-      </w:rPr>
-    </w:lvl>
-  </w:abstractNum>
-  <w:abstractNum w:abstractNumId="21" w15:restartNumberingAfterBreak="0">
-    <w:nsid w:val="79015DCC"/>
-    <w:multiLevelType w:val="multilevel"/>
-    <w:tmpl w:val="445E3B8C"/>
-    <w:lvl w:ilvl="0">
-      <w:start w:val="1"/>
-      <w:numFmt w:val="bullet"/>
-      <w:lvlText w:val=""/>
-      <w:lvlJc w:val="left"/>
-      <w:pPr>
-        <w:tabs>
-          <w:tab w:val="num" w:pos="720"/>
-        </w:tabs>
-        <w:ind w:left="720" w:hanging="360"/>
-      </w:pPr>
-      <w:rPr>
-        <w:rFonts w:ascii="Symbol" w:hAnsi="Symbol" w:hint="default"/>
-        <w:sz w:val="20"/>
-      </w:rPr>
-    </w:lvl>
-    <w:lvl w:ilvl="1" w:tentative="1">
-      <w:start w:val="1"/>
-      <w:numFmt w:val="bullet"/>
-      <w:lvlText w:val="o"/>
-      <w:lvlJc w:val="left"/>
-      <w:pPr>
-        <w:tabs>
-          <w:tab w:val="num" w:pos="1440"/>
-        </w:tabs>
-        <w:ind w:left="1440" w:hanging="360"/>
-      </w:pPr>
-      <w:rPr>
-        <w:rFonts w:ascii="Courier New" w:hAnsi="Courier New" w:hint="default"/>
-        <w:sz w:val="20"/>
-      </w:rPr>
-    </w:lvl>
-    <w:lvl w:ilvl="2" w:tentative="1">
-      <w:start w:val="1"/>
-      <w:numFmt w:val="bullet"/>
-      <w:lvlText w:val=""/>
-      <w:lvlJc w:val="left"/>
-      <w:pPr>
-        <w:tabs>
-          <w:tab w:val="num" w:pos="2160"/>
-        </w:tabs>
-        <w:ind w:left="2160" w:hanging="360"/>
-      </w:pPr>
-      <w:rPr>
-        <w:rFonts w:ascii="Wingdings" w:hAnsi="Wingdings" w:hint="default"/>
-        <w:sz w:val="20"/>
-      </w:rPr>
-    </w:lvl>
-    <w:lvl w:ilvl="3" w:tentative="1">
-      <w:start w:val="1"/>
-      <w:numFmt w:val="bullet"/>
-      <w:lvlText w:val=""/>
-      <w:lvlJc w:val="left"/>
-      <w:pPr>
-        <w:tabs>
-          <w:tab w:val="num" w:pos="2880"/>
-        </w:tabs>
-        <w:ind w:left="2880" w:hanging="360"/>
-      </w:pPr>
-      <w:rPr>
-        <w:rFonts w:ascii="Wingdings" w:hAnsi="Wingdings" w:hint="default"/>
-        <w:sz w:val="20"/>
-      </w:rPr>
-    </w:lvl>
-    <w:lvl w:ilvl="4" w:tentative="1">
-      <w:start w:val="1"/>
-      <w:numFmt w:val="bullet"/>
-      <w:lvlText w:val=""/>
-      <w:lvlJc w:val="left"/>
-      <w:pPr>
-        <w:tabs>
-          <w:tab w:val="num" w:pos="3600"/>
-        </w:tabs>
-        <w:ind w:left="3600" w:hanging="360"/>
-      </w:pPr>
-      <w:rPr>
-        <w:rFonts w:ascii="Wingdings" w:hAnsi="Wingdings" w:hint="default"/>
-        <w:sz w:val="20"/>
-      </w:rPr>
-    </w:lvl>
-    <w:lvl w:ilvl="5" w:tentative="1">
-      <w:start w:val="1"/>
-      <w:numFmt w:val="bullet"/>
-      <w:lvlText w:val=""/>
-      <w:lvlJc w:val="left"/>
-      <w:pPr>
-        <w:tabs>
-          <w:tab w:val="num" w:pos="4320"/>
-        </w:tabs>
-        <w:ind w:left="4320" w:hanging="360"/>
-      </w:pPr>
-      <w:rPr>
-        <w:rFonts w:ascii="Wingdings" w:hAnsi="Wingdings" w:hint="default"/>
-        <w:sz w:val="20"/>
-      </w:rPr>
-    </w:lvl>
-    <w:lvl w:ilvl="6" w:tentative="1">
-      <w:start w:val="1"/>
-      <w:numFmt w:val="bullet"/>
-      <w:lvlText w:val=""/>
-      <w:lvlJc w:val="left"/>
-      <w:pPr>
-        <w:tabs>
-          <w:tab w:val="num" w:pos="5040"/>
-        </w:tabs>
-        <w:ind w:left="5040" w:hanging="360"/>
-      </w:pPr>
-      <w:rPr>
-        <w:rFonts w:ascii="Wingdings" w:hAnsi="Wingdings" w:hint="default"/>
-        <w:sz w:val="20"/>
-      </w:rPr>
-    </w:lvl>
-    <w:lvl w:ilvl="7" w:tentative="1">
-      <w:start w:val="1"/>
-      <w:numFmt w:val="bullet"/>
-      <w:lvlText w:val=""/>
-      <w:lvlJc w:val="left"/>
-      <w:pPr>
-        <w:tabs>
-          <w:tab w:val="num" w:pos="5760"/>
-        </w:tabs>
-        <w:ind w:left="5760" w:hanging="360"/>
-      </w:pPr>
-      <w:rPr>
-        <w:rFonts w:ascii="Wingdings" w:hAnsi="Wingdings" w:hint="default"/>
-        <w:sz w:val="20"/>
-      </w:rPr>
-    </w:lvl>
-    <w:lvl w:ilvl="8" w:tentative="1">
-      <w:start w:val="1"/>
-      <w:numFmt w:val="bullet"/>
-      <w:lvlText w:val=""/>
-      <w:lvlJc w:val="left"/>
-      <w:pPr>
-        <w:tabs>
-          <w:tab w:val="num" w:pos="6480"/>
-        </w:tabs>
-        <w:ind w:left="6480" w:hanging="360"/>
-      </w:pPr>
-      <w:rPr>
-        <w:rFonts w:ascii="Wingdings" w:hAnsi="Wingdings" w:hint="default"/>
-        <w:sz w:val="20"/>
-      </w:rPr>
-    </w:lvl>
-  </w:abstractNum>
-  <w:abstractNum w:abstractNumId="22" w15:restartNumberingAfterBreak="0">
-    <w:nsid w:val="7A0905AD"/>
-    <w:multiLevelType w:val="multilevel"/>
-    <w:tmpl w:val="C75CB0F4"/>
-    <w:lvl w:ilvl="0">
-      <w:start w:val="1"/>
-      <w:numFmt w:val="bullet"/>
-      <w:lvlText w:val=""/>
-      <w:lvlJc w:val="left"/>
-      <w:pPr>
-        <w:tabs>
-          <w:tab w:val="num" w:pos="720"/>
-        </w:tabs>
-        <w:ind w:left="720" w:hanging="360"/>
-      </w:pPr>
-      <w:rPr>
-        <w:rFonts w:ascii="Symbol" w:hAnsi="Symbol" w:hint="default"/>
-        <w:sz w:val="20"/>
-      </w:rPr>
-    </w:lvl>
-    <w:lvl w:ilvl="1" w:tentative="1">
-      <w:start w:val="1"/>
-      <w:numFmt w:val="bullet"/>
-      <w:lvlText w:val="o"/>
-      <w:lvlJc w:val="left"/>
-      <w:pPr>
-        <w:tabs>
-          <w:tab w:val="num" w:pos="1440"/>
-        </w:tabs>
-        <w:ind w:left="1440" w:hanging="360"/>
-      </w:pPr>
-      <w:rPr>
-        <w:rFonts w:ascii="Courier New" w:hAnsi="Courier New" w:hint="default"/>
-        <w:sz w:val="20"/>
-      </w:rPr>
-    </w:lvl>
-    <w:lvl w:ilvl="2" w:tentative="1">
-      <w:start w:val="1"/>
-      <w:numFmt w:val="bullet"/>
-      <w:lvlText w:val=""/>
-      <w:lvlJc w:val="left"/>
-      <w:pPr>
-        <w:tabs>
-          <w:tab w:val="num" w:pos="2160"/>
-        </w:tabs>
-        <w:ind w:left="2160" w:hanging="360"/>
-      </w:pPr>
-      <w:rPr>
-        <w:rFonts w:ascii="Wingdings" w:hAnsi="Wingdings" w:hint="default"/>
-        <w:sz w:val="20"/>
-      </w:rPr>
-    </w:lvl>
-    <w:lvl w:ilvl="3" w:tentative="1">
-      <w:start w:val="1"/>
-      <w:numFmt w:val="bullet"/>
-      <w:lvlText w:val=""/>
-      <w:lvlJc w:val="left"/>
-      <w:pPr>
-        <w:tabs>
-          <w:tab w:val="num" w:pos="2880"/>
-        </w:tabs>
-        <w:ind w:left="2880" w:hanging="360"/>
-      </w:pPr>
-      <w:rPr>
-        <w:rFonts w:ascii="Wingdings" w:hAnsi="Wingdings" w:hint="default"/>
-        <w:sz w:val="20"/>
-      </w:rPr>
-    </w:lvl>
-    <w:lvl w:ilvl="4" w:tentative="1">
-      <w:start w:val="1"/>
-      <w:numFmt w:val="bullet"/>
-      <w:lvlText w:val=""/>
-      <w:lvlJc w:val="left"/>
-      <w:pPr>
-        <w:tabs>
-          <w:tab w:val="num" w:pos="3600"/>
-        </w:tabs>
-        <w:ind w:left="3600" w:hanging="360"/>
-      </w:pPr>
-      <w:rPr>
-        <w:rFonts w:ascii="Wingdings" w:hAnsi="Wingdings" w:hint="default"/>
-        <w:sz w:val="20"/>
-      </w:rPr>
-    </w:lvl>
-    <w:lvl w:ilvl="5" w:tentative="1">
-      <w:start w:val="1"/>
-      <w:numFmt w:val="bullet"/>
-      <w:lvlText w:val=""/>
-      <w:lvlJc w:val="left"/>
-      <w:pPr>
-        <w:tabs>
-          <w:tab w:val="num" w:pos="4320"/>
-        </w:tabs>
-        <w:ind w:left="4320" w:hanging="360"/>
-      </w:pPr>
-      <w:rPr>
-        <w:rFonts w:ascii="Wingdings" w:hAnsi="Wingdings" w:hint="default"/>
-        <w:sz w:val="20"/>
-      </w:rPr>
-    </w:lvl>
-    <w:lvl w:ilvl="6" w:tentative="1">
-      <w:start w:val="1"/>
-      <w:numFmt w:val="bullet"/>
-      <w:lvlText w:val=""/>
-      <w:lvlJc w:val="left"/>
-      <w:pPr>
-        <w:tabs>
-          <w:tab w:val="num" w:pos="5040"/>
-        </w:tabs>
-        <w:ind w:left="5040" w:hanging="360"/>
-      </w:pPr>
-      <w:rPr>
-        <w:rFonts w:ascii="Wingdings" w:hAnsi="Wingdings" w:hint="default"/>
-        <w:sz w:val="20"/>
-      </w:rPr>
-    </w:lvl>
-    <w:lvl w:ilvl="7" w:tentative="1">
-      <w:start w:val="1"/>
-      <w:numFmt w:val="bullet"/>
-      <w:lvlText w:val=""/>
-      <w:lvlJc w:val="left"/>
-      <w:pPr>
-        <w:tabs>
-          <w:tab w:val="num" w:pos="5760"/>
-        </w:tabs>
-        <w:ind w:left="5760" w:hanging="360"/>
-      </w:pPr>
-      <w:rPr>
-        <w:rFonts w:ascii="Wingdings" w:hAnsi="Wingdings" w:hint="default"/>
-        <w:sz w:val="20"/>
-      </w:rPr>
-    </w:lvl>
-    <w:lvl w:ilvl="8" w:tentative="1">
-      <w:start w:val="1"/>
-      <w:numFmt w:val="bullet"/>
-      <w:lvlText w:val=""/>
-      <w:lvlJc w:val="left"/>
-      <w:pPr>
-        <w:tabs>
-          <w:tab w:val="num" w:pos="6480"/>
-        </w:tabs>
-        <w:ind w:left="6480" w:hanging="360"/>
-      </w:pPr>
-      <w:rPr>
-        <w:rFonts w:ascii="Wingdings" w:hAnsi="Wingdings" w:hint="default"/>
-        <w:sz w:val="20"/>
-      </w:rPr>
-    </w:lvl>
-  </w:abstractNum>
-  <w:abstractNum w:abstractNumId="23" w15:restartNumberingAfterBreak="0">
-    <w:nsid w:val="7E375984"/>
-    <w:multiLevelType w:val="multilevel"/>
-    <w:tmpl w:val="CE702272"/>
-    <w:lvl w:ilvl="0">
-      <w:start w:val="1"/>
-      <w:numFmt w:val="bullet"/>
-      <w:lvlText w:val=""/>
-      <w:lvlJc w:val="left"/>
-      <w:pPr>
-        <w:tabs>
-          <w:tab w:val="num" w:pos="720"/>
-        </w:tabs>
-        <w:ind w:left="720" w:hanging="360"/>
-      </w:pPr>
-      <w:rPr>
-        <w:rFonts w:ascii="Symbol" w:hAnsi="Symbol" w:hint="default"/>
-        <w:sz w:val="20"/>
-      </w:rPr>
-    </w:lvl>
-    <w:lvl w:ilvl="1" w:tentative="1">
-      <w:start w:val="1"/>
-      <w:numFmt w:val="bullet"/>
-      <w:lvlText w:val="o"/>
-      <w:lvlJc w:val="left"/>
-      <w:pPr>
-        <w:tabs>
-          <w:tab w:val="num" w:pos="1440"/>
-        </w:tabs>
-        <w:ind w:left="1440" w:hanging="360"/>
-      </w:pPr>
-      <w:rPr>
-        <w:rFonts w:ascii="Courier New" w:hAnsi="Courier New" w:hint="default"/>
-        <w:sz w:val="20"/>
-      </w:rPr>
-    </w:lvl>
-    <w:lvl w:ilvl="2" w:tentative="1">
-      <w:start w:val="1"/>
-      <w:numFmt w:val="bullet"/>
-      <w:lvlText w:val=""/>
-      <w:lvlJc w:val="left"/>
-      <w:pPr>
-        <w:tabs>
-          <w:tab w:val="num" w:pos="2160"/>
-        </w:tabs>
-        <w:ind w:left="2160" w:hanging="360"/>
-      </w:pPr>
-      <w:rPr>
-        <w:rFonts w:ascii="Wingdings" w:hAnsi="Wingdings" w:hint="default"/>
-        <w:sz w:val="20"/>
-      </w:rPr>
-    </w:lvl>
-    <w:lvl w:ilvl="3" w:tentative="1">
-      <w:start w:val="1"/>
-      <w:numFmt w:val="bullet"/>
-      <w:lvlText w:val=""/>
-      <w:lvlJc w:val="left"/>
-      <w:pPr>
-        <w:tabs>
-          <w:tab w:val="num" w:pos="2880"/>
-        </w:tabs>
-        <w:ind w:left="2880" w:hanging="360"/>
-      </w:pPr>
-      <w:rPr>
-        <w:rFonts w:ascii="Wingdings" w:hAnsi="Wingdings" w:hint="default"/>
-        <w:sz w:val="20"/>
-      </w:rPr>
-    </w:lvl>
-    <w:lvl w:ilvl="4" w:tentative="1">
-      <w:start w:val="1"/>
-      <w:numFmt w:val="bullet"/>
-      <w:lvlText w:val=""/>
-      <w:lvlJc w:val="left"/>
-      <w:pPr>
-        <w:tabs>
-          <w:tab w:val="num" w:pos="3600"/>
-        </w:tabs>
-        <w:ind w:left="3600" w:hanging="360"/>
-      </w:pPr>
-      <w:rPr>
-        <w:rFonts w:ascii="Wingdings" w:hAnsi="Wingdings" w:hint="default"/>
-        <w:sz w:val="20"/>
-      </w:rPr>
-    </w:lvl>
-    <w:lvl w:ilvl="5" w:tentative="1">
-      <w:start w:val="1"/>
-      <w:numFmt w:val="bullet"/>
-      <w:lvlText w:val=""/>
-      <w:lvlJc w:val="left"/>
-      <w:pPr>
-        <w:tabs>
-          <w:tab w:val="num" w:pos="4320"/>
-        </w:tabs>
-        <w:ind w:left="4320" w:hanging="360"/>
-      </w:pPr>
-      <w:rPr>
-        <w:rFonts w:ascii="Wingdings" w:hAnsi="Wingdings" w:hint="default"/>
-        <w:sz w:val="20"/>
-      </w:rPr>
-    </w:lvl>
-    <w:lvl w:ilvl="6" w:tentative="1">
-      <w:start w:val="1"/>
-      <w:numFmt w:val="bullet"/>
-      <w:lvlText w:val=""/>
-      <w:lvlJc w:val="left"/>
-      <w:pPr>
-        <w:tabs>
-          <w:tab w:val="num" w:pos="5040"/>
-        </w:tabs>
-        <w:ind w:left="5040" w:hanging="360"/>
-      </w:pPr>
-      <w:rPr>
-        <w:rFonts w:ascii="Wingdings" w:hAnsi="Wingdings" w:hint="default"/>
-        <w:sz w:val="20"/>
-      </w:rPr>
-    </w:lvl>
-    <w:lvl w:ilvl="7" w:tentative="1">
-      <w:start w:val="1"/>
-      <w:numFmt w:val="bullet"/>
-      <w:lvlText w:val=""/>
-      <w:lvlJc w:val="left"/>
-      <w:pPr>
-        <w:tabs>
-          <w:tab w:val="num" w:pos="5760"/>
-        </w:tabs>
-        <w:ind w:left="5760" w:hanging="360"/>
-      </w:pPr>
-      <w:rPr>
-        <w:rFonts w:ascii="Wingdings" w:hAnsi="Wingdings" w:hint="default"/>
-        <w:sz w:val="20"/>
-      </w:rPr>
-    </w:lvl>
-    <w:lvl w:ilvl="8" w:tentative="1">
-      <w:start w:val="1"/>
-      <w:numFmt w:val="bullet"/>
-      <w:lvlText w:val=""/>
-      <w:lvlJc w:val="left"/>
-      <w:pPr>
-        <w:tabs>
-          <w:tab w:val="num" w:pos="6480"/>
-        </w:tabs>
-        <w:ind w:left="6480" w:hanging="360"/>
-      </w:pPr>
-      <w:rPr>
-        <w:rFonts w:ascii="Wingdings" w:hAnsi="Wingdings" w:hint="default"/>
-        <w:sz w:val="20"/>
-      </w:rPr>
-    </w:lvl>
-  </w:abstractNum>
-  <w:num w:numId="1" w16cid:durableId="469177503">
+  <w:num w:numId="1" w16cid:durableId="1207371244">
+    <w:abstractNumId w:val="6"/>
+  </w:num>
+  <w:num w:numId="2" w16cid:durableId="413285850">
+    <w:abstractNumId w:val="12"/>
+  </w:num>
+  <w:num w:numId="3" w16cid:durableId="823668740">
+    <w:abstractNumId w:val="2"/>
+  </w:num>
+  <w:num w:numId="4" w16cid:durableId="1755590055">
+    <w:abstractNumId w:val="15"/>
+  </w:num>
+  <w:num w:numId="5" w16cid:durableId="1806193208">
+    <w:abstractNumId w:val="1"/>
+  </w:num>
+  <w:num w:numId="6" w16cid:durableId="178544884">
+    <w:abstractNumId w:val="17"/>
+  </w:num>
+  <w:num w:numId="7" w16cid:durableId="271518866">
+    <w:abstractNumId w:val="8"/>
+  </w:num>
+  <w:num w:numId="8" w16cid:durableId="767391617">
+    <w:abstractNumId w:val="18"/>
+  </w:num>
+  <w:num w:numId="9" w16cid:durableId="1790976175">
+    <w:abstractNumId w:val="13"/>
+  </w:num>
+  <w:num w:numId="10" w16cid:durableId="880870378">
+    <w:abstractNumId w:val="0"/>
+  </w:num>
+  <w:num w:numId="11" w16cid:durableId="2054502459">
+    <w:abstractNumId w:val="16"/>
+  </w:num>
+  <w:num w:numId="12" w16cid:durableId="818692916">
+    <w:abstractNumId w:val="20"/>
+  </w:num>
+  <w:num w:numId="13" w16cid:durableId="771432570">
     <w:abstractNumId w:val="19"/>
   </w:num>
-  <w:num w:numId="2" w16cid:durableId="2010257221">
+  <w:num w:numId="14" w16cid:durableId="555512529">
+    <w:abstractNumId w:val="4"/>
+  </w:num>
+  <w:num w:numId="15" w16cid:durableId="1020275215">
+    <w:abstractNumId w:val="23"/>
+  </w:num>
+  <w:num w:numId="16" w16cid:durableId="1504971215">
+    <w:abstractNumId w:val="9"/>
+  </w:num>
+  <w:num w:numId="17" w16cid:durableId="492110232">
+    <w:abstractNumId w:val="22"/>
+  </w:num>
+  <w:num w:numId="18" w16cid:durableId="580603300">
+    <w:abstractNumId w:val="10"/>
+  </w:num>
+  <w:num w:numId="19" w16cid:durableId="343551596">
     <w:abstractNumId w:val="14"/>
   </w:num>
-  <w:num w:numId="3" w16cid:durableId="2144304891">
-    <w:abstractNumId w:val="12"/>
+  <w:num w:numId="20" w16cid:durableId="569728410">
+    <w:abstractNumId w:val="3"/>
   </w:num>
-  <w:num w:numId="4" w16cid:durableId="1463498019">
-    <w:abstractNumId w:val="8"/>
+  <w:num w:numId="21" w16cid:durableId="1706371676">
+    <w:abstractNumId w:val="7"/>
   </w:num>
-  <w:num w:numId="5" w16cid:durableId="122963397">
-    <w:abstractNumId w:val="10"/>
-  </w:num>
-  <w:num w:numId="6" w16cid:durableId="1096561021">
-    <w:abstractNumId w:val="13"/>
-  </w:num>
-  <w:num w:numId="7" w16cid:durableId="352338745">
+  <w:num w:numId="22" w16cid:durableId="132603340">
     <w:abstractNumId w:val="11"/>
   </w:num>
-  <w:num w:numId="8" w16cid:durableId="1235968277">
-    <w:abstractNumId w:val="3"/>
-  </w:num>
-  <w:num w:numId="9" w16cid:durableId="1186820558">
-    <w:abstractNumId w:val="4"/>
-  </w:num>
-  <w:num w:numId="10" w16cid:durableId="1160392483">
-    <w:abstractNumId w:val="7"/>
-  </w:num>
-  <w:num w:numId="11" w16cid:durableId="1650161811">
-    <w:abstractNumId w:val="2"/>
-  </w:num>
-  <w:num w:numId="12" w16cid:durableId="1882857940">
-    <w:abstractNumId w:val="20"/>
-  </w:num>
-  <w:num w:numId="13" w16cid:durableId="390352338">
-    <w:abstractNumId w:val="22"/>
-  </w:num>
-  <w:num w:numId="14" w16cid:durableId="1289360721">
+  <w:num w:numId="23" w16cid:durableId="290792279">
     <w:abstractNumId w:val="5"/>
   </w:num>
-  <w:num w:numId="15" w16cid:durableId="431243867">
-    <w:abstractNumId w:val="1"/>
-  </w:num>
-  <w:num w:numId="16" w16cid:durableId="1561551493">
-    <w:abstractNumId w:val="16"/>
-  </w:num>
-  <w:num w:numId="17" w16cid:durableId="134221150">
-    <w:abstractNumId w:val="15"/>
-  </w:num>
-  <w:num w:numId="18" w16cid:durableId="646593038">
-    <w:abstractNumId w:val="0"/>
-  </w:num>
-  <w:num w:numId="19" w16cid:durableId="332339844">
-    <w:abstractNumId w:val="17"/>
-  </w:num>
-  <w:num w:numId="20" w16cid:durableId="1877814506">
-    <w:abstractNumId w:val="23"/>
-  </w:num>
-  <w:num w:numId="21" w16cid:durableId="896159451">
-    <w:abstractNumId w:val="9"/>
-  </w:num>
-  <w:num w:numId="22" w16cid:durableId="1972513066">
-    <w:abstractNumId w:val="18"/>
-  </w:num>
-  <w:num w:numId="23" w16cid:durableId="1864199730">
+  <w:num w:numId="24" w16cid:durableId="16657545">
     <w:abstractNumId w:val="21"/>
-  </w:num>
-  <w:num w:numId="24" w16cid:durableId="1100568857">
-    <w:abstractNumId w:val="6"/>
   </w:num>
 </w:numbering>
 </file>

</xml_diff>

<commit_message>
deck, follow-along, handouts: Operate trimmed (drive fault and intent drift out, node-loss animation stays), Site Recovery in two parts, card layouts; src/design: the IIC Trailwright example with neutral values; follow-along paths point at the automation folders
</commit_message>
<xml_diff>
--- a/follow-along/Azure_Local_Follow_Along_Guide.docx
+++ b/follow-along/Azure_Local_Follow_Along_Guide.docx
@@ -1476,7 +1476,7 @@
           <w:szCs w:val="21"/>
           <w:lang w:val="en"/>
         </w:rPr>
-        <w:t>The IIC Trailwright project from the repo (src/design/trailwright-iic-example.trailwright.json), the same file the presenter opens; or your own design values</w:t>
+        <w:t>The IIC Trailwright project from the repo (src/design/trailwright-iic.example.trailwright.json), the same file the presenter opens; or your own design values</w:t>
       </w:r>
     </w:p>
     <w:p>
@@ -1536,7 +1536,7 @@
           <w:szCs w:val="21"/>
           <w:lang w:val="en"/>
         </w:rPr>
-        <w:t xml:space="preserve"> Open Azure Local Trailwright (labs.hybridsolutions.cloud/azurelocal-trailwright) and open the IIC project file from the repo (src/design/trailwright-iic-example.trailwright.json). To use your own design instead, start a new project with a connected, hyperconverged deployment of two machines. </w:t>
+        <w:t xml:space="preserve"> Open Azure Local Trailwright (labs.hybridsolutions.cloud/azurelocal-trailwright) and open the IIC project file from the repo (src/design/trailwright-iic.example.trailwright.json). To use your own design instead, start a new project with a connected, hyperconverged deployment of two machines. </w:t>
       </w:r>
     </w:p>
     <w:p>
@@ -2992,7 +2992,7 @@
           <w:color w:val="1B2430"/>
           <w:lang w:val="en"/>
         </w:rPr>
-        <w:t>automation/azure-local/cluster-deploy/bicep</w:t>
+        <w:t>automation/azure-local/cluster-deploy</w:t>
       </w:r>
     </w:p>
     <w:p>
@@ -4098,6 +4098,24 @@
         </w:rPr>
         <w:t>automation/azure-local/cluster-configure/monitoring</w:t>
       </w:r>
+      <w:r>
+        <w:rPr>
+          <w:rFonts w:ascii="Segoe UI" w:hAnsi="Segoe UI" w:cs="Segoe UI"/>
+          <w:color w:val="1B2430"/>
+          <w:sz w:val="21"/>
+          <w:szCs w:val="21"/>
+          <w:lang w:val="en"/>
+        </w:rPr>
+        <w:t xml:space="preserve">, </w:t>
+      </w:r>
+      <w:r>
+        <w:rPr>
+          <w:rStyle w:val="HTMLCode"/>
+          <w:color w:val="1B2430"/>
+          <w:lang w:val="en"/>
+        </w:rPr>
+        <w:t>handouts/Day2_Readiness_Checklist.md</w:t>
+      </w:r>
     </w:p>
     <w:p>
       <w:pPr>
@@ -5618,6 +5636,47 @@
     </w:p>
     <w:p>
       <w:pPr>
+        <w:pStyle w:val="NormalWeb"/>
+        <w:rPr>
+          <w:rFonts w:ascii="Segoe UI" w:hAnsi="Segoe UI" w:cs="Segoe UI"/>
+          <w:color w:val="1B2430"/>
+          <w:sz w:val="21"/>
+          <w:szCs w:val="21"/>
+          <w:lang w:val="en"/>
+        </w:rPr>
+      </w:pPr>
+      <w:r>
+        <w:rPr>
+          <w:rStyle w:val="Strong"/>
+          <w:rFonts w:ascii="Segoe UI" w:hAnsi="Segoe UI" w:cs="Segoe UI"/>
+          <w:color w:val="1B2430"/>
+          <w:sz w:val="21"/>
+          <w:szCs w:val="21"/>
+          <w:lang w:val="en"/>
+        </w:rPr>
+        <w:t>In the repo:</w:t>
+      </w:r>
+      <w:r>
+        <w:rPr>
+          <w:rFonts w:ascii="Segoe UI" w:hAnsi="Segoe UI" w:cs="Segoe UI"/>
+          <w:color w:val="1B2430"/>
+          <w:sz w:val="21"/>
+          <w:szCs w:val="21"/>
+          <w:lang w:val="en"/>
+        </w:rPr>
+        <w:t xml:space="preserve"> </w:t>
+      </w:r>
+      <w:r>
+        <w:rPr>
+          <w:rStyle w:val="HTMLCode"/>
+          <w:color w:val="1B2430"/>
+          <w:lang w:val="en"/>
+        </w:rPr>
+        <w:t>handouts/Day2_Operations_Runbook.md</w:t>
+      </w:r>
+    </w:p>
+    <w:p>
+      <w:pPr>
         <w:pStyle w:val="Heading3"/>
         <w:rPr>
           <w:rFonts w:ascii="Segoe UI" w:eastAsia="Times New Roman" w:hAnsi="Segoe UI" w:cs="Segoe UI"/>
@@ -6450,17 +6509,7 @@
           <w:szCs w:val="21"/>
           <w:lang w:val="en"/>
         </w:rPr>
-        <w:t xml:space="preserve"> </w:t>
-      </w:r>
-      <w:r>
-        <w:rPr>
-          <w:rFonts w:ascii="Segoe UI" w:hAnsi="Segoe UI" w:cs="Segoe UI"/>
-          <w:color w:val="1B2430"/>
-          <w:sz w:val="21"/>
-          <w:szCs w:val="21"/>
-          <w:lang w:val="en"/>
-        </w:rPr>
-        <w:t>Faults are run only on the lab cluster.</w:t>
+        <w:t xml:space="preserve"> Faults are run only on the lab cluster.</w:t>
       </w:r>
     </w:p>
     <w:p>
@@ -6517,9 +6566,9 @@
 <file path=word/numbering.xml><?xml version="1.0" encoding="utf-8"?>
 <w:numbering xmlns:wpc="http://schemas.microsoft.com/office/word/2010/wordprocessingCanvas" xmlns:cx="http://schemas.microsoft.com/office/drawing/2014/chartex" xmlns:cx1="http://schemas.microsoft.com/office/drawing/2015/9/8/chartex" xmlns:cx2="http://schemas.microsoft.com/office/drawing/2015/10/21/chartex" xmlns:cx3="http://schemas.microsoft.com/office/drawing/2016/5/9/chartex" xmlns:cx4="http://schemas.microsoft.com/office/drawing/2016/5/10/chartex" xmlns:cx5="http://schemas.microsoft.com/office/drawing/2016/5/11/chartex" xmlns:cx6="http://schemas.microsoft.com/office/drawing/2016/5/12/chartex" xmlns:cx7="http://schemas.microsoft.com/office/drawing/2016/5/13/chartex" xmlns:cx8="http://schemas.microsoft.com/office/drawing/2016/5/14/chartex" xmlns:mc="http://schemas.openxmlformats.org/markup-compatibility/2006" xmlns:aink="http://schemas.microsoft.com/office/drawing/2016/ink" xmlns:am3d="http://schemas.microsoft.com/office/drawing/2017/model3d" xmlns:o="urn:schemas-microsoft-com:office:office" xmlns:oel="http://schemas.microsoft.com/office/2019/extlst" xmlns:r="http://schemas.openxmlformats.org/officeDocument/2006/relationships" xmlns:m="http://schemas.openxmlformats.org/officeDocument/2006/math" xmlns:v="urn:schemas-microsoft-com:vml" xmlns:wp14="http://schemas.microsoft.com/office/word/2010/wordprocessingDrawing" xmlns:wp="http://schemas.openxmlformats.org/drawingml/2006/wordprocessingDrawing" xmlns:w10="urn:schemas-microsoft-com:office:word" xmlns:w="http://schemas.openxmlformats.org/wordprocessingml/2006/main" xmlns:w14="http://schemas.microsoft.com/office/word/2010/wordml" xmlns:w15="http://schemas.microsoft.com/office/word/2012/wordml" xmlns:w16cex="http://schemas.microsoft.com/office/word/2018/wordml/cex" xmlns:w16cid="http://schemas.microsoft.com/office/word/2016/wordml/cid" xmlns:w16="http://schemas.microsoft.com/office/word/2018/wordml" xmlns:w16du="http://schemas.microsoft.com/office/word/2023/wordml/word16du" xmlns:w16sdtdh="http://schemas.microsoft.com/office/word/2020/wordml/sdtdatahash" xmlns:w16sdtfl="http://schemas.microsoft.com/office/word/2024/wordml/sdtformatlock" xmlns:w16se="http://schemas.microsoft.com/office/word/2015/wordml/symex" xmlns:wpg="http://schemas.microsoft.com/office/word/2010/wordprocessingGroup" xmlns:wpi="http://schemas.microsoft.com/office/word/2010/wordprocessingInk" xmlns:wne="http://schemas.microsoft.com/office/word/2006/wordml" xmlns:wps="http://schemas.microsoft.com/office/word/2010/wordprocessingShape" mc:Ignorable="w14 w15 w16se w16cid w16 w16cex w16sdtdh w16sdtfl w16du wp14">
   <w:abstractNum w:abstractNumId="0" w15:restartNumberingAfterBreak="0">
-    <w:nsid w:val="09B33F6C"/>
+    <w:nsid w:val="053F7C9C"/>
     <w:multiLevelType w:val="multilevel"/>
-    <w:tmpl w:val="BF4655FE"/>
+    <w:tmpl w:val="98D4951A"/>
     <w:lvl w:ilvl="0">
       <w:start w:val="1"/>
       <w:numFmt w:val="decimal"/>
@@ -6634,13 +6683,13 @@
     </w:lvl>
   </w:abstractNum>
   <w:abstractNum w:abstractNumId="1" w15:restartNumberingAfterBreak="0">
-    <w:nsid w:val="0BEF6E73"/>
+    <w:nsid w:val="0B0854B1"/>
     <w:multiLevelType w:val="multilevel"/>
-    <w:tmpl w:val="1F30E01A"/>
+    <w:tmpl w:val="91305C00"/>
     <w:lvl w:ilvl="0">
       <w:start w:val="1"/>
-      <w:numFmt w:val="bullet"/>
-      <w:lvlText w:val=""/>
+      <w:numFmt w:val="decimal"/>
+      <w:lvlText w:val="%1."/>
       <w:lvlJc w:val="left"/>
       <w:pPr>
         <w:tabs>
@@ -6648,12 +6697,8 @@
         </w:tabs>
         <w:ind w:left="720" w:hanging="360"/>
       </w:pPr>
-      <w:rPr>
-        <w:rFonts w:ascii="Symbol" w:hAnsi="Symbol" w:hint="default"/>
-        <w:sz w:val="20"/>
-      </w:rPr>
-    </w:lvl>
-    <w:lvl w:ilvl="1" w:tentative="1">
+    </w:lvl>
+    <w:lvl w:ilvl="1">
       <w:start w:val="1"/>
       <w:numFmt w:val="bullet"/>
       <w:lvlText w:val="o"/>
@@ -6671,8 +6716,8 @@
     </w:lvl>
     <w:lvl w:ilvl="2" w:tentative="1">
       <w:start w:val="1"/>
-      <w:numFmt w:val="bullet"/>
-      <w:lvlText w:val=""/>
+      <w:numFmt w:val="decimal"/>
+      <w:lvlText w:val="%3."/>
       <w:lvlJc w:val="left"/>
       <w:pPr>
         <w:tabs>
@@ -6680,15 +6725,11 @@
         </w:tabs>
         <w:ind w:left="2160" w:hanging="360"/>
       </w:pPr>
-      <w:rPr>
-        <w:rFonts w:ascii="Wingdings" w:hAnsi="Wingdings" w:hint="default"/>
-        <w:sz w:val="20"/>
-      </w:rPr>
     </w:lvl>
     <w:lvl w:ilvl="3" w:tentative="1">
       <w:start w:val="1"/>
-      <w:numFmt w:val="bullet"/>
-      <w:lvlText w:val=""/>
+      <w:numFmt w:val="decimal"/>
+      <w:lvlText w:val="%4."/>
       <w:lvlJc w:val="left"/>
       <w:pPr>
         <w:tabs>
@@ -6696,15 +6737,11 @@
         </w:tabs>
         <w:ind w:left="2880" w:hanging="360"/>
       </w:pPr>
-      <w:rPr>
-        <w:rFonts w:ascii="Wingdings" w:hAnsi="Wingdings" w:hint="default"/>
-        <w:sz w:val="20"/>
-      </w:rPr>
     </w:lvl>
     <w:lvl w:ilvl="4" w:tentative="1">
       <w:start w:val="1"/>
-      <w:numFmt w:val="bullet"/>
-      <w:lvlText w:val=""/>
+      <w:numFmt w:val="decimal"/>
+      <w:lvlText w:val="%5."/>
       <w:lvlJc w:val="left"/>
       <w:pPr>
         <w:tabs>
@@ -6712,15 +6749,11 @@
         </w:tabs>
         <w:ind w:left="3600" w:hanging="360"/>
       </w:pPr>
-      <w:rPr>
-        <w:rFonts w:ascii="Wingdings" w:hAnsi="Wingdings" w:hint="default"/>
-        <w:sz w:val="20"/>
-      </w:rPr>
     </w:lvl>
     <w:lvl w:ilvl="5" w:tentative="1">
       <w:start w:val="1"/>
-      <w:numFmt w:val="bullet"/>
-      <w:lvlText w:val=""/>
+      <w:numFmt w:val="decimal"/>
+      <w:lvlText w:val="%6."/>
       <w:lvlJc w:val="left"/>
       <w:pPr>
         <w:tabs>
@@ -6728,15 +6761,11 @@
         </w:tabs>
         <w:ind w:left="4320" w:hanging="360"/>
       </w:pPr>
-      <w:rPr>
-        <w:rFonts w:ascii="Wingdings" w:hAnsi="Wingdings" w:hint="default"/>
-        <w:sz w:val="20"/>
-      </w:rPr>
     </w:lvl>
     <w:lvl w:ilvl="6" w:tentative="1">
       <w:start w:val="1"/>
-      <w:numFmt w:val="bullet"/>
-      <w:lvlText w:val=""/>
+      <w:numFmt w:val="decimal"/>
+      <w:lvlText w:val="%7."/>
       <w:lvlJc w:val="left"/>
       <w:pPr>
         <w:tabs>
@@ -6744,15 +6773,11 @@
         </w:tabs>
         <w:ind w:left="5040" w:hanging="360"/>
       </w:pPr>
-      <w:rPr>
-        <w:rFonts w:ascii="Wingdings" w:hAnsi="Wingdings" w:hint="default"/>
-        <w:sz w:val="20"/>
-      </w:rPr>
     </w:lvl>
     <w:lvl w:ilvl="7" w:tentative="1">
       <w:start w:val="1"/>
-      <w:numFmt w:val="bullet"/>
-      <w:lvlText w:val=""/>
+      <w:numFmt w:val="decimal"/>
+      <w:lvlText w:val="%8."/>
       <w:lvlJc w:val="left"/>
       <w:pPr>
         <w:tabs>
@@ -6760,15 +6785,11 @@
         </w:tabs>
         <w:ind w:left="5760" w:hanging="360"/>
       </w:pPr>
-      <w:rPr>
-        <w:rFonts w:ascii="Wingdings" w:hAnsi="Wingdings" w:hint="default"/>
-        <w:sz w:val="20"/>
-      </w:rPr>
     </w:lvl>
     <w:lvl w:ilvl="8" w:tentative="1">
       <w:start w:val="1"/>
-      <w:numFmt w:val="bullet"/>
-      <w:lvlText w:val=""/>
+      <w:numFmt w:val="decimal"/>
+      <w:lvlText w:val="%9."/>
       <w:lvlJc w:val="left"/>
       <w:pPr>
         <w:tabs>
@@ -6776,16 +6797,161 @@
         </w:tabs>
         <w:ind w:left="6480" w:hanging="360"/>
       </w:pPr>
-      <w:rPr>
-        <w:rFonts w:ascii="Wingdings" w:hAnsi="Wingdings" w:hint="default"/>
-        <w:sz w:val="20"/>
-      </w:rPr>
     </w:lvl>
   </w:abstractNum>
   <w:abstractNum w:abstractNumId="2" w15:restartNumberingAfterBreak="0">
-    <w:nsid w:val="0D552ACB"/>
+    <w:nsid w:val="101533D6"/>
     <w:multiLevelType w:val="multilevel"/>
-    <w:tmpl w:val="EE48D34A"/>
+    <w:tmpl w:val="18DE4718"/>
+    <w:lvl w:ilvl="0">
+      <w:start w:val="1"/>
+      <w:numFmt w:val="bullet"/>
+      <w:lvlText w:val=""/>
+      <w:lvlJc w:val="left"/>
+      <w:pPr>
+        <w:tabs>
+          <w:tab w:val="num" w:pos="720"/>
+        </w:tabs>
+        <w:ind w:left="720" w:hanging="360"/>
+      </w:pPr>
+      <w:rPr>
+        <w:rFonts w:ascii="Symbol" w:hAnsi="Symbol" w:hint="default"/>
+        <w:sz w:val="20"/>
+      </w:rPr>
+    </w:lvl>
+    <w:lvl w:ilvl="1" w:tentative="1">
+      <w:start w:val="1"/>
+      <w:numFmt w:val="bullet"/>
+      <w:lvlText w:val="o"/>
+      <w:lvlJc w:val="left"/>
+      <w:pPr>
+        <w:tabs>
+          <w:tab w:val="num" w:pos="1440"/>
+        </w:tabs>
+        <w:ind w:left="1440" w:hanging="360"/>
+      </w:pPr>
+      <w:rPr>
+        <w:rFonts w:ascii="Courier New" w:hAnsi="Courier New" w:hint="default"/>
+        <w:sz w:val="20"/>
+      </w:rPr>
+    </w:lvl>
+    <w:lvl w:ilvl="2" w:tentative="1">
+      <w:start w:val="1"/>
+      <w:numFmt w:val="bullet"/>
+      <w:lvlText w:val=""/>
+      <w:lvlJc w:val="left"/>
+      <w:pPr>
+        <w:tabs>
+          <w:tab w:val="num" w:pos="2160"/>
+        </w:tabs>
+        <w:ind w:left="2160" w:hanging="360"/>
+      </w:pPr>
+      <w:rPr>
+        <w:rFonts w:ascii="Wingdings" w:hAnsi="Wingdings" w:hint="default"/>
+        <w:sz w:val="20"/>
+      </w:rPr>
+    </w:lvl>
+    <w:lvl w:ilvl="3" w:tentative="1">
+      <w:start w:val="1"/>
+      <w:numFmt w:val="bullet"/>
+      <w:lvlText w:val=""/>
+      <w:lvlJc w:val="left"/>
+      <w:pPr>
+        <w:tabs>
+          <w:tab w:val="num" w:pos="2880"/>
+        </w:tabs>
+        <w:ind w:left="2880" w:hanging="360"/>
+      </w:pPr>
+      <w:rPr>
+        <w:rFonts w:ascii="Wingdings" w:hAnsi="Wingdings" w:hint="default"/>
+        <w:sz w:val="20"/>
+      </w:rPr>
+    </w:lvl>
+    <w:lvl w:ilvl="4" w:tentative="1">
+      <w:start w:val="1"/>
+      <w:numFmt w:val="bullet"/>
+      <w:lvlText w:val=""/>
+      <w:lvlJc w:val="left"/>
+      <w:pPr>
+        <w:tabs>
+          <w:tab w:val="num" w:pos="3600"/>
+        </w:tabs>
+        <w:ind w:left="3600" w:hanging="360"/>
+      </w:pPr>
+      <w:rPr>
+        <w:rFonts w:ascii="Wingdings" w:hAnsi="Wingdings" w:hint="default"/>
+        <w:sz w:val="20"/>
+      </w:rPr>
+    </w:lvl>
+    <w:lvl w:ilvl="5" w:tentative="1">
+      <w:start w:val="1"/>
+      <w:numFmt w:val="bullet"/>
+      <w:lvlText w:val=""/>
+      <w:lvlJc w:val="left"/>
+      <w:pPr>
+        <w:tabs>
+          <w:tab w:val="num" w:pos="4320"/>
+        </w:tabs>
+        <w:ind w:left="4320" w:hanging="360"/>
+      </w:pPr>
+      <w:rPr>
+        <w:rFonts w:ascii="Wingdings" w:hAnsi="Wingdings" w:hint="default"/>
+        <w:sz w:val="20"/>
+      </w:rPr>
+    </w:lvl>
+    <w:lvl w:ilvl="6" w:tentative="1">
+      <w:start w:val="1"/>
+      <w:numFmt w:val="bullet"/>
+      <w:lvlText w:val=""/>
+      <w:lvlJc w:val="left"/>
+      <w:pPr>
+        <w:tabs>
+          <w:tab w:val="num" w:pos="5040"/>
+        </w:tabs>
+        <w:ind w:left="5040" w:hanging="360"/>
+      </w:pPr>
+      <w:rPr>
+        <w:rFonts w:ascii="Wingdings" w:hAnsi="Wingdings" w:hint="default"/>
+        <w:sz w:val="20"/>
+      </w:rPr>
+    </w:lvl>
+    <w:lvl w:ilvl="7" w:tentative="1">
+      <w:start w:val="1"/>
+      <w:numFmt w:val="bullet"/>
+      <w:lvlText w:val=""/>
+      <w:lvlJc w:val="left"/>
+      <w:pPr>
+        <w:tabs>
+          <w:tab w:val="num" w:pos="5760"/>
+        </w:tabs>
+        <w:ind w:left="5760" w:hanging="360"/>
+      </w:pPr>
+      <w:rPr>
+        <w:rFonts w:ascii="Wingdings" w:hAnsi="Wingdings" w:hint="default"/>
+        <w:sz w:val="20"/>
+      </w:rPr>
+    </w:lvl>
+    <w:lvl w:ilvl="8" w:tentative="1">
+      <w:start w:val="1"/>
+      <w:numFmt w:val="bullet"/>
+      <w:lvlText w:val=""/>
+      <w:lvlJc w:val="left"/>
+      <w:pPr>
+        <w:tabs>
+          <w:tab w:val="num" w:pos="6480"/>
+        </w:tabs>
+        <w:ind w:left="6480" w:hanging="360"/>
+      </w:pPr>
+      <w:rPr>
+        <w:rFonts w:ascii="Wingdings" w:hAnsi="Wingdings" w:hint="default"/>
+        <w:sz w:val="20"/>
+      </w:rPr>
+    </w:lvl>
+  </w:abstractNum>
+  <w:abstractNum w:abstractNumId="3" w15:restartNumberingAfterBreak="0">
+    <w:nsid w:val="11A630B8"/>
+    <w:multiLevelType w:val="multilevel"/>
+    <w:tmpl w:val="7A9ADCC6"/>
     <w:lvl w:ilvl="0">
       <w:start w:val="1"/>
       <w:numFmt w:val="decimal"/>
@@ -6899,10 +7065,10 @@
       </w:pPr>
     </w:lvl>
   </w:abstractNum>
-  <w:abstractNum w:abstractNumId="3" w15:restartNumberingAfterBreak="0">
-    <w:nsid w:val="16D11825"/>
+  <w:abstractNum w:abstractNumId="4" w15:restartNumberingAfterBreak="0">
+    <w:nsid w:val="18041631"/>
     <w:multiLevelType w:val="multilevel"/>
-    <w:tmpl w:val="EFF8A8B8"/>
+    <w:tmpl w:val="FF946648"/>
     <w:lvl w:ilvl="0">
       <w:start w:val="1"/>
       <w:numFmt w:val="bullet"/>
@@ -7048,10 +7214,606 @@
       </w:rPr>
     </w:lvl>
   </w:abstractNum>
-  <w:abstractNum w:abstractNumId="4" w15:restartNumberingAfterBreak="0">
-    <w:nsid w:val="1D6E45AA"/>
+  <w:abstractNum w:abstractNumId="5" w15:restartNumberingAfterBreak="0">
+    <w:nsid w:val="1AF862DE"/>
     <w:multiLevelType w:val="multilevel"/>
-    <w:tmpl w:val="AFA62596"/>
+    <w:tmpl w:val="6E74E6C6"/>
+    <w:lvl w:ilvl="0">
+      <w:start w:val="1"/>
+      <w:numFmt w:val="bullet"/>
+      <w:lvlText w:val=""/>
+      <w:lvlJc w:val="left"/>
+      <w:pPr>
+        <w:tabs>
+          <w:tab w:val="num" w:pos="720"/>
+        </w:tabs>
+        <w:ind w:left="720" w:hanging="360"/>
+      </w:pPr>
+      <w:rPr>
+        <w:rFonts w:ascii="Symbol" w:hAnsi="Symbol" w:hint="default"/>
+        <w:sz w:val="20"/>
+      </w:rPr>
+    </w:lvl>
+    <w:lvl w:ilvl="1" w:tentative="1">
+      <w:start w:val="1"/>
+      <w:numFmt w:val="bullet"/>
+      <w:lvlText w:val="o"/>
+      <w:lvlJc w:val="left"/>
+      <w:pPr>
+        <w:tabs>
+          <w:tab w:val="num" w:pos="1440"/>
+        </w:tabs>
+        <w:ind w:left="1440" w:hanging="360"/>
+      </w:pPr>
+      <w:rPr>
+        <w:rFonts w:ascii="Courier New" w:hAnsi="Courier New" w:hint="default"/>
+        <w:sz w:val="20"/>
+      </w:rPr>
+    </w:lvl>
+    <w:lvl w:ilvl="2" w:tentative="1">
+      <w:start w:val="1"/>
+      <w:numFmt w:val="bullet"/>
+      <w:lvlText w:val=""/>
+      <w:lvlJc w:val="left"/>
+      <w:pPr>
+        <w:tabs>
+          <w:tab w:val="num" w:pos="2160"/>
+        </w:tabs>
+        <w:ind w:left="2160" w:hanging="360"/>
+      </w:pPr>
+      <w:rPr>
+        <w:rFonts w:ascii="Wingdings" w:hAnsi="Wingdings" w:hint="default"/>
+        <w:sz w:val="20"/>
+      </w:rPr>
+    </w:lvl>
+    <w:lvl w:ilvl="3" w:tentative="1">
+      <w:start w:val="1"/>
+      <w:numFmt w:val="bullet"/>
+      <w:lvlText w:val=""/>
+      <w:lvlJc w:val="left"/>
+      <w:pPr>
+        <w:tabs>
+          <w:tab w:val="num" w:pos="2880"/>
+        </w:tabs>
+        <w:ind w:left="2880" w:hanging="360"/>
+      </w:pPr>
+      <w:rPr>
+        <w:rFonts w:ascii="Wingdings" w:hAnsi="Wingdings" w:hint="default"/>
+        <w:sz w:val="20"/>
+      </w:rPr>
+    </w:lvl>
+    <w:lvl w:ilvl="4" w:tentative="1">
+      <w:start w:val="1"/>
+      <w:numFmt w:val="bullet"/>
+      <w:lvlText w:val=""/>
+      <w:lvlJc w:val="left"/>
+      <w:pPr>
+        <w:tabs>
+          <w:tab w:val="num" w:pos="3600"/>
+        </w:tabs>
+        <w:ind w:left="3600" w:hanging="360"/>
+      </w:pPr>
+      <w:rPr>
+        <w:rFonts w:ascii="Wingdings" w:hAnsi="Wingdings" w:hint="default"/>
+        <w:sz w:val="20"/>
+      </w:rPr>
+    </w:lvl>
+    <w:lvl w:ilvl="5" w:tentative="1">
+      <w:start w:val="1"/>
+      <w:numFmt w:val="bullet"/>
+      <w:lvlText w:val=""/>
+      <w:lvlJc w:val="left"/>
+      <w:pPr>
+        <w:tabs>
+          <w:tab w:val="num" w:pos="4320"/>
+        </w:tabs>
+        <w:ind w:left="4320" w:hanging="360"/>
+      </w:pPr>
+      <w:rPr>
+        <w:rFonts w:ascii="Wingdings" w:hAnsi="Wingdings" w:hint="default"/>
+        <w:sz w:val="20"/>
+      </w:rPr>
+    </w:lvl>
+    <w:lvl w:ilvl="6" w:tentative="1">
+      <w:start w:val="1"/>
+      <w:numFmt w:val="bullet"/>
+      <w:lvlText w:val=""/>
+      <w:lvlJc w:val="left"/>
+      <w:pPr>
+        <w:tabs>
+          <w:tab w:val="num" w:pos="5040"/>
+        </w:tabs>
+        <w:ind w:left="5040" w:hanging="360"/>
+      </w:pPr>
+      <w:rPr>
+        <w:rFonts w:ascii="Wingdings" w:hAnsi="Wingdings" w:hint="default"/>
+        <w:sz w:val="20"/>
+      </w:rPr>
+    </w:lvl>
+    <w:lvl w:ilvl="7" w:tentative="1">
+      <w:start w:val="1"/>
+      <w:numFmt w:val="bullet"/>
+      <w:lvlText w:val=""/>
+      <w:lvlJc w:val="left"/>
+      <w:pPr>
+        <w:tabs>
+          <w:tab w:val="num" w:pos="5760"/>
+        </w:tabs>
+        <w:ind w:left="5760" w:hanging="360"/>
+      </w:pPr>
+      <w:rPr>
+        <w:rFonts w:ascii="Wingdings" w:hAnsi="Wingdings" w:hint="default"/>
+        <w:sz w:val="20"/>
+      </w:rPr>
+    </w:lvl>
+    <w:lvl w:ilvl="8" w:tentative="1">
+      <w:start w:val="1"/>
+      <w:numFmt w:val="bullet"/>
+      <w:lvlText w:val=""/>
+      <w:lvlJc w:val="left"/>
+      <w:pPr>
+        <w:tabs>
+          <w:tab w:val="num" w:pos="6480"/>
+        </w:tabs>
+        <w:ind w:left="6480" w:hanging="360"/>
+      </w:pPr>
+      <w:rPr>
+        <w:rFonts w:ascii="Wingdings" w:hAnsi="Wingdings" w:hint="default"/>
+        <w:sz w:val="20"/>
+      </w:rPr>
+    </w:lvl>
+  </w:abstractNum>
+  <w:abstractNum w:abstractNumId="6" w15:restartNumberingAfterBreak="0">
+    <w:nsid w:val="1F9D01A7"/>
+    <w:multiLevelType w:val="multilevel"/>
+    <w:tmpl w:val="49746FA2"/>
+    <w:lvl w:ilvl="0">
+      <w:start w:val="1"/>
+      <w:numFmt w:val="bullet"/>
+      <w:lvlText w:val=""/>
+      <w:lvlJc w:val="left"/>
+      <w:pPr>
+        <w:tabs>
+          <w:tab w:val="num" w:pos="720"/>
+        </w:tabs>
+        <w:ind w:left="720" w:hanging="360"/>
+      </w:pPr>
+      <w:rPr>
+        <w:rFonts w:ascii="Symbol" w:hAnsi="Symbol" w:hint="default"/>
+        <w:sz w:val="20"/>
+      </w:rPr>
+    </w:lvl>
+    <w:lvl w:ilvl="1" w:tentative="1">
+      <w:start w:val="1"/>
+      <w:numFmt w:val="bullet"/>
+      <w:lvlText w:val="o"/>
+      <w:lvlJc w:val="left"/>
+      <w:pPr>
+        <w:tabs>
+          <w:tab w:val="num" w:pos="1440"/>
+        </w:tabs>
+        <w:ind w:left="1440" w:hanging="360"/>
+      </w:pPr>
+      <w:rPr>
+        <w:rFonts w:ascii="Courier New" w:hAnsi="Courier New" w:hint="default"/>
+        <w:sz w:val="20"/>
+      </w:rPr>
+    </w:lvl>
+    <w:lvl w:ilvl="2" w:tentative="1">
+      <w:start w:val="1"/>
+      <w:numFmt w:val="bullet"/>
+      <w:lvlText w:val=""/>
+      <w:lvlJc w:val="left"/>
+      <w:pPr>
+        <w:tabs>
+          <w:tab w:val="num" w:pos="2160"/>
+        </w:tabs>
+        <w:ind w:left="2160" w:hanging="360"/>
+      </w:pPr>
+      <w:rPr>
+        <w:rFonts w:ascii="Wingdings" w:hAnsi="Wingdings" w:hint="default"/>
+        <w:sz w:val="20"/>
+      </w:rPr>
+    </w:lvl>
+    <w:lvl w:ilvl="3" w:tentative="1">
+      <w:start w:val="1"/>
+      <w:numFmt w:val="bullet"/>
+      <w:lvlText w:val=""/>
+      <w:lvlJc w:val="left"/>
+      <w:pPr>
+        <w:tabs>
+          <w:tab w:val="num" w:pos="2880"/>
+        </w:tabs>
+        <w:ind w:left="2880" w:hanging="360"/>
+      </w:pPr>
+      <w:rPr>
+        <w:rFonts w:ascii="Wingdings" w:hAnsi="Wingdings" w:hint="default"/>
+        <w:sz w:val="20"/>
+      </w:rPr>
+    </w:lvl>
+    <w:lvl w:ilvl="4" w:tentative="1">
+      <w:start w:val="1"/>
+      <w:numFmt w:val="bullet"/>
+      <w:lvlText w:val=""/>
+      <w:lvlJc w:val="left"/>
+      <w:pPr>
+        <w:tabs>
+          <w:tab w:val="num" w:pos="3600"/>
+        </w:tabs>
+        <w:ind w:left="3600" w:hanging="360"/>
+      </w:pPr>
+      <w:rPr>
+        <w:rFonts w:ascii="Wingdings" w:hAnsi="Wingdings" w:hint="default"/>
+        <w:sz w:val="20"/>
+      </w:rPr>
+    </w:lvl>
+    <w:lvl w:ilvl="5" w:tentative="1">
+      <w:start w:val="1"/>
+      <w:numFmt w:val="bullet"/>
+      <w:lvlText w:val=""/>
+      <w:lvlJc w:val="left"/>
+      <w:pPr>
+        <w:tabs>
+          <w:tab w:val="num" w:pos="4320"/>
+        </w:tabs>
+        <w:ind w:left="4320" w:hanging="360"/>
+      </w:pPr>
+      <w:rPr>
+        <w:rFonts w:ascii="Wingdings" w:hAnsi="Wingdings" w:hint="default"/>
+        <w:sz w:val="20"/>
+      </w:rPr>
+    </w:lvl>
+    <w:lvl w:ilvl="6" w:tentative="1">
+      <w:start w:val="1"/>
+      <w:numFmt w:val="bullet"/>
+      <w:lvlText w:val=""/>
+      <w:lvlJc w:val="left"/>
+      <w:pPr>
+        <w:tabs>
+          <w:tab w:val="num" w:pos="5040"/>
+        </w:tabs>
+        <w:ind w:left="5040" w:hanging="360"/>
+      </w:pPr>
+      <w:rPr>
+        <w:rFonts w:ascii="Wingdings" w:hAnsi="Wingdings" w:hint="default"/>
+        <w:sz w:val="20"/>
+      </w:rPr>
+    </w:lvl>
+    <w:lvl w:ilvl="7" w:tentative="1">
+      <w:start w:val="1"/>
+      <w:numFmt w:val="bullet"/>
+      <w:lvlText w:val=""/>
+      <w:lvlJc w:val="left"/>
+      <w:pPr>
+        <w:tabs>
+          <w:tab w:val="num" w:pos="5760"/>
+        </w:tabs>
+        <w:ind w:left="5760" w:hanging="360"/>
+      </w:pPr>
+      <w:rPr>
+        <w:rFonts w:ascii="Wingdings" w:hAnsi="Wingdings" w:hint="default"/>
+        <w:sz w:val="20"/>
+      </w:rPr>
+    </w:lvl>
+    <w:lvl w:ilvl="8" w:tentative="1">
+      <w:start w:val="1"/>
+      <w:numFmt w:val="bullet"/>
+      <w:lvlText w:val=""/>
+      <w:lvlJc w:val="left"/>
+      <w:pPr>
+        <w:tabs>
+          <w:tab w:val="num" w:pos="6480"/>
+        </w:tabs>
+        <w:ind w:left="6480" w:hanging="360"/>
+      </w:pPr>
+      <w:rPr>
+        <w:rFonts w:ascii="Wingdings" w:hAnsi="Wingdings" w:hint="default"/>
+        <w:sz w:val="20"/>
+      </w:rPr>
+    </w:lvl>
+  </w:abstractNum>
+  <w:abstractNum w:abstractNumId="7" w15:restartNumberingAfterBreak="0">
+    <w:nsid w:val="204B11F1"/>
+    <w:multiLevelType w:val="multilevel"/>
+    <w:tmpl w:val="ED3A4824"/>
+    <w:lvl w:ilvl="0">
+      <w:start w:val="1"/>
+      <w:numFmt w:val="bullet"/>
+      <w:lvlText w:val=""/>
+      <w:lvlJc w:val="left"/>
+      <w:pPr>
+        <w:tabs>
+          <w:tab w:val="num" w:pos="720"/>
+        </w:tabs>
+        <w:ind w:left="720" w:hanging="360"/>
+      </w:pPr>
+      <w:rPr>
+        <w:rFonts w:ascii="Symbol" w:hAnsi="Symbol" w:hint="default"/>
+        <w:sz w:val="20"/>
+      </w:rPr>
+    </w:lvl>
+    <w:lvl w:ilvl="1" w:tentative="1">
+      <w:start w:val="1"/>
+      <w:numFmt w:val="bullet"/>
+      <w:lvlText w:val="o"/>
+      <w:lvlJc w:val="left"/>
+      <w:pPr>
+        <w:tabs>
+          <w:tab w:val="num" w:pos="1440"/>
+        </w:tabs>
+        <w:ind w:left="1440" w:hanging="360"/>
+      </w:pPr>
+      <w:rPr>
+        <w:rFonts w:ascii="Courier New" w:hAnsi="Courier New" w:hint="default"/>
+        <w:sz w:val="20"/>
+      </w:rPr>
+    </w:lvl>
+    <w:lvl w:ilvl="2" w:tentative="1">
+      <w:start w:val="1"/>
+      <w:numFmt w:val="bullet"/>
+      <w:lvlText w:val=""/>
+      <w:lvlJc w:val="left"/>
+      <w:pPr>
+        <w:tabs>
+          <w:tab w:val="num" w:pos="2160"/>
+        </w:tabs>
+        <w:ind w:left="2160" w:hanging="360"/>
+      </w:pPr>
+      <w:rPr>
+        <w:rFonts w:ascii="Wingdings" w:hAnsi="Wingdings" w:hint="default"/>
+        <w:sz w:val="20"/>
+      </w:rPr>
+    </w:lvl>
+    <w:lvl w:ilvl="3" w:tentative="1">
+      <w:start w:val="1"/>
+      <w:numFmt w:val="bullet"/>
+      <w:lvlText w:val=""/>
+      <w:lvlJc w:val="left"/>
+      <w:pPr>
+        <w:tabs>
+          <w:tab w:val="num" w:pos="2880"/>
+        </w:tabs>
+        <w:ind w:left="2880" w:hanging="360"/>
+      </w:pPr>
+      <w:rPr>
+        <w:rFonts w:ascii="Wingdings" w:hAnsi="Wingdings" w:hint="default"/>
+        <w:sz w:val="20"/>
+      </w:rPr>
+    </w:lvl>
+    <w:lvl w:ilvl="4" w:tentative="1">
+      <w:start w:val="1"/>
+      <w:numFmt w:val="bullet"/>
+      <w:lvlText w:val=""/>
+      <w:lvlJc w:val="left"/>
+      <w:pPr>
+        <w:tabs>
+          <w:tab w:val="num" w:pos="3600"/>
+        </w:tabs>
+        <w:ind w:left="3600" w:hanging="360"/>
+      </w:pPr>
+      <w:rPr>
+        <w:rFonts w:ascii="Wingdings" w:hAnsi="Wingdings" w:hint="default"/>
+        <w:sz w:val="20"/>
+      </w:rPr>
+    </w:lvl>
+    <w:lvl w:ilvl="5" w:tentative="1">
+      <w:start w:val="1"/>
+      <w:numFmt w:val="bullet"/>
+      <w:lvlText w:val=""/>
+      <w:lvlJc w:val="left"/>
+      <w:pPr>
+        <w:tabs>
+          <w:tab w:val="num" w:pos="4320"/>
+        </w:tabs>
+        <w:ind w:left="4320" w:hanging="360"/>
+      </w:pPr>
+      <w:rPr>
+        <w:rFonts w:ascii="Wingdings" w:hAnsi="Wingdings" w:hint="default"/>
+        <w:sz w:val="20"/>
+      </w:rPr>
+    </w:lvl>
+    <w:lvl w:ilvl="6" w:tentative="1">
+      <w:start w:val="1"/>
+      <w:numFmt w:val="bullet"/>
+      <w:lvlText w:val=""/>
+      <w:lvlJc w:val="left"/>
+      <w:pPr>
+        <w:tabs>
+          <w:tab w:val="num" w:pos="5040"/>
+        </w:tabs>
+        <w:ind w:left="5040" w:hanging="360"/>
+      </w:pPr>
+      <w:rPr>
+        <w:rFonts w:ascii="Wingdings" w:hAnsi="Wingdings" w:hint="default"/>
+        <w:sz w:val="20"/>
+      </w:rPr>
+    </w:lvl>
+    <w:lvl w:ilvl="7" w:tentative="1">
+      <w:start w:val="1"/>
+      <w:numFmt w:val="bullet"/>
+      <w:lvlText w:val=""/>
+      <w:lvlJc w:val="left"/>
+      <w:pPr>
+        <w:tabs>
+          <w:tab w:val="num" w:pos="5760"/>
+        </w:tabs>
+        <w:ind w:left="5760" w:hanging="360"/>
+      </w:pPr>
+      <w:rPr>
+        <w:rFonts w:ascii="Wingdings" w:hAnsi="Wingdings" w:hint="default"/>
+        <w:sz w:val="20"/>
+      </w:rPr>
+    </w:lvl>
+    <w:lvl w:ilvl="8" w:tentative="1">
+      <w:start w:val="1"/>
+      <w:numFmt w:val="bullet"/>
+      <w:lvlText w:val=""/>
+      <w:lvlJc w:val="left"/>
+      <w:pPr>
+        <w:tabs>
+          <w:tab w:val="num" w:pos="6480"/>
+        </w:tabs>
+        <w:ind w:left="6480" w:hanging="360"/>
+      </w:pPr>
+      <w:rPr>
+        <w:rFonts w:ascii="Wingdings" w:hAnsi="Wingdings" w:hint="default"/>
+        <w:sz w:val="20"/>
+      </w:rPr>
+    </w:lvl>
+  </w:abstractNum>
+  <w:abstractNum w:abstractNumId="8" w15:restartNumberingAfterBreak="0">
+    <w:nsid w:val="2F6B6A9E"/>
+    <w:multiLevelType w:val="multilevel"/>
+    <w:tmpl w:val="153E4A54"/>
+    <w:lvl w:ilvl="0">
+      <w:start w:val="1"/>
+      <w:numFmt w:val="bullet"/>
+      <w:lvlText w:val=""/>
+      <w:lvlJc w:val="left"/>
+      <w:pPr>
+        <w:tabs>
+          <w:tab w:val="num" w:pos="720"/>
+        </w:tabs>
+        <w:ind w:left="720" w:hanging="360"/>
+      </w:pPr>
+      <w:rPr>
+        <w:rFonts w:ascii="Symbol" w:hAnsi="Symbol" w:hint="default"/>
+        <w:sz w:val="20"/>
+      </w:rPr>
+    </w:lvl>
+    <w:lvl w:ilvl="1" w:tentative="1">
+      <w:start w:val="1"/>
+      <w:numFmt w:val="bullet"/>
+      <w:lvlText w:val="o"/>
+      <w:lvlJc w:val="left"/>
+      <w:pPr>
+        <w:tabs>
+          <w:tab w:val="num" w:pos="1440"/>
+        </w:tabs>
+        <w:ind w:left="1440" w:hanging="360"/>
+      </w:pPr>
+      <w:rPr>
+        <w:rFonts w:ascii="Courier New" w:hAnsi="Courier New" w:hint="default"/>
+        <w:sz w:val="20"/>
+      </w:rPr>
+    </w:lvl>
+    <w:lvl w:ilvl="2" w:tentative="1">
+      <w:start w:val="1"/>
+      <w:numFmt w:val="bullet"/>
+      <w:lvlText w:val=""/>
+      <w:lvlJc w:val="left"/>
+      <w:pPr>
+        <w:tabs>
+          <w:tab w:val="num" w:pos="2160"/>
+        </w:tabs>
+        <w:ind w:left="2160" w:hanging="360"/>
+      </w:pPr>
+      <w:rPr>
+        <w:rFonts w:ascii="Wingdings" w:hAnsi="Wingdings" w:hint="default"/>
+        <w:sz w:val="20"/>
+      </w:rPr>
+    </w:lvl>
+    <w:lvl w:ilvl="3" w:tentative="1">
+      <w:start w:val="1"/>
+      <w:numFmt w:val="bullet"/>
+      <w:lvlText w:val=""/>
+      <w:lvlJc w:val="left"/>
+      <w:pPr>
+        <w:tabs>
+          <w:tab w:val="num" w:pos="2880"/>
+        </w:tabs>
+        <w:ind w:left="2880" w:hanging="360"/>
+      </w:pPr>
+      <w:rPr>
+        <w:rFonts w:ascii="Wingdings" w:hAnsi="Wingdings" w:hint="default"/>
+        <w:sz w:val="20"/>
+      </w:rPr>
+    </w:lvl>
+    <w:lvl w:ilvl="4" w:tentative="1">
+      <w:start w:val="1"/>
+      <w:numFmt w:val="bullet"/>
+      <w:lvlText w:val=""/>
+      <w:lvlJc w:val="left"/>
+      <w:pPr>
+        <w:tabs>
+          <w:tab w:val="num" w:pos="3600"/>
+        </w:tabs>
+        <w:ind w:left="3600" w:hanging="360"/>
+      </w:pPr>
+      <w:rPr>
+        <w:rFonts w:ascii="Wingdings" w:hAnsi="Wingdings" w:hint="default"/>
+        <w:sz w:val="20"/>
+      </w:rPr>
+    </w:lvl>
+    <w:lvl w:ilvl="5" w:tentative="1">
+      <w:start w:val="1"/>
+      <w:numFmt w:val="bullet"/>
+      <w:lvlText w:val=""/>
+      <w:lvlJc w:val="left"/>
+      <w:pPr>
+        <w:tabs>
+          <w:tab w:val="num" w:pos="4320"/>
+        </w:tabs>
+        <w:ind w:left="4320" w:hanging="360"/>
+      </w:pPr>
+      <w:rPr>
+        <w:rFonts w:ascii="Wingdings" w:hAnsi="Wingdings" w:hint="default"/>
+        <w:sz w:val="20"/>
+      </w:rPr>
+    </w:lvl>
+    <w:lvl w:ilvl="6" w:tentative="1">
+      <w:start w:val="1"/>
+      <w:numFmt w:val="bullet"/>
+      <w:lvlText w:val=""/>
+      <w:lvlJc w:val="left"/>
+      <w:pPr>
+        <w:tabs>
+          <w:tab w:val="num" w:pos="5040"/>
+        </w:tabs>
+        <w:ind w:left="5040" w:hanging="360"/>
+      </w:pPr>
+      <w:rPr>
+        <w:rFonts w:ascii="Wingdings" w:hAnsi="Wingdings" w:hint="default"/>
+        <w:sz w:val="20"/>
+      </w:rPr>
+    </w:lvl>
+    <w:lvl w:ilvl="7" w:tentative="1">
+      <w:start w:val="1"/>
+      <w:numFmt w:val="bullet"/>
+      <w:lvlText w:val=""/>
+      <w:lvlJc w:val="left"/>
+      <w:pPr>
+        <w:tabs>
+          <w:tab w:val="num" w:pos="5760"/>
+        </w:tabs>
+        <w:ind w:left="5760" w:hanging="360"/>
+      </w:pPr>
+      <w:rPr>
+        <w:rFonts w:ascii="Wingdings" w:hAnsi="Wingdings" w:hint="default"/>
+        <w:sz w:val="20"/>
+      </w:rPr>
+    </w:lvl>
+    <w:lvl w:ilvl="8" w:tentative="1">
+      <w:start w:val="1"/>
+      <w:numFmt w:val="bullet"/>
+      <w:lvlText w:val=""/>
+      <w:lvlJc w:val="left"/>
+      <w:pPr>
+        <w:tabs>
+          <w:tab w:val="num" w:pos="6480"/>
+        </w:tabs>
+        <w:ind w:left="6480" w:hanging="360"/>
+      </w:pPr>
+      <w:rPr>
+        <w:rFonts w:ascii="Wingdings" w:hAnsi="Wingdings" w:hint="default"/>
+        <w:sz w:val="20"/>
+      </w:rPr>
+    </w:lvl>
+  </w:abstractNum>
+  <w:abstractNum w:abstractNumId="9" w15:restartNumberingAfterBreak="0">
+    <w:nsid w:val="3BE166F9"/>
+    <w:multiLevelType w:val="multilevel"/>
+    <w:tmpl w:val="758C15D8"/>
     <w:lvl w:ilvl="0">
       <w:start w:val="1"/>
       <w:numFmt w:val="decimal"/>
@@ -7165,10 +7927,10 @@
       </w:pPr>
     </w:lvl>
   </w:abstractNum>
-  <w:abstractNum w:abstractNumId="5" w15:restartNumberingAfterBreak="0">
-    <w:nsid w:val="221941C0"/>
+  <w:abstractNum w:abstractNumId="10" w15:restartNumberingAfterBreak="0">
+    <w:nsid w:val="404A1AE3"/>
     <w:multiLevelType w:val="multilevel"/>
-    <w:tmpl w:val="2BEC55D4"/>
+    <w:tmpl w:val="429EF5D8"/>
     <w:lvl w:ilvl="0">
       <w:start w:val="1"/>
       <w:numFmt w:val="bullet"/>
@@ -7314,10 +8076,10 @@
       </w:rPr>
     </w:lvl>
   </w:abstractNum>
-  <w:abstractNum w:abstractNumId="6" w15:restartNumberingAfterBreak="0">
-    <w:nsid w:val="22BF39F8"/>
+  <w:abstractNum w:abstractNumId="11" w15:restartNumberingAfterBreak="0">
+    <w:nsid w:val="42701253"/>
     <w:multiLevelType w:val="multilevel"/>
-    <w:tmpl w:val="A12A4814"/>
+    <w:tmpl w:val="7FC66282"/>
     <w:lvl w:ilvl="0">
       <w:start w:val="1"/>
       <w:numFmt w:val="bullet"/>
@@ -7463,10 +8225,159 @@
       </w:rPr>
     </w:lvl>
   </w:abstractNum>
-  <w:abstractNum w:abstractNumId="7" w15:restartNumberingAfterBreak="0">
-    <w:nsid w:val="2675064E"/>
+  <w:abstractNum w:abstractNumId="12" w15:restartNumberingAfterBreak="0">
+    <w:nsid w:val="570B0213"/>
     <w:multiLevelType w:val="multilevel"/>
-    <w:tmpl w:val="149AC6CA"/>
+    <w:tmpl w:val="A6EEA088"/>
+    <w:lvl w:ilvl="0">
+      <w:start w:val="1"/>
+      <w:numFmt w:val="bullet"/>
+      <w:lvlText w:val=""/>
+      <w:lvlJc w:val="left"/>
+      <w:pPr>
+        <w:tabs>
+          <w:tab w:val="num" w:pos="720"/>
+        </w:tabs>
+        <w:ind w:left="720" w:hanging="360"/>
+      </w:pPr>
+      <w:rPr>
+        <w:rFonts w:ascii="Symbol" w:hAnsi="Symbol" w:hint="default"/>
+        <w:sz w:val="20"/>
+      </w:rPr>
+    </w:lvl>
+    <w:lvl w:ilvl="1" w:tentative="1">
+      <w:start w:val="1"/>
+      <w:numFmt w:val="bullet"/>
+      <w:lvlText w:val="o"/>
+      <w:lvlJc w:val="left"/>
+      <w:pPr>
+        <w:tabs>
+          <w:tab w:val="num" w:pos="1440"/>
+        </w:tabs>
+        <w:ind w:left="1440" w:hanging="360"/>
+      </w:pPr>
+      <w:rPr>
+        <w:rFonts w:ascii="Courier New" w:hAnsi="Courier New" w:hint="default"/>
+        <w:sz w:val="20"/>
+      </w:rPr>
+    </w:lvl>
+    <w:lvl w:ilvl="2" w:tentative="1">
+      <w:start w:val="1"/>
+      <w:numFmt w:val="bullet"/>
+      <w:lvlText w:val=""/>
+      <w:lvlJc w:val="left"/>
+      <w:pPr>
+        <w:tabs>
+          <w:tab w:val="num" w:pos="2160"/>
+        </w:tabs>
+        <w:ind w:left="2160" w:hanging="360"/>
+      </w:pPr>
+      <w:rPr>
+        <w:rFonts w:ascii="Wingdings" w:hAnsi="Wingdings" w:hint="default"/>
+        <w:sz w:val="20"/>
+      </w:rPr>
+    </w:lvl>
+    <w:lvl w:ilvl="3" w:tentative="1">
+      <w:start w:val="1"/>
+      <w:numFmt w:val="bullet"/>
+      <w:lvlText w:val=""/>
+      <w:lvlJc w:val="left"/>
+      <w:pPr>
+        <w:tabs>
+          <w:tab w:val="num" w:pos="2880"/>
+        </w:tabs>
+        <w:ind w:left="2880" w:hanging="360"/>
+      </w:pPr>
+      <w:rPr>
+        <w:rFonts w:ascii="Wingdings" w:hAnsi="Wingdings" w:hint="default"/>
+        <w:sz w:val="20"/>
+      </w:rPr>
+    </w:lvl>
+    <w:lvl w:ilvl="4" w:tentative="1">
+      <w:start w:val="1"/>
+      <w:numFmt w:val="bullet"/>
+      <w:lvlText w:val=""/>
+      <w:lvlJc w:val="left"/>
+      <w:pPr>
+        <w:tabs>
+          <w:tab w:val="num" w:pos="3600"/>
+        </w:tabs>
+        <w:ind w:left="3600" w:hanging="360"/>
+      </w:pPr>
+      <w:rPr>
+        <w:rFonts w:ascii="Wingdings" w:hAnsi="Wingdings" w:hint="default"/>
+        <w:sz w:val="20"/>
+      </w:rPr>
+    </w:lvl>
+    <w:lvl w:ilvl="5" w:tentative="1">
+      <w:start w:val="1"/>
+      <w:numFmt w:val="bullet"/>
+      <w:lvlText w:val=""/>
+      <w:lvlJc w:val="left"/>
+      <w:pPr>
+        <w:tabs>
+          <w:tab w:val="num" w:pos="4320"/>
+        </w:tabs>
+        <w:ind w:left="4320" w:hanging="360"/>
+      </w:pPr>
+      <w:rPr>
+        <w:rFonts w:ascii="Wingdings" w:hAnsi="Wingdings" w:hint="default"/>
+        <w:sz w:val="20"/>
+      </w:rPr>
+    </w:lvl>
+    <w:lvl w:ilvl="6" w:tentative="1">
+      <w:start w:val="1"/>
+      <w:numFmt w:val="bullet"/>
+      <w:lvlText w:val=""/>
+      <w:lvlJc w:val="left"/>
+      <w:pPr>
+        <w:tabs>
+          <w:tab w:val="num" w:pos="5040"/>
+        </w:tabs>
+        <w:ind w:left="5040" w:hanging="360"/>
+      </w:pPr>
+      <w:rPr>
+        <w:rFonts w:ascii="Wingdings" w:hAnsi="Wingdings" w:hint="default"/>
+        <w:sz w:val="20"/>
+      </w:rPr>
+    </w:lvl>
+    <w:lvl w:ilvl="7" w:tentative="1">
+      <w:start w:val="1"/>
+      <w:numFmt w:val="bullet"/>
+      <w:lvlText w:val=""/>
+      <w:lvlJc w:val="left"/>
+      <w:pPr>
+        <w:tabs>
+          <w:tab w:val="num" w:pos="5760"/>
+        </w:tabs>
+        <w:ind w:left="5760" w:hanging="360"/>
+      </w:pPr>
+      <w:rPr>
+        <w:rFonts w:ascii="Wingdings" w:hAnsi="Wingdings" w:hint="default"/>
+        <w:sz w:val="20"/>
+      </w:rPr>
+    </w:lvl>
+    <w:lvl w:ilvl="8" w:tentative="1">
+      <w:start w:val="1"/>
+      <w:numFmt w:val="bullet"/>
+      <w:lvlText w:val=""/>
+      <w:lvlJc w:val="left"/>
+      <w:pPr>
+        <w:tabs>
+          <w:tab w:val="num" w:pos="6480"/>
+        </w:tabs>
+        <w:ind w:left="6480" w:hanging="360"/>
+      </w:pPr>
+      <w:rPr>
+        <w:rFonts w:ascii="Wingdings" w:hAnsi="Wingdings" w:hint="default"/>
+        <w:sz w:val="20"/>
+      </w:rPr>
+    </w:lvl>
+  </w:abstractNum>
+  <w:abstractNum w:abstractNumId="13" w15:restartNumberingAfterBreak="0">
+    <w:nsid w:val="5BA925B1"/>
+    <w:multiLevelType w:val="multilevel"/>
+    <w:tmpl w:val="75E8C6AA"/>
     <w:lvl w:ilvl="0">
       <w:start w:val="1"/>
       <w:numFmt w:val="decimal"/>
@@ -7580,10 +8491,159 @@
       </w:pPr>
     </w:lvl>
   </w:abstractNum>
-  <w:abstractNum w:abstractNumId="8" w15:restartNumberingAfterBreak="0">
-    <w:nsid w:val="37D93A36"/>
+  <w:abstractNum w:abstractNumId="14" w15:restartNumberingAfterBreak="0">
+    <w:nsid w:val="5DB52AFA"/>
     <w:multiLevelType w:val="multilevel"/>
-    <w:tmpl w:val="C6E031D4"/>
+    <w:tmpl w:val="F538EEFA"/>
+    <w:lvl w:ilvl="0">
+      <w:start w:val="1"/>
+      <w:numFmt w:val="bullet"/>
+      <w:lvlText w:val=""/>
+      <w:lvlJc w:val="left"/>
+      <w:pPr>
+        <w:tabs>
+          <w:tab w:val="num" w:pos="720"/>
+        </w:tabs>
+        <w:ind w:left="720" w:hanging="360"/>
+      </w:pPr>
+      <w:rPr>
+        <w:rFonts w:ascii="Symbol" w:hAnsi="Symbol" w:hint="default"/>
+        <w:sz w:val="20"/>
+      </w:rPr>
+    </w:lvl>
+    <w:lvl w:ilvl="1" w:tentative="1">
+      <w:start w:val="1"/>
+      <w:numFmt w:val="bullet"/>
+      <w:lvlText w:val="o"/>
+      <w:lvlJc w:val="left"/>
+      <w:pPr>
+        <w:tabs>
+          <w:tab w:val="num" w:pos="1440"/>
+        </w:tabs>
+        <w:ind w:left="1440" w:hanging="360"/>
+      </w:pPr>
+      <w:rPr>
+        <w:rFonts w:ascii="Courier New" w:hAnsi="Courier New" w:hint="default"/>
+        <w:sz w:val="20"/>
+      </w:rPr>
+    </w:lvl>
+    <w:lvl w:ilvl="2" w:tentative="1">
+      <w:start w:val="1"/>
+      <w:numFmt w:val="bullet"/>
+      <w:lvlText w:val=""/>
+      <w:lvlJc w:val="left"/>
+      <w:pPr>
+        <w:tabs>
+          <w:tab w:val="num" w:pos="2160"/>
+        </w:tabs>
+        <w:ind w:left="2160" w:hanging="360"/>
+      </w:pPr>
+      <w:rPr>
+        <w:rFonts w:ascii="Wingdings" w:hAnsi="Wingdings" w:hint="default"/>
+        <w:sz w:val="20"/>
+      </w:rPr>
+    </w:lvl>
+    <w:lvl w:ilvl="3" w:tentative="1">
+      <w:start w:val="1"/>
+      <w:numFmt w:val="bullet"/>
+      <w:lvlText w:val=""/>
+      <w:lvlJc w:val="left"/>
+      <w:pPr>
+        <w:tabs>
+          <w:tab w:val="num" w:pos="2880"/>
+        </w:tabs>
+        <w:ind w:left="2880" w:hanging="360"/>
+      </w:pPr>
+      <w:rPr>
+        <w:rFonts w:ascii="Wingdings" w:hAnsi="Wingdings" w:hint="default"/>
+        <w:sz w:val="20"/>
+      </w:rPr>
+    </w:lvl>
+    <w:lvl w:ilvl="4" w:tentative="1">
+      <w:start w:val="1"/>
+      <w:numFmt w:val="bullet"/>
+      <w:lvlText w:val=""/>
+      <w:lvlJc w:val="left"/>
+      <w:pPr>
+        <w:tabs>
+          <w:tab w:val="num" w:pos="3600"/>
+        </w:tabs>
+        <w:ind w:left="3600" w:hanging="360"/>
+      </w:pPr>
+      <w:rPr>
+        <w:rFonts w:ascii="Wingdings" w:hAnsi="Wingdings" w:hint="default"/>
+        <w:sz w:val="20"/>
+      </w:rPr>
+    </w:lvl>
+    <w:lvl w:ilvl="5" w:tentative="1">
+      <w:start w:val="1"/>
+      <w:numFmt w:val="bullet"/>
+      <w:lvlText w:val=""/>
+      <w:lvlJc w:val="left"/>
+      <w:pPr>
+        <w:tabs>
+          <w:tab w:val="num" w:pos="4320"/>
+        </w:tabs>
+        <w:ind w:left="4320" w:hanging="360"/>
+      </w:pPr>
+      <w:rPr>
+        <w:rFonts w:ascii="Wingdings" w:hAnsi="Wingdings" w:hint="default"/>
+        <w:sz w:val="20"/>
+      </w:rPr>
+    </w:lvl>
+    <w:lvl w:ilvl="6" w:tentative="1">
+      <w:start w:val="1"/>
+      <w:numFmt w:val="bullet"/>
+      <w:lvlText w:val=""/>
+      <w:lvlJc w:val="left"/>
+      <w:pPr>
+        <w:tabs>
+          <w:tab w:val="num" w:pos="5040"/>
+        </w:tabs>
+        <w:ind w:left="5040" w:hanging="360"/>
+      </w:pPr>
+      <w:rPr>
+        <w:rFonts w:ascii="Wingdings" w:hAnsi="Wingdings" w:hint="default"/>
+        <w:sz w:val="20"/>
+      </w:rPr>
+    </w:lvl>
+    <w:lvl w:ilvl="7" w:tentative="1">
+      <w:start w:val="1"/>
+      <w:numFmt w:val="bullet"/>
+      <w:lvlText w:val=""/>
+      <w:lvlJc w:val="left"/>
+      <w:pPr>
+        <w:tabs>
+          <w:tab w:val="num" w:pos="5760"/>
+        </w:tabs>
+        <w:ind w:left="5760" w:hanging="360"/>
+      </w:pPr>
+      <w:rPr>
+        <w:rFonts w:ascii="Wingdings" w:hAnsi="Wingdings" w:hint="default"/>
+        <w:sz w:val="20"/>
+      </w:rPr>
+    </w:lvl>
+    <w:lvl w:ilvl="8" w:tentative="1">
+      <w:start w:val="1"/>
+      <w:numFmt w:val="bullet"/>
+      <w:lvlText w:val=""/>
+      <w:lvlJc w:val="left"/>
+      <w:pPr>
+        <w:tabs>
+          <w:tab w:val="num" w:pos="6480"/>
+        </w:tabs>
+        <w:ind w:left="6480" w:hanging="360"/>
+      </w:pPr>
+      <w:rPr>
+        <w:rFonts w:ascii="Wingdings" w:hAnsi="Wingdings" w:hint="default"/>
+        <w:sz w:val="20"/>
+      </w:rPr>
+    </w:lvl>
+  </w:abstractNum>
+  <w:abstractNum w:abstractNumId="15" w15:restartNumberingAfterBreak="0">
+    <w:nsid w:val="5F8133E3"/>
+    <w:multiLevelType w:val="multilevel"/>
+    <w:tmpl w:val="B24EEEC0"/>
     <w:lvl w:ilvl="0">
       <w:start w:val="1"/>
       <w:numFmt w:val="decimal"/>
@@ -7697,10 +8757,10 @@
       </w:pPr>
     </w:lvl>
   </w:abstractNum>
-  <w:abstractNum w:abstractNumId="9" w15:restartNumberingAfterBreak="0">
-    <w:nsid w:val="3E8653C5"/>
+  <w:abstractNum w:abstractNumId="16" w15:restartNumberingAfterBreak="0">
+    <w:nsid w:val="5FA34D00"/>
     <w:multiLevelType w:val="multilevel"/>
-    <w:tmpl w:val="E3027C30"/>
+    <w:tmpl w:val="7AA0C210"/>
     <w:lvl w:ilvl="0">
       <w:start w:val="1"/>
       <w:numFmt w:val="bullet"/>
@@ -7846,10 +8906,457 @@
       </w:rPr>
     </w:lvl>
   </w:abstractNum>
-  <w:abstractNum w:abstractNumId="10" w15:restartNumberingAfterBreak="0">
-    <w:nsid w:val="41064503"/>
+  <w:abstractNum w:abstractNumId="17" w15:restartNumberingAfterBreak="0">
+    <w:nsid w:val="63E0619E"/>
     <w:multiLevelType w:val="multilevel"/>
-    <w:tmpl w:val="7970254C"/>
+    <w:tmpl w:val="7FEE2C82"/>
+    <w:lvl w:ilvl="0">
+      <w:start w:val="1"/>
+      <w:numFmt w:val="bullet"/>
+      <w:lvlText w:val=""/>
+      <w:lvlJc w:val="left"/>
+      <w:pPr>
+        <w:tabs>
+          <w:tab w:val="num" w:pos="720"/>
+        </w:tabs>
+        <w:ind w:left="720" w:hanging="360"/>
+      </w:pPr>
+      <w:rPr>
+        <w:rFonts w:ascii="Symbol" w:hAnsi="Symbol" w:hint="default"/>
+        <w:sz w:val="20"/>
+      </w:rPr>
+    </w:lvl>
+    <w:lvl w:ilvl="1" w:tentative="1">
+      <w:start w:val="1"/>
+      <w:numFmt w:val="bullet"/>
+      <w:lvlText w:val="o"/>
+      <w:lvlJc w:val="left"/>
+      <w:pPr>
+        <w:tabs>
+          <w:tab w:val="num" w:pos="1440"/>
+        </w:tabs>
+        <w:ind w:left="1440" w:hanging="360"/>
+      </w:pPr>
+      <w:rPr>
+        <w:rFonts w:ascii="Courier New" w:hAnsi="Courier New" w:hint="default"/>
+        <w:sz w:val="20"/>
+      </w:rPr>
+    </w:lvl>
+    <w:lvl w:ilvl="2" w:tentative="1">
+      <w:start w:val="1"/>
+      <w:numFmt w:val="bullet"/>
+      <w:lvlText w:val=""/>
+      <w:lvlJc w:val="left"/>
+      <w:pPr>
+        <w:tabs>
+          <w:tab w:val="num" w:pos="2160"/>
+        </w:tabs>
+        <w:ind w:left="2160" w:hanging="360"/>
+      </w:pPr>
+      <w:rPr>
+        <w:rFonts w:ascii="Wingdings" w:hAnsi="Wingdings" w:hint="default"/>
+        <w:sz w:val="20"/>
+      </w:rPr>
+    </w:lvl>
+    <w:lvl w:ilvl="3" w:tentative="1">
+      <w:start w:val="1"/>
+      <w:numFmt w:val="bullet"/>
+      <w:lvlText w:val=""/>
+      <w:lvlJc w:val="left"/>
+      <w:pPr>
+        <w:tabs>
+          <w:tab w:val="num" w:pos="2880"/>
+        </w:tabs>
+        <w:ind w:left="2880" w:hanging="360"/>
+      </w:pPr>
+      <w:rPr>
+        <w:rFonts w:ascii="Wingdings" w:hAnsi="Wingdings" w:hint="default"/>
+        <w:sz w:val="20"/>
+      </w:rPr>
+    </w:lvl>
+    <w:lvl w:ilvl="4" w:tentative="1">
+      <w:start w:val="1"/>
+      <w:numFmt w:val="bullet"/>
+      <w:lvlText w:val=""/>
+      <w:lvlJc w:val="left"/>
+      <w:pPr>
+        <w:tabs>
+          <w:tab w:val="num" w:pos="3600"/>
+        </w:tabs>
+        <w:ind w:left="3600" w:hanging="360"/>
+      </w:pPr>
+      <w:rPr>
+        <w:rFonts w:ascii="Wingdings" w:hAnsi="Wingdings" w:hint="default"/>
+        <w:sz w:val="20"/>
+      </w:rPr>
+    </w:lvl>
+    <w:lvl w:ilvl="5" w:tentative="1">
+      <w:start w:val="1"/>
+      <w:numFmt w:val="bullet"/>
+      <w:lvlText w:val=""/>
+      <w:lvlJc w:val="left"/>
+      <w:pPr>
+        <w:tabs>
+          <w:tab w:val="num" w:pos="4320"/>
+        </w:tabs>
+        <w:ind w:left="4320" w:hanging="360"/>
+      </w:pPr>
+      <w:rPr>
+        <w:rFonts w:ascii="Wingdings" w:hAnsi="Wingdings" w:hint="default"/>
+        <w:sz w:val="20"/>
+      </w:rPr>
+    </w:lvl>
+    <w:lvl w:ilvl="6" w:tentative="1">
+      <w:start w:val="1"/>
+      <w:numFmt w:val="bullet"/>
+      <w:lvlText w:val=""/>
+      <w:lvlJc w:val="left"/>
+      <w:pPr>
+        <w:tabs>
+          <w:tab w:val="num" w:pos="5040"/>
+        </w:tabs>
+        <w:ind w:left="5040" w:hanging="360"/>
+      </w:pPr>
+      <w:rPr>
+        <w:rFonts w:ascii="Wingdings" w:hAnsi="Wingdings" w:hint="default"/>
+        <w:sz w:val="20"/>
+      </w:rPr>
+    </w:lvl>
+    <w:lvl w:ilvl="7" w:tentative="1">
+      <w:start w:val="1"/>
+      <w:numFmt w:val="bullet"/>
+      <w:lvlText w:val=""/>
+      <w:lvlJc w:val="left"/>
+      <w:pPr>
+        <w:tabs>
+          <w:tab w:val="num" w:pos="5760"/>
+        </w:tabs>
+        <w:ind w:left="5760" w:hanging="360"/>
+      </w:pPr>
+      <w:rPr>
+        <w:rFonts w:ascii="Wingdings" w:hAnsi="Wingdings" w:hint="default"/>
+        <w:sz w:val="20"/>
+      </w:rPr>
+    </w:lvl>
+    <w:lvl w:ilvl="8" w:tentative="1">
+      <w:start w:val="1"/>
+      <w:numFmt w:val="bullet"/>
+      <w:lvlText w:val=""/>
+      <w:lvlJc w:val="left"/>
+      <w:pPr>
+        <w:tabs>
+          <w:tab w:val="num" w:pos="6480"/>
+        </w:tabs>
+        <w:ind w:left="6480" w:hanging="360"/>
+      </w:pPr>
+      <w:rPr>
+        <w:rFonts w:ascii="Wingdings" w:hAnsi="Wingdings" w:hint="default"/>
+        <w:sz w:val="20"/>
+      </w:rPr>
+    </w:lvl>
+  </w:abstractNum>
+  <w:abstractNum w:abstractNumId="18" w15:restartNumberingAfterBreak="0">
+    <w:nsid w:val="64171B7D"/>
+    <w:multiLevelType w:val="multilevel"/>
+    <w:tmpl w:val="69B4B228"/>
+    <w:lvl w:ilvl="0">
+      <w:start w:val="1"/>
+      <w:numFmt w:val="bullet"/>
+      <w:lvlText w:val=""/>
+      <w:lvlJc w:val="left"/>
+      <w:pPr>
+        <w:tabs>
+          <w:tab w:val="num" w:pos="720"/>
+        </w:tabs>
+        <w:ind w:left="720" w:hanging="360"/>
+      </w:pPr>
+      <w:rPr>
+        <w:rFonts w:ascii="Symbol" w:hAnsi="Symbol" w:hint="default"/>
+        <w:sz w:val="20"/>
+      </w:rPr>
+    </w:lvl>
+    <w:lvl w:ilvl="1" w:tentative="1">
+      <w:start w:val="1"/>
+      <w:numFmt w:val="bullet"/>
+      <w:lvlText w:val="o"/>
+      <w:lvlJc w:val="left"/>
+      <w:pPr>
+        <w:tabs>
+          <w:tab w:val="num" w:pos="1440"/>
+        </w:tabs>
+        <w:ind w:left="1440" w:hanging="360"/>
+      </w:pPr>
+      <w:rPr>
+        <w:rFonts w:ascii="Courier New" w:hAnsi="Courier New" w:hint="default"/>
+        <w:sz w:val="20"/>
+      </w:rPr>
+    </w:lvl>
+    <w:lvl w:ilvl="2" w:tentative="1">
+      <w:start w:val="1"/>
+      <w:numFmt w:val="bullet"/>
+      <w:lvlText w:val=""/>
+      <w:lvlJc w:val="left"/>
+      <w:pPr>
+        <w:tabs>
+          <w:tab w:val="num" w:pos="2160"/>
+        </w:tabs>
+        <w:ind w:left="2160" w:hanging="360"/>
+      </w:pPr>
+      <w:rPr>
+        <w:rFonts w:ascii="Wingdings" w:hAnsi="Wingdings" w:hint="default"/>
+        <w:sz w:val="20"/>
+      </w:rPr>
+    </w:lvl>
+    <w:lvl w:ilvl="3" w:tentative="1">
+      <w:start w:val="1"/>
+      <w:numFmt w:val="bullet"/>
+      <w:lvlText w:val=""/>
+      <w:lvlJc w:val="left"/>
+      <w:pPr>
+        <w:tabs>
+          <w:tab w:val="num" w:pos="2880"/>
+        </w:tabs>
+        <w:ind w:left="2880" w:hanging="360"/>
+      </w:pPr>
+      <w:rPr>
+        <w:rFonts w:ascii="Wingdings" w:hAnsi="Wingdings" w:hint="default"/>
+        <w:sz w:val="20"/>
+      </w:rPr>
+    </w:lvl>
+    <w:lvl w:ilvl="4" w:tentative="1">
+      <w:start w:val="1"/>
+      <w:numFmt w:val="bullet"/>
+      <w:lvlText w:val=""/>
+      <w:lvlJc w:val="left"/>
+      <w:pPr>
+        <w:tabs>
+          <w:tab w:val="num" w:pos="3600"/>
+        </w:tabs>
+        <w:ind w:left="3600" w:hanging="360"/>
+      </w:pPr>
+      <w:rPr>
+        <w:rFonts w:ascii="Wingdings" w:hAnsi="Wingdings" w:hint="default"/>
+        <w:sz w:val="20"/>
+      </w:rPr>
+    </w:lvl>
+    <w:lvl w:ilvl="5" w:tentative="1">
+      <w:start w:val="1"/>
+      <w:numFmt w:val="bullet"/>
+      <w:lvlText w:val=""/>
+      <w:lvlJc w:val="left"/>
+      <w:pPr>
+        <w:tabs>
+          <w:tab w:val="num" w:pos="4320"/>
+        </w:tabs>
+        <w:ind w:left="4320" w:hanging="360"/>
+      </w:pPr>
+      <w:rPr>
+        <w:rFonts w:ascii="Wingdings" w:hAnsi="Wingdings" w:hint="default"/>
+        <w:sz w:val="20"/>
+      </w:rPr>
+    </w:lvl>
+    <w:lvl w:ilvl="6" w:tentative="1">
+      <w:start w:val="1"/>
+      <w:numFmt w:val="bullet"/>
+      <w:lvlText w:val=""/>
+      <w:lvlJc w:val="left"/>
+      <w:pPr>
+        <w:tabs>
+          <w:tab w:val="num" w:pos="5040"/>
+        </w:tabs>
+        <w:ind w:left="5040" w:hanging="360"/>
+      </w:pPr>
+      <w:rPr>
+        <w:rFonts w:ascii="Wingdings" w:hAnsi="Wingdings" w:hint="default"/>
+        <w:sz w:val="20"/>
+      </w:rPr>
+    </w:lvl>
+    <w:lvl w:ilvl="7" w:tentative="1">
+      <w:start w:val="1"/>
+      <w:numFmt w:val="bullet"/>
+      <w:lvlText w:val=""/>
+      <w:lvlJc w:val="left"/>
+      <w:pPr>
+        <w:tabs>
+          <w:tab w:val="num" w:pos="5760"/>
+        </w:tabs>
+        <w:ind w:left="5760" w:hanging="360"/>
+      </w:pPr>
+      <w:rPr>
+        <w:rFonts w:ascii="Wingdings" w:hAnsi="Wingdings" w:hint="default"/>
+        <w:sz w:val="20"/>
+      </w:rPr>
+    </w:lvl>
+    <w:lvl w:ilvl="8" w:tentative="1">
+      <w:start w:val="1"/>
+      <w:numFmt w:val="bullet"/>
+      <w:lvlText w:val=""/>
+      <w:lvlJc w:val="left"/>
+      <w:pPr>
+        <w:tabs>
+          <w:tab w:val="num" w:pos="6480"/>
+        </w:tabs>
+        <w:ind w:left="6480" w:hanging="360"/>
+      </w:pPr>
+      <w:rPr>
+        <w:rFonts w:ascii="Wingdings" w:hAnsi="Wingdings" w:hint="default"/>
+        <w:sz w:val="20"/>
+      </w:rPr>
+    </w:lvl>
+  </w:abstractNum>
+  <w:abstractNum w:abstractNumId="19" w15:restartNumberingAfterBreak="0">
+    <w:nsid w:val="749428FB"/>
+    <w:multiLevelType w:val="multilevel"/>
+    <w:tmpl w:val="C270F378"/>
+    <w:lvl w:ilvl="0">
+      <w:start w:val="1"/>
+      <w:numFmt w:val="bullet"/>
+      <w:lvlText w:val=""/>
+      <w:lvlJc w:val="left"/>
+      <w:pPr>
+        <w:tabs>
+          <w:tab w:val="num" w:pos="720"/>
+        </w:tabs>
+        <w:ind w:left="720" w:hanging="360"/>
+      </w:pPr>
+      <w:rPr>
+        <w:rFonts w:ascii="Symbol" w:hAnsi="Symbol" w:hint="default"/>
+        <w:sz w:val="20"/>
+      </w:rPr>
+    </w:lvl>
+    <w:lvl w:ilvl="1" w:tentative="1">
+      <w:start w:val="1"/>
+      <w:numFmt w:val="bullet"/>
+      <w:lvlText w:val="o"/>
+      <w:lvlJc w:val="left"/>
+      <w:pPr>
+        <w:tabs>
+          <w:tab w:val="num" w:pos="1440"/>
+        </w:tabs>
+        <w:ind w:left="1440" w:hanging="360"/>
+      </w:pPr>
+      <w:rPr>
+        <w:rFonts w:ascii="Courier New" w:hAnsi="Courier New" w:hint="default"/>
+        <w:sz w:val="20"/>
+      </w:rPr>
+    </w:lvl>
+    <w:lvl w:ilvl="2" w:tentative="1">
+      <w:start w:val="1"/>
+      <w:numFmt w:val="bullet"/>
+      <w:lvlText w:val=""/>
+      <w:lvlJc w:val="left"/>
+      <w:pPr>
+        <w:tabs>
+          <w:tab w:val="num" w:pos="2160"/>
+        </w:tabs>
+        <w:ind w:left="2160" w:hanging="360"/>
+      </w:pPr>
+      <w:rPr>
+        <w:rFonts w:ascii="Wingdings" w:hAnsi="Wingdings" w:hint="default"/>
+        <w:sz w:val="20"/>
+      </w:rPr>
+    </w:lvl>
+    <w:lvl w:ilvl="3" w:tentative="1">
+      <w:start w:val="1"/>
+      <w:numFmt w:val="bullet"/>
+      <w:lvlText w:val=""/>
+      <w:lvlJc w:val="left"/>
+      <w:pPr>
+        <w:tabs>
+          <w:tab w:val="num" w:pos="2880"/>
+        </w:tabs>
+        <w:ind w:left="2880" w:hanging="360"/>
+      </w:pPr>
+      <w:rPr>
+        <w:rFonts w:ascii="Wingdings" w:hAnsi="Wingdings" w:hint="default"/>
+        <w:sz w:val="20"/>
+      </w:rPr>
+    </w:lvl>
+    <w:lvl w:ilvl="4" w:tentative="1">
+      <w:start w:val="1"/>
+      <w:numFmt w:val="bullet"/>
+      <w:lvlText w:val=""/>
+      <w:lvlJc w:val="left"/>
+      <w:pPr>
+        <w:tabs>
+          <w:tab w:val="num" w:pos="3600"/>
+        </w:tabs>
+        <w:ind w:left="3600" w:hanging="360"/>
+      </w:pPr>
+      <w:rPr>
+        <w:rFonts w:ascii="Wingdings" w:hAnsi="Wingdings" w:hint="default"/>
+        <w:sz w:val="20"/>
+      </w:rPr>
+    </w:lvl>
+    <w:lvl w:ilvl="5" w:tentative="1">
+      <w:start w:val="1"/>
+      <w:numFmt w:val="bullet"/>
+      <w:lvlText w:val=""/>
+      <w:lvlJc w:val="left"/>
+      <w:pPr>
+        <w:tabs>
+          <w:tab w:val="num" w:pos="4320"/>
+        </w:tabs>
+        <w:ind w:left="4320" w:hanging="360"/>
+      </w:pPr>
+      <w:rPr>
+        <w:rFonts w:ascii="Wingdings" w:hAnsi="Wingdings" w:hint="default"/>
+        <w:sz w:val="20"/>
+      </w:rPr>
+    </w:lvl>
+    <w:lvl w:ilvl="6" w:tentative="1">
+      <w:start w:val="1"/>
+      <w:numFmt w:val="bullet"/>
+      <w:lvlText w:val=""/>
+      <w:lvlJc w:val="left"/>
+      <w:pPr>
+        <w:tabs>
+          <w:tab w:val="num" w:pos="5040"/>
+        </w:tabs>
+        <w:ind w:left="5040" w:hanging="360"/>
+      </w:pPr>
+      <w:rPr>
+        <w:rFonts w:ascii="Wingdings" w:hAnsi="Wingdings" w:hint="default"/>
+        <w:sz w:val="20"/>
+      </w:rPr>
+    </w:lvl>
+    <w:lvl w:ilvl="7" w:tentative="1">
+      <w:start w:val="1"/>
+      <w:numFmt w:val="bullet"/>
+      <w:lvlText w:val=""/>
+      <w:lvlJc w:val="left"/>
+      <w:pPr>
+        <w:tabs>
+          <w:tab w:val="num" w:pos="5760"/>
+        </w:tabs>
+        <w:ind w:left="5760" w:hanging="360"/>
+      </w:pPr>
+      <w:rPr>
+        <w:rFonts w:ascii="Wingdings" w:hAnsi="Wingdings" w:hint="default"/>
+        <w:sz w:val="20"/>
+      </w:rPr>
+    </w:lvl>
+    <w:lvl w:ilvl="8" w:tentative="1">
+      <w:start w:val="1"/>
+      <w:numFmt w:val="bullet"/>
+      <w:lvlText w:val=""/>
+      <w:lvlJc w:val="left"/>
+      <w:pPr>
+        <w:tabs>
+          <w:tab w:val="num" w:pos="6480"/>
+        </w:tabs>
+        <w:ind w:left="6480" w:hanging="360"/>
+      </w:pPr>
+      <w:rPr>
+        <w:rFonts w:ascii="Wingdings" w:hAnsi="Wingdings" w:hint="default"/>
+        <w:sz w:val="20"/>
+      </w:rPr>
+    </w:lvl>
+  </w:abstractNum>
+  <w:abstractNum w:abstractNumId="20" w15:restartNumberingAfterBreak="0">
+    <w:nsid w:val="78302469"/>
+    <w:multiLevelType w:val="multilevel"/>
+    <w:tmpl w:val="FDE00012"/>
     <w:lvl w:ilvl="0">
       <w:start w:val="1"/>
       <w:numFmt w:val="decimal"/>
@@ -7963,10 +9470,10 @@
       </w:pPr>
     </w:lvl>
   </w:abstractNum>
-  <w:abstractNum w:abstractNumId="11" w15:restartNumberingAfterBreak="0">
-    <w:nsid w:val="41367D89"/>
+  <w:abstractNum w:abstractNumId="21" w15:restartNumberingAfterBreak="0">
+    <w:nsid w:val="78714F70"/>
     <w:multiLevelType w:val="multilevel"/>
-    <w:tmpl w:val="6CE4D154"/>
+    <w:tmpl w:val="730401BC"/>
     <w:lvl w:ilvl="0">
       <w:start w:val="1"/>
       <w:numFmt w:val="bullet"/>
@@ -8112,308 +9619,10 @@
       </w:rPr>
     </w:lvl>
   </w:abstractNum>
-  <w:abstractNum w:abstractNumId="12" w15:restartNumberingAfterBreak="0">
-    <w:nsid w:val="4CDB2B4D"/>
+  <w:abstractNum w:abstractNumId="22" w15:restartNumberingAfterBreak="0">
+    <w:nsid w:val="7C395A97"/>
     <w:multiLevelType w:val="multilevel"/>
-    <w:tmpl w:val="B1D4B054"/>
-    <w:lvl w:ilvl="0">
-      <w:start w:val="1"/>
-      <w:numFmt w:val="bullet"/>
-      <w:lvlText w:val=""/>
-      <w:lvlJc w:val="left"/>
-      <w:pPr>
-        <w:tabs>
-          <w:tab w:val="num" w:pos="720"/>
-        </w:tabs>
-        <w:ind w:left="720" w:hanging="360"/>
-      </w:pPr>
-      <w:rPr>
-        <w:rFonts w:ascii="Symbol" w:hAnsi="Symbol" w:hint="default"/>
-        <w:sz w:val="20"/>
-      </w:rPr>
-    </w:lvl>
-    <w:lvl w:ilvl="1" w:tentative="1">
-      <w:start w:val="1"/>
-      <w:numFmt w:val="bullet"/>
-      <w:lvlText w:val="o"/>
-      <w:lvlJc w:val="left"/>
-      <w:pPr>
-        <w:tabs>
-          <w:tab w:val="num" w:pos="1440"/>
-        </w:tabs>
-        <w:ind w:left="1440" w:hanging="360"/>
-      </w:pPr>
-      <w:rPr>
-        <w:rFonts w:ascii="Courier New" w:hAnsi="Courier New" w:hint="default"/>
-        <w:sz w:val="20"/>
-      </w:rPr>
-    </w:lvl>
-    <w:lvl w:ilvl="2" w:tentative="1">
-      <w:start w:val="1"/>
-      <w:numFmt w:val="bullet"/>
-      <w:lvlText w:val=""/>
-      <w:lvlJc w:val="left"/>
-      <w:pPr>
-        <w:tabs>
-          <w:tab w:val="num" w:pos="2160"/>
-        </w:tabs>
-        <w:ind w:left="2160" w:hanging="360"/>
-      </w:pPr>
-      <w:rPr>
-        <w:rFonts w:ascii="Wingdings" w:hAnsi="Wingdings" w:hint="default"/>
-        <w:sz w:val="20"/>
-      </w:rPr>
-    </w:lvl>
-    <w:lvl w:ilvl="3" w:tentative="1">
-      <w:start w:val="1"/>
-      <w:numFmt w:val="bullet"/>
-      <w:lvlText w:val=""/>
-      <w:lvlJc w:val="left"/>
-      <w:pPr>
-        <w:tabs>
-          <w:tab w:val="num" w:pos="2880"/>
-        </w:tabs>
-        <w:ind w:left="2880" w:hanging="360"/>
-      </w:pPr>
-      <w:rPr>
-        <w:rFonts w:ascii="Wingdings" w:hAnsi="Wingdings" w:hint="default"/>
-        <w:sz w:val="20"/>
-      </w:rPr>
-    </w:lvl>
-    <w:lvl w:ilvl="4" w:tentative="1">
-      <w:start w:val="1"/>
-      <w:numFmt w:val="bullet"/>
-      <w:lvlText w:val=""/>
-      <w:lvlJc w:val="left"/>
-      <w:pPr>
-        <w:tabs>
-          <w:tab w:val="num" w:pos="3600"/>
-        </w:tabs>
-        <w:ind w:left="3600" w:hanging="360"/>
-      </w:pPr>
-      <w:rPr>
-        <w:rFonts w:ascii="Wingdings" w:hAnsi="Wingdings" w:hint="default"/>
-        <w:sz w:val="20"/>
-      </w:rPr>
-    </w:lvl>
-    <w:lvl w:ilvl="5" w:tentative="1">
-      <w:start w:val="1"/>
-      <w:numFmt w:val="bullet"/>
-      <w:lvlText w:val=""/>
-      <w:lvlJc w:val="left"/>
-      <w:pPr>
-        <w:tabs>
-          <w:tab w:val="num" w:pos="4320"/>
-        </w:tabs>
-        <w:ind w:left="4320" w:hanging="360"/>
-      </w:pPr>
-      <w:rPr>
-        <w:rFonts w:ascii="Wingdings" w:hAnsi="Wingdings" w:hint="default"/>
-        <w:sz w:val="20"/>
-      </w:rPr>
-    </w:lvl>
-    <w:lvl w:ilvl="6" w:tentative="1">
-      <w:start w:val="1"/>
-      <w:numFmt w:val="bullet"/>
-      <w:lvlText w:val=""/>
-      <w:lvlJc w:val="left"/>
-      <w:pPr>
-        <w:tabs>
-          <w:tab w:val="num" w:pos="5040"/>
-        </w:tabs>
-        <w:ind w:left="5040" w:hanging="360"/>
-      </w:pPr>
-      <w:rPr>
-        <w:rFonts w:ascii="Wingdings" w:hAnsi="Wingdings" w:hint="default"/>
-        <w:sz w:val="20"/>
-      </w:rPr>
-    </w:lvl>
-    <w:lvl w:ilvl="7" w:tentative="1">
-      <w:start w:val="1"/>
-      <w:numFmt w:val="bullet"/>
-      <w:lvlText w:val=""/>
-      <w:lvlJc w:val="left"/>
-      <w:pPr>
-        <w:tabs>
-          <w:tab w:val="num" w:pos="5760"/>
-        </w:tabs>
-        <w:ind w:left="5760" w:hanging="360"/>
-      </w:pPr>
-      <w:rPr>
-        <w:rFonts w:ascii="Wingdings" w:hAnsi="Wingdings" w:hint="default"/>
-        <w:sz w:val="20"/>
-      </w:rPr>
-    </w:lvl>
-    <w:lvl w:ilvl="8" w:tentative="1">
-      <w:start w:val="1"/>
-      <w:numFmt w:val="bullet"/>
-      <w:lvlText w:val=""/>
-      <w:lvlJc w:val="left"/>
-      <w:pPr>
-        <w:tabs>
-          <w:tab w:val="num" w:pos="6480"/>
-        </w:tabs>
-        <w:ind w:left="6480" w:hanging="360"/>
-      </w:pPr>
-      <w:rPr>
-        <w:rFonts w:ascii="Wingdings" w:hAnsi="Wingdings" w:hint="default"/>
-        <w:sz w:val="20"/>
-      </w:rPr>
-    </w:lvl>
-  </w:abstractNum>
-  <w:abstractNum w:abstractNumId="13" w15:restartNumberingAfterBreak="0">
-    <w:nsid w:val="4EFF4799"/>
-    <w:multiLevelType w:val="multilevel"/>
-    <w:tmpl w:val="F68A9C46"/>
-    <w:lvl w:ilvl="0">
-      <w:start w:val="1"/>
-      <w:numFmt w:val="bullet"/>
-      <w:lvlText w:val=""/>
-      <w:lvlJc w:val="left"/>
-      <w:pPr>
-        <w:tabs>
-          <w:tab w:val="num" w:pos="720"/>
-        </w:tabs>
-        <w:ind w:left="720" w:hanging="360"/>
-      </w:pPr>
-      <w:rPr>
-        <w:rFonts w:ascii="Symbol" w:hAnsi="Symbol" w:hint="default"/>
-        <w:sz w:val="20"/>
-      </w:rPr>
-    </w:lvl>
-    <w:lvl w:ilvl="1" w:tentative="1">
-      <w:start w:val="1"/>
-      <w:numFmt w:val="bullet"/>
-      <w:lvlText w:val="o"/>
-      <w:lvlJc w:val="left"/>
-      <w:pPr>
-        <w:tabs>
-          <w:tab w:val="num" w:pos="1440"/>
-        </w:tabs>
-        <w:ind w:left="1440" w:hanging="360"/>
-      </w:pPr>
-      <w:rPr>
-        <w:rFonts w:ascii="Courier New" w:hAnsi="Courier New" w:hint="default"/>
-        <w:sz w:val="20"/>
-      </w:rPr>
-    </w:lvl>
-    <w:lvl w:ilvl="2" w:tentative="1">
-      <w:start w:val="1"/>
-      <w:numFmt w:val="bullet"/>
-      <w:lvlText w:val=""/>
-      <w:lvlJc w:val="left"/>
-      <w:pPr>
-        <w:tabs>
-          <w:tab w:val="num" w:pos="2160"/>
-        </w:tabs>
-        <w:ind w:left="2160" w:hanging="360"/>
-      </w:pPr>
-      <w:rPr>
-        <w:rFonts w:ascii="Wingdings" w:hAnsi="Wingdings" w:hint="default"/>
-        <w:sz w:val="20"/>
-      </w:rPr>
-    </w:lvl>
-    <w:lvl w:ilvl="3" w:tentative="1">
-      <w:start w:val="1"/>
-      <w:numFmt w:val="bullet"/>
-      <w:lvlText w:val=""/>
-      <w:lvlJc w:val="left"/>
-      <w:pPr>
-        <w:tabs>
-          <w:tab w:val="num" w:pos="2880"/>
-        </w:tabs>
-        <w:ind w:left="2880" w:hanging="360"/>
-      </w:pPr>
-      <w:rPr>
-        <w:rFonts w:ascii="Wingdings" w:hAnsi="Wingdings" w:hint="default"/>
-        <w:sz w:val="20"/>
-      </w:rPr>
-    </w:lvl>
-    <w:lvl w:ilvl="4" w:tentative="1">
-      <w:start w:val="1"/>
-      <w:numFmt w:val="bullet"/>
-      <w:lvlText w:val=""/>
-      <w:lvlJc w:val="left"/>
-      <w:pPr>
-        <w:tabs>
-          <w:tab w:val="num" w:pos="3600"/>
-        </w:tabs>
-        <w:ind w:left="3600" w:hanging="360"/>
-      </w:pPr>
-      <w:rPr>
-        <w:rFonts w:ascii="Wingdings" w:hAnsi="Wingdings" w:hint="default"/>
-        <w:sz w:val="20"/>
-      </w:rPr>
-    </w:lvl>
-    <w:lvl w:ilvl="5" w:tentative="1">
-      <w:start w:val="1"/>
-      <w:numFmt w:val="bullet"/>
-      <w:lvlText w:val=""/>
-      <w:lvlJc w:val="left"/>
-      <w:pPr>
-        <w:tabs>
-          <w:tab w:val="num" w:pos="4320"/>
-        </w:tabs>
-        <w:ind w:left="4320" w:hanging="360"/>
-      </w:pPr>
-      <w:rPr>
-        <w:rFonts w:ascii="Wingdings" w:hAnsi="Wingdings" w:hint="default"/>
-        <w:sz w:val="20"/>
-      </w:rPr>
-    </w:lvl>
-    <w:lvl w:ilvl="6" w:tentative="1">
-      <w:start w:val="1"/>
-      <w:numFmt w:val="bullet"/>
-      <w:lvlText w:val=""/>
-      <w:lvlJc w:val="left"/>
-      <w:pPr>
-        <w:tabs>
-          <w:tab w:val="num" w:pos="5040"/>
-        </w:tabs>
-        <w:ind w:left="5040" w:hanging="360"/>
-      </w:pPr>
-      <w:rPr>
-        <w:rFonts w:ascii="Wingdings" w:hAnsi="Wingdings" w:hint="default"/>
-        <w:sz w:val="20"/>
-      </w:rPr>
-    </w:lvl>
-    <w:lvl w:ilvl="7" w:tentative="1">
-      <w:start w:val="1"/>
-      <w:numFmt w:val="bullet"/>
-      <w:lvlText w:val=""/>
-      <w:lvlJc w:val="left"/>
-      <w:pPr>
-        <w:tabs>
-          <w:tab w:val="num" w:pos="5760"/>
-        </w:tabs>
-        <w:ind w:left="5760" w:hanging="360"/>
-      </w:pPr>
-      <w:rPr>
-        <w:rFonts w:ascii="Wingdings" w:hAnsi="Wingdings" w:hint="default"/>
-        <w:sz w:val="20"/>
-      </w:rPr>
-    </w:lvl>
-    <w:lvl w:ilvl="8" w:tentative="1">
-      <w:start w:val="1"/>
-      <w:numFmt w:val="bullet"/>
-      <w:lvlText w:val=""/>
-      <w:lvlJc w:val="left"/>
-      <w:pPr>
-        <w:tabs>
-          <w:tab w:val="num" w:pos="6480"/>
-        </w:tabs>
-        <w:ind w:left="6480" w:hanging="360"/>
-      </w:pPr>
-      <w:rPr>
-        <w:rFonts w:ascii="Wingdings" w:hAnsi="Wingdings" w:hint="default"/>
-        <w:sz w:val="20"/>
-      </w:rPr>
-    </w:lvl>
-  </w:abstractNum>
-  <w:abstractNum w:abstractNumId="14" w15:restartNumberingAfterBreak="0">
-    <w:nsid w:val="577A34D1"/>
-    <w:multiLevelType w:val="multilevel"/>
-    <w:tmpl w:val="C436F832"/>
+    <w:tmpl w:val="4C583BCE"/>
     <w:lvl w:ilvl="0">
       <w:start w:val="1"/>
       <w:numFmt w:val="decimal"/>
@@ -8527,904 +9736,10 @@
       </w:pPr>
     </w:lvl>
   </w:abstractNum>
-  <w:abstractNum w:abstractNumId="15" w15:restartNumberingAfterBreak="0">
-    <w:nsid w:val="582E1483"/>
+  <w:abstractNum w:abstractNumId="23" w15:restartNumberingAfterBreak="0">
+    <w:nsid w:val="7DFB654D"/>
     <w:multiLevelType w:val="multilevel"/>
-    <w:tmpl w:val="3168B22C"/>
-    <w:lvl w:ilvl="0">
-      <w:start w:val="1"/>
-      <w:numFmt w:val="bullet"/>
-      <w:lvlText w:val=""/>
-      <w:lvlJc w:val="left"/>
-      <w:pPr>
-        <w:tabs>
-          <w:tab w:val="num" w:pos="720"/>
-        </w:tabs>
-        <w:ind w:left="720" w:hanging="360"/>
-      </w:pPr>
-      <w:rPr>
-        <w:rFonts w:ascii="Symbol" w:hAnsi="Symbol" w:hint="default"/>
-        <w:sz w:val="20"/>
-      </w:rPr>
-    </w:lvl>
-    <w:lvl w:ilvl="1" w:tentative="1">
-      <w:start w:val="1"/>
-      <w:numFmt w:val="bullet"/>
-      <w:lvlText w:val="o"/>
-      <w:lvlJc w:val="left"/>
-      <w:pPr>
-        <w:tabs>
-          <w:tab w:val="num" w:pos="1440"/>
-        </w:tabs>
-        <w:ind w:left="1440" w:hanging="360"/>
-      </w:pPr>
-      <w:rPr>
-        <w:rFonts w:ascii="Courier New" w:hAnsi="Courier New" w:hint="default"/>
-        <w:sz w:val="20"/>
-      </w:rPr>
-    </w:lvl>
-    <w:lvl w:ilvl="2" w:tentative="1">
-      <w:start w:val="1"/>
-      <w:numFmt w:val="bullet"/>
-      <w:lvlText w:val=""/>
-      <w:lvlJc w:val="left"/>
-      <w:pPr>
-        <w:tabs>
-          <w:tab w:val="num" w:pos="2160"/>
-        </w:tabs>
-        <w:ind w:left="2160" w:hanging="360"/>
-      </w:pPr>
-      <w:rPr>
-        <w:rFonts w:ascii="Wingdings" w:hAnsi="Wingdings" w:hint="default"/>
-        <w:sz w:val="20"/>
-      </w:rPr>
-    </w:lvl>
-    <w:lvl w:ilvl="3" w:tentative="1">
-      <w:start w:val="1"/>
-      <w:numFmt w:val="bullet"/>
-      <w:lvlText w:val=""/>
-      <w:lvlJc w:val="left"/>
-      <w:pPr>
-        <w:tabs>
-          <w:tab w:val="num" w:pos="2880"/>
-        </w:tabs>
-        <w:ind w:left="2880" w:hanging="360"/>
-      </w:pPr>
-      <w:rPr>
-        <w:rFonts w:ascii="Wingdings" w:hAnsi="Wingdings" w:hint="default"/>
-        <w:sz w:val="20"/>
-      </w:rPr>
-    </w:lvl>
-    <w:lvl w:ilvl="4" w:tentative="1">
-      <w:start w:val="1"/>
-      <w:numFmt w:val="bullet"/>
-      <w:lvlText w:val=""/>
-      <w:lvlJc w:val="left"/>
-      <w:pPr>
-        <w:tabs>
-          <w:tab w:val="num" w:pos="3600"/>
-        </w:tabs>
-        <w:ind w:left="3600" w:hanging="360"/>
-      </w:pPr>
-      <w:rPr>
-        <w:rFonts w:ascii="Wingdings" w:hAnsi="Wingdings" w:hint="default"/>
-        <w:sz w:val="20"/>
-      </w:rPr>
-    </w:lvl>
-    <w:lvl w:ilvl="5" w:tentative="1">
-      <w:start w:val="1"/>
-      <w:numFmt w:val="bullet"/>
-      <w:lvlText w:val=""/>
-      <w:lvlJc w:val="left"/>
-      <w:pPr>
-        <w:tabs>
-          <w:tab w:val="num" w:pos="4320"/>
-        </w:tabs>
-        <w:ind w:left="4320" w:hanging="360"/>
-      </w:pPr>
-      <w:rPr>
-        <w:rFonts w:ascii="Wingdings" w:hAnsi="Wingdings" w:hint="default"/>
-        <w:sz w:val="20"/>
-      </w:rPr>
-    </w:lvl>
-    <w:lvl w:ilvl="6" w:tentative="1">
-      <w:start w:val="1"/>
-      <w:numFmt w:val="bullet"/>
-      <w:lvlText w:val=""/>
-      <w:lvlJc w:val="left"/>
-      <w:pPr>
-        <w:tabs>
-          <w:tab w:val="num" w:pos="5040"/>
-        </w:tabs>
-        <w:ind w:left="5040" w:hanging="360"/>
-      </w:pPr>
-      <w:rPr>
-        <w:rFonts w:ascii="Wingdings" w:hAnsi="Wingdings" w:hint="default"/>
-        <w:sz w:val="20"/>
-      </w:rPr>
-    </w:lvl>
-    <w:lvl w:ilvl="7" w:tentative="1">
-      <w:start w:val="1"/>
-      <w:numFmt w:val="bullet"/>
-      <w:lvlText w:val=""/>
-      <w:lvlJc w:val="left"/>
-      <w:pPr>
-        <w:tabs>
-          <w:tab w:val="num" w:pos="5760"/>
-        </w:tabs>
-        <w:ind w:left="5760" w:hanging="360"/>
-      </w:pPr>
-      <w:rPr>
-        <w:rFonts w:ascii="Wingdings" w:hAnsi="Wingdings" w:hint="default"/>
-        <w:sz w:val="20"/>
-      </w:rPr>
-    </w:lvl>
-    <w:lvl w:ilvl="8" w:tentative="1">
-      <w:start w:val="1"/>
-      <w:numFmt w:val="bullet"/>
-      <w:lvlText w:val=""/>
-      <w:lvlJc w:val="left"/>
-      <w:pPr>
-        <w:tabs>
-          <w:tab w:val="num" w:pos="6480"/>
-        </w:tabs>
-        <w:ind w:left="6480" w:hanging="360"/>
-      </w:pPr>
-      <w:rPr>
-        <w:rFonts w:ascii="Wingdings" w:hAnsi="Wingdings" w:hint="default"/>
-        <w:sz w:val="20"/>
-      </w:rPr>
-    </w:lvl>
-  </w:abstractNum>
-  <w:abstractNum w:abstractNumId="16" w15:restartNumberingAfterBreak="0">
-    <w:nsid w:val="644C0126"/>
-    <w:multiLevelType w:val="multilevel"/>
-    <w:tmpl w:val="68F87042"/>
-    <w:lvl w:ilvl="0">
-      <w:start w:val="1"/>
-      <w:numFmt w:val="bullet"/>
-      <w:lvlText w:val=""/>
-      <w:lvlJc w:val="left"/>
-      <w:pPr>
-        <w:tabs>
-          <w:tab w:val="num" w:pos="720"/>
-        </w:tabs>
-        <w:ind w:left="720" w:hanging="360"/>
-      </w:pPr>
-      <w:rPr>
-        <w:rFonts w:ascii="Symbol" w:hAnsi="Symbol" w:hint="default"/>
-        <w:sz w:val="20"/>
-      </w:rPr>
-    </w:lvl>
-    <w:lvl w:ilvl="1" w:tentative="1">
-      <w:start w:val="1"/>
-      <w:numFmt w:val="bullet"/>
-      <w:lvlText w:val="o"/>
-      <w:lvlJc w:val="left"/>
-      <w:pPr>
-        <w:tabs>
-          <w:tab w:val="num" w:pos="1440"/>
-        </w:tabs>
-        <w:ind w:left="1440" w:hanging="360"/>
-      </w:pPr>
-      <w:rPr>
-        <w:rFonts w:ascii="Courier New" w:hAnsi="Courier New" w:hint="default"/>
-        <w:sz w:val="20"/>
-      </w:rPr>
-    </w:lvl>
-    <w:lvl w:ilvl="2" w:tentative="1">
-      <w:start w:val="1"/>
-      <w:numFmt w:val="bullet"/>
-      <w:lvlText w:val=""/>
-      <w:lvlJc w:val="left"/>
-      <w:pPr>
-        <w:tabs>
-          <w:tab w:val="num" w:pos="2160"/>
-        </w:tabs>
-        <w:ind w:left="2160" w:hanging="360"/>
-      </w:pPr>
-      <w:rPr>
-        <w:rFonts w:ascii="Wingdings" w:hAnsi="Wingdings" w:hint="default"/>
-        <w:sz w:val="20"/>
-      </w:rPr>
-    </w:lvl>
-    <w:lvl w:ilvl="3" w:tentative="1">
-      <w:start w:val="1"/>
-      <w:numFmt w:val="bullet"/>
-      <w:lvlText w:val=""/>
-      <w:lvlJc w:val="left"/>
-      <w:pPr>
-        <w:tabs>
-          <w:tab w:val="num" w:pos="2880"/>
-        </w:tabs>
-        <w:ind w:left="2880" w:hanging="360"/>
-      </w:pPr>
-      <w:rPr>
-        <w:rFonts w:ascii="Wingdings" w:hAnsi="Wingdings" w:hint="default"/>
-        <w:sz w:val="20"/>
-      </w:rPr>
-    </w:lvl>
-    <w:lvl w:ilvl="4" w:tentative="1">
-      <w:start w:val="1"/>
-      <w:numFmt w:val="bullet"/>
-      <w:lvlText w:val=""/>
-      <w:lvlJc w:val="left"/>
-      <w:pPr>
-        <w:tabs>
-          <w:tab w:val="num" w:pos="3600"/>
-        </w:tabs>
-        <w:ind w:left="3600" w:hanging="360"/>
-      </w:pPr>
-      <w:rPr>
-        <w:rFonts w:ascii="Wingdings" w:hAnsi="Wingdings" w:hint="default"/>
-        <w:sz w:val="20"/>
-      </w:rPr>
-    </w:lvl>
-    <w:lvl w:ilvl="5" w:tentative="1">
-      <w:start w:val="1"/>
-      <w:numFmt w:val="bullet"/>
-      <w:lvlText w:val=""/>
-      <w:lvlJc w:val="left"/>
-      <w:pPr>
-        <w:tabs>
-          <w:tab w:val="num" w:pos="4320"/>
-        </w:tabs>
-        <w:ind w:left="4320" w:hanging="360"/>
-      </w:pPr>
-      <w:rPr>
-        <w:rFonts w:ascii="Wingdings" w:hAnsi="Wingdings" w:hint="default"/>
-        <w:sz w:val="20"/>
-      </w:rPr>
-    </w:lvl>
-    <w:lvl w:ilvl="6" w:tentative="1">
-      <w:start w:val="1"/>
-      <w:numFmt w:val="bullet"/>
-      <w:lvlText w:val=""/>
-      <w:lvlJc w:val="left"/>
-      <w:pPr>
-        <w:tabs>
-          <w:tab w:val="num" w:pos="5040"/>
-        </w:tabs>
-        <w:ind w:left="5040" w:hanging="360"/>
-      </w:pPr>
-      <w:rPr>
-        <w:rFonts w:ascii="Wingdings" w:hAnsi="Wingdings" w:hint="default"/>
-        <w:sz w:val="20"/>
-      </w:rPr>
-    </w:lvl>
-    <w:lvl w:ilvl="7" w:tentative="1">
-      <w:start w:val="1"/>
-      <w:numFmt w:val="bullet"/>
-      <w:lvlText w:val=""/>
-      <w:lvlJc w:val="left"/>
-      <w:pPr>
-        <w:tabs>
-          <w:tab w:val="num" w:pos="5760"/>
-        </w:tabs>
-        <w:ind w:left="5760" w:hanging="360"/>
-      </w:pPr>
-      <w:rPr>
-        <w:rFonts w:ascii="Wingdings" w:hAnsi="Wingdings" w:hint="default"/>
-        <w:sz w:val="20"/>
-      </w:rPr>
-    </w:lvl>
-    <w:lvl w:ilvl="8" w:tentative="1">
-      <w:start w:val="1"/>
-      <w:numFmt w:val="bullet"/>
-      <w:lvlText w:val=""/>
-      <w:lvlJc w:val="left"/>
-      <w:pPr>
-        <w:tabs>
-          <w:tab w:val="num" w:pos="6480"/>
-        </w:tabs>
-        <w:ind w:left="6480" w:hanging="360"/>
-      </w:pPr>
-      <w:rPr>
-        <w:rFonts w:ascii="Wingdings" w:hAnsi="Wingdings" w:hint="default"/>
-        <w:sz w:val="20"/>
-      </w:rPr>
-    </w:lvl>
-  </w:abstractNum>
-  <w:abstractNum w:abstractNumId="17" w15:restartNumberingAfterBreak="0">
-    <w:nsid w:val="666A4A82"/>
-    <w:multiLevelType w:val="multilevel"/>
-    <w:tmpl w:val="5900AF72"/>
-    <w:lvl w:ilvl="0">
-      <w:start w:val="1"/>
-      <w:numFmt w:val="bullet"/>
-      <w:lvlText w:val=""/>
-      <w:lvlJc w:val="left"/>
-      <w:pPr>
-        <w:tabs>
-          <w:tab w:val="num" w:pos="720"/>
-        </w:tabs>
-        <w:ind w:left="720" w:hanging="360"/>
-      </w:pPr>
-      <w:rPr>
-        <w:rFonts w:ascii="Symbol" w:hAnsi="Symbol" w:hint="default"/>
-        <w:sz w:val="20"/>
-      </w:rPr>
-    </w:lvl>
-    <w:lvl w:ilvl="1" w:tentative="1">
-      <w:start w:val="1"/>
-      <w:numFmt w:val="bullet"/>
-      <w:lvlText w:val="o"/>
-      <w:lvlJc w:val="left"/>
-      <w:pPr>
-        <w:tabs>
-          <w:tab w:val="num" w:pos="1440"/>
-        </w:tabs>
-        <w:ind w:left="1440" w:hanging="360"/>
-      </w:pPr>
-      <w:rPr>
-        <w:rFonts w:ascii="Courier New" w:hAnsi="Courier New" w:hint="default"/>
-        <w:sz w:val="20"/>
-      </w:rPr>
-    </w:lvl>
-    <w:lvl w:ilvl="2" w:tentative="1">
-      <w:start w:val="1"/>
-      <w:numFmt w:val="bullet"/>
-      <w:lvlText w:val=""/>
-      <w:lvlJc w:val="left"/>
-      <w:pPr>
-        <w:tabs>
-          <w:tab w:val="num" w:pos="2160"/>
-        </w:tabs>
-        <w:ind w:left="2160" w:hanging="360"/>
-      </w:pPr>
-      <w:rPr>
-        <w:rFonts w:ascii="Wingdings" w:hAnsi="Wingdings" w:hint="default"/>
-        <w:sz w:val="20"/>
-      </w:rPr>
-    </w:lvl>
-    <w:lvl w:ilvl="3" w:tentative="1">
-      <w:start w:val="1"/>
-      <w:numFmt w:val="bullet"/>
-      <w:lvlText w:val=""/>
-      <w:lvlJc w:val="left"/>
-      <w:pPr>
-        <w:tabs>
-          <w:tab w:val="num" w:pos="2880"/>
-        </w:tabs>
-        <w:ind w:left="2880" w:hanging="360"/>
-      </w:pPr>
-      <w:rPr>
-        <w:rFonts w:ascii="Wingdings" w:hAnsi="Wingdings" w:hint="default"/>
-        <w:sz w:val="20"/>
-      </w:rPr>
-    </w:lvl>
-    <w:lvl w:ilvl="4" w:tentative="1">
-      <w:start w:val="1"/>
-      <w:numFmt w:val="bullet"/>
-      <w:lvlText w:val=""/>
-      <w:lvlJc w:val="left"/>
-      <w:pPr>
-        <w:tabs>
-          <w:tab w:val="num" w:pos="3600"/>
-        </w:tabs>
-        <w:ind w:left="3600" w:hanging="360"/>
-      </w:pPr>
-      <w:rPr>
-        <w:rFonts w:ascii="Wingdings" w:hAnsi="Wingdings" w:hint="default"/>
-        <w:sz w:val="20"/>
-      </w:rPr>
-    </w:lvl>
-    <w:lvl w:ilvl="5" w:tentative="1">
-      <w:start w:val="1"/>
-      <w:numFmt w:val="bullet"/>
-      <w:lvlText w:val=""/>
-      <w:lvlJc w:val="left"/>
-      <w:pPr>
-        <w:tabs>
-          <w:tab w:val="num" w:pos="4320"/>
-        </w:tabs>
-        <w:ind w:left="4320" w:hanging="360"/>
-      </w:pPr>
-      <w:rPr>
-        <w:rFonts w:ascii="Wingdings" w:hAnsi="Wingdings" w:hint="default"/>
-        <w:sz w:val="20"/>
-      </w:rPr>
-    </w:lvl>
-    <w:lvl w:ilvl="6" w:tentative="1">
-      <w:start w:val="1"/>
-      <w:numFmt w:val="bullet"/>
-      <w:lvlText w:val=""/>
-      <w:lvlJc w:val="left"/>
-      <w:pPr>
-        <w:tabs>
-          <w:tab w:val="num" w:pos="5040"/>
-        </w:tabs>
-        <w:ind w:left="5040" w:hanging="360"/>
-      </w:pPr>
-      <w:rPr>
-        <w:rFonts w:ascii="Wingdings" w:hAnsi="Wingdings" w:hint="default"/>
-        <w:sz w:val="20"/>
-      </w:rPr>
-    </w:lvl>
-    <w:lvl w:ilvl="7" w:tentative="1">
-      <w:start w:val="1"/>
-      <w:numFmt w:val="bullet"/>
-      <w:lvlText w:val=""/>
-      <w:lvlJc w:val="left"/>
-      <w:pPr>
-        <w:tabs>
-          <w:tab w:val="num" w:pos="5760"/>
-        </w:tabs>
-        <w:ind w:left="5760" w:hanging="360"/>
-      </w:pPr>
-      <w:rPr>
-        <w:rFonts w:ascii="Wingdings" w:hAnsi="Wingdings" w:hint="default"/>
-        <w:sz w:val="20"/>
-      </w:rPr>
-    </w:lvl>
-    <w:lvl w:ilvl="8" w:tentative="1">
-      <w:start w:val="1"/>
-      <w:numFmt w:val="bullet"/>
-      <w:lvlText w:val=""/>
-      <w:lvlJc w:val="left"/>
-      <w:pPr>
-        <w:tabs>
-          <w:tab w:val="num" w:pos="6480"/>
-        </w:tabs>
-        <w:ind w:left="6480" w:hanging="360"/>
-      </w:pPr>
-      <w:rPr>
-        <w:rFonts w:ascii="Wingdings" w:hAnsi="Wingdings" w:hint="default"/>
-        <w:sz w:val="20"/>
-      </w:rPr>
-    </w:lvl>
-  </w:abstractNum>
-  <w:abstractNum w:abstractNumId="18" w15:restartNumberingAfterBreak="0">
-    <w:nsid w:val="6BA56F05"/>
-    <w:multiLevelType w:val="multilevel"/>
-    <w:tmpl w:val="B200427E"/>
-    <w:lvl w:ilvl="0">
-      <w:start w:val="1"/>
-      <w:numFmt w:val="bullet"/>
-      <w:lvlText w:val=""/>
-      <w:lvlJc w:val="left"/>
-      <w:pPr>
-        <w:tabs>
-          <w:tab w:val="num" w:pos="720"/>
-        </w:tabs>
-        <w:ind w:left="720" w:hanging="360"/>
-      </w:pPr>
-      <w:rPr>
-        <w:rFonts w:ascii="Symbol" w:hAnsi="Symbol" w:hint="default"/>
-        <w:sz w:val="20"/>
-      </w:rPr>
-    </w:lvl>
-    <w:lvl w:ilvl="1" w:tentative="1">
-      <w:start w:val="1"/>
-      <w:numFmt w:val="bullet"/>
-      <w:lvlText w:val="o"/>
-      <w:lvlJc w:val="left"/>
-      <w:pPr>
-        <w:tabs>
-          <w:tab w:val="num" w:pos="1440"/>
-        </w:tabs>
-        <w:ind w:left="1440" w:hanging="360"/>
-      </w:pPr>
-      <w:rPr>
-        <w:rFonts w:ascii="Courier New" w:hAnsi="Courier New" w:hint="default"/>
-        <w:sz w:val="20"/>
-      </w:rPr>
-    </w:lvl>
-    <w:lvl w:ilvl="2" w:tentative="1">
-      <w:start w:val="1"/>
-      <w:numFmt w:val="bullet"/>
-      <w:lvlText w:val=""/>
-      <w:lvlJc w:val="left"/>
-      <w:pPr>
-        <w:tabs>
-          <w:tab w:val="num" w:pos="2160"/>
-        </w:tabs>
-        <w:ind w:left="2160" w:hanging="360"/>
-      </w:pPr>
-      <w:rPr>
-        <w:rFonts w:ascii="Wingdings" w:hAnsi="Wingdings" w:hint="default"/>
-        <w:sz w:val="20"/>
-      </w:rPr>
-    </w:lvl>
-    <w:lvl w:ilvl="3" w:tentative="1">
-      <w:start w:val="1"/>
-      <w:numFmt w:val="bullet"/>
-      <w:lvlText w:val=""/>
-      <w:lvlJc w:val="left"/>
-      <w:pPr>
-        <w:tabs>
-          <w:tab w:val="num" w:pos="2880"/>
-        </w:tabs>
-        <w:ind w:left="2880" w:hanging="360"/>
-      </w:pPr>
-      <w:rPr>
-        <w:rFonts w:ascii="Wingdings" w:hAnsi="Wingdings" w:hint="default"/>
-        <w:sz w:val="20"/>
-      </w:rPr>
-    </w:lvl>
-    <w:lvl w:ilvl="4" w:tentative="1">
-      <w:start w:val="1"/>
-      <w:numFmt w:val="bullet"/>
-      <w:lvlText w:val=""/>
-      <w:lvlJc w:val="left"/>
-      <w:pPr>
-        <w:tabs>
-          <w:tab w:val="num" w:pos="3600"/>
-        </w:tabs>
-        <w:ind w:left="3600" w:hanging="360"/>
-      </w:pPr>
-      <w:rPr>
-        <w:rFonts w:ascii="Wingdings" w:hAnsi="Wingdings" w:hint="default"/>
-        <w:sz w:val="20"/>
-      </w:rPr>
-    </w:lvl>
-    <w:lvl w:ilvl="5" w:tentative="1">
-      <w:start w:val="1"/>
-      <w:numFmt w:val="bullet"/>
-      <w:lvlText w:val=""/>
-      <w:lvlJc w:val="left"/>
-      <w:pPr>
-        <w:tabs>
-          <w:tab w:val="num" w:pos="4320"/>
-        </w:tabs>
-        <w:ind w:left="4320" w:hanging="360"/>
-      </w:pPr>
-      <w:rPr>
-        <w:rFonts w:ascii="Wingdings" w:hAnsi="Wingdings" w:hint="default"/>
-        <w:sz w:val="20"/>
-      </w:rPr>
-    </w:lvl>
-    <w:lvl w:ilvl="6" w:tentative="1">
-      <w:start w:val="1"/>
-      <w:numFmt w:val="bullet"/>
-      <w:lvlText w:val=""/>
-      <w:lvlJc w:val="left"/>
-      <w:pPr>
-        <w:tabs>
-          <w:tab w:val="num" w:pos="5040"/>
-        </w:tabs>
-        <w:ind w:left="5040" w:hanging="360"/>
-      </w:pPr>
-      <w:rPr>
-        <w:rFonts w:ascii="Wingdings" w:hAnsi="Wingdings" w:hint="default"/>
-        <w:sz w:val="20"/>
-      </w:rPr>
-    </w:lvl>
-    <w:lvl w:ilvl="7" w:tentative="1">
-      <w:start w:val="1"/>
-      <w:numFmt w:val="bullet"/>
-      <w:lvlText w:val=""/>
-      <w:lvlJc w:val="left"/>
-      <w:pPr>
-        <w:tabs>
-          <w:tab w:val="num" w:pos="5760"/>
-        </w:tabs>
-        <w:ind w:left="5760" w:hanging="360"/>
-      </w:pPr>
-      <w:rPr>
-        <w:rFonts w:ascii="Wingdings" w:hAnsi="Wingdings" w:hint="default"/>
-        <w:sz w:val="20"/>
-      </w:rPr>
-    </w:lvl>
-    <w:lvl w:ilvl="8" w:tentative="1">
-      <w:start w:val="1"/>
-      <w:numFmt w:val="bullet"/>
-      <w:lvlText w:val=""/>
-      <w:lvlJc w:val="left"/>
-      <w:pPr>
-        <w:tabs>
-          <w:tab w:val="num" w:pos="6480"/>
-        </w:tabs>
-        <w:ind w:left="6480" w:hanging="360"/>
-      </w:pPr>
-      <w:rPr>
-        <w:rFonts w:ascii="Wingdings" w:hAnsi="Wingdings" w:hint="default"/>
-        <w:sz w:val="20"/>
-      </w:rPr>
-    </w:lvl>
-  </w:abstractNum>
-  <w:abstractNum w:abstractNumId="19" w15:restartNumberingAfterBreak="0">
-    <w:nsid w:val="6D540C72"/>
-    <w:multiLevelType w:val="multilevel"/>
-    <w:tmpl w:val="2220A812"/>
-    <w:lvl w:ilvl="0">
-      <w:start w:val="1"/>
-      <w:numFmt w:val="bullet"/>
-      <w:lvlText w:val=""/>
-      <w:lvlJc w:val="left"/>
-      <w:pPr>
-        <w:tabs>
-          <w:tab w:val="num" w:pos="720"/>
-        </w:tabs>
-        <w:ind w:left="720" w:hanging="360"/>
-      </w:pPr>
-      <w:rPr>
-        <w:rFonts w:ascii="Symbol" w:hAnsi="Symbol" w:hint="default"/>
-        <w:sz w:val="20"/>
-      </w:rPr>
-    </w:lvl>
-    <w:lvl w:ilvl="1" w:tentative="1">
-      <w:start w:val="1"/>
-      <w:numFmt w:val="bullet"/>
-      <w:lvlText w:val="o"/>
-      <w:lvlJc w:val="left"/>
-      <w:pPr>
-        <w:tabs>
-          <w:tab w:val="num" w:pos="1440"/>
-        </w:tabs>
-        <w:ind w:left="1440" w:hanging="360"/>
-      </w:pPr>
-      <w:rPr>
-        <w:rFonts w:ascii="Courier New" w:hAnsi="Courier New" w:hint="default"/>
-        <w:sz w:val="20"/>
-      </w:rPr>
-    </w:lvl>
-    <w:lvl w:ilvl="2" w:tentative="1">
-      <w:start w:val="1"/>
-      <w:numFmt w:val="bullet"/>
-      <w:lvlText w:val=""/>
-      <w:lvlJc w:val="left"/>
-      <w:pPr>
-        <w:tabs>
-          <w:tab w:val="num" w:pos="2160"/>
-        </w:tabs>
-        <w:ind w:left="2160" w:hanging="360"/>
-      </w:pPr>
-      <w:rPr>
-        <w:rFonts w:ascii="Wingdings" w:hAnsi="Wingdings" w:hint="default"/>
-        <w:sz w:val="20"/>
-      </w:rPr>
-    </w:lvl>
-    <w:lvl w:ilvl="3" w:tentative="1">
-      <w:start w:val="1"/>
-      <w:numFmt w:val="bullet"/>
-      <w:lvlText w:val=""/>
-      <w:lvlJc w:val="left"/>
-      <w:pPr>
-        <w:tabs>
-          <w:tab w:val="num" w:pos="2880"/>
-        </w:tabs>
-        <w:ind w:left="2880" w:hanging="360"/>
-      </w:pPr>
-      <w:rPr>
-        <w:rFonts w:ascii="Wingdings" w:hAnsi="Wingdings" w:hint="default"/>
-        <w:sz w:val="20"/>
-      </w:rPr>
-    </w:lvl>
-    <w:lvl w:ilvl="4" w:tentative="1">
-      <w:start w:val="1"/>
-      <w:numFmt w:val="bullet"/>
-      <w:lvlText w:val=""/>
-      <w:lvlJc w:val="left"/>
-      <w:pPr>
-        <w:tabs>
-          <w:tab w:val="num" w:pos="3600"/>
-        </w:tabs>
-        <w:ind w:left="3600" w:hanging="360"/>
-      </w:pPr>
-      <w:rPr>
-        <w:rFonts w:ascii="Wingdings" w:hAnsi="Wingdings" w:hint="default"/>
-        <w:sz w:val="20"/>
-      </w:rPr>
-    </w:lvl>
-    <w:lvl w:ilvl="5" w:tentative="1">
-      <w:start w:val="1"/>
-      <w:numFmt w:val="bullet"/>
-      <w:lvlText w:val=""/>
-      <w:lvlJc w:val="left"/>
-      <w:pPr>
-        <w:tabs>
-          <w:tab w:val="num" w:pos="4320"/>
-        </w:tabs>
-        <w:ind w:left="4320" w:hanging="360"/>
-      </w:pPr>
-      <w:rPr>
-        <w:rFonts w:ascii="Wingdings" w:hAnsi="Wingdings" w:hint="default"/>
-        <w:sz w:val="20"/>
-      </w:rPr>
-    </w:lvl>
-    <w:lvl w:ilvl="6" w:tentative="1">
-      <w:start w:val="1"/>
-      <w:numFmt w:val="bullet"/>
-      <w:lvlText w:val=""/>
-      <w:lvlJc w:val="left"/>
-      <w:pPr>
-        <w:tabs>
-          <w:tab w:val="num" w:pos="5040"/>
-        </w:tabs>
-        <w:ind w:left="5040" w:hanging="360"/>
-      </w:pPr>
-      <w:rPr>
-        <w:rFonts w:ascii="Wingdings" w:hAnsi="Wingdings" w:hint="default"/>
-        <w:sz w:val="20"/>
-      </w:rPr>
-    </w:lvl>
-    <w:lvl w:ilvl="7" w:tentative="1">
-      <w:start w:val="1"/>
-      <w:numFmt w:val="bullet"/>
-      <w:lvlText w:val=""/>
-      <w:lvlJc w:val="left"/>
-      <w:pPr>
-        <w:tabs>
-          <w:tab w:val="num" w:pos="5760"/>
-        </w:tabs>
-        <w:ind w:left="5760" w:hanging="360"/>
-      </w:pPr>
-      <w:rPr>
-        <w:rFonts w:ascii="Wingdings" w:hAnsi="Wingdings" w:hint="default"/>
-        <w:sz w:val="20"/>
-      </w:rPr>
-    </w:lvl>
-    <w:lvl w:ilvl="8" w:tentative="1">
-      <w:start w:val="1"/>
-      <w:numFmt w:val="bullet"/>
-      <w:lvlText w:val=""/>
-      <w:lvlJc w:val="left"/>
-      <w:pPr>
-        <w:tabs>
-          <w:tab w:val="num" w:pos="6480"/>
-        </w:tabs>
-        <w:ind w:left="6480" w:hanging="360"/>
-      </w:pPr>
-      <w:rPr>
-        <w:rFonts w:ascii="Wingdings" w:hAnsi="Wingdings" w:hint="default"/>
-        <w:sz w:val="20"/>
-      </w:rPr>
-    </w:lvl>
-  </w:abstractNum>
-  <w:abstractNum w:abstractNumId="20" w15:restartNumberingAfterBreak="0">
-    <w:nsid w:val="728073BC"/>
-    <w:multiLevelType w:val="multilevel"/>
-    <w:tmpl w:val="99AABF74"/>
-    <w:lvl w:ilvl="0">
-      <w:start w:val="1"/>
-      <w:numFmt w:val="bullet"/>
-      <w:lvlText w:val=""/>
-      <w:lvlJc w:val="left"/>
-      <w:pPr>
-        <w:tabs>
-          <w:tab w:val="num" w:pos="720"/>
-        </w:tabs>
-        <w:ind w:left="720" w:hanging="360"/>
-      </w:pPr>
-      <w:rPr>
-        <w:rFonts w:ascii="Symbol" w:hAnsi="Symbol" w:hint="default"/>
-        <w:sz w:val="20"/>
-      </w:rPr>
-    </w:lvl>
-    <w:lvl w:ilvl="1" w:tentative="1">
-      <w:start w:val="1"/>
-      <w:numFmt w:val="bullet"/>
-      <w:lvlText w:val="o"/>
-      <w:lvlJc w:val="left"/>
-      <w:pPr>
-        <w:tabs>
-          <w:tab w:val="num" w:pos="1440"/>
-        </w:tabs>
-        <w:ind w:left="1440" w:hanging="360"/>
-      </w:pPr>
-      <w:rPr>
-        <w:rFonts w:ascii="Courier New" w:hAnsi="Courier New" w:hint="default"/>
-        <w:sz w:val="20"/>
-      </w:rPr>
-    </w:lvl>
-    <w:lvl w:ilvl="2" w:tentative="1">
-      <w:start w:val="1"/>
-      <w:numFmt w:val="bullet"/>
-      <w:lvlText w:val=""/>
-      <w:lvlJc w:val="left"/>
-      <w:pPr>
-        <w:tabs>
-          <w:tab w:val="num" w:pos="2160"/>
-        </w:tabs>
-        <w:ind w:left="2160" w:hanging="360"/>
-      </w:pPr>
-      <w:rPr>
-        <w:rFonts w:ascii="Wingdings" w:hAnsi="Wingdings" w:hint="default"/>
-        <w:sz w:val="20"/>
-      </w:rPr>
-    </w:lvl>
-    <w:lvl w:ilvl="3" w:tentative="1">
-      <w:start w:val="1"/>
-      <w:numFmt w:val="bullet"/>
-      <w:lvlText w:val=""/>
-      <w:lvlJc w:val="left"/>
-      <w:pPr>
-        <w:tabs>
-          <w:tab w:val="num" w:pos="2880"/>
-        </w:tabs>
-        <w:ind w:left="2880" w:hanging="360"/>
-      </w:pPr>
-      <w:rPr>
-        <w:rFonts w:ascii="Wingdings" w:hAnsi="Wingdings" w:hint="default"/>
-        <w:sz w:val="20"/>
-      </w:rPr>
-    </w:lvl>
-    <w:lvl w:ilvl="4" w:tentative="1">
-      <w:start w:val="1"/>
-      <w:numFmt w:val="bullet"/>
-      <w:lvlText w:val=""/>
-      <w:lvlJc w:val="left"/>
-      <w:pPr>
-        <w:tabs>
-          <w:tab w:val="num" w:pos="3600"/>
-        </w:tabs>
-        <w:ind w:left="3600" w:hanging="360"/>
-      </w:pPr>
-      <w:rPr>
-        <w:rFonts w:ascii="Wingdings" w:hAnsi="Wingdings" w:hint="default"/>
-        <w:sz w:val="20"/>
-      </w:rPr>
-    </w:lvl>
-    <w:lvl w:ilvl="5" w:tentative="1">
-      <w:start w:val="1"/>
-      <w:numFmt w:val="bullet"/>
-      <w:lvlText w:val=""/>
-      <w:lvlJc w:val="left"/>
-      <w:pPr>
-        <w:tabs>
-          <w:tab w:val="num" w:pos="4320"/>
-        </w:tabs>
-        <w:ind w:left="4320" w:hanging="360"/>
-      </w:pPr>
-      <w:rPr>
-        <w:rFonts w:ascii="Wingdings" w:hAnsi="Wingdings" w:hint="default"/>
-        <w:sz w:val="20"/>
-      </w:rPr>
-    </w:lvl>
-    <w:lvl w:ilvl="6" w:tentative="1">
-      <w:start w:val="1"/>
-      <w:numFmt w:val="bullet"/>
-      <w:lvlText w:val=""/>
-      <w:lvlJc w:val="left"/>
-      <w:pPr>
-        <w:tabs>
-          <w:tab w:val="num" w:pos="5040"/>
-        </w:tabs>
-        <w:ind w:left="5040" w:hanging="360"/>
-      </w:pPr>
-      <w:rPr>
-        <w:rFonts w:ascii="Wingdings" w:hAnsi="Wingdings" w:hint="default"/>
-        <w:sz w:val="20"/>
-      </w:rPr>
-    </w:lvl>
-    <w:lvl w:ilvl="7" w:tentative="1">
-      <w:start w:val="1"/>
-      <w:numFmt w:val="bullet"/>
-      <w:lvlText w:val=""/>
-      <w:lvlJc w:val="left"/>
-      <w:pPr>
-        <w:tabs>
-          <w:tab w:val="num" w:pos="5760"/>
-        </w:tabs>
-        <w:ind w:left="5760" w:hanging="360"/>
-      </w:pPr>
-      <w:rPr>
-        <w:rFonts w:ascii="Wingdings" w:hAnsi="Wingdings" w:hint="default"/>
-        <w:sz w:val="20"/>
-      </w:rPr>
-    </w:lvl>
-    <w:lvl w:ilvl="8" w:tentative="1">
-      <w:start w:val="1"/>
-      <w:numFmt w:val="bullet"/>
-      <w:lvlText w:val=""/>
-      <w:lvlJc w:val="left"/>
-      <w:pPr>
-        <w:tabs>
-          <w:tab w:val="num" w:pos="6480"/>
-        </w:tabs>
-        <w:ind w:left="6480" w:hanging="360"/>
-      </w:pPr>
-      <w:rPr>
-        <w:rFonts w:ascii="Wingdings" w:hAnsi="Wingdings" w:hint="default"/>
-        <w:sz w:val="20"/>
-      </w:rPr>
-    </w:lvl>
-  </w:abstractNum>
-  <w:abstractNum w:abstractNumId="21" w15:restartNumberingAfterBreak="0">
-    <w:nsid w:val="73E455B7"/>
-    <w:multiLevelType w:val="multilevel"/>
-    <w:tmpl w:val="2834C214"/>
+    <w:tmpl w:val="F0F80A80"/>
     <w:lvl w:ilvl="0">
       <w:start w:val="1"/>
       <w:numFmt w:val="decimal"/>
@@ -9538,343 +9853,77 @@
       </w:pPr>
     </w:lvl>
   </w:abstractNum>
-  <w:abstractNum w:abstractNumId="22" w15:restartNumberingAfterBreak="0">
-    <w:nsid w:val="7DFC6F05"/>
-    <w:multiLevelType w:val="multilevel"/>
-    <w:tmpl w:val="AF1C3DD4"/>
-    <w:lvl w:ilvl="0">
-      <w:start w:val="1"/>
-      <w:numFmt w:val="decimal"/>
-      <w:lvlText w:val="%1."/>
-      <w:lvlJc w:val="left"/>
-      <w:pPr>
-        <w:tabs>
-          <w:tab w:val="num" w:pos="720"/>
-        </w:tabs>
-        <w:ind w:left="720" w:hanging="360"/>
-      </w:pPr>
-    </w:lvl>
-    <w:lvl w:ilvl="1">
-      <w:start w:val="1"/>
-      <w:numFmt w:val="bullet"/>
-      <w:lvlText w:val="o"/>
-      <w:lvlJc w:val="left"/>
-      <w:pPr>
-        <w:tabs>
-          <w:tab w:val="num" w:pos="1440"/>
-        </w:tabs>
-        <w:ind w:left="1440" w:hanging="360"/>
-      </w:pPr>
-      <w:rPr>
-        <w:rFonts w:ascii="Courier New" w:hAnsi="Courier New" w:hint="default"/>
-        <w:sz w:val="20"/>
-      </w:rPr>
-    </w:lvl>
-    <w:lvl w:ilvl="2" w:tentative="1">
-      <w:start w:val="1"/>
-      <w:numFmt w:val="decimal"/>
-      <w:lvlText w:val="%3."/>
-      <w:lvlJc w:val="left"/>
-      <w:pPr>
-        <w:tabs>
-          <w:tab w:val="num" w:pos="2160"/>
-        </w:tabs>
-        <w:ind w:left="2160" w:hanging="360"/>
-      </w:pPr>
-    </w:lvl>
-    <w:lvl w:ilvl="3" w:tentative="1">
-      <w:start w:val="1"/>
-      <w:numFmt w:val="decimal"/>
-      <w:lvlText w:val="%4."/>
-      <w:lvlJc w:val="left"/>
-      <w:pPr>
-        <w:tabs>
-          <w:tab w:val="num" w:pos="2880"/>
-        </w:tabs>
-        <w:ind w:left="2880" w:hanging="360"/>
-      </w:pPr>
-    </w:lvl>
-    <w:lvl w:ilvl="4" w:tentative="1">
-      <w:start w:val="1"/>
-      <w:numFmt w:val="decimal"/>
-      <w:lvlText w:val="%5."/>
-      <w:lvlJc w:val="left"/>
-      <w:pPr>
-        <w:tabs>
-          <w:tab w:val="num" w:pos="3600"/>
-        </w:tabs>
-        <w:ind w:left="3600" w:hanging="360"/>
-      </w:pPr>
-    </w:lvl>
-    <w:lvl w:ilvl="5" w:tentative="1">
-      <w:start w:val="1"/>
-      <w:numFmt w:val="decimal"/>
-      <w:lvlText w:val="%6."/>
-      <w:lvlJc w:val="left"/>
-      <w:pPr>
-        <w:tabs>
-          <w:tab w:val="num" w:pos="4320"/>
-        </w:tabs>
-        <w:ind w:left="4320" w:hanging="360"/>
-      </w:pPr>
-    </w:lvl>
-    <w:lvl w:ilvl="6" w:tentative="1">
-      <w:start w:val="1"/>
-      <w:numFmt w:val="decimal"/>
-      <w:lvlText w:val="%7."/>
-      <w:lvlJc w:val="left"/>
-      <w:pPr>
-        <w:tabs>
-          <w:tab w:val="num" w:pos="5040"/>
-        </w:tabs>
-        <w:ind w:left="5040" w:hanging="360"/>
-      </w:pPr>
-    </w:lvl>
-    <w:lvl w:ilvl="7" w:tentative="1">
-      <w:start w:val="1"/>
-      <w:numFmt w:val="decimal"/>
-      <w:lvlText w:val="%8."/>
-      <w:lvlJc w:val="left"/>
-      <w:pPr>
-        <w:tabs>
-          <w:tab w:val="num" w:pos="5760"/>
-        </w:tabs>
-        <w:ind w:left="5760" w:hanging="360"/>
-      </w:pPr>
-    </w:lvl>
-    <w:lvl w:ilvl="8" w:tentative="1">
-      <w:start w:val="1"/>
-      <w:numFmt w:val="decimal"/>
-      <w:lvlText w:val="%9."/>
-      <w:lvlJc w:val="left"/>
-      <w:pPr>
-        <w:tabs>
-          <w:tab w:val="num" w:pos="6480"/>
-        </w:tabs>
-        <w:ind w:left="6480" w:hanging="360"/>
-      </w:pPr>
-    </w:lvl>
-  </w:abstractNum>
-  <w:abstractNum w:abstractNumId="23" w15:restartNumberingAfterBreak="0">
-    <w:nsid w:val="7E7B1945"/>
-    <w:multiLevelType w:val="multilevel"/>
-    <w:tmpl w:val="5FDC0A68"/>
-    <w:lvl w:ilvl="0">
-      <w:start w:val="1"/>
-      <w:numFmt w:val="bullet"/>
-      <w:lvlText w:val=""/>
-      <w:lvlJc w:val="left"/>
-      <w:pPr>
-        <w:tabs>
-          <w:tab w:val="num" w:pos="720"/>
-        </w:tabs>
-        <w:ind w:left="720" w:hanging="360"/>
-      </w:pPr>
-      <w:rPr>
-        <w:rFonts w:ascii="Symbol" w:hAnsi="Symbol" w:hint="default"/>
-        <w:sz w:val="20"/>
-      </w:rPr>
-    </w:lvl>
-    <w:lvl w:ilvl="1" w:tentative="1">
-      <w:start w:val="1"/>
-      <w:numFmt w:val="bullet"/>
-      <w:lvlText w:val="o"/>
-      <w:lvlJc w:val="left"/>
-      <w:pPr>
-        <w:tabs>
-          <w:tab w:val="num" w:pos="1440"/>
-        </w:tabs>
-        <w:ind w:left="1440" w:hanging="360"/>
-      </w:pPr>
-      <w:rPr>
-        <w:rFonts w:ascii="Courier New" w:hAnsi="Courier New" w:hint="default"/>
-        <w:sz w:val="20"/>
-      </w:rPr>
-    </w:lvl>
-    <w:lvl w:ilvl="2" w:tentative="1">
-      <w:start w:val="1"/>
-      <w:numFmt w:val="bullet"/>
-      <w:lvlText w:val=""/>
-      <w:lvlJc w:val="left"/>
-      <w:pPr>
-        <w:tabs>
-          <w:tab w:val="num" w:pos="2160"/>
-        </w:tabs>
-        <w:ind w:left="2160" w:hanging="360"/>
-      </w:pPr>
-      <w:rPr>
-        <w:rFonts w:ascii="Wingdings" w:hAnsi="Wingdings" w:hint="default"/>
-        <w:sz w:val="20"/>
-      </w:rPr>
-    </w:lvl>
-    <w:lvl w:ilvl="3" w:tentative="1">
-      <w:start w:val="1"/>
-      <w:numFmt w:val="bullet"/>
-      <w:lvlText w:val=""/>
-      <w:lvlJc w:val="left"/>
-      <w:pPr>
-        <w:tabs>
-          <w:tab w:val="num" w:pos="2880"/>
-        </w:tabs>
-        <w:ind w:left="2880" w:hanging="360"/>
-      </w:pPr>
-      <w:rPr>
-        <w:rFonts w:ascii="Wingdings" w:hAnsi="Wingdings" w:hint="default"/>
-        <w:sz w:val="20"/>
-      </w:rPr>
-    </w:lvl>
-    <w:lvl w:ilvl="4" w:tentative="1">
-      <w:start w:val="1"/>
-      <w:numFmt w:val="bullet"/>
-      <w:lvlText w:val=""/>
-      <w:lvlJc w:val="left"/>
-      <w:pPr>
-        <w:tabs>
-          <w:tab w:val="num" w:pos="3600"/>
-        </w:tabs>
-        <w:ind w:left="3600" w:hanging="360"/>
-      </w:pPr>
-      <w:rPr>
-        <w:rFonts w:ascii="Wingdings" w:hAnsi="Wingdings" w:hint="default"/>
-        <w:sz w:val="20"/>
-      </w:rPr>
-    </w:lvl>
-    <w:lvl w:ilvl="5" w:tentative="1">
-      <w:start w:val="1"/>
-      <w:numFmt w:val="bullet"/>
-      <w:lvlText w:val=""/>
-      <w:lvlJc w:val="left"/>
-      <w:pPr>
-        <w:tabs>
-          <w:tab w:val="num" w:pos="4320"/>
-        </w:tabs>
-        <w:ind w:left="4320" w:hanging="360"/>
-      </w:pPr>
-      <w:rPr>
-        <w:rFonts w:ascii="Wingdings" w:hAnsi="Wingdings" w:hint="default"/>
-        <w:sz w:val="20"/>
-      </w:rPr>
-    </w:lvl>
-    <w:lvl w:ilvl="6" w:tentative="1">
-      <w:start w:val="1"/>
-      <w:numFmt w:val="bullet"/>
-      <w:lvlText w:val=""/>
-      <w:lvlJc w:val="left"/>
-      <w:pPr>
-        <w:tabs>
-          <w:tab w:val="num" w:pos="5040"/>
-        </w:tabs>
-        <w:ind w:left="5040" w:hanging="360"/>
-      </w:pPr>
-      <w:rPr>
-        <w:rFonts w:ascii="Wingdings" w:hAnsi="Wingdings" w:hint="default"/>
-        <w:sz w:val="20"/>
-      </w:rPr>
-    </w:lvl>
-    <w:lvl w:ilvl="7" w:tentative="1">
-      <w:start w:val="1"/>
-      <w:numFmt w:val="bullet"/>
-      <w:lvlText w:val=""/>
-      <w:lvlJc w:val="left"/>
-      <w:pPr>
-        <w:tabs>
-          <w:tab w:val="num" w:pos="5760"/>
-        </w:tabs>
-        <w:ind w:left="5760" w:hanging="360"/>
-      </w:pPr>
-      <w:rPr>
-        <w:rFonts w:ascii="Wingdings" w:hAnsi="Wingdings" w:hint="default"/>
-        <w:sz w:val="20"/>
-      </w:rPr>
-    </w:lvl>
-    <w:lvl w:ilvl="8" w:tentative="1">
-      <w:start w:val="1"/>
-      <w:numFmt w:val="bullet"/>
-      <w:lvlText w:val=""/>
-      <w:lvlJc w:val="left"/>
-      <w:pPr>
-        <w:tabs>
-          <w:tab w:val="num" w:pos="6480"/>
-        </w:tabs>
-        <w:ind w:left="6480" w:hanging="360"/>
-      </w:pPr>
-      <w:rPr>
-        <w:rFonts w:ascii="Wingdings" w:hAnsi="Wingdings" w:hint="default"/>
-        <w:sz w:val="20"/>
-      </w:rPr>
-    </w:lvl>
-  </w:abstractNum>
-  <w:num w:numId="1" w16cid:durableId="1207371244">
+  <w:num w:numId="1" w16cid:durableId="1776554960">
+    <w:abstractNumId w:val="2"/>
+  </w:num>
+  <w:num w:numId="2" w16cid:durableId="2053310182">
+    <w:abstractNumId w:val="10"/>
+  </w:num>
+  <w:num w:numId="3" w16cid:durableId="2079671549">
+    <w:abstractNumId w:val="13"/>
+  </w:num>
+  <w:num w:numId="4" w16cid:durableId="1302423933">
+    <w:abstractNumId w:val="16"/>
+  </w:num>
+  <w:num w:numId="5" w16cid:durableId="449596226">
     <w:abstractNumId w:val="6"/>
   </w:num>
-  <w:num w:numId="2" w16cid:durableId="413285850">
+  <w:num w:numId="6" w16cid:durableId="578684393">
+    <w:abstractNumId w:val="18"/>
+  </w:num>
+  <w:num w:numId="7" w16cid:durableId="39282450">
+    <w:abstractNumId w:val="15"/>
+  </w:num>
+  <w:num w:numId="8" w16cid:durableId="1796218453">
+    <w:abstractNumId w:val="17"/>
+  </w:num>
+  <w:num w:numId="9" w16cid:durableId="399644372">
     <w:abstractNumId w:val="12"/>
   </w:num>
-  <w:num w:numId="3" w16cid:durableId="823668740">
-    <w:abstractNumId w:val="2"/>
+  <w:num w:numId="10" w16cid:durableId="1800146558">
+    <w:abstractNumId w:val="22"/>
   </w:num>
-  <w:num w:numId="4" w16cid:durableId="1755590055">
-    <w:abstractNumId w:val="15"/>
+  <w:num w:numId="11" w16cid:durableId="448015823">
+    <w:abstractNumId w:val="4"/>
   </w:num>
-  <w:num w:numId="5" w16cid:durableId="1806193208">
+  <w:num w:numId="12" w16cid:durableId="1563367630">
+    <w:abstractNumId w:val="5"/>
+  </w:num>
+  <w:num w:numId="13" w16cid:durableId="1041511430">
+    <w:abstractNumId w:val="14"/>
+  </w:num>
+  <w:num w:numId="14" w16cid:durableId="725950786">
+    <w:abstractNumId w:val="3"/>
+  </w:num>
+  <w:num w:numId="15" w16cid:durableId="235824810">
+    <w:abstractNumId w:val="7"/>
+  </w:num>
+  <w:num w:numId="16" w16cid:durableId="991788780">
+    <w:abstractNumId w:val="11"/>
+  </w:num>
+  <w:num w:numId="17" w16cid:durableId="461316084">
+    <w:abstractNumId w:val="23"/>
+  </w:num>
+  <w:num w:numId="18" w16cid:durableId="1730181771">
     <w:abstractNumId w:val="1"/>
   </w:num>
-  <w:num w:numId="6" w16cid:durableId="178544884">
-    <w:abstractNumId w:val="17"/>
+  <w:num w:numId="19" w16cid:durableId="217208176">
+    <w:abstractNumId w:val="20"/>
   </w:num>
-  <w:num w:numId="7" w16cid:durableId="271518866">
+  <w:num w:numId="20" w16cid:durableId="1848133352">
+    <w:abstractNumId w:val="19"/>
+  </w:num>
+  <w:num w:numId="21" w16cid:durableId="1171529005">
+    <w:abstractNumId w:val="0"/>
+  </w:num>
+  <w:num w:numId="22" w16cid:durableId="16318728">
+    <w:abstractNumId w:val="21"/>
+  </w:num>
+  <w:num w:numId="23" w16cid:durableId="1775901175">
     <w:abstractNumId w:val="8"/>
   </w:num>
-  <w:num w:numId="8" w16cid:durableId="767391617">
-    <w:abstractNumId w:val="18"/>
-  </w:num>
-  <w:num w:numId="9" w16cid:durableId="1790976175">
-    <w:abstractNumId w:val="13"/>
-  </w:num>
-  <w:num w:numId="10" w16cid:durableId="880870378">
-    <w:abstractNumId w:val="0"/>
-  </w:num>
-  <w:num w:numId="11" w16cid:durableId="2054502459">
-    <w:abstractNumId w:val="16"/>
-  </w:num>
-  <w:num w:numId="12" w16cid:durableId="818692916">
-    <w:abstractNumId w:val="20"/>
-  </w:num>
-  <w:num w:numId="13" w16cid:durableId="771432570">
-    <w:abstractNumId w:val="19"/>
-  </w:num>
-  <w:num w:numId="14" w16cid:durableId="555512529">
-    <w:abstractNumId w:val="4"/>
-  </w:num>
-  <w:num w:numId="15" w16cid:durableId="1020275215">
-    <w:abstractNumId w:val="23"/>
-  </w:num>
-  <w:num w:numId="16" w16cid:durableId="1504971215">
+  <w:num w:numId="24" w16cid:durableId="1051809830">
     <w:abstractNumId w:val="9"/>
-  </w:num>
-  <w:num w:numId="17" w16cid:durableId="492110232">
-    <w:abstractNumId w:val="22"/>
-  </w:num>
-  <w:num w:numId="18" w16cid:durableId="580603300">
-    <w:abstractNumId w:val="10"/>
-  </w:num>
-  <w:num w:numId="19" w16cid:durableId="343551596">
-    <w:abstractNumId w:val="14"/>
-  </w:num>
-  <w:num w:numId="20" w16cid:durableId="569728410">
-    <w:abstractNumId w:val="3"/>
-  </w:num>
-  <w:num w:numId="21" w16cid:durableId="1706371676">
-    <w:abstractNumId w:val="7"/>
-  </w:num>
-  <w:num w:numId="22" w16cid:durableId="132603340">
-    <w:abstractNumId w:val="11"/>
-  </w:num>
-  <w:num w:numId="23" w16cid:durableId="290792279">
-    <w:abstractNumId w:val="5"/>
-  </w:num>
-  <w:num w:numId="24" w16cid:durableId="16657545">
-    <w:abstractNumId w:val="21"/>
   </w:num>
 </w:numbering>
 </file>

</xml_diff>

<commit_message>
deck, follow-along, handouts: the attendee is the engineer inside IIC; no ship wording
</commit_message>
<xml_diff>
--- a/follow-along/Azure_Local_Follow_Along_Guide.docx
+++ b/follow-along/Azure_Local_Follow_Along_Guide.docx
@@ -6566,9 +6566,158 @@
 <file path=word/numbering.xml><?xml version="1.0" encoding="utf-8"?>
 <w:numbering xmlns:wpc="http://schemas.microsoft.com/office/word/2010/wordprocessingCanvas" xmlns:cx="http://schemas.microsoft.com/office/drawing/2014/chartex" xmlns:cx1="http://schemas.microsoft.com/office/drawing/2015/9/8/chartex" xmlns:cx2="http://schemas.microsoft.com/office/drawing/2015/10/21/chartex" xmlns:cx3="http://schemas.microsoft.com/office/drawing/2016/5/9/chartex" xmlns:cx4="http://schemas.microsoft.com/office/drawing/2016/5/10/chartex" xmlns:cx5="http://schemas.microsoft.com/office/drawing/2016/5/11/chartex" xmlns:cx6="http://schemas.microsoft.com/office/drawing/2016/5/12/chartex" xmlns:cx7="http://schemas.microsoft.com/office/drawing/2016/5/13/chartex" xmlns:cx8="http://schemas.microsoft.com/office/drawing/2016/5/14/chartex" xmlns:mc="http://schemas.openxmlformats.org/markup-compatibility/2006" xmlns:aink="http://schemas.microsoft.com/office/drawing/2016/ink" xmlns:am3d="http://schemas.microsoft.com/office/drawing/2017/model3d" xmlns:o="urn:schemas-microsoft-com:office:office" xmlns:oel="http://schemas.microsoft.com/office/2019/extlst" xmlns:r="http://schemas.openxmlformats.org/officeDocument/2006/relationships" xmlns:m="http://schemas.openxmlformats.org/officeDocument/2006/math" xmlns:v="urn:schemas-microsoft-com:vml" xmlns:wp14="http://schemas.microsoft.com/office/word/2010/wordprocessingDrawing" xmlns:wp="http://schemas.openxmlformats.org/drawingml/2006/wordprocessingDrawing" xmlns:w10="urn:schemas-microsoft-com:office:word" xmlns:w="http://schemas.openxmlformats.org/wordprocessingml/2006/main" xmlns:w14="http://schemas.microsoft.com/office/word/2010/wordml" xmlns:w15="http://schemas.microsoft.com/office/word/2012/wordml" xmlns:w16cex="http://schemas.microsoft.com/office/word/2018/wordml/cex" xmlns:w16cid="http://schemas.microsoft.com/office/word/2016/wordml/cid" xmlns:w16="http://schemas.microsoft.com/office/word/2018/wordml" xmlns:w16du="http://schemas.microsoft.com/office/word/2023/wordml/word16du" xmlns:w16sdtdh="http://schemas.microsoft.com/office/word/2020/wordml/sdtdatahash" xmlns:w16sdtfl="http://schemas.microsoft.com/office/word/2024/wordml/sdtformatlock" xmlns:w16se="http://schemas.microsoft.com/office/word/2015/wordml/symex" xmlns:wpg="http://schemas.microsoft.com/office/word/2010/wordprocessingGroup" xmlns:wpi="http://schemas.microsoft.com/office/word/2010/wordprocessingInk" xmlns:wne="http://schemas.microsoft.com/office/word/2006/wordml" xmlns:wps="http://schemas.microsoft.com/office/word/2010/wordprocessingShape" mc:Ignorable="w14 w15 w16se w16cid w16 w16cex w16sdtdh w16sdtfl w16du wp14">
   <w:abstractNum w:abstractNumId="0" w15:restartNumberingAfterBreak="0">
-    <w:nsid w:val="053F7C9C"/>
+    <w:nsid w:val="0284235C"/>
     <w:multiLevelType w:val="multilevel"/>
-    <w:tmpl w:val="98D4951A"/>
+    <w:tmpl w:val="6360F33C"/>
+    <w:lvl w:ilvl="0">
+      <w:start w:val="1"/>
+      <w:numFmt w:val="bullet"/>
+      <w:lvlText w:val=""/>
+      <w:lvlJc w:val="left"/>
+      <w:pPr>
+        <w:tabs>
+          <w:tab w:val="num" w:pos="720"/>
+        </w:tabs>
+        <w:ind w:left="720" w:hanging="360"/>
+      </w:pPr>
+      <w:rPr>
+        <w:rFonts w:ascii="Symbol" w:hAnsi="Symbol" w:hint="default"/>
+        <w:sz w:val="20"/>
+      </w:rPr>
+    </w:lvl>
+    <w:lvl w:ilvl="1" w:tentative="1">
+      <w:start w:val="1"/>
+      <w:numFmt w:val="bullet"/>
+      <w:lvlText w:val="o"/>
+      <w:lvlJc w:val="left"/>
+      <w:pPr>
+        <w:tabs>
+          <w:tab w:val="num" w:pos="1440"/>
+        </w:tabs>
+        <w:ind w:left="1440" w:hanging="360"/>
+      </w:pPr>
+      <w:rPr>
+        <w:rFonts w:ascii="Courier New" w:hAnsi="Courier New" w:hint="default"/>
+        <w:sz w:val="20"/>
+      </w:rPr>
+    </w:lvl>
+    <w:lvl w:ilvl="2" w:tentative="1">
+      <w:start w:val="1"/>
+      <w:numFmt w:val="bullet"/>
+      <w:lvlText w:val=""/>
+      <w:lvlJc w:val="left"/>
+      <w:pPr>
+        <w:tabs>
+          <w:tab w:val="num" w:pos="2160"/>
+        </w:tabs>
+        <w:ind w:left="2160" w:hanging="360"/>
+      </w:pPr>
+      <w:rPr>
+        <w:rFonts w:ascii="Wingdings" w:hAnsi="Wingdings" w:hint="default"/>
+        <w:sz w:val="20"/>
+      </w:rPr>
+    </w:lvl>
+    <w:lvl w:ilvl="3" w:tentative="1">
+      <w:start w:val="1"/>
+      <w:numFmt w:val="bullet"/>
+      <w:lvlText w:val=""/>
+      <w:lvlJc w:val="left"/>
+      <w:pPr>
+        <w:tabs>
+          <w:tab w:val="num" w:pos="2880"/>
+        </w:tabs>
+        <w:ind w:left="2880" w:hanging="360"/>
+      </w:pPr>
+      <w:rPr>
+        <w:rFonts w:ascii="Wingdings" w:hAnsi="Wingdings" w:hint="default"/>
+        <w:sz w:val="20"/>
+      </w:rPr>
+    </w:lvl>
+    <w:lvl w:ilvl="4" w:tentative="1">
+      <w:start w:val="1"/>
+      <w:numFmt w:val="bullet"/>
+      <w:lvlText w:val=""/>
+      <w:lvlJc w:val="left"/>
+      <w:pPr>
+        <w:tabs>
+          <w:tab w:val="num" w:pos="3600"/>
+        </w:tabs>
+        <w:ind w:left="3600" w:hanging="360"/>
+      </w:pPr>
+      <w:rPr>
+        <w:rFonts w:ascii="Wingdings" w:hAnsi="Wingdings" w:hint="default"/>
+        <w:sz w:val="20"/>
+      </w:rPr>
+    </w:lvl>
+    <w:lvl w:ilvl="5" w:tentative="1">
+      <w:start w:val="1"/>
+      <w:numFmt w:val="bullet"/>
+      <w:lvlText w:val=""/>
+      <w:lvlJc w:val="left"/>
+      <w:pPr>
+        <w:tabs>
+          <w:tab w:val="num" w:pos="4320"/>
+        </w:tabs>
+        <w:ind w:left="4320" w:hanging="360"/>
+      </w:pPr>
+      <w:rPr>
+        <w:rFonts w:ascii="Wingdings" w:hAnsi="Wingdings" w:hint="default"/>
+        <w:sz w:val="20"/>
+      </w:rPr>
+    </w:lvl>
+    <w:lvl w:ilvl="6" w:tentative="1">
+      <w:start w:val="1"/>
+      <w:numFmt w:val="bullet"/>
+      <w:lvlText w:val=""/>
+      <w:lvlJc w:val="left"/>
+      <w:pPr>
+        <w:tabs>
+          <w:tab w:val="num" w:pos="5040"/>
+        </w:tabs>
+        <w:ind w:left="5040" w:hanging="360"/>
+      </w:pPr>
+      <w:rPr>
+        <w:rFonts w:ascii="Wingdings" w:hAnsi="Wingdings" w:hint="default"/>
+        <w:sz w:val="20"/>
+      </w:rPr>
+    </w:lvl>
+    <w:lvl w:ilvl="7" w:tentative="1">
+      <w:start w:val="1"/>
+      <w:numFmt w:val="bullet"/>
+      <w:lvlText w:val=""/>
+      <w:lvlJc w:val="left"/>
+      <w:pPr>
+        <w:tabs>
+          <w:tab w:val="num" w:pos="5760"/>
+        </w:tabs>
+        <w:ind w:left="5760" w:hanging="360"/>
+      </w:pPr>
+      <w:rPr>
+        <w:rFonts w:ascii="Wingdings" w:hAnsi="Wingdings" w:hint="default"/>
+        <w:sz w:val="20"/>
+      </w:rPr>
+    </w:lvl>
+    <w:lvl w:ilvl="8" w:tentative="1">
+      <w:start w:val="1"/>
+      <w:numFmt w:val="bullet"/>
+      <w:lvlText w:val=""/>
+      <w:lvlJc w:val="left"/>
+      <w:pPr>
+        <w:tabs>
+          <w:tab w:val="num" w:pos="6480"/>
+        </w:tabs>
+        <w:ind w:left="6480" w:hanging="360"/>
+      </w:pPr>
+      <w:rPr>
+        <w:rFonts w:ascii="Wingdings" w:hAnsi="Wingdings" w:hint="default"/>
+        <w:sz w:val="20"/>
+      </w:rPr>
+    </w:lvl>
+  </w:abstractNum>
+  <w:abstractNum w:abstractNumId="1" w15:restartNumberingAfterBreak="0">
+    <w:nsid w:val="0CD27FD2"/>
+    <w:multiLevelType w:val="multilevel"/>
+    <w:tmpl w:val="EA44D726"/>
     <w:lvl w:ilvl="0">
       <w:start w:val="1"/>
       <w:numFmt w:val="decimal"/>
@@ -6682,10 +6831,308 @@
       </w:pPr>
     </w:lvl>
   </w:abstractNum>
-  <w:abstractNum w:abstractNumId="1" w15:restartNumberingAfterBreak="0">
-    <w:nsid w:val="0B0854B1"/>
+  <w:abstractNum w:abstractNumId="2" w15:restartNumberingAfterBreak="0">
+    <w:nsid w:val="0D50635E"/>
     <w:multiLevelType w:val="multilevel"/>
-    <w:tmpl w:val="91305C00"/>
+    <w:tmpl w:val="8E6C4950"/>
+    <w:lvl w:ilvl="0">
+      <w:start w:val="1"/>
+      <w:numFmt w:val="bullet"/>
+      <w:lvlText w:val=""/>
+      <w:lvlJc w:val="left"/>
+      <w:pPr>
+        <w:tabs>
+          <w:tab w:val="num" w:pos="720"/>
+        </w:tabs>
+        <w:ind w:left="720" w:hanging="360"/>
+      </w:pPr>
+      <w:rPr>
+        <w:rFonts w:ascii="Symbol" w:hAnsi="Symbol" w:hint="default"/>
+        <w:sz w:val="20"/>
+      </w:rPr>
+    </w:lvl>
+    <w:lvl w:ilvl="1" w:tentative="1">
+      <w:start w:val="1"/>
+      <w:numFmt w:val="bullet"/>
+      <w:lvlText w:val="o"/>
+      <w:lvlJc w:val="left"/>
+      <w:pPr>
+        <w:tabs>
+          <w:tab w:val="num" w:pos="1440"/>
+        </w:tabs>
+        <w:ind w:left="1440" w:hanging="360"/>
+      </w:pPr>
+      <w:rPr>
+        <w:rFonts w:ascii="Courier New" w:hAnsi="Courier New" w:hint="default"/>
+        <w:sz w:val="20"/>
+      </w:rPr>
+    </w:lvl>
+    <w:lvl w:ilvl="2" w:tentative="1">
+      <w:start w:val="1"/>
+      <w:numFmt w:val="bullet"/>
+      <w:lvlText w:val=""/>
+      <w:lvlJc w:val="left"/>
+      <w:pPr>
+        <w:tabs>
+          <w:tab w:val="num" w:pos="2160"/>
+        </w:tabs>
+        <w:ind w:left="2160" w:hanging="360"/>
+      </w:pPr>
+      <w:rPr>
+        <w:rFonts w:ascii="Wingdings" w:hAnsi="Wingdings" w:hint="default"/>
+        <w:sz w:val="20"/>
+      </w:rPr>
+    </w:lvl>
+    <w:lvl w:ilvl="3" w:tentative="1">
+      <w:start w:val="1"/>
+      <w:numFmt w:val="bullet"/>
+      <w:lvlText w:val=""/>
+      <w:lvlJc w:val="left"/>
+      <w:pPr>
+        <w:tabs>
+          <w:tab w:val="num" w:pos="2880"/>
+        </w:tabs>
+        <w:ind w:left="2880" w:hanging="360"/>
+      </w:pPr>
+      <w:rPr>
+        <w:rFonts w:ascii="Wingdings" w:hAnsi="Wingdings" w:hint="default"/>
+        <w:sz w:val="20"/>
+      </w:rPr>
+    </w:lvl>
+    <w:lvl w:ilvl="4" w:tentative="1">
+      <w:start w:val="1"/>
+      <w:numFmt w:val="bullet"/>
+      <w:lvlText w:val=""/>
+      <w:lvlJc w:val="left"/>
+      <w:pPr>
+        <w:tabs>
+          <w:tab w:val="num" w:pos="3600"/>
+        </w:tabs>
+        <w:ind w:left="3600" w:hanging="360"/>
+      </w:pPr>
+      <w:rPr>
+        <w:rFonts w:ascii="Wingdings" w:hAnsi="Wingdings" w:hint="default"/>
+        <w:sz w:val="20"/>
+      </w:rPr>
+    </w:lvl>
+    <w:lvl w:ilvl="5" w:tentative="1">
+      <w:start w:val="1"/>
+      <w:numFmt w:val="bullet"/>
+      <w:lvlText w:val=""/>
+      <w:lvlJc w:val="left"/>
+      <w:pPr>
+        <w:tabs>
+          <w:tab w:val="num" w:pos="4320"/>
+        </w:tabs>
+        <w:ind w:left="4320" w:hanging="360"/>
+      </w:pPr>
+      <w:rPr>
+        <w:rFonts w:ascii="Wingdings" w:hAnsi="Wingdings" w:hint="default"/>
+        <w:sz w:val="20"/>
+      </w:rPr>
+    </w:lvl>
+    <w:lvl w:ilvl="6" w:tentative="1">
+      <w:start w:val="1"/>
+      <w:numFmt w:val="bullet"/>
+      <w:lvlText w:val=""/>
+      <w:lvlJc w:val="left"/>
+      <w:pPr>
+        <w:tabs>
+          <w:tab w:val="num" w:pos="5040"/>
+        </w:tabs>
+        <w:ind w:left="5040" w:hanging="360"/>
+      </w:pPr>
+      <w:rPr>
+        <w:rFonts w:ascii="Wingdings" w:hAnsi="Wingdings" w:hint="default"/>
+        <w:sz w:val="20"/>
+      </w:rPr>
+    </w:lvl>
+    <w:lvl w:ilvl="7" w:tentative="1">
+      <w:start w:val="1"/>
+      <w:numFmt w:val="bullet"/>
+      <w:lvlText w:val=""/>
+      <w:lvlJc w:val="left"/>
+      <w:pPr>
+        <w:tabs>
+          <w:tab w:val="num" w:pos="5760"/>
+        </w:tabs>
+        <w:ind w:left="5760" w:hanging="360"/>
+      </w:pPr>
+      <w:rPr>
+        <w:rFonts w:ascii="Wingdings" w:hAnsi="Wingdings" w:hint="default"/>
+        <w:sz w:val="20"/>
+      </w:rPr>
+    </w:lvl>
+    <w:lvl w:ilvl="8" w:tentative="1">
+      <w:start w:val="1"/>
+      <w:numFmt w:val="bullet"/>
+      <w:lvlText w:val=""/>
+      <w:lvlJc w:val="left"/>
+      <w:pPr>
+        <w:tabs>
+          <w:tab w:val="num" w:pos="6480"/>
+        </w:tabs>
+        <w:ind w:left="6480" w:hanging="360"/>
+      </w:pPr>
+      <w:rPr>
+        <w:rFonts w:ascii="Wingdings" w:hAnsi="Wingdings" w:hint="default"/>
+        <w:sz w:val="20"/>
+      </w:rPr>
+    </w:lvl>
+  </w:abstractNum>
+  <w:abstractNum w:abstractNumId="3" w15:restartNumberingAfterBreak="0">
+    <w:nsid w:val="0D8563EB"/>
+    <w:multiLevelType w:val="multilevel"/>
+    <w:tmpl w:val="10447772"/>
+    <w:lvl w:ilvl="0">
+      <w:start w:val="1"/>
+      <w:numFmt w:val="bullet"/>
+      <w:lvlText w:val=""/>
+      <w:lvlJc w:val="left"/>
+      <w:pPr>
+        <w:tabs>
+          <w:tab w:val="num" w:pos="720"/>
+        </w:tabs>
+        <w:ind w:left="720" w:hanging="360"/>
+      </w:pPr>
+      <w:rPr>
+        <w:rFonts w:ascii="Symbol" w:hAnsi="Symbol" w:hint="default"/>
+        <w:sz w:val="20"/>
+      </w:rPr>
+    </w:lvl>
+    <w:lvl w:ilvl="1" w:tentative="1">
+      <w:start w:val="1"/>
+      <w:numFmt w:val="bullet"/>
+      <w:lvlText w:val="o"/>
+      <w:lvlJc w:val="left"/>
+      <w:pPr>
+        <w:tabs>
+          <w:tab w:val="num" w:pos="1440"/>
+        </w:tabs>
+        <w:ind w:left="1440" w:hanging="360"/>
+      </w:pPr>
+      <w:rPr>
+        <w:rFonts w:ascii="Courier New" w:hAnsi="Courier New" w:hint="default"/>
+        <w:sz w:val="20"/>
+      </w:rPr>
+    </w:lvl>
+    <w:lvl w:ilvl="2" w:tentative="1">
+      <w:start w:val="1"/>
+      <w:numFmt w:val="bullet"/>
+      <w:lvlText w:val=""/>
+      <w:lvlJc w:val="left"/>
+      <w:pPr>
+        <w:tabs>
+          <w:tab w:val="num" w:pos="2160"/>
+        </w:tabs>
+        <w:ind w:left="2160" w:hanging="360"/>
+      </w:pPr>
+      <w:rPr>
+        <w:rFonts w:ascii="Wingdings" w:hAnsi="Wingdings" w:hint="default"/>
+        <w:sz w:val="20"/>
+      </w:rPr>
+    </w:lvl>
+    <w:lvl w:ilvl="3" w:tentative="1">
+      <w:start w:val="1"/>
+      <w:numFmt w:val="bullet"/>
+      <w:lvlText w:val=""/>
+      <w:lvlJc w:val="left"/>
+      <w:pPr>
+        <w:tabs>
+          <w:tab w:val="num" w:pos="2880"/>
+        </w:tabs>
+        <w:ind w:left="2880" w:hanging="360"/>
+      </w:pPr>
+      <w:rPr>
+        <w:rFonts w:ascii="Wingdings" w:hAnsi="Wingdings" w:hint="default"/>
+        <w:sz w:val="20"/>
+      </w:rPr>
+    </w:lvl>
+    <w:lvl w:ilvl="4" w:tentative="1">
+      <w:start w:val="1"/>
+      <w:numFmt w:val="bullet"/>
+      <w:lvlText w:val=""/>
+      <w:lvlJc w:val="left"/>
+      <w:pPr>
+        <w:tabs>
+          <w:tab w:val="num" w:pos="3600"/>
+        </w:tabs>
+        <w:ind w:left="3600" w:hanging="360"/>
+      </w:pPr>
+      <w:rPr>
+        <w:rFonts w:ascii="Wingdings" w:hAnsi="Wingdings" w:hint="default"/>
+        <w:sz w:val="20"/>
+      </w:rPr>
+    </w:lvl>
+    <w:lvl w:ilvl="5" w:tentative="1">
+      <w:start w:val="1"/>
+      <w:numFmt w:val="bullet"/>
+      <w:lvlText w:val=""/>
+      <w:lvlJc w:val="left"/>
+      <w:pPr>
+        <w:tabs>
+          <w:tab w:val="num" w:pos="4320"/>
+        </w:tabs>
+        <w:ind w:left="4320" w:hanging="360"/>
+      </w:pPr>
+      <w:rPr>
+        <w:rFonts w:ascii="Wingdings" w:hAnsi="Wingdings" w:hint="default"/>
+        <w:sz w:val="20"/>
+      </w:rPr>
+    </w:lvl>
+    <w:lvl w:ilvl="6" w:tentative="1">
+      <w:start w:val="1"/>
+      <w:numFmt w:val="bullet"/>
+      <w:lvlText w:val=""/>
+      <w:lvlJc w:val="left"/>
+      <w:pPr>
+        <w:tabs>
+          <w:tab w:val="num" w:pos="5040"/>
+        </w:tabs>
+        <w:ind w:left="5040" w:hanging="360"/>
+      </w:pPr>
+      <w:rPr>
+        <w:rFonts w:ascii="Wingdings" w:hAnsi="Wingdings" w:hint="default"/>
+        <w:sz w:val="20"/>
+      </w:rPr>
+    </w:lvl>
+    <w:lvl w:ilvl="7" w:tentative="1">
+      <w:start w:val="1"/>
+      <w:numFmt w:val="bullet"/>
+      <w:lvlText w:val=""/>
+      <w:lvlJc w:val="left"/>
+      <w:pPr>
+        <w:tabs>
+          <w:tab w:val="num" w:pos="5760"/>
+        </w:tabs>
+        <w:ind w:left="5760" w:hanging="360"/>
+      </w:pPr>
+      <w:rPr>
+        <w:rFonts w:ascii="Wingdings" w:hAnsi="Wingdings" w:hint="default"/>
+        <w:sz w:val="20"/>
+      </w:rPr>
+    </w:lvl>
+    <w:lvl w:ilvl="8" w:tentative="1">
+      <w:start w:val="1"/>
+      <w:numFmt w:val="bullet"/>
+      <w:lvlText w:val=""/>
+      <w:lvlJc w:val="left"/>
+      <w:pPr>
+        <w:tabs>
+          <w:tab w:val="num" w:pos="6480"/>
+        </w:tabs>
+        <w:ind w:left="6480" w:hanging="360"/>
+      </w:pPr>
+      <w:rPr>
+        <w:rFonts w:ascii="Wingdings" w:hAnsi="Wingdings" w:hint="default"/>
+        <w:sz w:val="20"/>
+      </w:rPr>
+    </w:lvl>
+  </w:abstractNum>
+  <w:abstractNum w:abstractNumId="4" w15:restartNumberingAfterBreak="0">
+    <w:nsid w:val="0EF20CAE"/>
+    <w:multiLevelType w:val="multilevel"/>
+    <w:tmpl w:val="3D9C199C"/>
     <w:lvl w:ilvl="0">
       <w:start w:val="1"/>
       <w:numFmt w:val="decimal"/>
@@ -6799,10 +7246,10 @@
       </w:pPr>
     </w:lvl>
   </w:abstractNum>
-  <w:abstractNum w:abstractNumId="2" w15:restartNumberingAfterBreak="0">
-    <w:nsid w:val="101533D6"/>
+  <w:abstractNum w:abstractNumId="5" w15:restartNumberingAfterBreak="0">
+    <w:nsid w:val="10860ED3"/>
     <w:multiLevelType w:val="multilevel"/>
-    <w:tmpl w:val="18DE4718"/>
+    <w:tmpl w:val="E88A76C8"/>
     <w:lvl w:ilvl="0">
       <w:start w:val="1"/>
       <w:numFmt w:val="bullet"/>
@@ -6948,10 +7395,159 @@
       </w:rPr>
     </w:lvl>
   </w:abstractNum>
-  <w:abstractNum w:abstractNumId="3" w15:restartNumberingAfterBreak="0">
-    <w:nsid w:val="11A630B8"/>
+  <w:abstractNum w:abstractNumId="6" w15:restartNumberingAfterBreak="0">
+    <w:nsid w:val="19546A5F"/>
     <w:multiLevelType w:val="multilevel"/>
-    <w:tmpl w:val="7A9ADCC6"/>
+    <w:tmpl w:val="02D855F8"/>
+    <w:lvl w:ilvl="0">
+      <w:start w:val="1"/>
+      <w:numFmt w:val="bullet"/>
+      <w:lvlText w:val=""/>
+      <w:lvlJc w:val="left"/>
+      <w:pPr>
+        <w:tabs>
+          <w:tab w:val="num" w:pos="720"/>
+        </w:tabs>
+        <w:ind w:left="720" w:hanging="360"/>
+      </w:pPr>
+      <w:rPr>
+        <w:rFonts w:ascii="Symbol" w:hAnsi="Symbol" w:hint="default"/>
+        <w:sz w:val="20"/>
+      </w:rPr>
+    </w:lvl>
+    <w:lvl w:ilvl="1" w:tentative="1">
+      <w:start w:val="1"/>
+      <w:numFmt w:val="bullet"/>
+      <w:lvlText w:val="o"/>
+      <w:lvlJc w:val="left"/>
+      <w:pPr>
+        <w:tabs>
+          <w:tab w:val="num" w:pos="1440"/>
+        </w:tabs>
+        <w:ind w:left="1440" w:hanging="360"/>
+      </w:pPr>
+      <w:rPr>
+        <w:rFonts w:ascii="Courier New" w:hAnsi="Courier New" w:hint="default"/>
+        <w:sz w:val="20"/>
+      </w:rPr>
+    </w:lvl>
+    <w:lvl w:ilvl="2" w:tentative="1">
+      <w:start w:val="1"/>
+      <w:numFmt w:val="bullet"/>
+      <w:lvlText w:val=""/>
+      <w:lvlJc w:val="left"/>
+      <w:pPr>
+        <w:tabs>
+          <w:tab w:val="num" w:pos="2160"/>
+        </w:tabs>
+        <w:ind w:left="2160" w:hanging="360"/>
+      </w:pPr>
+      <w:rPr>
+        <w:rFonts w:ascii="Wingdings" w:hAnsi="Wingdings" w:hint="default"/>
+        <w:sz w:val="20"/>
+      </w:rPr>
+    </w:lvl>
+    <w:lvl w:ilvl="3" w:tentative="1">
+      <w:start w:val="1"/>
+      <w:numFmt w:val="bullet"/>
+      <w:lvlText w:val=""/>
+      <w:lvlJc w:val="left"/>
+      <w:pPr>
+        <w:tabs>
+          <w:tab w:val="num" w:pos="2880"/>
+        </w:tabs>
+        <w:ind w:left="2880" w:hanging="360"/>
+      </w:pPr>
+      <w:rPr>
+        <w:rFonts w:ascii="Wingdings" w:hAnsi="Wingdings" w:hint="default"/>
+        <w:sz w:val="20"/>
+      </w:rPr>
+    </w:lvl>
+    <w:lvl w:ilvl="4" w:tentative="1">
+      <w:start w:val="1"/>
+      <w:numFmt w:val="bullet"/>
+      <w:lvlText w:val=""/>
+      <w:lvlJc w:val="left"/>
+      <w:pPr>
+        <w:tabs>
+          <w:tab w:val="num" w:pos="3600"/>
+        </w:tabs>
+        <w:ind w:left="3600" w:hanging="360"/>
+      </w:pPr>
+      <w:rPr>
+        <w:rFonts w:ascii="Wingdings" w:hAnsi="Wingdings" w:hint="default"/>
+        <w:sz w:val="20"/>
+      </w:rPr>
+    </w:lvl>
+    <w:lvl w:ilvl="5" w:tentative="1">
+      <w:start w:val="1"/>
+      <w:numFmt w:val="bullet"/>
+      <w:lvlText w:val=""/>
+      <w:lvlJc w:val="left"/>
+      <w:pPr>
+        <w:tabs>
+          <w:tab w:val="num" w:pos="4320"/>
+        </w:tabs>
+        <w:ind w:left="4320" w:hanging="360"/>
+      </w:pPr>
+      <w:rPr>
+        <w:rFonts w:ascii="Wingdings" w:hAnsi="Wingdings" w:hint="default"/>
+        <w:sz w:val="20"/>
+      </w:rPr>
+    </w:lvl>
+    <w:lvl w:ilvl="6" w:tentative="1">
+      <w:start w:val="1"/>
+      <w:numFmt w:val="bullet"/>
+      <w:lvlText w:val=""/>
+      <w:lvlJc w:val="left"/>
+      <w:pPr>
+        <w:tabs>
+          <w:tab w:val="num" w:pos="5040"/>
+        </w:tabs>
+        <w:ind w:left="5040" w:hanging="360"/>
+      </w:pPr>
+      <w:rPr>
+        <w:rFonts w:ascii="Wingdings" w:hAnsi="Wingdings" w:hint="default"/>
+        <w:sz w:val="20"/>
+      </w:rPr>
+    </w:lvl>
+    <w:lvl w:ilvl="7" w:tentative="1">
+      <w:start w:val="1"/>
+      <w:numFmt w:val="bullet"/>
+      <w:lvlText w:val=""/>
+      <w:lvlJc w:val="left"/>
+      <w:pPr>
+        <w:tabs>
+          <w:tab w:val="num" w:pos="5760"/>
+        </w:tabs>
+        <w:ind w:left="5760" w:hanging="360"/>
+      </w:pPr>
+      <w:rPr>
+        <w:rFonts w:ascii="Wingdings" w:hAnsi="Wingdings" w:hint="default"/>
+        <w:sz w:val="20"/>
+      </w:rPr>
+    </w:lvl>
+    <w:lvl w:ilvl="8" w:tentative="1">
+      <w:start w:val="1"/>
+      <w:numFmt w:val="bullet"/>
+      <w:lvlText w:val=""/>
+      <w:lvlJc w:val="left"/>
+      <w:pPr>
+        <w:tabs>
+          <w:tab w:val="num" w:pos="6480"/>
+        </w:tabs>
+        <w:ind w:left="6480" w:hanging="360"/>
+      </w:pPr>
+      <w:rPr>
+        <w:rFonts w:ascii="Wingdings" w:hAnsi="Wingdings" w:hint="default"/>
+        <w:sz w:val="20"/>
+      </w:rPr>
+    </w:lvl>
+  </w:abstractNum>
+  <w:abstractNum w:abstractNumId="7" w15:restartNumberingAfterBreak="0">
+    <w:nsid w:val="1DCC5BE1"/>
+    <w:multiLevelType w:val="multilevel"/>
+    <w:tmpl w:val="2B2E0C02"/>
     <w:lvl w:ilvl="0">
       <w:start w:val="1"/>
       <w:numFmt w:val="decimal"/>
@@ -7065,606 +7661,10 @@
       </w:pPr>
     </w:lvl>
   </w:abstractNum>
-  <w:abstractNum w:abstractNumId="4" w15:restartNumberingAfterBreak="0">
-    <w:nsid w:val="18041631"/>
+  <w:abstractNum w:abstractNumId="8" w15:restartNumberingAfterBreak="0">
+    <w:nsid w:val="21A31AE2"/>
     <w:multiLevelType w:val="multilevel"/>
-    <w:tmpl w:val="FF946648"/>
-    <w:lvl w:ilvl="0">
-      <w:start w:val="1"/>
-      <w:numFmt w:val="bullet"/>
-      <w:lvlText w:val=""/>
-      <w:lvlJc w:val="left"/>
-      <w:pPr>
-        <w:tabs>
-          <w:tab w:val="num" w:pos="720"/>
-        </w:tabs>
-        <w:ind w:left="720" w:hanging="360"/>
-      </w:pPr>
-      <w:rPr>
-        <w:rFonts w:ascii="Symbol" w:hAnsi="Symbol" w:hint="default"/>
-        <w:sz w:val="20"/>
-      </w:rPr>
-    </w:lvl>
-    <w:lvl w:ilvl="1" w:tentative="1">
-      <w:start w:val="1"/>
-      <w:numFmt w:val="bullet"/>
-      <w:lvlText w:val="o"/>
-      <w:lvlJc w:val="left"/>
-      <w:pPr>
-        <w:tabs>
-          <w:tab w:val="num" w:pos="1440"/>
-        </w:tabs>
-        <w:ind w:left="1440" w:hanging="360"/>
-      </w:pPr>
-      <w:rPr>
-        <w:rFonts w:ascii="Courier New" w:hAnsi="Courier New" w:hint="default"/>
-        <w:sz w:val="20"/>
-      </w:rPr>
-    </w:lvl>
-    <w:lvl w:ilvl="2" w:tentative="1">
-      <w:start w:val="1"/>
-      <w:numFmt w:val="bullet"/>
-      <w:lvlText w:val=""/>
-      <w:lvlJc w:val="left"/>
-      <w:pPr>
-        <w:tabs>
-          <w:tab w:val="num" w:pos="2160"/>
-        </w:tabs>
-        <w:ind w:left="2160" w:hanging="360"/>
-      </w:pPr>
-      <w:rPr>
-        <w:rFonts w:ascii="Wingdings" w:hAnsi="Wingdings" w:hint="default"/>
-        <w:sz w:val="20"/>
-      </w:rPr>
-    </w:lvl>
-    <w:lvl w:ilvl="3" w:tentative="1">
-      <w:start w:val="1"/>
-      <w:numFmt w:val="bullet"/>
-      <w:lvlText w:val=""/>
-      <w:lvlJc w:val="left"/>
-      <w:pPr>
-        <w:tabs>
-          <w:tab w:val="num" w:pos="2880"/>
-        </w:tabs>
-        <w:ind w:left="2880" w:hanging="360"/>
-      </w:pPr>
-      <w:rPr>
-        <w:rFonts w:ascii="Wingdings" w:hAnsi="Wingdings" w:hint="default"/>
-        <w:sz w:val="20"/>
-      </w:rPr>
-    </w:lvl>
-    <w:lvl w:ilvl="4" w:tentative="1">
-      <w:start w:val="1"/>
-      <w:numFmt w:val="bullet"/>
-      <w:lvlText w:val=""/>
-      <w:lvlJc w:val="left"/>
-      <w:pPr>
-        <w:tabs>
-          <w:tab w:val="num" w:pos="3600"/>
-        </w:tabs>
-        <w:ind w:left="3600" w:hanging="360"/>
-      </w:pPr>
-      <w:rPr>
-        <w:rFonts w:ascii="Wingdings" w:hAnsi="Wingdings" w:hint="default"/>
-        <w:sz w:val="20"/>
-      </w:rPr>
-    </w:lvl>
-    <w:lvl w:ilvl="5" w:tentative="1">
-      <w:start w:val="1"/>
-      <w:numFmt w:val="bullet"/>
-      <w:lvlText w:val=""/>
-      <w:lvlJc w:val="left"/>
-      <w:pPr>
-        <w:tabs>
-          <w:tab w:val="num" w:pos="4320"/>
-        </w:tabs>
-        <w:ind w:left="4320" w:hanging="360"/>
-      </w:pPr>
-      <w:rPr>
-        <w:rFonts w:ascii="Wingdings" w:hAnsi="Wingdings" w:hint="default"/>
-        <w:sz w:val="20"/>
-      </w:rPr>
-    </w:lvl>
-    <w:lvl w:ilvl="6" w:tentative="1">
-      <w:start w:val="1"/>
-      <w:numFmt w:val="bullet"/>
-      <w:lvlText w:val=""/>
-      <w:lvlJc w:val="left"/>
-      <w:pPr>
-        <w:tabs>
-          <w:tab w:val="num" w:pos="5040"/>
-        </w:tabs>
-        <w:ind w:left="5040" w:hanging="360"/>
-      </w:pPr>
-      <w:rPr>
-        <w:rFonts w:ascii="Wingdings" w:hAnsi="Wingdings" w:hint="default"/>
-        <w:sz w:val="20"/>
-      </w:rPr>
-    </w:lvl>
-    <w:lvl w:ilvl="7" w:tentative="1">
-      <w:start w:val="1"/>
-      <w:numFmt w:val="bullet"/>
-      <w:lvlText w:val=""/>
-      <w:lvlJc w:val="left"/>
-      <w:pPr>
-        <w:tabs>
-          <w:tab w:val="num" w:pos="5760"/>
-        </w:tabs>
-        <w:ind w:left="5760" w:hanging="360"/>
-      </w:pPr>
-      <w:rPr>
-        <w:rFonts w:ascii="Wingdings" w:hAnsi="Wingdings" w:hint="default"/>
-        <w:sz w:val="20"/>
-      </w:rPr>
-    </w:lvl>
-    <w:lvl w:ilvl="8" w:tentative="1">
-      <w:start w:val="1"/>
-      <w:numFmt w:val="bullet"/>
-      <w:lvlText w:val=""/>
-      <w:lvlJc w:val="left"/>
-      <w:pPr>
-        <w:tabs>
-          <w:tab w:val="num" w:pos="6480"/>
-        </w:tabs>
-        <w:ind w:left="6480" w:hanging="360"/>
-      </w:pPr>
-      <w:rPr>
-        <w:rFonts w:ascii="Wingdings" w:hAnsi="Wingdings" w:hint="default"/>
-        <w:sz w:val="20"/>
-      </w:rPr>
-    </w:lvl>
-  </w:abstractNum>
-  <w:abstractNum w:abstractNumId="5" w15:restartNumberingAfterBreak="0">
-    <w:nsid w:val="1AF862DE"/>
-    <w:multiLevelType w:val="multilevel"/>
-    <w:tmpl w:val="6E74E6C6"/>
-    <w:lvl w:ilvl="0">
-      <w:start w:val="1"/>
-      <w:numFmt w:val="bullet"/>
-      <w:lvlText w:val=""/>
-      <w:lvlJc w:val="left"/>
-      <w:pPr>
-        <w:tabs>
-          <w:tab w:val="num" w:pos="720"/>
-        </w:tabs>
-        <w:ind w:left="720" w:hanging="360"/>
-      </w:pPr>
-      <w:rPr>
-        <w:rFonts w:ascii="Symbol" w:hAnsi="Symbol" w:hint="default"/>
-        <w:sz w:val="20"/>
-      </w:rPr>
-    </w:lvl>
-    <w:lvl w:ilvl="1" w:tentative="1">
-      <w:start w:val="1"/>
-      <w:numFmt w:val="bullet"/>
-      <w:lvlText w:val="o"/>
-      <w:lvlJc w:val="left"/>
-      <w:pPr>
-        <w:tabs>
-          <w:tab w:val="num" w:pos="1440"/>
-        </w:tabs>
-        <w:ind w:left="1440" w:hanging="360"/>
-      </w:pPr>
-      <w:rPr>
-        <w:rFonts w:ascii="Courier New" w:hAnsi="Courier New" w:hint="default"/>
-        <w:sz w:val="20"/>
-      </w:rPr>
-    </w:lvl>
-    <w:lvl w:ilvl="2" w:tentative="1">
-      <w:start w:val="1"/>
-      <w:numFmt w:val="bullet"/>
-      <w:lvlText w:val=""/>
-      <w:lvlJc w:val="left"/>
-      <w:pPr>
-        <w:tabs>
-          <w:tab w:val="num" w:pos="2160"/>
-        </w:tabs>
-        <w:ind w:left="2160" w:hanging="360"/>
-      </w:pPr>
-      <w:rPr>
-        <w:rFonts w:ascii="Wingdings" w:hAnsi="Wingdings" w:hint="default"/>
-        <w:sz w:val="20"/>
-      </w:rPr>
-    </w:lvl>
-    <w:lvl w:ilvl="3" w:tentative="1">
-      <w:start w:val="1"/>
-      <w:numFmt w:val="bullet"/>
-      <w:lvlText w:val=""/>
-      <w:lvlJc w:val="left"/>
-      <w:pPr>
-        <w:tabs>
-          <w:tab w:val="num" w:pos="2880"/>
-        </w:tabs>
-        <w:ind w:left="2880" w:hanging="360"/>
-      </w:pPr>
-      <w:rPr>
-        <w:rFonts w:ascii="Wingdings" w:hAnsi="Wingdings" w:hint="default"/>
-        <w:sz w:val="20"/>
-      </w:rPr>
-    </w:lvl>
-    <w:lvl w:ilvl="4" w:tentative="1">
-      <w:start w:val="1"/>
-      <w:numFmt w:val="bullet"/>
-      <w:lvlText w:val=""/>
-      <w:lvlJc w:val="left"/>
-      <w:pPr>
-        <w:tabs>
-          <w:tab w:val="num" w:pos="3600"/>
-        </w:tabs>
-        <w:ind w:left="3600" w:hanging="360"/>
-      </w:pPr>
-      <w:rPr>
-        <w:rFonts w:ascii="Wingdings" w:hAnsi="Wingdings" w:hint="default"/>
-        <w:sz w:val="20"/>
-      </w:rPr>
-    </w:lvl>
-    <w:lvl w:ilvl="5" w:tentative="1">
-      <w:start w:val="1"/>
-      <w:numFmt w:val="bullet"/>
-      <w:lvlText w:val=""/>
-      <w:lvlJc w:val="left"/>
-      <w:pPr>
-        <w:tabs>
-          <w:tab w:val="num" w:pos="4320"/>
-        </w:tabs>
-        <w:ind w:left="4320" w:hanging="360"/>
-      </w:pPr>
-      <w:rPr>
-        <w:rFonts w:ascii="Wingdings" w:hAnsi="Wingdings" w:hint="default"/>
-        <w:sz w:val="20"/>
-      </w:rPr>
-    </w:lvl>
-    <w:lvl w:ilvl="6" w:tentative="1">
-      <w:start w:val="1"/>
-      <w:numFmt w:val="bullet"/>
-      <w:lvlText w:val=""/>
-      <w:lvlJc w:val="left"/>
-      <w:pPr>
-        <w:tabs>
-          <w:tab w:val="num" w:pos="5040"/>
-        </w:tabs>
-        <w:ind w:left="5040" w:hanging="360"/>
-      </w:pPr>
-      <w:rPr>
-        <w:rFonts w:ascii="Wingdings" w:hAnsi="Wingdings" w:hint="default"/>
-        <w:sz w:val="20"/>
-      </w:rPr>
-    </w:lvl>
-    <w:lvl w:ilvl="7" w:tentative="1">
-      <w:start w:val="1"/>
-      <w:numFmt w:val="bullet"/>
-      <w:lvlText w:val=""/>
-      <w:lvlJc w:val="left"/>
-      <w:pPr>
-        <w:tabs>
-          <w:tab w:val="num" w:pos="5760"/>
-        </w:tabs>
-        <w:ind w:left="5760" w:hanging="360"/>
-      </w:pPr>
-      <w:rPr>
-        <w:rFonts w:ascii="Wingdings" w:hAnsi="Wingdings" w:hint="default"/>
-        <w:sz w:val="20"/>
-      </w:rPr>
-    </w:lvl>
-    <w:lvl w:ilvl="8" w:tentative="1">
-      <w:start w:val="1"/>
-      <w:numFmt w:val="bullet"/>
-      <w:lvlText w:val=""/>
-      <w:lvlJc w:val="left"/>
-      <w:pPr>
-        <w:tabs>
-          <w:tab w:val="num" w:pos="6480"/>
-        </w:tabs>
-        <w:ind w:left="6480" w:hanging="360"/>
-      </w:pPr>
-      <w:rPr>
-        <w:rFonts w:ascii="Wingdings" w:hAnsi="Wingdings" w:hint="default"/>
-        <w:sz w:val="20"/>
-      </w:rPr>
-    </w:lvl>
-  </w:abstractNum>
-  <w:abstractNum w:abstractNumId="6" w15:restartNumberingAfterBreak="0">
-    <w:nsid w:val="1F9D01A7"/>
-    <w:multiLevelType w:val="multilevel"/>
-    <w:tmpl w:val="49746FA2"/>
-    <w:lvl w:ilvl="0">
-      <w:start w:val="1"/>
-      <w:numFmt w:val="bullet"/>
-      <w:lvlText w:val=""/>
-      <w:lvlJc w:val="left"/>
-      <w:pPr>
-        <w:tabs>
-          <w:tab w:val="num" w:pos="720"/>
-        </w:tabs>
-        <w:ind w:left="720" w:hanging="360"/>
-      </w:pPr>
-      <w:rPr>
-        <w:rFonts w:ascii="Symbol" w:hAnsi="Symbol" w:hint="default"/>
-        <w:sz w:val="20"/>
-      </w:rPr>
-    </w:lvl>
-    <w:lvl w:ilvl="1" w:tentative="1">
-      <w:start w:val="1"/>
-      <w:numFmt w:val="bullet"/>
-      <w:lvlText w:val="o"/>
-      <w:lvlJc w:val="left"/>
-      <w:pPr>
-        <w:tabs>
-          <w:tab w:val="num" w:pos="1440"/>
-        </w:tabs>
-        <w:ind w:left="1440" w:hanging="360"/>
-      </w:pPr>
-      <w:rPr>
-        <w:rFonts w:ascii="Courier New" w:hAnsi="Courier New" w:hint="default"/>
-        <w:sz w:val="20"/>
-      </w:rPr>
-    </w:lvl>
-    <w:lvl w:ilvl="2" w:tentative="1">
-      <w:start w:val="1"/>
-      <w:numFmt w:val="bullet"/>
-      <w:lvlText w:val=""/>
-      <w:lvlJc w:val="left"/>
-      <w:pPr>
-        <w:tabs>
-          <w:tab w:val="num" w:pos="2160"/>
-        </w:tabs>
-        <w:ind w:left="2160" w:hanging="360"/>
-      </w:pPr>
-      <w:rPr>
-        <w:rFonts w:ascii="Wingdings" w:hAnsi="Wingdings" w:hint="default"/>
-        <w:sz w:val="20"/>
-      </w:rPr>
-    </w:lvl>
-    <w:lvl w:ilvl="3" w:tentative="1">
-      <w:start w:val="1"/>
-      <w:numFmt w:val="bullet"/>
-      <w:lvlText w:val=""/>
-      <w:lvlJc w:val="left"/>
-      <w:pPr>
-        <w:tabs>
-          <w:tab w:val="num" w:pos="2880"/>
-        </w:tabs>
-        <w:ind w:left="2880" w:hanging="360"/>
-      </w:pPr>
-      <w:rPr>
-        <w:rFonts w:ascii="Wingdings" w:hAnsi="Wingdings" w:hint="default"/>
-        <w:sz w:val="20"/>
-      </w:rPr>
-    </w:lvl>
-    <w:lvl w:ilvl="4" w:tentative="1">
-      <w:start w:val="1"/>
-      <w:numFmt w:val="bullet"/>
-      <w:lvlText w:val=""/>
-      <w:lvlJc w:val="left"/>
-      <w:pPr>
-        <w:tabs>
-          <w:tab w:val="num" w:pos="3600"/>
-        </w:tabs>
-        <w:ind w:left="3600" w:hanging="360"/>
-      </w:pPr>
-      <w:rPr>
-        <w:rFonts w:ascii="Wingdings" w:hAnsi="Wingdings" w:hint="default"/>
-        <w:sz w:val="20"/>
-      </w:rPr>
-    </w:lvl>
-    <w:lvl w:ilvl="5" w:tentative="1">
-      <w:start w:val="1"/>
-      <w:numFmt w:val="bullet"/>
-      <w:lvlText w:val=""/>
-      <w:lvlJc w:val="left"/>
-      <w:pPr>
-        <w:tabs>
-          <w:tab w:val="num" w:pos="4320"/>
-        </w:tabs>
-        <w:ind w:left="4320" w:hanging="360"/>
-      </w:pPr>
-      <w:rPr>
-        <w:rFonts w:ascii="Wingdings" w:hAnsi="Wingdings" w:hint="default"/>
-        <w:sz w:val="20"/>
-      </w:rPr>
-    </w:lvl>
-    <w:lvl w:ilvl="6" w:tentative="1">
-      <w:start w:val="1"/>
-      <w:numFmt w:val="bullet"/>
-      <w:lvlText w:val=""/>
-      <w:lvlJc w:val="left"/>
-      <w:pPr>
-        <w:tabs>
-          <w:tab w:val="num" w:pos="5040"/>
-        </w:tabs>
-        <w:ind w:left="5040" w:hanging="360"/>
-      </w:pPr>
-      <w:rPr>
-        <w:rFonts w:ascii="Wingdings" w:hAnsi="Wingdings" w:hint="default"/>
-        <w:sz w:val="20"/>
-      </w:rPr>
-    </w:lvl>
-    <w:lvl w:ilvl="7" w:tentative="1">
-      <w:start w:val="1"/>
-      <w:numFmt w:val="bullet"/>
-      <w:lvlText w:val=""/>
-      <w:lvlJc w:val="left"/>
-      <w:pPr>
-        <w:tabs>
-          <w:tab w:val="num" w:pos="5760"/>
-        </w:tabs>
-        <w:ind w:left="5760" w:hanging="360"/>
-      </w:pPr>
-      <w:rPr>
-        <w:rFonts w:ascii="Wingdings" w:hAnsi="Wingdings" w:hint="default"/>
-        <w:sz w:val="20"/>
-      </w:rPr>
-    </w:lvl>
-    <w:lvl w:ilvl="8" w:tentative="1">
-      <w:start w:val="1"/>
-      <w:numFmt w:val="bullet"/>
-      <w:lvlText w:val=""/>
-      <w:lvlJc w:val="left"/>
-      <w:pPr>
-        <w:tabs>
-          <w:tab w:val="num" w:pos="6480"/>
-        </w:tabs>
-        <w:ind w:left="6480" w:hanging="360"/>
-      </w:pPr>
-      <w:rPr>
-        <w:rFonts w:ascii="Wingdings" w:hAnsi="Wingdings" w:hint="default"/>
-        <w:sz w:val="20"/>
-      </w:rPr>
-    </w:lvl>
-  </w:abstractNum>
-  <w:abstractNum w:abstractNumId="7" w15:restartNumberingAfterBreak="0">
-    <w:nsid w:val="204B11F1"/>
-    <w:multiLevelType w:val="multilevel"/>
-    <w:tmpl w:val="ED3A4824"/>
-    <w:lvl w:ilvl="0">
-      <w:start w:val="1"/>
-      <w:numFmt w:val="bullet"/>
-      <w:lvlText w:val=""/>
-      <w:lvlJc w:val="left"/>
-      <w:pPr>
-        <w:tabs>
-          <w:tab w:val="num" w:pos="720"/>
-        </w:tabs>
-        <w:ind w:left="720" w:hanging="360"/>
-      </w:pPr>
-      <w:rPr>
-        <w:rFonts w:ascii="Symbol" w:hAnsi="Symbol" w:hint="default"/>
-        <w:sz w:val="20"/>
-      </w:rPr>
-    </w:lvl>
-    <w:lvl w:ilvl="1" w:tentative="1">
-      <w:start w:val="1"/>
-      <w:numFmt w:val="bullet"/>
-      <w:lvlText w:val="o"/>
-      <w:lvlJc w:val="left"/>
-      <w:pPr>
-        <w:tabs>
-          <w:tab w:val="num" w:pos="1440"/>
-        </w:tabs>
-        <w:ind w:left="1440" w:hanging="360"/>
-      </w:pPr>
-      <w:rPr>
-        <w:rFonts w:ascii="Courier New" w:hAnsi="Courier New" w:hint="default"/>
-        <w:sz w:val="20"/>
-      </w:rPr>
-    </w:lvl>
-    <w:lvl w:ilvl="2" w:tentative="1">
-      <w:start w:val="1"/>
-      <w:numFmt w:val="bullet"/>
-      <w:lvlText w:val=""/>
-      <w:lvlJc w:val="left"/>
-      <w:pPr>
-        <w:tabs>
-          <w:tab w:val="num" w:pos="2160"/>
-        </w:tabs>
-        <w:ind w:left="2160" w:hanging="360"/>
-      </w:pPr>
-      <w:rPr>
-        <w:rFonts w:ascii="Wingdings" w:hAnsi="Wingdings" w:hint="default"/>
-        <w:sz w:val="20"/>
-      </w:rPr>
-    </w:lvl>
-    <w:lvl w:ilvl="3" w:tentative="1">
-      <w:start w:val="1"/>
-      <w:numFmt w:val="bullet"/>
-      <w:lvlText w:val=""/>
-      <w:lvlJc w:val="left"/>
-      <w:pPr>
-        <w:tabs>
-          <w:tab w:val="num" w:pos="2880"/>
-        </w:tabs>
-        <w:ind w:left="2880" w:hanging="360"/>
-      </w:pPr>
-      <w:rPr>
-        <w:rFonts w:ascii="Wingdings" w:hAnsi="Wingdings" w:hint="default"/>
-        <w:sz w:val="20"/>
-      </w:rPr>
-    </w:lvl>
-    <w:lvl w:ilvl="4" w:tentative="1">
-      <w:start w:val="1"/>
-      <w:numFmt w:val="bullet"/>
-      <w:lvlText w:val=""/>
-      <w:lvlJc w:val="left"/>
-      <w:pPr>
-        <w:tabs>
-          <w:tab w:val="num" w:pos="3600"/>
-        </w:tabs>
-        <w:ind w:left="3600" w:hanging="360"/>
-      </w:pPr>
-      <w:rPr>
-        <w:rFonts w:ascii="Wingdings" w:hAnsi="Wingdings" w:hint="default"/>
-        <w:sz w:val="20"/>
-      </w:rPr>
-    </w:lvl>
-    <w:lvl w:ilvl="5" w:tentative="1">
-      <w:start w:val="1"/>
-      <w:numFmt w:val="bullet"/>
-      <w:lvlText w:val=""/>
-      <w:lvlJc w:val="left"/>
-      <w:pPr>
-        <w:tabs>
-          <w:tab w:val="num" w:pos="4320"/>
-        </w:tabs>
-        <w:ind w:left="4320" w:hanging="360"/>
-      </w:pPr>
-      <w:rPr>
-        <w:rFonts w:ascii="Wingdings" w:hAnsi="Wingdings" w:hint="default"/>
-        <w:sz w:val="20"/>
-      </w:rPr>
-    </w:lvl>
-    <w:lvl w:ilvl="6" w:tentative="1">
-      <w:start w:val="1"/>
-      <w:numFmt w:val="bullet"/>
-      <w:lvlText w:val=""/>
-      <w:lvlJc w:val="left"/>
-      <w:pPr>
-        <w:tabs>
-          <w:tab w:val="num" w:pos="5040"/>
-        </w:tabs>
-        <w:ind w:left="5040" w:hanging="360"/>
-      </w:pPr>
-      <w:rPr>
-        <w:rFonts w:ascii="Wingdings" w:hAnsi="Wingdings" w:hint="default"/>
-        <w:sz w:val="20"/>
-      </w:rPr>
-    </w:lvl>
-    <w:lvl w:ilvl="7" w:tentative="1">
-      <w:start w:val="1"/>
-      <w:numFmt w:val="bullet"/>
-      <w:lvlText w:val=""/>
-      <w:lvlJc w:val="left"/>
-      <w:pPr>
-        <w:tabs>
-          <w:tab w:val="num" w:pos="5760"/>
-        </w:tabs>
-        <w:ind w:left="5760" w:hanging="360"/>
-      </w:pPr>
-      <w:rPr>
-        <w:rFonts w:ascii="Wingdings" w:hAnsi="Wingdings" w:hint="default"/>
-        <w:sz w:val="20"/>
-      </w:rPr>
-    </w:lvl>
-    <w:lvl w:ilvl="8" w:tentative="1">
-      <w:start w:val="1"/>
-      <w:numFmt w:val="bullet"/>
-      <w:lvlText w:val=""/>
-      <w:lvlJc w:val="left"/>
-      <w:pPr>
-        <w:tabs>
-          <w:tab w:val="num" w:pos="6480"/>
-        </w:tabs>
-        <w:ind w:left="6480" w:hanging="360"/>
-      </w:pPr>
-      <w:rPr>
-        <w:rFonts w:ascii="Wingdings" w:hAnsi="Wingdings" w:hint="default"/>
-        <w:sz w:val="20"/>
-      </w:rPr>
-    </w:lvl>
-  </w:abstractNum>
-  <w:abstractNum w:abstractNumId="8" w15:restartNumberingAfterBreak="0">
-    <w:nsid w:val="2F6B6A9E"/>
-    <w:multiLevelType w:val="multilevel"/>
-    <w:tmpl w:val="153E4A54"/>
+    <w:tmpl w:val="3272C2C2"/>
     <w:lvl w:ilvl="0">
       <w:start w:val="1"/>
       <w:numFmt w:val="bullet"/>
@@ -7811,9 +7811,456 @@
     </w:lvl>
   </w:abstractNum>
   <w:abstractNum w:abstractNumId="9" w15:restartNumberingAfterBreak="0">
-    <w:nsid w:val="3BE166F9"/>
+    <w:nsid w:val="26C91B3B"/>
     <w:multiLevelType w:val="multilevel"/>
-    <w:tmpl w:val="758C15D8"/>
+    <w:tmpl w:val="90162074"/>
+    <w:lvl w:ilvl="0">
+      <w:start w:val="1"/>
+      <w:numFmt w:val="bullet"/>
+      <w:lvlText w:val=""/>
+      <w:lvlJc w:val="left"/>
+      <w:pPr>
+        <w:tabs>
+          <w:tab w:val="num" w:pos="720"/>
+        </w:tabs>
+        <w:ind w:left="720" w:hanging="360"/>
+      </w:pPr>
+      <w:rPr>
+        <w:rFonts w:ascii="Symbol" w:hAnsi="Symbol" w:hint="default"/>
+        <w:sz w:val="20"/>
+      </w:rPr>
+    </w:lvl>
+    <w:lvl w:ilvl="1" w:tentative="1">
+      <w:start w:val="1"/>
+      <w:numFmt w:val="bullet"/>
+      <w:lvlText w:val="o"/>
+      <w:lvlJc w:val="left"/>
+      <w:pPr>
+        <w:tabs>
+          <w:tab w:val="num" w:pos="1440"/>
+        </w:tabs>
+        <w:ind w:left="1440" w:hanging="360"/>
+      </w:pPr>
+      <w:rPr>
+        <w:rFonts w:ascii="Courier New" w:hAnsi="Courier New" w:hint="default"/>
+        <w:sz w:val="20"/>
+      </w:rPr>
+    </w:lvl>
+    <w:lvl w:ilvl="2" w:tentative="1">
+      <w:start w:val="1"/>
+      <w:numFmt w:val="bullet"/>
+      <w:lvlText w:val=""/>
+      <w:lvlJc w:val="left"/>
+      <w:pPr>
+        <w:tabs>
+          <w:tab w:val="num" w:pos="2160"/>
+        </w:tabs>
+        <w:ind w:left="2160" w:hanging="360"/>
+      </w:pPr>
+      <w:rPr>
+        <w:rFonts w:ascii="Wingdings" w:hAnsi="Wingdings" w:hint="default"/>
+        <w:sz w:val="20"/>
+      </w:rPr>
+    </w:lvl>
+    <w:lvl w:ilvl="3" w:tentative="1">
+      <w:start w:val="1"/>
+      <w:numFmt w:val="bullet"/>
+      <w:lvlText w:val=""/>
+      <w:lvlJc w:val="left"/>
+      <w:pPr>
+        <w:tabs>
+          <w:tab w:val="num" w:pos="2880"/>
+        </w:tabs>
+        <w:ind w:left="2880" w:hanging="360"/>
+      </w:pPr>
+      <w:rPr>
+        <w:rFonts w:ascii="Wingdings" w:hAnsi="Wingdings" w:hint="default"/>
+        <w:sz w:val="20"/>
+      </w:rPr>
+    </w:lvl>
+    <w:lvl w:ilvl="4" w:tentative="1">
+      <w:start w:val="1"/>
+      <w:numFmt w:val="bullet"/>
+      <w:lvlText w:val=""/>
+      <w:lvlJc w:val="left"/>
+      <w:pPr>
+        <w:tabs>
+          <w:tab w:val="num" w:pos="3600"/>
+        </w:tabs>
+        <w:ind w:left="3600" w:hanging="360"/>
+      </w:pPr>
+      <w:rPr>
+        <w:rFonts w:ascii="Wingdings" w:hAnsi="Wingdings" w:hint="default"/>
+        <w:sz w:val="20"/>
+      </w:rPr>
+    </w:lvl>
+    <w:lvl w:ilvl="5" w:tentative="1">
+      <w:start w:val="1"/>
+      <w:numFmt w:val="bullet"/>
+      <w:lvlText w:val=""/>
+      <w:lvlJc w:val="left"/>
+      <w:pPr>
+        <w:tabs>
+          <w:tab w:val="num" w:pos="4320"/>
+        </w:tabs>
+        <w:ind w:left="4320" w:hanging="360"/>
+      </w:pPr>
+      <w:rPr>
+        <w:rFonts w:ascii="Wingdings" w:hAnsi="Wingdings" w:hint="default"/>
+        <w:sz w:val="20"/>
+      </w:rPr>
+    </w:lvl>
+    <w:lvl w:ilvl="6" w:tentative="1">
+      <w:start w:val="1"/>
+      <w:numFmt w:val="bullet"/>
+      <w:lvlText w:val=""/>
+      <w:lvlJc w:val="left"/>
+      <w:pPr>
+        <w:tabs>
+          <w:tab w:val="num" w:pos="5040"/>
+        </w:tabs>
+        <w:ind w:left="5040" w:hanging="360"/>
+      </w:pPr>
+      <w:rPr>
+        <w:rFonts w:ascii="Wingdings" w:hAnsi="Wingdings" w:hint="default"/>
+        <w:sz w:val="20"/>
+      </w:rPr>
+    </w:lvl>
+    <w:lvl w:ilvl="7" w:tentative="1">
+      <w:start w:val="1"/>
+      <w:numFmt w:val="bullet"/>
+      <w:lvlText w:val=""/>
+      <w:lvlJc w:val="left"/>
+      <w:pPr>
+        <w:tabs>
+          <w:tab w:val="num" w:pos="5760"/>
+        </w:tabs>
+        <w:ind w:left="5760" w:hanging="360"/>
+      </w:pPr>
+      <w:rPr>
+        <w:rFonts w:ascii="Wingdings" w:hAnsi="Wingdings" w:hint="default"/>
+        <w:sz w:val="20"/>
+      </w:rPr>
+    </w:lvl>
+    <w:lvl w:ilvl="8" w:tentative="1">
+      <w:start w:val="1"/>
+      <w:numFmt w:val="bullet"/>
+      <w:lvlText w:val=""/>
+      <w:lvlJc w:val="left"/>
+      <w:pPr>
+        <w:tabs>
+          <w:tab w:val="num" w:pos="6480"/>
+        </w:tabs>
+        <w:ind w:left="6480" w:hanging="360"/>
+      </w:pPr>
+      <w:rPr>
+        <w:rFonts w:ascii="Wingdings" w:hAnsi="Wingdings" w:hint="default"/>
+        <w:sz w:val="20"/>
+      </w:rPr>
+    </w:lvl>
+  </w:abstractNum>
+  <w:abstractNum w:abstractNumId="10" w15:restartNumberingAfterBreak="0">
+    <w:nsid w:val="28C95F5B"/>
+    <w:multiLevelType w:val="multilevel"/>
+    <w:tmpl w:val="D97A95A0"/>
+    <w:lvl w:ilvl="0">
+      <w:start w:val="1"/>
+      <w:numFmt w:val="bullet"/>
+      <w:lvlText w:val=""/>
+      <w:lvlJc w:val="left"/>
+      <w:pPr>
+        <w:tabs>
+          <w:tab w:val="num" w:pos="720"/>
+        </w:tabs>
+        <w:ind w:left="720" w:hanging="360"/>
+      </w:pPr>
+      <w:rPr>
+        <w:rFonts w:ascii="Symbol" w:hAnsi="Symbol" w:hint="default"/>
+        <w:sz w:val="20"/>
+      </w:rPr>
+    </w:lvl>
+    <w:lvl w:ilvl="1" w:tentative="1">
+      <w:start w:val="1"/>
+      <w:numFmt w:val="bullet"/>
+      <w:lvlText w:val="o"/>
+      <w:lvlJc w:val="left"/>
+      <w:pPr>
+        <w:tabs>
+          <w:tab w:val="num" w:pos="1440"/>
+        </w:tabs>
+        <w:ind w:left="1440" w:hanging="360"/>
+      </w:pPr>
+      <w:rPr>
+        <w:rFonts w:ascii="Courier New" w:hAnsi="Courier New" w:hint="default"/>
+        <w:sz w:val="20"/>
+      </w:rPr>
+    </w:lvl>
+    <w:lvl w:ilvl="2" w:tentative="1">
+      <w:start w:val="1"/>
+      <w:numFmt w:val="bullet"/>
+      <w:lvlText w:val=""/>
+      <w:lvlJc w:val="left"/>
+      <w:pPr>
+        <w:tabs>
+          <w:tab w:val="num" w:pos="2160"/>
+        </w:tabs>
+        <w:ind w:left="2160" w:hanging="360"/>
+      </w:pPr>
+      <w:rPr>
+        <w:rFonts w:ascii="Wingdings" w:hAnsi="Wingdings" w:hint="default"/>
+        <w:sz w:val="20"/>
+      </w:rPr>
+    </w:lvl>
+    <w:lvl w:ilvl="3" w:tentative="1">
+      <w:start w:val="1"/>
+      <w:numFmt w:val="bullet"/>
+      <w:lvlText w:val=""/>
+      <w:lvlJc w:val="left"/>
+      <w:pPr>
+        <w:tabs>
+          <w:tab w:val="num" w:pos="2880"/>
+        </w:tabs>
+        <w:ind w:left="2880" w:hanging="360"/>
+      </w:pPr>
+      <w:rPr>
+        <w:rFonts w:ascii="Wingdings" w:hAnsi="Wingdings" w:hint="default"/>
+        <w:sz w:val="20"/>
+      </w:rPr>
+    </w:lvl>
+    <w:lvl w:ilvl="4" w:tentative="1">
+      <w:start w:val="1"/>
+      <w:numFmt w:val="bullet"/>
+      <w:lvlText w:val=""/>
+      <w:lvlJc w:val="left"/>
+      <w:pPr>
+        <w:tabs>
+          <w:tab w:val="num" w:pos="3600"/>
+        </w:tabs>
+        <w:ind w:left="3600" w:hanging="360"/>
+      </w:pPr>
+      <w:rPr>
+        <w:rFonts w:ascii="Wingdings" w:hAnsi="Wingdings" w:hint="default"/>
+        <w:sz w:val="20"/>
+      </w:rPr>
+    </w:lvl>
+    <w:lvl w:ilvl="5" w:tentative="1">
+      <w:start w:val="1"/>
+      <w:numFmt w:val="bullet"/>
+      <w:lvlText w:val=""/>
+      <w:lvlJc w:val="left"/>
+      <w:pPr>
+        <w:tabs>
+          <w:tab w:val="num" w:pos="4320"/>
+        </w:tabs>
+        <w:ind w:left="4320" w:hanging="360"/>
+      </w:pPr>
+      <w:rPr>
+        <w:rFonts w:ascii="Wingdings" w:hAnsi="Wingdings" w:hint="default"/>
+        <w:sz w:val="20"/>
+      </w:rPr>
+    </w:lvl>
+    <w:lvl w:ilvl="6" w:tentative="1">
+      <w:start w:val="1"/>
+      <w:numFmt w:val="bullet"/>
+      <w:lvlText w:val=""/>
+      <w:lvlJc w:val="left"/>
+      <w:pPr>
+        <w:tabs>
+          <w:tab w:val="num" w:pos="5040"/>
+        </w:tabs>
+        <w:ind w:left="5040" w:hanging="360"/>
+      </w:pPr>
+      <w:rPr>
+        <w:rFonts w:ascii="Wingdings" w:hAnsi="Wingdings" w:hint="default"/>
+        <w:sz w:val="20"/>
+      </w:rPr>
+    </w:lvl>
+    <w:lvl w:ilvl="7" w:tentative="1">
+      <w:start w:val="1"/>
+      <w:numFmt w:val="bullet"/>
+      <w:lvlText w:val=""/>
+      <w:lvlJc w:val="left"/>
+      <w:pPr>
+        <w:tabs>
+          <w:tab w:val="num" w:pos="5760"/>
+        </w:tabs>
+        <w:ind w:left="5760" w:hanging="360"/>
+      </w:pPr>
+      <w:rPr>
+        <w:rFonts w:ascii="Wingdings" w:hAnsi="Wingdings" w:hint="default"/>
+        <w:sz w:val="20"/>
+      </w:rPr>
+    </w:lvl>
+    <w:lvl w:ilvl="8" w:tentative="1">
+      <w:start w:val="1"/>
+      <w:numFmt w:val="bullet"/>
+      <w:lvlText w:val=""/>
+      <w:lvlJc w:val="left"/>
+      <w:pPr>
+        <w:tabs>
+          <w:tab w:val="num" w:pos="6480"/>
+        </w:tabs>
+        <w:ind w:left="6480" w:hanging="360"/>
+      </w:pPr>
+      <w:rPr>
+        <w:rFonts w:ascii="Wingdings" w:hAnsi="Wingdings" w:hint="default"/>
+        <w:sz w:val="20"/>
+      </w:rPr>
+    </w:lvl>
+  </w:abstractNum>
+  <w:abstractNum w:abstractNumId="11" w15:restartNumberingAfterBreak="0">
+    <w:nsid w:val="2A861DEB"/>
+    <w:multiLevelType w:val="multilevel"/>
+    <w:tmpl w:val="F5DC9772"/>
+    <w:lvl w:ilvl="0">
+      <w:start w:val="1"/>
+      <w:numFmt w:val="bullet"/>
+      <w:lvlText w:val=""/>
+      <w:lvlJc w:val="left"/>
+      <w:pPr>
+        <w:tabs>
+          <w:tab w:val="num" w:pos="720"/>
+        </w:tabs>
+        <w:ind w:left="720" w:hanging="360"/>
+      </w:pPr>
+      <w:rPr>
+        <w:rFonts w:ascii="Symbol" w:hAnsi="Symbol" w:hint="default"/>
+        <w:sz w:val="20"/>
+      </w:rPr>
+    </w:lvl>
+    <w:lvl w:ilvl="1" w:tentative="1">
+      <w:start w:val="1"/>
+      <w:numFmt w:val="bullet"/>
+      <w:lvlText w:val="o"/>
+      <w:lvlJc w:val="left"/>
+      <w:pPr>
+        <w:tabs>
+          <w:tab w:val="num" w:pos="1440"/>
+        </w:tabs>
+        <w:ind w:left="1440" w:hanging="360"/>
+      </w:pPr>
+      <w:rPr>
+        <w:rFonts w:ascii="Courier New" w:hAnsi="Courier New" w:hint="default"/>
+        <w:sz w:val="20"/>
+      </w:rPr>
+    </w:lvl>
+    <w:lvl w:ilvl="2" w:tentative="1">
+      <w:start w:val="1"/>
+      <w:numFmt w:val="bullet"/>
+      <w:lvlText w:val=""/>
+      <w:lvlJc w:val="left"/>
+      <w:pPr>
+        <w:tabs>
+          <w:tab w:val="num" w:pos="2160"/>
+        </w:tabs>
+        <w:ind w:left="2160" w:hanging="360"/>
+      </w:pPr>
+      <w:rPr>
+        <w:rFonts w:ascii="Wingdings" w:hAnsi="Wingdings" w:hint="default"/>
+        <w:sz w:val="20"/>
+      </w:rPr>
+    </w:lvl>
+    <w:lvl w:ilvl="3" w:tentative="1">
+      <w:start w:val="1"/>
+      <w:numFmt w:val="bullet"/>
+      <w:lvlText w:val=""/>
+      <w:lvlJc w:val="left"/>
+      <w:pPr>
+        <w:tabs>
+          <w:tab w:val="num" w:pos="2880"/>
+        </w:tabs>
+        <w:ind w:left="2880" w:hanging="360"/>
+      </w:pPr>
+      <w:rPr>
+        <w:rFonts w:ascii="Wingdings" w:hAnsi="Wingdings" w:hint="default"/>
+        <w:sz w:val="20"/>
+      </w:rPr>
+    </w:lvl>
+    <w:lvl w:ilvl="4" w:tentative="1">
+      <w:start w:val="1"/>
+      <w:numFmt w:val="bullet"/>
+      <w:lvlText w:val=""/>
+      <w:lvlJc w:val="left"/>
+      <w:pPr>
+        <w:tabs>
+          <w:tab w:val="num" w:pos="3600"/>
+        </w:tabs>
+        <w:ind w:left="3600" w:hanging="360"/>
+      </w:pPr>
+      <w:rPr>
+        <w:rFonts w:ascii="Wingdings" w:hAnsi="Wingdings" w:hint="default"/>
+        <w:sz w:val="20"/>
+      </w:rPr>
+    </w:lvl>
+    <w:lvl w:ilvl="5" w:tentative="1">
+      <w:start w:val="1"/>
+      <w:numFmt w:val="bullet"/>
+      <w:lvlText w:val=""/>
+      <w:lvlJc w:val="left"/>
+      <w:pPr>
+        <w:tabs>
+          <w:tab w:val="num" w:pos="4320"/>
+        </w:tabs>
+        <w:ind w:left="4320" w:hanging="360"/>
+      </w:pPr>
+      <w:rPr>
+        <w:rFonts w:ascii="Wingdings" w:hAnsi="Wingdings" w:hint="default"/>
+        <w:sz w:val="20"/>
+      </w:rPr>
+    </w:lvl>
+    <w:lvl w:ilvl="6" w:tentative="1">
+      <w:start w:val="1"/>
+      <w:numFmt w:val="bullet"/>
+      <w:lvlText w:val=""/>
+      <w:lvlJc w:val="left"/>
+      <w:pPr>
+        <w:tabs>
+          <w:tab w:val="num" w:pos="5040"/>
+        </w:tabs>
+        <w:ind w:left="5040" w:hanging="360"/>
+      </w:pPr>
+      <w:rPr>
+        <w:rFonts w:ascii="Wingdings" w:hAnsi="Wingdings" w:hint="default"/>
+        <w:sz w:val="20"/>
+      </w:rPr>
+    </w:lvl>
+    <w:lvl w:ilvl="7" w:tentative="1">
+      <w:start w:val="1"/>
+      <w:numFmt w:val="bullet"/>
+      <w:lvlText w:val=""/>
+      <w:lvlJc w:val="left"/>
+      <w:pPr>
+        <w:tabs>
+          <w:tab w:val="num" w:pos="5760"/>
+        </w:tabs>
+        <w:ind w:left="5760" w:hanging="360"/>
+      </w:pPr>
+      <w:rPr>
+        <w:rFonts w:ascii="Wingdings" w:hAnsi="Wingdings" w:hint="default"/>
+        <w:sz w:val="20"/>
+      </w:rPr>
+    </w:lvl>
+    <w:lvl w:ilvl="8" w:tentative="1">
+      <w:start w:val="1"/>
+      <w:numFmt w:val="bullet"/>
+      <w:lvlText w:val=""/>
+      <w:lvlJc w:val="left"/>
+      <w:pPr>
+        <w:tabs>
+          <w:tab w:val="num" w:pos="6480"/>
+        </w:tabs>
+        <w:ind w:left="6480" w:hanging="360"/>
+      </w:pPr>
+      <w:rPr>
+        <w:rFonts w:ascii="Wingdings" w:hAnsi="Wingdings" w:hint="default"/>
+        <w:sz w:val="20"/>
+      </w:rPr>
+    </w:lvl>
+  </w:abstractNum>
+  <w:abstractNum w:abstractNumId="12" w15:restartNumberingAfterBreak="0">
+    <w:nsid w:val="3E98139C"/>
+    <w:multiLevelType w:val="multilevel"/>
+    <w:tmpl w:val="F7C83B44"/>
     <w:lvl w:ilvl="0">
       <w:start w:val="1"/>
       <w:numFmt w:val="decimal"/>
@@ -7927,457 +8374,10 @@
       </w:pPr>
     </w:lvl>
   </w:abstractNum>
-  <w:abstractNum w:abstractNumId="10" w15:restartNumberingAfterBreak="0">
-    <w:nsid w:val="404A1AE3"/>
+  <w:abstractNum w:abstractNumId="13" w15:restartNumberingAfterBreak="0">
+    <w:nsid w:val="3F084947"/>
     <w:multiLevelType w:val="multilevel"/>
-    <w:tmpl w:val="429EF5D8"/>
-    <w:lvl w:ilvl="0">
-      <w:start w:val="1"/>
-      <w:numFmt w:val="bullet"/>
-      <w:lvlText w:val=""/>
-      <w:lvlJc w:val="left"/>
-      <w:pPr>
-        <w:tabs>
-          <w:tab w:val="num" w:pos="720"/>
-        </w:tabs>
-        <w:ind w:left="720" w:hanging="360"/>
-      </w:pPr>
-      <w:rPr>
-        <w:rFonts w:ascii="Symbol" w:hAnsi="Symbol" w:hint="default"/>
-        <w:sz w:val="20"/>
-      </w:rPr>
-    </w:lvl>
-    <w:lvl w:ilvl="1" w:tentative="1">
-      <w:start w:val="1"/>
-      <w:numFmt w:val="bullet"/>
-      <w:lvlText w:val="o"/>
-      <w:lvlJc w:val="left"/>
-      <w:pPr>
-        <w:tabs>
-          <w:tab w:val="num" w:pos="1440"/>
-        </w:tabs>
-        <w:ind w:left="1440" w:hanging="360"/>
-      </w:pPr>
-      <w:rPr>
-        <w:rFonts w:ascii="Courier New" w:hAnsi="Courier New" w:hint="default"/>
-        <w:sz w:val="20"/>
-      </w:rPr>
-    </w:lvl>
-    <w:lvl w:ilvl="2" w:tentative="1">
-      <w:start w:val="1"/>
-      <w:numFmt w:val="bullet"/>
-      <w:lvlText w:val=""/>
-      <w:lvlJc w:val="left"/>
-      <w:pPr>
-        <w:tabs>
-          <w:tab w:val="num" w:pos="2160"/>
-        </w:tabs>
-        <w:ind w:left="2160" w:hanging="360"/>
-      </w:pPr>
-      <w:rPr>
-        <w:rFonts w:ascii="Wingdings" w:hAnsi="Wingdings" w:hint="default"/>
-        <w:sz w:val="20"/>
-      </w:rPr>
-    </w:lvl>
-    <w:lvl w:ilvl="3" w:tentative="1">
-      <w:start w:val="1"/>
-      <w:numFmt w:val="bullet"/>
-      <w:lvlText w:val=""/>
-      <w:lvlJc w:val="left"/>
-      <w:pPr>
-        <w:tabs>
-          <w:tab w:val="num" w:pos="2880"/>
-        </w:tabs>
-        <w:ind w:left="2880" w:hanging="360"/>
-      </w:pPr>
-      <w:rPr>
-        <w:rFonts w:ascii="Wingdings" w:hAnsi="Wingdings" w:hint="default"/>
-        <w:sz w:val="20"/>
-      </w:rPr>
-    </w:lvl>
-    <w:lvl w:ilvl="4" w:tentative="1">
-      <w:start w:val="1"/>
-      <w:numFmt w:val="bullet"/>
-      <w:lvlText w:val=""/>
-      <w:lvlJc w:val="left"/>
-      <w:pPr>
-        <w:tabs>
-          <w:tab w:val="num" w:pos="3600"/>
-        </w:tabs>
-        <w:ind w:left="3600" w:hanging="360"/>
-      </w:pPr>
-      <w:rPr>
-        <w:rFonts w:ascii="Wingdings" w:hAnsi="Wingdings" w:hint="default"/>
-        <w:sz w:val="20"/>
-      </w:rPr>
-    </w:lvl>
-    <w:lvl w:ilvl="5" w:tentative="1">
-      <w:start w:val="1"/>
-      <w:numFmt w:val="bullet"/>
-      <w:lvlText w:val=""/>
-      <w:lvlJc w:val="left"/>
-      <w:pPr>
-        <w:tabs>
-          <w:tab w:val="num" w:pos="4320"/>
-        </w:tabs>
-        <w:ind w:left="4320" w:hanging="360"/>
-      </w:pPr>
-      <w:rPr>
-        <w:rFonts w:ascii="Wingdings" w:hAnsi="Wingdings" w:hint="default"/>
-        <w:sz w:val="20"/>
-      </w:rPr>
-    </w:lvl>
-    <w:lvl w:ilvl="6" w:tentative="1">
-      <w:start w:val="1"/>
-      <w:numFmt w:val="bullet"/>
-      <w:lvlText w:val=""/>
-      <w:lvlJc w:val="left"/>
-      <w:pPr>
-        <w:tabs>
-          <w:tab w:val="num" w:pos="5040"/>
-        </w:tabs>
-        <w:ind w:left="5040" w:hanging="360"/>
-      </w:pPr>
-      <w:rPr>
-        <w:rFonts w:ascii="Wingdings" w:hAnsi="Wingdings" w:hint="default"/>
-        <w:sz w:val="20"/>
-      </w:rPr>
-    </w:lvl>
-    <w:lvl w:ilvl="7" w:tentative="1">
-      <w:start w:val="1"/>
-      <w:numFmt w:val="bullet"/>
-      <w:lvlText w:val=""/>
-      <w:lvlJc w:val="left"/>
-      <w:pPr>
-        <w:tabs>
-          <w:tab w:val="num" w:pos="5760"/>
-        </w:tabs>
-        <w:ind w:left="5760" w:hanging="360"/>
-      </w:pPr>
-      <w:rPr>
-        <w:rFonts w:ascii="Wingdings" w:hAnsi="Wingdings" w:hint="default"/>
-        <w:sz w:val="20"/>
-      </w:rPr>
-    </w:lvl>
-    <w:lvl w:ilvl="8" w:tentative="1">
-      <w:start w:val="1"/>
-      <w:numFmt w:val="bullet"/>
-      <w:lvlText w:val=""/>
-      <w:lvlJc w:val="left"/>
-      <w:pPr>
-        <w:tabs>
-          <w:tab w:val="num" w:pos="6480"/>
-        </w:tabs>
-        <w:ind w:left="6480" w:hanging="360"/>
-      </w:pPr>
-      <w:rPr>
-        <w:rFonts w:ascii="Wingdings" w:hAnsi="Wingdings" w:hint="default"/>
-        <w:sz w:val="20"/>
-      </w:rPr>
-    </w:lvl>
-  </w:abstractNum>
-  <w:abstractNum w:abstractNumId="11" w15:restartNumberingAfterBreak="0">
-    <w:nsid w:val="42701253"/>
-    <w:multiLevelType w:val="multilevel"/>
-    <w:tmpl w:val="7FC66282"/>
-    <w:lvl w:ilvl="0">
-      <w:start w:val="1"/>
-      <w:numFmt w:val="bullet"/>
-      <w:lvlText w:val=""/>
-      <w:lvlJc w:val="left"/>
-      <w:pPr>
-        <w:tabs>
-          <w:tab w:val="num" w:pos="720"/>
-        </w:tabs>
-        <w:ind w:left="720" w:hanging="360"/>
-      </w:pPr>
-      <w:rPr>
-        <w:rFonts w:ascii="Symbol" w:hAnsi="Symbol" w:hint="default"/>
-        <w:sz w:val="20"/>
-      </w:rPr>
-    </w:lvl>
-    <w:lvl w:ilvl="1" w:tentative="1">
-      <w:start w:val="1"/>
-      <w:numFmt w:val="bullet"/>
-      <w:lvlText w:val="o"/>
-      <w:lvlJc w:val="left"/>
-      <w:pPr>
-        <w:tabs>
-          <w:tab w:val="num" w:pos="1440"/>
-        </w:tabs>
-        <w:ind w:left="1440" w:hanging="360"/>
-      </w:pPr>
-      <w:rPr>
-        <w:rFonts w:ascii="Courier New" w:hAnsi="Courier New" w:hint="default"/>
-        <w:sz w:val="20"/>
-      </w:rPr>
-    </w:lvl>
-    <w:lvl w:ilvl="2" w:tentative="1">
-      <w:start w:val="1"/>
-      <w:numFmt w:val="bullet"/>
-      <w:lvlText w:val=""/>
-      <w:lvlJc w:val="left"/>
-      <w:pPr>
-        <w:tabs>
-          <w:tab w:val="num" w:pos="2160"/>
-        </w:tabs>
-        <w:ind w:left="2160" w:hanging="360"/>
-      </w:pPr>
-      <w:rPr>
-        <w:rFonts w:ascii="Wingdings" w:hAnsi="Wingdings" w:hint="default"/>
-        <w:sz w:val="20"/>
-      </w:rPr>
-    </w:lvl>
-    <w:lvl w:ilvl="3" w:tentative="1">
-      <w:start w:val="1"/>
-      <w:numFmt w:val="bullet"/>
-      <w:lvlText w:val=""/>
-      <w:lvlJc w:val="left"/>
-      <w:pPr>
-        <w:tabs>
-          <w:tab w:val="num" w:pos="2880"/>
-        </w:tabs>
-        <w:ind w:left="2880" w:hanging="360"/>
-      </w:pPr>
-      <w:rPr>
-        <w:rFonts w:ascii="Wingdings" w:hAnsi="Wingdings" w:hint="default"/>
-        <w:sz w:val="20"/>
-      </w:rPr>
-    </w:lvl>
-    <w:lvl w:ilvl="4" w:tentative="1">
-      <w:start w:val="1"/>
-      <w:numFmt w:val="bullet"/>
-      <w:lvlText w:val=""/>
-      <w:lvlJc w:val="left"/>
-      <w:pPr>
-        <w:tabs>
-          <w:tab w:val="num" w:pos="3600"/>
-        </w:tabs>
-        <w:ind w:left="3600" w:hanging="360"/>
-      </w:pPr>
-      <w:rPr>
-        <w:rFonts w:ascii="Wingdings" w:hAnsi="Wingdings" w:hint="default"/>
-        <w:sz w:val="20"/>
-      </w:rPr>
-    </w:lvl>
-    <w:lvl w:ilvl="5" w:tentative="1">
-      <w:start w:val="1"/>
-      <w:numFmt w:val="bullet"/>
-      <w:lvlText w:val=""/>
-      <w:lvlJc w:val="left"/>
-      <w:pPr>
-        <w:tabs>
-          <w:tab w:val="num" w:pos="4320"/>
-        </w:tabs>
-        <w:ind w:left="4320" w:hanging="360"/>
-      </w:pPr>
-      <w:rPr>
-        <w:rFonts w:ascii="Wingdings" w:hAnsi="Wingdings" w:hint="default"/>
-        <w:sz w:val="20"/>
-      </w:rPr>
-    </w:lvl>
-    <w:lvl w:ilvl="6" w:tentative="1">
-      <w:start w:val="1"/>
-      <w:numFmt w:val="bullet"/>
-      <w:lvlText w:val=""/>
-      <w:lvlJc w:val="left"/>
-      <w:pPr>
-        <w:tabs>
-          <w:tab w:val="num" w:pos="5040"/>
-        </w:tabs>
-        <w:ind w:left="5040" w:hanging="360"/>
-      </w:pPr>
-      <w:rPr>
-        <w:rFonts w:ascii="Wingdings" w:hAnsi="Wingdings" w:hint="default"/>
-        <w:sz w:val="20"/>
-      </w:rPr>
-    </w:lvl>
-    <w:lvl w:ilvl="7" w:tentative="1">
-      <w:start w:val="1"/>
-      <w:numFmt w:val="bullet"/>
-      <w:lvlText w:val=""/>
-      <w:lvlJc w:val="left"/>
-      <w:pPr>
-        <w:tabs>
-          <w:tab w:val="num" w:pos="5760"/>
-        </w:tabs>
-        <w:ind w:left="5760" w:hanging="360"/>
-      </w:pPr>
-      <w:rPr>
-        <w:rFonts w:ascii="Wingdings" w:hAnsi="Wingdings" w:hint="default"/>
-        <w:sz w:val="20"/>
-      </w:rPr>
-    </w:lvl>
-    <w:lvl w:ilvl="8" w:tentative="1">
-      <w:start w:val="1"/>
-      <w:numFmt w:val="bullet"/>
-      <w:lvlText w:val=""/>
-      <w:lvlJc w:val="left"/>
-      <w:pPr>
-        <w:tabs>
-          <w:tab w:val="num" w:pos="6480"/>
-        </w:tabs>
-        <w:ind w:left="6480" w:hanging="360"/>
-      </w:pPr>
-      <w:rPr>
-        <w:rFonts w:ascii="Wingdings" w:hAnsi="Wingdings" w:hint="default"/>
-        <w:sz w:val="20"/>
-      </w:rPr>
-    </w:lvl>
-  </w:abstractNum>
-  <w:abstractNum w:abstractNumId="12" w15:restartNumberingAfterBreak="0">
-    <w:nsid w:val="570B0213"/>
-    <w:multiLevelType w:val="multilevel"/>
-    <w:tmpl w:val="A6EEA088"/>
-    <w:lvl w:ilvl="0">
-      <w:start w:val="1"/>
-      <w:numFmt w:val="bullet"/>
-      <w:lvlText w:val=""/>
-      <w:lvlJc w:val="left"/>
-      <w:pPr>
-        <w:tabs>
-          <w:tab w:val="num" w:pos="720"/>
-        </w:tabs>
-        <w:ind w:left="720" w:hanging="360"/>
-      </w:pPr>
-      <w:rPr>
-        <w:rFonts w:ascii="Symbol" w:hAnsi="Symbol" w:hint="default"/>
-        <w:sz w:val="20"/>
-      </w:rPr>
-    </w:lvl>
-    <w:lvl w:ilvl="1" w:tentative="1">
-      <w:start w:val="1"/>
-      <w:numFmt w:val="bullet"/>
-      <w:lvlText w:val="o"/>
-      <w:lvlJc w:val="left"/>
-      <w:pPr>
-        <w:tabs>
-          <w:tab w:val="num" w:pos="1440"/>
-        </w:tabs>
-        <w:ind w:left="1440" w:hanging="360"/>
-      </w:pPr>
-      <w:rPr>
-        <w:rFonts w:ascii="Courier New" w:hAnsi="Courier New" w:hint="default"/>
-        <w:sz w:val="20"/>
-      </w:rPr>
-    </w:lvl>
-    <w:lvl w:ilvl="2" w:tentative="1">
-      <w:start w:val="1"/>
-      <w:numFmt w:val="bullet"/>
-      <w:lvlText w:val=""/>
-      <w:lvlJc w:val="left"/>
-      <w:pPr>
-        <w:tabs>
-          <w:tab w:val="num" w:pos="2160"/>
-        </w:tabs>
-        <w:ind w:left="2160" w:hanging="360"/>
-      </w:pPr>
-      <w:rPr>
-        <w:rFonts w:ascii="Wingdings" w:hAnsi="Wingdings" w:hint="default"/>
-        <w:sz w:val="20"/>
-      </w:rPr>
-    </w:lvl>
-    <w:lvl w:ilvl="3" w:tentative="1">
-      <w:start w:val="1"/>
-      <w:numFmt w:val="bullet"/>
-      <w:lvlText w:val=""/>
-      <w:lvlJc w:val="left"/>
-      <w:pPr>
-        <w:tabs>
-          <w:tab w:val="num" w:pos="2880"/>
-        </w:tabs>
-        <w:ind w:left="2880" w:hanging="360"/>
-      </w:pPr>
-      <w:rPr>
-        <w:rFonts w:ascii="Wingdings" w:hAnsi="Wingdings" w:hint="default"/>
-        <w:sz w:val="20"/>
-      </w:rPr>
-    </w:lvl>
-    <w:lvl w:ilvl="4" w:tentative="1">
-      <w:start w:val="1"/>
-      <w:numFmt w:val="bullet"/>
-      <w:lvlText w:val=""/>
-      <w:lvlJc w:val="left"/>
-      <w:pPr>
-        <w:tabs>
-          <w:tab w:val="num" w:pos="3600"/>
-        </w:tabs>
-        <w:ind w:left="3600" w:hanging="360"/>
-      </w:pPr>
-      <w:rPr>
-        <w:rFonts w:ascii="Wingdings" w:hAnsi="Wingdings" w:hint="default"/>
-        <w:sz w:val="20"/>
-      </w:rPr>
-    </w:lvl>
-    <w:lvl w:ilvl="5" w:tentative="1">
-      <w:start w:val="1"/>
-      <w:numFmt w:val="bullet"/>
-      <w:lvlText w:val=""/>
-      <w:lvlJc w:val="left"/>
-      <w:pPr>
-        <w:tabs>
-          <w:tab w:val="num" w:pos="4320"/>
-        </w:tabs>
-        <w:ind w:left="4320" w:hanging="360"/>
-      </w:pPr>
-      <w:rPr>
-        <w:rFonts w:ascii="Wingdings" w:hAnsi="Wingdings" w:hint="default"/>
-        <w:sz w:val="20"/>
-      </w:rPr>
-    </w:lvl>
-    <w:lvl w:ilvl="6" w:tentative="1">
-      <w:start w:val="1"/>
-      <w:numFmt w:val="bullet"/>
-      <w:lvlText w:val=""/>
-      <w:lvlJc w:val="left"/>
-      <w:pPr>
-        <w:tabs>
-          <w:tab w:val="num" w:pos="5040"/>
-        </w:tabs>
-        <w:ind w:left="5040" w:hanging="360"/>
-      </w:pPr>
-      <w:rPr>
-        <w:rFonts w:ascii="Wingdings" w:hAnsi="Wingdings" w:hint="default"/>
-        <w:sz w:val="20"/>
-      </w:rPr>
-    </w:lvl>
-    <w:lvl w:ilvl="7" w:tentative="1">
-      <w:start w:val="1"/>
-      <w:numFmt w:val="bullet"/>
-      <w:lvlText w:val=""/>
-      <w:lvlJc w:val="left"/>
-      <w:pPr>
-        <w:tabs>
-          <w:tab w:val="num" w:pos="5760"/>
-        </w:tabs>
-        <w:ind w:left="5760" w:hanging="360"/>
-      </w:pPr>
-      <w:rPr>
-        <w:rFonts w:ascii="Wingdings" w:hAnsi="Wingdings" w:hint="default"/>
-        <w:sz w:val="20"/>
-      </w:rPr>
-    </w:lvl>
-    <w:lvl w:ilvl="8" w:tentative="1">
-      <w:start w:val="1"/>
-      <w:numFmt w:val="bullet"/>
-      <w:lvlText w:val=""/>
-      <w:lvlJc w:val="left"/>
-      <w:pPr>
-        <w:tabs>
-          <w:tab w:val="num" w:pos="6480"/>
-        </w:tabs>
-        <w:ind w:left="6480" w:hanging="360"/>
-      </w:pPr>
-      <w:rPr>
-        <w:rFonts w:ascii="Wingdings" w:hAnsi="Wingdings" w:hint="default"/>
-        <w:sz w:val="20"/>
-      </w:rPr>
-    </w:lvl>
-  </w:abstractNum>
-  <w:abstractNum w:abstractNumId="13" w15:restartNumberingAfterBreak="0">
-    <w:nsid w:val="5BA925B1"/>
-    <w:multiLevelType w:val="multilevel"/>
-    <w:tmpl w:val="75E8C6AA"/>
+    <w:tmpl w:val="E9A280E6"/>
     <w:lvl w:ilvl="0">
       <w:start w:val="1"/>
       <w:numFmt w:val="decimal"/>
@@ -8492,9 +8492,9 @@
     </w:lvl>
   </w:abstractNum>
   <w:abstractNum w:abstractNumId="14" w15:restartNumberingAfterBreak="0">
-    <w:nsid w:val="5DB52AFA"/>
+    <w:nsid w:val="41FF131A"/>
     <w:multiLevelType w:val="multilevel"/>
-    <w:tmpl w:val="F538EEFA"/>
+    <w:tmpl w:val="DB1E861A"/>
     <w:lvl w:ilvl="0">
       <w:start w:val="1"/>
       <w:numFmt w:val="bullet"/>
@@ -8641,9 +8641,307 @@
     </w:lvl>
   </w:abstractNum>
   <w:abstractNum w:abstractNumId="15" w15:restartNumberingAfterBreak="0">
-    <w:nsid w:val="5F8133E3"/>
+    <w:nsid w:val="46C41BAC"/>
     <w:multiLevelType w:val="multilevel"/>
-    <w:tmpl w:val="B24EEEC0"/>
+    <w:tmpl w:val="79FAD3E0"/>
+    <w:lvl w:ilvl="0">
+      <w:start w:val="1"/>
+      <w:numFmt w:val="bullet"/>
+      <w:lvlText w:val=""/>
+      <w:lvlJc w:val="left"/>
+      <w:pPr>
+        <w:tabs>
+          <w:tab w:val="num" w:pos="720"/>
+        </w:tabs>
+        <w:ind w:left="720" w:hanging="360"/>
+      </w:pPr>
+      <w:rPr>
+        <w:rFonts w:ascii="Symbol" w:hAnsi="Symbol" w:hint="default"/>
+        <w:sz w:val="20"/>
+      </w:rPr>
+    </w:lvl>
+    <w:lvl w:ilvl="1" w:tentative="1">
+      <w:start w:val="1"/>
+      <w:numFmt w:val="bullet"/>
+      <w:lvlText w:val="o"/>
+      <w:lvlJc w:val="left"/>
+      <w:pPr>
+        <w:tabs>
+          <w:tab w:val="num" w:pos="1440"/>
+        </w:tabs>
+        <w:ind w:left="1440" w:hanging="360"/>
+      </w:pPr>
+      <w:rPr>
+        <w:rFonts w:ascii="Courier New" w:hAnsi="Courier New" w:hint="default"/>
+        <w:sz w:val="20"/>
+      </w:rPr>
+    </w:lvl>
+    <w:lvl w:ilvl="2" w:tentative="1">
+      <w:start w:val="1"/>
+      <w:numFmt w:val="bullet"/>
+      <w:lvlText w:val=""/>
+      <w:lvlJc w:val="left"/>
+      <w:pPr>
+        <w:tabs>
+          <w:tab w:val="num" w:pos="2160"/>
+        </w:tabs>
+        <w:ind w:left="2160" w:hanging="360"/>
+      </w:pPr>
+      <w:rPr>
+        <w:rFonts w:ascii="Wingdings" w:hAnsi="Wingdings" w:hint="default"/>
+        <w:sz w:val="20"/>
+      </w:rPr>
+    </w:lvl>
+    <w:lvl w:ilvl="3" w:tentative="1">
+      <w:start w:val="1"/>
+      <w:numFmt w:val="bullet"/>
+      <w:lvlText w:val=""/>
+      <w:lvlJc w:val="left"/>
+      <w:pPr>
+        <w:tabs>
+          <w:tab w:val="num" w:pos="2880"/>
+        </w:tabs>
+        <w:ind w:left="2880" w:hanging="360"/>
+      </w:pPr>
+      <w:rPr>
+        <w:rFonts w:ascii="Wingdings" w:hAnsi="Wingdings" w:hint="default"/>
+        <w:sz w:val="20"/>
+      </w:rPr>
+    </w:lvl>
+    <w:lvl w:ilvl="4" w:tentative="1">
+      <w:start w:val="1"/>
+      <w:numFmt w:val="bullet"/>
+      <w:lvlText w:val=""/>
+      <w:lvlJc w:val="left"/>
+      <w:pPr>
+        <w:tabs>
+          <w:tab w:val="num" w:pos="3600"/>
+        </w:tabs>
+        <w:ind w:left="3600" w:hanging="360"/>
+      </w:pPr>
+      <w:rPr>
+        <w:rFonts w:ascii="Wingdings" w:hAnsi="Wingdings" w:hint="default"/>
+        <w:sz w:val="20"/>
+      </w:rPr>
+    </w:lvl>
+    <w:lvl w:ilvl="5" w:tentative="1">
+      <w:start w:val="1"/>
+      <w:numFmt w:val="bullet"/>
+      <w:lvlText w:val=""/>
+      <w:lvlJc w:val="left"/>
+      <w:pPr>
+        <w:tabs>
+          <w:tab w:val="num" w:pos="4320"/>
+        </w:tabs>
+        <w:ind w:left="4320" w:hanging="360"/>
+      </w:pPr>
+      <w:rPr>
+        <w:rFonts w:ascii="Wingdings" w:hAnsi="Wingdings" w:hint="default"/>
+        <w:sz w:val="20"/>
+      </w:rPr>
+    </w:lvl>
+    <w:lvl w:ilvl="6" w:tentative="1">
+      <w:start w:val="1"/>
+      <w:numFmt w:val="bullet"/>
+      <w:lvlText w:val=""/>
+      <w:lvlJc w:val="left"/>
+      <w:pPr>
+        <w:tabs>
+          <w:tab w:val="num" w:pos="5040"/>
+        </w:tabs>
+        <w:ind w:left="5040" w:hanging="360"/>
+      </w:pPr>
+      <w:rPr>
+        <w:rFonts w:ascii="Wingdings" w:hAnsi="Wingdings" w:hint="default"/>
+        <w:sz w:val="20"/>
+      </w:rPr>
+    </w:lvl>
+    <w:lvl w:ilvl="7" w:tentative="1">
+      <w:start w:val="1"/>
+      <w:numFmt w:val="bullet"/>
+      <w:lvlText w:val=""/>
+      <w:lvlJc w:val="left"/>
+      <w:pPr>
+        <w:tabs>
+          <w:tab w:val="num" w:pos="5760"/>
+        </w:tabs>
+        <w:ind w:left="5760" w:hanging="360"/>
+      </w:pPr>
+      <w:rPr>
+        <w:rFonts w:ascii="Wingdings" w:hAnsi="Wingdings" w:hint="default"/>
+        <w:sz w:val="20"/>
+      </w:rPr>
+    </w:lvl>
+    <w:lvl w:ilvl="8" w:tentative="1">
+      <w:start w:val="1"/>
+      <w:numFmt w:val="bullet"/>
+      <w:lvlText w:val=""/>
+      <w:lvlJc w:val="left"/>
+      <w:pPr>
+        <w:tabs>
+          <w:tab w:val="num" w:pos="6480"/>
+        </w:tabs>
+        <w:ind w:left="6480" w:hanging="360"/>
+      </w:pPr>
+      <w:rPr>
+        <w:rFonts w:ascii="Wingdings" w:hAnsi="Wingdings" w:hint="default"/>
+        <w:sz w:val="20"/>
+      </w:rPr>
+    </w:lvl>
+  </w:abstractNum>
+  <w:abstractNum w:abstractNumId="16" w15:restartNumberingAfterBreak="0">
+    <w:nsid w:val="69B10872"/>
+    <w:multiLevelType w:val="multilevel"/>
+    <w:tmpl w:val="4566DEE6"/>
+    <w:lvl w:ilvl="0">
+      <w:start w:val="1"/>
+      <w:numFmt w:val="bullet"/>
+      <w:lvlText w:val=""/>
+      <w:lvlJc w:val="left"/>
+      <w:pPr>
+        <w:tabs>
+          <w:tab w:val="num" w:pos="720"/>
+        </w:tabs>
+        <w:ind w:left="720" w:hanging="360"/>
+      </w:pPr>
+      <w:rPr>
+        <w:rFonts w:ascii="Symbol" w:hAnsi="Symbol" w:hint="default"/>
+        <w:sz w:val="20"/>
+      </w:rPr>
+    </w:lvl>
+    <w:lvl w:ilvl="1" w:tentative="1">
+      <w:start w:val="1"/>
+      <w:numFmt w:val="bullet"/>
+      <w:lvlText w:val="o"/>
+      <w:lvlJc w:val="left"/>
+      <w:pPr>
+        <w:tabs>
+          <w:tab w:val="num" w:pos="1440"/>
+        </w:tabs>
+        <w:ind w:left="1440" w:hanging="360"/>
+      </w:pPr>
+      <w:rPr>
+        <w:rFonts w:ascii="Courier New" w:hAnsi="Courier New" w:hint="default"/>
+        <w:sz w:val="20"/>
+      </w:rPr>
+    </w:lvl>
+    <w:lvl w:ilvl="2" w:tentative="1">
+      <w:start w:val="1"/>
+      <w:numFmt w:val="bullet"/>
+      <w:lvlText w:val=""/>
+      <w:lvlJc w:val="left"/>
+      <w:pPr>
+        <w:tabs>
+          <w:tab w:val="num" w:pos="2160"/>
+        </w:tabs>
+        <w:ind w:left="2160" w:hanging="360"/>
+      </w:pPr>
+      <w:rPr>
+        <w:rFonts w:ascii="Wingdings" w:hAnsi="Wingdings" w:hint="default"/>
+        <w:sz w:val="20"/>
+      </w:rPr>
+    </w:lvl>
+    <w:lvl w:ilvl="3" w:tentative="1">
+      <w:start w:val="1"/>
+      <w:numFmt w:val="bullet"/>
+      <w:lvlText w:val=""/>
+      <w:lvlJc w:val="left"/>
+      <w:pPr>
+        <w:tabs>
+          <w:tab w:val="num" w:pos="2880"/>
+        </w:tabs>
+        <w:ind w:left="2880" w:hanging="360"/>
+      </w:pPr>
+      <w:rPr>
+        <w:rFonts w:ascii="Wingdings" w:hAnsi="Wingdings" w:hint="default"/>
+        <w:sz w:val="20"/>
+      </w:rPr>
+    </w:lvl>
+    <w:lvl w:ilvl="4" w:tentative="1">
+      <w:start w:val="1"/>
+      <w:numFmt w:val="bullet"/>
+      <w:lvlText w:val=""/>
+      <w:lvlJc w:val="left"/>
+      <w:pPr>
+        <w:tabs>
+          <w:tab w:val="num" w:pos="3600"/>
+        </w:tabs>
+        <w:ind w:left="3600" w:hanging="360"/>
+      </w:pPr>
+      <w:rPr>
+        <w:rFonts w:ascii="Wingdings" w:hAnsi="Wingdings" w:hint="default"/>
+        <w:sz w:val="20"/>
+      </w:rPr>
+    </w:lvl>
+    <w:lvl w:ilvl="5" w:tentative="1">
+      <w:start w:val="1"/>
+      <w:numFmt w:val="bullet"/>
+      <w:lvlText w:val=""/>
+      <w:lvlJc w:val="left"/>
+      <w:pPr>
+        <w:tabs>
+          <w:tab w:val="num" w:pos="4320"/>
+        </w:tabs>
+        <w:ind w:left="4320" w:hanging="360"/>
+      </w:pPr>
+      <w:rPr>
+        <w:rFonts w:ascii="Wingdings" w:hAnsi="Wingdings" w:hint="default"/>
+        <w:sz w:val="20"/>
+      </w:rPr>
+    </w:lvl>
+    <w:lvl w:ilvl="6" w:tentative="1">
+      <w:start w:val="1"/>
+      <w:numFmt w:val="bullet"/>
+      <w:lvlText w:val=""/>
+      <w:lvlJc w:val="left"/>
+      <w:pPr>
+        <w:tabs>
+          <w:tab w:val="num" w:pos="5040"/>
+        </w:tabs>
+        <w:ind w:left="5040" w:hanging="360"/>
+      </w:pPr>
+      <w:rPr>
+        <w:rFonts w:ascii="Wingdings" w:hAnsi="Wingdings" w:hint="default"/>
+        <w:sz w:val="20"/>
+      </w:rPr>
+    </w:lvl>
+    <w:lvl w:ilvl="7" w:tentative="1">
+      <w:start w:val="1"/>
+      <w:numFmt w:val="bullet"/>
+      <w:lvlText w:val=""/>
+      <w:lvlJc w:val="left"/>
+      <w:pPr>
+        <w:tabs>
+          <w:tab w:val="num" w:pos="5760"/>
+        </w:tabs>
+        <w:ind w:left="5760" w:hanging="360"/>
+      </w:pPr>
+      <w:rPr>
+        <w:rFonts w:ascii="Wingdings" w:hAnsi="Wingdings" w:hint="default"/>
+        <w:sz w:val="20"/>
+      </w:rPr>
+    </w:lvl>
+    <w:lvl w:ilvl="8" w:tentative="1">
+      <w:start w:val="1"/>
+      <w:numFmt w:val="bullet"/>
+      <w:lvlText w:val=""/>
+      <w:lvlJc w:val="left"/>
+      <w:pPr>
+        <w:tabs>
+          <w:tab w:val="num" w:pos="6480"/>
+        </w:tabs>
+        <w:ind w:left="6480" w:hanging="360"/>
+      </w:pPr>
+      <w:rPr>
+        <w:rFonts w:ascii="Wingdings" w:hAnsi="Wingdings" w:hint="default"/>
+        <w:sz w:val="20"/>
+      </w:rPr>
+    </w:lvl>
+  </w:abstractNum>
+  <w:abstractNum w:abstractNumId="17" w15:restartNumberingAfterBreak="0">
+    <w:nsid w:val="6BB8445B"/>
+    <w:multiLevelType w:val="multilevel"/>
+    <w:tmpl w:val="15C6C1B0"/>
     <w:lvl w:ilvl="0">
       <w:start w:val="1"/>
       <w:numFmt w:val="decimal"/>
@@ -8757,14 +9055,14 @@
       </w:pPr>
     </w:lvl>
   </w:abstractNum>
-  <w:abstractNum w:abstractNumId="16" w15:restartNumberingAfterBreak="0">
-    <w:nsid w:val="5FA34D00"/>
+  <w:abstractNum w:abstractNumId="18" w15:restartNumberingAfterBreak="0">
+    <w:nsid w:val="6CD03552"/>
     <w:multiLevelType w:val="multilevel"/>
-    <w:tmpl w:val="7AA0C210"/>
+    <w:tmpl w:val="892CDCAC"/>
     <w:lvl w:ilvl="0">
       <w:start w:val="1"/>
-      <w:numFmt w:val="bullet"/>
-      <w:lvlText w:val=""/>
+      <w:numFmt w:val="decimal"/>
+      <w:lvlText w:val="%1."/>
       <w:lvlJc w:val="left"/>
       <w:pPr>
         <w:tabs>
@@ -8772,12 +9070,8 @@
         </w:tabs>
         <w:ind w:left="720" w:hanging="360"/>
       </w:pPr>
-      <w:rPr>
-        <w:rFonts w:ascii="Symbol" w:hAnsi="Symbol" w:hint="default"/>
-        <w:sz w:val="20"/>
-      </w:rPr>
-    </w:lvl>
-    <w:lvl w:ilvl="1" w:tentative="1">
+    </w:lvl>
+    <w:lvl w:ilvl="1">
       <w:start w:val="1"/>
       <w:numFmt w:val="bullet"/>
       <w:lvlText w:val="o"/>
@@ -8795,8 +9089,8 @@
     </w:lvl>
     <w:lvl w:ilvl="2" w:tentative="1">
       <w:start w:val="1"/>
-      <w:numFmt w:val="bullet"/>
-      <w:lvlText w:val=""/>
+      <w:numFmt w:val="decimal"/>
+      <w:lvlText w:val="%3."/>
       <w:lvlJc w:val="left"/>
       <w:pPr>
         <w:tabs>
@@ -8804,15 +9098,11 @@
         </w:tabs>
         <w:ind w:left="2160" w:hanging="360"/>
       </w:pPr>
-      <w:rPr>
-        <w:rFonts w:ascii="Wingdings" w:hAnsi="Wingdings" w:hint="default"/>
-        <w:sz w:val="20"/>
-      </w:rPr>
     </w:lvl>
     <w:lvl w:ilvl="3" w:tentative="1">
       <w:start w:val="1"/>
-      <w:numFmt w:val="bullet"/>
-      <w:lvlText w:val=""/>
+      <w:numFmt w:val="decimal"/>
+      <w:lvlText w:val="%4."/>
       <w:lvlJc w:val="left"/>
       <w:pPr>
         <w:tabs>
@@ -8820,15 +9110,11 @@
         </w:tabs>
         <w:ind w:left="2880" w:hanging="360"/>
       </w:pPr>
-      <w:rPr>
-        <w:rFonts w:ascii="Wingdings" w:hAnsi="Wingdings" w:hint="default"/>
-        <w:sz w:val="20"/>
-      </w:rPr>
     </w:lvl>
     <w:lvl w:ilvl="4" w:tentative="1">
       <w:start w:val="1"/>
-      <w:numFmt w:val="bullet"/>
-      <w:lvlText w:val=""/>
+      <w:numFmt w:val="decimal"/>
+      <w:lvlText w:val="%5."/>
       <w:lvlJc w:val="left"/>
       <w:pPr>
         <w:tabs>
@@ -8836,15 +9122,11 @@
         </w:tabs>
         <w:ind w:left="3600" w:hanging="360"/>
       </w:pPr>
-      <w:rPr>
-        <w:rFonts w:ascii="Wingdings" w:hAnsi="Wingdings" w:hint="default"/>
-        <w:sz w:val="20"/>
-      </w:rPr>
     </w:lvl>
     <w:lvl w:ilvl="5" w:tentative="1">
       <w:start w:val="1"/>
-      <w:numFmt w:val="bullet"/>
-      <w:lvlText w:val=""/>
+      <w:numFmt w:val="decimal"/>
+      <w:lvlText w:val="%6."/>
       <w:lvlJc w:val="left"/>
       <w:pPr>
         <w:tabs>
@@ -8852,15 +9134,11 @@
         </w:tabs>
         <w:ind w:left="4320" w:hanging="360"/>
       </w:pPr>
-      <w:rPr>
-        <w:rFonts w:ascii="Wingdings" w:hAnsi="Wingdings" w:hint="default"/>
-        <w:sz w:val="20"/>
-      </w:rPr>
     </w:lvl>
     <w:lvl w:ilvl="6" w:tentative="1">
       <w:start w:val="1"/>
-      <w:numFmt w:val="bullet"/>
-      <w:lvlText w:val=""/>
+      <w:numFmt w:val="decimal"/>
+      <w:lvlText w:val="%7."/>
       <w:lvlJc w:val="left"/>
       <w:pPr>
         <w:tabs>
@@ -8868,15 +9146,11 @@
         </w:tabs>
         <w:ind w:left="5040" w:hanging="360"/>
       </w:pPr>
-      <w:rPr>
-        <w:rFonts w:ascii="Wingdings" w:hAnsi="Wingdings" w:hint="default"/>
-        <w:sz w:val="20"/>
-      </w:rPr>
     </w:lvl>
     <w:lvl w:ilvl="7" w:tentative="1">
       <w:start w:val="1"/>
-      <w:numFmt w:val="bullet"/>
-      <w:lvlText w:val=""/>
+      <w:numFmt w:val="decimal"/>
+      <w:lvlText w:val="%8."/>
       <w:lvlJc w:val="left"/>
       <w:pPr>
         <w:tabs>
@@ -8884,15 +9158,11 @@
         </w:tabs>
         <w:ind w:left="5760" w:hanging="360"/>
       </w:pPr>
-      <w:rPr>
-        <w:rFonts w:ascii="Wingdings" w:hAnsi="Wingdings" w:hint="default"/>
-        <w:sz w:val="20"/>
-      </w:rPr>
     </w:lvl>
     <w:lvl w:ilvl="8" w:tentative="1">
       <w:start w:val="1"/>
-      <w:numFmt w:val="bullet"/>
-      <w:lvlText w:val=""/>
+      <w:numFmt w:val="decimal"/>
+      <w:lvlText w:val="%9."/>
       <w:lvlJc w:val="left"/>
       <w:pPr>
         <w:tabs>
@@ -8900,318 +9170,16 @@
         </w:tabs>
         <w:ind w:left="6480" w:hanging="360"/>
       </w:pPr>
-      <w:rPr>
-        <w:rFonts w:ascii="Wingdings" w:hAnsi="Wingdings" w:hint="default"/>
-        <w:sz w:val="20"/>
-      </w:rPr>
-    </w:lvl>
-  </w:abstractNum>
-  <w:abstractNum w:abstractNumId="17" w15:restartNumberingAfterBreak="0">
-    <w:nsid w:val="63E0619E"/>
-    <w:multiLevelType w:val="multilevel"/>
-    <w:tmpl w:val="7FEE2C82"/>
-    <w:lvl w:ilvl="0">
-      <w:start w:val="1"/>
-      <w:numFmt w:val="bullet"/>
-      <w:lvlText w:val=""/>
-      <w:lvlJc w:val="left"/>
-      <w:pPr>
-        <w:tabs>
-          <w:tab w:val="num" w:pos="720"/>
-        </w:tabs>
-        <w:ind w:left="720" w:hanging="360"/>
-      </w:pPr>
-      <w:rPr>
-        <w:rFonts w:ascii="Symbol" w:hAnsi="Symbol" w:hint="default"/>
-        <w:sz w:val="20"/>
-      </w:rPr>
-    </w:lvl>
-    <w:lvl w:ilvl="1" w:tentative="1">
-      <w:start w:val="1"/>
-      <w:numFmt w:val="bullet"/>
-      <w:lvlText w:val="o"/>
-      <w:lvlJc w:val="left"/>
-      <w:pPr>
-        <w:tabs>
-          <w:tab w:val="num" w:pos="1440"/>
-        </w:tabs>
-        <w:ind w:left="1440" w:hanging="360"/>
-      </w:pPr>
-      <w:rPr>
-        <w:rFonts w:ascii="Courier New" w:hAnsi="Courier New" w:hint="default"/>
-        <w:sz w:val="20"/>
-      </w:rPr>
-    </w:lvl>
-    <w:lvl w:ilvl="2" w:tentative="1">
-      <w:start w:val="1"/>
-      <w:numFmt w:val="bullet"/>
-      <w:lvlText w:val=""/>
-      <w:lvlJc w:val="left"/>
-      <w:pPr>
-        <w:tabs>
-          <w:tab w:val="num" w:pos="2160"/>
-        </w:tabs>
-        <w:ind w:left="2160" w:hanging="360"/>
-      </w:pPr>
-      <w:rPr>
-        <w:rFonts w:ascii="Wingdings" w:hAnsi="Wingdings" w:hint="default"/>
-        <w:sz w:val="20"/>
-      </w:rPr>
-    </w:lvl>
-    <w:lvl w:ilvl="3" w:tentative="1">
-      <w:start w:val="1"/>
-      <w:numFmt w:val="bullet"/>
-      <w:lvlText w:val=""/>
-      <w:lvlJc w:val="left"/>
-      <w:pPr>
-        <w:tabs>
-          <w:tab w:val="num" w:pos="2880"/>
-        </w:tabs>
-        <w:ind w:left="2880" w:hanging="360"/>
-      </w:pPr>
-      <w:rPr>
-        <w:rFonts w:ascii="Wingdings" w:hAnsi="Wingdings" w:hint="default"/>
-        <w:sz w:val="20"/>
-      </w:rPr>
-    </w:lvl>
-    <w:lvl w:ilvl="4" w:tentative="1">
-      <w:start w:val="1"/>
-      <w:numFmt w:val="bullet"/>
-      <w:lvlText w:val=""/>
-      <w:lvlJc w:val="left"/>
-      <w:pPr>
-        <w:tabs>
-          <w:tab w:val="num" w:pos="3600"/>
-        </w:tabs>
-        <w:ind w:left="3600" w:hanging="360"/>
-      </w:pPr>
-      <w:rPr>
-        <w:rFonts w:ascii="Wingdings" w:hAnsi="Wingdings" w:hint="default"/>
-        <w:sz w:val="20"/>
-      </w:rPr>
-    </w:lvl>
-    <w:lvl w:ilvl="5" w:tentative="1">
-      <w:start w:val="1"/>
-      <w:numFmt w:val="bullet"/>
-      <w:lvlText w:val=""/>
-      <w:lvlJc w:val="left"/>
-      <w:pPr>
-        <w:tabs>
-          <w:tab w:val="num" w:pos="4320"/>
-        </w:tabs>
-        <w:ind w:left="4320" w:hanging="360"/>
-      </w:pPr>
-      <w:rPr>
-        <w:rFonts w:ascii="Wingdings" w:hAnsi="Wingdings" w:hint="default"/>
-        <w:sz w:val="20"/>
-      </w:rPr>
-    </w:lvl>
-    <w:lvl w:ilvl="6" w:tentative="1">
-      <w:start w:val="1"/>
-      <w:numFmt w:val="bullet"/>
-      <w:lvlText w:val=""/>
-      <w:lvlJc w:val="left"/>
-      <w:pPr>
-        <w:tabs>
-          <w:tab w:val="num" w:pos="5040"/>
-        </w:tabs>
-        <w:ind w:left="5040" w:hanging="360"/>
-      </w:pPr>
-      <w:rPr>
-        <w:rFonts w:ascii="Wingdings" w:hAnsi="Wingdings" w:hint="default"/>
-        <w:sz w:val="20"/>
-      </w:rPr>
-    </w:lvl>
-    <w:lvl w:ilvl="7" w:tentative="1">
-      <w:start w:val="1"/>
-      <w:numFmt w:val="bullet"/>
-      <w:lvlText w:val=""/>
-      <w:lvlJc w:val="left"/>
-      <w:pPr>
-        <w:tabs>
-          <w:tab w:val="num" w:pos="5760"/>
-        </w:tabs>
-        <w:ind w:left="5760" w:hanging="360"/>
-      </w:pPr>
-      <w:rPr>
-        <w:rFonts w:ascii="Wingdings" w:hAnsi="Wingdings" w:hint="default"/>
-        <w:sz w:val="20"/>
-      </w:rPr>
-    </w:lvl>
-    <w:lvl w:ilvl="8" w:tentative="1">
-      <w:start w:val="1"/>
-      <w:numFmt w:val="bullet"/>
-      <w:lvlText w:val=""/>
-      <w:lvlJc w:val="left"/>
-      <w:pPr>
-        <w:tabs>
-          <w:tab w:val="num" w:pos="6480"/>
-        </w:tabs>
-        <w:ind w:left="6480" w:hanging="360"/>
-      </w:pPr>
-      <w:rPr>
-        <w:rFonts w:ascii="Wingdings" w:hAnsi="Wingdings" w:hint="default"/>
-        <w:sz w:val="20"/>
-      </w:rPr>
-    </w:lvl>
-  </w:abstractNum>
-  <w:abstractNum w:abstractNumId="18" w15:restartNumberingAfterBreak="0">
-    <w:nsid w:val="64171B7D"/>
-    <w:multiLevelType w:val="multilevel"/>
-    <w:tmpl w:val="69B4B228"/>
-    <w:lvl w:ilvl="0">
-      <w:start w:val="1"/>
-      <w:numFmt w:val="bullet"/>
-      <w:lvlText w:val=""/>
-      <w:lvlJc w:val="left"/>
-      <w:pPr>
-        <w:tabs>
-          <w:tab w:val="num" w:pos="720"/>
-        </w:tabs>
-        <w:ind w:left="720" w:hanging="360"/>
-      </w:pPr>
-      <w:rPr>
-        <w:rFonts w:ascii="Symbol" w:hAnsi="Symbol" w:hint="default"/>
-        <w:sz w:val="20"/>
-      </w:rPr>
-    </w:lvl>
-    <w:lvl w:ilvl="1" w:tentative="1">
-      <w:start w:val="1"/>
-      <w:numFmt w:val="bullet"/>
-      <w:lvlText w:val="o"/>
-      <w:lvlJc w:val="left"/>
-      <w:pPr>
-        <w:tabs>
-          <w:tab w:val="num" w:pos="1440"/>
-        </w:tabs>
-        <w:ind w:left="1440" w:hanging="360"/>
-      </w:pPr>
-      <w:rPr>
-        <w:rFonts w:ascii="Courier New" w:hAnsi="Courier New" w:hint="default"/>
-        <w:sz w:val="20"/>
-      </w:rPr>
-    </w:lvl>
-    <w:lvl w:ilvl="2" w:tentative="1">
-      <w:start w:val="1"/>
-      <w:numFmt w:val="bullet"/>
-      <w:lvlText w:val=""/>
-      <w:lvlJc w:val="left"/>
-      <w:pPr>
-        <w:tabs>
-          <w:tab w:val="num" w:pos="2160"/>
-        </w:tabs>
-        <w:ind w:left="2160" w:hanging="360"/>
-      </w:pPr>
-      <w:rPr>
-        <w:rFonts w:ascii="Wingdings" w:hAnsi="Wingdings" w:hint="default"/>
-        <w:sz w:val="20"/>
-      </w:rPr>
-    </w:lvl>
-    <w:lvl w:ilvl="3" w:tentative="1">
-      <w:start w:val="1"/>
-      <w:numFmt w:val="bullet"/>
-      <w:lvlText w:val=""/>
-      <w:lvlJc w:val="left"/>
-      <w:pPr>
-        <w:tabs>
-          <w:tab w:val="num" w:pos="2880"/>
-        </w:tabs>
-        <w:ind w:left="2880" w:hanging="360"/>
-      </w:pPr>
-      <w:rPr>
-        <w:rFonts w:ascii="Wingdings" w:hAnsi="Wingdings" w:hint="default"/>
-        <w:sz w:val="20"/>
-      </w:rPr>
-    </w:lvl>
-    <w:lvl w:ilvl="4" w:tentative="1">
-      <w:start w:val="1"/>
-      <w:numFmt w:val="bullet"/>
-      <w:lvlText w:val=""/>
-      <w:lvlJc w:val="left"/>
-      <w:pPr>
-        <w:tabs>
-          <w:tab w:val="num" w:pos="3600"/>
-        </w:tabs>
-        <w:ind w:left="3600" w:hanging="360"/>
-      </w:pPr>
-      <w:rPr>
-        <w:rFonts w:ascii="Wingdings" w:hAnsi="Wingdings" w:hint="default"/>
-        <w:sz w:val="20"/>
-      </w:rPr>
-    </w:lvl>
-    <w:lvl w:ilvl="5" w:tentative="1">
-      <w:start w:val="1"/>
-      <w:numFmt w:val="bullet"/>
-      <w:lvlText w:val=""/>
-      <w:lvlJc w:val="left"/>
-      <w:pPr>
-        <w:tabs>
-          <w:tab w:val="num" w:pos="4320"/>
-        </w:tabs>
-        <w:ind w:left="4320" w:hanging="360"/>
-      </w:pPr>
-      <w:rPr>
-        <w:rFonts w:ascii="Wingdings" w:hAnsi="Wingdings" w:hint="default"/>
-        <w:sz w:val="20"/>
-      </w:rPr>
-    </w:lvl>
-    <w:lvl w:ilvl="6" w:tentative="1">
-      <w:start w:val="1"/>
-      <w:numFmt w:val="bullet"/>
-      <w:lvlText w:val=""/>
-      <w:lvlJc w:val="left"/>
-      <w:pPr>
-        <w:tabs>
-          <w:tab w:val="num" w:pos="5040"/>
-        </w:tabs>
-        <w:ind w:left="5040" w:hanging="360"/>
-      </w:pPr>
-      <w:rPr>
-        <w:rFonts w:ascii="Wingdings" w:hAnsi="Wingdings" w:hint="default"/>
-        <w:sz w:val="20"/>
-      </w:rPr>
-    </w:lvl>
-    <w:lvl w:ilvl="7" w:tentative="1">
-      <w:start w:val="1"/>
-      <w:numFmt w:val="bullet"/>
-      <w:lvlText w:val=""/>
-      <w:lvlJc w:val="left"/>
-      <w:pPr>
-        <w:tabs>
-          <w:tab w:val="num" w:pos="5760"/>
-        </w:tabs>
-        <w:ind w:left="5760" w:hanging="360"/>
-      </w:pPr>
-      <w:rPr>
-        <w:rFonts w:ascii="Wingdings" w:hAnsi="Wingdings" w:hint="default"/>
-        <w:sz w:val="20"/>
-      </w:rPr>
-    </w:lvl>
-    <w:lvl w:ilvl="8" w:tentative="1">
-      <w:start w:val="1"/>
-      <w:numFmt w:val="bullet"/>
-      <w:lvlText w:val=""/>
-      <w:lvlJc w:val="left"/>
-      <w:pPr>
-        <w:tabs>
-          <w:tab w:val="num" w:pos="6480"/>
-        </w:tabs>
-        <w:ind w:left="6480" w:hanging="360"/>
-      </w:pPr>
-      <w:rPr>
-        <w:rFonts w:ascii="Wingdings" w:hAnsi="Wingdings" w:hint="default"/>
-        <w:sz w:val="20"/>
-      </w:rPr>
     </w:lvl>
   </w:abstractNum>
   <w:abstractNum w:abstractNumId="19" w15:restartNumberingAfterBreak="0">
-    <w:nsid w:val="749428FB"/>
+    <w:nsid w:val="6E835D07"/>
     <w:multiLevelType w:val="multilevel"/>
-    <w:tmpl w:val="C270F378"/>
+    <w:tmpl w:val="276A6106"/>
     <w:lvl w:ilvl="0">
       <w:start w:val="1"/>
-      <w:numFmt w:val="bullet"/>
-      <w:lvlText w:val=""/>
+      <w:numFmt w:val="decimal"/>
+      <w:lvlText w:val="%1."/>
       <w:lvlJc w:val="left"/>
       <w:pPr>
         <w:tabs>
@@ -9219,12 +9187,8 @@
         </w:tabs>
         <w:ind w:left="720" w:hanging="360"/>
       </w:pPr>
-      <w:rPr>
-        <w:rFonts w:ascii="Symbol" w:hAnsi="Symbol" w:hint="default"/>
-        <w:sz w:val="20"/>
-      </w:rPr>
-    </w:lvl>
-    <w:lvl w:ilvl="1" w:tentative="1">
+    </w:lvl>
+    <w:lvl w:ilvl="1">
       <w:start w:val="1"/>
       <w:numFmt w:val="bullet"/>
       <w:lvlText w:val="o"/>
@@ -9242,8 +9206,8 @@
     </w:lvl>
     <w:lvl w:ilvl="2" w:tentative="1">
       <w:start w:val="1"/>
-      <w:numFmt w:val="bullet"/>
-      <w:lvlText w:val=""/>
+      <w:numFmt w:val="decimal"/>
+      <w:lvlText w:val="%3."/>
       <w:lvlJc w:val="left"/>
       <w:pPr>
         <w:tabs>
@@ -9251,15 +9215,11 @@
         </w:tabs>
         <w:ind w:left="2160" w:hanging="360"/>
       </w:pPr>
-      <w:rPr>
-        <w:rFonts w:ascii="Wingdings" w:hAnsi="Wingdings" w:hint="default"/>
-        <w:sz w:val="20"/>
-      </w:rPr>
     </w:lvl>
     <w:lvl w:ilvl="3" w:tentative="1">
       <w:start w:val="1"/>
-      <w:numFmt w:val="bullet"/>
-      <w:lvlText w:val=""/>
+      <w:numFmt w:val="decimal"/>
+      <w:lvlText w:val="%4."/>
       <w:lvlJc w:val="left"/>
       <w:pPr>
         <w:tabs>
@@ -9267,15 +9227,11 @@
         </w:tabs>
         <w:ind w:left="2880" w:hanging="360"/>
       </w:pPr>
-      <w:rPr>
-        <w:rFonts w:ascii="Wingdings" w:hAnsi="Wingdings" w:hint="default"/>
-        <w:sz w:val="20"/>
-      </w:rPr>
     </w:lvl>
     <w:lvl w:ilvl="4" w:tentative="1">
       <w:start w:val="1"/>
-      <w:numFmt w:val="bullet"/>
-      <w:lvlText w:val=""/>
+      <w:numFmt w:val="decimal"/>
+      <w:lvlText w:val="%5."/>
       <w:lvlJc w:val="left"/>
       <w:pPr>
         <w:tabs>
@@ -9283,15 +9239,11 @@
         </w:tabs>
         <w:ind w:left="3600" w:hanging="360"/>
       </w:pPr>
-      <w:rPr>
-        <w:rFonts w:ascii="Wingdings" w:hAnsi="Wingdings" w:hint="default"/>
-        <w:sz w:val="20"/>
-      </w:rPr>
     </w:lvl>
     <w:lvl w:ilvl="5" w:tentative="1">
       <w:start w:val="1"/>
-      <w:numFmt w:val="bullet"/>
-      <w:lvlText w:val=""/>
+      <w:numFmt w:val="decimal"/>
+      <w:lvlText w:val="%6."/>
       <w:lvlJc w:val="left"/>
       <w:pPr>
         <w:tabs>
@@ -9299,15 +9251,11 @@
         </w:tabs>
         <w:ind w:left="4320" w:hanging="360"/>
       </w:pPr>
-      <w:rPr>
-        <w:rFonts w:ascii="Wingdings" w:hAnsi="Wingdings" w:hint="default"/>
-        <w:sz w:val="20"/>
-      </w:rPr>
     </w:lvl>
     <w:lvl w:ilvl="6" w:tentative="1">
       <w:start w:val="1"/>
-      <w:numFmt w:val="bullet"/>
-      <w:lvlText w:val=""/>
+      <w:numFmt w:val="decimal"/>
+      <w:lvlText w:val="%7."/>
       <w:lvlJc w:val="left"/>
       <w:pPr>
         <w:tabs>
@@ -9315,15 +9263,11 @@
         </w:tabs>
         <w:ind w:left="5040" w:hanging="360"/>
       </w:pPr>
-      <w:rPr>
-        <w:rFonts w:ascii="Wingdings" w:hAnsi="Wingdings" w:hint="default"/>
-        <w:sz w:val="20"/>
-      </w:rPr>
     </w:lvl>
     <w:lvl w:ilvl="7" w:tentative="1">
       <w:start w:val="1"/>
-      <w:numFmt w:val="bullet"/>
-      <w:lvlText w:val=""/>
+      <w:numFmt w:val="decimal"/>
+      <w:lvlText w:val="%8."/>
       <w:lvlJc w:val="left"/>
       <w:pPr>
         <w:tabs>
@@ -9331,15 +9275,11 @@
         </w:tabs>
         <w:ind w:left="5760" w:hanging="360"/>
       </w:pPr>
-      <w:rPr>
-        <w:rFonts w:ascii="Wingdings" w:hAnsi="Wingdings" w:hint="default"/>
-        <w:sz w:val="20"/>
-      </w:rPr>
     </w:lvl>
     <w:lvl w:ilvl="8" w:tentative="1">
       <w:start w:val="1"/>
-      <w:numFmt w:val="bullet"/>
-      <w:lvlText w:val=""/>
+      <w:numFmt w:val="decimal"/>
+      <w:lvlText w:val="%9."/>
       <w:lvlJc w:val="left"/>
       <w:pPr>
         <w:tabs>
@@ -9347,16 +9287,161 @@
         </w:tabs>
         <w:ind w:left="6480" w:hanging="360"/>
       </w:pPr>
-      <w:rPr>
-        <w:rFonts w:ascii="Wingdings" w:hAnsi="Wingdings" w:hint="default"/>
-        <w:sz w:val="20"/>
-      </w:rPr>
     </w:lvl>
   </w:abstractNum>
   <w:abstractNum w:abstractNumId="20" w15:restartNumberingAfterBreak="0">
-    <w:nsid w:val="78302469"/>
+    <w:nsid w:val="709D0274"/>
     <w:multiLevelType w:val="multilevel"/>
-    <w:tmpl w:val="FDE00012"/>
+    <w:tmpl w:val="AAF866EE"/>
+    <w:lvl w:ilvl="0">
+      <w:start w:val="1"/>
+      <w:numFmt w:val="bullet"/>
+      <w:lvlText w:val=""/>
+      <w:lvlJc w:val="left"/>
+      <w:pPr>
+        <w:tabs>
+          <w:tab w:val="num" w:pos="720"/>
+        </w:tabs>
+        <w:ind w:left="720" w:hanging="360"/>
+      </w:pPr>
+      <w:rPr>
+        <w:rFonts w:ascii="Symbol" w:hAnsi="Symbol" w:hint="default"/>
+        <w:sz w:val="20"/>
+      </w:rPr>
+    </w:lvl>
+    <w:lvl w:ilvl="1" w:tentative="1">
+      <w:start w:val="1"/>
+      <w:numFmt w:val="bullet"/>
+      <w:lvlText w:val="o"/>
+      <w:lvlJc w:val="left"/>
+      <w:pPr>
+        <w:tabs>
+          <w:tab w:val="num" w:pos="1440"/>
+        </w:tabs>
+        <w:ind w:left="1440" w:hanging="360"/>
+      </w:pPr>
+      <w:rPr>
+        <w:rFonts w:ascii="Courier New" w:hAnsi="Courier New" w:hint="default"/>
+        <w:sz w:val="20"/>
+      </w:rPr>
+    </w:lvl>
+    <w:lvl w:ilvl="2" w:tentative="1">
+      <w:start w:val="1"/>
+      <w:numFmt w:val="bullet"/>
+      <w:lvlText w:val=""/>
+      <w:lvlJc w:val="left"/>
+      <w:pPr>
+        <w:tabs>
+          <w:tab w:val="num" w:pos="2160"/>
+        </w:tabs>
+        <w:ind w:left="2160" w:hanging="360"/>
+      </w:pPr>
+      <w:rPr>
+        <w:rFonts w:ascii="Wingdings" w:hAnsi="Wingdings" w:hint="default"/>
+        <w:sz w:val="20"/>
+      </w:rPr>
+    </w:lvl>
+    <w:lvl w:ilvl="3" w:tentative="1">
+      <w:start w:val="1"/>
+      <w:numFmt w:val="bullet"/>
+      <w:lvlText w:val=""/>
+      <w:lvlJc w:val="left"/>
+      <w:pPr>
+        <w:tabs>
+          <w:tab w:val="num" w:pos="2880"/>
+        </w:tabs>
+        <w:ind w:left="2880" w:hanging="360"/>
+      </w:pPr>
+      <w:rPr>
+        <w:rFonts w:ascii="Wingdings" w:hAnsi="Wingdings" w:hint="default"/>
+        <w:sz w:val="20"/>
+      </w:rPr>
+    </w:lvl>
+    <w:lvl w:ilvl="4" w:tentative="1">
+      <w:start w:val="1"/>
+      <w:numFmt w:val="bullet"/>
+      <w:lvlText w:val=""/>
+      <w:lvlJc w:val="left"/>
+      <w:pPr>
+        <w:tabs>
+          <w:tab w:val="num" w:pos="3600"/>
+        </w:tabs>
+        <w:ind w:left="3600" w:hanging="360"/>
+      </w:pPr>
+      <w:rPr>
+        <w:rFonts w:ascii="Wingdings" w:hAnsi="Wingdings" w:hint="default"/>
+        <w:sz w:val="20"/>
+      </w:rPr>
+    </w:lvl>
+    <w:lvl w:ilvl="5" w:tentative="1">
+      <w:start w:val="1"/>
+      <w:numFmt w:val="bullet"/>
+      <w:lvlText w:val=""/>
+      <w:lvlJc w:val="left"/>
+      <w:pPr>
+        <w:tabs>
+          <w:tab w:val="num" w:pos="4320"/>
+        </w:tabs>
+        <w:ind w:left="4320" w:hanging="360"/>
+      </w:pPr>
+      <w:rPr>
+        <w:rFonts w:ascii="Wingdings" w:hAnsi="Wingdings" w:hint="default"/>
+        <w:sz w:val="20"/>
+      </w:rPr>
+    </w:lvl>
+    <w:lvl w:ilvl="6" w:tentative="1">
+      <w:start w:val="1"/>
+      <w:numFmt w:val="bullet"/>
+      <w:lvlText w:val=""/>
+      <w:lvlJc w:val="left"/>
+      <w:pPr>
+        <w:tabs>
+          <w:tab w:val="num" w:pos="5040"/>
+        </w:tabs>
+        <w:ind w:left="5040" w:hanging="360"/>
+      </w:pPr>
+      <w:rPr>
+        <w:rFonts w:ascii="Wingdings" w:hAnsi="Wingdings" w:hint="default"/>
+        <w:sz w:val="20"/>
+      </w:rPr>
+    </w:lvl>
+    <w:lvl w:ilvl="7" w:tentative="1">
+      <w:start w:val="1"/>
+      <w:numFmt w:val="bullet"/>
+      <w:lvlText w:val=""/>
+      <w:lvlJc w:val="left"/>
+      <w:pPr>
+        <w:tabs>
+          <w:tab w:val="num" w:pos="5760"/>
+        </w:tabs>
+        <w:ind w:left="5760" w:hanging="360"/>
+      </w:pPr>
+      <w:rPr>
+        <w:rFonts w:ascii="Wingdings" w:hAnsi="Wingdings" w:hint="default"/>
+        <w:sz w:val="20"/>
+      </w:rPr>
+    </w:lvl>
+    <w:lvl w:ilvl="8" w:tentative="1">
+      <w:start w:val="1"/>
+      <w:numFmt w:val="bullet"/>
+      <w:lvlText w:val=""/>
+      <w:lvlJc w:val="left"/>
+      <w:pPr>
+        <w:tabs>
+          <w:tab w:val="num" w:pos="6480"/>
+        </w:tabs>
+        <w:ind w:left="6480" w:hanging="360"/>
+      </w:pPr>
+      <w:rPr>
+        <w:rFonts w:ascii="Wingdings" w:hAnsi="Wingdings" w:hint="default"/>
+        <w:sz w:val="20"/>
+      </w:rPr>
+    </w:lvl>
+  </w:abstractNum>
+  <w:abstractNum w:abstractNumId="21" w15:restartNumberingAfterBreak="0">
+    <w:nsid w:val="76BF4071"/>
+    <w:multiLevelType w:val="multilevel"/>
+    <w:tmpl w:val="E39C8D06"/>
     <w:lvl w:ilvl="0">
       <w:start w:val="1"/>
       <w:numFmt w:val="decimal"/>
@@ -9470,10 +9555,10 @@
       </w:pPr>
     </w:lvl>
   </w:abstractNum>
-  <w:abstractNum w:abstractNumId="21" w15:restartNumberingAfterBreak="0">
-    <w:nsid w:val="78714F70"/>
+  <w:abstractNum w:abstractNumId="22" w15:restartNumberingAfterBreak="0">
+    <w:nsid w:val="7BB05693"/>
     <w:multiLevelType w:val="multilevel"/>
-    <w:tmpl w:val="730401BC"/>
+    <w:tmpl w:val="1C207E52"/>
     <w:lvl w:ilvl="0">
       <w:start w:val="1"/>
       <w:numFmt w:val="bullet"/>
@@ -9617,133 +9702,16 @@
         <w:rFonts w:ascii="Wingdings" w:hAnsi="Wingdings" w:hint="default"/>
         <w:sz w:val="20"/>
       </w:rPr>
-    </w:lvl>
-  </w:abstractNum>
-  <w:abstractNum w:abstractNumId="22" w15:restartNumberingAfterBreak="0">
-    <w:nsid w:val="7C395A97"/>
-    <w:multiLevelType w:val="multilevel"/>
-    <w:tmpl w:val="4C583BCE"/>
-    <w:lvl w:ilvl="0">
-      <w:start w:val="1"/>
-      <w:numFmt w:val="decimal"/>
-      <w:lvlText w:val="%1."/>
-      <w:lvlJc w:val="left"/>
-      <w:pPr>
-        <w:tabs>
-          <w:tab w:val="num" w:pos="720"/>
-        </w:tabs>
-        <w:ind w:left="720" w:hanging="360"/>
-      </w:pPr>
-    </w:lvl>
-    <w:lvl w:ilvl="1">
-      <w:start w:val="1"/>
-      <w:numFmt w:val="bullet"/>
-      <w:lvlText w:val="o"/>
-      <w:lvlJc w:val="left"/>
-      <w:pPr>
-        <w:tabs>
-          <w:tab w:val="num" w:pos="1440"/>
-        </w:tabs>
-        <w:ind w:left="1440" w:hanging="360"/>
-      </w:pPr>
-      <w:rPr>
-        <w:rFonts w:ascii="Courier New" w:hAnsi="Courier New" w:hint="default"/>
-        <w:sz w:val="20"/>
-      </w:rPr>
-    </w:lvl>
-    <w:lvl w:ilvl="2" w:tentative="1">
-      <w:start w:val="1"/>
-      <w:numFmt w:val="decimal"/>
-      <w:lvlText w:val="%3."/>
-      <w:lvlJc w:val="left"/>
-      <w:pPr>
-        <w:tabs>
-          <w:tab w:val="num" w:pos="2160"/>
-        </w:tabs>
-        <w:ind w:left="2160" w:hanging="360"/>
-      </w:pPr>
-    </w:lvl>
-    <w:lvl w:ilvl="3" w:tentative="1">
-      <w:start w:val="1"/>
-      <w:numFmt w:val="decimal"/>
-      <w:lvlText w:val="%4."/>
-      <w:lvlJc w:val="left"/>
-      <w:pPr>
-        <w:tabs>
-          <w:tab w:val="num" w:pos="2880"/>
-        </w:tabs>
-        <w:ind w:left="2880" w:hanging="360"/>
-      </w:pPr>
-    </w:lvl>
-    <w:lvl w:ilvl="4" w:tentative="1">
-      <w:start w:val="1"/>
-      <w:numFmt w:val="decimal"/>
-      <w:lvlText w:val="%5."/>
-      <w:lvlJc w:val="left"/>
-      <w:pPr>
-        <w:tabs>
-          <w:tab w:val="num" w:pos="3600"/>
-        </w:tabs>
-        <w:ind w:left="3600" w:hanging="360"/>
-      </w:pPr>
-    </w:lvl>
-    <w:lvl w:ilvl="5" w:tentative="1">
-      <w:start w:val="1"/>
-      <w:numFmt w:val="decimal"/>
-      <w:lvlText w:val="%6."/>
-      <w:lvlJc w:val="left"/>
-      <w:pPr>
-        <w:tabs>
-          <w:tab w:val="num" w:pos="4320"/>
-        </w:tabs>
-        <w:ind w:left="4320" w:hanging="360"/>
-      </w:pPr>
-    </w:lvl>
-    <w:lvl w:ilvl="6" w:tentative="1">
-      <w:start w:val="1"/>
-      <w:numFmt w:val="decimal"/>
-      <w:lvlText w:val="%7."/>
-      <w:lvlJc w:val="left"/>
-      <w:pPr>
-        <w:tabs>
-          <w:tab w:val="num" w:pos="5040"/>
-        </w:tabs>
-        <w:ind w:left="5040" w:hanging="360"/>
-      </w:pPr>
-    </w:lvl>
-    <w:lvl w:ilvl="7" w:tentative="1">
-      <w:start w:val="1"/>
-      <w:numFmt w:val="decimal"/>
-      <w:lvlText w:val="%8."/>
-      <w:lvlJc w:val="left"/>
-      <w:pPr>
-        <w:tabs>
-          <w:tab w:val="num" w:pos="5760"/>
-        </w:tabs>
-        <w:ind w:left="5760" w:hanging="360"/>
-      </w:pPr>
-    </w:lvl>
-    <w:lvl w:ilvl="8" w:tentative="1">
-      <w:start w:val="1"/>
-      <w:numFmt w:val="decimal"/>
-      <w:lvlText w:val="%9."/>
-      <w:lvlJc w:val="left"/>
-      <w:pPr>
-        <w:tabs>
-          <w:tab w:val="num" w:pos="6480"/>
-        </w:tabs>
-        <w:ind w:left="6480" w:hanging="360"/>
-      </w:pPr>
     </w:lvl>
   </w:abstractNum>
   <w:abstractNum w:abstractNumId="23" w15:restartNumberingAfterBreak="0">
-    <w:nsid w:val="7DFB654D"/>
+    <w:nsid w:val="7DA16ECA"/>
     <w:multiLevelType w:val="multilevel"/>
-    <w:tmpl w:val="F0F80A80"/>
+    <w:tmpl w:val="0FD0118C"/>
     <w:lvl w:ilvl="0">
       <w:start w:val="1"/>
-      <w:numFmt w:val="decimal"/>
-      <w:lvlText w:val="%1."/>
+      <w:numFmt w:val="bullet"/>
+      <w:lvlText w:val=""/>
       <w:lvlJc w:val="left"/>
       <w:pPr>
         <w:tabs>
@@ -9751,8 +9719,12 @@
         </w:tabs>
         <w:ind w:left="720" w:hanging="360"/>
       </w:pPr>
-    </w:lvl>
-    <w:lvl w:ilvl="1">
+      <w:rPr>
+        <w:rFonts w:ascii="Symbol" w:hAnsi="Symbol" w:hint="default"/>
+        <w:sz w:val="20"/>
+      </w:rPr>
+    </w:lvl>
+    <w:lvl w:ilvl="1" w:tentative="1">
       <w:start w:val="1"/>
       <w:numFmt w:val="bullet"/>
       <w:lvlText w:val="o"/>
@@ -9770,8 +9742,8 @@
     </w:lvl>
     <w:lvl w:ilvl="2" w:tentative="1">
       <w:start w:val="1"/>
-      <w:numFmt w:val="decimal"/>
-      <w:lvlText w:val="%3."/>
+      <w:numFmt w:val="bullet"/>
+      <w:lvlText w:val=""/>
       <w:lvlJc w:val="left"/>
       <w:pPr>
         <w:tabs>
@@ -9779,11 +9751,15 @@
         </w:tabs>
         <w:ind w:left="2160" w:hanging="360"/>
       </w:pPr>
+      <w:rPr>
+        <w:rFonts w:ascii="Wingdings" w:hAnsi="Wingdings" w:hint="default"/>
+        <w:sz w:val="20"/>
+      </w:rPr>
     </w:lvl>
     <w:lvl w:ilvl="3" w:tentative="1">
       <w:start w:val="1"/>
-      <w:numFmt w:val="decimal"/>
-      <w:lvlText w:val="%4."/>
+      <w:numFmt w:val="bullet"/>
+      <w:lvlText w:val=""/>
       <w:lvlJc w:val="left"/>
       <w:pPr>
         <w:tabs>
@@ -9791,11 +9767,15 @@
         </w:tabs>
         <w:ind w:left="2880" w:hanging="360"/>
       </w:pPr>
+      <w:rPr>
+        <w:rFonts w:ascii="Wingdings" w:hAnsi="Wingdings" w:hint="default"/>
+        <w:sz w:val="20"/>
+      </w:rPr>
     </w:lvl>
     <w:lvl w:ilvl="4" w:tentative="1">
       <w:start w:val="1"/>
-      <w:numFmt w:val="decimal"/>
-      <w:lvlText w:val="%5."/>
+      <w:numFmt w:val="bullet"/>
+      <w:lvlText w:val=""/>
       <w:lvlJc w:val="left"/>
       <w:pPr>
         <w:tabs>
@@ -9803,11 +9783,15 @@
         </w:tabs>
         <w:ind w:left="3600" w:hanging="360"/>
       </w:pPr>
+      <w:rPr>
+        <w:rFonts w:ascii="Wingdings" w:hAnsi="Wingdings" w:hint="default"/>
+        <w:sz w:val="20"/>
+      </w:rPr>
     </w:lvl>
     <w:lvl w:ilvl="5" w:tentative="1">
       <w:start w:val="1"/>
-      <w:numFmt w:val="decimal"/>
-      <w:lvlText w:val="%6."/>
+      <w:numFmt w:val="bullet"/>
+      <w:lvlText w:val=""/>
       <w:lvlJc w:val="left"/>
       <w:pPr>
         <w:tabs>
@@ -9815,11 +9799,15 @@
         </w:tabs>
         <w:ind w:left="4320" w:hanging="360"/>
       </w:pPr>
+      <w:rPr>
+        <w:rFonts w:ascii="Wingdings" w:hAnsi="Wingdings" w:hint="default"/>
+        <w:sz w:val="20"/>
+      </w:rPr>
     </w:lvl>
     <w:lvl w:ilvl="6" w:tentative="1">
       <w:start w:val="1"/>
-      <w:numFmt w:val="decimal"/>
-      <w:lvlText w:val="%7."/>
+      <w:numFmt w:val="bullet"/>
+      <w:lvlText w:val=""/>
       <w:lvlJc w:val="left"/>
       <w:pPr>
         <w:tabs>
@@ -9827,11 +9815,15 @@
         </w:tabs>
         <w:ind w:left="5040" w:hanging="360"/>
       </w:pPr>
+      <w:rPr>
+        <w:rFonts w:ascii="Wingdings" w:hAnsi="Wingdings" w:hint="default"/>
+        <w:sz w:val="20"/>
+      </w:rPr>
     </w:lvl>
     <w:lvl w:ilvl="7" w:tentative="1">
       <w:start w:val="1"/>
-      <w:numFmt w:val="decimal"/>
-      <w:lvlText w:val="%8."/>
+      <w:numFmt w:val="bullet"/>
+      <w:lvlText w:val=""/>
       <w:lvlJc w:val="left"/>
       <w:pPr>
         <w:tabs>
@@ -9839,11 +9831,15 @@
         </w:tabs>
         <w:ind w:left="5760" w:hanging="360"/>
       </w:pPr>
+      <w:rPr>
+        <w:rFonts w:ascii="Wingdings" w:hAnsi="Wingdings" w:hint="default"/>
+        <w:sz w:val="20"/>
+      </w:rPr>
     </w:lvl>
     <w:lvl w:ilvl="8" w:tentative="1">
       <w:start w:val="1"/>
-      <w:numFmt w:val="decimal"/>
-      <w:lvlText w:val="%9."/>
+      <w:numFmt w:val="bullet"/>
+      <w:lvlText w:val=""/>
       <w:lvlJc w:val="left"/>
       <w:pPr>
         <w:tabs>
@@ -9851,79 +9847,83 @@
         </w:tabs>
         <w:ind w:left="6480" w:hanging="360"/>
       </w:pPr>
+      <w:rPr>
+        <w:rFonts w:ascii="Wingdings" w:hAnsi="Wingdings" w:hint="default"/>
+        <w:sz w:val="20"/>
+      </w:rPr>
     </w:lvl>
   </w:abstractNum>
-  <w:num w:numId="1" w16cid:durableId="1776554960">
+  <w:num w:numId="1" w16cid:durableId="930314535">
+    <w:abstractNumId w:val="9"/>
+  </w:num>
+  <w:num w:numId="2" w16cid:durableId="1039284445">
+    <w:abstractNumId w:val="6"/>
+  </w:num>
+  <w:num w:numId="3" w16cid:durableId="1997175895">
+    <w:abstractNumId w:val="12"/>
+  </w:num>
+  <w:num w:numId="4" w16cid:durableId="958536966">
+    <w:abstractNumId w:val="22"/>
+  </w:num>
+  <w:num w:numId="5" w16cid:durableId="1053819225">
+    <w:abstractNumId w:val="11"/>
+  </w:num>
+  <w:num w:numId="6" w16cid:durableId="318966070">
+    <w:abstractNumId w:val="20"/>
+  </w:num>
+  <w:num w:numId="7" w16cid:durableId="342706140">
+    <w:abstractNumId w:val="7"/>
+  </w:num>
+  <w:num w:numId="8" w16cid:durableId="601690247">
+    <w:abstractNumId w:val="5"/>
+  </w:num>
+  <w:num w:numId="9" w16cid:durableId="1580559029">
+    <w:abstractNumId w:val="15"/>
+  </w:num>
+  <w:num w:numId="10" w16cid:durableId="1379088044">
+    <w:abstractNumId w:val="19"/>
+  </w:num>
+  <w:num w:numId="11" w16cid:durableId="602224977">
+    <w:abstractNumId w:val="8"/>
+  </w:num>
+  <w:num w:numId="12" w16cid:durableId="1983655071">
     <w:abstractNumId w:val="2"/>
   </w:num>
-  <w:num w:numId="2" w16cid:durableId="2053310182">
+  <w:num w:numId="13" w16cid:durableId="1630211344">
+    <w:abstractNumId w:val="3"/>
+  </w:num>
+  <w:num w:numId="14" w16cid:durableId="816534433">
+    <w:abstractNumId w:val="13"/>
+  </w:num>
+  <w:num w:numId="15" w16cid:durableId="2147114760">
+    <w:abstractNumId w:val="0"/>
+  </w:num>
+  <w:num w:numId="16" w16cid:durableId="1118253228">
+    <w:abstractNumId w:val="23"/>
+  </w:num>
+  <w:num w:numId="17" w16cid:durableId="458106298">
+    <w:abstractNumId w:val="17"/>
+  </w:num>
+  <w:num w:numId="18" w16cid:durableId="993609435">
+    <w:abstractNumId w:val="1"/>
+  </w:num>
+  <w:num w:numId="19" w16cid:durableId="1574504186">
+    <w:abstractNumId w:val="4"/>
+  </w:num>
+  <w:num w:numId="20" w16cid:durableId="351538776">
+    <w:abstractNumId w:val="14"/>
+  </w:num>
+  <w:num w:numId="21" w16cid:durableId="864295347">
+    <w:abstractNumId w:val="18"/>
+  </w:num>
+  <w:num w:numId="22" w16cid:durableId="1393623739">
     <w:abstractNumId w:val="10"/>
   </w:num>
-  <w:num w:numId="3" w16cid:durableId="2079671549">
-    <w:abstractNumId w:val="13"/>
-  </w:num>
-  <w:num w:numId="4" w16cid:durableId="1302423933">
+  <w:num w:numId="23" w16cid:durableId="1415275609">
     <w:abstractNumId w:val="16"/>
   </w:num>
-  <w:num w:numId="5" w16cid:durableId="449596226">
-    <w:abstractNumId w:val="6"/>
-  </w:num>
-  <w:num w:numId="6" w16cid:durableId="578684393">
-    <w:abstractNumId w:val="18"/>
-  </w:num>
-  <w:num w:numId="7" w16cid:durableId="39282450">
-    <w:abstractNumId w:val="15"/>
-  </w:num>
-  <w:num w:numId="8" w16cid:durableId="1796218453">
-    <w:abstractNumId w:val="17"/>
-  </w:num>
-  <w:num w:numId="9" w16cid:durableId="399644372">
-    <w:abstractNumId w:val="12"/>
-  </w:num>
-  <w:num w:numId="10" w16cid:durableId="1800146558">
-    <w:abstractNumId w:val="22"/>
-  </w:num>
-  <w:num w:numId="11" w16cid:durableId="448015823">
-    <w:abstractNumId w:val="4"/>
-  </w:num>
-  <w:num w:numId="12" w16cid:durableId="1563367630">
-    <w:abstractNumId w:val="5"/>
-  </w:num>
-  <w:num w:numId="13" w16cid:durableId="1041511430">
-    <w:abstractNumId w:val="14"/>
-  </w:num>
-  <w:num w:numId="14" w16cid:durableId="725950786">
-    <w:abstractNumId w:val="3"/>
-  </w:num>
-  <w:num w:numId="15" w16cid:durableId="235824810">
-    <w:abstractNumId w:val="7"/>
-  </w:num>
-  <w:num w:numId="16" w16cid:durableId="991788780">
-    <w:abstractNumId w:val="11"/>
-  </w:num>
-  <w:num w:numId="17" w16cid:durableId="461316084">
-    <w:abstractNumId w:val="23"/>
-  </w:num>
-  <w:num w:numId="18" w16cid:durableId="1730181771">
-    <w:abstractNumId w:val="1"/>
-  </w:num>
-  <w:num w:numId="19" w16cid:durableId="217208176">
-    <w:abstractNumId w:val="20"/>
-  </w:num>
-  <w:num w:numId="20" w16cid:durableId="1848133352">
-    <w:abstractNumId w:val="19"/>
-  </w:num>
-  <w:num w:numId="21" w16cid:durableId="1171529005">
-    <w:abstractNumId w:val="0"/>
-  </w:num>
-  <w:num w:numId="22" w16cid:durableId="16318728">
+  <w:num w:numId="24" w16cid:durableId="1348555299">
     <w:abstractNumId w:val="21"/>
-  </w:num>
-  <w:num w:numId="23" w16cid:durableId="1775901175">
-    <w:abstractNumId w:val="8"/>
-  </w:num>
-  <w:num w:numId="24" w16cid:durableId="1051809830">
-    <w:abstractNumId w:val="9"/>
   </w:num>
 </w:numbering>
 </file>

</xml_diff>

<commit_message>
deck, follow-along: Engage slide as four cards
</commit_message>
<xml_diff>
--- a/follow-along/Azure_Local_Follow_Along_Guide.docx
+++ b/follow-along/Azure_Local_Follow_Along_Guide.docx
@@ -6566,9 +6566,9 @@
 <file path=word/numbering.xml><?xml version="1.0" encoding="utf-8"?>
 <w:numbering xmlns:wpc="http://schemas.microsoft.com/office/word/2010/wordprocessingCanvas" xmlns:cx="http://schemas.microsoft.com/office/drawing/2014/chartex" xmlns:cx1="http://schemas.microsoft.com/office/drawing/2015/9/8/chartex" xmlns:cx2="http://schemas.microsoft.com/office/drawing/2015/10/21/chartex" xmlns:cx3="http://schemas.microsoft.com/office/drawing/2016/5/9/chartex" xmlns:cx4="http://schemas.microsoft.com/office/drawing/2016/5/10/chartex" xmlns:cx5="http://schemas.microsoft.com/office/drawing/2016/5/11/chartex" xmlns:cx6="http://schemas.microsoft.com/office/drawing/2016/5/12/chartex" xmlns:cx7="http://schemas.microsoft.com/office/drawing/2016/5/13/chartex" xmlns:cx8="http://schemas.microsoft.com/office/drawing/2016/5/14/chartex" xmlns:mc="http://schemas.openxmlformats.org/markup-compatibility/2006" xmlns:aink="http://schemas.microsoft.com/office/drawing/2016/ink" xmlns:am3d="http://schemas.microsoft.com/office/drawing/2017/model3d" xmlns:o="urn:schemas-microsoft-com:office:office" xmlns:oel="http://schemas.microsoft.com/office/2019/extlst" xmlns:r="http://schemas.openxmlformats.org/officeDocument/2006/relationships" xmlns:m="http://schemas.openxmlformats.org/officeDocument/2006/math" xmlns:v="urn:schemas-microsoft-com:vml" xmlns:wp14="http://schemas.microsoft.com/office/word/2010/wordprocessingDrawing" xmlns:wp="http://schemas.openxmlformats.org/drawingml/2006/wordprocessingDrawing" xmlns:w10="urn:schemas-microsoft-com:office:word" xmlns:w="http://schemas.openxmlformats.org/wordprocessingml/2006/main" xmlns:w14="http://schemas.microsoft.com/office/word/2010/wordml" xmlns:w15="http://schemas.microsoft.com/office/word/2012/wordml" xmlns:w16cex="http://schemas.microsoft.com/office/word/2018/wordml/cex" xmlns:w16cid="http://schemas.microsoft.com/office/word/2016/wordml/cid" xmlns:w16="http://schemas.microsoft.com/office/word/2018/wordml" xmlns:w16du="http://schemas.microsoft.com/office/word/2023/wordml/word16du" xmlns:w16sdtdh="http://schemas.microsoft.com/office/word/2020/wordml/sdtdatahash" xmlns:w16sdtfl="http://schemas.microsoft.com/office/word/2024/wordml/sdtformatlock" xmlns:w16se="http://schemas.microsoft.com/office/word/2015/wordml/symex" xmlns:wpg="http://schemas.microsoft.com/office/word/2010/wordprocessingGroup" xmlns:wpi="http://schemas.microsoft.com/office/word/2010/wordprocessingInk" xmlns:wne="http://schemas.microsoft.com/office/word/2006/wordml" xmlns:wps="http://schemas.microsoft.com/office/word/2010/wordprocessingShape" mc:Ignorable="w14 w15 w16se w16cid w16 w16cex w16sdtdh w16sdtfl w16du wp14">
   <w:abstractNum w:abstractNumId="0" w15:restartNumberingAfterBreak="0">
-    <w:nsid w:val="0284235C"/>
+    <w:nsid w:val="00394865"/>
     <w:multiLevelType w:val="multilevel"/>
-    <w:tmpl w:val="6360F33C"/>
+    <w:tmpl w:val="0528423C"/>
     <w:lvl w:ilvl="0">
       <w:start w:val="1"/>
       <w:numFmt w:val="bullet"/>
@@ -6715,9 +6715,158 @@
     </w:lvl>
   </w:abstractNum>
   <w:abstractNum w:abstractNumId="1" w15:restartNumberingAfterBreak="0">
-    <w:nsid w:val="0CD27FD2"/>
+    <w:nsid w:val="051D5FE9"/>
     <w:multiLevelType w:val="multilevel"/>
-    <w:tmpl w:val="EA44D726"/>
+    <w:tmpl w:val="4D60B2AC"/>
+    <w:lvl w:ilvl="0">
+      <w:start w:val="1"/>
+      <w:numFmt w:val="bullet"/>
+      <w:lvlText w:val=""/>
+      <w:lvlJc w:val="left"/>
+      <w:pPr>
+        <w:tabs>
+          <w:tab w:val="num" w:pos="720"/>
+        </w:tabs>
+        <w:ind w:left="720" w:hanging="360"/>
+      </w:pPr>
+      <w:rPr>
+        <w:rFonts w:ascii="Symbol" w:hAnsi="Symbol" w:hint="default"/>
+        <w:sz w:val="20"/>
+      </w:rPr>
+    </w:lvl>
+    <w:lvl w:ilvl="1" w:tentative="1">
+      <w:start w:val="1"/>
+      <w:numFmt w:val="bullet"/>
+      <w:lvlText w:val="o"/>
+      <w:lvlJc w:val="left"/>
+      <w:pPr>
+        <w:tabs>
+          <w:tab w:val="num" w:pos="1440"/>
+        </w:tabs>
+        <w:ind w:left="1440" w:hanging="360"/>
+      </w:pPr>
+      <w:rPr>
+        <w:rFonts w:ascii="Courier New" w:hAnsi="Courier New" w:hint="default"/>
+        <w:sz w:val="20"/>
+      </w:rPr>
+    </w:lvl>
+    <w:lvl w:ilvl="2" w:tentative="1">
+      <w:start w:val="1"/>
+      <w:numFmt w:val="bullet"/>
+      <w:lvlText w:val=""/>
+      <w:lvlJc w:val="left"/>
+      <w:pPr>
+        <w:tabs>
+          <w:tab w:val="num" w:pos="2160"/>
+        </w:tabs>
+        <w:ind w:left="2160" w:hanging="360"/>
+      </w:pPr>
+      <w:rPr>
+        <w:rFonts w:ascii="Wingdings" w:hAnsi="Wingdings" w:hint="default"/>
+        <w:sz w:val="20"/>
+      </w:rPr>
+    </w:lvl>
+    <w:lvl w:ilvl="3" w:tentative="1">
+      <w:start w:val="1"/>
+      <w:numFmt w:val="bullet"/>
+      <w:lvlText w:val=""/>
+      <w:lvlJc w:val="left"/>
+      <w:pPr>
+        <w:tabs>
+          <w:tab w:val="num" w:pos="2880"/>
+        </w:tabs>
+        <w:ind w:left="2880" w:hanging="360"/>
+      </w:pPr>
+      <w:rPr>
+        <w:rFonts w:ascii="Wingdings" w:hAnsi="Wingdings" w:hint="default"/>
+        <w:sz w:val="20"/>
+      </w:rPr>
+    </w:lvl>
+    <w:lvl w:ilvl="4" w:tentative="1">
+      <w:start w:val="1"/>
+      <w:numFmt w:val="bullet"/>
+      <w:lvlText w:val=""/>
+      <w:lvlJc w:val="left"/>
+      <w:pPr>
+        <w:tabs>
+          <w:tab w:val="num" w:pos="3600"/>
+        </w:tabs>
+        <w:ind w:left="3600" w:hanging="360"/>
+      </w:pPr>
+      <w:rPr>
+        <w:rFonts w:ascii="Wingdings" w:hAnsi="Wingdings" w:hint="default"/>
+        <w:sz w:val="20"/>
+      </w:rPr>
+    </w:lvl>
+    <w:lvl w:ilvl="5" w:tentative="1">
+      <w:start w:val="1"/>
+      <w:numFmt w:val="bullet"/>
+      <w:lvlText w:val=""/>
+      <w:lvlJc w:val="left"/>
+      <w:pPr>
+        <w:tabs>
+          <w:tab w:val="num" w:pos="4320"/>
+        </w:tabs>
+        <w:ind w:left="4320" w:hanging="360"/>
+      </w:pPr>
+      <w:rPr>
+        <w:rFonts w:ascii="Wingdings" w:hAnsi="Wingdings" w:hint="default"/>
+        <w:sz w:val="20"/>
+      </w:rPr>
+    </w:lvl>
+    <w:lvl w:ilvl="6" w:tentative="1">
+      <w:start w:val="1"/>
+      <w:numFmt w:val="bullet"/>
+      <w:lvlText w:val=""/>
+      <w:lvlJc w:val="left"/>
+      <w:pPr>
+        <w:tabs>
+          <w:tab w:val="num" w:pos="5040"/>
+        </w:tabs>
+        <w:ind w:left="5040" w:hanging="360"/>
+      </w:pPr>
+      <w:rPr>
+        <w:rFonts w:ascii="Wingdings" w:hAnsi="Wingdings" w:hint="default"/>
+        <w:sz w:val="20"/>
+      </w:rPr>
+    </w:lvl>
+    <w:lvl w:ilvl="7" w:tentative="1">
+      <w:start w:val="1"/>
+      <w:numFmt w:val="bullet"/>
+      <w:lvlText w:val=""/>
+      <w:lvlJc w:val="left"/>
+      <w:pPr>
+        <w:tabs>
+          <w:tab w:val="num" w:pos="5760"/>
+        </w:tabs>
+        <w:ind w:left="5760" w:hanging="360"/>
+      </w:pPr>
+      <w:rPr>
+        <w:rFonts w:ascii="Wingdings" w:hAnsi="Wingdings" w:hint="default"/>
+        <w:sz w:val="20"/>
+      </w:rPr>
+    </w:lvl>
+    <w:lvl w:ilvl="8" w:tentative="1">
+      <w:start w:val="1"/>
+      <w:numFmt w:val="bullet"/>
+      <w:lvlText w:val=""/>
+      <w:lvlJc w:val="left"/>
+      <w:pPr>
+        <w:tabs>
+          <w:tab w:val="num" w:pos="6480"/>
+        </w:tabs>
+        <w:ind w:left="6480" w:hanging="360"/>
+      </w:pPr>
+      <w:rPr>
+        <w:rFonts w:ascii="Wingdings" w:hAnsi="Wingdings" w:hint="default"/>
+        <w:sz w:val="20"/>
+      </w:rPr>
+    </w:lvl>
+  </w:abstractNum>
+  <w:abstractNum w:abstractNumId="2" w15:restartNumberingAfterBreak="0">
+    <w:nsid w:val="106D4B50"/>
+    <w:multiLevelType w:val="multilevel"/>
+    <w:tmpl w:val="F95A8448"/>
     <w:lvl w:ilvl="0">
       <w:start w:val="1"/>
       <w:numFmt w:val="decimal"/>
@@ -6831,14 +6980,14 @@
       </w:pPr>
     </w:lvl>
   </w:abstractNum>
-  <w:abstractNum w:abstractNumId="2" w15:restartNumberingAfterBreak="0">
-    <w:nsid w:val="0D50635E"/>
+  <w:abstractNum w:abstractNumId="3" w15:restartNumberingAfterBreak="0">
+    <w:nsid w:val="136C4DEB"/>
     <w:multiLevelType w:val="multilevel"/>
-    <w:tmpl w:val="8E6C4950"/>
+    <w:tmpl w:val="EA94CA3E"/>
     <w:lvl w:ilvl="0">
       <w:start w:val="1"/>
-      <w:numFmt w:val="bullet"/>
-      <w:lvlText w:val=""/>
+      <w:numFmt w:val="decimal"/>
+      <w:lvlText w:val="%1."/>
       <w:lvlJc w:val="left"/>
       <w:pPr>
         <w:tabs>
@@ -6846,12 +6995,8 @@
         </w:tabs>
         <w:ind w:left="720" w:hanging="360"/>
       </w:pPr>
-      <w:rPr>
-        <w:rFonts w:ascii="Symbol" w:hAnsi="Symbol" w:hint="default"/>
-        <w:sz w:val="20"/>
-      </w:rPr>
-    </w:lvl>
-    <w:lvl w:ilvl="1" w:tentative="1">
+    </w:lvl>
+    <w:lvl w:ilvl="1">
       <w:start w:val="1"/>
       <w:numFmt w:val="bullet"/>
       <w:lvlText w:val="o"/>
@@ -6869,8 +7014,8 @@
     </w:lvl>
     <w:lvl w:ilvl="2" w:tentative="1">
       <w:start w:val="1"/>
-      <w:numFmt w:val="bullet"/>
-      <w:lvlText w:val=""/>
+      <w:numFmt w:val="decimal"/>
+      <w:lvlText w:val="%3."/>
       <w:lvlJc w:val="left"/>
       <w:pPr>
         <w:tabs>
@@ -6878,15 +7023,11 @@
         </w:tabs>
         <w:ind w:left="2160" w:hanging="360"/>
       </w:pPr>
-      <w:rPr>
-        <w:rFonts w:ascii="Wingdings" w:hAnsi="Wingdings" w:hint="default"/>
-        <w:sz w:val="20"/>
-      </w:rPr>
     </w:lvl>
     <w:lvl w:ilvl="3" w:tentative="1">
       <w:start w:val="1"/>
-      <w:numFmt w:val="bullet"/>
-      <w:lvlText w:val=""/>
+      <w:numFmt w:val="decimal"/>
+      <w:lvlText w:val="%4."/>
       <w:lvlJc w:val="left"/>
       <w:pPr>
         <w:tabs>
@@ -6894,15 +7035,11 @@
         </w:tabs>
         <w:ind w:left="2880" w:hanging="360"/>
       </w:pPr>
-      <w:rPr>
-        <w:rFonts w:ascii="Wingdings" w:hAnsi="Wingdings" w:hint="default"/>
-        <w:sz w:val="20"/>
-      </w:rPr>
     </w:lvl>
     <w:lvl w:ilvl="4" w:tentative="1">
       <w:start w:val="1"/>
-      <w:numFmt w:val="bullet"/>
-      <w:lvlText w:val=""/>
+      <w:numFmt w:val="decimal"/>
+      <w:lvlText w:val="%5."/>
       <w:lvlJc w:val="left"/>
       <w:pPr>
         <w:tabs>
@@ -6910,15 +7047,11 @@
         </w:tabs>
         <w:ind w:left="3600" w:hanging="360"/>
       </w:pPr>
-      <w:rPr>
-        <w:rFonts w:ascii="Wingdings" w:hAnsi="Wingdings" w:hint="default"/>
-        <w:sz w:val="20"/>
-      </w:rPr>
     </w:lvl>
     <w:lvl w:ilvl="5" w:tentative="1">
       <w:start w:val="1"/>
-      <w:numFmt w:val="bullet"/>
-      <w:lvlText w:val=""/>
+      <w:numFmt w:val="decimal"/>
+      <w:lvlText w:val="%6."/>
       <w:lvlJc w:val="left"/>
       <w:pPr>
         <w:tabs>
@@ -6926,15 +7059,11 @@
         </w:tabs>
         <w:ind w:left="4320" w:hanging="360"/>
       </w:pPr>
-      <w:rPr>
-        <w:rFonts w:ascii="Wingdings" w:hAnsi="Wingdings" w:hint="default"/>
-        <w:sz w:val="20"/>
-      </w:rPr>
     </w:lvl>
     <w:lvl w:ilvl="6" w:tentative="1">
       <w:start w:val="1"/>
-      <w:numFmt w:val="bullet"/>
-      <w:lvlText w:val=""/>
+      <w:numFmt w:val="decimal"/>
+      <w:lvlText w:val="%7."/>
       <w:lvlJc w:val="left"/>
       <w:pPr>
         <w:tabs>
@@ -6942,15 +7071,11 @@
         </w:tabs>
         <w:ind w:left="5040" w:hanging="360"/>
       </w:pPr>
-      <w:rPr>
-        <w:rFonts w:ascii="Wingdings" w:hAnsi="Wingdings" w:hint="default"/>
-        <w:sz w:val="20"/>
-      </w:rPr>
     </w:lvl>
     <w:lvl w:ilvl="7" w:tentative="1">
       <w:start w:val="1"/>
-      <w:numFmt w:val="bullet"/>
-      <w:lvlText w:val=""/>
+      <w:numFmt w:val="decimal"/>
+      <w:lvlText w:val="%8."/>
       <w:lvlJc w:val="left"/>
       <w:pPr>
         <w:tabs>
@@ -6958,15 +7083,11 @@
         </w:tabs>
         <w:ind w:left="5760" w:hanging="360"/>
       </w:pPr>
-      <w:rPr>
-        <w:rFonts w:ascii="Wingdings" w:hAnsi="Wingdings" w:hint="default"/>
-        <w:sz w:val="20"/>
-      </w:rPr>
     </w:lvl>
     <w:lvl w:ilvl="8" w:tentative="1">
       <w:start w:val="1"/>
-      <w:numFmt w:val="bullet"/>
-      <w:lvlText w:val=""/>
+      <w:numFmt w:val="decimal"/>
+      <w:lvlText w:val="%9."/>
       <w:lvlJc w:val="left"/>
       <w:pPr>
         <w:tabs>
@@ -6974,165 +7095,12 @@
         </w:tabs>
         <w:ind w:left="6480" w:hanging="360"/>
       </w:pPr>
-      <w:rPr>
-        <w:rFonts w:ascii="Wingdings" w:hAnsi="Wingdings" w:hint="default"/>
-        <w:sz w:val="20"/>
-      </w:rPr>
-    </w:lvl>
-  </w:abstractNum>
-  <w:abstractNum w:abstractNumId="3" w15:restartNumberingAfterBreak="0">
-    <w:nsid w:val="0D8563EB"/>
-    <w:multiLevelType w:val="multilevel"/>
-    <w:tmpl w:val="10447772"/>
-    <w:lvl w:ilvl="0">
-      <w:start w:val="1"/>
-      <w:numFmt w:val="bullet"/>
-      <w:lvlText w:val=""/>
-      <w:lvlJc w:val="left"/>
-      <w:pPr>
-        <w:tabs>
-          <w:tab w:val="num" w:pos="720"/>
-        </w:tabs>
-        <w:ind w:left="720" w:hanging="360"/>
-      </w:pPr>
-      <w:rPr>
-        <w:rFonts w:ascii="Symbol" w:hAnsi="Symbol" w:hint="default"/>
-        <w:sz w:val="20"/>
-      </w:rPr>
-    </w:lvl>
-    <w:lvl w:ilvl="1" w:tentative="1">
-      <w:start w:val="1"/>
-      <w:numFmt w:val="bullet"/>
-      <w:lvlText w:val="o"/>
-      <w:lvlJc w:val="left"/>
-      <w:pPr>
-        <w:tabs>
-          <w:tab w:val="num" w:pos="1440"/>
-        </w:tabs>
-        <w:ind w:left="1440" w:hanging="360"/>
-      </w:pPr>
-      <w:rPr>
-        <w:rFonts w:ascii="Courier New" w:hAnsi="Courier New" w:hint="default"/>
-        <w:sz w:val="20"/>
-      </w:rPr>
-    </w:lvl>
-    <w:lvl w:ilvl="2" w:tentative="1">
-      <w:start w:val="1"/>
-      <w:numFmt w:val="bullet"/>
-      <w:lvlText w:val=""/>
-      <w:lvlJc w:val="left"/>
-      <w:pPr>
-        <w:tabs>
-          <w:tab w:val="num" w:pos="2160"/>
-        </w:tabs>
-        <w:ind w:left="2160" w:hanging="360"/>
-      </w:pPr>
-      <w:rPr>
-        <w:rFonts w:ascii="Wingdings" w:hAnsi="Wingdings" w:hint="default"/>
-        <w:sz w:val="20"/>
-      </w:rPr>
-    </w:lvl>
-    <w:lvl w:ilvl="3" w:tentative="1">
-      <w:start w:val="1"/>
-      <w:numFmt w:val="bullet"/>
-      <w:lvlText w:val=""/>
-      <w:lvlJc w:val="left"/>
-      <w:pPr>
-        <w:tabs>
-          <w:tab w:val="num" w:pos="2880"/>
-        </w:tabs>
-        <w:ind w:left="2880" w:hanging="360"/>
-      </w:pPr>
-      <w:rPr>
-        <w:rFonts w:ascii="Wingdings" w:hAnsi="Wingdings" w:hint="default"/>
-        <w:sz w:val="20"/>
-      </w:rPr>
-    </w:lvl>
-    <w:lvl w:ilvl="4" w:tentative="1">
-      <w:start w:val="1"/>
-      <w:numFmt w:val="bullet"/>
-      <w:lvlText w:val=""/>
-      <w:lvlJc w:val="left"/>
-      <w:pPr>
-        <w:tabs>
-          <w:tab w:val="num" w:pos="3600"/>
-        </w:tabs>
-        <w:ind w:left="3600" w:hanging="360"/>
-      </w:pPr>
-      <w:rPr>
-        <w:rFonts w:ascii="Wingdings" w:hAnsi="Wingdings" w:hint="default"/>
-        <w:sz w:val="20"/>
-      </w:rPr>
-    </w:lvl>
-    <w:lvl w:ilvl="5" w:tentative="1">
-      <w:start w:val="1"/>
-      <w:numFmt w:val="bullet"/>
-      <w:lvlText w:val=""/>
-      <w:lvlJc w:val="left"/>
-      <w:pPr>
-        <w:tabs>
-          <w:tab w:val="num" w:pos="4320"/>
-        </w:tabs>
-        <w:ind w:left="4320" w:hanging="360"/>
-      </w:pPr>
-      <w:rPr>
-        <w:rFonts w:ascii="Wingdings" w:hAnsi="Wingdings" w:hint="default"/>
-        <w:sz w:val="20"/>
-      </w:rPr>
-    </w:lvl>
-    <w:lvl w:ilvl="6" w:tentative="1">
-      <w:start w:val="1"/>
-      <w:numFmt w:val="bullet"/>
-      <w:lvlText w:val=""/>
-      <w:lvlJc w:val="left"/>
-      <w:pPr>
-        <w:tabs>
-          <w:tab w:val="num" w:pos="5040"/>
-        </w:tabs>
-        <w:ind w:left="5040" w:hanging="360"/>
-      </w:pPr>
-      <w:rPr>
-        <w:rFonts w:ascii="Wingdings" w:hAnsi="Wingdings" w:hint="default"/>
-        <w:sz w:val="20"/>
-      </w:rPr>
-    </w:lvl>
-    <w:lvl w:ilvl="7" w:tentative="1">
-      <w:start w:val="1"/>
-      <w:numFmt w:val="bullet"/>
-      <w:lvlText w:val=""/>
-      <w:lvlJc w:val="left"/>
-      <w:pPr>
-        <w:tabs>
-          <w:tab w:val="num" w:pos="5760"/>
-        </w:tabs>
-        <w:ind w:left="5760" w:hanging="360"/>
-      </w:pPr>
-      <w:rPr>
-        <w:rFonts w:ascii="Wingdings" w:hAnsi="Wingdings" w:hint="default"/>
-        <w:sz w:val="20"/>
-      </w:rPr>
-    </w:lvl>
-    <w:lvl w:ilvl="8" w:tentative="1">
-      <w:start w:val="1"/>
-      <w:numFmt w:val="bullet"/>
-      <w:lvlText w:val=""/>
-      <w:lvlJc w:val="left"/>
-      <w:pPr>
-        <w:tabs>
-          <w:tab w:val="num" w:pos="6480"/>
-        </w:tabs>
-        <w:ind w:left="6480" w:hanging="360"/>
-      </w:pPr>
-      <w:rPr>
-        <w:rFonts w:ascii="Wingdings" w:hAnsi="Wingdings" w:hint="default"/>
-        <w:sz w:val="20"/>
-      </w:rPr>
     </w:lvl>
   </w:abstractNum>
   <w:abstractNum w:abstractNumId="4" w15:restartNumberingAfterBreak="0">
-    <w:nsid w:val="0EF20CAE"/>
+    <w:nsid w:val="1C082155"/>
     <w:multiLevelType w:val="multilevel"/>
-    <w:tmpl w:val="3D9C199C"/>
+    <w:tmpl w:val="CF2E9034"/>
     <w:lvl w:ilvl="0">
       <w:start w:val="1"/>
       <w:numFmt w:val="decimal"/>
@@ -7247,13 +7215,13 @@
     </w:lvl>
   </w:abstractNum>
   <w:abstractNum w:abstractNumId="5" w15:restartNumberingAfterBreak="0">
-    <w:nsid w:val="10860ED3"/>
+    <w:nsid w:val="1CC85E94"/>
     <w:multiLevelType w:val="multilevel"/>
-    <w:tmpl w:val="E88A76C8"/>
+    <w:tmpl w:val="5A9A3FFC"/>
     <w:lvl w:ilvl="0">
       <w:start w:val="1"/>
-      <w:numFmt w:val="bullet"/>
-      <w:lvlText w:val=""/>
+      <w:numFmt w:val="decimal"/>
+      <w:lvlText w:val="%1."/>
       <w:lvlJc w:val="left"/>
       <w:pPr>
         <w:tabs>
@@ -7261,12 +7229,8 @@
         </w:tabs>
         <w:ind w:left="720" w:hanging="360"/>
       </w:pPr>
-      <w:rPr>
-        <w:rFonts w:ascii="Symbol" w:hAnsi="Symbol" w:hint="default"/>
-        <w:sz w:val="20"/>
-      </w:rPr>
-    </w:lvl>
-    <w:lvl w:ilvl="1" w:tentative="1">
+    </w:lvl>
+    <w:lvl w:ilvl="1">
       <w:start w:val="1"/>
       <w:numFmt w:val="bullet"/>
       <w:lvlText w:val="o"/>
@@ -7284,8 +7248,8 @@
     </w:lvl>
     <w:lvl w:ilvl="2" w:tentative="1">
       <w:start w:val="1"/>
-      <w:numFmt w:val="bullet"/>
-      <w:lvlText w:val=""/>
+      <w:numFmt w:val="decimal"/>
+      <w:lvlText w:val="%3."/>
       <w:lvlJc w:val="left"/>
       <w:pPr>
         <w:tabs>
@@ -7293,15 +7257,11 @@
         </w:tabs>
         <w:ind w:left="2160" w:hanging="360"/>
       </w:pPr>
-      <w:rPr>
-        <w:rFonts w:ascii="Wingdings" w:hAnsi="Wingdings" w:hint="default"/>
-        <w:sz w:val="20"/>
-      </w:rPr>
     </w:lvl>
     <w:lvl w:ilvl="3" w:tentative="1">
       <w:start w:val="1"/>
-      <w:numFmt w:val="bullet"/>
-      <w:lvlText w:val=""/>
+      <w:numFmt w:val="decimal"/>
+      <w:lvlText w:val="%4."/>
       <w:lvlJc w:val="left"/>
       <w:pPr>
         <w:tabs>
@@ -7309,15 +7269,11 @@
         </w:tabs>
         <w:ind w:left="2880" w:hanging="360"/>
       </w:pPr>
-      <w:rPr>
-        <w:rFonts w:ascii="Wingdings" w:hAnsi="Wingdings" w:hint="default"/>
-        <w:sz w:val="20"/>
-      </w:rPr>
     </w:lvl>
     <w:lvl w:ilvl="4" w:tentative="1">
       <w:start w:val="1"/>
-      <w:numFmt w:val="bullet"/>
-      <w:lvlText w:val=""/>
+      <w:numFmt w:val="decimal"/>
+      <w:lvlText w:val="%5."/>
       <w:lvlJc w:val="left"/>
       <w:pPr>
         <w:tabs>
@@ -7325,15 +7281,11 @@
         </w:tabs>
         <w:ind w:left="3600" w:hanging="360"/>
       </w:pPr>
-      <w:rPr>
-        <w:rFonts w:ascii="Wingdings" w:hAnsi="Wingdings" w:hint="default"/>
-        <w:sz w:val="20"/>
-      </w:rPr>
     </w:lvl>
     <w:lvl w:ilvl="5" w:tentative="1">
       <w:start w:val="1"/>
-      <w:numFmt w:val="bullet"/>
-      <w:lvlText w:val=""/>
+      <w:numFmt w:val="decimal"/>
+      <w:lvlText w:val="%6."/>
       <w:lvlJc w:val="left"/>
       <w:pPr>
         <w:tabs>
@@ -7341,15 +7293,11 @@
         </w:tabs>
         <w:ind w:left="4320" w:hanging="360"/>
       </w:pPr>
-      <w:rPr>
-        <w:rFonts w:ascii="Wingdings" w:hAnsi="Wingdings" w:hint="default"/>
-        <w:sz w:val="20"/>
-      </w:rPr>
     </w:lvl>
     <w:lvl w:ilvl="6" w:tentative="1">
       <w:start w:val="1"/>
-      <w:numFmt w:val="bullet"/>
-      <w:lvlText w:val=""/>
+      <w:numFmt w:val="decimal"/>
+      <w:lvlText w:val="%7."/>
       <w:lvlJc w:val="left"/>
       <w:pPr>
         <w:tabs>
@@ -7357,15 +7305,11 @@
         </w:tabs>
         <w:ind w:left="5040" w:hanging="360"/>
       </w:pPr>
-      <w:rPr>
-        <w:rFonts w:ascii="Wingdings" w:hAnsi="Wingdings" w:hint="default"/>
-        <w:sz w:val="20"/>
-      </w:rPr>
     </w:lvl>
     <w:lvl w:ilvl="7" w:tentative="1">
       <w:start w:val="1"/>
-      <w:numFmt w:val="bullet"/>
-      <w:lvlText w:val=""/>
+      <w:numFmt w:val="decimal"/>
+      <w:lvlText w:val="%8."/>
       <w:lvlJc w:val="left"/>
       <w:pPr>
         <w:tabs>
@@ -7373,15 +7317,11 @@
         </w:tabs>
         <w:ind w:left="5760" w:hanging="360"/>
       </w:pPr>
-      <w:rPr>
-        <w:rFonts w:ascii="Wingdings" w:hAnsi="Wingdings" w:hint="default"/>
-        <w:sz w:val="20"/>
-      </w:rPr>
     </w:lvl>
     <w:lvl w:ilvl="8" w:tentative="1">
       <w:start w:val="1"/>
-      <w:numFmt w:val="bullet"/>
-      <w:lvlText w:val=""/>
+      <w:numFmt w:val="decimal"/>
+      <w:lvlText w:val="%9."/>
       <w:lvlJc w:val="left"/>
       <w:pPr>
         <w:tabs>
@@ -7389,20 +7329,16 @@
         </w:tabs>
         <w:ind w:left="6480" w:hanging="360"/>
       </w:pPr>
-      <w:rPr>
-        <w:rFonts w:ascii="Wingdings" w:hAnsi="Wingdings" w:hint="default"/>
-        <w:sz w:val="20"/>
-      </w:rPr>
     </w:lvl>
   </w:abstractNum>
   <w:abstractNum w:abstractNumId="6" w15:restartNumberingAfterBreak="0">
-    <w:nsid w:val="19546A5F"/>
+    <w:nsid w:val="230D5C1C"/>
     <w:multiLevelType w:val="multilevel"/>
-    <w:tmpl w:val="02D855F8"/>
+    <w:tmpl w:val="B4B05BFA"/>
     <w:lvl w:ilvl="0">
       <w:start w:val="1"/>
-      <w:numFmt w:val="bullet"/>
-      <w:lvlText w:val=""/>
+      <w:numFmt w:val="decimal"/>
+      <w:lvlText w:val="%1."/>
       <w:lvlJc w:val="left"/>
       <w:pPr>
         <w:tabs>
@@ -7410,12 +7346,8 @@
         </w:tabs>
         <w:ind w:left="720" w:hanging="360"/>
       </w:pPr>
-      <w:rPr>
-        <w:rFonts w:ascii="Symbol" w:hAnsi="Symbol" w:hint="default"/>
-        <w:sz w:val="20"/>
-      </w:rPr>
-    </w:lvl>
-    <w:lvl w:ilvl="1" w:tentative="1">
+    </w:lvl>
+    <w:lvl w:ilvl="1">
       <w:start w:val="1"/>
       <w:numFmt w:val="bullet"/>
       <w:lvlText w:val="o"/>
@@ -7433,8 +7365,8 @@
     </w:lvl>
     <w:lvl w:ilvl="2" w:tentative="1">
       <w:start w:val="1"/>
-      <w:numFmt w:val="bullet"/>
-      <w:lvlText w:val=""/>
+      <w:numFmt w:val="decimal"/>
+      <w:lvlText w:val="%3."/>
       <w:lvlJc w:val="left"/>
       <w:pPr>
         <w:tabs>
@@ -7442,15 +7374,11 @@
         </w:tabs>
         <w:ind w:left="2160" w:hanging="360"/>
       </w:pPr>
-      <w:rPr>
-        <w:rFonts w:ascii="Wingdings" w:hAnsi="Wingdings" w:hint="default"/>
-        <w:sz w:val="20"/>
-      </w:rPr>
     </w:lvl>
     <w:lvl w:ilvl="3" w:tentative="1">
       <w:start w:val="1"/>
-      <w:numFmt w:val="bullet"/>
-      <w:lvlText w:val=""/>
+      <w:numFmt w:val="decimal"/>
+      <w:lvlText w:val="%4."/>
       <w:lvlJc w:val="left"/>
       <w:pPr>
         <w:tabs>
@@ -7458,15 +7386,11 @@
         </w:tabs>
         <w:ind w:left="2880" w:hanging="360"/>
       </w:pPr>
-      <w:rPr>
-        <w:rFonts w:ascii="Wingdings" w:hAnsi="Wingdings" w:hint="default"/>
-        <w:sz w:val="20"/>
-      </w:rPr>
     </w:lvl>
     <w:lvl w:ilvl="4" w:tentative="1">
       <w:start w:val="1"/>
-      <w:numFmt w:val="bullet"/>
-      <w:lvlText w:val=""/>
+      <w:numFmt w:val="decimal"/>
+      <w:lvlText w:val="%5."/>
       <w:lvlJc w:val="left"/>
       <w:pPr>
         <w:tabs>
@@ -7474,15 +7398,11 @@
         </w:tabs>
         <w:ind w:left="3600" w:hanging="360"/>
       </w:pPr>
-      <w:rPr>
-        <w:rFonts w:ascii="Wingdings" w:hAnsi="Wingdings" w:hint="default"/>
-        <w:sz w:val="20"/>
-      </w:rPr>
     </w:lvl>
     <w:lvl w:ilvl="5" w:tentative="1">
       <w:start w:val="1"/>
-      <w:numFmt w:val="bullet"/>
-      <w:lvlText w:val=""/>
+      <w:numFmt w:val="decimal"/>
+      <w:lvlText w:val="%6."/>
       <w:lvlJc w:val="left"/>
       <w:pPr>
         <w:tabs>
@@ -7490,15 +7410,11 @@
         </w:tabs>
         <w:ind w:left="4320" w:hanging="360"/>
       </w:pPr>
-      <w:rPr>
-        <w:rFonts w:ascii="Wingdings" w:hAnsi="Wingdings" w:hint="default"/>
-        <w:sz w:val="20"/>
-      </w:rPr>
     </w:lvl>
     <w:lvl w:ilvl="6" w:tentative="1">
       <w:start w:val="1"/>
-      <w:numFmt w:val="bullet"/>
-      <w:lvlText w:val=""/>
+      <w:numFmt w:val="decimal"/>
+      <w:lvlText w:val="%7."/>
       <w:lvlJc w:val="left"/>
       <w:pPr>
         <w:tabs>
@@ -7506,15 +7422,11 @@
         </w:tabs>
         <w:ind w:left="5040" w:hanging="360"/>
       </w:pPr>
-      <w:rPr>
-        <w:rFonts w:ascii="Wingdings" w:hAnsi="Wingdings" w:hint="default"/>
-        <w:sz w:val="20"/>
-      </w:rPr>
     </w:lvl>
     <w:lvl w:ilvl="7" w:tentative="1">
       <w:start w:val="1"/>
-      <w:numFmt w:val="bullet"/>
-      <w:lvlText w:val=""/>
+      <w:numFmt w:val="decimal"/>
+      <w:lvlText w:val="%8."/>
       <w:lvlJc w:val="left"/>
       <w:pPr>
         <w:tabs>
@@ -7522,15 +7434,11 @@
         </w:tabs>
         <w:ind w:left="5760" w:hanging="360"/>
       </w:pPr>
-      <w:rPr>
-        <w:rFonts w:ascii="Wingdings" w:hAnsi="Wingdings" w:hint="default"/>
-        <w:sz w:val="20"/>
-      </w:rPr>
     </w:lvl>
     <w:lvl w:ilvl="8" w:tentative="1">
       <w:start w:val="1"/>
-      <w:numFmt w:val="bullet"/>
-      <w:lvlText w:val=""/>
+      <w:numFmt w:val="decimal"/>
+      <w:lvlText w:val="%9."/>
       <w:lvlJc w:val="left"/>
       <w:pPr>
         <w:tabs>
@@ -7538,16 +7446,310 @@
         </w:tabs>
         <w:ind w:left="6480" w:hanging="360"/>
       </w:pPr>
-      <w:rPr>
-        <w:rFonts w:ascii="Wingdings" w:hAnsi="Wingdings" w:hint="default"/>
-        <w:sz w:val="20"/>
-      </w:rPr>
     </w:lvl>
   </w:abstractNum>
   <w:abstractNum w:abstractNumId="7" w15:restartNumberingAfterBreak="0">
-    <w:nsid w:val="1DCC5BE1"/>
+    <w:nsid w:val="25D517E5"/>
     <w:multiLevelType w:val="multilevel"/>
-    <w:tmpl w:val="2B2E0C02"/>
+    <w:tmpl w:val="B268F6F6"/>
+    <w:lvl w:ilvl="0">
+      <w:start w:val="1"/>
+      <w:numFmt w:val="bullet"/>
+      <w:lvlText w:val=""/>
+      <w:lvlJc w:val="left"/>
+      <w:pPr>
+        <w:tabs>
+          <w:tab w:val="num" w:pos="720"/>
+        </w:tabs>
+        <w:ind w:left="720" w:hanging="360"/>
+      </w:pPr>
+      <w:rPr>
+        <w:rFonts w:ascii="Symbol" w:hAnsi="Symbol" w:hint="default"/>
+        <w:sz w:val="20"/>
+      </w:rPr>
+    </w:lvl>
+    <w:lvl w:ilvl="1" w:tentative="1">
+      <w:start w:val="1"/>
+      <w:numFmt w:val="bullet"/>
+      <w:lvlText w:val="o"/>
+      <w:lvlJc w:val="left"/>
+      <w:pPr>
+        <w:tabs>
+          <w:tab w:val="num" w:pos="1440"/>
+        </w:tabs>
+        <w:ind w:left="1440" w:hanging="360"/>
+      </w:pPr>
+      <w:rPr>
+        <w:rFonts w:ascii="Courier New" w:hAnsi="Courier New" w:hint="default"/>
+        <w:sz w:val="20"/>
+      </w:rPr>
+    </w:lvl>
+    <w:lvl w:ilvl="2" w:tentative="1">
+      <w:start w:val="1"/>
+      <w:numFmt w:val="bullet"/>
+      <w:lvlText w:val=""/>
+      <w:lvlJc w:val="left"/>
+      <w:pPr>
+        <w:tabs>
+          <w:tab w:val="num" w:pos="2160"/>
+        </w:tabs>
+        <w:ind w:left="2160" w:hanging="360"/>
+      </w:pPr>
+      <w:rPr>
+        <w:rFonts w:ascii="Wingdings" w:hAnsi="Wingdings" w:hint="default"/>
+        <w:sz w:val="20"/>
+      </w:rPr>
+    </w:lvl>
+    <w:lvl w:ilvl="3" w:tentative="1">
+      <w:start w:val="1"/>
+      <w:numFmt w:val="bullet"/>
+      <w:lvlText w:val=""/>
+      <w:lvlJc w:val="left"/>
+      <w:pPr>
+        <w:tabs>
+          <w:tab w:val="num" w:pos="2880"/>
+        </w:tabs>
+        <w:ind w:left="2880" w:hanging="360"/>
+      </w:pPr>
+      <w:rPr>
+        <w:rFonts w:ascii="Wingdings" w:hAnsi="Wingdings" w:hint="default"/>
+        <w:sz w:val="20"/>
+      </w:rPr>
+    </w:lvl>
+    <w:lvl w:ilvl="4" w:tentative="1">
+      <w:start w:val="1"/>
+      <w:numFmt w:val="bullet"/>
+      <w:lvlText w:val=""/>
+      <w:lvlJc w:val="left"/>
+      <w:pPr>
+        <w:tabs>
+          <w:tab w:val="num" w:pos="3600"/>
+        </w:tabs>
+        <w:ind w:left="3600" w:hanging="360"/>
+      </w:pPr>
+      <w:rPr>
+        <w:rFonts w:ascii="Wingdings" w:hAnsi="Wingdings" w:hint="default"/>
+        <w:sz w:val="20"/>
+      </w:rPr>
+    </w:lvl>
+    <w:lvl w:ilvl="5" w:tentative="1">
+      <w:start w:val="1"/>
+      <w:numFmt w:val="bullet"/>
+      <w:lvlText w:val=""/>
+      <w:lvlJc w:val="left"/>
+      <w:pPr>
+        <w:tabs>
+          <w:tab w:val="num" w:pos="4320"/>
+        </w:tabs>
+        <w:ind w:left="4320" w:hanging="360"/>
+      </w:pPr>
+      <w:rPr>
+        <w:rFonts w:ascii="Wingdings" w:hAnsi="Wingdings" w:hint="default"/>
+        <w:sz w:val="20"/>
+      </w:rPr>
+    </w:lvl>
+    <w:lvl w:ilvl="6" w:tentative="1">
+      <w:start w:val="1"/>
+      <w:numFmt w:val="bullet"/>
+      <w:lvlText w:val=""/>
+      <w:lvlJc w:val="left"/>
+      <w:pPr>
+        <w:tabs>
+          <w:tab w:val="num" w:pos="5040"/>
+        </w:tabs>
+        <w:ind w:left="5040" w:hanging="360"/>
+      </w:pPr>
+      <w:rPr>
+        <w:rFonts w:ascii="Wingdings" w:hAnsi="Wingdings" w:hint="default"/>
+        <w:sz w:val="20"/>
+      </w:rPr>
+    </w:lvl>
+    <w:lvl w:ilvl="7" w:tentative="1">
+      <w:start w:val="1"/>
+      <w:numFmt w:val="bullet"/>
+      <w:lvlText w:val=""/>
+      <w:lvlJc w:val="left"/>
+      <w:pPr>
+        <w:tabs>
+          <w:tab w:val="num" w:pos="5760"/>
+        </w:tabs>
+        <w:ind w:left="5760" w:hanging="360"/>
+      </w:pPr>
+      <w:rPr>
+        <w:rFonts w:ascii="Wingdings" w:hAnsi="Wingdings" w:hint="default"/>
+        <w:sz w:val="20"/>
+      </w:rPr>
+    </w:lvl>
+    <w:lvl w:ilvl="8" w:tentative="1">
+      <w:start w:val="1"/>
+      <w:numFmt w:val="bullet"/>
+      <w:lvlText w:val=""/>
+      <w:lvlJc w:val="left"/>
+      <w:pPr>
+        <w:tabs>
+          <w:tab w:val="num" w:pos="6480"/>
+        </w:tabs>
+        <w:ind w:left="6480" w:hanging="360"/>
+      </w:pPr>
+      <w:rPr>
+        <w:rFonts w:ascii="Wingdings" w:hAnsi="Wingdings" w:hint="default"/>
+        <w:sz w:val="20"/>
+      </w:rPr>
+    </w:lvl>
+  </w:abstractNum>
+  <w:abstractNum w:abstractNumId="8" w15:restartNumberingAfterBreak="0">
+    <w:nsid w:val="31BC3F67"/>
+    <w:multiLevelType w:val="multilevel"/>
+    <w:tmpl w:val="FB548540"/>
+    <w:lvl w:ilvl="0">
+      <w:start w:val="1"/>
+      <w:numFmt w:val="bullet"/>
+      <w:lvlText w:val=""/>
+      <w:lvlJc w:val="left"/>
+      <w:pPr>
+        <w:tabs>
+          <w:tab w:val="num" w:pos="720"/>
+        </w:tabs>
+        <w:ind w:left="720" w:hanging="360"/>
+      </w:pPr>
+      <w:rPr>
+        <w:rFonts w:ascii="Symbol" w:hAnsi="Symbol" w:hint="default"/>
+        <w:sz w:val="20"/>
+      </w:rPr>
+    </w:lvl>
+    <w:lvl w:ilvl="1" w:tentative="1">
+      <w:start w:val="1"/>
+      <w:numFmt w:val="bullet"/>
+      <w:lvlText w:val="o"/>
+      <w:lvlJc w:val="left"/>
+      <w:pPr>
+        <w:tabs>
+          <w:tab w:val="num" w:pos="1440"/>
+        </w:tabs>
+        <w:ind w:left="1440" w:hanging="360"/>
+      </w:pPr>
+      <w:rPr>
+        <w:rFonts w:ascii="Courier New" w:hAnsi="Courier New" w:hint="default"/>
+        <w:sz w:val="20"/>
+      </w:rPr>
+    </w:lvl>
+    <w:lvl w:ilvl="2" w:tentative="1">
+      <w:start w:val="1"/>
+      <w:numFmt w:val="bullet"/>
+      <w:lvlText w:val=""/>
+      <w:lvlJc w:val="left"/>
+      <w:pPr>
+        <w:tabs>
+          <w:tab w:val="num" w:pos="2160"/>
+        </w:tabs>
+        <w:ind w:left="2160" w:hanging="360"/>
+      </w:pPr>
+      <w:rPr>
+        <w:rFonts w:ascii="Wingdings" w:hAnsi="Wingdings" w:hint="default"/>
+        <w:sz w:val="20"/>
+      </w:rPr>
+    </w:lvl>
+    <w:lvl w:ilvl="3" w:tentative="1">
+      <w:start w:val="1"/>
+      <w:numFmt w:val="bullet"/>
+      <w:lvlText w:val=""/>
+      <w:lvlJc w:val="left"/>
+      <w:pPr>
+        <w:tabs>
+          <w:tab w:val="num" w:pos="2880"/>
+        </w:tabs>
+        <w:ind w:left="2880" w:hanging="360"/>
+      </w:pPr>
+      <w:rPr>
+        <w:rFonts w:ascii="Wingdings" w:hAnsi="Wingdings" w:hint="default"/>
+        <w:sz w:val="20"/>
+      </w:rPr>
+    </w:lvl>
+    <w:lvl w:ilvl="4" w:tentative="1">
+      <w:start w:val="1"/>
+      <w:numFmt w:val="bullet"/>
+      <w:lvlText w:val=""/>
+      <w:lvlJc w:val="left"/>
+      <w:pPr>
+        <w:tabs>
+          <w:tab w:val="num" w:pos="3600"/>
+        </w:tabs>
+        <w:ind w:left="3600" w:hanging="360"/>
+      </w:pPr>
+      <w:rPr>
+        <w:rFonts w:ascii="Wingdings" w:hAnsi="Wingdings" w:hint="default"/>
+        <w:sz w:val="20"/>
+      </w:rPr>
+    </w:lvl>
+    <w:lvl w:ilvl="5" w:tentative="1">
+      <w:start w:val="1"/>
+      <w:numFmt w:val="bullet"/>
+      <w:lvlText w:val=""/>
+      <w:lvlJc w:val="left"/>
+      <w:pPr>
+        <w:tabs>
+          <w:tab w:val="num" w:pos="4320"/>
+        </w:tabs>
+        <w:ind w:left="4320" w:hanging="360"/>
+      </w:pPr>
+      <w:rPr>
+        <w:rFonts w:ascii="Wingdings" w:hAnsi="Wingdings" w:hint="default"/>
+        <w:sz w:val="20"/>
+      </w:rPr>
+    </w:lvl>
+    <w:lvl w:ilvl="6" w:tentative="1">
+      <w:start w:val="1"/>
+      <w:numFmt w:val="bullet"/>
+      <w:lvlText w:val=""/>
+      <w:lvlJc w:val="left"/>
+      <w:pPr>
+        <w:tabs>
+          <w:tab w:val="num" w:pos="5040"/>
+        </w:tabs>
+        <w:ind w:left="5040" w:hanging="360"/>
+      </w:pPr>
+      <w:rPr>
+        <w:rFonts w:ascii="Wingdings" w:hAnsi="Wingdings" w:hint="default"/>
+        <w:sz w:val="20"/>
+      </w:rPr>
+    </w:lvl>
+    <w:lvl w:ilvl="7" w:tentative="1">
+      <w:start w:val="1"/>
+      <w:numFmt w:val="bullet"/>
+      <w:lvlText w:val=""/>
+      <w:lvlJc w:val="left"/>
+      <w:pPr>
+        <w:tabs>
+          <w:tab w:val="num" w:pos="5760"/>
+        </w:tabs>
+        <w:ind w:left="5760" w:hanging="360"/>
+      </w:pPr>
+      <w:rPr>
+        <w:rFonts w:ascii="Wingdings" w:hAnsi="Wingdings" w:hint="default"/>
+        <w:sz w:val="20"/>
+      </w:rPr>
+    </w:lvl>
+    <w:lvl w:ilvl="8" w:tentative="1">
+      <w:start w:val="1"/>
+      <w:numFmt w:val="bullet"/>
+      <w:lvlText w:val=""/>
+      <w:lvlJc w:val="left"/>
+      <w:pPr>
+        <w:tabs>
+          <w:tab w:val="num" w:pos="6480"/>
+        </w:tabs>
+        <w:ind w:left="6480" w:hanging="360"/>
+      </w:pPr>
+      <w:rPr>
+        <w:rFonts w:ascii="Wingdings" w:hAnsi="Wingdings" w:hint="default"/>
+        <w:sz w:val="20"/>
+      </w:rPr>
+    </w:lvl>
+  </w:abstractNum>
+  <w:abstractNum w:abstractNumId="9" w15:restartNumberingAfterBreak="0">
+    <w:nsid w:val="35FA7DF3"/>
+    <w:multiLevelType w:val="multilevel"/>
+    <w:tmpl w:val="3E56F6BA"/>
     <w:lvl w:ilvl="0">
       <w:start w:val="1"/>
       <w:numFmt w:val="decimal"/>
@@ -7661,308 +7863,10 @@
       </w:pPr>
     </w:lvl>
   </w:abstractNum>
-  <w:abstractNum w:abstractNumId="8" w15:restartNumberingAfterBreak="0">
-    <w:nsid w:val="21A31AE2"/>
+  <w:abstractNum w:abstractNumId="10" w15:restartNumberingAfterBreak="0">
+    <w:nsid w:val="36D13748"/>
     <w:multiLevelType w:val="multilevel"/>
-    <w:tmpl w:val="3272C2C2"/>
-    <w:lvl w:ilvl="0">
-      <w:start w:val="1"/>
-      <w:numFmt w:val="bullet"/>
-      <w:lvlText w:val=""/>
-      <w:lvlJc w:val="left"/>
-      <w:pPr>
-        <w:tabs>
-          <w:tab w:val="num" w:pos="720"/>
-        </w:tabs>
-        <w:ind w:left="720" w:hanging="360"/>
-      </w:pPr>
-      <w:rPr>
-        <w:rFonts w:ascii="Symbol" w:hAnsi="Symbol" w:hint="default"/>
-        <w:sz w:val="20"/>
-      </w:rPr>
-    </w:lvl>
-    <w:lvl w:ilvl="1" w:tentative="1">
-      <w:start w:val="1"/>
-      <w:numFmt w:val="bullet"/>
-      <w:lvlText w:val="o"/>
-      <w:lvlJc w:val="left"/>
-      <w:pPr>
-        <w:tabs>
-          <w:tab w:val="num" w:pos="1440"/>
-        </w:tabs>
-        <w:ind w:left="1440" w:hanging="360"/>
-      </w:pPr>
-      <w:rPr>
-        <w:rFonts w:ascii="Courier New" w:hAnsi="Courier New" w:hint="default"/>
-        <w:sz w:val="20"/>
-      </w:rPr>
-    </w:lvl>
-    <w:lvl w:ilvl="2" w:tentative="1">
-      <w:start w:val="1"/>
-      <w:numFmt w:val="bullet"/>
-      <w:lvlText w:val=""/>
-      <w:lvlJc w:val="left"/>
-      <w:pPr>
-        <w:tabs>
-          <w:tab w:val="num" w:pos="2160"/>
-        </w:tabs>
-        <w:ind w:left="2160" w:hanging="360"/>
-      </w:pPr>
-      <w:rPr>
-        <w:rFonts w:ascii="Wingdings" w:hAnsi="Wingdings" w:hint="default"/>
-        <w:sz w:val="20"/>
-      </w:rPr>
-    </w:lvl>
-    <w:lvl w:ilvl="3" w:tentative="1">
-      <w:start w:val="1"/>
-      <w:numFmt w:val="bullet"/>
-      <w:lvlText w:val=""/>
-      <w:lvlJc w:val="left"/>
-      <w:pPr>
-        <w:tabs>
-          <w:tab w:val="num" w:pos="2880"/>
-        </w:tabs>
-        <w:ind w:left="2880" w:hanging="360"/>
-      </w:pPr>
-      <w:rPr>
-        <w:rFonts w:ascii="Wingdings" w:hAnsi="Wingdings" w:hint="default"/>
-        <w:sz w:val="20"/>
-      </w:rPr>
-    </w:lvl>
-    <w:lvl w:ilvl="4" w:tentative="1">
-      <w:start w:val="1"/>
-      <w:numFmt w:val="bullet"/>
-      <w:lvlText w:val=""/>
-      <w:lvlJc w:val="left"/>
-      <w:pPr>
-        <w:tabs>
-          <w:tab w:val="num" w:pos="3600"/>
-        </w:tabs>
-        <w:ind w:left="3600" w:hanging="360"/>
-      </w:pPr>
-      <w:rPr>
-        <w:rFonts w:ascii="Wingdings" w:hAnsi="Wingdings" w:hint="default"/>
-        <w:sz w:val="20"/>
-      </w:rPr>
-    </w:lvl>
-    <w:lvl w:ilvl="5" w:tentative="1">
-      <w:start w:val="1"/>
-      <w:numFmt w:val="bullet"/>
-      <w:lvlText w:val=""/>
-      <w:lvlJc w:val="left"/>
-      <w:pPr>
-        <w:tabs>
-          <w:tab w:val="num" w:pos="4320"/>
-        </w:tabs>
-        <w:ind w:left="4320" w:hanging="360"/>
-      </w:pPr>
-      <w:rPr>
-        <w:rFonts w:ascii="Wingdings" w:hAnsi="Wingdings" w:hint="default"/>
-        <w:sz w:val="20"/>
-      </w:rPr>
-    </w:lvl>
-    <w:lvl w:ilvl="6" w:tentative="1">
-      <w:start w:val="1"/>
-      <w:numFmt w:val="bullet"/>
-      <w:lvlText w:val=""/>
-      <w:lvlJc w:val="left"/>
-      <w:pPr>
-        <w:tabs>
-          <w:tab w:val="num" w:pos="5040"/>
-        </w:tabs>
-        <w:ind w:left="5040" w:hanging="360"/>
-      </w:pPr>
-      <w:rPr>
-        <w:rFonts w:ascii="Wingdings" w:hAnsi="Wingdings" w:hint="default"/>
-        <w:sz w:val="20"/>
-      </w:rPr>
-    </w:lvl>
-    <w:lvl w:ilvl="7" w:tentative="1">
-      <w:start w:val="1"/>
-      <w:numFmt w:val="bullet"/>
-      <w:lvlText w:val=""/>
-      <w:lvlJc w:val="left"/>
-      <w:pPr>
-        <w:tabs>
-          <w:tab w:val="num" w:pos="5760"/>
-        </w:tabs>
-        <w:ind w:left="5760" w:hanging="360"/>
-      </w:pPr>
-      <w:rPr>
-        <w:rFonts w:ascii="Wingdings" w:hAnsi="Wingdings" w:hint="default"/>
-        <w:sz w:val="20"/>
-      </w:rPr>
-    </w:lvl>
-    <w:lvl w:ilvl="8" w:tentative="1">
-      <w:start w:val="1"/>
-      <w:numFmt w:val="bullet"/>
-      <w:lvlText w:val=""/>
-      <w:lvlJc w:val="left"/>
-      <w:pPr>
-        <w:tabs>
-          <w:tab w:val="num" w:pos="6480"/>
-        </w:tabs>
-        <w:ind w:left="6480" w:hanging="360"/>
-      </w:pPr>
-      <w:rPr>
-        <w:rFonts w:ascii="Wingdings" w:hAnsi="Wingdings" w:hint="default"/>
-        <w:sz w:val="20"/>
-      </w:rPr>
-    </w:lvl>
-  </w:abstractNum>
-  <w:abstractNum w:abstractNumId="9" w15:restartNumberingAfterBreak="0">
-    <w:nsid w:val="26C91B3B"/>
-    <w:multiLevelType w:val="multilevel"/>
-    <w:tmpl w:val="90162074"/>
-    <w:lvl w:ilvl="0">
-      <w:start w:val="1"/>
-      <w:numFmt w:val="bullet"/>
-      <w:lvlText w:val=""/>
-      <w:lvlJc w:val="left"/>
-      <w:pPr>
-        <w:tabs>
-          <w:tab w:val="num" w:pos="720"/>
-        </w:tabs>
-        <w:ind w:left="720" w:hanging="360"/>
-      </w:pPr>
-      <w:rPr>
-        <w:rFonts w:ascii="Symbol" w:hAnsi="Symbol" w:hint="default"/>
-        <w:sz w:val="20"/>
-      </w:rPr>
-    </w:lvl>
-    <w:lvl w:ilvl="1" w:tentative="1">
-      <w:start w:val="1"/>
-      <w:numFmt w:val="bullet"/>
-      <w:lvlText w:val="o"/>
-      <w:lvlJc w:val="left"/>
-      <w:pPr>
-        <w:tabs>
-          <w:tab w:val="num" w:pos="1440"/>
-        </w:tabs>
-        <w:ind w:left="1440" w:hanging="360"/>
-      </w:pPr>
-      <w:rPr>
-        <w:rFonts w:ascii="Courier New" w:hAnsi="Courier New" w:hint="default"/>
-        <w:sz w:val="20"/>
-      </w:rPr>
-    </w:lvl>
-    <w:lvl w:ilvl="2" w:tentative="1">
-      <w:start w:val="1"/>
-      <w:numFmt w:val="bullet"/>
-      <w:lvlText w:val=""/>
-      <w:lvlJc w:val="left"/>
-      <w:pPr>
-        <w:tabs>
-          <w:tab w:val="num" w:pos="2160"/>
-        </w:tabs>
-        <w:ind w:left="2160" w:hanging="360"/>
-      </w:pPr>
-      <w:rPr>
-        <w:rFonts w:ascii="Wingdings" w:hAnsi="Wingdings" w:hint="default"/>
-        <w:sz w:val="20"/>
-      </w:rPr>
-    </w:lvl>
-    <w:lvl w:ilvl="3" w:tentative="1">
-      <w:start w:val="1"/>
-      <w:numFmt w:val="bullet"/>
-      <w:lvlText w:val=""/>
-      <w:lvlJc w:val="left"/>
-      <w:pPr>
-        <w:tabs>
-          <w:tab w:val="num" w:pos="2880"/>
-        </w:tabs>
-        <w:ind w:left="2880" w:hanging="360"/>
-      </w:pPr>
-      <w:rPr>
-        <w:rFonts w:ascii="Wingdings" w:hAnsi="Wingdings" w:hint="default"/>
-        <w:sz w:val="20"/>
-      </w:rPr>
-    </w:lvl>
-    <w:lvl w:ilvl="4" w:tentative="1">
-      <w:start w:val="1"/>
-      <w:numFmt w:val="bullet"/>
-      <w:lvlText w:val=""/>
-      <w:lvlJc w:val="left"/>
-      <w:pPr>
-        <w:tabs>
-          <w:tab w:val="num" w:pos="3600"/>
-        </w:tabs>
-        <w:ind w:left="3600" w:hanging="360"/>
-      </w:pPr>
-      <w:rPr>
-        <w:rFonts w:ascii="Wingdings" w:hAnsi="Wingdings" w:hint="default"/>
-        <w:sz w:val="20"/>
-      </w:rPr>
-    </w:lvl>
-    <w:lvl w:ilvl="5" w:tentative="1">
-      <w:start w:val="1"/>
-      <w:numFmt w:val="bullet"/>
-      <w:lvlText w:val=""/>
-      <w:lvlJc w:val="left"/>
-      <w:pPr>
-        <w:tabs>
-          <w:tab w:val="num" w:pos="4320"/>
-        </w:tabs>
-        <w:ind w:left="4320" w:hanging="360"/>
-      </w:pPr>
-      <w:rPr>
-        <w:rFonts w:ascii="Wingdings" w:hAnsi="Wingdings" w:hint="default"/>
-        <w:sz w:val="20"/>
-      </w:rPr>
-    </w:lvl>
-    <w:lvl w:ilvl="6" w:tentative="1">
-      <w:start w:val="1"/>
-      <w:numFmt w:val="bullet"/>
-      <w:lvlText w:val=""/>
-      <w:lvlJc w:val="left"/>
-      <w:pPr>
-        <w:tabs>
-          <w:tab w:val="num" w:pos="5040"/>
-        </w:tabs>
-        <w:ind w:left="5040" w:hanging="360"/>
-      </w:pPr>
-      <w:rPr>
-        <w:rFonts w:ascii="Wingdings" w:hAnsi="Wingdings" w:hint="default"/>
-        <w:sz w:val="20"/>
-      </w:rPr>
-    </w:lvl>
-    <w:lvl w:ilvl="7" w:tentative="1">
-      <w:start w:val="1"/>
-      <w:numFmt w:val="bullet"/>
-      <w:lvlText w:val=""/>
-      <w:lvlJc w:val="left"/>
-      <w:pPr>
-        <w:tabs>
-          <w:tab w:val="num" w:pos="5760"/>
-        </w:tabs>
-        <w:ind w:left="5760" w:hanging="360"/>
-      </w:pPr>
-      <w:rPr>
-        <w:rFonts w:ascii="Wingdings" w:hAnsi="Wingdings" w:hint="default"/>
-        <w:sz w:val="20"/>
-      </w:rPr>
-    </w:lvl>
-    <w:lvl w:ilvl="8" w:tentative="1">
-      <w:start w:val="1"/>
-      <w:numFmt w:val="bullet"/>
-      <w:lvlText w:val=""/>
-      <w:lvlJc w:val="left"/>
-      <w:pPr>
-        <w:tabs>
-          <w:tab w:val="num" w:pos="6480"/>
-        </w:tabs>
-        <w:ind w:left="6480" w:hanging="360"/>
-      </w:pPr>
-      <w:rPr>
-        <w:rFonts w:ascii="Wingdings" w:hAnsi="Wingdings" w:hint="default"/>
-        <w:sz w:val="20"/>
-      </w:rPr>
-    </w:lvl>
-  </w:abstractNum>
-  <w:abstractNum w:abstractNumId="10" w15:restartNumberingAfterBreak="0">
-    <w:nsid w:val="28C95F5B"/>
-    <w:multiLevelType w:val="multilevel"/>
-    <w:tmpl w:val="D97A95A0"/>
+    <w:tmpl w:val="11F0A07C"/>
     <w:lvl w:ilvl="0">
       <w:start w:val="1"/>
       <w:numFmt w:val="bullet"/>
@@ -8109,13 +8013,13 @@
     </w:lvl>
   </w:abstractNum>
   <w:abstractNum w:abstractNumId="11" w15:restartNumberingAfterBreak="0">
-    <w:nsid w:val="2A861DEB"/>
+    <w:nsid w:val="378473FE"/>
     <w:multiLevelType w:val="multilevel"/>
-    <w:tmpl w:val="F5DC9772"/>
+    <w:tmpl w:val="44C47ED8"/>
     <w:lvl w:ilvl="0">
       <w:start w:val="1"/>
-      <w:numFmt w:val="bullet"/>
-      <w:lvlText w:val=""/>
+      <w:numFmt w:val="decimal"/>
+      <w:lvlText w:val="%1."/>
       <w:lvlJc w:val="left"/>
       <w:pPr>
         <w:tabs>
@@ -8123,12 +8027,8 @@
         </w:tabs>
         <w:ind w:left="720" w:hanging="360"/>
       </w:pPr>
-      <w:rPr>
-        <w:rFonts w:ascii="Symbol" w:hAnsi="Symbol" w:hint="default"/>
-        <w:sz w:val="20"/>
-      </w:rPr>
-    </w:lvl>
-    <w:lvl w:ilvl="1" w:tentative="1">
+    </w:lvl>
+    <w:lvl w:ilvl="1">
       <w:start w:val="1"/>
       <w:numFmt w:val="bullet"/>
       <w:lvlText w:val="o"/>
@@ -8146,8 +8046,8 @@
     </w:lvl>
     <w:lvl w:ilvl="2" w:tentative="1">
       <w:start w:val="1"/>
-      <w:numFmt w:val="bullet"/>
-      <w:lvlText w:val=""/>
+      <w:numFmt w:val="decimal"/>
+      <w:lvlText w:val="%3."/>
       <w:lvlJc w:val="left"/>
       <w:pPr>
         <w:tabs>
@@ -8155,15 +8055,11 @@
         </w:tabs>
         <w:ind w:left="2160" w:hanging="360"/>
       </w:pPr>
-      <w:rPr>
-        <w:rFonts w:ascii="Wingdings" w:hAnsi="Wingdings" w:hint="default"/>
-        <w:sz w:val="20"/>
-      </w:rPr>
     </w:lvl>
     <w:lvl w:ilvl="3" w:tentative="1">
       <w:start w:val="1"/>
-      <w:numFmt w:val="bullet"/>
-      <w:lvlText w:val=""/>
+      <w:numFmt w:val="decimal"/>
+      <w:lvlText w:val="%4."/>
       <w:lvlJc w:val="left"/>
       <w:pPr>
         <w:tabs>
@@ -8171,15 +8067,11 @@
         </w:tabs>
         <w:ind w:left="2880" w:hanging="360"/>
       </w:pPr>
-      <w:rPr>
-        <w:rFonts w:ascii="Wingdings" w:hAnsi="Wingdings" w:hint="default"/>
-        <w:sz w:val="20"/>
-      </w:rPr>
     </w:lvl>
     <w:lvl w:ilvl="4" w:tentative="1">
       <w:start w:val="1"/>
-      <w:numFmt w:val="bullet"/>
-      <w:lvlText w:val=""/>
+      <w:numFmt w:val="decimal"/>
+      <w:lvlText w:val="%5."/>
       <w:lvlJc w:val="left"/>
       <w:pPr>
         <w:tabs>
@@ -8187,15 +8079,11 @@
         </w:tabs>
         <w:ind w:left="3600" w:hanging="360"/>
       </w:pPr>
-      <w:rPr>
-        <w:rFonts w:ascii="Wingdings" w:hAnsi="Wingdings" w:hint="default"/>
-        <w:sz w:val="20"/>
-      </w:rPr>
     </w:lvl>
     <w:lvl w:ilvl="5" w:tentative="1">
       <w:start w:val="1"/>
-      <w:numFmt w:val="bullet"/>
-      <w:lvlText w:val=""/>
+      <w:numFmt w:val="decimal"/>
+      <w:lvlText w:val="%6."/>
       <w:lvlJc w:val="left"/>
       <w:pPr>
         <w:tabs>
@@ -8203,15 +8091,11 @@
         </w:tabs>
         <w:ind w:left="4320" w:hanging="360"/>
       </w:pPr>
-      <w:rPr>
-        <w:rFonts w:ascii="Wingdings" w:hAnsi="Wingdings" w:hint="default"/>
-        <w:sz w:val="20"/>
-      </w:rPr>
     </w:lvl>
     <w:lvl w:ilvl="6" w:tentative="1">
       <w:start w:val="1"/>
-      <w:numFmt w:val="bullet"/>
-      <w:lvlText w:val=""/>
+      <w:numFmt w:val="decimal"/>
+      <w:lvlText w:val="%7."/>
       <w:lvlJc w:val="left"/>
       <w:pPr>
         <w:tabs>
@@ -8219,15 +8103,11 @@
         </w:tabs>
         <w:ind w:left="5040" w:hanging="360"/>
       </w:pPr>
-      <w:rPr>
-        <w:rFonts w:ascii="Wingdings" w:hAnsi="Wingdings" w:hint="default"/>
-        <w:sz w:val="20"/>
-      </w:rPr>
     </w:lvl>
     <w:lvl w:ilvl="7" w:tentative="1">
       <w:start w:val="1"/>
-      <w:numFmt w:val="bullet"/>
-      <w:lvlText w:val=""/>
+      <w:numFmt w:val="decimal"/>
+      <w:lvlText w:val="%8."/>
       <w:lvlJc w:val="left"/>
       <w:pPr>
         <w:tabs>
@@ -8235,15 +8115,11 @@
         </w:tabs>
         <w:ind w:left="5760" w:hanging="360"/>
       </w:pPr>
-      <w:rPr>
-        <w:rFonts w:ascii="Wingdings" w:hAnsi="Wingdings" w:hint="default"/>
-        <w:sz w:val="20"/>
-      </w:rPr>
     </w:lvl>
     <w:lvl w:ilvl="8" w:tentative="1">
       <w:start w:val="1"/>
-      <w:numFmt w:val="bullet"/>
-      <w:lvlText w:val=""/>
+      <w:numFmt w:val="decimal"/>
+      <w:lvlText w:val="%9."/>
       <w:lvlJc w:val="left"/>
       <w:pPr>
         <w:tabs>
@@ -8251,16 +8127,310 @@
         </w:tabs>
         <w:ind w:left="6480" w:hanging="360"/>
       </w:pPr>
-      <w:rPr>
-        <w:rFonts w:ascii="Wingdings" w:hAnsi="Wingdings" w:hint="default"/>
-        <w:sz w:val="20"/>
-      </w:rPr>
     </w:lvl>
   </w:abstractNum>
   <w:abstractNum w:abstractNumId="12" w15:restartNumberingAfterBreak="0">
-    <w:nsid w:val="3E98139C"/>
+    <w:nsid w:val="3ED668E9"/>
     <w:multiLevelType w:val="multilevel"/>
-    <w:tmpl w:val="F7C83B44"/>
+    <w:tmpl w:val="DD024478"/>
+    <w:lvl w:ilvl="0">
+      <w:start w:val="1"/>
+      <w:numFmt w:val="bullet"/>
+      <w:lvlText w:val=""/>
+      <w:lvlJc w:val="left"/>
+      <w:pPr>
+        <w:tabs>
+          <w:tab w:val="num" w:pos="720"/>
+        </w:tabs>
+        <w:ind w:left="720" w:hanging="360"/>
+      </w:pPr>
+      <w:rPr>
+        <w:rFonts w:ascii="Symbol" w:hAnsi="Symbol" w:hint="default"/>
+        <w:sz w:val="20"/>
+      </w:rPr>
+    </w:lvl>
+    <w:lvl w:ilvl="1" w:tentative="1">
+      <w:start w:val="1"/>
+      <w:numFmt w:val="bullet"/>
+      <w:lvlText w:val="o"/>
+      <w:lvlJc w:val="left"/>
+      <w:pPr>
+        <w:tabs>
+          <w:tab w:val="num" w:pos="1440"/>
+        </w:tabs>
+        <w:ind w:left="1440" w:hanging="360"/>
+      </w:pPr>
+      <w:rPr>
+        <w:rFonts w:ascii="Courier New" w:hAnsi="Courier New" w:hint="default"/>
+        <w:sz w:val="20"/>
+      </w:rPr>
+    </w:lvl>
+    <w:lvl w:ilvl="2" w:tentative="1">
+      <w:start w:val="1"/>
+      <w:numFmt w:val="bullet"/>
+      <w:lvlText w:val=""/>
+      <w:lvlJc w:val="left"/>
+      <w:pPr>
+        <w:tabs>
+          <w:tab w:val="num" w:pos="2160"/>
+        </w:tabs>
+        <w:ind w:left="2160" w:hanging="360"/>
+      </w:pPr>
+      <w:rPr>
+        <w:rFonts w:ascii="Wingdings" w:hAnsi="Wingdings" w:hint="default"/>
+        <w:sz w:val="20"/>
+      </w:rPr>
+    </w:lvl>
+    <w:lvl w:ilvl="3" w:tentative="1">
+      <w:start w:val="1"/>
+      <w:numFmt w:val="bullet"/>
+      <w:lvlText w:val=""/>
+      <w:lvlJc w:val="left"/>
+      <w:pPr>
+        <w:tabs>
+          <w:tab w:val="num" w:pos="2880"/>
+        </w:tabs>
+        <w:ind w:left="2880" w:hanging="360"/>
+      </w:pPr>
+      <w:rPr>
+        <w:rFonts w:ascii="Wingdings" w:hAnsi="Wingdings" w:hint="default"/>
+        <w:sz w:val="20"/>
+      </w:rPr>
+    </w:lvl>
+    <w:lvl w:ilvl="4" w:tentative="1">
+      <w:start w:val="1"/>
+      <w:numFmt w:val="bullet"/>
+      <w:lvlText w:val=""/>
+      <w:lvlJc w:val="left"/>
+      <w:pPr>
+        <w:tabs>
+          <w:tab w:val="num" w:pos="3600"/>
+        </w:tabs>
+        <w:ind w:left="3600" w:hanging="360"/>
+      </w:pPr>
+      <w:rPr>
+        <w:rFonts w:ascii="Wingdings" w:hAnsi="Wingdings" w:hint="default"/>
+        <w:sz w:val="20"/>
+      </w:rPr>
+    </w:lvl>
+    <w:lvl w:ilvl="5" w:tentative="1">
+      <w:start w:val="1"/>
+      <w:numFmt w:val="bullet"/>
+      <w:lvlText w:val=""/>
+      <w:lvlJc w:val="left"/>
+      <w:pPr>
+        <w:tabs>
+          <w:tab w:val="num" w:pos="4320"/>
+        </w:tabs>
+        <w:ind w:left="4320" w:hanging="360"/>
+      </w:pPr>
+      <w:rPr>
+        <w:rFonts w:ascii="Wingdings" w:hAnsi="Wingdings" w:hint="default"/>
+        <w:sz w:val="20"/>
+      </w:rPr>
+    </w:lvl>
+    <w:lvl w:ilvl="6" w:tentative="1">
+      <w:start w:val="1"/>
+      <w:numFmt w:val="bullet"/>
+      <w:lvlText w:val=""/>
+      <w:lvlJc w:val="left"/>
+      <w:pPr>
+        <w:tabs>
+          <w:tab w:val="num" w:pos="5040"/>
+        </w:tabs>
+        <w:ind w:left="5040" w:hanging="360"/>
+      </w:pPr>
+      <w:rPr>
+        <w:rFonts w:ascii="Wingdings" w:hAnsi="Wingdings" w:hint="default"/>
+        <w:sz w:val="20"/>
+      </w:rPr>
+    </w:lvl>
+    <w:lvl w:ilvl="7" w:tentative="1">
+      <w:start w:val="1"/>
+      <w:numFmt w:val="bullet"/>
+      <w:lvlText w:val=""/>
+      <w:lvlJc w:val="left"/>
+      <w:pPr>
+        <w:tabs>
+          <w:tab w:val="num" w:pos="5760"/>
+        </w:tabs>
+        <w:ind w:left="5760" w:hanging="360"/>
+      </w:pPr>
+      <w:rPr>
+        <w:rFonts w:ascii="Wingdings" w:hAnsi="Wingdings" w:hint="default"/>
+        <w:sz w:val="20"/>
+      </w:rPr>
+    </w:lvl>
+    <w:lvl w:ilvl="8" w:tentative="1">
+      <w:start w:val="1"/>
+      <w:numFmt w:val="bullet"/>
+      <w:lvlText w:val=""/>
+      <w:lvlJc w:val="left"/>
+      <w:pPr>
+        <w:tabs>
+          <w:tab w:val="num" w:pos="6480"/>
+        </w:tabs>
+        <w:ind w:left="6480" w:hanging="360"/>
+      </w:pPr>
+      <w:rPr>
+        <w:rFonts w:ascii="Wingdings" w:hAnsi="Wingdings" w:hint="default"/>
+        <w:sz w:val="20"/>
+      </w:rPr>
+    </w:lvl>
+  </w:abstractNum>
+  <w:abstractNum w:abstractNumId="13" w15:restartNumberingAfterBreak="0">
+    <w:nsid w:val="443015EA"/>
+    <w:multiLevelType w:val="multilevel"/>
+    <w:tmpl w:val="BDBEACAA"/>
+    <w:lvl w:ilvl="0">
+      <w:start w:val="1"/>
+      <w:numFmt w:val="bullet"/>
+      <w:lvlText w:val=""/>
+      <w:lvlJc w:val="left"/>
+      <w:pPr>
+        <w:tabs>
+          <w:tab w:val="num" w:pos="720"/>
+        </w:tabs>
+        <w:ind w:left="720" w:hanging="360"/>
+      </w:pPr>
+      <w:rPr>
+        <w:rFonts w:ascii="Symbol" w:hAnsi="Symbol" w:hint="default"/>
+        <w:sz w:val="20"/>
+      </w:rPr>
+    </w:lvl>
+    <w:lvl w:ilvl="1" w:tentative="1">
+      <w:start w:val="1"/>
+      <w:numFmt w:val="bullet"/>
+      <w:lvlText w:val="o"/>
+      <w:lvlJc w:val="left"/>
+      <w:pPr>
+        <w:tabs>
+          <w:tab w:val="num" w:pos="1440"/>
+        </w:tabs>
+        <w:ind w:left="1440" w:hanging="360"/>
+      </w:pPr>
+      <w:rPr>
+        <w:rFonts w:ascii="Courier New" w:hAnsi="Courier New" w:hint="default"/>
+        <w:sz w:val="20"/>
+      </w:rPr>
+    </w:lvl>
+    <w:lvl w:ilvl="2" w:tentative="1">
+      <w:start w:val="1"/>
+      <w:numFmt w:val="bullet"/>
+      <w:lvlText w:val=""/>
+      <w:lvlJc w:val="left"/>
+      <w:pPr>
+        <w:tabs>
+          <w:tab w:val="num" w:pos="2160"/>
+        </w:tabs>
+        <w:ind w:left="2160" w:hanging="360"/>
+      </w:pPr>
+      <w:rPr>
+        <w:rFonts w:ascii="Wingdings" w:hAnsi="Wingdings" w:hint="default"/>
+        <w:sz w:val="20"/>
+      </w:rPr>
+    </w:lvl>
+    <w:lvl w:ilvl="3" w:tentative="1">
+      <w:start w:val="1"/>
+      <w:numFmt w:val="bullet"/>
+      <w:lvlText w:val=""/>
+      <w:lvlJc w:val="left"/>
+      <w:pPr>
+        <w:tabs>
+          <w:tab w:val="num" w:pos="2880"/>
+        </w:tabs>
+        <w:ind w:left="2880" w:hanging="360"/>
+      </w:pPr>
+      <w:rPr>
+        <w:rFonts w:ascii="Wingdings" w:hAnsi="Wingdings" w:hint="default"/>
+        <w:sz w:val="20"/>
+      </w:rPr>
+    </w:lvl>
+    <w:lvl w:ilvl="4" w:tentative="1">
+      <w:start w:val="1"/>
+      <w:numFmt w:val="bullet"/>
+      <w:lvlText w:val=""/>
+      <w:lvlJc w:val="left"/>
+      <w:pPr>
+        <w:tabs>
+          <w:tab w:val="num" w:pos="3600"/>
+        </w:tabs>
+        <w:ind w:left="3600" w:hanging="360"/>
+      </w:pPr>
+      <w:rPr>
+        <w:rFonts w:ascii="Wingdings" w:hAnsi="Wingdings" w:hint="default"/>
+        <w:sz w:val="20"/>
+      </w:rPr>
+    </w:lvl>
+    <w:lvl w:ilvl="5" w:tentative="1">
+      <w:start w:val="1"/>
+      <w:numFmt w:val="bullet"/>
+      <w:lvlText w:val=""/>
+      <w:lvlJc w:val="left"/>
+      <w:pPr>
+        <w:tabs>
+          <w:tab w:val="num" w:pos="4320"/>
+        </w:tabs>
+        <w:ind w:left="4320" w:hanging="360"/>
+      </w:pPr>
+      <w:rPr>
+        <w:rFonts w:ascii="Wingdings" w:hAnsi="Wingdings" w:hint="default"/>
+        <w:sz w:val="20"/>
+      </w:rPr>
+    </w:lvl>
+    <w:lvl w:ilvl="6" w:tentative="1">
+      <w:start w:val="1"/>
+      <w:numFmt w:val="bullet"/>
+      <w:lvlText w:val=""/>
+      <w:lvlJc w:val="left"/>
+      <w:pPr>
+        <w:tabs>
+          <w:tab w:val="num" w:pos="5040"/>
+        </w:tabs>
+        <w:ind w:left="5040" w:hanging="360"/>
+      </w:pPr>
+      <w:rPr>
+        <w:rFonts w:ascii="Wingdings" w:hAnsi="Wingdings" w:hint="default"/>
+        <w:sz w:val="20"/>
+      </w:rPr>
+    </w:lvl>
+    <w:lvl w:ilvl="7" w:tentative="1">
+      <w:start w:val="1"/>
+      <w:numFmt w:val="bullet"/>
+      <w:lvlText w:val=""/>
+      <w:lvlJc w:val="left"/>
+      <w:pPr>
+        <w:tabs>
+          <w:tab w:val="num" w:pos="5760"/>
+        </w:tabs>
+        <w:ind w:left="5760" w:hanging="360"/>
+      </w:pPr>
+      <w:rPr>
+        <w:rFonts w:ascii="Wingdings" w:hAnsi="Wingdings" w:hint="default"/>
+        <w:sz w:val="20"/>
+      </w:rPr>
+    </w:lvl>
+    <w:lvl w:ilvl="8" w:tentative="1">
+      <w:start w:val="1"/>
+      <w:numFmt w:val="bullet"/>
+      <w:lvlText w:val=""/>
+      <w:lvlJc w:val="left"/>
+      <w:pPr>
+        <w:tabs>
+          <w:tab w:val="num" w:pos="6480"/>
+        </w:tabs>
+        <w:ind w:left="6480" w:hanging="360"/>
+      </w:pPr>
+      <w:rPr>
+        <w:rFonts w:ascii="Wingdings" w:hAnsi="Wingdings" w:hint="default"/>
+        <w:sz w:val="20"/>
+      </w:rPr>
+    </w:lvl>
+  </w:abstractNum>
+  <w:abstractNum w:abstractNumId="14" w15:restartNumberingAfterBreak="0">
+    <w:nsid w:val="514C1E0D"/>
+    <w:multiLevelType w:val="multilevel"/>
+    <w:tmpl w:val="3B22DB98"/>
     <w:lvl w:ilvl="0">
       <w:start w:val="1"/>
       <w:numFmt w:val="decimal"/>
@@ -8374,10 +8544,308 @@
       </w:pPr>
     </w:lvl>
   </w:abstractNum>
-  <w:abstractNum w:abstractNumId="13" w15:restartNumberingAfterBreak="0">
-    <w:nsid w:val="3F084947"/>
+  <w:abstractNum w:abstractNumId="15" w15:restartNumberingAfterBreak="0">
+    <w:nsid w:val="55D63A10"/>
     <w:multiLevelType w:val="multilevel"/>
-    <w:tmpl w:val="E9A280E6"/>
+    <w:tmpl w:val="4F7808AA"/>
+    <w:lvl w:ilvl="0">
+      <w:start w:val="1"/>
+      <w:numFmt w:val="bullet"/>
+      <w:lvlText w:val=""/>
+      <w:lvlJc w:val="left"/>
+      <w:pPr>
+        <w:tabs>
+          <w:tab w:val="num" w:pos="720"/>
+        </w:tabs>
+        <w:ind w:left="720" w:hanging="360"/>
+      </w:pPr>
+      <w:rPr>
+        <w:rFonts w:ascii="Symbol" w:hAnsi="Symbol" w:hint="default"/>
+        <w:sz w:val="20"/>
+      </w:rPr>
+    </w:lvl>
+    <w:lvl w:ilvl="1" w:tentative="1">
+      <w:start w:val="1"/>
+      <w:numFmt w:val="bullet"/>
+      <w:lvlText w:val="o"/>
+      <w:lvlJc w:val="left"/>
+      <w:pPr>
+        <w:tabs>
+          <w:tab w:val="num" w:pos="1440"/>
+        </w:tabs>
+        <w:ind w:left="1440" w:hanging="360"/>
+      </w:pPr>
+      <w:rPr>
+        <w:rFonts w:ascii="Courier New" w:hAnsi="Courier New" w:hint="default"/>
+        <w:sz w:val="20"/>
+      </w:rPr>
+    </w:lvl>
+    <w:lvl w:ilvl="2" w:tentative="1">
+      <w:start w:val="1"/>
+      <w:numFmt w:val="bullet"/>
+      <w:lvlText w:val=""/>
+      <w:lvlJc w:val="left"/>
+      <w:pPr>
+        <w:tabs>
+          <w:tab w:val="num" w:pos="2160"/>
+        </w:tabs>
+        <w:ind w:left="2160" w:hanging="360"/>
+      </w:pPr>
+      <w:rPr>
+        <w:rFonts w:ascii="Wingdings" w:hAnsi="Wingdings" w:hint="default"/>
+        <w:sz w:val="20"/>
+      </w:rPr>
+    </w:lvl>
+    <w:lvl w:ilvl="3" w:tentative="1">
+      <w:start w:val="1"/>
+      <w:numFmt w:val="bullet"/>
+      <w:lvlText w:val=""/>
+      <w:lvlJc w:val="left"/>
+      <w:pPr>
+        <w:tabs>
+          <w:tab w:val="num" w:pos="2880"/>
+        </w:tabs>
+        <w:ind w:left="2880" w:hanging="360"/>
+      </w:pPr>
+      <w:rPr>
+        <w:rFonts w:ascii="Wingdings" w:hAnsi="Wingdings" w:hint="default"/>
+        <w:sz w:val="20"/>
+      </w:rPr>
+    </w:lvl>
+    <w:lvl w:ilvl="4" w:tentative="1">
+      <w:start w:val="1"/>
+      <w:numFmt w:val="bullet"/>
+      <w:lvlText w:val=""/>
+      <w:lvlJc w:val="left"/>
+      <w:pPr>
+        <w:tabs>
+          <w:tab w:val="num" w:pos="3600"/>
+        </w:tabs>
+        <w:ind w:left="3600" w:hanging="360"/>
+      </w:pPr>
+      <w:rPr>
+        <w:rFonts w:ascii="Wingdings" w:hAnsi="Wingdings" w:hint="default"/>
+        <w:sz w:val="20"/>
+      </w:rPr>
+    </w:lvl>
+    <w:lvl w:ilvl="5" w:tentative="1">
+      <w:start w:val="1"/>
+      <w:numFmt w:val="bullet"/>
+      <w:lvlText w:val=""/>
+      <w:lvlJc w:val="left"/>
+      <w:pPr>
+        <w:tabs>
+          <w:tab w:val="num" w:pos="4320"/>
+        </w:tabs>
+        <w:ind w:left="4320" w:hanging="360"/>
+      </w:pPr>
+      <w:rPr>
+        <w:rFonts w:ascii="Wingdings" w:hAnsi="Wingdings" w:hint="default"/>
+        <w:sz w:val="20"/>
+      </w:rPr>
+    </w:lvl>
+    <w:lvl w:ilvl="6" w:tentative="1">
+      <w:start w:val="1"/>
+      <w:numFmt w:val="bullet"/>
+      <w:lvlText w:val=""/>
+      <w:lvlJc w:val="left"/>
+      <w:pPr>
+        <w:tabs>
+          <w:tab w:val="num" w:pos="5040"/>
+        </w:tabs>
+        <w:ind w:left="5040" w:hanging="360"/>
+      </w:pPr>
+      <w:rPr>
+        <w:rFonts w:ascii="Wingdings" w:hAnsi="Wingdings" w:hint="default"/>
+        <w:sz w:val="20"/>
+      </w:rPr>
+    </w:lvl>
+    <w:lvl w:ilvl="7" w:tentative="1">
+      <w:start w:val="1"/>
+      <w:numFmt w:val="bullet"/>
+      <w:lvlText w:val=""/>
+      <w:lvlJc w:val="left"/>
+      <w:pPr>
+        <w:tabs>
+          <w:tab w:val="num" w:pos="5760"/>
+        </w:tabs>
+        <w:ind w:left="5760" w:hanging="360"/>
+      </w:pPr>
+      <w:rPr>
+        <w:rFonts w:ascii="Wingdings" w:hAnsi="Wingdings" w:hint="default"/>
+        <w:sz w:val="20"/>
+      </w:rPr>
+    </w:lvl>
+    <w:lvl w:ilvl="8" w:tentative="1">
+      <w:start w:val="1"/>
+      <w:numFmt w:val="bullet"/>
+      <w:lvlText w:val=""/>
+      <w:lvlJc w:val="left"/>
+      <w:pPr>
+        <w:tabs>
+          <w:tab w:val="num" w:pos="6480"/>
+        </w:tabs>
+        <w:ind w:left="6480" w:hanging="360"/>
+      </w:pPr>
+      <w:rPr>
+        <w:rFonts w:ascii="Wingdings" w:hAnsi="Wingdings" w:hint="default"/>
+        <w:sz w:val="20"/>
+      </w:rPr>
+    </w:lvl>
+  </w:abstractNum>
+  <w:abstractNum w:abstractNumId="16" w15:restartNumberingAfterBreak="0">
+    <w:nsid w:val="5BFD32B9"/>
+    <w:multiLevelType w:val="multilevel"/>
+    <w:tmpl w:val="43EC1E1C"/>
+    <w:lvl w:ilvl="0">
+      <w:start w:val="1"/>
+      <w:numFmt w:val="bullet"/>
+      <w:lvlText w:val=""/>
+      <w:lvlJc w:val="left"/>
+      <w:pPr>
+        <w:tabs>
+          <w:tab w:val="num" w:pos="720"/>
+        </w:tabs>
+        <w:ind w:left="720" w:hanging="360"/>
+      </w:pPr>
+      <w:rPr>
+        <w:rFonts w:ascii="Symbol" w:hAnsi="Symbol" w:hint="default"/>
+        <w:sz w:val="20"/>
+      </w:rPr>
+    </w:lvl>
+    <w:lvl w:ilvl="1" w:tentative="1">
+      <w:start w:val="1"/>
+      <w:numFmt w:val="bullet"/>
+      <w:lvlText w:val="o"/>
+      <w:lvlJc w:val="left"/>
+      <w:pPr>
+        <w:tabs>
+          <w:tab w:val="num" w:pos="1440"/>
+        </w:tabs>
+        <w:ind w:left="1440" w:hanging="360"/>
+      </w:pPr>
+      <w:rPr>
+        <w:rFonts w:ascii="Courier New" w:hAnsi="Courier New" w:hint="default"/>
+        <w:sz w:val="20"/>
+      </w:rPr>
+    </w:lvl>
+    <w:lvl w:ilvl="2" w:tentative="1">
+      <w:start w:val="1"/>
+      <w:numFmt w:val="bullet"/>
+      <w:lvlText w:val=""/>
+      <w:lvlJc w:val="left"/>
+      <w:pPr>
+        <w:tabs>
+          <w:tab w:val="num" w:pos="2160"/>
+        </w:tabs>
+        <w:ind w:left="2160" w:hanging="360"/>
+      </w:pPr>
+      <w:rPr>
+        <w:rFonts w:ascii="Wingdings" w:hAnsi="Wingdings" w:hint="default"/>
+        <w:sz w:val="20"/>
+      </w:rPr>
+    </w:lvl>
+    <w:lvl w:ilvl="3" w:tentative="1">
+      <w:start w:val="1"/>
+      <w:numFmt w:val="bullet"/>
+      <w:lvlText w:val=""/>
+      <w:lvlJc w:val="left"/>
+      <w:pPr>
+        <w:tabs>
+          <w:tab w:val="num" w:pos="2880"/>
+        </w:tabs>
+        <w:ind w:left="2880" w:hanging="360"/>
+      </w:pPr>
+      <w:rPr>
+        <w:rFonts w:ascii="Wingdings" w:hAnsi="Wingdings" w:hint="default"/>
+        <w:sz w:val="20"/>
+      </w:rPr>
+    </w:lvl>
+    <w:lvl w:ilvl="4" w:tentative="1">
+      <w:start w:val="1"/>
+      <w:numFmt w:val="bullet"/>
+      <w:lvlText w:val=""/>
+      <w:lvlJc w:val="left"/>
+      <w:pPr>
+        <w:tabs>
+          <w:tab w:val="num" w:pos="3600"/>
+        </w:tabs>
+        <w:ind w:left="3600" w:hanging="360"/>
+      </w:pPr>
+      <w:rPr>
+        <w:rFonts w:ascii="Wingdings" w:hAnsi="Wingdings" w:hint="default"/>
+        <w:sz w:val="20"/>
+      </w:rPr>
+    </w:lvl>
+    <w:lvl w:ilvl="5" w:tentative="1">
+      <w:start w:val="1"/>
+      <w:numFmt w:val="bullet"/>
+      <w:lvlText w:val=""/>
+      <w:lvlJc w:val="left"/>
+      <w:pPr>
+        <w:tabs>
+          <w:tab w:val="num" w:pos="4320"/>
+        </w:tabs>
+        <w:ind w:left="4320" w:hanging="360"/>
+      </w:pPr>
+      <w:rPr>
+        <w:rFonts w:ascii="Wingdings" w:hAnsi="Wingdings" w:hint="default"/>
+        <w:sz w:val="20"/>
+      </w:rPr>
+    </w:lvl>
+    <w:lvl w:ilvl="6" w:tentative="1">
+      <w:start w:val="1"/>
+      <w:numFmt w:val="bullet"/>
+      <w:lvlText w:val=""/>
+      <w:lvlJc w:val="left"/>
+      <w:pPr>
+        <w:tabs>
+          <w:tab w:val="num" w:pos="5040"/>
+        </w:tabs>
+        <w:ind w:left="5040" w:hanging="360"/>
+      </w:pPr>
+      <w:rPr>
+        <w:rFonts w:ascii="Wingdings" w:hAnsi="Wingdings" w:hint="default"/>
+        <w:sz w:val="20"/>
+      </w:rPr>
+    </w:lvl>
+    <w:lvl w:ilvl="7" w:tentative="1">
+      <w:start w:val="1"/>
+      <w:numFmt w:val="bullet"/>
+      <w:lvlText w:val=""/>
+      <w:lvlJc w:val="left"/>
+      <w:pPr>
+        <w:tabs>
+          <w:tab w:val="num" w:pos="5760"/>
+        </w:tabs>
+        <w:ind w:left="5760" w:hanging="360"/>
+      </w:pPr>
+      <w:rPr>
+        <w:rFonts w:ascii="Wingdings" w:hAnsi="Wingdings" w:hint="default"/>
+        <w:sz w:val="20"/>
+      </w:rPr>
+    </w:lvl>
+    <w:lvl w:ilvl="8" w:tentative="1">
+      <w:start w:val="1"/>
+      <w:numFmt w:val="bullet"/>
+      <w:lvlText w:val=""/>
+      <w:lvlJc w:val="left"/>
+      <w:pPr>
+        <w:tabs>
+          <w:tab w:val="num" w:pos="6480"/>
+        </w:tabs>
+        <w:ind w:left="6480" w:hanging="360"/>
+      </w:pPr>
+      <w:rPr>
+        <w:rFonts w:ascii="Wingdings" w:hAnsi="Wingdings" w:hint="default"/>
+        <w:sz w:val="20"/>
+      </w:rPr>
+    </w:lvl>
+  </w:abstractNum>
+  <w:abstractNum w:abstractNumId="17" w15:restartNumberingAfterBreak="0">
+    <w:nsid w:val="668B29A1"/>
+    <w:multiLevelType w:val="multilevel"/>
+    <w:tmpl w:val="945CFD9C"/>
     <w:lvl w:ilvl="0">
       <w:start w:val="1"/>
       <w:numFmt w:val="decimal"/>
@@ -8491,10 +8959,10 @@
       </w:pPr>
     </w:lvl>
   </w:abstractNum>
-  <w:abstractNum w:abstractNumId="14" w15:restartNumberingAfterBreak="0">
-    <w:nsid w:val="41FF131A"/>
+  <w:abstractNum w:abstractNumId="18" w15:restartNumberingAfterBreak="0">
+    <w:nsid w:val="688C0339"/>
     <w:multiLevelType w:val="multilevel"/>
-    <w:tmpl w:val="DB1E861A"/>
+    <w:tmpl w:val="7E006030"/>
     <w:lvl w:ilvl="0">
       <w:start w:val="1"/>
       <w:numFmt w:val="bullet"/>
@@ -8638,548 +9106,16 @@
         <w:rFonts w:ascii="Wingdings" w:hAnsi="Wingdings" w:hint="default"/>
         <w:sz w:val="20"/>
       </w:rPr>
-    </w:lvl>
-  </w:abstractNum>
-  <w:abstractNum w:abstractNumId="15" w15:restartNumberingAfterBreak="0">
-    <w:nsid w:val="46C41BAC"/>
-    <w:multiLevelType w:val="multilevel"/>
-    <w:tmpl w:val="79FAD3E0"/>
-    <w:lvl w:ilvl="0">
-      <w:start w:val="1"/>
-      <w:numFmt w:val="bullet"/>
-      <w:lvlText w:val=""/>
-      <w:lvlJc w:val="left"/>
-      <w:pPr>
-        <w:tabs>
-          <w:tab w:val="num" w:pos="720"/>
-        </w:tabs>
-        <w:ind w:left="720" w:hanging="360"/>
-      </w:pPr>
-      <w:rPr>
-        <w:rFonts w:ascii="Symbol" w:hAnsi="Symbol" w:hint="default"/>
-        <w:sz w:val="20"/>
-      </w:rPr>
-    </w:lvl>
-    <w:lvl w:ilvl="1" w:tentative="1">
-      <w:start w:val="1"/>
-      <w:numFmt w:val="bullet"/>
-      <w:lvlText w:val="o"/>
-      <w:lvlJc w:val="left"/>
-      <w:pPr>
-        <w:tabs>
-          <w:tab w:val="num" w:pos="1440"/>
-        </w:tabs>
-        <w:ind w:left="1440" w:hanging="360"/>
-      </w:pPr>
-      <w:rPr>
-        <w:rFonts w:ascii="Courier New" w:hAnsi="Courier New" w:hint="default"/>
-        <w:sz w:val="20"/>
-      </w:rPr>
-    </w:lvl>
-    <w:lvl w:ilvl="2" w:tentative="1">
-      <w:start w:val="1"/>
-      <w:numFmt w:val="bullet"/>
-      <w:lvlText w:val=""/>
-      <w:lvlJc w:val="left"/>
-      <w:pPr>
-        <w:tabs>
-          <w:tab w:val="num" w:pos="2160"/>
-        </w:tabs>
-        <w:ind w:left="2160" w:hanging="360"/>
-      </w:pPr>
-      <w:rPr>
-        <w:rFonts w:ascii="Wingdings" w:hAnsi="Wingdings" w:hint="default"/>
-        <w:sz w:val="20"/>
-      </w:rPr>
-    </w:lvl>
-    <w:lvl w:ilvl="3" w:tentative="1">
-      <w:start w:val="1"/>
-      <w:numFmt w:val="bullet"/>
-      <w:lvlText w:val=""/>
-      <w:lvlJc w:val="left"/>
-      <w:pPr>
-        <w:tabs>
-          <w:tab w:val="num" w:pos="2880"/>
-        </w:tabs>
-        <w:ind w:left="2880" w:hanging="360"/>
-      </w:pPr>
-      <w:rPr>
-        <w:rFonts w:ascii="Wingdings" w:hAnsi="Wingdings" w:hint="default"/>
-        <w:sz w:val="20"/>
-      </w:rPr>
-    </w:lvl>
-    <w:lvl w:ilvl="4" w:tentative="1">
-      <w:start w:val="1"/>
-      <w:numFmt w:val="bullet"/>
-      <w:lvlText w:val=""/>
-      <w:lvlJc w:val="left"/>
-      <w:pPr>
-        <w:tabs>
-          <w:tab w:val="num" w:pos="3600"/>
-        </w:tabs>
-        <w:ind w:left="3600" w:hanging="360"/>
-      </w:pPr>
-      <w:rPr>
-        <w:rFonts w:ascii="Wingdings" w:hAnsi="Wingdings" w:hint="default"/>
-        <w:sz w:val="20"/>
-      </w:rPr>
-    </w:lvl>
-    <w:lvl w:ilvl="5" w:tentative="1">
-      <w:start w:val="1"/>
-      <w:numFmt w:val="bullet"/>
-      <w:lvlText w:val=""/>
-      <w:lvlJc w:val="left"/>
-      <w:pPr>
-        <w:tabs>
-          <w:tab w:val="num" w:pos="4320"/>
-        </w:tabs>
-        <w:ind w:left="4320" w:hanging="360"/>
-      </w:pPr>
-      <w:rPr>
-        <w:rFonts w:ascii="Wingdings" w:hAnsi="Wingdings" w:hint="default"/>
-        <w:sz w:val="20"/>
-      </w:rPr>
-    </w:lvl>
-    <w:lvl w:ilvl="6" w:tentative="1">
-      <w:start w:val="1"/>
-      <w:numFmt w:val="bullet"/>
-      <w:lvlText w:val=""/>
-      <w:lvlJc w:val="left"/>
-      <w:pPr>
-        <w:tabs>
-          <w:tab w:val="num" w:pos="5040"/>
-        </w:tabs>
-        <w:ind w:left="5040" w:hanging="360"/>
-      </w:pPr>
-      <w:rPr>
-        <w:rFonts w:ascii="Wingdings" w:hAnsi="Wingdings" w:hint="default"/>
-        <w:sz w:val="20"/>
-      </w:rPr>
-    </w:lvl>
-    <w:lvl w:ilvl="7" w:tentative="1">
-      <w:start w:val="1"/>
-      <w:numFmt w:val="bullet"/>
-      <w:lvlText w:val=""/>
-      <w:lvlJc w:val="left"/>
-      <w:pPr>
-        <w:tabs>
-          <w:tab w:val="num" w:pos="5760"/>
-        </w:tabs>
-        <w:ind w:left="5760" w:hanging="360"/>
-      </w:pPr>
-      <w:rPr>
-        <w:rFonts w:ascii="Wingdings" w:hAnsi="Wingdings" w:hint="default"/>
-        <w:sz w:val="20"/>
-      </w:rPr>
-    </w:lvl>
-    <w:lvl w:ilvl="8" w:tentative="1">
-      <w:start w:val="1"/>
-      <w:numFmt w:val="bullet"/>
-      <w:lvlText w:val=""/>
-      <w:lvlJc w:val="left"/>
-      <w:pPr>
-        <w:tabs>
-          <w:tab w:val="num" w:pos="6480"/>
-        </w:tabs>
-        <w:ind w:left="6480" w:hanging="360"/>
-      </w:pPr>
-      <w:rPr>
-        <w:rFonts w:ascii="Wingdings" w:hAnsi="Wingdings" w:hint="default"/>
-        <w:sz w:val="20"/>
-      </w:rPr>
-    </w:lvl>
-  </w:abstractNum>
-  <w:abstractNum w:abstractNumId="16" w15:restartNumberingAfterBreak="0">
-    <w:nsid w:val="69B10872"/>
-    <w:multiLevelType w:val="multilevel"/>
-    <w:tmpl w:val="4566DEE6"/>
-    <w:lvl w:ilvl="0">
-      <w:start w:val="1"/>
-      <w:numFmt w:val="bullet"/>
-      <w:lvlText w:val=""/>
-      <w:lvlJc w:val="left"/>
-      <w:pPr>
-        <w:tabs>
-          <w:tab w:val="num" w:pos="720"/>
-        </w:tabs>
-        <w:ind w:left="720" w:hanging="360"/>
-      </w:pPr>
-      <w:rPr>
-        <w:rFonts w:ascii="Symbol" w:hAnsi="Symbol" w:hint="default"/>
-        <w:sz w:val="20"/>
-      </w:rPr>
-    </w:lvl>
-    <w:lvl w:ilvl="1" w:tentative="1">
-      <w:start w:val="1"/>
-      <w:numFmt w:val="bullet"/>
-      <w:lvlText w:val="o"/>
-      <w:lvlJc w:val="left"/>
-      <w:pPr>
-        <w:tabs>
-          <w:tab w:val="num" w:pos="1440"/>
-        </w:tabs>
-        <w:ind w:left="1440" w:hanging="360"/>
-      </w:pPr>
-      <w:rPr>
-        <w:rFonts w:ascii="Courier New" w:hAnsi="Courier New" w:hint="default"/>
-        <w:sz w:val="20"/>
-      </w:rPr>
-    </w:lvl>
-    <w:lvl w:ilvl="2" w:tentative="1">
-      <w:start w:val="1"/>
-      <w:numFmt w:val="bullet"/>
-      <w:lvlText w:val=""/>
-      <w:lvlJc w:val="left"/>
-      <w:pPr>
-        <w:tabs>
-          <w:tab w:val="num" w:pos="2160"/>
-        </w:tabs>
-        <w:ind w:left="2160" w:hanging="360"/>
-      </w:pPr>
-      <w:rPr>
-        <w:rFonts w:ascii="Wingdings" w:hAnsi="Wingdings" w:hint="default"/>
-        <w:sz w:val="20"/>
-      </w:rPr>
-    </w:lvl>
-    <w:lvl w:ilvl="3" w:tentative="1">
-      <w:start w:val="1"/>
-      <w:numFmt w:val="bullet"/>
-      <w:lvlText w:val=""/>
-      <w:lvlJc w:val="left"/>
-      <w:pPr>
-        <w:tabs>
-          <w:tab w:val="num" w:pos="2880"/>
-        </w:tabs>
-        <w:ind w:left="2880" w:hanging="360"/>
-      </w:pPr>
-      <w:rPr>
-        <w:rFonts w:ascii="Wingdings" w:hAnsi="Wingdings" w:hint="default"/>
-        <w:sz w:val="20"/>
-      </w:rPr>
-    </w:lvl>
-    <w:lvl w:ilvl="4" w:tentative="1">
-      <w:start w:val="1"/>
-      <w:numFmt w:val="bullet"/>
-      <w:lvlText w:val=""/>
-      <w:lvlJc w:val="left"/>
-      <w:pPr>
-        <w:tabs>
-          <w:tab w:val="num" w:pos="3600"/>
-        </w:tabs>
-        <w:ind w:left="3600" w:hanging="360"/>
-      </w:pPr>
-      <w:rPr>
-        <w:rFonts w:ascii="Wingdings" w:hAnsi="Wingdings" w:hint="default"/>
-        <w:sz w:val="20"/>
-      </w:rPr>
-    </w:lvl>
-    <w:lvl w:ilvl="5" w:tentative="1">
-      <w:start w:val="1"/>
-      <w:numFmt w:val="bullet"/>
-      <w:lvlText w:val=""/>
-      <w:lvlJc w:val="left"/>
-      <w:pPr>
-        <w:tabs>
-          <w:tab w:val="num" w:pos="4320"/>
-        </w:tabs>
-        <w:ind w:left="4320" w:hanging="360"/>
-      </w:pPr>
-      <w:rPr>
-        <w:rFonts w:ascii="Wingdings" w:hAnsi="Wingdings" w:hint="default"/>
-        <w:sz w:val="20"/>
-      </w:rPr>
-    </w:lvl>
-    <w:lvl w:ilvl="6" w:tentative="1">
-      <w:start w:val="1"/>
-      <w:numFmt w:val="bullet"/>
-      <w:lvlText w:val=""/>
-      <w:lvlJc w:val="left"/>
-      <w:pPr>
-        <w:tabs>
-          <w:tab w:val="num" w:pos="5040"/>
-        </w:tabs>
-        <w:ind w:left="5040" w:hanging="360"/>
-      </w:pPr>
-      <w:rPr>
-        <w:rFonts w:ascii="Wingdings" w:hAnsi="Wingdings" w:hint="default"/>
-        <w:sz w:val="20"/>
-      </w:rPr>
-    </w:lvl>
-    <w:lvl w:ilvl="7" w:tentative="1">
-      <w:start w:val="1"/>
-      <w:numFmt w:val="bullet"/>
-      <w:lvlText w:val=""/>
-      <w:lvlJc w:val="left"/>
-      <w:pPr>
-        <w:tabs>
-          <w:tab w:val="num" w:pos="5760"/>
-        </w:tabs>
-        <w:ind w:left="5760" w:hanging="360"/>
-      </w:pPr>
-      <w:rPr>
-        <w:rFonts w:ascii="Wingdings" w:hAnsi="Wingdings" w:hint="default"/>
-        <w:sz w:val="20"/>
-      </w:rPr>
-    </w:lvl>
-    <w:lvl w:ilvl="8" w:tentative="1">
-      <w:start w:val="1"/>
-      <w:numFmt w:val="bullet"/>
-      <w:lvlText w:val=""/>
-      <w:lvlJc w:val="left"/>
-      <w:pPr>
-        <w:tabs>
-          <w:tab w:val="num" w:pos="6480"/>
-        </w:tabs>
-        <w:ind w:left="6480" w:hanging="360"/>
-      </w:pPr>
-      <w:rPr>
-        <w:rFonts w:ascii="Wingdings" w:hAnsi="Wingdings" w:hint="default"/>
-        <w:sz w:val="20"/>
-      </w:rPr>
-    </w:lvl>
-  </w:abstractNum>
-  <w:abstractNum w:abstractNumId="17" w15:restartNumberingAfterBreak="0">
-    <w:nsid w:val="6BB8445B"/>
-    <w:multiLevelType w:val="multilevel"/>
-    <w:tmpl w:val="15C6C1B0"/>
-    <w:lvl w:ilvl="0">
-      <w:start w:val="1"/>
-      <w:numFmt w:val="decimal"/>
-      <w:lvlText w:val="%1."/>
-      <w:lvlJc w:val="left"/>
-      <w:pPr>
-        <w:tabs>
-          <w:tab w:val="num" w:pos="720"/>
-        </w:tabs>
-        <w:ind w:left="720" w:hanging="360"/>
-      </w:pPr>
-    </w:lvl>
-    <w:lvl w:ilvl="1">
-      <w:start w:val="1"/>
-      <w:numFmt w:val="bullet"/>
-      <w:lvlText w:val="o"/>
-      <w:lvlJc w:val="left"/>
-      <w:pPr>
-        <w:tabs>
-          <w:tab w:val="num" w:pos="1440"/>
-        </w:tabs>
-        <w:ind w:left="1440" w:hanging="360"/>
-      </w:pPr>
-      <w:rPr>
-        <w:rFonts w:ascii="Courier New" w:hAnsi="Courier New" w:hint="default"/>
-        <w:sz w:val="20"/>
-      </w:rPr>
-    </w:lvl>
-    <w:lvl w:ilvl="2" w:tentative="1">
-      <w:start w:val="1"/>
-      <w:numFmt w:val="decimal"/>
-      <w:lvlText w:val="%3."/>
-      <w:lvlJc w:val="left"/>
-      <w:pPr>
-        <w:tabs>
-          <w:tab w:val="num" w:pos="2160"/>
-        </w:tabs>
-        <w:ind w:left="2160" w:hanging="360"/>
-      </w:pPr>
-    </w:lvl>
-    <w:lvl w:ilvl="3" w:tentative="1">
-      <w:start w:val="1"/>
-      <w:numFmt w:val="decimal"/>
-      <w:lvlText w:val="%4."/>
-      <w:lvlJc w:val="left"/>
-      <w:pPr>
-        <w:tabs>
-          <w:tab w:val="num" w:pos="2880"/>
-        </w:tabs>
-        <w:ind w:left="2880" w:hanging="360"/>
-      </w:pPr>
-    </w:lvl>
-    <w:lvl w:ilvl="4" w:tentative="1">
-      <w:start w:val="1"/>
-      <w:numFmt w:val="decimal"/>
-      <w:lvlText w:val="%5."/>
-      <w:lvlJc w:val="left"/>
-      <w:pPr>
-        <w:tabs>
-          <w:tab w:val="num" w:pos="3600"/>
-        </w:tabs>
-        <w:ind w:left="3600" w:hanging="360"/>
-      </w:pPr>
-    </w:lvl>
-    <w:lvl w:ilvl="5" w:tentative="1">
-      <w:start w:val="1"/>
-      <w:numFmt w:val="decimal"/>
-      <w:lvlText w:val="%6."/>
-      <w:lvlJc w:val="left"/>
-      <w:pPr>
-        <w:tabs>
-          <w:tab w:val="num" w:pos="4320"/>
-        </w:tabs>
-        <w:ind w:left="4320" w:hanging="360"/>
-      </w:pPr>
-    </w:lvl>
-    <w:lvl w:ilvl="6" w:tentative="1">
-      <w:start w:val="1"/>
-      <w:numFmt w:val="decimal"/>
-      <w:lvlText w:val="%7."/>
-      <w:lvlJc w:val="left"/>
-      <w:pPr>
-        <w:tabs>
-          <w:tab w:val="num" w:pos="5040"/>
-        </w:tabs>
-        <w:ind w:left="5040" w:hanging="360"/>
-      </w:pPr>
-    </w:lvl>
-    <w:lvl w:ilvl="7" w:tentative="1">
-      <w:start w:val="1"/>
-      <w:numFmt w:val="decimal"/>
-      <w:lvlText w:val="%8."/>
-      <w:lvlJc w:val="left"/>
-      <w:pPr>
-        <w:tabs>
-          <w:tab w:val="num" w:pos="5760"/>
-        </w:tabs>
-        <w:ind w:left="5760" w:hanging="360"/>
-      </w:pPr>
-    </w:lvl>
-    <w:lvl w:ilvl="8" w:tentative="1">
-      <w:start w:val="1"/>
-      <w:numFmt w:val="decimal"/>
-      <w:lvlText w:val="%9."/>
-      <w:lvlJc w:val="left"/>
-      <w:pPr>
-        <w:tabs>
-          <w:tab w:val="num" w:pos="6480"/>
-        </w:tabs>
-        <w:ind w:left="6480" w:hanging="360"/>
-      </w:pPr>
-    </w:lvl>
-  </w:abstractNum>
-  <w:abstractNum w:abstractNumId="18" w15:restartNumberingAfterBreak="0">
-    <w:nsid w:val="6CD03552"/>
-    <w:multiLevelType w:val="multilevel"/>
-    <w:tmpl w:val="892CDCAC"/>
-    <w:lvl w:ilvl="0">
-      <w:start w:val="1"/>
-      <w:numFmt w:val="decimal"/>
-      <w:lvlText w:val="%1."/>
-      <w:lvlJc w:val="left"/>
-      <w:pPr>
-        <w:tabs>
-          <w:tab w:val="num" w:pos="720"/>
-        </w:tabs>
-        <w:ind w:left="720" w:hanging="360"/>
-      </w:pPr>
-    </w:lvl>
-    <w:lvl w:ilvl="1">
-      <w:start w:val="1"/>
-      <w:numFmt w:val="bullet"/>
-      <w:lvlText w:val="o"/>
-      <w:lvlJc w:val="left"/>
-      <w:pPr>
-        <w:tabs>
-          <w:tab w:val="num" w:pos="1440"/>
-        </w:tabs>
-        <w:ind w:left="1440" w:hanging="360"/>
-      </w:pPr>
-      <w:rPr>
-        <w:rFonts w:ascii="Courier New" w:hAnsi="Courier New" w:hint="default"/>
-        <w:sz w:val="20"/>
-      </w:rPr>
-    </w:lvl>
-    <w:lvl w:ilvl="2" w:tentative="1">
-      <w:start w:val="1"/>
-      <w:numFmt w:val="decimal"/>
-      <w:lvlText w:val="%3."/>
-      <w:lvlJc w:val="left"/>
-      <w:pPr>
-        <w:tabs>
-          <w:tab w:val="num" w:pos="2160"/>
-        </w:tabs>
-        <w:ind w:left="2160" w:hanging="360"/>
-      </w:pPr>
-    </w:lvl>
-    <w:lvl w:ilvl="3" w:tentative="1">
-      <w:start w:val="1"/>
-      <w:numFmt w:val="decimal"/>
-      <w:lvlText w:val="%4."/>
-      <w:lvlJc w:val="left"/>
-      <w:pPr>
-        <w:tabs>
-          <w:tab w:val="num" w:pos="2880"/>
-        </w:tabs>
-        <w:ind w:left="2880" w:hanging="360"/>
-      </w:pPr>
-    </w:lvl>
-    <w:lvl w:ilvl="4" w:tentative="1">
-      <w:start w:val="1"/>
-      <w:numFmt w:val="decimal"/>
-      <w:lvlText w:val="%5."/>
-      <w:lvlJc w:val="left"/>
-      <w:pPr>
-        <w:tabs>
-          <w:tab w:val="num" w:pos="3600"/>
-        </w:tabs>
-        <w:ind w:left="3600" w:hanging="360"/>
-      </w:pPr>
-    </w:lvl>
-    <w:lvl w:ilvl="5" w:tentative="1">
-      <w:start w:val="1"/>
-      <w:numFmt w:val="decimal"/>
-      <w:lvlText w:val="%6."/>
-      <w:lvlJc w:val="left"/>
-      <w:pPr>
-        <w:tabs>
-          <w:tab w:val="num" w:pos="4320"/>
-        </w:tabs>
-        <w:ind w:left="4320" w:hanging="360"/>
-      </w:pPr>
-    </w:lvl>
-    <w:lvl w:ilvl="6" w:tentative="1">
-      <w:start w:val="1"/>
-      <w:numFmt w:val="decimal"/>
-      <w:lvlText w:val="%7."/>
-      <w:lvlJc w:val="left"/>
-      <w:pPr>
-        <w:tabs>
-          <w:tab w:val="num" w:pos="5040"/>
-        </w:tabs>
-        <w:ind w:left="5040" w:hanging="360"/>
-      </w:pPr>
-    </w:lvl>
-    <w:lvl w:ilvl="7" w:tentative="1">
-      <w:start w:val="1"/>
-      <w:numFmt w:val="decimal"/>
-      <w:lvlText w:val="%8."/>
-      <w:lvlJc w:val="left"/>
-      <w:pPr>
-        <w:tabs>
-          <w:tab w:val="num" w:pos="5760"/>
-        </w:tabs>
-        <w:ind w:left="5760" w:hanging="360"/>
-      </w:pPr>
-    </w:lvl>
-    <w:lvl w:ilvl="8" w:tentative="1">
-      <w:start w:val="1"/>
-      <w:numFmt w:val="decimal"/>
-      <w:lvlText w:val="%9."/>
-      <w:lvlJc w:val="left"/>
-      <w:pPr>
-        <w:tabs>
-          <w:tab w:val="num" w:pos="6480"/>
-        </w:tabs>
-        <w:ind w:left="6480" w:hanging="360"/>
-      </w:pPr>
     </w:lvl>
   </w:abstractNum>
   <w:abstractNum w:abstractNumId="19" w15:restartNumberingAfterBreak="0">
-    <w:nsid w:val="6E835D07"/>
+    <w:nsid w:val="6D7B55F2"/>
     <w:multiLevelType w:val="multilevel"/>
-    <w:tmpl w:val="276A6106"/>
+    <w:tmpl w:val="D6C49EF8"/>
     <w:lvl w:ilvl="0">
       <w:start w:val="1"/>
-      <w:numFmt w:val="decimal"/>
-      <w:lvlText w:val="%1."/>
+      <w:numFmt w:val="bullet"/>
+      <w:lvlText w:val=""/>
       <w:lvlJc w:val="left"/>
       <w:pPr>
         <w:tabs>
@@ -9187,8 +9123,12 @@
         </w:tabs>
         <w:ind w:left="720" w:hanging="360"/>
       </w:pPr>
-    </w:lvl>
-    <w:lvl w:ilvl="1">
+      <w:rPr>
+        <w:rFonts w:ascii="Symbol" w:hAnsi="Symbol" w:hint="default"/>
+        <w:sz w:val="20"/>
+      </w:rPr>
+    </w:lvl>
+    <w:lvl w:ilvl="1" w:tentative="1">
       <w:start w:val="1"/>
       <w:numFmt w:val="bullet"/>
       <w:lvlText w:val="o"/>
@@ -9206,8 +9146,8 @@
     </w:lvl>
     <w:lvl w:ilvl="2" w:tentative="1">
       <w:start w:val="1"/>
-      <w:numFmt w:val="decimal"/>
-      <w:lvlText w:val="%3."/>
+      <w:numFmt w:val="bullet"/>
+      <w:lvlText w:val=""/>
       <w:lvlJc w:val="left"/>
       <w:pPr>
         <w:tabs>
@@ -9215,11 +9155,15 @@
         </w:tabs>
         <w:ind w:left="2160" w:hanging="360"/>
       </w:pPr>
+      <w:rPr>
+        <w:rFonts w:ascii="Wingdings" w:hAnsi="Wingdings" w:hint="default"/>
+        <w:sz w:val="20"/>
+      </w:rPr>
     </w:lvl>
     <w:lvl w:ilvl="3" w:tentative="1">
       <w:start w:val="1"/>
-      <w:numFmt w:val="decimal"/>
-      <w:lvlText w:val="%4."/>
+      <w:numFmt w:val="bullet"/>
+      <w:lvlText w:val=""/>
       <w:lvlJc w:val="left"/>
       <w:pPr>
         <w:tabs>
@@ -9227,11 +9171,15 @@
         </w:tabs>
         <w:ind w:left="2880" w:hanging="360"/>
       </w:pPr>
+      <w:rPr>
+        <w:rFonts w:ascii="Wingdings" w:hAnsi="Wingdings" w:hint="default"/>
+        <w:sz w:val="20"/>
+      </w:rPr>
     </w:lvl>
     <w:lvl w:ilvl="4" w:tentative="1">
       <w:start w:val="1"/>
-      <w:numFmt w:val="decimal"/>
-      <w:lvlText w:val="%5."/>
+      <w:numFmt w:val="bullet"/>
+      <w:lvlText w:val=""/>
       <w:lvlJc w:val="left"/>
       <w:pPr>
         <w:tabs>
@@ -9239,11 +9187,15 @@
         </w:tabs>
         <w:ind w:left="3600" w:hanging="360"/>
       </w:pPr>
+      <w:rPr>
+        <w:rFonts w:ascii="Wingdings" w:hAnsi="Wingdings" w:hint="default"/>
+        <w:sz w:val="20"/>
+      </w:rPr>
     </w:lvl>
     <w:lvl w:ilvl="5" w:tentative="1">
       <w:start w:val="1"/>
-      <w:numFmt w:val="decimal"/>
-      <w:lvlText w:val="%6."/>
+      <w:numFmt w:val="bullet"/>
+      <w:lvlText w:val=""/>
       <w:lvlJc w:val="left"/>
       <w:pPr>
         <w:tabs>
@@ -9251,11 +9203,15 @@
         </w:tabs>
         <w:ind w:left="4320" w:hanging="360"/>
       </w:pPr>
+      <w:rPr>
+        <w:rFonts w:ascii="Wingdings" w:hAnsi="Wingdings" w:hint="default"/>
+        <w:sz w:val="20"/>
+      </w:rPr>
     </w:lvl>
     <w:lvl w:ilvl="6" w:tentative="1">
       <w:start w:val="1"/>
-      <w:numFmt w:val="decimal"/>
-      <w:lvlText w:val="%7."/>
+      <w:numFmt w:val="bullet"/>
+      <w:lvlText w:val=""/>
       <w:lvlJc w:val="left"/>
       <w:pPr>
         <w:tabs>
@@ -9263,11 +9219,15 @@
         </w:tabs>
         <w:ind w:left="5040" w:hanging="360"/>
       </w:pPr>
+      <w:rPr>
+        <w:rFonts w:ascii="Wingdings" w:hAnsi="Wingdings" w:hint="default"/>
+        <w:sz w:val="20"/>
+      </w:rPr>
     </w:lvl>
     <w:lvl w:ilvl="7" w:tentative="1">
       <w:start w:val="1"/>
-      <w:numFmt w:val="decimal"/>
-      <w:lvlText w:val="%8."/>
+      <w:numFmt w:val="bullet"/>
+      <w:lvlText w:val=""/>
       <w:lvlJc w:val="left"/>
       <w:pPr>
         <w:tabs>
@@ -9275,11 +9235,15 @@
         </w:tabs>
         <w:ind w:left="5760" w:hanging="360"/>
       </w:pPr>
+      <w:rPr>
+        <w:rFonts w:ascii="Wingdings" w:hAnsi="Wingdings" w:hint="default"/>
+        <w:sz w:val="20"/>
+      </w:rPr>
     </w:lvl>
     <w:lvl w:ilvl="8" w:tentative="1">
       <w:start w:val="1"/>
-      <w:numFmt w:val="decimal"/>
-      <w:lvlText w:val="%9."/>
+      <w:numFmt w:val="bullet"/>
+      <w:lvlText w:val=""/>
       <w:lvlJc w:val="left"/>
       <w:pPr>
         <w:tabs>
@@ -9287,12 +9251,16 @@
         </w:tabs>
         <w:ind w:left="6480" w:hanging="360"/>
       </w:pPr>
+      <w:rPr>
+        <w:rFonts w:ascii="Wingdings" w:hAnsi="Wingdings" w:hint="default"/>
+        <w:sz w:val="20"/>
+      </w:rPr>
     </w:lvl>
   </w:abstractNum>
   <w:abstractNum w:abstractNumId="20" w15:restartNumberingAfterBreak="0">
-    <w:nsid w:val="709D0274"/>
+    <w:nsid w:val="703619DD"/>
     <w:multiLevelType w:val="multilevel"/>
-    <w:tmpl w:val="AAF866EE"/>
+    <w:tmpl w:val="BFA0D752"/>
     <w:lvl w:ilvl="0">
       <w:start w:val="1"/>
       <w:numFmt w:val="bullet"/>
@@ -9439,13 +9407,13 @@
     </w:lvl>
   </w:abstractNum>
   <w:abstractNum w:abstractNumId="21" w15:restartNumberingAfterBreak="0">
-    <w:nsid w:val="76BF4071"/>
+    <w:nsid w:val="75150072"/>
     <w:multiLevelType w:val="multilevel"/>
-    <w:tmpl w:val="E39C8D06"/>
+    <w:tmpl w:val="AB7C41DA"/>
     <w:lvl w:ilvl="0">
       <w:start w:val="1"/>
-      <w:numFmt w:val="decimal"/>
-      <w:lvlText w:val="%1."/>
+      <w:numFmt w:val="bullet"/>
+      <w:lvlText w:val=""/>
       <w:lvlJc w:val="left"/>
       <w:pPr>
         <w:tabs>
@@ -9453,8 +9421,12 @@
         </w:tabs>
         <w:ind w:left="720" w:hanging="360"/>
       </w:pPr>
-    </w:lvl>
-    <w:lvl w:ilvl="1">
+      <w:rPr>
+        <w:rFonts w:ascii="Symbol" w:hAnsi="Symbol" w:hint="default"/>
+        <w:sz w:val="20"/>
+      </w:rPr>
+    </w:lvl>
+    <w:lvl w:ilvl="1" w:tentative="1">
       <w:start w:val="1"/>
       <w:numFmt w:val="bullet"/>
       <w:lvlText w:val="o"/>
@@ -9472,8 +9444,8 @@
     </w:lvl>
     <w:lvl w:ilvl="2" w:tentative="1">
       <w:start w:val="1"/>
-      <w:numFmt w:val="decimal"/>
-      <w:lvlText w:val="%3."/>
+      <w:numFmt w:val="bullet"/>
+      <w:lvlText w:val=""/>
       <w:lvlJc w:val="left"/>
       <w:pPr>
         <w:tabs>
@@ -9481,11 +9453,15 @@
         </w:tabs>
         <w:ind w:left="2160" w:hanging="360"/>
       </w:pPr>
+      <w:rPr>
+        <w:rFonts w:ascii="Wingdings" w:hAnsi="Wingdings" w:hint="default"/>
+        <w:sz w:val="20"/>
+      </w:rPr>
     </w:lvl>
     <w:lvl w:ilvl="3" w:tentative="1">
       <w:start w:val="1"/>
-      <w:numFmt w:val="decimal"/>
-      <w:lvlText w:val="%4."/>
+      <w:numFmt w:val="bullet"/>
+      <w:lvlText w:val=""/>
       <w:lvlJc w:val="left"/>
       <w:pPr>
         <w:tabs>
@@ -9493,11 +9469,15 @@
         </w:tabs>
         <w:ind w:left="2880" w:hanging="360"/>
       </w:pPr>
+      <w:rPr>
+        <w:rFonts w:ascii="Wingdings" w:hAnsi="Wingdings" w:hint="default"/>
+        <w:sz w:val="20"/>
+      </w:rPr>
     </w:lvl>
     <w:lvl w:ilvl="4" w:tentative="1">
       <w:start w:val="1"/>
-      <w:numFmt w:val="decimal"/>
-      <w:lvlText w:val="%5."/>
+      <w:numFmt w:val="bullet"/>
+      <w:lvlText w:val=""/>
       <w:lvlJc w:val="left"/>
       <w:pPr>
         <w:tabs>
@@ -9505,11 +9485,15 @@
         </w:tabs>
         <w:ind w:left="3600" w:hanging="360"/>
       </w:pPr>
+      <w:rPr>
+        <w:rFonts w:ascii="Wingdings" w:hAnsi="Wingdings" w:hint="default"/>
+        <w:sz w:val="20"/>
+      </w:rPr>
     </w:lvl>
     <w:lvl w:ilvl="5" w:tentative="1">
       <w:start w:val="1"/>
-      <w:numFmt w:val="decimal"/>
-      <w:lvlText w:val="%6."/>
+      <w:numFmt w:val="bullet"/>
+      <w:lvlText w:val=""/>
       <w:lvlJc w:val="left"/>
       <w:pPr>
         <w:tabs>
@@ -9517,11 +9501,15 @@
         </w:tabs>
         <w:ind w:left="4320" w:hanging="360"/>
       </w:pPr>
+      <w:rPr>
+        <w:rFonts w:ascii="Wingdings" w:hAnsi="Wingdings" w:hint="default"/>
+        <w:sz w:val="20"/>
+      </w:rPr>
     </w:lvl>
     <w:lvl w:ilvl="6" w:tentative="1">
       <w:start w:val="1"/>
-      <w:numFmt w:val="decimal"/>
-      <w:lvlText w:val="%7."/>
+      <w:numFmt w:val="bullet"/>
+      <w:lvlText w:val=""/>
       <w:lvlJc w:val="left"/>
       <w:pPr>
         <w:tabs>
@@ -9529,11 +9517,15 @@
         </w:tabs>
         <w:ind w:left="5040" w:hanging="360"/>
       </w:pPr>
+      <w:rPr>
+        <w:rFonts w:ascii="Wingdings" w:hAnsi="Wingdings" w:hint="default"/>
+        <w:sz w:val="20"/>
+      </w:rPr>
     </w:lvl>
     <w:lvl w:ilvl="7" w:tentative="1">
       <w:start w:val="1"/>
-      <w:numFmt w:val="decimal"/>
-      <w:lvlText w:val="%8."/>
+      <w:numFmt w:val="bullet"/>
+      <w:lvlText w:val=""/>
       <w:lvlJc w:val="left"/>
       <w:pPr>
         <w:tabs>
@@ -9541,11 +9533,15 @@
         </w:tabs>
         <w:ind w:left="5760" w:hanging="360"/>
       </w:pPr>
+      <w:rPr>
+        <w:rFonts w:ascii="Wingdings" w:hAnsi="Wingdings" w:hint="default"/>
+        <w:sz w:val="20"/>
+      </w:rPr>
     </w:lvl>
     <w:lvl w:ilvl="8" w:tentative="1">
       <w:start w:val="1"/>
-      <w:numFmt w:val="decimal"/>
-      <w:lvlText w:val="%9."/>
+      <w:numFmt w:val="bullet"/>
+      <w:lvlText w:val=""/>
       <w:lvlJc w:val="left"/>
       <w:pPr>
         <w:tabs>
@@ -9553,12 +9549,16 @@
         </w:tabs>
         <w:ind w:left="6480" w:hanging="360"/>
       </w:pPr>
+      <w:rPr>
+        <w:rFonts w:ascii="Wingdings" w:hAnsi="Wingdings" w:hint="default"/>
+        <w:sz w:val="20"/>
+      </w:rPr>
     </w:lvl>
   </w:abstractNum>
   <w:abstractNum w:abstractNumId="22" w15:restartNumberingAfterBreak="0">
-    <w:nsid w:val="7BB05693"/>
+    <w:nsid w:val="7DB717C4"/>
     <w:multiLevelType w:val="multilevel"/>
-    <w:tmpl w:val="1C207E52"/>
+    <w:tmpl w:val="D3CA986E"/>
     <w:lvl w:ilvl="0">
       <w:start w:val="1"/>
       <w:numFmt w:val="bullet"/>
@@ -9705,9 +9705,9 @@
     </w:lvl>
   </w:abstractNum>
   <w:abstractNum w:abstractNumId="23" w15:restartNumberingAfterBreak="0">
-    <w:nsid w:val="7DA16ECA"/>
+    <w:nsid w:val="7FF77E2D"/>
     <w:multiLevelType w:val="multilevel"/>
-    <w:tmpl w:val="0FD0118C"/>
+    <w:tmpl w:val="D646E20A"/>
     <w:lvl w:ilvl="0">
       <w:start w:val="1"/>
       <w:numFmt w:val="bullet"/>
@@ -9853,77 +9853,77 @@
       </w:rPr>
     </w:lvl>
   </w:abstractNum>
-  <w:num w:numId="1" w16cid:durableId="930314535">
+  <w:num w:numId="1" w16cid:durableId="769089410">
+    <w:abstractNumId w:val="8"/>
+  </w:num>
+  <w:num w:numId="2" w16cid:durableId="1211456588">
+    <w:abstractNumId w:val="16"/>
+  </w:num>
+  <w:num w:numId="3" w16cid:durableId="1509363892">
+    <w:abstractNumId w:val="4"/>
+  </w:num>
+  <w:num w:numId="4" w16cid:durableId="102963090">
+    <w:abstractNumId w:val="20"/>
+  </w:num>
+  <w:num w:numId="5" w16cid:durableId="1359701458">
+    <w:abstractNumId w:val="21"/>
+  </w:num>
+  <w:num w:numId="6" w16cid:durableId="1092432731">
+    <w:abstractNumId w:val="18"/>
+  </w:num>
+  <w:num w:numId="7" w16cid:durableId="1841504906">
+    <w:abstractNumId w:val="17"/>
+  </w:num>
+  <w:num w:numId="8" w16cid:durableId="1444182314">
+    <w:abstractNumId w:val="13"/>
+  </w:num>
+  <w:num w:numId="9" w16cid:durableId="1918856857">
+    <w:abstractNumId w:val="1"/>
+  </w:num>
+  <w:num w:numId="10" w16cid:durableId="1712487621">
     <w:abstractNumId w:val="9"/>
   </w:num>
-  <w:num w:numId="2" w16cid:durableId="1039284445">
+  <w:num w:numId="11" w16cid:durableId="1875968949">
+    <w:abstractNumId w:val="15"/>
+  </w:num>
+  <w:num w:numId="12" w16cid:durableId="462887803">
+    <w:abstractNumId w:val="19"/>
+  </w:num>
+  <w:num w:numId="13" w16cid:durableId="727073889">
+    <w:abstractNumId w:val="23"/>
+  </w:num>
+  <w:num w:numId="14" w16cid:durableId="697126212">
+    <w:abstractNumId w:val="2"/>
+  </w:num>
+  <w:num w:numId="15" w16cid:durableId="1033921201">
+    <w:abstractNumId w:val="0"/>
+  </w:num>
+  <w:num w:numId="16" w16cid:durableId="491944515">
+    <w:abstractNumId w:val="22"/>
+  </w:num>
+  <w:num w:numId="17" w16cid:durableId="1943416652">
     <w:abstractNumId w:val="6"/>
   </w:num>
-  <w:num w:numId="3" w16cid:durableId="1997175895">
+  <w:num w:numId="18" w16cid:durableId="1717507935">
+    <w:abstractNumId w:val="11"/>
+  </w:num>
+  <w:num w:numId="19" w16cid:durableId="1908031909">
+    <w:abstractNumId w:val="14"/>
+  </w:num>
+  <w:num w:numId="20" w16cid:durableId="1809400749">
+    <w:abstractNumId w:val="7"/>
+  </w:num>
+  <w:num w:numId="21" w16cid:durableId="646202477">
+    <w:abstractNumId w:val="3"/>
+  </w:num>
+  <w:num w:numId="22" w16cid:durableId="271207760">
     <w:abstractNumId w:val="12"/>
   </w:num>
-  <w:num w:numId="4" w16cid:durableId="958536966">
-    <w:abstractNumId w:val="22"/>
-  </w:num>
-  <w:num w:numId="5" w16cid:durableId="1053819225">
-    <w:abstractNumId w:val="11"/>
-  </w:num>
-  <w:num w:numId="6" w16cid:durableId="318966070">
-    <w:abstractNumId w:val="20"/>
-  </w:num>
-  <w:num w:numId="7" w16cid:durableId="342706140">
-    <w:abstractNumId w:val="7"/>
-  </w:num>
-  <w:num w:numId="8" w16cid:durableId="601690247">
-    <w:abstractNumId w:val="5"/>
-  </w:num>
-  <w:num w:numId="9" w16cid:durableId="1580559029">
-    <w:abstractNumId w:val="15"/>
-  </w:num>
-  <w:num w:numId="10" w16cid:durableId="1379088044">
-    <w:abstractNumId w:val="19"/>
-  </w:num>
-  <w:num w:numId="11" w16cid:durableId="602224977">
-    <w:abstractNumId w:val="8"/>
-  </w:num>
-  <w:num w:numId="12" w16cid:durableId="1983655071">
-    <w:abstractNumId w:val="2"/>
-  </w:num>
-  <w:num w:numId="13" w16cid:durableId="1630211344">
-    <w:abstractNumId w:val="3"/>
-  </w:num>
-  <w:num w:numId="14" w16cid:durableId="816534433">
-    <w:abstractNumId w:val="13"/>
-  </w:num>
-  <w:num w:numId="15" w16cid:durableId="2147114760">
-    <w:abstractNumId w:val="0"/>
-  </w:num>
-  <w:num w:numId="16" w16cid:durableId="1118253228">
-    <w:abstractNumId w:val="23"/>
-  </w:num>
-  <w:num w:numId="17" w16cid:durableId="458106298">
-    <w:abstractNumId w:val="17"/>
-  </w:num>
-  <w:num w:numId="18" w16cid:durableId="993609435">
-    <w:abstractNumId w:val="1"/>
-  </w:num>
-  <w:num w:numId="19" w16cid:durableId="1574504186">
-    <w:abstractNumId w:val="4"/>
-  </w:num>
-  <w:num w:numId="20" w16cid:durableId="351538776">
-    <w:abstractNumId w:val="14"/>
-  </w:num>
-  <w:num w:numId="21" w16cid:durableId="864295347">
-    <w:abstractNumId w:val="18"/>
-  </w:num>
-  <w:num w:numId="22" w16cid:durableId="1393623739">
+  <w:num w:numId="23" w16cid:durableId="322315923">
     <w:abstractNumId w:val="10"/>
   </w:num>
-  <w:num w:numId="23" w16cid:durableId="1415275609">
-    <w:abstractNumId w:val="16"/>
-  </w:num>
-  <w:num w:numId="24" w16cid:durableId="1348555299">
-    <w:abstractNumId w:val="21"/>
+  <w:num w:numId="24" w16cid:durableId="226958260">
+    <w:abstractNumId w:val="5"/>
   </w:num>
 </w:numbering>
 </file>

</xml_diff>

<commit_message>
follow-along: Sonar replay command corrected
</commit_message>
<xml_diff>
--- a/follow-along/Azure_Local_Follow_Along_Guide.docx
+++ b/follow-along/Azure_Local_Follow_Along_Guide.docx
@@ -6566,9 +6566,9 @@
 <file path=word/numbering.xml><?xml version="1.0" encoding="utf-8"?>
 <w:numbering xmlns:wpc="http://schemas.microsoft.com/office/word/2010/wordprocessingCanvas" xmlns:cx="http://schemas.microsoft.com/office/drawing/2014/chartex" xmlns:cx1="http://schemas.microsoft.com/office/drawing/2015/9/8/chartex" xmlns:cx2="http://schemas.microsoft.com/office/drawing/2015/10/21/chartex" xmlns:cx3="http://schemas.microsoft.com/office/drawing/2016/5/9/chartex" xmlns:cx4="http://schemas.microsoft.com/office/drawing/2016/5/10/chartex" xmlns:cx5="http://schemas.microsoft.com/office/drawing/2016/5/11/chartex" xmlns:cx6="http://schemas.microsoft.com/office/drawing/2016/5/12/chartex" xmlns:cx7="http://schemas.microsoft.com/office/drawing/2016/5/13/chartex" xmlns:cx8="http://schemas.microsoft.com/office/drawing/2016/5/14/chartex" xmlns:mc="http://schemas.openxmlformats.org/markup-compatibility/2006" xmlns:aink="http://schemas.microsoft.com/office/drawing/2016/ink" xmlns:am3d="http://schemas.microsoft.com/office/drawing/2017/model3d" xmlns:o="urn:schemas-microsoft-com:office:office" xmlns:oel="http://schemas.microsoft.com/office/2019/extlst" xmlns:r="http://schemas.openxmlformats.org/officeDocument/2006/relationships" xmlns:m="http://schemas.openxmlformats.org/officeDocument/2006/math" xmlns:v="urn:schemas-microsoft-com:vml" xmlns:wp14="http://schemas.microsoft.com/office/word/2010/wordprocessingDrawing" xmlns:wp="http://schemas.openxmlformats.org/drawingml/2006/wordprocessingDrawing" xmlns:w10="urn:schemas-microsoft-com:office:word" xmlns:w="http://schemas.openxmlformats.org/wordprocessingml/2006/main" xmlns:w14="http://schemas.microsoft.com/office/word/2010/wordml" xmlns:w15="http://schemas.microsoft.com/office/word/2012/wordml" xmlns:w16cex="http://schemas.microsoft.com/office/word/2018/wordml/cex" xmlns:w16cid="http://schemas.microsoft.com/office/word/2016/wordml/cid" xmlns:w16="http://schemas.microsoft.com/office/word/2018/wordml" xmlns:w16du="http://schemas.microsoft.com/office/word/2023/wordml/word16du" xmlns:w16sdtdh="http://schemas.microsoft.com/office/word/2020/wordml/sdtdatahash" xmlns:w16sdtfl="http://schemas.microsoft.com/office/word/2024/wordml/sdtformatlock" xmlns:w16se="http://schemas.microsoft.com/office/word/2015/wordml/symex" xmlns:wpg="http://schemas.microsoft.com/office/word/2010/wordprocessingGroup" xmlns:wpi="http://schemas.microsoft.com/office/word/2010/wordprocessingInk" xmlns:wne="http://schemas.microsoft.com/office/word/2006/wordml" xmlns:wps="http://schemas.microsoft.com/office/word/2010/wordprocessingShape" mc:Ignorable="w14 w15 w16se w16cid w16 w16cex w16sdtdh w16sdtfl w16du wp14">
   <w:abstractNum w:abstractNumId="0" w15:restartNumberingAfterBreak="0">
-    <w:nsid w:val="00394865"/>
+    <w:nsid w:val="18E702E1"/>
     <w:multiLevelType w:val="multilevel"/>
-    <w:tmpl w:val="0528423C"/>
+    <w:tmpl w:val="3D5AEE8E"/>
     <w:lvl w:ilvl="0">
       <w:start w:val="1"/>
       <w:numFmt w:val="bullet"/>
@@ -6715,13 +6715,13 @@
     </w:lvl>
   </w:abstractNum>
   <w:abstractNum w:abstractNumId="1" w15:restartNumberingAfterBreak="0">
-    <w:nsid w:val="051D5FE9"/>
+    <w:nsid w:val="1A126089"/>
     <w:multiLevelType w:val="multilevel"/>
-    <w:tmpl w:val="4D60B2AC"/>
+    <w:tmpl w:val="5250211C"/>
     <w:lvl w:ilvl="0">
       <w:start w:val="1"/>
-      <w:numFmt w:val="bullet"/>
-      <w:lvlText w:val=""/>
+      <w:numFmt w:val="decimal"/>
+      <w:lvlText w:val="%1."/>
       <w:lvlJc w:val="left"/>
       <w:pPr>
         <w:tabs>
@@ -6729,12 +6729,8 @@
         </w:tabs>
         <w:ind w:left="720" w:hanging="360"/>
       </w:pPr>
-      <w:rPr>
-        <w:rFonts w:ascii="Symbol" w:hAnsi="Symbol" w:hint="default"/>
-        <w:sz w:val="20"/>
-      </w:rPr>
-    </w:lvl>
-    <w:lvl w:ilvl="1" w:tentative="1">
+    </w:lvl>
+    <w:lvl w:ilvl="1">
       <w:start w:val="1"/>
       <w:numFmt w:val="bullet"/>
       <w:lvlText w:val="o"/>
@@ -6752,8 +6748,8 @@
     </w:lvl>
     <w:lvl w:ilvl="2" w:tentative="1">
       <w:start w:val="1"/>
-      <w:numFmt w:val="bullet"/>
-      <w:lvlText w:val=""/>
+      <w:numFmt w:val="decimal"/>
+      <w:lvlText w:val="%3."/>
       <w:lvlJc w:val="left"/>
       <w:pPr>
         <w:tabs>
@@ -6761,15 +6757,11 @@
         </w:tabs>
         <w:ind w:left="2160" w:hanging="360"/>
       </w:pPr>
-      <w:rPr>
-        <w:rFonts w:ascii="Wingdings" w:hAnsi="Wingdings" w:hint="default"/>
-        <w:sz w:val="20"/>
-      </w:rPr>
     </w:lvl>
     <w:lvl w:ilvl="3" w:tentative="1">
       <w:start w:val="1"/>
-      <w:numFmt w:val="bullet"/>
-      <w:lvlText w:val=""/>
+      <w:numFmt w:val="decimal"/>
+      <w:lvlText w:val="%4."/>
       <w:lvlJc w:val="left"/>
       <w:pPr>
         <w:tabs>
@@ -6777,15 +6769,11 @@
         </w:tabs>
         <w:ind w:left="2880" w:hanging="360"/>
       </w:pPr>
-      <w:rPr>
-        <w:rFonts w:ascii="Wingdings" w:hAnsi="Wingdings" w:hint="default"/>
-        <w:sz w:val="20"/>
-      </w:rPr>
     </w:lvl>
     <w:lvl w:ilvl="4" w:tentative="1">
       <w:start w:val="1"/>
-      <w:numFmt w:val="bullet"/>
-      <w:lvlText w:val=""/>
+      <w:numFmt w:val="decimal"/>
+      <w:lvlText w:val="%5."/>
       <w:lvlJc w:val="left"/>
       <w:pPr>
         <w:tabs>
@@ -6793,15 +6781,11 @@
         </w:tabs>
         <w:ind w:left="3600" w:hanging="360"/>
       </w:pPr>
-      <w:rPr>
-        <w:rFonts w:ascii="Wingdings" w:hAnsi="Wingdings" w:hint="default"/>
-        <w:sz w:val="20"/>
-      </w:rPr>
     </w:lvl>
     <w:lvl w:ilvl="5" w:tentative="1">
       <w:start w:val="1"/>
-      <w:numFmt w:val="bullet"/>
-      <w:lvlText w:val=""/>
+      <w:numFmt w:val="decimal"/>
+      <w:lvlText w:val="%6."/>
       <w:lvlJc w:val="left"/>
       <w:pPr>
         <w:tabs>
@@ -6809,15 +6793,11 @@
         </w:tabs>
         <w:ind w:left="4320" w:hanging="360"/>
       </w:pPr>
-      <w:rPr>
-        <w:rFonts w:ascii="Wingdings" w:hAnsi="Wingdings" w:hint="default"/>
-        <w:sz w:val="20"/>
-      </w:rPr>
     </w:lvl>
     <w:lvl w:ilvl="6" w:tentative="1">
       <w:start w:val="1"/>
-      <w:numFmt w:val="bullet"/>
-      <w:lvlText w:val=""/>
+      <w:numFmt w:val="decimal"/>
+      <w:lvlText w:val="%7."/>
       <w:lvlJc w:val="left"/>
       <w:pPr>
         <w:tabs>
@@ -6825,15 +6805,11 @@
         </w:tabs>
         <w:ind w:left="5040" w:hanging="360"/>
       </w:pPr>
-      <w:rPr>
-        <w:rFonts w:ascii="Wingdings" w:hAnsi="Wingdings" w:hint="default"/>
-        <w:sz w:val="20"/>
-      </w:rPr>
     </w:lvl>
     <w:lvl w:ilvl="7" w:tentative="1">
       <w:start w:val="1"/>
-      <w:numFmt w:val="bullet"/>
-      <w:lvlText w:val=""/>
+      <w:numFmt w:val="decimal"/>
+      <w:lvlText w:val="%8."/>
       <w:lvlJc w:val="left"/>
       <w:pPr>
         <w:tabs>
@@ -6841,15 +6817,11 @@
         </w:tabs>
         <w:ind w:left="5760" w:hanging="360"/>
       </w:pPr>
-      <w:rPr>
-        <w:rFonts w:ascii="Wingdings" w:hAnsi="Wingdings" w:hint="default"/>
-        <w:sz w:val="20"/>
-      </w:rPr>
     </w:lvl>
     <w:lvl w:ilvl="8" w:tentative="1">
       <w:start w:val="1"/>
-      <w:numFmt w:val="bullet"/>
-      <w:lvlText w:val=""/>
+      <w:numFmt w:val="decimal"/>
+      <w:lvlText w:val="%9."/>
       <w:lvlJc w:val="left"/>
       <w:pPr>
         <w:tabs>
@@ -6857,16 +6829,310 @@
         </w:tabs>
         <w:ind w:left="6480" w:hanging="360"/>
       </w:pPr>
-      <w:rPr>
-        <w:rFonts w:ascii="Wingdings" w:hAnsi="Wingdings" w:hint="default"/>
-        <w:sz w:val="20"/>
-      </w:rPr>
     </w:lvl>
   </w:abstractNum>
   <w:abstractNum w:abstractNumId="2" w15:restartNumberingAfterBreak="0">
-    <w:nsid w:val="106D4B50"/>
+    <w:nsid w:val="1AF00DB5"/>
     <w:multiLevelType w:val="multilevel"/>
-    <w:tmpl w:val="F95A8448"/>
+    <w:tmpl w:val="0764EA52"/>
+    <w:lvl w:ilvl="0">
+      <w:start w:val="1"/>
+      <w:numFmt w:val="bullet"/>
+      <w:lvlText w:val=""/>
+      <w:lvlJc w:val="left"/>
+      <w:pPr>
+        <w:tabs>
+          <w:tab w:val="num" w:pos="720"/>
+        </w:tabs>
+        <w:ind w:left="720" w:hanging="360"/>
+      </w:pPr>
+      <w:rPr>
+        <w:rFonts w:ascii="Symbol" w:hAnsi="Symbol" w:hint="default"/>
+        <w:sz w:val="20"/>
+      </w:rPr>
+    </w:lvl>
+    <w:lvl w:ilvl="1" w:tentative="1">
+      <w:start w:val="1"/>
+      <w:numFmt w:val="bullet"/>
+      <w:lvlText w:val="o"/>
+      <w:lvlJc w:val="left"/>
+      <w:pPr>
+        <w:tabs>
+          <w:tab w:val="num" w:pos="1440"/>
+        </w:tabs>
+        <w:ind w:left="1440" w:hanging="360"/>
+      </w:pPr>
+      <w:rPr>
+        <w:rFonts w:ascii="Courier New" w:hAnsi="Courier New" w:hint="default"/>
+        <w:sz w:val="20"/>
+      </w:rPr>
+    </w:lvl>
+    <w:lvl w:ilvl="2" w:tentative="1">
+      <w:start w:val="1"/>
+      <w:numFmt w:val="bullet"/>
+      <w:lvlText w:val=""/>
+      <w:lvlJc w:val="left"/>
+      <w:pPr>
+        <w:tabs>
+          <w:tab w:val="num" w:pos="2160"/>
+        </w:tabs>
+        <w:ind w:left="2160" w:hanging="360"/>
+      </w:pPr>
+      <w:rPr>
+        <w:rFonts w:ascii="Wingdings" w:hAnsi="Wingdings" w:hint="default"/>
+        <w:sz w:val="20"/>
+      </w:rPr>
+    </w:lvl>
+    <w:lvl w:ilvl="3" w:tentative="1">
+      <w:start w:val="1"/>
+      <w:numFmt w:val="bullet"/>
+      <w:lvlText w:val=""/>
+      <w:lvlJc w:val="left"/>
+      <w:pPr>
+        <w:tabs>
+          <w:tab w:val="num" w:pos="2880"/>
+        </w:tabs>
+        <w:ind w:left="2880" w:hanging="360"/>
+      </w:pPr>
+      <w:rPr>
+        <w:rFonts w:ascii="Wingdings" w:hAnsi="Wingdings" w:hint="default"/>
+        <w:sz w:val="20"/>
+      </w:rPr>
+    </w:lvl>
+    <w:lvl w:ilvl="4" w:tentative="1">
+      <w:start w:val="1"/>
+      <w:numFmt w:val="bullet"/>
+      <w:lvlText w:val=""/>
+      <w:lvlJc w:val="left"/>
+      <w:pPr>
+        <w:tabs>
+          <w:tab w:val="num" w:pos="3600"/>
+        </w:tabs>
+        <w:ind w:left="3600" w:hanging="360"/>
+      </w:pPr>
+      <w:rPr>
+        <w:rFonts w:ascii="Wingdings" w:hAnsi="Wingdings" w:hint="default"/>
+        <w:sz w:val="20"/>
+      </w:rPr>
+    </w:lvl>
+    <w:lvl w:ilvl="5" w:tentative="1">
+      <w:start w:val="1"/>
+      <w:numFmt w:val="bullet"/>
+      <w:lvlText w:val=""/>
+      <w:lvlJc w:val="left"/>
+      <w:pPr>
+        <w:tabs>
+          <w:tab w:val="num" w:pos="4320"/>
+        </w:tabs>
+        <w:ind w:left="4320" w:hanging="360"/>
+      </w:pPr>
+      <w:rPr>
+        <w:rFonts w:ascii="Wingdings" w:hAnsi="Wingdings" w:hint="default"/>
+        <w:sz w:val="20"/>
+      </w:rPr>
+    </w:lvl>
+    <w:lvl w:ilvl="6" w:tentative="1">
+      <w:start w:val="1"/>
+      <w:numFmt w:val="bullet"/>
+      <w:lvlText w:val=""/>
+      <w:lvlJc w:val="left"/>
+      <w:pPr>
+        <w:tabs>
+          <w:tab w:val="num" w:pos="5040"/>
+        </w:tabs>
+        <w:ind w:left="5040" w:hanging="360"/>
+      </w:pPr>
+      <w:rPr>
+        <w:rFonts w:ascii="Wingdings" w:hAnsi="Wingdings" w:hint="default"/>
+        <w:sz w:val="20"/>
+      </w:rPr>
+    </w:lvl>
+    <w:lvl w:ilvl="7" w:tentative="1">
+      <w:start w:val="1"/>
+      <w:numFmt w:val="bullet"/>
+      <w:lvlText w:val=""/>
+      <w:lvlJc w:val="left"/>
+      <w:pPr>
+        <w:tabs>
+          <w:tab w:val="num" w:pos="5760"/>
+        </w:tabs>
+        <w:ind w:left="5760" w:hanging="360"/>
+      </w:pPr>
+      <w:rPr>
+        <w:rFonts w:ascii="Wingdings" w:hAnsi="Wingdings" w:hint="default"/>
+        <w:sz w:val="20"/>
+      </w:rPr>
+    </w:lvl>
+    <w:lvl w:ilvl="8" w:tentative="1">
+      <w:start w:val="1"/>
+      <w:numFmt w:val="bullet"/>
+      <w:lvlText w:val=""/>
+      <w:lvlJc w:val="left"/>
+      <w:pPr>
+        <w:tabs>
+          <w:tab w:val="num" w:pos="6480"/>
+        </w:tabs>
+        <w:ind w:left="6480" w:hanging="360"/>
+      </w:pPr>
+      <w:rPr>
+        <w:rFonts w:ascii="Wingdings" w:hAnsi="Wingdings" w:hint="default"/>
+        <w:sz w:val="20"/>
+      </w:rPr>
+    </w:lvl>
+  </w:abstractNum>
+  <w:abstractNum w:abstractNumId="3" w15:restartNumberingAfterBreak="0">
+    <w:nsid w:val="1B09547A"/>
+    <w:multiLevelType w:val="multilevel"/>
+    <w:tmpl w:val="48A8ABA6"/>
+    <w:lvl w:ilvl="0">
+      <w:start w:val="1"/>
+      <w:numFmt w:val="bullet"/>
+      <w:lvlText w:val=""/>
+      <w:lvlJc w:val="left"/>
+      <w:pPr>
+        <w:tabs>
+          <w:tab w:val="num" w:pos="720"/>
+        </w:tabs>
+        <w:ind w:left="720" w:hanging="360"/>
+      </w:pPr>
+      <w:rPr>
+        <w:rFonts w:ascii="Symbol" w:hAnsi="Symbol" w:hint="default"/>
+        <w:sz w:val="20"/>
+      </w:rPr>
+    </w:lvl>
+    <w:lvl w:ilvl="1" w:tentative="1">
+      <w:start w:val="1"/>
+      <w:numFmt w:val="bullet"/>
+      <w:lvlText w:val="o"/>
+      <w:lvlJc w:val="left"/>
+      <w:pPr>
+        <w:tabs>
+          <w:tab w:val="num" w:pos="1440"/>
+        </w:tabs>
+        <w:ind w:left="1440" w:hanging="360"/>
+      </w:pPr>
+      <w:rPr>
+        <w:rFonts w:ascii="Courier New" w:hAnsi="Courier New" w:hint="default"/>
+        <w:sz w:val="20"/>
+      </w:rPr>
+    </w:lvl>
+    <w:lvl w:ilvl="2" w:tentative="1">
+      <w:start w:val="1"/>
+      <w:numFmt w:val="bullet"/>
+      <w:lvlText w:val=""/>
+      <w:lvlJc w:val="left"/>
+      <w:pPr>
+        <w:tabs>
+          <w:tab w:val="num" w:pos="2160"/>
+        </w:tabs>
+        <w:ind w:left="2160" w:hanging="360"/>
+      </w:pPr>
+      <w:rPr>
+        <w:rFonts w:ascii="Wingdings" w:hAnsi="Wingdings" w:hint="default"/>
+        <w:sz w:val="20"/>
+      </w:rPr>
+    </w:lvl>
+    <w:lvl w:ilvl="3" w:tentative="1">
+      <w:start w:val="1"/>
+      <w:numFmt w:val="bullet"/>
+      <w:lvlText w:val=""/>
+      <w:lvlJc w:val="left"/>
+      <w:pPr>
+        <w:tabs>
+          <w:tab w:val="num" w:pos="2880"/>
+        </w:tabs>
+        <w:ind w:left="2880" w:hanging="360"/>
+      </w:pPr>
+      <w:rPr>
+        <w:rFonts w:ascii="Wingdings" w:hAnsi="Wingdings" w:hint="default"/>
+        <w:sz w:val="20"/>
+      </w:rPr>
+    </w:lvl>
+    <w:lvl w:ilvl="4" w:tentative="1">
+      <w:start w:val="1"/>
+      <w:numFmt w:val="bullet"/>
+      <w:lvlText w:val=""/>
+      <w:lvlJc w:val="left"/>
+      <w:pPr>
+        <w:tabs>
+          <w:tab w:val="num" w:pos="3600"/>
+        </w:tabs>
+        <w:ind w:left="3600" w:hanging="360"/>
+      </w:pPr>
+      <w:rPr>
+        <w:rFonts w:ascii="Wingdings" w:hAnsi="Wingdings" w:hint="default"/>
+        <w:sz w:val="20"/>
+      </w:rPr>
+    </w:lvl>
+    <w:lvl w:ilvl="5" w:tentative="1">
+      <w:start w:val="1"/>
+      <w:numFmt w:val="bullet"/>
+      <w:lvlText w:val=""/>
+      <w:lvlJc w:val="left"/>
+      <w:pPr>
+        <w:tabs>
+          <w:tab w:val="num" w:pos="4320"/>
+        </w:tabs>
+        <w:ind w:left="4320" w:hanging="360"/>
+      </w:pPr>
+      <w:rPr>
+        <w:rFonts w:ascii="Wingdings" w:hAnsi="Wingdings" w:hint="default"/>
+        <w:sz w:val="20"/>
+      </w:rPr>
+    </w:lvl>
+    <w:lvl w:ilvl="6" w:tentative="1">
+      <w:start w:val="1"/>
+      <w:numFmt w:val="bullet"/>
+      <w:lvlText w:val=""/>
+      <w:lvlJc w:val="left"/>
+      <w:pPr>
+        <w:tabs>
+          <w:tab w:val="num" w:pos="5040"/>
+        </w:tabs>
+        <w:ind w:left="5040" w:hanging="360"/>
+      </w:pPr>
+      <w:rPr>
+        <w:rFonts w:ascii="Wingdings" w:hAnsi="Wingdings" w:hint="default"/>
+        <w:sz w:val="20"/>
+      </w:rPr>
+    </w:lvl>
+    <w:lvl w:ilvl="7" w:tentative="1">
+      <w:start w:val="1"/>
+      <w:numFmt w:val="bullet"/>
+      <w:lvlText w:val=""/>
+      <w:lvlJc w:val="left"/>
+      <w:pPr>
+        <w:tabs>
+          <w:tab w:val="num" w:pos="5760"/>
+        </w:tabs>
+        <w:ind w:left="5760" w:hanging="360"/>
+      </w:pPr>
+      <w:rPr>
+        <w:rFonts w:ascii="Wingdings" w:hAnsi="Wingdings" w:hint="default"/>
+        <w:sz w:val="20"/>
+      </w:rPr>
+    </w:lvl>
+    <w:lvl w:ilvl="8" w:tentative="1">
+      <w:start w:val="1"/>
+      <w:numFmt w:val="bullet"/>
+      <w:lvlText w:val=""/>
+      <w:lvlJc w:val="left"/>
+      <w:pPr>
+        <w:tabs>
+          <w:tab w:val="num" w:pos="6480"/>
+        </w:tabs>
+        <w:ind w:left="6480" w:hanging="360"/>
+      </w:pPr>
+      <w:rPr>
+        <w:rFonts w:ascii="Wingdings" w:hAnsi="Wingdings" w:hint="default"/>
+        <w:sz w:val="20"/>
+      </w:rPr>
+    </w:lvl>
+  </w:abstractNum>
+  <w:abstractNum w:abstractNumId="4" w15:restartNumberingAfterBreak="0">
+    <w:nsid w:val="1BE7253F"/>
+    <w:multiLevelType w:val="multilevel"/>
+    <w:tmpl w:val="1F823230"/>
     <w:lvl w:ilvl="0">
       <w:start w:val="1"/>
       <w:numFmt w:val="decimal"/>
@@ -6980,10 +7246,159 @@
       </w:pPr>
     </w:lvl>
   </w:abstractNum>
-  <w:abstractNum w:abstractNumId="3" w15:restartNumberingAfterBreak="0">
-    <w:nsid w:val="136C4DEB"/>
+  <w:abstractNum w:abstractNumId="5" w15:restartNumberingAfterBreak="0">
+    <w:nsid w:val="1C0224E5"/>
     <w:multiLevelType w:val="multilevel"/>
-    <w:tmpl w:val="EA94CA3E"/>
+    <w:tmpl w:val="42809D38"/>
+    <w:lvl w:ilvl="0">
+      <w:start w:val="1"/>
+      <w:numFmt w:val="bullet"/>
+      <w:lvlText w:val=""/>
+      <w:lvlJc w:val="left"/>
+      <w:pPr>
+        <w:tabs>
+          <w:tab w:val="num" w:pos="720"/>
+        </w:tabs>
+        <w:ind w:left="720" w:hanging="360"/>
+      </w:pPr>
+      <w:rPr>
+        <w:rFonts w:ascii="Symbol" w:hAnsi="Symbol" w:hint="default"/>
+        <w:sz w:val="20"/>
+      </w:rPr>
+    </w:lvl>
+    <w:lvl w:ilvl="1" w:tentative="1">
+      <w:start w:val="1"/>
+      <w:numFmt w:val="bullet"/>
+      <w:lvlText w:val="o"/>
+      <w:lvlJc w:val="left"/>
+      <w:pPr>
+        <w:tabs>
+          <w:tab w:val="num" w:pos="1440"/>
+        </w:tabs>
+        <w:ind w:left="1440" w:hanging="360"/>
+      </w:pPr>
+      <w:rPr>
+        <w:rFonts w:ascii="Courier New" w:hAnsi="Courier New" w:hint="default"/>
+        <w:sz w:val="20"/>
+      </w:rPr>
+    </w:lvl>
+    <w:lvl w:ilvl="2" w:tentative="1">
+      <w:start w:val="1"/>
+      <w:numFmt w:val="bullet"/>
+      <w:lvlText w:val=""/>
+      <w:lvlJc w:val="left"/>
+      <w:pPr>
+        <w:tabs>
+          <w:tab w:val="num" w:pos="2160"/>
+        </w:tabs>
+        <w:ind w:left="2160" w:hanging="360"/>
+      </w:pPr>
+      <w:rPr>
+        <w:rFonts w:ascii="Wingdings" w:hAnsi="Wingdings" w:hint="default"/>
+        <w:sz w:val="20"/>
+      </w:rPr>
+    </w:lvl>
+    <w:lvl w:ilvl="3" w:tentative="1">
+      <w:start w:val="1"/>
+      <w:numFmt w:val="bullet"/>
+      <w:lvlText w:val=""/>
+      <w:lvlJc w:val="left"/>
+      <w:pPr>
+        <w:tabs>
+          <w:tab w:val="num" w:pos="2880"/>
+        </w:tabs>
+        <w:ind w:left="2880" w:hanging="360"/>
+      </w:pPr>
+      <w:rPr>
+        <w:rFonts w:ascii="Wingdings" w:hAnsi="Wingdings" w:hint="default"/>
+        <w:sz w:val="20"/>
+      </w:rPr>
+    </w:lvl>
+    <w:lvl w:ilvl="4" w:tentative="1">
+      <w:start w:val="1"/>
+      <w:numFmt w:val="bullet"/>
+      <w:lvlText w:val=""/>
+      <w:lvlJc w:val="left"/>
+      <w:pPr>
+        <w:tabs>
+          <w:tab w:val="num" w:pos="3600"/>
+        </w:tabs>
+        <w:ind w:left="3600" w:hanging="360"/>
+      </w:pPr>
+      <w:rPr>
+        <w:rFonts w:ascii="Wingdings" w:hAnsi="Wingdings" w:hint="default"/>
+        <w:sz w:val="20"/>
+      </w:rPr>
+    </w:lvl>
+    <w:lvl w:ilvl="5" w:tentative="1">
+      <w:start w:val="1"/>
+      <w:numFmt w:val="bullet"/>
+      <w:lvlText w:val=""/>
+      <w:lvlJc w:val="left"/>
+      <w:pPr>
+        <w:tabs>
+          <w:tab w:val="num" w:pos="4320"/>
+        </w:tabs>
+        <w:ind w:left="4320" w:hanging="360"/>
+      </w:pPr>
+      <w:rPr>
+        <w:rFonts w:ascii="Wingdings" w:hAnsi="Wingdings" w:hint="default"/>
+        <w:sz w:val="20"/>
+      </w:rPr>
+    </w:lvl>
+    <w:lvl w:ilvl="6" w:tentative="1">
+      <w:start w:val="1"/>
+      <w:numFmt w:val="bullet"/>
+      <w:lvlText w:val=""/>
+      <w:lvlJc w:val="left"/>
+      <w:pPr>
+        <w:tabs>
+          <w:tab w:val="num" w:pos="5040"/>
+        </w:tabs>
+        <w:ind w:left="5040" w:hanging="360"/>
+      </w:pPr>
+      <w:rPr>
+        <w:rFonts w:ascii="Wingdings" w:hAnsi="Wingdings" w:hint="default"/>
+        <w:sz w:val="20"/>
+      </w:rPr>
+    </w:lvl>
+    <w:lvl w:ilvl="7" w:tentative="1">
+      <w:start w:val="1"/>
+      <w:numFmt w:val="bullet"/>
+      <w:lvlText w:val=""/>
+      <w:lvlJc w:val="left"/>
+      <w:pPr>
+        <w:tabs>
+          <w:tab w:val="num" w:pos="5760"/>
+        </w:tabs>
+        <w:ind w:left="5760" w:hanging="360"/>
+      </w:pPr>
+      <w:rPr>
+        <w:rFonts w:ascii="Wingdings" w:hAnsi="Wingdings" w:hint="default"/>
+        <w:sz w:val="20"/>
+      </w:rPr>
+    </w:lvl>
+    <w:lvl w:ilvl="8" w:tentative="1">
+      <w:start w:val="1"/>
+      <w:numFmt w:val="bullet"/>
+      <w:lvlText w:val=""/>
+      <w:lvlJc w:val="left"/>
+      <w:pPr>
+        <w:tabs>
+          <w:tab w:val="num" w:pos="6480"/>
+        </w:tabs>
+        <w:ind w:left="6480" w:hanging="360"/>
+      </w:pPr>
+      <w:rPr>
+        <w:rFonts w:ascii="Wingdings" w:hAnsi="Wingdings" w:hint="default"/>
+        <w:sz w:val="20"/>
+      </w:rPr>
+    </w:lvl>
+  </w:abstractNum>
+  <w:abstractNum w:abstractNumId="6" w15:restartNumberingAfterBreak="0">
+    <w:nsid w:val="20092905"/>
+    <w:multiLevelType w:val="multilevel"/>
+    <w:tmpl w:val="C27476F2"/>
     <w:lvl w:ilvl="0">
       <w:start w:val="1"/>
       <w:numFmt w:val="decimal"/>
@@ -7097,10 +7512,10 @@
       </w:pPr>
     </w:lvl>
   </w:abstractNum>
-  <w:abstractNum w:abstractNumId="4" w15:restartNumberingAfterBreak="0">
-    <w:nsid w:val="1C082155"/>
+  <w:abstractNum w:abstractNumId="7" w15:restartNumberingAfterBreak="0">
+    <w:nsid w:val="250C7A9B"/>
     <w:multiLevelType w:val="multilevel"/>
-    <w:tmpl w:val="CF2E9034"/>
+    <w:tmpl w:val="AE72FBFA"/>
     <w:lvl w:ilvl="0">
       <w:start w:val="1"/>
       <w:numFmt w:val="decimal"/>
@@ -7214,10 +7629,10 @@
       </w:pPr>
     </w:lvl>
   </w:abstractNum>
-  <w:abstractNum w:abstractNumId="5" w15:restartNumberingAfterBreak="0">
-    <w:nsid w:val="1CC85E94"/>
+  <w:abstractNum w:abstractNumId="8" w15:restartNumberingAfterBreak="0">
+    <w:nsid w:val="25642C6B"/>
     <w:multiLevelType w:val="multilevel"/>
-    <w:tmpl w:val="5A9A3FFC"/>
+    <w:tmpl w:val="78DAC012"/>
     <w:lvl w:ilvl="0">
       <w:start w:val="1"/>
       <w:numFmt w:val="decimal"/>
@@ -7331,10 +7746,10 @@
       </w:pPr>
     </w:lvl>
   </w:abstractNum>
-  <w:abstractNum w:abstractNumId="6" w15:restartNumberingAfterBreak="0">
-    <w:nsid w:val="230D5C1C"/>
+  <w:abstractNum w:abstractNumId="9" w15:restartNumberingAfterBreak="0">
+    <w:nsid w:val="2BF76962"/>
     <w:multiLevelType w:val="multilevel"/>
-    <w:tmpl w:val="B4B05BFA"/>
+    <w:tmpl w:val="343EB2AC"/>
     <w:lvl w:ilvl="0">
       <w:start w:val="1"/>
       <w:numFmt w:val="decimal"/>
@@ -7448,308 +7863,10 @@
       </w:pPr>
     </w:lvl>
   </w:abstractNum>
-  <w:abstractNum w:abstractNumId="7" w15:restartNumberingAfterBreak="0">
-    <w:nsid w:val="25D517E5"/>
+  <w:abstractNum w:abstractNumId="10" w15:restartNumberingAfterBreak="0">
+    <w:nsid w:val="2E187C7D"/>
     <w:multiLevelType w:val="multilevel"/>
-    <w:tmpl w:val="B268F6F6"/>
-    <w:lvl w:ilvl="0">
-      <w:start w:val="1"/>
-      <w:numFmt w:val="bullet"/>
-      <w:lvlText w:val=""/>
-      <w:lvlJc w:val="left"/>
-      <w:pPr>
-        <w:tabs>
-          <w:tab w:val="num" w:pos="720"/>
-        </w:tabs>
-        <w:ind w:left="720" w:hanging="360"/>
-      </w:pPr>
-      <w:rPr>
-        <w:rFonts w:ascii="Symbol" w:hAnsi="Symbol" w:hint="default"/>
-        <w:sz w:val="20"/>
-      </w:rPr>
-    </w:lvl>
-    <w:lvl w:ilvl="1" w:tentative="1">
-      <w:start w:val="1"/>
-      <w:numFmt w:val="bullet"/>
-      <w:lvlText w:val="o"/>
-      <w:lvlJc w:val="left"/>
-      <w:pPr>
-        <w:tabs>
-          <w:tab w:val="num" w:pos="1440"/>
-        </w:tabs>
-        <w:ind w:left="1440" w:hanging="360"/>
-      </w:pPr>
-      <w:rPr>
-        <w:rFonts w:ascii="Courier New" w:hAnsi="Courier New" w:hint="default"/>
-        <w:sz w:val="20"/>
-      </w:rPr>
-    </w:lvl>
-    <w:lvl w:ilvl="2" w:tentative="1">
-      <w:start w:val="1"/>
-      <w:numFmt w:val="bullet"/>
-      <w:lvlText w:val=""/>
-      <w:lvlJc w:val="left"/>
-      <w:pPr>
-        <w:tabs>
-          <w:tab w:val="num" w:pos="2160"/>
-        </w:tabs>
-        <w:ind w:left="2160" w:hanging="360"/>
-      </w:pPr>
-      <w:rPr>
-        <w:rFonts w:ascii="Wingdings" w:hAnsi="Wingdings" w:hint="default"/>
-        <w:sz w:val="20"/>
-      </w:rPr>
-    </w:lvl>
-    <w:lvl w:ilvl="3" w:tentative="1">
-      <w:start w:val="1"/>
-      <w:numFmt w:val="bullet"/>
-      <w:lvlText w:val=""/>
-      <w:lvlJc w:val="left"/>
-      <w:pPr>
-        <w:tabs>
-          <w:tab w:val="num" w:pos="2880"/>
-        </w:tabs>
-        <w:ind w:left="2880" w:hanging="360"/>
-      </w:pPr>
-      <w:rPr>
-        <w:rFonts w:ascii="Wingdings" w:hAnsi="Wingdings" w:hint="default"/>
-        <w:sz w:val="20"/>
-      </w:rPr>
-    </w:lvl>
-    <w:lvl w:ilvl="4" w:tentative="1">
-      <w:start w:val="1"/>
-      <w:numFmt w:val="bullet"/>
-      <w:lvlText w:val=""/>
-      <w:lvlJc w:val="left"/>
-      <w:pPr>
-        <w:tabs>
-          <w:tab w:val="num" w:pos="3600"/>
-        </w:tabs>
-        <w:ind w:left="3600" w:hanging="360"/>
-      </w:pPr>
-      <w:rPr>
-        <w:rFonts w:ascii="Wingdings" w:hAnsi="Wingdings" w:hint="default"/>
-        <w:sz w:val="20"/>
-      </w:rPr>
-    </w:lvl>
-    <w:lvl w:ilvl="5" w:tentative="1">
-      <w:start w:val="1"/>
-      <w:numFmt w:val="bullet"/>
-      <w:lvlText w:val=""/>
-      <w:lvlJc w:val="left"/>
-      <w:pPr>
-        <w:tabs>
-          <w:tab w:val="num" w:pos="4320"/>
-        </w:tabs>
-        <w:ind w:left="4320" w:hanging="360"/>
-      </w:pPr>
-      <w:rPr>
-        <w:rFonts w:ascii="Wingdings" w:hAnsi="Wingdings" w:hint="default"/>
-        <w:sz w:val="20"/>
-      </w:rPr>
-    </w:lvl>
-    <w:lvl w:ilvl="6" w:tentative="1">
-      <w:start w:val="1"/>
-      <w:numFmt w:val="bullet"/>
-      <w:lvlText w:val=""/>
-      <w:lvlJc w:val="left"/>
-      <w:pPr>
-        <w:tabs>
-          <w:tab w:val="num" w:pos="5040"/>
-        </w:tabs>
-        <w:ind w:left="5040" w:hanging="360"/>
-      </w:pPr>
-      <w:rPr>
-        <w:rFonts w:ascii="Wingdings" w:hAnsi="Wingdings" w:hint="default"/>
-        <w:sz w:val="20"/>
-      </w:rPr>
-    </w:lvl>
-    <w:lvl w:ilvl="7" w:tentative="1">
-      <w:start w:val="1"/>
-      <w:numFmt w:val="bullet"/>
-      <w:lvlText w:val=""/>
-      <w:lvlJc w:val="left"/>
-      <w:pPr>
-        <w:tabs>
-          <w:tab w:val="num" w:pos="5760"/>
-        </w:tabs>
-        <w:ind w:left="5760" w:hanging="360"/>
-      </w:pPr>
-      <w:rPr>
-        <w:rFonts w:ascii="Wingdings" w:hAnsi="Wingdings" w:hint="default"/>
-        <w:sz w:val="20"/>
-      </w:rPr>
-    </w:lvl>
-    <w:lvl w:ilvl="8" w:tentative="1">
-      <w:start w:val="1"/>
-      <w:numFmt w:val="bullet"/>
-      <w:lvlText w:val=""/>
-      <w:lvlJc w:val="left"/>
-      <w:pPr>
-        <w:tabs>
-          <w:tab w:val="num" w:pos="6480"/>
-        </w:tabs>
-        <w:ind w:left="6480" w:hanging="360"/>
-      </w:pPr>
-      <w:rPr>
-        <w:rFonts w:ascii="Wingdings" w:hAnsi="Wingdings" w:hint="default"/>
-        <w:sz w:val="20"/>
-      </w:rPr>
-    </w:lvl>
-  </w:abstractNum>
-  <w:abstractNum w:abstractNumId="8" w15:restartNumberingAfterBreak="0">
-    <w:nsid w:val="31BC3F67"/>
-    <w:multiLevelType w:val="multilevel"/>
-    <w:tmpl w:val="FB548540"/>
-    <w:lvl w:ilvl="0">
-      <w:start w:val="1"/>
-      <w:numFmt w:val="bullet"/>
-      <w:lvlText w:val=""/>
-      <w:lvlJc w:val="left"/>
-      <w:pPr>
-        <w:tabs>
-          <w:tab w:val="num" w:pos="720"/>
-        </w:tabs>
-        <w:ind w:left="720" w:hanging="360"/>
-      </w:pPr>
-      <w:rPr>
-        <w:rFonts w:ascii="Symbol" w:hAnsi="Symbol" w:hint="default"/>
-        <w:sz w:val="20"/>
-      </w:rPr>
-    </w:lvl>
-    <w:lvl w:ilvl="1" w:tentative="1">
-      <w:start w:val="1"/>
-      <w:numFmt w:val="bullet"/>
-      <w:lvlText w:val="o"/>
-      <w:lvlJc w:val="left"/>
-      <w:pPr>
-        <w:tabs>
-          <w:tab w:val="num" w:pos="1440"/>
-        </w:tabs>
-        <w:ind w:left="1440" w:hanging="360"/>
-      </w:pPr>
-      <w:rPr>
-        <w:rFonts w:ascii="Courier New" w:hAnsi="Courier New" w:hint="default"/>
-        <w:sz w:val="20"/>
-      </w:rPr>
-    </w:lvl>
-    <w:lvl w:ilvl="2" w:tentative="1">
-      <w:start w:val="1"/>
-      <w:numFmt w:val="bullet"/>
-      <w:lvlText w:val=""/>
-      <w:lvlJc w:val="left"/>
-      <w:pPr>
-        <w:tabs>
-          <w:tab w:val="num" w:pos="2160"/>
-        </w:tabs>
-        <w:ind w:left="2160" w:hanging="360"/>
-      </w:pPr>
-      <w:rPr>
-        <w:rFonts w:ascii="Wingdings" w:hAnsi="Wingdings" w:hint="default"/>
-        <w:sz w:val="20"/>
-      </w:rPr>
-    </w:lvl>
-    <w:lvl w:ilvl="3" w:tentative="1">
-      <w:start w:val="1"/>
-      <w:numFmt w:val="bullet"/>
-      <w:lvlText w:val=""/>
-      <w:lvlJc w:val="left"/>
-      <w:pPr>
-        <w:tabs>
-          <w:tab w:val="num" w:pos="2880"/>
-        </w:tabs>
-        <w:ind w:left="2880" w:hanging="360"/>
-      </w:pPr>
-      <w:rPr>
-        <w:rFonts w:ascii="Wingdings" w:hAnsi="Wingdings" w:hint="default"/>
-        <w:sz w:val="20"/>
-      </w:rPr>
-    </w:lvl>
-    <w:lvl w:ilvl="4" w:tentative="1">
-      <w:start w:val="1"/>
-      <w:numFmt w:val="bullet"/>
-      <w:lvlText w:val=""/>
-      <w:lvlJc w:val="left"/>
-      <w:pPr>
-        <w:tabs>
-          <w:tab w:val="num" w:pos="3600"/>
-        </w:tabs>
-        <w:ind w:left="3600" w:hanging="360"/>
-      </w:pPr>
-      <w:rPr>
-        <w:rFonts w:ascii="Wingdings" w:hAnsi="Wingdings" w:hint="default"/>
-        <w:sz w:val="20"/>
-      </w:rPr>
-    </w:lvl>
-    <w:lvl w:ilvl="5" w:tentative="1">
-      <w:start w:val="1"/>
-      <w:numFmt w:val="bullet"/>
-      <w:lvlText w:val=""/>
-      <w:lvlJc w:val="left"/>
-      <w:pPr>
-        <w:tabs>
-          <w:tab w:val="num" w:pos="4320"/>
-        </w:tabs>
-        <w:ind w:left="4320" w:hanging="360"/>
-      </w:pPr>
-      <w:rPr>
-        <w:rFonts w:ascii="Wingdings" w:hAnsi="Wingdings" w:hint="default"/>
-        <w:sz w:val="20"/>
-      </w:rPr>
-    </w:lvl>
-    <w:lvl w:ilvl="6" w:tentative="1">
-      <w:start w:val="1"/>
-      <w:numFmt w:val="bullet"/>
-      <w:lvlText w:val=""/>
-      <w:lvlJc w:val="left"/>
-      <w:pPr>
-        <w:tabs>
-          <w:tab w:val="num" w:pos="5040"/>
-        </w:tabs>
-        <w:ind w:left="5040" w:hanging="360"/>
-      </w:pPr>
-      <w:rPr>
-        <w:rFonts w:ascii="Wingdings" w:hAnsi="Wingdings" w:hint="default"/>
-        <w:sz w:val="20"/>
-      </w:rPr>
-    </w:lvl>
-    <w:lvl w:ilvl="7" w:tentative="1">
-      <w:start w:val="1"/>
-      <w:numFmt w:val="bullet"/>
-      <w:lvlText w:val=""/>
-      <w:lvlJc w:val="left"/>
-      <w:pPr>
-        <w:tabs>
-          <w:tab w:val="num" w:pos="5760"/>
-        </w:tabs>
-        <w:ind w:left="5760" w:hanging="360"/>
-      </w:pPr>
-      <w:rPr>
-        <w:rFonts w:ascii="Wingdings" w:hAnsi="Wingdings" w:hint="default"/>
-        <w:sz w:val="20"/>
-      </w:rPr>
-    </w:lvl>
-    <w:lvl w:ilvl="8" w:tentative="1">
-      <w:start w:val="1"/>
-      <w:numFmt w:val="bullet"/>
-      <w:lvlText w:val=""/>
-      <w:lvlJc w:val="left"/>
-      <w:pPr>
-        <w:tabs>
-          <w:tab w:val="num" w:pos="6480"/>
-        </w:tabs>
-        <w:ind w:left="6480" w:hanging="360"/>
-      </w:pPr>
-      <w:rPr>
-        <w:rFonts w:ascii="Wingdings" w:hAnsi="Wingdings" w:hint="default"/>
-        <w:sz w:val="20"/>
-      </w:rPr>
-    </w:lvl>
-  </w:abstractNum>
-  <w:abstractNum w:abstractNumId="9" w15:restartNumberingAfterBreak="0">
-    <w:nsid w:val="35FA7DF3"/>
-    <w:multiLevelType w:val="multilevel"/>
-    <w:tmpl w:val="3E56F6BA"/>
+    <w:tmpl w:val="38E2820A"/>
     <w:lvl w:ilvl="0">
       <w:start w:val="1"/>
       <w:numFmt w:val="decimal"/>
@@ -7863,10 +7980,10 @@
       </w:pPr>
     </w:lvl>
   </w:abstractNum>
-  <w:abstractNum w:abstractNumId="10" w15:restartNumberingAfterBreak="0">
-    <w:nsid w:val="36D13748"/>
+  <w:abstractNum w:abstractNumId="11" w15:restartNumberingAfterBreak="0">
+    <w:nsid w:val="325A75CB"/>
     <w:multiLevelType w:val="multilevel"/>
-    <w:tmpl w:val="11F0A07C"/>
+    <w:tmpl w:val="67129F14"/>
     <w:lvl w:ilvl="0">
       <w:start w:val="1"/>
       <w:numFmt w:val="bullet"/>
@@ -8012,10 +8129,10 @@
       </w:rPr>
     </w:lvl>
   </w:abstractNum>
-  <w:abstractNum w:abstractNumId="11" w15:restartNumberingAfterBreak="0">
-    <w:nsid w:val="378473FE"/>
+  <w:abstractNum w:abstractNumId="12" w15:restartNumberingAfterBreak="0">
+    <w:nsid w:val="3957067F"/>
     <w:multiLevelType w:val="multilevel"/>
-    <w:tmpl w:val="44C47ED8"/>
+    <w:tmpl w:val="D29083EC"/>
     <w:lvl w:ilvl="0">
       <w:start w:val="1"/>
       <w:numFmt w:val="decimal"/>
@@ -8129,159 +8246,10 @@
       </w:pPr>
     </w:lvl>
   </w:abstractNum>
-  <w:abstractNum w:abstractNumId="12" w15:restartNumberingAfterBreak="0">
-    <w:nsid w:val="3ED668E9"/>
+  <w:abstractNum w:abstractNumId="13" w15:restartNumberingAfterBreak="0">
+    <w:nsid w:val="3B2B13FB"/>
     <w:multiLevelType w:val="multilevel"/>
-    <w:tmpl w:val="DD024478"/>
-    <w:lvl w:ilvl="0">
-      <w:start w:val="1"/>
-      <w:numFmt w:val="bullet"/>
-      <w:lvlText w:val=""/>
-      <w:lvlJc w:val="left"/>
-      <w:pPr>
-        <w:tabs>
-          <w:tab w:val="num" w:pos="720"/>
-        </w:tabs>
-        <w:ind w:left="720" w:hanging="360"/>
-      </w:pPr>
-      <w:rPr>
-        <w:rFonts w:ascii="Symbol" w:hAnsi="Symbol" w:hint="default"/>
-        <w:sz w:val="20"/>
-      </w:rPr>
-    </w:lvl>
-    <w:lvl w:ilvl="1" w:tentative="1">
-      <w:start w:val="1"/>
-      <w:numFmt w:val="bullet"/>
-      <w:lvlText w:val="o"/>
-      <w:lvlJc w:val="left"/>
-      <w:pPr>
-        <w:tabs>
-          <w:tab w:val="num" w:pos="1440"/>
-        </w:tabs>
-        <w:ind w:left="1440" w:hanging="360"/>
-      </w:pPr>
-      <w:rPr>
-        <w:rFonts w:ascii="Courier New" w:hAnsi="Courier New" w:hint="default"/>
-        <w:sz w:val="20"/>
-      </w:rPr>
-    </w:lvl>
-    <w:lvl w:ilvl="2" w:tentative="1">
-      <w:start w:val="1"/>
-      <w:numFmt w:val="bullet"/>
-      <w:lvlText w:val=""/>
-      <w:lvlJc w:val="left"/>
-      <w:pPr>
-        <w:tabs>
-          <w:tab w:val="num" w:pos="2160"/>
-        </w:tabs>
-        <w:ind w:left="2160" w:hanging="360"/>
-      </w:pPr>
-      <w:rPr>
-        <w:rFonts w:ascii="Wingdings" w:hAnsi="Wingdings" w:hint="default"/>
-        <w:sz w:val="20"/>
-      </w:rPr>
-    </w:lvl>
-    <w:lvl w:ilvl="3" w:tentative="1">
-      <w:start w:val="1"/>
-      <w:numFmt w:val="bullet"/>
-      <w:lvlText w:val=""/>
-      <w:lvlJc w:val="left"/>
-      <w:pPr>
-        <w:tabs>
-          <w:tab w:val="num" w:pos="2880"/>
-        </w:tabs>
-        <w:ind w:left="2880" w:hanging="360"/>
-      </w:pPr>
-      <w:rPr>
-        <w:rFonts w:ascii="Wingdings" w:hAnsi="Wingdings" w:hint="default"/>
-        <w:sz w:val="20"/>
-      </w:rPr>
-    </w:lvl>
-    <w:lvl w:ilvl="4" w:tentative="1">
-      <w:start w:val="1"/>
-      <w:numFmt w:val="bullet"/>
-      <w:lvlText w:val=""/>
-      <w:lvlJc w:val="left"/>
-      <w:pPr>
-        <w:tabs>
-          <w:tab w:val="num" w:pos="3600"/>
-        </w:tabs>
-        <w:ind w:left="3600" w:hanging="360"/>
-      </w:pPr>
-      <w:rPr>
-        <w:rFonts w:ascii="Wingdings" w:hAnsi="Wingdings" w:hint="default"/>
-        <w:sz w:val="20"/>
-      </w:rPr>
-    </w:lvl>
-    <w:lvl w:ilvl="5" w:tentative="1">
-      <w:start w:val="1"/>
-      <w:numFmt w:val="bullet"/>
-      <w:lvlText w:val=""/>
-      <w:lvlJc w:val="left"/>
-      <w:pPr>
-        <w:tabs>
-          <w:tab w:val="num" w:pos="4320"/>
-        </w:tabs>
-        <w:ind w:left="4320" w:hanging="360"/>
-      </w:pPr>
-      <w:rPr>
-        <w:rFonts w:ascii="Wingdings" w:hAnsi="Wingdings" w:hint="default"/>
-        <w:sz w:val="20"/>
-      </w:rPr>
-    </w:lvl>
-    <w:lvl w:ilvl="6" w:tentative="1">
-      <w:start w:val="1"/>
-      <w:numFmt w:val="bullet"/>
-      <w:lvlText w:val=""/>
-      <w:lvlJc w:val="left"/>
-      <w:pPr>
-        <w:tabs>
-          <w:tab w:val="num" w:pos="5040"/>
-        </w:tabs>
-        <w:ind w:left="5040" w:hanging="360"/>
-      </w:pPr>
-      <w:rPr>
-        <w:rFonts w:ascii="Wingdings" w:hAnsi="Wingdings" w:hint="default"/>
-        <w:sz w:val="20"/>
-      </w:rPr>
-    </w:lvl>
-    <w:lvl w:ilvl="7" w:tentative="1">
-      <w:start w:val="1"/>
-      <w:numFmt w:val="bullet"/>
-      <w:lvlText w:val=""/>
-      <w:lvlJc w:val="left"/>
-      <w:pPr>
-        <w:tabs>
-          <w:tab w:val="num" w:pos="5760"/>
-        </w:tabs>
-        <w:ind w:left="5760" w:hanging="360"/>
-      </w:pPr>
-      <w:rPr>
-        <w:rFonts w:ascii="Wingdings" w:hAnsi="Wingdings" w:hint="default"/>
-        <w:sz w:val="20"/>
-      </w:rPr>
-    </w:lvl>
-    <w:lvl w:ilvl="8" w:tentative="1">
-      <w:start w:val="1"/>
-      <w:numFmt w:val="bullet"/>
-      <w:lvlText w:val=""/>
-      <w:lvlJc w:val="left"/>
-      <w:pPr>
-        <w:tabs>
-          <w:tab w:val="num" w:pos="6480"/>
-        </w:tabs>
-        <w:ind w:left="6480" w:hanging="360"/>
-      </w:pPr>
-      <w:rPr>
-        <w:rFonts w:ascii="Wingdings" w:hAnsi="Wingdings" w:hint="default"/>
-        <w:sz w:val="20"/>
-      </w:rPr>
-    </w:lvl>
-  </w:abstractNum>
-  <w:abstractNum w:abstractNumId="13" w15:restartNumberingAfterBreak="0">
-    <w:nsid w:val="443015EA"/>
-    <w:multiLevelType w:val="multilevel"/>
-    <w:tmpl w:val="BDBEACAA"/>
+    <w:tmpl w:val="6FF4408C"/>
     <w:lvl w:ilvl="0">
       <w:start w:val="1"/>
       <w:numFmt w:val="bullet"/>
@@ -8428,9 +8396,1052 @@
     </w:lvl>
   </w:abstractNum>
   <w:abstractNum w:abstractNumId="14" w15:restartNumberingAfterBreak="0">
-    <w:nsid w:val="514C1E0D"/>
+    <w:nsid w:val="490D4141"/>
     <w:multiLevelType w:val="multilevel"/>
-    <w:tmpl w:val="3B22DB98"/>
+    <w:tmpl w:val="5980EAC8"/>
+    <w:lvl w:ilvl="0">
+      <w:start w:val="1"/>
+      <w:numFmt w:val="bullet"/>
+      <w:lvlText w:val=""/>
+      <w:lvlJc w:val="left"/>
+      <w:pPr>
+        <w:tabs>
+          <w:tab w:val="num" w:pos="720"/>
+        </w:tabs>
+        <w:ind w:left="720" w:hanging="360"/>
+      </w:pPr>
+      <w:rPr>
+        <w:rFonts w:ascii="Symbol" w:hAnsi="Symbol" w:hint="default"/>
+        <w:sz w:val="20"/>
+      </w:rPr>
+    </w:lvl>
+    <w:lvl w:ilvl="1" w:tentative="1">
+      <w:start w:val="1"/>
+      <w:numFmt w:val="bullet"/>
+      <w:lvlText w:val="o"/>
+      <w:lvlJc w:val="left"/>
+      <w:pPr>
+        <w:tabs>
+          <w:tab w:val="num" w:pos="1440"/>
+        </w:tabs>
+        <w:ind w:left="1440" w:hanging="360"/>
+      </w:pPr>
+      <w:rPr>
+        <w:rFonts w:ascii="Courier New" w:hAnsi="Courier New" w:hint="default"/>
+        <w:sz w:val="20"/>
+      </w:rPr>
+    </w:lvl>
+    <w:lvl w:ilvl="2" w:tentative="1">
+      <w:start w:val="1"/>
+      <w:numFmt w:val="bullet"/>
+      <w:lvlText w:val=""/>
+      <w:lvlJc w:val="left"/>
+      <w:pPr>
+        <w:tabs>
+          <w:tab w:val="num" w:pos="2160"/>
+        </w:tabs>
+        <w:ind w:left="2160" w:hanging="360"/>
+      </w:pPr>
+      <w:rPr>
+        <w:rFonts w:ascii="Wingdings" w:hAnsi="Wingdings" w:hint="default"/>
+        <w:sz w:val="20"/>
+      </w:rPr>
+    </w:lvl>
+    <w:lvl w:ilvl="3" w:tentative="1">
+      <w:start w:val="1"/>
+      <w:numFmt w:val="bullet"/>
+      <w:lvlText w:val=""/>
+      <w:lvlJc w:val="left"/>
+      <w:pPr>
+        <w:tabs>
+          <w:tab w:val="num" w:pos="2880"/>
+        </w:tabs>
+        <w:ind w:left="2880" w:hanging="360"/>
+      </w:pPr>
+      <w:rPr>
+        <w:rFonts w:ascii="Wingdings" w:hAnsi="Wingdings" w:hint="default"/>
+        <w:sz w:val="20"/>
+      </w:rPr>
+    </w:lvl>
+    <w:lvl w:ilvl="4" w:tentative="1">
+      <w:start w:val="1"/>
+      <w:numFmt w:val="bullet"/>
+      <w:lvlText w:val=""/>
+      <w:lvlJc w:val="left"/>
+      <w:pPr>
+        <w:tabs>
+          <w:tab w:val="num" w:pos="3600"/>
+        </w:tabs>
+        <w:ind w:left="3600" w:hanging="360"/>
+      </w:pPr>
+      <w:rPr>
+        <w:rFonts w:ascii="Wingdings" w:hAnsi="Wingdings" w:hint="default"/>
+        <w:sz w:val="20"/>
+      </w:rPr>
+    </w:lvl>
+    <w:lvl w:ilvl="5" w:tentative="1">
+      <w:start w:val="1"/>
+      <w:numFmt w:val="bullet"/>
+      <w:lvlText w:val=""/>
+      <w:lvlJc w:val="left"/>
+      <w:pPr>
+        <w:tabs>
+          <w:tab w:val="num" w:pos="4320"/>
+        </w:tabs>
+        <w:ind w:left="4320" w:hanging="360"/>
+      </w:pPr>
+      <w:rPr>
+        <w:rFonts w:ascii="Wingdings" w:hAnsi="Wingdings" w:hint="default"/>
+        <w:sz w:val="20"/>
+      </w:rPr>
+    </w:lvl>
+    <w:lvl w:ilvl="6" w:tentative="1">
+      <w:start w:val="1"/>
+      <w:numFmt w:val="bullet"/>
+      <w:lvlText w:val=""/>
+      <w:lvlJc w:val="left"/>
+      <w:pPr>
+        <w:tabs>
+          <w:tab w:val="num" w:pos="5040"/>
+        </w:tabs>
+        <w:ind w:left="5040" w:hanging="360"/>
+      </w:pPr>
+      <w:rPr>
+        <w:rFonts w:ascii="Wingdings" w:hAnsi="Wingdings" w:hint="default"/>
+        <w:sz w:val="20"/>
+      </w:rPr>
+    </w:lvl>
+    <w:lvl w:ilvl="7" w:tentative="1">
+      <w:start w:val="1"/>
+      <w:numFmt w:val="bullet"/>
+      <w:lvlText w:val=""/>
+      <w:lvlJc w:val="left"/>
+      <w:pPr>
+        <w:tabs>
+          <w:tab w:val="num" w:pos="5760"/>
+        </w:tabs>
+        <w:ind w:left="5760" w:hanging="360"/>
+      </w:pPr>
+      <w:rPr>
+        <w:rFonts w:ascii="Wingdings" w:hAnsi="Wingdings" w:hint="default"/>
+        <w:sz w:val="20"/>
+      </w:rPr>
+    </w:lvl>
+    <w:lvl w:ilvl="8" w:tentative="1">
+      <w:start w:val="1"/>
+      <w:numFmt w:val="bullet"/>
+      <w:lvlText w:val=""/>
+      <w:lvlJc w:val="left"/>
+      <w:pPr>
+        <w:tabs>
+          <w:tab w:val="num" w:pos="6480"/>
+        </w:tabs>
+        <w:ind w:left="6480" w:hanging="360"/>
+      </w:pPr>
+      <w:rPr>
+        <w:rFonts w:ascii="Wingdings" w:hAnsi="Wingdings" w:hint="default"/>
+        <w:sz w:val="20"/>
+      </w:rPr>
+    </w:lvl>
+  </w:abstractNum>
+  <w:abstractNum w:abstractNumId="15" w15:restartNumberingAfterBreak="0">
+    <w:nsid w:val="4F2F1640"/>
+    <w:multiLevelType w:val="multilevel"/>
+    <w:tmpl w:val="83248F16"/>
+    <w:lvl w:ilvl="0">
+      <w:start w:val="1"/>
+      <w:numFmt w:val="bullet"/>
+      <w:lvlText w:val=""/>
+      <w:lvlJc w:val="left"/>
+      <w:pPr>
+        <w:tabs>
+          <w:tab w:val="num" w:pos="720"/>
+        </w:tabs>
+        <w:ind w:left="720" w:hanging="360"/>
+      </w:pPr>
+      <w:rPr>
+        <w:rFonts w:ascii="Symbol" w:hAnsi="Symbol" w:hint="default"/>
+        <w:sz w:val="20"/>
+      </w:rPr>
+    </w:lvl>
+    <w:lvl w:ilvl="1" w:tentative="1">
+      <w:start w:val="1"/>
+      <w:numFmt w:val="bullet"/>
+      <w:lvlText w:val="o"/>
+      <w:lvlJc w:val="left"/>
+      <w:pPr>
+        <w:tabs>
+          <w:tab w:val="num" w:pos="1440"/>
+        </w:tabs>
+        <w:ind w:left="1440" w:hanging="360"/>
+      </w:pPr>
+      <w:rPr>
+        <w:rFonts w:ascii="Courier New" w:hAnsi="Courier New" w:hint="default"/>
+        <w:sz w:val="20"/>
+      </w:rPr>
+    </w:lvl>
+    <w:lvl w:ilvl="2" w:tentative="1">
+      <w:start w:val="1"/>
+      <w:numFmt w:val="bullet"/>
+      <w:lvlText w:val=""/>
+      <w:lvlJc w:val="left"/>
+      <w:pPr>
+        <w:tabs>
+          <w:tab w:val="num" w:pos="2160"/>
+        </w:tabs>
+        <w:ind w:left="2160" w:hanging="360"/>
+      </w:pPr>
+      <w:rPr>
+        <w:rFonts w:ascii="Wingdings" w:hAnsi="Wingdings" w:hint="default"/>
+        <w:sz w:val="20"/>
+      </w:rPr>
+    </w:lvl>
+    <w:lvl w:ilvl="3" w:tentative="1">
+      <w:start w:val="1"/>
+      <w:numFmt w:val="bullet"/>
+      <w:lvlText w:val=""/>
+      <w:lvlJc w:val="left"/>
+      <w:pPr>
+        <w:tabs>
+          <w:tab w:val="num" w:pos="2880"/>
+        </w:tabs>
+        <w:ind w:left="2880" w:hanging="360"/>
+      </w:pPr>
+      <w:rPr>
+        <w:rFonts w:ascii="Wingdings" w:hAnsi="Wingdings" w:hint="default"/>
+        <w:sz w:val="20"/>
+      </w:rPr>
+    </w:lvl>
+    <w:lvl w:ilvl="4" w:tentative="1">
+      <w:start w:val="1"/>
+      <w:numFmt w:val="bullet"/>
+      <w:lvlText w:val=""/>
+      <w:lvlJc w:val="left"/>
+      <w:pPr>
+        <w:tabs>
+          <w:tab w:val="num" w:pos="3600"/>
+        </w:tabs>
+        <w:ind w:left="3600" w:hanging="360"/>
+      </w:pPr>
+      <w:rPr>
+        <w:rFonts w:ascii="Wingdings" w:hAnsi="Wingdings" w:hint="default"/>
+        <w:sz w:val="20"/>
+      </w:rPr>
+    </w:lvl>
+    <w:lvl w:ilvl="5" w:tentative="1">
+      <w:start w:val="1"/>
+      <w:numFmt w:val="bullet"/>
+      <w:lvlText w:val=""/>
+      <w:lvlJc w:val="left"/>
+      <w:pPr>
+        <w:tabs>
+          <w:tab w:val="num" w:pos="4320"/>
+        </w:tabs>
+        <w:ind w:left="4320" w:hanging="360"/>
+      </w:pPr>
+      <w:rPr>
+        <w:rFonts w:ascii="Wingdings" w:hAnsi="Wingdings" w:hint="default"/>
+        <w:sz w:val="20"/>
+      </w:rPr>
+    </w:lvl>
+    <w:lvl w:ilvl="6" w:tentative="1">
+      <w:start w:val="1"/>
+      <w:numFmt w:val="bullet"/>
+      <w:lvlText w:val=""/>
+      <w:lvlJc w:val="left"/>
+      <w:pPr>
+        <w:tabs>
+          <w:tab w:val="num" w:pos="5040"/>
+        </w:tabs>
+        <w:ind w:left="5040" w:hanging="360"/>
+      </w:pPr>
+      <w:rPr>
+        <w:rFonts w:ascii="Wingdings" w:hAnsi="Wingdings" w:hint="default"/>
+        <w:sz w:val="20"/>
+      </w:rPr>
+    </w:lvl>
+    <w:lvl w:ilvl="7" w:tentative="1">
+      <w:start w:val="1"/>
+      <w:numFmt w:val="bullet"/>
+      <w:lvlText w:val=""/>
+      <w:lvlJc w:val="left"/>
+      <w:pPr>
+        <w:tabs>
+          <w:tab w:val="num" w:pos="5760"/>
+        </w:tabs>
+        <w:ind w:left="5760" w:hanging="360"/>
+      </w:pPr>
+      <w:rPr>
+        <w:rFonts w:ascii="Wingdings" w:hAnsi="Wingdings" w:hint="default"/>
+        <w:sz w:val="20"/>
+      </w:rPr>
+    </w:lvl>
+    <w:lvl w:ilvl="8" w:tentative="1">
+      <w:start w:val="1"/>
+      <w:numFmt w:val="bullet"/>
+      <w:lvlText w:val=""/>
+      <w:lvlJc w:val="left"/>
+      <w:pPr>
+        <w:tabs>
+          <w:tab w:val="num" w:pos="6480"/>
+        </w:tabs>
+        <w:ind w:left="6480" w:hanging="360"/>
+      </w:pPr>
+      <w:rPr>
+        <w:rFonts w:ascii="Wingdings" w:hAnsi="Wingdings" w:hint="default"/>
+        <w:sz w:val="20"/>
+      </w:rPr>
+    </w:lvl>
+  </w:abstractNum>
+  <w:abstractNum w:abstractNumId="16" w15:restartNumberingAfterBreak="0">
+    <w:nsid w:val="556D7449"/>
+    <w:multiLevelType w:val="multilevel"/>
+    <w:tmpl w:val="3DC8B45C"/>
+    <w:lvl w:ilvl="0">
+      <w:start w:val="1"/>
+      <w:numFmt w:val="bullet"/>
+      <w:lvlText w:val=""/>
+      <w:lvlJc w:val="left"/>
+      <w:pPr>
+        <w:tabs>
+          <w:tab w:val="num" w:pos="720"/>
+        </w:tabs>
+        <w:ind w:left="720" w:hanging="360"/>
+      </w:pPr>
+      <w:rPr>
+        <w:rFonts w:ascii="Symbol" w:hAnsi="Symbol" w:hint="default"/>
+        <w:sz w:val="20"/>
+      </w:rPr>
+    </w:lvl>
+    <w:lvl w:ilvl="1" w:tentative="1">
+      <w:start w:val="1"/>
+      <w:numFmt w:val="bullet"/>
+      <w:lvlText w:val="o"/>
+      <w:lvlJc w:val="left"/>
+      <w:pPr>
+        <w:tabs>
+          <w:tab w:val="num" w:pos="1440"/>
+        </w:tabs>
+        <w:ind w:left="1440" w:hanging="360"/>
+      </w:pPr>
+      <w:rPr>
+        <w:rFonts w:ascii="Courier New" w:hAnsi="Courier New" w:hint="default"/>
+        <w:sz w:val="20"/>
+      </w:rPr>
+    </w:lvl>
+    <w:lvl w:ilvl="2" w:tentative="1">
+      <w:start w:val="1"/>
+      <w:numFmt w:val="bullet"/>
+      <w:lvlText w:val=""/>
+      <w:lvlJc w:val="left"/>
+      <w:pPr>
+        <w:tabs>
+          <w:tab w:val="num" w:pos="2160"/>
+        </w:tabs>
+        <w:ind w:left="2160" w:hanging="360"/>
+      </w:pPr>
+      <w:rPr>
+        <w:rFonts w:ascii="Wingdings" w:hAnsi="Wingdings" w:hint="default"/>
+        <w:sz w:val="20"/>
+      </w:rPr>
+    </w:lvl>
+    <w:lvl w:ilvl="3" w:tentative="1">
+      <w:start w:val="1"/>
+      <w:numFmt w:val="bullet"/>
+      <w:lvlText w:val=""/>
+      <w:lvlJc w:val="left"/>
+      <w:pPr>
+        <w:tabs>
+          <w:tab w:val="num" w:pos="2880"/>
+        </w:tabs>
+        <w:ind w:left="2880" w:hanging="360"/>
+      </w:pPr>
+      <w:rPr>
+        <w:rFonts w:ascii="Wingdings" w:hAnsi="Wingdings" w:hint="default"/>
+        <w:sz w:val="20"/>
+      </w:rPr>
+    </w:lvl>
+    <w:lvl w:ilvl="4" w:tentative="1">
+      <w:start w:val="1"/>
+      <w:numFmt w:val="bullet"/>
+      <w:lvlText w:val=""/>
+      <w:lvlJc w:val="left"/>
+      <w:pPr>
+        <w:tabs>
+          <w:tab w:val="num" w:pos="3600"/>
+        </w:tabs>
+        <w:ind w:left="3600" w:hanging="360"/>
+      </w:pPr>
+      <w:rPr>
+        <w:rFonts w:ascii="Wingdings" w:hAnsi="Wingdings" w:hint="default"/>
+        <w:sz w:val="20"/>
+      </w:rPr>
+    </w:lvl>
+    <w:lvl w:ilvl="5" w:tentative="1">
+      <w:start w:val="1"/>
+      <w:numFmt w:val="bullet"/>
+      <w:lvlText w:val=""/>
+      <w:lvlJc w:val="left"/>
+      <w:pPr>
+        <w:tabs>
+          <w:tab w:val="num" w:pos="4320"/>
+        </w:tabs>
+        <w:ind w:left="4320" w:hanging="360"/>
+      </w:pPr>
+      <w:rPr>
+        <w:rFonts w:ascii="Wingdings" w:hAnsi="Wingdings" w:hint="default"/>
+        <w:sz w:val="20"/>
+      </w:rPr>
+    </w:lvl>
+    <w:lvl w:ilvl="6" w:tentative="1">
+      <w:start w:val="1"/>
+      <w:numFmt w:val="bullet"/>
+      <w:lvlText w:val=""/>
+      <w:lvlJc w:val="left"/>
+      <w:pPr>
+        <w:tabs>
+          <w:tab w:val="num" w:pos="5040"/>
+        </w:tabs>
+        <w:ind w:left="5040" w:hanging="360"/>
+      </w:pPr>
+      <w:rPr>
+        <w:rFonts w:ascii="Wingdings" w:hAnsi="Wingdings" w:hint="default"/>
+        <w:sz w:val="20"/>
+      </w:rPr>
+    </w:lvl>
+    <w:lvl w:ilvl="7" w:tentative="1">
+      <w:start w:val="1"/>
+      <w:numFmt w:val="bullet"/>
+      <w:lvlText w:val=""/>
+      <w:lvlJc w:val="left"/>
+      <w:pPr>
+        <w:tabs>
+          <w:tab w:val="num" w:pos="5760"/>
+        </w:tabs>
+        <w:ind w:left="5760" w:hanging="360"/>
+      </w:pPr>
+      <w:rPr>
+        <w:rFonts w:ascii="Wingdings" w:hAnsi="Wingdings" w:hint="default"/>
+        <w:sz w:val="20"/>
+      </w:rPr>
+    </w:lvl>
+    <w:lvl w:ilvl="8" w:tentative="1">
+      <w:start w:val="1"/>
+      <w:numFmt w:val="bullet"/>
+      <w:lvlText w:val=""/>
+      <w:lvlJc w:val="left"/>
+      <w:pPr>
+        <w:tabs>
+          <w:tab w:val="num" w:pos="6480"/>
+        </w:tabs>
+        <w:ind w:left="6480" w:hanging="360"/>
+      </w:pPr>
+      <w:rPr>
+        <w:rFonts w:ascii="Wingdings" w:hAnsi="Wingdings" w:hint="default"/>
+        <w:sz w:val="20"/>
+      </w:rPr>
+    </w:lvl>
+  </w:abstractNum>
+  <w:abstractNum w:abstractNumId="17" w15:restartNumberingAfterBreak="0">
+    <w:nsid w:val="62163445"/>
+    <w:multiLevelType w:val="multilevel"/>
+    <w:tmpl w:val="0CEC283C"/>
+    <w:lvl w:ilvl="0">
+      <w:start w:val="1"/>
+      <w:numFmt w:val="bullet"/>
+      <w:lvlText w:val=""/>
+      <w:lvlJc w:val="left"/>
+      <w:pPr>
+        <w:tabs>
+          <w:tab w:val="num" w:pos="720"/>
+        </w:tabs>
+        <w:ind w:left="720" w:hanging="360"/>
+      </w:pPr>
+      <w:rPr>
+        <w:rFonts w:ascii="Symbol" w:hAnsi="Symbol" w:hint="default"/>
+        <w:sz w:val="20"/>
+      </w:rPr>
+    </w:lvl>
+    <w:lvl w:ilvl="1" w:tentative="1">
+      <w:start w:val="1"/>
+      <w:numFmt w:val="bullet"/>
+      <w:lvlText w:val="o"/>
+      <w:lvlJc w:val="left"/>
+      <w:pPr>
+        <w:tabs>
+          <w:tab w:val="num" w:pos="1440"/>
+        </w:tabs>
+        <w:ind w:left="1440" w:hanging="360"/>
+      </w:pPr>
+      <w:rPr>
+        <w:rFonts w:ascii="Courier New" w:hAnsi="Courier New" w:hint="default"/>
+        <w:sz w:val="20"/>
+      </w:rPr>
+    </w:lvl>
+    <w:lvl w:ilvl="2" w:tentative="1">
+      <w:start w:val="1"/>
+      <w:numFmt w:val="bullet"/>
+      <w:lvlText w:val=""/>
+      <w:lvlJc w:val="left"/>
+      <w:pPr>
+        <w:tabs>
+          <w:tab w:val="num" w:pos="2160"/>
+        </w:tabs>
+        <w:ind w:left="2160" w:hanging="360"/>
+      </w:pPr>
+      <w:rPr>
+        <w:rFonts w:ascii="Wingdings" w:hAnsi="Wingdings" w:hint="default"/>
+        <w:sz w:val="20"/>
+      </w:rPr>
+    </w:lvl>
+    <w:lvl w:ilvl="3" w:tentative="1">
+      <w:start w:val="1"/>
+      <w:numFmt w:val="bullet"/>
+      <w:lvlText w:val=""/>
+      <w:lvlJc w:val="left"/>
+      <w:pPr>
+        <w:tabs>
+          <w:tab w:val="num" w:pos="2880"/>
+        </w:tabs>
+        <w:ind w:left="2880" w:hanging="360"/>
+      </w:pPr>
+      <w:rPr>
+        <w:rFonts w:ascii="Wingdings" w:hAnsi="Wingdings" w:hint="default"/>
+        <w:sz w:val="20"/>
+      </w:rPr>
+    </w:lvl>
+    <w:lvl w:ilvl="4" w:tentative="1">
+      <w:start w:val="1"/>
+      <w:numFmt w:val="bullet"/>
+      <w:lvlText w:val=""/>
+      <w:lvlJc w:val="left"/>
+      <w:pPr>
+        <w:tabs>
+          <w:tab w:val="num" w:pos="3600"/>
+        </w:tabs>
+        <w:ind w:left="3600" w:hanging="360"/>
+      </w:pPr>
+      <w:rPr>
+        <w:rFonts w:ascii="Wingdings" w:hAnsi="Wingdings" w:hint="default"/>
+        <w:sz w:val="20"/>
+      </w:rPr>
+    </w:lvl>
+    <w:lvl w:ilvl="5" w:tentative="1">
+      <w:start w:val="1"/>
+      <w:numFmt w:val="bullet"/>
+      <w:lvlText w:val=""/>
+      <w:lvlJc w:val="left"/>
+      <w:pPr>
+        <w:tabs>
+          <w:tab w:val="num" w:pos="4320"/>
+        </w:tabs>
+        <w:ind w:left="4320" w:hanging="360"/>
+      </w:pPr>
+      <w:rPr>
+        <w:rFonts w:ascii="Wingdings" w:hAnsi="Wingdings" w:hint="default"/>
+        <w:sz w:val="20"/>
+      </w:rPr>
+    </w:lvl>
+    <w:lvl w:ilvl="6" w:tentative="1">
+      <w:start w:val="1"/>
+      <w:numFmt w:val="bullet"/>
+      <w:lvlText w:val=""/>
+      <w:lvlJc w:val="left"/>
+      <w:pPr>
+        <w:tabs>
+          <w:tab w:val="num" w:pos="5040"/>
+        </w:tabs>
+        <w:ind w:left="5040" w:hanging="360"/>
+      </w:pPr>
+      <w:rPr>
+        <w:rFonts w:ascii="Wingdings" w:hAnsi="Wingdings" w:hint="default"/>
+        <w:sz w:val="20"/>
+      </w:rPr>
+    </w:lvl>
+    <w:lvl w:ilvl="7" w:tentative="1">
+      <w:start w:val="1"/>
+      <w:numFmt w:val="bullet"/>
+      <w:lvlText w:val=""/>
+      <w:lvlJc w:val="left"/>
+      <w:pPr>
+        <w:tabs>
+          <w:tab w:val="num" w:pos="5760"/>
+        </w:tabs>
+        <w:ind w:left="5760" w:hanging="360"/>
+      </w:pPr>
+      <w:rPr>
+        <w:rFonts w:ascii="Wingdings" w:hAnsi="Wingdings" w:hint="default"/>
+        <w:sz w:val="20"/>
+      </w:rPr>
+    </w:lvl>
+    <w:lvl w:ilvl="8" w:tentative="1">
+      <w:start w:val="1"/>
+      <w:numFmt w:val="bullet"/>
+      <w:lvlText w:val=""/>
+      <w:lvlJc w:val="left"/>
+      <w:pPr>
+        <w:tabs>
+          <w:tab w:val="num" w:pos="6480"/>
+        </w:tabs>
+        <w:ind w:left="6480" w:hanging="360"/>
+      </w:pPr>
+      <w:rPr>
+        <w:rFonts w:ascii="Wingdings" w:hAnsi="Wingdings" w:hint="default"/>
+        <w:sz w:val="20"/>
+      </w:rPr>
+    </w:lvl>
+  </w:abstractNum>
+  <w:abstractNum w:abstractNumId="18" w15:restartNumberingAfterBreak="0">
+    <w:nsid w:val="63876C32"/>
+    <w:multiLevelType w:val="multilevel"/>
+    <w:tmpl w:val="F31037A0"/>
+    <w:lvl w:ilvl="0">
+      <w:start w:val="1"/>
+      <w:numFmt w:val="bullet"/>
+      <w:lvlText w:val=""/>
+      <w:lvlJc w:val="left"/>
+      <w:pPr>
+        <w:tabs>
+          <w:tab w:val="num" w:pos="720"/>
+        </w:tabs>
+        <w:ind w:left="720" w:hanging="360"/>
+      </w:pPr>
+      <w:rPr>
+        <w:rFonts w:ascii="Symbol" w:hAnsi="Symbol" w:hint="default"/>
+        <w:sz w:val="20"/>
+      </w:rPr>
+    </w:lvl>
+    <w:lvl w:ilvl="1" w:tentative="1">
+      <w:start w:val="1"/>
+      <w:numFmt w:val="bullet"/>
+      <w:lvlText w:val="o"/>
+      <w:lvlJc w:val="left"/>
+      <w:pPr>
+        <w:tabs>
+          <w:tab w:val="num" w:pos="1440"/>
+        </w:tabs>
+        <w:ind w:left="1440" w:hanging="360"/>
+      </w:pPr>
+      <w:rPr>
+        <w:rFonts w:ascii="Courier New" w:hAnsi="Courier New" w:hint="default"/>
+        <w:sz w:val="20"/>
+      </w:rPr>
+    </w:lvl>
+    <w:lvl w:ilvl="2" w:tentative="1">
+      <w:start w:val="1"/>
+      <w:numFmt w:val="bullet"/>
+      <w:lvlText w:val=""/>
+      <w:lvlJc w:val="left"/>
+      <w:pPr>
+        <w:tabs>
+          <w:tab w:val="num" w:pos="2160"/>
+        </w:tabs>
+        <w:ind w:left="2160" w:hanging="360"/>
+      </w:pPr>
+      <w:rPr>
+        <w:rFonts w:ascii="Wingdings" w:hAnsi="Wingdings" w:hint="default"/>
+        <w:sz w:val="20"/>
+      </w:rPr>
+    </w:lvl>
+    <w:lvl w:ilvl="3" w:tentative="1">
+      <w:start w:val="1"/>
+      <w:numFmt w:val="bullet"/>
+      <w:lvlText w:val=""/>
+      <w:lvlJc w:val="left"/>
+      <w:pPr>
+        <w:tabs>
+          <w:tab w:val="num" w:pos="2880"/>
+        </w:tabs>
+        <w:ind w:left="2880" w:hanging="360"/>
+      </w:pPr>
+      <w:rPr>
+        <w:rFonts w:ascii="Wingdings" w:hAnsi="Wingdings" w:hint="default"/>
+        <w:sz w:val="20"/>
+      </w:rPr>
+    </w:lvl>
+    <w:lvl w:ilvl="4" w:tentative="1">
+      <w:start w:val="1"/>
+      <w:numFmt w:val="bullet"/>
+      <w:lvlText w:val=""/>
+      <w:lvlJc w:val="left"/>
+      <w:pPr>
+        <w:tabs>
+          <w:tab w:val="num" w:pos="3600"/>
+        </w:tabs>
+        <w:ind w:left="3600" w:hanging="360"/>
+      </w:pPr>
+      <w:rPr>
+        <w:rFonts w:ascii="Wingdings" w:hAnsi="Wingdings" w:hint="default"/>
+        <w:sz w:val="20"/>
+      </w:rPr>
+    </w:lvl>
+    <w:lvl w:ilvl="5" w:tentative="1">
+      <w:start w:val="1"/>
+      <w:numFmt w:val="bullet"/>
+      <w:lvlText w:val=""/>
+      <w:lvlJc w:val="left"/>
+      <w:pPr>
+        <w:tabs>
+          <w:tab w:val="num" w:pos="4320"/>
+        </w:tabs>
+        <w:ind w:left="4320" w:hanging="360"/>
+      </w:pPr>
+      <w:rPr>
+        <w:rFonts w:ascii="Wingdings" w:hAnsi="Wingdings" w:hint="default"/>
+        <w:sz w:val="20"/>
+      </w:rPr>
+    </w:lvl>
+    <w:lvl w:ilvl="6" w:tentative="1">
+      <w:start w:val="1"/>
+      <w:numFmt w:val="bullet"/>
+      <w:lvlText w:val=""/>
+      <w:lvlJc w:val="left"/>
+      <w:pPr>
+        <w:tabs>
+          <w:tab w:val="num" w:pos="5040"/>
+        </w:tabs>
+        <w:ind w:left="5040" w:hanging="360"/>
+      </w:pPr>
+      <w:rPr>
+        <w:rFonts w:ascii="Wingdings" w:hAnsi="Wingdings" w:hint="default"/>
+        <w:sz w:val="20"/>
+      </w:rPr>
+    </w:lvl>
+    <w:lvl w:ilvl="7" w:tentative="1">
+      <w:start w:val="1"/>
+      <w:numFmt w:val="bullet"/>
+      <w:lvlText w:val=""/>
+      <w:lvlJc w:val="left"/>
+      <w:pPr>
+        <w:tabs>
+          <w:tab w:val="num" w:pos="5760"/>
+        </w:tabs>
+        <w:ind w:left="5760" w:hanging="360"/>
+      </w:pPr>
+      <w:rPr>
+        <w:rFonts w:ascii="Wingdings" w:hAnsi="Wingdings" w:hint="default"/>
+        <w:sz w:val="20"/>
+      </w:rPr>
+    </w:lvl>
+    <w:lvl w:ilvl="8" w:tentative="1">
+      <w:start w:val="1"/>
+      <w:numFmt w:val="bullet"/>
+      <w:lvlText w:val=""/>
+      <w:lvlJc w:val="left"/>
+      <w:pPr>
+        <w:tabs>
+          <w:tab w:val="num" w:pos="6480"/>
+        </w:tabs>
+        <w:ind w:left="6480" w:hanging="360"/>
+      </w:pPr>
+      <w:rPr>
+        <w:rFonts w:ascii="Wingdings" w:hAnsi="Wingdings" w:hint="default"/>
+        <w:sz w:val="20"/>
+      </w:rPr>
+    </w:lvl>
+  </w:abstractNum>
+  <w:abstractNum w:abstractNumId="19" w15:restartNumberingAfterBreak="0">
+    <w:nsid w:val="6C140BE9"/>
+    <w:multiLevelType w:val="multilevel"/>
+    <w:tmpl w:val="3CB2F5FE"/>
+    <w:lvl w:ilvl="0">
+      <w:start w:val="1"/>
+      <w:numFmt w:val="bullet"/>
+      <w:lvlText w:val=""/>
+      <w:lvlJc w:val="left"/>
+      <w:pPr>
+        <w:tabs>
+          <w:tab w:val="num" w:pos="720"/>
+        </w:tabs>
+        <w:ind w:left="720" w:hanging="360"/>
+      </w:pPr>
+      <w:rPr>
+        <w:rFonts w:ascii="Symbol" w:hAnsi="Symbol" w:hint="default"/>
+        <w:sz w:val="20"/>
+      </w:rPr>
+    </w:lvl>
+    <w:lvl w:ilvl="1" w:tentative="1">
+      <w:start w:val="1"/>
+      <w:numFmt w:val="bullet"/>
+      <w:lvlText w:val="o"/>
+      <w:lvlJc w:val="left"/>
+      <w:pPr>
+        <w:tabs>
+          <w:tab w:val="num" w:pos="1440"/>
+        </w:tabs>
+        <w:ind w:left="1440" w:hanging="360"/>
+      </w:pPr>
+      <w:rPr>
+        <w:rFonts w:ascii="Courier New" w:hAnsi="Courier New" w:hint="default"/>
+        <w:sz w:val="20"/>
+      </w:rPr>
+    </w:lvl>
+    <w:lvl w:ilvl="2" w:tentative="1">
+      <w:start w:val="1"/>
+      <w:numFmt w:val="bullet"/>
+      <w:lvlText w:val=""/>
+      <w:lvlJc w:val="left"/>
+      <w:pPr>
+        <w:tabs>
+          <w:tab w:val="num" w:pos="2160"/>
+        </w:tabs>
+        <w:ind w:left="2160" w:hanging="360"/>
+      </w:pPr>
+      <w:rPr>
+        <w:rFonts w:ascii="Wingdings" w:hAnsi="Wingdings" w:hint="default"/>
+        <w:sz w:val="20"/>
+      </w:rPr>
+    </w:lvl>
+    <w:lvl w:ilvl="3" w:tentative="1">
+      <w:start w:val="1"/>
+      <w:numFmt w:val="bullet"/>
+      <w:lvlText w:val=""/>
+      <w:lvlJc w:val="left"/>
+      <w:pPr>
+        <w:tabs>
+          <w:tab w:val="num" w:pos="2880"/>
+        </w:tabs>
+        <w:ind w:left="2880" w:hanging="360"/>
+      </w:pPr>
+      <w:rPr>
+        <w:rFonts w:ascii="Wingdings" w:hAnsi="Wingdings" w:hint="default"/>
+        <w:sz w:val="20"/>
+      </w:rPr>
+    </w:lvl>
+    <w:lvl w:ilvl="4" w:tentative="1">
+      <w:start w:val="1"/>
+      <w:numFmt w:val="bullet"/>
+      <w:lvlText w:val=""/>
+      <w:lvlJc w:val="left"/>
+      <w:pPr>
+        <w:tabs>
+          <w:tab w:val="num" w:pos="3600"/>
+        </w:tabs>
+        <w:ind w:left="3600" w:hanging="360"/>
+      </w:pPr>
+      <w:rPr>
+        <w:rFonts w:ascii="Wingdings" w:hAnsi="Wingdings" w:hint="default"/>
+        <w:sz w:val="20"/>
+      </w:rPr>
+    </w:lvl>
+    <w:lvl w:ilvl="5" w:tentative="1">
+      <w:start w:val="1"/>
+      <w:numFmt w:val="bullet"/>
+      <w:lvlText w:val=""/>
+      <w:lvlJc w:val="left"/>
+      <w:pPr>
+        <w:tabs>
+          <w:tab w:val="num" w:pos="4320"/>
+        </w:tabs>
+        <w:ind w:left="4320" w:hanging="360"/>
+      </w:pPr>
+      <w:rPr>
+        <w:rFonts w:ascii="Wingdings" w:hAnsi="Wingdings" w:hint="default"/>
+        <w:sz w:val="20"/>
+      </w:rPr>
+    </w:lvl>
+    <w:lvl w:ilvl="6" w:tentative="1">
+      <w:start w:val="1"/>
+      <w:numFmt w:val="bullet"/>
+      <w:lvlText w:val=""/>
+      <w:lvlJc w:val="left"/>
+      <w:pPr>
+        <w:tabs>
+          <w:tab w:val="num" w:pos="5040"/>
+        </w:tabs>
+        <w:ind w:left="5040" w:hanging="360"/>
+      </w:pPr>
+      <w:rPr>
+        <w:rFonts w:ascii="Wingdings" w:hAnsi="Wingdings" w:hint="default"/>
+        <w:sz w:val="20"/>
+      </w:rPr>
+    </w:lvl>
+    <w:lvl w:ilvl="7" w:tentative="1">
+      <w:start w:val="1"/>
+      <w:numFmt w:val="bullet"/>
+      <w:lvlText w:val=""/>
+      <w:lvlJc w:val="left"/>
+      <w:pPr>
+        <w:tabs>
+          <w:tab w:val="num" w:pos="5760"/>
+        </w:tabs>
+        <w:ind w:left="5760" w:hanging="360"/>
+      </w:pPr>
+      <w:rPr>
+        <w:rFonts w:ascii="Wingdings" w:hAnsi="Wingdings" w:hint="default"/>
+        <w:sz w:val="20"/>
+      </w:rPr>
+    </w:lvl>
+    <w:lvl w:ilvl="8" w:tentative="1">
+      <w:start w:val="1"/>
+      <w:numFmt w:val="bullet"/>
+      <w:lvlText w:val=""/>
+      <w:lvlJc w:val="left"/>
+      <w:pPr>
+        <w:tabs>
+          <w:tab w:val="num" w:pos="6480"/>
+        </w:tabs>
+        <w:ind w:left="6480" w:hanging="360"/>
+      </w:pPr>
+      <w:rPr>
+        <w:rFonts w:ascii="Wingdings" w:hAnsi="Wingdings" w:hint="default"/>
+        <w:sz w:val="20"/>
+      </w:rPr>
+    </w:lvl>
+  </w:abstractNum>
+  <w:abstractNum w:abstractNumId="20" w15:restartNumberingAfterBreak="0">
+    <w:nsid w:val="72E75B52"/>
+    <w:multiLevelType w:val="multilevel"/>
+    <w:tmpl w:val="51348D1A"/>
+    <w:lvl w:ilvl="0">
+      <w:start w:val="1"/>
+      <w:numFmt w:val="bullet"/>
+      <w:lvlText w:val=""/>
+      <w:lvlJc w:val="left"/>
+      <w:pPr>
+        <w:tabs>
+          <w:tab w:val="num" w:pos="720"/>
+        </w:tabs>
+        <w:ind w:left="720" w:hanging="360"/>
+      </w:pPr>
+      <w:rPr>
+        <w:rFonts w:ascii="Symbol" w:hAnsi="Symbol" w:hint="default"/>
+        <w:sz w:val="20"/>
+      </w:rPr>
+    </w:lvl>
+    <w:lvl w:ilvl="1" w:tentative="1">
+      <w:start w:val="1"/>
+      <w:numFmt w:val="bullet"/>
+      <w:lvlText w:val="o"/>
+      <w:lvlJc w:val="left"/>
+      <w:pPr>
+        <w:tabs>
+          <w:tab w:val="num" w:pos="1440"/>
+        </w:tabs>
+        <w:ind w:left="1440" w:hanging="360"/>
+      </w:pPr>
+      <w:rPr>
+        <w:rFonts w:ascii="Courier New" w:hAnsi="Courier New" w:hint="default"/>
+        <w:sz w:val="20"/>
+      </w:rPr>
+    </w:lvl>
+    <w:lvl w:ilvl="2" w:tentative="1">
+      <w:start w:val="1"/>
+      <w:numFmt w:val="bullet"/>
+      <w:lvlText w:val=""/>
+      <w:lvlJc w:val="left"/>
+      <w:pPr>
+        <w:tabs>
+          <w:tab w:val="num" w:pos="2160"/>
+        </w:tabs>
+        <w:ind w:left="2160" w:hanging="360"/>
+      </w:pPr>
+      <w:rPr>
+        <w:rFonts w:ascii="Wingdings" w:hAnsi="Wingdings" w:hint="default"/>
+        <w:sz w:val="20"/>
+      </w:rPr>
+    </w:lvl>
+    <w:lvl w:ilvl="3" w:tentative="1">
+      <w:start w:val="1"/>
+      <w:numFmt w:val="bullet"/>
+      <w:lvlText w:val=""/>
+      <w:lvlJc w:val="left"/>
+      <w:pPr>
+        <w:tabs>
+          <w:tab w:val="num" w:pos="2880"/>
+        </w:tabs>
+        <w:ind w:left="2880" w:hanging="360"/>
+      </w:pPr>
+      <w:rPr>
+        <w:rFonts w:ascii="Wingdings" w:hAnsi="Wingdings" w:hint="default"/>
+        <w:sz w:val="20"/>
+      </w:rPr>
+    </w:lvl>
+    <w:lvl w:ilvl="4" w:tentative="1">
+      <w:start w:val="1"/>
+      <w:numFmt w:val="bullet"/>
+      <w:lvlText w:val=""/>
+      <w:lvlJc w:val="left"/>
+      <w:pPr>
+        <w:tabs>
+          <w:tab w:val="num" w:pos="3600"/>
+        </w:tabs>
+        <w:ind w:left="3600" w:hanging="360"/>
+      </w:pPr>
+      <w:rPr>
+        <w:rFonts w:ascii="Wingdings" w:hAnsi="Wingdings" w:hint="default"/>
+        <w:sz w:val="20"/>
+      </w:rPr>
+    </w:lvl>
+    <w:lvl w:ilvl="5" w:tentative="1">
+      <w:start w:val="1"/>
+      <w:numFmt w:val="bullet"/>
+      <w:lvlText w:val=""/>
+      <w:lvlJc w:val="left"/>
+      <w:pPr>
+        <w:tabs>
+          <w:tab w:val="num" w:pos="4320"/>
+        </w:tabs>
+        <w:ind w:left="4320" w:hanging="360"/>
+      </w:pPr>
+      <w:rPr>
+        <w:rFonts w:ascii="Wingdings" w:hAnsi="Wingdings" w:hint="default"/>
+        <w:sz w:val="20"/>
+      </w:rPr>
+    </w:lvl>
+    <w:lvl w:ilvl="6" w:tentative="1">
+      <w:start w:val="1"/>
+      <w:numFmt w:val="bullet"/>
+      <w:lvlText w:val=""/>
+      <w:lvlJc w:val="left"/>
+      <w:pPr>
+        <w:tabs>
+          <w:tab w:val="num" w:pos="5040"/>
+        </w:tabs>
+        <w:ind w:left="5040" w:hanging="360"/>
+      </w:pPr>
+      <w:rPr>
+        <w:rFonts w:ascii="Wingdings" w:hAnsi="Wingdings" w:hint="default"/>
+        <w:sz w:val="20"/>
+      </w:rPr>
+    </w:lvl>
+    <w:lvl w:ilvl="7" w:tentative="1">
+      <w:start w:val="1"/>
+      <w:numFmt w:val="bullet"/>
+      <w:lvlText w:val=""/>
+      <w:lvlJc w:val="left"/>
+      <w:pPr>
+        <w:tabs>
+          <w:tab w:val="num" w:pos="5760"/>
+        </w:tabs>
+        <w:ind w:left="5760" w:hanging="360"/>
+      </w:pPr>
+      <w:rPr>
+        <w:rFonts w:ascii="Wingdings" w:hAnsi="Wingdings" w:hint="default"/>
+        <w:sz w:val="20"/>
+      </w:rPr>
+    </w:lvl>
+    <w:lvl w:ilvl="8" w:tentative="1">
+      <w:start w:val="1"/>
+      <w:numFmt w:val="bullet"/>
+      <w:lvlText w:val=""/>
+      <w:lvlJc w:val="left"/>
+      <w:pPr>
+        <w:tabs>
+          <w:tab w:val="num" w:pos="6480"/>
+        </w:tabs>
+        <w:ind w:left="6480" w:hanging="360"/>
+      </w:pPr>
+      <w:rPr>
+        <w:rFonts w:ascii="Wingdings" w:hAnsi="Wingdings" w:hint="default"/>
+        <w:sz w:val="20"/>
+      </w:rPr>
+    </w:lvl>
+  </w:abstractNum>
+  <w:abstractNum w:abstractNumId="21" w15:restartNumberingAfterBreak="0">
+    <w:nsid w:val="73A846CF"/>
+    <w:multiLevelType w:val="multilevel"/>
+    <w:tmpl w:val="6FC4307A"/>
     <w:lvl w:ilvl="0">
       <w:start w:val="1"/>
       <w:numFmt w:val="decimal"/>
@@ -8544,1021 +9555,10 @@
       </w:pPr>
     </w:lvl>
   </w:abstractNum>
-  <w:abstractNum w:abstractNumId="15" w15:restartNumberingAfterBreak="0">
-    <w:nsid w:val="55D63A10"/>
+  <w:abstractNum w:abstractNumId="22" w15:restartNumberingAfterBreak="0">
+    <w:nsid w:val="75324DED"/>
     <w:multiLevelType w:val="multilevel"/>
-    <w:tmpl w:val="4F7808AA"/>
-    <w:lvl w:ilvl="0">
-      <w:start w:val="1"/>
-      <w:numFmt w:val="bullet"/>
-      <w:lvlText w:val=""/>
-      <w:lvlJc w:val="left"/>
-      <w:pPr>
-        <w:tabs>
-          <w:tab w:val="num" w:pos="720"/>
-        </w:tabs>
-        <w:ind w:left="720" w:hanging="360"/>
-      </w:pPr>
-      <w:rPr>
-        <w:rFonts w:ascii="Symbol" w:hAnsi="Symbol" w:hint="default"/>
-        <w:sz w:val="20"/>
-      </w:rPr>
-    </w:lvl>
-    <w:lvl w:ilvl="1" w:tentative="1">
-      <w:start w:val="1"/>
-      <w:numFmt w:val="bullet"/>
-      <w:lvlText w:val="o"/>
-      <w:lvlJc w:val="left"/>
-      <w:pPr>
-        <w:tabs>
-          <w:tab w:val="num" w:pos="1440"/>
-        </w:tabs>
-        <w:ind w:left="1440" w:hanging="360"/>
-      </w:pPr>
-      <w:rPr>
-        <w:rFonts w:ascii="Courier New" w:hAnsi="Courier New" w:hint="default"/>
-        <w:sz w:val="20"/>
-      </w:rPr>
-    </w:lvl>
-    <w:lvl w:ilvl="2" w:tentative="1">
-      <w:start w:val="1"/>
-      <w:numFmt w:val="bullet"/>
-      <w:lvlText w:val=""/>
-      <w:lvlJc w:val="left"/>
-      <w:pPr>
-        <w:tabs>
-          <w:tab w:val="num" w:pos="2160"/>
-        </w:tabs>
-        <w:ind w:left="2160" w:hanging="360"/>
-      </w:pPr>
-      <w:rPr>
-        <w:rFonts w:ascii="Wingdings" w:hAnsi="Wingdings" w:hint="default"/>
-        <w:sz w:val="20"/>
-      </w:rPr>
-    </w:lvl>
-    <w:lvl w:ilvl="3" w:tentative="1">
-      <w:start w:val="1"/>
-      <w:numFmt w:val="bullet"/>
-      <w:lvlText w:val=""/>
-      <w:lvlJc w:val="left"/>
-      <w:pPr>
-        <w:tabs>
-          <w:tab w:val="num" w:pos="2880"/>
-        </w:tabs>
-        <w:ind w:left="2880" w:hanging="360"/>
-      </w:pPr>
-      <w:rPr>
-        <w:rFonts w:ascii="Wingdings" w:hAnsi="Wingdings" w:hint="default"/>
-        <w:sz w:val="20"/>
-      </w:rPr>
-    </w:lvl>
-    <w:lvl w:ilvl="4" w:tentative="1">
-      <w:start w:val="1"/>
-      <w:numFmt w:val="bullet"/>
-      <w:lvlText w:val=""/>
-      <w:lvlJc w:val="left"/>
-      <w:pPr>
-        <w:tabs>
-          <w:tab w:val="num" w:pos="3600"/>
-        </w:tabs>
-        <w:ind w:left="3600" w:hanging="360"/>
-      </w:pPr>
-      <w:rPr>
-        <w:rFonts w:ascii="Wingdings" w:hAnsi="Wingdings" w:hint="default"/>
-        <w:sz w:val="20"/>
-      </w:rPr>
-    </w:lvl>
-    <w:lvl w:ilvl="5" w:tentative="1">
-      <w:start w:val="1"/>
-      <w:numFmt w:val="bullet"/>
-      <w:lvlText w:val=""/>
-      <w:lvlJc w:val="left"/>
-      <w:pPr>
-        <w:tabs>
-          <w:tab w:val="num" w:pos="4320"/>
-        </w:tabs>
-        <w:ind w:left="4320" w:hanging="360"/>
-      </w:pPr>
-      <w:rPr>
-        <w:rFonts w:ascii="Wingdings" w:hAnsi="Wingdings" w:hint="default"/>
-        <w:sz w:val="20"/>
-      </w:rPr>
-    </w:lvl>
-    <w:lvl w:ilvl="6" w:tentative="1">
-      <w:start w:val="1"/>
-      <w:numFmt w:val="bullet"/>
-      <w:lvlText w:val=""/>
-      <w:lvlJc w:val="left"/>
-      <w:pPr>
-        <w:tabs>
-          <w:tab w:val="num" w:pos="5040"/>
-        </w:tabs>
-        <w:ind w:left="5040" w:hanging="360"/>
-      </w:pPr>
-      <w:rPr>
-        <w:rFonts w:ascii="Wingdings" w:hAnsi="Wingdings" w:hint="default"/>
-        <w:sz w:val="20"/>
-      </w:rPr>
-    </w:lvl>
-    <w:lvl w:ilvl="7" w:tentative="1">
-      <w:start w:val="1"/>
-      <w:numFmt w:val="bullet"/>
-      <w:lvlText w:val=""/>
-      <w:lvlJc w:val="left"/>
-      <w:pPr>
-        <w:tabs>
-          <w:tab w:val="num" w:pos="5760"/>
-        </w:tabs>
-        <w:ind w:left="5760" w:hanging="360"/>
-      </w:pPr>
-      <w:rPr>
-        <w:rFonts w:ascii="Wingdings" w:hAnsi="Wingdings" w:hint="default"/>
-        <w:sz w:val="20"/>
-      </w:rPr>
-    </w:lvl>
-    <w:lvl w:ilvl="8" w:tentative="1">
-      <w:start w:val="1"/>
-      <w:numFmt w:val="bullet"/>
-      <w:lvlText w:val=""/>
-      <w:lvlJc w:val="left"/>
-      <w:pPr>
-        <w:tabs>
-          <w:tab w:val="num" w:pos="6480"/>
-        </w:tabs>
-        <w:ind w:left="6480" w:hanging="360"/>
-      </w:pPr>
-      <w:rPr>
-        <w:rFonts w:ascii="Wingdings" w:hAnsi="Wingdings" w:hint="default"/>
-        <w:sz w:val="20"/>
-      </w:rPr>
-    </w:lvl>
-  </w:abstractNum>
-  <w:abstractNum w:abstractNumId="16" w15:restartNumberingAfterBreak="0">
-    <w:nsid w:val="5BFD32B9"/>
-    <w:multiLevelType w:val="multilevel"/>
-    <w:tmpl w:val="43EC1E1C"/>
-    <w:lvl w:ilvl="0">
-      <w:start w:val="1"/>
-      <w:numFmt w:val="bullet"/>
-      <w:lvlText w:val=""/>
-      <w:lvlJc w:val="left"/>
-      <w:pPr>
-        <w:tabs>
-          <w:tab w:val="num" w:pos="720"/>
-        </w:tabs>
-        <w:ind w:left="720" w:hanging="360"/>
-      </w:pPr>
-      <w:rPr>
-        <w:rFonts w:ascii="Symbol" w:hAnsi="Symbol" w:hint="default"/>
-        <w:sz w:val="20"/>
-      </w:rPr>
-    </w:lvl>
-    <w:lvl w:ilvl="1" w:tentative="1">
-      <w:start w:val="1"/>
-      <w:numFmt w:val="bullet"/>
-      <w:lvlText w:val="o"/>
-      <w:lvlJc w:val="left"/>
-      <w:pPr>
-        <w:tabs>
-          <w:tab w:val="num" w:pos="1440"/>
-        </w:tabs>
-        <w:ind w:left="1440" w:hanging="360"/>
-      </w:pPr>
-      <w:rPr>
-        <w:rFonts w:ascii="Courier New" w:hAnsi="Courier New" w:hint="default"/>
-        <w:sz w:val="20"/>
-      </w:rPr>
-    </w:lvl>
-    <w:lvl w:ilvl="2" w:tentative="1">
-      <w:start w:val="1"/>
-      <w:numFmt w:val="bullet"/>
-      <w:lvlText w:val=""/>
-      <w:lvlJc w:val="left"/>
-      <w:pPr>
-        <w:tabs>
-          <w:tab w:val="num" w:pos="2160"/>
-        </w:tabs>
-        <w:ind w:left="2160" w:hanging="360"/>
-      </w:pPr>
-      <w:rPr>
-        <w:rFonts w:ascii="Wingdings" w:hAnsi="Wingdings" w:hint="default"/>
-        <w:sz w:val="20"/>
-      </w:rPr>
-    </w:lvl>
-    <w:lvl w:ilvl="3" w:tentative="1">
-      <w:start w:val="1"/>
-      <w:numFmt w:val="bullet"/>
-      <w:lvlText w:val=""/>
-      <w:lvlJc w:val="left"/>
-      <w:pPr>
-        <w:tabs>
-          <w:tab w:val="num" w:pos="2880"/>
-        </w:tabs>
-        <w:ind w:left="2880" w:hanging="360"/>
-      </w:pPr>
-      <w:rPr>
-        <w:rFonts w:ascii="Wingdings" w:hAnsi="Wingdings" w:hint="default"/>
-        <w:sz w:val="20"/>
-      </w:rPr>
-    </w:lvl>
-    <w:lvl w:ilvl="4" w:tentative="1">
-      <w:start w:val="1"/>
-      <w:numFmt w:val="bullet"/>
-      <w:lvlText w:val=""/>
-      <w:lvlJc w:val="left"/>
-      <w:pPr>
-        <w:tabs>
-          <w:tab w:val="num" w:pos="3600"/>
-        </w:tabs>
-        <w:ind w:left="3600" w:hanging="360"/>
-      </w:pPr>
-      <w:rPr>
-        <w:rFonts w:ascii="Wingdings" w:hAnsi="Wingdings" w:hint="default"/>
-        <w:sz w:val="20"/>
-      </w:rPr>
-    </w:lvl>
-    <w:lvl w:ilvl="5" w:tentative="1">
-      <w:start w:val="1"/>
-      <w:numFmt w:val="bullet"/>
-      <w:lvlText w:val=""/>
-      <w:lvlJc w:val="left"/>
-      <w:pPr>
-        <w:tabs>
-          <w:tab w:val="num" w:pos="4320"/>
-        </w:tabs>
-        <w:ind w:left="4320" w:hanging="360"/>
-      </w:pPr>
-      <w:rPr>
-        <w:rFonts w:ascii="Wingdings" w:hAnsi="Wingdings" w:hint="default"/>
-        <w:sz w:val="20"/>
-      </w:rPr>
-    </w:lvl>
-    <w:lvl w:ilvl="6" w:tentative="1">
-      <w:start w:val="1"/>
-      <w:numFmt w:val="bullet"/>
-      <w:lvlText w:val=""/>
-      <w:lvlJc w:val="left"/>
-      <w:pPr>
-        <w:tabs>
-          <w:tab w:val="num" w:pos="5040"/>
-        </w:tabs>
-        <w:ind w:left="5040" w:hanging="360"/>
-      </w:pPr>
-      <w:rPr>
-        <w:rFonts w:ascii="Wingdings" w:hAnsi="Wingdings" w:hint="default"/>
-        <w:sz w:val="20"/>
-      </w:rPr>
-    </w:lvl>
-    <w:lvl w:ilvl="7" w:tentative="1">
-      <w:start w:val="1"/>
-      <w:numFmt w:val="bullet"/>
-      <w:lvlText w:val=""/>
-      <w:lvlJc w:val="left"/>
-      <w:pPr>
-        <w:tabs>
-          <w:tab w:val="num" w:pos="5760"/>
-        </w:tabs>
-        <w:ind w:left="5760" w:hanging="360"/>
-      </w:pPr>
-      <w:rPr>
-        <w:rFonts w:ascii="Wingdings" w:hAnsi="Wingdings" w:hint="default"/>
-        <w:sz w:val="20"/>
-      </w:rPr>
-    </w:lvl>
-    <w:lvl w:ilvl="8" w:tentative="1">
-      <w:start w:val="1"/>
-      <w:numFmt w:val="bullet"/>
-      <w:lvlText w:val=""/>
-      <w:lvlJc w:val="left"/>
-      <w:pPr>
-        <w:tabs>
-          <w:tab w:val="num" w:pos="6480"/>
-        </w:tabs>
-        <w:ind w:left="6480" w:hanging="360"/>
-      </w:pPr>
-      <w:rPr>
-        <w:rFonts w:ascii="Wingdings" w:hAnsi="Wingdings" w:hint="default"/>
-        <w:sz w:val="20"/>
-      </w:rPr>
-    </w:lvl>
-  </w:abstractNum>
-  <w:abstractNum w:abstractNumId="17" w15:restartNumberingAfterBreak="0">
-    <w:nsid w:val="668B29A1"/>
-    <w:multiLevelType w:val="multilevel"/>
-    <w:tmpl w:val="945CFD9C"/>
-    <w:lvl w:ilvl="0">
-      <w:start w:val="1"/>
-      <w:numFmt w:val="decimal"/>
-      <w:lvlText w:val="%1."/>
-      <w:lvlJc w:val="left"/>
-      <w:pPr>
-        <w:tabs>
-          <w:tab w:val="num" w:pos="720"/>
-        </w:tabs>
-        <w:ind w:left="720" w:hanging="360"/>
-      </w:pPr>
-    </w:lvl>
-    <w:lvl w:ilvl="1">
-      <w:start w:val="1"/>
-      <w:numFmt w:val="bullet"/>
-      <w:lvlText w:val="o"/>
-      <w:lvlJc w:val="left"/>
-      <w:pPr>
-        <w:tabs>
-          <w:tab w:val="num" w:pos="1440"/>
-        </w:tabs>
-        <w:ind w:left="1440" w:hanging="360"/>
-      </w:pPr>
-      <w:rPr>
-        <w:rFonts w:ascii="Courier New" w:hAnsi="Courier New" w:hint="default"/>
-        <w:sz w:val="20"/>
-      </w:rPr>
-    </w:lvl>
-    <w:lvl w:ilvl="2" w:tentative="1">
-      <w:start w:val="1"/>
-      <w:numFmt w:val="decimal"/>
-      <w:lvlText w:val="%3."/>
-      <w:lvlJc w:val="left"/>
-      <w:pPr>
-        <w:tabs>
-          <w:tab w:val="num" w:pos="2160"/>
-        </w:tabs>
-        <w:ind w:left="2160" w:hanging="360"/>
-      </w:pPr>
-    </w:lvl>
-    <w:lvl w:ilvl="3" w:tentative="1">
-      <w:start w:val="1"/>
-      <w:numFmt w:val="decimal"/>
-      <w:lvlText w:val="%4."/>
-      <w:lvlJc w:val="left"/>
-      <w:pPr>
-        <w:tabs>
-          <w:tab w:val="num" w:pos="2880"/>
-        </w:tabs>
-        <w:ind w:left="2880" w:hanging="360"/>
-      </w:pPr>
-    </w:lvl>
-    <w:lvl w:ilvl="4" w:tentative="1">
-      <w:start w:val="1"/>
-      <w:numFmt w:val="decimal"/>
-      <w:lvlText w:val="%5."/>
-      <w:lvlJc w:val="left"/>
-      <w:pPr>
-        <w:tabs>
-          <w:tab w:val="num" w:pos="3600"/>
-        </w:tabs>
-        <w:ind w:left="3600" w:hanging="360"/>
-      </w:pPr>
-    </w:lvl>
-    <w:lvl w:ilvl="5" w:tentative="1">
-      <w:start w:val="1"/>
-      <w:numFmt w:val="decimal"/>
-      <w:lvlText w:val="%6."/>
-      <w:lvlJc w:val="left"/>
-      <w:pPr>
-        <w:tabs>
-          <w:tab w:val="num" w:pos="4320"/>
-        </w:tabs>
-        <w:ind w:left="4320" w:hanging="360"/>
-      </w:pPr>
-    </w:lvl>
-    <w:lvl w:ilvl="6" w:tentative="1">
-      <w:start w:val="1"/>
-      <w:numFmt w:val="decimal"/>
-      <w:lvlText w:val="%7."/>
-      <w:lvlJc w:val="left"/>
-      <w:pPr>
-        <w:tabs>
-          <w:tab w:val="num" w:pos="5040"/>
-        </w:tabs>
-        <w:ind w:left="5040" w:hanging="360"/>
-      </w:pPr>
-    </w:lvl>
-    <w:lvl w:ilvl="7" w:tentative="1">
-      <w:start w:val="1"/>
-      <w:numFmt w:val="decimal"/>
-      <w:lvlText w:val="%8."/>
-      <w:lvlJc w:val="left"/>
-      <w:pPr>
-        <w:tabs>
-          <w:tab w:val="num" w:pos="5760"/>
-        </w:tabs>
-        <w:ind w:left="5760" w:hanging="360"/>
-      </w:pPr>
-    </w:lvl>
-    <w:lvl w:ilvl="8" w:tentative="1">
-      <w:start w:val="1"/>
-      <w:numFmt w:val="decimal"/>
-      <w:lvlText w:val="%9."/>
-      <w:lvlJc w:val="left"/>
-      <w:pPr>
-        <w:tabs>
-          <w:tab w:val="num" w:pos="6480"/>
-        </w:tabs>
-        <w:ind w:left="6480" w:hanging="360"/>
-      </w:pPr>
-    </w:lvl>
-  </w:abstractNum>
-  <w:abstractNum w:abstractNumId="18" w15:restartNumberingAfterBreak="0">
-    <w:nsid w:val="688C0339"/>
-    <w:multiLevelType w:val="multilevel"/>
-    <w:tmpl w:val="7E006030"/>
-    <w:lvl w:ilvl="0">
-      <w:start w:val="1"/>
-      <w:numFmt w:val="bullet"/>
-      <w:lvlText w:val=""/>
-      <w:lvlJc w:val="left"/>
-      <w:pPr>
-        <w:tabs>
-          <w:tab w:val="num" w:pos="720"/>
-        </w:tabs>
-        <w:ind w:left="720" w:hanging="360"/>
-      </w:pPr>
-      <w:rPr>
-        <w:rFonts w:ascii="Symbol" w:hAnsi="Symbol" w:hint="default"/>
-        <w:sz w:val="20"/>
-      </w:rPr>
-    </w:lvl>
-    <w:lvl w:ilvl="1" w:tentative="1">
-      <w:start w:val="1"/>
-      <w:numFmt w:val="bullet"/>
-      <w:lvlText w:val="o"/>
-      <w:lvlJc w:val="left"/>
-      <w:pPr>
-        <w:tabs>
-          <w:tab w:val="num" w:pos="1440"/>
-        </w:tabs>
-        <w:ind w:left="1440" w:hanging="360"/>
-      </w:pPr>
-      <w:rPr>
-        <w:rFonts w:ascii="Courier New" w:hAnsi="Courier New" w:hint="default"/>
-        <w:sz w:val="20"/>
-      </w:rPr>
-    </w:lvl>
-    <w:lvl w:ilvl="2" w:tentative="1">
-      <w:start w:val="1"/>
-      <w:numFmt w:val="bullet"/>
-      <w:lvlText w:val=""/>
-      <w:lvlJc w:val="left"/>
-      <w:pPr>
-        <w:tabs>
-          <w:tab w:val="num" w:pos="2160"/>
-        </w:tabs>
-        <w:ind w:left="2160" w:hanging="360"/>
-      </w:pPr>
-      <w:rPr>
-        <w:rFonts w:ascii="Wingdings" w:hAnsi="Wingdings" w:hint="default"/>
-        <w:sz w:val="20"/>
-      </w:rPr>
-    </w:lvl>
-    <w:lvl w:ilvl="3" w:tentative="1">
-      <w:start w:val="1"/>
-      <w:numFmt w:val="bullet"/>
-      <w:lvlText w:val=""/>
-      <w:lvlJc w:val="left"/>
-      <w:pPr>
-        <w:tabs>
-          <w:tab w:val="num" w:pos="2880"/>
-        </w:tabs>
-        <w:ind w:left="2880" w:hanging="360"/>
-      </w:pPr>
-      <w:rPr>
-        <w:rFonts w:ascii="Wingdings" w:hAnsi="Wingdings" w:hint="default"/>
-        <w:sz w:val="20"/>
-      </w:rPr>
-    </w:lvl>
-    <w:lvl w:ilvl="4" w:tentative="1">
-      <w:start w:val="1"/>
-      <w:numFmt w:val="bullet"/>
-      <w:lvlText w:val=""/>
-      <w:lvlJc w:val="left"/>
-      <w:pPr>
-        <w:tabs>
-          <w:tab w:val="num" w:pos="3600"/>
-        </w:tabs>
-        <w:ind w:left="3600" w:hanging="360"/>
-      </w:pPr>
-      <w:rPr>
-        <w:rFonts w:ascii="Wingdings" w:hAnsi="Wingdings" w:hint="default"/>
-        <w:sz w:val="20"/>
-      </w:rPr>
-    </w:lvl>
-    <w:lvl w:ilvl="5" w:tentative="1">
-      <w:start w:val="1"/>
-      <w:numFmt w:val="bullet"/>
-      <w:lvlText w:val=""/>
-      <w:lvlJc w:val="left"/>
-      <w:pPr>
-        <w:tabs>
-          <w:tab w:val="num" w:pos="4320"/>
-        </w:tabs>
-        <w:ind w:left="4320" w:hanging="360"/>
-      </w:pPr>
-      <w:rPr>
-        <w:rFonts w:ascii="Wingdings" w:hAnsi="Wingdings" w:hint="default"/>
-        <w:sz w:val="20"/>
-      </w:rPr>
-    </w:lvl>
-    <w:lvl w:ilvl="6" w:tentative="1">
-      <w:start w:val="1"/>
-      <w:numFmt w:val="bullet"/>
-      <w:lvlText w:val=""/>
-      <w:lvlJc w:val="left"/>
-      <w:pPr>
-        <w:tabs>
-          <w:tab w:val="num" w:pos="5040"/>
-        </w:tabs>
-        <w:ind w:left="5040" w:hanging="360"/>
-      </w:pPr>
-      <w:rPr>
-        <w:rFonts w:ascii="Wingdings" w:hAnsi="Wingdings" w:hint="default"/>
-        <w:sz w:val="20"/>
-      </w:rPr>
-    </w:lvl>
-    <w:lvl w:ilvl="7" w:tentative="1">
-      <w:start w:val="1"/>
-      <w:numFmt w:val="bullet"/>
-      <w:lvlText w:val=""/>
-      <w:lvlJc w:val="left"/>
-      <w:pPr>
-        <w:tabs>
-          <w:tab w:val="num" w:pos="5760"/>
-        </w:tabs>
-        <w:ind w:left="5760" w:hanging="360"/>
-      </w:pPr>
-      <w:rPr>
-        <w:rFonts w:ascii="Wingdings" w:hAnsi="Wingdings" w:hint="default"/>
-        <w:sz w:val="20"/>
-      </w:rPr>
-    </w:lvl>
-    <w:lvl w:ilvl="8" w:tentative="1">
-      <w:start w:val="1"/>
-      <w:numFmt w:val="bullet"/>
-      <w:lvlText w:val=""/>
-      <w:lvlJc w:val="left"/>
-      <w:pPr>
-        <w:tabs>
-          <w:tab w:val="num" w:pos="6480"/>
-        </w:tabs>
-        <w:ind w:left="6480" w:hanging="360"/>
-      </w:pPr>
-      <w:rPr>
-        <w:rFonts w:ascii="Wingdings" w:hAnsi="Wingdings" w:hint="default"/>
-        <w:sz w:val="20"/>
-      </w:rPr>
-    </w:lvl>
-  </w:abstractNum>
-  <w:abstractNum w:abstractNumId="19" w15:restartNumberingAfterBreak="0">
-    <w:nsid w:val="6D7B55F2"/>
-    <w:multiLevelType w:val="multilevel"/>
-    <w:tmpl w:val="D6C49EF8"/>
-    <w:lvl w:ilvl="0">
-      <w:start w:val="1"/>
-      <w:numFmt w:val="bullet"/>
-      <w:lvlText w:val=""/>
-      <w:lvlJc w:val="left"/>
-      <w:pPr>
-        <w:tabs>
-          <w:tab w:val="num" w:pos="720"/>
-        </w:tabs>
-        <w:ind w:left="720" w:hanging="360"/>
-      </w:pPr>
-      <w:rPr>
-        <w:rFonts w:ascii="Symbol" w:hAnsi="Symbol" w:hint="default"/>
-        <w:sz w:val="20"/>
-      </w:rPr>
-    </w:lvl>
-    <w:lvl w:ilvl="1" w:tentative="1">
-      <w:start w:val="1"/>
-      <w:numFmt w:val="bullet"/>
-      <w:lvlText w:val="o"/>
-      <w:lvlJc w:val="left"/>
-      <w:pPr>
-        <w:tabs>
-          <w:tab w:val="num" w:pos="1440"/>
-        </w:tabs>
-        <w:ind w:left="1440" w:hanging="360"/>
-      </w:pPr>
-      <w:rPr>
-        <w:rFonts w:ascii="Courier New" w:hAnsi="Courier New" w:hint="default"/>
-        <w:sz w:val="20"/>
-      </w:rPr>
-    </w:lvl>
-    <w:lvl w:ilvl="2" w:tentative="1">
-      <w:start w:val="1"/>
-      <w:numFmt w:val="bullet"/>
-      <w:lvlText w:val=""/>
-      <w:lvlJc w:val="left"/>
-      <w:pPr>
-        <w:tabs>
-          <w:tab w:val="num" w:pos="2160"/>
-        </w:tabs>
-        <w:ind w:left="2160" w:hanging="360"/>
-      </w:pPr>
-      <w:rPr>
-        <w:rFonts w:ascii="Wingdings" w:hAnsi="Wingdings" w:hint="default"/>
-        <w:sz w:val="20"/>
-      </w:rPr>
-    </w:lvl>
-    <w:lvl w:ilvl="3" w:tentative="1">
-      <w:start w:val="1"/>
-      <w:numFmt w:val="bullet"/>
-      <w:lvlText w:val=""/>
-      <w:lvlJc w:val="left"/>
-      <w:pPr>
-        <w:tabs>
-          <w:tab w:val="num" w:pos="2880"/>
-        </w:tabs>
-        <w:ind w:left="2880" w:hanging="360"/>
-      </w:pPr>
-      <w:rPr>
-        <w:rFonts w:ascii="Wingdings" w:hAnsi="Wingdings" w:hint="default"/>
-        <w:sz w:val="20"/>
-      </w:rPr>
-    </w:lvl>
-    <w:lvl w:ilvl="4" w:tentative="1">
-      <w:start w:val="1"/>
-      <w:numFmt w:val="bullet"/>
-      <w:lvlText w:val=""/>
-      <w:lvlJc w:val="left"/>
-      <w:pPr>
-        <w:tabs>
-          <w:tab w:val="num" w:pos="3600"/>
-        </w:tabs>
-        <w:ind w:left="3600" w:hanging="360"/>
-      </w:pPr>
-      <w:rPr>
-        <w:rFonts w:ascii="Wingdings" w:hAnsi="Wingdings" w:hint="default"/>
-        <w:sz w:val="20"/>
-      </w:rPr>
-    </w:lvl>
-    <w:lvl w:ilvl="5" w:tentative="1">
-      <w:start w:val="1"/>
-      <w:numFmt w:val="bullet"/>
-      <w:lvlText w:val=""/>
-      <w:lvlJc w:val="left"/>
-      <w:pPr>
-        <w:tabs>
-          <w:tab w:val="num" w:pos="4320"/>
-        </w:tabs>
-        <w:ind w:left="4320" w:hanging="360"/>
-      </w:pPr>
-      <w:rPr>
-        <w:rFonts w:ascii="Wingdings" w:hAnsi="Wingdings" w:hint="default"/>
-        <w:sz w:val="20"/>
-      </w:rPr>
-    </w:lvl>
-    <w:lvl w:ilvl="6" w:tentative="1">
-      <w:start w:val="1"/>
-      <w:numFmt w:val="bullet"/>
-      <w:lvlText w:val=""/>
-      <w:lvlJc w:val="left"/>
-      <w:pPr>
-        <w:tabs>
-          <w:tab w:val="num" w:pos="5040"/>
-        </w:tabs>
-        <w:ind w:left="5040" w:hanging="360"/>
-      </w:pPr>
-      <w:rPr>
-        <w:rFonts w:ascii="Wingdings" w:hAnsi="Wingdings" w:hint="default"/>
-        <w:sz w:val="20"/>
-      </w:rPr>
-    </w:lvl>
-    <w:lvl w:ilvl="7" w:tentative="1">
-      <w:start w:val="1"/>
-      <w:numFmt w:val="bullet"/>
-      <w:lvlText w:val=""/>
-      <w:lvlJc w:val="left"/>
-      <w:pPr>
-        <w:tabs>
-          <w:tab w:val="num" w:pos="5760"/>
-        </w:tabs>
-        <w:ind w:left="5760" w:hanging="360"/>
-      </w:pPr>
-      <w:rPr>
-        <w:rFonts w:ascii="Wingdings" w:hAnsi="Wingdings" w:hint="default"/>
-        <w:sz w:val="20"/>
-      </w:rPr>
-    </w:lvl>
-    <w:lvl w:ilvl="8" w:tentative="1">
-      <w:start w:val="1"/>
-      <w:numFmt w:val="bullet"/>
-      <w:lvlText w:val=""/>
-      <w:lvlJc w:val="left"/>
-      <w:pPr>
-        <w:tabs>
-          <w:tab w:val="num" w:pos="6480"/>
-        </w:tabs>
-        <w:ind w:left="6480" w:hanging="360"/>
-      </w:pPr>
-      <w:rPr>
-        <w:rFonts w:ascii="Wingdings" w:hAnsi="Wingdings" w:hint="default"/>
-        <w:sz w:val="20"/>
-      </w:rPr>
-    </w:lvl>
-  </w:abstractNum>
-  <w:abstractNum w:abstractNumId="20" w15:restartNumberingAfterBreak="0">
-    <w:nsid w:val="703619DD"/>
-    <w:multiLevelType w:val="multilevel"/>
-    <w:tmpl w:val="BFA0D752"/>
-    <w:lvl w:ilvl="0">
-      <w:start w:val="1"/>
-      <w:numFmt w:val="bullet"/>
-      <w:lvlText w:val=""/>
-      <w:lvlJc w:val="left"/>
-      <w:pPr>
-        <w:tabs>
-          <w:tab w:val="num" w:pos="720"/>
-        </w:tabs>
-        <w:ind w:left="720" w:hanging="360"/>
-      </w:pPr>
-      <w:rPr>
-        <w:rFonts w:ascii="Symbol" w:hAnsi="Symbol" w:hint="default"/>
-        <w:sz w:val="20"/>
-      </w:rPr>
-    </w:lvl>
-    <w:lvl w:ilvl="1" w:tentative="1">
-      <w:start w:val="1"/>
-      <w:numFmt w:val="bullet"/>
-      <w:lvlText w:val="o"/>
-      <w:lvlJc w:val="left"/>
-      <w:pPr>
-        <w:tabs>
-          <w:tab w:val="num" w:pos="1440"/>
-        </w:tabs>
-        <w:ind w:left="1440" w:hanging="360"/>
-      </w:pPr>
-      <w:rPr>
-        <w:rFonts w:ascii="Courier New" w:hAnsi="Courier New" w:hint="default"/>
-        <w:sz w:val="20"/>
-      </w:rPr>
-    </w:lvl>
-    <w:lvl w:ilvl="2" w:tentative="1">
-      <w:start w:val="1"/>
-      <w:numFmt w:val="bullet"/>
-      <w:lvlText w:val=""/>
-      <w:lvlJc w:val="left"/>
-      <w:pPr>
-        <w:tabs>
-          <w:tab w:val="num" w:pos="2160"/>
-        </w:tabs>
-        <w:ind w:left="2160" w:hanging="360"/>
-      </w:pPr>
-      <w:rPr>
-        <w:rFonts w:ascii="Wingdings" w:hAnsi="Wingdings" w:hint="default"/>
-        <w:sz w:val="20"/>
-      </w:rPr>
-    </w:lvl>
-    <w:lvl w:ilvl="3" w:tentative="1">
-      <w:start w:val="1"/>
-      <w:numFmt w:val="bullet"/>
-      <w:lvlText w:val=""/>
-      <w:lvlJc w:val="left"/>
-      <w:pPr>
-        <w:tabs>
-          <w:tab w:val="num" w:pos="2880"/>
-        </w:tabs>
-        <w:ind w:left="2880" w:hanging="360"/>
-      </w:pPr>
-      <w:rPr>
-        <w:rFonts w:ascii="Wingdings" w:hAnsi="Wingdings" w:hint="default"/>
-        <w:sz w:val="20"/>
-      </w:rPr>
-    </w:lvl>
-    <w:lvl w:ilvl="4" w:tentative="1">
-      <w:start w:val="1"/>
-      <w:numFmt w:val="bullet"/>
-      <w:lvlText w:val=""/>
-      <w:lvlJc w:val="left"/>
-      <w:pPr>
-        <w:tabs>
-          <w:tab w:val="num" w:pos="3600"/>
-        </w:tabs>
-        <w:ind w:left="3600" w:hanging="360"/>
-      </w:pPr>
-      <w:rPr>
-        <w:rFonts w:ascii="Wingdings" w:hAnsi="Wingdings" w:hint="default"/>
-        <w:sz w:val="20"/>
-      </w:rPr>
-    </w:lvl>
-    <w:lvl w:ilvl="5" w:tentative="1">
-      <w:start w:val="1"/>
-      <w:numFmt w:val="bullet"/>
-      <w:lvlText w:val=""/>
-      <w:lvlJc w:val="left"/>
-      <w:pPr>
-        <w:tabs>
-          <w:tab w:val="num" w:pos="4320"/>
-        </w:tabs>
-        <w:ind w:left="4320" w:hanging="360"/>
-      </w:pPr>
-      <w:rPr>
-        <w:rFonts w:ascii="Wingdings" w:hAnsi="Wingdings" w:hint="default"/>
-        <w:sz w:val="20"/>
-      </w:rPr>
-    </w:lvl>
-    <w:lvl w:ilvl="6" w:tentative="1">
-      <w:start w:val="1"/>
-      <w:numFmt w:val="bullet"/>
-      <w:lvlText w:val=""/>
-      <w:lvlJc w:val="left"/>
-      <w:pPr>
-        <w:tabs>
-          <w:tab w:val="num" w:pos="5040"/>
-        </w:tabs>
-        <w:ind w:left="5040" w:hanging="360"/>
-      </w:pPr>
-      <w:rPr>
-        <w:rFonts w:ascii="Wingdings" w:hAnsi="Wingdings" w:hint="default"/>
-        <w:sz w:val="20"/>
-      </w:rPr>
-    </w:lvl>
-    <w:lvl w:ilvl="7" w:tentative="1">
-      <w:start w:val="1"/>
-      <w:numFmt w:val="bullet"/>
-      <w:lvlText w:val=""/>
-      <w:lvlJc w:val="left"/>
-      <w:pPr>
-        <w:tabs>
-          <w:tab w:val="num" w:pos="5760"/>
-        </w:tabs>
-        <w:ind w:left="5760" w:hanging="360"/>
-      </w:pPr>
-      <w:rPr>
-        <w:rFonts w:ascii="Wingdings" w:hAnsi="Wingdings" w:hint="default"/>
-        <w:sz w:val="20"/>
-      </w:rPr>
-    </w:lvl>
-    <w:lvl w:ilvl="8" w:tentative="1">
-      <w:start w:val="1"/>
-      <w:numFmt w:val="bullet"/>
-      <w:lvlText w:val=""/>
-      <w:lvlJc w:val="left"/>
-      <w:pPr>
-        <w:tabs>
-          <w:tab w:val="num" w:pos="6480"/>
-        </w:tabs>
-        <w:ind w:left="6480" w:hanging="360"/>
-      </w:pPr>
-      <w:rPr>
-        <w:rFonts w:ascii="Wingdings" w:hAnsi="Wingdings" w:hint="default"/>
-        <w:sz w:val="20"/>
-      </w:rPr>
-    </w:lvl>
-  </w:abstractNum>
-  <w:abstractNum w:abstractNumId="21" w15:restartNumberingAfterBreak="0">
-    <w:nsid w:val="75150072"/>
-    <w:multiLevelType w:val="multilevel"/>
-    <w:tmpl w:val="AB7C41DA"/>
-    <w:lvl w:ilvl="0">
-      <w:start w:val="1"/>
-      <w:numFmt w:val="bullet"/>
-      <w:lvlText w:val=""/>
-      <w:lvlJc w:val="left"/>
-      <w:pPr>
-        <w:tabs>
-          <w:tab w:val="num" w:pos="720"/>
-        </w:tabs>
-        <w:ind w:left="720" w:hanging="360"/>
-      </w:pPr>
-      <w:rPr>
-        <w:rFonts w:ascii="Symbol" w:hAnsi="Symbol" w:hint="default"/>
-        <w:sz w:val="20"/>
-      </w:rPr>
-    </w:lvl>
-    <w:lvl w:ilvl="1" w:tentative="1">
-      <w:start w:val="1"/>
-      <w:numFmt w:val="bullet"/>
-      <w:lvlText w:val="o"/>
-      <w:lvlJc w:val="left"/>
-      <w:pPr>
-        <w:tabs>
-          <w:tab w:val="num" w:pos="1440"/>
-        </w:tabs>
-        <w:ind w:left="1440" w:hanging="360"/>
-      </w:pPr>
-      <w:rPr>
-        <w:rFonts w:ascii="Courier New" w:hAnsi="Courier New" w:hint="default"/>
-        <w:sz w:val="20"/>
-      </w:rPr>
-    </w:lvl>
-    <w:lvl w:ilvl="2" w:tentative="1">
-      <w:start w:val="1"/>
-      <w:numFmt w:val="bullet"/>
-      <w:lvlText w:val=""/>
-      <w:lvlJc w:val="left"/>
-      <w:pPr>
-        <w:tabs>
-          <w:tab w:val="num" w:pos="2160"/>
-        </w:tabs>
-        <w:ind w:left="2160" w:hanging="360"/>
-      </w:pPr>
-      <w:rPr>
-        <w:rFonts w:ascii="Wingdings" w:hAnsi="Wingdings" w:hint="default"/>
-        <w:sz w:val="20"/>
-      </w:rPr>
-    </w:lvl>
-    <w:lvl w:ilvl="3" w:tentative="1">
-      <w:start w:val="1"/>
-      <w:numFmt w:val="bullet"/>
-      <w:lvlText w:val=""/>
-      <w:lvlJc w:val="left"/>
-      <w:pPr>
-        <w:tabs>
-          <w:tab w:val="num" w:pos="2880"/>
-        </w:tabs>
-        <w:ind w:left="2880" w:hanging="360"/>
-      </w:pPr>
-      <w:rPr>
-        <w:rFonts w:ascii="Wingdings" w:hAnsi="Wingdings" w:hint="default"/>
-        <w:sz w:val="20"/>
-      </w:rPr>
-    </w:lvl>
-    <w:lvl w:ilvl="4" w:tentative="1">
-      <w:start w:val="1"/>
-      <w:numFmt w:val="bullet"/>
-      <w:lvlText w:val=""/>
-      <w:lvlJc w:val="left"/>
-      <w:pPr>
-        <w:tabs>
-          <w:tab w:val="num" w:pos="3600"/>
-        </w:tabs>
-        <w:ind w:left="3600" w:hanging="360"/>
-      </w:pPr>
-      <w:rPr>
-        <w:rFonts w:ascii="Wingdings" w:hAnsi="Wingdings" w:hint="default"/>
-        <w:sz w:val="20"/>
-      </w:rPr>
-    </w:lvl>
-    <w:lvl w:ilvl="5" w:tentative="1">
-      <w:start w:val="1"/>
-      <w:numFmt w:val="bullet"/>
-      <w:lvlText w:val=""/>
-      <w:lvlJc w:val="left"/>
-      <w:pPr>
-        <w:tabs>
-          <w:tab w:val="num" w:pos="4320"/>
-        </w:tabs>
-        <w:ind w:left="4320" w:hanging="360"/>
-      </w:pPr>
-      <w:rPr>
-        <w:rFonts w:ascii="Wingdings" w:hAnsi="Wingdings" w:hint="default"/>
-        <w:sz w:val="20"/>
-      </w:rPr>
-    </w:lvl>
-    <w:lvl w:ilvl="6" w:tentative="1">
-      <w:start w:val="1"/>
-      <w:numFmt w:val="bullet"/>
-      <w:lvlText w:val=""/>
-      <w:lvlJc w:val="left"/>
-      <w:pPr>
-        <w:tabs>
-          <w:tab w:val="num" w:pos="5040"/>
-        </w:tabs>
-        <w:ind w:left="5040" w:hanging="360"/>
-      </w:pPr>
-      <w:rPr>
-        <w:rFonts w:ascii="Wingdings" w:hAnsi="Wingdings" w:hint="default"/>
-        <w:sz w:val="20"/>
-      </w:rPr>
-    </w:lvl>
-    <w:lvl w:ilvl="7" w:tentative="1">
-      <w:start w:val="1"/>
-      <w:numFmt w:val="bullet"/>
-      <w:lvlText w:val=""/>
-      <w:lvlJc w:val="left"/>
-      <w:pPr>
-        <w:tabs>
-          <w:tab w:val="num" w:pos="5760"/>
-        </w:tabs>
-        <w:ind w:left="5760" w:hanging="360"/>
-      </w:pPr>
-      <w:rPr>
-        <w:rFonts w:ascii="Wingdings" w:hAnsi="Wingdings" w:hint="default"/>
-        <w:sz w:val="20"/>
-      </w:rPr>
-    </w:lvl>
-    <w:lvl w:ilvl="8" w:tentative="1">
-      <w:start w:val="1"/>
-      <w:numFmt w:val="bullet"/>
-      <w:lvlText w:val=""/>
-      <w:lvlJc w:val="left"/>
-      <w:pPr>
-        <w:tabs>
-          <w:tab w:val="num" w:pos="6480"/>
-        </w:tabs>
-        <w:ind w:left="6480" w:hanging="360"/>
-      </w:pPr>
-      <w:rPr>
-        <w:rFonts w:ascii="Wingdings" w:hAnsi="Wingdings" w:hint="default"/>
-        <w:sz w:val="20"/>
-      </w:rPr>
-    </w:lvl>
-  </w:abstractNum>
-  <w:abstractNum w:abstractNumId="22" w15:restartNumberingAfterBreak="0">
-    <w:nsid w:val="7DB717C4"/>
-    <w:multiLevelType w:val="multilevel"/>
-    <w:tmpl w:val="D3CA986E"/>
+    <w:tmpl w:val="7FA207B4"/>
     <w:lvl w:ilvl="0">
       <w:start w:val="1"/>
       <w:numFmt w:val="bullet"/>
@@ -9705,9 +9705,9 @@
     </w:lvl>
   </w:abstractNum>
   <w:abstractNum w:abstractNumId="23" w15:restartNumberingAfterBreak="0">
-    <w:nsid w:val="7FF77E2D"/>
+    <w:nsid w:val="7DF5631D"/>
     <w:multiLevelType w:val="multilevel"/>
-    <w:tmpl w:val="D646E20A"/>
+    <w:tmpl w:val="52F8865A"/>
     <w:lvl w:ilvl="0">
       <w:start w:val="1"/>
       <w:numFmt w:val="bullet"/>
@@ -9853,77 +9853,77 @@
       </w:rPr>
     </w:lvl>
   </w:abstractNum>
-  <w:num w:numId="1" w16cid:durableId="769089410">
+  <w:num w:numId="1" w16cid:durableId="1914194116">
+    <w:abstractNumId w:val="16"/>
+  </w:num>
+  <w:num w:numId="2" w16cid:durableId="1548373885">
+    <w:abstractNumId w:val="14"/>
+  </w:num>
+  <w:num w:numId="3" w16cid:durableId="538052202">
+    <w:abstractNumId w:val="10"/>
+  </w:num>
+  <w:num w:numId="4" w16cid:durableId="625738969">
+    <w:abstractNumId w:val="11"/>
+  </w:num>
+  <w:num w:numId="5" w16cid:durableId="1976989494">
+    <w:abstractNumId w:val="2"/>
+  </w:num>
+  <w:num w:numId="6" w16cid:durableId="2123185039">
+    <w:abstractNumId w:val="5"/>
+  </w:num>
+  <w:num w:numId="7" w16cid:durableId="1258909731">
+    <w:abstractNumId w:val="1"/>
+  </w:num>
+  <w:num w:numId="8" w16cid:durableId="1801146896">
+    <w:abstractNumId w:val="15"/>
+  </w:num>
+  <w:num w:numId="9" w16cid:durableId="1606425142">
+    <w:abstractNumId w:val="20"/>
+  </w:num>
+  <w:num w:numId="10" w16cid:durableId="948320440">
+    <w:abstractNumId w:val="12"/>
+  </w:num>
+  <w:num w:numId="11" w16cid:durableId="1131360316">
+    <w:abstractNumId w:val="13"/>
+  </w:num>
+  <w:num w:numId="12" w16cid:durableId="609969975">
+    <w:abstractNumId w:val="0"/>
+  </w:num>
+  <w:num w:numId="13" w16cid:durableId="1916016134">
+    <w:abstractNumId w:val="22"/>
+  </w:num>
+  <w:num w:numId="14" w16cid:durableId="28453543">
     <w:abstractNumId w:val="8"/>
   </w:num>
-  <w:num w:numId="2" w16cid:durableId="1211456588">
-    <w:abstractNumId w:val="16"/>
+  <w:num w:numId="15" w16cid:durableId="1174346076">
+    <w:abstractNumId w:val="23"/>
   </w:num>
-  <w:num w:numId="3" w16cid:durableId="1509363892">
+  <w:num w:numId="16" w16cid:durableId="1075054816">
+    <w:abstractNumId w:val="3"/>
+  </w:num>
+  <w:num w:numId="17" w16cid:durableId="1608153573">
     <w:abstractNumId w:val="4"/>
   </w:num>
-  <w:num w:numId="4" w16cid:durableId="102963090">
-    <w:abstractNumId w:val="20"/>
+  <w:num w:numId="18" w16cid:durableId="574507640">
+    <w:abstractNumId w:val="7"/>
   </w:num>
-  <w:num w:numId="5" w16cid:durableId="1359701458">
-    <w:abstractNumId w:val="21"/>
+  <w:num w:numId="19" w16cid:durableId="1524978905">
+    <w:abstractNumId w:val="6"/>
   </w:num>
-  <w:num w:numId="6" w16cid:durableId="1092432731">
+  <w:num w:numId="20" w16cid:durableId="526262911">
     <w:abstractNumId w:val="18"/>
   </w:num>
-  <w:num w:numId="7" w16cid:durableId="1841504906">
+  <w:num w:numId="21" w16cid:durableId="1935431101">
+    <w:abstractNumId w:val="9"/>
+  </w:num>
+  <w:num w:numId="22" w16cid:durableId="1499225319">
+    <w:abstractNumId w:val="19"/>
+  </w:num>
+  <w:num w:numId="23" w16cid:durableId="105123926">
     <w:abstractNumId w:val="17"/>
   </w:num>
-  <w:num w:numId="8" w16cid:durableId="1444182314">
-    <w:abstractNumId w:val="13"/>
-  </w:num>
-  <w:num w:numId="9" w16cid:durableId="1918856857">
-    <w:abstractNumId w:val="1"/>
-  </w:num>
-  <w:num w:numId="10" w16cid:durableId="1712487621">
-    <w:abstractNumId w:val="9"/>
-  </w:num>
-  <w:num w:numId="11" w16cid:durableId="1875968949">
-    <w:abstractNumId w:val="15"/>
-  </w:num>
-  <w:num w:numId="12" w16cid:durableId="462887803">
-    <w:abstractNumId w:val="19"/>
-  </w:num>
-  <w:num w:numId="13" w16cid:durableId="727073889">
-    <w:abstractNumId w:val="23"/>
-  </w:num>
-  <w:num w:numId="14" w16cid:durableId="697126212">
-    <w:abstractNumId w:val="2"/>
-  </w:num>
-  <w:num w:numId="15" w16cid:durableId="1033921201">
-    <w:abstractNumId w:val="0"/>
-  </w:num>
-  <w:num w:numId="16" w16cid:durableId="491944515">
-    <w:abstractNumId w:val="22"/>
-  </w:num>
-  <w:num w:numId="17" w16cid:durableId="1943416652">
-    <w:abstractNumId w:val="6"/>
-  </w:num>
-  <w:num w:numId="18" w16cid:durableId="1717507935">
-    <w:abstractNumId w:val="11"/>
-  </w:num>
-  <w:num w:numId="19" w16cid:durableId="1908031909">
-    <w:abstractNumId w:val="14"/>
-  </w:num>
-  <w:num w:numId="20" w16cid:durableId="1809400749">
-    <w:abstractNumId w:val="7"/>
-  </w:num>
-  <w:num w:numId="21" w16cid:durableId="646202477">
-    <w:abstractNumId w:val="3"/>
-  </w:num>
-  <w:num w:numId="22" w16cid:durableId="271207760">
-    <w:abstractNumId w:val="12"/>
-  </w:num>
-  <w:num w:numId="23" w16cid:durableId="322315923">
-    <w:abstractNumId w:val="10"/>
-  </w:num>
-  <w:num w:numId="24" w16cid:durableId="226958260">
-    <w:abstractNumId w:val="5"/>
+  <w:num w:numId="24" w16cid:durableId="548340504">
+    <w:abstractNumId w:val="21"/>
   </w:num>
 </w:numbering>
 </file>

</xml_diff>

<commit_message>
follow-along: Sonar replay command
</commit_message>
<xml_diff>
--- a/follow-along/Azure_Local_Follow_Along_Guide.docx
+++ b/follow-along/Azure_Local_Follow_Along_Guide.docx
@@ -6566,9 +6566,9 @@
 <file path=word/numbering.xml><?xml version="1.0" encoding="utf-8"?>
 <w:numbering xmlns:wpc="http://schemas.microsoft.com/office/word/2010/wordprocessingCanvas" xmlns:cx="http://schemas.microsoft.com/office/drawing/2014/chartex" xmlns:cx1="http://schemas.microsoft.com/office/drawing/2015/9/8/chartex" xmlns:cx2="http://schemas.microsoft.com/office/drawing/2015/10/21/chartex" xmlns:cx3="http://schemas.microsoft.com/office/drawing/2016/5/9/chartex" xmlns:cx4="http://schemas.microsoft.com/office/drawing/2016/5/10/chartex" xmlns:cx5="http://schemas.microsoft.com/office/drawing/2016/5/11/chartex" xmlns:cx6="http://schemas.microsoft.com/office/drawing/2016/5/12/chartex" xmlns:cx7="http://schemas.microsoft.com/office/drawing/2016/5/13/chartex" xmlns:cx8="http://schemas.microsoft.com/office/drawing/2016/5/14/chartex" xmlns:mc="http://schemas.openxmlformats.org/markup-compatibility/2006" xmlns:aink="http://schemas.microsoft.com/office/drawing/2016/ink" xmlns:am3d="http://schemas.microsoft.com/office/drawing/2017/model3d" xmlns:o="urn:schemas-microsoft-com:office:office" xmlns:oel="http://schemas.microsoft.com/office/2019/extlst" xmlns:r="http://schemas.openxmlformats.org/officeDocument/2006/relationships" xmlns:m="http://schemas.openxmlformats.org/officeDocument/2006/math" xmlns:v="urn:schemas-microsoft-com:vml" xmlns:wp14="http://schemas.microsoft.com/office/word/2010/wordprocessingDrawing" xmlns:wp="http://schemas.openxmlformats.org/drawingml/2006/wordprocessingDrawing" xmlns:w10="urn:schemas-microsoft-com:office:word" xmlns:w="http://schemas.openxmlformats.org/wordprocessingml/2006/main" xmlns:w14="http://schemas.microsoft.com/office/word/2010/wordml" xmlns:w15="http://schemas.microsoft.com/office/word/2012/wordml" xmlns:w16cex="http://schemas.microsoft.com/office/word/2018/wordml/cex" xmlns:w16cid="http://schemas.microsoft.com/office/word/2016/wordml/cid" xmlns:w16="http://schemas.microsoft.com/office/word/2018/wordml" xmlns:w16du="http://schemas.microsoft.com/office/word/2023/wordml/word16du" xmlns:w16sdtdh="http://schemas.microsoft.com/office/word/2020/wordml/sdtdatahash" xmlns:w16sdtfl="http://schemas.microsoft.com/office/word/2024/wordml/sdtformatlock" xmlns:w16se="http://schemas.microsoft.com/office/word/2015/wordml/symex" xmlns:wpg="http://schemas.microsoft.com/office/word/2010/wordprocessingGroup" xmlns:wpi="http://schemas.microsoft.com/office/word/2010/wordprocessingInk" xmlns:wne="http://schemas.microsoft.com/office/word/2006/wordml" xmlns:wps="http://schemas.microsoft.com/office/word/2010/wordprocessingShape" mc:Ignorable="w14 w15 w16se w16cid w16 w16cex w16sdtdh w16sdtfl w16du wp14">
   <w:abstractNum w:abstractNumId="0" w15:restartNumberingAfterBreak="0">
-    <w:nsid w:val="18E702E1"/>
+    <w:nsid w:val="06343692"/>
     <w:multiLevelType w:val="multilevel"/>
-    <w:tmpl w:val="3D5AEE8E"/>
+    <w:tmpl w:val="A29487E2"/>
     <w:lvl w:ilvl="0">
       <w:start w:val="1"/>
       <w:numFmt w:val="bullet"/>
@@ -6715,9 +6715,9 @@
     </w:lvl>
   </w:abstractNum>
   <w:abstractNum w:abstractNumId="1" w15:restartNumberingAfterBreak="0">
-    <w:nsid w:val="1A126089"/>
+    <w:nsid w:val="08026352"/>
     <w:multiLevelType w:val="multilevel"/>
-    <w:tmpl w:val="5250211C"/>
+    <w:tmpl w:val="25AC9C4C"/>
     <w:lvl w:ilvl="0">
       <w:start w:val="1"/>
       <w:numFmt w:val="decimal"/>
@@ -6832,9 +6832,9 @@
     </w:lvl>
   </w:abstractNum>
   <w:abstractNum w:abstractNumId="2" w15:restartNumberingAfterBreak="0">
-    <w:nsid w:val="1AF00DB5"/>
+    <w:nsid w:val="0EE76C51"/>
     <w:multiLevelType w:val="multilevel"/>
-    <w:tmpl w:val="0764EA52"/>
+    <w:tmpl w:val="38CC4B14"/>
     <w:lvl w:ilvl="0">
       <w:start w:val="1"/>
       <w:numFmt w:val="bullet"/>
@@ -6981,9 +6981,9 @@
     </w:lvl>
   </w:abstractNum>
   <w:abstractNum w:abstractNumId="3" w15:restartNumberingAfterBreak="0">
-    <w:nsid w:val="1B09547A"/>
+    <w:nsid w:val="192F56AC"/>
     <w:multiLevelType w:val="multilevel"/>
-    <w:tmpl w:val="48A8ABA6"/>
+    <w:tmpl w:val="986014DC"/>
     <w:lvl w:ilvl="0">
       <w:start w:val="1"/>
       <w:numFmt w:val="bullet"/>
@@ -7130,9 +7130,307 @@
     </w:lvl>
   </w:abstractNum>
   <w:abstractNum w:abstractNumId="4" w15:restartNumberingAfterBreak="0">
-    <w:nsid w:val="1BE7253F"/>
+    <w:nsid w:val="1BEA16BB"/>
     <w:multiLevelType w:val="multilevel"/>
-    <w:tmpl w:val="1F823230"/>
+    <w:tmpl w:val="88DA8AB0"/>
+    <w:lvl w:ilvl="0">
+      <w:start w:val="1"/>
+      <w:numFmt w:val="bullet"/>
+      <w:lvlText w:val=""/>
+      <w:lvlJc w:val="left"/>
+      <w:pPr>
+        <w:tabs>
+          <w:tab w:val="num" w:pos="720"/>
+        </w:tabs>
+        <w:ind w:left="720" w:hanging="360"/>
+      </w:pPr>
+      <w:rPr>
+        <w:rFonts w:ascii="Symbol" w:hAnsi="Symbol" w:hint="default"/>
+        <w:sz w:val="20"/>
+      </w:rPr>
+    </w:lvl>
+    <w:lvl w:ilvl="1" w:tentative="1">
+      <w:start w:val="1"/>
+      <w:numFmt w:val="bullet"/>
+      <w:lvlText w:val="o"/>
+      <w:lvlJc w:val="left"/>
+      <w:pPr>
+        <w:tabs>
+          <w:tab w:val="num" w:pos="1440"/>
+        </w:tabs>
+        <w:ind w:left="1440" w:hanging="360"/>
+      </w:pPr>
+      <w:rPr>
+        <w:rFonts w:ascii="Courier New" w:hAnsi="Courier New" w:hint="default"/>
+        <w:sz w:val="20"/>
+      </w:rPr>
+    </w:lvl>
+    <w:lvl w:ilvl="2" w:tentative="1">
+      <w:start w:val="1"/>
+      <w:numFmt w:val="bullet"/>
+      <w:lvlText w:val=""/>
+      <w:lvlJc w:val="left"/>
+      <w:pPr>
+        <w:tabs>
+          <w:tab w:val="num" w:pos="2160"/>
+        </w:tabs>
+        <w:ind w:left="2160" w:hanging="360"/>
+      </w:pPr>
+      <w:rPr>
+        <w:rFonts w:ascii="Wingdings" w:hAnsi="Wingdings" w:hint="default"/>
+        <w:sz w:val="20"/>
+      </w:rPr>
+    </w:lvl>
+    <w:lvl w:ilvl="3" w:tentative="1">
+      <w:start w:val="1"/>
+      <w:numFmt w:val="bullet"/>
+      <w:lvlText w:val=""/>
+      <w:lvlJc w:val="left"/>
+      <w:pPr>
+        <w:tabs>
+          <w:tab w:val="num" w:pos="2880"/>
+        </w:tabs>
+        <w:ind w:left="2880" w:hanging="360"/>
+      </w:pPr>
+      <w:rPr>
+        <w:rFonts w:ascii="Wingdings" w:hAnsi="Wingdings" w:hint="default"/>
+        <w:sz w:val="20"/>
+      </w:rPr>
+    </w:lvl>
+    <w:lvl w:ilvl="4" w:tentative="1">
+      <w:start w:val="1"/>
+      <w:numFmt w:val="bullet"/>
+      <w:lvlText w:val=""/>
+      <w:lvlJc w:val="left"/>
+      <w:pPr>
+        <w:tabs>
+          <w:tab w:val="num" w:pos="3600"/>
+        </w:tabs>
+        <w:ind w:left="3600" w:hanging="360"/>
+      </w:pPr>
+      <w:rPr>
+        <w:rFonts w:ascii="Wingdings" w:hAnsi="Wingdings" w:hint="default"/>
+        <w:sz w:val="20"/>
+      </w:rPr>
+    </w:lvl>
+    <w:lvl w:ilvl="5" w:tentative="1">
+      <w:start w:val="1"/>
+      <w:numFmt w:val="bullet"/>
+      <w:lvlText w:val=""/>
+      <w:lvlJc w:val="left"/>
+      <w:pPr>
+        <w:tabs>
+          <w:tab w:val="num" w:pos="4320"/>
+        </w:tabs>
+        <w:ind w:left="4320" w:hanging="360"/>
+      </w:pPr>
+      <w:rPr>
+        <w:rFonts w:ascii="Wingdings" w:hAnsi="Wingdings" w:hint="default"/>
+        <w:sz w:val="20"/>
+      </w:rPr>
+    </w:lvl>
+    <w:lvl w:ilvl="6" w:tentative="1">
+      <w:start w:val="1"/>
+      <w:numFmt w:val="bullet"/>
+      <w:lvlText w:val=""/>
+      <w:lvlJc w:val="left"/>
+      <w:pPr>
+        <w:tabs>
+          <w:tab w:val="num" w:pos="5040"/>
+        </w:tabs>
+        <w:ind w:left="5040" w:hanging="360"/>
+      </w:pPr>
+      <w:rPr>
+        <w:rFonts w:ascii="Wingdings" w:hAnsi="Wingdings" w:hint="default"/>
+        <w:sz w:val="20"/>
+      </w:rPr>
+    </w:lvl>
+    <w:lvl w:ilvl="7" w:tentative="1">
+      <w:start w:val="1"/>
+      <w:numFmt w:val="bullet"/>
+      <w:lvlText w:val=""/>
+      <w:lvlJc w:val="left"/>
+      <w:pPr>
+        <w:tabs>
+          <w:tab w:val="num" w:pos="5760"/>
+        </w:tabs>
+        <w:ind w:left="5760" w:hanging="360"/>
+      </w:pPr>
+      <w:rPr>
+        <w:rFonts w:ascii="Wingdings" w:hAnsi="Wingdings" w:hint="default"/>
+        <w:sz w:val="20"/>
+      </w:rPr>
+    </w:lvl>
+    <w:lvl w:ilvl="8" w:tentative="1">
+      <w:start w:val="1"/>
+      <w:numFmt w:val="bullet"/>
+      <w:lvlText w:val=""/>
+      <w:lvlJc w:val="left"/>
+      <w:pPr>
+        <w:tabs>
+          <w:tab w:val="num" w:pos="6480"/>
+        </w:tabs>
+        <w:ind w:left="6480" w:hanging="360"/>
+      </w:pPr>
+      <w:rPr>
+        <w:rFonts w:ascii="Wingdings" w:hAnsi="Wingdings" w:hint="default"/>
+        <w:sz w:val="20"/>
+      </w:rPr>
+    </w:lvl>
+  </w:abstractNum>
+  <w:abstractNum w:abstractNumId="5" w15:restartNumberingAfterBreak="0">
+    <w:nsid w:val="1F802BE2"/>
+    <w:multiLevelType w:val="multilevel"/>
+    <w:tmpl w:val="74486766"/>
+    <w:lvl w:ilvl="0">
+      <w:start w:val="1"/>
+      <w:numFmt w:val="bullet"/>
+      <w:lvlText w:val=""/>
+      <w:lvlJc w:val="left"/>
+      <w:pPr>
+        <w:tabs>
+          <w:tab w:val="num" w:pos="720"/>
+        </w:tabs>
+        <w:ind w:left="720" w:hanging="360"/>
+      </w:pPr>
+      <w:rPr>
+        <w:rFonts w:ascii="Symbol" w:hAnsi="Symbol" w:hint="default"/>
+        <w:sz w:val="20"/>
+      </w:rPr>
+    </w:lvl>
+    <w:lvl w:ilvl="1" w:tentative="1">
+      <w:start w:val="1"/>
+      <w:numFmt w:val="bullet"/>
+      <w:lvlText w:val="o"/>
+      <w:lvlJc w:val="left"/>
+      <w:pPr>
+        <w:tabs>
+          <w:tab w:val="num" w:pos="1440"/>
+        </w:tabs>
+        <w:ind w:left="1440" w:hanging="360"/>
+      </w:pPr>
+      <w:rPr>
+        <w:rFonts w:ascii="Courier New" w:hAnsi="Courier New" w:hint="default"/>
+        <w:sz w:val="20"/>
+      </w:rPr>
+    </w:lvl>
+    <w:lvl w:ilvl="2" w:tentative="1">
+      <w:start w:val="1"/>
+      <w:numFmt w:val="bullet"/>
+      <w:lvlText w:val=""/>
+      <w:lvlJc w:val="left"/>
+      <w:pPr>
+        <w:tabs>
+          <w:tab w:val="num" w:pos="2160"/>
+        </w:tabs>
+        <w:ind w:left="2160" w:hanging="360"/>
+      </w:pPr>
+      <w:rPr>
+        <w:rFonts w:ascii="Wingdings" w:hAnsi="Wingdings" w:hint="default"/>
+        <w:sz w:val="20"/>
+      </w:rPr>
+    </w:lvl>
+    <w:lvl w:ilvl="3" w:tentative="1">
+      <w:start w:val="1"/>
+      <w:numFmt w:val="bullet"/>
+      <w:lvlText w:val=""/>
+      <w:lvlJc w:val="left"/>
+      <w:pPr>
+        <w:tabs>
+          <w:tab w:val="num" w:pos="2880"/>
+        </w:tabs>
+        <w:ind w:left="2880" w:hanging="360"/>
+      </w:pPr>
+      <w:rPr>
+        <w:rFonts w:ascii="Wingdings" w:hAnsi="Wingdings" w:hint="default"/>
+        <w:sz w:val="20"/>
+      </w:rPr>
+    </w:lvl>
+    <w:lvl w:ilvl="4" w:tentative="1">
+      <w:start w:val="1"/>
+      <w:numFmt w:val="bullet"/>
+      <w:lvlText w:val=""/>
+      <w:lvlJc w:val="left"/>
+      <w:pPr>
+        <w:tabs>
+          <w:tab w:val="num" w:pos="3600"/>
+        </w:tabs>
+        <w:ind w:left="3600" w:hanging="360"/>
+      </w:pPr>
+      <w:rPr>
+        <w:rFonts w:ascii="Wingdings" w:hAnsi="Wingdings" w:hint="default"/>
+        <w:sz w:val="20"/>
+      </w:rPr>
+    </w:lvl>
+    <w:lvl w:ilvl="5" w:tentative="1">
+      <w:start w:val="1"/>
+      <w:numFmt w:val="bullet"/>
+      <w:lvlText w:val=""/>
+      <w:lvlJc w:val="left"/>
+      <w:pPr>
+        <w:tabs>
+          <w:tab w:val="num" w:pos="4320"/>
+        </w:tabs>
+        <w:ind w:left="4320" w:hanging="360"/>
+      </w:pPr>
+      <w:rPr>
+        <w:rFonts w:ascii="Wingdings" w:hAnsi="Wingdings" w:hint="default"/>
+        <w:sz w:val="20"/>
+      </w:rPr>
+    </w:lvl>
+    <w:lvl w:ilvl="6" w:tentative="1">
+      <w:start w:val="1"/>
+      <w:numFmt w:val="bullet"/>
+      <w:lvlText w:val=""/>
+      <w:lvlJc w:val="left"/>
+      <w:pPr>
+        <w:tabs>
+          <w:tab w:val="num" w:pos="5040"/>
+        </w:tabs>
+        <w:ind w:left="5040" w:hanging="360"/>
+      </w:pPr>
+      <w:rPr>
+        <w:rFonts w:ascii="Wingdings" w:hAnsi="Wingdings" w:hint="default"/>
+        <w:sz w:val="20"/>
+      </w:rPr>
+    </w:lvl>
+    <w:lvl w:ilvl="7" w:tentative="1">
+      <w:start w:val="1"/>
+      <w:numFmt w:val="bullet"/>
+      <w:lvlText w:val=""/>
+      <w:lvlJc w:val="left"/>
+      <w:pPr>
+        <w:tabs>
+          <w:tab w:val="num" w:pos="5760"/>
+        </w:tabs>
+        <w:ind w:left="5760" w:hanging="360"/>
+      </w:pPr>
+      <w:rPr>
+        <w:rFonts w:ascii="Wingdings" w:hAnsi="Wingdings" w:hint="default"/>
+        <w:sz w:val="20"/>
+      </w:rPr>
+    </w:lvl>
+    <w:lvl w:ilvl="8" w:tentative="1">
+      <w:start w:val="1"/>
+      <w:numFmt w:val="bullet"/>
+      <w:lvlText w:val=""/>
+      <w:lvlJc w:val="left"/>
+      <w:pPr>
+        <w:tabs>
+          <w:tab w:val="num" w:pos="6480"/>
+        </w:tabs>
+        <w:ind w:left="6480" w:hanging="360"/>
+      </w:pPr>
+      <w:rPr>
+        <w:rFonts w:ascii="Wingdings" w:hAnsi="Wingdings" w:hint="default"/>
+        <w:sz w:val="20"/>
+      </w:rPr>
+    </w:lvl>
+  </w:abstractNum>
+  <w:abstractNum w:abstractNumId="6" w15:restartNumberingAfterBreak="0">
+    <w:nsid w:val="32274737"/>
+    <w:multiLevelType w:val="multilevel"/>
+    <w:tmpl w:val="9162EBE6"/>
     <w:lvl w:ilvl="0">
       <w:start w:val="1"/>
       <w:numFmt w:val="decimal"/>
@@ -7246,159 +7544,10 @@
       </w:pPr>
     </w:lvl>
   </w:abstractNum>
-  <w:abstractNum w:abstractNumId="5" w15:restartNumberingAfterBreak="0">
-    <w:nsid w:val="1C0224E5"/>
+  <w:abstractNum w:abstractNumId="7" w15:restartNumberingAfterBreak="0">
+    <w:nsid w:val="3D4F52E1"/>
     <w:multiLevelType w:val="multilevel"/>
-    <w:tmpl w:val="42809D38"/>
-    <w:lvl w:ilvl="0">
-      <w:start w:val="1"/>
-      <w:numFmt w:val="bullet"/>
-      <w:lvlText w:val=""/>
-      <w:lvlJc w:val="left"/>
-      <w:pPr>
-        <w:tabs>
-          <w:tab w:val="num" w:pos="720"/>
-        </w:tabs>
-        <w:ind w:left="720" w:hanging="360"/>
-      </w:pPr>
-      <w:rPr>
-        <w:rFonts w:ascii="Symbol" w:hAnsi="Symbol" w:hint="default"/>
-        <w:sz w:val="20"/>
-      </w:rPr>
-    </w:lvl>
-    <w:lvl w:ilvl="1" w:tentative="1">
-      <w:start w:val="1"/>
-      <w:numFmt w:val="bullet"/>
-      <w:lvlText w:val="o"/>
-      <w:lvlJc w:val="left"/>
-      <w:pPr>
-        <w:tabs>
-          <w:tab w:val="num" w:pos="1440"/>
-        </w:tabs>
-        <w:ind w:left="1440" w:hanging="360"/>
-      </w:pPr>
-      <w:rPr>
-        <w:rFonts w:ascii="Courier New" w:hAnsi="Courier New" w:hint="default"/>
-        <w:sz w:val="20"/>
-      </w:rPr>
-    </w:lvl>
-    <w:lvl w:ilvl="2" w:tentative="1">
-      <w:start w:val="1"/>
-      <w:numFmt w:val="bullet"/>
-      <w:lvlText w:val=""/>
-      <w:lvlJc w:val="left"/>
-      <w:pPr>
-        <w:tabs>
-          <w:tab w:val="num" w:pos="2160"/>
-        </w:tabs>
-        <w:ind w:left="2160" w:hanging="360"/>
-      </w:pPr>
-      <w:rPr>
-        <w:rFonts w:ascii="Wingdings" w:hAnsi="Wingdings" w:hint="default"/>
-        <w:sz w:val="20"/>
-      </w:rPr>
-    </w:lvl>
-    <w:lvl w:ilvl="3" w:tentative="1">
-      <w:start w:val="1"/>
-      <w:numFmt w:val="bullet"/>
-      <w:lvlText w:val=""/>
-      <w:lvlJc w:val="left"/>
-      <w:pPr>
-        <w:tabs>
-          <w:tab w:val="num" w:pos="2880"/>
-        </w:tabs>
-        <w:ind w:left="2880" w:hanging="360"/>
-      </w:pPr>
-      <w:rPr>
-        <w:rFonts w:ascii="Wingdings" w:hAnsi="Wingdings" w:hint="default"/>
-        <w:sz w:val="20"/>
-      </w:rPr>
-    </w:lvl>
-    <w:lvl w:ilvl="4" w:tentative="1">
-      <w:start w:val="1"/>
-      <w:numFmt w:val="bullet"/>
-      <w:lvlText w:val=""/>
-      <w:lvlJc w:val="left"/>
-      <w:pPr>
-        <w:tabs>
-          <w:tab w:val="num" w:pos="3600"/>
-        </w:tabs>
-        <w:ind w:left="3600" w:hanging="360"/>
-      </w:pPr>
-      <w:rPr>
-        <w:rFonts w:ascii="Wingdings" w:hAnsi="Wingdings" w:hint="default"/>
-        <w:sz w:val="20"/>
-      </w:rPr>
-    </w:lvl>
-    <w:lvl w:ilvl="5" w:tentative="1">
-      <w:start w:val="1"/>
-      <w:numFmt w:val="bullet"/>
-      <w:lvlText w:val=""/>
-      <w:lvlJc w:val="left"/>
-      <w:pPr>
-        <w:tabs>
-          <w:tab w:val="num" w:pos="4320"/>
-        </w:tabs>
-        <w:ind w:left="4320" w:hanging="360"/>
-      </w:pPr>
-      <w:rPr>
-        <w:rFonts w:ascii="Wingdings" w:hAnsi="Wingdings" w:hint="default"/>
-        <w:sz w:val="20"/>
-      </w:rPr>
-    </w:lvl>
-    <w:lvl w:ilvl="6" w:tentative="1">
-      <w:start w:val="1"/>
-      <w:numFmt w:val="bullet"/>
-      <w:lvlText w:val=""/>
-      <w:lvlJc w:val="left"/>
-      <w:pPr>
-        <w:tabs>
-          <w:tab w:val="num" w:pos="5040"/>
-        </w:tabs>
-        <w:ind w:left="5040" w:hanging="360"/>
-      </w:pPr>
-      <w:rPr>
-        <w:rFonts w:ascii="Wingdings" w:hAnsi="Wingdings" w:hint="default"/>
-        <w:sz w:val="20"/>
-      </w:rPr>
-    </w:lvl>
-    <w:lvl w:ilvl="7" w:tentative="1">
-      <w:start w:val="1"/>
-      <w:numFmt w:val="bullet"/>
-      <w:lvlText w:val=""/>
-      <w:lvlJc w:val="left"/>
-      <w:pPr>
-        <w:tabs>
-          <w:tab w:val="num" w:pos="5760"/>
-        </w:tabs>
-        <w:ind w:left="5760" w:hanging="360"/>
-      </w:pPr>
-      <w:rPr>
-        <w:rFonts w:ascii="Wingdings" w:hAnsi="Wingdings" w:hint="default"/>
-        <w:sz w:val="20"/>
-      </w:rPr>
-    </w:lvl>
-    <w:lvl w:ilvl="8" w:tentative="1">
-      <w:start w:val="1"/>
-      <w:numFmt w:val="bullet"/>
-      <w:lvlText w:val=""/>
-      <w:lvlJc w:val="left"/>
-      <w:pPr>
-        <w:tabs>
-          <w:tab w:val="num" w:pos="6480"/>
-        </w:tabs>
-        <w:ind w:left="6480" w:hanging="360"/>
-      </w:pPr>
-      <w:rPr>
-        <w:rFonts w:ascii="Wingdings" w:hAnsi="Wingdings" w:hint="default"/>
-        <w:sz w:val="20"/>
-      </w:rPr>
-    </w:lvl>
-  </w:abstractNum>
-  <w:abstractNum w:abstractNumId="6" w15:restartNumberingAfterBreak="0">
-    <w:nsid w:val="20092905"/>
-    <w:multiLevelType w:val="multilevel"/>
-    <w:tmpl w:val="C27476F2"/>
+    <w:tmpl w:val="78DC1B60"/>
     <w:lvl w:ilvl="0">
       <w:start w:val="1"/>
       <w:numFmt w:val="decimal"/>
@@ -7512,10 +7661,308 @@
       </w:pPr>
     </w:lvl>
   </w:abstractNum>
-  <w:abstractNum w:abstractNumId="7" w15:restartNumberingAfterBreak="0">
-    <w:nsid w:val="250C7A9B"/>
+  <w:abstractNum w:abstractNumId="8" w15:restartNumberingAfterBreak="0">
+    <w:nsid w:val="46C54005"/>
     <w:multiLevelType w:val="multilevel"/>
-    <w:tmpl w:val="AE72FBFA"/>
+    <w:tmpl w:val="A5CAB3C6"/>
+    <w:lvl w:ilvl="0">
+      <w:start w:val="1"/>
+      <w:numFmt w:val="bullet"/>
+      <w:lvlText w:val=""/>
+      <w:lvlJc w:val="left"/>
+      <w:pPr>
+        <w:tabs>
+          <w:tab w:val="num" w:pos="720"/>
+        </w:tabs>
+        <w:ind w:left="720" w:hanging="360"/>
+      </w:pPr>
+      <w:rPr>
+        <w:rFonts w:ascii="Symbol" w:hAnsi="Symbol" w:hint="default"/>
+        <w:sz w:val="20"/>
+      </w:rPr>
+    </w:lvl>
+    <w:lvl w:ilvl="1" w:tentative="1">
+      <w:start w:val="1"/>
+      <w:numFmt w:val="bullet"/>
+      <w:lvlText w:val="o"/>
+      <w:lvlJc w:val="left"/>
+      <w:pPr>
+        <w:tabs>
+          <w:tab w:val="num" w:pos="1440"/>
+        </w:tabs>
+        <w:ind w:left="1440" w:hanging="360"/>
+      </w:pPr>
+      <w:rPr>
+        <w:rFonts w:ascii="Courier New" w:hAnsi="Courier New" w:hint="default"/>
+        <w:sz w:val="20"/>
+      </w:rPr>
+    </w:lvl>
+    <w:lvl w:ilvl="2" w:tentative="1">
+      <w:start w:val="1"/>
+      <w:numFmt w:val="bullet"/>
+      <w:lvlText w:val=""/>
+      <w:lvlJc w:val="left"/>
+      <w:pPr>
+        <w:tabs>
+          <w:tab w:val="num" w:pos="2160"/>
+        </w:tabs>
+        <w:ind w:left="2160" w:hanging="360"/>
+      </w:pPr>
+      <w:rPr>
+        <w:rFonts w:ascii="Wingdings" w:hAnsi="Wingdings" w:hint="default"/>
+        <w:sz w:val="20"/>
+      </w:rPr>
+    </w:lvl>
+    <w:lvl w:ilvl="3" w:tentative="1">
+      <w:start w:val="1"/>
+      <w:numFmt w:val="bullet"/>
+      <w:lvlText w:val=""/>
+      <w:lvlJc w:val="left"/>
+      <w:pPr>
+        <w:tabs>
+          <w:tab w:val="num" w:pos="2880"/>
+        </w:tabs>
+        <w:ind w:left="2880" w:hanging="360"/>
+      </w:pPr>
+      <w:rPr>
+        <w:rFonts w:ascii="Wingdings" w:hAnsi="Wingdings" w:hint="default"/>
+        <w:sz w:val="20"/>
+      </w:rPr>
+    </w:lvl>
+    <w:lvl w:ilvl="4" w:tentative="1">
+      <w:start w:val="1"/>
+      <w:numFmt w:val="bullet"/>
+      <w:lvlText w:val=""/>
+      <w:lvlJc w:val="left"/>
+      <w:pPr>
+        <w:tabs>
+          <w:tab w:val="num" w:pos="3600"/>
+        </w:tabs>
+        <w:ind w:left="3600" w:hanging="360"/>
+      </w:pPr>
+      <w:rPr>
+        <w:rFonts w:ascii="Wingdings" w:hAnsi="Wingdings" w:hint="default"/>
+        <w:sz w:val="20"/>
+      </w:rPr>
+    </w:lvl>
+    <w:lvl w:ilvl="5" w:tentative="1">
+      <w:start w:val="1"/>
+      <w:numFmt w:val="bullet"/>
+      <w:lvlText w:val=""/>
+      <w:lvlJc w:val="left"/>
+      <w:pPr>
+        <w:tabs>
+          <w:tab w:val="num" w:pos="4320"/>
+        </w:tabs>
+        <w:ind w:left="4320" w:hanging="360"/>
+      </w:pPr>
+      <w:rPr>
+        <w:rFonts w:ascii="Wingdings" w:hAnsi="Wingdings" w:hint="default"/>
+        <w:sz w:val="20"/>
+      </w:rPr>
+    </w:lvl>
+    <w:lvl w:ilvl="6" w:tentative="1">
+      <w:start w:val="1"/>
+      <w:numFmt w:val="bullet"/>
+      <w:lvlText w:val=""/>
+      <w:lvlJc w:val="left"/>
+      <w:pPr>
+        <w:tabs>
+          <w:tab w:val="num" w:pos="5040"/>
+        </w:tabs>
+        <w:ind w:left="5040" w:hanging="360"/>
+      </w:pPr>
+      <w:rPr>
+        <w:rFonts w:ascii="Wingdings" w:hAnsi="Wingdings" w:hint="default"/>
+        <w:sz w:val="20"/>
+      </w:rPr>
+    </w:lvl>
+    <w:lvl w:ilvl="7" w:tentative="1">
+      <w:start w:val="1"/>
+      <w:numFmt w:val="bullet"/>
+      <w:lvlText w:val=""/>
+      <w:lvlJc w:val="left"/>
+      <w:pPr>
+        <w:tabs>
+          <w:tab w:val="num" w:pos="5760"/>
+        </w:tabs>
+        <w:ind w:left="5760" w:hanging="360"/>
+      </w:pPr>
+      <w:rPr>
+        <w:rFonts w:ascii="Wingdings" w:hAnsi="Wingdings" w:hint="default"/>
+        <w:sz w:val="20"/>
+      </w:rPr>
+    </w:lvl>
+    <w:lvl w:ilvl="8" w:tentative="1">
+      <w:start w:val="1"/>
+      <w:numFmt w:val="bullet"/>
+      <w:lvlText w:val=""/>
+      <w:lvlJc w:val="left"/>
+      <w:pPr>
+        <w:tabs>
+          <w:tab w:val="num" w:pos="6480"/>
+        </w:tabs>
+        <w:ind w:left="6480" w:hanging="360"/>
+      </w:pPr>
+      <w:rPr>
+        <w:rFonts w:ascii="Wingdings" w:hAnsi="Wingdings" w:hint="default"/>
+        <w:sz w:val="20"/>
+      </w:rPr>
+    </w:lvl>
+  </w:abstractNum>
+  <w:abstractNum w:abstractNumId="9" w15:restartNumberingAfterBreak="0">
+    <w:nsid w:val="491D2C94"/>
+    <w:multiLevelType w:val="multilevel"/>
+    <w:tmpl w:val="CB4A634C"/>
+    <w:lvl w:ilvl="0">
+      <w:start w:val="1"/>
+      <w:numFmt w:val="bullet"/>
+      <w:lvlText w:val=""/>
+      <w:lvlJc w:val="left"/>
+      <w:pPr>
+        <w:tabs>
+          <w:tab w:val="num" w:pos="720"/>
+        </w:tabs>
+        <w:ind w:left="720" w:hanging="360"/>
+      </w:pPr>
+      <w:rPr>
+        <w:rFonts w:ascii="Symbol" w:hAnsi="Symbol" w:hint="default"/>
+        <w:sz w:val="20"/>
+      </w:rPr>
+    </w:lvl>
+    <w:lvl w:ilvl="1" w:tentative="1">
+      <w:start w:val="1"/>
+      <w:numFmt w:val="bullet"/>
+      <w:lvlText w:val="o"/>
+      <w:lvlJc w:val="left"/>
+      <w:pPr>
+        <w:tabs>
+          <w:tab w:val="num" w:pos="1440"/>
+        </w:tabs>
+        <w:ind w:left="1440" w:hanging="360"/>
+      </w:pPr>
+      <w:rPr>
+        <w:rFonts w:ascii="Courier New" w:hAnsi="Courier New" w:hint="default"/>
+        <w:sz w:val="20"/>
+      </w:rPr>
+    </w:lvl>
+    <w:lvl w:ilvl="2" w:tentative="1">
+      <w:start w:val="1"/>
+      <w:numFmt w:val="bullet"/>
+      <w:lvlText w:val=""/>
+      <w:lvlJc w:val="left"/>
+      <w:pPr>
+        <w:tabs>
+          <w:tab w:val="num" w:pos="2160"/>
+        </w:tabs>
+        <w:ind w:left="2160" w:hanging="360"/>
+      </w:pPr>
+      <w:rPr>
+        <w:rFonts w:ascii="Wingdings" w:hAnsi="Wingdings" w:hint="default"/>
+        <w:sz w:val="20"/>
+      </w:rPr>
+    </w:lvl>
+    <w:lvl w:ilvl="3" w:tentative="1">
+      <w:start w:val="1"/>
+      <w:numFmt w:val="bullet"/>
+      <w:lvlText w:val=""/>
+      <w:lvlJc w:val="left"/>
+      <w:pPr>
+        <w:tabs>
+          <w:tab w:val="num" w:pos="2880"/>
+        </w:tabs>
+        <w:ind w:left="2880" w:hanging="360"/>
+      </w:pPr>
+      <w:rPr>
+        <w:rFonts w:ascii="Wingdings" w:hAnsi="Wingdings" w:hint="default"/>
+        <w:sz w:val="20"/>
+      </w:rPr>
+    </w:lvl>
+    <w:lvl w:ilvl="4" w:tentative="1">
+      <w:start w:val="1"/>
+      <w:numFmt w:val="bullet"/>
+      <w:lvlText w:val=""/>
+      <w:lvlJc w:val="left"/>
+      <w:pPr>
+        <w:tabs>
+          <w:tab w:val="num" w:pos="3600"/>
+        </w:tabs>
+        <w:ind w:left="3600" w:hanging="360"/>
+      </w:pPr>
+      <w:rPr>
+        <w:rFonts w:ascii="Wingdings" w:hAnsi="Wingdings" w:hint="default"/>
+        <w:sz w:val="20"/>
+      </w:rPr>
+    </w:lvl>
+    <w:lvl w:ilvl="5" w:tentative="1">
+      <w:start w:val="1"/>
+      <w:numFmt w:val="bullet"/>
+      <w:lvlText w:val=""/>
+      <w:lvlJc w:val="left"/>
+      <w:pPr>
+        <w:tabs>
+          <w:tab w:val="num" w:pos="4320"/>
+        </w:tabs>
+        <w:ind w:left="4320" w:hanging="360"/>
+      </w:pPr>
+      <w:rPr>
+        <w:rFonts w:ascii="Wingdings" w:hAnsi="Wingdings" w:hint="default"/>
+        <w:sz w:val="20"/>
+      </w:rPr>
+    </w:lvl>
+    <w:lvl w:ilvl="6" w:tentative="1">
+      <w:start w:val="1"/>
+      <w:numFmt w:val="bullet"/>
+      <w:lvlText w:val=""/>
+      <w:lvlJc w:val="left"/>
+      <w:pPr>
+        <w:tabs>
+          <w:tab w:val="num" w:pos="5040"/>
+        </w:tabs>
+        <w:ind w:left="5040" w:hanging="360"/>
+      </w:pPr>
+      <w:rPr>
+        <w:rFonts w:ascii="Wingdings" w:hAnsi="Wingdings" w:hint="default"/>
+        <w:sz w:val="20"/>
+      </w:rPr>
+    </w:lvl>
+    <w:lvl w:ilvl="7" w:tentative="1">
+      <w:start w:val="1"/>
+      <w:numFmt w:val="bullet"/>
+      <w:lvlText w:val=""/>
+      <w:lvlJc w:val="left"/>
+      <w:pPr>
+        <w:tabs>
+          <w:tab w:val="num" w:pos="5760"/>
+        </w:tabs>
+        <w:ind w:left="5760" w:hanging="360"/>
+      </w:pPr>
+      <w:rPr>
+        <w:rFonts w:ascii="Wingdings" w:hAnsi="Wingdings" w:hint="default"/>
+        <w:sz w:val="20"/>
+      </w:rPr>
+    </w:lvl>
+    <w:lvl w:ilvl="8" w:tentative="1">
+      <w:start w:val="1"/>
+      <w:numFmt w:val="bullet"/>
+      <w:lvlText w:val=""/>
+      <w:lvlJc w:val="left"/>
+      <w:pPr>
+        <w:tabs>
+          <w:tab w:val="num" w:pos="6480"/>
+        </w:tabs>
+        <w:ind w:left="6480" w:hanging="360"/>
+      </w:pPr>
+      <w:rPr>
+        <w:rFonts w:ascii="Wingdings" w:hAnsi="Wingdings" w:hint="default"/>
+        <w:sz w:val="20"/>
+      </w:rPr>
+    </w:lvl>
+  </w:abstractNum>
+  <w:abstractNum w:abstractNumId="10" w15:restartNumberingAfterBreak="0">
+    <w:nsid w:val="4AAD1768"/>
+    <w:multiLevelType w:val="multilevel"/>
+    <w:tmpl w:val="622E1BB2"/>
     <w:lvl w:ilvl="0">
       <w:start w:val="1"/>
       <w:numFmt w:val="decimal"/>
@@ -7629,10 +8076,457 @@
       </w:pPr>
     </w:lvl>
   </w:abstractNum>
-  <w:abstractNum w:abstractNumId="8" w15:restartNumberingAfterBreak="0">
-    <w:nsid w:val="25642C6B"/>
+  <w:abstractNum w:abstractNumId="11" w15:restartNumberingAfterBreak="0">
+    <w:nsid w:val="5022015F"/>
     <w:multiLevelType w:val="multilevel"/>
-    <w:tmpl w:val="78DAC012"/>
+    <w:tmpl w:val="8848BC6E"/>
+    <w:lvl w:ilvl="0">
+      <w:start w:val="1"/>
+      <w:numFmt w:val="bullet"/>
+      <w:lvlText w:val=""/>
+      <w:lvlJc w:val="left"/>
+      <w:pPr>
+        <w:tabs>
+          <w:tab w:val="num" w:pos="720"/>
+        </w:tabs>
+        <w:ind w:left="720" w:hanging="360"/>
+      </w:pPr>
+      <w:rPr>
+        <w:rFonts w:ascii="Symbol" w:hAnsi="Symbol" w:hint="default"/>
+        <w:sz w:val="20"/>
+      </w:rPr>
+    </w:lvl>
+    <w:lvl w:ilvl="1" w:tentative="1">
+      <w:start w:val="1"/>
+      <w:numFmt w:val="bullet"/>
+      <w:lvlText w:val="o"/>
+      <w:lvlJc w:val="left"/>
+      <w:pPr>
+        <w:tabs>
+          <w:tab w:val="num" w:pos="1440"/>
+        </w:tabs>
+        <w:ind w:left="1440" w:hanging="360"/>
+      </w:pPr>
+      <w:rPr>
+        <w:rFonts w:ascii="Courier New" w:hAnsi="Courier New" w:hint="default"/>
+        <w:sz w:val="20"/>
+      </w:rPr>
+    </w:lvl>
+    <w:lvl w:ilvl="2" w:tentative="1">
+      <w:start w:val="1"/>
+      <w:numFmt w:val="bullet"/>
+      <w:lvlText w:val=""/>
+      <w:lvlJc w:val="left"/>
+      <w:pPr>
+        <w:tabs>
+          <w:tab w:val="num" w:pos="2160"/>
+        </w:tabs>
+        <w:ind w:left="2160" w:hanging="360"/>
+      </w:pPr>
+      <w:rPr>
+        <w:rFonts w:ascii="Wingdings" w:hAnsi="Wingdings" w:hint="default"/>
+        <w:sz w:val="20"/>
+      </w:rPr>
+    </w:lvl>
+    <w:lvl w:ilvl="3" w:tentative="1">
+      <w:start w:val="1"/>
+      <w:numFmt w:val="bullet"/>
+      <w:lvlText w:val=""/>
+      <w:lvlJc w:val="left"/>
+      <w:pPr>
+        <w:tabs>
+          <w:tab w:val="num" w:pos="2880"/>
+        </w:tabs>
+        <w:ind w:left="2880" w:hanging="360"/>
+      </w:pPr>
+      <w:rPr>
+        <w:rFonts w:ascii="Wingdings" w:hAnsi="Wingdings" w:hint="default"/>
+        <w:sz w:val="20"/>
+      </w:rPr>
+    </w:lvl>
+    <w:lvl w:ilvl="4" w:tentative="1">
+      <w:start w:val="1"/>
+      <w:numFmt w:val="bullet"/>
+      <w:lvlText w:val=""/>
+      <w:lvlJc w:val="left"/>
+      <w:pPr>
+        <w:tabs>
+          <w:tab w:val="num" w:pos="3600"/>
+        </w:tabs>
+        <w:ind w:left="3600" w:hanging="360"/>
+      </w:pPr>
+      <w:rPr>
+        <w:rFonts w:ascii="Wingdings" w:hAnsi="Wingdings" w:hint="default"/>
+        <w:sz w:val="20"/>
+      </w:rPr>
+    </w:lvl>
+    <w:lvl w:ilvl="5" w:tentative="1">
+      <w:start w:val="1"/>
+      <w:numFmt w:val="bullet"/>
+      <w:lvlText w:val=""/>
+      <w:lvlJc w:val="left"/>
+      <w:pPr>
+        <w:tabs>
+          <w:tab w:val="num" w:pos="4320"/>
+        </w:tabs>
+        <w:ind w:left="4320" w:hanging="360"/>
+      </w:pPr>
+      <w:rPr>
+        <w:rFonts w:ascii="Wingdings" w:hAnsi="Wingdings" w:hint="default"/>
+        <w:sz w:val="20"/>
+      </w:rPr>
+    </w:lvl>
+    <w:lvl w:ilvl="6" w:tentative="1">
+      <w:start w:val="1"/>
+      <w:numFmt w:val="bullet"/>
+      <w:lvlText w:val=""/>
+      <w:lvlJc w:val="left"/>
+      <w:pPr>
+        <w:tabs>
+          <w:tab w:val="num" w:pos="5040"/>
+        </w:tabs>
+        <w:ind w:left="5040" w:hanging="360"/>
+      </w:pPr>
+      <w:rPr>
+        <w:rFonts w:ascii="Wingdings" w:hAnsi="Wingdings" w:hint="default"/>
+        <w:sz w:val="20"/>
+      </w:rPr>
+    </w:lvl>
+    <w:lvl w:ilvl="7" w:tentative="1">
+      <w:start w:val="1"/>
+      <w:numFmt w:val="bullet"/>
+      <w:lvlText w:val=""/>
+      <w:lvlJc w:val="left"/>
+      <w:pPr>
+        <w:tabs>
+          <w:tab w:val="num" w:pos="5760"/>
+        </w:tabs>
+        <w:ind w:left="5760" w:hanging="360"/>
+      </w:pPr>
+      <w:rPr>
+        <w:rFonts w:ascii="Wingdings" w:hAnsi="Wingdings" w:hint="default"/>
+        <w:sz w:val="20"/>
+      </w:rPr>
+    </w:lvl>
+    <w:lvl w:ilvl="8" w:tentative="1">
+      <w:start w:val="1"/>
+      <w:numFmt w:val="bullet"/>
+      <w:lvlText w:val=""/>
+      <w:lvlJc w:val="left"/>
+      <w:pPr>
+        <w:tabs>
+          <w:tab w:val="num" w:pos="6480"/>
+        </w:tabs>
+        <w:ind w:left="6480" w:hanging="360"/>
+      </w:pPr>
+      <w:rPr>
+        <w:rFonts w:ascii="Wingdings" w:hAnsi="Wingdings" w:hint="default"/>
+        <w:sz w:val="20"/>
+      </w:rPr>
+    </w:lvl>
+  </w:abstractNum>
+  <w:abstractNum w:abstractNumId="12" w15:restartNumberingAfterBreak="0">
+    <w:nsid w:val="52E96A2F"/>
+    <w:multiLevelType w:val="multilevel"/>
+    <w:tmpl w:val="9D66D454"/>
+    <w:lvl w:ilvl="0">
+      <w:start w:val="1"/>
+      <w:numFmt w:val="bullet"/>
+      <w:lvlText w:val=""/>
+      <w:lvlJc w:val="left"/>
+      <w:pPr>
+        <w:tabs>
+          <w:tab w:val="num" w:pos="720"/>
+        </w:tabs>
+        <w:ind w:left="720" w:hanging="360"/>
+      </w:pPr>
+      <w:rPr>
+        <w:rFonts w:ascii="Symbol" w:hAnsi="Symbol" w:hint="default"/>
+        <w:sz w:val="20"/>
+      </w:rPr>
+    </w:lvl>
+    <w:lvl w:ilvl="1" w:tentative="1">
+      <w:start w:val="1"/>
+      <w:numFmt w:val="bullet"/>
+      <w:lvlText w:val="o"/>
+      <w:lvlJc w:val="left"/>
+      <w:pPr>
+        <w:tabs>
+          <w:tab w:val="num" w:pos="1440"/>
+        </w:tabs>
+        <w:ind w:left="1440" w:hanging="360"/>
+      </w:pPr>
+      <w:rPr>
+        <w:rFonts w:ascii="Courier New" w:hAnsi="Courier New" w:hint="default"/>
+        <w:sz w:val="20"/>
+      </w:rPr>
+    </w:lvl>
+    <w:lvl w:ilvl="2" w:tentative="1">
+      <w:start w:val="1"/>
+      <w:numFmt w:val="bullet"/>
+      <w:lvlText w:val=""/>
+      <w:lvlJc w:val="left"/>
+      <w:pPr>
+        <w:tabs>
+          <w:tab w:val="num" w:pos="2160"/>
+        </w:tabs>
+        <w:ind w:left="2160" w:hanging="360"/>
+      </w:pPr>
+      <w:rPr>
+        <w:rFonts w:ascii="Wingdings" w:hAnsi="Wingdings" w:hint="default"/>
+        <w:sz w:val="20"/>
+      </w:rPr>
+    </w:lvl>
+    <w:lvl w:ilvl="3" w:tentative="1">
+      <w:start w:val="1"/>
+      <w:numFmt w:val="bullet"/>
+      <w:lvlText w:val=""/>
+      <w:lvlJc w:val="left"/>
+      <w:pPr>
+        <w:tabs>
+          <w:tab w:val="num" w:pos="2880"/>
+        </w:tabs>
+        <w:ind w:left="2880" w:hanging="360"/>
+      </w:pPr>
+      <w:rPr>
+        <w:rFonts w:ascii="Wingdings" w:hAnsi="Wingdings" w:hint="default"/>
+        <w:sz w:val="20"/>
+      </w:rPr>
+    </w:lvl>
+    <w:lvl w:ilvl="4" w:tentative="1">
+      <w:start w:val="1"/>
+      <w:numFmt w:val="bullet"/>
+      <w:lvlText w:val=""/>
+      <w:lvlJc w:val="left"/>
+      <w:pPr>
+        <w:tabs>
+          <w:tab w:val="num" w:pos="3600"/>
+        </w:tabs>
+        <w:ind w:left="3600" w:hanging="360"/>
+      </w:pPr>
+      <w:rPr>
+        <w:rFonts w:ascii="Wingdings" w:hAnsi="Wingdings" w:hint="default"/>
+        <w:sz w:val="20"/>
+      </w:rPr>
+    </w:lvl>
+    <w:lvl w:ilvl="5" w:tentative="1">
+      <w:start w:val="1"/>
+      <w:numFmt w:val="bullet"/>
+      <w:lvlText w:val=""/>
+      <w:lvlJc w:val="left"/>
+      <w:pPr>
+        <w:tabs>
+          <w:tab w:val="num" w:pos="4320"/>
+        </w:tabs>
+        <w:ind w:left="4320" w:hanging="360"/>
+      </w:pPr>
+      <w:rPr>
+        <w:rFonts w:ascii="Wingdings" w:hAnsi="Wingdings" w:hint="default"/>
+        <w:sz w:val="20"/>
+      </w:rPr>
+    </w:lvl>
+    <w:lvl w:ilvl="6" w:tentative="1">
+      <w:start w:val="1"/>
+      <w:numFmt w:val="bullet"/>
+      <w:lvlText w:val=""/>
+      <w:lvlJc w:val="left"/>
+      <w:pPr>
+        <w:tabs>
+          <w:tab w:val="num" w:pos="5040"/>
+        </w:tabs>
+        <w:ind w:left="5040" w:hanging="360"/>
+      </w:pPr>
+      <w:rPr>
+        <w:rFonts w:ascii="Wingdings" w:hAnsi="Wingdings" w:hint="default"/>
+        <w:sz w:val="20"/>
+      </w:rPr>
+    </w:lvl>
+    <w:lvl w:ilvl="7" w:tentative="1">
+      <w:start w:val="1"/>
+      <w:numFmt w:val="bullet"/>
+      <w:lvlText w:val=""/>
+      <w:lvlJc w:val="left"/>
+      <w:pPr>
+        <w:tabs>
+          <w:tab w:val="num" w:pos="5760"/>
+        </w:tabs>
+        <w:ind w:left="5760" w:hanging="360"/>
+      </w:pPr>
+      <w:rPr>
+        <w:rFonts w:ascii="Wingdings" w:hAnsi="Wingdings" w:hint="default"/>
+        <w:sz w:val="20"/>
+      </w:rPr>
+    </w:lvl>
+    <w:lvl w:ilvl="8" w:tentative="1">
+      <w:start w:val="1"/>
+      <w:numFmt w:val="bullet"/>
+      <w:lvlText w:val=""/>
+      <w:lvlJc w:val="left"/>
+      <w:pPr>
+        <w:tabs>
+          <w:tab w:val="num" w:pos="6480"/>
+        </w:tabs>
+        <w:ind w:left="6480" w:hanging="360"/>
+      </w:pPr>
+      <w:rPr>
+        <w:rFonts w:ascii="Wingdings" w:hAnsi="Wingdings" w:hint="default"/>
+        <w:sz w:val="20"/>
+      </w:rPr>
+    </w:lvl>
+  </w:abstractNum>
+  <w:abstractNum w:abstractNumId="13" w15:restartNumberingAfterBreak="0">
+    <w:nsid w:val="54F20F62"/>
+    <w:multiLevelType w:val="multilevel"/>
+    <w:tmpl w:val="AA644B90"/>
+    <w:lvl w:ilvl="0">
+      <w:start w:val="1"/>
+      <w:numFmt w:val="bullet"/>
+      <w:lvlText w:val=""/>
+      <w:lvlJc w:val="left"/>
+      <w:pPr>
+        <w:tabs>
+          <w:tab w:val="num" w:pos="720"/>
+        </w:tabs>
+        <w:ind w:left="720" w:hanging="360"/>
+      </w:pPr>
+      <w:rPr>
+        <w:rFonts w:ascii="Symbol" w:hAnsi="Symbol" w:hint="default"/>
+        <w:sz w:val="20"/>
+      </w:rPr>
+    </w:lvl>
+    <w:lvl w:ilvl="1" w:tentative="1">
+      <w:start w:val="1"/>
+      <w:numFmt w:val="bullet"/>
+      <w:lvlText w:val="o"/>
+      <w:lvlJc w:val="left"/>
+      <w:pPr>
+        <w:tabs>
+          <w:tab w:val="num" w:pos="1440"/>
+        </w:tabs>
+        <w:ind w:left="1440" w:hanging="360"/>
+      </w:pPr>
+      <w:rPr>
+        <w:rFonts w:ascii="Courier New" w:hAnsi="Courier New" w:hint="default"/>
+        <w:sz w:val="20"/>
+      </w:rPr>
+    </w:lvl>
+    <w:lvl w:ilvl="2" w:tentative="1">
+      <w:start w:val="1"/>
+      <w:numFmt w:val="bullet"/>
+      <w:lvlText w:val=""/>
+      <w:lvlJc w:val="left"/>
+      <w:pPr>
+        <w:tabs>
+          <w:tab w:val="num" w:pos="2160"/>
+        </w:tabs>
+        <w:ind w:left="2160" w:hanging="360"/>
+      </w:pPr>
+      <w:rPr>
+        <w:rFonts w:ascii="Wingdings" w:hAnsi="Wingdings" w:hint="default"/>
+        <w:sz w:val="20"/>
+      </w:rPr>
+    </w:lvl>
+    <w:lvl w:ilvl="3" w:tentative="1">
+      <w:start w:val="1"/>
+      <w:numFmt w:val="bullet"/>
+      <w:lvlText w:val=""/>
+      <w:lvlJc w:val="left"/>
+      <w:pPr>
+        <w:tabs>
+          <w:tab w:val="num" w:pos="2880"/>
+        </w:tabs>
+        <w:ind w:left="2880" w:hanging="360"/>
+      </w:pPr>
+      <w:rPr>
+        <w:rFonts w:ascii="Wingdings" w:hAnsi="Wingdings" w:hint="default"/>
+        <w:sz w:val="20"/>
+      </w:rPr>
+    </w:lvl>
+    <w:lvl w:ilvl="4" w:tentative="1">
+      <w:start w:val="1"/>
+      <w:numFmt w:val="bullet"/>
+      <w:lvlText w:val=""/>
+      <w:lvlJc w:val="left"/>
+      <w:pPr>
+        <w:tabs>
+          <w:tab w:val="num" w:pos="3600"/>
+        </w:tabs>
+        <w:ind w:left="3600" w:hanging="360"/>
+      </w:pPr>
+      <w:rPr>
+        <w:rFonts w:ascii="Wingdings" w:hAnsi="Wingdings" w:hint="default"/>
+        <w:sz w:val="20"/>
+      </w:rPr>
+    </w:lvl>
+    <w:lvl w:ilvl="5" w:tentative="1">
+      <w:start w:val="1"/>
+      <w:numFmt w:val="bullet"/>
+      <w:lvlText w:val=""/>
+      <w:lvlJc w:val="left"/>
+      <w:pPr>
+        <w:tabs>
+          <w:tab w:val="num" w:pos="4320"/>
+        </w:tabs>
+        <w:ind w:left="4320" w:hanging="360"/>
+      </w:pPr>
+      <w:rPr>
+        <w:rFonts w:ascii="Wingdings" w:hAnsi="Wingdings" w:hint="default"/>
+        <w:sz w:val="20"/>
+      </w:rPr>
+    </w:lvl>
+    <w:lvl w:ilvl="6" w:tentative="1">
+      <w:start w:val="1"/>
+      <w:numFmt w:val="bullet"/>
+      <w:lvlText w:val=""/>
+      <w:lvlJc w:val="left"/>
+      <w:pPr>
+        <w:tabs>
+          <w:tab w:val="num" w:pos="5040"/>
+        </w:tabs>
+        <w:ind w:left="5040" w:hanging="360"/>
+      </w:pPr>
+      <w:rPr>
+        <w:rFonts w:ascii="Wingdings" w:hAnsi="Wingdings" w:hint="default"/>
+        <w:sz w:val="20"/>
+      </w:rPr>
+    </w:lvl>
+    <w:lvl w:ilvl="7" w:tentative="1">
+      <w:start w:val="1"/>
+      <w:numFmt w:val="bullet"/>
+      <w:lvlText w:val=""/>
+      <w:lvlJc w:val="left"/>
+      <w:pPr>
+        <w:tabs>
+          <w:tab w:val="num" w:pos="5760"/>
+        </w:tabs>
+        <w:ind w:left="5760" w:hanging="360"/>
+      </w:pPr>
+      <w:rPr>
+        <w:rFonts w:ascii="Wingdings" w:hAnsi="Wingdings" w:hint="default"/>
+        <w:sz w:val="20"/>
+      </w:rPr>
+    </w:lvl>
+    <w:lvl w:ilvl="8" w:tentative="1">
+      <w:start w:val="1"/>
+      <w:numFmt w:val="bullet"/>
+      <w:lvlText w:val=""/>
+      <w:lvlJc w:val="left"/>
+      <w:pPr>
+        <w:tabs>
+          <w:tab w:val="num" w:pos="6480"/>
+        </w:tabs>
+        <w:ind w:left="6480" w:hanging="360"/>
+      </w:pPr>
+      <w:rPr>
+        <w:rFonts w:ascii="Wingdings" w:hAnsi="Wingdings" w:hint="default"/>
+        <w:sz w:val="20"/>
+      </w:rPr>
+    </w:lvl>
+  </w:abstractNum>
+  <w:abstractNum w:abstractNumId="14" w15:restartNumberingAfterBreak="0">
+    <w:nsid w:val="55305606"/>
+    <w:multiLevelType w:val="multilevel"/>
+    <w:tmpl w:val="B782ACE8"/>
     <w:lvl w:ilvl="0">
       <w:start w:val="1"/>
       <w:numFmt w:val="decimal"/>
@@ -7746,10 +8640,10 @@
       </w:pPr>
     </w:lvl>
   </w:abstractNum>
-  <w:abstractNum w:abstractNumId="9" w15:restartNumberingAfterBreak="0">
-    <w:nsid w:val="2BF76962"/>
+  <w:abstractNum w:abstractNumId="15" w15:restartNumberingAfterBreak="0">
+    <w:nsid w:val="565B20D0"/>
     <w:multiLevelType w:val="multilevel"/>
-    <w:tmpl w:val="343EB2AC"/>
+    <w:tmpl w:val="01DC9C6C"/>
     <w:lvl w:ilvl="0">
       <w:start w:val="1"/>
       <w:numFmt w:val="decimal"/>
@@ -7863,10 +8757,10 @@
       </w:pPr>
     </w:lvl>
   </w:abstractNum>
-  <w:abstractNum w:abstractNumId="10" w15:restartNumberingAfterBreak="0">
-    <w:nsid w:val="2E187C7D"/>
+  <w:abstractNum w:abstractNumId="16" w15:restartNumberingAfterBreak="0">
+    <w:nsid w:val="609F1034"/>
     <w:multiLevelType w:val="multilevel"/>
-    <w:tmpl w:val="38E2820A"/>
+    <w:tmpl w:val="7CB21ABA"/>
     <w:lvl w:ilvl="0">
       <w:start w:val="1"/>
       <w:numFmt w:val="decimal"/>
@@ -7980,10 +8874,10 @@
       </w:pPr>
     </w:lvl>
   </w:abstractNum>
-  <w:abstractNum w:abstractNumId="11" w15:restartNumberingAfterBreak="0">
-    <w:nsid w:val="325A75CB"/>
+  <w:abstractNum w:abstractNumId="17" w15:restartNumberingAfterBreak="0">
+    <w:nsid w:val="69D72976"/>
     <w:multiLevelType w:val="multilevel"/>
-    <w:tmpl w:val="67129F14"/>
+    <w:tmpl w:val="89C822A8"/>
     <w:lvl w:ilvl="0">
       <w:start w:val="1"/>
       <w:numFmt w:val="bullet"/>
@@ -8129,10 +9023,10 @@
       </w:rPr>
     </w:lvl>
   </w:abstractNum>
-  <w:abstractNum w:abstractNumId="12" w15:restartNumberingAfterBreak="0">
-    <w:nsid w:val="3957067F"/>
+  <w:abstractNum w:abstractNumId="18" w15:restartNumberingAfterBreak="0">
+    <w:nsid w:val="6B5A2429"/>
     <w:multiLevelType w:val="multilevel"/>
-    <w:tmpl w:val="D29083EC"/>
+    <w:tmpl w:val="F5A0A986"/>
     <w:lvl w:ilvl="0">
       <w:start w:val="1"/>
       <w:numFmt w:val="decimal"/>
@@ -8246,904 +9140,10 @@
       </w:pPr>
     </w:lvl>
   </w:abstractNum>
-  <w:abstractNum w:abstractNumId="13" w15:restartNumberingAfterBreak="0">
-    <w:nsid w:val="3B2B13FB"/>
+  <w:abstractNum w:abstractNumId="19" w15:restartNumberingAfterBreak="0">
+    <w:nsid w:val="745F2D3E"/>
     <w:multiLevelType w:val="multilevel"/>
-    <w:tmpl w:val="6FF4408C"/>
-    <w:lvl w:ilvl="0">
-      <w:start w:val="1"/>
-      <w:numFmt w:val="bullet"/>
-      <w:lvlText w:val=""/>
-      <w:lvlJc w:val="left"/>
-      <w:pPr>
-        <w:tabs>
-          <w:tab w:val="num" w:pos="720"/>
-        </w:tabs>
-        <w:ind w:left="720" w:hanging="360"/>
-      </w:pPr>
-      <w:rPr>
-        <w:rFonts w:ascii="Symbol" w:hAnsi="Symbol" w:hint="default"/>
-        <w:sz w:val="20"/>
-      </w:rPr>
-    </w:lvl>
-    <w:lvl w:ilvl="1" w:tentative="1">
-      <w:start w:val="1"/>
-      <w:numFmt w:val="bullet"/>
-      <w:lvlText w:val="o"/>
-      <w:lvlJc w:val="left"/>
-      <w:pPr>
-        <w:tabs>
-          <w:tab w:val="num" w:pos="1440"/>
-        </w:tabs>
-        <w:ind w:left="1440" w:hanging="360"/>
-      </w:pPr>
-      <w:rPr>
-        <w:rFonts w:ascii="Courier New" w:hAnsi="Courier New" w:hint="default"/>
-        <w:sz w:val="20"/>
-      </w:rPr>
-    </w:lvl>
-    <w:lvl w:ilvl="2" w:tentative="1">
-      <w:start w:val="1"/>
-      <w:numFmt w:val="bullet"/>
-      <w:lvlText w:val=""/>
-      <w:lvlJc w:val="left"/>
-      <w:pPr>
-        <w:tabs>
-          <w:tab w:val="num" w:pos="2160"/>
-        </w:tabs>
-        <w:ind w:left="2160" w:hanging="360"/>
-      </w:pPr>
-      <w:rPr>
-        <w:rFonts w:ascii="Wingdings" w:hAnsi="Wingdings" w:hint="default"/>
-        <w:sz w:val="20"/>
-      </w:rPr>
-    </w:lvl>
-    <w:lvl w:ilvl="3" w:tentative="1">
-      <w:start w:val="1"/>
-      <w:numFmt w:val="bullet"/>
-      <w:lvlText w:val=""/>
-      <w:lvlJc w:val="left"/>
-      <w:pPr>
-        <w:tabs>
-          <w:tab w:val="num" w:pos="2880"/>
-        </w:tabs>
-        <w:ind w:left="2880" w:hanging="360"/>
-      </w:pPr>
-      <w:rPr>
-        <w:rFonts w:ascii="Wingdings" w:hAnsi="Wingdings" w:hint="default"/>
-        <w:sz w:val="20"/>
-      </w:rPr>
-    </w:lvl>
-    <w:lvl w:ilvl="4" w:tentative="1">
-      <w:start w:val="1"/>
-      <w:numFmt w:val="bullet"/>
-      <w:lvlText w:val=""/>
-      <w:lvlJc w:val="left"/>
-      <w:pPr>
-        <w:tabs>
-          <w:tab w:val="num" w:pos="3600"/>
-        </w:tabs>
-        <w:ind w:left="3600" w:hanging="360"/>
-      </w:pPr>
-      <w:rPr>
-        <w:rFonts w:ascii="Wingdings" w:hAnsi="Wingdings" w:hint="default"/>
-        <w:sz w:val="20"/>
-      </w:rPr>
-    </w:lvl>
-    <w:lvl w:ilvl="5" w:tentative="1">
-      <w:start w:val="1"/>
-      <w:numFmt w:val="bullet"/>
-      <w:lvlText w:val=""/>
-      <w:lvlJc w:val="left"/>
-      <w:pPr>
-        <w:tabs>
-          <w:tab w:val="num" w:pos="4320"/>
-        </w:tabs>
-        <w:ind w:left="4320" w:hanging="360"/>
-      </w:pPr>
-      <w:rPr>
-        <w:rFonts w:ascii="Wingdings" w:hAnsi="Wingdings" w:hint="default"/>
-        <w:sz w:val="20"/>
-      </w:rPr>
-    </w:lvl>
-    <w:lvl w:ilvl="6" w:tentative="1">
-      <w:start w:val="1"/>
-      <w:numFmt w:val="bullet"/>
-      <w:lvlText w:val=""/>
-      <w:lvlJc w:val="left"/>
-      <w:pPr>
-        <w:tabs>
-          <w:tab w:val="num" w:pos="5040"/>
-        </w:tabs>
-        <w:ind w:left="5040" w:hanging="360"/>
-      </w:pPr>
-      <w:rPr>
-        <w:rFonts w:ascii="Wingdings" w:hAnsi="Wingdings" w:hint="default"/>
-        <w:sz w:val="20"/>
-      </w:rPr>
-    </w:lvl>
-    <w:lvl w:ilvl="7" w:tentative="1">
-      <w:start w:val="1"/>
-      <w:numFmt w:val="bullet"/>
-      <w:lvlText w:val=""/>
-      <w:lvlJc w:val="left"/>
-      <w:pPr>
-        <w:tabs>
-          <w:tab w:val="num" w:pos="5760"/>
-        </w:tabs>
-        <w:ind w:left="5760" w:hanging="360"/>
-      </w:pPr>
-      <w:rPr>
-        <w:rFonts w:ascii="Wingdings" w:hAnsi="Wingdings" w:hint="default"/>
-        <w:sz w:val="20"/>
-      </w:rPr>
-    </w:lvl>
-    <w:lvl w:ilvl="8" w:tentative="1">
-      <w:start w:val="1"/>
-      <w:numFmt w:val="bullet"/>
-      <w:lvlText w:val=""/>
-      <w:lvlJc w:val="left"/>
-      <w:pPr>
-        <w:tabs>
-          <w:tab w:val="num" w:pos="6480"/>
-        </w:tabs>
-        <w:ind w:left="6480" w:hanging="360"/>
-      </w:pPr>
-      <w:rPr>
-        <w:rFonts w:ascii="Wingdings" w:hAnsi="Wingdings" w:hint="default"/>
-        <w:sz w:val="20"/>
-      </w:rPr>
-    </w:lvl>
-  </w:abstractNum>
-  <w:abstractNum w:abstractNumId="14" w15:restartNumberingAfterBreak="0">
-    <w:nsid w:val="490D4141"/>
-    <w:multiLevelType w:val="multilevel"/>
-    <w:tmpl w:val="5980EAC8"/>
-    <w:lvl w:ilvl="0">
-      <w:start w:val="1"/>
-      <w:numFmt w:val="bullet"/>
-      <w:lvlText w:val=""/>
-      <w:lvlJc w:val="left"/>
-      <w:pPr>
-        <w:tabs>
-          <w:tab w:val="num" w:pos="720"/>
-        </w:tabs>
-        <w:ind w:left="720" w:hanging="360"/>
-      </w:pPr>
-      <w:rPr>
-        <w:rFonts w:ascii="Symbol" w:hAnsi="Symbol" w:hint="default"/>
-        <w:sz w:val="20"/>
-      </w:rPr>
-    </w:lvl>
-    <w:lvl w:ilvl="1" w:tentative="1">
-      <w:start w:val="1"/>
-      <w:numFmt w:val="bullet"/>
-      <w:lvlText w:val="o"/>
-      <w:lvlJc w:val="left"/>
-      <w:pPr>
-        <w:tabs>
-          <w:tab w:val="num" w:pos="1440"/>
-        </w:tabs>
-        <w:ind w:left="1440" w:hanging="360"/>
-      </w:pPr>
-      <w:rPr>
-        <w:rFonts w:ascii="Courier New" w:hAnsi="Courier New" w:hint="default"/>
-        <w:sz w:val="20"/>
-      </w:rPr>
-    </w:lvl>
-    <w:lvl w:ilvl="2" w:tentative="1">
-      <w:start w:val="1"/>
-      <w:numFmt w:val="bullet"/>
-      <w:lvlText w:val=""/>
-      <w:lvlJc w:val="left"/>
-      <w:pPr>
-        <w:tabs>
-          <w:tab w:val="num" w:pos="2160"/>
-        </w:tabs>
-        <w:ind w:left="2160" w:hanging="360"/>
-      </w:pPr>
-      <w:rPr>
-        <w:rFonts w:ascii="Wingdings" w:hAnsi="Wingdings" w:hint="default"/>
-        <w:sz w:val="20"/>
-      </w:rPr>
-    </w:lvl>
-    <w:lvl w:ilvl="3" w:tentative="1">
-      <w:start w:val="1"/>
-      <w:numFmt w:val="bullet"/>
-      <w:lvlText w:val=""/>
-      <w:lvlJc w:val="left"/>
-      <w:pPr>
-        <w:tabs>
-          <w:tab w:val="num" w:pos="2880"/>
-        </w:tabs>
-        <w:ind w:left="2880" w:hanging="360"/>
-      </w:pPr>
-      <w:rPr>
-        <w:rFonts w:ascii="Wingdings" w:hAnsi="Wingdings" w:hint="default"/>
-        <w:sz w:val="20"/>
-      </w:rPr>
-    </w:lvl>
-    <w:lvl w:ilvl="4" w:tentative="1">
-      <w:start w:val="1"/>
-      <w:numFmt w:val="bullet"/>
-      <w:lvlText w:val=""/>
-      <w:lvlJc w:val="left"/>
-      <w:pPr>
-        <w:tabs>
-          <w:tab w:val="num" w:pos="3600"/>
-        </w:tabs>
-        <w:ind w:left="3600" w:hanging="360"/>
-      </w:pPr>
-      <w:rPr>
-        <w:rFonts w:ascii="Wingdings" w:hAnsi="Wingdings" w:hint="default"/>
-        <w:sz w:val="20"/>
-      </w:rPr>
-    </w:lvl>
-    <w:lvl w:ilvl="5" w:tentative="1">
-      <w:start w:val="1"/>
-      <w:numFmt w:val="bullet"/>
-      <w:lvlText w:val=""/>
-      <w:lvlJc w:val="left"/>
-      <w:pPr>
-        <w:tabs>
-          <w:tab w:val="num" w:pos="4320"/>
-        </w:tabs>
-        <w:ind w:left="4320" w:hanging="360"/>
-      </w:pPr>
-      <w:rPr>
-        <w:rFonts w:ascii="Wingdings" w:hAnsi="Wingdings" w:hint="default"/>
-        <w:sz w:val="20"/>
-      </w:rPr>
-    </w:lvl>
-    <w:lvl w:ilvl="6" w:tentative="1">
-      <w:start w:val="1"/>
-      <w:numFmt w:val="bullet"/>
-      <w:lvlText w:val=""/>
-      <w:lvlJc w:val="left"/>
-      <w:pPr>
-        <w:tabs>
-          <w:tab w:val="num" w:pos="5040"/>
-        </w:tabs>
-        <w:ind w:left="5040" w:hanging="360"/>
-      </w:pPr>
-      <w:rPr>
-        <w:rFonts w:ascii="Wingdings" w:hAnsi="Wingdings" w:hint="default"/>
-        <w:sz w:val="20"/>
-      </w:rPr>
-    </w:lvl>
-    <w:lvl w:ilvl="7" w:tentative="1">
-      <w:start w:val="1"/>
-      <w:numFmt w:val="bullet"/>
-      <w:lvlText w:val=""/>
-      <w:lvlJc w:val="left"/>
-      <w:pPr>
-        <w:tabs>
-          <w:tab w:val="num" w:pos="5760"/>
-        </w:tabs>
-        <w:ind w:left="5760" w:hanging="360"/>
-      </w:pPr>
-      <w:rPr>
-        <w:rFonts w:ascii="Wingdings" w:hAnsi="Wingdings" w:hint="default"/>
-        <w:sz w:val="20"/>
-      </w:rPr>
-    </w:lvl>
-    <w:lvl w:ilvl="8" w:tentative="1">
-      <w:start w:val="1"/>
-      <w:numFmt w:val="bullet"/>
-      <w:lvlText w:val=""/>
-      <w:lvlJc w:val="left"/>
-      <w:pPr>
-        <w:tabs>
-          <w:tab w:val="num" w:pos="6480"/>
-        </w:tabs>
-        <w:ind w:left="6480" w:hanging="360"/>
-      </w:pPr>
-      <w:rPr>
-        <w:rFonts w:ascii="Wingdings" w:hAnsi="Wingdings" w:hint="default"/>
-        <w:sz w:val="20"/>
-      </w:rPr>
-    </w:lvl>
-  </w:abstractNum>
-  <w:abstractNum w:abstractNumId="15" w15:restartNumberingAfterBreak="0">
-    <w:nsid w:val="4F2F1640"/>
-    <w:multiLevelType w:val="multilevel"/>
-    <w:tmpl w:val="83248F16"/>
-    <w:lvl w:ilvl="0">
-      <w:start w:val="1"/>
-      <w:numFmt w:val="bullet"/>
-      <w:lvlText w:val=""/>
-      <w:lvlJc w:val="left"/>
-      <w:pPr>
-        <w:tabs>
-          <w:tab w:val="num" w:pos="720"/>
-        </w:tabs>
-        <w:ind w:left="720" w:hanging="360"/>
-      </w:pPr>
-      <w:rPr>
-        <w:rFonts w:ascii="Symbol" w:hAnsi="Symbol" w:hint="default"/>
-        <w:sz w:val="20"/>
-      </w:rPr>
-    </w:lvl>
-    <w:lvl w:ilvl="1" w:tentative="1">
-      <w:start w:val="1"/>
-      <w:numFmt w:val="bullet"/>
-      <w:lvlText w:val="o"/>
-      <w:lvlJc w:val="left"/>
-      <w:pPr>
-        <w:tabs>
-          <w:tab w:val="num" w:pos="1440"/>
-        </w:tabs>
-        <w:ind w:left="1440" w:hanging="360"/>
-      </w:pPr>
-      <w:rPr>
-        <w:rFonts w:ascii="Courier New" w:hAnsi="Courier New" w:hint="default"/>
-        <w:sz w:val="20"/>
-      </w:rPr>
-    </w:lvl>
-    <w:lvl w:ilvl="2" w:tentative="1">
-      <w:start w:val="1"/>
-      <w:numFmt w:val="bullet"/>
-      <w:lvlText w:val=""/>
-      <w:lvlJc w:val="left"/>
-      <w:pPr>
-        <w:tabs>
-          <w:tab w:val="num" w:pos="2160"/>
-        </w:tabs>
-        <w:ind w:left="2160" w:hanging="360"/>
-      </w:pPr>
-      <w:rPr>
-        <w:rFonts w:ascii="Wingdings" w:hAnsi="Wingdings" w:hint="default"/>
-        <w:sz w:val="20"/>
-      </w:rPr>
-    </w:lvl>
-    <w:lvl w:ilvl="3" w:tentative="1">
-      <w:start w:val="1"/>
-      <w:numFmt w:val="bullet"/>
-      <w:lvlText w:val=""/>
-      <w:lvlJc w:val="left"/>
-      <w:pPr>
-        <w:tabs>
-          <w:tab w:val="num" w:pos="2880"/>
-        </w:tabs>
-        <w:ind w:left="2880" w:hanging="360"/>
-      </w:pPr>
-      <w:rPr>
-        <w:rFonts w:ascii="Wingdings" w:hAnsi="Wingdings" w:hint="default"/>
-        <w:sz w:val="20"/>
-      </w:rPr>
-    </w:lvl>
-    <w:lvl w:ilvl="4" w:tentative="1">
-      <w:start w:val="1"/>
-      <w:numFmt w:val="bullet"/>
-      <w:lvlText w:val=""/>
-      <w:lvlJc w:val="left"/>
-      <w:pPr>
-        <w:tabs>
-          <w:tab w:val="num" w:pos="3600"/>
-        </w:tabs>
-        <w:ind w:left="3600" w:hanging="360"/>
-      </w:pPr>
-      <w:rPr>
-        <w:rFonts w:ascii="Wingdings" w:hAnsi="Wingdings" w:hint="default"/>
-        <w:sz w:val="20"/>
-      </w:rPr>
-    </w:lvl>
-    <w:lvl w:ilvl="5" w:tentative="1">
-      <w:start w:val="1"/>
-      <w:numFmt w:val="bullet"/>
-      <w:lvlText w:val=""/>
-      <w:lvlJc w:val="left"/>
-      <w:pPr>
-        <w:tabs>
-          <w:tab w:val="num" w:pos="4320"/>
-        </w:tabs>
-        <w:ind w:left="4320" w:hanging="360"/>
-      </w:pPr>
-      <w:rPr>
-        <w:rFonts w:ascii="Wingdings" w:hAnsi="Wingdings" w:hint="default"/>
-        <w:sz w:val="20"/>
-      </w:rPr>
-    </w:lvl>
-    <w:lvl w:ilvl="6" w:tentative="1">
-      <w:start w:val="1"/>
-      <w:numFmt w:val="bullet"/>
-      <w:lvlText w:val=""/>
-      <w:lvlJc w:val="left"/>
-      <w:pPr>
-        <w:tabs>
-          <w:tab w:val="num" w:pos="5040"/>
-        </w:tabs>
-        <w:ind w:left="5040" w:hanging="360"/>
-      </w:pPr>
-      <w:rPr>
-        <w:rFonts w:ascii="Wingdings" w:hAnsi="Wingdings" w:hint="default"/>
-        <w:sz w:val="20"/>
-      </w:rPr>
-    </w:lvl>
-    <w:lvl w:ilvl="7" w:tentative="1">
-      <w:start w:val="1"/>
-      <w:numFmt w:val="bullet"/>
-      <w:lvlText w:val=""/>
-      <w:lvlJc w:val="left"/>
-      <w:pPr>
-        <w:tabs>
-          <w:tab w:val="num" w:pos="5760"/>
-        </w:tabs>
-        <w:ind w:left="5760" w:hanging="360"/>
-      </w:pPr>
-      <w:rPr>
-        <w:rFonts w:ascii="Wingdings" w:hAnsi="Wingdings" w:hint="default"/>
-        <w:sz w:val="20"/>
-      </w:rPr>
-    </w:lvl>
-    <w:lvl w:ilvl="8" w:tentative="1">
-      <w:start w:val="1"/>
-      <w:numFmt w:val="bullet"/>
-      <w:lvlText w:val=""/>
-      <w:lvlJc w:val="left"/>
-      <w:pPr>
-        <w:tabs>
-          <w:tab w:val="num" w:pos="6480"/>
-        </w:tabs>
-        <w:ind w:left="6480" w:hanging="360"/>
-      </w:pPr>
-      <w:rPr>
-        <w:rFonts w:ascii="Wingdings" w:hAnsi="Wingdings" w:hint="default"/>
-        <w:sz w:val="20"/>
-      </w:rPr>
-    </w:lvl>
-  </w:abstractNum>
-  <w:abstractNum w:abstractNumId="16" w15:restartNumberingAfterBreak="0">
-    <w:nsid w:val="556D7449"/>
-    <w:multiLevelType w:val="multilevel"/>
-    <w:tmpl w:val="3DC8B45C"/>
-    <w:lvl w:ilvl="0">
-      <w:start w:val="1"/>
-      <w:numFmt w:val="bullet"/>
-      <w:lvlText w:val=""/>
-      <w:lvlJc w:val="left"/>
-      <w:pPr>
-        <w:tabs>
-          <w:tab w:val="num" w:pos="720"/>
-        </w:tabs>
-        <w:ind w:left="720" w:hanging="360"/>
-      </w:pPr>
-      <w:rPr>
-        <w:rFonts w:ascii="Symbol" w:hAnsi="Symbol" w:hint="default"/>
-        <w:sz w:val="20"/>
-      </w:rPr>
-    </w:lvl>
-    <w:lvl w:ilvl="1" w:tentative="1">
-      <w:start w:val="1"/>
-      <w:numFmt w:val="bullet"/>
-      <w:lvlText w:val="o"/>
-      <w:lvlJc w:val="left"/>
-      <w:pPr>
-        <w:tabs>
-          <w:tab w:val="num" w:pos="1440"/>
-        </w:tabs>
-        <w:ind w:left="1440" w:hanging="360"/>
-      </w:pPr>
-      <w:rPr>
-        <w:rFonts w:ascii="Courier New" w:hAnsi="Courier New" w:hint="default"/>
-        <w:sz w:val="20"/>
-      </w:rPr>
-    </w:lvl>
-    <w:lvl w:ilvl="2" w:tentative="1">
-      <w:start w:val="1"/>
-      <w:numFmt w:val="bullet"/>
-      <w:lvlText w:val=""/>
-      <w:lvlJc w:val="left"/>
-      <w:pPr>
-        <w:tabs>
-          <w:tab w:val="num" w:pos="2160"/>
-        </w:tabs>
-        <w:ind w:left="2160" w:hanging="360"/>
-      </w:pPr>
-      <w:rPr>
-        <w:rFonts w:ascii="Wingdings" w:hAnsi="Wingdings" w:hint="default"/>
-        <w:sz w:val="20"/>
-      </w:rPr>
-    </w:lvl>
-    <w:lvl w:ilvl="3" w:tentative="1">
-      <w:start w:val="1"/>
-      <w:numFmt w:val="bullet"/>
-      <w:lvlText w:val=""/>
-      <w:lvlJc w:val="left"/>
-      <w:pPr>
-        <w:tabs>
-          <w:tab w:val="num" w:pos="2880"/>
-        </w:tabs>
-        <w:ind w:left="2880" w:hanging="360"/>
-      </w:pPr>
-      <w:rPr>
-        <w:rFonts w:ascii="Wingdings" w:hAnsi="Wingdings" w:hint="default"/>
-        <w:sz w:val="20"/>
-      </w:rPr>
-    </w:lvl>
-    <w:lvl w:ilvl="4" w:tentative="1">
-      <w:start w:val="1"/>
-      <w:numFmt w:val="bullet"/>
-      <w:lvlText w:val=""/>
-      <w:lvlJc w:val="left"/>
-      <w:pPr>
-        <w:tabs>
-          <w:tab w:val="num" w:pos="3600"/>
-        </w:tabs>
-        <w:ind w:left="3600" w:hanging="360"/>
-      </w:pPr>
-      <w:rPr>
-        <w:rFonts w:ascii="Wingdings" w:hAnsi="Wingdings" w:hint="default"/>
-        <w:sz w:val="20"/>
-      </w:rPr>
-    </w:lvl>
-    <w:lvl w:ilvl="5" w:tentative="1">
-      <w:start w:val="1"/>
-      <w:numFmt w:val="bullet"/>
-      <w:lvlText w:val=""/>
-      <w:lvlJc w:val="left"/>
-      <w:pPr>
-        <w:tabs>
-          <w:tab w:val="num" w:pos="4320"/>
-        </w:tabs>
-        <w:ind w:left="4320" w:hanging="360"/>
-      </w:pPr>
-      <w:rPr>
-        <w:rFonts w:ascii="Wingdings" w:hAnsi="Wingdings" w:hint="default"/>
-        <w:sz w:val="20"/>
-      </w:rPr>
-    </w:lvl>
-    <w:lvl w:ilvl="6" w:tentative="1">
-      <w:start w:val="1"/>
-      <w:numFmt w:val="bullet"/>
-      <w:lvlText w:val=""/>
-      <w:lvlJc w:val="left"/>
-      <w:pPr>
-        <w:tabs>
-          <w:tab w:val="num" w:pos="5040"/>
-        </w:tabs>
-        <w:ind w:left="5040" w:hanging="360"/>
-      </w:pPr>
-      <w:rPr>
-        <w:rFonts w:ascii="Wingdings" w:hAnsi="Wingdings" w:hint="default"/>
-        <w:sz w:val="20"/>
-      </w:rPr>
-    </w:lvl>
-    <w:lvl w:ilvl="7" w:tentative="1">
-      <w:start w:val="1"/>
-      <w:numFmt w:val="bullet"/>
-      <w:lvlText w:val=""/>
-      <w:lvlJc w:val="left"/>
-      <w:pPr>
-        <w:tabs>
-          <w:tab w:val="num" w:pos="5760"/>
-        </w:tabs>
-        <w:ind w:left="5760" w:hanging="360"/>
-      </w:pPr>
-      <w:rPr>
-        <w:rFonts w:ascii="Wingdings" w:hAnsi="Wingdings" w:hint="default"/>
-        <w:sz w:val="20"/>
-      </w:rPr>
-    </w:lvl>
-    <w:lvl w:ilvl="8" w:tentative="1">
-      <w:start w:val="1"/>
-      <w:numFmt w:val="bullet"/>
-      <w:lvlText w:val=""/>
-      <w:lvlJc w:val="left"/>
-      <w:pPr>
-        <w:tabs>
-          <w:tab w:val="num" w:pos="6480"/>
-        </w:tabs>
-        <w:ind w:left="6480" w:hanging="360"/>
-      </w:pPr>
-      <w:rPr>
-        <w:rFonts w:ascii="Wingdings" w:hAnsi="Wingdings" w:hint="default"/>
-        <w:sz w:val="20"/>
-      </w:rPr>
-    </w:lvl>
-  </w:abstractNum>
-  <w:abstractNum w:abstractNumId="17" w15:restartNumberingAfterBreak="0">
-    <w:nsid w:val="62163445"/>
-    <w:multiLevelType w:val="multilevel"/>
-    <w:tmpl w:val="0CEC283C"/>
-    <w:lvl w:ilvl="0">
-      <w:start w:val="1"/>
-      <w:numFmt w:val="bullet"/>
-      <w:lvlText w:val=""/>
-      <w:lvlJc w:val="left"/>
-      <w:pPr>
-        <w:tabs>
-          <w:tab w:val="num" w:pos="720"/>
-        </w:tabs>
-        <w:ind w:left="720" w:hanging="360"/>
-      </w:pPr>
-      <w:rPr>
-        <w:rFonts w:ascii="Symbol" w:hAnsi="Symbol" w:hint="default"/>
-        <w:sz w:val="20"/>
-      </w:rPr>
-    </w:lvl>
-    <w:lvl w:ilvl="1" w:tentative="1">
-      <w:start w:val="1"/>
-      <w:numFmt w:val="bullet"/>
-      <w:lvlText w:val="o"/>
-      <w:lvlJc w:val="left"/>
-      <w:pPr>
-        <w:tabs>
-          <w:tab w:val="num" w:pos="1440"/>
-        </w:tabs>
-        <w:ind w:left="1440" w:hanging="360"/>
-      </w:pPr>
-      <w:rPr>
-        <w:rFonts w:ascii="Courier New" w:hAnsi="Courier New" w:hint="default"/>
-        <w:sz w:val="20"/>
-      </w:rPr>
-    </w:lvl>
-    <w:lvl w:ilvl="2" w:tentative="1">
-      <w:start w:val="1"/>
-      <w:numFmt w:val="bullet"/>
-      <w:lvlText w:val=""/>
-      <w:lvlJc w:val="left"/>
-      <w:pPr>
-        <w:tabs>
-          <w:tab w:val="num" w:pos="2160"/>
-        </w:tabs>
-        <w:ind w:left="2160" w:hanging="360"/>
-      </w:pPr>
-      <w:rPr>
-        <w:rFonts w:ascii="Wingdings" w:hAnsi="Wingdings" w:hint="default"/>
-        <w:sz w:val="20"/>
-      </w:rPr>
-    </w:lvl>
-    <w:lvl w:ilvl="3" w:tentative="1">
-      <w:start w:val="1"/>
-      <w:numFmt w:val="bullet"/>
-      <w:lvlText w:val=""/>
-      <w:lvlJc w:val="left"/>
-      <w:pPr>
-        <w:tabs>
-          <w:tab w:val="num" w:pos="2880"/>
-        </w:tabs>
-        <w:ind w:left="2880" w:hanging="360"/>
-      </w:pPr>
-      <w:rPr>
-        <w:rFonts w:ascii="Wingdings" w:hAnsi="Wingdings" w:hint="default"/>
-        <w:sz w:val="20"/>
-      </w:rPr>
-    </w:lvl>
-    <w:lvl w:ilvl="4" w:tentative="1">
-      <w:start w:val="1"/>
-      <w:numFmt w:val="bullet"/>
-      <w:lvlText w:val=""/>
-      <w:lvlJc w:val="left"/>
-      <w:pPr>
-        <w:tabs>
-          <w:tab w:val="num" w:pos="3600"/>
-        </w:tabs>
-        <w:ind w:left="3600" w:hanging="360"/>
-      </w:pPr>
-      <w:rPr>
-        <w:rFonts w:ascii="Wingdings" w:hAnsi="Wingdings" w:hint="default"/>
-        <w:sz w:val="20"/>
-      </w:rPr>
-    </w:lvl>
-    <w:lvl w:ilvl="5" w:tentative="1">
-      <w:start w:val="1"/>
-      <w:numFmt w:val="bullet"/>
-      <w:lvlText w:val=""/>
-      <w:lvlJc w:val="left"/>
-      <w:pPr>
-        <w:tabs>
-          <w:tab w:val="num" w:pos="4320"/>
-        </w:tabs>
-        <w:ind w:left="4320" w:hanging="360"/>
-      </w:pPr>
-      <w:rPr>
-        <w:rFonts w:ascii="Wingdings" w:hAnsi="Wingdings" w:hint="default"/>
-        <w:sz w:val="20"/>
-      </w:rPr>
-    </w:lvl>
-    <w:lvl w:ilvl="6" w:tentative="1">
-      <w:start w:val="1"/>
-      <w:numFmt w:val="bullet"/>
-      <w:lvlText w:val=""/>
-      <w:lvlJc w:val="left"/>
-      <w:pPr>
-        <w:tabs>
-          <w:tab w:val="num" w:pos="5040"/>
-        </w:tabs>
-        <w:ind w:left="5040" w:hanging="360"/>
-      </w:pPr>
-      <w:rPr>
-        <w:rFonts w:ascii="Wingdings" w:hAnsi="Wingdings" w:hint="default"/>
-        <w:sz w:val="20"/>
-      </w:rPr>
-    </w:lvl>
-    <w:lvl w:ilvl="7" w:tentative="1">
-      <w:start w:val="1"/>
-      <w:numFmt w:val="bullet"/>
-      <w:lvlText w:val=""/>
-      <w:lvlJc w:val="left"/>
-      <w:pPr>
-        <w:tabs>
-          <w:tab w:val="num" w:pos="5760"/>
-        </w:tabs>
-        <w:ind w:left="5760" w:hanging="360"/>
-      </w:pPr>
-      <w:rPr>
-        <w:rFonts w:ascii="Wingdings" w:hAnsi="Wingdings" w:hint="default"/>
-        <w:sz w:val="20"/>
-      </w:rPr>
-    </w:lvl>
-    <w:lvl w:ilvl="8" w:tentative="1">
-      <w:start w:val="1"/>
-      <w:numFmt w:val="bullet"/>
-      <w:lvlText w:val=""/>
-      <w:lvlJc w:val="left"/>
-      <w:pPr>
-        <w:tabs>
-          <w:tab w:val="num" w:pos="6480"/>
-        </w:tabs>
-        <w:ind w:left="6480" w:hanging="360"/>
-      </w:pPr>
-      <w:rPr>
-        <w:rFonts w:ascii="Wingdings" w:hAnsi="Wingdings" w:hint="default"/>
-        <w:sz w:val="20"/>
-      </w:rPr>
-    </w:lvl>
-  </w:abstractNum>
-  <w:abstractNum w:abstractNumId="18" w15:restartNumberingAfterBreak="0">
-    <w:nsid w:val="63876C32"/>
-    <w:multiLevelType w:val="multilevel"/>
-    <w:tmpl w:val="F31037A0"/>
-    <w:lvl w:ilvl="0">
-      <w:start w:val="1"/>
-      <w:numFmt w:val="bullet"/>
-      <w:lvlText w:val=""/>
-      <w:lvlJc w:val="left"/>
-      <w:pPr>
-        <w:tabs>
-          <w:tab w:val="num" w:pos="720"/>
-        </w:tabs>
-        <w:ind w:left="720" w:hanging="360"/>
-      </w:pPr>
-      <w:rPr>
-        <w:rFonts w:ascii="Symbol" w:hAnsi="Symbol" w:hint="default"/>
-        <w:sz w:val="20"/>
-      </w:rPr>
-    </w:lvl>
-    <w:lvl w:ilvl="1" w:tentative="1">
-      <w:start w:val="1"/>
-      <w:numFmt w:val="bullet"/>
-      <w:lvlText w:val="o"/>
-      <w:lvlJc w:val="left"/>
-      <w:pPr>
-        <w:tabs>
-          <w:tab w:val="num" w:pos="1440"/>
-        </w:tabs>
-        <w:ind w:left="1440" w:hanging="360"/>
-      </w:pPr>
-      <w:rPr>
-        <w:rFonts w:ascii="Courier New" w:hAnsi="Courier New" w:hint="default"/>
-        <w:sz w:val="20"/>
-      </w:rPr>
-    </w:lvl>
-    <w:lvl w:ilvl="2" w:tentative="1">
-      <w:start w:val="1"/>
-      <w:numFmt w:val="bullet"/>
-      <w:lvlText w:val=""/>
-      <w:lvlJc w:val="left"/>
-      <w:pPr>
-        <w:tabs>
-          <w:tab w:val="num" w:pos="2160"/>
-        </w:tabs>
-        <w:ind w:left="2160" w:hanging="360"/>
-      </w:pPr>
-      <w:rPr>
-        <w:rFonts w:ascii="Wingdings" w:hAnsi="Wingdings" w:hint="default"/>
-        <w:sz w:val="20"/>
-      </w:rPr>
-    </w:lvl>
-    <w:lvl w:ilvl="3" w:tentative="1">
-      <w:start w:val="1"/>
-      <w:numFmt w:val="bullet"/>
-      <w:lvlText w:val=""/>
-      <w:lvlJc w:val="left"/>
-      <w:pPr>
-        <w:tabs>
-          <w:tab w:val="num" w:pos="2880"/>
-        </w:tabs>
-        <w:ind w:left="2880" w:hanging="360"/>
-      </w:pPr>
-      <w:rPr>
-        <w:rFonts w:ascii="Wingdings" w:hAnsi="Wingdings" w:hint="default"/>
-        <w:sz w:val="20"/>
-      </w:rPr>
-    </w:lvl>
-    <w:lvl w:ilvl="4" w:tentative="1">
-      <w:start w:val="1"/>
-      <w:numFmt w:val="bullet"/>
-      <w:lvlText w:val=""/>
-      <w:lvlJc w:val="left"/>
-      <w:pPr>
-        <w:tabs>
-          <w:tab w:val="num" w:pos="3600"/>
-        </w:tabs>
-        <w:ind w:left="3600" w:hanging="360"/>
-      </w:pPr>
-      <w:rPr>
-        <w:rFonts w:ascii="Wingdings" w:hAnsi="Wingdings" w:hint="default"/>
-        <w:sz w:val="20"/>
-      </w:rPr>
-    </w:lvl>
-    <w:lvl w:ilvl="5" w:tentative="1">
-      <w:start w:val="1"/>
-      <w:numFmt w:val="bullet"/>
-      <w:lvlText w:val=""/>
-      <w:lvlJc w:val="left"/>
-      <w:pPr>
-        <w:tabs>
-          <w:tab w:val="num" w:pos="4320"/>
-        </w:tabs>
-        <w:ind w:left="4320" w:hanging="360"/>
-      </w:pPr>
-      <w:rPr>
-        <w:rFonts w:ascii="Wingdings" w:hAnsi="Wingdings" w:hint="default"/>
-        <w:sz w:val="20"/>
-      </w:rPr>
-    </w:lvl>
-    <w:lvl w:ilvl="6" w:tentative="1">
-      <w:start w:val="1"/>
-      <w:numFmt w:val="bullet"/>
-      <w:lvlText w:val=""/>
-      <w:lvlJc w:val="left"/>
-      <w:pPr>
-        <w:tabs>
-          <w:tab w:val="num" w:pos="5040"/>
-        </w:tabs>
-        <w:ind w:left="5040" w:hanging="360"/>
-      </w:pPr>
-      <w:rPr>
-        <w:rFonts w:ascii="Wingdings" w:hAnsi="Wingdings" w:hint="default"/>
-        <w:sz w:val="20"/>
-      </w:rPr>
-    </w:lvl>
-    <w:lvl w:ilvl="7" w:tentative="1">
-      <w:start w:val="1"/>
-      <w:numFmt w:val="bullet"/>
-      <w:lvlText w:val=""/>
-      <w:lvlJc w:val="left"/>
-      <w:pPr>
-        <w:tabs>
-          <w:tab w:val="num" w:pos="5760"/>
-        </w:tabs>
-        <w:ind w:left="5760" w:hanging="360"/>
-      </w:pPr>
-      <w:rPr>
-        <w:rFonts w:ascii="Wingdings" w:hAnsi="Wingdings" w:hint="default"/>
-        <w:sz w:val="20"/>
-      </w:rPr>
-    </w:lvl>
-    <w:lvl w:ilvl="8" w:tentative="1">
-      <w:start w:val="1"/>
-      <w:numFmt w:val="bullet"/>
-      <w:lvlText w:val=""/>
-      <w:lvlJc w:val="left"/>
-      <w:pPr>
-        <w:tabs>
-          <w:tab w:val="num" w:pos="6480"/>
-        </w:tabs>
-        <w:ind w:left="6480" w:hanging="360"/>
-      </w:pPr>
-      <w:rPr>
-        <w:rFonts w:ascii="Wingdings" w:hAnsi="Wingdings" w:hint="default"/>
-        <w:sz w:val="20"/>
-      </w:rPr>
-    </w:lvl>
-  </w:abstractNum>
-  <w:abstractNum w:abstractNumId="19" w15:restartNumberingAfterBreak="0">
-    <w:nsid w:val="6C140BE9"/>
-    <w:multiLevelType w:val="multilevel"/>
-    <w:tmpl w:val="3CB2F5FE"/>
+    <w:tmpl w:val="A2508580"/>
     <w:lvl w:ilvl="0">
       <w:start w:val="1"/>
       <w:numFmt w:val="bullet"/>
@@ -9290,9 +9290,9 @@
     </w:lvl>
   </w:abstractNum>
   <w:abstractNum w:abstractNumId="20" w15:restartNumberingAfterBreak="0">
-    <w:nsid w:val="72E75B52"/>
+    <w:nsid w:val="76364B8C"/>
     <w:multiLevelType w:val="multilevel"/>
-    <w:tmpl w:val="51348D1A"/>
+    <w:tmpl w:val="02DAB2F0"/>
     <w:lvl w:ilvl="0">
       <w:start w:val="1"/>
       <w:numFmt w:val="bullet"/>
@@ -9439,9 +9439,158 @@
     </w:lvl>
   </w:abstractNum>
   <w:abstractNum w:abstractNumId="21" w15:restartNumberingAfterBreak="0">
-    <w:nsid w:val="73A846CF"/>
+    <w:nsid w:val="7791580C"/>
     <w:multiLevelType w:val="multilevel"/>
-    <w:tmpl w:val="6FC4307A"/>
+    <w:tmpl w:val="349ED9F6"/>
+    <w:lvl w:ilvl="0">
+      <w:start w:val="1"/>
+      <w:numFmt w:val="bullet"/>
+      <w:lvlText w:val=""/>
+      <w:lvlJc w:val="left"/>
+      <w:pPr>
+        <w:tabs>
+          <w:tab w:val="num" w:pos="720"/>
+        </w:tabs>
+        <w:ind w:left="720" w:hanging="360"/>
+      </w:pPr>
+      <w:rPr>
+        <w:rFonts w:ascii="Symbol" w:hAnsi="Symbol" w:hint="default"/>
+        <w:sz w:val="20"/>
+      </w:rPr>
+    </w:lvl>
+    <w:lvl w:ilvl="1" w:tentative="1">
+      <w:start w:val="1"/>
+      <w:numFmt w:val="bullet"/>
+      <w:lvlText w:val="o"/>
+      <w:lvlJc w:val="left"/>
+      <w:pPr>
+        <w:tabs>
+          <w:tab w:val="num" w:pos="1440"/>
+        </w:tabs>
+        <w:ind w:left="1440" w:hanging="360"/>
+      </w:pPr>
+      <w:rPr>
+        <w:rFonts w:ascii="Courier New" w:hAnsi="Courier New" w:hint="default"/>
+        <w:sz w:val="20"/>
+      </w:rPr>
+    </w:lvl>
+    <w:lvl w:ilvl="2" w:tentative="1">
+      <w:start w:val="1"/>
+      <w:numFmt w:val="bullet"/>
+      <w:lvlText w:val=""/>
+      <w:lvlJc w:val="left"/>
+      <w:pPr>
+        <w:tabs>
+          <w:tab w:val="num" w:pos="2160"/>
+        </w:tabs>
+        <w:ind w:left="2160" w:hanging="360"/>
+      </w:pPr>
+      <w:rPr>
+        <w:rFonts w:ascii="Wingdings" w:hAnsi="Wingdings" w:hint="default"/>
+        <w:sz w:val="20"/>
+      </w:rPr>
+    </w:lvl>
+    <w:lvl w:ilvl="3" w:tentative="1">
+      <w:start w:val="1"/>
+      <w:numFmt w:val="bullet"/>
+      <w:lvlText w:val=""/>
+      <w:lvlJc w:val="left"/>
+      <w:pPr>
+        <w:tabs>
+          <w:tab w:val="num" w:pos="2880"/>
+        </w:tabs>
+        <w:ind w:left="2880" w:hanging="360"/>
+      </w:pPr>
+      <w:rPr>
+        <w:rFonts w:ascii="Wingdings" w:hAnsi="Wingdings" w:hint="default"/>
+        <w:sz w:val="20"/>
+      </w:rPr>
+    </w:lvl>
+    <w:lvl w:ilvl="4" w:tentative="1">
+      <w:start w:val="1"/>
+      <w:numFmt w:val="bullet"/>
+      <w:lvlText w:val=""/>
+      <w:lvlJc w:val="left"/>
+      <w:pPr>
+        <w:tabs>
+          <w:tab w:val="num" w:pos="3600"/>
+        </w:tabs>
+        <w:ind w:left="3600" w:hanging="360"/>
+      </w:pPr>
+      <w:rPr>
+        <w:rFonts w:ascii="Wingdings" w:hAnsi="Wingdings" w:hint="default"/>
+        <w:sz w:val="20"/>
+      </w:rPr>
+    </w:lvl>
+    <w:lvl w:ilvl="5" w:tentative="1">
+      <w:start w:val="1"/>
+      <w:numFmt w:val="bullet"/>
+      <w:lvlText w:val=""/>
+      <w:lvlJc w:val="left"/>
+      <w:pPr>
+        <w:tabs>
+          <w:tab w:val="num" w:pos="4320"/>
+        </w:tabs>
+        <w:ind w:left="4320" w:hanging="360"/>
+      </w:pPr>
+      <w:rPr>
+        <w:rFonts w:ascii="Wingdings" w:hAnsi="Wingdings" w:hint="default"/>
+        <w:sz w:val="20"/>
+      </w:rPr>
+    </w:lvl>
+    <w:lvl w:ilvl="6" w:tentative="1">
+      <w:start w:val="1"/>
+      <w:numFmt w:val="bullet"/>
+      <w:lvlText w:val=""/>
+      <w:lvlJc w:val="left"/>
+      <w:pPr>
+        <w:tabs>
+          <w:tab w:val="num" w:pos="5040"/>
+        </w:tabs>
+        <w:ind w:left="5040" w:hanging="360"/>
+      </w:pPr>
+      <w:rPr>
+        <w:rFonts w:ascii="Wingdings" w:hAnsi="Wingdings" w:hint="default"/>
+        <w:sz w:val="20"/>
+      </w:rPr>
+    </w:lvl>
+    <w:lvl w:ilvl="7" w:tentative="1">
+      <w:start w:val="1"/>
+      <w:numFmt w:val="bullet"/>
+      <w:lvlText w:val=""/>
+      <w:lvlJc w:val="left"/>
+      <w:pPr>
+        <w:tabs>
+          <w:tab w:val="num" w:pos="5760"/>
+        </w:tabs>
+        <w:ind w:left="5760" w:hanging="360"/>
+      </w:pPr>
+      <w:rPr>
+        <w:rFonts w:ascii="Wingdings" w:hAnsi="Wingdings" w:hint="default"/>
+        <w:sz w:val="20"/>
+      </w:rPr>
+    </w:lvl>
+    <w:lvl w:ilvl="8" w:tentative="1">
+      <w:start w:val="1"/>
+      <w:numFmt w:val="bullet"/>
+      <w:lvlText w:val=""/>
+      <w:lvlJc w:val="left"/>
+      <w:pPr>
+        <w:tabs>
+          <w:tab w:val="num" w:pos="6480"/>
+        </w:tabs>
+        <w:ind w:left="6480" w:hanging="360"/>
+      </w:pPr>
+      <w:rPr>
+        <w:rFonts w:ascii="Wingdings" w:hAnsi="Wingdings" w:hint="default"/>
+        <w:sz w:val="20"/>
+      </w:rPr>
+    </w:lvl>
+  </w:abstractNum>
+  <w:abstractNum w:abstractNumId="22" w15:restartNumberingAfterBreak="0">
+    <w:nsid w:val="7A2651DF"/>
+    <w:multiLevelType w:val="multilevel"/>
+    <w:tmpl w:val="618C9B0E"/>
     <w:lvl w:ilvl="0">
       <w:start w:val="1"/>
       <w:numFmt w:val="decimal"/>
@@ -9555,10 +9704,10 @@
       </w:pPr>
     </w:lvl>
   </w:abstractNum>
-  <w:abstractNum w:abstractNumId="22" w15:restartNumberingAfterBreak="0">
-    <w:nsid w:val="75324DED"/>
+  <w:abstractNum w:abstractNumId="23" w15:restartNumberingAfterBreak="0">
+    <w:nsid w:val="7CB9204D"/>
     <w:multiLevelType w:val="multilevel"/>
-    <w:tmpl w:val="7FA207B4"/>
+    <w:tmpl w:val="D6A8A346"/>
     <w:lvl w:ilvl="0">
       <w:start w:val="1"/>
       <w:numFmt w:val="bullet"/>
@@ -9704,226 +9853,77 @@
       </w:rPr>
     </w:lvl>
   </w:abstractNum>
-  <w:abstractNum w:abstractNumId="23" w15:restartNumberingAfterBreak="0">
-    <w:nsid w:val="7DF5631D"/>
-    <w:multiLevelType w:val="multilevel"/>
-    <w:tmpl w:val="52F8865A"/>
-    <w:lvl w:ilvl="0">
-      <w:start w:val="1"/>
-      <w:numFmt w:val="bullet"/>
-      <w:lvlText w:val=""/>
-      <w:lvlJc w:val="left"/>
-      <w:pPr>
-        <w:tabs>
-          <w:tab w:val="num" w:pos="720"/>
-        </w:tabs>
-        <w:ind w:left="720" w:hanging="360"/>
-      </w:pPr>
-      <w:rPr>
-        <w:rFonts w:ascii="Symbol" w:hAnsi="Symbol" w:hint="default"/>
-        <w:sz w:val="20"/>
-      </w:rPr>
-    </w:lvl>
-    <w:lvl w:ilvl="1" w:tentative="1">
-      <w:start w:val="1"/>
-      <w:numFmt w:val="bullet"/>
-      <w:lvlText w:val="o"/>
-      <w:lvlJc w:val="left"/>
-      <w:pPr>
-        <w:tabs>
-          <w:tab w:val="num" w:pos="1440"/>
-        </w:tabs>
-        <w:ind w:left="1440" w:hanging="360"/>
-      </w:pPr>
-      <w:rPr>
-        <w:rFonts w:ascii="Courier New" w:hAnsi="Courier New" w:hint="default"/>
-        <w:sz w:val="20"/>
-      </w:rPr>
-    </w:lvl>
-    <w:lvl w:ilvl="2" w:tentative="1">
-      <w:start w:val="1"/>
-      <w:numFmt w:val="bullet"/>
-      <w:lvlText w:val=""/>
-      <w:lvlJc w:val="left"/>
-      <w:pPr>
-        <w:tabs>
-          <w:tab w:val="num" w:pos="2160"/>
-        </w:tabs>
-        <w:ind w:left="2160" w:hanging="360"/>
-      </w:pPr>
-      <w:rPr>
-        <w:rFonts w:ascii="Wingdings" w:hAnsi="Wingdings" w:hint="default"/>
-        <w:sz w:val="20"/>
-      </w:rPr>
-    </w:lvl>
-    <w:lvl w:ilvl="3" w:tentative="1">
-      <w:start w:val="1"/>
-      <w:numFmt w:val="bullet"/>
-      <w:lvlText w:val=""/>
-      <w:lvlJc w:val="left"/>
-      <w:pPr>
-        <w:tabs>
-          <w:tab w:val="num" w:pos="2880"/>
-        </w:tabs>
-        <w:ind w:left="2880" w:hanging="360"/>
-      </w:pPr>
-      <w:rPr>
-        <w:rFonts w:ascii="Wingdings" w:hAnsi="Wingdings" w:hint="default"/>
-        <w:sz w:val="20"/>
-      </w:rPr>
-    </w:lvl>
-    <w:lvl w:ilvl="4" w:tentative="1">
-      <w:start w:val="1"/>
-      <w:numFmt w:val="bullet"/>
-      <w:lvlText w:val=""/>
-      <w:lvlJc w:val="left"/>
-      <w:pPr>
-        <w:tabs>
-          <w:tab w:val="num" w:pos="3600"/>
-        </w:tabs>
-        <w:ind w:left="3600" w:hanging="360"/>
-      </w:pPr>
-      <w:rPr>
-        <w:rFonts w:ascii="Wingdings" w:hAnsi="Wingdings" w:hint="default"/>
-        <w:sz w:val="20"/>
-      </w:rPr>
-    </w:lvl>
-    <w:lvl w:ilvl="5" w:tentative="1">
-      <w:start w:val="1"/>
-      <w:numFmt w:val="bullet"/>
-      <w:lvlText w:val=""/>
-      <w:lvlJc w:val="left"/>
-      <w:pPr>
-        <w:tabs>
-          <w:tab w:val="num" w:pos="4320"/>
-        </w:tabs>
-        <w:ind w:left="4320" w:hanging="360"/>
-      </w:pPr>
-      <w:rPr>
-        <w:rFonts w:ascii="Wingdings" w:hAnsi="Wingdings" w:hint="default"/>
-        <w:sz w:val="20"/>
-      </w:rPr>
-    </w:lvl>
-    <w:lvl w:ilvl="6" w:tentative="1">
-      <w:start w:val="1"/>
-      <w:numFmt w:val="bullet"/>
-      <w:lvlText w:val=""/>
-      <w:lvlJc w:val="left"/>
-      <w:pPr>
-        <w:tabs>
-          <w:tab w:val="num" w:pos="5040"/>
-        </w:tabs>
-        <w:ind w:left="5040" w:hanging="360"/>
-      </w:pPr>
-      <w:rPr>
-        <w:rFonts w:ascii="Wingdings" w:hAnsi="Wingdings" w:hint="default"/>
-        <w:sz w:val="20"/>
-      </w:rPr>
-    </w:lvl>
-    <w:lvl w:ilvl="7" w:tentative="1">
-      <w:start w:val="1"/>
-      <w:numFmt w:val="bullet"/>
-      <w:lvlText w:val=""/>
-      <w:lvlJc w:val="left"/>
-      <w:pPr>
-        <w:tabs>
-          <w:tab w:val="num" w:pos="5760"/>
-        </w:tabs>
-        <w:ind w:left="5760" w:hanging="360"/>
-      </w:pPr>
-      <w:rPr>
-        <w:rFonts w:ascii="Wingdings" w:hAnsi="Wingdings" w:hint="default"/>
-        <w:sz w:val="20"/>
-      </w:rPr>
-    </w:lvl>
-    <w:lvl w:ilvl="8" w:tentative="1">
-      <w:start w:val="1"/>
-      <w:numFmt w:val="bullet"/>
-      <w:lvlText w:val=""/>
-      <w:lvlJc w:val="left"/>
-      <w:pPr>
-        <w:tabs>
-          <w:tab w:val="num" w:pos="6480"/>
-        </w:tabs>
-        <w:ind w:left="6480" w:hanging="360"/>
-      </w:pPr>
-      <w:rPr>
-        <w:rFonts w:ascii="Wingdings" w:hAnsi="Wingdings" w:hint="default"/>
-        <w:sz w:val="20"/>
-      </w:rPr>
-    </w:lvl>
-  </w:abstractNum>
-  <w:num w:numId="1" w16cid:durableId="1914194116">
+  <w:num w:numId="1" w16cid:durableId="1150706291">
+    <w:abstractNumId w:val="0"/>
+  </w:num>
+  <w:num w:numId="2" w16cid:durableId="358745784">
+    <w:abstractNumId w:val="5"/>
+  </w:num>
+  <w:num w:numId="3" w16cid:durableId="2018344397">
+    <w:abstractNumId w:val="22"/>
+  </w:num>
+  <w:num w:numId="4" w16cid:durableId="833569733">
+    <w:abstractNumId w:val="23"/>
+  </w:num>
+  <w:num w:numId="5" w16cid:durableId="1687487282">
+    <w:abstractNumId w:val="2"/>
+  </w:num>
+  <w:num w:numId="6" w16cid:durableId="211039289">
+    <w:abstractNumId w:val="12"/>
+  </w:num>
+  <w:num w:numId="7" w16cid:durableId="1161700690">
+    <w:abstractNumId w:val="6"/>
+  </w:num>
+  <w:num w:numId="8" w16cid:durableId="858083140">
+    <w:abstractNumId w:val="21"/>
+  </w:num>
+  <w:num w:numId="9" w16cid:durableId="1508858891">
+    <w:abstractNumId w:val="3"/>
+  </w:num>
+  <w:num w:numId="10" w16cid:durableId="831411530">
+    <w:abstractNumId w:val="15"/>
+  </w:num>
+  <w:num w:numId="11" w16cid:durableId="595099224">
+    <w:abstractNumId w:val="11"/>
+  </w:num>
+  <w:num w:numId="12" w16cid:durableId="1863274480">
+    <w:abstractNumId w:val="9"/>
+  </w:num>
+  <w:num w:numId="13" w16cid:durableId="391081910">
+    <w:abstractNumId w:val="20"/>
+  </w:num>
+  <w:num w:numId="14" w16cid:durableId="1400012093">
     <w:abstractNumId w:val="16"/>
   </w:num>
-  <w:num w:numId="2" w16cid:durableId="1548373885">
+  <w:num w:numId="15" w16cid:durableId="56393134">
+    <w:abstractNumId w:val="17"/>
+  </w:num>
+  <w:num w:numId="16" w16cid:durableId="568811694">
+    <w:abstractNumId w:val="8"/>
+  </w:num>
+  <w:num w:numId="17" w16cid:durableId="1197693042">
+    <w:abstractNumId w:val="7"/>
+  </w:num>
+  <w:num w:numId="18" w16cid:durableId="1718697452">
     <w:abstractNumId w:val="14"/>
   </w:num>
-  <w:num w:numId="3" w16cid:durableId="538052202">
+  <w:num w:numId="19" w16cid:durableId="1896693000">
     <w:abstractNumId w:val="10"/>
   </w:num>
-  <w:num w:numId="4" w16cid:durableId="625738969">
-    <w:abstractNumId w:val="11"/>
+  <w:num w:numId="20" w16cid:durableId="346643704">
+    <w:abstractNumId w:val="4"/>
   </w:num>
-  <w:num w:numId="5" w16cid:durableId="1976989494">
-    <w:abstractNumId w:val="2"/>
+  <w:num w:numId="21" w16cid:durableId="133640560">
+    <w:abstractNumId w:val="18"/>
   </w:num>
-  <w:num w:numId="6" w16cid:durableId="2123185039">
-    <w:abstractNumId w:val="5"/>
-  </w:num>
-  <w:num w:numId="7" w16cid:durableId="1258909731">
-    <w:abstractNumId w:val="1"/>
-  </w:num>
-  <w:num w:numId="8" w16cid:durableId="1801146896">
-    <w:abstractNumId w:val="15"/>
-  </w:num>
-  <w:num w:numId="9" w16cid:durableId="1606425142">
-    <w:abstractNumId w:val="20"/>
-  </w:num>
-  <w:num w:numId="10" w16cid:durableId="948320440">
-    <w:abstractNumId w:val="12"/>
-  </w:num>
-  <w:num w:numId="11" w16cid:durableId="1131360316">
+  <w:num w:numId="22" w16cid:durableId="773289777">
     <w:abstractNumId w:val="13"/>
   </w:num>
-  <w:num w:numId="12" w16cid:durableId="609969975">
-    <w:abstractNumId w:val="0"/>
-  </w:num>
-  <w:num w:numId="13" w16cid:durableId="1916016134">
-    <w:abstractNumId w:val="22"/>
-  </w:num>
-  <w:num w:numId="14" w16cid:durableId="28453543">
-    <w:abstractNumId w:val="8"/>
-  </w:num>
-  <w:num w:numId="15" w16cid:durableId="1174346076">
-    <w:abstractNumId w:val="23"/>
-  </w:num>
-  <w:num w:numId="16" w16cid:durableId="1075054816">
-    <w:abstractNumId w:val="3"/>
-  </w:num>
-  <w:num w:numId="17" w16cid:durableId="1608153573">
-    <w:abstractNumId w:val="4"/>
-  </w:num>
-  <w:num w:numId="18" w16cid:durableId="574507640">
-    <w:abstractNumId w:val="7"/>
-  </w:num>
-  <w:num w:numId="19" w16cid:durableId="1524978905">
-    <w:abstractNumId w:val="6"/>
-  </w:num>
-  <w:num w:numId="20" w16cid:durableId="526262911">
-    <w:abstractNumId w:val="18"/>
-  </w:num>
-  <w:num w:numId="21" w16cid:durableId="1935431101">
-    <w:abstractNumId w:val="9"/>
-  </w:num>
-  <w:num w:numId="22" w16cid:durableId="1499225319">
+  <w:num w:numId="23" w16cid:durableId="2067801413">
     <w:abstractNumId w:val="19"/>
   </w:num>
-  <w:num w:numId="23" w16cid:durableId="105123926">
-    <w:abstractNumId w:val="17"/>
-  </w:num>
-  <w:num w:numId="24" w16cid:durableId="548340504">
-    <w:abstractNumId w:val="21"/>
+  <w:num w:numId="24" w16cid:durableId="1243687009">
+    <w:abstractNumId w:val="1"/>
   </w:num>
 </w:numbering>
 </file>

</xml_diff>

<commit_message>
deck: Chart 4 redrawn (two routes, one deployment); what-if and route A wording
</commit_message>
<xml_diff>
--- a/follow-along/Azure_Local_Follow_Along_Guide.docx
+++ b/follow-along/Azure_Local_Follow_Along_Guide.docx
@@ -6566,9 +6566,9 @@
 <file path=word/numbering.xml><?xml version="1.0" encoding="utf-8"?>
 <w:numbering xmlns:wpc="http://schemas.microsoft.com/office/word/2010/wordprocessingCanvas" xmlns:cx="http://schemas.microsoft.com/office/drawing/2014/chartex" xmlns:cx1="http://schemas.microsoft.com/office/drawing/2015/9/8/chartex" xmlns:cx2="http://schemas.microsoft.com/office/drawing/2015/10/21/chartex" xmlns:cx3="http://schemas.microsoft.com/office/drawing/2016/5/9/chartex" xmlns:cx4="http://schemas.microsoft.com/office/drawing/2016/5/10/chartex" xmlns:cx5="http://schemas.microsoft.com/office/drawing/2016/5/11/chartex" xmlns:cx6="http://schemas.microsoft.com/office/drawing/2016/5/12/chartex" xmlns:cx7="http://schemas.microsoft.com/office/drawing/2016/5/13/chartex" xmlns:cx8="http://schemas.microsoft.com/office/drawing/2016/5/14/chartex" xmlns:mc="http://schemas.openxmlformats.org/markup-compatibility/2006" xmlns:aink="http://schemas.microsoft.com/office/drawing/2016/ink" xmlns:am3d="http://schemas.microsoft.com/office/drawing/2017/model3d" xmlns:o="urn:schemas-microsoft-com:office:office" xmlns:oel="http://schemas.microsoft.com/office/2019/extlst" xmlns:r="http://schemas.openxmlformats.org/officeDocument/2006/relationships" xmlns:m="http://schemas.openxmlformats.org/officeDocument/2006/math" xmlns:v="urn:schemas-microsoft-com:vml" xmlns:wp14="http://schemas.microsoft.com/office/word/2010/wordprocessingDrawing" xmlns:wp="http://schemas.openxmlformats.org/drawingml/2006/wordprocessingDrawing" xmlns:w10="urn:schemas-microsoft-com:office:word" xmlns:w="http://schemas.openxmlformats.org/wordprocessingml/2006/main" xmlns:w14="http://schemas.microsoft.com/office/word/2010/wordml" xmlns:w15="http://schemas.microsoft.com/office/word/2012/wordml" xmlns:w16cex="http://schemas.microsoft.com/office/word/2018/wordml/cex" xmlns:w16cid="http://schemas.microsoft.com/office/word/2016/wordml/cid" xmlns:w16="http://schemas.microsoft.com/office/word/2018/wordml" xmlns:w16du="http://schemas.microsoft.com/office/word/2023/wordml/word16du" xmlns:w16sdtdh="http://schemas.microsoft.com/office/word/2020/wordml/sdtdatahash" xmlns:w16sdtfl="http://schemas.microsoft.com/office/word/2024/wordml/sdtformatlock" xmlns:w16se="http://schemas.microsoft.com/office/word/2015/wordml/symex" xmlns:wpg="http://schemas.microsoft.com/office/word/2010/wordprocessingGroup" xmlns:wpi="http://schemas.microsoft.com/office/word/2010/wordprocessingInk" xmlns:wne="http://schemas.microsoft.com/office/word/2006/wordml" xmlns:wps="http://schemas.microsoft.com/office/word/2010/wordprocessingShape" mc:Ignorable="w14 w15 w16se w16cid w16 w16cex w16sdtdh w16sdtfl w16du wp14">
   <w:abstractNum w:abstractNumId="0" w15:restartNumberingAfterBreak="0">
-    <w:nsid w:val="06343692"/>
+    <w:nsid w:val="0CEC722F"/>
     <w:multiLevelType w:val="multilevel"/>
-    <w:tmpl w:val="A29487E2"/>
+    <w:tmpl w:val="743EE854"/>
     <w:lvl w:ilvl="0">
       <w:start w:val="1"/>
       <w:numFmt w:val="bullet"/>
@@ -6715,9 +6715,307 @@
     </w:lvl>
   </w:abstractNum>
   <w:abstractNum w:abstractNumId="1" w15:restartNumberingAfterBreak="0">
-    <w:nsid w:val="08026352"/>
+    <w:nsid w:val="103565C0"/>
     <w:multiLevelType w:val="multilevel"/>
-    <w:tmpl w:val="25AC9C4C"/>
+    <w:tmpl w:val="9956FBA4"/>
+    <w:lvl w:ilvl="0">
+      <w:start w:val="1"/>
+      <w:numFmt w:val="bullet"/>
+      <w:lvlText w:val=""/>
+      <w:lvlJc w:val="left"/>
+      <w:pPr>
+        <w:tabs>
+          <w:tab w:val="num" w:pos="720"/>
+        </w:tabs>
+        <w:ind w:left="720" w:hanging="360"/>
+      </w:pPr>
+      <w:rPr>
+        <w:rFonts w:ascii="Symbol" w:hAnsi="Symbol" w:hint="default"/>
+        <w:sz w:val="20"/>
+      </w:rPr>
+    </w:lvl>
+    <w:lvl w:ilvl="1" w:tentative="1">
+      <w:start w:val="1"/>
+      <w:numFmt w:val="bullet"/>
+      <w:lvlText w:val="o"/>
+      <w:lvlJc w:val="left"/>
+      <w:pPr>
+        <w:tabs>
+          <w:tab w:val="num" w:pos="1440"/>
+        </w:tabs>
+        <w:ind w:left="1440" w:hanging="360"/>
+      </w:pPr>
+      <w:rPr>
+        <w:rFonts w:ascii="Courier New" w:hAnsi="Courier New" w:hint="default"/>
+        <w:sz w:val="20"/>
+      </w:rPr>
+    </w:lvl>
+    <w:lvl w:ilvl="2" w:tentative="1">
+      <w:start w:val="1"/>
+      <w:numFmt w:val="bullet"/>
+      <w:lvlText w:val=""/>
+      <w:lvlJc w:val="left"/>
+      <w:pPr>
+        <w:tabs>
+          <w:tab w:val="num" w:pos="2160"/>
+        </w:tabs>
+        <w:ind w:left="2160" w:hanging="360"/>
+      </w:pPr>
+      <w:rPr>
+        <w:rFonts w:ascii="Wingdings" w:hAnsi="Wingdings" w:hint="default"/>
+        <w:sz w:val="20"/>
+      </w:rPr>
+    </w:lvl>
+    <w:lvl w:ilvl="3" w:tentative="1">
+      <w:start w:val="1"/>
+      <w:numFmt w:val="bullet"/>
+      <w:lvlText w:val=""/>
+      <w:lvlJc w:val="left"/>
+      <w:pPr>
+        <w:tabs>
+          <w:tab w:val="num" w:pos="2880"/>
+        </w:tabs>
+        <w:ind w:left="2880" w:hanging="360"/>
+      </w:pPr>
+      <w:rPr>
+        <w:rFonts w:ascii="Wingdings" w:hAnsi="Wingdings" w:hint="default"/>
+        <w:sz w:val="20"/>
+      </w:rPr>
+    </w:lvl>
+    <w:lvl w:ilvl="4" w:tentative="1">
+      <w:start w:val="1"/>
+      <w:numFmt w:val="bullet"/>
+      <w:lvlText w:val=""/>
+      <w:lvlJc w:val="left"/>
+      <w:pPr>
+        <w:tabs>
+          <w:tab w:val="num" w:pos="3600"/>
+        </w:tabs>
+        <w:ind w:left="3600" w:hanging="360"/>
+      </w:pPr>
+      <w:rPr>
+        <w:rFonts w:ascii="Wingdings" w:hAnsi="Wingdings" w:hint="default"/>
+        <w:sz w:val="20"/>
+      </w:rPr>
+    </w:lvl>
+    <w:lvl w:ilvl="5" w:tentative="1">
+      <w:start w:val="1"/>
+      <w:numFmt w:val="bullet"/>
+      <w:lvlText w:val=""/>
+      <w:lvlJc w:val="left"/>
+      <w:pPr>
+        <w:tabs>
+          <w:tab w:val="num" w:pos="4320"/>
+        </w:tabs>
+        <w:ind w:left="4320" w:hanging="360"/>
+      </w:pPr>
+      <w:rPr>
+        <w:rFonts w:ascii="Wingdings" w:hAnsi="Wingdings" w:hint="default"/>
+        <w:sz w:val="20"/>
+      </w:rPr>
+    </w:lvl>
+    <w:lvl w:ilvl="6" w:tentative="1">
+      <w:start w:val="1"/>
+      <w:numFmt w:val="bullet"/>
+      <w:lvlText w:val=""/>
+      <w:lvlJc w:val="left"/>
+      <w:pPr>
+        <w:tabs>
+          <w:tab w:val="num" w:pos="5040"/>
+        </w:tabs>
+        <w:ind w:left="5040" w:hanging="360"/>
+      </w:pPr>
+      <w:rPr>
+        <w:rFonts w:ascii="Wingdings" w:hAnsi="Wingdings" w:hint="default"/>
+        <w:sz w:val="20"/>
+      </w:rPr>
+    </w:lvl>
+    <w:lvl w:ilvl="7" w:tentative="1">
+      <w:start w:val="1"/>
+      <w:numFmt w:val="bullet"/>
+      <w:lvlText w:val=""/>
+      <w:lvlJc w:val="left"/>
+      <w:pPr>
+        <w:tabs>
+          <w:tab w:val="num" w:pos="5760"/>
+        </w:tabs>
+        <w:ind w:left="5760" w:hanging="360"/>
+      </w:pPr>
+      <w:rPr>
+        <w:rFonts w:ascii="Wingdings" w:hAnsi="Wingdings" w:hint="default"/>
+        <w:sz w:val="20"/>
+      </w:rPr>
+    </w:lvl>
+    <w:lvl w:ilvl="8" w:tentative="1">
+      <w:start w:val="1"/>
+      <w:numFmt w:val="bullet"/>
+      <w:lvlText w:val=""/>
+      <w:lvlJc w:val="left"/>
+      <w:pPr>
+        <w:tabs>
+          <w:tab w:val="num" w:pos="6480"/>
+        </w:tabs>
+        <w:ind w:left="6480" w:hanging="360"/>
+      </w:pPr>
+      <w:rPr>
+        <w:rFonts w:ascii="Wingdings" w:hAnsi="Wingdings" w:hint="default"/>
+        <w:sz w:val="20"/>
+      </w:rPr>
+    </w:lvl>
+  </w:abstractNum>
+  <w:abstractNum w:abstractNumId="2" w15:restartNumberingAfterBreak="0">
+    <w:nsid w:val="1BF96729"/>
+    <w:multiLevelType w:val="multilevel"/>
+    <w:tmpl w:val="9CFCEB88"/>
+    <w:lvl w:ilvl="0">
+      <w:start w:val="1"/>
+      <w:numFmt w:val="bullet"/>
+      <w:lvlText w:val=""/>
+      <w:lvlJc w:val="left"/>
+      <w:pPr>
+        <w:tabs>
+          <w:tab w:val="num" w:pos="720"/>
+        </w:tabs>
+        <w:ind w:left="720" w:hanging="360"/>
+      </w:pPr>
+      <w:rPr>
+        <w:rFonts w:ascii="Symbol" w:hAnsi="Symbol" w:hint="default"/>
+        <w:sz w:val="20"/>
+      </w:rPr>
+    </w:lvl>
+    <w:lvl w:ilvl="1" w:tentative="1">
+      <w:start w:val="1"/>
+      <w:numFmt w:val="bullet"/>
+      <w:lvlText w:val="o"/>
+      <w:lvlJc w:val="left"/>
+      <w:pPr>
+        <w:tabs>
+          <w:tab w:val="num" w:pos="1440"/>
+        </w:tabs>
+        <w:ind w:left="1440" w:hanging="360"/>
+      </w:pPr>
+      <w:rPr>
+        <w:rFonts w:ascii="Courier New" w:hAnsi="Courier New" w:hint="default"/>
+        <w:sz w:val="20"/>
+      </w:rPr>
+    </w:lvl>
+    <w:lvl w:ilvl="2" w:tentative="1">
+      <w:start w:val="1"/>
+      <w:numFmt w:val="bullet"/>
+      <w:lvlText w:val=""/>
+      <w:lvlJc w:val="left"/>
+      <w:pPr>
+        <w:tabs>
+          <w:tab w:val="num" w:pos="2160"/>
+        </w:tabs>
+        <w:ind w:left="2160" w:hanging="360"/>
+      </w:pPr>
+      <w:rPr>
+        <w:rFonts w:ascii="Wingdings" w:hAnsi="Wingdings" w:hint="default"/>
+        <w:sz w:val="20"/>
+      </w:rPr>
+    </w:lvl>
+    <w:lvl w:ilvl="3" w:tentative="1">
+      <w:start w:val="1"/>
+      <w:numFmt w:val="bullet"/>
+      <w:lvlText w:val=""/>
+      <w:lvlJc w:val="left"/>
+      <w:pPr>
+        <w:tabs>
+          <w:tab w:val="num" w:pos="2880"/>
+        </w:tabs>
+        <w:ind w:left="2880" w:hanging="360"/>
+      </w:pPr>
+      <w:rPr>
+        <w:rFonts w:ascii="Wingdings" w:hAnsi="Wingdings" w:hint="default"/>
+        <w:sz w:val="20"/>
+      </w:rPr>
+    </w:lvl>
+    <w:lvl w:ilvl="4" w:tentative="1">
+      <w:start w:val="1"/>
+      <w:numFmt w:val="bullet"/>
+      <w:lvlText w:val=""/>
+      <w:lvlJc w:val="left"/>
+      <w:pPr>
+        <w:tabs>
+          <w:tab w:val="num" w:pos="3600"/>
+        </w:tabs>
+        <w:ind w:left="3600" w:hanging="360"/>
+      </w:pPr>
+      <w:rPr>
+        <w:rFonts w:ascii="Wingdings" w:hAnsi="Wingdings" w:hint="default"/>
+        <w:sz w:val="20"/>
+      </w:rPr>
+    </w:lvl>
+    <w:lvl w:ilvl="5" w:tentative="1">
+      <w:start w:val="1"/>
+      <w:numFmt w:val="bullet"/>
+      <w:lvlText w:val=""/>
+      <w:lvlJc w:val="left"/>
+      <w:pPr>
+        <w:tabs>
+          <w:tab w:val="num" w:pos="4320"/>
+        </w:tabs>
+        <w:ind w:left="4320" w:hanging="360"/>
+      </w:pPr>
+      <w:rPr>
+        <w:rFonts w:ascii="Wingdings" w:hAnsi="Wingdings" w:hint="default"/>
+        <w:sz w:val="20"/>
+      </w:rPr>
+    </w:lvl>
+    <w:lvl w:ilvl="6" w:tentative="1">
+      <w:start w:val="1"/>
+      <w:numFmt w:val="bullet"/>
+      <w:lvlText w:val=""/>
+      <w:lvlJc w:val="left"/>
+      <w:pPr>
+        <w:tabs>
+          <w:tab w:val="num" w:pos="5040"/>
+        </w:tabs>
+        <w:ind w:left="5040" w:hanging="360"/>
+      </w:pPr>
+      <w:rPr>
+        <w:rFonts w:ascii="Wingdings" w:hAnsi="Wingdings" w:hint="default"/>
+        <w:sz w:val="20"/>
+      </w:rPr>
+    </w:lvl>
+    <w:lvl w:ilvl="7" w:tentative="1">
+      <w:start w:val="1"/>
+      <w:numFmt w:val="bullet"/>
+      <w:lvlText w:val=""/>
+      <w:lvlJc w:val="left"/>
+      <w:pPr>
+        <w:tabs>
+          <w:tab w:val="num" w:pos="5760"/>
+        </w:tabs>
+        <w:ind w:left="5760" w:hanging="360"/>
+      </w:pPr>
+      <w:rPr>
+        <w:rFonts w:ascii="Wingdings" w:hAnsi="Wingdings" w:hint="default"/>
+        <w:sz w:val="20"/>
+      </w:rPr>
+    </w:lvl>
+    <w:lvl w:ilvl="8" w:tentative="1">
+      <w:start w:val="1"/>
+      <w:numFmt w:val="bullet"/>
+      <w:lvlText w:val=""/>
+      <w:lvlJc w:val="left"/>
+      <w:pPr>
+        <w:tabs>
+          <w:tab w:val="num" w:pos="6480"/>
+        </w:tabs>
+        <w:ind w:left="6480" w:hanging="360"/>
+      </w:pPr>
+      <w:rPr>
+        <w:rFonts w:ascii="Wingdings" w:hAnsi="Wingdings" w:hint="default"/>
+        <w:sz w:val="20"/>
+      </w:rPr>
+    </w:lvl>
+  </w:abstractNum>
+  <w:abstractNum w:abstractNumId="3" w15:restartNumberingAfterBreak="0">
+    <w:nsid w:val="1FFF2917"/>
+    <w:multiLevelType w:val="multilevel"/>
+    <w:tmpl w:val="0CE61060"/>
     <w:lvl w:ilvl="0">
       <w:start w:val="1"/>
       <w:numFmt w:val="decimal"/>
@@ -6831,308 +7129,10 @@
       </w:pPr>
     </w:lvl>
   </w:abstractNum>
-  <w:abstractNum w:abstractNumId="2" w15:restartNumberingAfterBreak="0">
-    <w:nsid w:val="0EE76C51"/>
+  <w:abstractNum w:abstractNumId="4" w15:restartNumberingAfterBreak="0">
+    <w:nsid w:val="26F70141"/>
     <w:multiLevelType w:val="multilevel"/>
-    <w:tmpl w:val="38CC4B14"/>
-    <w:lvl w:ilvl="0">
-      <w:start w:val="1"/>
-      <w:numFmt w:val="bullet"/>
-      <w:lvlText w:val=""/>
-      <w:lvlJc w:val="left"/>
-      <w:pPr>
-        <w:tabs>
-          <w:tab w:val="num" w:pos="720"/>
-        </w:tabs>
-        <w:ind w:left="720" w:hanging="360"/>
-      </w:pPr>
-      <w:rPr>
-        <w:rFonts w:ascii="Symbol" w:hAnsi="Symbol" w:hint="default"/>
-        <w:sz w:val="20"/>
-      </w:rPr>
-    </w:lvl>
-    <w:lvl w:ilvl="1" w:tentative="1">
-      <w:start w:val="1"/>
-      <w:numFmt w:val="bullet"/>
-      <w:lvlText w:val="o"/>
-      <w:lvlJc w:val="left"/>
-      <w:pPr>
-        <w:tabs>
-          <w:tab w:val="num" w:pos="1440"/>
-        </w:tabs>
-        <w:ind w:left="1440" w:hanging="360"/>
-      </w:pPr>
-      <w:rPr>
-        <w:rFonts w:ascii="Courier New" w:hAnsi="Courier New" w:hint="default"/>
-        <w:sz w:val="20"/>
-      </w:rPr>
-    </w:lvl>
-    <w:lvl w:ilvl="2" w:tentative="1">
-      <w:start w:val="1"/>
-      <w:numFmt w:val="bullet"/>
-      <w:lvlText w:val=""/>
-      <w:lvlJc w:val="left"/>
-      <w:pPr>
-        <w:tabs>
-          <w:tab w:val="num" w:pos="2160"/>
-        </w:tabs>
-        <w:ind w:left="2160" w:hanging="360"/>
-      </w:pPr>
-      <w:rPr>
-        <w:rFonts w:ascii="Wingdings" w:hAnsi="Wingdings" w:hint="default"/>
-        <w:sz w:val="20"/>
-      </w:rPr>
-    </w:lvl>
-    <w:lvl w:ilvl="3" w:tentative="1">
-      <w:start w:val="1"/>
-      <w:numFmt w:val="bullet"/>
-      <w:lvlText w:val=""/>
-      <w:lvlJc w:val="left"/>
-      <w:pPr>
-        <w:tabs>
-          <w:tab w:val="num" w:pos="2880"/>
-        </w:tabs>
-        <w:ind w:left="2880" w:hanging="360"/>
-      </w:pPr>
-      <w:rPr>
-        <w:rFonts w:ascii="Wingdings" w:hAnsi="Wingdings" w:hint="default"/>
-        <w:sz w:val="20"/>
-      </w:rPr>
-    </w:lvl>
-    <w:lvl w:ilvl="4" w:tentative="1">
-      <w:start w:val="1"/>
-      <w:numFmt w:val="bullet"/>
-      <w:lvlText w:val=""/>
-      <w:lvlJc w:val="left"/>
-      <w:pPr>
-        <w:tabs>
-          <w:tab w:val="num" w:pos="3600"/>
-        </w:tabs>
-        <w:ind w:left="3600" w:hanging="360"/>
-      </w:pPr>
-      <w:rPr>
-        <w:rFonts w:ascii="Wingdings" w:hAnsi="Wingdings" w:hint="default"/>
-        <w:sz w:val="20"/>
-      </w:rPr>
-    </w:lvl>
-    <w:lvl w:ilvl="5" w:tentative="1">
-      <w:start w:val="1"/>
-      <w:numFmt w:val="bullet"/>
-      <w:lvlText w:val=""/>
-      <w:lvlJc w:val="left"/>
-      <w:pPr>
-        <w:tabs>
-          <w:tab w:val="num" w:pos="4320"/>
-        </w:tabs>
-        <w:ind w:left="4320" w:hanging="360"/>
-      </w:pPr>
-      <w:rPr>
-        <w:rFonts w:ascii="Wingdings" w:hAnsi="Wingdings" w:hint="default"/>
-        <w:sz w:val="20"/>
-      </w:rPr>
-    </w:lvl>
-    <w:lvl w:ilvl="6" w:tentative="1">
-      <w:start w:val="1"/>
-      <w:numFmt w:val="bullet"/>
-      <w:lvlText w:val=""/>
-      <w:lvlJc w:val="left"/>
-      <w:pPr>
-        <w:tabs>
-          <w:tab w:val="num" w:pos="5040"/>
-        </w:tabs>
-        <w:ind w:left="5040" w:hanging="360"/>
-      </w:pPr>
-      <w:rPr>
-        <w:rFonts w:ascii="Wingdings" w:hAnsi="Wingdings" w:hint="default"/>
-        <w:sz w:val="20"/>
-      </w:rPr>
-    </w:lvl>
-    <w:lvl w:ilvl="7" w:tentative="1">
-      <w:start w:val="1"/>
-      <w:numFmt w:val="bullet"/>
-      <w:lvlText w:val=""/>
-      <w:lvlJc w:val="left"/>
-      <w:pPr>
-        <w:tabs>
-          <w:tab w:val="num" w:pos="5760"/>
-        </w:tabs>
-        <w:ind w:left="5760" w:hanging="360"/>
-      </w:pPr>
-      <w:rPr>
-        <w:rFonts w:ascii="Wingdings" w:hAnsi="Wingdings" w:hint="default"/>
-        <w:sz w:val="20"/>
-      </w:rPr>
-    </w:lvl>
-    <w:lvl w:ilvl="8" w:tentative="1">
-      <w:start w:val="1"/>
-      <w:numFmt w:val="bullet"/>
-      <w:lvlText w:val=""/>
-      <w:lvlJc w:val="left"/>
-      <w:pPr>
-        <w:tabs>
-          <w:tab w:val="num" w:pos="6480"/>
-        </w:tabs>
-        <w:ind w:left="6480" w:hanging="360"/>
-      </w:pPr>
-      <w:rPr>
-        <w:rFonts w:ascii="Wingdings" w:hAnsi="Wingdings" w:hint="default"/>
-        <w:sz w:val="20"/>
-      </w:rPr>
-    </w:lvl>
-  </w:abstractNum>
-  <w:abstractNum w:abstractNumId="3" w15:restartNumberingAfterBreak="0">
-    <w:nsid w:val="192F56AC"/>
-    <w:multiLevelType w:val="multilevel"/>
-    <w:tmpl w:val="986014DC"/>
-    <w:lvl w:ilvl="0">
-      <w:start w:val="1"/>
-      <w:numFmt w:val="bullet"/>
-      <w:lvlText w:val=""/>
-      <w:lvlJc w:val="left"/>
-      <w:pPr>
-        <w:tabs>
-          <w:tab w:val="num" w:pos="720"/>
-        </w:tabs>
-        <w:ind w:left="720" w:hanging="360"/>
-      </w:pPr>
-      <w:rPr>
-        <w:rFonts w:ascii="Symbol" w:hAnsi="Symbol" w:hint="default"/>
-        <w:sz w:val="20"/>
-      </w:rPr>
-    </w:lvl>
-    <w:lvl w:ilvl="1" w:tentative="1">
-      <w:start w:val="1"/>
-      <w:numFmt w:val="bullet"/>
-      <w:lvlText w:val="o"/>
-      <w:lvlJc w:val="left"/>
-      <w:pPr>
-        <w:tabs>
-          <w:tab w:val="num" w:pos="1440"/>
-        </w:tabs>
-        <w:ind w:left="1440" w:hanging="360"/>
-      </w:pPr>
-      <w:rPr>
-        <w:rFonts w:ascii="Courier New" w:hAnsi="Courier New" w:hint="default"/>
-        <w:sz w:val="20"/>
-      </w:rPr>
-    </w:lvl>
-    <w:lvl w:ilvl="2" w:tentative="1">
-      <w:start w:val="1"/>
-      <w:numFmt w:val="bullet"/>
-      <w:lvlText w:val=""/>
-      <w:lvlJc w:val="left"/>
-      <w:pPr>
-        <w:tabs>
-          <w:tab w:val="num" w:pos="2160"/>
-        </w:tabs>
-        <w:ind w:left="2160" w:hanging="360"/>
-      </w:pPr>
-      <w:rPr>
-        <w:rFonts w:ascii="Wingdings" w:hAnsi="Wingdings" w:hint="default"/>
-        <w:sz w:val="20"/>
-      </w:rPr>
-    </w:lvl>
-    <w:lvl w:ilvl="3" w:tentative="1">
-      <w:start w:val="1"/>
-      <w:numFmt w:val="bullet"/>
-      <w:lvlText w:val=""/>
-      <w:lvlJc w:val="left"/>
-      <w:pPr>
-        <w:tabs>
-          <w:tab w:val="num" w:pos="2880"/>
-        </w:tabs>
-        <w:ind w:left="2880" w:hanging="360"/>
-      </w:pPr>
-      <w:rPr>
-        <w:rFonts w:ascii="Wingdings" w:hAnsi="Wingdings" w:hint="default"/>
-        <w:sz w:val="20"/>
-      </w:rPr>
-    </w:lvl>
-    <w:lvl w:ilvl="4" w:tentative="1">
-      <w:start w:val="1"/>
-      <w:numFmt w:val="bullet"/>
-      <w:lvlText w:val=""/>
-      <w:lvlJc w:val="left"/>
-      <w:pPr>
-        <w:tabs>
-          <w:tab w:val="num" w:pos="3600"/>
-        </w:tabs>
-        <w:ind w:left="3600" w:hanging="360"/>
-      </w:pPr>
-      <w:rPr>
-        <w:rFonts w:ascii="Wingdings" w:hAnsi="Wingdings" w:hint="default"/>
-        <w:sz w:val="20"/>
-      </w:rPr>
-    </w:lvl>
-    <w:lvl w:ilvl="5" w:tentative="1">
-      <w:start w:val="1"/>
-      <w:numFmt w:val="bullet"/>
-      <w:lvlText w:val=""/>
-      <w:lvlJc w:val="left"/>
-      <w:pPr>
-        <w:tabs>
-          <w:tab w:val="num" w:pos="4320"/>
-        </w:tabs>
-        <w:ind w:left="4320" w:hanging="360"/>
-      </w:pPr>
-      <w:rPr>
-        <w:rFonts w:ascii="Wingdings" w:hAnsi="Wingdings" w:hint="default"/>
-        <w:sz w:val="20"/>
-      </w:rPr>
-    </w:lvl>
-    <w:lvl w:ilvl="6" w:tentative="1">
-      <w:start w:val="1"/>
-      <w:numFmt w:val="bullet"/>
-      <w:lvlText w:val=""/>
-      <w:lvlJc w:val="left"/>
-      <w:pPr>
-        <w:tabs>
-          <w:tab w:val="num" w:pos="5040"/>
-        </w:tabs>
-        <w:ind w:left="5040" w:hanging="360"/>
-      </w:pPr>
-      <w:rPr>
-        <w:rFonts w:ascii="Wingdings" w:hAnsi="Wingdings" w:hint="default"/>
-        <w:sz w:val="20"/>
-      </w:rPr>
-    </w:lvl>
-    <w:lvl w:ilvl="7" w:tentative="1">
-      <w:start w:val="1"/>
-      <w:numFmt w:val="bullet"/>
-      <w:lvlText w:val=""/>
-      <w:lvlJc w:val="left"/>
-      <w:pPr>
-        <w:tabs>
-          <w:tab w:val="num" w:pos="5760"/>
-        </w:tabs>
-        <w:ind w:left="5760" w:hanging="360"/>
-      </w:pPr>
-      <w:rPr>
-        <w:rFonts w:ascii="Wingdings" w:hAnsi="Wingdings" w:hint="default"/>
-        <w:sz w:val="20"/>
-      </w:rPr>
-    </w:lvl>
-    <w:lvl w:ilvl="8" w:tentative="1">
-      <w:start w:val="1"/>
-      <w:numFmt w:val="bullet"/>
-      <w:lvlText w:val=""/>
-      <w:lvlJc w:val="left"/>
-      <w:pPr>
-        <w:tabs>
-          <w:tab w:val="num" w:pos="6480"/>
-        </w:tabs>
-        <w:ind w:left="6480" w:hanging="360"/>
-      </w:pPr>
-      <w:rPr>
-        <w:rFonts w:ascii="Wingdings" w:hAnsi="Wingdings" w:hint="default"/>
-        <w:sz w:val="20"/>
-      </w:rPr>
-    </w:lvl>
-  </w:abstractNum>
-  <w:abstractNum w:abstractNumId="4" w15:restartNumberingAfterBreak="0">
-    <w:nsid w:val="1BEA16BB"/>
-    <w:multiLevelType w:val="multilevel"/>
-    <w:tmpl w:val="88DA8AB0"/>
+    <w:tmpl w:val="8B98E19E"/>
     <w:lvl w:ilvl="0">
       <w:start w:val="1"/>
       <w:numFmt w:val="bullet"/>
@@ -7279,13 +7279,13 @@
     </w:lvl>
   </w:abstractNum>
   <w:abstractNum w:abstractNumId="5" w15:restartNumberingAfterBreak="0">
-    <w:nsid w:val="1F802BE2"/>
+    <w:nsid w:val="26FE1D0F"/>
     <w:multiLevelType w:val="multilevel"/>
-    <w:tmpl w:val="74486766"/>
+    <w:tmpl w:val="F4142B58"/>
     <w:lvl w:ilvl="0">
       <w:start w:val="1"/>
-      <w:numFmt w:val="bullet"/>
-      <w:lvlText w:val=""/>
+      <w:numFmt w:val="decimal"/>
+      <w:lvlText w:val="%1."/>
       <w:lvlJc w:val="left"/>
       <w:pPr>
         <w:tabs>
@@ -7293,12 +7293,8 @@
         </w:tabs>
         <w:ind w:left="720" w:hanging="360"/>
       </w:pPr>
-      <w:rPr>
-        <w:rFonts w:ascii="Symbol" w:hAnsi="Symbol" w:hint="default"/>
-        <w:sz w:val="20"/>
-      </w:rPr>
-    </w:lvl>
-    <w:lvl w:ilvl="1" w:tentative="1">
+    </w:lvl>
+    <w:lvl w:ilvl="1">
       <w:start w:val="1"/>
       <w:numFmt w:val="bullet"/>
       <w:lvlText w:val="o"/>
@@ -7316,8 +7312,8 @@
     </w:lvl>
     <w:lvl w:ilvl="2" w:tentative="1">
       <w:start w:val="1"/>
-      <w:numFmt w:val="bullet"/>
-      <w:lvlText w:val=""/>
+      <w:numFmt w:val="decimal"/>
+      <w:lvlText w:val="%3."/>
       <w:lvlJc w:val="left"/>
       <w:pPr>
         <w:tabs>
@@ -7325,15 +7321,11 @@
         </w:tabs>
         <w:ind w:left="2160" w:hanging="360"/>
       </w:pPr>
-      <w:rPr>
-        <w:rFonts w:ascii="Wingdings" w:hAnsi="Wingdings" w:hint="default"/>
-        <w:sz w:val="20"/>
-      </w:rPr>
     </w:lvl>
     <w:lvl w:ilvl="3" w:tentative="1">
       <w:start w:val="1"/>
-      <w:numFmt w:val="bullet"/>
-      <w:lvlText w:val=""/>
+      <w:numFmt w:val="decimal"/>
+      <w:lvlText w:val="%4."/>
       <w:lvlJc w:val="left"/>
       <w:pPr>
         <w:tabs>
@@ -7341,15 +7333,11 @@
         </w:tabs>
         <w:ind w:left="2880" w:hanging="360"/>
       </w:pPr>
-      <w:rPr>
-        <w:rFonts w:ascii="Wingdings" w:hAnsi="Wingdings" w:hint="default"/>
-        <w:sz w:val="20"/>
-      </w:rPr>
     </w:lvl>
     <w:lvl w:ilvl="4" w:tentative="1">
       <w:start w:val="1"/>
-      <w:numFmt w:val="bullet"/>
-      <w:lvlText w:val=""/>
+      <w:numFmt w:val="decimal"/>
+      <w:lvlText w:val="%5."/>
       <w:lvlJc w:val="left"/>
       <w:pPr>
         <w:tabs>
@@ -7357,15 +7345,11 @@
         </w:tabs>
         <w:ind w:left="3600" w:hanging="360"/>
       </w:pPr>
-      <w:rPr>
-        <w:rFonts w:ascii="Wingdings" w:hAnsi="Wingdings" w:hint="default"/>
-        <w:sz w:val="20"/>
-      </w:rPr>
     </w:lvl>
     <w:lvl w:ilvl="5" w:tentative="1">
       <w:start w:val="1"/>
-      <w:numFmt w:val="bullet"/>
-      <w:lvlText w:val=""/>
+      <w:numFmt w:val="decimal"/>
+      <w:lvlText w:val="%6."/>
       <w:lvlJc w:val="left"/>
       <w:pPr>
         <w:tabs>
@@ -7373,15 +7357,11 @@
         </w:tabs>
         <w:ind w:left="4320" w:hanging="360"/>
       </w:pPr>
-      <w:rPr>
-        <w:rFonts w:ascii="Wingdings" w:hAnsi="Wingdings" w:hint="default"/>
-        <w:sz w:val="20"/>
-      </w:rPr>
     </w:lvl>
     <w:lvl w:ilvl="6" w:tentative="1">
       <w:start w:val="1"/>
-      <w:numFmt w:val="bullet"/>
-      <w:lvlText w:val=""/>
+      <w:numFmt w:val="decimal"/>
+      <w:lvlText w:val="%7."/>
       <w:lvlJc w:val="left"/>
       <w:pPr>
         <w:tabs>
@@ -7389,15 +7369,11 @@
         </w:tabs>
         <w:ind w:left="5040" w:hanging="360"/>
       </w:pPr>
-      <w:rPr>
-        <w:rFonts w:ascii="Wingdings" w:hAnsi="Wingdings" w:hint="default"/>
-        <w:sz w:val="20"/>
-      </w:rPr>
     </w:lvl>
     <w:lvl w:ilvl="7" w:tentative="1">
       <w:start w:val="1"/>
-      <w:numFmt w:val="bullet"/>
-      <w:lvlText w:val=""/>
+      <w:numFmt w:val="decimal"/>
+      <w:lvlText w:val="%8."/>
       <w:lvlJc w:val="left"/>
       <w:pPr>
         <w:tabs>
@@ -7405,15 +7381,11 @@
         </w:tabs>
         <w:ind w:left="5760" w:hanging="360"/>
       </w:pPr>
-      <w:rPr>
-        <w:rFonts w:ascii="Wingdings" w:hAnsi="Wingdings" w:hint="default"/>
-        <w:sz w:val="20"/>
-      </w:rPr>
     </w:lvl>
     <w:lvl w:ilvl="8" w:tentative="1">
       <w:start w:val="1"/>
-      <w:numFmt w:val="bullet"/>
-      <w:lvlText w:val=""/>
+      <w:numFmt w:val="decimal"/>
+      <w:lvlText w:val="%9."/>
       <w:lvlJc w:val="left"/>
       <w:pPr>
         <w:tabs>
@@ -7421,16 +7393,12 @@
         </w:tabs>
         <w:ind w:left="6480" w:hanging="360"/>
       </w:pPr>
-      <w:rPr>
-        <w:rFonts w:ascii="Wingdings" w:hAnsi="Wingdings" w:hint="default"/>
-        <w:sz w:val="20"/>
-      </w:rPr>
     </w:lvl>
   </w:abstractNum>
   <w:abstractNum w:abstractNumId="6" w15:restartNumberingAfterBreak="0">
-    <w:nsid w:val="32274737"/>
+    <w:nsid w:val="3C9F6DCE"/>
     <w:multiLevelType w:val="multilevel"/>
-    <w:tmpl w:val="9162EBE6"/>
+    <w:tmpl w:val="9DD0CC0E"/>
     <w:lvl w:ilvl="0">
       <w:start w:val="1"/>
       <w:numFmt w:val="decimal"/>
@@ -7545,9 +7513,158 @@
     </w:lvl>
   </w:abstractNum>
   <w:abstractNum w:abstractNumId="7" w15:restartNumberingAfterBreak="0">
-    <w:nsid w:val="3D4F52E1"/>
+    <w:nsid w:val="3FBD69C4"/>
     <w:multiLevelType w:val="multilevel"/>
-    <w:tmpl w:val="78DC1B60"/>
+    <w:tmpl w:val="84068482"/>
+    <w:lvl w:ilvl="0">
+      <w:start w:val="1"/>
+      <w:numFmt w:val="bullet"/>
+      <w:lvlText w:val=""/>
+      <w:lvlJc w:val="left"/>
+      <w:pPr>
+        <w:tabs>
+          <w:tab w:val="num" w:pos="720"/>
+        </w:tabs>
+        <w:ind w:left="720" w:hanging="360"/>
+      </w:pPr>
+      <w:rPr>
+        <w:rFonts w:ascii="Symbol" w:hAnsi="Symbol" w:hint="default"/>
+        <w:sz w:val="20"/>
+      </w:rPr>
+    </w:lvl>
+    <w:lvl w:ilvl="1" w:tentative="1">
+      <w:start w:val="1"/>
+      <w:numFmt w:val="bullet"/>
+      <w:lvlText w:val="o"/>
+      <w:lvlJc w:val="left"/>
+      <w:pPr>
+        <w:tabs>
+          <w:tab w:val="num" w:pos="1440"/>
+        </w:tabs>
+        <w:ind w:left="1440" w:hanging="360"/>
+      </w:pPr>
+      <w:rPr>
+        <w:rFonts w:ascii="Courier New" w:hAnsi="Courier New" w:hint="default"/>
+        <w:sz w:val="20"/>
+      </w:rPr>
+    </w:lvl>
+    <w:lvl w:ilvl="2" w:tentative="1">
+      <w:start w:val="1"/>
+      <w:numFmt w:val="bullet"/>
+      <w:lvlText w:val=""/>
+      <w:lvlJc w:val="left"/>
+      <w:pPr>
+        <w:tabs>
+          <w:tab w:val="num" w:pos="2160"/>
+        </w:tabs>
+        <w:ind w:left="2160" w:hanging="360"/>
+      </w:pPr>
+      <w:rPr>
+        <w:rFonts w:ascii="Wingdings" w:hAnsi="Wingdings" w:hint="default"/>
+        <w:sz w:val="20"/>
+      </w:rPr>
+    </w:lvl>
+    <w:lvl w:ilvl="3" w:tentative="1">
+      <w:start w:val="1"/>
+      <w:numFmt w:val="bullet"/>
+      <w:lvlText w:val=""/>
+      <w:lvlJc w:val="left"/>
+      <w:pPr>
+        <w:tabs>
+          <w:tab w:val="num" w:pos="2880"/>
+        </w:tabs>
+        <w:ind w:left="2880" w:hanging="360"/>
+      </w:pPr>
+      <w:rPr>
+        <w:rFonts w:ascii="Wingdings" w:hAnsi="Wingdings" w:hint="default"/>
+        <w:sz w:val="20"/>
+      </w:rPr>
+    </w:lvl>
+    <w:lvl w:ilvl="4" w:tentative="1">
+      <w:start w:val="1"/>
+      <w:numFmt w:val="bullet"/>
+      <w:lvlText w:val=""/>
+      <w:lvlJc w:val="left"/>
+      <w:pPr>
+        <w:tabs>
+          <w:tab w:val="num" w:pos="3600"/>
+        </w:tabs>
+        <w:ind w:left="3600" w:hanging="360"/>
+      </w:pPr>
+      <w:rPr>
+        <w:rFonts w:ascii="Wingdings" w:hAnsi="Wingdings" w:hint="default"/>
+        <w:sz w:val="20"/>
+      </w:rPr>
+    </w:lvl>
+    <w:lvl w:ilvl="5" w:tentative="1">
+      <w:start w:val="1"/>
+      <w:numFmt w:val="bullet"/>
+      <w:lvlText w:val=""/>
+      <w:lvlJc w:val="left"/>
+      <w:pPr>
+        <w:tabs>
+          <w:tab w:val="num" w:pos="4320"/>
+        </w:tabs>
+        <w:ind w:left="4320" w:hanging="360"/>
+      </w:pPr>
+      <w:rPr>
+        <w:rFonts w:ascii="Wingdings" w:hAnsi="Wingdings" w:hint="default"/>
+        <w:sz w:val="20"/>
+      </w:rPr>
+    </w:lvl>
+    <w:lvl w:ilvl="6" w:tentative="1">
+      <w:start w:val="1"/>
+      <w:numFmt w:val="bullet"/>
+      <w:lvlText w:val=""/>
+      <w:lvlJc w:val="left"/>
+      <w:pPr>
+        <w:tabs>
+          <w:tab w:val="num" w:pos="5040"/>
+        </w:tabs>
+        <w:ind w:left="5040" w:hanging="360"/>
+      </w:pPr>
+      <w:rPr>
+        <w:rFonts w:ascii="Wingdings" w:hAnsi="Wingdings" w:hint="default"/>
+        <w:sz w:val="20"/>
+      </w:rPr>
+    </w:lvl>
+    <w:lvl w:ilvl="7" w:tentative="1">
+      <w:start w:val="1"/>
+      <w:numFmt w:val="bullet"/>
+      <w:lvlText w:val=""/>
+      <w:lvlJc w:val="left"/>
+      <w:pPr>
+        <w:tabs>
+          <w:tab w:val="num" w:pos="5760"/>
+        </w:tabs>
+        <w:ind w:left="5760" w:hanging="360"/>
+      </w:pPr>
+      <w:rPr>
+        <w:rFonts w:ascii="Wingdings" w:hAnsi="Wingdings" w:hint="default"/>
+        <w:sz w:val="20"/>
+      </w:rPr>
+    </w:lvl>
+    <w:lvl w:ilvl="8" w:tentative="1">
+      <w:start w:val="1"/>
+      <w:numFmt w:val="bullet"/>
+      <w:lvlText w:val=""/>
+      <w:lvlJc w:val="left"/>
+      <w:pPr>
+        <w:tabs>
+          <w:tab w:val="num" w:pos="6480"/>
+        </w:tabs>
+        <w:ind w:left="6480" w:hanging="360"/>
+      </w:pPr>
+      <w:rPr>
+        <w:rFonts w:ascii="Wingdings" w:hAnsi="Wingdings" w:hint="default"/>
+        <w:sz w:val="20"/>
+      </w:rPr>
+    </w:lvl>
+  </w:abstractNum>
+  <w:abstractNum w:abstractNumId="8" w15:restartNumberingAfterBreak="0">
+    <w:nsid w:val="41B1783E"/>
+    <w:multiLevelType w:val="multilevel"/>
+    <w:tmpl w:val="74D4457A"/>
     <w:lvl w:ilvl="0">
       <w:start w:val="1"/>
       <w:numFmt w:val="decimal"/>
@@ -7661,159 +7778,10 @@
       </w:pPr>
     </w:lvl>
   </w:abstractNum>
-  <w:abstractNum w:abstractNumId="8" w15:restartNumberingAfterBreak="0">
-    <w:nsid w:val="46C54005"/>
+  <w:abstractNum w:abstractNumId="9" w15:restartNumberingAfterBreak="0">
+    <w:nsid w:val="49BA3629"/>
     <w:multiLevelType w:val="multilevel"/>
-    <w:tmpl w:val="A5CAB3C6"/>
-    <w:lvl w:ilvl="0">
-      <w:start w:val="1"/>
-      <w:numFmt w:val="bullet"/>
-      <w:lvlText w:val=""/>
-      <w:lvlJc w:val="left"/>
-      <w:pPr>
-        <w:tabs>
-          <w:tab w:val="num" w:pos="720"/>
-        </w:tabs>
-        <w:ind w:left="720" w:hanging="360"/>
-      </w:pPr>
-      <w:rPr>
-        <w:rFonts w:ascii="Symbol" w:hAnsi="Symbol" w:hint="default"/>
-        <w:sz w:val="20"/>
-      </w:rPr>
-    </w:lvl>
-    <w:lvl w:ilvl="1" w:tentative="1">
-      <w:start w:val="1"/>
-      <w:numFmt w:val="bullet"/>
-      <w:lvlText w:val="o"/>
-      <w:lvlJc w:val="left"/>
-      <w:pPr>
-        <w:tabs>
-          <w:tab w:val="num" w:pos="1440"/>
-        </w:tabs>
-        <w:ind w:left="1440" w:hanging="360"/>
-      </w:pPr>
-      <w:rPr>
-        <w:rFonts w:ascii="Courier New" w:hAnsi="Courier New" w:hint="default"/>
-        <w:sz w:val="20"/>
-      </w:rPr>
-    </w:lvl>
-    <w:lvl w:ilvl="2" w:tentative="1">
-      <w:start w:val="1"/>
-      <w:numFmt w:val="bullet"/>
-      <w:lvlText w:val=""/>
-      <w:lvlJc w:val="left"/>
-      <w:pPr>
-        <w:tabs>
-          <w:tab w:val="num" w:pos="2160"/>
-        </w:tabs>
-        <w:ind w:left="2160" w:hanging="360"/>
-      </w:pPr>
-      <w:rPr>
-        <w:rFonts w:ascii="Wingdings" w:hAnsi="Wingdings" w:hint="default"/>
-        <w:sz w:val="20"/>
-      </w:rPr>
-    </w:lvl>
-    <w:lvl w:ilvl="3" w:tentative="1">
-      <w:start w:val="1"/>
-      <w:numFmt w:val="bullet"/>
-      <w:lvlText w:val=""/>
-      <w:lvlJc w:val="left"/>
-      <w:pPr>
-        <w:tabs>
-          <w:tab w:val="num" w:pos="2880"/>
-        </w:tabs>
-        <w:ind w:left="2880" w:hanging="360"/>
-      </w:pPr>
-      <w:rPr>
-        <w:rFonts w:ascii="Wingdings" w:hAnsi="Wingdings" w:hint="default"/>
-        <w:sz w:val="20"/>
-      </w:rPr>
-    </w:lvl>
-    <w:lvl w:ilvl="4" w:tentative="1">
-      <w:start w:val="1"/>
-      <w:numFmt w:val="bullet"/>
-      <w:lvlText w:val=""/>
-      <w:lvlJc w:val="left"/>
-      <w:pPr>
-        <w:tabs>
-          <w:tab w:val="num" w:pos="3600"/>
-        </w:tabs>
-        <w:ind w:left="3600" w:hanging="360"/>
-      </w:pPr>
-      <w:rPr>
-        <w:rFonts w:ascii="Wingdings" w:hAnsi="Wingdings" w:hint="default"/>
-        <w:sz w:val="20"/>
-      </w:rPr>
-    </w:lvl>
-    <w:lvl w:ilvl="5" w:tentative="1">
-      <w:start w:val="1"/>
-      <w:numFmt w:val="bullet"/>
-      <w:lvlText w:val=""/>
-      <w:lvlJc w:val="left"/>
-      <w:pPr>
-        <w:tabs>
-          <w:tab w:val="num" w:pos="4320"/>
-        </w:tabs>
-        <w:ind w:left="4320" w:hanging="360"/>
-      </w:pPr>
-      <w:rPr>
-        <w:rFonts w:ascii="Wingdings" w:hAnsi="Wingdings" w:hint="default"/>
-        <w:sz w:val="20"/>
-      </w:rPr>
-    </w:lvl>
-    <w:lvl w:ilvl="6" w:tentative="1">
-      <w:start w:val="1"/>
-      <w:numFmt w:val="bullet"/>
-      <w:lvlText w:val=""/>
-      <w:lvlJc w:val="left"/>
-      <w:pPr>
-        <w:tabs>
-          <w:tab w:val="num" w:pos="5040"/>
-        </w:tabs>
-        <w:ind w:left="5040" w:hanging="360"/>
-      </w:pPr>
-      <w:rPr>
-        <w:rFonts w:ascii="Wingdings" w:hAnsi="Wingdings" w:hint="default"/>
-        <w:sz w:val="20"/>
-      </w:rPr>
-    </w:lvl>
-    <w:lvl w:ilvl="7" w:tentative="1">
-      <w:start w:val="1"/>
-      <w:numFmt w:val="bullet"/>
-      <w:lvlText w:val=""/>
-      <w:lvlJc w:val="left"/>
-      <w:pPr>
-        <w:tabs>
-          <w:tab w:val="num" w:pos="5760"/>
-        </w:tabs>
-        <w:ind w:left="5760" w:hanging="360"/>
-      </w:pPr>
-      <w:rPr>
-        <w:rFonts w:ascii="Wingdings" w:hAnsi="Wingdings" w:hint="default"/>
-        <w:sz w:val="20"/>
-      </w:rPr>
-    </w:lvl>
-    <w:lvl w:ilvl="8" w:tentative="1">
-      <w:start w:val="1"/>
-      <w:numFmt w:val="bullet"/>
-      <w:lvlText w:val=""/>
-      <w:lvlJc w:val="left"/>
-      <w:pPr>
-        <w:tabs>
-          <w:tab w:val="num" w:pos="6480"/>
-        </w:tabs>
-        <w:ind w:left="6480" w:hanging="360"/>
-      </w:pPr>
-      <w:rPr>
-        <w:rFonts w:ascii="Wingdings" w:hAnsi="Wingdings" w:hint="default"/>
-        <w:sz w:val="20"/>
-      </w:rPr>
-    </w:lvl>
-  </w:abstractNum>
-  <w:abstractNum w:abstractNumId="9" w15:restartNumberingAfterBreak="0">
-    <w:nsid w:val="491D2C94"/>
-    <w:multiLevelType w:val="multilevel"/>
-    <w:tmpl w:val="CB4A634C"/>
+    <w:tmpl w:val="0E00929C"/>
     <w:lvl w:ilvl="0">
       <w:start w:val="1"/>
       <w:numFmt w:val="bullet"/>
@@ -7960,9 +7928,158 @@
     </w:lvl>
   </w:abstractNum>
   <w:abstractNum w:abstractNumId="10" w15:restartNumberingAfterBreak="0">
-    <w:nsid w:val="4AAD1768"/>
+    <w:nsid w:val="4A7365A5"/>
     <w:multiLevelType w:val="multilevel"/>
-    <w:tmpl w:val="622E1BB2"/>
+    <w:tmpl w:val="4DB48B76"/>
+    <w:lvl w:ilvl="0">
+      <w:start w:val="1"/>
+      <w:numFmt w:val="bullet"/>
+      <w:lvlText w:val=""/>
+      <w:lvlJc w:val="left"/>
+      <w:pPr>
+        <w:tabs>
+          <w:tab w:val="num" w:pos="720"/>
+        </w:tabs>
+        <w:ind w:left="720" w:hanging="360"/>
+      </w:pPr>
+      <w:rPr>
+        <w:rFonts w:ascii="Symbol" w:hAnsi="Symbol" w:hint="default"/>
+        <w:sz w:val="20"/>
+      </w:rPr>
+    </w:lvl>
+    <w:lvl w:ilvl="1" w:tentative="1">
+      <w:start w:val="1"/>
+      <w:numFmt w:val="bullet"/>
+      <w:lvlText w:val="o"/>
+      <w:lvlJc w:val="left"/>
+      <w:pPr>
+        <w:tabs>
+          <w:tab w:val="num" w:pos="1440"/>
+        </w:tabs>
+        <w:ind w:left="1440" w:hanging="360"/>
+      </w:pPr>
+      <w:rPr>
+        <w:rFonts w:ascii="Courier New" w:hAnsi="Courier New" w:hint="default"/>
+        <w:sz w:val="20"/>
+      </w:rPr>
+    </w:lvl>
+    <w:lvl w:ilvl="2" w:tentative="1">
+      <w:start w:val="1"/>
+      <w:numFmt w:val="bullet"/>
+      <w:lvlText w:val=""/>
+      <w:lvlJc w:val="left"/>
+      <w:pPr>
+        <w:tabs>
+          <w:tab w:val="num" w:pos="2160"/>
+        </w:tabs>
+        <w:ind w:left="2160" w:hanging="360"/>
+      </w:pPr>
+      <w:rPr>
+        <w:rFonts w:ascii="Wingdings" w:hAnsi="Wingdings" w:hint="default"/>
+        <w:sz w:val="20"/>
+      </w:rPr>
+    </w:lvl>
+    <w:lvl w:ilvl="3" w:tentative="1">
+      <w:start w:val="1"/>
+      <w:numFmt w:val="bullet"/>
+      <w:lvlText w:val=""/>
+      <w:lvlJc w:val="left"/>
+      <w:pPr>
+        <w:tabs>
+          <w:tab w:val="num" w:pos="2880"/>
+        </w:tabs>
+        <w:ind w:left="2880" w:hanging="360"/>
+      </w:pPr>
+      <w:rPr>
+        <w:rFonts w:ascii="Wingdings" w:hAnsi="Wingdings" w:hint="default"/>
+        <w:sz w:val="20"/>
+      </w:rPr>
+    </w:lvl>
+    <w:lvl w:ilvl="4" w:tentative="1">
+      <w:start w:val="1"/>
+      <w:numFmt w:val="bullet"/>
+      <w:lvlText w:val=""/>
+      <w:lvlJc w:val="left"/>
+      <w:pPr>
+        <w:tabs>
+          <w:tab w:val="num" w:pos="3600"/>
+        </w:tabs>
+        <w:ind w:left="3600" w:hanging="360"/>
+      </w:pPr>
+      <w:rPr>
+        <w:rFonts w:ascii="Wingdings" w:hAnsi="Wingdings" w:hint="default"/>
+        <w:sz w:val="20"/>
+      </w:rPr>
+    </w:lvl>
+    <w:lvl w:ilvl="5" w:tentative="1">
+      <w:start w:val="1"/>
+      <w:numFmt w:val="bullet"/>
+      <w:lvlText w:val=""/>
+      <w:lvlJc w:val="left"/>
+      <w:pPr>
+        <w:tabs>
+          <w:tab w:val="num" w:pos="4320"/>
+        </w:tabs>
+        <w:ind w:left="4320" w:hanging="360"/>
+      </w:pPr>
+      <w:rPr>
+        <w:rFonts w:ascii="Wingdings" w:hAnsi="Wingdings" w:hint="default"/>
+        <w:sz w:val="20"/>
+      </w:rPr>
+    </w:lvl>
+    <w:lvl w:ilvl="6" w:tentative="1">
+      <w:start w:val="1"/>
+      <w:numFmt w:val="bullet"/>
+      <w:lvlText w:val=""/>
+      <w:lvlJc w:val="left"/>
+      <w:pPr>
+        <w:tabs>
+          <w:tab w:val="num" w:pos="5040"/>
+        </w:tabs>
+        <w:ind w:left="5040" w:hanging="360"/>
+      </w:pPr>
+      <w:rPr>
+        <w:rFonts w:ascii="Wingdings" w:hAnsi="Wingdings" w:hint="default"/>
+        <w:sz w:val="20"/>
+      </w:rPr>
+    </w:lvl>
+    <w:lvl w:ilvl="7" w:tentative="1">
+      <w:start w:val="1"/>
+      <w:numFmt w:val="bullet"/>
+      <w:lvlText w:val=""/>
+      <w:lvlJc w:val="left"/>
+      <w:pPr>
+        <w:tabs>
+          <w:tab w:val="num" w:pos="5760"/>
+        </w:tabs>
+        <w:ind w:left="5760" w:hanging="360"/>
+      </w:pPr>
+      <w:rPr>
+        <w:rFonts w:ascii="Wingdings" w:hAnsi="Wingdings" w:hint="default"/>
+        <w:sz w:val="20"/>
+      </w:rPr>
+    </w:lvl>
+    <w:lvl w:ilvl="8" w:tentative="1">
+      <w:start w:val="1"/>
+      <w:numFmt w:val="bullet"/>
+      <w:lvlText w:val=""/>
+      <w:lvlJc w:val="left"/>
+      <w:pPr>
+        <w:tabs>
+          <w:tab w:val="num" w:pos="6480"/>
+        </w:tabs>
+        <w:ind w:left="6480" w:hanging="360"/>
+      </w:pPr>
+      <w:rPr>
+        <w:rFonts w:ascii="Wingdings" w:hAnsi="Wingdings" w:hint="default"/>
+        <w:sz w:val="20"/>
+      </w:rPr>
+    </w:lvl>
+  </w:abstractNum>
+  <w:abstractNum w:abstractNumId="11" w15:restartNumberingAfterBreak="0">
+    <w:nsid w:val="4CF47CC8"/>
+    <w:multiLevelType w:val="multilevel"/>
+    <w:tmpl w:val="9384AF5A"/>
     <w:lvl w:ilvl="0">
       <w:start w:val="1"/>
       <w:numFmt w:val="decimal"/>
@@ -8076,159 +8193,10 @@
       </w:pPr>
     </w:lvl>
   </w:abstractNum>
-  <w:abstractNum w:abstractNumId="11" w15:restartNumberingAfterBreak="0">
-    <w:nsid w:val="5022015F"/>
+  <w:abstractNum w:abstractNumId="12" w15:restartNumberingAfterBreak="0">
+    <w:nsid w:val="4D184761"/>
     <w:multiLevelType w:val="multilevel"/>
-    <w:tmpl w:val="8848BC6E"/>
-    <w:lvl w:ilvl="0">
-      <w:start w:val="1"/>
-      <w:numFmt w:val="bullet"/>
-      <w:lvlText w:val=""/>
-      <w:lvlJc w:val="left"/>
-      <w:pPr>
-        <w:tabs>
-          <w:tab w:val="num" w:pos="720"/>
-        </w:tabs>
-        <w:ind w:left="720" w:hanging="360"/>
-      </w:pPr>
-      <w:rPr>
-        <w:rFonts w:ascii="Symbol" w:hAnsi="Symbol" w:hint="default"/>
-        <w:sz w:val="20"/>
-      </w:rPr>
-    </w:lvl>
-    <w:lvl w:ilvl="1" w:tentative="1">
-      <w:start w:val="1"/>
-      <w:numFmt w:val="bullet"/>
-      <w:lvlText w:val="o"/>
-      <w:lvlJc w:val="left"/>
-      <w:pPr>
-        <w:tabs>
-          <w:tab w:val="num" w:pos="1440"/>
-        </w:tabs>
-        <w:ind w:left="1440" w:hanging="360"/>
-      </w:pPr>
-      <w:rPr>
-        <w:rFonts w:ascii="Courier New" w:hAnsi="Courier New" w:hint="default"/>
-        <w:sz w:val="20"/>
-      </w:rPr>
-    </w:lvl>
-    <w:lvl w:ilvl="2" w:tentative="1">
-      <w:start w:val="1"/>
-      <w:numFmt w:val="bullet"/>
-      <w:lvlText w:val=""/>
-      <w:lvlJc w:val="left"/>
-      <w:pPr>
-        <w:tabs>
-          <w:tab w:val="num" w:pos="2160"/>
-        </w:tabs>
-        <w:ind w:left="2160" w:hanging="360"/>
-      </w:pPr>
-      <w:rPr>
-        <w:rFonts w:ascii="Wingdings" w:hAnsi="Wingdings" w:hint="default"/>
-        <w:sz w:val="20"/>
-      </w:rPr>
-    </w:lvl>
-    <w:lvl w:ilvl="3" w:tentative="1">
-      <w:start w:val="1"/>
-      <w:numFmt w:val="bullet"/>
-      <w:lvlText w:val=""/>
-      <w:lvlJc w:val="left"/>
-      <w:pPr>
-        <w:tabs>
-          <w:tab w:val="num" w:pos="2880"/>
-        </w:tabs>
-        <w:ind w:left="2880" w:hanging="360"/>
-      </w:pPr>
-      <w:rPr>
-        <w:rFonts w:ascii="Wingdings" w:hAnsi="Wingdings" w:hint="default"/>
-        <w:sz w:val="20"/>
-      </w:rPr>
-    </w:lvl>
-    <w:lvl w:ilvl="4" w:tentative="1">
-      <w:start w:val="1"/>
-      <w:numFmt w:val="bullet"/>
-      <w:lvlText w:val=""/>
-      <w:lvlJc w:val="left"/>
-      <w:pPr>
-        <w:tabs>
-          <w:tab w:val="num" w:pos="3600"/>
-        </w:tabs>
-        <w:ind w:left="3600" w:hanging="360"/>
-      </w:pPr>
-      <w:rPr>
-        <w:rFonts w:ascii="Wingdings" w:hAnsi="Wingdings" w:hint="default"/>
-        <w:sz w:val="20"/>
-      </w:rPr>
-    </w:lvl>
-    <w:lvl w:ilvl="5" w:tentative="1">
-      <w:start w:val="1"/>
-      <w:numFmt w:val="bullet"/>
-      <w:lvlText w:val=""/>
-      <w:lvlJc w:val="left"/>
-      <w:pPr>
-        <w:tabs>
-          <w:tab w:val="num" w:pos="4320"/>
-        </w:tabs>
-        <w:ind w:left="4320" w:hanging="360"/>
-      </w:pPr>
-      <w:rPr>
-        <w:rFonts w:ascii="Wingdings" w:hAnsi="Wingdings" w:hint="default"/>
-        <w:sz w:val="20"/>
-      </w:rPr>
-    </w:lvl>
-    <w:lvl w:ilvl="6" w:tentative="1">
-      <w:start w:val="1"/>
-      <w:numFmt w:val="bullet"/>
-      <w:lvlText w:val=""/>
-      <w:lvlJc w:val="left"/>
-      <w:pPr>
-        <w:tabs>
-          <w:tab w:val="num" w:pos="5040"/>
-        </w:tabs>
-        <w:ind w:left="5040" w:hanging="360"/>
-      </w:pPr>
-      <w:rPr>
-        <w:rFonts w:ascii="Wingdings" w:hAnsi="Wingdings" w:hint="default"/>
-        <w:sz w:val="20"/>
-      </w:rPr>
-    </w:lvl>
-    <w:lvl w:ilvl="7" w:tentative="1">
-      <w:start w:val="1"/>
-      <w:numFmt w:val="bullet"/>
-      <w:lvlText w:val=""/>
-      <w:lvlJc w:val="left"/>
-      <w:pPr>
-        <w:tabs>
-          <w:tab w:val="num" w:pos="5760"/>
-        </w:tabs>
-        <w:ind w:left="5760" w:hanging="360"/>
-      </w:pPr>
-      <w:rPr>
-        <w:rFonts w:ascii="Wingdings" w:hAnsi="Wingdings" w:hint="default"/>
-        <w:sz w:val="20"/>
-      </w:rPr>
-    </w:lvl>
-    <w:lvl w:ilvl="8" w:tentative="1">
-      <w:start w:val="1"/>
-      <w:numFmt w:val="bullet"/>
-      <w:lvlText w:val=""/>
-      <w:lvlJc w:val="left"/>
-      <w:pPr>
-        <w:tabs>
-          <w:tab w:val="num" w:pos="6480"/>
-        </w:tabs>
-        <w:ind w:left="6480" w:hanging="360"/>
-      </w:pPr>
-      <w:rPr>
-        <w:rFonts w:ascii="Wingdings" w:hAnsi="Wingdings" w:hint="default"/>
-        <w:sz w:val="20"/>
-      </w:rPr>
-    </w:lvl>
-  </w:abstractNum>
-  <w:abstractNum w:abstractNumId="12" w15:restartNumberingAfterBreak="0">
-    <w:nsid w:val="52E96A2F"/>
-    <w:multiLevelType w:val="multilevel"/>
-    <w:tmpl w:val="9D66D454"/>
+    <w:tmpl w:val="0F44E644"/>
     <w:lvl w:ilvl="0">
       <w:start w:val="1"/>
       <w:numFmt w:val="bullet"/>
@@ -8375,13 +8343,13 @@
     </w:lvl>
   </w:abstractNum>
   <w:abstractNum w:abstractNumId="13" w15:restartNumberingAfterBreak="0">
-    <w:nsid w:val="54F20F62"/>
+    <w:nsid w:val="51A03C88"/>
     <w:multiLevelType w:val="multilevel"/>
-    <w:tmpl w:val="AA644B90"/>
+    <w:tmpl w:val="C9D0C1DC"/>
     <w:lvl w:ilvl="0">
       <w:start w:val="1"/>
-      <w:numFmt w:val="bullet"/>
-      <w:lvlText w:val=""/>
+      <w:numFmt w:val="decimal"/>
+      <w:lvlText w:val="%1."/>
       <w:lvlJc w:val="left"/>
       <w:pPr>
         <w:tabs>
@@ -8389,12 +8357,8 @@
         </w:tabs>
         <w:ind w:left="720" w:hanging="360"/>
       </w:pPr>
-      <w:rPr>
-        <w:rFonts w:ascii="Symbol" w:hAnsi="Symbol" w:hint="default"/>
-        <w:sz w:val="20"/>
-      </w:rPr>
-    </w:lvl>
-    <w:lvl w:ilvl="1" w:tentative="1">
+    </w:lvl>
+    <w:lvl w:ilvl="1">
       <w:start w:val="1"/>
       <w:numFmt w:val="bullet"/>
       <w:lvlText w:val="o"/>
@@ -8412,8 +8376,8 @@
     </w:lvl>
     <w:lvl w:ilvl="2" w:tentative="1">
       <w:start w:val="1"/>
-      <w:numFmt w:val="bullet"/>
-      <w:lvlText w:val=""/>
+      <w:numFmt w:val="decimal"/>
+      <w:lvlText w:val="%3."/>
       <w:lvlJc w:val="left"/>
       <w:pPr>
         <w:tabs>
@@ -8421,15 +8385,11 @@
         </w:tabs>
         <w:ind w:left="2160" w:hanging="360"/>
       </w:pPr>
-      <w:rPr>
-        <w:rFonts w:ascii="Wingdings" w:hAnsi="Wingdings" w:hint="default"/>
-        <w:sz w:val="20"/>
-      </w:rPr>
     </w:lvl>
     <w:lvl w:ilvl="3" w:tentative="1">
       <w:start w:val="1"/>
-      <w:numFmt w:val="bullet"/>
-      <w:lvlText w:val=""/>
+      <w:numFmt w:val="decimal"/>
+      <w:lvlText w:val="%4."/>
       <w:lvlJc w:val="left"/>
       <w:pPr>
         <w:tabs>
@@ -8437,15 +8397,11 @@
         </w:tabs>
         <w:ind w:left="2880" w:hanging="360"/>
       </w:pPr>
-      <w:rPr>
-        <w:rFonts w:ascii="Wingdings" w:hAnsi="Wingdings" w:hint="default"/>
-        <w:sz w:val="20"/>
-      </w:rPr>
     </w:lvl>
     <w:lvl w:ilvl="4" w:tentative="1">
       <w:start w:val="1"/>
-      <w:numFmt w:val="bullet"/>
-      <w:lvlText w:val=""/>
+      <w:numFmt w:val="decimal"/>
+      <w:lvlText w:val="%5."/>
       <w:lvlJc w:val="left"/>
       <w:pPr>
         <w:tabs>
@@ -8453,15 +8409,11 @@
         </w:tabs>
         <w:ind w:left="3600" w:hanging="360"/>
       </w:pPr>
-      <w:rPr>
-        <w:rFonts w:ascii="Wingdings" w:hAnsi="Wingdings" w:hint="default"/>
-        <w:sz w:val="20"/>
-      </w:rPr>
     </w:lvl>
     <w:lvl w:ilvl="5" w:tentative="1">
       <w:start w:val="1"/>
-      <w:numFmt w:val="bullet"/>
-      <w:lvlText w:val=""/>
+      <w:numFmt w:val="decimal"/>
+      <w:lvlText w:val="%6."/>
       <w:lvlJc w:val="left"/>
       <w:pPr>
         <w:tabs>
@@ -8469,15 +8421,11 @@
         </w:tabs>
         <w:ind w:left="4320" w:hanging="360"/>
       </w:pPr>
-      <w:rPr>
-        <w:rFonts w:ascii="Wingdings" w:hAnsi="Wingdings" w:hint="default"/>
-        <w:sz w:val="20"/>
-      </w:rPr>
     </w:lvl>
     <w:lvl w:ilvl="6" w:tentative="1">
       <w:start w:val="1"/>
-      <w:numFmt w:val="bullet"/>
-      <w:lvlText w:val=""/>
+      <w:numFmt w:val="decimal"/>
+      <w:lvlText w:val="%7."/>
       <w:lvlJc w:val="left"/>
       <w:pPr>
         <w:tabs>
@@ -8485,15 +8433,11 @@
         </w:tabs>
         <w:ind w:left="5040" w:hanging="360"/>
       </w:pPr>
-      <w:rPr>
-        <w:rFonts w:ascii="Wingdings" w:hAnsi="Wingdings" w:hint="default"/>
-        <w:sz w:val="20"/>
-      </w:rPr>
     </w:lvl>
     <w:lvl w:ilvl="7" w:tentative="1">
       <w:start w:val="1"/>
-      <w:numFmt w:val="bullet"/>
-      <w:lvlText w:val=""/>
+      <w:numFmt w:val="decimal"/>
+      <w:lvlText w:val="%8."/>
       <w:lvlJc w:val="left"/>
       <w:pPr>
         <w:tabs>
@@ -8501,15 +8445,11 @@
         </w:tabs>
         <w:ind w:left="5760" w:hanging="360"/>
       </w:pPr>
-      <w:rPr>
-        <w:rFonts w:ascii="Wingdings" w:hAnsi="Wingdings" w:hint="default"/>
-        <w:sz w:val="20"/>
-      </w:rPr>
     </w:lvl>
     <w:lvl w:ilvl="8" w:tentative="1">
       <w:start w:val="1"/>
-      <w:numFmt w:val="bullet"/>
-      <w:lvlText w:val=""/>
+      <w:numFmt w:val="decimal"/>
+      <w:lvlText w:val="%9."/>
       <w:lvlJc w:val="left"/>
       <w:pPr>
         <w:tabs>
@@ -8517,16 +8457,310 @@
         </w:tabs>
         <w:ind w:left="6480" w:hanging="360"/>
       </w:pPr>
-      <w:rPr>
-        <w:rFonts w:ascii="Wingdings" w:hAnsi="Wingdings" w:hint="default"/>
-        <w:sz w:val="20"/>
-      </w:rPr>
     </w:lvl>
   </w:abstractNum>
   <w:abstractNum w:abstractNumId="14" w15:restartNumberingAfterBreak="0">
-    <w:nsid w:val="55305606"/>
+    <w:nsid w:val="52607A08"/>
     <w:multiLevelType w:val="multilevel"/>
-    <w:tmpl w:val="B782ACE8"/>
+    <w:tmpl w:val="910CDEAE"/>
+    <w:lvl w:ilvl="0">
+      <w:start w:val="1"/>
+      <w:numFmt w:val="bullet"/>
+      <w:lvlText w:val=""/>
+      <w:lvlJc w:val="left"/>
+      <w:pPr>
+        <w:tabs>
+          <w:tab w:val="num" w:pos="720"/>
+        </w:tabs>
+        <w:ind w:left="720" w:hanging="360"/>
+      </w:pPr>
+      <w:rPr>
+        <w:rFonts w:ascii="Symbol" w:hAnsi="Symbol" w:hint="default"/>
+        <w:sz w:val="20"/>
+      </w:rPr>
+    </w:lvl>
+    <w:lvl w:ilvl="1" w:tentative="1">
+      <w:start w:val="1"/>
+      <w:numFmt w:val="bullet"/>
+      <w:lvlText w:val="o"/>
+      <w:lvlJc w:val="left"/>
+      <w:pPr>
+        <w:tabs>
+          <w:tab w:val="num" w:pos="1440"/>
+        </w:tabs>
+        <w:ind w:left="1440" w:hanging="360"/>
+      </w:pPr>
+      <w:rPr>
+        <w:rFonts w:ascii="Courier New" w:hAnsi="Courier New" w:hint="default"/>
+        <w:sz w:val="20"/>
+      </w:rPr>
+    </w:lvl>
+    <w:lvl w:ilvl="2" w:tentative="1">
+      <w:start w:val="1"/>
+      <w:numFmt w:val="bullet"/>
+      <w:lvlText w:val=""/>
+      <w:lvlJc w:val="left"/>
+      <w:pPr>
+        <w:tabs>
+          <w:tab w:val="num" w:pos="2160"/>
+        </w:tabs>
+        <w:ind w:left="2160" w:hanging="360"/>
+      </w:pPr>
+      <w:rPr>
+        <w:rFonts w:ascii="Wingdings" w:hAnsi="Wingdings" w:hint="default"/>
+        <w:sz w:val="20"/>
+      </w:rPr>
+    </w:lvl>
+    <w:lvl w:ilvl="3" w:tentative="1">
+      <w:start w:val="1"/>
+      <w:numFmt w:val="bullet"/>
+      <w:lvlText w:val=""/>
+      <w:lvlJc w:val="left"/>
+      <w:pPr>
+        <w:tabs>
+          <w:tab w:val="num" w:pos="2880"/>
+        </w:tabs>
+        <w:ind w:left="2880" w:hanging="360"/>
+      </w:pPr>
+      <w:rPr>
+        <w:rFonts w:ascii="Wingdings" w:hAnsi="Wingdings" w:hint="default"/>
+        <w:sz w:val="20"/>
+      </w:rPr>
+    </w:lvl>
+    <w:lvl w:ilvl="4" w:tentative="1">
+      <w:start w:val="1"/>
+      <w:numFmt w:val="bullet"/>
+      <w:lvlText w:val=""/>
+      <w:lvlJc w:val="left"/>
+      <w:pPr>
+        <w:tabs>
+          <w:tab w:val="num" w:pos="3600"/>
+        </w:tabs>
+        <w:ind w:left="3600" w:hanging="360"/>
+      </w:pPr>
+      <w:rPr>
+        <w:rFonts w:ascii="Wingdings" w:hAnsi="Wingdings" w:hint="default"/>
+        <w:sz w:val="20"/>
+      </w:rPr>
+    </w:lvl>
+    <w:lvl w:ilvl="5" w:tentative="1">
+      <w:start w:val="1"/>
+      <w:numFmt w:val="bullet"/>
+      <w:lvlText w:val=""/>
+      <w:lvlJc w:val="left"/>
+      <w:pPr>
+        <w:tabs>
+          <w:tab w:val="num" w:pos="4320"/>
+        </w:tabs>
+        <w:ind w:left="4320" w:hanging="360"/>
+      </w:pPr>
+      <w:rPr>
+        <w:rFonts w:ascii="Wingdings" w:hAnsi="Wingdings" w:hint="default"/>
+        <w:sz w:val="20"/>
+      </w:rPr>
+    </w:lvl>
+    <w:lvl w:ilvl="6" w:tentative="1">
+      <w:start w:val="1"/>
+      <w:numFmt w:val="bullet"/>
+      <w:lvlText w:val=""/>
+      <w:lvlJc w:val="left"/>
+      <w:pPr>
+        <w:tabs>
+          <w:tab w:val="num" w:pos="5040"/>
+        </w:tabs>
+        <w:ind w:left="5040" w:hanging="360"/>
+      </w:pPr>
+      <w:rPr>
+        <w:rFonts w:ascii="Wingdings" w:hAnsi="Wingdings" w:hint="default"/>
+        <w:sz w:val="20"/>
+      </w:rPr>
+    </w:lvl>
+    <w:lvl w:ilvl="7" w:tentative="1">
+      <w:start w:val="1"/>
+      <w:numFmt w:val="bullet"/>
+      <w:lvlText w:val=""/>
+      <w:lvlJc w:val="left"/>
+      <w:pPr>
+        <w:tabs>
+          <w:tab w:val="num" w:pos="5760"/>
+        </w:tabs>
+        <w:ind w:left="5760" w:hanging="360"/>
+      </w:pPr>
+      <w:rPr>
+        <w:rFonts w:ascii="Wingdings" w:hAnsi="Wingdings" w:hint="default"/>
+        <w:sz w:val="20"/>
+      </w:rPr>
+    </w:lvl>
+    <w:lvl w:ilvl="8" w:tentative="1">
+      <w:start w:val="1"/>
+      <w:numFmt w:val="bullet"/>
+      <w:lvlText w:val=""/>
+      <w:lvlJc w:val="left"/>
+      <w:pPr>
+        <w:tabs>
+          <w:tab w:val="num" w:pos="6480"/>
+        </w:tabs>
+        <w:ind w:left="6480" w:hanging="360"/>
+      </w:pPr>
+      <w:rPr>
+        <w:rFonts w:ascii="Wingdings" w:hAnsi="Wingdings" w:hint="default"/>
+        <w:sz w:val="20"/>
+      </w:rPr>
+    </w:lvl>
+  </w:abstractNum>
+  <w:abstractNum w:abstractNumId="15" w15:restartNumberingAfterBreak="0">
+    <w:nsid w:val="54620450"/>
+    <w:multiLevelType w:val="multilevel"/>
+    <w:tmpl w:val="29DE83AC"/>
+    <w:lvl w:ilvl="0">
+      <w:start w:val="1"/>
+      <w:numFmt w:val="bullet"/>
+      <w:lvlText w:val=""/>
+      <w:lvlJc w:val="left"/>
+      <w:pPr>
+        <w:tabs>
+          <w:tab w:val="num" w:pos="720"/>
+        </w:tabs>
+        <w:ind w:left="720" w:hanging="360"/>
+      </w:pPr>
+      <w:rPr>
+        <w:rFonts w:ascii="Symbol" w:hAnsi="Symbol" w:hint="default"/>
+        <w:sz w:val="20"/>
+      </w:rPr>
+    </w:lvl>
+    <w:lvl w:ilvl="1" w:tentative="1">
+      <w:start w:val="1"/>
+      <w:numFmt w:val="bullet"/>
+      <w:lvlText w:val="o"/>
+      <w:lvlJc w:val="left"/>
+      <w:pPr>
+        <w:tabs>
+          <w:tab w:val="num" w:pos="1440"/>
+        </w:tabs>
+        <w:ind w:left="1440" w:hanging="360"/>
+      </w:pPr>
+      <w:rPr>
+        <w:rFonts w:ascii="Courier New" w:hAnsi="Courier New" w:hint="default"/>
+        <w:sz w:val="20"/>
+      </w:rPr>
+    </w:lvl>
+    <w:lvl w:ilvl="2" w:tentative="1">
+      <w:start w:val="1"/>
+      <w:numFmt w:val="bullet"/>
+      <w:lvlText w:val=""/>
+      <w:lvlJc w:val="left"/>
+      <w:pPr>
+        <w:tabs>
+          <w:tab w:val="num" w:pos="2160"/>
+        </w:tabs>
+        <w:ind w:left="2160" w:hanging="360"/>
+      </w:pPr>
+      <w:rPr>
+        <w:rFonts w:ascii="Wingdings" w:hAnsi="Wingdings" w:hint="default"/>
+        <w:sz w:val="20"/>
+      </w:rPr>
+    </w:lvl>
+    <w:lvl w:ilvl="3" w:tentative="1">
+      <w:start w:val="1"/>
+      <w:numFmt w:val="bullet"/>
+      <w:lvlText w:val=""/>
+      <w:lvlJc w:val="left"/>
+      <w:pPr>
+        <w:tabs>
+          <w:tab w:val="num" w:pos="2880"/>
+        </w:tabs>
+        <w:ind w:left="2880" w:hanging="360"/>
+      </w:pPr>
+      <w:rPr>
+        <w:rFonts w:ascii="Wingdings" w:hAnsi="Wingdings" w:hint="default"/>
+        <w:sz w:val="20"/>
+      </w:rPr>
+    </w:lvl>
+    <w:lvl w:ilvl="4" w:tentative="1">
+      <w:start w:val="1"/>
+      <w:numFmt w:val="bullet"/>
+      <w:lvlText w:val=""/>
+      <w:lvlJc w:val="left"/>
+      <w:pPr>
+        <w:tabs>
+          <w:tab w:val="num" w:pos="3600"/>
+        </w:tabs>
+        <w:ind w:left="3600" w:hanging="360"/>
+      </w:pPr>
+      <w:rPr>
+        <w:rFonts w:ascii="Wingdings" w:hAnsi="Wingdings" w:hint="default"/>
+        <w:sz w:val="20"/>
+      </w:rPr>
+    </w:lvl>
+    <w:lvl w:ilvl="5" w:tentative="1">
+      <w:start w:val="1"/>
+      <w:numFmt w:val="bullet"/>
+      <w:lvlText w:val=""/>
+      <w:lvlJc w:val="left"/>
+      <w:pPr>
+        <w:tabs>
+          <w:tab w:val="num" w:pos="4320"/>
+        </w:tabs>
+        <w:ind w:left="4320" w:hanging="360"/>
+      </w:pPr>
+      <w:rPr>
+        <w:rFonts w:ascii="Wingdings" w:hAnsi="Wingdings" w:hint="default"/>
+        <w:sz w:val="20"/>
+      </w:rPr>
+    </w:lvl>
+    <w:lvl w:ilvl="6" w:tentative="1">
+      <w:start w:val="1"/>
+      <w:numFmt w:val="bullet"/>
+      <w:lvlText w:val=""/>
+      <w:lvlJc w:val="left"/>
+      <w:pPr>
+        <w:tabs>
+          <w:tab w:val="num" w:pos="5040"/>
+        </w:tabs>
+        <w:ind w:left="5040" w:hanging="360"/>
+      </w:pPr>
+      <w:rPr>
+        <w:rFonts w:ascii="Wingdings" w:hAnsi="Wingdings" w:hint="default"/>
+        <w:sz w:val="20"/>
+      </w:rPr>
+    </w:lvl>
+    <w:lvl w:ilvl="7" w:tentative="1">
+      <w:start w:val="1"/>
+      <w:numFmt w:val="bullet"/>
+      <w:lvlText w:val=""/>
+      <w:lvlJc w:val="left"/>
+      <w:pPr>
+        <w:tabs>
+          <w:tab w:val="num" w:pos="5760"/>
+        </w:tabs>
+        <w:ind w:left="5760" w:hanging="360"/>
+      </w:pPr>
+      <w:rPr>
+        <w:rFonts w:ascii="Wingdings" w:hAnsi="Wingdings" w:hint="default"/>
+        <w:sz w:val="20"/>
+      </w:rPr>
+    </w:lvl>
+    <w:lvl w:ilvl="8" w:tentative="1">
+      <w:start w:val="1"/>
+      <w:numFmt w:val="bullet"/>
+      <w:lvlText w:val=""/>
+      <w:lvlJc w:val="left"/>
+      <w:pPr>
+        <w:tabs>
+          <w:tab w:val="num" w:pos="6480"/>
+        </w:tabs>
+        <w:ind w:left="6480" w:hanging="360"/>
+      </w:pPr>
+      <w:rPr>
+        <w:rFonts w:ascii="Wingdings" w:hAnsi="Wingdings" w:hint="default"/>
+        <w:sz w:val="20"/>
+      </w:rPr>
+    </w:lvl>
+  </w:abstractNum>
+  <w:abstractNum w:abstractNumId="16" w15:restartNumberingAfterBreak="0">
+    <w:nsid w:val="5A466E48"/>
+    <w:multiLevelType w:val="multilevel"/>
+    <w:tmpl w:val="0F20A44C"/>
     <w:lvl w:ilvl="0">
       <w:start w:val="1"/>
       <w:numFmt w:val="decimal"/>
@@ -8640,10 +8874,457 @@
       </w:pPr>
     </w:lvl>
   </w:abstractNum>
-  <w:abstractNum w:abstractNumId="15" w15:restartNumberingAfterBreak="0">
-    <w:nsid w:val="565B20D0"/>
+  <w:abstractNum w:abstractNumId="17" w15:restartNumberingAfterBreak="0">
+    <w:nsid w:val="5C457D02"/>
     <w:multiLevelType w:val="multilevel"/>
-    <w:tmpl w:val="01DC9C6C"/>
+    <w:tmpl w:val="2B1AE864"/>
+    <w:lvl w:ilvl="0">
+      <w:start w:val="1"/>
+      <w:numFmt w:val="bullet"/>
+      <w:lvlText w:val=""/>
+      <w:lvlJc w:val="left"/>
+      <w:pPr>
+        <w:tabs>
+          <w:tab w:val="num" w:pos="720"/>
+        </w:tabs>
+        <w:ind w:left="720" w:hanging="360"/>
+      </w:pPr>
+      <w:rPr>
+        <w:rFonts w:ascii="Symbol" w:hAnsi="Symbol" w:hint="default"/>
+        <w:sz w:val="20"/>
+      </w:rPr>
+    </w:lvl>
+    <w:lvl w:ilvl="1" w:tentative="1">
+      <w:start w:val="1"/>
+      <w:numFmt w:val="bullet"/>
+      <w:lvlText w:val="o"/>
+      <w:lvlJc w:val="left"/>
+      <w:pPr>
+        <w:tabs>
+          <w:tab w:val="num" w:pos="1440"/>
+        </w:tabs>
+        <w:ind w:left="1440" w:hanging="360"/>
+      </w:pPr>
+      <w:rPr>
+        <w:rFonts w:ascii="Courier New" w:hAnsi="Courier New" w:hint="default"/>
+        <w:sz w:val="20"/>
+      </w:rPr>
+    </w:lvl>
+    <w:lvl w:ilvl="2" w:tentative="1">
+      <w:start w:val="1"/>
+      <w:numFmt w:val="bullet"/>
+      <w:lvlText w:val=""/>
+      <w:lvlJc w:val="left"/>
+      <w:pPr>
+        <w:tabs>
+          <w:tab w:val="num" w:pos="2160"/>
+        </w:tabs>
+        <w:ind w:left="2160" w:hanging="360"/>
+      </w:pPr>
+      <w:rPr>
+        <w:rFonts w:ascii="Wingdings" w:hAnsi="Wingdings" w:hint="default"/>
+        <w:sz w:val="20"/>
+      </w:rPr>
+    </w:lvl>
+    <w:lvl w:ilvl="3" w:tentative="1">
+      <w:start w:val="1"/>
+      <w:numFmt w:val="bullet"/>
+      <w:lvlText w:val=""/>
+      <w:lvlJc w:val="left"/>
+      <w:pPr>
+        <w:tabs>
+          <w:tab w:val="num" w:pos="2880"/>
+        </w:tabs>
+        <w:ind w:left="2880" w:hanging="360"/>
+      </w:pPr>
+      <w:rPr>
+        <w:rFonts w:ascii="Wingdings" w:hAnsi="Wingdings" w:hint="default"/>
+        <w:sz w:val="20"/>
+      </w:rPr>
+    </w:lvl>
+    <w:lvl w:ilvl="4" w:tentative="1">
+      <w:start w:val="1"/>
+      <w:numFmt w:val="bullet"/>
+      <w:lvlText w:val=""/>
+      <w:lvlJc w:val="left"/>
+      <w:pPr>
+        <w:tabs>
+          <w:tab w:val="num" w:pos="3600"/>
+        </w:tabs>
+        <w:ind w:left="3600" w:hanging="360"/>
+      </w:pPr>
+      <w:rPr>
+        <w:rFonts w:ascii="Wingdings" w:hAnsi="Wingdings" w:hint="default"/>
+        <w:sz w:val="20"/>
+      </w:rPr>
+    </w:lvl>
+    <w:lvl w:ilvl="5" w:tentative="1">
+      <w:start w:val="1"/>
+      <w:numFmt w:val="bullet"/>
+      <w:lvlText w:val=""/>
+      <w:lvlJc w:val="left"/>
+      <w:pPr>
+        <w:tabs>
+          <w:tab w:val="num" w:pos="4320"/>
+        </w:tabs>
+        <w:ind w:left="4320" w:hanging="360"/>
+      </w:pPr>
+      <w:rPr>
+        <w:rFonts w:ascii="Wingdings" w:hAnsi="Wingdings" w:hint="default"/>
+        <w:sz w:val="20"/>
+      </w:rPr>
+    </w:lvl>
+    <w:lvl w:ilvl="6" w:tentative="1">
+      <w:start w:val="1"/>
+      <w:numFmt w:val="bullet"/>
+      <w:lvlText w:val=""/>
+      <w:lvlJc w:val="left"/>
+      <w:pPr>
+        <w:tabs>
+          <w:tab w:val="num" w:pos="5040"/>
+        </w:tabs>
+        <w:ind w:left="5040" w:hanging="360"/>
+      </w:pPr>
+      <w:rPr>
+        <w:rFonts w:ascii="Wingdings" w:hAnsi="Wingdings" w:hint="default"/>
+        <w:sz w:val="20"/>
+      </w:rPr>
+    </w:lvl>
+    <w:lvl w:ilvl="7" w:tentative="1">
+      <w:start w:val="1"/>
+      <w:numFmt w:val="bullet"/>
+      <w:lvlText w:val=""/>
+      <w:lvlJc w:val="left"/>
+      <w:pPr>
+        <w:tabs>
+          <w:tab w:val="num" w:pos="5760"/>
+        </w:tabs>
+        <w:ind w:left="5760" w:hanging="360"/>
+      </w:pPr>
+      <w:rPr>
+        <w:rFonts w:ascii="Wingdings" w:hAnsi="Wingdings" w:hint="default"/>
+        <w:sz w:val="20"/>
+      </w:rPr>
+    </w:lvl>
+    <w:lvl w:ilvl="8" w:tentative="1">
+      <w:start w:val="1"/>
+      <w:numFmt w:val="bullet"/>
+      <w:lvlText w:val=""/>
+      <w:lvlJc w:val="left"/>
+      <w:pPr>
+        <w:tabs>
+          <w:tab w:val="num" w:pos="6480"/>
+        </w:tabs>
+        <w:ind w:left="6480" w:hanging="360"/>
+      </w:pPr>
+      <w:rPr>
+        <w:rFonts w:ascii="Wingdings" w:hAnsi="Wingdings" w:hint="default"/>
+        <w:sz w:val="20"/>
+      </w:rPr>
+    </w:lvl>
+  </w:abstractNum>
+  <w:abstractNum w:abstractNumId="18" w15:restartNumberingAfterBreak="0">
+    <w:nsid w:val="60295F08"/>
+    <w:multiLevelType w:val="multilevel"/>
+    <w:tmpl w:val="EDB851CE"/>
+    <w:lvl w:ilvl="0">
+      <w:start w:val="1"/>
+      <w:numFmt w:val="bullet"/>
+      <w:lvlText w:val=""/>
+      <w:lvlJc w:val="left"/>
+      <w:pPr>
+        <w:tabs>
+          <w:tab w:val="num" w:pos="720"/>
+        </w:tabs>
+        <w:ind w:left="720" w:hanging="360"/>
+      </w:pPr>
+      <w:rPr>
+        <w:rFonts w:ascii="Symbol" w:hAnsi="Symbol" w:hint="default"/>
+        <w:sz w:val="20"/>
+      </w:rPr>
+    </w:lvl>
+    <w:lvl w:ilvl="1" w:tentative="1">
+      <w:start w:val="1"/>
+      <w:numFmt w:val="bullet"/>
+      <w:lvlText w:val="o"/>
+      <w:lvlJc w:val="left"/>
+      <w:pPr>
+        <w:tabs>
+          <w:tab w:val="num" w:pos="1440"/>
+        </w:tabs>
+        <w:ind w:left="1440" w:hanging="360"/>
+      </w:pPr>
+      <w:rPr>
+        <w:rFonts w:ascii="Courier New" w:hAnsi="Courier New" w:hint="default"/>
+        <w:sz w:val="20"/>
+      </w:rPr>
+    </w:lvl>
+    <w:lvl w:ilvl="2" w:tentative="1">
+      <w:start w:val="1"/>
+      <w:numFmt w:val="bullet"/>
+      <w:lvlText w:val=""/>
+      <w:lvlJc w:val="left"/>
+      <w:pPr>
+        <w:tabs>
+          <w:tab w:val="num" w:pos="2160"/>
+        </w:tabs>
+        <w:ind w:left="2160" w:hanging="360"/>
+      </w:pPr>
+      <w:rPr>
+        <w:rFonts w:ascii="Wingdings" w:hAnsi="Wingdings" w:hint="default"/>
+        <w:sz w:val="20"/>
+      </w:rPr>
+    </w:lvl>
+    <w:lvl w:ilvl="3" w:tentative="1">
+      <w:start w:val="1"/>
+      <w:numFmt w:val="bullet"/>
+      <w:lvlText w:val=""/>
+      <w:lvlJc w:val="left"/>
+      <w:pPr>
+        <w:tabs>
+          <w:tab w:val="num" w:pos="2880"/>
+        </w:tabs>
+        <w:ind w:left="2880" w:hanging="360"/>
+      </w:pPr>
+      <w:rPr>
+        <w:rFonts w:ascii="Wingdings" w:hAnsi="Wingdings" w:hint="default"/>
+        <w:sz w:val="20"/>
+      </w:rPr>
+    </w:lvl>
+    <w:lvl w:ilvl="4" w:tentative="1">
+      <w:start w:val="1"/>
+      <w:numFmt w:val="bullet"/>
+      <w:lvlText w:val=""/>
+      <w:lvlJc w:val="left"/>
+      <w:pPr>
+        <w:tabs>
+          <w:tab w:val="num" w:pos="3600"/>
+        </w:tabs>
+        <w:ind w:left="3600" w:hanging="360"/>
+      </w:pPr>
+      <w:rPr>
+        <w:rFonts w:ascii="Wingdings" w:hAnsi="Wingdings" w:hint="default"/>
+        <w:sz w:val="20"/>
+      </w:rPr>
+    </w:lvl>
+    <w:lvl w:ilvl="5" w:tentative="1">
+      <w:start w:val="1"/>
+      <w:numFmt w:val="bullet"/>
+      <w:lvlText w:val=""/>
+      <w:lvlJc w:val="left"/>
+      <w:pPr>
+        <w:tabs>
+          <w:tab w:val="num" w:pos="4320"/>
+        </w:tabs>
+        <w:ind w:left="4320" w:hanging="360"/>
+      </w:pPr>
+      <w:rPr>
+        <w:rFonts w:ascii="Wingdings" w:hAnsi="Wingdings" w:hint="default"/>
+        <w:sz w:val="20"/>
+      </w:rPr>
+    </w:lvl>
+    <w:lvl w:ilvl="6" w:tentative="1">
+      <w:start w:val="1"/>
+      <w:numFmt w:val="bullet"/>
+      <w:lvlText w:val=""/>
+      <w:lvlJc w:val="left"/>
+      <w:pPr>
+        <w:tabs>
+          <w:tab w:val="num" w:pos="5040"/>
+        </w:tabs>
+        <w:ind w:left="5040" w:hanging="360"/>
+      </w:pPr>
+      <w:rPr>
+        <w:rFonts w:ascii="Wingdings" w:hAnsi="Wingdings" w:hint="default"/>
+        <w:sz w:val="20"/>
+      </w:rPr>
+    </w:lvl>
+    <w:lvl w:ilvl="7" w:tentative="1">
+      <w:start w:val="1"/>
+      <w:numFmt w:val="bullet"/>
+      <w:lvlText w:val=""/>
+      <w:lvlJc w:val="left"/>
+      <w:pPr>
+        <w:tabs>
+          <w:tab w:val="num" w:pos="5760"/>
+        </w:tabs>
+        <w:ind w:left="5760" w:hanging="360"/>
+      </w:pPr>
+      <w:rPr>
+        <w:rFonts w:ascii="Wingdings" w:hAnsi="Wingdings" w:hint="default"/>
+        <w:sz w:val="20"/>
+      </w:rPr>
+    </w:lvl>
+    <w:lvl w:ilvl="8" w:tentative="1">
+      <w:start w:val="1"/>
+      <w:numFmt w:val="bullet"/>
+      <w:lvlText w:val=""/>
+      <w:lvlJc w:val="left"/>
+      <w:pPr>
+        <w:tabs>
+          <w:tab w:val="num" w:pos="6480"/>
+        </w:tabs>
+        <w:ind w:left="6480" w:hanging="360"/>
+      </w:pPr>
+      <w:rPr>
+        <w:rFonts w:ascii="Wingdings" w:hAnsi="Wingdings" w:hint="default"/>
+        <w:sz w:val="20"/>
+      </w:rPr>
+    </w:lvl>
+  </w:abstractNum>
+  <w:abstractNum w:abstractNumId="19" w15:restartNumberingAfterBreak="0">
+    <w:nsid w:val="610C5543"/>
+    <w:multiLevelType w:val="multilevel"/>
+    <w:tmpl w:val="1C38F110"/>
+    <w:lvl w:ilvl="0">
+      <w:start w:val="1"/>
+      <w:numFmt w:val="bullet"/>
+      <w:lvlText w:val=""/>
+      <w:lvlJc w:val="left"/>
+      <w:pPr>
+        <w:tabs>
+          <w:tab w:val="num" w:pos="720"/>
+        </w:tabs>
+        <w:ind w:left="720" w:hanging="360"/>
+      </w:pPr>
+      <w:rPr>
+        <w:rFonts w:ascii="Symbol" w:hAnsi="Symbol" w:hint="default"/>
+        <w:sz w:val="20"/>
+      </w:rPr>
+    </w:lvl>
+    <w:lvl w:ilvl="1" w:tentative="1">
+      <w:start w:val="1"/>
+      <w:numFmt w:val="bullet"/>
+      <w:lvlText w:val="o"/>
+      <w:lvlJc w:val="left"/>
+      <w:pPr>
+        <w:tabs>
+          <w:tab w:val="num" w:pos="1440"/>
+        </w:tabs>
+        <w:ind w:left="1440" w:hanging="360"/>
+      </w:pPr>
+      <w:rPr>
+        <w:rFonts w:ascii="Courier New" w:hAnsi="Courier New" w:hint="default"/>
+        <w:sz w:val="20"/>
+      </w:rPr>
+    </w:lvl>
+    <w:lvl w:ilvl="2" w:tentative="1">
+      <w:start w:val="1"/>
+      <w:numFmt w:val="bullet"/>
+      <w:lvlText w:val=""/>
+      <w:lvlJc w:val="left"/>
+      <w:pPr>
+        <w:tabs>
+          <w:tab w:val="num" w:pos="2160"/>
+        </w:tabs>
+        <w:ind w:left="2160" w:hanging="360"/>
+      </w:pPr>
+      <w:rPr>
+        <w:rFonts w:ascii="Wingdings" w:hAnsi="Wingdings" w:hint="default"/>
+        <w:sz w:val="20"/>
+      </w:rPr>
+    </w:lvl>
+    <w:lvl w:ilvl="3" w:tentative="1">
+      <w:start w:val="1"/>
+      <w:numFmt w:val="bullet"/>
+      <w:lvlText w:val=""/>
+      <w:lvlJc w:val="left"/>
+      <w:pPr>
+        <w:tabs>
+          <w:tab w:val="num" w:pos="2880"/>
+        </w:tabs>
+        <w:ind w:left="2880" w:hanging="360"/>
+      </w:pPr>
+      <w:rPr>
+        <w:rFonts w:ascii="Wingdings" w:hAnsi="Wingdings" w:hint="default"/>
+        <w:sz w:val="20"/>
+      </w:rPr>
+    </w:lvl>
+    <w:lvl w:ilvl="4" w:tentative="1">
+      <w:start w:val="1"/>
+      <w:numFmt w:val="bullet"/>
+      <w:lvlText w:val=""/>
+      <w:lvlJc w:val="left"/>
+      <w:pPr>
+        <w:tabs>
+          <w:tab w:val="num" w:pos="3600"/>
+        </w:tabs>
+        <w:ind w:left="3600" w:hanging="360"/>
+      </w:pPr>
+      <w:rPr>
+        <w:rFonts w:ascii="Wingdings" w:hAnsi="Wingdings" w:hint="default"/>
+        <w:sz w:val="20"/>
+      </w:rPr>
+    </w:lvl>
+    <w:lvl w:ilvl="5" w:tentative="1">
+      <w:start w:val="1"/>
+      <w:numFmt w:val="bullet"/>
+      <w:lvlText w:val=""/>
+      <w:lvlJc w:val="left"/>
+      <w:pPr>
+        <w:tabs>
+          <w:tab w:val="num" w:pos="4320"/>
+        </w:tabs>
+        <w:ind w:left="4320" w:hanging="360"/>
+      </w:pPr>
+      <w:rPr>
+        <w:rFonts w:ascii="Wingdings" w:hAnsi="Wingdings" w:hint="default"/>
+        <w:sz w:val="20"/>
+      </w:rPr>
+    </w:lvl>
+    <w:lvl w:ilvl="6" w:tentative="1">
+      <w:start w:val="1"/>
+      <w:numFmt w:val="bullet"/>
+      <w:lvlText w:val=""/>
+      <w:lvlJc w:val="left"/>
+      <w:pPr>
+        <w:tabs>
+          <w:tab w:val="num" w:pos="5040"/>
+        </w:tabs>
+        <w:ind w:left="5040" w:hanging="360"/>
+      </w:pPr>
+      <w:rPr>
+        <w:rFonts w:ascii="Wingdings" w:hAnsi="Wingdings" w:hint="default"/>
+        <w:sz w:val="20"/>
+      </w:rPr>
+    </w:lvl>
+    <w:lvl w:ilvl="7" w:tentative="1">
+      <w:start w:val="1"/>
+      <w:numFmt w:val="bullet"/>
+      <w:lvlText w:val=""/>
+      <w:lvlJc w:val="left"/>
+      <w:pPr>
+        <w:tabs>
+          <w:tab w:val="num" w:pos="5760"/>
+        </w:tabs>
+        <w:ind w:left="5760" w:hanging="360"/>
+      </w:pPr>
+      <w:rPr>
+        <w:rFonts w:ascii="Wingdings" w:hAnsi="Wingdings" w:hint="default"/>
+        <w:sz w:val="20"/>
+      </w:rPr>
+    </w:lvl>
+    <w:lvl w:ilvl="8" w:tentative="1">
+      <w:start w:val="1"/>
+      <w:numFmt w:val="bullet"/>
+      <w:lvlText w:val=""/>
+      <w:lvlJc w:val="left"/>
+      <w:pPr>
+        <w:tabs>
+          <w:tab w:val="num" w:pos="6480"/>
+        </w:tabs>
+        <w:ind w:left="6480" w:hanging="360"/>
+      </w:pPr>
+      <w:rPr>
+        <w:rFonts w:ascii="Wingdings" w:hAnsi="Wingdings" w:hint="default"/>
+        <w:sz w:val="20"/>
+      </w:rPr>
+    </w:lvl>
+  </w:abstractNum>
+  <w:abstractNum w:abstractNumId="20" w15:restartNumberingAfterBreak="0">
+    <w:nsid w:val="667A1063"/>
+    <w:multiLevelType w:val="multilevel"/>
+    <w:tmpl w:val="9FFAD29A"/>
     <w:lvl w:ilvl="0">
       <w:start w:val="1"/>
       <w:numFmt w:val="decimal"/>
@@ -8757,10 +9438,159 @@
       </w:pPr>
     </w:lvl>
   </w:abstractNum>
-  <w:abstractNum w:abstractNumId="16" w15:restartNumberingAfterBreak="0">
-    <w:nsid w:val="609F1034"/>
+  <w:abstractNum w:abstractNumId="21" w15:restartNumberingAfterBreak="0">
+    <w:nsid w:val="68C35F01"/>
     <w:multiLevelType w:val="multilevel"/>
-    <w:tmpl w:val="7CB21ABA"/>
+    <w:tmpl w:val="0110126E"/>
+    <w:lvl w:ilvl="0">
+      <w:start w:val="1"/>
+      <w:numFmt w:val="bullet"/>
+      <w:lvlText w:val=""/>
+      <w:lvlJc w:val="left"/>
+      <w:pPr>
+        <w:tabs>
+          <w:tab w:val="num" w:pos="720"/>
+        </w:tabs>
+        <w:ind w:left="720" w:hanging="360"/>
+      </w:pPr>
+      <w:rPr>
+        <w:rFonts w:ascii="Symbol" w:hAnsi="Symbol" w:hint="default"/>
+        <w:sz w:val="20"/>
+      </w:rPr>
+    </w:lvl>
+    <w:lvl w:ilvl="1" w:tentative="1">
+      <w:start w:val="1"/>
+      <w:numFmt w:val="bullet"/>
+      <w:lvlText w:val="o"/>
+      <w:lvlJc w:val="left"/>
+      <w:pPr>
+        <w:tabs>
+          <w:tab w:val="num" w:pos="1440"/>
+        </w:tabs>
+        <w:ind w:left="1440" w:hanging="360"/>
+      </w:pPr>
+      <w:rPr>
+        <w:rFonts w:ascii="Courier New" w:hAnsi="Courier New" w:hint="default"/>
+        <w:sz w:val="20"/>
+      </w:rPr>
+    </w:lvl>
+    <w:lvl w:ilvl="2" w:tentative="1">
+      <w:start w:val="1"/>
+      <w:numFmt w:val="bullet"/>
+      <w:lvlText w:val=""/>
+      <w:lvlJc w:val="left"/>
+      <w:pPr>
+        <w:tabs>
+          <w:tab w:val="num" w:pos="2160"/>
+        </w:tabs>
+        <w:ind w:left="2160" w:hanging="360"/>
+      </w:pPr>
+      <w:rPr>
+        <w:rFonts w:ascii="Wingdings" w:hAnsi="Wingdings" w:hint="default"/>
+        <w:sz w:val="20"/>
+      </w:rPr>
+    </w:lvl>
+    <w:lvl w:ilvl="3" w:tentative="1">
+      <w:start w:val="1"/>
+      <w:numFmt w:val="bullet"/>
+      <w:lvlText w:val=""/>
+      <w:lvlJc w:val="left"/>
+      <w:pPr>
+        <w:tabs>
+          <w:tab w:val="num" w:pos="2880"/>
+        </w:tabs>
+        <w:ind w:left="2880" w:hanging="360"/>
+      </w:pPr>
+      <w:rPr>
+        <w:rFonts w:ascii="Wingdings" w:hAnsi="Wingdings" w:hint="default"/>
+        <w:sz w:val="20"/>
+      </w:rPr>
+    </w:lvl>
+    <w:lvl w:ilvl="4" w:tentative="1">
+      <w:start w:val="1"/>
+      <w:numFmt w:val="bullet"/>
+      <w:lvlText w:val=""/>
+      <w:lvlJc w:val="left"/>
+      <w:pPr>
+        <w:tabs>
+          <w:tab w:val="num" w:pos="3600"/>
+        </w:tabs>
+        <w:ind w:left="3600" w:hanging="360"/>
+      </w:pPr>
+      <w:rPr>
+        <w:rFonts w:ascii="Wingdings" w:hAnsi="Wingdings" w:hint="default"/>
+        <w:sz w:val="20"/>
+      </w:rPr>
+    </w:lvl>
+    <w:lvl w:ilvl="5" w:tentative="1">
+      <w:start w:val="1"/>
+      <w:numFmt w:val="bullet"/>
+      <w:lvlText w:val=""/>
+      <w:lvlJc w:val="left"/>
+      <w:pPr>
+        <w:tabs>
+          <w:tab w:val="num" w:pos="4320"/>
+        </w:tabs>
+        <w:ind w:left="4320" w:hanging="360"/>
+      </w:pPr>
+      <w:rPr>
+        <w:rFonts w:ascii="Wingdings" w:hAnsi="Wingdings" w:hint="default"/>
+        <w:sz w:val="20"/>
+      </w:rPr>
+    </w:lvl>
+    <w:lvl w:ilvl="6" w:tentative="1">
+      <w:start w:val="1"/>
+      <w:numFmt w:val="bullet"/>
+      <w:lvlText w:val=""/>
+      <w:lvlJc w:val="left"/>
+      <w:pPr>
+        <w:tabs>
+          <w:tab w:val="num" w:pos="5040"/>
+        </w:tabs>
+        <w:ind w:left="5040" w:hanging="360"/>
+      </w:pPr>
+      <w:rPr>
+        <w:rFonts w:ascii="Wingdings" w:hAnsi="Wingdings" w:hint="default"/>
+        <w:sz w:val="20"/>
+      </w:rPr>
+    </w:lvl>
+    <w:lvl w:ilvl="7" w:tentative="1">
+      <w:start w:val="1"/>
+      <w:numFmt w:val="bullet"/>
+      <w:lvlText w:val=""/>
+      <w:lvlJc w:val="left"/>
+      <w:pPr>
+        <w:tabs>
+          <w:tab w:val="num" w:pos="5760"/>
+        </w:tabs>
+        <w:ind w:left="5760" w:hanging="360"/>
+      </w:pPr>
+      <w:rPr>
+        <w:rFonts w:ascii="Wingdings" w:hAnsi="Wingdings" w:hint="default"/>
+        <w:sz w:val="20"/>
+      </w:rPr>
+    </w:lvl>
+    <w:lvl w:ilvl="8" w:tentative="1">
+      <w:start w:val="1"/>
+      <w:numFmt w:val="bullet"/>
+      <w:lvlText w:val=""/>
+      <w:lvlJc w:val="left"/>
+      <w:pPr>
+        <w:tabs>
+          <w:tab w:val="num" w:pos="6480"/>
+        </w:tabs>
+        <w:ind w:left="6480" w:hanging="360"/>
+      </w:pPr>
+      <w:rPr>
+        <w:rFonts w:ascii="Wingdings" w:hAnsi="Wingdings" w:hint="default"/>
+        <w:sz w:val="20"/>
+      </w:rPr>
+    </w:lvl>
+  </w:abstractNum>
+  <w:abstractNum w:abstractNumId="22" w15:restartNumberingAfterBreak="0">
+    <w:nsid w:val="69FB03EA"/>
+    <w:multiLevelType w:val="multilevel"/>
+    <w:tmpl w:val="AC4AFE90"/>
     <w:lvl w:ilvl="0">
       <w:start w:val="1"/>
       <w:numFmt w:val="decimal"/>
@@ -8874,10 +9704,10 @@
       </w:pPr>
     </w:lvl>
   </w:abstractNum>
-  <w:abstractNum w:abstractNumId="17" w15:restartNumberingAfterBreak="0">
-    <w:nsid w:val="69D72976"/>
+  <w:abstractNum w:abstractNumId="23" w15:restartNumberingAfterBreak="0">
+    <w:nsid w:val="763A5F07"/>
     <w:multiLevelType w:val="multilevel"/>
-    <w:tmpl w:val="89C822A8"/>
+    <w:tmpl w:val="C60AEC24"/>
     <w:lvl w:ilvl="0">
       <w:start w:val="1"/>
       <w:numFmt w:val="bullet"/>
@@ -9023,907 +9853,77 @@
       </w:rPr>
     </w:lvl>
   </w:abstractNum>
-  <w:abstractNum w:abstractNumId="18" w15:restartNumberingAfterBreak="0">
-    <w:nsid w:val="6B5A2429"/>
-    <w:multiLevelType w:val="multilevel"/>
-    <w:tmpl w:val="F5A0A986"/>
-    <w:lvl w:ilvl="0">
-      <w:start w:val="1"/>
-      <w:numFmt w:val="decimal"/>
-      <w:lvlText w:val="%1."/>
-      <w:lvlJc w:val="left"/>
-      <w:pPr>
-        <w:tabs>
-          <w:tab w:val="num" w:pos="720"/>
-        </w:tabs>
-        <w:ind w:left="720" w:hanging="360"/>
-      </w:pPr>
-    </w:lvl>
-    <w:lvl w:ilvl="1">
-      <w:start w:val="1"/>
-      <w:numFmt w:val="bullet"/>
-      <w:lvlText w:val="o"/>
-      <w:lvlJc w:val="left"/>
-      <w:pPr>
-        <w:tabs>
-          <w:tab w:val="num" w:pos="1440"/>
-        </w:tabs>
-        <w:ind w:left="1440" w:hanging="360"/>
-      </w:pPr>
-      <w:rPr>
-        <w:rFonts w:ascii="Courier New" w:hAnsi="Courier New" w:hint="default"/>
-        <w:sz w:val="20"/>
-      </w:rPr>
-    </w:lvl>
-    <w:lvl w:ilvl="2" w:tentative="1">
-      <w:start w:val="1"/>
-      <w:numFmt w:val="decimal"/>
-      <w:lvlText w:val="%3."/>
-      <w:lvlJc w:val="left"/>
-      <w:pPr>
-        <w:tabs>
-          <w:tab w:val="num" w:pos="2160"/>
-        </w:tabs>
-        <w:ind w:left="2160" w:hanging="360"/>
-      </w:pPr>
-    </w:lvl>
-    <w:lvl w:ilvl="3" w:tentative="1">
-      <w:start w:val="1"/>
-      <w:numFmt w:val="decimal"/>
-      <w:lvlText w:val="%4."/>
-      <w:lvlJc w:val="left"/>
-      <w:pPr>
-        <w:tabs>
-          <w:tab w:val="num" w:pos="2880"/>
-        </w:tabs>
-        <w:ind w:left="2880" w:hanging="360"/>
-      </w:pPr>
-    </w:lvl>
-    <w:lvl w:ilvl="4" w:tentative="1">
-      <w:start w:val="1"/>
-      <w:numFmt w:val="decimal"/>
-      <w:lvlText w:val="%5."/>
-      <w:lvlJc w:val="left"/>
-      <w:pPr>
-        <w:tabs>
-          <w:tab w:val="num" w:pos="3600"/>
-        </w:tabs>
-        <w:ind w:left="3600" w:hanging="360"/>
-      </w:pPr>
-    </w:lvl>
-    <w:lvl w:ilvl="5" w:tentative="1">
-      <w:start w:val="1"/>
-      <w:numFmt w:val="decimal"/>
-      <w:lvlText w:val="%6."/>
-      <w:lvlJc w:val="left"/>
-      <w:pPr>
-        <w:tabs>
-          <w:tab w:val="num" w:pos="4320"/>
-        </w:tabs>
-        <w:ind w:left="4320" w:hanging="360"/>
-      </w:pPr>
-    </w:lvl>
-    <w:lvl w:ilvl="6" w:tentative="1">
-      <w:start w:val="1"/>
-      <w:numFmt w:val="decimal"/>
-      <w:lvlText w:val="%7."/>
-      <w:lvlJc w:val="left"/>
-      <w:pPr>
-        <w:tabs>
-          <w:tab w:val="num" w:pos="5040"/>
-        </w:tabs>
-        <w:ind w:left="5040" w:hanging="360"/>
-      </w:pPr>
-    </w:lvl>
-    <w:lvl w:ilvl="7" w:tentative="1">
-      <w:start w:val="1"/>
-      <w:numFmt w:val="decimal"/>
-      <w:lvlText w:val="%8."/>
-      <w:lvlJc w:val="left"/>
-      <w:pPr>
-        <w:tabs>
-          <w:tab w:val="num" w:pos="5760"/>
-        </w:tabs>
-        <w:ind w:left="5760" w:hanging="360"/>
-      </w:pPr>
-    </w:lvl>
-    <w:lvl w:ilvl="8" w:tentative="1">
-      <w:start w:val="1"/>
-      <w:numFmt w:val="decimal"/>
-      <w:lvlText w:val="%9."/>
-      <w:lvlJc w:val="left"/>
-      <w:pPr>
-        <w:tabs>
-          <w:tab w:val="num" w:pos="6480"/>
-        </w:tabs>
-        <w:ind w:left="6480" w:hanging="360"/>
-      </w:pPr>
-    </w:lvl>
-  </w:abstractNum>
-  <w:abstractNum w:abstractNumId="19" w15:restartNumberingAfterBreak="0">
-    <w:nsid w:val="745F2D3E"/>
-    <w:multiLevelType w:val="multilevel"/>
-    <w:tmpl w:val="A2508580"/>
-    <w:lvl w:ilvl="0">
-      <w:start w:val="1"/>
-      <w:numFmt w:val="bullet"/>
-      <w:lvlText w:val=""/>
-      <w:lvlJc w:val="left"/>
-      <w:pPr>
-        <w:tabs>
-          <w:tab w:val="num" w:pos="720"/>
-        </w:tabs>
-        <w:ind w:left="720" w:hanging="360"/>
-      </w:pPr>
-      <w:rPr>
-        <w:rFonts w:ascii="Symbol" w:hAnsi="Symbol" w:hint="default"/>
-        <w:sz w:val="20"/>
-      </w:rPr>
-    </w:lvl>
-    <w:lvl w:ilvl="1" w:tentative="1">
-      <w:start w:val="1"/>
-      <w:numFmt w:val="bullet"/>
-      <w:lvlText w:val="o"/>
-      <w:lvlJc w:val="left"/>
-      <w:pPr>
-        <w:tabs>
-          <w:tab w:val="num" w:pos="1440"/>
-        </w:tabs>
-        <w:ind w:left="1440" w:hanging="360"/>
-      </w:pPr>
-      <w:rPr>
-        <w:rFonts w:ascii="Courier New" w:hAnsi="Courier New" w:hint="default"/>
-        <w:sz w:val="20"/>
-      </w:rPr>
-    </w:lvl>
-    <w:lvl w:ilvl="2" w:tentative="1">
-      <w:start w:val="1"/>
-      <w:numFmt w:val="bullet"/>
-      <w:lvlText w:val=""/>
-      <w:lvlJc w:val="left"/>
-      <w:pPr>
-        <w:tabs>
-          <w:tab w:val="num" w:pos="2160"/>
-        </w:tabs>
-        <w:ind w:left="2160" w:hanging="360"/>
-      </w:pPr>
-      <w:rPr>
-        <w:rFonts w:ascii="Wingdings" w:hAnsi="Wingdings" w:hint="default"/>
-        <w:sz w:val="20"/>
-      </w:rPr>
-    </w:lvl>
-    <w:lvl w:ilvl="3" w:tentative="1">
-      <w:start w:val="1"/>
-      <w:numFmt w:val="bullet"/>
-      <w:lvlText w:val=""/>
-      <w:lvlJc w:val="left"/>
-      <w:pPr>
-        <w:tabs>
-          <w:tab w:val="num" w:pos="2880"/>
-        </w:tabs>
-        <w:ind w:left="2880" w:hanging="360"/>
-      </w:pPr>
-      <w:rPr>
-        <w:rFonts w:ascii="Wingdings" w:hAnsi="Wingdings" w:hint="default"/>
-        <w:sz w:val="20"/>
-      </w:rPr>
-    </w:lvl>
-    <w:lvl w:ilvl="4" w:tentative="1">
-      <w:start w:val="1"/>
-      <w:numFmt w:val="bullet"/>
-      <w:lvlText w:val=""/>
-      <w:lvlJc w:val="left"/>
-      <w:pPr>
-        <w:tabs>
-          <w:tab w:val="num" w:pos="3600"/>
-        </w:tabs>
-        <w:ind w:left="3600" w:hanging="360"/>
-      </w:pPr>
-      <w:rPr>
-        <w:rFonts w:ascii="Wingdings" w:hAnsi="Wingdings" w:hint="default"/>
-        <w:sz w:val="20"/>
-      </w:rPr>
-    </w:lvl>
-    <w:lvl w:ilvl="5" w:tentative="1">
-      <w:start w:val="1"/>
-      <w:numFmt w:val="bullet"/>
-      <w:lvlText w:val=""/>
-      <w:lvlJc w:val="left"/>
-      <w:pPr>
-        <w:tabs>
-          <w:tab w:val="num" w:pos="4320"/>
-        </w:tabs>
-        <w:ind w:left="4320" w:hanging="360"/>
-      </w:pPr>
-      <w:rPr>
-        <w:rFonts w:ascii="Wingdings" w:hAnsi="Wingdings" w:hint="default"/>
-        <w:sz w:val="20"/>
-      </w:rPr>
-    </w:lvl>
-    <w:lvl w:ilvl="6" w:tentative="1">
-      <w:start w:val="1"/>
-      <w:numFmt w:val="bullet"/>
-      <w:lvlText w:val=""/>
-      <w:lvlJc w:val="left"/>
-      <w:pPr>
-        <w:tabs>
-          <w:tab w:val="num" w:pos="5040"/>
-        </w:tabs>
-        <w:ind w:left="5040" w:hanging="360"/>
-      </w:pPr>
-      <w:rPr>
-        <w:rFonts w:ascii="Wingdings" w:hAnsi="Wingdings" w:hint="default"/>
-        <w:sz w:val="20"/>
-      </w:rPr>
-    </w:lvl>
-    <w:lvl w:ilvl="7" w:tentative="1">
-      <w:start w:val="1"/>
-      <w:numFmt w:val="bullet"/>
-      <w:lvlText w:val=""/>
-      <w:lvlJc w:val="left"/>
-      <w:pPr>
-        <w:tabs>
-          <w:tab w:val="num" w:pos="5760"/>
-        </w:tabs>
-        <w:ind w:left="5760" w:hanging="360"/>
-      </w:pPr>
-      <w:rPr>
-        <w:rFonts w:ascii="Wingdings" w:hAnsi="Wingdings" w:hint="default"/>
-        <w:sz w:val="20"/>
-      </w:rPr>
-    </w:lvl>
-    <w:lvl w:ilvl="8" w:tentative="1">
-      <w:start w:val="1"/>
-      <w:numFmt w:val="bullet"/>
-      <w:lvlText w:val=""/>
-      <w:lvlJc w:val="left"/>
-      <w:pPr>
-        <w:tabs>
-          <w:tab w:val="num" w:pos="6480"/>
-        </w:tabs>
-        <w:ind w:left="6480" w:hanging="360"/>
-      </w:pPr>
-      <w:rPr>
-        <w:rFonts w:ascii="Wingdings" w:hAnsi="Wingdings" w:hint="default"/>
-        <w:sz w:val="20"/>
-      </w:rPr>
-    </w:lvl>
-  </w:abstractNum>
-  <w:abstractNum w:abstractNumId="20" w15:restartNumberingAfterBreak="0">
-    <w:nsid w:val="76364B8C"/>
-    <w:multiLevelType w:val="multilevel"/>
-    <w:tmpl w:val="02DAB2F0"/>
-    <w:lvl w:ilvl="0">
-      <w:start w:val="1"/>
-      <w:numFmt w:val="bullet"/>
-      <w:lvlText w:val=""/>
-      <w:lvlJc w:val="left"/>
-      <w:pPr>
-        <w:tabs>
-          <w:tab w:val="num" w:pos="720"/>
-        </w:tabs>
-        <w:ind w:left="720" w:hanging="360"/>
-      </w:pPr>
-      <w:rPr>
-        <w:rFonts w:ascii="Symbol" w:hAnsi="Symbol" w:hint="default"/>
-        <w:sz w:val="20"/>
-      </w:rPr>
-    </w:lvl>
-    <w:lvl w:ilvl="1" w:tentative="1">
-      <w:start w:val="1"/>
-      <w:numFmt w:val="bullet"/>
-      <w:lvlText w:val="o"/>
-      <w:lvlJc w:val="left"/>
-      <w:pPr>
-        <w:tabs>
-          <w:tab w:val="num" w:pos="1440"/>
-        </w:tabs>
-        <w:ind w:left="1440" w:hanging="360"/>
-      </w:pPr>
-      <w:rPr>
-        <w:rFonts w:ascii="Courier New" w:hAnsi="Courier New" w:hint="default"/>
-        <w:sz w:val="20"/>
-      </w:rPr>
-    </w:lvl>
-    <w:lvl w:ilvl="2" w:tentative="1">
-      <w:start w:val="1"/>
-      <w:numFmt w:val="bullet"/>
-      <w:lvlText w:val=""/>
-      <w:lvlJc w:val="left"/>
-      <w:pPr>
-        <w:tabs>
-          <w:tab w:val="num" w:pos="2160"/>
-        </w:tabs>
-        <w:ind w:left="2160" w:hanging="360"/>
-      </w:pPr>
-      <w:rPr>
-        <w:rFonts w:ascii="Wingdings" w:hAnsi="Wingdings" w:hint="default"/>
-        <w:sz w:val="20"/>
-      </w:rPr>
-    </w:lvl>
-    <w:lvl w:ilvl="3" w:tentative="1">
-      <w:start w:val="1"/>
-      <w:numFmt w:val="bullet"/>
-      <w:lvlText w:val=""/>
-      <w:lvlJc w:val="left"/>
-      <w:pPr>
-        <w:tabs>
-          <w:tab w:val="num" w:pos="2880"/>
-        </w:tabs>
-        <w:ind w:left="2880" w:hanging="360"/>
-      </w:pPr>
-      <w:rPr>
-        <w:rFonts w:ascii="Wingdings" w:hAnsi="Wingdings" w:hint="default"/>
-        <w:sz w:val="20"/>
-      </w:rPr>
-    </w:lvl>
-    <w:lvl w:ilvl="4" w:tentative="1">
-      <w:start w:val="1"/>
-      <w:numFmt w:val="bullet"/>
-      <w:lvlText w:val=""/>
-      <w:lvlJc w:val="left"/>
-      <w:pPr>
-        <w:tabs>
-          <w:tab w:val="num" w:pos="3600"/>
-        </w:tabs>
-        <w:ind w:left="3600" w:hanging="360"/>
-      </w:pPr>
-      <w:rPr>
-        <w:rFonts w:ascii="Wingdings" w:hAnsi="Wingdings" w:hint="default"/>
-        <w:sz w:val="20"/>
-      </w:rPr>
-    </w:lvl>
-    <w:lvl w:ilvl="5" w:tentative="1">
-      <w:start w:val="1"/>
-      <w:numFmt w:val="bullet"/>
-      <w:lvlText w:val=""/>
-      <w:lvlJc w:val="left"/>
-      <w:pPr>
-        <w:tabs>
-          <w:tab w:val="num" w:pos="4320"/>
-        </w:tabs>
-        <w:ind w:left="4320" w:hanging="360"/>
-      </w:pPr>
-      <w:rPr>
-        <w:rFonts w:ascii="Wingdings" w:hAnsi="Wingdings" w:hint="default"/>
-        <w:sz w:val="20"/>
-      </w:rPr>
-    </w:lvl>
-    <w:lvl w:ilvl="6" w:tentative="1">
-      <w:start w:val="1"/>
-      <w:numFmt w:val="bullet"/>
-      <w:lvlText w:val=""/>
-      <w:lvlJc w:val="left"/>
-      <w:pPr>
-        <w:tabs>
-          <w:tab w:val="num" w:pos="5040"/>
-        </w:tabs>
-        <w:ind w:left="5040" w:hanging="360"/>
-      </w:pPr>
-      <w:rPr>
-        <w:rFonts w:ascii="Wingdings" w:hAnsi="Wingdings" w:hint="default"/>
-        <w:sz w:val="20"/>
-      </w:rPr>
-    </w:lvl>
-    <w:lvl w:ilvl="7" w:tentative="1">
-      <w:start w:val="1"/>
-      <w:numFmt w:val="bullet"/>
-      <w:lvlText w:val=""/>
-      <w:lvlJc w:val="left"/>
-      <w:pPr>
-        <w:tabs>
-          <w:tab w:val="num" w:pos="5760"/>
-        </w:tabs>
-        <w:ind w:left="5760" w:hanging="360"/>
-      </w:pPr>
-      <w:rPr>
-        <w:rFonts w:ascii="Wingdings" w:hAnsi="Wingdings" w:hint="default"/>
-        <w:sz w:val="20"/>
-      </w:rPr>
-    </w:lvl>
-    <w:lvl w:ilvl="8" w:tentative="1">
-      <w:start w:val="1"/>
-      <w:numFmt w:val="bullet"/>
-      <w:lvlText w:val=""/>
-      <w:lvlJc w:val="left"/>
-      <w:pPr>
-        <w:tabs>
-          <w:tab w:val="num" w:pos="6480"/>
-        </w:tabs>
-        <w:ind w:left="6480" w:hanging="360"/>
-      </w:pPr>
-      <w:rPr>
-        <w:rFonts w:ascii="Wingdings" w:hAnsi="Wingdings" w:hint="default"/>
-        <w:sz w:val="20"/>
-      </w:rPr>
-    </w:lvl>
-  </w:abstractNum>
-  <w:abstractNum w:abstractNumId="21" w15:restartNumberingAfterBreak="0">
-    <w:nsid w:val="7791580C"/>
-    <w:multiLevelType w:val="multilevel"/>
-    <w:tmpl w:val="349ED9F6"/>
-    <w:lvl w:ilvl="0">
-      <w:start w:val="1"/>
-      <w:numFmt w:val="bullet"/>
-      <w:lvlText w:val=""/>
-      <w:lvlJc w:val="left"/>
-      <w:pPr>
-        <w:tabs>
-          <w:tab w:val="num" w:pos="720"/>
-        </w:tabs>
-        <w:ind w:left="720" w:hanging="360"/>
-      </w:pPr>
-      <w:rPr>
-        <w:rFonts w:ascii="Symbol" w:hAnsi="Symbol" w:hint="default"/>
-        <w:sz w:val="20"/>
-      </w:rPr>
-    </w:lvl>
-    <w:lvl w:ilvl="1" w:tentative="1">
-      <w:start w:val="1"/>
-      <w:numFmt w:val="bullet"/>
-      <w:lvlText w:val="o"/>
-      <w:lvlJc w:val="left"/>
-      <w:pPr>
-        <w:tabs>
-          <w:tab w:val="num" w:pos="1440"/>
-        </w:tabs>
-        <w:ind w:left="1440" w:hanging="360"/>
-      </w:pPr>
-      <w:rPr>
-        <w:rFonts w:ascii="Courier New" w:hAnsi="Courier New" w:hint="default"/>
-        <w:sz w:val="20"/>
-      </w:rPr>
-    </w:lvl>
-    <w:lvl w:ilvl="2" w:tentative="1">
-      <w:start w:val="1"/>
-      <w:numFmt w:val="bullet"/>
-      <w:lvlText w:val=""/>
-      <w:lvlJc w:val="left"/>
-      <w:pPr>
-        <w:tabs>
-          <w:tab w:val="num" w:pos="2160"/>
-        </w:tabs>
-        <w:ind w:left="2160" w:hanging="360"/>
-      </w:pPr>
-      <w:rPr>
-        <w:rFonts w:ascii="Wingdings" w:hAnsi="Wingdings" w:hint="default"/>
-        <w:sz w:val="20"/>
-      </w:rPr>
-    </w:lvl>
-    <w:lvl w:ilvl="3" w:tentative="1">
-      <w:start w:val="1"/>
-      <w:numFmt w:val="bullet"/>
-      <w:lvlText w:val=""/>
-      <w:lvlJc w:val="left"/>
-      <w:pPr>
-        <w:tabs>
-          <w:tab w:val="num" w:pos="2880"/>
-        </w:tabs>
-        <w:ind w:left="2880" w:hanging="360"/>
-      </w:pPr>
-      <w:rPr>
-        <w:rFonts w:ascii="Wingdings" w:hAnsi="Wingdings" w:hint="default"/>
-        <w:sz w:val="20"/>
-      </w:rPr>
-    </w:lvl>
-    <w:lvl w:ilvl="4" w:tentative="1">
-      <w:start w:val="1"/>
-      <w:numFmt w:val="bullet"/>
-      <w:lvlText w:val=""/>
-      <w:lvlJc w:val="left"/>
-      <w:pPr>
-        <w:tabs>
-          <w:tab w:val="num" w:pos="3600"/>
-        </w:tabs>
-        <w:ind w:left="3600" w:hanging="360"/>
-      </w:pPr>
-      <w:rPr>
-        <w:rFonts w:ascii="Wingdings" w:hAnsi="Wingdings" w:hint="default"/>
-        <w:sz w:val="20"/>
-      </w:rPr>
-    </w:lvl>
-    <w:lvl w:ilvl="5" w:tentative="1">
-      <w:start w:val="1"/>
-      <w:numFmt w:val="bullet"/>
-      <w:lvlText w:val=""/>
-      <w:lvlJc w:val="left"/>
-      <w:pPr>
-        <w:tabs>
-          <w:tab w:val="num" w:pos="4320"/>
-        </w:tabs>
-        <w:ind w:left="4320" w:hanging="360"/>
-      </w:pPr>
-      <w:rPr>
-        <w:rFonts w:ascii="Wingdings" w:hAnsi="Wingdings" w:hint="default"/>
-        <w:sz w:val="20"/>
-      </w:rPr>
-    </w:lvl>
-    <w:lvl w:ilvl="6" w:tentative="1">
-      <w:start w:val="1"/>
-      <w:numFmt w:val="bullet"/>
-      <w:lvlText w:val=""/>
-      <w:lvlJc w:val="left"/>
-      <w:pPr>
-        <w:tabs>
-          <w:tab w:val="num" w:pos="5040"/>
-        </w:tabs>
-        <w:ind w:left="5040" w:hanging="360"/>
-      </w:pPr>
-      <w:rPr>
-        <w:rFonts w:ascii="Wingdings" w:hAnsi="Wingdings" w:hint="default"/>
-        <w:sz w:val="20"/>
-      </w:rPr>
-    </w:lvl>
-    <w:lvl w:ilvl="7" w:tentative="1">
-      <w:start w:val="1"/>
-      <w:numFmt w:val="bullet"/>
-      <w:lvlText w:val=""/>
-      <w:lvlJc w:val="left"/>
-      <w:pPr>
-        <w:tabs>
-          <w:tab w:val="num" w:pos="5760"/>
-        </w:tabs>
-        <w:ind w:left="5760" w:hanging="360"/>
-      </w:pPr>
-      <w:rPr>
-        <w:rFonts w:ascii="Wingdings" w:hAnsi="Wingdings" w:hint="default"/>
-        <w:sz w:val="20"/>
-      </w:rPr>
-    </w:lvl>
-    <w:lvl w:ilvl="8" w:tentative="1">
-      <w:start w:val="1"/>
-      <w:numFmt w:val="bullet"/>
-      <w:lvlText w:val=""/>
-      <w:lvlJc w:val="left"/>
-      <w:pPr>
-        <w:tabs>
-          <w:tab w:val="num" w:pos="6480"/>
-        </w:tabs>
-        <w:ind w:left="6480" w:hanging="360"/>
-      </w:pPr>
-      <w:rPr>
-        <w:rFonts w:ascii="Wingdings" w:hAnsi="Wingdings" w:hint="default"/>
-        <w:sz w:val="20"/>
-      </w:rPr>
-    </w:lvl>
-  </w:abstractNum>
-  <w:abstractNum w:abstractNumId="22" w15:restartNumberingAfterBreak="0">
-    <w:nsid w:val="7A2651DF"/>
-    <w:multiLevelType w:val="multilevel"/>
-    <w:tmpl w:val="618C9B0E"/>
-    <w:lvl w:ilvl="0">
-      <w:start w:val="1"/>
-      <w:numFmt w:val="decimal"/>
-      <w:lvlText w:val="%1."/>
-      <w:lvlJc w:val="left"/>
-      <w:pPr>
-        <w:tabs>
-          <w:tab w:val="num" w:pos="720"/>
-        </w:tabs>
-        <w:ind w:left="720" w:hanging="360"/>
-      </w:pPr>
-    </w:lvl>
-    <w:lvl w:ilvl="1">
-      <w:start w:val="1"/>
-      <w:numFmt w:val="bullet"/>
-      <w:lvlText w:val="o"/>
-      <w:lvlJc w:val="left"/>
-      <w:pPr>
-        <w:tabs>
-          <w:tab w:val="num" w:pos="1440"/>
-        </w:tabs>
-        <w:ind w:left="1440" w:hanging="360"/>
-      </w:pPr>
-      <w:rPr>
-        <w:rFonts w:ascii="Courier New" w:hAnsi="Courier New" w:hint="default"/>
-        <w:sz w:val="20"/>
-      </w:rPr>
-    </w:lvl>
-    <w:lvl w:ilvl="2" w:tentative="1">
-      <w:start w:val="1"/>
-      <w:numFmt w:val="decimal"/>
-      <w:lvlText w:val="%3."/>
-      <w:lvlJc w:val="left"/>
-      <w:pPr>
-        <w:tabs>
-          <w:tab w:val="num" w:pos="2160"/>
-        </w:tabs>
-        <w:ind w:left="2160" w:hanging="360"/>
-      </w:pPr>
-    </w:lvl>
-    <w:lvl w:ilvl="3" w:tentative="1">
-      <w:start w:val="1"/>
-      <w:numFmt w:val="decimal"/>
-      <w:lvlText w:val="%4."/>
-      <w:lvlJc w:val="left"/>
-      <w:pPr>
-        <w:tabs>
-          <w:tab w:val="num" w:pos="2880"/>
-        </w:tabs>
-        <w:ind w:left="2880" w:hanging="360"/>
-      </w:pPr>
-    </w:lvl>
-    <w:lvl w:ilvl="4" w:tentative="1">
-      <w:start w:val="1"/>
-      <w:numFmt w:val="decimal"/>
-      <w:lvlText w:val="%5."/>
-      <w:lvlJc w:val="left"/>
-      <w:pPr>
-        <w:tabs>
-          <w:tab w:val="num" w:pos="3600"/>
-        </w:tabs>
-        <w:ind w:left="3600" w:hanging="360"/>
-      </w:pPr>
-    </w:lvl>
-    <w:lvl w:ilvl="5" w:tentative="1">
-      <w:start w:val="1"/>
-      <w:numFmt w:val="decimal"/>
-      <w:lvlText w:val="%6."/>
-      <w:lvlJc w:val="left"/>
-      <w:pPr>
-        <w:tabs>
-          <w:tab w:val="num" w:pos="4320"/>
-        </w:tabs>
-        <w:ind w:left="4320" w:hanging="360"/>
-      </w:pPr>
-    </w:lvl>
-    <w:lvl w:ilvl="6" w:tentative="1">
-      <w:start w:val="1"/>
-      <w:numFmt w:val="decimal"/>
-      <w:lvlText w:val="%7."/>
-      <w:lvlJc w:val="left"/>
-      <w:pPr>
-        <w:tabs>
-          <w:tab w:val="num" w:pos="5040"/>
-        </w:tabs>
-        <w:ind w:left="5040" w:hanging="360"/>
-      </w:pPr>
-    </w:lvl>
-    <w:lvl w:ilvl="7" w:tentative="1">
-      <w:start w:val="1"/>
-      <w:numFmt w:val="decimal"/>
-      <w:lvlText w:val="%8."/>
-      <w:lvlJc w:val="left"/>
-      <w:pPr>
-        <w:tabs>
-          <w:tab w:val="num" w:pos="5760"/>
-        </w:tabs>
-        <w:ind w:left="5760" w:hanging="360"/>
-      </w:pPr>
-    </w:lvl>
-    <w:lvl w:ilvl="8" w:tentative="1">
-      <w:start w:val="1"/>
-      <w:numFmt w:val="decimal"/>
-      <w:lvlText w:val="%9."/>
-      <w:lvlJc w:val="left"/>
-      <w:pPr>
-        <w:tabs>
-          <w:tab w:val="num" w:pos="6480"/>
-        </w:tabs>
-        <w:ind w:left="6480" w:hanging="360"/>
-      </w:pPr>
-    </w:lvl>
-  </w:abstractNum>
-  <w:abstractNum w:abstractNumId="23" w15:restartNumberingAfterBreak="0">
-    <w:nsid w:val="7CB9204D"/>
-    <w:multiLevelType w:val="multilevel"/>
-    <w:tmpl w:val="D6A8A346"/>
-    <w:lvl w:ilvl="0">
-      <w:start w:val="1"/>
-      <w:numFmt w:val="bullet"/>
-      <w:lvlText w:val=""/>
-      <w:lvlJc w:val="left"/>
-      <w:pPr>
-        <w:tabs>
-          <w:tab w:val="num" w:pos="720"/>
-        </w:tabs>
-        <w:ind w:left="720" w:hanging="360"/>
-      </w:pPr>
-      <w:rPr>
-        <w:rFonts w:ascii="Symbol" w:hAnsi="Symbol" w:hint="default"/>
-        <w:sz w:val="20"/>
-      </w:rPr>
-    </w:lvl>
-    <w:lvl w:ilvl="1" w:tentative="1">
-      <w:start w:val="1"/>
-      <w:numFmt w:val="bullet"/>
-      <w:lvlText w:val="o"/>
-      <w:lvlJc w:val="left"/>
-      <w:pPr>
-        <w:tabs>
-          <w:tab w:val="num" w:pos="1440"/>
-        </w:tabs>
-        <w:ind w:left="1440" w:hanging="360"/>
-      </w:pPr>
-      <w:rPr>
-        <w:rFonts w:ascii="Courier New" w:hAnsi="Courier New" w:hint="default"/>
-        <w:sz w:val="20"/>
-      </w:rPr>
-    </w:lvl>
-    <w:lvl w:ilvl="2" w:tentative="1">
-      <w:start w:val="1"/>
-      <w:numFmt w:val="bullet"/>
-      <w:lvlText w:val=""/>
-      <w:lvlJc w:val="left"/>
-      <w:pPr>
-        <w:tabs>
-          <w:tab w:val="num" w:pos="2160"/>
-        </w:tabs>
-        <w:ind w:left="2160" w:hanging="360"/>
-      </w:pPr>
-      <w:rPr>
-        <w:rFonts w:ascii="Wingdings" w:hAnsi="Wingdings" w:hint="default"/>
-        <w:sz w:val="20"/>
-      </w:rPr>
-    </w:lvl>
-    <w:lvl w:ilvl="3" w:tentative="1">
-      <w:start w:val="1"/>
-      <w:numFmt w:val="bullet"/>
-      <w:lvlText w:val=""/>
-      <w:lvlJc w:val="left"/>
-      <w:pPr>
-        <w:tabs>
-          <w:tab w:val="num" w:pos="2880"/>
-        </w:tabs>
-        <w:ind w:left="2880" w:hanging="360"/>
-      </w:pPr>
-      <w:rPr>
-        <w:rFonts w:ascii="Wingdings" w:hAnsi="Wingdings" w:hint="default"/>
-        <w:sz w:val="20"/>
-      </w:rPr>
-    </w:lvl>
-    <w:lvl w:ilvl="4" w:tentative="1">
-      <w:start w:val="1"/>
-      <w:numFmt w:val="bullet"/>
-      <w:lvlText w:val=""/>
-      <w:lvlJc w:val="left"/>
-      <w:pPr>
-        <w:tabs>
-          <w:tab w:val="num" w:pos="3600"/>
-        </w:tabs>
-        <w:ind w:left="3600" w:hanging="360"/>
-      </w:pPr>
-      <w:rPr>
-        <w:rFonts w:ascii="Wingdings" w:hAnsi="Wingdings" w:hint="default"/>
-        <w:sz w:val="20"/>
-      </w:rPr>
-    </w:lvl>
-    <w:lvl w:ilvl="5" w:tentative="1">
-      <w:start w:val="1"/>
-      <w:numFmt w:val="bullet"/>
-      <w:lvlText w:val=""/>
-      <w:lvlJc w:val="left"/>
-      <w:pPr>
-        <w:tabs>
-          <w:tab w:val="num" w:pos="4320"/>
-        </w:tabs>
-        <w:ind w:left="4320" w:hanging="360"/>
-      </w:pPr>
-      <w:rPr>
-        <w:rFonts w:ascii="Wingdings" w:hAnsi="Wingdings" w:hint="default"/>
-        <w:sz w:val="20"/>
-      </w:rPr>
-    </w:lvl>
-    <w:lvl w:ilvl="6" w:tentative="1">
-      <w:start w:val="1"/>
-      <w:numFmt w:val="bullet"/>
-      <w:lvlText w:val=""/>
-      <w:lvlJc w:val="left"/>
-      <w:pPr>
-        <w:tabs>
-          <w:tab w:val="num" w:pos="5040"/>
-        </w:tabs>
-        <w:ind w:left="5040" w:hanging="360"/>
-      </w:pPr>
-      <w:rPr>
-        <w:rFonts w:ascii="Wingdings" w:hAnsi="Wingdings" w:hint="default"/>
-        <w:sz w:val="20"/>
-      </w:rPr>
-    </w:lvl>
-    <w:lvl w:ilvl="7" w:tentative="1">
-      <w:start w:val="1"/>
-      <w:numFmt w:val="bullet"/>
-      <w:lvlText w:val=""/>
-      <w:lvlJc w:val="left"/>
-      <w:pPr>
-        <w:tabs>
-          <w:tab w:val="num" w:pos="5760"/>
-        </w:tabs>
-        <w:ind w:left="5760" w:hanging="360"/>
-      </w:pPr>
-      <w:rPr>
-        <w:rFonts w:ascii="Wingdings" w:hAnsi="Wingdings" w:hint="default"/>
-        <w:sz w:val="20"/>
-      </w:rPr>
-    </w:lvl>
-    <w:lvl w:ilvl="8" w:tentative="1">
-      <w:start w:val="1"/>
-      <w:numFmt w:val="bullet"/>
-      <w:lvlText w:val=""/>
-      <w:lvlJc w:val="left"/>
-      <w:pPr>
-        <w:tabs>
-          <w:tab w:val="num" w:pos="6480"/>
-        </w:tabs>
-        <w:ind w:left="6480" w:hanging="360"/>
-      </w:pPr>
-      <w:rPr>
-        <w:rFonts w:ascii="Wingdings" w:hAnsi="Wingdings" w:hint="default"/>
-        <w:sz w:val="20"/>
-      </w:rPr>
-    </w:lvl>
-  </w:abstractNum>
-  <w:num w:numId="1" w16cid:durableId="1150706291">
+  <w:num w:numId="1" w16cid:durableId="1142040967">
+    <w:abstractNumId w:val="19"/>
+  </w:num>
+  <w:num w:numId="2" w16cid:durableId="2127574743">
+    <w:abstractNumId w:val="15"/>
+  </w:num>
+  <w:num w:numId="3" w16cid:durableId="541751673">
+    <w:abstractNumId w:val="5"/>
+  </w:num>
+  <w:num w:numId="4" w16cid:durableId="726488050">
+    <w:abstractNumId w:val="21"/>
+  </w:num>
+  <w:num w:numId="5" w16cid:durableId="147064838">
+    <w:abstractNumId w:val="4"/>
+  </w:num>
+  <w:num w:numId="6" w16cid:durableId="1523931280">
+    <w:abstractNumId w:val="23"/>
+  </w:num>
+  <w:num w:numId="7" w16cid:durableId="1535919478">
+    <w:abstractNumId w:val="11"/>
+  </w:num>
+  <w:num w:numId="8" w16cid:durableId="742721870">
+    <w:abstractNumId w:val="1"/>
+  </w:num>
+  <w:num w:numId="9" w16cid:durableId="1116290684">
+    <w:abstractNumId w:val="2"/>
+  </w:num>
+  <w:num w:numId="10" w16cid:durableId="1903367524">
+    <w:abstractNumId w:val="20"/>
+  </w:num>
+  <w:num w:numId="11" w16cid:durableId="1903296726">
+    <w:abstractNumId w:val="18"/>
+  </w:num>
+  <w:num w:numId="12" w16cid:durableId="641809844">
+    <w:abstractNumId w:val="14"/>
+  </w:num>
+  <w:num w:numId="13" w16cid:durableId="2045672775">
+    <w:abstractNumId w:val="17"/>
+  </w:num>
+  <w:num w:numId="14" w16cid:durableId="1441757347">
+    <w:abstractNumId w:val="13"/>
+  </w:num>
+  <w:num w:numId="15" w16cid:durableId="1954165444">
+    <w:abstractNumId w:val="9"/>
+  </w:num>
+  <w:num w:numId="16" w16cid:durableId="665280382">
+    <w:abstractNumId w:val="12"/>
+  </w:num>
+  <w:num w:numId="17" w16cid:durableId="1044522080">
+    <w:abstractNumId w:val="3"/>
+  </w:num>
+  <w:num w:numId="18" w16cid:durableId="1947734775">
+    <w:abstractNumId w:val="6"/>
+  </w:num>
+  <w:num w:numId="19" w16cid:durableId="1443258147">
+    <w:abstractNumId w:val="8"/>
+  </w:num>
+  <w:num w:numId="20" w16cid:durableId="1163814860">
     <w:abstractNumId w:val="0"/>
   </w:num>
-  <w:num w:numId="2" w16cid:durableId="358745784">
-    <w:abstractNumId w:val="5"/>
-  </w:num>
-  <w:num w:numId="3" w16cid:durableId="2018344397">
-    <w:abstractNumId w:val="22"/>
-  </w:num>
-  <w:num w:numId="4" w16cid:durableId="833569733">
-    <w:abstractNumId w:val="23"/>
-  </w:num>
-  <w:num w:numId="5" w16cid:durableId="1687487282">
-    <w:abstractNumId w:val="2"/>
-  </w:num>
-  <w:num w:numId="6" w16cid:durableId="211039289">
-    <w:abstractNumId w:val="12"/>
-  </w:num>
-  <w:num w:numId="7" w16cid:durableId="1161700690">
-    <w:abstractNumId w:val="6"/>
-  </w:num>
-  <w:num w:numId="8" w16cid:durableId="858083140">
-    <w:abstractNumId w:val="21"/>
-  </w:num>
-  <w:num w:numId="9" w16cid:durableId="1508858891">
-    <w:abstractNumId w:val="3"/>
-  </w:num>
-  <w:num w:numId="10" w16cid:durableId="831411530">
-    <w:abstractNumId w:val="15"/>
-  </w:num>
-  <w:num w:numId="11" w16cid:durableId="595099224">
-    <w:abstractNumId w:val="11"/>
-  </w:num>
-  <w:num w:numId="12" w16cid:durableId="1863274480">
-    <w:abstractNumId w:val="9"/>
-  </w:num>
-  <w:num w:numId="13" w16cid:durableId="391081910">
-    <w:abstractNumId w:val="20"/>
-  </w:num>
-  <w:num w:numId="14" w16cid:durableId="1400012093">
+  <w:num w:numId="21" w16cid:durableId="1181972989">
     <w:abstractNumId w:val="16"/>
   </w:num>
-  <w:num w:numId="15" w16cid:durableId="56393134">
-    <w:abstractNumId w:val="17"/>
-  </w:num>
-  <w:num w:numId="16" w16cid:durableId="568811694">
-    <w:abstractNumId w:val="8"/>
-  </w:num>
-  <w:num w:numId="17" w16cid:durableId="1197693042">
+  <w:num w:numId="22" w16cid:durableId="1848209210">
     <w:abstractNumId w:val="7"/>
   </w:num>
-  <w:num w:numId="18" w16cid:durableId="1718697452">
-    <w:abstractNumId w:val="14"/>
-  </w:num>
-  <w:num w:numId="19" w16cid:durableId="1896693000">
+  <w:num w:numId="23" w16cid:durableId="1764495479">
     <w:abstractNumId w:val="10"/>
   </w:num>
-  <w:num w:numId="20" w16cid:durableId="346643704">
-    <w:abstractNumId w:val="4"/>
-  </w:num>
-  <w:num w:numId="21" w16cid:durableId="133640560">
-    <w:abstractNumId w:val="18"/>
-  </w:num>
-  <w:num w:numId="22" w16cid:durableId="773289777">
-    <w:abstractNumId w:val="13"/>
-  </w:num>
-  <w:num w:numId="23" w16cid:durableId="2067801413">
-    <w:abstractNumId w:val="19"/>
-  </w:num>
-  <w:num w:numId="24" w16cid:durableId="1243687009">
-    <w:abstractNumId w:val="1"/>
+  <w:num w:numId="24" w16cid:durableId="1147631898">
+    <w:abstractNumId w:val="22"/>
   </w:num>
 </w:numbering>
 </file>

</xml_diff>

<commit_message>
deck: Meet IIC slide, voyage legs on every slide, intro as poster and link
</commit_message>
<xml_diff>
--- a/follow-along/Azure_Local_Follow_Along_Guide.docx
+++ b/follow-along/Azure_Local_Follow_Along_Guide.docx
@@ -6566,13 +6566,13 @@
 <file path=word/numbering.xml><?xml version="1.0" encoding="utf-8"?>
 <w:numbering xmlns:wpc="http://schemas.microsoft.com/office/word/2010/wordprocessingCanvas" xmlns:cx="http://schemas.microsoft.com/office/drawing/2014/chartex" xmlns:cx1="http://schemas.microsoft.com/office/drawing/2015/9/8/chartex" xmlns:cx2="http://schemas.microsoft.com/office/drawing/2015/10/21/chartex" xmlns:cx3="http://schemas.microsoft.com/office/drawing/2016/5/9/chartex" xmlns:cx4="http://schemas.microsoft.com/office/drawing/2016/5/10/chartex" xmlns:cx5="http://schemas.microsoft.com/office/drawing/2016/5/11/chartex" xmlns:cx6="http://schemas.microsoft.com/office/drawing/2016/5/12/chartex" xmlns:cx7="http://schemas.microsoft.com/office/drawing/2016/5/13/chartex" xmlns:cx8="http://schemas.microsoft.com/office/drawing/2016/5/14/chartex" xmlns:mc="http://schemas.openxmlformats.org/markup-compatibility/2006" xmlns:aink="http://schemas.microsoft.com/office/drawing/2016/ink" xmlns:am3d="http://schemas.microsoft.com/office/drawing/2017/model3d" xmlns:o="urn:schemas-microsoft-com:office:office" xmlns:oel="http://schemas.microsoft.com/office/2019/extlst" xmlns:r="http://schemas.openxmlformats.org/officeDocument/2006/relationships" xmlns:m="http://schemas.openxmlformats.org/officeDocument/2006/math" xmlns:v="urn:schemas-microsoft-com:vml" xmlns:wp14="http://schemas.microsoft.com/office/word/2010/wordprocessingDrawing" xmlns:wp="http://schemas.openxmlformats.org/drawingml/2006/wordprocessingDrawing" xmlns:w10="urn:schemas-microsoft-com:office:word" xmlns:w="http://schemas.openxmlformats.org/wordprocessingml/2006/main" xmlns:w14="http://schemas.microsoft.com/office/word/2010/wordml" xmlns:w15="http://schemas.microsoft.com/office/word/2012/wordml" xmlns:w16cex="http://schemas.microsoft.com/office/word/2018/wordml/cex" xmlns:w16cid="http://schemas.microsoft.com/office/word/2016/wordml/cid" xmlns:w16="http://schemas.microsoft.com/office/word/2018/wordml" xmlns:w16du="http://schemas.microsoft.com/office/word/2023/wordml/word16du" xmlns:w16sdtdh="http://schemas.microsoft.com/office/word/2020/wordml/sdtdatahash" xmlns:w16sdtfl="http://schemas.microsoft.com/office/word/2024/wordml/sdtformatlock" xmlns:w16se="http://schemas.microsoft.com/office/word/2015/wordml/symex" xmlns:wpg="http://schemas.microsoft.com/office/word/2010/wordprocessingGroup" xmlns:wpi="http://schemas.microsoft.com/office/word/2010/wordprocessingInk" xmlns:wne="http://schemas.microsoft.com/office/word/2006/wordml" xmlns:wps="http://schemas.microsoft.com/office/word/2010/wordprocessingShape" mc:Ignorable="w14 w15 w16se w16cid w16 w16cex w16sdtdh w16sdtfl w16du wp14">
   <w:abstractNum w:abstractNumId="0" w15:restartNumberingAfterBreak="0">
-    <w:nsid w:val="0CEC722F"/>
+    <w:nsid w:val="00130E6D"/>
     <w:multiLevelType w:val="multilevel"/>
-    <w:tmpl w:val="743EE854"/>
+    <w:tmpl w:val="5448B00A"/>
     <w:lvl w:ilvl="0">
       <w:start w:val="1"/>
-      <w:numFmt w:val="bullet"/>
-      <w:lvlText w:val=""/>
+      <w:numFmt w:val="decimal"/>
+      <w:lvlText w:val="%1."/>
       <w:lvlJc w:val="left"/>
       <w:pPr>
         <w:tabs>
@@ -6580,12 +6580,8 @@
         </w:tabs>
         <w:ind w:left="720" w:hanging="360"/>
       </w:pPr>
-      <w:rPr>
-        <w:rFonts w:ascii="Symbol" w:hAnsi="Symbol" w:hint="default"/>
-        <w:sz w:val="20"/>
-      </w:rPr>
-    </w:lvl>
-    <w:lvl w:ilvl="1" w:tentative="1">
+    </w:lvl>
+    <w:lvl w:ilvl="1">
       <w:start w:val="1"/>
       <w:numFmt w:val="bullet"/>
       <w:lvlText w:val="o"/>
@@ -6603,8 +6599,8 @@
     </w:lvl>
     <w:lvl w:ilvl="2" w:tentative="1">
       <w:start w:val="1"/>
-      <w:numFmt w:val="bullet"/>
-      <w:lvlText w:val=""/>
+      <w:numFmt w:val="decimal"/>
+      <w:lvlText w:val="%3."/>
       <w:lvlJc w:val="left"/>
       <w:pPr>
         <w:tabs>
@@ -6612,15 +6608,11 @@
         </w:tabs>
         <w:ind w:left="2160" w:hanging="360"/>
       </w:pPr>
-      <w:rPr>
-        <w:rFonts w:ascii="Wingdings" w:hAnsi="Wingdings" w:hint="default"/>
-        <w:sz w:val="20"/>
-      </w:rPr>
     </w:lvl>
     <w:lvl w:ilvl="3" w:tentative="1">
       <w:start w:val="1"/>
-      <w:numFmt w:val="bullet"/>
-      <w:lvlText w:val=""/>
+      <w:numFmt w:val="decimal"/>
+      <w:lvlText w:val="%4."/>
       <w:lvlJc w:val="left"/>
       <w:pPr>
         <w:tabs>
@@ -6628,15 +6620,11 @@
         </w:tabs>
         <w:ind w:left="2880" w:hanging="360"/>
       </w:pPr>
-      <w:rPr>
-        <w:rFonts w:ascii="Wingdings" w:hAnsi="Wingdings" w:hint="default"/>
-        <w:sz w:val="20"/>
-      </w:rPr>
     </w:lvl>
     <w:lvl w:ilvl="4" w:tentative="1">
       <w:start w:val="1"/>
-      <w:numFmt w:val="bullet"/>
-      <w:lvlText w:val=""/>
+      <w:numFmt w:val="decimal"/>
+      <w:lvlText w:val="%5."/>
       <w:lvlJc w:val="left"/>
       <w:pPr>
         <w:tabs>
@@ -6644,15 +6632,11 @@
         </w:tabs>
         <w:ind w:left="3600" w:hanging="360"/>
       </w:pPr>
-      <w:rPr>
-        <w:rFonts w:ascii="Wingdings" w:hAnsi="Wingdings" w:hint="default"/>
-        <w:sz w:val="20"/>
-      </w:rPr>
     </w:lvl>
     <w:lvl w:ilvl="5" w:tentative="1">
       <w:start w:val="1"/>
-      <w:numFmt w:val="bullet"/>
-      <w:lvlText w:val=""/>
+      <w:numFmt w:val="decimal"/>
+      <w:lvlText w:val="%6."/>
       <w:lvlJc w:val="left"/>
       <w:pPr>
         <w:tabs>
@@ -6660,15 +6644,11 @@
         </w:tabs>
         <w:ind w:left="4320" w:hanging="360"/>
       </w:pPr>
-      <w:rPr>
-        <w:rFonts w:ascii="Wingdings" w:hAnsi="Wingdings" w:hint="default"/>
-        <w:sz w:val="20"/>
-      </w:rPr>
     </w:lvl>
     <w:lvl w:ilvl="6" w:tentative="1">
       <w:start w:val="1"/>
-      <w:numFmt w:val="bullet"/>
-      <w:lvlText w:val=""/>
+      <w:numFmt w:val="decimal"/>
+      <w:lvlText w:val="%7."/>
       <w:lvlJc w:val="left"/>
       <w:pPr>
         <w:tabs>
@@ -6676,15 +6656,11 @@
         </w:tabs>
         <w:ind w:left="5040" w:hanging="360"/>
       </w:pPr>
-      <w:rPr>
-        <w:rFonts w:ascii="Wingdings" w:hAnsi="Wingdings" w:hint="default"/>
-        <w:sz w:val="20"/>
-      </w:rPr>
     </w:lvl>
     <w:lvl w:ilvl="7" w:tentative="1">
       <w:start w:val="1"/>
-      <w:numFmt w:val="bullet"/>
-      <w:lvlText w:val=""/>
+      <w:numFmt w:val="decimal"/>
+      <w:lvlText w:val="%8."/>
       <w:lvlJc w:val="left"/>
       <w:pPr>
         <w:tabs>
@@ -6692,15 +6668,11 @@
         </w:tabs>
         <w:ind w:left="5760" w:hanging="360"/>
       </w:pPr>
-      <w:rPr>
-        <w:rFonts w:ascii="Wingdings" w:hAnsi="Wingdings" w:hint="default"/>
-        <w:sz w:val="20"/>
-      </w:rPr>
     </w:lvl>
     <w:lvl w:ilvl="8" w:tentative="1">
       <w:start w:val="1"/>
-      <w:numFmt w:val="bullet"/>
-      <w:lvlText w:val=""/>
+      <w:numFmt w:val="decimal"/>
+      <w:lvlText w:val="%9."/>
       <w:lvlJc w:val="left"/>
       <w:pPr>
         <w:tabs>
@@ -6708,20 +6680,16 @@
         </w:tabs>
         <w:ind w:left="6480" w:hanging="360"/>
       </w:pPr>
-      <w:rPr>
-        <w:rFonts w:ascii="Wingdings" w:hAnsi="Wingdings" w:hint="default"/>
-        <w:sz w:val="20"/>
-      </w:rPr>
     </w:lvl>
   </w:abstractNum>
   <w:abstractNum w:abstractNumId="1" w15:restartNumberingAfterBreak="0">
-    <w:nsid w:val="103565C0"/>
+    <w:nsid w:val="05873D33"/>
     <w:multiLevelType w:val="multilevel"/>
-    <w:tmpl w:val="9956FBA4"/>
+    <w:tmpl w:val="3CFA8E64"/>
     <w:lvl w:ilvl="0">
       <w:start w:val="1"/>
-      <w:numFmt w:val="bullet"/>
-      <w:lvlText w:val=""/>
+      <w:numFmt w:val="decimal"/>
+      <w:lvlText w:val="%1."/>
       <w:lvlJc w:val="left"/>
       <w:pPr>
         <w:tabs>
@@ -6729,12 +6697,8 @@
         </w:tabs>
         <w:ind w:left="720" w:hanging="360"/>
       </w:pPr>
-      <w:rPr>
-        <w:rFonts w:ascii="Symbol" w:hAnsi="Symbol" w:hint="default"/>
-        <w:sz w:val="20"/>
-      </w:rPr>
-    </w:lvl>
-    <w:lvl w:ilvl="1" w:tentative="1">
+    </w:lvl>
+    <w:lvl w:ilvl="1">
       <w:start w:val="1"/>
       <w:numFmt w:val="bullet"/>
       <w:lvlText w:val="o"/>
@@ -6752,8 +6716,8 @@
     </w:lvl>
     <w:lvl w:ilvl="2" w:tentative="1">
       <w:start w:val="1"/>
-      <w:numFmt w:val="bullet"/>
-      <w:lvlText w:val=""/>
+      <w:numFmt w:val="decimal"/>
+      <w:lvlText w:val="%3."/>
       <w:lvlJc w:val="left"/>
       <w:pPr>
         <w:tabs>
@@ -6761,15 +6725,11 @@
         </w:tabs>
         <w:ind w:left="2160" w:hanging="360"/>
       </w:pPr>
-      <w:rPr>
-        <w:rFonts w:ascii="Wingdings" w:hAnsi="Wingdings" w:hint="default"/>
-        <w:sz w:val="20"/>
-      </w:rPr>
     </w:lvl>
     <w:lvl w:ilvl="3" w:tentative="1">
       <w:start w:val="1"/>
-      <w:numFmt w:val="bullet"/>
-      <w:lvlText w:val=""/>
+      <w:numFmt w:val="decimal"/>
+      <w:lvlText w:val="%4."/>
       <w:lvlJc w:val="left"/>
       <w:pPr>
         <w:tabs>
@@ -6777,15 +6737,11 @@
         </w:tabs>
         <w:ind w:left="2880" w:hanging="360"/>
       </w:pPr>
-      <w:rPr>
-        <w:rFonts w:ascii="Wingdings" w:hAnsi="Wingdings" w:hint="default"/>
-        <w:sz w:val="20"/>
-      </w:rPr>
     </w:lvl>
     <w:lvl w:ilvl="4" w:tentative="1">
       <w:start w:val="1"/>
-      <w:numFmt w:val="bullet"/>
-      <w:lvlText w:val=""/>
+      <w:numFmt w:val="decimal"/>
+      <w:lvlText w:val="%5."/>
       <w:lvlJc w:val="left"/>
       <w:pPr>
         <w:tabs>
@@ -6793,15 +6749,11 @@
         </w:tabs>
         <w:ind w:left="3600" w:hanging="360"/>
       </w:pPr>
-      <w:rPr>
-        <w:rFonts w:ascii="Wingdings" w:hAnsi="Wingdings" w:hint="default"/>
-        <w:sz w:val="20"/>
-      </w:rPr>
     </w:lvl>
     <w:lvl w:ilvl="5" w:tentative="1">
       <w:start w:val="1"/>
-      <w:numFmt w:val="bullet"/>
-      <w:lvlText w:val=""/>
+      <w:numFmt w:val="decimal"/>
+      <w:lvlText w:val="%6."/>
       <w:lvlJc w:val="left"/>
       <w:pPr>
         <w:tabs>
@@ -6809,15 +6761,11 @@
         </w:tabs>
         <w:ind w:left="4320" w:hanging="360"/>
       </w:pPr>
-      <w:rPr>
-        <w:rFonts w:ascii="Wingdings" w:hAnsi="Wingdings" w:hint="default"/>
-        <w:sz w:val="20"/>
-      </w:rPr>
     </w:lvl>
     <w:lvl w:ilvl="6" w:tentative="1">
       <w:start w:val="1"/>
-      <w:numFmt w:val="bullet"/>
-      <w:lvlText w:val=""/>
+      <w:numFmt w:val="decimal"/>
+      <w:lvlText w:val="%7."/>
       <w:lvlJc w:val="left"/>
       <w:pPr>
         <w:tabs>
@@ -6825,15 +6773,11 @@
         </w:tabs>
         <w:ind w:left="5040" w:hanging="360"/>
       </w:pPr>
-      <w:rPr>
-        <w:rFonts w:ascii="Wingdings" w:hAnsi="Wingdings" w:hint="default"/>
-        <w:sz w:val="20"/>
-      </w:rPr>
     </w:lvl>
     <w:lvl w:ilvl="7" w:tentative="1">
       <w:start w:val="1"/>
-      <w:numFmt w:val="bullet"/>
-      <w:lvlText w:val=""/>
+      <w:numFmt w:val="decimal"/>
+      <w:lvlText w:val="%8."/>
       <w:lvlJc w:val="left"/>
       <w:pPr>
         <w:tabs>
@@ -6841,15 +6785,11 @@
         </w:tabs>
         <w:ind w:left="5760" w:hanging="360"/>
       </w:pPr>
-      <w:rPr>
-        <w:rFonts w:ascii="Wingdings" w:hAnsi="Wingdings" w:hint="default"/>
-        <w:sz w:val="20"/>
-      </w:rPr>
     </w:lvl>
     <w:lvl w:ilvl="8" w:tentative="1">
       <w:start w:val="1"/>
-      <w:numFmt w:val="bullet"/>
-      <w:lvlText w:val=""/>
+      <w:numFmt w:val="decimal"/>
+      <w:lvlText w:val="%9."/>
       <w:lvlJc w:val="left"/>
       <w:pPr>
         <w:tabs>
@@ -6857,16 +6797,12 @@
         </w:tabs>
         <w:ind w:left="6480" w:hanging="360"/>
       </w:pPr>
-      <w:rPr>
-        <w:rFonts w:ascii="Wingdings" w:hAnsi="Wingdings" w:hint="default"/>
-        <w:sz w:val="20"/>
-      </w:rPr>
     </w:lvl>
   </w:abstractNum>
   <w:abstractNum w:abstractNumId="2" w15:restartNumberingAfterBreak="0">
-    <w:nsid w:val="1BF96729"/>
+    <w:nsid w:val="0B4B5B71"/>
     <w:multiLevelType w:val="multilevel"/>
-    <w:tmpl w:val="9CFCEB88"/>
+    <w:tmpl w:val="A30EE962"/>
     <w:lvl w:ilvl="0">
       <w:start w:val="1"/>
       <w:numFmt w:val="bullet"/>
@@ -7013,9 +6949,9 @@
     </w:lvl>
   </w:abstractNum>
   <w:abstractNum w:abstractNumId="3" w15:restartNumberingAfterBreak="0">
-    <w:nsid w:val="1FFF2917"/>
+    <w:nsid w:val="0F056E9A"/>
     <w:multiLevelType w:val="multilevel"/>
-    <w:tmpl w:val="0CE61060"/>
+    <w:tmpl w:val="9410BE54"/>
     <w:lvl w:ilvl="0">
       <w:start w:val="1"/>
       <w:numFmt w:val="decimal"/>
@@ -7130,9 +7066,9 @@
     </w:lvl>
   </w:abstractNum>
   <w:abstractNum w:abstractNumId="4" w15:restartNumberingAfterBreak="0">
-    <w:nsid w:val="26F70141"/>
+    <w:nsid w:val="0FDB7E0D"/>
     <w:multiLevelType w:val="multilevel"/>
-    <w:tmpl w:val="8B98E19E"/>
+    <w:tmpl w:val="F7AAE7D2"/>
     <w:lvl w:ilvl="0">
       <w:start w:val="1"/>
       <w:numFmt w:val="bullet"/>
@@ -7279,9 +7215,605 @@
     </w:lvl>
   </w:abstractNum>
   <w:abstractNum w:abstractNumId="5" w15:restartNumberingAfterBreak="0">
-    <w:nsid w:val="26FE1D0F"/>
+    <w:nsid w:val="11F51F9E"/>
     <w:multiLevelType w:val="multilevel"/>
-    <w:tmpl w:val="F4142B58"/>
+    <w:tmpl w:val="42FAFB40"/>
+    <w:lvl w:ilvl="0">
+      <w:start w:val="1"/>
+      <w:numFmt w:val="bullet"/>
+      <w:lvlText w:val=""/>
+      <w:lvlJc w:val="left"/>
+      <w:pPr>
+        <w:tabs>
+          <w:tab w:val="num" w:pos="720"/>
+        </w:tabs>
+        <w:ind w:left="720" w:hanging="360"/>
+      </w:pPr>
+      <w:rPr>
+        <w:rFonts w:ascii="Symbol" w:hAnsi="Symbol" w:hint="default"/>
+        <w:sz w:val="20"/>
+      </w:rPr>
+    </w:lvl>
+    <w:lvl w:ilvl="1" w:tentative="1">
+      <w:start w:val="1"/>
+      <w:numFmt w:val="bullet"/>
+      <w:lvlText w:val="o"/>
+      <w:lvlJc w:val="left"/>
+      <w:pPr>
+        <w:tabs>
+          <w:tab w:val="num" w:pos="1440"/>
+        </w:tabs>
+        <w:ind w:left="1440" w:hanging="360"/>
+      </w:pPr>
+      <w:rPr>
+        <w:rFonts w:ascii="Courier New" w:hAnsi="Courier New" w:hint="default"/>
+        <w:sz w:val="20"/>
+      </w:rPr>
+    </w:lvl>
+    <w:lvl w:ilvl="2" w:tentative="1">
+      <w:start w:val="1"/>
+      <w:numFmt w:val="bullet"/>
+      <w:lvlText w:val=""/>
+      <w:lvlJc w:val="left"/>
+      <w:pPr>
+        <w:tabs>
+          <w:tab w:val="num" w:pos="2160"/>
+        </w:tabs>
+        <w:ind w:left="2160" w:hanging="360"/>
+      </w:pPr>
+      <w:rPr>
+        <w:rFonts w:ascii="Wingdings" w:hAnsi="Wingdings" w:hint="default"/>
+        <w:sz w:val="20"/>
+      </w:rPr>
+    </w:lvl>
+    <w:lvl w:ilvl="3" w:tentative="1">
+      <w:start w:val="1"/>
+      <w:numFmt w:val="bullet"/>
+      <w:lvlText w:val=""/>
+      <w:lvlJc w:val="left"/>
+      <w:pPr>
+        <w:tabs>
+          <w:tab w:val="num" w:pos="2880"/>
+        </w:tabs>
+        <w:ind w:left="2880" w:hanging="360"/>
+      </w:pPr>
+      <w:rPr>
+        <w:rFonts w:ascii="Wingdings" w:hAnsi="Wingdings" w:hint="default"/>
+        <w:sz w:val="20"/>
+      </w:rPr>
+    </w:lvl>
+    <w:lvl w:ilvl="4" w:tentative="1">
+      <w:start w:val="1"/>
+      <w:numFmt w:val="bullet"/>
+      <w:lvlText w:val=""/>
+      <w:lvlJc w:val="left"/>
+      <w:pPr>
+        <w:tabs>
+          <w:tab w:val="num" w:pos="3600"/>
+        </w:tabs>
+        <w:ind w:left="3600" w:hanging="360"/>
+      </w:pPr>
+      <w:rPr>
+        <w:rFonts w:ascii="Wingdings" w:hAnsi="Wingdings" w:hint="default"/>
+        <w:sz w:val="20"/>
+      </w:rPr>
+    </w:lvl>
+    <w:lvl w:ilvl="5" w:tentative="1">
+      <w:start w:val="1"/>
+      <w:numFmt w:val="bullet"/>
+      <w:lvlText w:val=""/>
+      <w:lvlJc w:val="left"/>
+      <w:pPr>
+        <w:tabs>
+          <w:tab w:val="num" w:pos="4320"/>
+        </w:tabs>
+        <w:ind w:left="4320" w:hanging="360"/>
+      </w:pPr>
+      <w:rPr>
+        <w:rFonts w:ascii="Wingdings" w:hAnsi="Wingdings" w:hint="default"/>
+        <w:sz w:val="20"/>
+      </w:rPr>
+    </w:lvl>
+    <w:lvl w:ilvl="6" w:tentative="1">
+      <w:start w:val="1"/>
+      <w:numFmt w:val="bullet"/>
+      <w:lvlText w:val=""/>
+      <w:lvlJc w:val="left"/>
+      <w:pPr>
+        <w:tabs>
+          <w:tab w:val="num" w:pos="5040"/>
+        </w:tabs>
+        <w:ind w:left="5040" w:hanging="360"/>
+      </w:pPr>
+      <w:rPr>
+        <w:rFonts w:ascii="Wingdings" w:hAnsi="Wingdings" w:hint="default"/>
+        <w:sz w:val="20"/>
+      </w:rPr>
+    </w:lvl>
+    <w:lvl w:ilvl="7" w:tentative="1">
+      <w:start w:val="1"/>
+      <w:numFmt w:val="bullet"/>
+      <w:lvlText w:val=""/>
+      <w:lvlJc w:val="left"/>
+      <w:pPr>
+        <w:tabs>
+          <w:tab w:val="num" w:pos="5760"/>
+        </w:tabs>
+        <w:ind w:left="5760" w:hanging="360"/>
+      </w:pPr>
+      <w:rPr>
+        <w:rFonts w:ascii="Wingdings" w:hAnsi="Wingdings" w:hint="default"/>
+        <w:sz w:val="20"/>
+      </w:rPr>
+    </w:lvl>
+    <w:lvl w:ilvl="8" w:tentative="1">
+      <w:start w:val="1"/>
+      <w:numFmt w:val="bullet"/>
+      <w:lvlText w:val=""/>
+      <w:lvlJc w:val="left"/>
+      <w:pPr>
+        <w:tabs>
+          <w:tab w:val="num" w:pos="6480"/>
+        </w:tabs>
+        <w:ind w:left="6480" w:hanging="360"/>
+      </w:pPr>
+      <w:rPr>
+        <w:rFonts w:ascii="Wingdings" w:hAnsi="Wingdings" w:hint="default"/>
+        <w:sz w:val="20"/>
+      </w:rPr>
+    </w:lvl>
+  </w:abstractNum>
+  <w:abstractNum w:abstractNumId="6" w15:restartNumberingAfterBreak="0">
+    <w:nsid w:val="1F68234F"/>
+    <w:multiLevelType w:val="multilevel"/>
+    <w:tmpl w:val="B1E0838A"/>
+    <w:lvl w:ilvl="0">
+      <w:start w:val="1"/>
+      <w:numFmt w:val="bullet"/>
+      <w:lvlText w:val=""/>
+      <w:lvlJc w:val="left"/>
+      <w:pPr>
+        <w:tabs>
+          <w:tab w:val="num" w:pos="720"/>
+        </w:tabs>
+        <w:ind w:left="720" w:hanging="360"/>
+      </w:pPr>
+      <w:rPr>
+        <w:rFonts w:ascii="Symbol" w:hAnsi="Symbol" w:hint="default"/>
+        <w:sz w:val="20"/>
+      </w:rPr>
+    </w:lvl>
+    <w:lvl w:ilvl="1" w:tentative="1">
+      <w:start w:val="1"/>
+      <w:numFmt w:val="bullet"/>
+      <w:lvlText w:val="o"/>
+      <w:lvlJc w:val="left"/>
+      <w:pPr>
+        <w:tabs>
+          <w:tab w:val="num" w:pos="1440"/>
+        </w:tabs>
+        <w:ind w:left="1440" w:hanging="360"/>
+      </w:pPr>
+      <w:rPr>
+        <w:rFonts w:ascii="Courier New" w:hAnsi="Courier New" w:hint="default"/>
+        <w:sz w:val="20"/>
+      </w:rPr>
+    </w:lvl>
+    <w:lvl w:ilvl="2" w:tentative="1">
+      <w:start w:val="1"/>
+      <w:numFmt w:val="bullet"/>
+      <w:lvlText w:val=""/>
+      <w:lvlJc w:val="left"/>
+      <w:pPr>
+        <w:tabs>
+          <w:tab w:val="num" w:pos="2160"/>
+        </w:tabs>
+        <w:ind w:left="2160" w:hanging="360"/>
+      </w:pPr>
+      <w:rPr>
+        <w:rFonts w:ascii="Wingdings" w:hAnsi="Wingdings" w:hint="default"/>
+        <w:sz w:val="20"/>
+      </w:rPr>
+    </w:lvl>
+    <w:lvl w:ilvl="3" w:tentative="1">
+      <w:start w:val="1"/>
+      <w:numFmt w:val="bullet"/>
+      <w:lvlText w:val=""/>
+      <w:lvlJc w:val="left"/>
+      <w:pPr>
+        <w:tabs>
+          <w:tab w:val="num" w:pos="2880"/>
+        </w:tabs>
+        <w:ind w:left="2880" w:hanging="360"/>
+      </w:pPr>
+      <w:rPr>
+        <w:rFonts w:ascii="Wingdings" w:hAnsi="Wingdings" w:hint="default"/>
+        <w:sz w:val="20"/>
+      </w:rPr>
+    </w:lvl>
+    <w:lvl w:ilvl="4" w:tentative="1">
+      <w:start w:val="1"/>
+      <w:numFmt w:val="bullet"/>
+      <w:lvlText w:val=""/>
+      <w:lvlJc w:val="left"/>
+      <w:pPr>
+        <w:tabs>
+          <w:tab w:val="num" w:pos="3600"/>
+        </w:tabs>
+        <w:ind w:left="3600" w:hanging="360"/>
+      </w:pPr>
+      <w:rPr>
+        <w:rFonts w:ascii="Wingdings" w:hAnsi="Wingdings" w:hint="default"/>
+        <w:sz w:val="20"/>
+      </w:rPr>
+    </w:lvl>
+    <w:lvl w:ilvl="5" w:tentative="1">
+      <w:start w:val="1"/>
+      <w:numFmt w:val="bullet"/>
+      <w:lvlText w:val=""/>
+      <w:lvlJc w:val="left"/>
+      <w:pPr>
+        <w:tabs>
+          <w:tab w:val="num" w:pos="4320"/>
+        </w:tabs>
+        <w:ind w:left="4320" w:hanging="360"/>
+      </w:pPr>
+      <w:rPr>
+        <w:rFonts w:ascii="Wingdings" w:hAnsi="Wingdings" w:hint="default"/>
+        <w:sz w:val="20"/>
+      </w:rPr>
+    </w:lvl>
+    <w:lvl w:ilvl="6" w:tentative="1">
+      <w:start w:val="1"/>
+      <w:numFmt w:val="bullet"/>
+      <w:lvlText w:val=""/>
+      <w:lvlJc w:val="left"/>
+      <w:pPr>
+        <w:tabs>
+          <w:tab w:val="num" w:pos="5040"/>
+        </w:tabs>
+        <w:ind w:left="5040" w:hanging="360"/>
+      </w:pPr>
+      <w:rPr>
+        <w:rFonts w:ascii="Wingdings" w:hAnsi="Wingdings" w:hint="default"/>
+        <w:sz w:val="20"/>
+      </w:rPr>
+    </w:lvl>
+    <w:lvl w:ilvl="7" w:tentative="1">
+      <w:start w:val="1"/>
+      <w:numFmt w:val="bullet"/>
+      <w:lvlText w:val=""/>
+      <w:lvlJc w:val="left"/>
+      <w:pPr>
+        <w:tabs>
+          <w:tab w:val="num" w:pos="5760"/>
+        </w:tabs>
+        <w:ind w:left="5760" w:hanging="360"/>
+      </w:pPr>
+      <w:rPr>
+        <w:rFonts w:ascii="Wingdings" w:hAnsi="Wingdings" w:hint="default"/>
+        <w:sz w:val="20"/>
+      </w:rPr>
+    </w:lvl>
+    <w:lvl w:ilvl="8" w:tentative="1">
+      <w:start w:val="1"/>
+      <w:numFmt w:val="bullet"/>
+      <w:lvlText w:val=""/>
+      <w:lvlJc w:val="left"/>
+      <w:pPr>
+        <w:tabs>
+          <w:tab w:val="num" w:pos="6480"/>
+        </w:tabs>
+        <w:ind w:left="6480" w:hanging="360"/>
+      </w:pPr>
+      <w:rPr>
+        <w:rFonts w:ascii="Wingdings" w:hAnsi="Wingdings" w:hint="default"/>
+        <w:sz w:val="20"/>
+      </w:rPr>
+    </w:lvl>
+  </w:abstractNum>
+  <w:abstractNum w:abstractNumId="7" w15:restartNumberingAfterBreak="0">
+    <w:nsid w:val="20202D22"/>
+    <w:multiLevelType w:val="multilevel"/>
+    <w:tmpl w:val="6F0A4232"/>
+    <w:lvl w:ilvl="0">
+      <w:start w:val="1"/>
+      <w:numFmt w:val="bullet"/>
+      <w:lvlText w:val=""/>
+      <w:lvlJc w:val="left"/>
+      <w:pPr>
+        <w:tabs>
+          <w:tab w:val="num" w:pos="720"/>
+        </w:tabs>
+        <w:ind w:left="720" w:hanging="360"/>
+      </w:pPr>
+      <w:rPr>
+        <w:rFonts w:ascii="Symbol" w:hAnsi="Symbol" w:hint="default"/>
+        <w:sz w:val="20"/>
+      </w:rPr>
+    </w:lvl>
+    <w:lvl w:ilvl="1" w:tentative="1">
+      <w:start w:val="1"/>
+      <w:numFmt w:val="bullet"/>
+      <w:lvlText w:val="o"/>
+      <w:lvlJc w:val="left"/>
+      <w:pPr>
+        <w:tabs>
+          <w:tab w:val="num" w:pos="1440"/>
+        </w:tabs>
+        <w:ind w:left="1440" w:hanging="360"/>
+      </w:pPr>
+      <w:rPr>
+        <w:rFonts w:ascii="Courier New" w:hAnsi="Courier New" w:hint="default"/>
+        <w:sz w:val="20"/>
+      </w:rPr>
+    </w:lvl>
+    <w:lvl w:ilvl="2" w:tentative="1">
+      <w:start w:val="1"/>
+      <w:numFmt w:val="bullet"/>
+      <w:lvlText w:val=""/>
+      <w:lvlJc w:val="left"/>
+      <w:pPr>
+        <w:tabs>
+          <w:tab w:val="num" w:pos="2160"/>
+        </w:tabs>
+        <w:ind w:left="2160" w:hanging="360"/>
+      </w:pPr>
+      <w:rPr>
+        <w:rFonts w:ascii="Wingdings" w:hAnsi="Wingdings" w:hint="default"/>
+        <w:sz w:val="20"/>
+      </w:rPr>
+    </w:lvl>
+    <w:lvl w:ilvl="3" w:tentative="1">
+      <w:start w:val="1"/>
+      <w:numFmt w:val="bullet"/>
+      <w:lvlText w:val=""/>
+      <w:lvlJc w:val="left"/>
+      <w:pPr>
+        <w:tabs>
+          <w:tab w:val="num" w:pos="2880"/>
+        </w:tabs>
+        <w:ind w:left="2880" w:hanging="360"/>
+      </w:pPr>
+      <w:rPr>
+        <w:rFonts w:ascii="Wingdings" w:hAnsi="Wingdings" w:hint="default"/>
+        <w:sz w:val="20"/>
+      </w:rPr>
+    </w:lvl>
+    <w:lvl w:ilvl="4" w:tentative="1">
+      <w:start w:val="1"/>
+      <w:numFmt w:val="bullet"/>
+      <w:lvlText w:val=""/>
+      <w:lvlJc w:val="left"/>
+      <w:pPr>
+        <w:tabs>
+          <w:tab w:val="num" w:pos="3600"/>
+        </w:tabs>
+        <w:ind w:left="3600" w:hanging="360"/>
+      </w:pPr>
+      <w:rPr>
+        <w:rFonts w:ascii="Wingdings" w:hAnsi="Wingdings" w:hint="default"/>
+        <w:sz w:val="20"/>
+      </w:rPr>
+    </w:lvl>
+    <w:lvl w:ilvl="5" w:tentative="1">
+      <w:start w:val="1"/>
+      <w:numFmt w:val="bullet"/>
+      <w:lvlText w:val=""/>
+      <w:lvlJc w:val="left"/>
+      <w:pPr>
+        <w:tabs>
+          <w:tab w:val="num" w:pos="4320"/>
+        </w:tabs>
+        <w:ind w:left="4320" w:hanging="360"/>
+      </w:pPr>
+      <w:rPr>
+        <w:rFonts w:ascii="Wingdings" w:hAnsi="Wingdings" w:hint="default"/>
+        <w:sz w:val="20"/>
+      </w:rPr>
+    </w:lvl>
+    <w:lvl w:ilvl="6" w:tentative="1">
+      <w:start w:val="1"/>
+      <w:numFmt w:val="bullet"/>
+      <w:lvlText w:val=""/>
+      <w:lvlJc w:val="left"/>
+      <w:pPr>
+        <w:tabs>
+          <w:tab w:val="num" w:pos="5040"/>
+        </w:tabs>
+        <w:ind w:left="5040" w:hanging="360"/>
+      </w:pPr>
+      <w:rPr>
+        <w:rFonts w:ascii="Wingdings" w:hAnsi="Wingdings" w:hint="default"/>
+        <w:sz w:val="20"/>
+      </w:rPr>
+    </w:lvl>
+    <w:lvl w:ilvl="7" w:tentative="1">
+      <w:start w:val="1"/>
+      <w:numFmt w:val="bullet"/>
+      <w:lvlText w:val=""/>
+      <w:lvlJc w:val="left"/>
+      <w:pPr>
+        <w:tabs>
+          <w:tab w:val="num" w:pos="5760"/>
+        </w:tabs>
+        <w:ind w:left="5760" w:hanging="360"/>
+      </w:pPr>
+      <w:rPr>
+        <w:rFonts w:ascii="Wingdings" w:hAnsi="Wingdings" w:hint="default"/>
+        <w:sz w:val="20"/>
+      </w:rPr>
+    </w:lvl>
+    <w:lvl w:ilvl="8" w:tentative="1">
+      <w:start w:val="1"/>
+      <w:numFmt w:val="bullet"/>
+      <w:lvlText w:val=""/>
+      <w:lvlJc w:val="left"/>
+      <w:pPr>
+        <w:tabs>
+          <w:tab w:val="num" w:pos="6480"/>
+        </w:tabs>
+        <w:ind w:left="6480" w:hanging="360"/>
+      </w:pPr>
+      <w:rPr>
+        <w:rFonts w:ascii="Wingdings" w:hAnsi="Wingdings" w:hint="default"/>
+        <w:sz w:val="20"/>
+      </w:rPr>
+    </w:lvl>
+  </w:abstractNum>
+  <w:abstractNum w:abstractNumId="8" w15:restartNumberingAfterBreak="0">
+    <w:nsid w:val="250D1B7C"/>
+    <w:multiLevelType w:val="multilevel"/>
+    <w:tmpl w:val="2ED6209A"/>
+    <w:lvl w:ilvl="0">
+      <w:start w:val="1"/>
+      <w:numFmt w:val="bullet"/>
+      <w:lvlText w:val=""/>
+      <w:lvlJc w:val="left"/>
+      <w:pPr>
+        <w:tabs>
+          <w:tab w:val="num" w:pos="720"/>
+        </w:tabs>
+        <w:ind w:left="720" w:hanging="360"/>
+      </w:pPr>
+      <w:rPr>
+        <w:rFonts w:ascii="Symbol" w:hAnsi="Symbol" w:hint="default"/>
+        <w:sz w:val="20"/>
+      </w:rPr>
+    </w:lvl>
+    <w:lvl w:ilvl="1" w:tentative="1">
+      <w:start w:val="1"/>
+      <w:numFmt w:val="bullet"/>
+      <w:lvlText w:val="o"/>
+      <w:lvlJc w:val="left"/>
+      <w:pPr>
+        <w:tabs>
+          <w:tab w:val="num" w:pos="1440"/>
+        </w:tabs>
+        <w:ind w:left="1440" w:hanging="360"/>
+      </w:pPr>
+      <w:rPr>
+        <w:rFonts w:ascii="Courier New" w:hAnsi="Courier New" w:hint="default"/>
+        <w:sz w:val="20"/>
+      </w:rPr>
+    </w:lvl>
+    <w:lvl w:ilvl="2" w:tentative="1">
+      <w:start w:val="1"/>
+      <w:numFmt w:val="bullet"/>
+      <w:lvlText w:val=""/>
+      <w:lvlJc w:val="left"/>
+      <w:pPr>
+        <w:tabs>
+          <w:tab w:val="num" w:pos="2160"/>
+        </w:tabs>
+        <w:ind w:left="2160" w:hanging="360"/>
+      </w:pPr>
+      <w:rPr>
+        <w:rFonts w:ascii="Wingdings" w:hAnsi="Wingdings" w:hint="default"/>
+        <w:sz w:val="20"/>
+      </w:rPr>
+    </w:lvl>
+    <w:lvl w:ilvl="3" w:tentative="1">
+      <w:start w:val="1"/>
+      <w:numFmt w:val="bullet"/>
+      <w:lvlText w:val=""/>
+      <w:lvlJc w:val="left"/>
+      <w:pPr>
+        <w:tabs>
+          <w:tab w:val="num" w:pos="2880"/>
+        </w:tabs>
+        <w:ind w:left="2880" w:hanging="360"/>
+      </w:pPr>
+      <w:rPr>
+        <w:rFonts w:ascii="Wingdings" w:hAnsi="Wingdings" w:hint="default"/>
+        <w:sz w:val="20"/>
+      </w:rPr>
+    </w:lvl>
+    <w:lvl w:ilvl="4" w:tentative="1">
+      <w:start w:val="1"/>
+      <w:numFmt w:val="bullet"/>
+      <w:lvlText w:val=""/>
+      <w:lvlJc w:val="left"/>
+      <w:pPr>
+        <w:tabs>
+          <w:tab w:val="num" w:pos="3600"/>
+        </w:tabs>
+        <w:ind w:left="3600" w:hanging="360"/>
+      </w:pPr>
+      <w:rPr>
+        <w:rFonts w:ascii="Wingdings" w:hAnsi="Wingdings" w:hint="default"/>
+        <w:sz w:val="20"/>
+      </w:rPr>
+    </w:lvl>
+    <w:lvl w:ilvl="5" w:tentative="1">
+      <w:start w:val="1"/>
+      <w:numFmt w:val="bullet"/>
+      <w:lvlText w:val=""/>
+      <w:lvlJc w:val="left"/>
+      <w:pPr>
+        <w:tabs>
+          <w:tab w:val="num" w:pos="4320"/>
+        </w:tabs>
+        <w:ind w:left="4320" w:hanging="360"/>
+      </w:pPr>
+      <w:rPr>
+        <w:rFonts w:ascii="Wingdings" w:hAnsi="Wingdings" w:hint="default"/>
+        <w:sz w:val="20"/>
+      </w:rPr>
+    </w:lvl>
+    <w:lvl w:ilvl="6" w:tentative="1">
+      <w:start w:val="1"/>
+      <w:numFmt w:val="bullet"/>
+      <w:lvlText w:val=""/>
+      <w:lvlJc w:val="left"/>
+      <w:pPr>
+        <w:tabs>
+          <w:tab w:val="num" w:pos="5040"/>
+        </w:tabs>
+        <w:ind w:left="5040" w:hanging="360"/>
+      </w:pPr>
+      <w:rPr>
+        <w:rFonts w:ascii="Wingdings" w:hAnsi="Wingdings" w:hint="default"/>
+        <w:sz w:val="20"/>
+      </w:rPr>
+    </w:lvl>
+    <w:lvl w:ilvl="7" w:tentative="1">
+      <w:start w:val="1"/>
+      <w:numFmt w:val="bullet"/>
+      <w:lvlText w:val=""/>
+      <w:lvlJc w:val="left"/>
+      <w:pPr>
+        <w:tabs>
+          <w:tab w:val="num" w:pos="5760"/>
+        </w:tabs>
+        <w:ind w:left="5760" w:hanging="360"/>
+      </w:pPr>
+      <w:rPr>
+        <w:rFonts w:ascii="Wingdings" w:hAnsi="Wingdings" w:hint="default"/>
+        <w:sz w:val="20"/>
+      </w:rPr>
+    </w:lvl>
+    <w:lvl w:ilvl="8" w:tentative="1">
+      <w:start w:val="1"/>
+      <w:numFmt w:val="bullet"/>
+      <w:lvlText w:val=""/>
+      <w:lvlJc w:val="left"/>
+      <w:pPr>
+        <w:tabs>
+          <w:tab w:val="num" w:pos="6480"/>
+        </w:tabs>
+        <w:ind w:left="6480" w:hanging="360"/>
+      </w:pPr>
+      <w:rPr>
+        <w:rFonts w:ascii="Wingdings" w:hAnsi="Wingdings" w:hint="default"/>
+        <w:sz w:val="20"/>
+      </w:rPr>
+    </w:lvl>
+  </w:abstractNum>
+  <w:abstractNum w:abstractNumId="9" w15:restartNumberingAfterBreak="0">
+    <w:nsid w:val="281F6DB6"/>
+    <w:multiLevelType w:val="multilevel"/>
+    <w:tmpl w:val="4738911C"/>
     <w:lvl w:ilvl="0">
       <w:start w:val="1"/>
       <w:numFmt w:val="decimal"/>
@@ -7395,10 +7927,457 @@
       </w:pPr>
     </w:lvl>
   </w:abstractNum>
-  <w:abstractNum w:abstractNumId="6" w15:restartNumberingAfterBreak="0">
-    <w:nsid w:val="3C9F6DCE"/>
+  <w:abstractNum w:abstractNumId="10" w15:restartNumberingAfterBreak="0">
+    <w:nsid w:val="2C3F19BC"/>
     <w:multiLevelType w:val="multilevel"/>
-    <w:tmpl w:val="9DD0CC0E"/>
+    <w:tmpl w:val="E3FE272E"/>
+    <w:lvl w:ilvl="0">
+      <w:start w:val="1"/>
+      <w:numFmt w:val="bullet"/>
+      <w:lvlText w:val=""/>
+      <w:lvlJc w:val="left"/>
+      <w:pPr>
+        <w:tabs>
+          <w:tab w:val="num" w:pos="720"/>
+        </w:tabs>
+        <w:ind w:left="720" w:hanging="360"/>
+      </w:pPr>
+      <w:rPr>
+        <w:rFonts w:ascii="Symbol" w:hAnsi="Symbol" w:hint="default"/>
+        <w:sz w:val="20"/>
+      </w:rPr>
+    </w:lvl>
+    <w:lvl w:ilvl="1" w:tentative="1">
+      <w:start w:val="1"/>
+      <w:numFmt w:val="bullet"/>
+      <w:lvlText w:val="o"/>
+      <w:lvlJc w:val="left"/>
+      <w:pPr>
+        <w:tabs>
+          <w:tab w:val="num" w:pos="1440"/>
+        </w:tabs>
+        <w:ind w:left="1440" w:hanging="360"/>
+      </w:pPr>
+      <w:rPr>
+        <w:rFonts w:ascii="Courier New" w:hAnsi="Courier New" w:hint="default"/>
+        <w:sz w:val="20"/>
+      </w:rPr>
+    </w:lvl>
+    <w:lvl w:ilvl="2" w:tentative="1">
+      <w:start w:val="1"/>
+      <w:numFmt w:val="bullet"/>
+      <w:lvlText w:val=""/>
+      <w:lvlJc w:val="left"/>
+      <w:pPr>
+        <w:tabs>
+          <w:tab w:val="num" w:pos="2160"/>
+        </w:tabs>
+        <w:ind w:left="2160" w:hanging="360"/>
+      </w:pPr>
+      <w:rPr>
+        <w:rFonts w:ascii="Wingdings" w:hAnsi="Wingdings" w:hint="default"/>
+        <w:sz w:val="20"/>
+      </w:rPr>
+    </w:lvl>
+    <w:lvl w:ilvl="3" w:tentative="1">
+      <w:start w:val="1"/>
+      <w:numFmt w:val="bullet"/>
+      <w:lvlText w:val=""/>
+      <w:lvlJc w:val="left"/>
+      <w:pPr>
+        <w:tabs>
+          <w:tab w:val="num" w:pos="2880"/>
+        </w:tabs>
+        <w:ind w:left="2880" w:hanging="360"/>
+      </w:pPr>
+      <w:rPr>
+        <w:rFonts w:ascii="Wingdings" w:hAnsi="Wingdings" w:hint="default"/>
+        <w:sz w:val="20"/>
+      </w:rPr>
+    </w:lvl>
+    <w:lvl w:ilvl="4" w:tentative="1">
+      <w:start w:val="1"/>
+      <w:numFmt w:val="bullet"/>
+      <w:lvlText w:val=""/>
+      <w:lvlJc w:val="left"/>
+      <w:pPr>
+        <w:tabs>
+          <w:tab w:val="num" w:pos="3600"/>
+        </w:tabs>
+        <w:ind w:left="3600" w:hanging="360"/>
+      </w:pPr>
+      <w:rPr>
+        <w:rFonts w:ascii="Wingdings" w:hAnsi="Wingdings" w:hint="default"/>
+        <w:sz w:val="20"/>
+      </w:rPr>
+    </w:lvl>
+    <w:lvl w:ilvl="5" w:tentative="1">
+      <w:start w:val="1"/>
+      <w:numFmt w:val="bullet"/>
+      <w:lvlText w:val=""/>
+      <w:lvlJc w:val="left"/>
+      <w:pPr>
+        <w:tabs>
+          <w:tab w:val="num" w:pos="4320"/>
+        </w:tabs>
+        <w:ind w:left="4320" w:hanging="360"/>
+      </w:pPr>
+      <w:rPr>
+        <w:rFonts w:ascii="Wingdings" w:hAnsi="Wingdings" w:hint="default"/>
+        <w:sz w:val="20"/>
+      </w:rPr>
+    </w:lvl>
+    <w:lvl w:ilvl="6" w:tentative="1">
+      <w:start w:val="1"/>
+      <w:numFmt w:val="bullet"/>
+      <w:lvlText w:val=""/>
+      <w:lvlJc w:val="left"/>
+      <w:pPr>
+        <w:tabs>
+          <w:tab w:val="num" w:pos="5040"/>
+        </w:tabs>
+        <w:ind w:left="5040" w:hanging="360"/>
+      </w:pPr>
+      <w:rPr>
+        <w:rFonts w:ascii="Wingdings" w:hAnsi="Wingdings" w:hint="default"/>
+        <w:sz w:val="20"/>
+      </w:rPr>
+    </w:lvl>
+    <w:lvl w:ilvl="7" w:tentative="1">
+      <w:start w:val="1"/>
+      <w:numFmt w:val="bullet"/>
+      <w:lvlText w:val=""/>
+      <w:lvlJc w:val="left"/>
+      <w:pPr>
+        <w:tabs>
+          <w:tab w:val="num" w:pos="5760"/>
+        </w:tabs>
+        <w:ind w:left="5760" w:hanging="360"/>
+      </w:pPr>
+      <w:rPr>
+        <w:rFonts w:ascii="Wingdings" w:hAnsi="Wingdings" w:hint="default"/>
+        <w:sz w:val="20"/>
+      </w:rPr>
+    </w:lvl>
+    <w:lvl w:ilvl="8" w:tentative="1">
+      <w:start w:val="1"/>
+      <w:numFmt w:val="bullet"/>
+      <w:lvlText w:val=""/>
+      <w:lvlJc w:val="left"/>
+      <w:pPr>
+        <w:tabs>
+          <w:tab w:val="num" w:pos="6480"/>
+        </w:tabs>
+        <w:ind w:left="6480" w:hanging="360"/>
+      </w:pPr>
+      <w:rPr>
+        <w:rFonts w:ascii="Wingdings" w:hAnsi="Wingdings" w:hint="default"/>
+        <w:sz w:val="20"/>
+      </w:rPr>
+    </w:lvl>
+  </w:abstractNum>
+  <w:abstractNum w:abstractNumId="11" w15:restartNumberingAfterBreak="0">
+    <w:nsid w:val="2C9F7BF3"/>
+    <w:multiLevelType w:val="multilevel"/>
+    <w:tmpl w:val="B36EFB5C"/>
+    <w:lvl w:ilvl="0">
+      <w:start w:val="1"/>
+      <w:numFmt w:val="bullet"/>
+      <w:lvlText w:val=""/>
+      <w:lvlJc w:val="left"/>
+      <w:pPr>
+        <w:tabs>
+          <w:tab w:val="num" w:pos="720"/>
+        </w:tabs>
+        <w:ind w:left="720" w:hanging="360"/>
+      </w:pPr>
+      <w:rPr>
+        <w:rFonts w:ascii="Symbol" w:hAnsi="Symbol" w:hint="default"/>
+        <w:sz w:val="20"/>
+      </w:rPr>
+    </w:lvl>
+    <w:lvl w:ilvl="1" w:tentative="1">
+      <w:start w:val="1"/>
+      <w:numFmt w:val="bullet"/>
+      <w:lvlText w:val="o"/>
+      <w:lvlJc w:val="left"/>
+      <w:pPr>
+        <w:tabs>
+          <w:tab w:val="num" w:pos="1440"/>
+        </w:tabs>
+        <w:ind w:left="1440" w:hanging="360"/>
+      </w:pPr>
+      <w:rPr>
+        <w:rFonts w:ascii="Courier New" w:hAnsi="Courier New" w:hint="default"/>
+        <w:sz w:val="20"/>
+      </w:rPr>
+    </w:lvl>
+    <w:lvl w:ilvl="2" w:tentative="1">
+      <w:start w:val="1"/>
+      <w:numFmt w:val="bullet"/>
+      <w:lvlText w:val=""/>
+      <w:lvlJc w:val="left"/>
+      <w:pPr>
+        <w:tabs>
+          <w:tab w:val="num" w:pos="2160"/>
+        </w:tabs>
+        <w:ind w:left="2160" w:hanging="360"/>
+      </w:pPr>
+      <w:rPr>
+        <w:rFonts w:ascii="Wingdings" w:hAnsi="Wingdings" w:hint="default"/>
+        <w:sz w:val="20"/>
+      </w:rPr>
+    </w:lvl>
+    <w:lvl w:ilvl="3" w:tentative="1">
+      <w:start w:val="1"/>
+      <w:numFmt w:val="bullet"/>
+      <w:lvlText w:val=""/>
+      <w:lvlJc w:val="left"/>
+      <w:pPr>
+        <w:tabs>
+          <w:tab w:val="num" w:pos="2880"/>
+        </w:tabs>
+        <w:ind w:left="2880" w:hanging="360"/>
+      </w:pPr>
+      <w:rPr>
+        <w:rFonts w:ascii="Wingdings" w:hAnsi="Wingdings" w:hint="default"/>
+        <w:sz w:val="20"/>
+      </w:rPr>
+    </w:lvl>
+    <w:lvl w:ilvl="4" w:tentative="1">
+      <w:start w:val="1"/>
+      <w:numFmt w:val="bullet"/>
+      <w:lvlText w:val=""/>
+      <w:lvlJc w:val="left"/>
+      <w:pPr>
+        <w:tabs>
+          <w:tab w:val="num" w:pos="3600"/>
+        </w:tabs>
+        <w:ind w:left="3600" w:hanging="360"/>
+      </w:pPr>
+      <w:rPr>
+        <w:rFonts w:ascii="Wingdings" w:hAnsi="Wingdings" w:hint="default"/>
+        <w:sz w:val="20"/>
+      </w:rPr>
+    </w:lvl>
+    <w:lvl w:ilvl="5" w:tentative="1">
+      <w:start w:val="1"/>
+      <w:numFmt w:val="bullet"/>
+      <w:lvlText w:val=""/>
+      <w:lvlJc w:val="left"/>
+      <w:pPr>
+        <w:tabs>
+          <w:tab w:val="num" w:pos="4320"/>
+        </w:tabs>
+        <w:ind w:left="4320" w:hanging="360"/>
+      </w:pPr>
+      <w:rPr>
+        <w:rFonts w:ascii="Wingdings" w:hAnsi="Wingdings" w:hint="default"/>
+        <w:sz w:val="20"/>
+      </w:rPr>
+    </w:lvl>
+    <w:lvl w:ilvl="6" w:tentative="1">
+      <w:start w:val="1"/>
+      <w:numFmt w:val="bullet"/>
+      <w:lvlText w:val=""/>
+      <w:lvlJc w:val="left"/>
+      <w:pPr>
+        <w:tabs>
+          <w:tab w:val="num" w:pos="5040"/>
+        </w:tabs>
+        <w:ind w:left="5040" w:hanging="360"/>
+      </w:pPr>
+      <w:rPr>
+        <w:rFonts w:ascii="Wingdings" w:hAnsi="Wingdings" w:hint="default"/>
+        <w:sz w:val="20"/>
+      </w:rPr>
+    </w:lvl>
+    <w:lvl w:ilvl="7" w:tentative="1">
+      <w:start w:val="1"/>
+      <w:numFmt w:val="bullet"/>
+      <w:lvlText w:val=""/>
+      <w:lvlJc w:val="left"/>
+      <w:pPr>
+        <w:tabs>
+          <w:tab w:val="num" w:pos="5760"/>
+        </w:tabs>
+        <w:ind w:left="5760" w:hanging="360"/>
+      </w:pPr>
+      <w:rPr>
+        <w:rFonts w:ascii="Wingdings" w:hAnsi="Wingdings" w:hint="default"/>
+        <w:sz w:val="20"/>
+      </w:rPr>
+    </w:lvl>
+    <w:lvl w:ilvl="8" w:tentative="1">
+      <w:start w:val="1"/>
+      <w:numFmt w:val="bullet"/>
+      <w:lvlText w:val=""/>
+      <w:lvlJc w:val="left"/>
+      <w:pPr>
+        <w:tabs>
+          <w:tab w:val="num" w:pos="6480"/>
+        </w:tabs>
+        <w:ind w:left="6480" w:hanging="360"/>
+      </w:pPr>
+      <w:rPr>
+        <w:rFonts w:ascii="Wingdings" w:hAnsi="Wingdings" w:hint="default"/>
+        <w:sz w:val="20"/>
+      </w:rPr>
+    </w:lvl>
+  </w:abstractNum>
+  <w:abstractNum w:abstractNumId="12" w15:restartNumberingAfterBreak="0">
+    <w:nsid w:val="34197215"/>
+    <w:multiLevelType w:val="multilevel"/>
+    <w:tmpl w:val="DB341D2A"/>
+    <w:lvl w:ilvl="0">
+      <w:start w:val="1"/>
+      <w:numFmt w:val="bullet"/>
+      <w:lvlText w:val=""/>
+      <w:lvlJc w:val="left"/>
+      <w:pPr>
+        <w:tabs>
+          <w:tab w:val="num" w:pos="720"/>
+        </w:tabs>
+        <w:ind w:left="720" w:hanging="360"/>
+      </w:pPr>
+      <w:rPr>
+        <w:rFonts w:ascii="Symbol" w:hAnsi="Symbol" w:hint="default"/>
+        <w:sz w:val="20"/>
+      </w:rPr>
+    </w:lvl>
+    <w:lvl w:ilvl="1" w:tentative="1">
+      <w:start w:val="1"/>
+      <w:numFmt w:val="bullet"/>
+      <w:lvlText w:val="o"/>
+      <w:lvlJc w:val="left"/>
+      <w:pPr>
+        <w:tabs>
+          <w:tab w:val="num" w:pos="1440"/>
+        </w:tabs>
+        <w:ind w:left="1440" w:hanging="360"/>
+      </w:pPr>
+      <w:rPr>
+        <w:rFonts w:ascii="Courier New" w:hAnsi="Courier New" w:hint="default"/>
+        <w:sz w:val="20"/>
+      </w:rPr>
+    </w:lvl>
+    <w:lvl w:ilvl="2" w:tentative="1">
+      <w:start w:val="1"/>
+      <w:numFmt w:val="bullet"/>
+      <w:lvlText w:val=""/>
+      <w:lvlJc w:val="left"/>
+      <w:pPr>
+        <w:tabs>
+          <w:tab w:val="num" w:pos="2160"/>
+        </w:tabs>
+        <w:ind w:left="2160" w:hanging="360"/>
+      </w:pPr>
+      <w:rPr>
+        <w:rFonts w:ascii="Wingdings" w:hAnsi="Wingdings" w:hint="default"/>
+        <w:sz w:val="20"/>
+      </w:rPr>
+    </w:lvl>
+    <w:lvl w:ilvl="3" w:tentative="1">
+      <w:start w:val="1"/>
+      <w:numFmt w:val="bullet"/>
+      <w:lvlText w:val=""/>
+      <w:lvlJc w:val="left"/>
+      <w:pPr>
+        <w:tabs>
+          <w:tab w:val="num" w:pos="2880"/>
+        </w:tabs>
+        <w:ind w:left="2880" w:hanging="360"/>
+      </w:pPr>
+      <w:rPr>
+        <w:rFonts w:ascii="Wingdings" w:hAnsi="Wingdings" w:hint="default"/>
+        <w:sz w:val="20"/>
+      </w:rPr>
+    </w:lvl>
+    <w:lvl w:ilvl="4" w:tentative="1">
+      <w:start w:val="1"/>
+      <w:numFmt w:val="bullet"/>
+      <w:lvlText w:val=""/>
+      <w:lvlJc w:val="left"/>
+      <w:pPr>
+        <w:tabs>
+          <w:tab w:val="num" w:pos="3600"/>
+        </w:tabs>
+        <w:ind w:left="3600" w:hanging="360"/>
+      </w:pPr>
+      <w:rPr>
+        <w:rFonts w:ascii="Wingdings" w:hAnsi="Wingdings" w:hint="default"/>
+        <w:sz w:val="20"/>
+      </w:rPr>
+    </w:lvl>
+    <w:lvl w:ilvl="5" w:tentative="1">
+      <w:start w:val="1"/>
+      <w:numFmt w:val="bullet"/>
+      <w:lvlText w:val=""/>
+      <w:lvlJc w:val="left"/>
+      <w:pPr>
+        <w:tabs>
+          <w:tab w:val="num" w:pos="4320"/>
+        </w:tabs>
+        <w:ind w:left="4320" w:hanging="360"/>
+      </w:pPr>
+      <w:rPr>
+        <w:rFonts w:ascii="Wingdings" w:hAnsi="Wingdings" w:hint="default"/>
+        <w:sz w:val="20"/>
+      </w:rPr>
+    </w:lvl>
+    <w:lvl w:ilvl="6" w:tentative="1">
+      <w:start w:val="1"/>
+      <w:numFmt w:val="bullet"/>
+      <w:lvlText w:val=""/>
+      <w:lvlJc w:val="left"/>
+      <w:pPr>
+        <w:tabs>
+          <w:tab w:val="num" w:pos="5040"/>
+        </w:tabs>
+        <w:ind w:left="5040" w:hanging="360"/>
+      </w:pPr>
+      <w:rPr>
+        <w:rFonts w:ascii="Wingdings" w:hAnsi="Wingdings" w:hint="default"/>
+        <w:sz w:val="20"/>
+      </w:rPr>
+    </w:lvl>
+    <w:lvl w:ilvl="7" w:tentative="1">
+      <w:start w:val="1"/>
+      <w:numFmt w:val="bullet"/>
+      <w:lvlText w:val=""/>
+      <w:lvlJc w:val="left"/>
+      <w:pPr>
+        <w:tabs>
+          <w:tab w:val="num" w:pos="5760"/>
+        </w:tabs>
+        <w:ind w:left="5760" w:hanging="360"/>
+      </w:pPr>
+      <w:rPr>
+        <w:rFonts w:ascii="Wingdings" w:hAnsi="Wingdings" w:hint="default"/>
+        <w:sz w:val="20"/>
+      </w:rPr>
+    </w:lvl>
+    <w:lvl w:ilvl="8" w:tentative="1">
+      <w:start w:val="1"/>
+      <w:numFmt w:val="bullet"/>
+      <w:lvlText w:val=""/>
+      <w:lvlJc w:val="left"/>
+      <w:pPr>
+        <w:tabs>
+          <w:tab w:val="num" w:pos="6480"/>
+        </w:tabs>
+        <w:ind w:left="6480" w:hanging="360"/>
+      </w:pPr>
+      <w:rPr>
+        <w:rFonts w:ascii="Wingdings" w:hAnsi="Wingdings" w:hint="default"/>
+        <w:sz w:val="20"/>
+      </w:rPr>
+    </w:lvl>
+  </w:abstractNum>
+  <w:abstractNum w:abstractNumId="13" w15:restartNumberingAfterBreak="0">
+    <w:nsid w:val="369F396C"/>
+    <w:multiLevelType w:val="multilevel"/>
+    <w:tmpl w:val="664A7AAC"/>
     <w:lvl w:ilvl="0">
       <w:start w:val="1"/>
       <w:numFmt w:val="decimal"/>
@@ -7512,159 +8491,10 @@
       </w:pPr>
     </w:lvl>
   </w:abstractNum>
-  <w:abstractNum w:abstractNumId="7" w15:restartNumberingAfterBreak="0">
-    <w:nsid w:val="3FBD69C4"/>
+  <w:abstractNum w:abstractNumId="14" w15:restartNumberingAfterBreak="0">
+    <w:nsid w:val="3F001937"/>
     <w:multiLevelType w:val="multilevel"/>
-    <w:tmpl w:val="84068482"/>
-    <w:lvl w:ilvl="0">
-      <w:start w:val="1"/>
-      <w:numFmt w:val="bullet"/>
-      <w:lvlText w:val=""/>
-      <w:lvlJc w:val="left"/>
-      <w:pPr>
-        <w:tabs>
-          <w:tab w:val="num" w:pos="720"/>
-        </w:tabs>
-        <w:ind w:left="720" w:hanging="360"/>
-      </w:pPr>
-      <w:rPr>
-        <w:rFonts w:ascii="Symbol" w:hAnsi="Symbol" w:hint="default"/>
-        <w:sz w:val="20"/>
-      </w:rPr>
-    </w:lvl>
-    <w:lvl w:ilvl="1" w:tentative="1">
-      <w:start w:val="1"/>
-      <w:numFmt w:val="bullet"/>
-      <w:lvlText w:val="o"/>
-      <w:lvlJc w:val="left"/>
-      <w:pPr>
-        <w:tabs>
-          <w:tab w:val="num" w:pos="1440"/>
-        </w:tabs>
-        <w:ind w:left="1440" w:hanging="360"/>
-      </w:pPr>
-      <w:rPr>
-        <w:rFonts w:ascii="Courier New" w:hAnsi="Courier New" w:hint="default"/>
-        <w:sz w:val="20"/>
-      </w:rPr>
-    </w:lvl>
-    <w:lvl w:ilvl="2" w:tentative="1">
-      <w:start w:val="1"/>
-      <w:numFmt w:val="bullet"/>
-      <w:lvlText w:val=""/>
-      <w:lvlJc w:val="left"/>
-      <w:pPr>
-        <w:tabs>
-          <w:tab w:val="num" w:pos="2160"/>
-        </w:tabs>
-        <w:ind w:left="2160" w:hanging="360"/>
-      </w:pPr>
-      <w:rPr>
-        <w:rFonts w:ascii="Wingdings" w:hAnsi="Wingdings" w:hint="default"/>
-        <w:sz w:val="20"/>
-      </w:rPr>
-    </w:lvl>
-    <w:lvl w:ilvl="3" w:tentative="1">
-      <w:start w:val="1"/>
-      <w:numFmt w:val="bullet"/>
-      <w:lvlText w:val=""/>
-      <w:lvlJc w:val="left"/>
-      <w:pPr>
-        <w:tabs>
-          <w:tab w:val="num" w:pos="2880"/>
-        </w:tabs>
-        <w:ind w:left="2880" w:hanging="360"/>
-      </w:pPr>
-      <w:rPr>
-        <w:rFonts w:ascii="Wingdings" w:hAnsi="Wingdings" w:hint="default"/>
-        <w:sz w:val="20"/>
-      </w:rPr>
-    </w:lvl>
-    <w:lvl w:ilvl="4" w:tentative="1">
-      <w:start w:val="1"/>
-      <w:numFmt w:val="bullet"/>
-      <w:lvlText w:val=""/>
-      <w:lvlJc w:val="left"/>
-      <w:pPr>
-        <w:tabs>
-          <w:tab w:val="num" w:pos="3600"/>
-        </w:tabs>
-        <w:ind w:left="3600" w:hanging="360"/>
-      </w:pPr>
-      <w:rPr>
-        <w:rFonts w:ascii="Wingdings" w:hAnsi="Wingdings" w:hint="default"/>
-        <w:sz w:val="20"/>
-      </w:rPr>
-    </w:lvl>
-    <w:lvl w:ilvl="5" w:tentative="1">
-      <w:start w:val="1"/>
-      <w:numFmt w:val="bullet"/>
-      <w:lvlText w:val=""/>
-      <w:lvlJc w:val="left"/>
-      <w:pPr>
-        <w:tabs>
-          <w:tab w:val="num" w:pos="4320"/>
-        </w:tabs>
-        <w:ind w:left="4320" w:hanging="360"/>
-      </w:pPr>
-      <w:rPr>
-        <w:rFonts w:ascii="Wingdings" w:hAnsi="Wingdings" w:hint="default"/>
-        <w:sz w:val="20"/>
-      </w:rPr>
-    </w:lvl>
-    <w:lvl w:ilvl="6" w:tentative="1">
-      <w:start w:val="1"/>
-      <w:numFmt w:val="bullet"/>
-      <w:lvlText w:val=""/>
-      <w:lvlJc w:val="left"/>
-      <w:pPr>
-        <w:tabs>
-          <w:tab w:val="num" w:pos="5040"/>
-        </w:tabs>
-        <w:ind w:left="5040" w:hanging="360"/>
-      </w:pPr>
-      <w:rPr>
-        <w:rFonts w:ascii="Wingdings" w:hAnsi="Wingdings" w:hint="default"/>
-        <w:sz w:val="20"/>
-      </w:rPr>
-    </w:lvl>
-    <w:lvl w:ilvl="7" w:tentative="1">
-      <w:start w:val="1"/>
-      <w:numFmt w:val="bullet"/>
-      <w:lvlText w:val=""/>
-      <w:lvlJc w:val="left"/>
-      <w:pPr>
-        <w:tabs>
-          <w:tab w:val="num" w:pos="5760"/>
-        </w:tabs>
-        <w:ind w:left="5760" w:hanging="360"/>
-      </w:pPr>
-      <w:rPr>
-        <w:rFonts w:ascii="Wingdings" w:hAnsi="Wingdings" w:hint="default"/>
-        <w:sz w:val="20"/>
-      </w:rPr>
-    </w:lvl>
-    <w:lvl w:ilvl="8" w:tentative="1">
-      <w:start w:val="1"/>
-      <w:numFmt w:val="bullet"/>
-      <w:lvlText w:val=""/>
-      <w:lvlJc w:val="left"/>
-      <w:pPr>
-        <w:tabs>
-          <w:tab w:val="num" w:pos="6480"/>
-        </w:tabs>
-        <w:ind w:left="6480" w:hanging="360"/>
-      </w:pPr>
-      <w:rPr>
-        <w:rFonts w:ascii="Wingdings" w:hAnsi="Wingdings" w:hint="default"/>
-        <w:sz w:val="20"/>
-      </w:rPr>
-    </w:lvl>
-  </w:abstractNum>
-  <w:abstractNum w:abstractNumId="8" w15:restartNumberingAfterBreak="0">
-    <w:nsid w:val="41B1783E"/>
-    <w:multiLevelType w:val="multilevel"/>
-    <w:tmpl w:val="74D4457A"/>
+    <w:tmpl w:val="205E2628"/>
     <w:lvl w:ilvl="0">
       <w:start w:val="1"/>
       <w:numFmt w:val="decimal"/>
@@ -7778,10 +8608,10 @@
       </w:pPr>
     </w:lvl>
   </w:abstractNum>
-  <w:abstractNum w:abstractNumId="9" w15:restartNumberingAfterBreak="0">
-    <w:nsid w:val="49BA3629"/>
+  <w:abstractNum w:abstractNumId="15" w15:restartNumberingAfterBreak="0">
+    <w:nsid w:val="4200440E"/>
     <w:multiLevelType w:val="multilevel"/>
-    <w:tmpl w:val="0E00929C"/>
+    <w:tmpl w:val="34723F74"/>
     <w:lvl w:ilvl="0">
       <w:start w:val="1"/>
       <w:numFmt w:val="bullet"/>
@@ -7927,10 +8757,10 @@
       </w:rPr>
     </w:lvl>
   </w:abstractNum>
-  <w:abstractNum w:abstractNumId="10" w15:restartNumberingAfterBreak="0">
-    <w:nsid w:val="4A7365A5"/>
+  <w:abstractNum w:abstractNumId="16" w15:restartNumberingAfterBreak="0">
+    <w:nsid w:val="433349C9"/>
     <w:multiLevelType w:val="multilevel"/>
-    <w:tmpl w:val="4DB48B76"/>
+    <w:tmpl w:val="BE5439E6"/>
     <w:lvl w:ilvl="0">
       <w:start w:val="1"/>
       <w:numFmt w:val="bullet"/>
@@ -8076,10 +8906,10 @@
       </w:rPr>
     </w:lvl>
   </w:abstractNum>
-  <w:abstractNum w:abstractNumId="11" w15:restartNumberingAfterBreak="0">
-    <w:nsid w:val="4CF47CC8"/>
+  <w:abstractNum w:abstractNumId="17" w15:restartNumberingAfterBreak="0">
+    <w:nsid w:val="4BEA1ECD"/>
     <w:multiLevelType w:val="multilevel"/>
-    <w:tmpl w:val="9384AF5A"/>
+    <w:tmpl w:val="8D9881A0"/>
     <w:lvl w:ilvl="0">
       <w:start w:val="1"/>
       <w:numFmt w:val="decimal"/>
@@ -8193,159 +9023,10 @@
       </w:pPr>
     </w:lvl>
   </w:abstractNum>
-  <w:abstractNum w:abstractNumId="12" w15:restartNumberingAfterBreak="0">
-    <w:nsid w:val="4D184761"/>
+  <w:abstractNum w:abstractNumId="18" w15:restartNumberingAfterBreak="0">
+    <w:nsid w:val="587556E4"/>
     <w:multiLevelType w:val="multilevel"/>
-    <w:tmpl w:val="0F44E644"/>
-    <w:lvl w:ilvl="0">
-      <w:start w:val="1"/>
-      <w:numFmt w:val="bullet"/>
-      <w:lvlText w:val=""/>
-      <w:lvlJc w:val="left"/>
-      <w:pPr>
-        <w:tabs>
-          <w:tab w:val="num" w:pos="720"/>
-        </w:tabs>
-        <w:ind w:left="720" w:hanging="360"/>
-      </w:pPr>
-      <w:rPr>
-        <w:rFonts w:ascii="Symbol" w:hAnsi="Symbol" w:hint="default"/>
-        <w:sz w:val="20"/>
-      </w:rPr>
-    </w:lvl>
-    <w:lvl w:ilvl="1" w:tentative="1">
-      <w:start w:val="1"/>
-      <w:numFmt w:val="bullet"/>
-      <w:lvlText w:val="o"/>
-      <w:lvlJc w:val="left"/>
-      <w:pPr>
-        <w:tabs>
-          <w:tab w:val="num" w:pos="1440"/>
-        </w:tabs>
-        <w:ind w:left="1440" w:hanging="360"/>
-      </w:pPr>
-      <w:rPr>
-        <w:rFonts w:ascii="Courier New" w:hAnsi="Courier New" w:hint="default"/>
-        <w:sz w:val="20"/>
-      </w:rPr>
-    </w:lvl>
-    <w:lvl w:ilvl="2" w:tentative="1">
-      <w:start w:val="1"/>
-      <w:numFmt w:val="bullet"/>
-      <w:lvlText w:val=""/>
-      <w:lvlJc w:val="left"/>
-      <w:pPr>
-        <w:tabs>
-          <w:tab w:val="num" w:pos="2160"/>
-        </w:tabs>
-        <w:ind w:left="2160" w:hanging="360"/>
-      </w:pPr>
-      <w:rPr>
-        <w:rFonts w:ascii="Wingdings" w:hAnsi="Wingdings" w:hint="default"/>
-        <w:sz w:val="20"/>
-      </w:rPr>
-    </w:lvl>
-    <w:lvl w:ilvl="3" w:tentative="1">
-      <w:start w:val="1"/>
-      <w:numFmt w:val="bullet"/>
-      <w:lvlText w:val=""/>
-      <w:lvlJc w:val="left"/>
-      <w:pPr>
-        <w:tabs>
-          <w:tab w:val="num" w:pos="2880"/>
-        </w:tabs>
-        <w:ind w:left="2880" w:hanging="360"/>
-      </w:pPr>
-      <w:rPr>
-        <w:rFonts w:ascii="Wingdings" w:hAnsi="Wingdings" w:hint="default"/>
-        <w:sz w:val="20"/>
-      </w:rPr>
-    </w:lvl>
-    <w:lvl w:ilvl="4" w:tentative="1">
-      <w:start w:val="1"/>
-      <w:numFmt w:val="bullet"/>
-      <w:lvlText w:val=""/>
-      <w:lvlJc w:val="left"/>
-      <w:pPr>
-        <w:tabs>
-          <w:tab w:val="num" w:pos="3600"/>
-        </w:tabs>
-        <w:ind w:left="3600" w:hanging="360"/>
-      </w:pPr>
-      <w:rPr>
-        <w:rFonts w:ascii="Wingdings" w:hAnsi="Wingdings" w:hint="default"/>
-        <w:sz w:val="20"/>
-      </w:rPr>
-    </w:lvl>
-    <w:lvl w:ilvl="5" w:tentative="1">
-      <w:start w:val="1"/>
-      <w:numFmt w:val="bullet"/>
-      <w:lvlText w:val=""/>
-      <w:lvlJc w:val="left"/>
-      <w:pPr>
-        <w:tabs>
-          <w:tab w:val="num" w:pos="4320"/>
-        </w:tabs>
-        <w:ind w:left="4320" w:hanging="360"/>
-      </w:pPr>
-      <w:rPr>
-        <w:rFonts w:ascii="Wingdings" w:hAnsi="Wingdings" w:hint="default"/>
-        <w:sz w:val="20"/>
-      </w:rPr>
-    </w:lvl>
-    <w:lvl w:ilvl="6" w:tentative="1">
-      <w:start w:val="1"/>
-      <w:numFmt w:val="bullet"/>
-      <w:lvlText w:val=""/>
-      <w:lvlJc w:val="left"/>
-      <w:pPr>
-        <w:tabs>
-          <w:tab w:val="num" w:pos="5040"/>
-        </w:tabs>
-        <w:ind w:left="5040" w:hanging="360"/>
-      </w:pPr>
-      <w:rPr>
-        <w:rFonts w:ascii="Wingdings" w:hAnsi="Wingdings" w:hint="default"/>
-        <w:sz w:val="20"/>
-      </w:rPr>
-    </w:lvl>
-    <w:lvl w:ilvl="7" w:tentative="1">
-      <w:start w:val="1"/>
-      <w:numFmt w:val="bullet"/>
-      <w:lvlText w:val=""/>
-      <w:lvlJc w:val="left"/>
-      <w:pPr>
-        <w:tabs>
-          <w:tab w:val="num" w:pos="5760"/>
-        </w:tabs>
-        <w:ind w:left="5760" w:hanging="360"/>
-      </w:pPr>
-      <w:rPr>
-        <w:rFonts w:ascii="Wingdings" w:hAnsi="Wingdings" w:hint="default"/>
-        <w:sz w:val="20"/>
-      </w:rPr>
-    </w:lvl>
-    <w:lvl w:ilvl="8" w:tentative="1">
-      <w:start w:val="1"/>
-      <w:numFmt w:val="bullet"/>
-      <w:lvlText w:val=""/>
-      <w:lvlJc w:val="left"/>
-      <w:pPr>
-        <w:tabs>
-          <w:tab w:val="num" w:pos="6480"/>
-        </w:tabs>
-        <w:ind w:left="6480" w:hanging="360"/>
-      </w:pPr>
-      <w:rPr>
-        <w:rFonts w:ascii="Wingdings" w:hAnsi="Wingdings" w:hint="default"/>
-        <w:sz w:val="20"/>
-      </w:rPr>
-    </w:lvl>
-  </w:abstractNum>
-  <w:abstractNum w:abstractNumId="13" w15:restartNumberingAfterBreak="0">
-    <w:nsid w:val="51A03C88"/>
-    <w:multiLevelType w:val="multilevel"/>
-    <w:tmpl w:val="C9D0C1DC"/>
+    <w:tmpl w:val="5B0E8DC2"/>
     <w:lvl w:ilvl="0">
       <w:start w:val="1"/>
       <w:numFmt w:val="decimal"/>
@@ -8459,10 +9140,10 @@
       </w:pPr>
     </w:lvl>
   </w:abstractNum>
-  <w:abstractNum w:abstractNumId="14" w15:restartNumberingAfterBreak="0">
-    <w:nsid w:val="52607A08"/>
+  <w:abstractNum w:abstractNumId="19" w15:restartNumberingAfterBreak="0">
+    <w:nsid w:val="5CCF4415"/>
     <w:multiLevelType w:val="multilevel"/>
-    <w:tmpl w:val="910CDEAE"/>
+    <w:tmpl w:val="17C076EE"/>
     <w:lvl w:ilvl="0">
       <w:start w:val="1"/>
       <w:numFmt w:val="bullet"/>
@@ -8608,10 +9289,10 @@
       </w:rPr>
     </w:lvl>
   </w:abstractNum>
-  <w:abstractNum w:abstractNumId="15" w15:restartNumberingAfterBreak="0">
-    <w:nsid w:val="54620450"/>
+  <w:abstractNum w:abstractNumId="20" w15:restartNumberingAfterBreak="0">
+    <w:nsid w:val="6FAE32C3"/>
     <w:multiLevelType w:val="multilevel"/>
-    <w:tmpl w:val="29DE83AC"/>
+    <w:tmpl w:val="F07C8ECC"/>
     <w:lvl w:ilvl="0">
       <w:start w:val="1"/>
       <w:numFmt w:val="bullet"/>
@@ -8757,10 +9438,308 @@
       </w:rPr>
     </w:lvl>
   </w:abstractNum>
-  <w:abstractNum w:abstractNumId="16" w15:restartNumberingAfterBreak="0">
-    <w:nsid w:val="5A466E48"/>
+  <w:abstractNum w:abstractNumId="21" w15:restartNumberingAfterBreak="0">
+    <w:nsid w:val="703B56DC"/>
     <w:multiLevelType w:val="multilevel"/>
-    <w:tmpl w:val="0F20A44C"/>
+    <w:tmpl w:val="02F0106A"/>
+    <w:lvl w:ilvl="0">
+      <w:start w:val="1"/>
+      <w:numFmt w:val="bullet"/>
+      <w:lvlText w:val=""/>
+      <w:lvlJc w:val="left"/>
+      <w:pPr>
+        <w:tabs>
+          <w:tab w:val="num" w:pos="720"/>
+        </w:tabs>
+        <w:ind w:left="720" w:hanging="360"/>
+      </w:pPr>
+      <w:rPr>
+        <w:rFonts w:ascii="Symbol" w:hAnsi="Symbol" w:hint="default"/>
+        <w:sz w:val="20"/>
+      </w:rPr>
+    </w:lvl>
+    <w:lvl w:ilvl="1" w:tentative="1">
+      <w:start w:val="1"/>
+      <w:numFmt w:val="bullet"/>
+      <w:lvlText w:val="o"/>
+      <w:lvlJc w:val="left"/>
+      <w:pPr>
+        <w:tabs>
+          <w:tab w:val="num" w:pos="1440"/>
+        </w:tabs>
+        <w:ind w:left="1440" w:hanging="360"/>
+      </w:pPr>
+      <w:rPr>
+        <w:rFonts w:ascii="Courier New" w:hAnsi="Courier New" w:hint="default"/>
+        <w:sz w:val="20"/>
+      </w:rPr>
+    </w:lvl>
+    <w:lvl w:ilvl="2" w:tentative="1">
+      <w:start w:val="1"/>
+      <w:numFmt w:val="bullet"/>
+      <w:lvlText w:val=""/>
+      <w:lvlJc w:val="left"/>
+      <w:pPr>
+        <w:tabs>
+          <w:tab w:val="num" w:pos="2160"/>
+        </w:tabs>
+        <w:ind w:left="2160" w:hanging="360"/>
+      </w:pPr>
+      <w:rPr>
+        <w:rFonts w:ascii="Wingdings" w:hAnsi="Wingdings" w:hint="default"/>
+        <w:sz w:val="20"/>
+      </w:rPr>
+    </w:lvl>
+    <w:lvl w:ilvl="3" w:tentative="1">
+      <w:start w:val="1"/>
+      <w:numFmt w:val="bullet"/>
+      <w:lvlText w:val=""/>
+      <w:lvlJc w:val="left"/>
+      <w:pPr>
+        <w:tabs>
+          <w:tab w:val="num" w:pos="2880"/>
+        </w:tabs>
+        <w:ind w:left="2880" w:hanging="360"/>
+      </w:pPr>
+      <w:rPr>
+        <w:rFonts w:ascii="Wingdings" w:hAnsi="Wingdings" w:hint="default"/>
+        <w:sz w:val="20"/>
+      </w:rPr>
+    </w:lvl>
+    <w:lvl w:ilvl="4" w:tentative="1">
+      <w:start w:val="1"/>
+      <w:numFmt w:val="bullet"/>
+      <w:lvlText w:val=""/>
+      <w:lvlJc w:val="left"/>
+      <w:pPr>
+        <w:tabs>
+          <w:tab w:val="num" w:pos="3600"/>
+        </w:tabs>
+        <w:ind w:left="3600" w:hanging="360"/>
+      </w:pPr>
+      <w:rPr>
+        <w:rFonts w:ascii="Wingdings" w:hAnsi="Wingdings" w:hint="default"/>
+        <w:sz w:val="20"/>
+      </w:rPr>
+    </w:lvl>
+    <w:lvl w:ilvl="5" w:tentative="1">
+      <w:start w:val="1"/>
+      <w:numFmt w:val="bullet"/>
+      <w:lvlText w:val=""/>
+      <w:lvlJc w:val="left"/>
+      <w:pPr>
+        <w:tabs>
+          <w:tab w:val="num" w:pos="4320"/>
+        </w:tabs>
+        <w:ind w:left="4320" w:hanging="360"/>
+      </w:pPr>
+      <w:rPr>
+        <w:rFonts w:ascii="Wingdings" w:hAnsi="Wingdings" w:hint="default"/>
+        <w:sz w:val="20"/>
+      </w:rPr>
+    </w:lvl>
+    <w:lvl w:ilvl="6" w:tentative="1">
+      <w:start w:val="1"/>
+      <w:numFmt w:val="bullet"/>
+      <w:lvlText w:val=""/>
+      <w:lvlJc w:val="left"/>
+      <w:pPr>
+        <w:tabs>
+          <w:tab w:val="num" w:pos="5040"/>
+        </w:tabs>
+        <w:ind w:left="5040" w:hanging="360"/>
+      </w:pPr>
+      <w:rPr>
+        <w:rFonts w:ascii="Wingdings" w:hAnsi="Wingdings" w:hint="default"/>
+        <w:sz w:val="20"/>
+      </w:rPr>
+    </w:lvl>
+    <w:lvl w:ilvl="7" w:tentative="1">
+      <w:start w:val="1"/>
+      <w:numFmt w:val="bullet"/>
+      <w:lvlText w:val=""/>
+      <w:lvlJc w:val="left"/>
+      <w:pPr>
+        <w:tabs>
+          <w:tab w:val="num" w:pos="5760"/>
+        </w:tabs>
+        <w:ind w:left="5760" w:hanging="360"/>
+      </w:pPr>
+      <w:rPr>
+        <w:rFonts w:ascii="Wingdings" w:hAnsi="Wingdings" w:hint="default"/>
+        <w:sz w:val="20"/>
+      </w:rPr>
+    </w:lvl>
+    <w:lvl w:ilvl="8" w:tentative="1">
+      <w:start w:val="1"/>
+      <w:numFmt w:val="bullet"/>
+      <w:lvlText w:val=""/>
+      <w:lvlJc w:val="left"/>
+      <w:pPr>
+        <w:tabs>
+          <w:tab w:val="num" w:pos="6480"/>
+        </w:tabs>
+        <w:ind w:left="6480" w:hanging="360"/>
+      </w:pPr>
+      <w:rPr>
+        <w:rFonts w:ascii="Wingdings" w:hAnsi="Wingdings" w:hint="default"/>
+        <w:sz w:val="20"/>
+      </w:rPr>
+    </w:lvl>
+  </w:abstractNum>
+  <w:abstractNum w:abstractNumId="22" w15:restartNumberingAfterBreak="0">
+    <w:nsid w:val="75B319F1"/>
+    <w:multiLevelType w:val="multilevel"/>
+    <w:tmpl w:val="B2B65ECE"/>
+    <w:lvl w:ilvl="0">
+      <w:start w:val="1"/>
+      <w:numFmt w:val="bullet"/>
+      <w:lvlText w:val=""/>
+      <w:lvlJc w:val="left"/>
+      <w:pPr>
+        <w:tabs>
+          <w:tab w:val="num" w:pos="720"/>
+        </w:tabs>
+        <w:ind w:left="720" w:hanging="360"/>
+      </w:pPr>
+      <w:rPr>
+        <w:rFonts w:ascii="Symbol" w:hAnsi="Symbol" w:hint="default"/>
+        <w:sz w:val="20"/>
+      </w:rPr>
+    </w:lvl>
+    <w:lvl w:ilvl="1" w:tentative="1">
+      <w:start w:val="1"/>
+      <w:numFmt w:val="bullet"/>
+      <w:lvlText w:val="o"/>
+      <w:lvlJc w:val="left"/>
+      <w:pPr>
+        <w:tabs>
+          <w:tab w:val="num" w:pos="1440"/>
+        </w:tabs>
+        <w:ind w:left="1440" w:hanging="360"/>
+      </w:pPr>
+      <w:rPr>
+        <w:rFonts w:ascii="Courier New" w:hAnsi="Courier New" w:hint="default"/>
+        <w:sz w:val="20"/>
+      </w:rPr>
+    </w:lvl>
+    <w:lvl w:ilvl="2" w:tentative="1">
+      <w:start w:val="1"/>
+      <w:numFmt w:val="bullet"/>
+      <w:lvlText w:val=""/>
+      <w:lvlJc w:val="left"/>
+      <w:pPr>
+        <w:tabs>
+          <w:tab w:val="num" w:pos="2160"/>
+        </w:tabs>
+        <w:ind w:left="2160" w:hanging="360"/>
+      </w:pPr>
+      <w:rPr>
+        <w:rFonts w:ascii="Wingdings" w:hAnsi="Wingdings" w:hint="default"/>
+        <w:sz w:val="20"/>
+      </w:rPr>
+    </w:lvl>
+    <w:lvl w:ilvl="3" w:tentative="1">
+      <w:start w:val="1"/>
+      <w:numFmt w:val="bullet"/>
+      <w:lvlText w:val=""/>
+      <w:lvlJc w:val="left"/>
+      <w:pPr>
+        <w:tabs>
+          <w:tab w:val="num" w:pos="2880"/>
+        </w:tabs>
+        <w:ind w:left="2880" w:hanging="360"/>
+      </w:pPr>
+      <w:rPr>
+        <w:rFonts w:ascii="Wingdings" w:hAnsi="Wingdings" w:hint="default"/>
+        <w:sz w:val="20"/>
+      </w:rPr>
+    </w:lvl>
+    <w:lvl w:ilvl="4" w:tentative="1">
+      <w:start w:val="1"/>
+      <w:numFmt w:val="bullet"/>
+      <w:lvlText w:val=""/>
+      <w:lvlJc w:val="left"/>
+      <w:pPr>
+        <w:tabs>
+          <w:tab w:val="num" w:pos="3600"/>
+        </w:tabs>
+        <w:ind w:left="3600" w:hanging="360"/>
+      </w:pPr>
+      <w:rPr>
+        <w:rFonts w:ascii="Wingdings" w:hAnsi="Wingdings" w:hint="default"/>
+        <w:sz w:val="20"/>
+      </w:rPr>
+    </w:lvl>
+    <w:lvl w:ilvl="5" w:tentative="1">
+      <w:start w:val="1"/>
+      <w:numFmt w:val="bullet"/>
+      <w:lvlText w:val=""/>
+      <w:lvlJc w:val="left"/>
+      <w:pPr>
+        <w:tabs>
+          <w:tab w:val="num" w:pos="4320"/>
+        </w:tabs>
+        <w:ind w:left="4320" w:hanging="360"/>
+      </w:pPr>
+      <w:rPr>
+        <w:rFonts w:ascii="Wingdings" w:hAnsi="Wingdings" w:hint="default"/>
+        <w:sz w:val="20"/>
+      </w:rPr>
+    </w:lvl>
+    <w:lvl w:ilvl="6" w:tentative="1">
+      <w:start w:val="1"/>
+      <w:numFmt w:val="bullet"/>
+      <w:lvlText w:val=""/>
+      <w:lvlJc w:val="left"/>
+      <w:pPr>
+        <w:tabs>
+          <w:tab w:val="num" w:pos="5040"/>
+        </w:tabs>
+        <w:ind w:left="5040" w:hanging="360"/>
+      </w:pPr>
+      <w:rPr>
+        <w:rFonts w:ascii="Wingdings" w:hAnsi="Wingdings" w:hint="default"/>
+        <w:sz w:val="20"/>
+      </w:rPr>
+    </w:lvl>
+    <w:lvl w:ilvl="7" w:tentative="1">
+      <w:start w:val="1"/>
+      <w:numFmt w:val="bullet"/>
+      <w:lvlText w:val=""/>
+      <w:lvlJc w:val="left"/>
+      <w:pPr>
+        <w:tabs>
+          <w:tab w:val="num" w:pos="5760"/>
+        </w:tabs>
+        <w:ind w:left="5760" w:hanging="360"/>
+      </w:pPr>
+      <w:rPr>
+        <w:rFonts w:ascii="Wingdings" w:hAnsi="Wingdings" w:hint="default"/>
+        <w:sz w:val="20"/>
+      </w:rPr>
+    </w:lvl>
+    <w:lvl w:ilvl="8" w:tentative="1">
+      <w:start w:val="1"/>
+      <w:numFmt w:val="bullet"/>
+      <w:lvlText w:val=""/>
+      <w:lvlJc w:val="left"/>
+      <w:pPr>
+        <w:tabs>
+          <w:tab w:val="num" w:pos="6480"/>
+        </w:tabs>
+        <w:ind w:left="6480" w:hanging="360"/>
+      </w:pPr>
+      <w:rPr>
+        <w:rFonts w:ascii="Wingdings" w:hAnsi="Wingdings" w:hint="default"/>
+        <w:sz w:val="20"/>
+      </w:rPr>
+    </w:lvl>
+  </w:abstractNum>
+  <w:abstractNum w:abstractNumId="23" w15:restartNumberingAfterBreak="0">
+    <w:nsid w:val="7D6571B5"/>
+    <w:multiLevelType w:val="multilevel"/>
+    <w:tmpl w:val="D51C4D7E"/>
     <w:lvl w:ilvl="0">
       <w:start w:val="1"/>
       <w:numFmt w:val="decimal"/>
@@ -8874,1056 +9853,77 @@
       </w:pPr>
     </w:lvl>
   </w:abstractNum>
-  <w:abstractNum w:abstractNumId="17" w15:restartNumberingAfterBreak="0">
-    <w:nsid w:val="5C457D02"/>
-    <w:multiLevelType w:val="multilevel"/>
-    <w:tmpl w:val="2B1AE864"/>
-    <w:lvl w:ilvl="0">
-      <w:start w:val="1"/>
-      <w:numFmt w:val="bullet"/>
-      <w:lvlText w:val=""/>
-      <w:lvlJc w:val="left"/>
-      <w:pPr>
-        <w:tabs>
-          <w:tab w:val="num" w:pos="720"/>
-        </w:tabs>
-        <w:ind w:left="720" w:hanging="360"/>
-      </w:pPr>
-      <w:rPr>
-        <w:rFonts w:ascii="Symbol" w:hAnsi="Symbol" w:hint="default"/>
-        <w:sz w:val="20"/>
-      </w:rPr>
-    </w:lvl>
-    <w:lvl w:ilvl="1" w:tentative="1">
-      <w:start w:val="1"/>
-      <w:numFmt w:val="bullet"/>
-      <w:lvlText w:val="o"/>
-      <w:lvlJc w:val="left"/>
-      <w:pPr>
-        <w:tabs>
-          <w:tab w:val="num" w:pos="1440"/>
-        </w:tabs>
-        <w:ind w:left="1440" w:hanging="360"/>
-      </w:pPr>
-      <w:rPr>
-        <w:rFonts w:ascii="Courier New" w:hAnsi="Courier New" w:hint="default"/>
-        <w:sz w:val="20"/>
-      </w:rPr>
-    </w:lvl>
-    <w:lvl w:ilvl="2" w:tentative="1">
-      <w:start w:val="1"/>
-      <w:numFmt w:val="bullet"/>
-      <w:lvlText w:val=""/>
-      <w:lvlJc w:val="left"/>
-      <w:pPr>
-        <w:tabs>
-          <w:tab w:val="num" w:pos="2160"/>
-        </w:tabs>
-        <w:ind w:left="2160" w:hanging="360"/>
-      </w:pPr>
-      <w:rPr>
-        <w:rFonts w:ascii="Wingdings" w:hAnsi="Wingdings" w:hint="default"/>
-        <w:sz w:val="20"/>
-      </w:rPr>
-    </w:lvl>
-    <w:lvl w:ilvl="3" w:tentative="1">
-      <w:start w:val="1"/>
-      <w:numFmt w:val="bullet"/>
-      <w:lvlText w:val=""/>
-      <w:lvlJc w:val="left"/>
-      <w:pPr>
-        <w:tabs>
-          <w:tab w:val="num" w:pos="2880"/>
-        </w:tabs>
-        <w:ind w:left="2880" w:hanging="360"/>
-      </w:pPr>
-      <w:rPr>
-        <w:rFonts w:ascii="Wingdings" w:hAnsi="Wingdings" w:hint="default"/>
-        <w:sz w:val="20"/>
-      </w:rPr>
-    </w:lvl>
-    <w:lvl w:ilvl="4" w:tentative="1">
-      <w:start w:val="1"/>
-      <w:numFmt w:val="bullet"/>
-      <w:lvlText w:val=""/>
-      <w:lvlJc w:val="left"/>
-      <w:pPr>
-        <w:tabs>
-          <w:tab w:val="num" w:pos="3600"/>
-        </w:tabs>
-        <w:ind w:left="3600" w:hanging="360"/>
-      </w:pPr>
-      <w:rPr>
-        <w:rFonts w:ascii="Wingdings" w:hAnsi="Wingdings" w:hint="default"/>
-        <w:sz w:val="20"/>
-      </w:rPr>
-    </w:lvl>
-    <w:lvl w:ilvl="5" w:tentative="1">
-      <w:start w:val="1"/>
-      <w:numFmt w:val="bullet"/>
-      <w:lvlText w:val=""/>
-      <w:lvlJc w:val="left"/>
-      <w:pPr>
-        <w:tabs>
-          <w:tab w:val="num" w:pos="4320"/>
-        </w:tabs>
-        <w:ind w:left="4320" w:hanging="360"/>
-      </w:pPr>
-      <w:rPr>
-        <w:rFonts w:ascii="Wingdings" w:hAnsi="Wingdings" w:hint="default"/>
-        <w:sz w:val="20"/>
-      </w:rPr>
-    </w:lvl>
-    <w:lvl w:ilvl="6" w:tentative="1">
-      <w:start w:val="1"/>
-      <w:numFmt w:val="bullet"/>
-      <w:lvlText w:val=""/>
-      <w:lvlJc w:val="left"/>
-      <w:pPr>
-        <w:tabs>
-          <w:tab w:val="num" w:pos="5040"/>
-        </w:tabs>
-        <w:ind w:left="5040" w:hanging="360"/>
-      </w:pPr>
-      <w:rPr>
-        <w:rFonts w:ascii="Wingdings" w:hAnsi="Wingdings" w:hint="default"/>
-        <w:sz w:val="20"/>
-      </w:rPr>
-    </w:lvl>
-    <w:lvl w:ilvl="7" w:tentative="1">
-      <w:start w:val="1"/>
-      <w:numFmt w:val="bullet"/>
-      <w:lvlText w:val=""/>
-      <w:lvlJc w:val="left"/>
-      <w:pPr>
-        <w:tabs>
-          <w:tab w:val="num" w:pos="5760"/>
-        </w:tabs>
-        <w:ind w:left="5760" w:hanging="360"/>
-      </w:pPr>
-      <w:rPr>
-        <w:rFonts w:ascii="Wingdings" w:hAnsi="Wingdings" w:hint="default"/>
-        <w:sz w:val="20"/>
-      </w:rPr>
-    </w:lvl>
-    <w:lvl w:ilvl="8" w:tentative="1">
-      <w:start w:val="1"/>
-      <w:numFmt w:val="bullet"/>
-      <w:lvlText w:val=""/>
-      <w:lvlJc w:val="left"/>
-      <w:pPr>
-        <w:tabs>
-          <w:tab w:val="num" w:pos="6480"/>
-        </w:tabs>
-        <w:ind w:left="6480" w:hanging="360"/>
-      </w:pPr>
-      <w:rPr>
-        <w:rFonts w:ascii="Wingdings" w:hAnsi="Wingdings" w:hint="default"/>
-        <w:sz w:val="20"/>
-      </w:rPr>
-    </w:lvl>
-  </w:abstractNum>
-  <w:abstractNum w:abstractNumId="18" w15:restartNumberingAfterBreak="0">
-    <w:nsid w:val="60295F08"/>
-    <w:multiLevelType w:val="multilevel"/>
-    <w:tmpl w:val="EDB851CE"/>
-    <w:lvl w:ilvl="0">
-      <w:start w:val="1"/>
-      <w:numFmt w:val="bullet"/>
-      <w:lvlText w:val=""/>
-      <w:lvlJc w:val="left"/>
-      <w:pPr>
-        <w:tabs>
-          <w:tab w:val="num" w:pos="720"/>
-        </w:tabs>
-        <w:ind w:left="720" w:hanging="360"/>
-      </w:pPr>
-      <w:rPr>
-        <w:rFonts w:ascii="Symbol" w:hAnsi="Symbol" w:hint="default"/>
-        <w:sz w:val="20"/>
-      </w:rPr>
-    </w:lvl>
-    <w:lvl w:ilvl="1" w:tentative="1">
-      <w:start w:val="1"/>
-      <w:numFmt w:val="bullet"/>
-      <w:lvlText w:val="o"/>
-      <w:lvlJc w:val="left"/>
-      <w:pPr>
-        <w:tabs>
-          <w:tab w:val="num" w:pos="1440"/>
-        </w:tabs>
-        <w:ind w:left="1440" w:hanging="360"/>
-      </w:pPr>
-      <w:rPr>
-        <w:rFonts w:ascii="Courier New" w:hAnsi="Courier New" w:hint="default"/>
-        <w:sz w:val="20"/>
-      </w:rPr>
-    </w:lvl>
-    <w:lvl w:ilvl="2" w:tentative="1">
-      <w:start w:val="1"/>
-      <w:numFmt w:val="bullet"/>
-      <w:lvlText w:val=""/>
-      <w:lvlJc w:val="left"/>
-      <w:pPr>
-        <w:tabs>
-          <w:tab w:val="num" w:pos="2160"/>
-        </w:tabs>
-        <w:ind w:left="2160" w:hanging="360"/>
-      </w:pPr>
-      <w:rPr>
-        <w:rFonts w:ascii="Wingdings" w:hAnsi="Wingdings" w:hint="default"/>
-        <w:sz w:val="20"/>
-      </w:rPr>
-    </w:lvl>
-    <w:lvl w:ilvl="3" w:tentative="1">
-      <w:start w:val="1"/>
-      <w:numFmt w:val="bullet"/>
-      <w:lvlText w:val=""/>
-      <w:lvlJc w:val="left"/>
-      <w:pPr>
-        <w:tabs>
-          <w:tab w:val="num" w:pos="2880"/>
-        </w:tabs>
-        <w:ind w:left="2880" w:hanging="360"/>
-      </w:pPr>
-      <w:rPr>
-        <w:rFonts w:ascii="Wingdings" w:hAnsi="Wingdings" w:hint="default"/>
-        <w:sz w:val="20"/>
-      </w:rPr>
-    </w:lvl>
-    <w:lvl w:ilvl="4" w:tentative="1">
-      <w:start w:val="1"/>
-      <w:numFmt w:val="bullet"/>
-      <w:lvlText w:val=""/>
-      <w:lvlJc w:val="left"/>
-      <w:pPr>
-        <w:tabs>
-          <w:tab w:val="num" w:pos="3600"/>
-        </w:tabs>
-        <w:ind w:left="3600" w:hanging="360"/>
-      </w:pPr>
-      <w:rPr>
-        <w:rFonts w:ascii="Wingdings" w:hAnsi="Wingdings" w:hint="default"/>
-        <w:sz w:val="20"/>
-      </w:rPr>
-    </w:lvl>
-    <w:lvl w:ilvl="5" w:tentative="1">
-      <w:start w:val="1"/>
-      <w:numFmt w:val="bullet"/>
-      <w:lvlText w:val=""/>
-      <w:lvlJc w:val="left"/>
-      <w:pPr>
-        <w:tabs>
-          <w:tab w:val="num" w:pos="4320"/>
-        </w:tabs>
-        <w:ind w:left="4320" w:hanging="360"/>
-      </w:pPr>
-      <w:rPr>
-        <w:rFonts w:ascii="Wingdings" w:hAnsi="Wingdings" w:hint="default"/>
-        <w:sz w:val="20"/>
-      </w:rPr>
-    </w:lvl>
-    <w:lvl w:ilvl="6" w:tentative="1">
-      <w:start w:val="1"/>
-      <w:numFmt w:val="bullet"/>
-      <w:lvlText w:val=""/>
-      <w:lvlJc w:val="left"/>
-      <w:pPr>
-        <w:tabs>
-          <w:tab w:val="num" w:pos="5040"/>
-        </w:tabs>
-        <w:ind w:left="5040" w:hanging="360"/>
-      </w:pPr>
-      <w:rPr>
-        <w:rFonts w:ascii="Wingdings" w:hAnsi="Wingdings" w:hint="default"/>
-        <w:sz w:val="20"/>
-      </w:rPr>
-    </w:lvl>
-    <w:lvl w:ilvl="7" w:tentative="1">
-      <w:start w:val="1"/>
-      <w:numFmt w:val="bullet"/>
-      <w:lvlText w:val=""/>
-      <w:lvlJc w:val="left"/>
-      <w:pPr>
-        <w:tabs>
-          <w:tab w:val="num" w:pos="5760"/>
-        </w:tabs>
-        <w:ind w:left="5760" w:hanging="360"/>
-      </w:pPr>
-      <w:rPr>
-        <w:rFonts w:ascii="Wingdings" w:hAnsi="Wingdings" w:hint="default"/>
-        <w:sz w:val="20"/>
-      </w:rPr>
-    </w:lvl>
-    <w:lvl w:ilvl="8" w:tentative="1">
-      <w:start w:val="1"/>
-      <w:numFmt w:val="bullet"/>
-      <w:lvlText w:val=""/>
-      <w:lvlJc w:val="left"/>
-      <w:pPr>
-        <w:tabs>
-          <w:tab w:val="num" w:pos="6480"/>
-        </w:tabs>
-        <w:ind w:left="6480" w:hanging="360"/>
-      </w:pPr>
-      <w:rPr>
-        <w:rFonts w:ascii="Wingdings" w:hAnsi="Wingdings" w:hint="default"/>
-        <w:sz w:val="20"/>
-      </w:rPr>
-    </w:lvl>
-  </w:abstractNum>
-  <w:abstractNum w:abstractNumId="19" w15:restartNumberingAfterBreak="0">
-    <w:nsid w:val="610C5543"/>
-    <w:multiLevelType w:val="multilevel"/>
-    <w:tmpl w:val="1C38F110"/>
-    <w:lvl w:ilvl="0">
-      <w:start w:val="1"/>
-      <w:numFmt w:val="bullet"/>
-      <w:lvlText w:val=""/>
-      <w:lvlJc w:val="left"/>
-      <w:pPr>
-        <w:tabs>
-          <w:tab w:val="num" w:pos="720"/>
-        </w:tabs>
-        <w:ind w:left="720" w:hanging="360"/>
-      </w:pPr>
-      <w:rPr>
-        <w:rFonts w:ascii="Symbol" w:hAnsi="Symbol" w:hint="default"/>
-        <w:sz w:val="20"/>
-      </w:rPr>
-    </w:lvl>
-    <w:lvl w:ilvl="1" w:tentative="1">
-      <w:start w:val="1"/>
-      <w:numFmt w:val="bullet"/>
-      <w:lvlText w:val="o"/>
-      <w:lvlJc w:val="left"/>
-      <w:pPr>
-        <w:tabs>
-          <w:tab w:val="num" w:pos="1440"/>
-        </w:tabs>
-        <w:ind w:left="1440" w:hanging="360"/>
-      </w:pPr>
-      <w:rPr>
-        <w:rFonts w:ascii="Courier New" w:hAnsi="Courier New" w:hint="default"/>
-        <w:sz w:val="20"/>
-      </w:rPr>
-    </w:lvl>
-    <w:lvl w:ilvl="2" w:tentative="1">
-      <w:start w:val="1"/>
-      <w:numFmt w:val="bullet"/>
-      <w:lvlText w:val=""/>
-      <w:lvlJc w:val="left"/>
-      <w:pPr>
-        <w:tabs>
-          <w:tab w:val="num" w:pos="2160"/>
-        </w:tabs>
-        <w:ind w:left="2160" w:hanging="360"/>
-      </w:pPr>
-      <w:rPr>
-        <w:rFonts w:ascii="Wingdings" w:hAnsi="Wingdings" w:hint="default"/>
-        <w:sz w:val="20"/>
-      </w:rPr>
-    </w:lvl>
-    <w:lvl w:ilvl="3" w:tentative="1">
-      <w:start w:val="1"/>
-      <w:numFmt w:val="bullet"/>
-      <w:lvlText w:val=""/>
-      <w:lvlJc w:val="left"/>
-      <w:pPr>
-        <w:tabs>
-          <w:tab w:val="num" w:pos="2880"/>
-        </w:tabs>
-        <w:ind w:left="2880" w:hanging="360"/>
-      </w:pPr>
-      <w:rPr>
-        <w:rFonts w:ascii="Wingdings" w:hAnsi="Wingdings" w:hint="default"/>
-        <w:sz w:val="20"/>
-      </w:rPr>
-    </w:lvl>
-    <w:lvl w:ilvl="4" w:tentative="1">
-      <w:start w:val="1"/>
-      <w:numFmt w:val="bullet"/>
-      <w:lvlText w:val=""/>
-      <w:lvlJc w:val="left"/>
-      <w:pPr>
-        <w:tabs>
-          <w:tab w:val="num" w:pos="3600"/>
-        </w:tabs>
-        <w:ind w:left="3600" w:hanging="360"/>
-      </w:pPr>
-      <w:rPr>
-        <w:rFonts w:ascii="Wingdings" w:hAnsi="Wingdings" w:hint="default"/>
-        <w:sz w:val="20"/>
-      </w:rPr>
-    </w:lvl>
-    <w:lvl w:ilvl="5" w:tentative="1">
-      <w:start w:val="1"/>
-      <w:numFmt w:val="bullet"/>
-      <w:lvlText w:val=""/>
-      <w:lvlJc w:val="left"/>
-      <w:pPr>
-        <w:tabs>
-          <w:tab w:val="num" w:pos="4320"/>
-        </w:tabs>
-        <w:ind w:left="4320" w:hanging="360"/>
-      </w:pPr>
-      <w:rPr>
-        <w:rFonts w:ascii="Wingdings" w:hAnsi="Wingdings" w:hint="default"/>
-        <w:sz w:val="20"/>
-      </w:rPr>
-    </w:lvl>
-    <w:lvl w:ilvl="6" w:tentative="1">
-      <w:start w:val="1"/>
-      <w:numFmt w:val="bullet"/>
-      <w:lvlText w:val=""/>
-      <w:lvlJc w:val="left"/>
-      <w:pPr>
-        <w:tabs>
-          <w:tab w:val="num" w:pos="5040"/>
-        </w:tabs>
-        <w:ind w:left="5040" w:hanging="360"/>
-      </w:pPr>
-      <w:rPr>
-        <w:rFonts w:ascii="Wingdings" w:hAnsi="Wingdings" w:hint="default"/>
-        <w:sz w:val="20"/>
-      </w:rPr>
-    </w:lvl>
-    <w:lvl w:ilvl="7" w:tentative="1">
-      <w:start w:val="1"/>
-      <w:numFmt w:val="bullet"/>
-      <w:lvlText w:val=""/>
-      <w:lvlJc w:val="left"/>
-      <w:pPr>
-        <w:tabs>
-          <w:tab w:val="num" w:pos="5760"/>
-        </w:tabs>
-        <w:ind w:left="5760" w:hanging="360"/>
-      </w:pPr>
-      <w:rPr>
-        <w:rFonts w:ascii="Wingdings" w:hAnsi="Wingdings" w:hint="default"/>
-        <w:sz w:val="20"/>
-      </w:rPr>
-    </w:lvl>
-    <w:lvl w:ilvl="8" w:tentative="1">
-      <w:start w:val="1"/>
-      <w:numFmt w:val="bullet"/>
-      <w:lvlText w:val=""/>
-      <w:lvlJc w:val="left"/>
-      <w:pPr>
-        <w:tabs>
-          <w:tab w:val="num" w:pos="6480"/>
-        </w:tabs>
-        <w:ind w:left="6480" w:hanging="360"/>
-      </w:pPr>
-      <w:rPr>
-        <w:rFonts w:ascii="Wingdings" w:hAnsi="Wingdings" w:hint="default"/>
-        <w:sz w:val="20"/>
-      </w:rPr>
-    </w:lvl>
-  </w:abstractNum>
-  <w:abstractNum w:abstractNumId="20" w15:restartNumberingAfterBreak="0">
-    <w:nsid w:val="667A1063"/>
-    <w:multiLevelType w:val="multilevel"/>
-    <w:tmpl w:val="9FFAD29A"/>
-    <w:lvl w:ilvl="0">
-      <w:start w:val="1"/>
-      <w:numFmt w:val="decimal"/>
-      <w:lvlText w:val="%1."/>
-      <w:lvlJc w:val="left"/>
-      <w:pPr>
-        <w:tabs>
-          <w:tab w:val="num" w:pos="720"/>
-        </w:tabs>
-        <w:ind w:left="720" w:hanging="360"/>
-      </w:pPr>
-    </w:lvl>
-    <w:lvl w:ilvl="1">
-      <w:start w:val="1"/>
-      <w:numFmt w:val="bullet"/>
-      <w:lvlText w:val="o"/>
-      <w:lvlJc w:val="left"/>
-      <w:pPr>
-        <w:tabs>
-          <w:tab w:val="num" w:pos="1440"/>
-        </w:tabs>
-        <w:ind w:left="1440" w:hanging="360"/>
-      </w:pPr>
-      <w:rPr>
-        <w:rFonts w:ascii="Courier New" w:hAnsi="Courier New" w:hint="default"/>
-        <w:sz w:val="20"/>
-      </w:rPr>
-    </w:lvl>
-    <w:lvl w:ilvl="2" w:tentative="1">
-      <w:start w:val="1"/>
-      <w:numFmt w:val="decimal"/>
-      <w:lvlText w:val="%3."/>
-      <w:lvlJc w:val="left"/>
-      <w:pPr>
-        <w:tabs>
-          <w:tab w:val="num" w:pos="2160"/>
-        </w:tabs>
-        <w:ind w:left="2160" w:hanging="360"/>
-      </w:pPr>
-    </w:lvl>
-    <w:lvl w:ilvl="3" w:tentative="1">
-      <w:start w:val="1"/>
-      <w:numFmt w:val="decimal"/>
-      <w:lvlText w:val="%4."/>
-      <w:lvlJc w:val="left"/>
-      <w:pPr>
-        <w:tabs>
-          <w:tab w:val="num" w:pos="2880"/>
-        </w:tabs>
-        <w:ind w:left="2880" w:hanging="360"/>
-      </w:pPr>
-    </w:lvl>
-    <w:lvl w:ilvl="4" w:tentative="1">
-      <w:start w:val="1"/>
-      <w:numFmt w:val="decimal"/>
-      <w:lvlText w:val="%5."/>
-      <w:lvlJc w:val="left"/>
-      <w:pPr>
-        <w:tabs>
-          <w:tab w:val="num" w:pos="3600"/>
-        </w:tabs>
-        <w:ind w:left="3600" w:hanging="360"/>
-      </w:pPr>
-    </w:lvl>
-    <w:lvl w:ilvl="5" w:tentative="1">
-      <w:start w:val="1"/>
-      <w:numFmt w:val="decimal"/>
-      <w:lvlText w:val="%6."/>
-      <w:lvlJc w:val="left"/>
-      <w:pPr>
-        <w:tabs>
-          <w:tab w:val="num" w:pos="4320"/>
-        </w:tabs>
-        <w:ind w:left="4320" w:hanging="360"/>
-      </w:pPr>
-    </w:lvl>
-    <w:lvl w:ilvl="6" w:tentative="1">
-      <w:start w:val="1"/>
-      <w:numFmt w:val="decimal"/>
-      <w:lvlText w:val="%7."/>
-      <w:lvlJc w:val="left"/>
-      <w:pPr>
-        <w:tabs>
-          <w:tab w:val="num" w:pos="5040"/>
-        </w:tabs>
-        <w:ind w:left="5040" w:hanging="360"/>
-      </w:pPr>
-    </w:lvl>
-    <w:lvl w:ilvl="7" w:tentative="1">
-      <w:start w:val="1"/>
-      <w:numFmt w:val="decimal"/>
-      <w:lvlText w:val="%8."/>
-      <w:lvlJc w:val="left"/>
-      <w:pPr>
-        <w:tabs>
-          <w:tab w:val="num" w:pos="5760"/>
-        </w:tabs>
-        <w:ind w:left="5760" w:hanging="360"/>
-      </w:pPr>
-    </w:lvl>
-    <w:lvl w:ilvl="8" w:tentative="1">
-      <w:start w:val="1"/>
-      <w:numFmt w:val="decimal"/>
-      <w:lvlText w:val="%9."/>
-      <w:lvlJc w:val="left"/>
-      <w:pPr>
-        <w:tabs>
-          <w:tab w:val="num" w:pos="6480"/>
-        </w:tabs>
-        <w:ind w:left="6480" w:hanging="360"/>
-      </w:pPr>
-    </w:lvl>
-  </w:abstractNum>
-  <w:abstractNum w:abstractNumId="21" w15:restartNumberingAfterBreak="0">
-    <w:nsid w:val="68C35F01"/>
-    <w:multiLevelType w:val="multilevel"/>
-    <w:tmpl w:val="0110126E"/>
-    <w:lvl w:ilvl="0">
-      <w:start w:val="1"/>
-      <w:numFmt w:val="bullet"/>
-      <w:lvlText w:val=""/>
-      <w:lvlJc w:val="left"/>
-      <w:pPr>
-        <w:tabs>
-          <w:tab w:val="num" w:pos="720"/>
-        </w:tabs>
-        <w:ind w:left="720" w:hanging="360"/>
-      </w:pPr>
-      <w:rPr>
-        <w:rFonts w:ascii="Symbol" w:hAnsi="Symbol" w:hint="default"/>
-        <w:sz w:val="20"/>
-      </w:rPr>
-    </w:lvl>
-    <w:lvl w:ilvl="1" w:tentative="1">
-      <w:start w:val="1"/>
-      <w:numFmt w:val="bullet"/>
-      <w:lvlText w:val="o"/>
-      <w:lvlJc w:val="left"/>
-      <w:pPr>
-        <w:tabs>
-          <w:tab w:val="num" w:pos="1440"/>
-        </w:tabs>
-        <w:ind w:left="1440" w:hanging="360"/>
-      </w:pPr>
-      <w:rPr>
-        <w:rFonts w:ascii="Courier New" w:hAnsi="Courier New" w:hint="default"/>
-        <w:sz w:val="20"/>
-      </w:rPr>
-    </w:lvl>
-    <w:lvl w:ilvl="2" w:tentative="1">
-      <w:start w:val="1"/>
-      <w:numFmt w:val="bullet"/>
-      <w:lvlText w:val=""/>
-      <w:lvlJc w:val="left"/>
-      <w:pPr>
-        <w:tabs>
-          <w:tab w:val="num" w:pos="2160"/>
-        </w:tabs>
-        <w:ind w:left="2160" w:hanging="360"/>
-      </w:pPr>
-      <w:rPr>
-        <w:rFonts w:ascii="Wingdings" w:hAnsi="Wingdings" w:hint="default"/>
-        <w:sz w:val="20"/>
-      </w:rPr>
-    </w:lvl>
-    <w:lvl w:ilvl="3" w:tentative="1">
-      <w:start w:val="1"/>
-      <w:numFmt w:val="bullet"/>
-      <w:lvlText w:val=""/>
-      <w:lvlJc w:val="left"/>
-      <w:pPr>
-        <w:tabs>
-          <w:tab w:val="num" w:pos="2880"/>
-        </w:tabs>
-        <w:ind w:left="2880" w:hanging="360"/>
-      </w:pPr>
-      <w:rPr>
-        <w:rFonts w:ascii="Wingdings" w:hAnsi="Wingdings" w:hint="default"/>
-        <w:sz w:val="20"/>
-      </w:rPr>
-    </w:lvl>
-    <w:lvl w:ilvl="4" w:tentative="1">
-      <w:start w:val="1"/>
-      <w:numFmt w:val="bullet"/>
-      <w:lvlText w:val=""/>
-      <w:lvlJc w:val="left"/>
-      <w:pPr>
-        <w:tabs>
-          <w:tab w:val="num" w:pos="3600"/>
-        </w:tabs>
-        <w:ind w:left="3600" w:hanging="360"/>
-      </w:pPr>
-      <w:rPr>
-        <w:rFonts w:ascii="Wingdings" w:hAnsi="Wingdings" w:hint="default"/>
-        <w:sz w:val="20"/>
-      </w:rPr>
-    </w:lvl>
-    <w:lvl w:ilvl="5" w:tentative="1">
-      <w:start w:val="1"/>
-      <w:numFmt w:val="bullet"/>
-      <w:lvlText w:val=""/>
-      <w:lvlJc w:val="left"/>
-      <w:pPr>
-        <w:tabs>
-          <w:tab w:val="num" w:pos="4320"/>
-        </w:tabs>
-        <w:ind w:left="4320" w:hanging="360"/>
-      </w:pPr>
-      <w:rPr>
-        <w:rFonts w:ascii="Wingdings" w:hAnsi="Wingdings" w:hint="default"/>
-        <w:sz w:val="20"/>
-      </w:rPr>
-    </w:lvl>
-    <w:lvl w:ilvl="6" w:tentative="1">
-      <w:start w:val="1"/>
-      <w:numFmt w:val="bullet"/>
-      <w:lvlText w:val=""/>
-      <w:lvlJc w:val="left"/>
-      <w:pPr>
-        <w:tabs>
-          <w:tab w:val="num" w:pos="5040"/>
-        </w:tabs>
-        <w:ind w:left="5040" w:hanging="360"/>
-      </w:pPr>
-      <w:rPr>
-        <w:rFonts w:ascii="Wingdings" w:hAnsi="Wingdings" w:hint="default"/>
-        <w:sz w:val="20"/>
-      </w:rPr>
-    </w:lvl>
-    <w:lvl w:ilvl="7" w:tentative="1">
-      <w:start w:val="1"/>
-      <w:numFmt w:val="bullet"/>
-      <w:lvlText w:val=""/>
-      <w:lvlJc w:val="left"/>
-      <w:pPr>
-        <w:tabs>
-          <w:tab w:val="num" w:pos="5760"/>
-        </w:tabs>
-        <w:ind w:left="5760" w:hanging="360"/>
-      </w:pPr>
-      <w:rPr>
-        <w:rFonts w:ascii="Wingdings" w:hAnsi="Wingdings" w:hint="default"/>
-        <w:sz w:val="20"/>
-      </w:rPr>
-    </w:lvl>
-    <w:lvl w:ilvl="8" w:tentative="1">
-      <w:start w:val="1"/>
-      <w:numFmt w:val="bullet"/>
-      <w:lvlText w:val=""/>
-      <w:lvlJc w:val="left"/>
-      <w:pPr>
-        <w:tabs>
-          <w:tab w:val="num" w:pos="6480"/>
-        </w:tabs>
-        <w:ind w:left="6480" w:hanging="360"/>
-      </w:pPr>
-      <w:rPr>
-        <w:rFonts w:ascii="Wingdings" w:hAnsi="Wingdings" w:hint="default"/>
-        <w:sz w:val="20"/>
-      </w:rPr>
-    </w:lvl>
-  </w:abstractNum>
-  <w:abstractNum w:abstractNumId="22" w15:restartNumberingAfterBreak="0">
-    <w:nsid w:val="69FB03EA"/>
-    <w:multiLevelType w:val="multilevel"/>
-    <w:tmpl w:val="AC4AFE90"/>
-    <w:lvl w:ilvl="0">
-      <w:start w:val="1"/>
-      <w:numFmt w:val="decimal"/>
-      <w:lvlText w:val="%1."/>
-      <w:lvlJc w:val="left"/>
-      <w:pPr>
-        <w:tabs>
-          <w:tab w:val="num" w:pos="720"/>
-        </w:tabs>
-        <w:ind w:left="720" w:hanging="360"/>
-      </w:pPr>
-    </w:lvl>
-    <w:lvl w:ilvl="1">
-      <w:start w:val="1"/>
-      <w:numFmt w:val="bullet"/>
-      <w:lvlText w:val="o"/>
-      <w:lvlJc w:val="left"/>
-      <w:pPr>
-        <w:tabs>
-          <w:tab w:val="num" w:pos="1440"/>
-        </w:tabs>
-        <w:ind w:left="1440" w:hanging="360"/>
-      </w:pPr>
-      <w:rPr>
-        <w:rFonts w:ascii="Courier New" w:hAnsi="Courier New" w:hint="default"/>
-        <w:sz w:val="20"/>
-      </w:rPr>
-    </w:lvl>
-    <w:lvl w:ilvl="2" w:tentative="1">
-      <w:start w:val="1"/>
-      <w:numFmt w:val="decimal"/>
-      <w:lvlText w:val="%3."/>
-      <w:lvlJc w:val="left"/>
-      <w:pPr>
-        <w:tabs>
-          <w:tab w:val="num" w:pos="2160"/>
-        </w:tabs>
-        <w:ind w:left="2160" w:hanging="360"/>
-      </w:pPr>
-    </w:lvl>
-    <w:lvl w:ilvl="3" w:tentative="1">
-      <w:start w:val="1"/>
-      <w:numFmt w:val="decimal"/>
-      <w:lvlText w:val="%4."/>
-      <w:lvlJc w:val="left"/>
-      <w:pPr>
-        <w:tabs>
-          <w:tab w:val="num" w:pos="2880"/>
-        </w:tabs>
-        <w:ind w:left="2880" w:hanging="360"/>
-      </w:pPr>
-    </w:lvl>
-    <w:lvl w:ilvl="4" w:tentative="1">
-      <w:start w:val="1"/>
-      <w:numFmt w:val="decimal"/>
-      <w:lvlText w:val="%5."/>
-      <w:lvlJc w:val="left"/>
-      <w:pPr>
-        <w:tabs>
-          <w:tab w:val="num" w:pos="3600"/>
-        </w:tabs>
-        <w:ind w:left="3600" w:hanging="360"/>
-      </w:pPr>
-    </w:lvl>
-    <w:lvl w:ilvl="5" w:tentative="1">
-      <w:start w:val="1"/>
-      <w:numFmt w:val="decimal"/>
-      <w:lvlText w:val="%6."/>
-      <w:lvlJc w:val="left"/>
-      <w:pPr>
-        <w:tabs>
-          <w:tab w:val="num" w:pos="4320"/>
-        </w:tabs>
-        <w:ind w:left="4320" w:hanging="360"/>
-      </w:pPr>
-    </w:lvl>
-    <w:lvl w:ilvl="6" w:tentative="1">
-      <w:start w:val="1"/>
-      <w:numFmt w:val="decimal"/>
-      <w:lvlText w:val="%7."/>
-      <w:lvlJc w:val="left"/>
-      <w:pPr>
-        <w:tabs>
-          <w:tab w:val="num" w:pos="5040"/>
-        </w:tabs>
-        <w:ind w:left="5040" w:hanging="360"/>
-      </w:pPr>
-    </w:lvl>
-    <w:lvl w:ilvl="7" w:tentative="1">
-      <w:start w:val="1"/>
-      <w:numFmt w:val="decimal"/>
-      <w:lvlText w:val="%8."/>
-      <w:lvlJc w:val="left"/>
-      <w:pPr>
-        <w:tabs>
-          <w:tab w:val="num" w:pos="5760"/>
-        </w:tabs>
-        <w:ind w:left="5760" w:hanging="360"/>
-      </w:pPr>
-    </w:lvl>
-    <w:lvl w:ilvl="8" w:tentative="1">
-      <w:start w:val="1"/>
-      <w:numFmt w:val="decimal"/>
-      <w:lvlText w:val="%9."/>
-      <w:lvlJc w:val="left"/>
-      <w:pPr>
-        <w:tabs>
-          <w:tab w:val="num" w:pos="6480"/>
-        </w:tabs>
-        <w:ind w:left="6480" w:hanging="360"/>
-      </w:pPr>
-    </w:lvl>
-  </w:abstractNum>
-  <w:abstractNum w:abstractNumId="23" w15:restartNumberingAfterBreak="0">
-    <w:nsid w:val="763A5F07"/>
-    <w:multiLevelType w:val="multilevel"/>
-    <w:tmpl w:val="C60AEC24"/>
-    <w:lvl w:ilvl="0">
-      <w:start w:val="1"/>
-      <w:numFmt w:val="bullet"/>
-      <w:lvlText w:val=""/>
-      <w:lvlJc w:val="left"/>
-      <w:pPr>
-        <w:tabs>
-          <w:tab w:val="num" w:pos="720"/>
-        </w:tabs>
-        <w:ind w:left="720" w:hanging="360"/>
-      </w:pPr>
-      <w:rPr>
-        <w:rFonts w:ascii="Symbol" w:hAnsi="Symbol" w:hint="default"/>
-        <w:sz w:val="20"/>
-      </w:rPr>
-    </w:lvl>
-    <w:lvl w:ilvl="1" w:tentative="1">
-      <w:start w:val="1"/>
-      <w:numFmt w:val="bullet"/>
-      <w:lvlText w:val="o"/>
-      <w:lvlJc w:val="left"/>
-      <w:pPr>
-        <w:tabs>
-          <w:tab w:val="num" w:pos="1440"/>
-        </w:tabs>
-        <w:ind w:left="1440" w:hanging="360"/>
-      </w:pPr>
-      <w:rPr>
-        <w:rFonts w:ascii="Courier New" w:hAnsi="Courier New" w:hint="default"/>
-        <w:sz w:val="20"/>
-      </w:rPr>
-    </w:lvl>
-    <w:lvl w:ilvl="2" w:tentative="1">
-      <w:start w:val="1"/>
-      <w:numFmt w:val="bullet"/>
-      <w:lvlText w:val=""/>
-      <w:lvlJc w:val="left"/>
-      <w:pPr>
-        <w:tabs>
-          <w:tab w:val="num" w:pos="2160"/>
-        </w:tabs>
-        <w:ind w:left="2160" w:hanging="360"/>
-      </w:pPr>
-      <w:rPr>
-        <w:rFonts w:ascii="Wingdings" w:hAnsi="Wingdings" w:hint="default"/>
-        <w:sz w:val="20"/>
-      </w:rPr>
-    </w:lvl>
-    <w:lvl w:ilvl="3" w:tentative="1">
-      <w:start w:val="1"/>
-      <w:numFmt w:val="bullet"/>
-      <w:lvlText w:val=""/>
-      <w:lvlJc w:val="left"/>
-      <w:pPr>
-        <w:tabs>
-          <w:tab w:val="num" w:pos="2880"/>
-        </w:tabs>
-        <w:ind w:left="2880" w:hanging="360"/>
-      </w:pPr>
-      <w:rPr>
-        <w:rFonts w:ascii="Wingdings" w:hAnsi="Wingdings" w:hint="default"/>
-        <w:sz w:val="20"/>
-      </w:rPr>
-    </w:lvl>
-    <w:lvl w:ilvl="4" w:tentative="1">
-      <w:start w:val="1"/>
-      <w:numFmt w:val="bullet"/>
-      <w:lvlText w:val=""/>
-      <w:lvlJc w:val="left"/>
-      <w:pPr>
-        <w:tabs>
-          <w:tab w:val="num" w:pos="3600"/>
-        </w:tabs>
-        <w:ind w:left="3600" w:hanging="360"/>
-      </w:pPr>
-      <w:rPr>
-        <w:rFonts w:ascii="Wingdings" w:hAnsi="Wingdings" w:hint="default"/>
-        <w:sz w:val="20"/>
-      </w:rPr>
-    </w:lvl>
-    <w:lvl w:ilvl="5" w:tentative="1">
-      <w:start w:val="1"/>
-      <w:numFmt w:val="bullet"/>
-      <w:lvlText w:val=""/>
-      <w:lvlJc w:val="left"/>
-      <w:pPr>
-        <w:tabs>
-          <w:tab w:val="num" w:pos="4320"/>
-        </w:tabs>
-        <w:ind w:left="4320" w:hanging="360"/>
-      </w:pPr>
-      <w:rPr>
-        <w:rFonts w:ascii="Wingdings" w:hAnsi="Wingdings" w:hint="default"/>
-        <w:sz w:val="20"/>
-      </w:rPr>
-    </w:lvl>
-    <w:lvl w:ilvl="6" w:tentative="1">
-      <w:start w:val="1"/>
-      <w:numFmt w:val="bullet"/>
-      <w:lvlText w:val=""/>
-      <w:lvlJc w:val="left"/>
-      <w:pPr>
-        <w:tabs>
-          <w:tab w:val="num" w:pos="5040"/>
-        </w:tabs>
-        <w:ind w:left="5040" w:hanging="360"/>
-      </w:pPr>
-      <w:rPr>
-        <w:rFonts w:ascii="Wingdings" w:hAnsi="Wingdings" w:hint="default"/>
-        <w:sz w:val="20"/>
-      </w:rPr>
-    </w:lvl>
-    <w:lvl w:ilvl="7" w:tentative="1">
-      <w:start w:val="1"/>
-      <w:numFmt w:val="bullet"/>
-      <w:lvlText w:val=""/>
-      <w:lvlJc w:val="left"/>
-      <w:pPr>
-        <w:tabs>
-          <w:tab w:val="num" w:pos="5760"/>
-        </w:tabs>
-        <w:ind w:left="5760" w:hanging="360"/>
-      </w:pPr>
-      <w:rPr>
-        <w:rFonts w:ascii="Wingdings" w:hAnsi="Wingdings" w:hint="default"/>
-        <w:sz w:val="20"/>
-      </w:rPr>
-    </w:lvl>
-    <w:lvl w:ilvl="8" w:tentative="1">
-      <w:start w:val="1"/>
-      <w:numFmt w:val="bullet"/>
-      <w:lvlText w:val=""/>
-      <w:lvlJc w:val="left"/>
-      <w:pPr>
-        <w:tabs>
-          <w:tab w:val="num" w:pos="6480"/>
-        </w:tabs>
-        <w:ind w:left="6480" w:hanging="360"/>
-      </w:pPr>
-      <w:rPr>
-        <w:rFonts w:ascii="Wingdings" w:hAnsi="Wingdings" w:hint="default"/>
-        <w:sz w:val="20"/>
-      </w:rPr>
-    </w:lvl>
-  </w:abstractNum>
-  <w:num w:numId="1" w16cid:durableId="1142040967">
+  <w:num w:numId="1" w16cid:durableId="1785928519">
+    <w:abstractNumId w:val="20"/>
+  </w:num>
+  <w:num w:numId="2" w16cid:durableId="1433091898">
+    <w:abstractNumId w:val="11"/>
+  </w:num>
+  <w:num w:numId="3" w16cid:durableId="1959332771">
+    <w:abstractNumId w:val="18"/>
+  </w:num>
+  <w:num w:numId="4" w16cid:durableId="757217153">
+    <w:abstractNumId w:val="10"/>
+  </w:num>
+  <w:num w:numId="5" w16cid:durableId="709643889">
+    <w:abstractNumId w:val="5"/>
+  </w:num>
+  <w:num w:numId="6" w16cid:durableId="2131390395">
+    <w:abstractNumId w:val="2"/>
+  </w:num>
+  <w:num w:numId="7" w16cid:durableId="1438603822">
+    <w:abstractNumId w:val="13"/>
+  </w:num>
+  <w:num w:numId="8" w16cid:durableId="2083746221">
+    <w:abstractNumId w:val="21"/>
+  </w:num>
+  <w:num w:numId="9" w16cid:durableId="1076592137">
+    <w:abstractNumId w:val="16"/>
+  </w:num>
+  <w:num w:numId="10" w16cid:durableId="44526923">
+    <w:abstractNumId w:val="1"/>
+  </w:num>
+  <w:num w:numId="11" w16cid:durableId="447510136">
+    <w:abstractNumId w:val="12"/>
+  </w:num>
+  <w:num w:numId="12" w16cid:durableId="1427074482">
+    <w:abstractNumId w:val="6"/>
+  </w:num>
+  <w:num w:numId="13" w16cid:durableId="79107718">
+    <w:abstractNumId w:val="8"/>
+  </w:num>
+  <w:num w:numId="14" w16cid:durableId="542139360">
+    <w:abstractNumId w:val="14"/>
+  </w:num>
+  <w:num w:numId="15" w16cid:durableId="130707303">
     <w:abstractNumId w:val="19"/>
   </w:num>
-  <w:num w:numId="2" w16cid:durableId="2127574743">
+  <w:num w:numId="16" w16cid:durableId="2046713255">
+    <w:abstractNumId w:val="7"/>
+  </w:num>
+  <w:num w:numId="17" w16cid:durableId="634530354">
+    <w:abstractNumId w:val="3"/>
+  </w:num>
+  <w:num w:numId="18" w16cid:durableId="742945943">
+    <w:abstractNumId w:val="23"/>
+  </w:num>
+  <w:num w:numId="19" w16cid:durableId="610821640">
+    <w:abstractNumId w:val="9"/>
+  </w:num>
+  <w:num w:numId="20" w16cid:durableId="326792665">
+    <w:abstractNumId w:val="4"/>
+  </w:num>
+  <w:num w:numId="21" w16cid:durableId="826363627">
+    <w:abstractNumId w:val="17"/>
+  </w:num>
+  <w:num w:numId="22" w16cid:durableId="1624118118">
     <w:abstractNumId w:val="15"/>
   </w:num>
-  <w:num w:numId="3" w16cid:durableId="541751673">
-    <w:abstractNumId w:val="5"/>
+  <w:num w:numId="23" w16cid:durableId="1343820647">
+    <w:abstractNumId w:val="22"/>
   </w:num>
-  <w:num w:numId="4" w16cid:durableId="726488050">
-    <w:abstractNumId w:val="21"/>
-  </w:num>
-  <w:num w:numId="5" w16cid:durableId="147064838">
-    <w:abstractNumId w:val="4"/>
-  </w:num>
-  <w:num w:numId="6" w16cid:durableId="1523931280">
-    <w:abstractNumId w:val="23"/>
-  </w:num>
-  <w:num w:numId="7" w16cid:durableId="1535919478">
-    <w:abstractNumId w:val="11"/>
-  </w:num>
-  <w:num w:numId="8" w16cid:durableId="742721870">
-    <w:abstractNumId w:val="1"/>
-  </w:num>
-  <w:num w:numId="9" w16cid:durableId="1116290684">
-    <w:abstractNumId w:val="2"/>
-  </w:num>
-  <w:num w:numId="10" w16cid:durableId="1903367524">
-    <w:abstractNumId w:val="20"/>
-  </w:num>
-  <w:num w:numId="11" w16cid:durableId="1903296726">
-    <w:abstractNumId w:val="18"/>
-  </w:num>
-  <w:num w:numId="12" w16cid:durableId="641809844">
-    <w:abstractNumId w:val="14"/>
-  </w:num>
-  <w:num w:numId="13" w16cid:durableId="2045672775">
-    <w:abstractNumId w:val="17"/>
-  </w:num>
-  <w:num w:numId="14" w16cid:durableId="1441757347">
-    <w:abstractNumId w:val="13"/>
-  </w:num>
-  <w:num w:numId="15" w16cid:durableId="1954165444">
-    <w:abstractNumId w:val="9"/>
-  </w:num>
-  <w:num w:numId="16" w16cid:durableId="665280382">
-    <w:abstractNumId w:val="12"/>
-  </w:num>
-  <w:num w:numId="17" w16cid:durableId="1044522080">
-    <w:abstractNumId w:val="3"/>
-  </w:num>
-  <w:num w:numId="18" w16cid:durableId="1947734775">
-    <w:abstractNumId w:val="6"/>
-  </w:num>
-  <w:num w:numId="19" w16cid:durableId="1443258147">
-    <w:abstractNumId w:val="8"/>
-  </w:num>
-  <w:num w:numId="20" w16cid:durableId="1163814860">
+  <w:num w:numId="24" w16cid:durableId="2058122310">
     <w:abstractNumId w:val="0"/>
-  </w:num>
-  <w:num w:numId="21" w16cid:durableId="1181972989">
-    <w:abstractNumId w:val="16"/>
-  </w:num>
-  <w:num w:numId="22" w16cid:durableId="1848209210">
-    <w:abstractNumId w:val="7"/>
-  </w:num>
-  <w:num w:numId="23" w16cid:durableId="1764495479">
-    <w:abstractNumId w:val="10"/>
-  </w:num>
-  <w:num w:numId="24" w16cid:durableId="1147631898">
-    <w:abstractNumId w:val="22"/>
   </w:num>
 </w:numbering>
 </file>

</xml_diff>

<commit_message>
deck, follow-along, handouts: Beacon at Discover; card slides one line per item
</commit_message>
<xml_diff>
--- a/follow-along/Azure_Local_Follow_Along_Guide.docx
+++ b/follow-along/Azure_Local_Follow_Along_Guide.docx
@@ -6566,9 +6566,9 @@
 <file path=word/numbering.xml><?xml version="1.0" encoding="utf-8"?>
 <w:numbering xmlns:wpc="http://schemas.microsoft.com/office/word/2010/wordprocessingCanvas" xmlns:cx="http://schemas.microsoft.com/office/drawing/2014/chartex" xmlns:cx1="http://schemas.microsoft.com/office/drawing/2015/9/8/chartex" xmlns:cx2="http://schemas.microsoft.com/office/drawing/2015/10/21/chartex" xmlns:cx3="http://schemas.microsoft.com/office/drawing/2016/5/9/chartex" xmlns:cx4="http://schemas.microsoft.com/office/drawing/2016/5/10/chartex" xmlns:cx5="http://schemas.microsoft.com/office/drawing/2016/5/11/chartex" xmlns:cx6="http://schemas.microsoft.com/office/drawing/2016/5/12/chartex" xmlns:cx7="http://schemas.microsoft.com/office/drawing/2016/5/13/chartex" xmlns:cx8="http://schemas.microsoft.com/office/drawing/2016/5/14/chartex" xmlns:mc="http://schemas.openxmlformats.org/markup-compatibility/2006" xmlns:aink="http://schemas.microsoft.com/office/drawing/2016/ink" xmlns:am3d="http://schemas.microsoft.com/office/drawing/2017/model3d" xmlns:o="urn:schemas-microsoft-com:office:office" xmlns:oel="http://schemas.microsoft.com/office/2019/extlst" xmlns:r="http://schemas.openxmlformats.org/officeDocument/2006/relationships" xmlns:m="http://schemas.openxmlformats.org/officeDocument/2006/math" xmlns:v="urn:schemas-microsoft-com:vml" xmlns:wp14="http://schemas.microsoft.com/office/word/2010/wordprocessingDrawing" xmlns:wp="http://schemas.openxmlformats.org/drawingml/2006/wordprocessingDrawing" xmlns:w10="urn:schemas-microsoft-com:office:word" xmlns:w="http://schemas.openxmlformats.org/wordprocessingml/2006/main" xmlns:w14="http://schemas.microsoft.com/office/word/2010/wordml" xmlns:w15="http://schemas.microsoft.com/office/word/2012/wordml" xmlns:w16cex="http://schemas.microsoft.com/office/word/2018/wordml/cex" xmlns:w16cid="http://schemas.microsoft.com/office/word/2016/wordml/cid" xmlns:w16="http://schemas.microsoft.com/office/word/2018/wordml" xmlns:w16du="http://schemas.microsoft.com/office/word/2023/wordml/word16du" xmlns:w16sdtdh="http://schemas.microsoft.com/office/word/2020/wordml/sdtdatahash" xmlns:w16sdtfl="http://schemas.microsoft.com/office/word/2024/wordml/sdtformatlock" xmlns:w16se="http://schemas.microsoft.com/office/word/2015/wordml/symex" xmlns:wpg="http://schemas.microsoft.com/office/word/2010/wordprocessingGroup" xmlns:wpi="http://schemas.microsoft.com/office/word/2010/wordprocessingInk" xmlns:wne="http://schemas.microsoft.com/office/word/2006/wordml" xmlns:wps="http://schemas.microsoft.com/office/word/2010/wordprocessingShape" mc:Ignorable="w14 w15 w16se w16cid w16 w16cex w16sdtdh w16sdtfl w16du wp14">
   <w:abstractNum w:abstractNumId="0" w15:restartNumberingAfterBreak="0">
-    <w:nsid w:val="00130E6D"/>
+    <w:nsid w:val="07BC7421"/>
     <w:multiLevelType w:val="multilevel"/>
-    <w:tmpl w:val="5448B00A"/>
+    <w:tmpl w:val="D5A6F290"/>
     <w:lvl w:ilvl="0">
       <w:start w:val="1"/>
       <w:numFmt w:val="decimal"/>
@@ -6683,9 +6683,307 @@
     </w:lvl>
   </w:abstractNum>
   <w:abstractNum w:abstractNumId="1" w15:restartNumberingAfterBreak="0">
-    <w:nsid w:val="05873D33"/>
+    <w:nsid w:val="12ED4009"/>
     <w:multiLevelType w:val="multilevel"/>
-    <w:tmpl w:val="3CFA8E64"/>
+    <w:tmpl w:val="C29EE260"/>
+    <w:lvl w:ilvl="0">
+      <w:start w:val="1"/>
+      <w:numFmt w:val="bullet"/>
+      <w:lvlText w:val=""/>
+      <w:lvlJc w:val="left"/>
+      <w:pPr>
+        <w:tabs>
+          <w:tab w:val="num" w:pos="720"/>
+        </w:tabs>
+        <w:ind w:left="720" w:hanging="360"/>
+      </w:pPr>
+      <w:rPr>
+        <w:rFonts w:ascii="Symbol" w:hAnsi="Symbol" w:hint="default"/>
+        <w:sz w:val="20"/>
+      </w:rPr>
+    </w:lvl>
+    <w:lvl w:ilvl="1" w:tentative="1">
+      <w:start w:val="1"/>
+      <w:numFmt w:val="bullet"/>
+      <w:lvlText w:val="o"/>
+      <w:lvlJc w:val="left"/>
+      <w:pPr>
+        <w:tabs>
+          <w:tab w:val="num" w:pos="1440"/>
+        </w:tabs>
+        <w:ind w:left="1440" w:hanging="360"/>
+      </w:pPr>
+      <w:rPr>
+        <w:rFonts w:ascii="Courier New" w:hAnsi="Courier New" w:hint="default"/>
+        <w:sz w:val="20"/>
+      </w:rPr>
+    </w:lvl>
+    <w:lvl w:ilvl="2" w:tentative="1">
+      <w:start w:val="1"/>
+      <w:numFmt w:val="bullet"/>
+      <w:lvlText w:val=""/>
+      <w:lvlJc w:val="left"/>
+      <w:pPr>
+        <w:tabs>
+          <w:tab w:val="num" w:pos="2160"/>
+        </w:tabs>
+        <w:ind w:left="2160" w:hanging="360"/>
+      </w:pPr>
+      <w:rPr>
+        <w:rFonts w:ascii="Wingdings" w:hAnsi="Wingdings" w:hint="default"/>
+        <w:sz w:val="20"/>
+      </w:rPr>
+    </w:lvl>
+    <w:lvl w:ilvl="3" w:tentative="1">
+      <w:start w:val="1"/>
+      <w:numFmt w:val="bullet"/>
+      <w:lvlText w:val=""/>
+      <w:lvlJc w:val="left"/>
+      <w:pPr>
+        <w:tabs>
+          <w:tab w:val="num" w:pos="2880"/>
+        </w:tabs>
+        <w:ind w:left="2880" w:hanging="360"/>
+      </w:pPr>
+      <w:rPr>
+        <w:rFonts w:ascii="Wingdings" w:hAnsi="Wingdings" w:hint="default"/>
+        <w:sz w:val="20"/>
+      </w:rPr>
+    </w:lvl>
+    <w:lvl w:ilvl="4" w:tentative="1">
+      <w:start w:val="1"/>
+      <w:numFmt w:val="bullet"/>
+      <w:lvlText w:val=""/>
+      <w:lvlJc w:val="left"/>
+      <w:pPr>
+        <w:tabs>
+          <w:tab w:val="num" w:pos="3600"/>
+        </w:tabs>
+        <w:ind w:left="3600" w:hanging="360"/>
+      </w:pPr>
+      <w:rPr>
+        <w:rFonts w:ascii="Wingdings" w:hAnsi="Wingdings" w:hint="default"/>
+        <w:sz w:val="20"/>
+      </w:rPr>
+    </w:lvl>
+    <w:lvl w:ilvl="5" w:tentative="1">
+      <w:start w:val="1"/>
+      <w:numFmt w:val="bullet"/>
+      <w:lvlText w:val=""/>
+      <w:lvlJc w:val="left"/>
+      <w:pPr>
+        <w:tabs>
+          <w:tab w:val="num" w:pos="4320"/>
+        </w:tabs>
+        <w:ind w:left="4320" w:hanging="360"/>
+      </w:pPr>
+      <w:rPr>
+        <w:rFonts w:ascii="Wingdings" w:hAnsi="Wingdings" w:hint="default"/>
+        <w:sz w:val="20"/>
+      </w:rPr>
+    </w:lvl>
+    <w:lvl w:ilvl="6" w:tentative="1">
+      <w:start w:val="1"/>
+      <w:numFmt w:val="bullet"/>
+      <w:lvlText w:val=""/>
+      <w:lvlJc w:val="left"/>
+      <w:pPr>
+        <w:tabs>
+          <w:tab w:val="num" w:pos="5040"/>
+        </w:tabs>
+        <w:ind w:left="5040" w:hanging="360"/>
+      </w:pPr>
+      <w:rPr>
+        <w:rFonts w:ascii="Wingdings" w:hAnsi="Wingdings" w:hint="default"/>
+        <w:sz w:val="20"/>
+      </w:rPr>
+    </w:lvl>
+    <w:lvl w:ilvl="7" w:tentative="1">
+      <w:start w:val="1"/>
+      <w:numFmt w:val="bullet"/>
+      <w:lvlText w:val=""/>
+      <w:lvlJc w:val="left"/>
+      <w:pPr>
+        <w:tabs>
+          <w:tab w:val="num" w:pos="5760"/>
+        </w:tabs>
+        <w:ind w:left="5760" w:hanging="360"/>
+      </w:pPr>
+      <w:rPr>
+        <w:rFonts w:ascii="Wingdings" w:hAnsi="Wingdings" w:hint="default"/>
+        <w:sz w:val="20"/>
+      </w:rPr>
+    </w:lvl>
+    <w:lvl w:ilvl="8" w:tentative="1">
+      <w:start w:val="1"/>
+      <w:numFmt w:val="bullet"/>
+      <w:lvlText w:val=""/>
+      <w:lvlJc w:val="left"/>
+      <w:pPr>
+        <w:tabs>
+          <w:tab w:val="num" w:pos="6480"/>
+        </w:tabs>
+        <w:ind w:left="6480" w:hanging="360"/>
+      </w:pPr>
+      <w:rPr>
+        <w:rFonts w:ascii="Wingdings" w:hAnsi="Wingdings" w:hint="default"/>
+        <w:sz w:val="20"/>
+      </w:rPr>
+    </w:lvl>
+  </w:abstractNum>
+  <w:abstractNum w:abstractNumId="2" w15:restartNumberingAfterBreak="0">
+    <w:nsid w:val="15713D12"/>
+    <w:multiLevelType w:val="multilevel"/>
+    <w:tmpl w:val="178238FE"/>
+    <w:lvl w:ilvl="0">
+      <w:start w:val="1"/>
+      <w:numFmt w:val="bullet"/>
+      <w:lvlText w:val=""/>
+      <w:lvlJc w:val="left"/>
+      <w:pPr>
+        <w:tabs>
+          <w:tab w:val="num" w:pos="720"/>
+        </w:tabs>
+        <w:ind w:left="720" w:hanging="360"/>
+      </w:pPr>
+      <w:rPr>
+        <w:rFonts w:ascii="Symbol" w:hAnsi="Symbol" w:hint="default"/>
+        <w:sz w:val="20"/>
+      </w:rPr>
+    </w:lvl>
+    <w:lvl w:ilvl="1" w:tentative="1">
+      <w:start w:val="1"/>
+      <w:numFmt w:val="bullet"/>
+      <w:lvlText w:val="o"/>
+      <w:lvlJc w:val="left"/>
+      <w:pPr>
+        <w:tabs>
+          <w:tab w:val="num" w:pos="1440"/>
+        </w:tabs>
+        <w:ind w:left="1440" w:hanging="360"/>
+      </w:pPr>
+      <w:rPr>
+        <w:rFonts w:ascii="Courier New" w:hAnsi="Courier New" w:hint="default"/>
+        <w:sz w:val="20"/>
+      </w:rPr>
+    </w:lvl>
+    <w:lvl w:ilvl="2" w:tentative="1">
+      <w:start w:val="1"/>
+      <w:numFmt w:val="bullet"/>
+      <w:lvlText w:val=""/>
+      <w:lvlJc w:val="left"/>
+      <w:pPr>
+        <w:tabs>
+          <w:tab w:val="num" w:pos="2160"/>
+        </w:tabs>
+        <w:ind w:left="2160" w:hanging="360"/>
+      </w:pPr>
+      <w:rPr>
+        <w:rFonts w:ascii="Wingdings" w:hAnsi="Wingdings" w:hint="default"/>
+        <w:sz w:val="20"/>
+      </w:rPr>
+    </w:lvl>
+    <w:lvl w:ilvl="3" w:tentative="1">
+      <w:start w:val="1"/>
+      <w:numFmt w:val="bullet"/>
+      <w:lvlText w:val=""/>
+      <w:lvlJc w:val="left"/>
+      <w:pPr>
+        <w:tabs>
+          <w:tab w:val="num" w:pos="2880"/>
+        </w:tabs>
+        <w:ind w:left="2880" w:hanging="360"/>
+      </w:pPr>
+      <w:rPr>
+        <w:rFonts w:ascii="Wingdings" w:hAnsi="Wingdings" w:hint="default"/>
+        <w:sz w:val="20"/>
+      </w:rPr>
+    </w:lvl>
+    <w:lvl w:ilvl="4" w:tentative="1">
+      <w:start w:val="1"/>
+      <w:numFmt w:val="bullet"/>
+      <w:lvlText w:val=""/>
+      <w:lvlJc w:val="left"/>
+      <w:pPr>
+        <w:tabs>
+          <w:tab w:val="num" w:pos="3600"/>
+        </w:tabs>
+        <w:ind w:left="3600" w:hanging="360"/>
+      </w:pPr>
+      <w:rPr>
+        <w:rFonts w:ascii="Wingdings" w:hAnsi="Wingdings" w:hint="default"/>
+        <w:sz w:val="20"/>
+      </w:rPr>
+    </w:lvl>
+    <w:lvl w:ilvl="5" w:tentative="1">
+      <w:start w:val="1"/>
+      <w:numFmt w:val="bullet"/>
+      <w:lvlText w:val=""/>
+      <w:lvlJc w:val="left"/>
+      <w:pPr>
+        <w:tabs>
+          <w:tab w:val="num" w:pos="4320"/>
+        </w:tabs>
+        <w:ind w:left="4320" w:hanging="360"/>
+      </w:pPr>
+      <w:rPr>
+        <w:rFonts w:ascii="Wingdings" w:hAnsi="Wingdings" w:hint="default"/>
+        <w:sz w:val="20"/>
+      </w:rPr>
+    </w:lvl>
+    <w:lvl w:ilvl="6" w:tentative="1">
+      <w:start w:val="1"/>
+      <w:numFmt w:val="bullet"/>
+      <w:lvlText w:val=""/>
+      <w:lvlJc w:val="left"/>
+      <w:pPr>
+        <w:tabs>
+          <w:tab w:val="num" w:pos="5040"/>
+        </w:tabs>
+        <w:ind w:left="5040" w:hanging="360"/>
+      </w:pPr>
+      <w:rPr>
+        <w:rFonts w:ascii="Wingdings" w:hAnsi="Wingdings" w:hint="default"/>
+        <w:sz w:val="20"/>
+      </w:rPr>
+    </w:lvl>
+    <w:lvl w:ilvl="7" w:tentative="1">
+      <w:start w:val="1"/>
+      <w:numFmt w:val="bullet"/>
+      <w:lvlText w:val=""/>
+      <w:lvlJc w:val="left"/>
+      <w:pPr>
+        <w:tabs>
+          <w:tab w:val="num" w:pos="5760"/>
+        </w:tabs>
+        <w:ind w:left="5760" w:hanging="360"/>
+      </w:pPr>
+      <w:rPr>
+        <w:rFonts w:ascii="Wingdings" w:hAnsi="Wingdings" w:hint="default"/>
+        <w:sz w:val="20"/>
+      </w:rPr>
+    </w:lvl>
+    <w:lvl w:ilvl="8" w:tentative="1">
+      <w:start w:val="1"/>
+      <w:numFmt w:val="bullet"/>
+      <w:lvlText w:val=""/>
+      <w:lvlJc w:val="left"/>
+      <w:pPr>
+        <w:tabs>
+          <w:tab w:val="num" w:pos="6480"/>
+        </w:tabs>
+        <w:ind w:left="6480" w:hanging="360"/>
+      </w:pPr>
+      <w:rPr>
+        <w:rFonts w:ascii="Wingdings" w:hAnsi="Wingdings" w:hint="default"/>
+        <w:sz w:val="20"/>
+      </w:rPr>
+    </w:lvl>
+  </w:abstractNum>
+  <w:abstractNum w:abstractNumId="3" w15:restartNumberingAfterBreak="0">
+    <w:nsid w:val="15CA24A5"/>
+    <w:multiLevelType w:val="multilevel"/>
+    <w:tmpl w:val="F8DA4EF6"/>
     <w:lvl w:ilvl="0">
       <w:start w:val="1"/>
       <w:numFmt w:val="decimal"/>
@@ -6799,10 +7097,10 @@
       </w:pPr>
     </w:lvl>
   </w:abstractNum>
-  <w:abstractNum w:abstractNumId="2" w15:restartNumberingAfterBreak="0">
-    <w:nsid w:val="0B4B5B71"/>
+  <w:abstractNum w:abstractNumId="4" w15:restartNumberingAfterBreak="0">
+    <w:nsid w:val="16C06E83"/>
     <w:multiLevelType w:val="multilevel"/>
-    <w:tmpl w:val="A30EE962"/>
+    <w:tmpl w:val="EEEEE1A8"/>
     <w:lvl w:ilvl="0">
       <w:start w:val="1"/>
       <w:numFmt w:val="bullet"/>
@@ -6948,10 +7246,755 @@
       </w:rPr>
     </w:lvl>
   </w:abstractNum>
-  <w:abstractNum w:abstractNumId="3" w15:restartNumberingAfterBreak="0">
-    <w:nsid w:val="0F056E9A"/>
+  <w:abstractNum w:abstractNumId="5" w15:restartNumberingAfterBreak="0">
+    <w:nsid w:val="1E7F178B"/>
     <w:multiLevelType w:val="multilevel"/>
-    <w:tmpl w:val="9410BE54"/>
+    <w:tmpl w:val="EF9E1028"/>
+    <w:lvl w:ilvl="0">
+      <w:start w:val="1"/>
+      <w:numFmt w:val="bullet"/>
+      <w:lvlText w:val=""/>
+      <w:lvlJc w:val="left"/>
+      <w:pPr>
+        <w:tabs>
+          <w:tab w:val="num" w:pos="720"/>
+        </w:tabs>
+        <w:ind w:left="720" w:hanging="360"/>
+      </w:pPr>
+      <w:rPr>
+        <w:rFonts w:ascii="Symbol" w:hAnsi="Symbol" w:hint="default"/>
+        <w:sz w:val="20"/>
+      </w:rPr>
+    </w:lvl>
+    <w:lvl w:ilvl="1" w:tentative="1">
+      <w:start w:val="1"/>
+      <w:numFmt w:val="bullet"/>
+      <w:lvlText w:val="o"/>
+      <w:lvlJc w:val="left"/>
+      <w:pPr>
+        <w:tabs>
+          <w:tab w:val="num" w:pos="1440"/>
+        </w:tabs>
+        <w:ind w:left="1440" w:hanging="360"/>
+      </w:pPr>
+      <w:rPr>
+        <w:rFonts w:ascii="Courier New" w:hAnsi="Courier New" w:hint="default"/>
+        <w:sz w:val="20"/>
+      </w:rPr>
+    </w:lvl>
+    <w:lvl w:ilvl="2" w:tentative="1">
+      <w:start w:val="1"/>
+      <w:numFmt w:val="bullet"/>
+      <w:lvlText w:val=""/>
+      <w:lvlJc w:val="left"/>
+      <w:pPr>
+        <w:tabs>
+          <w:tab w:val="num" w:pos="2160"/>
+        </w:tabs>
+        <w:ind w:left="2160" w:hanging="360"/>
+      </w:pPr>
+      <w:rPr>
+        <w:rFonts w:ascii="Wingdings" w:hAnsi="Wingdings" w:hint="default"/>
+        <w:sz w:val="20"/>
+      </w:rPr>
+    </w:lvl>
+    <w:lvl w:ilvl="3" w:tentative="1">
+      <w:start w:val="1"/>
+      <w:numFmt w:val="bullet"/>
+      <w:lvlText w:val=""/>
+      <w:lvlJc w:val="left"/>
+      <w:pPr>
+        <w:tabs>
+          <w:tab w:val="num" w:pos="2880"/>
+        </w:tabs>
+        <w:ind w:left="2880" w:hanging="360"/>
+      </w:pPr>
+      <w:rPr>
+        <w:rFonts w:ascii="Wingdings" w:hAnsi="Wingdings" w:hint="default"/>
+        <w:sz w:val="20"/>
+      </w:rPr>
+    </w:lvl>
+    <w:lvl w:ilvl="4" w:tentative="1">
+      <w:start w:val="1"/>
+      <w:numFmt w:val="bullet"/>
+      <w:lvlText w:val=""/>
+      <w:lvlJc w:val="left"/>
+      <w:pPr>
+        <w:tabs>
+          <w:tab w:val="num" w:pos="3600"/>
+        </w:tabs>
+        <w:ind w:left="3600" w:hanging="360"/>
+      </w:pPr>
+      <w:rPr>
+        <w:rFonts w:ascii="Wingdings" w:hAnsi="Wingdings" w:hint="default"/>
+        <w:sz w:val="20"/>
+      </w:rPr>
+    </w:lvl>
+    <w:lvl w:ilvl="5" w:tentative="1">
+      <w:start w:val="1"/>
+      <w:numFmt w:val="bullet"/>
+      <w:lvlText w:val=""/>
+      <w:lvlJc w:val="left"/>
+      <w:pPr>
+        <w:tabs>
+          <w:tab w:val="num" w:pos="4320"/>
+        </w:tabs>
+        <w:ind w:left="4320" w:hanging="360"/>
+      </w:pPr>
+      <w:rPr>
+        <w:rFonts w:ascii="Wingdings" w:hAnsi="Wingdings" w:hint="default"/>
+        <w:sz w:val="20"/>
+      </w:rPr>
+    </w:lvl>
+    <w:lvl w:ilvl="6" w:tentative="1">
+      <w:start w:val="1"/>
+      <w:numFmt w:val="bullet"/>
+      <w:lvlText w:val=""/>
+      <w:lvlJc w:val="left"/>
+      <w:pPr>
+        <w:tabs>
+          <w:tab w:val="num" w:pos="5040"/>
+        </w:tabs>
+        <w:ind w:left="5040" w:hanging="360"/>
+      </w:pPr>
+      <w:rPr>
+        <w:rFonts w:ascii="Wingdings" w:hAnsi="Wingdings" w:hint="default"/>
+        <w:sz w:val="20"/>
+      </w:rPr>
+    </w:lvl>
+    <w:lvl w:ilvl="7" w:tentative="1">
+      <w:start w:val="1"/>
+      <w:numFmt w:val="bullet"/>
+      <w:lvlText w:val=""/>
+      <w:lvlJc w:val="left"/>
+      <w:pPr>
+        <w:tabs>
+          <w:tab w:val="num" w:pos="5760"/>
+        </w:tabs>
+        <w:ind w:left="5760" w:hanging="360"/>
+      </w:pPr>
+      <w:rPr>
+        <w:rFonts w:ascii="Wingdings" w:hAnsi="Wingdings" w:hint="default"/>
+        <w:sz w:val="20"/>
+      </w:rPr>
+    </w:lvl>
+    <w:lvl w:ilvl="8" w:tentative="1">
+      <w:start w:val="1"/>
+      <w:numFmt w:val="bullet"/>
+      <w:lvlText w:val=""/>
+      <w:lvlJc w:val="left"/>
+      <w:pPr>
+        <w:tabs>
+          <w:tab w:val="num" w:pos="6480"/>
+        </w:tabs>
+        <w:ind w:left="6480" w:hanging="360"/>
+      </w:pPr>
+      <w:rPr>
+        <w:rFonts w:ascii="Wingdings" w:hAnsi="Wingdings" w:hint="default"/>
+        <w:sz w:val="20"/>
+      </w:rPr>
+    </w:lvl>
+  </w:abstractNum>
+  <w:abstractNum w:abstractNumId="6" w15:restartNumberingAfterBreak="0">
+    <w:nsid w:val="28726949"/>
+    <w:multiLevelType w:val="multilevel"/>
+    <w:tmpl w:val="D4E299D2"/>
+    <w:lvl w:ilvl="0">
+      <w:start w:val="1"/>
+      <w:numFmt w:val="bullet"/>
+      <w:lvlText w:val=""/>
+      <w:lvlJc w:val="left"/>
+      <w:pPr>
+        <w:tabs>
+          <w:tab w:val="num" w:pos="720"/>
+        </w:tabs>
+        <w:ind w:left="720" w:hanging="360"/>
+      </w:pPr>
+      <w:rPr>
+        <w:rFonts w:ascii="Symbol" w:hAnsi="Symbol" w:hint="default"/>
+        <w:sz w:val="20"/>
+      </w:rPr>
+    </w:lvl>
+    <w:lvl w:ilvl="1" w:tentative="1">
+      <w:start w:val="1"/>
+      <w:numFmt w:val="bullet"/>
+      <w:lvlText w:val="o"/>
+      <w:lvlJc w:val="left"/>
+      <w:pPr>
+        <w:tabs>
+          <w:tab w:val="num" w:pos="1440"/>
+        </w:tabs>
+        <w:ind w:left="1440" w:hanging="360"/>
+      </w:pPr>
+      <w:rPr>
+        <w:rFonts w:ascii="Courier New" w:hAnsi="Courier New" w:hint="default"/>
+        <w:sz w:val="20"/>
+      </w:rPr>
+    </w:lvl>
+    <w:lvl w:ilvl="2" w:tentative="1">
+      <w:start w:val="1"/>
+      <w:numFmt w:val="bullet"/>
+      <w:lvlText w:val=""/>
+      <w:lvlJc w:val="left"/>
+      <w:pPr>
+        <w:tabs>
+          <w:tab w:val="num" w:pos="2160"/>
+        </w:tabs>
+        <w:ind w:left="2160" w:hanging="360"/>
+      </w:pPr>
+      <w:rPr>
+        <w:rFonts w:ascii="Wingdings" w:hAnsi="Wingdings" w:hint="default"/>
+        <w:sz w:val="20"/>
+      </w:rPr>
+    </w:lvl>
+    <w:lvl w:ilvl="3" w:tentative="1">
+      <w:start w:val="1"/>
+      <w:numFmt w:val="bullet"/>
+      <w:lvlText w:val=""/>
+      <w:lvlJc w:val="left"/>
+      <w:pPr>
+        <w:tabs>
+          <w:tab w:val="num" w:pos="2880"/>
+        </w:tabs>
+        <w:ind w:left="2880" w:hanging="360"/>
+      </w:pPr>
+      <w:rPr>
+        <w:rFonts w:ascii="Wingdings" w:hAnsi="Wingdings" w:hint="default"/>
+        <w:sz w:val="20"/>
+      </w:rPr>
+    </w:lvl>
+    <w:lvl w:ilvl="4" w:tentative="1">
+      <w:start w:val="1"/>
+      <w:numFmt w:val="bullet"/>
+      <w:lvlText w:val=""/>
+      <w:lvlJc w:val="left"/>
+      <w:pPr>
+        <w:tabs>
+          <w:tab w:val="num" w:pos="3600"/>
+        </w:tabs>
+        <w:ind w:left="3600" w:hanging="360"/>
+      </w:pPr>
+      <w:rPr>
+        <w:rFonts w:ascii="Wingdings" w:hAnsi="Wingdings" w:hint="default"/>
+        <w:sz w:val="20"/>
+      </w:rPr>
+    </w:lvl>
+    <w:lvl w:ilvl="5" w:tentative="1">
+      <w:start w:val="1"/>
+      <w:numFmt w:val="bullet"/>
+      <w:lvlText w:val=""/>
+      <w:lvlJc w:val="left"/>
+      <w:pPr>
+        <w:tabs>
+          <w:tab w:val="num" w:pos="4320"/>
+        </w:tabs>
+        <w:ind w:left="4320" w:hanging="360"/>
+      </w:pPr>
+      <w:rPr>
+        <w:rFonts w:ascii="Wingdings" w:hAnsi="Wingdings" w:hint="default"/>
+        <w:sz w:val="20"/>
+      </w:rPr>
+    </w:lvl>
+    <w:lvl w:ilvl="6" w:tentative="1">
+      <w:start w:val="1"/>
+      <w:numFmt w:val="bullet"/>
+      <w:lvlText w:val=""/>
+      <w:lvlJc w:val="left"/>
+      <w:pPr>
+        <w:tabs>
+          <w:tab w:val="num" w:pos="5040"/>
+        </w:tabs>
+        <w:ind w:left="5040" w:hanging="360"/>
+      </w:pPr>
+      <w:rPr>
+        <w:rFonts w:ascii="Wingdings" w:hAnsi="Wingdings" w:hint="default"/>
+        <w:sz w:val="20"/>
+      </w:rPr>
+    </w:lvl>
+    <w:lvl w:ilvl="7" w:tentative="1">
+      <w:start w:val="1"/>
+      <w:numFmt w:val="bullet"/>
+      <w:lvlText w:val=""/>
+      <w:lvlJc w:val="left"/>
+      <w:pPr>
+        <w:tabs>
+          <w:tab w:val="num" w:pos="5760"/>
+        </w:tabs>
+        <w:ind w:left="5760" w:hanging="360"/>
+      </w:pPr>
+      <w:rPr>
+        <w:rFonts w:ascii="Wingdings" w:hAnsi="Wingdings" w:hint="default"/>
+        <w:sz w:val="20"/>
+      </w:rPr>
+    </w:lvl>
+    <w:lvl w:ilvl="8" w:tentative="1">
+      <w:start w:val="1"/>
+      <w:numFmt w:val="bullet"/>
+      <w:lvlText w:val=""/>
+      <w:lvlJc w:val="left"/>
+      <w:pPr>
+        <w:tabs>
+          <w:tab w:val="num" w:pos="6480"/>
+        </w:tabs>
+        <w:ind w:left="6480" w:hanging="360"/>
+      </w:pPr>
+      <w:rPr>
+        <w:rFonts w:ascii="Wingdings" w:hAnsi="Wingdings" w:hint="default"/>
+        <w:sz w:val="20"/>
+      </w:rPr>
+    </w:lvl>
+  </w:abstractNum>
+  <w:abstractNum w:abstractNumId="7" w15:restartNumberingAfterBreak="0">
+    <w:nsid w:val="38931832"/>
+    <w:multiLevelType w:val="multilevel"/>
+    <w:tmpl w:val="F848AE18"/>
+    <w:lvl w:ilvl="0">
+      <w:start w:val="1"/>
+      <w:numFmt w:val="bullet"/>
+      <w:lvlText w:val=""/>
+      <w:lvlJc w:val="left"/>
+      <w:pPr>
+        <w:tabs>
+          <w:tab w:val="num" w:pos="720"/>
+        </w:tabs>
+        <w:ind w:left="720" w:hanging="360"/>
+      </w:pPr>
+      <w:rPr>
+        <w:rFonts w:ascii="Symbol" w:hAnsi="Symbol" w:hint="default"/>
+        <w:sz w:val="20"/>
+      </w:rPr>
+    </w:lvl>
+    <w:lvl w:ilvl="1" w:tentative="1">
+      <w:start w:val="1"/>
+      <w:numFmt w:val="bullet"/>
+      <w:lvlText w:val="o"/>
+      <w:lvlJc w:val="left"/>
+      <w:pPr>
+        <w:tabs>
+          <w:tab w:val="num" w:pos="1440"/>
+        </w:tabs>
+        <w:ind w:left="1440" w:hanging="360"/>
+      </w:pPr>
+      <w:rPr>
+        <w:rFonts w:ascii="Courier New" w:hAnsi="Courier New" w:hint="default"/>
+        <w:sz w:val="20"/>
+      </w:rPr>
+    </w:lvl>
+    <w:lvl w:ilvl="2" w:tentative="1">
+      <w:start w:val="1"/>
+      <w:numFmt w:val="bullet"/>
+      <w:lvlText w:val=""/>
+      <w:lvlJc w:val="left"/>
+      <w:pPr>
+        <w:tabs>
+          <w:tab w:val="num" w:pos="2160"/>
+        </w:tabs>
+        <w:ind w:left="2160" w:hanging="360"/>
+      </w:pPr>
+      <w:rPr>
+        <w:rFonts w:ascii="Wingdings" w:hAnsi="Wingdings" w:hint="default"/>
+        <w:sz w:val="20"/>
+      </w:rPr>
+    </w:lvl>
+    <w:lvl w:ilvl="3" w:tentative="1">
+      <w:start w:val="1"/>
+      <w:numFmt w:val="bullet"/>
+      <w:lvlText w:val=""/>
+      <w:lvlJc w:val="left"/>
+      <w:pPr>
+        <w:tabs>
+          <w:tab w:val="num" w:pos="2880"/>
+        </w:tabs>
+        <w:ind w:left="2880" w:hanging="360"/>
+      </w:pPr>
+      <w:rPr>
+        <w:rFonts w:ascii="Wingdings" w:hAnsi="Wingdings" w:hint="default"/>
+        <w:sz w:val="20"/>
+      </w:rPr>
+    </w:lvl>
+    <w:lvl w:ilvl="4" w:tentative="1">
+      <w:start w:val="1"/>
+      <w:numFmt w:val="bullet"/>
+      <w:lvlText w:val=""/>
+      <w:lvlJc w:val="left"/>
+      <w:pPr>
+        <w:tabs>
+          <w:tab w:val="num" w:pos="3600"/>
+        </w:tabs>
+        <w:ind w:left="3600" w:hanging="360"/>
+      </w:pPr>
+      <w:rPr>
+        <w:rFonts w:ascii="Wingdings" w:hAnsi="Wingdings" w:hint="default"/>
+        <w:sz w:val="20"/>
+      </w:rPr>
+    </w:lvl>
+    <w:lvl w:ilvl="5" w:tentative="1">
+      <w:start w:val="1"/>
+      <w:numFmt w:val="bullet"/>
+      <w:lvlText w:val=""/>
+      <w:lvlJc w:val="left"/>
+      <w:pPr>
+        <w:tabs>
+          <w:tab w:val="num" w:pos="4320"/>
+        </w:tabs>
+        <w:ind w:left="4320" w:hanging="360"/>
+      </w:pPr>
+      <w:rPr>
+        <w:rFonts w:ascii="Wingdings" w:hAnsi="Wingdings" w:hint="default"/>
+        <w:sz w:val="20"/>
+      </w:rPr>
+    </w:lvl>
+    <w:lvl w:ilvl="6" w:tentative="1">
+      <w:start w:val="1"/>
+      <w:numFmt w:val="bullet"/>
+      <w:lvlText w:val=""/>
+      <w:lvlJc w:val="left"/>
+      <w:pPr>
+        <w:tabs>
+          <w:tab w:val="num" w:pos="5040"/>
+        </w:tabs>
+        <w:ind w:left="5040" w:hanging="360"/>
+      </w:pPr>
+      <w:rPr>
+        <w:rFonts w:ascii="Wingdings" w:hAnsi="Wingdings" w:hint="default"/>
+        <w:sz w:val="20"/>
+      </w:rPr>
+    </w:lvl>
+    <w:lvl w:ilvl="7" w:tentative="1">
+      <w:start w:val="1"/>
+      <w:numFmt w:val="bullet"/>
+      <w:lvlText w:val=""/>
+      <w:lvlJc w:val="left"/>
+      <w:pPr>
+        <w:tabs>
+          <w:tab w:val="num" w:pos="5760"/>
+        </w:tabs>
+        <w:ind w:left="5760" w:hanging="360"/>
+      </w:pPr>
+      <w:rPr>
+        <w:rFonts w:ascii="Wingdings" w:hAnsi="Wingdings" w:hint="default"/>
+        <w:sz w:val="20"/>
+      </w:rPr>
+    </w:lvl>
+    <w:lvl w:ilvl="8" w:tentative="1">
+      <w:start w:val="1"/>
+      <w:numFmt w:val="bullet"/>
+      <w:lvlText w:val=""/>
+      <w:lvlJc w:val="left"/>
+      <w:pPr>
+        <w:tabs>
+          <w:tab w:val="num" w:pos="6480"/>
+        </w:tabs>
+        <w:ind w:left="6480" w:hanging="360"/>
+      </w:pPr>
+      <w:rPr>
+        <w:rFonts w:ascii="Wingdings" w:hAnsi="Wingdings" w:hint="default"/>
+        <w:sz w:val="20"/>
+      </w:rPr>
+    </w:lvl>
+  </w:abstractNum>
+  <w:abstractNum w:abstractNumId="8" w15:restartNumberingAfterBreak="0">
+    <w:nsid w:val="3BF576E4"/>
+    <w:multiLevelType w:val="multilevel"/>
+    <w:tmpl w:val="B42A3C2E"/>
+    <w:lvl w:ilvl="0">
+      <w:start w:val="1"/>
+      <w:numFmt w:val="bullet"/>
+      <w:lvlText w:val=""/>
+      <w:lvlJc w:val="left"/>
+      <w:pPr>
+        <w:tabs>
+          <w:tab w:val="num" w:pos="720"/>
+        </w:tabs>
+        <w:ind w:left="720" w:hanging="360"/>
+      </w:pPr>
+      <w:rPr>
+        <w:rFonts w:ascii="Symbol" w:hAnsi="Symbol" w:hint="default"/>
+        <w:sz w:val="20"/>
+      </w:rPr>
+    </w:lvl>
+    <w:lvl w:ilvl="1" w:tentative="1">
+      <w:start w:val="1"/>
+      <w:numFmt w:val="bullet"/>
+      <w:lvlText w:val="o"/>
+      <w:lvlJc w:val="left"/>
+      <w:pPr>
+        <w:tabs>
+          <w:tab w:val="num" w:pos="1440"/>
+        </w:tabs>
+        <w:ind w:left="1440" w:hanging="360"/>
+      </w:pPr>
+      <w:rPr>
+        <w:rFonts w:ascii="Courier New" w:hAnsi="Courier New" w:hint="default"/>
+        <w:sz w:val="20"/>
+      </w:rPr>
+    </w:lvl>
+    <w:lvl w:ilvl="2" w:tentative="1">
+      <w:start w:val="1"/>
+      <w:numFmt w:val="bullet"/>
+      <w:lvlText w:val=""/>
+      <w:lvlJc w:val="left"/>
+      <w:pPr>
+        <w:tabs>
+          <w:tab w:val="num" w:pos="2160"/>
+        </w:tabs>
+        <w:ind w:left="2160" w:hanging="360"/>
+      </w:pPr>
+      <w:rPr>
+        <w:rFonts w:ascii="Wingdings" w:hAnsi="Wingdings" w:hint="default"/>
+        <w:sz w:val="20"/>
+      </w:rPr>
+    </w:lvl>
+    <w:lvl w:ilvl="3" w:tentative="1">
+      <w:start w:val="1"/>
+      <w:numFmt w:val="bullet"/>
+      <w:lvlText w:val=""/>
+      <w:lvlJc w:val="left"/>
+      <w:pPr>
+        <w:tabs>
+          <w:tab w:val="num" w:pos="2880"/>
+        </w:tabs>
+        <w:ind w:left="2880" w:hanging="360"/>
+      </w:pPr>
+      <w:rPr>
+        <w:rFonts w:ascii="Wingdings" w:hAnsi="Wingdings" w:hint="default"/>
+        <w:sz w:val="20"/>
+      </w:rPr>
+    </w:lvl>
+    <w:lvl w:ilvl="4" w:tentative="1">
+      <w:start w:val="1"/>
+      <w:numFmt w:val="bullet"/>
+      <w:lvlText w:val=""/>
+      <w:lvlJc w:val="left"/>
+      <w:pPr>
+        <w:tabs>
+          <w:tab w:val="num" w:pos="3600"/>
+        </w:tabs>
+        <w:ind w:left="3600" w:hanging="360"/>
+      </w:pPr>
+      <w:rPr>
+        <w:rFonts w:ascii="Wingdings" w:hAnsi="Wingdings" w:hint="default"/>
+        <w:sz w:val="20"/>
+      </w:rPr>
+    </w:lvl>
+    <w:lvl w:ilvl="5" w:tentative="1">
+      <w:start w:val="1"/>
+      <w:numFmt w:val="bullet"/>
+      <w:lvlText w:val=""/>
+      <w:lvlJc w:val="left"/>
+      <w:pPr>
+        <w:tabs>
+          <w:tab w:val="num" w:pos="4320"/>
+        </w:tabs>
+        <w:ind w:left="4320" w:hanging="360"/>
+      </w:pPr>
+      <w:rPr>
+        <w:rFonts w:ascii="Wingdings" w:hAnsi="Wingdings" w:hint="default"/>
+        <w:sz w:val="20"/>
+      </w:rPr>
+    </w:lvl>
+    <w:lvl w:ilvl="6" w:tentative="1">
+      <w:start w:val="1"/>
+      <w:numFmt w:val="bullet"/>
+      <w:lvlText w:val=""/>
+      <w:lvlJc w:val="left"/>
+      <w:pPr>
+        <w:tabs>
+          <w:tab w:val="num" w:pos="5040"/>
+        </w:tabs>
+        <w:ind w:left="5040" w:hanging="360"/>
+      </w:pPr>
+      <w:rPr>
+        <w:rFonts w:ascii="Wingdings" w:hAnsi="Wingdings" w:hint="default"/>
+        <w:sz w:val="20"/>
+      </w:rPr>
+    </w:lvl>
+    <w:lvl w:ilvl="7" w:tentative="1">
+      <w:start w:val="1"/>
+      <w:numFmt w:val="bullet"/>
+      <w:lvlText w:val=""/>
+      <w:lvlJc w:val="left"/>
+      <w:pPr>
+        <w:tabs>
+          <w:tab w:val="num" w:pos="5760"/>
+        </w:tabs>
+        <w:ind w:left="5760" w:hanging="360"/>
+      </w:pPr>
+      <w:rPr>
+        <w:rFonts w:ascii="Wingdings" w:hAnsi="Wingdings" w:hint="default"/>
+        <w:sz w:val="20"/>
+      </w:rPr>
+    </w:lvl>
+    <w:lvl w:ilvl="8" w:tentative="1">
+      <w:start w:val="1"/>
+      <w:numFmt w:val="bullet"/>
+      <w:lvlText w:val=""/>
+      <w:lvlJc w:val="left"/>
+      <w:pPr>
+        <w:tabs>
+          <w:tab w:val="num" w:pos="6480"/>
+        </w:tabs>
+        <w:ind w:left="6480" w:hanging="360"/>
+      </w:pPr>
+      <w:rPr>
+        <w:rFonts w:ascii="Wingdings" w:hAnsi="Wingdings" w:hint="default"/>
+        <w:sz w:val="20"/>
+      </w:rPr>
+    </w:lvl>
+  </w:abstractNum>
+  <w:abstractNum w:abstractNumId="9" w15:restartNumberingAfterBreak="0">
+    <w:nsid w:val="43B67114"/>
+    <w:multiLevelType w:val="multilevel"/>
+    <w:tmpl w:val="AB0A2BAE"/>
+    <w:lvl w:ilvl="0">
+      <w:start w:val="1"/>
+      <w:numFmt w:val="bullet"/>
+      <w:lvlText w:val=""/>
+      <w:lvlJc w:val="left"/>
+      <w:pPr>
+        <w:tabs>
+          <w:tab w:val="num" w:pos="720"/>
+        </w:tabs>
+        <w:ind w:left="720" w:hanging="360"/>
+      </w:pPr>
+      <w:rPr>
+        <w:rFonts w:ascii="Symbol" w:hAnsi="Symbol" w:hint="default"/>
+        <w:sz w:val="20"/>
+      </w:rPr>
+    </w:lvl>
+    <w:lvl w:ilvl="1" w:tentative="1">
+      <w:start w:val="1"/>
+      <w:numFmt w:val="bullet"/>
+      <w:lvlText w:val="o"/>
+      <w:lvlJc w:val="left"/>
+      <w:pPr>
+        <w:tabs>
+          <w:tab w:val="num" w:pos="1440"/>
+        </w:tabs>
+        <w:ind w:left="1440" w:hanging="360"/>
+      </w:pPr>
+      <w:rPr>
+        <w:rFonts w:ascii="Courier New" w:hAnsi="Courier New" w:hint="default"/>
+        <w:sz w:val="20"/>
+      </w:rPr>
+    </w:lvl>
+    <w:lvl w:ilvl="2" w:tentative="1">
+      <w:start w:val="1"/>
+      <w:numFmt w:val="bullet"/>
+      <w:lvlText w:val=""/>
+      <w:lvlJc w:val="left"/>
+      <w:pPr>
+        <w:tabs>
+          <w:tab w:val="num" w:pos="2160"/>
+        </w:tabs>
+        <w:ind w:left="2160" w:hanging="360"/>
+      </w:pPr>
+      <w:rPr>
+        <w:rFonts w:ascii="Wingdings" w:hAnsi="Wingdings" w:hint="default"/>
+        <w:sz w:val="20"/>
+      </w:rPr>
+    </w:lvl>
+    <w:lvl w:ilvl="3" w:tentative="1">
+      <w:start w:val="1"/>
+      <w:numFmt w:val="bullet"/>
+      <w:lvlText w:val=""/>
+      <w:lvlJc w:val="left"/>
+      <w:pPr>
+        <w:tabs>
+          <w:tab w:val="num" w:pos="2880"/>
+        </w:tabs>
+        <w:ind w:left="2880" w:hanging="360"/>
+      </w:pPr>
+      <w:rPr>
+        <w:rFonts w:ascii="Wingdings" w:hAnsi="Wingdings" w:hint="default"/>
+        <w:sz w:val="20"/>
+      </w:rPr>
+    </w:lvl>
+    <w:lvl w:ilvl="4" w:tentative="1">
+      <w:start w:val="1"/>
+      <w:numFmt w:val="bullet"/>
+      <w:lvlText w:val=""/>
+      <w:lvlJc w:val="left"/>
+      <w:pPr>
+        <w:tabs>
+          <w:tab w:val="num" w:pos="3600"/>
+        </w:tabs>
+        <w:ind w:left="3600" w:hanging="360"/>
+      </w:pPr>
+      <w:rPr>
+        <w:rFonts w:ascii="Wingdings" w:hAnsi="Wingdings" w:hint="default"/>
+        <w:sz w:val="20"/>
+      </w:rPr>
+    </w:lvl>
+    <w:lvl w:ilvl="5" w:tentative="1">
+      <w:start w:val="1"/>
+      <w:numFmt w:val="bullet"/>
+      <w:lvlText w:val=""/>
+      <w:lvlJc w:val="left"/>
+      <w:pPr>
+        <w:tabs>
+          <w:tab w:val="num" w:pos="4320"/>
+        </w:tabs>
+        <w:ind w:left="4320" w:hanging="360"/>
+      </w:pPr>
+      <w:rPr>
+        <w:rFonts w:ascii="Wingdings" w:hAnsi="Wingdings" w:hint="default"/>
+        <w:sz w:val="20"/>
+      </w:rPr>
+    </w:lvl>
+    <w:lvl w:ilvl="6" w:tentative="1">
+      <w:start w:val="1"/>
+      <w:numFmt w:val="bullet"/>
+      <w:lvlText w:val=""/>
+      <w:lvlJc w:val="left"/>
+      <w:pPr>
+        <w:tabs>
+          <w:tab w:val="num" w:pos="5040"/>
+        </w:tabs>
+        <w:ind w:left="5040" w:hanging="360"/>
+      </w:pPr>
+      <w:rPr>
+        <w:rFonts w:ascii="Wingdings" w:hAnsi="Wingdings" w:hint="default"/>
+        <w:sz w:val="20"/>
+      </w:rPr>
+    </w:lvl>
+    <w:lvl w:ilvl="7" w:tentative="1">
+      <w:start w:val="1"/>
+      <w:numFmt w:val="bullet"/>
+      <w:lvlText w:val=""/>
+      <w:lvlJc w:val="left"/>
+      <w:pPr>
+        <w:tabs>
+          <w:tab w:val="num" w:pos="5760"/>
+        </w:tabs>
+        <w:ind w:left="5760" w:hanging="360"/>
+      </w:pPr>
+      <w:rPr>
+        <w:rFonts w:ascii="Wingdings" w:hAnsi="Wingdings" w:hint="default"/>
+        <w:sz w:val="20"/>
+      </w:rPr>
+    </w:lvl>
+    <w:lvl w:ilvl="8" w:tentative="1">
+      <w:start w:val="1"/>
+      <w:numFmt w:val="bullet"/>
+      <w:lvlText w:val=""/>
+      <w:lvlJc w:val="left"/>
+      <w:pPr>
+        <w:tabs>
+          <w:tab w:val="num" w:pos="6480"/>
+        </w:tabs>
+        <w:ind w:left="6480" w:hanging="360"/>
+      </w:pPr>
+      <w:rPr>
+        <w:rFonts w:ascii="Wingdings" w:hAnsi="Wingdings" w:hint="default"/>
+        <w:sz w:val="20"/>
+      </w:rPr>
+    </w:lvl>
+  </w:abstractNum>
+  <w:abstractNum w:abstractNumId="10" w15:restartNumberingAfterBreak="0">
+    <w:nsid w:val="49EA4D01"/>
+    <w:multiLevelType w:val="multilevel"/>
+    <w:tmpl w:val="A4B68E0A"/>
     <w:lvl w:ilvl="0">
       <w:start w:val="1"/>
       <w:numFmt w:val="decimal"/>
@@ -7065,10 +8108,10 @@
       </w:pPr>
     </w:lvl>
   </w:abstractNum>
-  <w:abstractNum w:abstractNumId="4" w15:restartNumberingAfterBreak="0">
-    <w:nsid w:val="0FDB7E0D"/>
+  <w:abstractNum w:abstractNumId="11" w15:restartNumberingAfterBreak="0">
+    <w:nsid w:val="5251240B"/>
     <w:multiLevelType w:val="multilevel"/>
-    <w:tmpl w:val="F7AAE7D2"/>
+    <w:tmpl w:val="D55CB9F0"/>
     <w:lvl w:ilvl="0">
       <w:start w:val="1"/>
       <w:numFmt w:val="bullet"/>
@@ -7214,606 +8257,10 @@
       </w:rPr>
     </w:lvl>
   </w:abstractNum>
-  <w:abstractNum w:abstractNumId="5" w15:restartNumberingAfterBreak="0">
-    <w:nsid w:val="11F51F9E"/>
+  <w:abstractNum w:abstractNumId="12" w15:restartNumberingAfterBreak="0">
+    <w:nsid w:val="53D5678A"/>
     <w:multiLevelType w:val="multilevel"/>
-    <w:tmpl w:val="42FAFB40"/>
-    <w:lvl w:ilvl="0">
-      <w:start w:val="1"/>
-      <w:numFmt w:val="bullet"/>
-      <w:lvlText w:val=""/>
-      <w:lvlJc w:val="left"/>
-      <w:pPr>
-        <w:tabs>
-          <w:tab w:val="num" w:pos="720"/>
-        </w:tabs>
-        <w:ind w:left="720" w:hanging="360"/>
-      </w:pPr>
-      <w:rPr>
-        <w:rFonts w:ascii="Symbol" w:hAnsi="Symbol" w:hint="default"/>
-        <w:sz w:val="20"/>
-      </w:rPr>
-    </w:lvl>
-    <w:lvl w:ilvl="1" w:tentative="1">
-      <w:start w:val="1"/>
-      <w:numFmt w:val="bullet"/>
-      <w:lvlText w:val="o"/>
-      <w:lvlJc w:val="left"/>
-      <w:pPr>
-        <w:tabs>
-          <w:tab w:val="num" w:pos="1440"/>
-        </w:tabs>
-        <w:ind w:left="1440" w:hanging="360"/>
-      </w:pPr>
-      <w:rPr>
-        <w:rFonts w:ascii="Courier New" w:hAnsi="Courier New" w:hint="default"/>
-        <w:sz w:val="20"/>
-      </w:rPr>
-    </w:lvl>
-    <w:lvl w:ilvl="2" w:tentative="1">
-      <w:start w:val="1"/>
-      <w:numFmt w:val="bullet"/>
-      <w:lvlText w:val=""/>
-      <w:lvlJc w:val="left"/>
-      <w:pPr>
-        <w:tabs>
-          <w:tab w:val="num" w:pos="2160"/>
-        </w:tabs>
-        <w:ind w:left="2160" w:hanging="360"/>
-      </w:pPr>
-      <w:rPr>
-        <w:rFonts w:ascii="Wingdings" w:hAnsi="Wingdings" w:hint="default"/>
-        <w:sz w:val="20"/>
-      </w:rPr>
-    </w:lvl>
-    <w:lvl w:ilvl="3" w:tentative="1">
-      <w:start w:val="1"/>
-      <w:numFmt w:val="bullet"/>
-      <w:lvlText w:val=""/>
-      <w:lvlJc w:val="left"/>
-      <w:pPr>
-        <w:tabs>
-          <w:tab w:val="num" w:pos="2880"/>
-        </w:tabs>
-        <w:ind w:left="2880" w:hanging="360"/>
-      </w:pPr>
-      <w:rPr>
-        <w:rFonts w:ascii="Wingdings" w:hAnsi="Wingdings" w:hint="default"/>
-        <w:sz w:val="20"/>
-      </w:rPr>
-    </w:lvl>
-    <w:lvl w:ilvl="4" w:tentative="1">
-      <w:start w:val="1"/>
-      <w:numFmt w:val="bullet"/>
-      <w:lvlText w:val=""/>
-      <w:lvlJc w:val="left"/>
-      <w:pPr>
-        <w:tabs>
-          <w:tab w:val="num" w:pos="3600"/>
-        </w:tabs>
-        <w:ind w:left="3600" w:hanging="360"/>
-      </w:pPr>
-      <w:rPr>
-        <w:rFonts w:ascii="Wingdings" w:hAnsi="Wingdings" w:hint="default"/>
-        <w:sz w:val="20"/>
-      </w:rPr>
-    </w:lvl>
-    <w:lvl w:ilvl="5" w:tentative="1">
-      <w:start w:val="1"/>
-      <w:numFmt w:val="bullet"/>
-      <w:lvlText w:val=""/>
-      <w:lvlJc w:val="left"/>
-      <w:pPr>
-        <w:tabs>
-          <w:tab w:val="num" w:pos="4320"/>
-        </w:tabs>
-        <w:ind w:left="4320" w:hanging="360"/>
-      </w:pPr>
-      <w:rPr>
-        <w:rFonts w:ascii="Wingdings" w:hAnsi="Wingdings" w:hint="default"/>
-        <w:sz w:val="20"/>
-      </w:rPr>
-    </w:lvl>
-    <w:lvl w:ilvl="6" w:tentative="1">
-      <w:start w:val="1"/>
-      <w:numFmt w:val="bullet"/>
-      <w:lvlText w:val=""/>
-      <w:lvlJc w:val="left"/>
-      <w:pPr>
-        <w:tabs>
-          <w:tab w:val="num" w:pos="5040"/>
-        </w:tabs>
-        <w:ind w:left="5040" w:hanging="360"/>
-      </w:pPr>
-      <w:rPr>
-        <w:rFonts w:ascii="Wingdings" w:hAnsi="Wingdings" w:hint="default"/>
-        <w:sz w:val="20"/>
-      </w:rPr>
-    </w:lvl>
-    <w:lvl w:ilvl="7" w:tentative="1">
-      <w:start w:val="1"/>
-      <w:numFmt w:val="bullet"/>
-      <w:lvlText w:val=""/>
-      <w:lvlJc w:val="left"/>
-      <w:pPr>
-        <w:tabs>
-          <w:tab w:val="num" w:pos="5760"/>
-        </w:tabs>
-        <w:ind w:left="5760" w:hanging="360"/>
-      </w:pPr>
-      <w:rPr>
-        <w:rFonts w:ascii="Wingdings" w:hAnsi="Wingdings" w:hint="default"/>
-        <w:sz w:val="20"/>
-      </w:rPr>
-    </w:lvl>
-    <w:lvl w:ilvl="8" w:tentative="1">
-      <w:start w:val="1"/>
-      <w:numFmt w:val="bullet"/>
-      <w:lvlText w:val=""/>
-      <w:lvlJc w:val="left"/>
-      <w:pPr>
-        <w:tabs>
-          <w:tab w:val="num" w:pos="6480"/>
-        </w:tabs>
-        <w:ind w:left="6480" w:hanging="360"/>
-      </w:pPr>
-      <w:rPr>
-        <w:rFonts w:ascii="Wingdings" w:hAnsi="Wingdings" w:hint="default"/>
-        <w:sz w:val="20"/>
-      </w:rPr>
-    </w:lvl>
-  </w:abstractNum>
-  <w:abstractNum w:abstractNumId="6" w15:restartNumberingAfterBreak="0">
-    <w:nsid w:val="1F68234F"/>
-    <w:multiLevelType w:val="multilevel"/>
-    <w:tmpl w:val="B1E0838A"/>
-    <w:lvl w:ilvl="0">
-      <w:start w:val="1"/>
-      <w:numFmt w:val="bullet"/>
-      <w:lvlText w:val=""/>
-      <w:lvlJc w:val="left"/>
-      <w:pPr>
-        <w:tabs>
-          <w:tab w:val="num" w:pos="720"/>
-        </w:tabs>
-        <w:ind w:left="720" w:hanging="360"/>
-      </w:pPr>
-      <w:rPr>
-        <w:rFonts w:ascii="Symbol" w:hAnsi="Symbol" w:hint="default"/>
-        <w:sz w:val="20"/>
-      </w:rPr>
-    </w:lvl>
-    <w:lvl w:ilvl="1" w:tentative="1">
-      <w:start w:val="1"/>
-      <w:numFmt w:val="bullet"/>
-      <w:lvlText w:val="o"/>
-      <w:lvlJc w:val="left"/>
-      <w:pPr>
-        <w:tabs>
-          <w:tab w:val="num" w:pos="1440"/>
-        </w:tabs>
-        <w:ind w:left="1440" w:hanging="360"/>
-      </w:pPr>
-      <w:rPr>
-        <w:rFonts w:ascii="Courier New" w:hAnsi="Courier New" w:hint="default"/>
-        <w:sz w:val="20"/>
-      </w:rPr>
-    </w:lvl>
-    <w:lvl w:ilvl="2" w:tentative="1">
-      <w:start w:val="1"/>
-      <w:numFmt w:val="bullet"/>
-      <w:lvlText w:val=""/>
-      <w:lvlJc w:val="left"/>
-      <w:pPr>
-        <w:tabs>
-          <w:tab w:val="num" w:pos="2160"/>
-        </w:tabs>
-        <w:ind w:left="2160" w:hanging="360"/>
-      </w:pPr>
-      <w:rPr>
-        <w:rFonts w:ascii="Wingdings" w:hAnsi="Wingdings" w:hint="default"/>
-        <w:sz w:val="20"/>
-      </w:rPr>
-    </w:lvl>
-    <w:lvl w:ilvl="3" w:tentative="1">
-      <w:start w:val="1"/>
-      <w:numFmt w:val="bullet"/>
-      <w:lvlText w:val=""/>
-      <w:lvlJc w:val="left"/>
-      <w:pPr>
-        <w:tabs>
-          <w:tab w:val="num" w:pos="2880"/>
-        </w:tabs>
-        <w:ind w:left="2880" w:hanging="360"/>
-      </w:pPr>
-      <w:rPr>
-        <w:rFonts w:ascii="Wingdings" w:hAnsi="Wingdings" w:hint="default"/>
-        <w:sz w:val="20"/>
-      </w:rPr>
-    </w:lvl>
-    <w:lvl w:ilvl="4" w:tentative="1">
-      <w:start w:val="1"/>
-      <w:numFmt w:val="bullet"/>
-      <w:lvlText w:val=""/>
-      <w:lvlJc w:val="left"/>
-      <w:pPr>
-        <w:tabs>
-          <w:tab w:val="num" w:pos="3600"/>
-        </w:tabs>
-        <w:ind w:left="3600" w:hanging="360"/>
-      </w:pPr>
-      <w:rPr>
-        <w:rFonts w:ascii="Wingdings" w:hAnsi="Wingdings" w:hint="default"/>
-        <w:sz w:val="20"/>
-      </w:rPr>
-    </w:lvl>
-    <w:lvl w:ilvl="5" w:tentative="1">
-      <w:start w:val="1"/>
-      <w:numFmt w:val="bullet"/>
-      <w:lvlText w:val=""/>
-      <w:lvlJc w:val="left"/>
-      <w:pPr>
-        <w:tabs>
-          <w:tab w:val="num" w:pos="4320"/>
-        </w:tabs>
-        <w:ind w:left="4320" w:hanging="360"/>
-      </w:pPr>
-      <w:rPr>
-        <w:rFonts w:ascii="Wingdings" w:hAnsi="Wingdings" w:hint="default"/>
-        <w:sz w:val="20"/>
-      </w:rPr>
-    </w:lvl>
-    <w:lvl w:ilvl="6" w:tentative="1">
-      <w:start w:val="1"/>
-      <w:numFmt w:val="bullet"/>
-      <w:lvlText w:val=""/>
-      <w:lvlJc w:val="left"/>
-      <w:pPr>
-        <w:tabs>
-          <w:tab w:val="num" w:pos="5040"/>
-        </w:tabs>
-        <w:ind w:left="5040" w:hanging="360"/>
-      </w:pPr>
-      <w:rPr>
-        <w:rFonts w:ascii="Wingdings" w:hAnsi="Wingdings" w:hint="default"/>
-        <w:sz w:val="20"/>
-      </w:rPr>
-    </w:lvl>
-    <w:lvl w:ilvl="7" w:tentative="1">
-      <w:start w:val="1"/>
-      <w:numFmt w:val="bullet"/>
-      <w:lvlText w:val=""/>
-      <w:lvlJc w:val="left"/>
-      <w:pPr>
-        <w:tabs>
-          <w:tab w:val="num" w:pos="5760"/>
-        </w:tabs>
-        <w:ind w:left="5760" w:hanging="360"/>
-      </w:pPr>
-      <w:rPr>
-        <w:rFonts w:ascii="Wingdings" w:hAnsi="Wingdings" w:hint="default"/>
-        <w:sz w:val="20"/>
-      </w:rPr>
-    </w:lvl>
-    <w:lvl w:ilvl="8" w:tentative="1">
-      <w:start w:val="1"/>
-      <w:numFmt w:val="bullet"/>
-      <w:lvlText w:val=""/>
-      <w:lvlJc w:val="left"/>
-      <w:pPr>
-        <w:tabs>
-          <w:tab w:val="num" w:pos="6480"/>
-        </w:tabs>
-        <w:ind w:left="6480" w:hanging="360"/>
-      </w:pPr>
-      <w:rPr>
-        <w:rFonts w:ascii="Wingdings" w:hAnsi="Wingdings" w:hint="default"/>
-        <w:sz w:val="20"/>
-      </w:rPr>
-    </w:lvl>
-  </w:abstractNum>
-  <w:abstractNum w:abstractNumId="7" w15:restartNumberingAfterBreak="0">
-    <w:nsid w:val="20202D22"/>
-    <w:multiLevelType w:val="multilevel"/>
-    <w:tmpl w:val="6F0A4232"/>
-    <w:lvl w:ilvl="0">
-      <w:start w:val="1"/>
-      <w:numFmt w:val="bullet"/>
-      <w:lvlText w:val=""/>
-      <w:lvlJc w:val="left"/>
-      <w:pPr>
-        <w:tabs>
-          <w:tab w:val="num" w:pos="720"/>
-        </w:tabs>
-        <w:ind w:left="720" w:hanging="360"/>
-      </w:pPr>
-      <w:rPr>
-        <w:rFonts w:ascii="Symbol" w:hAnsi="Symbol" w:hint="default"/>
-        <w:sz w:val="20"/>
-      </w:rPr>
-    </w:lvl>
-    <w:lvl w:ilvl="1" w:tentative="1">
-      <w:start w:val="1"/>
-      <w:numFmt w:val="bullet"/>
-      <w:lvlText w:val="o"/>
-      <w:lvlJc w:val="left"/>
-      <w:pPr>
-        <w:tabs>
-          <w:tab w:val="num" w:pos="1440"/>
-        </w:tabs>
-        <w:ind w:left="1440" w:hanging="360"/>
-      </w:pPr>
-      <w:rPr>
-        <w:rFonts w:ascii="Courier New" w:hAnsi="Courier New" w:hint="default"/>
-        <w:sz w:val="20"/>
-      </w:rPr>
-    </w:lvl>
-    <w:lvl w:ilvl="2" w:tentative="1">
-      <w:start w:val="1"/>
-      <w:numFmt w:val="bullet"/>
-      <w:lvlText w:val=""/>
-      <w:lvlJc w:val="left"/>
-      <w:pPr>
-        <w:tabs>
-          <w:tab w:val="num" w:pos="2160"/>
-        </w:tabs>
-        <w:ind w:left="2160" w:hanging="360"/>
-      </w:pPr>
-      <w:rPr>
-        <w:rFonts w:ascii="Wingdings" w:hAnsi="Wingdings" w:hint="default"/>
-        <w:sz w:val="20"/>
-      </w:rPr>
-    </w:lvl>
-    <w:lvl w:ilvl="3" w:tentative="1">
-      <w:start w:val="1"/>
-      <w:numFmt w:val="bullet"/>
-      <w:lvlText w:val=""/>
-      <w:lvlJc w:val="left"/>
-      <w:pPr>
-        <w:tabs>
-          <w:tab w:val="num" w:pos="2880"/>
-        </w:tabs>
-        <w:ind w:left="2880" w:hanging="360"/>
-      </w:pPr>
-      <w:rPr>
-        <w:rFonts w:ascii="Wingdings" w:hAnsi="Wingdings" w:hint="default"/>
-        <w:sz w:val="20"/>
-      </w:rPr>
-    </w:lvl>
-    <w:lvl w:ilvl="4" w:tentative="1">
-      <w:start w:val="1"/>
-      <w:numFmt w:val="bullet"/>
-      <w:lvlText w:val=""/>
-      <w:lvlJc w:val="left"/>
-      <w:pPr>
-        <w:tabs>
-          <w:tab w:val="num" w:pos="3600"/>
-        </w:tabs>
-        <w:ind w:left="3600" w:hanging="360"/>
-      </w:pPr>
-      <w:rPr>
-        <w:rFonts w:ascii="Wingdings" w:hAnsi="Wingdings" w:hint="default"/>
-        <w:sz w:val="20"/>
-      </w:rPr>
-    </w:lvl>
-    <w:lvl w:ilvl="5" w:tentative="1">
-      <w:start w:val="1"/>
-      <w:numFmt w:val="bullet"/>
-      <w:lvlText w:val=""/>
-      <w:lvlJc w:val="left"/>
-      <w:pPr>
-        <w:tabs>
-          <w:tab w:val="num" w:pos="4320"/>
-        </w:tabs>
-        <w:ind w:left="4320" w:hanging="360"/>
-      </w:pPr>
-      <w:rPr>
-        <w:rFonts w:ascii="Wingdings" w:hAnsi="Wingdings" w:hint="default"/>
-        <w:sz w:val="20"/>
-      </w:rPr>
-    </w:lvl>
-    <w:lvl w:ilvl="6" w:tentative="1">
-      <w:start w:val="1"/>
-      <w:numFmt w:val="bullet"/>
-      <w:lvlText w:val=""/>
-      <w:lvlJc w:val="left"/>
-      <w:pPr>
-        <w:tabs>
-          <w:tab w:val="num" w:pos="5040"/>
-        </w:tabs>
-        <w:ind w:left="5040" w:hanging="360"/>
-      </w:pPr>
-      <w:rPr>
-        <w:rFonts w:ascii="Wingdings" w:hAnsi="Wingdings" w:hint="default"/>
-        <w:sz w:val="20"/>
-      </w:rPr>
-    </w:lvl>
-    <w:lvl w:ilvl="7" w:tentative="1">
-      <w:start w:val="1"/>
-      <w:numFmt w:val="bullet"/>
-      <w:lvlText w:val=""/>
-      <w:lvlJc w:val="left"/>
-      <w:pPr>
-        <w:tabs>
-          <w:tab w:val="num" w:pos="5760"/>
-        </w:tabs>
-        <w:ind w:left="5760" w:hanging="360"/>
-      </w:pPr>
-      <w:rPr>
-        <w:rFonts w:ascii="Wingdings" w:hAnsi="Wingdings" w:hint="default"/>
-        <w:sz w:val="20"/>
-      </w:rPr>
-    </w:lvl>
-    <w:lvl w:ilvl="8" w:tentative="1">
-      <w:start w:val="1"/>
-      <w:numFmt w:val="bullet"/>
-      <w:lvlText w:val=""/>
-      <w:lvlJc w:val="left"/>
-      <w:pPr>
-        <w:tabs>
-          <w:tab w:val="num" w:pos="6480"/>
-        </w:tabs>
-        <w:ind w:left="6480" w:hanging="360"/>
-      </w:pPr>
-      <w:rPr>
-        <w:rFonts w:ascii="Wingdings" w:hAnsi="Wingdings" w:hint="default"/>
-        <w:sz w:val="20"/>
-      </w:rPr>
-    </w:lvl>
-  </w:abstractNum>
-  <w:abstractNum w:abstractNumId="8" w15:restartNumberingAfterBreak="0">
-    <w:nsid w:val="250D1B7C"/>
-    <w:multiLevelType w:val="multilevel"/>
-    <w:tmpl w:val="2ED6209A"/>
-    <w:lvl w:ilvl="0">
-      <w:start w:val="1"/>
-      <w:numFmt w:val="bullet"/>
-      <w:lvlText w:val=""/>
-      <w:lvlJc w:val="left"/>
-      <w:pPr>
-        <w:tabs>
-          <w:tab w:val="num" w:pos="720"/>
-        </w:tabs>
-        <w:ind w:left="720" w:hanging="360"/>
-      </w:pPr>
-      <w:rPr>
-        <w:rFonts w:ascii="Symbol" w:hAnsi="Symbol" w:hint="default"/>
-        <w:sz w:val="20"/>
-      </w:rPr>
-    </w:lvl>
-    <w:lvl w:ilvl="1" w:tentative="1">
-      <w:start w:val="1"/>
-      <w:numFmt w:val="bullet"/>
-      <w:lvlText w:val="o"/>
-      <w:lvlJc w:val="left"/>
-      <w:pPr>
-        <w:tabs>
-          <w:tab w:val="num" w:pos="1440"/>
-        </w:tabs>
-        <w:ind w:left="1440" w:hanging="360"/>
-      </w:pPr>
-      <w:rPr>
-        <w:rFonts w:ascii="Courier New" w:hAnsi="Courier New" w:hint="default"/>
-        <w:sz w:val="20"/>
-      </w:rPr>
-    </w:lvl>
-    <w:lvl w:ilvl="2" w:tentative="1">
-      <w:start w:val="1"/>
-      <w:numFmt w:val="bullet"/>
-      <w:lvlText w:val=""/>
-      <w:lvlJc w:val="left"/>
-      <w:pPr>
-        <w:tabs>
-          <w:tab w:val="num" w:pos="2160"/>
-        </w:tabs>
-        <w:ind w:left="2160" w:hanging="360"/>
-      </w:pPr>
-      <w:rPr>
-        <w:rFonts w:ascii="Wingdings" w:hAnsi="Wingdings" w:hint="default"/>
-        <w:sz w:val="20"/>
-      </w:rPr>
-    </w:lvl>
-    <w:lvl w:ilvl="3" w:tentative="1">
-      <w:start w:val="1"/>
-      <w:numFmt w:val="bullet"/>
-      <w:lvlText w:val=""/>
-      <w:lvlJc w:val="left"/>
-      <w:pPr>
-        <w:tabs>
-          <w:tab w:val="num" w:pos="2880"/>
-        </w:tabs>
-        <w:ind w:left="2880" w:hanging="360"/>
-      </w:pPr>
-      <w:rPr>
-        <w:rFonts w:ascii="Wingdings" w:hAnsi="Wingdings" w:hint="default"/>
-        <w:sz w:val="20"/>
-      </w:rPr>
-    </w:lvl>
-    <w:lvl w:ilvl="4" w:tentative="1">
-      <w:start w:val="1"/>
-      <w:numFmt w:val="bullet"/>
-      <w:lvlText w:val=""/>
-      <w:lvlJc w:val="left"/>
-      <w:pPr>
-        <w:tabs>
-          <w:tab w:val="num" w:pos="3600"/>
-        </w:tabs>
-        <w:ind w:left="3600" w:hanging="360"/>
-      </w:pPr>
-      <w:rPr>
-        <w:rFonts w:ascii="Wingdings" w:hAnsi="Wingdings" w:hint="default"/>
-        <w:sz w:val="20"/>
-      </w:rPr>
-    </w:lvl>
-    <w:lvl w:ilvl="5" w:tentative="1">
-      <w:start w:val="1"/>
-      <w:numFmt w:val="bullet"/>
-      <w:lvlText w:val=""/>
-      <w:lvlJc w:val="left"/>
-      <w:pPr>
-        <w:tabs>
-          <w:tab w:val="num" w:pos="4320"/>
-        </w:tabs>
-        <w:ind w:left="4320" w:hanging="360"/>
-      </w:pPr>
-      <w:rPr>
-        <w:rFonts w:ascii="Wingdings" w:hAnsi="Wingdings" w:hint="default"/>
-        <w:sz w:val="20"/>
-      </w:rPr>
-    </w:lvl>
-    <w:lvl w:ilvl="6" w:tentative="1">
-      <w:start w:val="1"/>
-      <w:numFmt w:val="bullet"/>
-      <w:lvlText w:val=""/>
-      <w:lvlJc w:val="left"/>
-      <w:pPr>
-        <w:tabs>
-          <w:tab w:val="num" w:pos="5040"/>
-        </w:tabs>
-        <w:ind w:left="5040" w:hanging="360"/>
-      </w:pPr>
-      <w:rPr>
-        <w:rFonts w:ascii="Wingdings" w:hAnsi="Wingdings" w:hint="default"/>
-        <w:sz w:val="20"/>
-      </w:rPr>
-    </w:lvl>
-    <w:lvl w:ilvl="7" w:tentative="1">
-      <w:start w:val="1"/>
-      <w:numFmt w:val="bullet"/>
-      <w:lvlText w:val=""/>
-      <w:lvlJc w:val="left"/>
-      <w:pPr>
-        <w:tabs>
-          <w:tab w:val="num" w:pos="5760"/>
-        </w:tabs>
-        <w:ind w:left="5760" w:hanging="360"/>
-      </w:pPr>
-      <w:rPr>
-        <w:rFonts w:ascii="Wingdings" w:hAnsi="Wingdings" w:hint="default"/>
-        <w:sz w:val="20"/>
-      </w:rPr>
-    </w:lvl>
-    <w:lvl w:ilvl="8" w:tentative="1">
-      <w:start w:val="1"/>
-      <w:numFmt w:val="bullet"/>
-      <w:lvlText w:val=""/>
-      <w:lvlJc w:val="left"/>
-      <w:pPr>
-        <w:tabs>
-          <w:tab w:val="num" w:pos="6480"/>
-        </w:tabs>
-        <w:ind w:left="6480" w:hanging="360"/>
-      </w:pPr>
-      <w:rPr>
-        <w:rFonts w:ascii="Wingdings" w:hAnsi="Wingdings" w:hint="default"/>
-        <w:sz w:val="20"/>
-      </w:rPr>
-    </w:lvl>
-  </w:abstractNum>
-  <w:abstractNum w:abstractNumId="9" w15:restartNumberingAfterBreak="0">
-    <w:nsid w:val="281F6DB6"/>
-    <w:multiLevelType w:val="multilevel"/>
-    <w:tmpl w:val="4738911C"/>
+    <w:tmpl w:val="F11EABE2"/>
     <w:lvl w:ilvl="0">
       <w:start w:val="1"/>
       <w:numFmt w:val="decimal"/>
@@ -7927,457 +8374,10 @@
       </w:pPr>
     </w:lvl>
   </w:abstractNum>
-  <w:abstractNum w:abstractNumId="10" w15:restartNumberingAfterBreak="0">
-    <w:nsid w:val="2C3F19BC"/>
+  <w:abstractNum w:abstractNumId="13" w15:restartNumberingAfterBreak="0">
+    <w:nsid w:val="541D2321"/>
     <w:multiLevelType w:val="multilevel"/>
-    <w:tmpl w:val="E3FE272E"/>
-    <w:lvl w:ilvl="0">
-      <w:start w:val="1"/>
-      <w:numFmt w:val="bullet"/>
-      <w:lvlText w:val=""/>
-      <w:lvlJc w:val="left"/>
-      <w:pPr>
-        <w:tabs>
-          <w:tab w:val="num" w:pos="720"/>
-        </w:tabs>
-        <w:ind w:left="720" w:hanging="360"/>
-      </w:pPr>
-      <w:rPr>
-        <w:rFonts w:ascii="Symbol" w:hAnsi="Symbol" w:hint="default"/>
-        <w:sz w:val="20"/>
-      </w:rPr>
-    </w:lvl>
-    <w:lvl w:ilvl="1" w:tentative="1">
-      <w:start w:val="1"/>
-      <w:numFmt w:val="bullet"/>
-      <w:lvlText w:val="o"/>
-      <w:lvlJc w:val="left"/>
-      <w:pPr>
-        <w:tabs>
-          <w:tab w:val="num" w:pos="1440"/>
-        </w:tabs>
-        <w:ind w:left="1440" w:hanging="360"/>
-      </w:pPr>
-      <w:rPr>
-        <w:rFonts w:ascii="Courier New" w:hAnsi="Courier New" w:hint="default"/>
-        <w:sz w:val="20"/>
-      </w:rPr>
-    </w:lvl>
-    <w:lvl w:ilvl="2" w:tentative="1">
-      <w:start w:val="1"/>
-      <w:numFmt w:val="bullet"/>
-      <w:lvlText w:val=""/>
-      <w:lvlJc w:val="left"/>
-      <w:pPr>
-        <w:tabs>
-          <w:tab w:val="num" w:pos="2160"/>
-        </w:tabs>
-        <w:ind w:left="2160" w:hanging="360"/>
-      </w:pPr>
-      <w:rPr>
-        <w:rFonts w:ascii="Wingdings" w:hAnsi="Wingdings" w:hint="default"/>
-        <w:sz w:val="20"/>
-      </w:rPr>
-    </w:lvl>
-    <w:lvl w:ilvl="3" w:tentative="1">
-      <w:start w:val="1"/>
-      <w:numFmt w:val="bullet"/>
-      <w:lvlText w:val=""/>
-      <w:lvlJc w:val="left"/>
-      <w:pPr>
-        <w:tabs>
-          <w:tab w:val="num" w:pos="2880"/>
-        </w:tabs>
-        <w:ind w:left="2880" w:hanging="360"/>
-      </w:pPr>
-      <w:rPr>
-        <w:rFonts w:ascii="Wingdings" w:hAnsi="Wingdings" w:hint="default"/>
-        <w:sz w:val="20"/>
-      </w:rPr>
-    </w:lvl>
-    <w:lvl w:ilvl="4" w:tentative="1">
-      <w:start w:val="1"/>
-      <w:numFmt w:val="bullet"/>
-      <w:lvlText w:val=""/>
-      <w:lvlJc w:val="left"/>
-      <w:pPr>
-        <w:tabs>
-          <w:tab w:val="num" w:pos="3600"/>
-        </w:tabs>
-        <w:ind w:left="3600" w:hanging="360"/>
-      </w:pPr>
-      <w:rPr>
-        <w:rFonts w:ascii="Wingdings" w:hAnsi="Wingdings" w:hint="default"/>
-        <w:sz w:val="20"/>
-      </w:rPr>
-    </w:lvl>
-    <w:lvl w:ilvl="5" w:tentative="1">
-      <w:start w:val="1"/>
-      <w:numFmt w:val="bullet"/>
-      <w:lvlText w:val=""/>
-      <w:lvlJc w:val="left"/>
-      <w:pPr>
-        <w:tabs>
-          <w:tab w:val="num" w:pos="4320"/>
-        </w:tabs>
-        <w:ind w:left="4320" w:hanging="360"/>
-      </w:pPr>
-      <w:rPr>
-        <w:rFonts w:ascii="Wingdings" w:hAnsi="Wingdings" w:hint="default"/>
-        <w:sz w:val="20"/>
-      </w:rPr>
-    </w:lvl>
-    <w:lvl w:ilvl="6" w:tentative="1">
-      <w:start w:val="1"/>
-      <w:numFmt w:val="bullet"/>
-      <w:lvlText w:val=""/>
-      <w:lvlJc w:val="left"/>
-      <w:pPr>
-        <w:tabs>
-          <w:tab w:val="num" w:pos="5040"/>
-        </w:tabs>
-        <w:ind w:left="5040" w:hanging="360"/>
-      </w:pPr>
-      <w:rPr>
-        <w:rFonts w:ascii="Wingdings" w:hAnsi="Wingdings" w:hint="default"/>
-        <w:sz w:val="20"/>
-      </w:rPr>
-    </w:lvl>
-    <w:lvl w:ilvl="7" w:tentative="1">
-      <w:start w:val="1"/>
-      <w:numFmt w:val="bullet"/>
-      <w:lvlText w:val=""/>
-      <w:lvlJc w:val="left"/>
-      <w:pPr>
-        <w:tabs>
-          <w:tab w:val="num" w:pos="5760"/>
-        </w:tabs>
-        <w:ind w:left="5760" w:hanging="360"/>
-      </w:pPr>
-      <w:rPr>
-        <w:rFonts w:ascii="Wingdings" w:hAnsi="Wingdings" w:hint="default"/>
-        <w:sz w:val="20"/>
-      </w:rPr>
-    </w:lvl>
-    <w:lvl w:ilvl="8" w:tentative="1">
-      <w:start w:val="1"/>
-      <w:numFmt w:val="bullet"/>
-      <w:lvlText w:val=""/>
-      <w:lvlJc w:val="left"/>
-      <w:pPr>
-        <w:tabs>
-          <w:tab w:val="num" w:pos="6480"/>
-        </w:tabs>
-        <w:ind w:left="6480" w:hanging="360"/>
-      </w:pPr>
-      <w:rPr>
-        <w:rFonts w:ascii="Wingdings" w:hAnsi="Wingdings" w:hint="default"/>
-        <w:sz w:val="20"/>
-      </w:rPr>
-    </w:lvl>
-  </w:abstractNum>
-  <w:abstractNum w:abstractNumId="11" w15:restartNumberingAfterBreak="0">
-    <w:nsid w:val="2C9F7BF3"/>
-    <w:multiLevelType w:val="multilevel"/>
-    <w:tmpl w:val="B36EFB5C"/>
-    <w:lvl w:ilvl="0">
-      <w:start w:val="1"/>
-      <w:numFmt w:val="bullet"/>
-      <w:lvlText w:val=""/>
-      <w:lvlJc w:val="left"/>
-      <w:pPr>
-        <w:tabs>
-          <w:tab w:val="num" w:pos="720"/>
-        </w:tabs>
-        <w:ind w:left="720" w:hanging="360"/>
-      </w:pPr>
-      <w:rPr>
-        <w:rFonts w:ascii="Symbol" w:hAnsi="Symbol" w:hint="default"/>
-        <w:sz w:val="20"/>
-      </w:rPr>
-    </w:lvl>
-    <w:lvl w:ilvl="1" w:tentative="1">
-      <w:start w:val="1"/>
-      <w:numFmt w:val="bullet"/>
-      <w:lvlText w:val="o"/>
-      <w:lvlJc w:val="left"/>
-      <w:pPr>
-        <w:tabs>
-          <w:tab w:val="num" w:pos="1440"/>
-        </w:tabs>
-        <w:ind w:left="1440" w:hanging="360"/>
-      </w:pPr>
-      <w:rPr>
-        <w:rFonts w:ascii="Courier New" w:hAnsi="Courier New" w:hint="default"/>
-        <w:sz w:val="20"/>
-      </w:rPr>
-    </w:lvl>
-    <w:lvl w:ilvl="2" w:tentative="1">
-      <w:start w:val="1"/>
-      <w:numFmt w:val="bullet"/>
-      <w:lvlText w:val=""/>
-      <w:lvlJc w:val="left"/>
-      <w:pPr>
-        <w:tabs>
-          <w:tab w:val="num" w:pos="2160"/>
-        </w:tabs>
-        <w:ind w:left="2160" w:hanging="360"/>
-      </w:pPr>
-      <w:rPr>
-        <w:rFonts w:ascii="Wingdings" w:hAnsi="Wingdings" w:hint="default"/>
-        <w:sz w:val="20"/>
-      </w:rPr>
-    </w:lvl>
-    <w:lvl w:ilvl="3" w:tentative="1">
-      <w:start w:val="1"/>
-      <w:numFmt w:val="bullet"/>
-      <w:lvlText w:val=""/>
-      <w:lvlJc w:val="left"/>
-      <w:pPr>
-        <w:tabs>
-          <w:tab w:val="num" w:pos="2880"/>
-        </w:tabs>
-        <w:ind w:left="2880" w:hanging="360"/>
-      </w:pPr>
-      <w:rPr>
-        <w:rFonts w:ascii="Wingdings" w:hAnsi="Wingdings" w:hint="default"/>
-        <w:sz w:val="20"/>
-      </w:rPr>
-    </w:lvl>
-    <w:lvl w:ilvl="4" w:tentative="1">
-      <w:start w:val="1"/>
-      <w:numFmt w:val="bullet"/>
-      <w:lvlText w:val=""/>
-      <w:lvlJc w:val="left"/>
-      <w:pPr>
-        <w:tabs>
-          <w:tab w:val="num" w:pos="3600"/>
-        </w:tabs>
-        <w:ind w:left="3600" w:hanging="360"/>
-      </w:pPr>
-      <w:rPr>
-        <w:rFonts w:ascii="Wingdings" w:hAnsi="Wingdings" w:hint="default"/>
-        <w:sz w:val="20"/>
-      </w:rPr>
-    </w:lvl>
-    <w:lvl w:ilvl="5" w:tentative="1">
-      <w:start w:val="1"/>
-      <w:numFmt w:val="bullet"/>
-      <w:lvlText w:val=""/>
-      <w:lvlJc w:val="left"/>
-      <w:pPr>
-        <w:tabs>
-          <w:tab w:val="num" w:pos="4320"/>
-        </w:tabs>
-        <w:ind w:left="4320" w:hanging="360"/>
-      </w:pPr>
-      <w:rPr>
-        <w:rFonts w:ascii="Wingdings" w:hAnsi="Wingdings" w:hint="default"/>
-        <w:sz w:val="20"/>
-      </w:rPr>
-    </w:lvl>
-    <w:lvl w:ilvl="6" w:tentative="1">
-      <w:start w:val="1"/>
-      <w:numFmt w:val="bullet"/>
-      <w:lvlText w:val=""/>
-      <w:lvlJc w:val="left"/>
-      <w:pPr>
-        <w:tabs>
-          <w:tab w:val="num" w:pos="5040"/>
-        </w:tabs>
-        <w:ind w:left="5040" w:hanging="360"/>
-      </w:pPr>
-      <w:rPr>
-        <w:rFonts w:ascii="Wingdings" w:hAnsi="Wingdings" w:hint="default"/>
-        <w:sz w:val="20"/>
-      </w:rPr>
-    </w:lvl>
-    <w:lvl w:ilvl="7" w:tentative="1">
-      <w:start w:val="1"/>
-      <w:numFmt w:val="bullet"/>
-      <w:lvlText w:val=""/>
-      <w:lvlJc w:val="left"/>
-      <w:pPr>
-        <w:tabs>
-          <w:tab w:val="num" w:pos="5760"/>
-        </w:tabs>
-        <w:ind w:left="5760" w:hanging="360"/>
-      </w:pPr>
-      <w:rPr>
-        <w:rFonts w:ascii="Wingdings" w:hAnsi="Wingdings" w:hint="default"/>
-        <w:sz w:val="20"/>
-      </w:rPr>
-    </w:lvl>
-    <w:lvl w:ilvl="8" w:tentative="1">
-      <w:start w:val="1"/>
-      <w:numFmt w:val="bullet"/>
-      <w:lvlText w:val=""/>
-      <w:lvlJc w:val="left"/>
-      <w:pPr>
-        <w:tabs>
-          <w:tab w:val="num" w:pos="6480"/>
-        </w:tabs>
-        <w:ind w:left="6480" w:hanging="360"/>
-      </w:pPr>
-      <w:rPr>
-        <w:rFonts w:ascii="Wingdings" w:hAnsi="Wingdings" w:hint="default"/>
-        <w:sz w:val="20"/>
-      </w:rPr>
-    </w:lvl>
-  </w:abstractNum>
-  <w:abstractNum w:abstractNumId="12" w15:restartNumberingAfterBreak="0">
-    <w:nsid w:val="34197215"/>
-    <w:multiLevelType w:val="multilevel"/>
-    <w:tmpl w:val="DB341D2A"/>
-    <w:lvl w:ilvl="0">
-      <w:start w:val="1"/>
-      <w:numFmt w:val="bullet"/>
-      <w:lvlText w:val=""/>
-      <w:lvlJc w:val="left"/>
-      <w:pPr>
-        <w:tabs>
-          <w:tab w:val="num" w:pos="720"/>
-        </w:tabs>
-        <w:ind w:left="720" w:hanging="360"/>
-      </w:pPr>
-      <w:rPr>
-        <w:rFonts w:ascii="Symbol" w:hAnsi="Symbol" w:hint="default"/>
-        <w:sz w:val="20"/>
-      </w:rPr>
-    </w:lvl>
-    <w:lvl w:ilvl="1" w:tentative="1">
-      <w:start w:val="1"/>
-      <w:numFmt w:val="bullet"/>
-      <w:lvlText w:val="o"/>
-      <w:lvlJc w:val="left"/>
-      <w:pPr>
-        <w:tabs>
-          <w:tab w:val="num" w:pos="1440"/>
-        </w:tabs>
-        <w:ind w:left="1440" w:hanging="360"/>
-      </w:pPr>
-      <w:rPr>
-        <w:rFonts w:ascii="Courier New" w:hAnsi="Courier New" w:hint="default"/>
-        <w:sz w:val="20"/>
-      </w:rPr>
-    </w:lvl>
-    <w:lvl w:ilvl="2" w:tentative="1">
-      <w:start w:val="1"/>
-      <w:numFmt w:val="bullet"/>
-      <w:lvlText w:val=""/>
-      <w:lvlJc w:val="left"/>
-      <w:pPr>
-        <w:tabs>
-          <w:tab w:val="num" w:pos="2160"/>
-        </w:tabs>
-        <w:ind w:left="2160" w:hanging="360"/>
-      </w:pPr>
-      <w:rPr>
-        <w:rFonts w:ascii="Wingdings" w:hAnsi="Wingdings" w:hint="default"/>
-        <w:sz w:val="20"/>
-      </w:rPr>
-    </w:lvl>
-    <w:lvl w:ilvl="3" w:tentative="1">
-      <w:start w:val="1"/>
-      <w:numFmt w:val="bullet"/>
-      <w:lvlText w:val=""/>
-      <w:lvlJc w:val="left"/>
-      <w:pPr>
-        <w:tabs>
-          <w:tab w:val="num" w:pos="2880"/>
-        </w:tabs>
-        <w:ind w:left="2880" w:hanging="360"/>
-      </w:pPr>
-      <w:rPr>
-        <w:rFonts w:ascii="Wingdings" w:hAnsi="Wingdings" w:hint="default"/>
-        <w:sz w:val="20"/>
-      </w:rPr>
-    </w:lvl>
-    <w:lvl w:ilvl="4" w:tentative="1">
-      <w:start w:val="1"/>
-      <w:numFmt w:val="bullet"/>
-      <w:lvlText w:val=""/>
-      <w:lvlJc w:val="left"/>
-      <w:pPr>
-        <w:tabs>
-          <w:tab w:val="num" w:pos="3600"/>
-        </w:tabs>
-        <w:ind w:left="3600" w:hanging="360"/>
-      </w:pPr>
-      <w:rPr>
-        <w:rFonts w:ascii="Wingdings" w:hAnsi="Wingdings" w:hint="default"/>
-        <w:sz w:val="20"/>
-      </w:rPr>
-    </w:lvl>
-    <w:lvl w:ilvl="5" w:tentative="1">
-      <w:start w:val="1"/>
-      <w:numFmt w:val="bullet"/>
-      <w:lvlText w:val=""/>
-      <w:lvlJc w:val="left"/>
-      <w:pPr>
-        <w:tabs>
-          <w:tab w:val="num" w:pos="4320"/>
-        </w:tabs>
-        <w:ind w:left="4320" w:hanging="360"/>
-      </w:pPr>
-      <w:rPr>
-        <w:rFonts w:ascii="Wingdings" w:hAnsi="Wingdings" w:hint="default"/>
-        <w:sz w:val="20"/>
-      </w:rPr>
-    </w:lvl>
-    <w:lvl w:ilvl="6" w:tentative="1">
-      <w:start w:val="1"/>
-      <w:numFmt w:val="bullet"/>
-      <w:lvlText w:val=""/>
-      <w:lvlJc w:val="left"/>
-      <w:pPr>
-        <w:tabs>
-          <w:tab w:val="num" w:pos="5040"/>
-        </w:tabs>
-        <w:ind w:left="5040" w:hanging="360"/>
-      </w:pPr>
-      <w:rPr>
-        <w:rFonts w:ascii="Wingdings" w:hAnsi="Wingdings" w:hint="default"/>
-        <w:sz w:val="20"/>
-      </w:rPr>
-    </w:lvl>
-    <w:lvl w:ilvl="7" w:tentative="1">
-      <w:start w:val="1"/>
-      <w:numFmt w:val="bullet"/>
-      <w:lvlText w:val=""/>
-      <w:lvlJc w:val="left"/>
-      <w:pPr>
-        <w:tabs>
-          <w:tab w:val="num" w:pos="5760"/>
-        </w:tabs>
-        <w:ind w:left="5760" w:hanging="360"/>
-      </w:pPr>
-      <w:rPr>
-        <w:rFonts w:ascii="Wingdings" w:hAnsi="Wingdings" w:hint="default"/>
-        <w:sz w:val="20"/>
-      </w:rPr>
-    </w:lvl>
-    <w:lvl w:ilvl="8" w:tentative="1">
-      <w:start w:val="1"/>
-      <w:numFmt w:val="bullet"/>
-      <w:lvlText w:val=""/>
-      <w:lvlJc w:val="left"/>
-      <w:pPr>
-        <w:tabs>
-          <w:tab w:val="num" w:pos="6480"/>
-        </w:tabs>
-        <w:ind w:left="6480" w:hanging="360"/>
-      </w:pPr>
-      <w:rPr>
-        <w:rFonts w:ascii="Wingdings" w:hAnsi="Wingdings" w:hint="default"/>
-        <w:sz w:val="20"/>
-      </w:rPr>
-    </w:lvl>
-  </w:abstractNum>
-  <w:abstractNum w:abstractNumId="13" w15:restartNumberingAfterBreak="0">
-    <w:nsid w:val="369F396C"/>
-    <w:multiLevelType w:val="multilevel"/>
-    <w:tmpl w:val="664A7AAC"/>
+    <w:tmpl w:val="DD2C6F98"/>
     <w:lvl w:ilvl="0">
       <w:start w:val="1"/>
       <w:numFmt w:val="decimal"/>
@@ -8492,9 +8492,456 @@
     </w:lvl>
   </w:abstractNum>
   <w:abstractNum w:abstractNumId="14" w15:restartNumberingAfterBreak="0">
-    <w:nsid w:val="3F001937"/>
+    <w:nsid w:val="54B272F0"/>
     <w:multiLevelType w:val="multilevel"/>
-    <w:tmpl w:val="205E2628"/>
+    <w:tmpl w:val="8834D534"/>
+    <w:lvl w:ilvl="0">
+      <w:start w:val="1"/>
+      <w:numFmt w:val="bullet"/>
+      <w:lvlText w:val=""/>
+      <w:lvlJc w:val="left"/>
+      <w:pPr>
+        <w:tabs>
+          <w:tab w:val="num" w:pos="720"/>
+        </w:tabs>
+        <w:ind w:left="720" w:hanging="360"/>
+      </w:pPr>
+      <w:rPr>
+        <w:rFonts w:ascii="Symbol" w:hAnsi="Symbol" w:hint="default"/>
+        <w:sz w:val="20"/>
+      </w:rPr>
+    </w:lvl>
+    <w:lvl w:ilvl="1" w:tentative="1">
+      <w:start w:val="1"/>
+      <w:numFmt w:val="bullet"/>
+      <w:lvlText w:val="o"/>
+      <w:lvlJc w:val="left"/>
+      <w:pPr>
+        <w:tabs>
+          <w:tab w:val="num" w:pos="1440"/>
+        </w:tabs>
+        <w:ind w:left="1440" w:hanging="360"/>
+      </w:pPr>
+      <w:rPr>
+        <w:rFonts w:ascii="Courier New" w:hAnsi="Courier New" w:hint="default"/>
+        <w:sz w:val="20"/>
+      </w:rPr>
+    </w:lvl>
+    <w:lvl w:ilvl="2" w:tentative="1">
+      <w:start w:val="1"/>
+      <w:numFmt w:val="bullet"/>
+      <w:lvlText w:val=""/>
+      <w:lvlJc w:val="left"/>
+      <w:pPr>
+        <w:tabs>
+          <w:tab w:val="num" w:pos="2160"/>
+        </w:tabs>
+        <w:ind w:left="2160" w:hanging="360"/>
+      </w:pPr>
+      <w:rPr>
+        <w:rFonts w:ascii="Wingdings" w:hAnsi="Wingdings" w:hint="default"/>
+        <w:sz w:val="20"/>
+      </w:rPr>
+    </w:lvl>
+    <w:lvl w:ilvl="3" w:tentative="1">
+      <w:start w:val="1"/>
+      <w:numFmt w:val="bullet"/>
+      <w:lvlText w:val=""/>
+      <w:lvlJc w:val="left"/>
+      <w:pPr>
+        <w:tabs>
+          <w:tab w:val="num" w:pos="2880"/>
+        </w:tabs>
+        <w:ind w:left="2880" w:hanging="360"/>
+      </w:pPr>
+      <w:rPr>
+        <w:rFonts w:ascii="Wingdings" w:hAnsi="Wingdings" w:hint="default"/>
+        <w:sz w:val="20"/>
+      </w:rPr>
+    </w:lvl>
+    <w:lvl w:ilvl="4" w:tentative="1">
+      <w:start w:val="1"/>
+      <w:numFmt w:val="bullet"/>
+      <w:lvlText w:val=""/>
+      <w:lvlJc w:val="left"/>
+      <w:pPr>
+        <w:tabs>
+          <w:tab w:val="num" w:pos="3600"/>
+        </w:tabs>
+        <w:ind w:left="3600" w:hanging="360"/>
+      </w:pPr>
+      <w:rPr>
+        <w:rFonts w:ascii="Wingdings" w:hAnsi="Wingdings" w:hint="default"/>
+        <w:sz w:val="20"/>
+      </w:rPr>
+    </w:lvl>
+    <w:lvl w:ilvl="5" w:tentative="1">
+      <w:start w:val="1"/>
+      <w:numFmt w:val="bullet"/>
+      <w:lvlText w:val=""/>
+      <w:lvlJc w:val="left"/>
+      <w:pPr>
+        <w:tabs>
+          <w:tab w:val="num" w:pos="4320"/>
+        </w:tabs>
+        <w:ind w:left="4320" w:hanging="360"/>
+      </w:pPr>
+      <w:rPr>
+        <w:rFonts w:ascii="Wingdings" w:hAnsi="Wingdings" w:hint="default"/>
+        <w:sz w:val="20"/>
+      </w:rPr>
+    </w:lvl>
+    <w:lvl w:ilvl="6" w:tentative="1">
+      <w:start w:val="1"/>
+      <w:numFmt w:val="bullet"/>
+      <w:lvlText w:val=""/>
+      <w:lvlJc w:val="left"/>
+      <w:pPr>
+        <w:tabs>
+          <w:tab w:val="num" w:pos="5040"/>
+        </w:tabs>
+        <w:ind w:left="5040" w:hanging="360"/>
+      </w:pPr>
+      <w:rPr>
+        <w:rFonts w:ascii="Wingdings" w:hAnsi="Wingdings" w:hint="default"/>
+        <w:sz w:val="20"/>
+      </w:rPr>
+    </w:lvl>
+    <w:lvl w:ilvl="7" w:tentative="1">
+      <w:start w:val="1"/>
+      <w:numFmt w:val="bullet"/>
+      <w:lvlText w:val=""/>
+      <w:lvlJc w:val="left"/>
+      <w:pPr>
+        <w:tabs>
+          <w:tab w:val="num" w:pos="5760"/>
+        </w:tabs>
+        <w:ind w:left="5760" w:hanging="360"/>
+      </w:pPr>
+      <w:rPr>
+        <w:rFonts w:ascii="Wingdings" w:hAnsi="Wingdings" w:hint="default"/>
+        <w:sz w:val="20"/>
+      </w:rPr>
+    </w:lvl>
+    <w:lvl w:ilvl="8" w:tentative="1">
+      <w:start w:val="1"/>
+      <w:numFmt w:val="bullet"/>
+      <w:lvlText w:val=""/>
+      <w:lvlJc w:val="left"/>
+      <w:pPr>
+        <w:tabs>
+          <w:tab w:val="num" w:pos="6480"/>
+        </w:tabs>
+        <w:ind w:left="6480" w:hanging="360"/>
+      </w:pPr>
+      <w:rPr>
+        <w:rFonts w:ascii="Wingdings" w:hAnsi="Wingdings" w:hint="default"/>
+        <w:sz w:val="20"/>
+      </w:rPr>
+    </w:lvl>
+  </w:abstractNum>
+  <w:abstractNum w:abstractNumId="15" w15:restartNumberingAfterBreak="0">
+    <w:nsid w:val="5D357195"/>
+    <w:multiLevelType w:val="multilevel"/>
+    <w:tmpl w:val="3FF06852"/>
+    <w:lvl w:ilvl="0">
+      <w:start w:val="1"/>
+      <w:numFmt w:val="bullet"/>
+      <w:lvlText w:val=""/>
+      <w:lvlJc w:val="left"/>
+      <w:pPr>
+        <w:tabs>
+          <w:tab w:val="num" w:pos="720"/>
+        </w:tabs>
+        <w:ind w:left="720" w:hanging="360"/>
+      </w:pPr>
+      <w:rPr>
+        <w:rFonts w:ascii="Symbol" w:hAnsi="Symbol" w:hint="default"/>
+        <w:sz w:val="20"/>
+      </w:rPr>
+    </w:lvl>
+    <w:lvl w:ilvl="1" w:tentative="1">
+      <w:start w:val="1"/>
+      <w:numFmt w:val="bullet"/>
+      <w:lvlText w:val="o"/>
+      <w:lvlJc w:val="left"/>
+      <w:pPr>
+        <w:tabs>
+          <w:tab w:val="num" w:pos="1440"/>
+        </w:tabs>
+        <w:ind w:left="1440" w:hanging="360"/>
+      </w:pPr>
+      <w:rPr>
+        <w:rFonts w:ascii="Courier New" w:hAnsi="Courier New" w:hint="default"/>
+        <w:sz w:val="20"/>
+      </w:rPr>
+    </w:lvl>
+    <w:lvl w:ilvl="2" w:tentative="1">
+      <w:start w:val="1"/>
+      <w:numFmt w:val="bullet"/>
+      <w:lvlText w:val=""/>
+      <w:lvlJc w:val="left"/>
+      <w:pPr>
+        <w:tabs>
+          <w:tab w:val="num" w:pos="2160"/>
+        </w:tabs>
+        <w:ind w:left="2160" w:hanging="360"/>
+      </w:pPr>
+      <w:rPr>
+        <w:rFonts w:ascii="Wingdings" w:hAnsi="Wingdings" w:hint="default"/>
+        <w:sz w:val="20"/>
+      </w:rPr>
+    </w:lvl>
+    <w:lvl w:ilvl="3" w:tentative="1">
+      <w:start w:val="1"/>
+      <w:numFmt w:val="bullet"/>
+      <w:lvlText w:val=""/>
+      <w:lvlJc w:val="left"/>
+      <w:pPr>
+        <w:tabs>
+          <w:tab w:val="num" w:pos="2880"/>
+        </w:tabs>
+        <w:ind w:left="2880" w:hanging="360"/>
+      </w:pPr>
+      <w:rPr>
+        <w:rFonts w:ascii="Wingdings" w:hAnsi="Wingdings" w:hint="default"/>
+        <w:sz w:val="20"/>
+      </w:rPr>
+    </w:lvl>
+    <w:lvl w:ilvl="4" w:tentative="1">
+      <w:start w:val="1"/>
+      <w:numFmt w:val="bullet"/>
+      <w:lvlText w:val=""/>
+      <w:lvlJc w:val="left"/>
+      <w:pPr>
+        <w:tabs>
+          <w:tab w:val="num" w:pos="3600"/>
+        </w:tabs>
+        <w:ind w:left="3600" w:hanging="360"/>
+      </w:pPr>
+      <w:rPr>
+        <w:rFonts w:ascii="Wingdings" w:hAnsi="Wingdings" w:hint="default"/>
+        <w:sz w:val="20"/>
+      </w:rPr>
+    </w:lvl>
+    <w:lvl w:ilvl="5" w:tentative="1">
+      <w:start w:val="1"/>
+      <w:numFmt w:val="bullet"/>
+      <w:lvlText w:val=""/>
+      <w:lvlJc w:val="left"/>
+      <w:pPr>
+        <w:tabs>
+          <w:tab w:val="num" w:pos="4320"/>
+        </w:tabs>
+        <w:ind w:left="4320" w:hanging="360"/>
+      </w:pPr>
+      <w:rPr>
+        <w:rFonts w:ascii="Wingdings" w:hAnsi="Wingdings" w:hint="default"/>
+        <w:sz w:val="20"/>
+      </w:rPr>
+    </w:lvl>
+    <w:lvl w:ilvl="6" w:tentative="1">
+      <w:start w:val="1"/>
+      <w:numFmt w:val="bullet"/>
+      <w:lvlText w:val=""/>
+      <w:lvlJc w:val="left"/>
+      <w:pPr>
+        <w:tabs>
+          <w:tab w:val="num" w:pos="5040"/>
+        </w:tabs>
+        <w:ind w:left="5040" w:hanging="360"/>
+      </w:pPr>
+      <w:rPr>
+        <w:rFonts w:ascii="Wingdings" w:hAnsi="Wingdings" w:hint="default"/>
+        <w:sz w:val="20"/>
+      </w:rPr>
+    </w:lvl>
+    <w:lvl w:ilvl="7" w:tentative="1">
+      <w:start w:val="1"/>
+      <w:numFmt w:val="bullet"/>
+      <w:lvlText w:val=""/>
+      <w:lvlJc w:val="left"/>
+      <w:pPr>
+        <w:tabs>
+          <w:tab w:val="num" w:pos="5760"/>
+        </w:tabs>
+        <w:ind w:left="5760" w:hanging="360"/>
+      </w:pPr>
+      <w:rPr>
+        <w:rFonts w:ascii="Wingdings" w:hAnsi="Wingdings" w:hint="default"/>
+        <w:sz w:val="20"/>
+      </w:rPr>
+    </w:lvl>
+    <w:lvl w:ilvl="8" w:tentative="1">
+      <w:start w:val="1"/>
+      <w:numFmt w:val="bullet"/>
+      <w:lvlText w:val=""/>
+      <w:lvlJc w:val="left"/>
+      <w:pPr>
+        <w:tabs>
+          <w:tab w:val="num" w:pos="6480"/>
+        </w:tabs>
+        <w:ind w:left="6480" w:hanging="360"/>
+      </w:pPr>
+      <w:rPr>
+        <w:rFonts w:ascii="Wingdings" w:hAnsi="Wingdings" w:hint="default"/>
+        <w:sz w:val="20"/>
+      </w:rPr>
+    </w:lvl>
+  </w:abstractNum>
+  <w:abstractNum w:abstractNumId="16" w15:restartNumberingAfterBreak="0">
+    <w:nsid w:val="5DD44DD7"/>
+    <w:multiLevelType w:val="multilevel"/>
+    <w:tmpl w:val="F1527D52"/>
+    <w:lvl w:ilvl="0">
+      <w:start w:val="1"/>
+      <w:numFmt w:val="bullet"/>
+      <w:lvlText w:val=""/>
+      <w:lvlJc w:val="left"/>
+      <w:pPr>
+        <w:tabs>
+          <w:tab w:val="num" w:pos="720"/>
+        </w:tabs>
+        <w:ind w:left="720" w:hanging="360"/>
+      </w:pPr>
+      <w:rPr>
+        <w:rFonts w:ascii="Symbol" w:hAnsi="Symbol" w:hint="default"/>
+        <w:sz w:val="20"/>
+      </w:rPr>
+    </w:lvl>
+    <w:lvl w:ilvl="1" w:tentative="1">
+      <w:start w:val="1"/>
+      <w:numFmt w:val="bullet"/>
+      <w:lvlText w:val="o"/>
+      <w:lvlJc w:val="left"/>
+      <w:pPr>
+        <w:tabs>
+          <w:tab w:val="num" w:pos="1440"/>
+        </w:tabs>
+        <w:ind w:left="1440" w:hanging="360"/>
+      </w:pPr>
+      <w:rPr>
+        <w:rFonts w:ascii="Courier New" w:hAnsi="Courier New" w:hint="default"/>
+        <w:sz w:val="20"/>
+      </w:rPr>
+    </w:lvl>
+    <w:lvl w:ilvl="2" w:tentative="1">
+      <w:start w:val="1"/>
+      <w:numFmt w:val="bullet"/>
+      <w:lvlText w:val=""/>
+      <w:lvlJc w:val="left"/>
+      <w:pPr>
+        <w:tabs>
+          <w:tab w:val="num" w:pos="2160"/>
+        </w:tabs>
+        <w:ind w:left="2160" w:hanging="360"/>
+      </w:pPr>
+      <w:rPr>
+        <w:rFonts w:ascii="Wingdings" w:hAnsi="Wingdings" w:hint="default"/>
+        <w:sz w:val="20"/>
+      </w:rPr>
+    </w:lvl>
+    <w:lvl w:ilvl="3" w:tentative="1">
+      <w:start w:val="1"/>
+      <w:numFmt w:val="bullet"/>
+      <w:lvlText w:val=""/>
+      <w:lvlJc w:val="left"/>
+      <w:pPr>
+        <w:tabs>
+          <w:tab w:val="num" w:pos="2880"/>
+        </w:tabs>
+        <w:ind w:left="2880" w:hanging="360"/>
+      </w:pPr>
+      <w:rPr>
+        <w:rFonts w:ascii="Wingdings" w:hAnsi="Wingdings" w:hint="default"/>
+        <w:sz w:val="20"/>
+      </w:rPr>
+    </w:lvl>
+    <w:lvl w:ilvl="4" w:tentative="1">
+      <w:start w:val="1"/>
+      <w:numFmt w:val="bullet"/>
+      <w:lvlText w:val=""/>
+      <w:lvlJc w:val="left"/>
+      <w:pPr>
+        <w:tabs>
+          <w:tab w:val="num" w:pos="3600"/>
+        </w:tabs>
+        <w:ind w:left="3600" w:hanging="360"/>
+      </w:pPr>
+      <w:rPr>
+        <w:rFonts w:ascii="Wingdings" w:hAnsi="Wingdings" w:hint="default"/>
+        <w:sz w:val="20"/>
+      </w:rPr>
+    </w:lvl>
+    <w:lvl w:ilvl="5" w:tentative="1">
+      <w:start w:val="1"/>
+      <w:numFmt w:val="bullet"/>
+      <w:lvlText w:val=""/>
+      <w:lvlJc w:val="left"/>
+      <w:pPr>
+        <w:tabs>
+          <w:tab w:val="num" w:pos="4320"/>
+        </w:tabs>
+        <w:ind w:left="4320" w:hanging="360"/>
+      </w:pPr>
+      <w:rPr>
+        <w:rFonts w:ascii="Wingdings" w:hAnsi="Wingdings" w:hint="default"/>
+        <w:sz w:val="20"/>
+      </w:rPr>
+    </w:lvl>
+    <w:lvl w:ilvl="6" w:tentative="1">
+      <w:start w:val="1"/>
+      <w:numFmt w:val="bullet"/>
+      <w:lvlText w:val=""/>
+      <w:lvlJc w:val="left"/>
+      <w:pPr>
+        <w:tabs>
+          <w:tab w:val="num" w:pos="5040"/>
+        </w:tabs>
+        <w:ind w:left="5040" w:hanging="360"/>
+      </w:pPr>
+      <w:rPr>
+        <w:rFonts w:ascii="Wingdings" w:hAnsi="Wingdings" w:hint="default"/>
+        <w:sz w:val="20"/>
+      </w:rPr>
+    </w:lvl>
+    <w:lvl w:ilvl="7" w:tentative="1">
+      <w:start w:val="1"/>
+      <w:numFmt w:val="bullet"/>
+      <w:lvlText w:val=""/>
+      <w:lvlJc w:val="left"/>
+      <w:pPr>
+        <w:tabs>
+          <w:tab w:val="num" w:pos="5760"/>
+        </w:tabs>
+        <w:ind w:left="5760" w:hanging="360"/>
+      </w:pPr>
+      <w:rPr>
+        <w:rFonts w:ascii="Wingdings" w:hAnsi="Wingdings" w:hint="default"/>
+        <w:sz w:val="20"/>
+      </w:rPr>
+    </w:lvl>
+    <w:lvl w:ilvl="8" w:tentative="1">
+      <w:start w:val="1"/>
+      <w:numFmt w:val="bullet"/>
+      <w:lvlText w:val=""/>
+      <w:lvlJc w:val="left"/>
+      <w:pPr>
+        <w:tabs>
+          <w:tab w:val="num" w:pos="6480"/>
+        </w:tabs>
+        <w:ind w:left="6480" w:hanging="360"/>
+      </w:pPr>
+      <w:rPr>
+        <w:rFonts w:ascii="Wingdings" w:hAnsi="Wingdings" w:hint="default"/>
+        <w:sz w:val="20"/>
+      </w:rPr>
+    </w:lvl>
+  </w:abstractNum>
+  <w:abstractNum w:abstractNumId="17" w15:restartNumberingAfterBreak="0">
+    <w:nsid w:val="6AA472A5"/>
+    <w:multiLevelType w:val="multilevel"/>
+    <w:tmpl w:val="06C2C09E"/>
     <w:lvl w:ilvl="0">
       <w:start w:val="1"/>
       <w:numFmt w:val="decimal"/>
@@ -8608,308 +9055,10 @@
       </w:pPr>
     </w:lvl>
   </w:abstractNum>
-  <w:abstractNum w:abstractNumId="15" w15:restartNumberingAfterBreak="0">
-    <w:nsid w:val="4200440E"/>
+  <w:abstractNum w:abstractNumId="18" w15:restartNumberingAfterBreak="0">
+    <w:nsid w:val="6AD0763F"/>
     <w:multiLevelType w:val="multilevel"/>
-    <w:tmpl w:val="34723F74"/>
-    <w:lvl w:ilvl="0">
-      <w:start w:val="1"/>
-      <w:numFmt w:val="bullet"/>
-      <w:lvlText w:val=""/>
-      <w:lvlJc w:val="left"/>
-      <w:pPr>
-        <w:tabs>
-          <w:tab w:val="num" w:pos="720"/>
-        </w:tabs>
-        <w:ind w:left="720" w:hanging="360"/>
-      </w:pPr>
-      <w:rPr>
-        <w:rFonts w:ascii="Symbol" w:hAnsi="Symbol" w:hint="default"/>
-        <w:sz w:val="20"/>
-      </w:rPr>
-    </w:lvl>
-    <w:lvl w:ilvl="1" w:tentative="1">
-      <w:start w:val="1"/>
-      <w:numFmt w:val="bullet"/>
-      <w:lvlText w:val="o"/>
-      <w:lvlJc w:val="left"/>
-      <w:pPr>
-        <w:tabs>
-          <w:tab w:val="num" w:pos="1440"/>
-        </w:tabs>
-        <w:ind w:left="1440" w:hanging="360"/>
-      </w:pPr>
-      <w:rPr>
-        <w:rFonts w:ascii="Courier New" w:hAnsi="Courier New" w:hint="default"/>
-        <w:sz w:val="20"/>
-      </w:rPr>
-    </w:lvl>
-    <w:lvl w:ilvl="2" w:tentative="1">
-      <w:start w:val="1"/>
-      <w:numFmt w:val="bullet"/>
-      <w:lvlText w:val=""/>
-      <w:lvlJc w:val="left"/>
-      <w:pPr>
-        <w:tabs>
-          <w:tab w:val="num" w:pos="2160"/>
-        </w:tabs>
-        <w:ind w:left="2160" w:hanging="360"/>
-      </w:pPr>
-      <w:rPr>
-        <w:rFonts w:ascii="Wingdings" w:hAnsi="Wingdings" w:hint="default"/>
-        <w:sz w:val="20"/>
-      </w:rPr>
-    </w:lvl>
-    <w:lvl w:ilvl="3" w:tentative="1">
-      <w:start w:val="1"/>
-      <w:numFmt w:val="bullet"/>
-      <w:lvlText w:val=""/>
-      <w:lvlJc w:val="left"/>
-      <w:pPr>
-        <w:tabs>
-          <w:tab w:val="num" w:pos="2880"/>
-        </w:tabs>
-        <w:ind w:left="2880" w:hanging="360"/>
-      </w:pPr>
-      <w:rPr>
-        <w:rFonts w:ascii="Wingdings" w:hAnsi="Wingdings" w:hint="default"/>
-        <w:sz w:val="20"/>
-      </w:rPr>
-    </w:lvl>
-    <w:lvl w:ilvl="4" w:tentative="1">
-      <w:start w:val="1"/>
-      <w:numFmt w:val="bullet"/>
-      <w:lvlText w:val=""/>
-      <w:lvlJc w:val="left"/>
-      <w:pPr>
-        <w:tabs>
-          <w:tab w:val="num" w:pos="3600"/>
-        </w:tabs>
-        <w:ind w:left="3600" w:hanging="360"/>
-      </w:pPr>
-      <w:rPr>
-        <w:rFonts w:ascii="Wingdings" w:hAnsi="Wingdings" w:hint="default"/>
-        <w:sz w:val="20"/>
-      </w:rPr>
-    </w:lvl>
-    <w:lvl w:ilvl="5" w:tentative="1">
-      <w:start w:val="1"/>
-      <w:numFmt w:val="bullet"/>
-      <w:lvlText w:val=""/>
-      <w:lvlJc w:val="left"/>
-      <w:pPr>
-        <w:tabs>
-          <w:tab w:val="num" w:pos="4320"/>
-        </w:tabs>
-        <w:ind w:left="4320" w:hanging="360"/>
-      </w:pPr>
-      <w:rPr>
-        <w:rFonts w:ascii="Wingdings" w:hAnsi="Wingdings" w:hint="default"/>
-        <w:sz w:val="20"/>
-      </w:rPr>
-    </w:lvl>
-    <w:lvl w:ilvl="6" w:tentative="1">
-      <w:start w:val="1"/>
-      <w:numFmt w:val="bullet"/>
-      <w:lvlText w:val=""/>
-      <w:lvlJc w:val="left"/>
-      <w:pPr>
-        <w:tabs>
-          <w:tab w:val="num" w:pos="5040"/>
-        </w:tabs>
-        <w:ind w:left="5040" w:hanging="360"/>
-      </w:pPr>
-      <w:rPr>
-        <w:rFonts w:ascii="Wingdings" w:hAnsi="Wingdings" w:hint="default"/>
-        <w:sz w:val="20"/>
-      </w:rPr>
-    </w:lvl>
-    <w:lvl w:ilvl="7" w:tentative="1">
-      <w:start w:val="1"/>
-      <w:numFmt w:val="bullet"/>
-      <w:lvlText w:val=""/>
-      <w:lvlJc w:val="left"/>
-      <w:pPr>
-        <w:tabs>
-          <w:tab w:val="num" w:pos="5760"/>
-        </w:tabs>
-        <w:ind w:left="5760" w:hanging="360"/>
-      </w:pPr>
-      <w:rPr>
-        <w:rFonts w:ascii="Wingdings" w:hAnsi="Wingdings" w:hint="default"/>
-        <w:sz w:val="20"/>
-      </w:rPr>
-    </w:lvl>
-    <w:lvl w:ilvl="8" w:tentative="1">
-      <w:start w:val="1"/>
-      <w:numFmt w:val="bullet"/>
-      <w:lvlText w:val=""/>
-      <w:lvlJc w:val="left"/>
-      <w:pPr>
-        <w:tabs>
-          <w:tab w:val="num" w:pos="6480"/>
-        </w:tabs>
-        <w:ind w:left="6480" w:hanging="360"/>
-      </w:pPr>
-      <w:rPr>
-        <w:rFonts w:ascii="Wingdings" w:hAnsi="Wingdings" w:hint="default"/>
-        <w:sz w:val="20"/>
-      </w:rPr>
-    </w:lvl>
-  </w:abstractNum>
-  <w:abstractNum w:abstractNumId="16" w15:restartNumberingAfterBreak="0">
-    <w:nsid w:val="433349C9"/>
-    <w:multiLevelType w:val="multilevel"/>
-    <w:tmpl w:val="BE5439E6"/>
-    <w:lvl w:ilvl="0">
-      <w:start w:val="1"/>
-      <w:numFmt w:val="bullet"/>
-      <w:lvlText w:val=""/>
-      <w:lvlJc w:val="left"/>
-      <w:pPr>
-        <w:tabs>
-          <w:tab w:val="num" w:pos="720"/>
-        </w:tabs>
-        <w:ind w:left="720" w:hanging="360"/>
-      </w:pPr>
-      <w:rPr>
-        <w:rFonts w:ascii="Symbol" w:hAnsi="Symbol" w:hint="default"/>
-        <w:sz w:val="20"/>
-      </w:rPr>
-    </w:lvl>
-    <w:lvl w:ilvl="1" w:tentative="1">
-      <w:start w:val="1"/>
-      <w:numFmt w:val="bullet"/>
-      <w:lvlText w:val="o"/>
-      <w:lvlJc w:val="left"/>
-      <w:pPr>
-        <w:tabs>
-          <w:tab w:val="num" w:pos="1440"/>
-        </w:tabs>
-        <w:ind w:left="1440" w:hanging="360"/>
-      </w:pPr>
-      <w:rPr>
-        <w:rFonts w:ascii="Courier New" w:hAnsi="Courier New" w:hint="default"/>
-        <w:sz w:val="20"/>
-      </w:rPr>
-    </w:lvl>
-    <w:lvl w:ilvl="2" w:tentative="1">
-      <w:start w:val="1"/>
-      <w:numFmt w:val="bullet"/>
-      <w:lvlText w:val=""/>
-      <w:lvlJc w:val="left"/>
-      <w:pPr>
-        <w:tabs>
-          <w:tab w:val="num" w:pos="2160"/>
-        </w:tabs>
-        <w:ind w:left="2160" w:hanging="360"/>
-      </w:pPr>
-      <w:rPr>
-        <w:rFonts w:ascii="Wingdings" w:hAnsi="Wingdings" w:hint="default"/>
-        <w:sz w:val="20"/>
-      </w:rPr>
-    </w:lvl>
-    <w:lvl w:ilvl="3" w:tentative="1">
-      <w:start w:val="1"/>
-      <w:numFmt w:val="bullet"/>
-      <w:lvlText w:val=""/>
-      <w:lvlJc w:val="left"/>
-      <w:pPr>
-        <w:tabs>
-          <w:tab w:val="num" w:pos="2880"/>
-        </w:tabs>
-        <w:ind w:left="2880" w:hanging="360"/>
-      </w:pPr>
-      <w:rPr>
-        <w:rFonts w:ascii="Wingdings" w:hAnsi="Wingdings" w:hint="default"/>
-        <w:sz w:val="20"/>
-      </w:rPr>
-    </w:lvl>
-    <w:lvl w:ilvl="4" w:tentative="1">
-      <w:start w:val="1"/>
-      <w:numFmt w:val="bullet"/>
-      <w:lvlText w:val=""/>
-      <w:lvlJc w:val="left"/>
-      <w:pPr>
-        <w:tabs>
-          <w:tab w:val="num" w:pos="3600"/>
-        </w:tabs>
-        <w:ind w:left="3600" w:hanging="360"/>
-      </w:pPr>
-      <w:rPr>
-        <w:rFonts w:ascii="Wingdings" w:hAnsi="Wingdings" w:hint="default"/>
-        <w:sz w:val="20"/>
-      </w:rPr>
-    </w:lvl>
-    <w:lvl w:ilvl="5" w:tentative="1">
-      <w:start w:val="1"/>
-      <w:numFmt w:val="bullet"/>
-      <w:lvlText w:val=""/>
-      <w:lvlJc w:val="left"/>
-      <w:pPr>
-        <w:tabs>
-          <w:tab w:val="num" w:pos="4320"/>
-        </w:tabs>
-        <w:ind w:left="4320" w:hanging="360"/>
-      </w:pPr>
-      <w:rPr>
-        <w:rFonts w:ascii="Wingdings" w:hAnsi="Wingdings" w:hint="default"/>
-        <w:sz w:val="20"/>
-      </w:rPr>
-    </w:lvl>
-    <w:lvl w:ilvl="6" w:tentative="1">
-      <w:start w:val="1"/>
-      <w:numFmt w:val="bullet"/>
-      <w:lvlText w:val=""/>
-      <w:lvlJc w:val="left"/>
-      <w:pPr>
-        <w:tabs>
-          <w:tab w:val="num" w:pos="5040"/>
-        </w:tabs>
-        <w:ind w:left="5040" w:hanging="360"/>
-      </w:pPr>
-      <w:rPr>
-        <w:rFonts w:ascii="Wingdings" w:hAnsi="Wingdings" w:hint="default"/>
-        <w:sz w:val="20"/>
-      </w:rPr>
-    </w:lvl>
-    <w:lvl w:ilvl="7" w:tentative="1">
-      <w:start w:val="1"/>
-      <w:numFmt w:val="bullet"/>
-      <w:lvlText w:val=""/>
-      <w:lvlJc w:val="left"/>
-      <w:pPr>
-        <w:tabs>
-          <w:tab w:val="num" w:pos="5760"/>
-        </w:tabs>
-        <w:ind w:left="5760" w:hanging="360"/>
-      </w:pPr>
-      <w:rPr>
-        <w:rFonts w:ascii="Wingdings" w:hAnsi="Wingdings" w:hint="default"/>
-        <w:sz w:val="20"/>
-      </w:rPr>
-    </w:lvl>
-    <w:lvl w:ilvl="8" w:tentative="1">
-      <w:start w:val="1"/>
-      <w:numFmt w:val="bullet"/>
-      <w:lvlText w:val=""/>
-      <w:lvlJc w:val="left"/>
-      <w:pPr>
-        <w:tabs>
-          <w:tab w:val="num" w:pos="6480"/>
-        </w:tabs>
-        <w:ind w:left="6480" w:hanging="360"/>
-      </w:pPr>
-      <w:rPr>
-        <w:rFonts w:ascii="Wingdings" w:hAnsi="Wingdings" w:hint="default"/>
-        <w:sz w:val="20"/>
-      </w:rPr>
-    </w:lvl>
-  </w:abstractNum>
-  <w:abstractNum w:abstractNumId="17" w15:restartNumberingAfterBreak="0">
-    <w:nsid w:val="4BEA1ECD"/>
-    <w:multiLevelType w:val="multilevel"/>
-    <w:tmpl w:val="8D9881A0"/>
+    <w:tmpl w:val="2DA44A4E"/>
     <w:lvl w:ilvl="0">
       <w:start w:val="1"/>
       <w:numFmt w:val="decimal"/>
@@ -9023,10 +9172,308 @@
       </w:pPr>
     </w:lvl>
   </w:abstractNum>
-  <w:abstractNum w:abstractNumId="18" w15:restartNumberingAfterBreak="0">
-    <w:nsid w:val="587556E4"/>
+  <w:abstractNum w:abstractNumId="19" w15:restartNumberingAfterBreak="0">
+    <w:nsid w:val="6B33450C"/>
     <w:multiLevelType w:val="multilevel"/>
-    <w:tmpl w:val="5B0E8DC2"/>
+    <w:tmpl w:val="43A0AF5C"/>
+    <w:lvl w:ilvl="0">
+      <w:start w:val="1"/>
+      <w:numFmt w:val="bullet"/>
+      <w:lvlText w:val=""/>
+      <w:lvlJc w:val="left"/>
+      <w:pPr>
+        <w:tabs>
+          <w:tab w:val="num" w:pos="720"/>
+        </w:tabs>
+        <w:ind w:left="720" w:hanging="360"/>
+      </w:pPr>
+      <w:rPr>
+        <w:rFonts w:ascii="Symbol" w:hAnsi="Symbol" w:hint="default"/>
+        <w:sz w:val="20"/>
+      </w:rPr>
+    </w:lvl>
+    <w:lvl w:ilvl="1" w:tentative="1">
+      <w:start w:val="1"/>
+      <w:numFmt w:val="bullet"/>
+      <w:lvlText w:val="o"/>
+      <w:lvlJc w:val="left"/>
+      <w:pPr>
+        <w:tabs>
+          <w:tab w:val="num" w:pos="1440"/>
+        </w:tabs>
+        <w:ind w:left="1440" w:hanging="360"/>
+      </w:pPr>
+      <w:rPr>
+        <w:rFonts w:ascii="Courier New" w:hAnsi="Courier New" w:hint="default"/>
+        <w:sz w:val="20"/>
+      </w:rPr>
+    </w:lvl>
+    <w:lvl w:ilvl="2" w:tentative="1">
+      <w:start w:val="1"/>
+      <w:numFmt w:val="bullet"/>
+      <w:lvlText w:val=""/>
+      <w:lvlJc w:val="left"/>
+      <w:pPr>
+        <w:tabs>
+          <w:tab w:val="num" w:pos="2160"/>
+        </w:tabs>
+        <w:ind w:left="2160" w:hanging="360"/>
+      </w:pPr>
+      <w:rPr>
+        <w:rFonts w:ascii="Wingdings" w:hAnsi="Wingdings" w:hint="default"/>
+        <w:sz w:val="20"/>
+      </w:rPr>
+    </w:lvl>
+    <w:lvl w:ilvl="3" w:tentative="1">
+      <w:start w:val="1"/>
+      <w:numFmt w:val="bullet"/>
+      <w:lvlText w:val=""/>
+      <w:lvlJc w:val="left"/>
+      <w:pPr>
+        <w:tabs>
+          <w:tab w:val="num" w:pos="2880"/>
+        </w:tabs>
+        <w:ind w:left="2880" w:hanging="360"/>
+      </w:pPr>
+      <w:rPr>
+        <w:rFonts w:ascii="Wingdings" w:hAnsi="Wingdings" w:hint="default"/>
+        <w:sz w:val="20"/>
+      </w:rPr>
+    </w:lvl>
+    <w:lvl w:ilvl="4" w:tentative="1">
+      <w:start w:val="1"/>
+      <w:numFmt w:val="bullet"/>
+      <w:lvlText w:val=""/>
+      <w:lvlJc w:val="left"/>
+      <w:pPr>
+        <w:tabs>
+          <w:tab w:val="num" w:pos="3600"/>
+        </w:tabs>
+        <w:ind w:left="3600" w:hanging="360"/>
+      </w:pPr>
+      <w:rPr>
+        <w:rFonts w:ascii="Wingdings" w:hAnsi="Wingdings" w:hint="default"/>
+        <w:sz w:val="20"/>
+      </w:rPr>
+    </w:lvl>
+    <w:lvl w:ilvl="5" w:tentative="1">
+      <w:start w:val="1"/>
+      <w:numFmt w:val="bullet"/>
+      <w:lvlText w:val=""/>
+      <w:lvlJc w:val="left"/>
+      <w:pPr>
+        <w:tabs>
+          <w:tab w:val="num" w:pos="4320"/>
+        </w:tabs>
+        <w:ind w:left="4320" w:hanging="360"/>
+      </w:pPr>
+      <w:rPr>
+        <w:rFonts w:ascii="Wingdings" w:hAnsi="Wingdings" w:hint="default"/>
+        <w:sz w:val="20"/>
+      </w:rPr>
+    </w:lvl>
+    <w:lvl w:ilvl="6" w:tentative="1">
+      <w:start w:val="1"/>
+      <w:numFmt w:val="bullet"/>
+      <w:lvlText w:val=""/>
+      <w:lvlJc w:val="left"/>
+      <w:pPr>
+        <w:tabs>
+          <w:tab w:val="num" w:pos="5040"/>
+        </w:tabs>
+        <w:ind w:left="5040" w:hanging="360"/>
+      </w:pPr>
+      <w:rPr>
+        <w:rFonts w:ascii="Wingdings" w:hAnsi="Wingdings" w:hint="default"/>
+        <w:sz w:val="20"/>
+      </w:rPr>
+    </w:lvl>
+    <w:lvl w:ilvl="7" w:tentative="1">
+      <w:start w:val="1"/>
+      <w:numFmt w:val="bullet"/>
+      <w:lvlText w:val=""/>
+      <w:lvlJc w:val="left"/>
+      <w:pPr>
+        <w:tabs>
+          <w:tab w:val="num" w:pos="5760"/>
+        </w:tabs>
+        <w:ind w:left="5760" w:hanging="360"/>
+      </w:pPr>
+      <w:rPr>
+        <w:rFonts w:ascii="Wingdings" w:hAnsi="Wingdings" w:hint="default"/>
+        <w:sz w:val="20"/>
+      </w:rPr>
+    </w:lvl>
+    <w:lvl w:ilvl="8" w:tentative="1">
+      <w:start w:val="1"/>
+      <w:numFmt w:val="bullet"/>
+      <w:lvlText w:val=""/>
+      <w:lvlJc w:val="left"/>
+      <w:pPr>
+        <w:tabs>
+          <w:tab w:val="num" w:pos="6480"/>
+        </w:tabs>
+        <w:ind w:left="6480" w:hanging="360"/>
+      </w:pPr>
+      <w:rPr>
+        <w:rFonts w:ascii="Wingdings" w:hAnsi="Wingdings" w:hint="default"/>
+        <w:sz w:val="20"/>
+      </w:rPr>
+    </w:lvl>
+  </w:abstractNum>
+  <w:abstractNum w:abstractNumId="20" w15:restartNumberingAfterBreak="0">
+    <w:nsid w:val="6D371C55"/>
+    <w:multiLevelType w:val="multilevel"/>
+    <w:tmpl w:val="F56AA1E8"/>
+    <w:lvl w:ilvl="0">
+      <w:start w:val="1"/>
+      <w:numFmt w:val="bullet"/>
+      <w:lvlText w:val=""/>
+      <w:lvlJc w:val="left"/>
+      <w:pPr>
+        <w:tabs>
+          <w:tab w:val="num" w:pos="720"/>
+        </w:tabs>
+        <w:ind w:left="720" w:hanging="360"/>
+      </w:pPr>
+      <w:rPr>
+        <w:rFonts w:ascii="Symbol" w:hAnsi="Symbol" w:hint="default"/>
+        <w:sz w:val="20"/>
+      </w:rPr>
+    </w:lvl>
+    <w:lvl w:ilvl="1" w:tentative="1">
+      <w:start w:val="1"/>
+      <w:numFmt w:val="bullet"/>
+      <w:lvlText w:val="o"/>
+      <w:lvlJc w:val="left"/>
+      <w:pPr>
+        <w:tabs>
+          <w:tab w:val="num" w:pos="1440"/>
+        </w:tabs>
+        <w:ind w:left="1440" w:hanging="360"/>
+      </w:pPr>
+      <w:rPr>
+        <w:rFonts w:ascii="Courier New" w:hAnsi="Courier New" w:hint="default"/>
+        <w:sz w:val="20"/>
+      </w:rPr>
+    </w:lvl>
+    <w:lvl w:ilvl="2" w:tentative="1">
+      <w:start w:val="1"/>
+      <w:numFmt w:val="bullet"/>
+      <w:lvlText w:val=""/>
+      <w:lvlJc w:val="left"/>
+      <w:pPr>
+        <w:tabs>
+          <w:tab w:val="num" w:pos="2160"/>
+        </w:tabs>
+        <w:ind w:left="2160" w:hanging="360"/>
+      </w:pPr>
+      <w:rPr>
+        <w:rFonts w:ascii="Wingdings" w:hAnsi="Wingdings" w:hint="default"/>
+        <w:sz w:val="20"/>
+      </w:rPr>
+    </w:lvl>
+    <w:lvl w:ilvl="3" w:tentative="1">
+      <w:start w:val="1"/>
+      <w:numFmt w:val="bullet"/>
+      <w:lvlText w:val=""/>
+      <w:lvlJc w:val="left"/>
+      <w:pPr>
+        <w:tabs>
+          <w:tab w:val="num" w:pos="2880"/>
+        </w:tabs>
+        <w:ind w:left="2880" w:hanging="360"/>
+      </w:pPr>
+      <w:rPr>
+        <w:rFonts w:ascii="Wingdings" w:hAnsi="Wingdings" w:hint="default"/>
+        <w:sz w:val="20"/>
+      </w:rPr>
+    </w:lvl>
+    <w:lvl w:ilvl="4" w:tentative="1">
+      <w:start w:val="1"/>
+      <w:numFmt w:val="bullet"/>
+      <w:lvlText w:val=""/>
+      <w:lvlJc w:val="left"/>
+      <w:pPr>
+        <w:tabs>
+          <w:tab w:val="num" w:pos="3600"/>
+        </w:tabs>
+        <w:ind w:left="3600" w:hanging="360"/>
+      </w:pPr>
+      <w:rPr>
+        <w:rFonts w:ascii="Wingdings" w:hAnsi="Wingdings" w:hint="default"/>
+        <w:sz w:val="20"/>
+      </w:rPr>
+    </w:lvl>
+    <w:lvl w:ilvl="5" w:tentative="1">
+      <w:start w:val="1"/>
+      <w:numFmt w:val="bullet"/>
+      <w:lvlText w:val=""/>
+      <w:lvlJc w:val="left"/>
+      <w:pPr>
+        <w:tabs>
+          <w:tab w:val="num" w:pos="4320"/>
+        </w:tabs>
+        <w:ind w:left="4320" w:hanging="360"/>
+      </w:pPr>
+      <w:rPr>
+        <w:rFonts w:ascii="Wingdings" w:hAnsi="Wingdings" w:hint="default"/>
+        <w:sz w:val="20"/>
+      </w:rPr>
+    </w:lvl>
+    <w:lvl w:ilvl="6" w:tentative="1">
+      <w:start w:val="1"/>
+      <w:numFmt w:val="bullet"/>
+      <w:lvlText w:val=""/>
+      <w:lvlJc w:val="left"/>
+      <w:pPr>
+        <w:tabs>
+          <w:tab w:val="num" w:pos="5040"/>
+        </w:tabs>
+        <w:ind w:left="5040" w:hanging="360"/>
+      </w:pPr>
+      <w:rPr>
+        <w:rFonts w:ascii="Wingdings" w:hAnsi="Wingdings" w:hint="default"/>
+        <w:sz w:val="20"/>
+      </w:rPr>
+    </w:lvl>
+    <w:lvl w:ilvl="7" w:tentative="1">
+      <w:start w:val="1"/>
+      <w:numFmt w:val="bullet"/>
+      <w:lvlText w:val=""/>
+      <w:lvlJc w:val="left"/>
+      <w:pPr>
+        <w:tabs>
+          <w:tab w:val="num" w:pos="5760"/>
+        </w:tabs>
+        <w:ind w:left="5760" w:hanging="360"/>
+      </w:pPr>
+      <w:rPr>
+        <w:rFonts w:ascii="Wingdings" w:hAnsi="Wingdings" w:hint="default"/>
+        <w:sz w:val="20"/>
+      </w:rPr>
+    </w:lvl>
+    <w:lvl w:ilvl="8" w:tentative="1">
+      <w:start w:val="1"/>
+      <w:numFmt w:val="bullet"/>
+      <w:lvlText w:val=""/>
+      <w:lvlJc w:val="left"/>
+      <w:pPr>
+        <w:tabs>
+          <w:tab w:val="num" w:pos="6480"/>
+        </w:tabs>
+        <w:ind w:left="6480" w:hanging="360"/>
+      </w:pPr>
+      <w:rPr>
+        <w:rFonts w:ascii="Wingdings" w:hAnsi="Wingdings" w:hint="default"/>
+        <w:sz w:val="20"/>
+      </w:rPr>
+    </w:lvl>
+  </w:abstractNum>
+  <w:abstractNum w:abstractNumId="21" w15:restartNumberingAfterBreak="0">
+    <w:nsid w:val="72BE2980"/>
+    <w:multiLevelType w:val="multilevel"/>
+    <w:tmpl w:val="BD282586"/>
     <w:lvl w:ilvl="0">
       <w:start w:val="1"/>
       <w:numFmt w:val="decimal"/>
@@ -9140,14 +9587,14 @@
       </w:pPr>
     </w:lvl>
   </w:abstractNum>
-  <w:abstractNum w:abstractNumId="19" w15:restartNumberingAfterBreak="0">
-    <w:nsid w:val="5CCF4415"/>
+  <w:abstractNum w:abstractNumId="22" w15:restartNumberingAfterBreak="0">
+    <w:nsid w:val="74900422"/>
     <w:multiLevelType w:val="multilevel"/>
-    <w:tmpl w:val="17C076EE"/>
+    <w:tmpl w:val="70B69978"/>
     <w:lvl w:ilvl="0">
       <w:start w:val="1"/>
-      <w:numFmt w:val="bullet"/>
-      <w:lvlText w:val=""/>
+      <w:numFmt w:val="decimal"/>
+      <w:lvlText w:val="%1."/>
       <w:lvlJc w:val="left"/>
       <w:pPr>
         <w:tabs>
@@ -9155,12 +9602,8 @@
         </w:tabs>
         <w:ind w:left="720" w:hanging="360"/>
       </w:pPr>
-      <w:rPr>
-        <w:rFonts w:ascii="Symbol" w:hAnsi="Symbol" w:hint="default"/>
-        <w:sz w:val="20"/>
-      </w:rPr>
-    </w:lvl>
-    <w:lvl w:ilvl="1" w:tentative="1">
+    </w:lvl>
+    <w:lvl w:ilvl="1">
       <w:start w:val="1"/>
       <w:numFmt w:val="bullet"/>
       <w:lvlText w:val="o"/>
@@ -9178,8 +9621,8 @@
     </w:lvl>
     <w:lvl w:ilvl="2" w:tentative="1">
       <w:start w:val="1"/>
-      <w:numFmt w:val="bullet"/>
-      <w:lvlText w:val=""/>
+      <w:numFmt w:val="decimal"/>
+      <w:lvlText w:val="%3."/>
       <w:lvlJc w:val="left"/>
       <w:pPr>
         <w:tabs>
@@ -9187,15 +9630,11 @@
         </w:tabs>
         <w:ind w:left="2160" w:hanging="360"/>
       </w:pPr>
-      <w:rPr>
-        <w:rFonts w:ascii="Wingdings" w:hAnsi="Wingdings" w:hint="default"/>
-        <w:sz w:val="20"/>
-      </w:rPr>
     </w:lvl>
     <w:lvl w:ilvl="3" w:tentative="1">
       <w:start w:val="1"/>
-      <w:numFmt w:val="bullet"/>
-      <w:lvlText w:val=""/>
+      <w:numFmt w:val="decimal"/>
+      <w:lvlText w:val="%4."/>
       <w:lvlJc w:val="left"/>
       <w:pPr>
         <w:tabs>
@@ -9203,15 +9642,11 @@
         </w:tabs>
         <w:ind w:left="2880" w:hanging="360"/>
       </w:pPr>
-      <w:rPr>
-        <w:rFonts w:ascii="Wingdings" w:hAnsi="Wingdings" w:hint="default"/>
-        <w:sz w:val="20"/>
-      </w:rPr>
     </w:lvl>
     <w:lvl w:ilvl="4" w:tentative="1">
       <w:start w:val="1"/>
-      <w:numFmt w:val="bullet"/>
-      <w:lvlText w:val=""/>
+      <w:numFmt w:val="decimal"/>
+      <w:lvlText w:val="%5."/>
       <w:lvlJc w:val="left"/>
       <w:pPr>
         <w:tabs>
@@ -9219,15 +9654,11 @@
         </w:tabs>
         <w:ind w:left="3600" w:hanging="360"/>
       </w:pPr>
-      <w:rPr>
-        <w:rFonts w:ascii="Wingdings" w:hAnsi="Wingdings" w:hint="default"/>
-        <w:sz w:val="20"/>
-      </w:rPr>
     </w:lvl>
     <w:lvl w:ilvl="5" w:tentative="1">
       <w:start w:val="1"/>
-      <w:numFmt w:val="bullet"/>
-      <w:lvlText w:val=""/>
+      <w:numFmt w:val="decimal"/>
+      <w:lvlText w:val="%6."/>
       <w:lvlJc w:val="left"/>
       <w:pPr>
         <w:tabs>
@@ -9235,15 +9666,11 @@
         </w:tabs>
         <w:ind w:left="4320" w:hanging="360"/>
       </w:pPr>
-      <w:rPr>
-        <w:rFonts w:ascii="Wingdings" w:hAnsi="Wingdings" w:hint="default"/>
-        <w:sz w:val="20"/>
-      </w:rPr>
     </w:lvl>
     <w:lvl w:ilvl="6" w:tentative="1">
       <w:start w:val="1"/>
-      <w:numFmt w:val="bullet"/>
-      <w:lvlText w:val=""/>
+      <w:numFmt w:val="decimal"/>
+      <w:lvlText w:val="%7."/>
       <w:lvlJc w:val="left"/>
       <w:pPr>
         <w:tabs>
@@ -9251,15 +9678,11 @@
         </w:tabs>
         <w:ind w:left="5040" w:hanging="360"/>
       </w:pPr>
-      <w:rPr>
-        <w:rFonts w:ascii="Wingdings" w:hAnsi="Wingdings" w:hint="default"/>
-        <w:sz w:val="20"/>
-      </w:rPr>
     </w:lvl>
     <w:lvl w:ilvl="7" w:tentative="1">
       <w:start w:val="1"/>
-      <w:numFmt w:val="bullet"/>
-      <w:lvlText w:val=""/>
+      <w:numFmt w:val="decimal"/>
+      <w:lvlText w:val="%8."/>
       <w:lvlJc w:val="left"/>
       <w:pPr>
         <w:tabs>
@@ -9267,15 +9690,11 @@
         </w:tabs>
         <w:ind w:left="5760" w:hanging="360"/>
       </w:pPr>
-      <w:rPr>
-        <w:rFonts w:ascii="Wingdings" w:hAnsi="Wingdings" w:hint="default"/>
-        <w:sz w:val="20"/>
-      </w:rPr>
     </w:lvl>
     <w:lvl w:ilvl="8" w:tentative="1">
       <w:start w:val="1"/>
-      <w:numFmt w:val="bullet"/>
-      <w:lvlText w:val=""/>
+      <w:numFmt w:val="decimal"/>
+      <w:lvlText w:val="%9."/>
       <w:lvlJc w:val="left"/>
       <w:pPr>
         <w:tabs>
@@ -9283,467 +9702,16 @@
         </w:tabs>
         <w:ind w:left="6480" w:hanging="360"/>
       </w:pPr>
-      <w:rPr>
-        <w:rFonts w:ascii="Wingdings" w:hAnsi="Wingdings" w:hint="default"/>
-        <w:sz w:val="20"/>
-      </w:rPr>
-    </w:lvl>
-  </w:abstractNum>
-  <w:abstractNum w:abstractNumId="20" w15:restartNumberingAfterBreak="0">
-    <w:nsid w:val="6FAE32C3"/>
-    <w:multiLevelType w:val="multilevel"/>
-    <w:tmpl w:val="F07C8ECC"/>
-    <w:lvl w:ilvl="0">
-      <w:start w:val="1"/>
-      <w:numFmt w:val="bullet"/>
-      <w:lvlText w:val=""/>
-      <w:lvlJc w:val="left"/>
-      <w:pPr>
-        <w:tabs>
-          <w:tab w:val="num" w:pos="720"/>
-        </w:tabs>
-        <w:ind w:left="720" w:hanging="360"/>
-      </w:pPr>
-      <w:rPr>
-        <w:rFonts w:ascii="Symbol" w:hAnsi="Symbol" w:hint="default"/>
-        <w:sz w:val="20"/>
-      </w:rPr>
-    </w:lvl>
-    <w:lvl w:ilvl="1" w:tentative="1">
-      <w:start w:val="1"/>
-      <w:numFmt w:val="bullet"/>
-      <w:lvlText w:val="o"/>
-      <w:lvlJc w:val="left"/>
-      <w:pPr>
-        <w:tabs>
-          <w:tab w:val="num" w:pos="1440"/>
-        </w:tabs>
-        <w:ind w:left="1440" w:hanging="360"/>
-      </w:pPr>
-      <w:rPr>
-        <w:rFonts w:ascii="Courier New" w:hAnsi="Courier New" w:hint="default"/>
-        <w:sz w:val="20"/>
-      </w:rPr>
-    </w:lvl>
-    <w:lvl w:ilvl="2" w:tentative="1">
-      <w:start w:val="1"/>
-      <w:numFmt w:val="bullet"/>
-      <w:lvlText w:val=""/>
-      <w:lvlJc w:val="left"/>
-      <w:pPr>
-        <w:tabs>
-          <w:tab w:val="num" w:pos="2160"/>
-        </w:tabs>
-        <w:ind w:left="2160" w:hanging="360"/>
-      </w:pPr>
-      <w:rPr>
-        <w:rFonts w:ascii="Wingdings" w:hAnsi="Wingdings" w:hint="default"/>
-        <w:sz w:val="20"/>
-      </w:rPr>
-    </w:lvl>
-    <w:lvl w:ilvl="3" w:tentative="1">
-      <w:start w:val="1"/>
-      <w:numFmt w:val="bullet"/>
-      <w:lvlText w:val=""/>
-      <w:lvlJc w:val="left"/>
-      <w:pPr>
-        <w:tabs>
-          <w:tab w:val="num" w:pos="2880"/>
-        </w:tabs>
-        <w:ind w:left="2880" w:hanging="360"/>
-      </w:pPr>
-      <w:rPr>
-        <w:rFonts w:ascii="Wingdings" w:hAnsi="Wingdings" w:hint="default"/>
-        <w:sz w:val="20"/>
-      </w:rPr>
-    </w:lvl>
-    <w:lvl w:ilvl="4" w:tentative="1">
-      <w:start w:val="1"/>
-      <w:numFmt w:val="bullet"/>
-      <w:lvlText w:val=""/>
-      <w:lvlJc w:val="left"/>
-      <w:pPr>
-        <w:tabs>
-          <w:tab w:val="num" w:pos="3600"/>
-        </w:tabs>
-        <w:ind w:left="3600" w:hanging="360"/>
-      </w:pPr>
-      <w:rPr>
-        <w:rFonts w:ascii="Wingdings" w:hAnsi="Wingdings" w:hint="default"/>
-        <w:sz w:val="20"/>
-      </w:rPr>
-    </w:lvl>
-    <w:lvl w:ilvl="5" w:tentative="1">
-      <w:start w:val="1"/>
-      <w:numFmt w:val="bullet"/>
-      <w:lvlText w:val=""/>
-      <w:lvlJc w:val="left"/>
-      <w:pPr>
-        <w:tabs>
-          <w:tab w:val="num" w:pos="4320"/>
-        </w:tabs>
-        <w:ind w:left="4320" w:hanging="360"/>
-      </w:pPr>
-      <w:rPr>
-        <w:rFonts w:ascii="Wingdings" w:hAnsi="Wingdings" w:hint="default"/>
-        <w:sz w:val="20"/>
-      </w:rPr>
-    </w:lvl>
-    <w:lvl w:ilvl="6" w:tentative="1">
-      <w:start w:val="1"/>
-      <w:numFmt w:val="bullet"/>
-      <w:lvlText w:val=""/>
-      <w:lvlJc w:val="left"/>
-      <w:pPr>
-        <w:tabs>
-          <w:tab w:val="num" w:pos="5040"/>
-        </w:tabs>
-        <w:ind w:left="5040" w:hanging="360"/>
-      </w:pPr>
-      <w:rPr>
-        <w:rFonts w:ascii="Wingdings" w:hAnsi="Wingdings" w:hint="default"/>
-        <w:sz w:val="20"/>
-      </w:rPr>
-    </w:lvl>
-    <w:lvl w:ilvl="7" w:tentative="1">
-      <w:start w:val="1"/>
-      <w:numFmt w:val="bullet"/>
-      <w:lvlText w:val=""/>
-      <w:lvlJc w:val="left"/>
-      <w:pPr>
-        <w:tabs>
-          <w:tab w:val="num" w:pos="5760"/>
-        </w:tabs>
-        <w:ind w:left="5760" w:hanging="360"/>
-      </w:pPr>
-      <w:rPr>
-        <w:rFonts w:ascii="Wingdings" w:hAnsi="Wingdings" w:hint="default"/>
-        <w:sz w:val="20"/>
-      </w:rPr>
-    </w:lvl>
-    <w:lvl w:ilvl="8" w:tentative="1">
-      <w:start w:val="1"/>
-      <w:numFmt w:val="bullet"/>
-      <w:lvlText w:val=""/>
-      <w:lvlJc w:val="left"/>
-      <w:pPr>
-        <w:tabs>
-          <w:tab w:val="num" w:pos="6480"/>
-        </w:tabs>
-        <w:ind w:left="6480" w:hanging="360"/>
-      </w:pPr>
-      <w:rPr>
-        <w:rFonts w:ascii="Wingdings" w:hAnsi="Wingdings" w:hint="default"/>
-        <w:sz w:val="20"/>
-      </w:rPr>
-    </w:lvl>
-  </w:abstractNum>
-  <w:abstractNum w:abstractNumId="21" w15:restartNumberingAfterBreak="0">
-    <w:nsid w:val="703B56DC"/>
-    <w:multiLevelType w:val="multilevel"/>
-    <w:tmpl w:val="02F0106A"/>
-    <w:lvl w:ilvl="0">
-      <w:start w:val="1"/>
-      <w:numFmt w:val="bullet"/>
-      <w:lvlText w:val=""/>
-      <w:lvlJc w:val="left"/>
-      <w:pPr>
-        <w:tabs>
-          <w:tab w:val="num" w:pos="720"/>
-        </w:tabs>
-        <w:ind w:left="720" w:hanging="360"/>
-      </w:pPr>
-      <w:rPr>
-        <w:rFonts w:ascii="Symbol" w:hAnsi="Symbol" w:hint="default"/>
-        <w:sz w:val="20"/>
-      </w:rPr>
-    </w:lvl>
-    <w:lvl w:ilvl="1" w:tentative="1">
-      <w:start w:val="1"/>
-      <w:numFmt w:val="bullet"/>
-      <w:lvlText w:val="o"/>
-      <w:lvlJc w:val="left"/>
-      <w:pPr>
-        <w:tabs>
-          <w:tab w:val="num" w:pos="1440"/>
-        </w:tabs>
-        <w:ind w:left="1440" w:hanging="360"/>
-      </w:pPr>
-      <w:rPr>
-        <w:rFonts w:ascii="Courier New" w:hAnsi="Courier New" w:hint="default"/>
-        <w:sz w:val="20"/>
-      </w:rPr>
-    </w:lvl>
-    <w:lvl w:ilvl="2" w:tentative="1">
-      <w:start w:val="1"/>
-      <w:numFmt w:val="bullet"/>
-      <w:lvlText w:val=""/>
-      <w:lvlJc w:val="left"/>
-      <w:pPr>
-        <w:tabs>
-          <w:tab w:val="num" w:pos="2160"/>
-        </w:tabs>
-        <w:ind w:left="2160" w:hanging="360"/>
-      </w:pPr>
-      <w:rPr>
-        <w:rFonts w:ascii="Wingdings" w:hAnsi="Wingdings" w:hint="default"/>
-        <w:sz w:val="20"/>
-      </w:rPr>
-    </w:lvl>
-    <w:lvl w:ilvl="3" w:tentative="1">
-      <w:start w:val="1"/>
-      <w:numFmt w:val="bullet"/>
-      <w:lvlText w:val=""/>
-      <w:lvlJc w:val="left"/>
-      <w:pPr>
-        <w:tabs>
-          <w:tab w:val="num" w:pos="2880"/>
-        </w:tabs>
-        <w:ind w:left="2880" w:hanging="360"/>
-      </w:pPr>
-      <w:rPr>
-        <w:rFonts w:ascii="Wingdings" w:hAnsi="Wingdings" w:hint="default"/>
-        <w:sz w:val="20"/>
-      </w:rPr>
-    </w:lvl>
-    <w:lvl w:ilvl="4" w:tentative="1">
-      <w:start w:val="1"/>
-      <w:numFmt w:val="bullet"/>
-      <w:lvlText w:val=""/>
-      <w:lvlJc w:val="left"/>
-      <w:pPr>
-        <w:tabs>
-          <w:tab w:val="num" w:pos="3600"/>
-        </w:tabs>
-        <w:ind w:left="3600" w:hanging="360"/>
-      </w:pPr>
-      <w:rPr>
-        <w:rFonts w:ascii="Wingdings" w:hAnsi="Wingdings" w:hint="default"/>
-        <w:sz w:val="20"/>
-      </w:rPr>
-    </w:lvl>
-    <w:lvl w:ilvl="5" w:tentative="1">
-      <w:start w:val="1"/>
-      <w:numFmt w:val="bullet"/>
-      <w:lvlText w:val=""/>
-      <w:lvlJc w:val="left"/>
-      <w:pPr>
-        <w:tabs>
-          <w:tab w:val="num" w:pos="4320"/>
-        </w:tabs>
-        <w:ind w:left="4320" w:hanging="360"/>
-      </w:pPr>
-      <w:rPr>
-        <w:rFonts w:ascii="Wingdings" w:hAnsi="Wingdings" w:hint="default"/>
-        <w:sz w:val="20"/>
-      </w:rPr>
-    </w:lvl>
-    <w:lvl w:ilvl="6" w:tentative="1">
-      <w:start w:val="1"/>
-      <w:numFmt w:val="bullet"/>
-      <w:lvlText w:val=""/>
-      <w:lvlJc w:val="left"/>
-      <w:pPr>
-        <w:tabs>
-          <w:tab w:val="num" w:pos="5040"/>
-        </w:tabs>
-        <w:ind w:left="5040" w:hanging="360"/>
-      </w:pPr>
-      <w:rPr>
-        <w:rFonts w:ascii="Wingdings" w:hAnsi="Wingdings" w:hint="default"/>
-        <w:sz w:val="20"/>
-      </w:rPr>
-    </w:lvl>
-    <w:lvl w:ilvl="7" w:tentative="1">
-      <w:start w:val="1"/>
-      <w:numFmt w:val="bullet"/>
-      <w:lvlText w:val=""/>
-      <w:lvlJc w:val="left"/>
-      <w:pPr>
-        <w:tabs>
-          <w:tab w:val="num" w:pos="5760"/>
-        </w:tabs>
-        <w:ind w:left="5760" w:hanging="360"/>
-      </w:pPr>
-      <w:rPr>
-        <w:rFonts w:ascii="Wingdings" w:hAnsi="Wingdings" w:hint="default"/>
-        <w:sz w:val="20"/>
-      </w:rPr>
-    </w:lvl>
-    <w:lvl w:ilvl="8" w:tentative="1">
-      <w:start w:val="1"/>
-      <w:numFmt w:val="bullet"/>
-      <w:lvlText w:val=""/>
-      <w:lvlJc w:val="left"/>
-      <w:pPr>
-        <w:tabs>
-          <w:tab w:val="num" w:pos="6480"/>
-        </w:tabs>
-        <w:ind w:left="6480" w:hanging="360"/>
-      </w:pPr>
-      <w:rPr>
-        <w:rFonts w:ascii="Wingdings" w:hAnsi="Wingdings" w:hint="default"/>
-        <w:sz w:val="20"/>
-      </w:rPr>
-    </w:lvl>
-  </w:abstractNum>
-  <w:abstractNum w:abstractNumId="22" w15:restartNumberingAfterBreak="0">
-    <w:nsid w:val="75B319F1"/>
-    <w:multiLevelType w:val="multilevel"/>
-    <w:tmpl w:val="B2B65ECE"/>
-    <w:lvl w:ilvl="0">
-      <w:start w:val="1"/>
-      <w:numFmt w:val="bullet"/>
-      <w:lvlText w:val=""/>
-      <w:lvlJc w:val="left"/>
-      <w:pPr>
-        <w:tabs>
-          <w:tab w:val="num" w:pos="720"/>
-        </w:tabs>
-        <w:ind w:left="720" w:hanging="360"/>
-      </w:pPr>
-      <w:rPr>
-        <w:rFonts w:ascii="Symbol" w:hAnsi="Symbol" w:hint="default"/>
-        <w:sz w:val="20"/>
-      </w:rPr>
-    </w:lvl>
-    <w:lvl w:ilvl="1" w:tentative="1">
-      <w:start w:val="1"/>
-      <w:numFmt w:val="bullet"/>
-      <w:lvlText w:val="o"/>
-      <w:lvlJc w:val="left"/>
-      <w:pPr>
-        <w:tabs>
-          <w:tab w:val="num" w:pos="1440"/>
-        </w:tabs>
-        <w:ind w:left="1440" w:hanging="360"/>
-      </w:pPr>
-      <w:rPr>
-        <w:rFonts w:ascii="Courier New" w:hAnsi="Courier New" w:hint="default"/>
-        <w:sz w:val="20"/>
-      </w:rPr>
-    </w:lvl>
-    <w:lvl w:ilvl="2" w:tentative="1">
-      <w:start w:val="1"/>
-      <w:numFmt w:val="bullet"/>
-      <w:lvlText w:val=""/>
-      <w:lvlJc w:val="left"/>
-      <w:pPr>
-        <w:tabs>
-          <w:tab w:val="num" w:pos="2160"/>
-        </w:tabs>
-        <w:ind w:left="2160" w:hanging="360"/>
-      </w:pPr>
-      <w:rPr>
-        <w:rFonts w:ascii="Wingdings" w:hAnsi="Wingdings" w:hint="default"/>
-        <w:sz w:val="20"/>
-      </w:rPr>
-    </w:lvl>
-    <w:lvl w:ilvl="3" w:tentative="1">
-      <w:start w:val="1"/>
-      <w:numFmt w:val="bullet"/>
-      <w:lvlText w:val=""/>
-      <w:lvlJc w:val="left"/>
-      <w:pPr>
-        <w:tabs>
-          <w:tab w:val="num" w:pos="2880"/>
-        </w:tabs>
-        <w:ind w:left="2880" w:hanging="360"/>
-      </w:pPr>
-      <w:rPr>
-        <w:rFonts w:ascii="Wingdings" w:hAnsi="Wingdings" w:hint="default"/>
-        <w:sz w:val="20"/>
-      </w:rPr>
-    </w:lvl>
-    <w:lvl w:ilvl="4" w:tentative="1">
-      <w:start w:val="1"/>
-      <w:numFmt w:val="bullet"/>
-      <w:lvlText w:val=""/>
-      <w:lvlJc w:val="left"/>
-      <w:pPr>
-        <w:tabs>
-          <w:tab w:val="num" w:pos="3600"/>
-        </w:tabs>
-        <w:ind w:left="3600" w:hanging="360"/>
-      </w:pPr>
-      <w:rPr>
-        <w:rFonts w:ascii="Wingdings" w:hAnsi="Wingdings" w:hint="default"/>
-        <w:sz w:val="20"/>
-      </w:rPr>
-    </w:lvl>
-    <w:lvl w:ilvl="5" w:tentative="1">
-      <w:start w:val="1"/>
-      <w:numFmt w:val="bullet"/>
-      <w:lvlText w:val=""/>
-      <w:lvlJc w:val="left"/>
-      <w:pPr>
-        <w:tabs>
-          <w:tab w:val="num" w:pos="4320"/>
-        </w:tabs>
-        <w:ind w:left="4320" w:hanging="360"/>
-      </w:pPr>
-      <w:rPr>
-        <w:rFonts w:ascii="Wingdings" w:hAnsi="Wingdings" w:hint="default"/>
-        <w:sz w:val="20"/>
-      </w:rPr>
-    </w:lvl>
-    <w:lvl w:ilvl="6" w:tentative="1">
-      <w:start w:val="1"/>
-      <w:numFmt w:val="bullet"/>
-      <w:lvlText w:val=""/>
-      <w:lvlJc w:val="left"/>
-      <w:pPr>
-        <w:tabs>
-          <w:tab w:val="num" w:pos="5040"/>
-        </w:tabs>
-        <w:ind w:left="5040" w:hanging="360"/>
-      </w:pPr>
-      <w:rPr>
-        <w:rFonts w:ascii="Wingdings" w:hAnsi="Wingdings" w:hint="default"/>
-        <w:sz w:val="20"/>
-      </w:rPr>
-    </w:lvl>
-    <w:lvl w:ilvl="7" w:tentative="1">
-      <w:start w:val="1"/>
-      <w:numFmt w:val="bullet"/>
-      <w:lvlText w:val=""/>
-      <w:lvlJc w:val="left"/>
-      <w:pPr>
-        <w:tabs>
-          <w:tab w:val="num" w:pos="5760"/>
-        </w:tabs>
-        <w:ind w:left="5760" w:hanging="360"/>
-      </w:pPr>
-      <w:rPr>
-        <w:rFonts w:ascii="Wingdings" w:hAnsi="Wingdings" w:hint="default"/>
-        <w:sz w:val="20"/>
-      </w:rPr>
-    </w:lvl>
-    <w:lvl w:ilvl="8" w:tentative="1">
-      <w:start w:val="1"/>
-      <w:numFmt w:val="bullet"/>
-      <w:lvlText w:val=""/>
-      <w:lvlJc w:val="left"/>
-      <w:pPr>
-        <w:tabs>
-          <w:tab w:val="num" w:pos="6480"/>
-        </w:tabs>
-        <w:ind w:left="6480" w:hanging="360"/>
-      </w:pPr>
-      <w:rPr>
-        <w:rFonts w:ascii="Wingdings" w:hAnsi="Wingdings" w:hint="default"/>
-        <w:sz w:val="20"/>
-      </w:rPr>
     </w:lvl>
   </w:abstractNum>
   <w:abstractNum w:abstractNumId="23" w15:restartNumberingAfterBreak="0">
-    <w:nsid w:val="7D6571B5"/>
+    <w:nsid w:val="78791A7F"/>
     <w:multiLevelType w:val="multilevel"/>
-    <w:tmpl w:val="D51C4D7E"/>
+    <w:tmpl w:val="5754B40E"/>
     <w:lvl w:ilvl="0">
       <w:start w:val="1"/>
-      <w:numFmt w:val="decimal"/>
-      <w:lvlText w:val="%1."/>
+      <w:numFmt w:val="bullet"/>
+      <w:lvlText w:val=""/>
       <w:lvlJc w:val="left"/>
       <w:pPr>
         <w:tabs>
@@ -9751,8 +9719,12 @@
         </w:tabs>
         <w:ind w:left="720" w:hanging="360"/>
       </w:pPr>
-    </w:lvl>
-    <w:lvl w:ilvl="1">
+      <w:rPr>
+        <w:rFonts w:ascii="Symbol" w:hAnsi="Symbol" w:hint="default"/>
+        <w:sz w:val="20"/>
+      </w:rPr>
+    </w:lvl>
+    <w:lvl w:ilvl="1" w:tentative="1">
       <w:start w:val="1"/>
       <w:numFmt w:val="bullet"/>
       <w:lvlText w:val="o"/>
@@ -9770,8 +9742,8 @@
     </w:lvl>
     <w:lvl w:ilvl="2" w:tentative="1">
       <w:start w:val="1"/>
-      <w:numFmt w:val="decimal"/>
-      <w:lvlText w:val="%3."/>
+      <w:numFmt w:val="bullet"/>
+      <w:lvlText w:val=""/>
       <w:lvlJc w:val="left"/>
       <w:pPr>
         <w:tabs>
@@ -9779,11 +9751,15 @@
         </w:tabs>
         <w:ind w:left="2160" w:hanging="360"/>
       </w:pPr>
+      <w:rPr>
+        <w:rFonts w:ascii="Wingdings" w:hAnsi="Wingdings" w:hint="default"/>
+        <w:sz w:val="20"/>
+      </w:rPr>
     </w:lvl>
     <w:lvl w:ilvl="3" w:tentative="1">
       <w:start w:val="1"/>
-      <w:numFmt w:val="decimal"/>
-      <w:lvlText w:val="%4."/>
+      <w:numFmt w:val="bullet"/>
+      <w:lvlText w:val=""/>
       <w:lvlJc w:val="left"/>
       <w:pPr>
         <w:tabs>
@@ -9791,11 +9767,15 @@
         </w:tabs>
         <w:ind w:left="2880" w:hanging="360"/>
       </w:pPr>
+      <w:rPr>
+        <w:rFonts w:ascii="Wingdings" w:hAnsi="Wingdings" w:hint="default"/>
+        <w:sz w:val="20"/>
+      </w:rPr>
     </w:lvl>
     <w:lvl w:ilvl="4" w:tentative="1">
       <w:start w:val="1"/>
-      <w:numFmt w:val="decimal"/>
-      <w:lvlText w:val="%5."/>
+      <w:numFmt w:val="bullet"/>
+      <w:lvlText w:val=""/>
       <w:lvlJc w:val="left"/>
       <w:pPr>
         <w:tabs>
@@ -9803,11 +9783,15 @@
         </w:tabs>
         <w:ind w:left="3600" w:hanging="360"/>
       </w:pPr>
+      <w:rPr>
+        <w:rFonts w:ascii="Wingdings" w:hAnsi="Wingdings" w:hint="default"/>
+        <w:sz w:val="20"/>
+      </w:rPr>
     </w:lvl>
     <w:lvl w:ilvl="5" w:tentative="1">
       <w:start w:val="1"/>
-      <w:numFmt w:val="decimal"/>
-      <w:lvlText w:val="%6."/>
+      <w:numFmt w:val="bullet"/>
+      <w:lvlText w:val=""/>
       <w:lvlJc w:val="left"/>
       <w:pPr>
         <w:tabs>
@@ -9815,11 +9799,15 @@
         </w:tabs>
         <w:ind w:left="4320" w:hanging="360"/>
       </w:pPr>
+      <w:rPr>
+        <w:rFonts w:ascii="Wingdings" w:hAnsi="Wingdings" w:hint="default"/>
+        <w:sz w:val="20"/>
+      </w:rPr>
     </w:lvl>
     <w:lvl w:ilvl="6" w:tentative="1">
       <w:start w:val="1"/>
-      <w:numFmt w:val="decimal"/>
-      <w:lvlText w:val="%7."/>
+      <w:numFmt w:val="bullet"/>
+      <w:lvlText w:val=""/>
       <w:lvlJc w:val="left"/>
       <w:pPr>
         <w:tabs>
@@ -9827,11 +9815,15 @@
         </w:tabs>
         <w:ind w:left="5040" w:hanging="360"/>
       </w:pPr>
+      <w:rPr>
+        <w:rFonts w:ascii="Wingdings" w:hAnsi="Wingdings" w:hint="default"/>
+        <w:sz w:val="20"/>
+      </w:rPr>
     </w:lvl>
     <w:lvl w:ilvl="7" w:tentative="1">
       <w:start w:val="1"/>
-      <w:numFmt w:val="decimal"/>
-      <w:lvlText w:val="%8."/>
+      <w:numFmt w:val="bullet"/>
+      <w:lvlText w:val=""/>
       <w:lvlJc w:val="left"/>
       <w:pPr>
         <w:tabs>
@@ -9839,11 +9831,15 @@
         </w:tabs>
         <w:ind w:left="5760" w:hanging="360"/>
       </w:pPr>
+      <w:rPr>
+        <w:rFonts w:ascii="Wingdings" w:hAnsi="Wingdings" w:hint="default"/>
+        <w:sz w:val="20"/>
+      </w:rPr>
     </w:lvl>
     <w:lvl w:ilvl="8" w:tentative="1">
       <w:start w:val="1"/>
-      <w:numFmt w:val="decimal"/>
-      <w:lvlText w:val="%9."/>
+      <w:numFmt w:val="bullet"/>
+      <w:lvlText w:val=""/>
       <w:lvlJc w:val="left"/>
       <w:pPr>
         <w:tabs>
@@ -9851,79 +9847,83 @@
         </w:tabs>
         <w:ind w:left="6480" w:hanging="360"/>
       </w:pPr>
+      <w:rPr>
+        <w:rFonts w:ascii="Wingdings" w:hAnsi="Wingdings" w:hint="default"/>
+        <w:sz w:val="20"/>
+      </w:rPr>
     </w:lvl>
   </w:abstractNum>
-  <w:num w:numId="1" w16cid:durableId="1785928519">
+  <w:num w:numId="1" w16cid:durableId="1901285681">
     <w:abstractNumId w:val="20"/>
   </w:num>
-  <w:num w:numId="2" w16cid:durableId="1433091898">
+  <w:num w:numId="2" w16cid:durableId="192160931">
+    <w:abstractNumId w:val="5"/>
+  </w:num>
+  <w:num w:numId="3" w16cid:durableId="1379935737">
+    <w:abstractNumId w:val="10"/>
+  </w:num>
+  <w:num w:numId="4" w16cid:durableId="331415729">
+    <w:abstractNumId w:val="23"/>
+  </w:num>
+  <w:num w:numId="5" w16cid:durableId="976568499">
+    <w:abstractNumId w:val="6"/>
+  </w:num>
+  <w:num w:numId="6" w16cid:durableId="1493332876">
     <w:abstractNumId w:val="11"/>
   </w:num>
-  <w:num w:numId="3" w16cid:durableId="1959332771">
-    <w:abstractNumId w:val="18"/>
+  <w:num w:numId="7" w16cid:durableId="536696491">
+    <w:abstractNumId w:val="0"/>
   </w:num>
-  <w:num w:numId="4" w16cid:durableId="757217153">
-    <w:abstractNumId w:val="10"/>
+  <w:num w:numId="8" w16cid:durableId="943539371">
+    <w:abstractNumId w:val="4"/>
   </w:num>
-  <w:num w:numId="5" w16cid:durableId="709643889">
-    <w:abstractNumId w:val="5"/>
+  <w:num w:numId="9" w16cid:durableId="454755953">
+    <w:abstractNumId w:val="1"/>
   </w:num>
-  <w:num w:numId="6" w16cid:durableId="2131390395">
+  <w:num w:numId="10" w16cid:durableId="933980619">
+    <w:abstractNumId w:val="12"/>
+  </w:num>
+  <w:num w:numId="11" w16cid:durableId="654991138">
+    <w:abstractNumId w:val="16"/>
+  </w:num>
+  <w:num w:numId="12" w16cid:durableId="2120761356">
+    <w:abstractNumId w:val="19"/>
+  </w:num>
+  <w:num w:numId="13" w16cid:durableId="1126700228">
+    <w:abstractNumId w:val="15"/>
+  </w:num>
+  <w:num w:numId="14" w16cid:durableId="74981539">
+    <w:abstractNumId w:val="17"/>
+  </w:num>
+  <w:num w:numId="15" w16cid:durableId="622617137">
+    <w:abstractNumId w:val="7"/>
+  </w:num>
+  <w:num w:numId="16" w16cid:durableId="109865694">
+    <w:abstractNumId w:val="8"/>
+  </w:num>
+  <w:num w:numId="17" w16cid:durableId="1517966273">
+    <w:abstractNumId w:val="3"/>
+  </w:num>
+  <w:num w:numId="18" w16cid:durableId="1530145350">
+    <w:abstractNumId w:val="13"/>
+  </w:num>
+  <w:num w:numId="19" w16cid:durableId="1821772248">
+    <w:abstractNumId w:val="21"/>
+  </w:num>
+  <w:num w:numId="20" w16cid:durableId="16663946">
+    <w:abstractNumId w:val="9"/>
+  </w:num>
+  <w:num w:numId="21" w16cid:durableId="56982076">
+    <w:abstractNumId w:val="22"/>
+  </w:num>
+  <w:num w:numId="22" w16cid:durableId="1515455496">
     <w:abstractNumId w:val="2"/>
   </w:num>
-  <w:num w:numId="7" w16cid:durableId="1438603822">
-    <w:abstractNumId w:val="13"/>
-  </w:num>
-  <w:num w:numId="8" w16cid:durableId="2083746221">
-    <w:abstractNumId w:val="21"/>
-  </w:num>
-  <w:num w:numId="9" w16cid:durableId="1076592137">
-    <w:abstractNumId w:val="16"/>
-  </w:num>
-  <w:num w:numId="10" w16cid:durableId="44526923">
-    <w:abstractNumId w:val="1"/>
-  </w:num>
-  <w:num w:numId="11" w16cid:durableId="447510136">
-    <w:abstractNumId w:val="12"/>
-  </w:num>
-  <w:num w:numId="12" w16cid:durableId="1427074482">
-    <w:abstractNumId w:val="6"/>
-  </w:num>
-  <w:num w:numId="13" w16cid:durableId="79107718">
-    <w:abstractNumId w:val="8"/>
-  </w:num>
-  <w:num w:numId="14" w16cid:durableId="542139360">
+  <w:num w:numId="23" w16cid:durableId="1734347685">
     <w:abstractNumId w:val="14"/>
   </w:num>
-  <w:num w:numId="15" w16cid:durableId="130707303">
-    <w:abstractNumId w:val="19"/>
-  </w:num>
-  <w:num w:numId="16" w16cid:durableId="2046713255">
-    <w:abstractNumId w:val="7"/>
-  </w:num>
-  <w:num w:numId="17" w16cid:durableId="634530354">
-    <w:abstractNumId w:val="3"/>
-  </w:num>
-  <w:num w:numId="18" w16cid:durableId="742945943">
-    <w:abstractNumId w:val="23"/>
-  </w:num>
-  <w:num w:numId="19" w16cid:durableId="610821640">
-    <w:abstractNumId w:val="9"/>
-  </w:num>
-  <w:num w:numId="20" w16cid:durableId="326792665">
-    <w:abstractNumId w:val="4"/>
-  </w:num>
-  <w:num w:numId="21" w16cid:durableId="826363627">
-    <w:abstractNumId w:val="17"/>
-  </w:num>
-  <w:num w:numId="22" w16cid:durableId="1624118118">
-    <w:abstractNumId w:val="15"/>
-  </w:num>
-  <w:num w:numId="23" w16cid:durableId="1343820647">
-    <w:abstractNumId w:val="22"/>
-  </w:num>
-  <w:num w:numId="24" w16cid:durableId="2058122310">
-    <w:abstractNumId w:val="0"/>
+  <w:num w:numId="24" w16cid:durableId="2026011847">
+    <w:abstractNumId w:val="18"/>
   </w:num>
 </w:numbering>
 </file>

</xml_diff>

<commit_message>
audit fixes: image import script published for New-VmImageCli, Day-2 state links, policy initiative path, neutral contract wording, Trailwright project path in the follow-along (PDF, DOCX, site), automation README notes on wrapper-deployed solutions and tuning inputs, AVD schema key
Co-Authored-By: Claude Sonnet 5.5 <noreply@anthropic.com>
</commit_message>
<xml_diff>
--- a/follow-along/Azure_Local_Follow_Along_Guide.docx
+++ b/follow-along/Azure_Local_Follow_Along_Guide.docx
@@ -1926,7 +1926,7 @@
           <w:color w:val="1B2430"/>
           <w:lang w:val="en"/>
         </w:rPr>
-        <w:t>src/design/trailwright-iic-example.trailwright.json</w:t>
+        <w:t>src/design/trailwright-iic.example.trailwright.json</w:t>
       </w:r>
       <w:r>
         <w:rPr>
@@ -6566,9 +6566,307 @@
 <file path=word/numbering.xml><?xml version="1.0" encoding="utf-8"?>
 <w:numbering xmlns:wpc="http://schemas.microsoft.com/office/word/2010/wordprocessingCanvas" xmlns:cx="http://schemas.microsoft.com/office/drawing/2014/chartex" xmlns:cx1="http://schemas.microsoft.com/office/drawing/2015/9/8/chartex" xmlns:cx2="http://schemas.microsoft.com/office/drawing/2015/10/21/chartex" xmlns:cx3="http://schemas.microsoft.com/office/drawing/2016/5/9/chartex" xmlns:cx4="http://schemas.microsoft.com/office/drawing/2016/5/10/chartex" xmlns:cx5="http://schemas.microsoft.com/office/drawing/2016/5/11/chartex" xmlns:cx6="http://schemas.microsoft.com/office/drawing/2016/5/12/chartex" xmlns:cx7="http://schemas.microsoft.com/office/drawing/2016/5/13/chartex" xmlns:cx8="http://schemas.microsoft.com/office/drawing/2016/5/14/chartex" xmlns:mc="http://schemas.openxmlformats.org/markup-compatibility/2006" xmlns:aink="http://schemas.microsoft.com/office/drawing/2016/ink" xmlns:am3d="http://schemas.microsoft.com/office/drawing/2017/model3d" xmlns:o="urn:schemas-microsoft-com:office:office" xmlns:oel="http://schemas.microsoft.com/office/2019/extlst" xmlns:r="http://schemas.openxmlformats.org/officeDocument/2006/relationships" xmlns:m="http://schemas.openxmlformats.org/officeDocument/2006/math" xmlns:v="urn:schemas-microsoft-com:vml" xmlns:wp14="http://schemas.microsoft.com/office/word/2010/wordprocessingDrawing" xmlns:wp="http://schemas.openxmlformats.org/drawingml/2006/wordprocessingDrawing" xmlns:w10="urn:schemas-microsoft-com:office:word" xmlns:w="http://schemas.openxmlformats.org/wordprocessingml/2006/main" xmlns:w14="http://schemas.microsoft.com/office/word/2010/wordml" xmlns:w15="http://schemas.microsoft.com/office/word/2012/wordml" xmlns:w16cex="http://schemas.microsoft.com/office/word/2018/wordml/cex" xmlns:w16cid="http://schemas.microsoft.com/office/word/2016/wordml/cid" xmlns:w16="http://schemas.microsoft.com/office/word/2018/wordml" xmlns:w16du="http://schemas.microsoft.com/office/word/2023/wordml/word16du" xmlns:w16sdtdh="http://schemas.microsoft.com/office/word/2020/wordml/sdtdatahash" xmlns:w16sdtfl="http://schemas.microsoft.com/office/word/2024/wordml/sdtformatlock" xmlns:w16se="http://schemas.microsoft.com/office/word/2015/wordml/symex" xmlns:wpg="http://schemas.microsoft.com/office/word/2010/wordprocessingGroup" xmlns:wpi="http://schemas.microsoft.com/office/word/2010/wordprocessingInk" xmlns:wne="http://schemas.microsoft.com/office/word/2006/wordml" xmlns:wps="http://schemas.microsoft.com/office/word/2010/wordprocessingShape" mc:Ignorable="w14 w15 w16se w16cid w16 w16cex w16sdtdh w16sdtfl w16du wp14">
   <w:abstractNum w:abstractNumId="0" w15:restartNumberingAfterBreak="0">
-    <w:nsid w:val="07BC7421"/>
+    <w:nsid w:val="02CE5402"/>
     <w:multiLevelType w:val="multilevel"/>
-    <w:tmpl w:val="D5A6F290"/>
+    <w:tmpl w:val="53881216"/>
+    <w:lvl w:ilvl="0">
+      <w:start w:val="1"/>
+      <w:numFmt w:val="bullet"/>
+      <w:lvlText w:val=""/>
+      <w:lvlJc w:val="left"/>
+      <w:pPr>
+        <w:tabs>
+          <w:tab w:val="num" w:pos="720"/>
+        </w:tabs>
+        <w:ind w:left="720" w:hanging="360"/>
+      </w:pPr>
+      <w:rPr>
+        <w:rFonts w:ascii="Symbol" w:hAnsi="Symbol" w:hint="default"/>
+        <w:sz w:val="20"/>
+      </w:rPr>
+    </w:lvl>
+    <w:lvl w:ilvl="1" w:tentative="1">
+      <w:start w:val="1"/>
+      <w:numFmt w:val="bullet"/>
+      <w:lvlText w:val="o"/>
+      <w:lvlJc w:val="left"/>
+      <w:pPr>
+        <w:tabs>
+          <w:tab w:val="num" w:pos="1440"/>
+        </w:tabs>
+        <w:ind w:left="1440" w:hanging="360"/>
+      </w:pPr>
+      <w:rPr>
+        <w:rFonts w:ascii="Courier New" w:hAnsi="Courier New" w:hint="default"/>
+        <w:sz w:val="20"/>
+      </w:rPr>
+    </w:lvl>
+    <w:lvl w:ilvl="2" w:tentative="1">
+      <w:start w:val="1"/>
+      <w:numFmt w:val="bullet"/>
+      <w:lvlText w:val=""/>
+      <w:lvlJc w:val="left"/>
+      <w:pPr>
+        <w:tabs>
+          <w:tab w:val="num" w:pos="2160"/>
+        </w:tabs>
+        <w:ind w:left="2160" w:hanging="360"/>
+      </w:pPr>
+      <w:rPr>
+        <w:rFonts w:ascii="Wingdings" w:hAnsi="Wingdings" w:hint="default"/>
+        <w:sz w:val="20"/>
+      </w:rPr>
+    </w:lvl>
+    <w:lvl w:ilvl="3" w:tentative="1">
+      <w:start w:val="1"/>
+      <w:numFmt w:val="bullet"/>
+      <w:lvlText w:val=""/>
+      <w:lvlJc w:val="left"/>
+      <w:pPr>
+        <w:tabs>
+          <w:tab w:val="num" w:pos="2880"/>
+        </w:tabs>
+        <w:ind w:left="2880" w:hanging="360"/>
+      </w:pPr>
+      <w:rPr>
+        <w:rFonts w:ascii="Wingdings" w:hAnsi="Wingdings" w:hint="default"/>
+        <w:sz w:val="20"/>
+      </w:rPr>
+    </w:lvl>
+    <w:lvl w:ilvl="4" w:tentative="1">
+      <w:start w:val="1"/>
+      <w:numFmt w:val="bullet"/>
+      <w:lvlText w:val=""/>
+      <w:lvlJc w:val="left"/>
+      <w:pPr>
+        <w:tabs>
+          <w:tab w:val="num" w:pos="3600"/>
+        </w:tabs>
+        <w:ind w:left="3600" w:hanging="360"/>
+      </w:pPr>
+      <w:rPr>
+        <w:rFonts w:ascii="Wingdings" w:hAnsi="Wingdings" w:hint="default"/>
+        <w:sz w:val="20"/>
+      </w:rPr>
+    </w:lvl>
+    <w:lvl w:ilvl="5" w:tentative="1">
+      <w:start w:val="1"/>
+      <w:numFmt w:val="bullet"/>
+      <w:lvlText w:val=""/>
+      <w:lvlJc w:val="left"/>
+      <w:pPr>
+        <w:tabs>
+          <w:tab w:val="num" w:pos="4320"/>
+        </w:tabs>
+        <w:ind w:left="4320" w:hanging="360"/>
+      </w:pPr>
+      <w:rPr>
+        <w:rFonts w:ascii="Wingdings" w:hAnsi="Wingdings" w:hint="default"/>
+        <w:sz w:val="20"/>
+      </w:rPr>
+    </w:lvl>
+    <w:lvl w:ilvl="6" w:tentative="1">
+      <w:start w:val="1"/>
+      <w:numFmt w:val="bullet"/>
+      <w:lvlText w:val=""/>
+      <w:lvlJc w:val="left"/>
+      <w:pPr>
+        <w:tabs>
+          <w:tab w:val="num" w:pos="5040"/>
+        </w:tabs>
+        <w:ind w:left="5040" w:hanging="360"/>
+      </w:pPr>
+      <w:rPr>
+        <w:rFonts w:ascii="Wingdings" w:hAnsi="Wingdings" w:hint="default"/>
+        <w:sz w:val="20"/>
+      </w:rPr>
+    </w:lvl>
+    <w:lvl w:ilvl="7" w:tentative="1">
+      <w:start w:val="1"/>
+      <w:numFmt w:val="bullet"/>
+      <w:lvlText w:val=""/>
+      <w:lvlJc w:val="left"/>
+      <w:pPr>
+        <w:tabs>
+          <w:tab w:val="num" w:pos="5760"/>
+        </w:tabs>
+        <w:ind w:left="5760" w:hanging="360"/>
+      </w:pPr>
+      <w:rPr>
+        <w:rFonts w:ascii="Wingdings" w:hAnsi="Wingdings" w:hint="default"/>
+        <w:sz w:val="20"/>
+      </w:rPr>
+    </w:lvl>
+    <w:lvl w:ilvl="8" w:tentative="1">
+      <w:start w:val="1"/>
+      <w:numFmt w:val="bullet"/>
+      <w:lvlText w:val=""/>
+      <w:lvlJc w:val="left"/>
+      <w:pPr>
+        <w:tabs>
+          <w:tab w:val="num" w:pos="6480"/>
+        </w:tabs>
+        <w:ind w:left="6480" w:hanging="360"/>
+      </w:pPr>
+      <w:rPr>
+        <w:rFonts w:ascii="Wingdings" w:hAnsi="Wingdings" w:hint="default"/>
+        <w:sz w:val="20"/>
+      </w:rPr>
+    </w:lvl>
+  </w:abstractNum>
+  <w:abstractNum w:abstractNumId="1" w15:restartNumberingAfterBreak="0">
+    <w:nsid w:val="031574FC"/>
+    <w:multiLevelType w:val="multilevel"/>
+    <w:tmpl w:val="8AFE9F2E"/>
+    <w:lvl w:ilvl="0">
+      <w:start w:val="1"/>
+      <w:numFmt w:val="bullet"/>
+      <w:lvlText w:val=""/>
+      <w:lvlJc w:val="left"/>
+      <w:pPr>
+        <w:tabs>
+          <w:tab w:val="num" w:pos="720"/>
+        </w:tabs>
+        <w:ind w:left="720" w:hanging="360"/>
+      </w:pPr>
+      <w:rPr>
+        <w:rFonts w:ascii="Symbol" w:hAnsi="Symbol" w:hint="default"/>
+        <w:sz w:val="20"/>
+      </w:rPr>
+    </w:lvl>
+    <w:lvl w:ilvl="1" w:tentative="1">
+      <w:start w:val="1"/>
+      <w:numFmt w:val="bullet"/>
+      <w:lvlText w:val="o"/>
+      <w:lvlJc w:val="left"/>
+      <w:pPr>
+        <w:tabs>
+          <w:tab w:val="num" w:pos="1440"/>
+        </w:tabs>
+        <w:ind w:left="1440" w:hanging="360"/>
+      </w:pPr>
+      <w:rPr>
+        <w:rFonts w:ascii="Courier New" w:hAnsi="Courier New" w:hint="default"/>
+        <w:sz w:val="20"/>
+      </w:rPr>
+    </w:lvl>
+    <w:lvl w:ilvl="2" w:tentative="1">
+      <w:start w:val="1"/>
+      <w:numFmt w:val="bullet"/>
+      <w:lvlText w:val=""/>
+      <w:lvlJc w:val="left"/>
+      <w:pPr>
+        <w:tabs>
+          <w:tab w:val="num" w:pos="2160"/>
+        </w:tabs>
+        <w:ind w:left="2160" w:hanging="360"/>
+      </w:pPr>
+      <w:rPr>
+        <w:rFonts w:ascii="Wingdings" w:hAnsi="Wingdings" w:hint="default"/>
+        <w:sz w:val="20"/>
+      </w:rPr>
+    </w:lvl>
+    <w:lvl w:ilvl="3" w:tentative="1">
+      <w:start w:val="1"/>
+      <w:numFmt w:val="bullet"/>
+      <w:lvlText w:val=""/>
+      <w:lvlJc w:val="left"/>
+      <w:pPr>
+        <w:tabs>
+          <w:tab w:val="num" w:pos="2880"/>
+        </w:tabs>
+        <w:ind w:left="2880" w:hanging="360"/>
+      </w:pPr>
+      <w:rPr>
+        <w:rFonts w:ascii="Wingdings" w:hAnsi="Wingdings" w:hint="default"/>
+        <w:sz w:val="20"/>
+      </w:rPr>
+    </w:lvl>
+    <w:lvl w:ilvl="4" w:tentative="1">
+      <w:start w:val="1"/>
+      <w:numFmt w:val="bullet"/>
+      <w:lvlText w:val=""/>
+      <w:lvlJc w:val="left"/>
+      <w:pPr>
+        <w:tabs>
+          <w:tab w:val="num" w:pos="3600"/>
+        </w:tabs>
+        <w:ind w:left="3600" w:hanging="360"/>
+      </w:pPr>
+      <w:rPr>
+        <w:rFonts w:ascii="Wingdings" w:hAnsi="Wingdings" w:hint="default"/>
+        <w:sz w:val="20"/>
+      </w:rPr>
+    </w:lvl>
+    <w:lvl w:ilvl="5" w:tentative="1">
+      <w:start w:val="1"/>
+      <w:numFmt w:val="bullet"/>
+      <w:lvlText w:val=""/>
+      <w:lvlJc w:val="left"/>
+      <w:pPr>
+        <w:tabs>
+          <w:tab w:val="num" w:pos="4320"/>
+        </w:tabs>
+        <w:ind w:left="4320" w:hanging="360"/>
+      </w:pPr>
+      <w:rPr>
+        <w:rFonts w:ascii="Wingdings" w:hAnsi="Wingdings" w:hint="default"/>
+        <w:sz w:val="20"/>
+      </w:rPr>
+    </w:lvl>
+    <w:lvl w:ilvl="6" w:tentative="1">
+      <w:start w:val="1"/>
+      <w:numFmt w:val="bullet"/>
+      <w:lvlText w:val=""/>
+      <w:lvlJc w:val="left"/>
+      <w:pPr>
+        <w:tabs>
+          <w:tab w:val="num" w:pos="5040"/>
+        </w:tabs>
+        <w:ind w:left="5040" w:hanging="360"/>
+      </w:pPr>
+      <w:rPr>
+        <w:rFonts w:ascii="Wingdings" w:hAnsi="Wingdings" w:hint="default"/>
+        <w:sz w:val="20"/>
+      </w:rPr>
+    </w:lvl>
+    <w:lvl w:ilvl="7" w:tentative="1">
+      <w:start w:val="1"/>
+      <w:numFmt w:val="bullet"/>
+      <w:lvlText w:val=""/>
+      <w:lvlJc w:val="left"/>
+      <w:pPr>
+        <w:tabs>
+          <w:tab w:val="num" w:pos="5760"/>
+        </w:tabs>
+        <w:ind w:left="5760" w:hanging="360"/>
+      </w:pPr>
+      <w:rPr>
+        <w:rFonts w:ascii="Wingdings" w:hAnsi="Wingdings" w:hint="default"/>
+        <w:sz w:val="20"/>
+      </w:rPr>
+    </w:lvl>
+    <w:lvl w:ilvl="8" w:tentative="1">
+      <w:start w:val="1"/>
+      <w:numFmt w:val="bullet"/>
+      <w:lvlText w:val=""/>
+      <w:lvlJc w:val="left"/>
+      <w:pPr>
+        <w:tabs>
+          <w:tab w:val="num" w:pos="6480"/>
+        </w:tabs>
+        <w:ind w:left="6480" w:hanging="360"/>
+      </w:pPr>
+      <w:rPr>
+        <w:rFonts w:ascii="Wingdings" w:hAnsi="Wingdings" w:hint="default"/>
+        <w:sz w:val="20"/>
+      </w:rPr>
+    </w:lvl>
+  </w:abstractNum>
+  <w:abstractNum w:abstractNumId="2" w15:restartNumberingAfterBreak="0">
+    <w:nsid w:val="0648155D"/>
+    <w:multiLevelType w:val="multilevel"/>
+    <w:tmpl w:val="8C949048"/>
     <w:lvl w:ilvl="0">
       <w:start w:val="1"/>
       <w:numFmt w:val="decimal"/>
@@ -6682,10 +6980,10 @@
       </w:pPr>
     </w:lvl>
   </w:abstractNum>
-  <w:abstractNum w:abstractNumId="1" w15:restartNumberingAfterBreak="0">
-    <w:nsid w:val="12ED4009"/>
+  <w:abstractNum w:abstractNumId="3" w15:restartNumberingAfterBreak="0">
+    <w:nsid w:val="0AA810CA"/>
     <w:multiLevelType w:val="multilevel"/>
-    <w:tmpl w:val="C29EE260"/>
+    <w:tmpl w:val="9FE47EA4"/>
     <w:lvl w:ilvl="0">
       <w:start w:val="1"/>
       <w:numFmt w:val="bullet"/>
@@ -6831,10 +7129,10 @@
       </w:rPr>
     </w:lvl>
   </w:abstractNum>
-  <w:abstractNum w:abstractNumId="2" w15:restartNumberingAfterBreak="0">
-    <w:nsid w:val="15713D12"/>
+  <w:abstractNum w:abstractNumId="4" w15:restartNumberingAfterBreak="0">
+    <w:nsid w:val="0CD45A9D"/>
     <w:multiLevelType w:val="multilevel"/>
-    <w:tmpl w:val="178238FE"/>
+    <w:tmpl w:val="F6DA9092"/>
     <w:lvl w:ilvl="0">
       <w:start w:val="1"/>
       <w:numFmt w:val="bullet"/>
@@ -6980,10 +7278,308 @@
       </w:rPr>
     </w:lvl>
   </w:abstractNum>
-  <w:abstractNum w:abstractNumId="3" w15:restartNumberingAfterBreak="0">
-    <w:nsid w:val="15CA24A5"/>
+  <w:abstractNum w:abstractNumId="5" w15:restartNumberingAfterBreak="0">
+    <w:nsid w:val="11075B92"/>
     <w:multiLevelType w:val="multilevel"/>
-    <w:tmpl w:val="F8DA4EF6"/>
+    <w:tmpl w:val="7EE0E428"/>
+    <w:lvl w:ilvl="0">
+      <w:start w:val="1"/>
+      <w:numFmt w:val="bullet"/>
+      <w:lvlText w:val=""/>
+      <w:lvlJc w:val="left"/>
+      <w:pPr>
+        <w:tabs>
+          <w:tab w:val="num" w:pos="720"/>
+        </w:tabs>
+        <w:ind w:left="720" w:hanging="360"/>
+      </w:pPr>
+      <w:rPr>
+        <w:rFonts w:ascii="Symbol" w:hAnsi="Symbol" w:hint="default"/>
+        <w:sz w:val="20"/>
+      </w:rPr>
+    </w:lvl>
+    <w:lvl w:ilvl="1" w:tentative="1">
+      <w:start w:val="1"/>
+      <w:numFmt w:val="bullet"/>
+      <w:lvlText w:val="o"/>
+      <w:lvlJc w:val="left"/>
+      <w:pPr>
+        <w:tabs>
+          <w:tab w:val="num" w:pos="1440"/>
+        </w:tabs>
+        <w:ind w:left="1440" w:hanging="360"/>
+      </w:pPr>
+      <w:rPr>
+        <w:rFonts w:ascii="Courier New" w:hAnsi="Courier New" w:hint="default"/>
+        <w:sz w:val="20"/>
+      </w:rPr>
+    </w:lvl>
+    <w:lvl w:ilvl="2" w:tentative="1">
+      <w:start w:val="1"/>
+      <w:numFmt w:val="bullet"/>
+      <w:lvlText w:val=""/>
+      <w:lvlJc w:val="left"/>
+      <w:pPr>
+        <w:tabs>
+          <w:tab w:val="num" w:pos="2160"/>
+        </w:tabs>
+        <w:ind w:left="2160" w:hanging="360"/>
+      </w:pPr>
+      <w:rPr>
+        <w:rFonts w:ascii="Wingdings" w:hAnsi="Wingdings" w:hint="default"/>
+        <w:sz w:val="20"/>
+      </w:rPr>
+    </w:lvl>
+    <w:lvl w:ilvl="3" w:tentative="1">
+      <w:start w:val="1"/>
+      <w:numFmt w:val="bullet"/>
+      <w:lvlText w:val=""/>
+      <w:lvlJc w:val="left"/>
+      <w:pPr>
+        <w:tabs>
+          <w:tab w:val="num" w:pos="2880"/>
+        </w:tabs>
+        <w:ind w:left="2880" w:hanging="360"/>
+      </w:pPr>
+      <w:rPr>
+        <w:rFonts w:ascii="Wingdings" w:hAnsi="Wingdings" w:hint="default"/>
+        <w:sz w:val="20"/>
+      </w:rPr>
+    </w:lvl>
+    <w:lvl w:ilvl="4" w:tentative="1">
+      <w:start w:val="1"/>
+      <w:numFmt w:val="bullet"/>
+      <w:lvlText w:val=""/>
+      <w:lvlJc w:val="left"/>
+      <w:pPr>
+        <w:tabs>
+          <w:tab w:val="num" w:pos="3600"/>
+        </w:tabs>
+        <w:ind w:left="3600" w:hanging="360"/>
+      </w:pPr>
+      <w:rPr>
+        <w:rFonts w:ascii="Wingdings" w:hAnsi="Wingdings" w:hint="default"/>
+        <w:sz w:val="20"/>
+      </w:rPr>
+    </w:lvl>
+    <w:lvl w:ilvl="5" w:tentative="1">
+      <w:start w:val="1"/>
+      <w:numFmt w:val="bullet"/>
+      <w:lvlText w:val=""/>
+      <w:lvlJc w:val="left"/>
+      <w:pPr>
+        <w:tabs>
+          <w:tab w:val="num" w:pos="4320"/>
+        </w:tabs>
+        <w:ind w:left="4320" w:hanging="360"/>
+      </w:pPr>
+      <w:rPr>
+        <w:rFonts w:ascii="Wingdings" w:hAnsi="Wingdings" w:hint="default"/>
+        <w:sz w:val="20"/>
+      </w:rPr>
+    </w:lvl>
+    <w:lvl w:ilvl="6" w:tentative="1">
+      <w:start w:val="1"/>
+      <w:numFmt w:val="bullet"/>
+      <w:lvlText w:val=""/>
+      <w:lvlJc w:val="left"/>
+      <w:pPr>
+        <w:tabs>
+          <w:tab w:val="num" w:pos="5040"/>
+        </w:tabs>
+        <w:ind w:left="5040" w:hanging="360"/>
+      </w:pPr>
+      <w:rPr>
+        <w:rFonts w:ascii="Wingdings" w:hAnsi="Wingdings" w:hint="default"/>
+        <w:sz w:val="20"/>
+      </w:rPr>
+    </w:lvl>
+    <w:lvl w:ilvl="7" w:tentative="1">
+      <w:start w:val="1"/>
+      <w:numFmt w:val="bullet"/>
+      <w:lvlText w:val=""/>
+      <w:lvlJc w:val="left"/>
+      <w:pPr>
+        <w:tabs>
+          <w:tab w:val="num" w:pos="5760"/>
+        </w:tabs>
+        <w:ind w:left="5760" w:hanging="360"/>
+      </w:pPr>
+      <w:rPr>
+        <w:rFonts w:ascii="Wingdings" w:hAnsi="Wingdings" w:hint="default"/>
+        <w:sz w:val="20"/>
+      </w:rPr>
+    </w:lvl>
+    <w:lvl w:ilvl="8" w:tentative="1">
+      <w:start w:val="1"/>
+      <w:numFmt w:val="bullet"/>
+      <w:lvlText w:val=""/>
+      <w:lvlJc w:val="left"/>
+      <w:pPr>
+        <w:tabs>
+          <w:tab w:val="num" w:pos="6480"/>
+        </w:tabs>
+        <w:ind w:left="6480" w:hanging="360"/>
+      </w:pPr>
+      <w:rPr>
+        <w:rFonts w:ascii="Wingdings" w:hAnsi="Wingdings" w:hint="default"/>
+        <w:sz w:val="20"/>
+      </w:rPr>
+    </w:lvl>
+  </w:abstractNum>
+  <w:abstractNum w:abstractNumId="6" w15:restartNumberingAfterBreak="0">
+    <w:nsid w:val="1572658B"/>
+    <w:multiLevelType w:val="multilevel"/>
+    <w:tmpl w:val="C90ED5B4"/>
+    <w:lvl w:ilvl="0">
+      <w:start w:val="1"/>
+      <w:numFmt w:val="bullet"/>
+      <w:lvlText w:val=""/>
+      <w:lvlJc w:val="left"/>
+      <w:pPr>
+        <w:tabs>
+          <w:tab w:val="num" w:pos="720"/>
+        </w:tabs>
+        <w:ind w:left="720" w:hanging="360"/>
+      </w:pPr>
+      <w:rPr>
+        <w:rFonts w:ascii="Symbol" w:hAnsi="Symbol" w:hint="default"/>
+        <w:sz w:val="20"/>
+      </w:rPr>
+    </w:lvl>
+    <w:lvl w:ilvl="1" w:tentative="1">
+      <w:start w:val="1"/>
+      <w:numFmt w:val="bullet"/>
+      <w:lvlText w:val="o"/>
+      <w:lvlJc w:val="left"/>
+      <w:pPr>
+        <w:tabs>
+          <w:tab w:val="num" w:pos="1440"/>
+        </w:tabs>
+        <w:ind w:left="1440" w:hanging="360"/>
+      </w:pPr>
+      <w:rPr>
+        <w:rFonts w:ascii="Courier New" w:hAnsi="Courier New" w:hint="default"/>
+        <w:sz w:val="20"/>
+      </w:rPr>
+    </w:lvl>
+    <w:lvl w:ilvl="2" w:tentative="1">
+      <w:start w:val="1"/>
+      <w:numFmt w:val="bullet"/>
+      <w:lvlText w:val=""/>
+      <w:lvlJc w:val="left"/>
+      <w:pPr>
+        <w:tabs>
+          <w:tab w:val="num" w:pos="2160"/>
+        </w:tabs>
+        <w:ind w:left="2160" w:hanging="360"/>
+      </w:pPr>
+      <w:rPr>
+        <w:rFonts w:ascii="Wingdings" w:hAnsi="Wingdings" w:hint="default"/>
+        <w:sz w:val="20"/>
+      </w:rPr>
+    </w:lvl>
+    <w:lvl w:ilvl="3" w:tentative="1">
+      <w:start w:val="1"/>
+      <w:numFmt w:val="bullet"/>
+      <w:lvlText w:val=""/>
+      <w:lvlJc w:val="left"/>
+      <w:pPr>
+        <w:tabs>
+          <w:tab w:val="num" w:pos="2880"/>
+        </w:tabs>
+        <w:ind w:left="2880" w:hanging="360"/>
+      </w:pPr>
+      <w:rPr>
+        <w:rFonts w:ascii="Wingdings" w:hAnsi="Wingdings" w:hint="default"/>
+        <w:sz w:val="20"/>
+      </w:rPr>
+    </w:lvl>
+    <w:lvl w:ilvl="4" w:tentative="1">
+      <w:start w:val="1"/>
+      <w:numFmt w:val="bullet"/>
+      <w:lvlText w:val=""/>
+      <w:lvlJc w:val="left"/>
+      <w:pPr>
+        <w:tabs>
+          <w:tab w:val="num" w:pos="3600"/>
+        </w:tabs>
+        <w:ind w:left="3600" w:hanging="360"/>
+      </w:pPr>
+      <w:rPr>
+        <w:rFonts w:ascii="Wingdings" w:hAnsi="Wingdings" w:hint="default"/>
+        <w:sz w:val="20"/>
+      </w:rPr>
+    </w:lvl>
+    <w:lvl w:ilvl="5" w:tentative="1">
+      <w:start w:val="1"/>
+      <w:numFmt w:val="bullet"/>
+      <w:lvlText w:val=""/>
+      <w:lvlJc w:val="left"/>
+      <w:pPr>
+        <w:tabs>
+          <w:tab w:val="num" w:pos="4320"/>
+        </w:tabs>
+        <w:ind w:left="4320" w:hanging="360"/>
+      </w:pPr>
+      <w:rPr>
+        <w:rFonts w:ascii="Wingdings" w:hAnsi="Wingdings" w:hint="default"/>
+        <w:sz w:val="20"/>
+      </w:rPr>
+    </w:lvl>
+    <w:lvl w:ilvl="6" w:tentative="1">
+      <w:start w:val="1"/>
+      <w:numFmt w:val="bullet"/>
+      <w:lvlText w:val=""/>
+      <w:lvlJc w:val="left"/>
+      <w:pPr>
+        <w:tabs>
+          <w:tab w:val="num" w:pos="5040"/>
+        </w:tabs>
+        <w:ind w:left="5040" w:hanging="360"/>
+      </w:pPr>
+      <w:rPr>
+        <w:rFonts w:ascii="Wingdings" w:hAnsi="Wingdings" w:hint="default"/>
+        <w:sz w:val="20"/>
+      </w:rPr>
+    </w:lvl>
+    <w:lvl w:ilvl="7" w:tentative="1">
+      <w:start w:val="1"/>
+      <w:numFmt w:val="bullet"/>
+      <w:lvlText w:val=""/>
+      <w:lvlJc w:val="left"/>
+      <w:pPr>
+        <w:tabs>
+          <w:tab w:val="num" w:pos="5760"/>
+        </w:tabs>
+        <w:ind w:left="5760" w:hanging="360"/>
+      </w:pPr>
+      <w:rPr>
+        <w:rFonts w:ascii="Wingdings" w:hAnsi="Wingdings" w:hint="default"/>
+        <w:sz w:val="20"/>
+      </w:rPr>
+    </w:lvl>
+    <w:lvl w:ilvl="8" w:tentative="1">
+      <w:start w:val="1"/>
+      <w:numFmt w:val="bullet"/>
+      <w:lvlText w:val=""/>
+      <w:lvlJc w:val="left"/>
+      <w:pPr>
+        <w:tabs>
+          <w:tab w:val="num" w:pos="6480"/>
+        </w:tabs>
+        <w:ind w:left="6480" w:hanging="360"/>
+      </w:pPr>
+      <w:rPr>
+        <w:rFonts w:ascii="Wingdings" w:hAnsi="Wingdings" w:hint="default"/>
+        <w:sz w:val="20"/>
+      </w:rPr>
+    </w:lvl>
+  </w:abstractNum>
+  <w:abstractNum w:abstractNumId="7" w15:restartNumberingAfterBreak="0">
+    <w:nsid w:val="1C5E7641"/>
+    <w:multiLevelType w:val="multilevel"/>
+    <w:tmpl w:val="ECEC995E"/>
     <w:lvl w:ilvl="0">
       <w:start w:val="1"/>
       <w:numFmt w:val="decimal"/>
@@ -7097,606 +7693,10 @@
       </w:pPr>
     </w:lvl>
   </w:abstractNum>
-  <w:abstractNum w:abstractNumId="4" w15:restartNumberingAfterBreak="0">
-    <w:nsid w:val="16C06E83"/>
+  <w:abstractNum w:abstractNumId="8" w15:restartNumberingAfterBreak="0">
+    <w:nsid w:val="2192146A"/>
     <w:multiLevelType w:val="multilevel"/>
-    <w:tmpl w:val="EEEEE1A8"/>
-    <w:lvl w:ilvl="0">
-      <w:start w:val="1"/>
-      <w:numFmt w:val="bullet"/>
-      <w:lvlText w:val=""/>
-      <w:lvlJc w:val="left"/>
-      <w:pPr>
-        <w:tabs>
-          <w:tab w:val="num" w:pos="720"/>
-        </w:tabs>
-        <w:ind w:left="720" w:hanging="360"/>
-      </w:pPr>
-      <w:rPr>
-        <w:rFonts w:ascii="Symbol" w:hAnsi="Symbol" w:hint="default"/>
-        <w:sz w:val="20"/>
-      </w:rPr>
-    </w:lvl>
-    <w:lvl w:ilvl="1" w:tentative="1">
-      <w:start w:val="1"/>
-      <w:numFmt w:val="bullet"/>
-      <w:lvlText w:val="o"/>
-      <w:lvlJc w:val="left"/>
-      <w:pPr>
-        <w:tabs>
-          <w:tab w:val="num" w:pos="1440"/>
-        </w:tabs>
-        <w:ind w:left="1440" w:hanging="360"/>
-      </w:pPr>
-      <w:rPr>
-        <w:rFonts w:ascii="Courier New" w:hAnsi="Courier New" w:hint="default"/>
-        <w:sz w:val="20"/>
-      </w:rPr>
-    </w:lvl>
-    <w:lvl w:ilvl="2" w:tentative="1">
-      <w:start w:val="1"/>
-      <w:numFmt w:val="bullet"/>
-      <w:lvlText w:val=""/>
-      <w:lvlJc w:val="left"/>
-      <w:pPr>
-        <w:tabs>
-          <w:tab w:val="num" w:pos="2160"/>
-        </w:tabs>
-        <w:ind w:left="2160" w:hanging="360"/>
-      </w:pPr>
-      <w:rPr>
-        <w:rFonts w:ascii="Wingdings" w:hAnsi="Wingdings" w:hint="default"/>
-        <w:sz w:val="20"/>
-      </w:rPr>
-    </w:lvl>
-    <w:lvl w:ilvl="3" w:tentative="1">
-      <w:start w:val="1"/>
-      <w:numFmt w:val="bullet"/>
-      <w:lvlText w:val=""/>
-      <w:lvlJc w:val="left"/>
-      <w:pPr>
-        <w:tabs>
-          <w:tab w:val="num" w:pos="2880"/>
-        </w:tabs>
-        <w:ind w:left="2880" w:hanging="360"/>
-      </w:pPr>
-      <w:rPr>
-        <w:rFonts w:ascii="Wingdings" w:hAnsi="Wingdings" w:hint="default"/>
-        <w:sz w:val="20"/>
-      </w:rPr>
-    </w:lvl>
-    <w:lvl w:ilvl="4" w:tentative="1">
-      <w:start w:val="1"/>
-      <w:numFmt w:val="bullet"/>
-      <w:lvlText w:val=""/>
-      <w:lvlJc w:val="left"/>
-      <w:pPr>
-        <w:tabs>
-          <w:tab w:val="num" w:pos="3600"/>
-        </w:tabs>
-        <w:ind w:left="3600" w:hanging="360"/>
-      </w:pPr>
-      <w:rPr>
-        <w:rFonts w:ascii="Wingdings" w:hAnsi="Wingdings" w:hint="default"/>
-        <w:sz w:val="20"/>
-      </w:rPr>
-    </w:lvl>
-    <w:lvl w:ilvl="5" w:tentative="1">
-      <w:start w:val="1"/>
-      <w:numFmt w:val="bullet"/>
-      <w:lvlText w:val=""/>
-      <w:lvlJc w:val="left"/>
-      <w:pPr>
-        <w:tabs>
-          <w:tab w:val="num" w:pos="4320"/>
-        </w:tabs>
-        <w:ind w:left="4320" w:hanging="360"/>
-      </w:pPr>
-      <w:rPr>
-        <w:rFonts w:ascii="Wingdings" w:hAnsi="Wingdings" w:hint="default"/>
-        <w:sz w:val="20"/>
-      </w:rPr>
-    </w:lvl>
-    <w:lvl w:ilvl="6" w:tentative="1">
-      <w:start w:val="1"/>
-      <w:numFmt w:val="bullet"/>
-      <w:lvlText w:val=""/>
-      <w:lvlJc w:val="left"/>
-      <w:pPr>
-        <w:tabs>
-          <w:tab w:val="num" w:pos="5040"/>
-        </w:tabs>
-        <w:ind w:left="5040" w:hanging="360"/>
-      </w:pPr>
-      <w:rPr>
-        <w:rFonts w:ascii="Wingdings" w:hAnsi="Wingdings" w:hint="default"/>
-        <w:sz w:val="20"/>
-      </w:rPr>
-    </w:lvl>
-    <w:lvl w:ilvl="7" w:tentative="1">
-      <w:start w:val="1"/>
-      <w:numFmt w:val="bullet"/>
-      <w:lvlText w:val=""/>
-      <w:lvlJc w:val="left"/>
-      <w:pPr>
-        <w:tabs>
-          <w:tab w:val="num" w:pos="5760"/>
-        </w:tabs>
-        <w:ind w:left="5760" w:hanging="360"/>
-      </w:pPr>
-      <w:rPr>
-        <w:rFonts w:ascii="Wingdings" w:hAnsi="Wingdings" w:hint="default"/>
-        <w:sz w:val="20"/>
-      </w:rPr>
-    </w:lvl>
-    <w:lvl w:ilvl="8" w:tentative="1">
-      <w:start w:val="1"/>
-      <w:numFmt w:val="bullet"/>
-      <w:lvlText w:val=""/>
-      <w:lvlJc w:val="left"/>
-      <w:pPr>
-        <w:tabs>
-          <w:tab w:val="num" w:pos="6480"/>
-        </w:tabs>
-        <w:ind w:left="6480" w:hanging="360"/>
-      </w:pPr>
-      <w:rPr>
-        <w:rFonts w:ascii="Wingdings" w:hAnsi="Wingdings" w:hint="default"/>
-        <w:sz w:val="20"/>
-      </w:rPr>
-    </w:lvl>
-  </w:abstractNum>
-  <w:abstractNum w:abstractNumId="5" w15:restartNumberingAfterBreak="0">
-    <w:nsid w:val="1E7F178B"/>
-    <w:multiLevelType w:val="multilevel"/>
-    <w:tmpl w:val="EF9E1028"/>
-    <w:lvl w:ilvl="0">
-      <w:start w:val="1"/>
-      <w:numFmt w:val="bullet"/>
-      <w:lvlText w:val=""/>
-      <w:lvlJc w:val="left"/>
-      <w:pPr>
-        <w:tabs>
-          <w:tab w:val="num" w:pos="720"/>
-        </w:tabs>
-        <w:ind w:left="720" w:hanging="360"/>
-      </w:pPr>
-      <w:rPr>
-        <w:rFonts w:ascii="Symbol" w:hAnsi="Symbol" w:hint="default"/>
-        <w:sz w:val="20"/>
-      </w:rPr>
-    </w:lvl>
-    <w:lvl w:ilvl="1" w:tentative="1">
-      <w:start w:val="1"/>
-      <w:numFmt w:val="bullet"/>
-      <w:lvlText w:val="o"/>
-      <w:lvlJc w:val="left"/>
-      <w:pPr>
-        <w:tabs>
-          <w:tab w:val="num" w:pos="1440"/>
-        </w:tabs>
-        <w:ind w:left="1440" w:hanging="360"/>
-      </w:pPr>
-      <w:rPr>
-        <w:rFonts w:ascii="Courier New" w:hAnsi="Courier New" w:hint="default"/>
-        <w:sz w:val="20"/>
-      </w:rPr>
-    </w:lvl>
-    <w:lvl w:ilvl="2" w:tentative="1">
-      <w:start w:val="1"/>
-      <w:numFmt w:val="bullet"/>
-      <w:lvlText w:val=""/>
-      <w:lvlJc w:val="left"/>
-      <w:pPr>
-        <w:tabs>
-          <w:tab w:val="num" w:pos="2160"/>
-        </w:tabs>
-        <w:ind w:left="2160" w:hanging="360"/>
-      </w:pPr>
-      <w:rPr>
-        <w:rFonts w:ascii="Wingdings" w:hAnsi="Wingdings" w:hint="default"/>
-        <w:sz w:val="20"/>
-      </w:rPr>
-    </w:lvl>
-    <w:lvl w:ilvl="3" w:tentative="1">
-      <w:start w:val="1"/>
-      <w:numFmt w:val="bullet"/>
-      <w:lvlText w:val=""/>
-      <w:lvlJc w:val="left"/>
-      <w:pPr>
-        <w:tabs>
-          <w:tab w:val="num" w:pos="2880"/>
-        </w:tabs>
-        <w:ind w:left="2880" w:hanging="360"/>
-      </w:pPr>
-      <w:rPr>
-        <w:rFonts w:ascii="Wingdings" w:hAnsi="Wingdings" w:hint="default"/>
-        <w:sz w:val="20"/>
-      </w:rPr>
-    </w:lvl>
-    <w:lvl w:ilvl="4" w:tentative="1">
-      <w:start w:val="1"/>
-      <w:numFmt w:val="bullet"/>
-      <w:lvlText w:val=""/>
-      <w:lvlJc w:val="left"/>
-      <w:pPr>
-        <w:tabs>
-          <w:tab w:val="num" w:pos="3600"/>
-        </w:tabs>
-        <w:ind w:left="3600" w:hanging="360"/>
-      </w:pPr>
-      <w:rPr>
-        <w:rFonts w:ascii="Wingdings" w:hAnsi="Wingdings" w:hint="default"/>
-        <w:sz w:val="20"/>
-      </w:rPr>
-    </w:lvl>
-    <w:lvl w:ilvl="5" w:tentative="1">
-      <w:start w:val="1"/>
-      <w:numFmt w:val="bullet"/>
-      <w:lvlText w:val=""/>
-      <w:lvlJc w:val="left"/>
-      <w:pPr>
-        <w:tabs>
-          <w:tab w:val="num" w:pos="4320"/>
-        </w:tabs>
-        <w:ind w:left="4320" w:hanging="360"/>
-      </w:pPr>
-      <w:rPr>
-        <w:rFonts w:ascii="Wingdings" w:hAnsi="Wingdings" w:hint="default"/>
-        <w:sz w:val="20"/>
-      </w:rPr>
-    </w:lvl>
-    <w:lvl w:ilvl="6" w:tentative="1">
-      <w:start w:val="1"/>
-      <w:numFmt w:val="bullet"/>
-      <w:lvlText w:val=""/>
-      <w:lvlJc w:val="left"/>
-      <w:pPr>
-        <w:tabs>
-          <w:tab w:val="num" w:pos="5040"/>
-        </w:tabs>
-        <w:ind w:left="5040" w:hanging="360"/>
-      </w:pPr>
-      <w:rPr>
-        <w:rFonts w:ascii="Wingdings" w:hAnsi="Wingdings" w:hint="default"/>
-        <w:sz w:val="20"/>
-      </w:rPr>
-    </w:lvl>
-    <w:lvl w:ilvl="7" w:tentative="1">
-      <w:start w:val="1"/>
-      <w:numFmt w:val="bullet"/>
-      <w:lvlText w:val=""/>
-      <w:lvlJc w:val="left"/>
-      <w:pPr>
-        <w:tabs>
-          <w:tab w:val="num" w:pos="5760"/>
-        </w:tabs>
-        <w:ind w:left="5760" w:hanging="360"/>
-      </w:pPr>
-      <w:rPr>
-        <w:rFonts w:ascii="Wingdings" w:hAnsi="Wingdings" w:hint="default"/>
-        <w:sz w:val="20"/>
-      </w:rPr>
-    </w:lvl>
-    <w:lvl w:ilvl="8" w:tentative="1">
-      <w:start w:val="1"/>
-      <w:numFmt w:val="bullet"/>
-      <w:lvlText w:val=""/>
-      <w:lvlJc w:val="left"/>
-      <w:pPr>
-        <w:tabs>
-          <w:tab w:val="num" w:pos="6480"/>
-        </w:tabs>
-        <w:ind w:left="6480" w:hanging="360"/>
-      </w:pPr>
-      <w:rPr>
-        <w:rFonts w:ascii="Wingdings" w:hAnsi="Wingdings" w:hint="default"/>
-        <w:sz w:val="20"/>
-      </w:rPr>
-    </w:lvl>
-  </w:abstractNum>
-  <w:abstractNum w:abstractNumId="6" w15:restartNumberingAfterBreak="0">
-    <w:nsid w:val="28726949"/>
-    <w:multiLevelType w:val="multilevel"/>
-    <w:tmpl w:val="D4E299D2"/>
-    <w:lvl w:ilvl="0">
-      <w:start w:val="1"/>
-      <w:numFmt w:val="bullet"/>
-      <w:lvlText w:val=""/>
-      <w:lvlJc w:val="left"/>
-      <w:pPr>
-        <w:tabs>
-          <w:tab w:val="num" w:pos="720"/>
-        </w:tabs>
-        <w:ind w:left="720" w:hanging="360"/>
-      </w:pPr>
-      <w:rPr>
-        <w:rFonts w:ascii="Symbol" w:hAnsi="Symbol" w:hint="default"/>
-        <w:sz w:val="20"/>
-      </w:rPr>
-    </w:lvl>
-    <w:lvl w:ilvl="1" w:tentative="1">
-      <w:start w:val="1"/>
-      <w:numFmt w:val="bullet"/>
-      <w:lvlText w:val="o"/>
-      <w:lvlJc w:val="left"/>
-      <w:pPr>
-        <w:tabs>
-          <w:tab w:val="num" w:pos="1440"/>
-        </w:tabs>
-        <w:ind w:left="1440" w:hanging="360"/>
-      </w:pPr>
-      <w:rPr>
-        <w:rFonts w:ascii="Courier New" w:hAnsi="Courier New" w:hint="default"/>
-        <w:sz w:val="20"/>
-      </w:rPr>
-    </w:lvl>
-    <w:lvl w:ilvl="2" w:tentative="1">
-      <w:start w:val="1"/>
-      <w:numFmt w:val="bullet"/>
-      <w:lvlText w:val=""/>
-      <w:lvlJc w:val="left"/>
-      <w:pPr>
-        <w:tabs>
-          <w:tab w:val="num" w:pos="2160"/>
-        </w:tabs>
-        <w:ind w:left="2160" w:hanging="360"/>
-      </w:pPr>
-      <w:rPr>
-        <w:rFonts w:ascii="Wingdings" w:hAnsi="Wingdings" w:hint="default"/>
-        <w:sz w:val="20"/>
-      </w:rPr>
-    </w:lvl>
-    <w:lvl w:ilvl="3" w:tentative="1">
-      <w:start w:val="1"/>
-      <w:numFmt w:val="bullet"/>
-      <w:lvlText w:val=""/>
-      <w:lvlJc w:val="left"/>
-      <w:pPr>
-        <w:tabs>
-          <w:tab w:val="num" w:pos="2880"/>
-        </w:tabs>
-        <w:ind w:left="2880" w:hanging="360"/>
-      </w:pPr>
-      <w:rPr>
-        <w:rFonts w:ascii="Wingdings" w:hAnsi="Wingdings" w:hint="default"/>
-        <w:sz w:val="20"/>
-      </w:rPr>
-    </w:lvl>
-    <w:lvl w:ilvl="4" w:tentative="1">
-      <w:start w:val="1"/>
-      <w:numFmt w:val="bullet"/>
-      <w:lvlText w:val=""/>
-      <w:lvlJc w:val="left"/>
-      <w:pPr>
-        <w:tabs>
-          <w:tab w:val="num" w:pos="3600"/>
-        </w:tabs>
-        <w:ind w:left="3600" w:hanging="360"/>
-      </w:pPr>
-      <w:rPr>
-        <w:rFonts w:ascii="Wingdings" w:hAnsi="Wingdings" w:hint="default"/>
-        <w:sz w:val="20"/>
-      </w:rPr>
-    </w:lvl>
-    <w:lvl w:ilvl="5" w:tentative="1">
-      <w:start w:val="1"/>
-      <w:numFmt w:val="bullet"/>
-      <w:lvlText w:val=""/>
-      <w:lvlJc w:val="left"/>
-      <w:pPr>
-        <w:tabs>
-          <w:tab w:val="num" w:pos="4320"/>
-        </w:tabs>
-        <w:ind w:left="4320" w:hanging="360"/>
-      </w:pPr>
-      <w:rPr>
-        <w:rFonts w:ascii="Wingdings" w:hAnsi="Wingdings" w:hint="default"/>
-        <w:sz w:val="20"/>
-      </w:rPr>
-    </w:lvl>
-    <w:lvl w:ilvl="6" w:tentative="1">
-      <w:start w:val="1"/>
-      <w:numFmt w:val="bullet"/>
-      <w:lvlText w:val=""/>
-      <w:lvlJc w:val="left"/>
-      <w:pPr>
-        <w:tabs>
-          <w:tab w:val="num" w:pos="5040"/>
-        </w:tabs>
-        <w:ind w:left="5040" w:hanging="360"/>
-      </w:pPr>
-      <w:rPr>
-        <w:rFonts w:ascii="Wingdings" w:hAnsi="Wingdings" w:hint="default"/>
-        <w:sz w:val="20"/>
-      </w:rPr>
-    </w:lvl>
-    <w:lvl w:ilvl="7" w:tentative="1">
-      <w:start w:val="1"/>
-      <w:numFmt w:val="bullet"/>
-      <w:lvlText w:val=""/>
-      <w:lvlJc w:val="left"/>
-      <w:pPr>
-        <w:tabs>
-          <w:tab w:val="num" w:pos="5760"/>
-        </w:tabs>
-        <w:ind w:left="5760" w:hanging="360"/>
-      </w:pPr>
-      <w:rPr>
-        <w:rFonts w:ascii="Wingdings" w:hAnsi="Wingdings" w:hint="default"/>
-        <w:sz w:val="20"/>
-      </w:rPr>
-    </w:lvl>
-    <w:lvl w:ilvl="8" w:tentative="1">
-      <w:start w:val="1"/>
-      <w:numFmt w:val="bullet"/>
-      <w:lvlText w:val=""/>
-      <w:lvlJc w:val="left"/>
-      <w:pPr>
-        <w:tabs>
-          <w:tab w:val="num" w:pos="6480"/>
-        </w:tabs>
-        <w:ind w:left="6480" w:hanging="360"/>
-      </w:pPr>
-      <w:rPr>
-        <w:rFonts w:ascii="Wingdings" w:hAnsi="Wingdings" w:hint="default"/>
-        <w:sz w:val="20"/>
-      </w:rPr>
-    </w:lvl>
-  </w:abstractNum>
-  <w:abstractNum w:abstractNumId="7" w15:restartNumberingAfterBreak="0">
-    <w:nsid w:val="38931832"/>
-    <w:multiLevelType w:val="multilevel"/>
-    <w:tmpl w:val="F848AE18"/>
-    <w:lvl w:ilvl="0">
-      <w:start w:val="1"/>
-      <w:numFmt w:val="bullet"/>
-      <w:lvlText w:val=""/>
-      <w:lvlJc w:val="left"/>
-      <w:pPr>
-        <w:tabs>
-          <w:tab w:val="num" w:pos="720"/>
-        </w:tabs>
-        <w:ind w:left="720" w:hanging="360"/>
-      </w:pPr>
-      <w:rPr>
-        <w:rFonts w:ascii="Symbol" w:hAnsi="Symbol" w:hint="default"/>
-        <w:sz w:val="20"/>
-      </w:rPr>
-    </w:lvl>
-    <w:lvl w:ilvl="1" w:tentative="1">
-      <w:start w:val="1"/>
-      <w:numFmt w:val="bullet"/>
-      <w:lvlText w:val="o"/>
-      <w:lvlJc w:val="left"/>
-      <w:pPr>
-        <w:tabs>
-          <w:tab w:val="num" w:pos="1440"/>
-        </w:tabs>
-        <w:ind w:left="1440" w:hanging="360"/>
-      </w:pPr>
-      <w:rPr>
-        <w:rFonts w:ascii="Courier New" w:hAnsi="Courier New" w:hint="default"/>
-        <w:sz w:val="20"/>
-      </w:rPr>
-    </w:lvl>
-    <w:lvl w:ilvl="2" w:tentative="1">
-      <w:start w:val="1"/>
-      <w:numFmt w:val="bullet"/>
-      <w:lvlText w:val=""/>
-      <w:lvlJc w:val="left"/>
-      <w:pPr>
-        <w:tabs>
-          <w:tab w:val="num" w:pos="2160"/>
-        </w:tabs>
-        <w:ind w:left="2160" w:hanging="360"/>
-      </w:pPr>
-      <w:rPr>
-        <w:rFonts w:ascii="Wingdings" w:hAnsi="Wingdings" w:hint="default"/>
-        <w:sz w:val="20"/>
-      </w:rPr>
-    </w:lvl>
-    <w:lvl w:ilvl="3" w:tentative="1">
-      <w:start w:val="1"/>
-      <w:numFmt w:val="bullet"/>
-      <w:lvlText w:val=""/>
-      <w:lvlJc w:val="left"/>
-      <w:pPr>
-        <w:tabs>
-          <w:tab w:val="num" w:pos="2880"/>
-        </w:tabs>
-        <w:ind w:left="2880" w:hanging="360"/>
-      </w:pPr>
-      <w:rPr>
-        <w:rFonts w:ascii="Wingdings" w:hAnsi="Wingdings" w:hint="default"/>
-        <w:sz w:val="20"/>
-      </w:rPr>
-    </w:lvl>
-    <w:lvl w:ilvl="4" w:tentative="1">
-      <w:start w:val="1"/>
-      <w:numFmt w:val="bullet"/>
-      <w:lvlText w:val=""/>
-      <w:lvlJc w:val="left"/>
-      <w:pPr>
-        <w:tabs>
-          <w:tab w:val="num" w:pos="3600"/>
-        </w:tabs>
-        <w:ind w:left="3600" w:hanging="360"/>
-      </w:pPr>
-      <w:rPr>
-        <w:rFonts w:ascii="Wingdings" w:hAnsi="Wingdings" w:hint="default"/>
-        <w:sz w:val="20"/>
-      </w:rPr>
-    </w:lvl>
-    <w:lvl w:ilvl="5" w:tentative="1">
-      <w:start w:val="1"/>
-      <w:numFmt w:val="bullet"/>
-      <w:lvlText w:val=""/>
-      <w:lvlJc w:val="left"/>
-      <w:pPr>
-        <w:tabs>
-          <w:tab w:val="num" w:pos="4320"/>
-        </w:tabs>
-        <w:ind w:left="4320" w:hanging="360"/>
-      </w:pPr>
-      <w:rPr>
-        <w:rFonts w:ascii="Wingdings" w:hAnsi="Wingdings" w:hint="default"/>
-        <w:sz w:val="20"/>
-      </w:rPr>
-    </w:lvl>
-    <w:lvl w:ilvl="6" w:tentative="1">
-      <w:start w:val="1"/>
-      <w:numFmt w:val="bullet"/>
-      <w:lvlText w:val=""/>
-      <w:lvlJc w:val="left"/>
-      <w:pPr>
-        <w:tabs>
-          <w:tab w:val="num" w:pos="5040"/>
-        </w:tabs>
-        <w:ind w:left="5040" w:hanging="360"/>
-      </w:pPr>
-      <w:rPr>
-        <w:rFonts w:ascii="Wingdings" w:hAnsi="Wingdings" w:hint="default"/>
-        <w:sz w:val="20"/>
-      </w:rPr>
-    </w:lvl>
-    <w:lvl w:ilvl="7" w:tentative="1">
-      <w:start w:val="1"/>
-      <w:numFmt w:val="bullet"/>
-      <w:lvlText w:val=""/>
-      <w:lvlJc w:val="left"/>
-      <w:pPr>
-        <w:tabs>
-          <w:tab w:val="num" w:pos="5760"/>
-        </w:tabs>
-        <w:ind w:left="5760" w:hanging="360"/>
-      </w:pPr>
-      <w:rPr>
-        <w:rFonts w:ascii="Wingdings" w:hAnsi="Wingdings" w:hint="default"/>
-        <w:sz w:val="20"/>
-      </w:rPr>
-    </w:lvl>
-    <w:lvl w:ilvl="8" w:tentative="1">
-      <w:start w:val="1"/>
-      <w:numFmt w:val="bullet"/>
-      <w:lvlText w:val=""/>
-      <w:lvlJc w:val="left"/>
-      <w:pPr>
-        <w:tabs>
-          <w:tab w:val="num" w:pos="6480"/>
-        </w:tabs>
-        <w:ind w:left="6480" w:hanging="360"/>
-      </w:pPr>
-      <w:rPr>
-        <w:rFonts w:ascii="Wingdings" w:hAnsi="Wingdings" w:hint="default"/>
-        <w:sz w:val="20"/>
-      </w:rPr>
-    </w:lvl>
-  </w:abstractNum>
-  <w:abstractNum w:abstractNumId="8" w15:restartNumberingAfterBreak="0">
-    <w:nsid w:val="3BF576E4"/>
-    <w:multiLevelType w:val="multilevel"/>
-    <w:tmpl w:val="B42A3C2E"/>
+    <w:tmpl w:val="BC00BB52"/>
     <w:lvl w:ilvl="0">
       <w:start w:val="1"/>
       <w:numFmt w:val="bullet"/>
@@ -7843,13 +7843,13 @@
     </w:lvl>
   </w:abstractNum>
   <w:abstractNum w:abstractNumId="9" w15:restartNumberingAfterBreak="0">
-    <w:nsid w:val="43B67114"/>
+    <w:nsid w:val="34097B1C"/>
     <w:multiLevelType w:val="multilevel"/>
-    <w:tmpl w:val="AB0A2BAE"/>
+    <w:tmpl w:val="5072AB98"/>
     <w:lvl w:ilvl="0">
       <w:start w:val="1"/>
-      <w:numFmt w:val="bullet"/>
-      <w:lvlText w:val=""/>
+      <w:numFmt w:val="decimal"/>
+      <w:lvlText w:val="%1."/>
       <w:lvlJc w:val="left"/>
       <w:pPr>
         <w:tabs>
@@ -7857,12 +7857,8 @@
         </w:tabs>
         <w:ind w:left="720" w:hanging="360"/>
       </w:pPr>
-      <w:rPr>
-        <w:rFonts w:ascii="Symbol" w:hAnsi="Symbol" w:hint="default"/>
-        <w:sz w:val="20"/>
-      </w:rPr>
-    </w:lvl>
-    <w:lvl w:ilvl="1" w:tentative="1">
+    </w:lvl>
+    <w:lvl w:ilvl="1">
       <w:start w:val="1"/>
       <w:numFmt w:val="bullet"/>
       <w:lvlText w:val="o"/>
@@ -7880,8 +7876,8 @@
     </w:lvl>
     <w:lvl w:ilvl="2" w:tentative="1">
       <w:start w:val="1"/>
-      <w:numFmt w:val="bullet"/>
-      <w:lvlText w:val=""/>
+      <w:numFmt w:val="decimal"/>
+      <w:lvlText w:val="%3."/>
       <w:lvlJc w:val="left"/>
       <w:pPr>
         <w:tabs>
@@ -7889,15 +7885,11 @@
         </w:tabs>
         <w:ind w:left="2160" w:hanging="360"/>
       </w:pPr>
-      <w:rPr>
-        <w:rFonts w:ascii="Wingdings" w:hAnsi="Wingdings" w:hint="default"/>
-        <w:sz w:val="20"/>
-      </w:rPr>
     </w:lvl>
     <w:lvl w:ilvl="3" w:tentative="1">
       <w:start w:val="1"/>
-      <w:numFmt w:val="bullet"/>
-      <w:lvlText w:val=""/>
+      <w:numFmt w:val="decimal"/>
+      <w:lvlText w:val="%4."/>
       <w:lvlJc w:val="left"/>
       <w:pPr>
         <w:tabs>
@@ -7905,15 +7897,11 @@
         </w:tabs>
         <w:ind w:left="2880" w:hanging="360"/>
       </w:pPr>
-      <w:rPr>
-        <w:rFonts w:ascii="Wingdings" w:hAnsi="Wingdings" w:hint="default"/>
-        <w:sz w:val="20"/>
-      </w:rPr>
     </w:lvl>
     <w:lvl w:ilvl="4" w:tentative="1">
       <w:start w:val="1"/>
-      <w:numFmt w:val="bullet"/>
-      <w:lvlText w:val=""/>
+      <w:numFmt w:val="decimal"/>
+      <w:lvlText w:val="%5."/>
       <w:lvlJc w:val="left"/>
       <w:pPr>
         <w:tabs>
@@ -7921,15 +7909,11 @@
         </w:tabs>
         <w:ind w:left="3600" w:hanging="360"/>
       </w:pPr>
-      <w:rPr>
-        <w:rFonts w:ascii="Wingdings" w:hAnsi="Wingdings" w:hint="default"/>
-        <w:sz w:val="20"/>
-      </w:rPr>
     </w:lvl>
     <w:lvl w:ilvl="5" w:tentative="1">
       <w:start w:val="1"/>
-      <w:numFmt w:val="bullet"/>
-      <w:lvlText w:val=""/>
+      <w:numFmt w:val="decimal"/>
+      <w:lvlText w:val="%6."/>
       <w:lvlJc w:val="left"/>
       <w:pPr>
         <w:tabs>
@@ -7937,15 +7921,11 @@
         </w:tabs>
         <w:ind w:left="4320" w:hanging="360"/>
       </w:pPr>
-      <w:rPr>
-        <w:rFonts w:ascii="Wingdings" w:hAnsi="Wingdings" w:hint="default"/>
-        <w:sz w:val="20"/>
-      </w:rPr>
     </w:lvl>
     <w:lvl w:ilvl="6" w:tentative="1">
       <w:start w:val="1"/>
-      <w:numFmt w:val="bullet"/>
-      <w:lvlText w:val=""/>
+      <w:numFmt w:val="decimal"/>
+      <w:lvlText w:val="%7."/>
       <w:lvlJc w:val="left"/>
       <w:pPr>
         <w:tabs>
@@ -7953,15 +7933,11 @@
         </w:tabs>
         <w:ind w:left="5040" w:hanging="360"/>
       </w:pPr>
-      <w:rPr>
-        <w:rFonts w:ascii="Wingdings" w:hAnsi="Wingdings" w:hint="default"/>
-        <w:sz w:val="20"/>
-      </w:rPr>
     </w:lvl>
     <w:lvl w:ilvl="7" w:tentative="1">
       <w:start w:val="1"/>
-      <w:numFmt w:val="bullet"/>
-      <w:lvlText w:val=""/>
+      <w:numFmt w:val="decimal"/>
+      <w:lvlText w:val="%8."/>
       <w:lvlJc w:val="left"/>
       <w:pPr>
         <w:tabs>
@@ -7969,15 +7945,11 @@
         </w:tabs>
         <w:ind w:left="5760" w:hanging="360"/>
       </w:pPr>
-      <w:rPr>
-        <w:rFonts w:ascii="Wingdings" w:hAnsi="Wingdings" w:hint="default"/>
-        <w:sz w:val="20"/>
-      </w:rPr>
     </w:lvl>
     <w:lvl w:ilvl="8" w:tentative="1">
       <w:start w:val="1"/>
-      <w:numFmt w:val="bullet"/>
-      <w:lvlText w:val=""/>
+      <w:numFmt w:val="decimal"/>
+      <w:lvlText w:val="%9."/>
       <w:lvlJc w:val="left"/>
       <w:pPr>
         <w:tabs>
@@ -7985,16 +7957,757 @@
         </w:tabs>
         <w:ind w:left="6480" w:hanging="360"/>
       </w:pPr>
-      <w:rPr>
-        <w:rFonts w:ascii="Wingdings" w:hAnsi="Wingdings" w:hint="default"/>
-        <w:sz w:val="20"/>
-      </w:rPr>
     </w:lvl>
   </w:abstractNum>
   <w:abstractNum w:abstractNumId="10" w15:restartNumberingAfterBreak="0">
-    <w:nsid w:val="49EA4D01"/>
+    <w:nsid w:val="39541924"/>
     <w:multiLevelType w:val="multilevel"/>
-    <w:tmpl w:val="A4B68E0A"/>
+    <w:tmpl w:val="4EF20F64"/>
+    <w:lvl w:ilvl="0">
+      <w:start w:val="1"/>
+      <w:numFmt w:val="bullet"/>
+      <w:lvlText w:val=""/>
+      <w:lvlJc w:val="left"/>
+      <w:pPr>
+        <w:tabs>
+          <w:tab w:val="num" w:pos="720"/>
+        </w:tabs>
+        <w:ind w:left="720" w:hanging="360"/>
+      </w:pPr>
+      <w:rPr>
+        <w:rFonts w:ascii="Symbol" w:hAnsi="Symbol" w:hint="default"/>
+        <w:sz w:val="20"/>
+      </w:rPr>
+    </w:lvl>
+    <w:lvl w:ilvl="1" w:tentative="1">
+      <w:start w:val="1"/>
+      <w:numFmt w:val="bullet"/>
+      <w:lvlText w:val="o"/>
+      <w:lvlJc w:val="left"/>
+      <w:pPr>
+        <w:tabs>
+          <w:tab w:val="num" w:pos="1440"/>
+        </w:tabs>
+        <w:ind w:left="1440" w:hanging="360"/>
+      </w:pPr>
+      <w:rPr>
+        <w:rFonts w:ascii="Courier New" w:hAnsi="Courier New" w:hint="default"/>
+        <w:sz w:val="20"/>
+      </w:rPr>
+    </w:lvl>
+    <w:lvl w:ilvl="2" w:tentative="1">
+      <w:start w:val="1"/>
+      <w:numFmt w:val="bullet"/>
+      <w:lvlText w:val=""/>
+      <w:lvlJc w:val="left"/>
+      <w:pPr>
+        <w:tabs>
+          <w:tab w:val="num" w:pos="2160"/>
+        </w:tabs>
+        <w:ind w:left="2160" w:hanging="360"/>
+      </w:pPr>
+      <w:rPr>
+        <w:rFonts w:ascii="Wingdings" w:hAnsi="Wingdings" w:hint="default"/>
+        <w:sz w:val="20"/>
+      </w:rPr>
+    </w:lvl>
+    <w:lvl w:ilvl="3" w:tentative="1">
+      <w:start w:val="1"/>
+      <w:numFmt w:val="bullet"/>
+      <w:lvlText w:val=""/>
+      <w:lvlJc w:val="left"/>
+      <w:pPr>
+        <w:tabs>
+          <w:tab w:val="num" w:pos="2880"/>
+        </w:tabs>
+        <w:ind w:left="2880" w:hanging="360"/>
+      </w:pPr>
+      <w:rPr>
+        <w:rFonts w:ascii="Wingdings" w:hAnsi="Wingdings" w:hint="default"/>
+        <w:sz w:val="20"/>
+      </w:rPr>
+    </w:lvl>
+    <w:lvl w:ilvl="4" w:tentative="1">
+      <w:start w:val="1"/>
+      <w:numFmt w:val="bullet"/>
+      <w:lvlText w:val=""/>
+      <w:lvlJc w:val="left"/>
+      <w:pPr>
+        <w:tabs>
+          <w:tab w:val="num" w:pos="3600"/>
+        </w:tabs>
+        <w:ind w:left="3600" w:hanging="360"/>
+      </w:pPr>
+      <w:rPr>
+        <w:rFonts w:ascii="Wingdings" w:hAnsi="Wingdings" w:hint="default"/>
+        <w:sz w:val="20"/>
+      </w:rPr>
+    </w:lvl>
+    <w:lvl w:ilvl="5" w:tentative="1">
+      <w:start w:val="1"/>
+      <w:numFmt w:val="bullet"/>
+      <w:lvlText w:val=""/>
+      <w:lvlJc w:val="left"/>
+      <w:pPr>
+        <w:tabs>
+          <w:tab w:val="num" w:pos="4320"/>
+        </w:tabs>
+        <w:ind w:left="4320" w:hanging="360"/>
+      </w:pPr>
+      <w:rPr>
+        <w:rFonts w:ascii="Wingdings" w:hAnsi="Wingdings" w:hint="default"/>
+        <w:sz w:val="20"/>
+      </w:rPr>
+    </w:lvl>
+    <w:lvl w:ilvl="6" w:tentative="1">
+      <w:start w:val="1"/>
+      <w:numFmt w:val="bullet"/>
+      <w:lvlText w:val=""/>
+      <w:lvlJc w:val="left"/>
+      <w:pPr>
+        <w:tabs>
+          <w:tab w:val="num" w:pos="5040"/>
+        </w:tabs>
+        <w:ind w:left="5040" w:hanging="360"/>
+      </w:pPr>
+      <w:rPr>
+        <w:rFonts w:ascii="Wingdings" w:hAnsi="Wingdings" w:hint="default"/>
+        <w:sz w:val="20"/>
+      </w:rPr>
+    </w:lvl>
+    <w:lvl w:ilvl="7" w:tentative="1">
+      <w:start w:val="1"/>
+      <w:numFmt w:val="bullet"/>
+      <w:lvlText w:val=""/>
+      <w:lvlJc w:val="left"/>
+      <w:pPr>
+        <w:tabs>
+          <w:tab w:val="num" w:pos="5760"/>
+        </w:tabs>
+        <w:ind w:left="5760" w:hanging="360"/>
+      </w:pPr>
+      <w:rPr>
+        <w:rFonts w:ascii="Wingdings" w:hAnsi="Wingdings" w:hint="default"/>
+        <w:sz w:val="20"/>
+      </w:rPr>
+    </w:lvl>
+    <w:lvl w:ilvl="8" w:tentative="1">
+      <w:start w:val="1"/>
+      <w:numFmt w:val="bullet"/>
+      <w:lvlText w:val=""/>
+      <w:lvlJc w:val="left"/>
+      <w:pPr>
+        <w:tabs>
+          <w:tab w:val="num" w:pos="6480"/>
+        </w:tabs>
+        <w:ind w:left="6480" w:hanging="360"/>
+      </w:pPr>
+      <w:rPr>
+        <w:rFonts w:ascii="Wingdings" w:hAnsi="Wingdings" w:hint="default"/>
+        <w:sz w:val="20"/>
+      </w:rPr>
+    </w:lvl>
+  </w:abstractNum>
+  <w:abstractNum w:abstractNumId="11" w15:restartNumberingAfterBreak="0">
+    <w:nsid w:val="3EC95792"/>
+    <w:multiLevelType w:val="multilevel"/>
+    <w:tmpl w:val="741A922C"/>
+    <w:lvl w:ilvl="0">
+      <w:start w:val="1"/>
+      <w:numFmt w:val="bullet"/>
+      <w:lvlText w:val=""/>
+      <w:lvlJc w:val="left"/>
+      <w:pPr>
+        <w:tabs>
+          <w:tab w:val="num" w:pos="720"/>
+        </w:tabs>
+        <w:ind w:left="720" w:hanging="360"/>
+      </w:pPr>
+      <w:rPr>
+        <w:rFonts w:ascii="Symbol" w:hAnsi="Symbol" w:hint="default"/>
+        <w:sz w:val="20"/>
+      </w:rPr>
+    </w:lvl>
+    <w:lvl w:ilvl="1" w:tentative="1">
+      <w:start w:val="1"/>
+      <w:numFmt w:val="bullet"/>
+      <w:lvlText w:val="o"/>
+      <w:lvlJc w:val="left"/>
+      <w:pPr>
+        <w:tabs>
+          <w:tab w:val="num" w:pos="1440"/>
+        </w:tabs>
+        <w:ind w:left="1440" w:hanging="360"/>
+      </w:pPr>
+      <w:rPr>
+        <w:rFonts w:ascii="Courier New" w:hAnsi="Courier New" w:hint="default"/>
+        <w:sz w:val="20"/>
+      </w:rPr>
+    </w:lvl>
+    <w:lvl w:ilvl="2" w:tentative="1">
+      <w:start w:val="1"/>
+      <w:numFmt w:val="bullet"/>
+      <w:lvlText w:val=""/>
+      <w:lvlJc w:val="left"/>
+      <w:pPr>
+        <w:tabs>
+          <w:tab w:val="num" w:pos="2160"/>
+        </w:tabs>
+        <w:ind w:left="2160" w:hanging="360"/>
+      </w:pPr>
+      <w:rPr>
+        <w:rFonts w:ascii="Wingdings" w:hAnsi="Wingdings" w:hint="default"/>
+        <w:sz w:val="20"/>
+      </w:rPr>
+    </w:lvl>
+    <w:lvl w:ilvl="3" w:tentative="1">
+      <w:start w:val="1"/>
+      <w:numFmt w:val="bullet"/>
+      <w:lvlText w:val=""/>
+      <w:lvlJc w:val="left"/>
+      <w:pPr>
+        <w:tabs>
+          <w:tab w:val="num" w:pos="2880"/>
+        </w:tabs>
+        <w:ind w:left="2880" w:hanging="360"/>
+      </w:pPr>
+      <w:rPr>
+        <w:rFonts w:ascii="Wingdings" w:hAnsi="Wingdings" w:hint="default"/>
+        <w:sz w:val="20"/>
+      </w:rPr>
+    </w:lvl>
+    <w:lvl w:ilvl="4" w:tentative="1">
+      <w:start w:val="1"/>
+      <w:numFmt w:val="bullet"/>
+      <w:lvlText w:val=""/>
+      <w:lvlJc w:val="left"/>
+      <w:pPr>
+        <w:tabs>
+          <w:tab w:val="num" w:pos="3600"/>
+        </w:tabs>
+        <w:ind w:left="3600" w:hanging="360"/>
+      </w:pPr>
+      <w:rPr>
+        <w:rFonts w:ascii="Wingdings" w:hAnsi="Wingdings" w:hint="default"/>
+        <w:sz w:val="20"/>
+      </w:rPr>
+    </w:lvl>
+    <w:lvl w:ilvl="5" w:tentative="1">
+      <w:start w:val="1"/>
+      <w:numFmt w:val="bullet"/>
+      <w:lvlText w:val=""/>
+      <w:lvlJc w:val="left"/>
+      <w:pPr>
+        <w:tabs>
+          <w:tab w:val="num" w:pos="4320"/>
+        </w:tabs>
+        <w:ind w:left="4320" w:hanging="360"/>
+      </w:pPr>
+      <w:rPr>
+        <w:rFonts w:ascii="Wingdings" w:hAnsi="Wingdings" w:hint="default"/>
+        <w:sz w:val="20"/>
+      </w:rPr>
+    </w:lvl>
+    <w:lvl w:ilvl="6" w:tentative="1">
+      <w:start w:val="1"/>
+      <w:numFmt w:val="bullet"/>
+      <w:lvlText w:val=""/>
+      <w:lvlJc w:val="left"/>
+      <w:pPr>
+        <w:tabs>
+          <w:tab w:val="num" w:pos="5040"/>
+        </w:tabs>
+        <w:ind w:left="5040" w:hanging="360"/>
+      </w:pPr>
+      <w:rPr>
+        <w:rFonts w:ascii="Wingdings" w:hAnsi="Wingdings" w:hint="default"/>
+        <w:sz w:val="20"/>
+      </w:rPr>
+    </w:lvl>
+    <w:lvl w:ilvl="7" w:tentative="1">
+      <w:start w:val="1"/>
+      <w:numFmt w:val="bullet"/>
+      <w:lvlText w:val=""/>
+      <w:lvlJc w:val="left"/>
+      <w:pPr>
+        <w:tabs>
+          <w:tab w:val="num" w:pos="5760"/>
+        </w:tabs>
+        <w:ind w:left="5760" w:hanging="360"/>
+      </w:pPr>
+      <w:rPr>
+        <w:rFonts w:ascii="Wingdings" w:hAnsi="Wingdings" w:hint="default"/>
+        <w:sz w:val="20"/>
+      </w:rPr>
+    </w:lvl>
+    <w:lvl w:ilvl="8" w:tentative="1">
+      <w:start w:val="1"/>
+      <w:numFmt w:val="bullet"/>
+      <w:lvlText w:val=""/>
+      <w:lvlJc w:val="left"/>
+      <w:pPr>
+        <w:tabs>
+          <w:tab w:val="num" w:pos="6480"/>
+        </w:tabs>
+        <w:ind w:left="6480" w:hanging="360"/>
+      </w:pPr>
+      <w:rPr>
+        <w:rFonts w:ascii="Wingdings" w:hAnsi="Wingdings" w:hint="default"/>
+        <w:sz w:val="20"/>
+      </w:rPr>
+    </w:lvl>
+  </w:abstractNum>
+  <w:abstractNum w:abstractNumId="12" w15:restartNumberingAfterBreak="0">
+    <w:nsid w:val="44F40913"/>
+    <w:multiLevelType w:val="multilevel"/>
+    <w:tmpl w:val="C1B86274"/>
+    <w:lvl w:ilvl="0">
+      <w:start w:val="1"/>
+      <w:numFmt w:val="bullet"/>
+      <w:lvlText w:val=""/>
+      <w:lvlJc w:val="left"/>
+      <w:pPr>
+        <w:tabs>
+          <w:tab w:val="num" w:pos="720"/>
+        </w:tabs>
+        <w:ind w:left="720" w:hanging="360"/>
+      </w:pPr>
+      <w:rPr>
+        <w:rFonts w:ascii="Symbol" w:hAnsi="Symbol" w:hint="default"/>
+        <w:sz w:val="20"/>
+      </w:rPr>
+    </w:lvl>
+    <w:lvl w:ilvl="1" w:tentative="1">
+      <w:start w:val="1"/>
+      <w:numFmt w:val="bullet"/>
+      <w:lvlText w:val="o"/>
+      <w:lvlJc w:val="left"/>
+      <w:pPr>
+        <w:tabs>
+          <w:tab w:val="num" w:pos="1440"/>
+        </w:tabs>
+        <w:ind w:left="1440" w:hanging="360"/>
+      </w:pPr>
+      <w:rPr>
+        <w:rFonts w:ascii="Courier New" w:hAnsi="Courier New" w:hint="default"/>
+        <w:sz w:val="20"/>
+      </w:rPr>
+    </w:lvl>
+    <w:lvl w:ilvl="2" w:tentative="1">
+      <w:start w:val="1"/>
+      <w:numFmt w:val="bullet"/>
+      <w:lvlText w:val=""/>
+      <w:lvlJc w:val="left"/>
+      <w:pPr>
+        <w:tabs>
+          <w:tab w:val="num" w:pos="2160"/>
+        </w:tabs>
+        <w:ind w:left="2160" w:hanging="360"/>
+      </w:pPr>
+      <w:rPr>
+        <w:rFonts w:ascii="Wingdings" w:hAnsi="Wingdings" w:hint="default"/>
+        <w:sz w:val="20"/>
+      </w:rPr>
+    </w:lvl>
+    <w:lvl w:ilvl="3" w:tentative="1">
+      <w:start w:val="1"/>
+      <w:numFmt w:val="bullet"/>
+      <w:lvlText w:val=""/>
+      <w:lvlJc w:val="left"/>
+      <w:pPr>
+        <w:tabs>
+          <w:tab w:val="num" w:pos="2880"/>
+        </w:tabs>
+        <w:ind w:left="2880" w:hanging="360"/>
+      </w:pPr>
+      <w:rPr>
+        <w:rFonts w:ascii="Wingdings" w:hAnsi="Wingdings" w:hint="default"/>
+        <w:sz w:val="20"/>
+      </w:rPr>
+    </w:lvl>
+    <w:lvl w:ilvl="4" w:tentative="1">
+      <w:start w:val="1"/>
+      <w:numFmt w:val="bullet"/>
+      <w:lvlText w:val=""/>
+      <w:lvlJc w:val="left"/>
+      <w:pPr>
+        <w:tabs>
+          <w:tab w:val="num" w:pos="3600"/>
+        </w:tabs>
+        <w:ind w:left="3600" w:hanging="360"/>
+      </w:pPr>
+      <w:rPr>
+        <w:rFonts w:ascii="Wingdings" w:hAnsi="Wingdings" w:hint="default"/>
+        <w:sz w:val="20"/>
+      </w:rPr>
+    </w:lvl>
+    <w:lvl w:ilvl="5" w:tentative="1">
+      <w:start w:val="1"/>
+      <w:numFmt w:val="bullet"/>
+      <w:lvlText w:val=""/>
+      <w:lvlJc w:val="left"/>
+      <w:pPr>
+        <w:tabs>
+          <w:tab w:val="num" w:pos="4320"/>
+        </w:tabs>
+        <w:ind w:left="4320" w:hanging="360"/>
+      </w:pPr>
+      <w:rPr>
+        <w:rFonts w:ascii="Wingdings" w:hAnsi="Wingdings" w:hint="default"/>
+        <w:sz w:val="20"/>
+      </w:rPr>
+    </w:lvl>
+    <w:lvl w:ilvl="6" w:tentative="1">
+      <w:start w:val="1"/>
+      <w:numFmt w:val="bullet"/>
+      <w:lvlText w:val=""/>
+      <w:lvlJc w:val="left"/>
+      <w:pPr>
+        <w:tabs>
+          <w:tab w:val="num" w:pos="5040"/>
+        </w:tabs>
+        <w:ind w:left="5040" w:hanging="360"/>
+      </w:pPr>
+      <w:rPr>
+        <w:rFonts w:ascii="Wingdings" w:hAnsi="Wingdings" w:hint="default"/>
+        <w:sz w:val="20"/>
+      </w:rPr>
+    </w:lvl>
+    <w:lvl w:ilvl="7" w:tentative="1">
+      <w:start w:val="1"/>
+      <w:numFmt w:val="bullet"/>
+      <w:lvlText w:val=""/>
+      <w:lvlJc w:val="left"/>
+      <w:pPr>
+        <w:tabs>
+          <w:tab w:val="num" w:pos="5760"/>
+        </w:tabs>
+        <w:ind w:left="5760" w:hanging="360"/>
+      </w:pPr>
+      <w:rPr>
+        <w:rFonts w:ascii="Wingdings" w:hAnsi="Wingdings" w:hint="default"/>
+        <w:sz w:val="20"/>
+      </w:rPr>
+    </w:lvl>
+    <w:lvl w:ilvl="8" w:tentative="1">
+      <w:start w:val="1"/>
+      <w:numFmt w:val="bullet"/>
+      <w:lvlText w:val=""/>
+      <w:lvlJc w:val="left"/>
+      <w:pPr>
+        <w:tabs>
+          <w:tab w:val="num" w:pos="6480"/>
+        </w:tabs>
+        <w:ind w:left="6480" w:hanging="360"/>
+      </w:pPr>
+      <w:rPr>
+        <w:rFonts w:ascii="Wingdings" w:hAnsi="Wingdings" w:hint="default"/>
+        <w:sz w:val="20"/>
+      </w:rPr>
+    </w:lvl>
+  </w:abstractNum>
+  <w:abstractNum w:abstractNumId="13" w15:restartNumberingAfterBreak="0">
+    <w:nsid w:val="49F21780"/>
+    <w:multiLevelType w:val="multilevel"/>
+    <w:tmpl w:val="754C5908"/>
+    <w:lvl w:ilvl="0">
+      <w:start w:val="1"/>
+      <w:numFmt w:val="bullet"/>
+      <w:lvlText w:val=""/>
+      <w:lvlJc w:val="left"/>
+      <w:pPr>
+        <w:tabs>
+          <w:tab w:val="num" w:pos="720"/>
+        </w:tabs>
+        <w:ind w:left="720" w:hanging="360"/>
+      </w:pPr>
+      <w:rPr>
+        <w:rFonts w:ascii="Symbol" w:hAnsi="Symbol" w:hint="default"/>
+        <w:sz w:val="20"/>
+      </w:rPr>
+    </w:lvl>
+    <w:lvl w:ilvl="1" w:tentative="1">
+      <w:start w:val="1"/>
+      <w:numFmt w:val="bullet"/>
+      <w:lvlText w:val="o"/>
+      <w:lvlJc w:val="left"/>
+      <w:pPr>
+        <w:tabs>
+          <w:tab w:val="num" w:pos="1440"/>
+        </w:tabs>
+        <w:ind w:left="1440" w:hanging="360"/>
+      </w:pPr>
+      <w:rPr>
+        <w:rFonts w:ascii="Courier New" w:hAnsi="Courier New" w:hint="default"/>
+        <w:sz w:val="20"/>
+      </w:rPr>
+    </w:lvl>
+    <w:lvl w:ilvl="2" w:tentative="1">
+      <w:start w:val="1"/>
+      <w:numFmt w:val="bullet"/>
+      <w:lvlText w:val=""/>
+      <w:lvlJc w:val="left"/>
+      <w:pPr>
+        <w:tabs>
+          <w:tab w:val="num" w:pos="2160"/>
+        </w:tabs>
+        <w:ind w:left="2160" w:hanging="360"/>
+      </w:pPr>
+      <w:rPr>
+        <w:rFonts w:ascii="Wingdings" w:hAnsi="Wingdings" w:hint="default"/>
+        <w:sz w:val="20"/>
+      </w:rPr>
+    </w:lvl>
+    <w:lvl w:ilvl="3" w:tentative="1">
+      <w:start w:val="1"/>
+      <w:numFmt w:val="bullet"/>
+      <w:lvlText w:val=""/>
+      <w:lvlJc w:val="left"/>
+      <w:pPr>
+        <w:tabs>
+          <w:tab w:val="num" w:pos="2880"/>
+        </w:tabs>
+        <w:ind w:left="2880" w:hanging="360"/>
+      </w:pPr>
+      <w:rPr>
+        <w:rFonts w:ascii="Wingdings" w:hAnsi="Wingdings" w:hint="default"/>
+        <w:sz w:val="20"/>
+      </w:rPr>
+    </w:lvl>
+    <w:lvl w:ilvl="4" w:tentative="1">
+      <w:start w:val="1"/>
+      <w:numFmt w:val="bullet"/>
+      <w:lvlText w:val=""/>
+      <w:lvlJc w:val="left"/>
+      <w:pPr>
+        <w:tabs>
+          <w:tab w:val="num" w:pos="3600"/>
+        </w:tabs>
+        <w:ind w:left="3600" w:hanging="360"/>
+      </w:pPr>
+      <w:rPr>
+        <w:rFonts w:ascii="Wingdings" w:hAnsi="Wingdings" w:hint="default"/>
+        <w:sz w:val="20"/>
+      </w:rPr>
+    </w:lvl>
+    <w:lvl w:ilvl="5" w:tentative="1">
+      <w:start w:val="1"/>
+      <w:numFmt w:val="bullet"/>
+      <w:lvlText w:val=""/>
+      <w:lvlJc w:val="left"/>
+      <w:pPr>
+        <w:tabs>
+          <w:tab w:val="num" w:pos="4320"/>
+        </w:tabs>
+        <w:ind w:left="4320" w:hanging="360"/>
+      </w:pPr>
+      <w:rPr>
+        <w:rFonts w:ascii="Wingdings" w:hAnsi="Wingdings" w:hint="default"/>
+        <w:sz w:val="20"/>
+      </w:rPr>
+    </w:lvl>
+    <w:lvl w:ilvl="6" w:tentative="1">
+      <w:start w:val="1"/>
+      <w:numFmt w:val="bullet"/>
+      <w:lvlText w:val=""/>
+      <w:lvlJc w:val="left"/>
+      <w:pPr>
+        <w:tabs>
+          <w:tab w:val="num" w:pos="5040"/>
+        </w:tabs>
+        <w:ind w:left="5040" w:hanging="360"/>
+      </w:pPr>
+      <w:rPr>
+        <w:rFonts w:ascii="Wingdings" w:hAnsi="Wingdings" w:hint="default"/>
+        <w:sz w:val="20"/>
+      </w:rPr>
+    </w:lvl>
+    <w:lvl w:ilvl="7" w:tentative="1">
+      <w:start w:val="1"/>
+      <w:numFmt w:val="bullet"/>
+      <w:lvlText w:val=""/>
+      <w:lvlJc w:val="left"/>
+      <w:pPr>
+        <w:tabs>
+          <w:tab w:val="num" w:pos="5760"/>
+        </w:tabs>
+        <w:ind w:left="5760" w:hanging="360"/>
+      </w:pPr>
+      <w:rPr>
+        <w:rFonts w:ascii="Wingdings" w:hAnsi="Wingdings" w:hint="default"/>
+        <w:sz w:val="20"/>
+      </w:rPr>
+    </w:lvl>
+    <w:lvl w:ilvl="8" w:tentative="1">
+      <w:start w:val="1"/>
+      <w:numFmt w:val="bullet"/>
+      <w:lvlText w:val=""/>
+      <w:lvlJc w:val="left"/>
+      <w:pPr>
+        <w:tabs>
+          <w:tab w:val="num" w:pos="6480"/>
+        </w:tabs>
+        <w:ind w:left="6480" w:hanging="360"/>
+      </w:pPr>
+      <w:rPr>
+        <w:rFonts w:ascii="Wingdings" w:hAnsi="Wingdings" w:hint="default"/>
+        <w:sz w:val="20"/>
+      </w:rPr>
+    </w:lvl>
+  </w:abstractNum>
+  <w:abstractNum w:abstractNumId="14" w15:restartNumberingAfterBreak="0">
+    <w:nsid w:val="568B4996"/>
+    <w:multiLevelType w:val="multilevel"/>
+    <w:tmpl w:val="93F226CA"/>
+    <w:lvl w:ilvl="0">
+      <w:start w:val="1"/>
+      <w:numFmt w:val="bullet"/>
+      <w:lvlText w:val=""/>
+      <w:lvlJc w:val="left"/>
+      <w:pPr>
+        <w:tabs>
+          <w:tab w:val="num" w:pos="720"/>
+        </w:tabs>
+        <w:ind w:left="720" w:hanging="360"/>
+      </w:pPr>
+      <w:rPr>
+        <w:rFonts w:ascii="Symbol" w:hAnsi="Symbol" w:hint="default"/>
+        <w:sz w:val="20"/>
+      </w:rPr>
+    </w:lvl>
+    <w:lvl w:ilvl="1" w:tentative="1">
+      <w:start w:val="1"/>
+      <w:numFmt w:val="bullet"/>
+      <w:lvlText w:val="o"/>
+      <w:lvlJc w:val="left"/>
+      <w:pPr>
+        <w:tabs>
+          <w:tab w:val="num" w:pos="1440"/>
+        </w:tabs>
+        <w:ind w:left="1440" w:hanging="360"/>
+      </w:pPr>
+      <w:rPr>
+        <w:rFonts w:ascii="Courier New" w:hAnsi="Courier New" w:hint="default"/>
+        <w:sz w:val="20"/>
+      </w:rPr>
+    </w:lvl>
+    <w:lvl w:ilvl="2" w:tentative="1">
+      <w:start w:val="1"/>
+      <w:numFmt w:val="bullet"/>
+      <w:lvlText w:val=""/>
+      <w:lvlJc w:val="left"/>
+      <w:pPr>
+        <w:tabs>
+          <w:tab w:val="num" w:pos="2160"/>
+        </w:tabs>
+        <w:ind w:left="2160" w:hanging="360"/>
+      </w:pPr>
+      <w:rPr>
+        <w:rFonts w:ascii="Wingdings" w:hAnsi="Wingdings" w:hint="default"/>
+        <w:sz w:val="20"/>
+      </w:rPr>
+    </w:lvl>
+    <w:lvl w:ilvl="3" w:tentative="1">
+      <w:start w:val="1"/>
+      <w:numFmt w:val="bullet"/>
+      <w:lvlText w:val=""/>
+      <w:lvlJc w:val="left"/>
+      <w:pPr>
+        <w:tabs>
+          <w:tab w:val="num" w:pos="2880"/>
+        </w:tabs>
+        <w:ind w:left="2880" w:hanging="360"/>
+      </w:pPr>
+      <w:rPr>
+        <w:rFonts w:ascii="Wingdings" w:hAnsi="Wingdings" w:hint="default"/>
+        <w:sz w:val="20"/>
+      </w:rPr>
+    </w:lvl>
+    <w:lvl w:ilvl="4" w:tentative="1">
+      <w:start w:val="1"/>
+      <w:numFmt w:val="bullet"/>
+      <w:lvlText w:val=""/>
+      <w:lvlJc w:val="left"/>
+      <w:pPr>
+        <w:tabs>
+          <w:tab w:val="num" w:pos="3600"/>
+        </w:tabs>
+        <w:ind w:left="3600" w:hanging="360"/>
+      </w:pPr>
+      <w:rPr>
+        <w:rFonts w:ascii="Wingdings" w:hAnsi="Wingdings" w:hint="default"/>
+        <w:sz w:val="20"/>
+      </w:rPr>
+    </w:lvl>
+    <w:lvl w:ilvl="5" w:tentative="1">
+      <w:start w:val="1"/>
+      <w:numFmt w:val="bullet"/>
+      <w:lvlText w:val=""/>
+      <w:lvlJc w:val="left"/>
+      <w:pPr>
+        <w:tabs>
+          <w:tab w:val="num" w:pos="4320"/>
+        </w:tabs>
+        <w:ind w:left="4320" w:hanging="360"/>
+      </w:pPr>
+      <w:rPr>
+        <w:rFonts w:ascii="Wingdings" w:hAnsi="Wingdings" w:hint="default"/>
+        <w:sz w:val="20"/>
+      </w:rPr>
+    </w:lvl>
+    <w:lvl w:ilvl="6" w:tentative="1">
+      <w:start w:val="1"/>
+      <w:numFmt w:val="bullet"/>
+      <w:lvlText w:val=""/>
+      <w:lvlJc w:val="left"/>
+      <w:pPr>
+        <w:tabs>
+          <w:tab w:val="num" w:pos="5040"/>
+        </w:tabs>
+        <w:ind w:left="5040" w:hanging="360"/>
+      </w:pPr>
+      <w:rPr>
+        <w:rFonts w:ascii="Wingdings" w:hAnsi="Wingdings" w:hint="default"/>
+        <w:sz w:val="20"/>
+      </w:rPr>
+    </w:lvl>
+    <w:lvl w:ilvl="7" w:tentative="1">
+      <w:start w:val="1"/>
+      <w:numFmt w:val="bullet"/>
+      <w:lvlText w:val=""/>
+      <w:lvlJc w:val="left"/>
+      <w:pPr>
+        <w:tabs>
+          <w:tab w:val="num" w:pos="5760"/>
+        </w:tabs>
+        <w:ind w:left="5760" w:hanging="360"/>
+      </w:pPr>
+      <w:rPr>
+        <w:rFonts w:ascii="Wingdings" w:hAnsi="Wingdings" w:hint="default"/>
+        <w:sz w:val="20"/>
+      </w:rPr>
+    </w:lvl>
+    <w:lvl w:ilvl="8" w:tentative="1">
+      <w:start w:val="1"/>
+      <w:numFmt w:val="bullet"/>
+      <w:lvlText w:val=""/>
+      <w:lvlJc w:val="left"/>
+      <w:pPr>
+        <w:tabs>
+          <w:tab w:val="num" w:pos="6480"/>
+        </w:tabs>
+        <w:ind w:left="6480" w:hanging="360"/>
+      </w:pPr>
+      <w:rPr>
+        <w:rFonts w:ascii="Wingdings" w:hAnsi="Wingdings" w:hint="default"/>
+        <w:sz w:val="20"/>
+      </w:rPr>
+    </w:lvl>
+  </w:abstractNum>
+  <w:abstractNum w:abstractNumId="15" w15:restartNumberingAfterBreak="0">
+    <w:nsid w:val="58EC1BDD"/>
+    <w:multiLevelType w:val="multilevel"/>
+    <w:tmpl w:val="5DFC0D3C"/>
     <w:lvl w:ilvl="0">
       <w:start w:val="1"/>
       <w:numFmt w:val="decimal"/>
@@ -8108,159 +8821,10 @@
       </w:pPr>
     </w:lvl>
   </w:abstractNum>
-  <w:abstractNum w:abstractNumId="11" w15:restartNumberingAfterBreak="0">
-    <w:nsid w:val="5251240B"/>
+  <w:abstractNum w:abstractNumId="16" w15:restartNumberingAfterBreak="0">
+    <w:nsid w:val="60BA16E7"/>
     <w:multiLevelType w:val="multilevel"/>
-    <w:tmpl w:val="D55CB9F0"/>
-    <w:lvl w:ilvl="0">
-      <w:start w:val="1"/>
-      <w:numFmt w:val="bullet"/>
-      <w:lvlText w:val=""/>
-      <w:lvlJc w:val="left"/>
-      <w:pPr>
-        <w:tabs>
-          <w:tab w:val="num" w:pos="720"/>
-        </w:tabs>
-        <w:ind w:left="720" w:hanging="360"/>
-      </w:pPr>
-      <w:rPr>
-        <w:rFonts w:ascii="Symbol" w:hAnsi="Symbol" w:hint="default"/>
-        <w:sz w:val="20"/>
-      </w:rPr>
-    </w:lvl>
-    <w:lvl w:ilvl="1" w:tentative="1">
-      <w:start w:val="1"/>
-      <w:numFmt w:val="bullet"/>
-      <w:lvlText w:val="o"/>
-      <w:lvlJc w:val="left"/>
-      <w:pPr>
-        <w:tabs>
-          <w:tab w:val="num" w:pos="1440"/>
-        </w:tabs>
-        <w:ind w:left="1440" w:hanging="360"/>
-      </w:pPr>
-      <w:rPr>
-        <w:rFonts w:ascii="Courier New" w:hAnsi="Courier New" w:hint="default"/>
-        <w:sz w:val="20"/>
-      </w:rPr>
-    </w:lvl>
-    <w:lvl w:ilvl="2" w:tentative="1">
-      <w:start w:val="1"/>
-      <w:numFmt w:val="bullet"/>
-      <w:lvlText w:val=""/>
-      <w:lvlJc w:val="left"/>
-      <w:pPr>
-        <w:tabs>
-          <w:tab w:val="num" w:pos="2160"/>
-        </w:tabs>
-        <w:ind w:left="2160" w:hanging="360"/>
-      </w:pPr>
-      <w:rPr>
-        <w:rFonts w:ascii="Wingdings" w:hAnsi="Wingdings" w:hint="default"/>
-        <w:sz w:val="20"/>
-      </w:rPr>
-    </w:lvl>
-    <w:lvl w:ilvl="3" w:tentative="1">
-      <w:start w:val="1"/>
-      <w:numFmt w:val="bullet"/>
-      <w:lvlText w:val=""/>
-      <w:lvlJc w:val="left"/>
-      <w:pPr>
-        <w:tabs>
-          <w:tab w:val="num" w:pos="2880"/>
-        </w:tabs>
-        <w:ind w:left="2880" w:hanging="360"/>
-      </w:pPr>
-      <w:rPr>
-        <w:rFonts w:ascii="Wingdings" w:hAnsi="Wingdings" w:hint="default"/>
-        <w:sz w:val="20"/>
-      </w:rPr>
-    </w:lvl>
-    <w:lvl w:ilvl="4" w:tentative="1">
-      <w:start w:val="1"/>
-      <w:numFmt w:val="bullet"/>
-      <w:lvlText w:val=""/>
-      <w:lvlJc w:val="left"/>
-      <w:pPr>
-        <w:tabs>
-          <w:tab w:val="num" w:pos="3600"/>
-        </w:tabs>
-        <w:ind w:left="3600" w:hanging="360"/>
-      </w:pPr>
-      <w:rPr>
-        <w:rFonts w:ascii="Wingdings" w:hAnsi="Wingdings" w:hint="default"/>
-        <w:sz w:val="20"/>
-      </w:rPr>
-    </w:lvl>
-    <w:lvl w:ilvl="5" w:tentative="1">
-      <w:start w:val="1"/>
-      <w:numFmt w:val="bullet"/>
-      <w:lvlText w:val=""/>
-      <w:lvlJc w:val="left"/>
-      <w:pPr>
-        <w:tabs>
-          <w:tab w:val="num" w:pos="4320"/>
-        </w:tabs>
-        <w:ind w:left="4320" w:hanging="360"/>
-      </w:pPr>
-      <w:rPr>
-        <w:rFonts w:ascii="Wingdings" w:hAnsi="Wingdings" w:hint="default"/>
-        <w:sz w:val="20"/>
-      </w:rPr>
-    </w:lvl>
-    <w:lvl w:ilvl="6" w:tentative="1">
-      <w:start w:val="1"/>
-      <w:numFmt w:val="bullet"/>
-      <w:lvlText w:val=""/>
-      <w:lvlJc w:val="left"/>
-      <w:pPr>
-        <w:tabs>
-          <w:tab w:val="num" w:pos="5040"/>
-        </w:tabs>
-        <w:ind w:left="5040" w:hanging="360"/>
-      </w:pPr>
-      <w:rPr>
-        <w:rFonts w:ascii="Wingdings" w:hAnsi="Wingdings" w:hint="default"/>
-        <w:sz w:val="20"/>
-      </w:rPr>
-    </w:lvl>
-    <w:lvl w:ilvl="7" w:tentative="1">
-      <w:start w:val="1"/>
-      <w:numFmt w:val="bullet"/>
-      <w:lvlText w:val=""/>
-      <w:lvlJc w:val="left"/>
-      <w:pPr>
-        <w:tabs>
-          <w:tab w:val="num" w:pos="5760"/>
-        </w:tabs>
-        <w:ind w:left="5760" w:hanging="360"/>
-      </w:pPr>
-      <w:rPr>
-        <w:rFonts w:ascii="Wingdings" w:hAnsi="Wingdings" w:hint="default"/>
-        <w:sz w:val="20"/>
-      </w:rPr>
-    </w:lvl>
-    <w:lvl w:ilvl="8" w:tentative="1">
-      <w:start w:val="1"/>
-      <w:numFmt w:val="bullet"/>
-      <w:lvlText w:val=""/>
-      <w:lvlJc w:val="left"/>
-      <w:pPr>
-        <w:tabs>
-          <w:tab w:val="num" w:pos="6480"/>
-        </w:tabs>
-        <w:ind w:left="6480" w:hanging="360"/>
-      </w:pPr>
-      <w:rPr>
-        <w:rFonts w:ascii="Wingdings" w:hAnsi="Wingdings" w:hint="default"/>
-        <w:sz w:val="20"/>
-      </w:rPr>
-    </w:lvl>
-  </w:abstractNum>
-  <w:abstractNum w:abstractNumId="12" w15:restartNumberingAfterBreak="0">
-    <w:nsid w:val="53D5678A"/>
-    <w:multiLevelType w:val="multilevel"/>
-    <w:tmpl w:val="F11EABE2"/>
+    <w:tmpl w:val="A036D13A"/>
     <w:lvl w:ilvl="0">
       <w:start w:val="1"/>
       <w:numFmt w:val="decimal"/>
@@ -8374,10 +8938,159 @@
       </w:pPr>
     </w:lvl>
   </w:abstractNum>
-  <w:abstractNum w:abstractNumId="13" w15:restartNumberingAfterBreak="0">
-    <w:nsid w:val="541D2321"/>
+  <w:abstractNum w:abstractNumId="17" w15:restartNumberingAfterBreak="0">
+    <w:nsid w:val="614C72DA"/>
     <w:multiLevelType w:val="multilevel"/>
-    <w:tmpl w:val="DD2C6F98"/>
+    <w:tmpl w:val="EFDA3E62"/>
+    <w:lvl w:ilvl="0">
+      <w:start w:val="1"/>
+      <w:numFmt w:val="bullet"/>
+      <w:lvlText w:val=""/>
+      <w:lvlJc w:val="left"/>
+      <w:pPr>
+        <w:tabs>
+          <w:tab w:val="num" w:pos="720"/>
+        </w:tabs>
+        <w:ind w:left="720" w:hanging="360"/>
+      </w:pPr>
+      <w:rPr>
+        <w:rFonts w:ascii="Symbol" w:hAnsi="Symbol" w:hint="default"/>
+        <w:sz w:val="20"/>
+      </w:rPr>
+    </w:lvl>
+    <w:lvl w:ilvl="1" w:tentative="1">
+      <w:start w:val="1"/>
+      <w:numFmt w:val="bullet"/>
+      <w:lvlText w:val="o"/>
+      <w:lvlJc w:val="left"/>
+      <w:pPr>
+        <w:tabs>
+          <w:tab w:val="num" w:pos="1440"/>
+        </w:tabs>
+        <w:ind w:left="1440" w:hanging="360"/>
+      </w:pPr>
+      <w:rPr>
+        <w:rFonts w:ascii="Courier New" w:hAnsi="Courier New" w:hint="default"/>
+        <w:sz w:val="20"/>
+      </w:rPr>
+    </w:lvl>
+    <w:lvl w:ilvl="2" w:tentative="1">
+      <w:start w:val="1"/>
+      <w:numFmt w:val="bullet"/>
+      <w:lvlText w:val=""/>
+      <w:lvlJc w:val="left"/>
+      <w:pPr>
+        <w:tabs>
+          <w:tab w:val="num" w:pos="2160"/>
+        </w:tabs>
+        <w:ind w:left="2160" w:hanging="360"/>
+      </w:pPr>
+      <w:rPr>
+        <w:rFonts w:ascii="Wingdings" w:hAnsi="Wingdings" w:hint="default"/>
+        <w:sz w:val="20"/>
+      </w:rPr>
+    </w:lvl>
+    <w:lvl w:ilvl="3" w:tentative="1">
+      <w:start w:val="1"/>
+      <w:numFmt w:val="bullet"/>
+      <w:lvlText w:val=""/>
+      <w:lvlJc w:val="left"/>
+      <w:pPr>
+        <w:tabs>
+          <w:tab w:val="num" w:pos="2880"/>
+        </w:tabs>
+        <w:ind w:left="2880" w:hanging="360"/>
+      </w:pPr>
+      <w:rPr>
+        <w:rFonts w:ascii="Wingdings" w:hAnsi="Wingdings" w:hint="default"/>
+        <w:sz w:val="20"/>
+      </w:rPr>
+    </w:lvl>
+    <w:lvl w:ilvl="4" w:tentative="1">
+      <w:start w:val="1"/>
+      <w:numFmt w:val="bullet"/>
+      <w:lvlText w:val=""/>
+      <w:lvlJc w:val="left"/>
+      <w:pPr>
+        <w:tabs>
+          <w:tab w:val="num" w:pos="3600"/>
+        </w:tabs>
+        <w:ind w:left="3600" w:hanging="360"/>
+      </w:pPr>
+      <w:rPr>
+        <w:rFonts w:ascii="Wingdings" w:hAnsi="Wingdings" w:hint="default"/>
+        <w:sz w:val="20"/>
+      </w:rPr>
+    </w:lvl>
+    <w:lvl w:ilvl="5" w:tentative="1">
+      <w:start w:val="1"/>
+      <w:numFmt w:val="bullet"/>
+      <w:lvlText w:val=""/>
+      <w:lvlJc w:val="left"/>
+      <w:pPr>
+        <w:tabs>
+          <w:tab w:val="num" w:pos="4320"/>
+        </w:tabs>
+        <w:ind w:left="4320" w:hanging="360"/>
+      </w:pPr>
+      <w:rPr>
+        <w:rFonts w:ascii="Wingdings" w:hAnsi="Wingdings" w:hint="default"/>
+        <w:sz w:val="20"/>
+      </w:rPr>
+    </w:lvl>
+    <w:lvl w:ilvl="6" w:tentative="1">
+      <w:start w:val="1"/>
+      <w:numFmt w:val="bullet"/>
+      <w:lvlText w:val=""/>
+      <w:lvlJc w:val="left"/>
+      <w:pPr>
+        <w:tabs>
+          <w:tab w:val="num" w:pos="5040"/>
+        </w:tabs>
+        <w:ind w:left="5040" w:hanging="360"/>
+      </w:pPr>
+      <w:rPr>
+        <w:rFonts w:ascii="Wingdings" w:hAnsi="Wingdings" w:hint="default"/>
+        <w:sz w:val="20"/>
+      </w:rPr>
+    </w:lvl>
+    <w:lvl w:ilvl="7" w:tentative="1">
+      <w:start w:val="1"/>
+      <w:numFmt w:val="bullet"/>
+      <w:lvlText w:val=""/>
+      <w:lvlJc w:val="left"/>
+      <w:pPr>
+        <w:tabs>
+          <w:tab w:val="num" w:pos="5760"/>
+        </w:tabs>
+        <w:ind w:left="5760" w:hanging="360"/>
+      </w:pPr>
+      <w:rPr>
+        <w:rFonts w:ascii="Wingdings" w:hAnsi="Wingdings" w:hint="default"/>
+        <w:sz w:val="20"/>
+      </w:rPr>
+    </w:lvl>
+    <w:lvl w:ilvl="8" w:tentative="1">
+      <w:start w:val="1"/>
+      <w:numFmt w:val="bullet"/>
+      <w:lvlText w:val=""/>
+      <w:lvlJc w:val="left"/>
+      <w:pPr>
+        <w:tabs>
+          <w:tab w:val="num" w:pos="6480"/>
+        </w:tabs>
+        <w:ind w:left="6480" w:hanging="360"/>
+      </w:pPr>
+      <w:rPr>
+        <w:rFonts w:ascii="Wingdings" w:hAnsi="Wingdings" w:hint="default"/>
+        <w:sz w:val="20"/>
+      </w:rPr>
+    </w:lvl>
+  </w:abstractNum>
+  <w:abstractNum w:abstractNumId="18" w15:restartNumberingAfterBreak="0">
+    <w:nsid w:val="674C2DFF"/>
+    <w:multiLevelType w:val="multilevel"/>
+    <w:tmpl w:val="7AFCB516"/>
     <w:lvl w:ilvl="0">
       <w:start w:val="1"/>
       <w:numFmt w:val="decimal"/>
@@ -8491,457 +9204,10 @@
       </w:pPr>
     </w:lvl>
   </w:abstractNum>
-  <w:abstractNum w:abstractNumId="14" w15:restartNumberingAfterBreak="0">
-    <w:nsid w:val="54B272F0"/>
+  <w:abstractNum w:abstractNumId="19" w15:restartNumberingAfterBreak="0">
+    <w:nsid w:val="69220088"/>
     <w:multiLevelType w:val="multilevel"/>
-    <w:tmpl w:val="8834D534"/>
-    <w:lvl w:ilvl="0">
-      <w:start w:val="1"/>
-      <w:numFmt w:val="bullet"/>
-      <w:lvlText w:val=""/>
-      <w:lvlJc w:val="left"/>
-      <w:pPr>
-        <w:tabs>
-          <w:tab w:val="num" w:pos="720"/>
-        </w:tabs>
-        <w:ind w:left="720" w:hanging="360"/>
-      </w:pPr>
-      <w:rPr>
-        <w:rFonts w:ascii="Symbol" w:hAnsi="Symbol" w:hint="default"/>
-        <w:sz w:val="20"/>
-      </w:rPr>
-    </w:lvl>
-    <w:lvl w:ilvl="1" w:tentative="1">
-      <w:start w:val="1"/>
-      <w:numFmt w:val="bullet"/>
-      <w:lvlText w:val="o"/>
-      <w:lvlJc w:val="left"/>
-      <w:pPr>
-        <w:tabs>
-          <w:tab w:val="num" w:pos="1440"/>
-        </w:tabs>
-        <w:ind w:left="1440" w:hanging="360"/>
-      </w:pPr>
-      <w:rPr>
-        <w:rFonts w:ascii="Courier New" w:hAnsi="Courier New" w:hint="default"/>
-        <w:sz w:val="20"/>
-      </w:rPr>
-    </w:lvl>
-    <w:lvl w:ilvl="2" w:tentative="1">
-      <w:start w:val="1"/>
-      <w:numFmt w:val="bullet"/>
-      <w:lvlText w:val=""/>
-      <w:lvlJc w:val="left"/>
-      <w:pPr>
-        <w:tabs>
-          <w:tab w:val="num" w:pos="2160"/>
-        </w:tabs>
-        <w:ind w:left="2160" w:hanging="360"/>
-      </w:pPr>
-      <w:rPr>
-        <w:rFonts w:ascii="Wingdings" w:hAnsi="Wingdings" w:hint="default"/>
-        <w:sz w:val="20"/>
-      </w:rPr>
-    </w:lvl>
-    <w:lvl w:ilvl="3" w:tentative="1">
-      <w:start w:val="1"/>
-      <w:numFmt w:val="bullet"/>
-      <w:lvlText w:val=""/>
-      <w:lvlJc w:val="left"/>
-      <w:pPr>
-        <w:tabs>
-          <w:tab w:val="num" w:pos="2880"/>
-        </w:tabs>
-        <w:ind w:left="2880" w:hanging="360"/>
-      </w:pPr>
-      <w:rPr>
-        <w:rFonts w:ascii="Wingdings" w:hAnsi="Wingdings" w:hint="default"/>
-        <w:sz w:val="20"/>
-      </w:rPr>
-    </w:lvl>
-    <w:lvl w:ilvl="4" w:tentative="1">
-      <w:start w:val="1"/>
-      <w:numFmt w:val="bullet"/>
-      <w:lvlText w:val=""/>
-      <w:lvlJc w:val="left"/>
-      <w:pPr>
-        <w:tabs>
-          <w:tab w:val="num" w:pos="3600"/>
-        </w:tabs>
-        <w:ind w:left="3600" w:hanging="360"/>
-      </w:pPr>
-      <w:rPr>
-        <w:rFonts w:ascii="Wingdings" w:hAnsi="Wingdings" w:hint="default"/>
-        <w:sz w:val="20"/>
-      </w:rPr>
-    </w:lvl>
-    <w:lvl w:ilvl="5" w:tentative="1">
-      <w:start w:val="1"/>
-      <w:numFmt w:val="bullet"/>
-      <w:lvlText w:val=""/>
-      <w:lvlJc w:val="left"/>
-      <w:pPr>
-        <w:tabs>
-          <w:tab w:val="num" w:pos="4320"/>
-        </w:tabs>
-        <w:ind w:left="4320" w:hanging="360"/>
-      </w:pPr>
-      <w:rPr>
-        <w:rFonts w:ascii="Wingdings" w:hAnsi="Wingdings" w:hint="default"/>
-        <w:sz w:val="20"/>
-      </w:rPr>
-    </w:lvl>
-    <w:lvl w:ilvl="6" w:tentative="1">
-      <w:start w:val="1"/>
-      <w:numFmt w:val="bullet"/>
-      <w:lvlText w:val=""/>
-      <w:lvlJc w:val="left"/>
-      <w:pPr>
-        <w:tabs>
-          <w:tab w:val="num" w:pos="5040"/>
-        </w:tabs>
-        <w:ind w:left="5040" w:hanging="360"/>
-      </w:pPr>
-      <w:rPr>
-        <w:rFonts w:ascii="Wingdings" w:hAnsi="Wingdings" w:hint="default"/>
-        <w:sz w:val="20"/>
-      </w:rPr>
-    </w:lvl>
-    <w:lvl w:ilvl="7" w:tentative="1">
-      <w:start w:val="1"/>
-      <w:numFmt w:val="bullet"/>
-      <w:lvlText w:val=""/>
-      <w:lvlJc w:val="left"/>
-      <w:pPr>
-        <w:tabs>
-          <w:tab w:val="num" w:pos="5760"/>
-        </w:tabs>
-        <w:ind w:left="5760" w:hanging="360"/>
-      </w:pPr>
-      <w:rPr>
-        <w:rFonts w:ascii="Wingdings" w:hAnsi="Wingdings" w:hint="default"/>
-        <w:sz w:val="20"/>
-      </w:rPr>
-    </w:lvl>
-    <w:lvl w:ilvl="8" w:tentative="1">
-      <w:start w:val="1"/>
-      <w:numFmt w:val="bullet"/>
-      <w:lvlText w:val=""/>
-      <w:lvlJc w:val="left"/>
-      <w:pPr>
-        <w:tabs>
-          <w:tab w:val="num" w:pos="6480"/>
-        </w:tabs>
-        <w:ind w:left="6480" w:hanging="360"/>
-      </w:pPr>
-      <w:rPr>
-        <w:rFonts w:ascii="Wingdings" w:hAnsi="Wingdings" w:hint="default"/>
-        <w:sz w:val="20"/>
-      </w:rPr>
-    </w:lvl>
-  </w:abstractNum>
-  <w:abstractNum w:abstractNumId="15" w15:restartNumberingAfterBreak="0">
-    <w:nsid w:val="5D357195"/>
-    <w:multiLevelType w:val="multilevel"/>
-    <w:tmpl w:val="3FF06852"/>
-    <w:lvl w:ilvl="0">
-      <w:start w:val="1"/>
-      <w:numFmt w:val="bullet"/>
-      <w:lvlText w:val=""/>
-      <w:lvlJc w:val="left"/>
-      <w:pPr>
-        <w:tabs>
-          <w:tab w:val="num" w:pos="720"/>
-        </w:tabs>
-        <w:ind w:left="720" w:hanging="360"/>
-      </w:pPr>
-      <w:rPr>
-        <w:rFonts w:ascii="Symbol" w:hAnsi="Symbol" w:hint="default"/>
-        <w:sz w:val="20"/>
-      </w:rPr>
-    </w:lvl>
-    <w:lvl w:ilvl="1" w:tentative="1">
-      <w:start w:val="1"/>
-      <w:numFmt w:val="bullet"/>
-      <w:lvlText w:val="o"/>
-      <w:lvlJc w:val="left"/>
-      <w:pPr>
-        <w:tabs>
-          <w:tab w:val="num" w:pos="1440"/>
-        </w:tabs>
-        <w:ind w:left="1440" w:hanging="360"/>
-      </w:pPr>
-      <w:rPr>
-        <w:rFonts w:ascii="Courier New" w:hAnsi="Courier New" w:hint="default"/>
-        <w:sz w:val="20"/>
-      </w:rPr>
-    </w:lvl>
-    <w:lvl w:ilvl="2" w:tentative="1">
-      <w:start w:val="1"/>
-      <w:numFmt w:val="bullet"/>
-      <w:lvlText w:val=""/>
-      <w:lvlJc w:val="left"/>
-      <w:pPr>
-        <w:tabs>
-          <w:tab w:val="num" w:pos="2160"/>
-        </w:tabs>
-        <w:ind w:left="2160" w:hanging="360"/>
-      </w:pPr>
-      <w:rPr>
-        <w:rFonts w:ascii="Wingdings" w:hAnsi="Wingdings" w:hint="default"/>
-        <w:sz w:val="20"/>
-      </w:rPr>
-    </w:lvl>
-    <w:lvl w:ilvl="3" w:tentative="1">
-      <w:start w:val="1"/>
-      <w:numFmt w:val="bullet"/>
-      <w:lvlText w:val=""/>
-      <w:lvlJc w:val="left"/>
-      <w:pPr>
-        <w:tabs>
-          <w:tab w:val="num" w:pos="2880"/>
-        </w:tabs>
-        <w:ind w:left="2880" w:hanging="360"/>
-      </w:pPr>
-      <w:rPr>
-        <w:rFonts w:ascii="Wingdings" w:hAnsi="Wingdings" w:hint="default"/>
-        <w:sz w:val="20"/>
-      </w:rPr>
-    </w:lvl>
-    <w:lvl w:ilvl="4" w:tentative="1">
-      <w:start w:val="1"/>
-      <w:numFmt w:val="bullet"/>
-      <w:lvlText w:val=""/>
-      <w:lvlJc w:val="left"/>
-      <w:pPr>
-        <w:tabs>
-          <w:tab w:val="num" w:pos="3600"/>
-        </w:tabs>
-        <w:ind w:left="3600" w:hanging="360"/>
-      </w:pPr>
-      <w:rPr>
-        <w:rFonts w:ascii="Wingdings" w:hAnsi="Wingdings" w:hint="default"/>
-        <w:sz w:val="20"/>
-      </w:rPr>
-    </w:lvl>
-    <w:lvl w:ilvl="5" w:tentative="1">
-      <w:start w:val="1"/>
-      <w:numFmt w:val="bullet"/>
-      <w:lvlText w:val=""/>
-      <w:lvlJc w:val="left"/>
-      <w:pPr>
-        <w:tabs>
-          <w:tab w:val="num" w:pos="4320"/>
-        </w:tabs>
-        <w:ind w:left="4320" w:hanging="360"/>
-      </w:pPr>
-      <w:rPr>
-        <w:rFonts w:ascii="Wingdings" w:hAnsi="Wingdings" w:hint="default"/>
-        <w:sz w:val="20"/>
-      </w:rPr>
-    </w:lvl>
-    <w:lvl w:ilvl="6" w:tentative="1">
-      <w:start w:val="1"/>
-      <w:numFmt w:val="bullet"/>
-      <w:lvlText w:val=""/>
-      <w:lvlJc w:val="left"/>
-      <w:pPr>
-        <w:tabs>
-          <w:tab w:val="num" w:pos="5040"/>
-        </w:tabs>
-        <w:ind w:left="5040" w:hanging="360"/>
-      </w:pPr>
-      <w:rPr>
-        <w:rFonts w:ascii="Wingdings" w:hAnsi="Wingdings" w:hint="default"/>
-        <w:sz w:val="20"/>
-      </w:rPr>
-    </w:lvl>
-    <w:lvl w:ilvl="7" w:tentative="1">
-      <w:start w:val="1"/>
-      <w:numFmt w:val="bullet"/>
-      <w:lvlText w:val=""/>
-      <w:lvlJc w:val="left"/>
-      <w:pPr>
-        <w:tabs>
-          <w:tab w:val="num" w:pos="5760"/>
-        </w:tabs>
-        <w:ind w:left="5760" w:hanging="360"/>
-      </w:pPr>
-      <w:rPr>
-        <w:rFonts w:ascii="Wingdings" w:hAnsi="Wingdings" w:hint="default"/>
-        <w:sz w:val="20"/>
-      </w:rPr>
-    </w:lvl>
-    <w:lvl w:ilvl="8" w:tentative="1">
-      <w:start w:val="1"/>
-      <w:numFmt w:val="bullet"/>
-      <w:lvlText w:val=""/>
-      <w:lvlJc w:val="left"/>
-      <w:pPr>
-        <w:tabs>
-          <w:tab w:val="num" w:pos="6480"/>
-        </w:tabs>
-        <w:ind w:left="6480" w:hanging="360"/>
-      </w:pPr>
-      <w:rPr>
-        <w:rFonts w:ascii="Wingdings" w:hAnsi="Wingdings" w:hint="default"/>
-        <w:sz w:val="20"/>
-      </w:rPr>
-    </w:lvl>
-  </w:abstractNum>
-  <w:abstractNum w:abstractNumId="16" w15:restartNumberingAfterBreak="0">
-    <w:nsid w:val="5DD44DD7"/>
-    <w:multiLevelType w:val="multilevel"/>
-    <w:tmpl w:val="F1527D52"/>
-    <w:lvl w:ilvl="0">
-      <w:start w:val="1"/>
-      <w:numFmt w:val="bullet"/>
-      <w:lvlText w:val=""/>
-      <w:lvlJc w:val="left"/>
-      <w:pPr>
-        <w:tabs>
-          <w:tab w:val="num" w:pos="720"/>
-        </w:tabs>
-        <w:ind w:left="720" w:hanging="360"/>
-      </w:pPr>
-      <w:rPr>
-        <w:rFonts w:ascii="Symbol" w:hAnsi="Symbol" w:hint="default"/>
-        <w:sz w:val="20"/>
-      </w:rPr>
-    </w:lvl>
-    <w:lvl w:ilvl="1" w:tentative="1">
-      <w:start w:val="1"/>
-      <w:numFmt w:val="bullet"/>
-      <w:lvlText w:val="o"/>
-      <w:lvlJc w:val="left"/>
-      <w:pPr>
-        <w:tabs>
-          <w:tab w:val="num" w:pos="1440"/>
-        </w:tabs>
-        <w:ind w:left="1440" w:hanging="360"/>
-      </w:pPr>
-      <w:rPr>
-        <w:rFonts w:ascii="Courier New" w:hAnsi="Courier New" w:hint="default"/>
-        <w:sz w:val="20"/>
-      </w:rPr>
-    </w:lvl>
-    <w:lvl w:ilvl="2" w:tentative="1">
-      <w:start w:val="1"/>
-      <w:numFmt w:val="bullet"/>
-      <w:lvlText w:val=""/>
-      <w:lvlJc w:val="left"/>
-      <w:pPr>
-        <w:tabs>
-          <w:tab w:val="num" w:pos="2160"/>
-        </w:tabs>
-        <w:ind w:left="2160" w:hanging="360"/>
-      </w:pPr>
-      <w:rPr>
-        <w:rFonts w:ascii="Wingdings" w:hAnsi="Wingdings" w:hint="default"/>
-        <w:sz w:val="20"/>
-      </w:rPr>
-    </w:lvl>
-    <w:lvl w:ilvl="3" w:tentative="1">
-      <w:start w:val="1"/>
-      <w:numFmt w:val="bullet"/>
-      <w:lvlText w:val=""/>
-      <w:lvlJc w:val="left"/>
-      <w:pPr>
-        <w:tabs>
-          <w:tab w:val="num" w:pos="2880"/>
-        </w:tabs>
-        <w:ind w:left="2880" w:hanging="360"/>
-      </w:pPr>
-      <w:rPr>
-        <w:rFonts w:ascii="Wingdings" w:hAnsi="Wingdings" w:hint="default"/>
-        <w:sz w:val="20"/>
-      </w:rPr>
-    </w:lvl>
-    <w:lvl w:ilvl="4" w:tentative="1">
-      <w:start w:val="1"/>
-      <w:numFmt w:val="bullet"/>
-      <w:lvlText w:val=""/>
-      <w:lvlJc w:val="left"/>
-      <w:pPr>
-        <w:tabs>
-          <w:tab w:val="num" w:pos="3600"/>
-        </w:tabs>
-        <w:ind w:left="3600" w:hanging="360"/>
-      </w:pPr>
-      <w:rPr>
-        <w:rFonts w:ascii="Wingdings" w:hAnsi="Wingdings" w:hint="default"/>
-        <w:sz w:val="20"/>
-      </w:rPr>
-    </w:lvl>
-    <w:lvl w:ilvl="5" w:tentative="1">
-      <w:start w:val="1"/>
-      <w:numFmt w:val="bullet"/>
-      <w:lvlText w:val=""/>
-      <w:lvlJc w:val="left"/>
-      <w:pPr>
-        <w:tabs>
-          <w:tab w:val="num" w:pos="4320"/>
-        </w:tabs>
-        <w:ind w:left="4320" w:hanging="360"/>
-      </w:pPr>
-      <w:rPr>
-        <w:rFonts w:ascii="Wingdings" w:hAnsi="Wingdings" w:hint="default"/>
-        <w:sz w:val="20"/>
-      </w:rPr>
-    </w:lvl>
-    <w:lvl w:ilvl="6" w:tentative="1">
-      <w:start w:val="1"/>
-      <w:numFmt w:val="bullet"/>
-      <w:lvlText w:val=""/>
-      <w:lvlJc w:val="left"/>
-      <w:pPr>
-        <w:tabs>
-          <w:tab w:val="num" w:pos="5040"/>
-        </w:tabs>
-        <w:ind w:left="5040" w:hanging="360"/>
-      </w:pPr>
-      <w:rPr>
-        <w:rFonts w:ascii="Wingdings" w:hAnsi="Wingdings" w:hint="default"/>
-        <w:sz w:val="20"/>
-      </w:rPr>
-    </w:lvl>
-    <w:lvl w:ilvl="7" w:tentative="1">
-      <w:start w:val="1"/>
-      <w:numFmt w:val="bullet"/>
-      <w:lvlText w:val=""/>
-      <w:lvlJc w:val="left"/>
-      <w:pPr>
-        <w:tabs>
-          <w:tab w:val="num" w:pos="5760"/>
-        </w:tabs>
-        <w:ind w:left="5760" w:hanging="360"/>
-      </w:pPr>
-      <w:rPr>
-        <w:rFonts w:ascii="Wingdings" w:hAnsi="Wingdings" w:hint="default"/>
-        <w:sz w:val="20"/>
-      </w:rPr>
-    </w:lvl>
-    <w:lvl w:ilvl="8" w:tentative="1">
-      <w:start w:val="1"/>
-      <w:numFmt w:val="bullet"/>
-      <w:lvlText w:val=""/>
-      <w:lvlJc w:val="left"/>
-      <w:pPr>
-        <w:tabs>
-          <w:tab w:val="num" w:pos="6480"/>
-        </w:tabs>
-        <w:ind w:left="6480" w:hanging="360"/>
-      </w:pPr>
-      <w:rPr>
-        <w:rFonts w:ascii="Wingdings" w:hAnsi="Wingdings" w:hint="default"/>
-        <w:sz w:val="20"/>
-      </w:rPr>
-    </w:lvl>
-  </w:abstractNum>
-  <w:abstractNum w:abstractNumId="17" w15:restartNumberingAfterBreak="0">
-    <w:nsid w:val="6AA472A5"/>
-    <w:multiLevelType w:val="multilevel"/>
-    <w:tmpl w:val="06C2C09E"/>
+    <w:tmpl w:val="3E76C310"/>
     <w:lvl w:ilvl="0">
       <w:start w:val="1"/>
       <w:numFmt w:val="decimal"/>
@@ -9055,10 +9321,10 @@
       </w:pPr>
     </w:lvl>
   </w:abstractNum>
-  <w:abstractNum w:abstractNumId="18" w15:restartNumberingAfterBreak="0">
-    <w:nsid w:val="6AD0763F"/>
+  <w:abstractNum w:abstractNumId="20" w15:restartNumberingAfterBreak="0">
+    <w:nsid w:val="6D7200C1"/>
     <w:multiLevelType w:val="multilevel"/>
-    <w:tmpl w:val="2DA44A4E"/>
+    <w:tmpl w:val="2998132C"/>
     <w:lvl w:ilvl="0">
       <w:start w:val="1"/>
       <w:numFmt w:val="decimal"/>
@@ -9172,10 +9438,10 @@
       </w:pPr>
     </w:lvl>
   </w:abstractNum>
-  <w:abstractNum w:abstractNumId="19" w15:restartNumberingAfterBreak="0">
-    <w:nsid w:val="6B33450C"/>
+  <w:abstractNum w:abstractNumId="21" w15:restartNumberingAfterBreak="0">
+    <w:nsid w:val="70F235E9"/>
     <w:multiLevelType w:val="multilevel"/>
-    <w:tmpl w:val="43A0AF5C"/>
+    <w:tmpl w:val="D0481186"/>
     <w:lvl w:ilvl="0">
       <w:start w:val="1"/>
       <w:numFmt w:val="bullet"/>
@@ -9321,159 +9587,10 @@
       </w:rPr>
     </w:lvl>
   </w:abstractNum>
-  <w:abstractNum w:abstractNumId="20" w15:restartNumberingAfterBreak="0">
-    <w:nsid w:val="6D371C55"/>
+  <w:abstractNum w:abstractNumId="22" w15:restartNumberingAfterBreak="0">
+    <w:nsid w:val="7D933B71"/>
     <w:multiLevelType w:val="multilevel"/>
-    <w:tmpl w:val="F56AA1E8"/>
-    <w:lvl w:ilvl="0">
-      <w:start w:val="1"/>
-      <w:numFmt w:val="bullet"/>
-      <w:lvlText w:val=""/>
-      <w:lvlJc w:val="left"/>
-      <w:pPr>
-        <w:tabs>
-          <w:tab w:val="num" w:pos="720"/>
-        </w:tabs>
-        <w:ind w:left="720" w:hanging="360"/>
-      </w:pPr>
-      <w:rPr>
-        <w:rFonts w:ascii="Symbol" w:hAnsi="Symbol" w:hint="default"/>
-        <w:sz w:val="20"/>
-      </w:rPr>
-    </w:lvl>
-    <w:lvl w:ilvl="1" w:tentative="1">
-      <w:start w:val="1"/>
-      <w:numFmt w:val="bullet"/>
-      <w:lvlText w:val="o"/>
-      <w:lvlJc w:val="left"/>
-      <w:pPr>
-        <w:tabs>
-          <w:tab w:val="num" w:pos="1440"/>
-        </w:tabs>
-        <w:ind w:left="1440" w:hanging="360"/>
-      </w:pPr>
-      <w:rPr>
-        <w:rFonts w:ascii="Courier New" w:hAnsi="Courier New" w:hint="default"/>
-        <w:sz w:val="20"/>
-      </w:rPr>
-    </w:lvl>
-    <w:lvl w:ilvl="2" w:tentative="1">
-      <w:start w:val="1"/>
-      <w:numFmt w:val="bullet"/>
-      <w:lvlText w:val=""/>
-      <w:lvlJc w:val="left"/>
-      <w:pPr>
-        <w:tabs>
-          <w:tab w:val="num" w:pos="2160"/>
-        </w:tabs>
-        <w:ind w:left="2160" w:hanging="360"/>
-      </w:pPr>
-      <w:rPr>
-        <w:rFonts w:ascii="Wingdings" w:hAnsi="Wingdings" w:hint="default"/>
-        <w:sz w:val="20"/>
-      </w:rPr>
-    </w:lvl>
-    <w:lvl w:ilvl="3" w:tentative="1">
-      <w:start w:val="1"/>
-      <w:numFmt w:val="bullet"/>
-      <w:lvlText w:val=""/>
-      <w:lvlJc w:val="left"/>
-      <w:pPr>
-        <w:tabs>
-          <w:tab w:val="num" w:pos="2880"/>
-        </w:tabs>
-        <w:ind w:left="2880" w:hanging="360"/>
-      </w:pPr>
-      <w:rPr>
-        <w:rFonts w:ascii="Wingdings" w:hAnsi="Wingdings" w:hint="default"/>
-        <w:sz w:val="20"/>
-      </w:rPr>
-    </w:lvl>
-    <w:lvl w:ilvl="4" w:tentative="1">
-      <w:start w:val="1"/>
-      <w:numFmt w:val="bullet"/>
-      <w:lvlText w:val=""/>
-      <w:lvlJc w:val="left"/>
-      <w:pPr>
-        <w:tabs>
-          <w:tab w:val="num" w:pos="3600"/>
-        </w:tabs>
-        <w:ind w:left="3600" w:hanging="360"/>
-      </w:pPr>
-      <w:rPr>
-        <w:rFonts w:ascii="Wingdings" w:hAnsi="Wingdings" w:hint="default"/>
-        <w:sz w:val="20"/>
-      </w:rPr>
-    </w:lvl>
-    <w:lvl w:ilvl="5" w:tentative="1">
-      <w:start w:val="1"/>
-      <w:numFmt w:val="bullet"/>
-      <w:lvlText w:val=""/>
-      <w:lvlJc w:val="left"/>
-      <w:pPr>
-        <w:tabs>
-          <w:tab w:val="num" w:pos="4320"/>
-        </w:tabs>
-        <w:ind w:left="4320" w:hanging="360"/>
-      </w:pPr>
-      <w:rPr>
-        <w:rFonts w:ascii="Wingdings" w:hAnsi="Wingdings" w:hint="default"/>
-        <w:sz w:val="20"/>
-      </w:rPr>
-    </w:lvl>
-    <w:lvl w:ilvl="6" w:tentative="1">
-      <w:start w:val="1"/>
-      <w:numFmt w:val="bullet"/>
-      <w:lvlText w:val=""/>
-      <w:lvlJc w:val="left"/>
-      <w:pPr>
-        <w:tabs>
-          <w:tab w:val="num" w:pos="5040"/>
-        </w:tabs>
-        <w:ind w:left="5040" w:hanging="360"/>
-      </w:pPr>
-      <w:rPr>
-        <w:rFonts w:ascii="Wingdings" w:hAnsi="Wingdings" w:hint="default"/>
-        <w:sz w:val="20"/>
-      </w:rPr>
-    </w:lvl>
-    <w:lvl w:ilvl="7" w:tentative="1">
-      <w:start w:val="1"/>
-      <w:numFmt w:val="bullet"/>
-      <w:lvlText w:val=""/>
-      <w:lvlJc w:val="left"/>
-      <w:pPr>
-        <w:tabs>
-          <w:tab w:val="num" w:pos="5760"/>
-        </w:tabs>
-        <w:ind w:left="5760" w:hanging="360"/>
-      </w:pPr>
-      <w:rPr>
-        <w:rFonts w:ascii="Wingdings" w:hAnsi="Wingdings" w:hint="default"/>
-        <w:sz w:val="20"/>
-      </w:rPr>
-    </w:lvl>
-    <w:lvl w:ilvl="8" w:tentative="1">
-      <w:start w:val="1"/>
-      <w:numFmt w:val="bullet"/>
-      <w:lvlText w:val=""/>
-      <w:lvlJc w:val="left"/>
-      <w:pPr>
-        <w:tabs>
-          <w:tab w:val="num" w:pos="6480"/>
-        </w:tabs>
-        <w:ind w:left="6480" w:hanging="360"/>
-      </w:pPr>
-      <w:rPr>
-        <w:rFonts w:ascii="Wingdings" w:hAnsi="Wingdings" w:hint="default"/>
-        <w:sz w:val="20"/>
-      </w:rPr>
-    </w:lvl>
-  </w:abstractNum>
-  <w:abstractNum w:abstractNumId="21" w15:restartNumberingAfterBreak="0">
-    <w:nsid w:val="72BE2980"/>
-    <w:multiLevelType w:val="multilevel"/>
-    <w:tmpl w:val="BD282586"/>
+    <w:tmpl w:val="4626A26E"/>
     <w:lvl w:ilvl="0">
       <w:start w:val="1"/>
       <w:numFmt w:val="decimal"/>
@@ -9587,14 +9704,14 @@
       </w:pPr>
     </w:lvl>
   </w:abstractNum>
-  <w:abstractNum w:abstractNumId="22" w15:restartNumberingAfterBreak="0">
-    <w:nsid w:val="74900422"/>
+  <w:abstractNum w:abstractNumId="23" w15:restartNumberingAfterBreak="0">
+    <w:nsid w:val="7F775A24"/>
     <w:multiLevelType w:val="multilevel"/>
-    <w:tmpl w:val="70B69978"/>
+    <w:tmpl w:val="A21485AA"/>
     <w:lvl w:ilvl="0">
       <w:start w:val="1"/>
-      <w:numFmt w:val="decimal"/>
-      <w:lvlText w:val="%1."/>
+      <w:numFmt w:val="bullet"/>
+      <w:lvlText w:val=""/>
       <w:lvlJc w:val="left"/>
       <w:pPr>
         <w:tabs>
@@ -9602,8 +9719,12 @@
         </w:tabs>
         <w:ind w:left="720" w:hanging="360"/>
       </w:pPr>
-    </w:lvl>
-    <w:lvl w:ilvl="1">
+      <w:rPr>
+        <w:rFonts w:ascii="Symbol" w:hAnsi="Symbol" w:hint="default"/>
+        <w:sz w:val="20"/>
+      </w:rPr>
+    </w:lvl>
+    <w:lvl w:ilvl="1" w:tentative="1">
       <w:start w:val="1"/>
       <w:numFmt w:val="bullet"/>
       <w:lvlText w:val="o"/>
@@ -9621,8 +9742,8 @@
     </w:lvl>
     <w:lvl w:ilvl="2" w:tentative="1">
       <w:start w:val="1"/>
-      <w:numFmt w:val="decimal"/>
-      <w:lvlText w:val="%3."/>
+      <w:numFmt w:val="bullet"/>
+      <w:lvlText w:val=""/>
       <w:lvlJc w:val="left"/>
       <w:pPr>
         <w:tabs>
@@ -9630,11 +9751,15 @@
         </w:tabs>
         <w:ind w:left="2160" w:hanging="360"/>
       </w:pPr>
+      <w:rPr>
+        <w:rFonts w:ascii="Wingdings" w:hAnsi="Wingdings" w:hint="default"/>
+        <w:sz w:val="20"/>
+      </w:rPr>
     </w:lvl>
     <w:lvl w:ilvl="3" w:tentative="1">
       <w:start w:val="1"/>
-      <w:numFmt w:val="decimal"/>
-      <w:lvlText w:val="%4."/>
+      <w:numFmt w:val="bullet"/>
+      <w:lvlText w:val=""/>
       <w:lvlJc w:val="left"/>
       <w:pPr>
         <w:tabs>
@@ -9642,11 +9767,15 @@
         </w:tabs>
         <w:ind w:left="2880" w:hanging="360"/>
       </w:pPr>
+      <w:rPr>
+        <w:rFonts w:ascii="Wingdings" w:hAnsi="Wingdings" w:hint="default"/>
+        <w:sz w:val="20"/>
+      </w:rPr>
     </w:lvl>
     <w:lvl w:ilvl="4" w:tentative="1">
       <w:start w:val="1"/>
-      <w:numFmt w:val="decimal"/>
-      <w:lvlText w:val="%5."/>
+      <w:numFmt w:val="bullet"/>
+      <w:lvlText w:val=""/>
       <w:lvlJc w:val="left"/>
       <w:pPr>
         <w:tabs>
@@ -9654,11 +9783,15 @@
         </w:tabs>
         <w:ind w:left="3600" w:hanging="360"/>
       </w:pPr>
+      <w:rPr>
+        <w:rFonts w:ascii="Wingdings" w:hAnsi="Wingdings" w:hint="default"/>
+        <w:sz w:val="20"/>
+      </w:rPr>
     </w:lvl>
     <w:lvl w:ilvl="5" w:tentative="1">
       <w:start w:val="1"/>
-      <w:numFmt w:val="decimal"/>
-      <w:lvlText w:val="%6."/>
+      <w:numFmt w:val="bullet"/>
+      <w:lvlText w:val=""/>
       <w:lvlJc w:val="left"/>
       <w:pPr>
         <w:tabs>
@@ -9666,11 +9799,15 @@
         </w:tabs>
         <w:ind w:left="4320" w:hanging="360"/>
       </w:pPr>
+      <w:rPr>
+        <w:rFonts w:ascii="Wingdings" w:hAnsi="Wingdings" w:hint="default"/>
+        <w:sz w:val="20"/>
+      </w:rPr>
     </w:lvl>
     <w:lvl w:ilvl="6" w:tentative="1">
       <w:start w:val="1"/>
-      <w:numFmt w:val="decimal"/>
-      <w:lvlText w:val="%7."/>
+      <w:numFmt w:val="bullet"/>
+      <w:lvlText w:val=""/>
       <w:lvlJc w:val="left"/>
       <w:pPr>
         <w:tabs>
@@ -9678,11 +9815,15 @@
         </w:tabs>
         <w:ind w:left="5040" w:hanging="360"/>
       </w:pPr>
+      <w:rPr>
+        <w:rFonts w:ascii="Wingdings" w:hAnsi="Wingdings" w:hint="default"/>
+        <w:sz w:val="20"/>
+      </w:rPr>
     </w:lvl>
     <w:lvl w:ilvl="7" w:tentative="1">
       <w:start w:val="1"/>
-      <w:numFmt w:val="decimal"/>
-      <w:lvlText w:val="%8."/>
+      <w:numFmt w:val="bullet"/>
+      <w:lvlText w:val=""/>
       <w:lvlJc w:val="left"/>
       <w:pPr>
         <w:tabs>
@@ -9690,11 +9831,15 @@
         </w:tabs>
         <w:ind w:left="5760" w:hanging="360"/>
       </w:pPr>
+      <w:rPr>
+        <w:rFonts w:ascii="Wingdings" w:hAnsi="Wingdings" w:hint="default"/>
+        <w:sz w:val="20"/>
+      </w:rPr>
     </w:lvl>
     <w:lvl w:ilvl="8" w:tentative="1">
       <w:start w:val="1"/>
-      <w:numFmt w:val="decimal"/>
-      <w:lvlText w:val="%9."/>
+      <w:numFmt w:val="bullet"/>
+      <w:lvlText w:val=""/>
       <w:lvlJc w:val="left"/>
       <w:pPr>
         <w:tabs>
@@ -9702,228 +9847,83 @@
         </w:tabs>
         <w:ind w:left="6480" w:hanging="360"/>
       </w:pPr>
+      <w:rPr>
+        <w:rFonts w:ascii="Wingdings" w:hAnsi="Wingdings" w:hint="default"/>
+        <w:sz w:val="20"/>
+      </w:rPr>
     </w:lvl>
   </w:abstractNum>
-  <w:abstractNum w:abstractNumId="23" w15:restartNumberingAfterBreak="0">
-    <w:nsid w:val="78791A7F"/>
-    <w:multiLevelType w:val="multilevel"/>
-    <w:tmpl w:val="5754B40E"/>
-    <w:lvl w:ilvl="0">
-      <w:start w:val="1"/>
-      <w:numFmt w:val="bullet"/>
-      <w:lvlText w:val=""/>
-      <w:lvlJc w:val="left"/>
-      <w:pPr>
-        <w:tabs>
-          <w:tab w:val="num" w:pos="720"/>
-        </w:tabs>
-        <w:ind w:left="720" w:hanging="360"/>
-      </w:pPr>
-      <w:rPr>
-        <w:rFonts w:ascii="Symbol" w:hAnsi="Symbol" w:hint="default"/>
-        <w:sz w:val="20"/>
-      </w:rPr>
-    </w:lvl>
-    <w:lvl w:ilvl="1" w:tentative="1">
-      <w:start w:val="1"/>
-      <w:numFmt w:val="bullet"/>
-      <w:lvlText w:val="o"/>
-      <w:lvlJc w:val="left"/>
-      <w:pPr>
-        <w:tabs>
-          <w:tab w:val="num" w:pos="1440"/>
-        </w:tabs>
-        <w:ind w:left="1440" w:hanging="360"/>
-      </w:pPr>
-      <w:rPr>
-        <w:rFonts w:ascii="Courier New" w:hAnsi="Courier New" w:hint="default"/>
-        <w:sz w:val="20"/>
-      </w:rPr>
-    </w:lvl>
-    <w:lvl w:ilvl="2" w:tentative="1">
-      <w:start w:val="1"/>
-      <w:numFmt w:val="bullet"/>
-      <w:lvlText w:val=""/>
-      <w:lvlJc w:val="left"/>
-      <w:pPr>
-        <w:tabs>
-          <w:tab w:val="num" w:pos="2160"/>
-        </w:tabs>
-        <w:ind w:left="2160" w:hanging="360"/>
-      </w:pPr>
-      <w:rPr>
-        <w:rFonts w:ascii="Wingdings" w:hAnsi="Wingdings" w:hint="default"/>
-        <w:sz w:val="20"/>
-      </w:rPr>
-    </w:lvl>
-    <w:lvl w:ilvl="3" w:tentative="1">
-      <w:start w:val="1"/>
-      <w:numFmt w:val="bullet"/>
-      <w:lvlText w:val=""/>
-      <w:lvlJc w:val="left"/>
-      <w:pPr>
-        <w:tabs>
-          <w:tab w:val="num" w:pos="2880"/>
-        </w:tabs>
-        <w:ind w:left="2880" w:hanging="360"/>
-      </w:pPr>
-      <w:rPr>
-        <w:rFonts w:ascii="Wingdings" w:hAnsi="Wingdings" w:hint="default"/>
-        <w:sz w:val="20"/>
-      </w:rPr>
-    </w:lvl>
-    <w:lvl w:ilvl="4" w:tentative="1">
-      <w:start w:val="1"/>
-      <w:numFmt w:val="bullet"/>
-      <w:lvlText w:val=""/>
-      <w:lvlJc w:val="left"/>
-      <w:pPr>
-        <w:tabs>
-          <w:tab w:val="num" w:pos="3600"/>
-        </w:tabs>
-        <w:ind w:left="3600" w:hanging="360"/>
-      </w:pPr>
-      <w:rPr>
-        <w:rFonts w:ascii="Wingdings" w:hAnsi="Wingdings" w:hint="default"/>
-        <w:sz w:val="20"/>
-      </w:rPr>
-    </w:lvl>
-    <w:lvl w:ilvl="5" w:tentative="1">
-      <w:start w:val="1"/>
-      <w:numFmt w:val="bullet"/>
-      <w:lvlText w:val=""/>
-      <w:lvlJc w:val="left"/>
-      <w:pPr>
-        <w:tabs>
-          <w:tab w:val="num" w:pos="4320"/>
-        </w:tabs>
-        <w:ind w:left="4320" w:hanging="360"/>
-      </w:pPr>
-      <w:rPr>
-        <w:rFonts w:ascii="Wingdings" w:hAnsi="Wingdings" w:hint="default"/>
-        <w:sz w:val="20"/>
-      </w:rPr>
-    </w:lvl>
-    <w:lvl w:ilvl="6" w:tentative="1">
-      <w:start w:val="1"/>
-      <w:numFmt w:val="bullet"/>
-      <w:lvlText w:val=""/>
-      <w:lvlJc w:val="left"/>
-      <w:pPr>
-        <w:tabs>
-          <w:tab w:val="num" w:pos="5040"/>
-        </w:tabs>
-        <w:ind w:left="5040" w:hanging="360"/>
-      </w:pPr>
-      <w:rPr>
-        <w:rFonts w:ascii="Wingdings" w:hAnsi="Wingdings" w:hint="default"/>
-        <w:sz w:val="20"/>
-      </w:rPr>
-    </w:lvl>
-    <w:lvl w:ilvl="7" w:tentative="1">
-      <w:start w:val="1"/>
-      <w:numFmt w:val="bullet"/>
-      <w:lvlText w:val=""/>
-      <w:lvlJc w:val="left"/>
-      <w:pPr>
-        <w:tabs>
-          <w:tab w:val="num" w:pos="5760"/>
-        </w:tabs>
-        <w:ind w:left="5760" w:hanging="360"/>
-      </w:pPr>
-      <w:rPr>
-        <w:rFonts w:ascii="Wingdings" w:hAnsi="Wingdings" w:hint="default"/>
-        <w:sz w:val="20"/>
-      </w:rPr>
-    </w:lvl>
-    <w:lvl w:ilvl="8" w:tentative="1">
-      <w:start w:val="1"/>
-      <w:numFmt w:val="bullet"/>
-      <w:lvlText w:val=""/>
-      <w:lvlJc w:val="left"/>
-      <w:pPr>
-        <w:tabs>
-          <w:tab w:val="num" w:pos="6480"/>
-        </w:tabs>
-        <w:ind w:left="6480" w:hanging="360"/>
-      </w:pPr>
-      <w:rPr>
-        <w:rFonts w:ascii="Wingdings" w:hAnsi="Wingdings" w:hint="default"/>
-        <w:sz w:val="20"/>
-      </w:rPr>
-    </w:lvl>
-  </w:abstractNum>
-  <w:num w:numId="1" w16cid:durableId="1901285681">
+  <w:num w:numId="1" w16cid:durableId="404382897">
+    <w:abstractNumId w:val="1"/>
+  </w:num>
+  <w:num w:numId="2" w16cid:durableId="2042634295">
+    <w:abstractNumId w:val="8"/>
+  </w:num>
+  <w:num w:numId="3" w16cid:durableId="1229026258">
+    <w:abstractNumId w:val="2"/>
+  </w:num>
+  <w:num w:numId="4" w16cid:durableId="1182280139">
+    <w:abstractNumId w:val="5"/>
+  </w:num>
+  <w:num w:numId="5" w16cid:durableId="79957622">
+    <w:abstractNumId w:val="6"/>
+  </w:num>
+  <w:num w:numId="6" w16cid:durableId="1637373893">
+    <w:abstractNumId w:val="21"/>
+  </w:num>
+  <w:num w:numId="7" w16cid:durableId="473839207">
+    <w:abstractNumId w:val="15"/>
+  </w:num>
+  <w:num w:numId="8" w16cid:durableId="1104301981">
+    <w:abstractNumId w:val="14"/>
+  </w:num>
+  <w:num w:numId="9" w16cid:durableId="1828202719">
+    <w:abstractNumId w:val="3"/>
+  </w:num>
+  <w:num w:numId="10" w16cid:durableId="1170951628">
+    <w:abstractNumId w:val="9"/>
+  </w:num>
+  <w:num w:numId="11" w16cid:durableId="173882388">
+    <w:abstractNumId w:val="13"/>
+  </w:num>
+  <w:num w:numId="12" w16cid:durableId="1773041090">
+    <w:abstractNumId w:val="4"/>
+  </w:num>
+  <w:num w:numId="13" w16cid:durableId="1622955522">
+    <w:abstractNumId w:val="17"/>
+  </w:num>
+  <w:num w:numId="14" w16cid:durableId="336661429">
+    <w:abstractNumId w:val="16"/>
+  </w:num>
+  <w:num w:numId="15" w16cid:durableId="209653396">
+    <w:abstractNumId w:val="11"/>
+  </w:num>
+  <w:num w:numId="16" w16cid:durableId="747700466">
+    <w:abstractNumId w:val="23"/>
+  </w:num>
+  <w:num w:numId="17" w16cid:durableId="1479496382">
+    <w:abstractNumId w:val="18"/>
+  </w:num>
+  <w:num w:numId="18" w16cid:durableId="628973833">
+    <w:abstractNumId w:val="7"/>
+  </w:num>
+  <w:num w:numId="19" w16cid:durableId="1705791791">
     <w:abstractNumId w:val="20"/>
   </w:num>
-  <w:num w:numId="2" w16cid:durableId="192160931">
-    <w:abstractNumId w:val="5"/>
-  </w:num>
-  <w:num w:numId="3" w16cid:durableId="1379935737">
+  <w:num w:numId="20" w16cid:durableId="2055738215">
     <w:abstractNumId w:val="10"/>
   </w:num>
-  <w:num w:numId="4" w16cid:durableId="331415729">
-    <w:abstractNumId w:val="23"/>
+  <w:num w:numId="21" w16cid:durableId="1864588610">
+    <w:abstractNumId w:val="22"/>
   </w:num>
-  <w:num w:numId="5" w16cid:durableId="976568499">
-    <w:abstractNumId w:val="6"/>
-  </w:num>
-  <w:num w:numId="6" w16cid:durableId="1493332876">
-    <w:abstractNumId w:val="11"/>
-  </w:num>
-  <w:num w:numId="7" w16cid:durableId="536696491">
+  <w:num w:numId="22" w16cid:durableId="264196856">
     <w:abstractNumId w:val="0"/>
   </w:num>
-  <w:num w:numId="8" w16cid:durableId="943539371">
-    <w:abstractNumId w:val="4"/>
-  </w:num>
-  <w:num w:numId="9" w16cid:durableId="454755953">
-    <w:abstractNumId w:val="1"/>
-  </w:num>
-  <w:num w:numId="10" w16cid:durableId="933980619">
+  <w:num w:numId="23" w16cid:durableId="851843112">
     <w:abstractNumId w:val="12"/>
   </w:num>
-  <w:num w:numId="11" w16cid:durableId="654991138">
-    <w:abstractNumId w:val="16"/>
-  </w:num>
-  <w:num w:numId="12" w16cid:durableId="2120761356">
+  <w:num w:numId="24" w16cid:durableId="2055229840">
     <w:abstractNumId w:val="19"/>
-  </w:num>
-  <w:num w:numId="13" w16cid:durableId="1126700228">
-    <w:abstractNumId w:val="15"/>
-  </w:num>
-  <w:num w:numId="14" w16cid:durableId="74981539">
-    <w:abstractNumId w:val="17"/>
-  </w:num>
-  <w:num w:numId="15" w16cid:durableId="622617137">
-    <w:abstractNumId w:val="7"/>
-  </w:num>
-  <w:num w:numId="16" w16cid:durableId="109865694">
-    <w:abstractNumId w:val="8"/>
-  </w:num>
-  <w:num w:numId="17" w16cid:durableId="1517966273">
-    <w:abstractNumId w:val="3"/>
-  </w:num>
-  <w:num w:numId="18" w16cid:durableId="1530145350">
-    <w:abstractNumId w:val="13"/>
-  </w:num>
-  <w:num w:numId="19" w16cid:durableId="1821772248">
-    <w:abstractNumId w:val="21"/>
-  </w:num>
-  <w:num w:numId="20" w16cid:durableId="16663946">
-    <w:abstractNumId w:val="9"/>
-  </w:num>
-  <w:num w:numId="21" w16cid:durableId="56982076">
-    <w:abstractNumId w:val="22"/>
-  </w:num>
-  <w:num w:numId="22" w16cid:durableId="1515455496">
-    <w:abstractNumId w:val="2"/>
-  </w:num>
-  <w:num w:numId="23" w16cid:durableId="1734347685">
-    <w:abstractNumId w:val="14"/>
-  </w:num>
-  <w:num w:numId="24" w16cid:durableId="2026011847">
-    <w:abstractNumId w:val="18"/>
   </w:num>
 </w:numbering>
 </file>

</xml_diff>